<commit_message>
Step 23 - Add LineReconstructor
</commit_message>
<xml_diff>
--- a/output/output.docx
+++ b/output/output.docx
@@ -4,457 +4,37 @@
   <w:body>
     <w:p>
       <w:r>
-        <w:t xml:space="preserve"> </w:t>
-      </w:r>
-      <w:r>
-        <w:t xml:space="preserve">1 </w:t>
-      </w:r>
-      <w:r>
-        <w:br/>
+        <w:t>1</w:t>
       </w:r>
     </w:p>
     <w:p>
       <w:r>
-        <w:t xml:space="preserve">Sample PDF </w:t>
-      </w:r>
-      <w:r>
-        <w:br/>
+        <w:t>Sample PDF</w:t>
       </w:r>
     </w:p>
     <w:p>
       <w:r>
-        <w:t xml:space="preserve"> </w:t>
-      </w:r>
-      <w:r>
-        <w:t xml:space="preserve">Created for testing </w:t>
-      </w:r>
-      <w:r>
-        <w:t>PDFObject</w:t>
-      </w:r>
-      <w:r>
-        <w:t xml:space="preserve"> </w:t>
-      </w:r>
-      <w:r>
-        <w:t xml:space="preserve"> </w:t>
-      </w:r>
-      <w:r>
-        <w:t xml:space="preserve">This PDF is three pages long. Three long pages. Or three short pages if </w:t>
-      </w:r>
-      <w:r>
-        <w:t xml:space="preserve">you’re optimistic. Is it the same as saying “three long minutes”, knowing </w:t>
-      </w:r>
-      <w:r>
-        <w:t xml:space="preserve">that all minutes are the same duration, and one cannot possibly be longer </w:t>
-      </w:r>
-      <w:r>
-        <w:t xml:space="preserve">than the other? If these pages are all the same size, can one possibly be </w:t>
-      </w:r>
-      <w:r>
-        <w:t xml:space="preserve">longer than the other? </w:t>
-      </w:r>
-      <w:r>
-        <w:t xml:space="preserve"> </w:t>
-      </w:r>
-      <w:r>
-        <w:t xml:space="preserve">I digress. Here’s some Latin. Lorem ipsum dolor sit amet, consectetur adipiscing elit. Integer nec </w:t>
-      </w:r>
-      <w:r>
-        <w:t xml:space="preserve">odio. Praesent libero. Sed cursus ante dapibus diam. Sed nisi. Nulla quis sem at nibh elementum </w:t>
-      </w:r>
-      <w:r>
-        <w:t xml:space="preserve">imperdiet. Duis sagittis ipsum. Praesent mauris. Fusce nec tellus sed augue semper porta. Mauris </w:t>
-      </w:r>
-      <w:r>
-        <w:t xml:space="preserve">massa. Vestibulum lacinia arcu eget nulla. Class aptent taciti sociosqu ad litora torquent per </w:t>
-      </w:r>
-      <w:r>
-        <w:t xml:space="preserve">conubia nostra, per inceptos himenaeos. Curabitur sodales ligula in libero.  </w:t>
-      </w:r>
-      <w:r>
-        <w:t xml:space="preserve"> </w:t>
-      </w:r>
-      <w:r>
-        <w:t xml:space="preserve">Sed dignissim lacinia nunc. Curabitur tortor. Pellentesque nibh. Aenean quam. In scelerisque sem </w:t>
-      </w:r>
-      <w:r>
-        <w:t xml:space="preserve">at dolor. Maecenas mattis. Sed convallis tristique sem. Proin ut ligula vel nunc egestas porttitor. </w:t>
-      </w:r>
-      <w:r>
-        <w:t xml:space="preserve">Morbi lectus risus, iaculis vel, suscipit quis, luctus non, massa. Fusce ac turpis quis ligula lacinia </w:t>
-      </w:r>
-      <w:r>
-        <w:t xml:space="preserve">aliquet. Mauris ipsum. Nulla metus metus, ullamcorper vel, tincidunt sed, euismod in, nibh.  </w:t>
-      </w:r>
-      <w:r>
-        <w:t xml:space="preserve"> </w:t>
-      </w:r>
-      <w:r>
-        <w:t xml:space="preserve">Quisque volutpat condimentum velit. Class aptent taciti sociosqu ad litora torquent per conubia </w:t>
-      </w:r>
-      <w:r>
-        <w:t xml:space="preserve">nostra, per inceptos himenaeos. Nam nec ante. Sed lacinia, urna non tincidunt mattis, tortor neque </w:t>
-      </w:r>
-      <w:r>
-        <w:t xml:space="preserve">adipiscing diam, a cursus ipsum ante quis turpis. Nulla facilisi. Ut fringilla. Suspendisse potenti. </w:t>
-      </w:r>
-      <w:r>
-        <w:t xml:space="preserve">Nunc feugiat mi a tellus consequat imperdiet. Vestibulum sapien. Proin quam. Etiam ultrices.  </w:t>
-      </w:r>
-      <w:r>
-        <w:t xml:space="preserve"> </w:t>
-      </w:r>
-      <w:r>
-        <w:t xml:space="preserve">Suspendisse in justo eu magna luctus suscipit. Sed lectus. Integer euismod lacus luctus magna. </w:t>
-      </w:r>
-      <w:r>
-        <w:t xml:space="preserve">Quisque cursus, metus vitae pharetra auctor, sem massa mattis sem, at interdum magna augue </w:t>
-      </w:r>
-      <w:r>
-        <w:t xml:space="preserve">eget diam. Vestibulum ante ipsum primis in faucibus orci luctus et ultrices posuere cubilia Curae; </w:t>
-      </w:r>
-      <w:r>
-        <w:t xml:space="preserve">Morbi lacinia molestie dui. Praesent blandit dolor. Sed non quam. In vel mi sit amet augue congue </w:t>
-      </w:r>
-      <w:r>
-        <w:t xml:space="preserve">elementum. Morbi in ipsum sit amet pede facilisis laoreet. Donec lacus nunc, viverra nec, blandit </w:t>
-      </w:r>
-      <w:r>
-        <w:t xml:space="preserve">vel, egestas et, augue. Vestibulum tincidunt malesuada tellus. Ut ultrices ultrices enim. Curabitur </w:t>
-      </w:r>
-      <w:r>
-        <w:t xml:space="preserve">sit amet mauris.  </w:t>
-      </w:r>
-      <w:r>
-        <w:t xml:space="preserve"> </w:t>
-      </w:r>
-      <w:r>
-        <w:t xml:space="preserve">Morbi in dui quis est pulvinar ullamcorper. Nulla facilisi. Integer lacinia sollicitudin massa. Cras </w:t>
-      </w:r>
-      <w:r>
-        <w:t xml:space="preserve">metus. Sed aliquet risus a tortor. Integer id quam. Morbi mi. Quisque nisl felis, venenatis tristique, </w:t>
-      </w:r>
-      <w:r>
-        <w:t xml:space="preserve">dignissim in, ultrices sit amet, augue. Proin sodales libero eget ante. Nulla quam. Aenean laoreet. </w:t>
-      </w:r>
-      <w:r>
-        <w:t xml:space="preserve">Vestibulum nisi lectus, commodo ac, facilisis ac, ultricies eu, pede. Ut orci risus, accumsan </w:t>
-      </w:r>
-      <w:r>
-        <w:t xml:space="preserve">porttitor, cursus quis, aliquet eget, justo. Sed pretium blandit orci.  </w:t>
-      </w:r>
-      <w:r>
-        <w:t xml:space="preserve"> </w:t>
-      </w:r>
-      <w:r>
-        <w:t xml:space="preserve">Ut eu diam at pede suscipit sodales. Aenean lectus elit, fermentum non, convallis id, sagittis at, </w:t>
-      </w:r>
-      <w:r>
-        <w:t xml:space="preserve">neque. Nullam mauris orci, aliquet et, iaculis et, viverra vitae, ligula. Nulla ut felis in purus </w:t>
-      </w:r>
-      <w:r>
-        <w:t xml:space="preserve">aliquam imperdiet. Maecenas aliquet mollis lectus. Vivamus consectetuer risus et tortor. Lorem </w:t>
-      </w:r>
-      <w:r>
-        <w:br/>
+        <w:t>Created for testing PDFObject This PDF is three pages long. Three long pages. Or three short pages if you’re optimistic. Is it the same as saying “three long minutes”, knowing that all minutes are the same duration, and one cannot possibly be longer than the other? If these pages are all the same size, can one possibly be longer than the other? I digress. Here’s some Latin. Lorem ipsum dolor sit amet, consectetur adipiscing elit. Integer nec odio. Praesent libero. Sed cursus ante dapibus diam. Sed nisi. Nulla quis sem at nibh elementum imperdiet. Duis sagittis ipsum. Praesent mauris. Fusce nec tellus sed augue semper porta. Mauris massa. Vestibulum lacinia arcu eget nulla. Class aptent taciti sociosqu ad litora torquent per conubia nostra, per inceptos himenaeos. Curabitur sodales ligula in libero. Sed dignissim lacinia nunc. Curabitur tortor. Pellentesque nibh. Aenean quam. In scelerisque sem at dolor. Maecenas mattis. Sed convallis tristique sem. Proin ut ligula vel nunc egestas porttitor. Morbi lectus risus, iaculis vel, suscipit quis, luctus non, massa. Fusce ac turpis quis ligula lacinia aliquet. Mauris ipsum. Nulla metus metus, ullamcorper vel, tincidunt sed, euismod in, nibh. Quisque volutpat condimentum velit. Class aptent taciti sociosqu ad litora torquent per conubia nostra, per inceptos himenaeos. Nam nec ante. Sed lacinia, urna non tincidunt mattis, tortor neque adipiscing diam, a cursus ipsum ante quis turpis. Nulla facilisi. Ut fringilla. Suspendisse potenti. Nunc feugiat mi a tellus consequat imperdiet. Vestibulum sapien. Proin quam. Etiam ultrices. Suspendisse in justo eu magna luctus suscipit. Sed lectus. Integer euismod lacus luctus magna. Quisque cursus, metus vitae pharetra auctor, sem massa mattis sem, at interdum magna augue eget diam. Vestibulum ante ipsum primis in faucibus orci luctus et ultrices posuere cubilia Curae; Morbi lacinia molestie dui. Praesent blandit dolor. Sed non quam. In vel mi sit amet augue congue elementum. Morbi in ipsum sit amet pede facilisis laoreet. Donec lacus nunc, viverra nec, blandit vel, egestas et, augue. Vestibulum tincidunt malesuada tellus. Ut ultrices ultrices enim. Curabitur sit amet mauris. Morbi in dui quis est pulvinar ullamcorper. Nulla facilisi. Integer lacinia sollicitudin massa. Cras metus. Sed aliquet risus a tortor. Integer id quam. Morbi mi. Quisque nisl felis, venenatis tristique, dignissim in, ultrices sit amet, augue. Proin sodales libero eget ante. Nulla quam. Aenean laoreet. Vestibulum nisi lectus, commodo ac, facilisis ac, ultricies eu, pede. Ut orci risus, accumsan porttitor, cursus quis, aliquet eget, justo. Sed pretium blandit orci. Ut eu diam at pede suscipit sodales. Aenean lectus elit, fermentum non, convallis id, sagittis at, neque. Nullam mauris orci, aliquet et, iaculis et, viverra vitae, ligula. Nulla ut felis in purus aliquam imperdiet. Maecenas aliquet mollis lectus. Vivamus consectetuer risus et tortor. Lorem</w:t>
       </w:r>
     </w:p>
     <w:p>
       <w:r>
-        <w:br w:type="page"/>
+        <w:t>2</w:t>
       </w:r>
     </w:p>
     <w:p>
       <w:r>
-        <w:t xml:space="preserve"> </w:t>
-      </w:r>
-      <w:r>
-        <w:t xml:space="preserve">2 </w:t>
-      </w:r>
-      <w:r>
-        <w:br/>
+        <w:t>ipsum dolor sit amet, consectetur adipiscing elit. Integer nec odio. Praesent libero. Sed cursus ante dapibus diam. Sed nisi. Nulla quis sem at nibh elementum imperdiet. Duis sagittis ipsum. Praesent mauris. Fusce nec tellus sed augue semper porta. Mauris massa. Vestibulum lacinia arcu eget nulla. Class aptent taciti sociosqu ad litora torquent per conubia nostra, per inceptos himenaeos. Curabitur sodales ligula in libero. Sed dignissim lacinia nunc. Curabitur tortor. Pellentesque nibh. Aenean quam. In scelerisque sem at dolor. Maecenas mattis. Sed convallis tristique sem. Proin ut ligula vel nunc egestas porttitor. Morbi lectus risus, iaculis vel, suscipit quis, luctus non, massa. Fusce ac turpis quis ligula lacinia aliquet. Mauris ipsum. Nulla metus metus, ullamcorper vel, tincidunt sed, euismod in, nibh. Quisque volutpat condimentum velit. Class aptent taciti sociosqu ad litora torquent per conubia nostra, per inceptos himenaeos. Nam nec ante. Sed lacinia, urna non tincidunt mattis, tortor neque adipiscing diam, a cursus ipsum ante quis turpis. Nulla facilisi. Ut fringilla. Suspendisse potenti. Nunc feugiat mi a tellus consequat imperdiet. Vestibulum sapien. Proin quam. Etiam ultrices. Suspendisse in justo eu magna luctus suscipit. Sed lectus. Integer euismod lacus luctus magna. Quisque cursus, metus vitae pharetra auctor, sem massa mattis sem, at interdum magna augue eget diam. Vestibulum ante ipsum primis in faucibus orci luctus et ultrices posuere cubilia Curae; Morbi lacinia molestie dui. Praesent blandit dolor. Sed non quam. In vel mi sit amet augue congue elementum. Morbi in ipsum sit amet pede facilisis laoreet. Donec lacus nunc, viverra nec, blandit vel, egestas et, augue. Vestibulum tincidunt malesuada tellus. Ut ultrices ultrices enim. Curabitur sit amet mauris. Morbi in dui quis est pulvinar ullamcorper. Nulla facilisi. Integer lacinia sollicitudin massa. Cras metus. Sed aliquet risus a tortor. Integer id quam. Morbi mi. Lorem ipsum dolor sit amet, consectetur adipiscing elit. Integer nec odio. Praesent libero. Sed cursus ante dapibus diam. Sed nisi. Nulla quis sem at nibh elementum imperdiet. Duis sagittis ipsum. Praesent mauris. Fusce nec tellus sed augue semper porta. Mauris massa. Vestibulum lacinia arcu eget nulla. Class aptent taciti sociosqu ad litora torquent per conubia nostra, per inceptos himenaeos. Curabitur sodales ligula in libero. Sed dignissim lacinia nunc. Curabitur tortor. Pellentesque nibh. Aenean quam. In scelerisque sem at dolor. Maecenas mattis. Sed convallis tristique sem. Proin ut ligula vel nunc egestas porttitor. Morbi lectus risus, iaculis vel, suscipit quis, luctus non, massa. Fusce ac turpis quis ligula lacinia aliquet. Mauris ipsum. Nulla metus metus, ullamcorper vel, tincidunt sed, euismod in, nibh. Quisque volutpat condimentum velit. Class aptent taciti sociosqu ad litora torquent per conubia nostra, per inceptos himenaeos. Nam nec ante. Sed lacinia, urna non tincidunt mattis, tortor neque adipiscing diam, a cursus ipsum ante quis turpis. Nulla facilisi. Ut fringilla. Suspendisse potenti. Nunc feugiat mi a tellus consequat imperdiet. Vestibulum sapien. Proin quam. Etiam ultrices. Suspendisse in justo eu magna luctus suscipit. Sed lectus. Integer euismod lacus luctus magna. Quisque cursus, metus vitae pharetra auctor, sem massa mattis sem, at interdum magna augue eget diam. Vestibulum ante ipsum primis in faucibus orci luctus et ultrices posuere cubilia Curae; Morbi lacinia molestie dui. Praesent blandit dolor. Sed non quam. In vel mi sit amet augue congue</w:t>
       </w:r>
     </w:p>
     <w:p>
       <w:r>
-        <w:t xml:space="preserve">ipsum dolor sit amet, consectetur adipiscing elit. Integer nec odio. Praesent libero. Sed cursus ante </w:t>
-      </w:r>
-      <w:r>
-        <w:t xml:space="preserve">dapibus diam. Sed nisi. Nulla quis sem at nibh elementum imperdiet. Duis sagittis ipsum. </w:t>
-      </w:r>
-      <w:r>
-        <w:t xml:space="preserve">Praesent mauris.  </w:t>
-      </w:r>
-      <w:r>
-        <w:t xml:space="preserve"> </w:t>
-      </w:r>
-      <w:r>
-        <w:t xml:space="preserve">Fusce nec tellus sed augue semper porta. Mauris massa. Vestibulum lacinia arcu eget nulla. Class </w:t>
-      </w:r>
-      <w:r>
-        <w:t xml:space="preserve">aptent taciti sociosqu ad litora torquent per conubia nostra, per inceptos himenaeos. Curabitur </w:t>
-      </w:r>
-      <w:r>
-        <w:t xml:space="preserve">sodales ligula in libero. Sed dignissim lacinia nunc. Curabitur tortor. Pellentesque nibh. Aenean </w:t>
-      </w:r>
-      <w:r>
-        <w:t xml:space="preserve">quam. In scelerisque sem at dolor. Maecenas mattis. Sed convallis tristique sem.  </w:t>
-      </w:r>
-      <w:r>
-        <w:t xml:space="preserve"> </w:t>
-      </w:r>
-      <w:r>
-        <w:t xml:space="preserve">Proin ut ligula vel nunc egestas porttitor. Morbi lectus risus, iaculis vel, suscipit quis, luctus non, </w:t>
-      </w:r>
-      <w:r>
-        <w:t xml:space="preserve">massa. Fusce ac turpis quis ligula lacinia aliquet. Mauris ipsum. Nulla metus metus, ullamcorper </w:t>
-      </w:r>
-      <w:r>
-        <w:t xml:space="preserve">vel, tincidunt sed, euismod in, nibh. Quisque volutpat condimentum velit. Class aptent taciti </w:t>
-      </w:r>
-      <w:r>
-        <w:t xml:space="preserve">sociosqu ad litora torquent per conubia nostra, per inceptos himenaeos. Nam nec ante. Sed lacinia, </w:t>
-      </w:r>
-      <w:r>
-        <w:t xml:space="preserve">urna non tincidunt mattis, tortor neque adipiscing diam, a cursus ipsum ante quis turpis. Nulla </w:t>
-      </w:r>
-      <w:r>
-        <w:t xml:space="preserve">facilisi. Ut fringilla. Suspendisse potenti.  </w:t>
-      </w:r>
-      <w:r>
-        <w:t xml:space="preserve"> </w:t>
-      </w:r>
-      <w:r>
-        <w:t xml:space="preserve">Nunc feugiat mi a tellus consequat imperdiet. Vestibulum sapien. Proin quam. Etiam ultrices. </w:t>
-      </w:r>
-      <w:r>
-        <w:t xml:space="preserve">Suspendisse in justo eu magna luctus suscipit. Sed lectus. Integer euismod lacus luctus magna. </w:t>
-      </w:r>
-      <w:r>
-        <w:t xml:space="preserve">Quisque cursus, metus vitae pharetra auctor, sem massa mattis sem, at interdum magna augue </w:t>
-      </w:r>
-      <w:r>
-        <w:t xml:space="preserve">eget diam. Vestibulum ante ipsum primis in faucibus orci luctus et ultrices posuere cubilia Curae; </w:t>
-      </w:r>
-      <w:r>
-        <w:t xml:space="preserve">Morbi lacinia molestie dui. Praesent blandit dolor. Sed non quam. In vel mi sit amet augue congue </w:t>
-      </w:r>
-      <w:r>
-        <w:t xml:space="preserve">elementum. Morbi in ipsum sit amet pede facilisis laoreet.  </w:t>
-      </w:r>
-      <w:r>
-        <w:t xml:space="preserve"> </w:t>
-      </w:r>
-      <w:r>
-        <w:t xml:space="preserve">Donec lacus nunc, viverra nec, blandit vel, egestas et, augue. Vestibulum tincidunt malesuada </w:t>
-      </w:r>
-      <w:r>
-        <w:t xml:space="preserve">tellus. Ut ultrices ultrices enim. Curabitur sit amet mauris. Morbi in dui quis est pulvinar </w:t>
-      </w:r>
-      <w:r>
-        <w:t xml:space="preserve">ullamcorper. Nulla facilisi. Integer lacinia sollicitudin massa. Cras metus. Sed aliquet risus a </w:t>
-      </w:r>
-      <w:r>
-        <w:t xml:space="preserve">tortor. Integer id quam. Morbi mi.  </w:t>
-      </w:r>
-      <w:r>
-        <w:t xml:space="preserve"> </w:t>
-      </w:r>
-      <w:r>
-        <w:t xml:space="preserve">Lorem ipsum dolor sit amet, consectetur adipiscing elit. Integer nec odio. Praesent libero. Sed </w:t>
-      </w:r>
-      <w:r>
-        <w:t xml:space="preserve">cursus ante dapibus diam. Sed nisi. Nulla quis sem at nibh elementum imperdiet. Duis sagittis </w:t>
-      </w:r>
-      <w:r>
-        <w:t xml:space="preserve">ipsum. Praesent mauris. Fusce nec tellus sed augue semper porta. Mauris massa. Vestibulum </w:t>
-      </w:r>
-      <w:r>
-        <w:t xml:space="preserve">lacinia arcu eget nulla. Class aptent taciti sociosqu ad litora torquent per conubia nostra, per </w:t>
-      </w:r>
-      <w:r>
-        <w:t xml:space="preserve">inceptos himenaeos. Curabitur sodales ligula in libero.  </w:t>
-      </w:r>
-      <w:r>
-        <w:t xml:space="preserve"> </w:t>
-      </w:r>
-      <w:r>
-        <w:t xml:space="preserve">Sed dignissim lacinia nunc. Curabitur tortor. Pellentesque nibh. Aenean quam. In scelerisque sem </w:t>
-      </w:r>
-      <w:r>
-        <w:t xml:space="preserve">at dolor. Maecenas mattis. Sed convallis tristique sem. Proin ut ligula vel nunc egestas porttitor. </w:t>
-      </w:r>
-      <w:r>
-        <w:t xml:space="preserve">Morbi lectus risus, iaculis vel, suscipit quis, luctus non, massa. Fusce ac turpis quis ligula lacinia </w:t>
-      </w:r>
-      <w:r>
-        <w:t xml:space="preserve">aliquet. Mauris ipsum. Nulla metus metus, ullamcorper vel, tincidunt sed, euismod in, nibh.  </w:t>
-      </w:r>
-      <w:r>
-        <w:t xml:space="preserve"> </w:t>
-      </w:r>
-      <w:r>
-        <w:t xml:space="preserve">Quisque volutpat condimentum velit. Class aptent taciti sociosqu ad litora torquent per conubia </w:t>
-      </w:r>
-      <w:r>
-        <w:t xml:space="preserve">nostra, per inceptos himenaeos. Nam nec ante. Sed lacinia, urna non tincidunt mattis, tortor neque </w:t>
-      </w:r>
-      <w:r>
-        <w:t xml:space="preserve">adipiscing diam, a cursus ipsum ante quis turpis. Nulla facilisi. Ut fringilla. Suspendisse potenti. </w:t>
-      </w:r>
-      <w:r>
-        <w:t xml:space="preserve">Nunc feugiat mi a tellus consequat imperdiet. Vestibulum sapien. Proin quam. Etiam ultrices.  </w:t>
-      </w:r>
-      <w:r>
-        <w:t xml:space="preserve"> </w:t>
-      </w:r>
-      <w:r>
-        <w:t xml:space="preserve">Suspendisse in justo eu magna luctus suscipit. Sed lectus. Integer euismod lacus luctus magna. </w:t>
-      </w:r>
-      <w:r>
-        <w:t xml:space="preserve">Quisque cursus, metus vitae pharetra auctor, sem massa mattis sem, at interdum magna augue </w:t>
-      </w:r>
-      <w:r>
-        <w:t xml:space="preserve">eget diam. Vestibulum ante ipsum primis in faucibus orci luctus et ultrices posuere cubilia Curae; </w:t>
-      </w:r>
-      <w:r>
-        <w:t xml:space="preserve">Morbi lacinia molestie dui. Praesent blandit dolor. Sed non quam. In vel mi sit amet augue congue </w:t>
-      </w:r>
-      <w:r>
-        <w:br/>
+        <w:t>3</w:t>
       </w:r>
     </w:p>
     <w:p>
       <w:r>
-        <w:br w:type="page"/>
-      </w:r>
-    </w:p>
-    <w:p>
-      <w:r>
-        <w:t xml:space="preserve"> </w:t>
-      </w:r>
-      <w:r>
-        <w:t xml:space="preserve">3 </w:t>
-      </w:r>
-      <w:r>
-        <w:br/>
-      </w:r>
-    </w:p>
-    <w:p>
-      <w:r>
-        <w:t xml:space="preserve">elementum. Morbi in ipsum sit amet pede facilisis laoreet. Donec lacus nunc, viverra nec, blandit </w:t>
-      </w:r>
-      <w:r>
-        <w:t xml:space="preserve">vel, egestas et, augue. Vestibulum tincidunt malesuada tellus. Ut ultrices ultrices enim. Curabitur </w:t>
-      </w:r>
-      <w:r>
-        <w:t xml:space="preserve">sit amet mauris.  </w:t>
-      </w:r>
-      <w:r>
-        <w:t xml:space="preserve"> </w:t>
-      </w:r>
-      <w:r>
-        <w:t xml:space="preserve">Morbi in dui quis est pulvinar ullamcorper. Nulla facilisi. Integer lacinia sollicitudin massa. Cras </w:t>
-      </w:r>
-      <w:r>
-        <w:t xml:space="preserve">metus. Sed aliquet risus a tortor. Integer id quam. Morbi mi. Quisque nisl felis, venenatis tristique, </w:t>
-      </w:r>
-      <w:r>
-        <w:t xml:space="preserve">dignissim in, ultrices sit amet, augue. Proin sodales libero eget ante. Nulla quam. Aenean laoreet. </w:t>
-      </w:r>
-      <w:r>
-        <w:t xml:space="preserve">Vestibulum nisi lectus, commodo ac, facilisis ac, ultricies eu, pede. Ut orci risus, accumsan </w:t>
-      </w:r>
-      <w:r>
-        <w:t xml:space="preserve">porttitor, cursus quis, aliquet eget, justo. Sed pretium blandit orci.  </w:t>
-      </w:r>
-      <w:r>
-        <w:t xml:space="preserve"> </w:t>
-      </w:r>
-      <w:r>
-        <w:t xml:space="preserve">Ut eu diam at pede suscipit sodales. Aenean lectus elit, fermentum non, convallis id, sagittis at, </w:t>
-      </w:r>
-      <w:r>
-        <w:t xml:space="preserve">neque. Nullam mauris orci, aliquet et, iaculis et, viverra vitae, ligula. Nulla ut felis in purus </w:t>
-      </w:r>
-      <w:r>
-        <w:t xml:space="preserve">aliquam imperdiet. Maecenas aliquet mollis lectus. Vivamus consectetuer risus et tortor. Lorem </w:t>
-      </w:r>
-      <w:r>
-        <w:t xml:space="preserve">ipsum dolor sit amet, consectetur adipiscing elit. Integer nec odio. Praesent libero. Sed cursus ante </w:t>
-      </w:r>
-      <w:r>
-        <w:t xml:space="preserve">dapibus diam. Sed nisi. Nulla quis sem at nibh elementum imperdiet. Duis sagittis ipsum. </w:t>
-      </w:r>
-      <w:r>
-        <w:t xml:space="preserve">Praesent mauris.  </w:t>
-      </w:r>
-      <w:r>
-        <w:t xml:space="preserve"> </w:t>
-      </w:r>
-      <w:r>
-        <w:t xml:space="preserve">Fusce nec tellus sed augue semper porta. Mauris massa. Vestibulum lacinia arcu eget nulla. Class </w:t>
-      </w:r>
-      <w:r>
-        <w:t xml:space="preserve">aptent taciti sociosqu ad litora torquent per conubia nostra, per inceptos himenaeos. Curabitur </w:t>
-      </w:r>
-      <w:r>
-        <w:t xml:space="preserve">sodales ligula in libero. Sed dignissim lacinia nunc. Curabitur tortor. Pellentesque nibh. Aenean </w:t>
-      </w:r>
-      <w:r>
-        <w:t xml:space="preserve">quam. In scelerisque sem at dolor. Maecenas mattis. Sed convallis tristique sem.  </w:t>
-      </w:r>
-      <w:r>
-        <w:t xml:space="preserve"> </w:t>
-      </w:r>
-      <w:r>
-        <w:t xml:space="preserve">Proin ut ligula vel nunc egestas porttitor. Morbi lectus risus, iaculis vel, suscipit quis, luctus non, </w:t>
-      </w:r>
-      <w:r>
-        <w:t xml:space="preserve">massa. Fusce ac turpis quis ligula lacinia aliquet. Mauris ipsum. Nulla metus metus, ullamcorper </w:t>
-      </w:r>
-      <w:r>
-        <w:t xml:space="preserve">vel, tincidunt sed, euismod in, nibh. Quisque volutpat condimentum velit. Class aptent taciti </w:t>
-      </w:r>
-      <w:r>
-        <w:t xml:space="preserve">sociosqu ad litora torquent per conubia nostra, per inceptos himenaeos. Nam nec ante. Sed lacinia, </w:t>
-      </w:r>
-      <w:r>
-        <w:t xml:space="preserve">urna non tincidunt mattis, tortor neque adipiscing diam, a cursus ipsum ante quis turpis. Nulla </w:t>
-      </w:r>
-      <w:r>
-        <w:t xml:space="preserve">facilisi. Ut fringilla. Suspendisse potenti.  </w:t>
-      </w:r>
-      <w:r>
-        <w:t xml:space="preserve"> </w:t>
-      </w:r>
-      <w:r>
-        <w:t xml:space="preserve">Nunc feugiat mi a tellus consequat imperdiet. Vestibulum sapien. Proin quam. Etiam ultrices. </w:t>
-      </w:r>
-      <w:r>
-        <w:t xml:space="preserve">Suspendisse in justo eu magna luctus suscipit. Sed lectus. Integer euismod lacus luctus magna. </w:t>
-      </w:r>
-      <w:r>
-        <w:t xml:space="preserve">Quisque cursus, metus vitae pharetra auctor, sem massa mattis sem, at interdum magna augue </w:t>
-      </w:r>
-      <w:r>
-        <w:t xml:space="preserve">eget diam. Vestibulum ante ipsum primis in faucibus orci luctus et ultrices posuere cubilia Curae; </w:t>
-      </w:r>
-      <w:r>
-        <w:t xml:space="preserve">Morbi lacinia molestie dui. Praesent blandit dolor. Sed non quam. In vel mi sit amet augue congue </w:t>
-      </w:r>
-      <w:r>
-        <w:t xml:space="preserve">elementum. Morbi in ipsum sit amet pede facilisis laoreet.  </w:t>
-      </w:r>
-      <w:r>
-        <w:t xml:space="preserve"> </w:t>
-      </w:r>
-      <w:r>
-        <w:br/>
-      </w:r>
-    </w:p>
-    <w:p>
-      <w:r>
-        <w:br w:type="page"/>
+        <w:t>elementum. Morbi in ipsum sit amet pede facilisis laoreet. Donec lacus nunc, viverra nec, blandit vel, egestas et, augue. Vestibulum tincidunt malesuada tellus. Ut ultrices ultrices enim. Curabitur sit amet mauris. Morbi in dui quis est pulvinar ullamcorper. Nulla facilisi. Integer lacinia sollicitudin massa. Cras metus. Sed aliquet risus a tortor. Integer id quam. Morbi mi. Quisque nisl felis, venenatis tristique, dignissim in, ultrices sit amet, augue. Proin sodales libero eget ante. Nulla quam. Aenean laoreet. Vestibulum nisi lectus, commodo ac, facilisis ac, ultricies eu, pede. Ut orci risus, accumsan porttitor, cursus quis, aliquet eget, justo. Sed pretium blandit orci. Ut eu diam at pede suscipit sodales. Aenean lectus elit, fermentum non, convallis id, sagittis at, neque. Nullam mauris orci, aliquet et, iaculis et, viverra vitae, ligula. Nulla ut felis in purus aliquam imperdiet. Maecenas aliquet mollis lectus. Vivamus consectetuer risus et tortor. Lorem ipsum dolor sit amet, consectetur adipiscing elit. Integer nec odio. Praesent libero. Sed cursus ante dapibus diam. Sed nisi. Nulla quis sem at nibh elementum imperdiet. Duis sagittis ipsum. Praesent mauris. Fusce nec tellus sed augue semper porta. Mauris massa. Vestibulum lacinia arcu eget nulla. Class aptent taciti sociosqu ad litora torquent per conubia nostra, per inceptos himenaeos. Curabitur sodales ligula in libero. Sed dignissim lacinia nunc. Curabitur tortor. Pellentesque nibh. Aenean quam. In scelerisque sem at dolor. Maecenas mattis. Sed convallis tristique sem. Proin ut ligula vel nunc egestas porttitor. Morbi lectus risus, iaculis vel, suscipit quis, luctus non, massa. Fusce ac turpis quis ligula lacinia aliquet. Mauris ipsum. Nulla metus metus, ullamcorper vel, tincidunt sed, euismod in, nibh. Quisque volutpat condimentum velit. Class aptent taciti sociosqu ad litora torquent per conubia nostra, per inceptos himenaeos. Nam nec ante. Sed lacinia, urna non tincidunt mattis, tortor neque adipiscing diam, a cursus ipsum ante quis turpis. Nulla facilisi. Ut fringilla. Suspendisse potenti. Nunc feugiat mi a tellus consequat imperdiet. Vestibulum sapien. Proin quam. Etiam ultrices. Suspendisse in justo eu magna luctus suscipit. Sed lectus. Integer euismod lacus luctus magna. Quisque cursus, metus vitae pharetra auctor, sem massa mattis sem, at interdum magna augue eget diam. Vestibulum ante ipsum primis in faucibus orci luctus et ultrices posuere cubilia Curae; Morbi lacinia molestie dui. Praesent blandit dolor. Sed non quam. In vel mi sit amet augue congue elementum. Morbi in ipsum sit amet pede facilisis laoreet.</w:t>
       </w:r>
     </w:p>
     <w:sectPr>

</xml_diff>

<commit_message>
Step 27 - Add heading detection
</commit_message>
<xml_diff>
--- a/output/output.docx
+++ b/output/output.docx
@@ -2,11 +2,6 @@
 <file path=word/document.xml><?xml version="1.0" encoding="utf-8"?>
 <w:document xmlns:wpc="http://schemas.microsoft.com/office/word/2010/wordprocessingCanvas" xmlns:mo="http://schemas.microsoft.com/office/mac/office/2008/main" xmlns:mc="http://schemas.openxmlformats.org/markup-compatibility/2006" xmlns:mv="urn:schemas-microsoft-com:mac:vml" xmlns:o="urn:schemas-microsoft-com:office:office" xmlns:r="http://schemas.openxmlformats.org/officeDocument/2006/relationships" xmlns:m="http://schemas.openxmlformats.org/officeDocument/2006/math" xmlns:v="urn:schemas-microsoft-com:vml" xmlns:wp14="http://schemas.microsoft.com/office/word/2010/wordprocessingDrawing" xmlns:wp="http://schemas.openxmlformats.org/drawingml/2006/wordprocessingDrawing" xmlns:w10="urn:schemas-microsoft-com:office:word" xmlns:w="http://schemas.openxmlformats.org/wordprocessingml/2006/main" xmlns:w14="http://schemas.microsoft.com/office/word/2010/wordml" xmlns:wpg="http://schemas.microsoft.com/office/word/2010/wordprocessingGroup" xmlns:wpi="http://schemas.microsoft.com/office/word/2010/wordprocessingInk" xmlns:wne="http://schemas.microsoft.com/office/word/2006/wordml" xmlns:wps="http://schemas.microsoft.com/office/word/2010/wordprocessingShape" mc:Ignorable="w14 wp14">
   <w:body>
-    <w:p>
-      <w:r>
-        <w:t>1</w:t>
-      </w:r>
-    </w:p>
     <w:p>
       <w:r>
         <w:t>Sample PDF</w:t>
@@ -19,7 +14,7 @@
     </w:p>
     <w:p>
       <w:r>
-        <w:t>2</w:t>
+        <w:br w:type="page"/>
       </w:r>
     </w:p>
     <w:p>
@@ -29,7 +24,7 @@
     </w:p>
     <w:p>
       <w:r>
-        <w:t>3</w:t>
+        <w:br w:type="page"/>
       </w:r>
     </w:p>
     <w:p>

</xml_diff>

<commit_message>
Step 29 - Improve heading detection using document statistics
</commit_message>
<xml_diff>
--- a/output/output.docx
+++ b/output/output.docx
@@ -3,11 +3,17 @@
 <w:document xmlns:wpc="http://schemas.microsoft.com/office/word/2010/wordprocessingCanvas" xmlns:mo="http://schemas.microsoft.com/office/mac/office/2008/main" xmlns:mc="http://schemas.openxmlformats.org/markup-compatibility/2006" xmlns:mv="urn:schemas-microsoft-com:mac:vml" xmlns:o="urn:schemas-microsoft-com:office:office" xmlns:r="http://schemas.openxmlformats.org/officeDocument/2006/relationships" xmlns:m="http://schemas.openxmlformats.org/officeDocument/2006/math" xmlns:v="urn:schemas-microsoft-com:vml" xmlns:wp14="http://schemas.microsoft.com/office/word/2010/wordprocessingDrawing" xmlns:wp="http://schemas.openxmlformats.org/drawingml/2006/wordprocessingDrawing" xmlns:w10="urn:schemas-microsoft-com:office:word" xmlns:w="http://schemas.openxmlformats.org/wordprocessingml/2006/main" xmlns:w14="http://schemas.microsoft.com/office/word/2010/wordml" xmlns:wpg="http://schemas.microsoft.com/office/word/2010/wordprocessingGroup" xmlns:wpi="http://schemas.microsoft.com/office/word/2010/wordprocessingInk" xmlns:wne="http://schemas.microsoft.com/office/word/2006/wordml" xmlns:wps="http://schemas.microsoft.com/office/word/2010/wordprocessingShape" mc:Ignorable="w14 wp14">
   <w:body>
     <w:p>
+      <w:pPr>
+        <w:pStyle w:val="Heading1"/>
+      </w:pPr>
       <w:r>
         <w:t>Sample PDF</w:t>
       </w:r>
     </w:p>
     <w:p>
+      <w:pPr>
+        <w:pStyle w:val="Heading1"/>
+      </w:pPr>
       <w:r>
         <w:t>Created for testing PDFObject This PDF is three pages long. Three long pages. Or three short pages if you’re optimistic. Is it the same as saying “three long minutes”, knowing that all minutes are the same duration, and one cannot possibly be longer than the other? If these pages are all the same size, can one possibly be longer than the other? I digress. Here’s some Latin. Lorem ipsum dolor sit amet, consectetur adipiscing elit. Integer nec odio. Praesent libero. Sed cursus ante dapibus diam. Sed nisi. Nulla quis sem at nibh elementum imperdiet. Duis sagittis ipsum. Praesent mauris. Fusce nec tellus sed augue semper porta. Mauris massa. Vestibulum lacinia arcu eget nulla. Class aptent taciti sociosqu ad litora torquent per conubia nostra, per inceptos himenaeos. Curabitur sodales ligula in libero. Sed dignissim lacinia nunc. Curabitur tortor. Pellentesque nibh. Aenean quam. In scelerisque sem at dolor. Maecenas mattis. Sed convallis tristique sem. Proin ut ligula vel nunc egestas porttitor. Morbi lectus risus, iaculis vel, suscipit quis, luctus non, massa. Fusce ac turpis quis ligula lacinia aliquet. Mauris ipsum. Nulla metus metus, ullamcorper vel, tincidunt sed, euismod in, nibh. Quisque volutpat condimentum velit. Class aptent taciti sociosqu ad litora torquent per conubia nostra, per inceptos himenaeos. Nam nec ante. Sed lacinia, urna non tincidunt mattis, tortor neque adipiscing diam, a cursus ipsum ante quis turpis. Nulla facilisi. Ut fringilla. Suspendisse potenti. Nunc feugiat mi a tellus consequat imperdiet. Vestibulum sapien. Proin quam. Etiam ultrices. Suspendisse in justo eu magna luctus suscipit. Sed lectus. Integer euismod lacus luctus magna. Quisque cursus, metus vitae pharetra auctor, sem massa mattis sem, at interdum magna augue eget diam. Vestibulum ante ipsum primis in faucibus orci luctus et ultrices posuere cubilia Curae; Morbi lacinia molestie dui. Praesent blandit dolor. Sed non quam. In vel mi sit amet augue congue elementum. Morbi in ipsum sit amet pede facilisis laoreet. Donec lacus nunc, viverra nec, blandit vel, egestas et, augue. Vestibulum tincidunt malesuada tellus. Ut ultrices ultrices enim. Curabitur sit amet mauris. Morbi in dui quis est pulvinar ullamcorper. Nulla facilisi. Integer lacinia sollicitudin massa. Cras metus. Sed aliquet risus a tortor. Integer id quam. Morbi mi. Quisque nisl felis, venenatis tristique, dignissim in, ultrices sit amet, augue. Proin sodales libero eget ante. Nulla quam. Aenean laoreet. Vestibulum nisi lectus, commodo ac, facilisis ac, ultricies eu, pede. Ut orci risus, accumsan porttitor, cursus quis, aliquet eget, justo. Sed pretium blandit orci. Ut eu diam at pede suscipit sodales. Aenean lectus elit, fermentum non, convallis id, sagittis at, neque. Nullam mauris orci, aliquet et, iaculis et, viverra vitae, ligula. Nulla ut felis in purus aliquam imperdiet. Maecenas aliquet mollis lectus. Vivamus consectetuer risus et tortor. Lorem</w:t>
       </w:r>

</xml_diff>

<commit_message>
Step 32 - Introduce RunBuilder
</commit_message>
<xml_diff>
--- a/output/output.docx
+++ b/output/output.docx
@@ -4,12 +4,276 @@
   <w:body>
     <w:p>
       <w:r>
-        <w:t>Sample PDF</w:t>
+        <w:rPr>
+          <w:sz w:val="72"/>
+        </w:rPr>
+        <w:t xml:space="preserve">Sample PDF </w:t>
       </w:r>
     </w:p>
     <w:p>
       <w:r>
-        <w:t>Created for testing PDFObject This PDF is three pages long. Three long pages. Or three short pages if you’re optimistic. Is it the same as saying “three long minutes”, knowing that all minutes are the same duration, and one cannot possibly be longer than the other? If these pages are all the same size, can one possibly be longer than the other? I digress. Here’s some Latin. Lorem ipsum dolor sit amet, consectetur adipiscing elit. Integer nec odio. Praesent libero. Sed cursus ante dapibus diam. Sed nisi. Nulla quis sem at nibh elementum imperdiet. Duis sagittis ipsum. Praesent mauris. Fusce nec tellus sed augue semper porta. Mauris massa. Vestibulum lacinia arcu eget nulla. Class aptent taciti sociosqu ad litora torquent per conubia nostra, per inceptos himenaeos. Curabitur sodales ligula in libero. Sed dignissim lacinia nunc. Curabitur tortor. Pellentesque nibh. Aenean quam. In scelerisque sem at dolor. Maecenas mattis. Sed convallis tristique sem. Proin ut ligula vel nunc egestas porttitor. Morbi lectus risus, iaculis vel, suscipit quis, luctus non, massa. Fusce ac turpis quis ligula lacinia aliquet. Mauris ipsum. Nulla metus metus, ullamcorper vel, tincidunt sed, euismod in, nibh. Quisque volutpat condimentum velit. Class aptent taciti sociosqu ad litora torquent per conubia nostra, per inceptos himenaeos. Nam nec ante. Sed lacinia, urna non tincidunt mattis, tortor neque adipiscing diam, a cursus ipsum ante quis turpis. Nulla facilisi. Ut fringilla. Suspendisse potenti. Nunc feugiat mi a tellus consequat imperdiet. Vestibulum sapien. Proin quam. Etiam ultrices. Suspendisse in justo eu magna luctus suscipit. Sed lectus. Integer euismod lacus luctus magna. Quisque cursus, metus vitae pharetra auctor, sem massa mattis sem, at interdum magna augue eget diam. Vestibulum ante ipsum primis in faucibus orci luctus et ultrices posuere cubilia Curae; Morbi lacinia molestie dui. Praesent blandit dolor. Sed non quam. In vel mi sit amet augue congue elementum. Morbi in ipsum sit amet pede facilisis laoreet. Donec lacus nunc, viverra nec, blandit vel, egestas et, augue. Vestibulum tincidunt malesuada tellus. Ut ultrices ultrices enim. Curabitur sit amet mauris. Morbi in dui quis est pulvinar ullamcorper. Nulla facilisi. Integer lacinia sollicitudin massa. Cras metus. Sed aliquet risus a tortor. Integer id quam. Morbi mi. Quisque nisl felis, venenatis tristique, dignissim in, ultrices sit amet, augue. Proin sodales libero eget ante. Nulla quam. Aenean laoreet. Vestibulum nisi lectus, commodo ac, facilisis ac, ultricies eu, pede. Ut orci risus, accumsan porttitor, cursus quis, aliquet eget, justo. Sed pretium blandit orci. Ut eu diam at pede suscipit sodales. Aenean lectus elit, fermentum non, convallis id, sagittis at, neque. Nullam mauris orci, aliquet et, iaculis et, viverra vitae, ligula. Nulla ut felis in purus aliquam imperdiet. Maecenas aliquet mollis lectus. Vivamus consectetuer risus et tortor. Lorem</w:t>
+        <w:rPr>
+          <w:sz w:val="24"/>
+        </w:rPr>
+        <w:t xml:space="preserve"> </w:t>
+      </w:r>
+      <w:r>
+        <w:rPr>
+          <w:sz w:val="36"/>
+        </w:rPr>
+        <w:t xml:space="preserve">Created for testing </w:t>
+      </w:r>
+      <w:r>
+        <w:rPr>
+          <w:sz w:val="36"/>
+        </w:rPr>
+        <w:t>PDFObject</w:t>
+      </w:r>
+      <w:r>
+        <w:rPr>
+          <w:sz w:val="36"/>
+        </w:rPr>
+        <w:t xml:space="preserve"> </w:t>
+      </w:r>
+      <w:r>
+        <w:rPr>
+          <w:sz w:val="24"/>
+        </w:rPr>
+        <w:t xml:space="preserve"> </w:t>
+      </w:r>
+      <w:r>
+        <w:rPr>
+          <w:sz w:val="31"/>
+        </w:rPr>
+        <w:t xml:space="preserve">This PDF is three pages long. Three long pages. Or three short pages if </w:t>
+      </w:r>
+      <w:r>
+        <w:rPr>
+          <w:sz w:val="31"/>
+        </w:rPr>
+        <w:t xml:space="preserve">you’re optimistic. Is it the same as saying “three long minutes”, knowing </w:t>
+      </w:r>
+      <w:r>
+        <w:rPr>
+          <w:sz w:val="31"/>
+        </w:rPr>
+        <w:t xml:space="preserve">that all minutes are the same duration, and one cannot possibly be longer </w:t>
+      </w:r>
+      <w:r>
+        <w:rPr>
+          <w:sz w:val="31"/>
+        </w:rPr>
+        <w:t xml:space="preserve">than the other? If these pages are all the same size, can one possibly be </w:t>
+      </w:r>
+      <w:r>
+        <w:rPr>
+          <w:sz w:val="31"/>
+        </w:rPr>
+        <w:t xml:space="preserve">longer than the other? </w:t>
+      </w:r>
+      <w:r>
+        <w:rPr>
+          <w:sz w:val="24"/>
+        </w:rPr>
+        <w:t xml:space="preserve"> </w:t>
+      </w:r>
+      <w:r>
+        <w:rPr>
+          <w:sz w:val="24"/>
+        </w:rPr>
+        <w:t xml:space="preserve">I digress. Here’s some Latin. Lorem ipsum dolor sit amet, consectetur adipiscing elit. Integer nec </w:t>
+      </w:r>
+      <w:r>
+        <w:rPr>
+          <w:sz w:val="24"/>
+        </w:rPr>
+        <w:t xml:space="preserve">odio. Praesent libero. Sed cursus ante dapibus diam. Sed nisi. Nulla quis sem at nibh elementum </w:t>
+      </w:r>
+      <w:r>
+        <w:rPr>
+          <w:sz w:val="24"/>
+        </w:rPr>
+        <w:t xml:space="preserve">imperdiet. Duis sagittis ipsum. Praesent mauris. Fusce nec tellus sed augue semper porta. Mauris </w:t>
+      </w:r>
+      <w:r>
+        <w:rPr>
+          <w:sz w:val="24"/>
+        </w:rPr>
+        <w:t xml:space="preserve">massa. Vestibulum lacinia arcu eget nulla. Class aptent taciti sociosqu ad litora torquent per </w:t>
+      </w:r>
+      <w:r>
+        <w:rPr>
+          <w:sz w:val="24"/>
+        </w:rPr>
+        <w:t xml:space="preserve">conubia nostra, per inceptos himenaeos. Curabitur sodales ligula in libero.  </w:t>
+      </w:r>
+      <w:r>
+        <w:rPr>
+          <w:sz w:val="24"/>
+        </w:rPr>
+        <w:t xml:space="preserve"> </w:t>
+      </w:r>
+      <w:r>
+        <w:rPr>
+          <w:sz w:val="24"/>
+        </w:rPr>
+        <w:t xml:space="preserve">Sed dignissim lacinia nunc. Curabitur tortor. Pellentesque nibh. Aenean quam. In scelerisque sem </w:t>
+      </w:r>
+      <w:r>
+        <w:rPr>
+          <w:sz w:val="24"/>
+        </w:rPr>
+        <w:t xml:space="preserve">at dolor. Maecenas mattis. Sed convallis tristique sem. Proin ut ligula vel nunc egestas porttitor. </w:t>
+      </w:r>
+      <w:r>
+        <w:rPr>
+          <w:sz w:val="24"/>
+        </w:rPr>
+        <w:t xml:space="preserve">Morbi lectus risus, iaculis vel, suscipit quis, luctus non, massa. Fusce ac turpis quis ligula lacinia </w:t>
+      </w:r>
+      <w:r>
+        <w:rPr>
+          <w:sz w:val="24"/>
+        </w:rPr>
+        <w:t xml:space="preserve">aliquet. Mauris ipsum. Nulla metus metus, ullamcorper vel, tincidunt sed, euismod in, nibh.  </w:t>
+      </w:r>
+      <w:r>
+        <w:rPr>
+          <w:sz w:val="24"/>
+        </w:rPr>
+        <w:t xml:space="preserve"> </w:t>
+      </w:r>
+      <w:r>
+        <w:rPr>
+          <w:sz w:val="24"/>
+        </w:rPr>
+        <w:t xml:space="preserve">Quisque volutpat condimentum velit. Class aptent taciti sociosqu ad litora torquent per conubia </w:t>
+      </w:r>
+      <w:r>
+        <w:rPr>
+          <w:sz w:val="24"/>
+        </w:rPr>
+        <w:t xml:space="preserve">nostra, per inceptos himenaeos. Nam nec ante. Sed lacinia, urna non tincidunt mattis, tortor neque </w:t>
+      </w:r>
+      <w:r>
+        <w:rPr>
+          <w:sz w:val="24"/>
+        </w:rPr>
+        <w:t xml:space="preserve">adipiscing diam, a cursus ipsum ante quis turpis. Nulla facilisi. Ut fringilla. Suspendisse potenti. </w:t>
+      </w:r>
+      <w:r>
+        <w:rPr>
+          <w:sz w:val="24"/>
+        </w:rPr>
+        <w:t xml:space="preserve">Nunc feugiat mi a tellus consequat imperdiet. Vestibulum sapien. Proin quam. Etiam ultrices.  </w:t>
+      </w:r>
+      <w:r>
+        <w:rPr>
+          <w:sz w:val="24"/>
+        </w:rPr>
+        <w:t xml:space="preserve"> </w:t>
+      </w:r>
+      <w:r>
+        <w:rPr>
+          <w:sz w:val="24"/>
+        </w:rPr>
+        <w:t xml:space="preserve">Suspendisse in justo eu magna luctus suscipit. Sed lectus. Integer euismod lacus luctus magna. </w:t>
+      </w:r>
+      <w:r>
+        <w:rPr>
+          <w:sz w:val="24"/>
+        </w:rPr>
+        <w:t xml:space="preserve">Quisque cursus, metus vitae pharetra auctor, sem massa mattis sem, at interdum magna augue </w:t>
+      </w:r>
+      <w:r>
+        <w:rPr>
+          <w:sz w:val="24"/>
+        </w:rPr>
+        <w:t xml:space="preserve">eget diam. Vestibulum ante ipsum primis in faucibus orci luctus et ultrices posuere cubilia Curae; </w:t>
+      </w:r>
+      <w:r>
+        <w:rPr>
+          <w:sz w:val="24"/>
+        </w:rPr>
+        <w:t xml:space="preserve">Morbi lacinia molestie dui. Praesent blandit dolor. Sed non quam. In vel mi sit amet augue congue </w:t>
+      </w:r>
+      <w:r>
+        <w:rPr>
+          <w:sz w:val="24"/>
+        </w:rPr>
+        <w:t xml:space="preserve">elementum. Morbi in ipsum sit amet pede facilisis laoreet. Donec lacus nunc, viverra nec, blandit </w:t>
+      </w:r>
+      <w:r>
+        <w:rPr>
+          <w:sz w:val="24"/>
+        </w:rPr>
+        <w:t xml:space="preserve">vel, egestas et, augue. Vestibulum tincidunt malesuada tellus. Ut ultrices ultrices enim. Curabitur </w:t>
+      </w:r>
+      <w:r>
+        <w:rPr>
+          <w:sz w:val="24"/>
+        </w:rPr>
+        <w:t xml:space="preserve">sit amet mauris.  </w:t>
+      </w:r>
+      <w:r>
+        <w:rPr>
+          <w:sz w:val="24"/>
+        </w:rPr>
+        <w:t xml:space="preserve"> </w:t>
+      </w:r>
+      <w:r>
+        <w:rPr>
+          <w:sz w:val="24"/>
+        </w:rPr>
+        <w:t xml:space="preserve">Morbi in dui quis est pulvinar ullamcorper. Nulla facilisi. Integer lacinia sollicitudin massa. Cras </w:t>
+      </w:r>
+      <w:r>
+        <w:rPr>
+          <w:sz w:val="24"/>
+        </w:rPr>
+        <w:t xml:space="preserve">metus. Sed aliquet risus a tortor. Integer id quam. Morbi mi. Quisque nisl felis, venenatis tristique, </w:t>
+      </w:r>
+      <w:r>
+        <w:rPr>
+          <w:sz w:val="24"/>
+        </w:rPr>
+        <w:t xml:space="preserve">dignissim in, ultrices sit amet, augue. Proin sodales libero eget ante. Nulla quam. Aenean laoreet. </w:t>
+      </w:r>
+      <w:r>
+        <w:rPr>
+          <w:sz w:val="24"/>
+        </w:rPr>
+        <w:t xml:space="preserve">Vestibulum nisi lectus, commodo ac, facilisis ac, ultricies eu, pede. Ut orci risus, accumsan </w:t>
+      </w:r>
+      <w:r>
+        <w:rPr>
+          <w:sz w:val="24"/>
+        </w:rPr>
+        <w:t xml:space="preserve">porttitor, cursus quis, aliquet eget, justo. Sed pretium blandit orci.  </w:t>
+      </w:r>
+      <w:r>
+        <w:rPr>
+          <w:sz w:val="24"/>
+        </w:rPr>
+        <w:t xml:space="preserve"> </w:t>
+      </w:r>
+      <w:r>
+        <w:rPr>
+          <w:sz w:val="24"/>
+        </w:rPr>
+        <w:t xml:space="preserve">Ut eu diam at pede suscipit sodales. Aenean lectus elit, fermentum non, convallis id, sagittis at, </w:t>
+      </w:r>
+      <w:r>
+        <w:rPr>
+          <w:sz w:val="24"/>
+        </w:rPr>
+        <w:t xml:space="preserve">neque. Nullam mauris orci, aliquet et, iaculis et, viverra vitae, ligula. Nulla ut felis in purus </w:t>
+      </w:r>
+      <w:r>
+        <w:rPr>
+          <w:sz w:val="24"/>
+        </w:rPr>
+        <w:t xml:space="preserve">aliquam imperdiet. Maecenas aliquet mollis lectus. Vivamus consectetuer risus et tortor. Lorem </w:t>
       </w:r>
     </w:p>
     <w:p>
@@ -19,7 +283,292 @@
     </w:p>
     <w:p>
       <w:r>
-        <w:t>ipsum dolor sit amet, consectetur adipiscing elit. Integer nec odio. Praesent libero. Sed cursus ante dapibus diam. Sed nisi. Nulla quis sem at nibh elementum imperdiet. Duis sagittis ipsum. Praesent mauris. Fusce nec tellus sed augue semper porta. Mauris massa. Vestibulum lacinia arcu eget nulla. Class aptent taciti sociosqu ad litora torquent per conubia nostra, per inceptos himenaeos. Curabitur sodales ligula in libero. Sed dignissim lacinia nunc. Curabitur tortor. Pellentesque nibh. Aenean quam. In scelerisque sem at dolor. Maecenas mattis. Sed convallis tristique sem. Proin ut ligula vel nunc egestas porttitor. Morbi lectus risus, iaculis vel, suscipit quis, luctus non, massa. Fusce ac turpis quis ligula lacinia aliquet. Mauris ipsum. Nulla metus metus, ullamcorper vel, tincidunt sed, euismod in, nibh. Quisque volutpat condimentum velit. Class aptent taciti sociosqu ad litora torquent per conubia nostra, per inceptos himenaeos. Nam nec ante. Sed lacinia, urna non tincidunt mattis, tortor neque adipiscing diam, a cursus ipsum ante quis turpis. Nulla facilisi. Ut fringilla. Suspendisse potenti. Nunc feugiat mi a tellus consequat imperdiet. Vestibulum sapien. Proin quam. Etiam ultrices. Suspendisse in justo eu magna luctus suscipit. Sed lectus. Integer euismod lacus luctus magna. Quisque cursus, metus vitae pharetra auctor, sem massa mattis sem, at interdum magna augue eget diam. Vestibulum ante ipsum primis in faucibus orci luctus et ultrices posuere cubilia Curae; Morbi lacinia molestie dui. Praesent blandit dolor. Sed non quam. In vel mi sit amet augue congue elementum. Morbi in ipsum sit amet pede facilisis laoreet. Donec lacus nunc, viverra nec, blandit vel, egestas et, augue. Vestibulum tincidunt malesuada tellus. Ut ultrices ultrices enim. Curabitur sit amet mauris. Morbi in dui quis est pulvinar ullamcorper. Nulla facilisi. Integer lacinia sollicitudin massa. Cras metus. Sed aliquet risus a tortor. Integer id quam. Morbi mi. Lorem ipsum dolor sit amet, consectetur adipiscing elit. Integer nec odio. Praesent libero. Sed cursus ante dapibus diam. Sed nisi. Nulla quis sem at nibh elementum imperdiet. Duis sagittis ipsum. Praesent mauris. Fusce nec tellus sed augue semper porta. Mauris massa. Vestibulum lacinia arcu eget nulla. Class aptent taciti sociosqu ad litora torquent per conubia nostra, per inceptos himenaeos. Curabitur sodales ligula in libero. Sed dignissim lacinia nunc. Curabitur tortor. Pellentesque nibh. Aenean quam. In scelerisque sem at dolor. Maecenas mattis. Sed convallis tristique sem. Proin ut ligula vel nunc egestas porttitor. Morbi lectus risus, iaculis vel, suscipit quis, luctus non, massa. Fusce ac turpis quis ligula lacinia aliquet. Mauris ipsum. Nulla metus metus, ullamcorper vel, tincidunt sed, euismod in, nibh. Quisque volutpat condimentum velit. Class aptent taciti sociosqu ad litora torquent per conubia nostra, per inceptos himenaeos. Nam nec ante. Sed lacinia, urna non tincidunt mattis, tortor neque adipiscing diam, a cursus ipsum ante quis turpis. Nulla facilisi. Ut fringilla. Suspendisse potenti. Nunc feugiat mi a tellus consequat imperdiet. Vestibulum sapien. Proin quam. Etiam ultrices. Suspendisse in justo eu magna luctus suscipit. Sed lectus. Integer euismod lacus luctus magna. Quisque cursus, metus vitae pharetra auctor, sem massa mattis sem, at interdum magna augue eget diam. Vestibulum ante ipsum primis in faucibus orci luctus et ultrices posuere cubilia Curae; Morbi lacinia molestie dui. Praesent blandit dolor. Sed non quam. In vel mi sit amet augue congue</w:t>
+        <w:rPr>
+          <w:sz w:val="24"/>
+        </w:rPr>
+        <w:t xml:space="preserve">ipsum dolor sit amet, consectetur adipiscing elit. Integer nec odio. Praesent libero. Sed cursus ante </w:t>
+      </w:r>
+      <w:r>
+        <w:rPr>
+          <w:sz w:val="24"/>
+        </w:rPr>
+        <w:t xml:space="preserve">dapibus diam. Sed nisi. Nulla quis sem at nibh elementum imperdiet. Duis sagittis ipsum. </w:t>
+      </w:r>
+      <w:r>
+        <w:rPr>
+          <w:sz w:val="24"/>
+        </w:rPr>
+        <w:t xml:space="preserve">Praesent mauris.  </w:t>
+      </w:r>
+      <w:r>
+        <w:rPr>
+          <w:sz w:val="24"/>
+        </w:rPr>
+        <w:t xml:space="preserve"> </w:t>
+      </w:r>
+      <w:r>
+        <w:rPr>
+          <w:sz w:val="24"/>
+        </w:rPr>
+        <w:t xml:space="preserve">Fusce nec tellus sed augue semper porta. Mauris massa. Vestibulum lacinia arcu eget nulla. Class </w:t>
+      </w:r>
+      <w:r>
+        <w:rPr>
+          <w:sz w:val="24"/>
+        </w:rPr>
+        <w:t xml:space="preserve">aptent taciti sociosqu ad litora torquent per conubia nostra, per inceptos himenaeos. Curabitur </w:t>
+      </w:r>
+      <w:r>
+        <w:rPr>
+          <w:sz w:val="24"/>
+        </w:rPr>
+        <w:t xml:space="preserve">sodales ligula in libero. Sed dignissim lacinia nunc. Curabitur tortor. Pellentesque nibh. Aenean </w:t>
+      </w:r>
+      <w:r>
+        <w:rPr>
+          <w:sz w:val="24"/>
+        </w:rPr>
+        <w:t xml:space="preserve">quam. In scelerisque sem at dolor. Maecenas mattis. Sed convallis tristique sem.  </w:t>
+      </w:r>
+      <w:r>
+        <w:rPr>
+          <w:sz w:val="24"/>
+        </w:rPr>
+        <w:t xml:space="preserve"> </w:t>
+      </w:r>
+      <w:r>
+        <w:rPr>
+          <w:sz w:val="24"/>
+        </w:rPr>
+        <w:t xml:space="preserve">Proin ut ligula vel nunc egestas porttitor. Morbi lectus risus, iaculis vel, suscipit quis, luctus non, </w:t>
+      </w:r>
+      <w:r>
+        <w:rPr>
+          <w:sz w:val="24"/>
+        </w:rPr>
+        <w:t xml:space="preserve">massa. Fusce ac turpis quis ligula lacinia aliquet. Mauris ipsum. Nulla metus metus, ullamcorper </w:t>
+      </w:r>
+      <w:r>
+        <w:rPr>
+          <w:sz w:val="24"/>
+        </w:rPr>
+        <w:t xml:space="preserve">vel, tincidunt sed, euismod in, nibh. Quisque volutpat condimentum velit. Class aptent taciti </w:t>
+      </w:r>
+      <w:r>
+        <w:rPr>
+          <w:sz w:val="24"/>
+        </w:rPr>
+        <w:t xml:space="preserve">sociosqu ad litora torquent per conubia nostra, per inceptos himenaeos. Nam nec ante. Sed lacinia, </w:t>
+      </w:r>
+      <w:r>
+        <w:rPr>
+          <w:sz w:val="24"/>
+        </w:rPr>
+        <w:t xml:space="preserve">urna non tincidunt mattis, tortor neque adipiscing diam, a cursus ipsum ante quis turpis. Nulla </w:t>
+      </w:r>
+      <w:r>
+        <w:rPr>
+          <w:sz w:val="24"/>
+        </w:rPr>
+        <w:t xml:space="preserve">facilisi. Ut fringilla. Suspendisse potenti.  </w:t>
+      </w:r>
+      <w:r>
+        <w:rPr>
+          <w:sz w:val="24"/>
+        </w:rPr>
+        <w:t xml:space="preserve"> </w:t>
+      </w:r>
+      <w:r>
+        <w:rPr>
+          <w:sz w:val="24"/>
+        </w:rPr>
+        <w:t xml:space="preserve">Nunc feugiat mi a tellus consequat imperdiet. Vestibulum sapien. Proin quam. Etiam ultrices. </w:t>
+      </w:r>
+      <w:r>
+        <w:rPr>
+          <w:sz w:val="24"/>
+        </w:rPr>
+        <w:t xml:space="preserve">Suspendisse in justo eu magna luctus suscipit. Sed lectus. Integer euismod lacus luctus magna. </w:t>
+      </w:r>
+      <w:r>
+        <w:rPr>
+          <w:sz w:val="24"/>
+        </w:rPr>
+        <w:t xml:space="preserve">Quisque cursus, metus vitae pharetra auctor, sem massa mattis sem, at interdum magna augue </w:t>
+      </w:r>
+      <w:r>
+        <w:rPr>
+          <w:sz w:val="24"/>
+        </w:rPr>
+        <w:t xml:space="preserve">eget diam. Vestibulum ante ipsum primis in faucibus orci luctus et ultrices posuere cubilia Curae; </w:t>
+      </w:r>
+      <w:r>
+        <w:rPr>
+          <w:sz w:val="24"/>
+        </w:rPr>
+        <w:t xml:space="preserve">Morbi lacinia molestie dui. Praesent blandit dolor. Sed non quam. In vel mi sit amet augue congue </w:t>
+      </w:r>
+      <w:r>
+        <w:rPr>
+          <w:sz w:val="24"/>
+        </w:rPr>
+        <w:t xml:space="preserve">elementum. Morbi in ipsum sit amet pede facilisis laoreet.  </w:t>
+      </w:r>
+      <w:r>
+        <w:rPr>
+          <w:sz w:val="24"/>
+        </w:rPr>
+        <w:t xml:space="preserve"> </w:t>
+      </w:r>
+      <w:r>
+        <w:rPr>
+          <w:sz w:val="24"/>
+        </w:rPr>
+        <w:t xml:space="preserve">Donec lacus nunc, viverra nec, blandit vel, egestas et, augue. Vestibulum tincidunt malesuada </w:t>
+      </w:r>
+      <w:r>
+        <w:rPr>
+          <w:sz w:val="24"/>
+        </w:rPr>
+        <w:t xml:space="preserve">tellus. Ut ultrices ultrices enim. Curabitur sit amet mauris. Morbi in dui quis est pulvinar </w:t>
+      </w:r>
+      <w:r>
+        <w:rPr>
+          <w:sz w:val="24"/>
+        </w:rPr>
+        <w:t xml:space="preserve">ullamcorper. Nulla facilisi. Integer lacinia sollicitudin massa. Cras metus. Sed aliquet risus a </w:t>
+      </w:r>
+      <w:r>
+        <w:rPr>
+          <w:sz w:val="24"/>
+        </w:rPr>
+        <w:t xml:space="preserve">tortor. Integer id quam. Morbi mi.  </w:t>
+      </w:r>
+      <w:r>
+        <w:rPr>
+          <w:sz w:val="24"/>
+        </w:rPr>
+        <w:t xml:space="preserve"> </w:t>
+      </w:r>
+      <w:r>
+        <w:rPr>
+          <w:sz w:val="24"/>
+        </w:rPr>
+        <w:t xml:space="preserve">Lorem ipsum dolor sit amet, consectetur adipiscing elit. Integer nec odio. Praesent libero. Sed </w:t>
+      </w:r>
+      <w:r>
+        <w:rPr>
+          <w:sz w:val="24"/>
+        </w:rPr>
+        <w:t xml:space="preserve">cursus ante dapibus diam. Sed nisi. Nulla quis sem at nibh elementum imperdiet. Duis sagittis </w:t>
+      </w:r>
+      <w:r>
+        <w:rPr>
+          <w:sz w:val="24"/>
+        </w:rPr>
+        <w:t xml:space="preserve">ipsum. Praesent mauris. Fusce nec tellus sed augue semper porta. Mauris massa. Vestibulum </w:t>
+      </w:r>
+      <w:r>
+        <w:rPr>
+          <w:sz w:val="24"/>
+        </w:rPr>
+        <w:t xml:space="preserve">lacinia arcu eget nulla. Class aptent taciti sociosqu ad litora torquent per conubia nostra, per </w:t>
+      </w:r>
+      <w:r>
+        <w:rPr>
+          <w:sz w:val="24"/>
+        </w:rPr>
+        <w:t xml:space="preserve">inceptos himenaeos. Curabitur sodales ligula in libero.  </w:t>
+      </w:r>
+      <w:r>
+        <w:rPr>
+          <w:sz w:val="24"/>
+        </w:rPr>
+        <w:t xml:space="preserve"> </w:t>
+      </w:r>
+      <w:r>
+        <w:rPr>
+          <w:sz w:val="24"/>
+        </w:rPr>
+        <w:t xml:space="preserve">Sed dignissim lacinia nunc. Curabitur tortor. Pellentesque nibh. Aenean quam. In scelerisque sem </w:t>
+      </w:r>
+      <w:r>
+        <w:rPr>
+          <w:sz w:val="24"/>
+        </w:rPr>
+        <w:t xml:space="preserve">at dolor. Maecenas mattis. Sed convallis tristique sem. Proin ut ligula vel nunc egestas porttitor. </w:t>
+      </w:r>
+      <w:r>
+        <w:rPr>
+          <w:sz w:val="24"/>
+        </w:rPr>
+        <w:t xml:space="preserve">Morbi lectus risus, iaculis vel, suscipit quis, luctus non, massa. Fusce ac turpis quis ligula lacinia </w:t>
+      </w:r>
+      <w:r>
+        <w:rPr>
+          <w:sz w:val="24"/>
+        </w:rPr>
+        <w:t xml:space="preserve">aliquet. Mauris ipsum. Nulla metus metus, ullamcorper vel, tincidunt sed, euismod in, nibh.  </w:t>
+      </w:r>
+      <w:r>
+        <w:rPr>
+          <w:sz w:val="24"/>
+        </w:rPr>
+        <w:t xml:space="preserve"> </w:t>
+      </w:r>
+      <w:r>
+        <w:rPr>
+          <w:sz w:val="24"/>
+        </w:rPr>
+        <w:t xml:space="preserve">Quisque volutpat condimentum velit. Class aptent taciti sociosqu ad litora torquent per conubia </w:t>
+      </w:r>
+      <w:r>
+        <w:rPr>
+          <w:sz w:val="24"/>
+        </w:rPr>
+        <w:t xml:space="preserve">nostra, per inceptos himenaeos. Nam nec ante. Sed lacinia, urna non tincidunt mattis, tortor neque </w:t>
+      </w:r>
+      <w:r>
+        <w:rPr>
+          <w:sz w:val="24"/>
+        </w:rPr>
+        <w:t xml:space="preserve">adipiscing diam, a cursus ipsum ante quis turpis. Nulla facilisi. Ut fringilla. Suspendisse potenti. </w:t>
+      </w:r>
+      <w:r>
+        <w:rPr>
+          <w:sz w:val="24"/>
+        </w:rPr>
+        <w:t xml:space="preserve">Nunc feugiat mi a tellus consequat imperdiet. Vestibulum sapien. Proin quam. Etiam ultrices.  </w:t>
+      </w:r>
+      <w:r>
+        <w:rPr>
+          <w:sz w:val="24"/>
+        </w:rPr>
+        <w:t xml:space="preserve"> </w:t>
+      </w:r>
+      <w:r>
+        <w:rPr>
+          <w:sz w:val="24"/>
+        </w:rPr>
+        <w:t xml:space="preserve">Suspendisse in justo eu magna luctus suscipit. Sed lectus. Integer euismod lacus luctus magna. </w:t>
+      </w:r>
+      <w:r>
+        <w:rPr>
+          <w:sz w:val="24"/>
+        </w:rPr>
+        <w:t xml:space="preserve">Quisque cursus, metus vitae pharetra auctor, sem massa mattis sem, at interdum magna augue </w:t>
+      </w:r>
+      <w:r>
+        <w:rPr>
+          <w:sz w:val="24"/>
+        </w:rPr>
+        <w:t xml:space="preserve">eget diam. Vestibulum ante ipsum primis in faucibus orci luctus et ultrices posuere cubilia Curae; </w:t>
+      </w:r>
+      <w:r>
+        <w:rPr>
+          <w:sz w:val="24"/>
+        </w:rPr>
+        <w:t xml:space="preserve">Morbi lacinia molestie dui. Praesent blandit dolor. Sed non quam. In vel mi sit amet augue congue </w:t>
       </w:r>
     </w:p>
     <w:p>
@@ -29,7 +578,220 @@
     </w:p>
     <w:p>
       <w:r>
-        <w:t>elementum. Morbi in ipsum sit amet pede facilisis laoreet. Donec lacus nunc, viverra nec, blandit vel, egestas et, augue. Vestibulum tincidunt malesuada tellus. Ut ultrices ultrices enim. Curabitur sit amet mauris. Morbi in dui quis est pulvinar ullamcorper. Nulla facilisi. Integer lacinia sollicitudin massa. Cras metus. Sed aliquet risus a tortor. Integer id quam. Morbi mi. Quisque nisl felis, venenatis tristique, dignissim in, ultrices sit amet, augue. Proin sodales libero eget ante. Nulla quam. Aenean laoreet. Vestibulum nisi lectus, commodo ac, facilisis ac, ultricies eu, pede. Ut orci risus, accumsan porttitor, cursus quis, aliquet eget, justo. Sed pretium blandit orci. Ut eu diam at pede suscipit sodales. Aenean lectus elit, fermentum non, convallis id, sagittis at, neque. Nullam mauris orci, aliquet et, iaculis et, viverra vitae, ligula. Nulla ut felis in purus aliquam imperdiet. Maecenas aliquet mollis lectus. Vivamus consectetuer risus et tortor. Lorem ipsum dolor sit amet, consectetur adipiscing elit. Integer nec odio. Praesent libero. Sed cursus ante dapibus diam. Sed nisi. Nulla quis sem at nibh elementum imperdiet. Duis sagittis ipsum. Praesent mauris. Fusce nec tellus sed augue semper porta. Mauris massa. Vestibulum lacinia arcu eget nulla. Class aptent taciti sociosqu ad litora torquent per conubia nostra, per inceptos himenaeos. Curabitur sodales ligula in libero. Sed dignissim lacinia nunc. Curabitur tortor. Pellentesque nibh. Aenean quam. In scelerisque sem at dolor. Maecenas mattis. Sed convallis tristique sem. Proin ut ligula vel nunc egestas porttitor. Morbi lectus risus, iaculis vel, suscipit quis, luctus non, massa. Fusce ac turpis quis ligula lacinia aliquet. Mauris ipsum. Nulla metus metus, ullamcorper vel, tincidunt sed, euismod in, nibh. Quisque volutpat condimentum velit. Class aptent taciti sociosqu ad litora torquent per conubia nostra, per inceptos himenaeos. Nam nec ante. Sed lacinia, urna non tincidunt mattis, tortor neque adipiscing diam, a cursus ipsum ante quis turpis. Nulla facilisi. Ut fringilla. Suspendisse potenti. Nunc feugiat mi a tellus consequat imperdiet. Vestibulum sapien. Proin quam. Etiam ultrices. Suspendisse in justo eu magna luctus suscipit. Sed lectus. Integer euismod lacus luctus magna. Quisque cursus, metus vitae pharetra auctor, sem massa mattis sem, at interdum magna augue eget diam. Vestibulum ante ipsum primis in faucibus orci luctus et ultrices posuere cubilia Curae; Morbi lacinia molestie dui. Praesent blandit dolor. Sed non quam. In vel mi sit amet augue congue elementum. Morbi in ipsum sit amet pede facilisis laoreet.</w:t>
+        <w:rPr>
+          <w:sz w:val="24"/>
+        </w:rPr>
+        <w:t xml:space="preserve">elementum. Morbi in ipsum sit amet pede facilisis laoreet. Donec lacus nunc, viverra nec, blandit </w:t>
+      </w:r>
+      <w:r>
+        <w:rPr>
+          <w:sz w:val="24"/>
+        </w:rPr>
+        <w:t xml:space="preserve">vel, egestas et, augue. Vestibulum tincidunt malesuada tellus. Ut ultrices ultrices enim. Curabitur </w:t>
+      </w:r>
+      <w:r>
+        <w:rPr>
+          <w:sz w:val="24"/>
+        </w:rPr>
+        <w:t xml:space="preserve">sit amet mauris.  </w:t>
+      </w:r>
+      <w:r>
+        <w:rPr>
+          <w:sz w:val="24"/>
+        </w:rPr>
+        <w:t xml:space="preserve"> </w:t>
+      </w:r>
+      <w:r>
+        <w:rPr>
+          <w:sz w:val="24"/>
+        </w:rPr>
+        <w:t xml:space="preserve">Morbi in dui quis est pulvinar ullamcorper. Nulla facilisi. Integer lacinia sollicitudin massa. Cras </w:t>
+      </w:r>
+      <w:r>
+        <w:rPr>
+          <w:sz w:val="24"/>
+        </w:rPr>
+        <w:t xml:space="preserve">metus. Sed aliquet risus a tortor. Integer id quam. Morbi mi. Quisque nisl felis, venenatis tristique, </w:t>
+      </w:r>
+      <w:r>
+        <w:rPr>
+          <w:sz w:val="24"/>
+        </w:rPr>
+        <w:t xml:space="preserve">dignissim in, ultrices sit amet, augue. Proin sodales libero eget ante. Nulla quam. Aenean laoreet. </w:t>
+      </w:r>
+      <w:r>
+        <w:rPr>
+          <w:sz w:val="24"/>
+        </w:rPr>
+        <w:t xml:space="preserve">Vestibulum nisi lectus, commodo ac, facilisis ac, ultricies eu, pede. Ut orci risus, accumsan </w:t>
+      </w:r>
+      <w:r>
+        <w:rPr>
+          <w:sz w:val="24"/>
+        </w:rPr>
+        <w:t xml:space="preserve">porttitor, cursus quis, aliquet eget, justo. Sed pretium blandit orci.  </w:t>
+      </w:r>
+      <w:r>
+        <w:rPr>
+          <w:sz w:val="24"/>
+        </w:rPr>
+        <w:t xml:space="preserve"> </w:t>
+      </w:r>
+      <w:r>
+        <w:rPr>
+          <w:sz w:val="24"/>
+        </w:rPr>
+        <w:t xml:space="preserve">Ut eu diam at pede suscipit sodales. Aenean lectus elit, fermentum non, convallis id, sagittis at, </w:t>
+      </w:r>
+      <w:r>
+        <w:rPr>
+          <w:sz w:val="24"/>
+        </w:rPr>
+        <w:t xml:space="preserve">neque. Nullam mauris orci, aliquet et, iaculis et, viverra vitae, ligula. Nulla ut felis in purus </w:t>
+      </w:r>
+      <w:r>
+        <w:rPr>
+          <w:sz w:val="24"/>
+        </w:rPr>
+        <w:t xml:space="preserve">aliquam imperdiet. Maecenas aliquet mollis lectus. Vivamus consectetuer risus et tortor. Lorem </w:t>
+      </w:r>
+      <w:r>
+        <w:rPr>
+          <w:sz w:val="24"/>
+        </w:rPr>
+        <w:t xml:space="preserve">ipsum dolor sit amet, consectetur adipiscing elit. Integer nec odio. Praesent libero. Sed cursus ante </w:t>
+      </w:r>
+      <w:r>
+        <w:rPr>
+          <w:sz w:val="24"/>
+        </w:rPr>
+        <w:t xml:space="preserve">dapibus diam. Sed nisi. Nulla quis sem at nibh elementum imperdiet. Duis sagittis ipsum. </w:t>
+      </w:r>
+      <w:r>
+        <w:rPr>
+          <w:sz w:val="24"/>
+        </w:rPr>
+        <w:t xml:space="preserve">Praesent mauris.  </w:t>
+      </w:r>
+      <w:r>
+        <w:rPr>
+          <w:sz w:val="24"/>
+        </w:rPr>
+        <w:t xml:space="preserve"> </w:t>
+      </w:r>
+      <w:r>
+        <w:rPr>
+          <w:sz w:val="24"/>
+        </w:rPr>
+        <w:t xml:space="preserve">Fusce nec tellus sed augue semper porta. Mauris massa. Vestibulum lacinia arcu eget nulla. Class </w:t>
+      </w:r>
+      <w:r>
+        <w:rPr>
+          <w:sz w:val="24"/>
+        </w:rPr>
+        <w:t xml:space="preserve">aptent taciti sociosqu ad litora torquent per conubia nostra, per inceptos himenaeos. Curabitur </w:t>
+      </w:r>
+      <w:r>
+        <w:rPr>
+          <w:sz w:val="24"/>
+        </w:rPr>
+        <w:t xml:space="preserve">sodales ligula in libero. Sed dignissim lacinia nunc. Curabitur tortor. Pellentesque nibh. Aenean </w:t>
+      </w:r>
+      <w:r>
+        <w:rPr>
+          <w:sz w:val="24"/>
+        </w:rPr>
+        <w:t xml:space="preserve">quam. In scelerisque sem at dolor. Maecenas mattis. Sed convallis tristique sem.  </w:t>
+      </w:r>
+      <w:r>
+        <w:rPr>
+          <w:sz w:val="24"/>
+        </w:rPr>
+        <w:t xml:space="preserve"> </w:t>
+      </w:r>
+      <w:r>
+        <w:rPr>
+          <w:sz w:val="24"/>
+        </w:rPr>
+        <w:t xml:space="preserve">Proin ut ligula vel nunc egestas porttitor. Morbi lectus risus, iaculis vel, suscipit quis, luctus non, </w:t>
+      </w:r>
+      <w:r>
+        <w:rPr>
+          <w:sz w:val="24"/>
+        </w:rPr>
+        <w:t xml:space="preserve">massa. Fusce ac turpis quis ligula lacinia aliquet. Mauris ipsum. Nulla metus metus, ullamcorper </w:t>
+      </w:r>
+      <w:r>
+        <w:rPr>
+          <w:sz w:val="24"/>
+        </w:rPr>
+        <w:t xml:space="preserve">vel, tincidunt sed, euismod in, nibh. Quisque volutpat condimentum velit. Class aptent taciti </w:t>
+      </w:r>
+      <w:r>
+        <w:rPr>
+          <w:sz w:val="24"/>
+        </w:rPr>
+        <w:t xml:space="preserve">sociosqu ad litora torquent per conubia nostra, per inceptos himenaeos. Nam nec ante. Sed lacinia, </w:t>
+      </w:r>
+      <w:r>
+        <w:rPr>
+          <w:sz w:val="24"/>
+        </w:rPr>
+        <w:t xml:space="preserve">urna non tincidunt mattis, tortor neque adipiscing diam, a cursus ipsum ante quis turpis. Nulla </w:t>
+      </w:r>
+      <w:r>
+        <w:rPr>
+          <w:sz w:val="24"/>
+        </w:rPr>
+        <w:t xml:space="preserve">facilisi. Ut fringilla. Suspendisse potenti.  </w:t>
+      </w:r>
+      <w:r>
+        <w:rPr>
+          <w:sz w:val="24"/>
+        </w:rPr>
+        <w:t xml:space="preserve"> </w:t>
+      </w:r>
+      <w:r>
+        <w:rPr>
+          <w:sz w:val="24"/>
+        </w:rPr>
+        <w:t xml:space="preserve">Nunc feugiat mi a tellus consequat imperdiet. Vestibulum sapien. Proin quam. Etiam ultrices. </w:t>
+      </w:r>
+      <w:r>
+        <w:rPr>
+          <w:sz w:val="24"/>
+        </w:rPr>
+        <w:t xml:space="preserve">Suspendisse in justo eu magna luctus suscipit. Sed lectus. Integer euismod lacus luctus magna. </w:t>
+      </w:r>
+      <w:r>
+        <w:rPr>
+          <w:sz w:val="24"/>
+        </w:rPr>
+        <w:t xml:space="preserve">Quisque cursus, metus vitae pharetra auctor, sem massa mattis sem, at interdum magna augue </w:t>
+      </w:r>
+      <w:r>
+        <w:rPr>
+          <w:sz w:val="24"/>
+        </w:rPr>
+        <w:t xml:space="preserve">eget diam. Vestibulum ante ipsum primis in faucibus orci luctus et ultrices posuere cubilia Curae; </w:t>
+      </w:r>
+      <w:r>
+        <w:rPr>
+          <w:sz w:val="24"/>
+        </w:rPr>
+        <w:t xml:space="preserve">Morbi lacinia molestie dui. Praesent blandit dolor. Sed non quam. In vel mi sit amet augue congue </w:t>
+      </w:r>
+      <w:r>
+        <w:rPr>
+          <w:sz w:val="24"/>
+        </w:rPr>
+        <w:t xml:space="preserve">elementum. Morbi in ipsum sit amet pede facilisis laoreet.  </w:t>
+      </w:r>
+      <w:r>
+        <w:rPr>
+          <w:sz w:val="24"/>
+        </w:rPr>
+        <w:t xml:space="preserve"> </w:t>
       </w:r>
     </w:p>
     <w:sectPr>

</xml_diff>

<commit_message>
Step 33 - Add Typography Engine
</commit_message>
<xml_diff>
--- a/output/output.docx
+++ b/output/output.docx
@@ -5,6 +5,9 @@
     <w:p>
       <w:r>
         <w:rPr>
+          <w:rFonts w:ascii="CenturySchoolbook-Bold" w:hAnsi="CenturySchoolbook-Bold"/>
+          <w:b/>
+          <w:i w:val="0"/>
           <w:sz w:val="72"/>
         </w:rPr>
         <w:t xml:space="preserve">Sample PDF </w:t>
@@ -13,264 +16,396 @@
     <w:p>
       <w:r>
         <w:rPr>
+          <w:rFonts w:ascii="CenturySchoolbook" w:hAnsi="CenturySchoolbook"/>
+          <w:b w:val="0"/>
+          <w:i w:val="0"/>
           <w:sz w:val="24"/>
         </w:rPr>
         <w:t xml:space="preserve"> </w:t>
       </w:r>
       <w:r>
         <w:rPr>
+          <w:rFonts w:ascii="CenturySchoolbook" w:hAnsi="CenturySchoolbook"/>
+          <w:b w:val="0"/>
+          <w:i w:val="0"/>
           <w:sz w:val="36"/>
         </w:rPr>
         <w:t xml:space="preserve">Created for testing </w:t>
       </w:r>
       <w:r>
         <w:rPr>
+          <w:rFonts w:ascii="CenturySchoolbook" w:hAnsi="CenturySchoolbook"/>
+          <w:b w:val="0"/>
+          <w:i w:val="0"/>
           <w:sz w:val="36"/>
         </w:rPr>
         <w:t>PDFObject</w:t>
       </w:r>
       <w:r>
         <w:rPr>
+          <w:rFonts w:ascii="CenturySchoolbook" w:hAnsi="CenturySchoolbook"/>
+          <w:b w:val="0"/>
+          <w:i w:val="0"/>
           <w:sz w:val="36"/>
         </w:rPr>
         <w:t xml:space="preserve"> </w:t>
       </w:r>
       <w:r>
         <w:rPr>
+          <w:rFonts w:ascii="CenturySchoolbook" w:hAnsi="CenturySchoolbook"/>
+          <w:b w:val="0"/>
+          <w:i w:val="0"/>
           <w:sz w:val="24"/>
         </w:rPr>
         <w:t xml:space="preserve"> </w:t>
       </w:r>
       <w:r>
         <w:rPr>
+          <w:rFonts w:ascii="CenturySchoolbook" w:hAnsi="CenturySchoolbook"/>
+          <w:b w:val="0"/>
+          <w:i w:val="0"/>
           <w:sz w:val="31"/>
         </w:rPr>
         <w:t xml:space="preserve">This PDF is three pages long. Three long pages. Or three short pages if </w:t>
       </w:r>
       <w:r>
         <w:rPr>
+          <w:rFonts w:ascii="CenturySchoolbook" w:hAnsi="CenturySchoolbook"/>
+          <w:b w:val="0"/>
+          <w:i w:val="0"/>
           <w:sz w:val="31"/>
         </w:rPr>
         <w:t xml:space="preserve">you’re optimistic. Is it the same as saying “three long minutes”, knowing </w:t>
       </w:r>
       <w:r>
         <w:rPr>
+          <w:rFonts w:ascii="CenturySchoolbook" w:hAnsi="CenturySchoolbook"/>
+          <w:b w:val="0"/>
+          <w:i w:val="0"/>
           <w:sz w:val="31"/>
         </w:rPr>
         <w:t xml:space="preserve">that all minutes are the same duration, and one cannot possibly be longer </w:t>
       </w:r>
       <w:r>
         <w:rPr>
+          <w:rFonts w:ascii="CenturySchoolbook" w:hAnsi="CenturySchoolbook"/>
+          <w:b w:val="0"/>
+          <w:i w:val="0"/>
           <w:sz w:val="31"/>
         </w:rPr>
         <w:t xml:space="preserve">than the other? If these pages are all the same size, can one possibly be </w:t>
       </w:r>
       <w:r>
         <w:rPr>
+          <w:rFonts w:ascii="CenturySchoolbook" w:hAnsi="CenturySchoolbook"/>
+          <w:b w:val="0"/>
+          <w:i w:val="0"/>
           <w:sz w:val="31"/>
         </w:rPr>
         <w:t xml:space="preserve">longer than the other? </w:t>
       </w:r>
       <w:r>
         <w:rPr>
+          <w:rFonts w:ascii="CenturySchoolbook" w:hAnsi="CenturySchoolbook"/>
+          <w:b w:val="0"/>
+          <w:i w:val="0"/>
           <w:sz w:val="24"/>
         </w:rPr>
         <w:t xml:space="preserve"> </w:t>
       </w:r>
       <w:r>
         <w:rPr>
+          <w:rFonts w:ascii="CenturySchoolbook" w:hAnsi="CenturySchoolbook"/>
+          <w:b w:val="0"/>
+          <w:i w:val="0"/>
           <w:sz w:val="24"/>
         </w:rPr>
         <w:t xml:space="preserve">I digress. Here’s some Latin. Lorem ipsum dolor sit amet, consectetur adipiscing elit. Integer nec </w:t>
       </w:r>
       <w:r>
         <w:rPr>
+          <w:rFonts w:ascii="CenturySchoolbook" w:hAnsi="CenturySchoolbook"/>
+          <w:b w:val="0"/>
+          <w:i w:val="0"/>
           <w:sz w:val="24"/>
         </w:rPr>
         <w:t xml:space="preserve">odio. Praesent libero. Sed cursus ante dapibus diam. Sed nisi. Nulla quis sem at nibh elementum </w:t>
       </w:r>
       <w:r>
         <w:rPr>
+          <w:rFonts w:ascii="CenturySchoolbook" w:hAnsi="CenturySchoolbook"/>
+          <w:b w:val="0"/>
+          <w:i w:val="0"/>
           <w:sz w:val="24"/>
         </w:rPr>
         <w:t xml:space="preserve">imperdiet. Duis sagittis ipsum. Praesent mauris. Fusce nec tellus sed augue semper porta. Mauris </w:t>
       </w:r>
       <w:r>
         <w:rPr>
+          <w:rFonts w:ascii="CenturySchoolbook" w:hAnsi="CenturySchoolbook"/>
+          <w:b w:val="0"/>
+          <w:i w:val="0"/>
           <w:sz w:val="24"/>
         </w:rPr>
         <w:t xml:space="preserve">massa. Vestibulum lacinia arcu eget nulla. Class aptent taciti sociosqu ad litora torquent per </w:t>
       </w:r>
       <w:r>
         <w:rPr>
+          <w:rFonts w:ascii="CenturySchoolbook" w:hAnsi="CenturySchoolbook"/>
+          <w:b w:val="0"/>
+          <w:i w:val="0"/>
           <w:sz w:val="24"/>
         </w:rPr>
         <w:t xml:space="preserve">conubia nostra, per inceptos himenaeos. Curabitur sodales ligula in libero.  </w:t>
       </w:r>
       <w:r>
         <w:rPr>
+          <w:rFonts w:ascii="CenturySchoolbook" w:hAnsi="CenturySchoolbook"/>
+          <w:b w:val="0"/>
+          <w:i w:val="0"/>
           <w:sz w:val="24"/>
         </w:rPr>
         <w:t xml:space="preserve"> </w:t>
       </w:r>
       <w:r>
         <w:rPr>
+          <w:rFonts w:ascii="CenturySchoolbook" w:hAnsi="CenturySchoolbook"/>
+          <w:b w:val="0"/>
+          <w:i w:val="0"/>
           <w:sz w:val="24"/>
         </w:rPr>
         <w:t xml:space="preserve">Sed dignissim lacinia nunc. Curabitur tortor. Pellentesque nibh. Aenean quam. In scelerisque sem </w:t>
       </w:r>
       <w:r>
         <w:rPr>
+          <w:rFonts w:ascii="CenturySchoolbook" w:hAnsi="CenturySchoolbook"/>
+          <w:b w:val="0"/>
+          <w:i w:val="0"/>
           <w:sz w:val="24"/>
         </w:rPr>
         <w:t xml:space="preserve">at dolor. Maecenas mattis. Sed convallis tristique sem. Proin ut ligula vel nunc egestas porttitor. </w:t>
       </w:r>
       <w:r>
         <w:rPr>
+          <w:rFonts w:ascii="CenturySchoolbook" w:hAnsi="CenturySchoolbook"/>
+          <w:b w:val="0"/>
+          <w:i w:val="0"/>
           <w:sz w:val="24"/>
         </w:rPr>
         <w:t xml:space="preserve">Morbi lectus risus, iaculis vel, suscipit quis, luctus non, massa. Fusce ac turpis quis ligula lacinia </w:t>
       </w:r>
       <w:r>
         <w:rPr>
+          <w:rFonts w:ascii="CenturySchoolbook" w:hAnsi="CenturySchoolbook"/>
+          <w:b w:val="0"/>
+          <w:i w:val="0"/>
           <w:sz w:val="24"/>
         </w:rPr>
         <w:t xml:space="preserve">aliquet. Mauris ipsum. Nulla metus metus, ullamcorper vel, tincidunt sed, euismod in, nibh.  </w:t>
       </w:r>
       <w:r>
         <w:rPr>
+          <w:rFonts w:ascii="CenturySchoolbook" w:hAnsi="CenturySchoolbook"/>
+          <w:b w:val="0"/>
+          <w:i w:val="0"/>
           <w:sz w:val="24"/>
         </w:rPr>
         <w:t xml:space="preserve"> </w:t>
       </w:r>
       <w:r>
         <w:rPr>
+          <w:rFonts w:ascii="CenturySchoolbook" w:hAnsi="CenturySchoolbook"/>
+          <w:b w:val="0"/>
+          <w:i w:val="0"/>
           <w:sz w:val="24"/>
         </w:rPr>
         <w:t xml:space="preserve">Quisque volutpat condimentum velit. Class aptent taciti sociosqu ad litora torquent per conubia </w:t>
       </w:r>
       <w:r>
         <w:rPr>
+          <w:rFonts w:ascii="CenturySchoolbook" w:hAnsi="CenturySchoolbook"/>
+          <w:b w:val="0"/>
+          <w:i w:val="0"/>
           <w:sz w:val="24"/>
         </w:rPr>
         <w:t xml:space="preserve">nostra, per inceptos himenaeos. Nam nec ante. Sed lacinia, urna non tincidunt mattis, tortor neque </w:t>
       </w:r>
       <w:r>
         <w:rPr>
+          <w:rFonts w:ascii="CenturySchoolbook" w:hAnsi="CenturySchoolbook"/>
+          <w:b w:val="0"/>
+          <w:i w:val="0"/>
           <w:sz w:val="24"/>
         </w:rPr>
         <w:t xml:space="preserve">adipiscing diam, a cursus ipsum ante quis turpis. Nulla facilisi. Ut fringilla. Suspendisse potenti. </w:t>
       </w:r>
       <w:r>
         <w:rPr>
+          <w:rFonts w:ascii="CenturySchoolbook" w:hAnsi="CenturySchoolbook"/>
+          <w:b w:val="0"/>
+          <w:i w:val="0"/>
           <w:sz w:val="24"/>
         </w:rPr>
         <w:t xml:space="preserve">Nunc feugiat mi a tellus consequat imperdiet. Vestibulum sapien. Proin quam. Etiam ultrices.  </w:t>
       </w:r>
       <w:r>
         <w:rPr>
+          <w:rFonts w:ascii="CenturySchoolbook" w:hAnsi="CenturySchoolbook"/>
+          <w:b w:val="0"/>
+          <w:i w:val="0"/>
           <w:sz w:val="24"/>
         </w:rPr>
         <w:t xml:space="preserve"> </w:t>
       </w:r>
       <w:r>
         <w:rPr>
+          <w:rFonts w:ascii="CenturySchoolbook" w:hAnsi="CenturySchoolbook"/>
+          <w:b w:val="0"/>
+          <w:i w:val="0"/>
           <w:sz w:val="24"/>
         </w:rPr>
         <w:t xml:space="preserve">Suspendisse in justo eu magna luctus suscipit. Sed lectus. Integer euismod lacus luctus magna. </w:t>
       </w:r>
       <w:r>
         <w:rPr>
+          <w:rFonts w:ascii="CenturySchoolbook" w:hAnsi="CenturySchoolbook"/>
+          <w:b w:val="0"/>
+          <w:i w:val="0"/>
           <w:sz w:val="24"/>
         </w:rPr>
         <w:t xml:space="preserve">Quisque cursus, metus vitae pharetra auctor, sem massa mattis sem, at interdum magna augue </w:t>
       </w:r>
       <w:r>
         <w:rPr>
+          <w:rFonts w:ascii="CenturySchoolbook" w:hAnsi="CenturySchoolbook"/>
+          <w:b w:val="0"/>
+          <w:i w:val="0"/>
           <w:sz w:val="24"/>
         </w:rPr>
         <w:t xml:space="preserve">eget diam. Vestibulum ante ipsum primis in faucibus orci luctus et ultrices posuere cubilia Curae; </w:t>
       </w:r>
       <w:r>
         <w:rPr>
+          <w:rFonts w:ascii="CenturySchoolbook" w:hAnsi="CenturySchoolbook"/>
+          <w:b w:val="0"/>
+          <w:i w:val="0"/>
           <w:sz w:val="24"/>
         </w:rPr>
         <w:t xml:space="preserve">Morbi lacinia molestie dui. Praesent blandit dolor. Sed non quam. In vel mi sit amet augue congue </w:t>
       </w:r>
       <w:r>
         <w:rPr>
+          <w:rFonts w:ascii="CenturySchoolbook" w:hAnsi="CenturySchoolbook"/>
+          <w:b w:val="0"/>
+          <w:i w:val="0"/>
           <w:sz w:val="24"/>
         </w:rPr>
         <w:t xml:space="preserve">elementum. Morbi in ipsum sit amet pede facilisis laoreet. Donec lacus nunc, viverra nec, blandit </w:t>
       </w:r>
       <w:r>
         <w:rPr>
+          <w:rFonts w:ascii="CenturySchoolbook" w:hAnsi="CenturySchoolbook"/>
+          <w:b w:val="0"/>
+          <w:i w:val="0"/>
           <w:sz w:val="24"/>
         </w:rPr>
         <w:t xml:space="preserve">vel, egestas et, augue. Vestibulum tincidunt malesuada tellus. Ut ultrices ultrices enim. Curabitur </w:t>
       </w:r>
       <w:r>
         <w:rPr>
+          <w:rFonts w:ascii="CenturySchoolbook" w:hAnsi="CenturySchoolbook"/>
+          <w:b w:val="0"/>
+          <w:i w:val="0"/>
           <w:sz w:val="24"/>
         </w:rPr>
         <w:t xml:space="preserve">sit amet mauris.  </w:t>
       </w:r>
       <w:r>
         <w:rPr>
+          <w:rFonts w:ascii="CenturySchoolbook" w:hAnsi="CenturySchoolbook"/>
+          <w:b w:val="0"/>
+          <w:i w:val="0"/>
           <w:sz w:val="24"/>
         </w:rPr>
         <w:t xml:space="preserve"> </w:t>
       </w:r>
       <w:r>
         <w:rPr>
+          <w:rFonts w:ascii="CenturySchoolbook" w:hAnsi="CenturySchoolbook"/>
+          <w:b w:val="0"/>
+          <w:i w:val="0"/>
           <w:sz w:val="24"/>
         </w:rPr>
         <w:t xml:space="preserve">Morbi in dui quis est pulvinar ullamcorper. Nulla facilisi. Integer lacinia sollicitudin massa. Cras </w:t>
       </w:r>
       <w:r>
         <w:rPr>
+          <w:rFonts w:ascii="CenturySchoolbook" w:hAnsi="CenturySchoolbook"/>
+          <w:b w:val="0"/>
+          <w:i w:val="0"/>
           <w:sz w:val="24"/>
         </w:rPr>
         <w:t xml:space="preserve">metus. Sed aliquet risus a tortor. Integer id quam. Morbi mi. Quisque nisl felis, venenatis tristique, </w:t>
       </w:r>
       <w:r>
         <w:rPr>
+          <w:rFonts w:ascii="CenturySchoolbook" w:hAnsi="CenturySchoolbook"/>
+          <w:b w:val="0"/>
+          <w:i w:val="0"/>
           <w:sz w:val="24"/>
         </w:rPr>
         <w:t xml:space="preserve">dignissim in, ultrices sit amet, augue. Proin sodales libero eget ante. Nulla quam. Aenean laoreet. </w:t>
       </w:r>
       <w:r>
         <w:rPr>
+          <w:rFonts w:ascii="CenturySchoolbook" w:hAnsi="CenturySchoolbook"/>
+          <w:b w:val="0"/>
+          <w:i w:val="0"/>
           <w:sz w:val="24"/>
         </w:rPr>
         <w:t xml:space="preserve">Vestibulum nisi lectus, commodo ac, facilisis ac, ultricies eu, pede. Ut orci risus, accumsan </w:t>
       </w:r>
       <w:r>
         <w:rPr>
+          <w:rFonts w:ascii="CenturySchoolbook" w:hAnsi="CenturySchoolbook"/>
+          <w:b w:val="0"/>
+          <w:i w:val="0"/>
           <w:sz w:val="24"/>
         </w:rPr>
         <w:t xml:space="preserve">porttitor, cursus quis, aliquet eget, justo. Sed pretium blandit orci.  </w:t>
       </w:r>
       <w:r>
         <w:rPr>
+          <w:rFonts w:ascii="CenturySchoolbook" w:hAnsi="CenturySchoolbook"/>
+          <w:b w:val="0"/>
+          <w:i w:val="0"/>
           <w:sz w:val="24"/>
         </w:rPr>
         <w:t xml:space="preserve"> </w:t>
       </w:r>
       <w:r>
         <w:rPr>
+          <w:rFonts w:ascii="CenturySchoolbook" w:hAnsi="CenturySchoolbook"/>
+          <w:b w:val="0"/>
+          <w:i w:val="0"/>
           <w:sz w:val="24"/>
         </w:rPr>
         <w:t xml:space="preserve">Ut eu diam at pede suscipit sodales. Aenean lectus elit, fermentum non, convallis id, sagittis at, </w:t>
       </w:r>
       <w:r>
         <w:rPr>
+          <w:rFonts w:ascii="CenturySchoolbook" w:hAnsi="CenturySchoolbook"/>
+          <w:b w:val="0"/>
+          <w:i w:val="0"/>
           <w:sz w:val="24"/>
         </w:rPr>
         <w:t xml:space="preserve">neque. Nullam mauris orci, aliquet et, iaculis et, viverra vitae, ligula. Nulla ut felis in purus </w:t>
       </w:r>
       <w:r>
         <w:rPr>
+          <w:rFonts w:ascii="CenturySchoolbook" w:hAnsi="CenturySchoolbook"/>
+          <w:b w:val="0"/>
+          <w:i w:val="0"/>
           <w:sz w:val="24"/>
         </w:rPr>
         <w:t xml:space="preserve">aliquam imperdiet. Maecenas aliquet mollis lectus. Vivamus consectetuer risus et tortor. Lorem </w:t>
@@ -284,288 +419,432 @@
     <w:p>
       <w:r>
         <w:rPr>
+          <w:rFonts w:ascii="CenturySchoolbook" w:hAnsi="CenturySchoolbook"/>
+          <w:b w:val="0"/>
+          <w:i w:val="0"/>
           <w:sz w:val="24"/>
         </w:rPr>
         <w:t xml:space="preserve">ipsum dolor sit amet, consectetur adipiscing elit. Integer nec odio. Praesent libero. Sed cursus ante </w:t>
       </w:r>
       <w:r>
         <w:rPr>
+          <w:rFonts w:ascii="CenturySchoolbook" w:hAnsi="CenturySchoolbook"/>
+          <w:b w:val="0"/>
+          <w:i w:val="0"/>
           <w:sz w:val="24"/>
         </w:rPr>
         <w:t xml:space="preserve">dapibus diam. Sed nisi. Nulla quis sem at nibh elementum imperdiet. Duis sagittis ipsum. </w:t>
       </w:r>
       <w:r>
         <w:rPr>
+          <w:rFonts w:ascii="CenturySchoolbook" w:hAnsi="CenturySchoolbook"/>
+          <w:b w:val="0"/>
+          <w:i w:val="0"/>
           <w:sz w:val="24"/>
         </w:rPr>
         <w:t xml:space="preserve">Praesent mauris.  </w:t>
       </w:r>
       <w:r>
         <w:rPr>
+          <w:rFonts w:ascii="CenturySchoolbook" w:hAnsi="CenturySchoolbook"/>
+          <w:b w:val="0"/>
+          <w:i w:val="0"/>
           <w:sz w:val="24"/>
         </w:rPr>
         <w:t xml:space="preserve"> </w:t>
       </w:r>
       <w:r>
         <w:rPr>
+          <w:rFonts w:ascii="CenturySchoolbook" w:hAnsi="CenturySchoolbook"/>
+          <w:b w:val="0"/>
+          <w:i w:val="0"/>
           <w:sz w:val="24"/>
         </w:rPr>
         <w:t xml:space="preserve">Fusce nec tellus sed augue semper porta. Mauris massa. Vestibulum lacinia arcu eget nulla. Class </w:t>
       </w:r>
       <w:r>
         <w:rPr>
+          <w:rFonts w:ascii="CenturySchoolbook" w:hAnsi="CenturySchoolbook"/>
+          <w:b w:val="0"/>
+          <w:i w:val="0"/>
           <w:sz w:val="24"/>
         </w:rPr>
         <w:t xml:space="preserve">aptent taciti sociosqu ad litora torquent per conubia nostra, per inceptos himenaeos. Curabitur </w:t>
       </w:r>
       <w:r>
         <w:rPr>
+          <w:rFonts w:ascii="CenturySchoolbook" w:hAnsi="CenturySchoolbook"/>
+          <w:b w:val="0"/>
+          <w:i w:val="0"/>
           <w:sz w:val="24"/>
         </w:rPr>
         <w:t xml:space="preserve">sodales ligula in libero. Sed dignissim lacinia nunc. Curabitur tortor. Pellentesque nibh. Aenean </w:t>
       </w:r>
       <w:r>
         <w:rPr>
+          <w:rFonts w:ascii="CenturySchoolbook" w:hAnsi="CenturySchoolbook"/>
+          <w:b w:val="0"/>
+          <w:i w:val="0"/>
           <w:sz w:val="24"/>
         </w:rPr>
         <w:t xml:space="preserve">quam. In scelerisque sem at dolor. Maecenas mattis. Sed convallis tristique sem.  </w:t>
       </w:r>
       <w:r>
         <w:rPr>
+          <w:rFonts w:ascii="CenturySchoolbook" w:hAnsi="CenturySchoolbook"/>
+          <w:b w:val="0"/>
+          <w:i w:val="0"/>
           <w:sz w:val="24"/>
         </w:rPr>
         <w:t xml:space="preserve"> </w:t>
       </w:r>
       <w:r>
         <w:rPr>
+          <w:rFonts w:ascii="CenturySchoolbook" w:hAnsi="CenturySchoolbook"/>
+          <w:b w:val="0"/>
+          <w:i w:val="0"/>
           <w:sz w:val="24"/>
         </w:rPr>
         <w:t xml:space="preserve">Proin ut ligula vel nunc egestas porttitor. Morbi lectus risus, iaculis vel, suscipit quis, luctus non, </w:t>
       </w:r>
       <w:r>
         <w:rPr>
+          <w:rFonts w:ascii="CenturySchoolbook" w:hAnsi="CenturySchoolbook"/>
+          <w:b w:val="0"/>
+          <w:i w:val="0"/>
           <w:sz w:val="24"/>
         </w:rPr>
         <w:t xml:space="preserve">massa. Fusce ac turpis quis ligula lacinia aliquet. Mauris ipsum. Nulla metus metus, ullamcorper </w:t>
       </w:r>
       <w:r>
         <w:rPr>
+          <w:rFonts w:ascii="CenturySchoolbook" w:hAnsi="CenturySchoolbook"/>
+          <w:b w:val="0"/>
+          <w:i w:val="0"/>
           <w:sz w:val="24"/>
         </w:rPr>
         <w:t xml:space="preserve">vel, tincidunt sed, euismod in, nibh. Quisque volutpat condimentum velit. Class aptent taciti </w:t>
       </w:r>
       <w:r>
         <w:rPr>
+          <w:rFonts w:ascii="CenturySchoolbook" w:hAnsi="CenturySchoolbook"/>
+          <w:b w:val="0"/>
+          <w:i w:val="0"/>
           <w:sz w:val="24"/>
         </w:rPr>
         <w:t xml:space="preserve">sociosqu ad litora torquent per conubia nostra, per inceptos himenaeos. Nam nec ante. Sed lacinia, </w:t>
       </w:r>
       <w:r>
         <w:rPr>
+          <w:rFonts w:ascii="CenturySchoolbook" w:hAnsi="CenturySchoolbook"/>
+          <w:b w:val="0"/>
+          <w:i w:val="0"/>
           <w:sz w:val="24"/>
         </w:rPr>
         <w:t xml:space="preserve">urna non tincidunt mattis, tortor neque adipiscing diam, a cursus ipsum ante quis turpis. Nulla </w:t>
       </w:r>
       <w:r>
         <w:rPr>
+          <w:rFonts w:ascii="CenturySchoolbook" w:hAnsi="CenturySchoolbook"/>
+          <w:b w:val="0"/>
+          <w:i w:val="0"/>
           <w:sz w:val="24"/>
         </w:rPr>
         <w:t xml:space="preserve">facilisi. Ut fringilla. Suspendisse potenti.  </w:t>
       </w:r>
       <w:r>
         <w:rPr>
+          <w:rFonts w:ascii="CenturySchoolbook" w:hAnsi="CenturySchoolbook"/>
+          <w:b w:val="0"/>
+          <w:i w:val="0"/>
           <w:sz w:val="24"/>
         </w:rPr>
         <w:t xml:space="preserve"> </w:t>
       </w:r>
       <w:r>
         <w:rPr>
+          <w:rFonts w:ascii="CenturySchoolbook" w:hAnsi="CenturySchoolbook"/>
+          <w:b w:val="0"/>
+          <w:i w:val="0"/>
           <w:sz w:val="24"/>
         </w:rPr>
         <w:t xml:space="preserve">Nunc feugiat mi a tellus consequat imperdiet. Vestibulum sapien. Proin quam. Etiam ultrices. </w:t>
       </w:r>
       <w:r>
         <w:rPr>
+          <w:rFonts w:ascii="CenturySchoolbook" w:hAnsi="CenturySchoolbook"/>
+          <w:b w:val="0"/>
+          <w:i w:val="0"/>
           <w:sz w:val="24"/>
         </w:rPr>
         <w:t xml:space="preserve">Suspendisse in justo eu magna luctus suscipit. Sed lectus. Integer euismod lacus luctus magna. </w:t>
       </w:r>
       <w:r>
         <w:rPr>
+          <w:rFonts w:ascii="CenturySchoolbook" w:hAnsi="CenturySchoolbook"/>
+          <w:b w:val="0"/>
+          <w:i w:val="0"/>
           <w:sz w:val="24"/>
         </w:rPr>
         <w:t xml:space="preserve">Quisque cursus, metus vitae pharetra auctor, sem massa mattis sem, at interdum magna augue </w:t>
       </w:r>
       <w:r>
         <w:rPr>
+          <w:rFonts w:ascii="CenturySchoolbook" w:hAnsi="CenturySchoolbook"/>
+          <w:b w:val="0"/>
+          <w:i w:val="0"/>
           <w:sz w:val="24"/>
         </w:rPr>
         <w:t xml:space="preserve">eget diam. Vestibulum ante ipsum primis in faucibus orci luctus et ultrices posuere cubilia Curae; </w:t>
       </w:r>
       <w:r>
         <w:rPr>
+          <w:rFonts w:ascii="CenturySchoolbook" w:hAnsi="CenturySchoolbook"/>
+          <w:b w:val="0"/>
+          <w:i w:val="0"/>
           <w:sz w:val="24"/>
         </w:rPr>
         <w:t xml:space="preserve">Morbi lacinia molestie dui. Praesent blandit dolor. Sed non quam. In vel mi sit amet augue congue </w:t>
       </w:r>
       <w:r>
         <w:rPr>
+          <w:rFonts w:ascii="CenturySchoolbook" w:hAnsi="CenturySchoolbook"/>
+          <w:b w:val="0"/>
+          <w:i w:val="0"/>
           <w:sz w:val="24"/>
         </w:rPr>
         <w:t xml:space="preserve">elementum. Morbi in ipsum sit amet pede facilisis laoreet.  </w:t>
       </w:r>
       <w:r>
         <w:rPr>
+          <w:rFonts w:ascii="CenturySchoolbook" w:hAnsi="CenturySchoolbook"/>
+          <w:b w:val="0"/>
+          <w:i w:val="0"/>
           <w:sz w:val="24"/>
         </w:rPr>
         <w:t xml:space="preserve"> </w:t>
       </w:r>
       <w:r>
         <w:rPr>
+          <w:rFonts w:ascii="CenturySchoolbook" w:hAnsi="CenturySchoolbook"/>
+          <w:b w:val="0"/>
+          <w:i w:val="0"/>
           <w:sz w:val="24"/>
         </w:rPr>
         <w:t xml:space="preserve">Donec lacus nunc, viverra nec, blandit vel, egestas et, augue. Vestibulum tincidunt malesuada </w:t>
       </w:r>
       <w:r>
         <w:rPr>
+          <w:rFonts w:ascii="CenturySchoolbook" w:hAnsi="CenturySchoolbook"/>
+          <w:b w:val="0"/>
+          <w:i w:val="0"/>
           <w:sz w:val="24"/>
         </w:rPr>
         <w:t xml:space="preserve">tellus. Ut ultrices ultrices enim. Curabitur sit amet mauris. Morbi in dui quis est pulvinar </w:t>
       </w:r>
       <w:r>
         <w:rPr>
+          <w:rFonts w:ascii="CenturySchoolbook" w:hAnsi="CenturySchoolbook"/>
+          <w:b w:val="0"/>
+          <w:i w:val="0"/>
           <w:sz w:val="24"/>
         </w:rPr>
         <w:t xml:space="preserve">ullamcorper. Nulla facilisi. Integer lacinia sollicitudin massa. Cras metus. Sed aliquet risus a </w:t>
       </w:r>
       <w:r>
         <w:rPr>
+          <w:rFonts w:ascii="CenturySchoolbook" w:hAnsi="CenturySchoolbook"/>
+          <w:b w:val="0"/>
+          <w:i w:val="0"/>
           <w:sz w:val="24"/>
         </w:rPr>
         <w:t xml:space="preserve">tortor. Integer id quam. Morbi mi.  </w:t>
       </w:r>
       <w:r>
         <w:rPr>
+          <w:rFonts w:ascii="CenturySchoolbook" w:hAnsi="CenturySchoolbook"/>
+          <w:b w:val="0"/>
+          <w:i w:val="0"/>
           <w:sz w:val="24"/>
         </w:rPr>
         <w:t xml:space="preserve"> </w:t>
       </w:r>
       <w:r>
         <w:rPr>
+          <w:rFonts w:ascii="CenturySchoolbook" w:hAnsi="CenturySchoolbook"/>
+          <w:b w:val="0"/>
+          <w:i w:val="0"/>
           <w:sz w:val="24"/>
         </w:rPr>
         <w:t xml:space="preserve">Lorem ipsum dolor sit amet, consectetur adipiscing elit. Integer nec odio. Praesent libero. Sed </w:t>
       </w:r>
       <w:r>
         <w:rPr>
+          <w:rFonts w:ascii="CenturySchoolbook" w:hAnsi="CenturySchoolbook"/>
+          <w:b w:val="0"/>
+          <w:i w:val="0"/>
           <w:sz w:val="24"/>
         </w:rPr>
         <w:t xml:space="preserve">cursus ante dapibus diam. Sed nisi. Nulla quis sem at nibh elementum imperdiet. Duis sagittis </w:t>
       </w:r>
       <w:r>
         <w:rPr>
+          <w:rFonts w:ascii="CenturySchoolbook" w:hAnsi="CenturySchoolbook"/>
+          <w:b w:val="0"/>
+          <w:i w:val="0"/>
           <w:sz w:val="24"/>
         </w:rPr>
         <w:t xml:space="preserve">ipsum. Praesent mauris. Fusce nec tellus sed augue semper porta. Mauris massa. Vestibulum </w:t>
       </w:r>
       <w:r>
         <w:rPr>
+          <w:rFonts w:ascii="CenturySchoolbook" w:hAnsi="CenturySchoolbook"/>
+          <w:b w:val="0"/>
+          <w:i w:val="0"/>
           <w:sz w:val="24"/>
         </w:rPr>
         <w:t xml:space="preserve">lacinia arcu eget nulla. Class aptent taciti sociosqu ad litora torquent per conubia nostra, per </w:t>
       </w:r>
       <w:r>
         <w:rPr>
+          <w:rFonts w:ascii="CenturySchoolbook" w:hAnsi="CenturySchoolbook"/>
+          <w:b w:val="0"/>
+          <w:i w:val="0"/>
           <w:sz w:val="24"/>
         </w:rPr>
         <w:t xml:space="preserve">inceptos himenaeos. Curabitur sodales ligula in libero.  </w:t>
       </w:r>
       <w:r>
         <w:rPr>
+          <w:rFonts w:ascii="CenturySchoolbook" w:hAnsi="CenturySchoolbook"/>
+          <w:b w:val="0"/>
+          <w:i w:val="0"/>
           <w:sz w:val="24"/>
         </w:rPr>
         <w:t xml:space="preserve"> </w:t>
       </w:r>
       <w:r>
         <w:rPr>
+          <w:rFonts w:ascii="CenturySchoolbook" w:hAnsi="CenturySchoolbook"/>
+          <w:b w:val="0"/>
+          <w:i w:val="0"/>
           <w:sz w:val="24"/>
         </w:rPr>
         <w:t xml:space="preserve">Sed dignissim lacinia nunc. Curabitur tortor. Pellentesque nibh. Aenean quam. In scelerisque sem </w:t>
       </w:r>
       <w:r>
         <w:rPr>
+          <w:rFonts w:ascii="CenturySchoolbook" w:hAnsi="CenturySchoolbook"/>
+          <w:b w:val="0"/>
+          <w:i w:val="0"/>
           <w:sz w:val="24"/>
         </w:rPr>
         <w:t xml:space="preserve">at dolor. Maecenas mattis. Sed convallis tristique sem. Proin ut ligula vel nunc egestas porttitor. </w:t>
       </w:r>
       <w:r>
         <w:rPr>
+          <w:rFonts w:ascii="CenturySchoolbook" w:hAnsi="CenturySchoolbook"/>
+          <w:b w:val="0"/>
+          <w:i w:val="0"/>
           <w:sz w:val="24"/>
         </w:rPr>
         <w:t xml:space="preserve">Morbi lectus risus, iaculis vel, suscipit quis, luctus non, massa. Fusce ac turpis quis ligula lacinia </w:t>
       </w:r>
       <w:r>
         <w:rPr>
+          <w:rFonts w:ascii="CenturySchoolbook" w:hAnsi="CenturySchoolbook"/>
+          <w:b w:val="0"/>
+          <w:i w:val="0"/>
           <w:sz w:val="24"/>
         </w:rPr>
         <w:t xml:space="preserve">aliquet. Mauris ipsum. Nulla metus metus, ullamcorper vel, tincidunt sed, euismod in, nibh.  </w:t>
       </w:r>
       <w:r>
         <w:rPr>
+          <w:rFonts w:ascii="CenturySchoolbook" w:hAnsi="CenturySchoolbook"/>
+          <w:b w:val="0"/>
+          <w:i w:val="0"/>
           <w:sz w:val="24"/>
         </w:rPr>
         <w:t xml:space="preserve"> </w:t>
       </w:r>
       <w:r>
         <w:rPr>
+          <w:rFonts w:ascii="CenturySchoolbook" w:hAnsi="CenturySchoolbook"/>
+          <w:b w:val="0"/>
+          <w:i w:val="0"/>
           <w:sz w:val="24"/>
         </w:rPr>
         <w:t xml:space="preserve">Quisque volutpat condimentum velit. Class aptent taciti sociosqu ad litora torquent per conubia </w:t>
       </w:r>
       <w:r>
         <w:rPr>
+          <w:rFonts w:ascii="CenturySchoolbook" w:hAnsi="CenturySchoolbook"/>
+          <w:b w:val="0"/>
+          <w:i w:val="0"/>
           <w:sz w:val="24"/>
         </w:rPr>
         <w:t xml:space="preserve">nostra, per inceptos himenaeos. Nam nec ante. Sed lacinia, urna non tincidunt mattis, tortor neque </w:t>
       </w:r>
       <w:r>
         <w:rPr>
+          <w:rFonts w:ascii="CenturySchoolbook" w:hAnsi="CenturySchoolbook"/>
+          <w:b w:val="0"/>
+          <w:i w:val="0"/>
           <w:sz w:val="24"/>
         </w:rPr>
         <w:t xml:space="preserve">adipiscing diam, a cursus ipsum ante quis turpis. Nulla facilisi. Ut fringilla. Suspendisse potenti. </w:t>
       </w:r>
       <w:r>
         <w:rPr>
+          <w:rFonts w:ascii="CenturySchoolbook" w:hAnsi="CenturySchoolbook"/>
+          <w:b w:val="0"/>
+          <w:i w:val="0"/>
           <w:sz w:val="24"/>
         </w:rPr>
         <w:t xml:space="preserve">Nunc feugiat mi a tellus consequat imperdiet. Vestibulum sapien. Proin quam. Etiam ultrices.  </w:t>
       </w:r>
       <w:r>
         <w:rPr>
+          <w:rFonts w:ascii="CenturySchoolbook" w:hAnsi="CenturySchoolbook"/>
+          <w:b w:val="0"/>
+          <w:i w:val="0"/>
           <w:sz w:val="24"/>
         </w:rPr>
         <w:t xml:space="preserve"> </w:t>
       </w:r>
       <w:r>
         <w:rPr>
+          <w:rFonts w:ascii="CenturySchoolbook" w:hAnsi="CenturySchoolbook"/>
+          <w:b w:val="0"/>
+          <w:i w:val="0"/>
           <w:sz w:val="24"/>
         </w:rPr>
         <w:t xml:space="preserve">Suspendisse in justo eu magna luctus suscipit. Sed lectus. Integer euismod lacus luctus magna. </w:t>
       </w:r>
       <w:r>
         <w:rPr>
+          <w:rFonts w:ascii="CenturySchoolbook" w:hAnsi="CenturySchoolbook"/>
+          <w:b w:val="0"/>
+          <w:i w:val="0"/>
           <w:sz w:val="24"/>
         </w:rPr>
         <w:t xml:space="preserve">Quisque cursus, metus vitae pharetra auctor, sem massa mattis sem, at interdum magna augue </w:t>
       </w:r>
       <w:r>
         <w:rPr>
+          <w:rFonts w:ascii="CenturySchoolbook" w:hAnsi="CenturySchoolbook"/>
+          <w:b w:val="0"/>
+          <w:i w:val="0"/>
           <w:sz w:val="24"/>
         </w:rPr>
         <w:t xml:space="preserve">eget diam. Vestibulum ante ipsum primis in faucibus orci luctus et ultrices posuere cubilia Curae; </w:t>
       </w:r>
       <w:r>
         <w:rPr>
+          <w:rFonts w:ascii="CenturySchoolbook" w:hAnsi="CenturySchoolbook"/>
+          <w:b w:val="0"/>
+          <w:i w:val="0"/>
           <w:sz w:val="24"/>
         </w:rPr>
         <w:t xml:space="preserve">Morbi lacinia molestie dui. Praesent blandit dolor. Sed non quam. In vel mi sit amet augue congue </w:t>
@@ -579,216 +858,324 @@
     <w:p>
       <w:r>
         <w:rPr>
+          <w:rFonts w:ascii="CenturySchoolbook" w:hAnsi="CenturySchoolbook"/>
+          <w:b w:val="0"/>
+          <w:i w:val="0"/>
           <w:sz w:val="24"/>
         </w:rPr>
         <w:t xml:space="preserve">elementum. Morbi in ipsum sit amet pede facilisis laoreet. Donec lacus nunc, viverra nec, blandit </w:t>
       </w:r>
       <w:r>
         <w:rPr>
+          <w:rFonts w:ascii="CenturySchoolbook" w:hAnsi="CenturySchoolbook"/>
+          <w:b w:val="0"/>
+          <w:i w:val="0"/>
           <w:sz w:val="24"/>
         </w:rPr>
         <w:t xml:space="preserve">vel, egestas et, augue. Vestibulum tincidunt malesuada tellus. Ut ultrices ultrices enim. Curabitur </w:t>
       </w:r>
       <w:r>
         <w:rPr>
+          <w:rFonts w:ascii="CenturySchoolbook" w:hAnsi="CenturySchoolbook"/>
+          <w:b w:val="0"/>
+          <w:i w:val="0"/>
           <w:sz w:val="24"/>
         </w:rPr>
         <w:t xml:space="preserve">sit amet mauris.  </w:t>
       </w:r>
       <w:r>
         <w:rPr>
+          <w:rFonts w:ascii="CenturySchoolbook" w:hAnsi="CenturySchoolbook"/>
+          <w:b w:val="0"/>
+          <w:i w:val="0"/>
           <w:sz w:val="24"/>
         </w:rPr>
         <w:t xml:space="preserve"> </w:t>
       </w:r>
       <w:r>
         <w:rPr>
+          <w:rFonts w:ascii="CenturySchoolbook" w:hAnsi="CenturySchoolbook"/>
+          <w:b w:val="0"/>
+          <w:i w:val="0"/>
           <w:sz w:val="24"/>
         </w:rPr>
         <w:t xml:space="preserve">Morbi in dui quis est pulvinar ullamcorper. Nulla facilisi. Integer lacinia sollicitudin massa. Cras </w:t>
       </w:r>
       <w:r>
         <w:rPr>
+          <w:rFonts w:ascii="CenturySchoolbook" w:hAnsi="CenturySchoolbook"/>
+          <w:b w:val="0"/>
+          <w:i w:val="0"/>
           <w:sz w:val="24"/>
         </w:rPr>
         <w:t xml:space="preserve">metus. Sed aliquet risus a tortor. Integer id quam. Morbi mi. Quisque nisl felis, venenatis tristique, </w:t>
       </w:r>
       <w:r>
         <w:rPr>
+          <w:rFonts w:ascii="CenturySchoolbook" w:hAnsi="CenturySchoolbook"/>
+          <w:b w:val="0"/>
+          <w:i w:val="0"/>
           <w:sz w:val="24"/>
         </w:rPr>
         <w:t xml:space="preserve">dignissim in, ultrices sit amet, augue. Proin sodales libero eget ante. Nulla quam. Aenean laoreet. </w:t>
       </w:r>
       <w:r>
         <w:rPr>
+          <w:rFonts w:ascii="CenturySchoolbook" w:hAnsi="CenturySchoolbook"/>
+          <w:b w:val="0"/>
+          <w:i w:val="0"/>
           <w:sz w:val="24"/>
         </w:rPr>
         <w:t xml:space="preserve">Vestibulum nisi lectus, commodo ac, facilisis ac, ultricies eu, pede. Ut orci risus, accumsan </w:t>
       </w:r>
       <w:r>
         <w:rPr>
+          <w:rFonts w:ascii="CenturySchoolbook" w:hAnsi="CenturySchoolbook"/>
+          <w:b w:val="0"/>
+          <w:i w:val="0"/>
           <w:sz w:val="24"/>
         </w:rPr>
         <w:t xml:space="preserve">porttitor, cursus quis, aliquet eget, justo. Sed pretium blandit orci.  </w:t>
       </w:r>
       <w:r>
         <w:rPr>
+          <w:rFonts w:ascii="CenturySchoolbook" w:hAnsi="CenturySchoolbook"/>
+          <w:b w:val="0"/>
+          <w:i w:val="0"/>
           <w:sz w:val="24"/>
         </w:rPr>
         <w:t xml:space="preserve"> </w:t>
       </w:r>
       <w:r>
         <w:rPr>
+          <w:rFonts w:ascii="CenturySchoolbook" w:hAnsi="CenturySchoolbook"/>
+          <w:b w:val="0"/>
+          <w:i w:val="0"/>
           <w:sz w:val="24"/>
         </w:rPr>
         <w:t xml:space="preserve">Ut eu diam at pede suscipit sodales. Aenean lectus elit, fermentum non, convallis id, sagittis at, </w:t>
       </w:r>
       <w:r>
         <w:rPr>
+          <w:rFonts w:ascii="CenturySchoolbook" w:hAnsi="CenturySchoolbook"/>
+          <w:b w:val="0"/>
+          <w:i w:val="0"/>
           <w:sz w:val="24"/>
         </w:rPr>
         <w:t xml:space="preserve">neque. Nullam mauris orci, aliquet et, iaculis et, viverra vitae, ligula. Nulla ut felis in purus </w:t>
       </w:r>
       <w:r>
         <w:rPr>
+          <w:rFonts w:ascii="CenturySchoolbook" w:hAnsi="CenturySchoolbook"/>
+          <w:b w:val="0"/>
+          <w:i w:val="0"/>
           <w:sz w:val="24"/>
         </w:rPr>
         <w:t xml:space="preserve">aliquam imperdiet. Maecenas aliquet mollis lectus. Vivamus consectetuer risus et tortor. Lorem </w:t>
       </w:r>
       <w:r>
         <w:rPr>
+          <w:rFonts w:ascii="CenturySchoolbook" w:hAnsi="CenturySchoolbook"/>
+          <w:b w:val="0"/>
+          <w:i w:val="0"/>
           <w:sz w:val="24"/>
         </w:rPr>
         <w:t xml:space="preserve">ipsum dolor sit amet, consectetur adipiscing elit. Integer nec odio. Praesent libero. Sed cursus ante </w:t>
       </w:r>
       <w:r>
         <w:rPr>
+          <w:rFonts w:ascii="CenturySchoolbook" w:hAnsi="CenturySchoolbook"/>
+          <w:b w:val="0"/>
+          <w:i w:val="0"/>
           <w:sz w:val="24"/>
         </w:rPr>
         <w:t xml:space="preserve">dapibus diam. Sed nisi. Nulla quis sem at nibh elementum imperdiet. Duis sagittis ipsum. </w:t>
       </w:r>
       <w:r>
         <w:rPr>
+          <w:rFonts w:ascii="CenturySchoolbook" w:hAnsi="CenturySchoolbook"/>
+          <w:b w:val="0"/>
+          <w:i w:val="0"/>
           <w:sz w:val="24"/>
         </w:rPr>
         <w:t xml:space="preserve">Praesent mauris.  </w:t>
       </w:r>
       <w:r>
         <w:rPr>
+          <w:rFonts w:ascii="CenturySchoolbook" w:hAnsi="CenturySchoolbook"/>
+          <w:b w:val="0"/>
+          <w:i w:val="0"/>
           <w:sz w:val="24"/>
         </w:rPr>
         <w:t xml:space="preserve"> </w:t>
       </w:r>
       <w:r>
         <w:rPr>
+          <w:rFonts w:ascii="CenturySchoolbook" w:hAnsi="CenturySchoolbook"/>
+          <w:b w:val="0"/>
+          <w:i w:val="0"/>
           <w:sz w:val="24"/>
         </w:rPr>
         <w:t xml:space="preserve">Fusce nec tellus sed augue semper porta. Mauris massa. Vestibulum lacinia arcu eget nulla. Class </w:t>
       </w:r>
       <w:r>
         <w:rPr>
+          <w:rFonts w:ascii="CenturySchoolbook" w:hAnsi="CenturySchoolbook"/>
+          <w:b w:val="0"/>
+          <w:i w:val="0"/>
           <w:sz w:val="24"/>
         </w:rPr>
         <w:t xml:space="preserve">aptent taciti sociosqu ad litora torquent per conubia nostra, per inceptos himenaeos. Curabitur </w:t>
       </w:r>
       <w:r>
         <w:rPr>
+          <w:rFonts w:ascii="CenturySchoolbook" w:hAnsi="CenturySchoolbook"/>
+          <w:b w:val="0"/>
+          <w:i w:val="0"/>
           <w:sz w:val="24"/>
         </w:rPr>
         <w:t xml:space="preserve">sodales ligula in libero. Sed dignissim lacinia nunc. Curabitur tortor. Pellentesque nibh. Aenean </w:t>
       </w:r>
       <w:r>
         <w:rPr>
+          <w:rFonts w:ascii="CenturySchoolbook" w:hAnsi="CenturySchoolbook"/>
+          <w:b w:val="0"/>
+          <w:i w:val="0"/>
           <w:sz w:val="24"/>
         </w:rPr>
         <w:t xml:space="preserve">quam. In scelerisque sem at dolor. Maecenas mattis. Sed convallis tristique sem.  </w:t>
       </w:r>
       <w:r>
         <w:rPr>
+          <w:rFonts w:ascii="CenturySchoolbook" w:hAnsi="CenturySchoolbook"/>
+          <w:b w:val="0"/>
+          <w:i w:val="0"/>
           <w:sz w:val="24"/>
         </w:rPr>
         <w:t xml:space="preserve"> </w:t>
       </w:r>
       <w:r>
         <w:rPr>
+          <w:rFonts w:ascii="CenturySchoolbook" w:hAnsi="CenturySchoolbook"/>
+          <w:b w:val="0"/>
+          <w:i w:val="0"/>
           <w:sz w:val="24"/>
         </w:rPr>
         <w:t xml:space="preserve">Proin ut ligula vel nunc egestas porttitor. Morbi lectus risus, iaculis vel, suscipit quis, luctus non, </w:t>
       </w:r>
       <w:r>
         <w:rPr>
+          <w:rFonts w:ascii="CenturySchoolbook" w:hAnsi="CenturySchoolbook"/>
+          <w:b w:val="0"/>
+          <w:i w:val="0"/>
           <w:sz w:val="24"/>
         </w:rPr>
         <w:t xml:space="preserve">massa. Fusce ac turpis quis ligula lacinia aliquet. Mauris ipsum. Nulla metus metus, ullamcorper </w:t>
       </w:r>
       <w:r>
         <w:rPr>
+          <w:rFonts w:ascii="CenturySchoolbook" w:hAnsi="CenturySchoolbook"/>
+          <w:b w:val="0"/>
+          <w:i w:val="0"/>
           <w:sz w:val="24"/>
         </w:rPr>
         <w:t xml:space="preserve">vel, tincidunt sed, euismod in, nibh. Quisque volutpat condimentum velit. Class aptent taciti </w:t>
       </w:r>
       <w:r>
         <w:rPr>
+          <w:rFonts w:ascii="CenturySchoolbook" w:hAnsi="CenturySchoolbook"/>
+          <w:b w:val="0"/>
+          <w:i w:val="0"/>
           <w:sz w:val="24"/>
         </w:rPr>
         <w:t xml:space="preserve">sociosqu ad litora torquent per conubia nostra, per inceptos himenaeos. Nam nec ante. Sed lacinia, </w:t>
       </w:r>
       <w:r>
         <w:rPr>
+          <w:rFonts w:ascii="CenturySchoolbook" w:hAnsi="CenturySchoolbook"/>
+          <w:b w:val="0"/>
+          <w:i w:val="0"/>
           <w:sz w:val="24"/>
         </w:rPr>
         <w:t xml:space="preserve">urna non tincidunt mattis, tortor neque adipiscing diam, a cursus ipsum ante quis turpis. Nulla </w:t>
       </w:r>
       <w:r>
         <w:rPr>
+          <w:rFonts w:ascii="CenturySchoolbook" w:hAnsi="CenturySchoolbook"/>
+          <w:b w:val="0"/>
+          <w:i w:val="0"/>
           <w:sz w:val="24"/>
         </w:rPr>
         <w:t xml:space="preserve">facilisi. Ut fringilla. Suspendisse potenti.  </w:t>
       </w:r>
       <w:r>
         <w:rPr>
+          <w:rFonts w:ascii="CenturySchoolbook" w:hAnsi="CenturySchoolbook"/>
+          <w:b w:val="0"/>
+          <w:i w:val="0"/>
           <w:sz w:val="24"/>
         </w:rPr>
         <w:t xml:space="preserve"> </w:t>
       </w:r>
       <w:r>
         <w:rPr>
+          <w:rFonts w:ascii="CenturySchoolbook" w:hAnsi="CenturySchoolbook"/>
+          <w:b w:val="0"/>
+          <w:i w:val="0"/>
           <w:sz w:val="24"/>
         </w:rPr>
         <w:t xml:space="preserve">Nunc feugiat mi a tellus consequat imperdiet. Vestibulum sapien. Proin quam. Etiam ultrices. </w:t>
       </w:r>
       <w:r>
         <w:rPr>
+          <w:rFonts w:ascii="CenturySchoolbook" w:hAnsi="CenturySchoolbook"/>
+          <w:b w:val="0"/>
+          <w:i w:val="0"/>
           <w:sz w:val="24"/>
         </w:rPr>
         <w:t xml:space="preserve">Suspendisse in justo eu magna luctus suscipit. Sed lectus. Integer euismod lacus luctus magna. </w:t>
       </w:r>
       <w:r>
         <w:rPr>
+          <w:rFonts w:ascii="CenturySchoolbook" w:hAnsi="CenturySchoolbook"/>
+          <w:b w:val="0"/>
+          <w:i w:val="0"/>
           <w:sz w:val="24"/>
         </w:rPr>
         <w:t xml:space="preserve">Quisque cursus, metus vitae pharetra auctor, sem massa mattis sem, at interdum magna augue </w:t>
       </w:r>
       <w:r>
         <w:rPr>
+          <w:rFonts w:ascii="CenturySchoolbook" w:hAnsi="CenturySchoolbook"/>
+          <w:b w:val="0"/>
+          <w:i w:val="0"/>
           <w:sz w:val="24"/>
         </w:rPr>
         <w:t xml:space="preserve">eget diam. Vestibulum ante ipsum primis in faucibus orci luctus et ultrices posuere cubilia Curae; </w:t>
       </w:r>
       <w:r>
         <w:rPr>
+          <w:rFonts w:ascii="CenturySchoolbook" w:hAnsi="CenturySchoolbook"/>
+          <w:b w:val="0"/>
+          <w:i w:val="0"/>
           <w:sz w:val="24"/>
         </w:rPr>
         <w:t xml:space="preserve">Morbi lacinia molestie dui. Praesent blandit dolor. Sed non quam. In vel mi sit amet augue congue </w:t>
       </w:r>
       <w:r>
         <w:rPr>
+          <w:rFonts w:ascii="CenturySchoolbook" w:hAnsi="CenturySchoolbook"/>
+          <w:b w:val="0"/>
+          <w:i w:val="0"/>
           <w:sz w:val="24"/>
         </w:rPr>
         <w:t xml:space="preserve">elementum. Morbi in ipsum sit amet pede facilisis laoreet.  </w:t>
       </w:r>
       <w:r>
         <w:rPr>
+          <w:rFonts w:ascii="CenturySchoolbook" w:hAnsi="CenturySchoolbook"/>
+          <w:b w:val="0"/>
+          <w:i w:val="0"/>
           <w:sz w:val="24"/>
         </w:rPr>
         <w:t xml:space="preserve"> </w:t>

</xml_diff>

<commit_message>
Step 35 - Fix typography runs and preserve font color
</commit_message>
<xml_diff>
--- a/output/output.docx
+++ b/output/output.docx
@@ -3,24 +3,35 @@
 <w:document xmlns:wpc="http://schemas.microsoft.com/office/word/2010/wordprocessingCanvas" xmlns:mo="http://schemas.microsoft.com/office/mac/office/2008/main" xmlns:mc="http://schemas.openxmlformats.org/markup-compatibility/2006" xmlns:mv="urn:schemas-microsoft-com:mac:vml" xmlns:o="urn:schemas-microsoft-com:office:office" xmlns:r="http://schemas.openxmlformats.org/officeDocument/2006/relationships" xmlns:m="http://schemas.openxmlformats.org/officeDocument/2006/math" xmlns:v="urn:schemas-microsoft-com:vml" xmlns:wp14="http://schemas.microsoft.com/office/word/2010/wordprocessingDrawing" xmlns:wp="http://schemas.openxmlformats.org/drawingml/2006/wordprocessingDrawing" xmlns:w10="urn:schemas-microsoft-com:office:word" xmlns:w="http://schemas.openxmlformats.org/wordprocessingml/2006/main" xmlns:w14="http://schemas.microsoft.com/office/word/2010/wordml" xmlns:wpg="http://schemas.microsoft.com/office/word/2010/wordprocessingGroup" xmlns:wpi="http://schemas.microsoft.com/office/word/2010/wordprocessingInk" xmlns:wne="http://schemas.microsoft.com/office/word/2006/wordml" xmlns:wps="http://schemas.microsoft.com/office/word/2010/wordprocessingShape" mc:Ignorable="w14 wp14">
   <w:body>
     <w:p>
+      <w:pPr>
+        <w:jc w:val="left"/>
+      </w:pPr>
       <w:r>
         <w:rPr>
           <w:rFonts w:ascii="CenturySchoolbook-Bold" w:hAnsi="CenturySchoolbook-Bold"/>
           <w:b/>
           <w:i w:val="0"/>
+          <w:color w:val="2E74B5"/>
           <w:sz w:val="72"/>
         </w:rPr>
         <w:t xml:space="preserve">Sample PDF </w:t>
       </w:r>
     </w:p>
     <w:p>
+      <w:pPr>
+        <w:jc w:val="left"/>
+      </w:pPr>
       <w:r>
         <w:rPr>
           <w:rFonts w:ascii="CenturySchoolbook" w:hAnsi="CenturySchoolbook"/>
           <w:b w:val="0"/>
           <w:i w:val="0"/>
+          <w:color w:val="000000"/>
           <w:sz w:val="24"/>
         </w:rPr>
+        <w:t xml:space="preserve"> </w:t>
+      </w:r>
+      <w:r>
         <w:t xml:space="preserve"> </w:t>
       </w:r>
       <w:r>
@@ -28,6 +39,7 @@
           <w:rFonts w:ascii="CenturySchoolbook" w:hAnsi="CenturySchoolbook"/>
           <w:b w:val="0"/>
           <w:i w:val="0"/>
+          <w:color w:val="000000"/>
           <w:sz w:val="36"/>
         </w:rPr>
         <w:t xml:space="preserve">Created for testing </w:t>
@@ -37,6 +49,7 @@
           <w:rFonts w:ascii="CenturySchoolbook" w:hAnsi="CenturySchoolbook"/>
           <w:b w:val="0"/>
           <w:i w:val="0"/>
+          <w:color w:val="5B9BD5"/>
           <w:sz w:val="36"/>
         </w:rPr>
         <w:t>PDFObject</w:t>
@@ -46,8 +59,12 @@
           <w:rFonts w:ascii="CenturySchoolbook" w:hAnsi="CenturySchoolbook"/>
           <w:b w:val="0"/>
           <w:i w:val="0"/>
+          <w:color w:val="000000"/>
           <w:sz w:val="36"/>
         </w:rPr>
+        <w:t xml:space="preserve"> </w:t>
+      </w:r>
+      <w:r>
         <w:t xml:space="preserve"> </w:t>
       </w:r>
       <w:r>
@@ -55,8 +72,12 @@
           <w:rFonts w:ascii="CenturySchoolbook" w:hAnsi="CenturySchoolbook"/>
           <w:b w:val="0"/>
           <w:i w:val="0"/>
+          <w:color w:val="000000"/>
           <w:sz w:val="24"/>
         </w:rPr>
+        <w:t xml:space="preserve"> </w:t>
+      </w:r>
+      <w:r>
         <w:t xml:space="preserve"> </w:t>
       </w:r>
       <w:r>
@@ -64,53 +85,12 @@
           <w:rFonts w:ascii="CenturySchoolbook" w:hAnsi="CenturySchoolbook"/>
           <w:b w:val="0"/>
           <w:i w:val="0"/>
+          <w:color w:val="000000"/>
           <w:sz w:val="31"/>
         </w:rPr>
         <w:t xml:space="preserve">This PDF is three pages long. Three long pages. Or three short pages if </w:t>
       </w:r>
       <w:r>
-        <w:rPr>
-          <w:rFonts w:ascii="CenturySchoolbook" w:hAnsi="CenturySchoolbook"/>
-          <w:b w:val="0"/>
-          <w:i w:val="0"/>
-          <w:sz w:val="31"/>
-        </w:rPr>
-        <w:t xml:space="preserve">you’re optimistic. Is it the same as saying “three long minutes”, knowing </w:t>
-      </w:r>
-      <w:r>
-        <w:rPr>
-          <w:rFonts w:ascii="CenturySchoolbook" w:hAnsi="CenturySchoolbook"/>
-          <w:b w:val="0"/>
-          <w:i w:val="0"/>
-          <w:sz w:val="31"/>
-        </w:rPr>
-        <w:t xml:space="preserve">that all minutes are the same duration, and one cannot possibly be longer </w:t>
-      </w:r>
-      <w:r>
-        <w:rPr>
-          <w:rFonts w:ascii="CenturySchoolbook" w:hAnsi="CenturySchoolbook"/>
-          <w:b w:val="0"/>
-          <w:i w:val="0"/>
-          <w:sz w:val="31"/>
-        </w:rPr>
-        <w:t xml:space="preserve">than the other? If these pages are all the same size, can one possibly be </w:t>
-      </w:r>
-      <w:r>
-        <w:rPr>
-          <w:rFonts w:ascii="CenturySchoolbook" w:hAnsi="CenturySchoolbook"/>
-          <w:b w:val="0"/>
-          <w:i w:val="0"/>
-          <w:sz w:val="31"/>
-        </w:rPr>
-        <w:t xml:space="preserve">longer than the other? </w:t>
-      </w:r>
-      <w:r>
-        <w:rPr>
-          <w:rFonts w:ascii="CenturySchoolbook" w:hAnsi="CenturySchoolbook"/>
-          <w:b w:val="0"/>
-          <w:i w:val="0"/>
-          <w:sz w:val="24"/>
-        </w:rPr>
         <w:t xml:space="preserve"> </w:t>
       </w:r>
       <w:r>
@@ -118,53 +98,12 @@
           <w:rFonts w:ascii="CenturySchoolbook" w:hAnsi="CenturySchoolbook"/>
           <w:b w:val="0"/>
           <w:i w:val="0"/>
-          <w:sz w:val="24"/>
+          <w:color w:val="000000"/>
+          <w:sz w:val="31"/>
         </w:rPr>
-        <w:t xml:space="preserve">I digress. Here’s some Latin. Lorem ipsum dolor sit amet, consectetur adipiscing elit. Integer nec </w:t>
+        <w:t xml:space="preserve">you’re optimistic. Is it the same as saying “three long minutes”, knowing </w:t>
       </w:r>
       <w:r>
-        <w:rPr>
-          <w:rFonts w:ascii="CenturySchoolbook" w:hAnsi="CenturySchoolbook"/>
-          <w:b w:val="0"/>
-          <w:i w:val="0"/>
-          <w:sz w:val="24"/>
-        </w:rPr>
-        <w:t xml:space="preserve">odio. Praesent libero. Sed cursus ante dapibus diam. Sed nisi. Nulla quis sem at nibh elementum </w:t>
-      </w:r>
-      <w:r>
-        <w:rPr>
-          <w:rFonts w:ascii="CenturySchoolbook" w:hAnsi="CenturySchoolbook"/>
-          <w:b w:val="0"/>
-          <w:i w:val="0"/>
-          <w:sz w:val="24"/>
-        </w:rPr>
-        <w:t xml:space="preserve">imperdiet. Duis sagittis ipsum. Praesent mauris. Fusce nec tellus sed augue semper porta. Mauris </w:t>
-      </w:r>
-      <w:r>
-        <w:rPr>
-          <w:rFonts w:ascii="CenturySchoolbook" w:hAnsi="CenturySchoolbook"/>
-          <w:b w:val="0"/>
-          <w:i w:val="0"/>
-          <w:sz w:val="24"/>
-        </w:rPr>
-        <w:t xml:space="preserve">massa. Vestibulum lacinia arcu eget nulla. Class aptent taciti sociosqu ad litora torquent per </w:t>
-      </w:r>
-      <w:r>
-        <w:rPr>
-          <w:rFonts w:ascii="CenturySchoolbook" w:hAnsi="CenturySchoolbook"/>
-          <w:b w:val="0"/>
-          <w:i w:val="0"/>
-          <w:sz w:val="24"/>
-        </w:rPr>
-        <w:t xml:space="preserve">conubia nostra, per inceptos himenaeos. Curabitur sodales ligula in libero.  </w:t>
-      </w:r>
-      <w:r>
-        <w:rPr>
-          <w:rFonts w:ascii="CenturySchoolbook" w:hAnsi="CenturySchoolbook"/>
-          <w:b w:val="0"/>
-          <w:i w:val="0"/>
-          <w:sz w:val="24"/>
-        </w:rPr>
         <w:t xml:space="preserve"> </w:t>
       </w:r>
       <w:r>
@@ -172,44 +111,12 @@
           <w:rFonts w:ascii="CenturySchoolbook" w:hAnsi="CenturySchoolbook"/>
           <w:b w:val="0"/>
           <w:i w:val="0"/>
-          <w:sz w:val="24"/>
+          <w:color w:val="000000"/>
+          <w:sz w:val="31"/>
         </w:rPr>
-        <w:t xml:space="preserve">Sed dignissim lacinia nunc. Curabitur tortor. Pellentesque nibh. Aenean quam. In scelerisque sem </w:t>
+        <w:t xml:space="preserve">that all minutes are the same duration, and one cannot possibly be longer </w:t>
       </w:r>
       <w:r>
-        <w:rPr>
-          <w:rFonts w:ascii="CenturySchoolbook" w:hAnsi="CenturySchoolbook"/>
-          <w:b w:val="0"/>
-          <w:i w:val="0"/>
-          <w:sz w:val="24"/>
-        </w:rPr>
-        <w:t xml:space="preserve">at dolor. Maecenas mattis. Sed convallis tristique sem. Proin ut ligula vel nunc egestas porttitor. </w:t>
-      </w:r>
-      <w:r>
-        <w:rPr>
-          <w:rFonts w:ascii="CenturySchoolbook" w:hAnsi="CenturySchoolbook"/>
-          <w:b w:val="0"/>
-          <w:i w:val="0"/>
-          <w:sz w:val="24"/>
-        </w:rPr>
-        <w:t xml:space="preserve">Morbi lectus risus, iaculis vel, suscipit quis, luctus non, massa. Fusce ac turpis quis ligula lacinia </w:t>
-      </w:r>
-      <w:r>
-        <w:rPr>
-          <w:rFonts w:ascii="CenturySchoolbook" w:hAnsi="CenturySchoolbook"/>
-          <w:b w:val="0"/>
-          <w:i w:val="0"/>
-          <w:sz w:val="24"/>
-        </w:rPr>
-        <w:t xml:space="preserve">aliquet. Mauris ipsum. Nulla metus metus, ullamcorper vel, tincidunt sed, euismod in, nibh.  </w:t>
-      </w:r>
-      <w:r>
-        <w:rPr>
-          <w:rFonts w:ascii="CenturySchoolbook" w:hAnsi="CenturySchoolbook"/>
-          <w:b w:val="0"/>
-          <w:i w:val="0"/>
-          <w:sz w:val="24"/>
-        </w:rPr>
         <w:t xml:space="preserve"> </w:t>
       </w:r>
       <w:r>
@@ -217,44 +124,12 @@
           <w:rFonts w:ascii="CenturySchoolbook" w:hAnsi="CenturySchoolbook"/>
           <w:b w:val="0"/>
           <w:i w:val="0"/>
-          <w:sz w:val="24"/>
+          <w:color w:val="000000"/>
+          <w:sz w:val="31"/>
         </w:rPr>
-        <w:t xml:space="preserve">Quisque volutpat condimentum velit. Class aptent taciti sociosqu ad litora torquent per conubia </w:t>
+        <w:t xml:space="preserve">than the other? If these pages are all the same size, can one possibly be </w:t>
       </w:r>
       <w:r>
-        <w:rPr>
-          <w:rFonts w:ascii="CenturySchoolbook" w:hAnsi="CenturySchoolbook"/>
-          <w:b w:val="0"/>
-          <w:i w:val="0"/>
-          <w:sz w:val="24"/>
-        </w:rPr>
-        <w:t xml:space="preserve">nostra, per inceptos himenaeos. Nam nec ante. Sed lacinia, urna non tincidunt mattis, tortor neque </w:t>
-      </w:r>
-      <w:r>
-        <w:rPr>
-          <w:rFonts w:ascii="CenturySchoolbook" w:hAnsi="CenturySchoolbook"/>
-          <w:b w:val="0"/>
-          <w:i w:val="0"/>
-          <w:sz w:val="24"/>
-        </w:rPr>
-        <w:t xml:space="preserve">adipiscing diam, a cursus ipsum ante quis turpis. Nulla facilisi. Ut fringilla. Suspendisse potenti. </w:t>
-      </w:r>
-      <w:r>
-        <w:rPr>
-          <w:rFonts w:ascii="CenturySchoolbook" w:hAnsi="CenturySchoolbook"/>
-          <w:b w:val="0"/>
-          <w:i w:val="0"/>
-          <w:sz w:val="24"/>
-        </w:rPr>
-        <w:t xml:space="preserve">Nunc feugiat mi a tellus consequat imperdiet. Vestibulum sapien. Proin quam. Etiam ultrices.  </w:t>
-      </w:r>
-      <w:r>
-        <w:rPr>
-          <w:rFonts w:ascii="CenturySchoolbook" w:hAnsi="CenturySchoolbook"/>
-          <w:b w:val="0"/>
-          <w:i w:val="0"/>
-          <w:sz w:val="24"/>
-        </w:rPr>
         <w:t xml:space="preserve"> </w:t>
       </w:r>
       <w:r>
@@ -262,71 +137,12 @@
           <w:rFonts w:ascii="CenturySchoolbook" w:hAnsi="CenturySchoolbook"/>
           <w:b w:val="0"/>
           <w:i w:val="0"/>
-          <w:sz w:val="24"/>
+          <w:color w:val="000000"/>
+          <w:sz w:val="31"/>
         </w:rPr>
-        <w:t xml:space="preserve">Suspendisse in justo eu magna luctus suscipit. Sed lectus. Integer euismod lacus luctus magna. </w:t>
+        <w:t xml:space="preserve">longer than the other? </w:t>
       </w:r>
       <w:r>
-        <w:rPr>
-          <w:rFonts w:ascii="CenturySchoolbook" w:hAnsi="CenturySchoolbook"/>
-          <w:b w:val="0"/>
-          <w:i w:val="0"/>
-          <w:sz w:val="24"/>
-        </w:rPr>
-        <w:t xml:space="preserve">Quisque cursus, metus vitae pharetra auctor, sem massa mattis sem, at interdum magna augue </w:t>
-      </w:r>
-      <w:r>
-        <w:rPr>
-          <w:rFonts w:ascii="CenturySchoolbook" w:hAnsi="CenturySchoolbook"/>
-          <w:b w:val="0"/>
-          <w:i w:val="0"/>
-          <w:sz w:val="24"/>
-        </w:rPr>
-        <w:t xml:space="preserve">eget diam. Vestibulum ante ipsum primis in faucibus orci luctus et ultrices posuere cubilia Curae; </w:t>
-      </w:r>
-      <w:r>
-        <w:rPr>
-          <w:rFonts w:ascii="CenturySchoolbook" w:hAnsi="CenturySchoolbook"/>
-          <w:b w:val="0"/>
-          <w:i w:val="0"/>
-          <w:sz w:val="24"/>
-        </w:rPr>
-        <w:t xml:space="preserve">Morbi lacinia molestie dui. Praesent blandit dolor. Sed non quam. In vel mi sit amet augue congue </w:t>
-      </w:r>
-      <w:r>
-        <w:rPr>
-          <w:rFonts w:ascii="CenturySchoolbook" w:hAnsi="CenturySchoolbook"/>
-          <w:b w:val="0"/>
-          <w:i w:val="0"/>
-          <w:sz w:val="24"/>
-        </w:rPr>
-        <w:t xml:space="preserve">elementum. Morbi in ipsum sit amet pede facilisis laoreet. Donec lacus nunc, viverra nec, blandit </w:t>
-      </w:r>
-      <w:r>
-        <w:rPr>
-          <w:rFonts w:ascii="CenturySchoolbook" w:hAnsi="CenturySchoolbook"/>
-          <w:b w:val="0"/>
-          <w:i w:val="0"/>
-          <w:sz w:val="24"/>
-        </w:rPr>
-        <w:t xml:space="preserve">vel, egestas et, augue. Vestibulum tincidunt malesuada tellus. Ut ultrices ultrices enim. Curabitur </w:t>
-      </w:r>
-      <w:r>
-        <w:rPr>
-          <w:rFonts w:ascii="CenturySchoolbook" w:hAnsi="CenturySchoolbook"/>
-          <w:b w:val="0"/>
-          <w:i w:val="0"/>
-          <w:sz w:val="24"/>
-        </w:rPr>
-        <w:t xml:space="preserve">sit amet mauris.  </w:t>
-      </w:r>
-      <w:r>
-        <w:rPr>
-          <w:rFonts w:ascii="CenturySchoolbook" w:hAnsi="CenturySchoolbook"/>
-          <w:b w:val="0"/>
-          <w:i w:val="0"/>
-          <w:sz w:val="24"/>
-        </w:rPr>
         <w:t xml:space="preserve"> </w:t>
       </w:r>
       <w:r>
@@ -334,53 +150,12 @@
           <w:rFonts w:ascii="CenturySchoolbook" w:hAnsi="CenturySchoolbook"/>
           <w:b w:val="0"/>
           <w:i w:val="0"/>
+          <w:color w:val="000000"/>
           <w:sz w:val="24"/>
         </w:rPr>
-        <w:t xml:space="preserve">Morbi in dui quis est pulvinar ullamcorper. Nulla facilisi. Integer lacinia sollicitudin massa. Cras </w:t>
+        <w:t xml:space="preserve"> </w:t>
       </w:r>
       <w:r>
-        <w:rPr>
-          <w:rFonts w:ascii="CenturySchoolbook" w:hAnsi="CenturySchoolbook"/>
-          <w:b w:val="0"/>
-          <w:i w:val="0"/>
-          <w:sz w:val="24"/>
-        </w:rPr>
-        <w:t xml:space="preserve">metus. Sed aliquet risus a tortor. Integer id quam. Morbi mi. Quisque nisl felis, venenatis tristique, </w:t>
-      </w:r>
-      <w:r>
-        <w:rPr>
-          <w:rFonts w:ascii="CenturySchoolbook" w:hAnsi="CenturySchoolbook"/>
-          <w:b w:val="0"/>
-          <w:i w:val="0"/>
-          <w:sz w:val="24"/>
-        </w:rPr>
-        <w:t xml:space="preserve">dignissim in, ultrices sit amet, augue. Proin sodales libero eget ante. Nulla quam. Aenean laoreet. </w:t>
-      </w:r>
-      <w:r>
-        <w:rPr>
-          <w:rFonts w:ascii="CenturySchoolbook" w:hAnsi="CenturySchoolbook"/>
-          <w:b w:val="0"/>
-          <w:i w:val="0"/>
-          <w:sz w:val="24"/>
-        </w:rPr>
-        <w:t xml:space="preserve">Vestibulum nisi lectus, commodo ac, facilisis ac, ultricies eu, pede. Ut orci risus, accumsan </w:t>
-      </w:r>
-      <w:r>
-        <w:rPr>
-          <w:rFonts w:ascii="CenturySchoolbook" w:hAnsi="CenturySchoolbook"/>
-          <w:b w:val="0"/>
-          <w:i w:val="0"/>
-          <w:sz w:val="24"/>
-        </w:rPr>
-        <w:t xml:space="preserve">porttitor, cursus quis, aliquet eget, justo. Sed pretium blandit orci.  </w:t>
-      </w:r>
-      <w:r>
-        <w:rPr>
-          <w:rFonts w:ascii="CenturySchoolbook" w:hAnsi="CenturySchoolbook"/>
-          <w:b w:val="0"/>
-          <w:i w:val="0"/>
-          <w:sz w:val="24"/>
-        </w:rPr>
         <w:t xml:space="preserve"> </w:t>
       </w:r>
       <w:r>
@@ -388,24 +163,423 @@
           <w:rFonts w:ascii="CenturySchoolbook" w:hAnsi="CenturySchoolbook"/>
           <w:b w:val="0"/>
           <w:i w:val="0"/>
+          <w:color w:val="000000"/>
           <w:sz w:val="24"/>
         </w:rPr>
-        <w:t xml:space="preserve">Ut eu diam at pede suscipit sodales. Aenean lectus elit, fermentum non, convallis id, sagittis at, </w:t>
+        <w:t xml:space="preserve">I digress. Here’s some Latin. Lorem ipsum dolor sit amet, consectetur adipiscing elit. Integer nec </w:t>
+      </w:r>
+      <w:r>
+        <w:t xml:space="preserve"> </w:t>
       </w:r>
       <w:r>
         <w:rPr>
           <w:rFonts w:ascii="CenturySchoolbook" w:hAnsi="CenturySchoolbook"/>
           <w:b w:val="0"/>
           <w:i w:val="0"/>
+          <w:color w:val="000000"/>
           <w:sz w:val="24"/>
         </w:rPr>
-        <w:t xml:space="preserve">neque. Nullam mauris orci, aliquet et, iaculis et, viverra vitae, ligula. Nulla ut felis in purus </w:t>
+        <w:t xml:space="preserve">odio. Praesent libero. Sed cursus ante dapibus diam. Sed nisi. Nulla quis sem at nibh elementum </w:t>
+      </w:r>
+      <w:r>
+        <w:t xml:space="preserve"> </w:t>
       </w:r>
       <w:r>
         <w:rPr>
           <w:rFonts w:ascii="CenturySchoolbook" w:hAnsi="CenturySchoolbook"/>
           <w:b w:val="0"/>
           <w:i w:val="0"/>
+          <w:color w:val="000000"/>
+          <w:sz w:val="24"/>
+        </w:rPr>
+        <w:t xml:space="preserve">imperdiet. Duis sagittis ipsum. Praesent mauris. Fusce nec tellus sed augue semper porta. Mauris </w:t>
+      </w:r>
+      <w:r>
+        <w:t xml:space="preserve"> </w:t>
+      </w:r>
+      <w:r>
+        <w:rPr>
+          <w:rFonts w:ascii="CenturySchoolbook" w:hAnsi="CenturySchoolbook"/>
+          <w:b w:val="0"/>
+          <w:i w:val="0"/>
+          <w:color w:val="000000"/>
+          <w:sz w:val="24"/>
+        </w:rPr>
+        <w:t xml:space="preserve">massa. Vestibulum lacinia arcu eget nulla. Class aptent taciti sociosqu ad litora torquent per </w:t>
+      </w:r>
+      <w:r>
+        <w:t xml:space="preserve"> </w:t>
+      </w:r>
+      <w:r>
+        <w:rPr>
+          <w:rFonts w:ascii="CenturySchoolbook" w:hAnsi="CenturySchoolbook"/>
+          <w:b w:val="0"/>
+          <w:i w:val="0"/>
+          <w:color w:val="000000"/>
+          <w:sz w:val="24"/>
+        </w:rPr>
+        <w:t xml:space="preserve">conubia nostra, per inceptos himenaeos. Curabitur sodales ligula in libero.  </w:t>
+      </w:r>
+      <w:r>
+        <w:t xml:space="preserve"> </w:t>
+      </w:r>
+      <w:r>
+        <w:rPr>
+          <w:rFonts w:ascii="CenturySchoolbook" w:hAnsi="CenturySchoolbook"/>
+          <w:b w:val="0"/>
+          <w:i w:val="0"/>
+          <w:color w:val="000000"/>
+          <w:sz w:val="24"/>
+        </w:rPr>
+        <w:t xml:space="preserve"> </w:t>
+      </w:r>
+      <w:r>
+        <w:t xml:space="preserve"> </w:t>
+      </w:r>
+      <w:r>
+        <w:rPr>
+          <w:rFonts w:ascii="CenturySchoolbook" w:hAnsi="CenturySchoolbook"/>
+          <w:b w:val="0"/>
+          <w:i w:val="0"/>
+          <w:color w:val="000000"/>
+          <w:sz w:val="24"/>
+        </w:rPr>
+        <w:t xml:space="preserve">Sed dignissim lacinia nunc. Curabitur tortor. Pellentesque nibh. Aenean quam. In scelerisque sem </w:t>
+      </w:r>
+      <w:r>
+        <w:t xml:space="preserve"> </w:t>
+      </w:r>
+      <w:r>
+        <w:rPr>
+          <w:rFonts w:ascii="CenturySchoolbook" w:hAnsi="CenturySchoolbook"/>
+          <w:b w:val="0"/>
+          <w:i w:val="0"/>
+          <w:color w:val="000000"/>
+          <w:sz w:val="24"/>
+        </w:rPr>
+        <w:t xml:space="preserve">at dolor. Maecenas mattis. Sed convallis tristique sem. Proin ut ligula vel nunc egestas porttitor. </w:t>
+      </w:r>
+      <w:r>
+        <w:t xml:space="preserve"> </w:t>
+      </w:r>
+      <w:r>
+        <w:rPr>
+          <w:rFonts w:ascii="CenturySchoolbook" w:hAnsi="CenturySchoolbook"/>
+          <w:b w:val="0"/>
+          <w:i w:val="0"/>
+          <w:color w:val="000000"/>
+          <w:sz w:val="24"/>
+        </w:rPr>
+        <w:t xml:space="preserve">Morbi lectus risus, iaculis vel, suscipit quis, luctus non, massa. Fusce ac turpis quis ligula lacinia </w:t>
+      </w:r>
+      <w:r>
+        <w:t xml:space="preserve"> </w:t>
+      </w:r>
+      <w:r>
+        <w:rPr>
+          <w:rFonts w:ascii="CenturySchoolbook" w:hAnsi="CenturySchoolbook"/>
+          <w:b w:val="0"/>
+          <w:i w:val="0"/>
+          <w:color w:val="000000"/>
+          <w:sz w:val="24"/>
+        </w:rPr>
+        <w:t xml:space="preserve">aliquet. Mauris ipsum. Nulla metus metus, ullamcorper vel, tincidunt sed, euismod in, nibh.  </w:t>
+      </w:r>
+      <w:r>
+        <w:t xml:space="preserve"> </w:t>
+      </w:r>
+      <w:r>
+        <w:rPr>
+          <w:rFonts w:ascii="CenturySchoolbook" w:hAnsi="CenturySchoolbook"/>
+          <w:b w:val="0"/>
+          <w:i w:val="0"/>
+          <w:color w:val="000000"/>
+          <w:sz w:val="24"/>
+        </w:rPr>
+        <w:t xml:space="preserve"> </w:t>
+      </w:r>
+      <w:r>
+        <w:t xml:space="preserve"> </w:t>
+      </w:r>
+      <w:r>
+        <w:rPr>
+          <w:rFonts w:ascii="CenturySchoolbook" w:hAnsi="CenturySchoolbook"/>
+          <w:b w:val="0"/>
+          <w:i w:val="0"/>
+          <w:color w:val="000000"/>
+          <w:sz w:val="24"/>
+        </w:rPr>
+        <w:t xml:space="preserve">Quisque volutpat condimentum velit. Class aptent taciti sociosqu ad litora torquent per conubia </w:t>
+      </w:r>
+      <w:r>
+        <w:t xml:space="preserve"> </w:t>
+      </w:r>
+      <w:r>
+        <w:rPr>
+          <w:rFonts w:ascii="CenturySchoolbook" w:hAnsi="CenturySchoolbook"/>
+          <w:b w:val="0"/>
+          <w:i w:val="0"/>
+          <w:color w:val="000000"/>
+          <w:sz w:val="24"/>
+        </w:rPr>
+        <w:t xml:space="preserve">nostra, per inceptos himenaeos. Nam nec ante. Sed lacinia, urna non tincidunt mattis, tortor neque </w:t>
+      </w:r>
+      <w:r>
+        <w:t xml:space="preserve"> </w:t>
+      </w:r>
+      <w:r>
+        <w:rPr>
+          <w:rFonts w:ascii="CenturySchoolbook" w:hAnsi="CenturySchoolbook"/>
+          <w:b w:val="0"/>
+          <w:i w:val="0"/>
+          <w:color w:val="000000"/>
+          <w:sz w:val="24"/>
+        </w:rPr>
+        <w:t xml:space="preserve">adipiscing diam, a cursus ipsum ante quis turpis. Nulla facilisi. Ut fringilla. Suspendisse potenti. </w:t>
+      </w:r>
+      <w:r>
+        <w:t xml:space="preserve"> </w:t>
+      </w:r>
+      <w:r>
+        <w:rPr>
+          <w:rFonts w:ascii="CenturySchoolbook" w:hAnsi="CenturySchoolbook"/>
+          <w:b w:val="0"/>
+          <w:i w:val="0"/>
+          <w:color w:val="000000"/>
+          <w:sz w:val="24"/>
+        </w:rPr>
+        <w:t xml:space="preserve">Nunc feugiat mi a tellus consequat imperdiet. Vestibulum sapien. Proin quam. Etiam ultrices.  </w:t>
+      </w:r>
+      <w:r>
+        <w:t xml:space="preserve"> </w:t>
+      </w:r>
+      <w:r>
+        <w:rPr>
+          <w:rFonts w:ascii="CenturySchoolbook" w:hAnsi="CenturySchoolbook"/>
+          <w:b w:val="0"/>
+          <w:i w:val="0"/>
+          <w:color w:val="000000"/>
+          <w:sz w:val="24"/>
+        </w:rPr>
+        <w:t xml:space="preserve"> </w:t>
+      </w:r>
+      <w:r>
+        <w:t xml:space="preserve"> </w:t>
+      </w:r>
+      <w:r>
+        <w:rPr>
+          <w:rFonts w:ascii="CenturySchoolbook" w:hAnsi="CenturySchoolbook"/>
+          <w:b w:val="0"/>
+          <w:i w:val="0"/>
+          <w:color w:val="000000"/>
+          <w:sz w:val="24"/>
+        </w:rPr>
+        <w:t xml:space="preserve">Suspendisse in justo eu magna luctus suscipit. Sed lectus. Integer euismod lacus luctus magna. </w:t>
+      </w:r>
+      <w:r>
+        <w:t xml:space="preserve"> </w:t>
+      </w:r>
+      <w:r>
+        <w:rPr>
+          <w:rFonts w:ascii="CenturySchoolbook" w:hAnsi="CenturySchoolbook"/>
+          <w:b w:val="0"/>
+          <w:i w:val="0"/>
+          <w:color w:val="000000"/>
+          <w:sz w:val="24"/>
+        </w:rPr>
+        <w:t xml:space="preserve">Quisque cursus, metus vitae pharetra auctor, sem massa mattis sem, at interdum magna augue </w:t>
+      </w:r>
+      <w:r>
+        <w:t xml:space="preserve"> </w:t>
+      </w:r>
+      <w:r>
+        <w:rPr>
+          <w:rFonts w:ascii="CenturySchoolbook" w:hAnsi="CenturySchoolbook"/>
+          <w:b w:val="0"/>
+          <w:i w:val="0"/>
+          <w:color w:val="000000"/>
+          <w:sz w:val="24"/>
+        </w:rPr>
+        <w:t xml:space="preserve">eget diam. Vestibulum ante ipsum primis in faucibus orci luctus et ultrices posuere cubilia Curae; </w:t>
+      </w:r>
+      <w:r>
+        <w:t xml:space="preserve"> </w:t>
+      </w:r>
+      <w:r>
+        <w:rPr>
+          <w:rFonts w:ascii="CenturySchoolbook" w:hAnsi="CenturySchoolbook"/>
+          <w:b w:val="0"/>
+          <w:i w:val="0"/>
+          <w:color w:val="000000"/>
+          <w:sz w:val="24"/>
+        </w:rPr>
+        <w:t xml:space="preserve">Morbi lacinia molestie dui. Praesent blandit dolor. Sed non quam. In vel mi sit amet augue congue </w:t>
+      </w:r>
+      <w:r>
+        <w:t xml:space="preserve"> </w:t>
+      </w:r>
+      <w:r>
+        <w:rPr>
+          <w:rFonts w:ascii="CenturySchoolbook" w:hAnsi="CenturySchoolbook"/>
+          <w:b w:val="0"/>
+          <w:i w:val="0"/>
+          <w:color w:val="000000"/>
+          <w:sz w:val="24"/>
+        </w:rPr>
+        <w:t xml:space="preserve">elementum. Morbi in ipsum sit amet pede facilisis laoreet. Donec lacus nunc, viverra nec, blandit </w:t>
+      </w:r>
+      <w:r>
+        <w:t xml:space="preserve"> </w:t>
+      </w:r>
+      <w:r>
+        <w:rPr>
+          <w:rFonts w:ascii="CenturySchoolbook" w:hAnsi="CenturySchoolbook"/>
+          <w:b w:val="0"/>
+          <w:i w:val="0"/>
+          <w:color w:val="000000"/>
+          <w:sz w:val="24"/>
+        </w:rPr>
+        <w:t xml:space="preserve">vel, egestas et, augue. Vestibulum tincidunt malesuada tellus. Ut ultrices ultrices enim. Curabitur </w:t>
+      </w:r>
+      <w:r>
+        <w:t xml:space="preserve"> </w:t>
+      </w:r>
+      <w:r>
+        <w:rPr>
+          <w:rFonts w:ascii="CenturySchoolbook" w:hAnsi="CenturySchoolbook"/>
+          <w:b w:val="0"/>
+          <w:i w:val="0"/>
+          <w:color w:val="000000"/>
+          <w:sz w:val="24"/>
+        </w:rPr>
+        <w:t xml:space="preserve">sit amet mauris.  </w:t>
+      </w:r>
+      <w:r>
+        <w:t xml:space="preserve"> </w:t>
+      </w:r>
+      <w:r>
+        <w:rPr>
+          <w:rFonts w:ascii="CenturySchoolbook" w:hAnsi="CenturySchoolbook"/>
+          <w:b w:val="0"/>
+          <w:i w:val="0"/>
+          <w:color w:val="000000"/>
+          <w:sz w:val="24"/>
+        </w:rPr>
+        <w:t xml:space="preserve"> </w:t>
+      </w:r>
+      <w:r>
+        <w:t xml:space="preserve"> </w:t>
+      </w:r>
+      <w:r>
+        <w:rPr>
+          <w:rFonts w:ascii="CenturySchoolbook" w:hAnsi="CenturySchoolbook"/>
+          <w:b w:val="0"/>
+          <w:i w:val="0"/>
+          <w:color w:val="000000"/>
+          <w:sz w:val="24"/>
+        </w:rPr>
+        <w:t xml:space="preserve">Morbi in dui quis est pulvinar ullamcorper. Nulla facilisi. Integer lacinia sollicitudin massa. Cras </w:t>
+      </w:r>
+      <w:r>
+        <w:t xml:space="preserve"> </w:t>
+      </w:r>
+      <w:r>
+        <w:rPr>
+          <w:rFonts w:ascii="CenturySchoolbook" w:hAnsi="CenturySchoolbook"/>
+          <w:b w:val="0"/>
+          <w:i w:val="0"/>
+          <w:color w:val="000000"/>
+          <w:sz w:val="24"/>
+        </w:rPr>
+        <w:t xml:space="preserve">metus. Sed aliquet risus a tortor. Integer id quam. Morbi mi. Quisque nisl felis, venenatis tristique, </w:t>
+      </w:r>
+      <w:r>
+        <w:t xml:space="preserve"> </w:t>
+      </w:r>
+      <w:r>
+        <w:rPr>
+          <w:rFonts w:ascii="CenturySchoolbook" w:hAnsi="CenturySchoolbook"/>
+          <w:b w:val="0"/>
+          <w:i w:val="0"/>
+          <w:color w:val="000000"/>
+          <w:sz w:val="24"/>
+        </w:rPr>
+        <w:t xml:space="preserve">dignissim in, ultrices sit amet, augue. Proin sodales libero eget ante. Nulla quam. Aenean laoreet. </w:t>
+      </w:r>
+      <w:r>
+        <w:t xml:space="preserve"> </w:t>
+      </w:r>
+      <w:r>
+        <w:rPr>
+          <w:rFonts w:ascii="CenturySchoolbook" w:hAnsi="CenturySchoolbook"/>
+          <w:b w:val="0"/>
+          <w:i w:val="0"/>
+          <w:color w:val="000000"/>
+          <w:sz w:val="24"/>
+        </w:rPr>
+        <w:t xml:space="preserve">Vestibulum nisi lectus, commodo ac, facilisis ac, ultricies eu, pede. Ut orci risus, accumsan </w:t>
+      </w:r>
+      <w:r>
+        <w:t xml:space="preserve"> </w:t>
+      </w:r>
+      <w:r>
+        <w:rPr>
+          <w:rFonts w:ascii="CenturySchoolbook" w:hAnsi="CenturySchoolbook"/>
+          <w:b w:val="0"/>
+          <w:i w:val="0"/>
+          <w:color w:val="000000"/>
+          <w:sz w:val="24"/>
+        </w:rPr>
+        <w:t xml:space="preserve">porttitor, cursus quis, aliquet eget, justo. Sed pretium blandit orci.  </w:t>
+      </w:r>
+      <w:r>
+        <w:t xml:space="preserve"> </w:t>
+      </w:r>
+      <w:r>
+        <w:rPr>
+          <w:rFonts w:ascii="CenturySchoolbook" w:hAnsi="CenturySchoolbook"/>
+          <w:b w:val="0"/>
+          <w:i w:val="0"/>
+          <w:color w:val="000000"/>
+          <w:sz w:val="24"/>
+        </w:rPr>
+        <w:t xml:space="preserve"> </w:t>
+      </w:r>
+      <w:r>
+        <w:t xml:space="preserve"> </w:t>
+      </w:r>
+      <w:r>
+        <w:rPr>
+          <w:rFonts w:ascii="CenturySchoolbook" w:hAnsi="CenturySchoolbook"/>
+          <w:b w:val="0"/>
+          <w:i w:val="0"/>
+          <w:color w:val="000000"/>
+          <w:sz w:val="24"/>
+        </w:rPr>
+        <w:t xml:space="preserve">Ut eu diam at pede suscipit sodales. Aenean lectus elit, fermentum non, convallis id, sagittis at, </w:t>
+      </w:r>
+      <w:r>
+        <w:t xml:space="preserve"> </w:t>
+      </w:r>
+      <w:r>
+        <w:rPr>
+          <w:rFonts w:ascii="CenturySchoolbook" w:hAnsi="CenturySchoolbook"/>
+          <w:b w:val="0"/>
+          <w:i w:val="0"/>
+          <w:color w:val="000000"/>
+          <w:sz w:val="24"/>
+        </w:rPr>
+        <w:t xml:space="preserve">neque. Nullam mauris orci, aliquet et, iaculis et, viverra vitae, ligula. Nulla ut felis in purus </w:t>
+      </w:r>
+      <w:r>
+        <w:t xml:space="preserve"> </w:t>
+      </w:r>
+      <w:r>
+        <w:rPr>
+          <w:rFonts w:ascii="CenturySchoolbook" w:hAnsi="CenturySchoolbook"/>
+          <w:b w:val="0"/>
+          <w:i w:val="0"/>
+          <w:color w:val="000000"/>
           <w:sz w:val="24"/>
         </w:rPr>
         <w:t xml:space="preserve">aliquam imperdiet. Maecenas aliquet mollis lectus. Vivamus consectetuer risus et tortor. Lorem </w:t>
@@ -417,40 +591,20 @@
       </w:r>
     </w:p>
     <w:p>
+      <w:pPr>
+        <w:jc w:val="left"/>
+      </w:pPr>
       <w:r>
         <w:rPr>
           <w:rFonts w:ascii="CenturySchoolbook" w:hAnsi="CenturySchoolbook"/>
           <w:b w:val="0"/>
           <w:i w:val="0"/>
+          <w:color w:val="000000"/>
           <w:sz w:val="24"/>
         </w:rPr>
         <w:t xml:space="preserve">ipsum dolor sit amet, consectetur adipiscing elit. Integer nec odio. Praesent libero. Sed cursus ante </w:t>
       </w:r>
       <w:r>
-        <w:rPr>
-          <w:rFonts w:ascii="CenturySchoolbook" w:hAnsi="CenturySchoolbook"/>
-          <w:b w:val="0"/>
-          <w:i w:val="0"/>
-          <w:sz w:val="24"/>
-        </w:rPr>
-        <w:t xml:space="preserve">dapibus diam. Sed nisi. Nulla quis sem at nibh elementum imperdiet. Duis sagittis ipsum. </w:t>
-      </w:r>
-      <w:r>
-        <w:rPr>
-          <w:rFonts w:ascii="CenturySchoolbook" w:hAnsi="CenturySchoolbook"/>
-          <w:b w:val="0"/>
-          <w:i w:val="0"/>
-          <w:sz w:val="24"/>
-        </w:rPr>
-        <w:t xml:space="preserve">Praesent mauris.  </w:t>
-      </w:r>
-      <w:r>
-        <w:rPr>
-          <w:rFonts w:ascii="CenturySchoolbook" w:hAnsi="CenturySchoolbook"/>
-          <w:b w:val="0"/>
-          <w:i w:val="0"/>
-          <w:sz w:val="24"/>
-        </w:rPr>
         <w:t xml:space="preserve"> </w:t>
       </w:r>
       <w:r>
@@ -458,44 +612,12 @@
           <w:rFonts w:ascii="CenturySchoolbook" w:hAnsi="CenturySchoolbook"/>
           <w:b w:val="0"/>
           <w:i w:val="0"/>
+          <w:color w:val="000000"/>
           <w:sz w:val="24"/>
         </w:rPr>
-        <w:t xml:space="preserve">Fusce nec tellus sed augue semper porta. Mauris massa. Vestibulum lacinia arcu eget nulla. Class </w:t>
+        <w:t xml:space="preserve">dapibus diam. Sed nisi. Nulla quis sem at nibh elementum imperdiet. Duis sagittis ipsum. </w:t>
       </w:r>
       <w:r>
-        <w:rPr>
-          <w:rFonts w:ascii="CenturySchoolbook" w:hAnsi="CenturySchoolbook"/>
-          <w:b w:val="0"/>
-          <w:i w:val="0"/>
-          <w:sz w:val="24"/>
-        </w:rPr>
-        <w:t xml:space="preserve">aptent taciti sociosqu ad litora torquent per conubia nostra, per inceptos himenaeos. Curabitur </w:t>
-      </w:r>
-      <w:r>
-        <w:rPr>
-          <w:rFonts w:ascii="CenturySchoolbook" w:hAnsi="CenturySchoolbook"/>
-          <w:b w:val="0"/>
-          <w:i w:val="0"/>
-          <w:sz w:val="24"/>
-        </w:rPr>
-        <w:t xml:space="preserve">sodales ligula in libero. Sed dignissim lacinia nunc. Curabitur tortor. Pellentesque nibh. Aenean </w:t>
-      </w:r>
-      <w:r>
-        <w:rPr>
-          <w:rFonts w:ascii="CenturySchoolbook" w:hAnsi="CenturySchoolbook"/>
-          <w:b w:val="0"/>
-          <w:i w:val="0"/>
-          <w:sz w:val="24"/>
-        </w:rPr>
-        <w:t xml:space="preserve">quam. In scelerisque sem at dolor. Maecenas mattis. Sed convallis tristique sem.  </w:t>
-      </w:r>
-      <w:r>
-        <w:rPr>
-          <w:rFonts w:ascii="CenturySchoolbook" w:hAnsi="CenturySchoolbook"/>
-          <w:b w:val="0"/>
-          <w:i w:val="0"/>
-          <w:sz w:val="24"/>
-        </w:rPr>
         <w:t xml:space="preserve"> </w:t>
       </w:r>
       <w:r>
@@ -503,62 +625,12 @@
           <w:rFonts w:ascii="CenturySchoolbook" w:hAnsi="CenturySchoolbook"/>
           <w:b w:val="0"/>
           <w:i w:val="0"/>
+          <w:color w:val="000000"/>
           <w:sz w:val="24"/>
         </w:rPr>
-        <w:t xml:space="preserve">Proin ut ligula vel nunc egestas porttitor. Morbi lectus risus, iaculis vel, suscipit quis, luctus non, </w:t>
+        <w:t xml:space="preserve">Praesent mauris.  </w:t>
       </w:r>
       <w:r>
-        <w:rPr>
-          <w:rFonts w:ascii="CenturySchoolbook" w:hAnsi="CenturySchoolbook"/>
-          <w:b w:val="0"/>
-          <w:i w:val="0"/>
-          <w:sz w:val="24"/>
-        </w:rPr>
-        <w:t xml:space="preserve">massa. Fusce ac turpis quis ligula lacinia aliquet. Mauris ipsum. Nulla metus metus, ullamcorper </w:t>
-      </w:r>
-      <w:r>
-        <w:rPr>
-          <w:rFonts w:ascii="CenturySchoolbook" w:hAnsi="CenturySchoolbook"/>
-          <w:b w:val="0"/>
-          <w:i w:val="0"/>
-          <w:sz w:val="24"/>
-        </w:rPr>
-        <w:t xml:space="preserve">vel, tincidunt sed, euismod in, nibh. Quisque volutpat condimentum velit. Class aptent taciti </w:t>
-      </w:r>
-      <w:r>
-        <w:rPr>
-          <w:rFonts w:ascii="CenturySchoolbook" w:hAnsi="CenturySchoolbook"/>
-          <w:b w:val="0"/>
-          <w:i w:val="0"/>
-          <w:sz w:val="24"/>
-        </w:rPr>
-        <w:t xml:space="preserve">sociosqu ad litora torquent per conubia nostra, per inceptos himenaeos. Nam nec ante. Sed lacinia, </w:t>
-      </w:r>
-      <w:r>
-        <w:rPr>
-          <w:rFonts w:ascii="CenturySchoolbook" w:hAnsi="CenturySchoolbook"/>
-          <w:b w:val="0"/>
-          <w:i w:val="0"/>
-          <w:sz w:val="24"/>
-        </w:rPr>
-        <w:t xml:space="preserve">urna non tincidunt mattis, tortor neque adipiscing diam, a cursus ipsum ante quis turpis. Nulla </w:t>
-      </w:r>
-      <w:r>
-        <w:rPr>
-          <w:rFonts w:ascii="CenturySchoolbook" w:hAnsi="CenturySchoolbook"/>
-          <w:b w:val="0"/>
-          <w:i w:val="0"/>
-          <w:sz w:val="24"/>
-        </w:rPr>
-        <w:t xml:space="preserve">facilisi. Ut fringilla. Suspendisse potenti.  </w:t>
-      </w:r>
-      <w:r>
-        <w:rPr>
-          <w:rFonts w:ascii="CenturySchoolbook" w:hAnsi="CenturySchoolbook"/>
-          <w:b w:val="0"/>
-          <w:i w:val="0"/>
-          <w:sz w:val="24"/>
-        </w:rPr>
         <w:t xml:space="preserve"> </w:t>
       </w:r>
       <w:r>
@@ -566,62 +638,12 @@
           <w:rFonts w:ascii="CenturySchoolbook" w:hAnsi="CenturySchoolbook"/>
           <w:b w:val="0"/>
           <w:i w:val="0"/>
+          <w:color w:val="000000"/>
           <w:sz w:val="24"/>
         </w:rPr>
-        <w:t xml:space="preserve">Nunc feugiat mi a tellus consequat imperdiet. Vestibulum sapien. Proin quam. Etiam ultrices. </w:t>
+        <w:t xml:space="preserve"> </w:t>
       </w:r>
       <w:r>
-        <w:rPr>
-          <w:rFonts w:ascii="CenturySchoolbook" w:hAnsi="CenturySchoolbook"/>
-          <w:b w:val="0"/>
-          <w:i w:val="0"/>
-          <w:sz w:val="24"/>
-        </w:rPr>
-        <w:t xml:space="preserve">Suspendisse in justo eu magna luctus suscipit. Sed lectus. Integer euismod lacus luctus magna. </w:t>
-      </w:r>
-      <w:r>
-        <w:rPr>
-          <w:rFonts w:ascii="CenturySchoolbook" w:hAnsi="CenturySchoolbook"/>
-          <w:b w:val="0"/>
-          <w:i w:val="0"/>
-          <w:sz w:val="24"/>
-        </w:rPr>
-        <w:t xml:space="preserve">Quisque cursus, metus vitae pharetra auctor, sem massa mattis sem, at interdum magna augue </w:t>
-      </w:r>
-      <w:r>
-        <w:rPr>
-          <w:rFonts w:ascii="CenturySchoolbook" w:hAnsi="CenturySchoolbook"/>
-          <w:b w:val="0"/>
-          <w:i w:val="0"/>
-          <w:sz w:val="24"/>
-        </w:rPr>
-        <w:t xml:space="preserve">eget diam. Vestibulum ante ipsum primis in faucibus orci luctus et ultrices posuere cubilia Curae; </w:t>
-      </w:r>
-      <w:r>
-        <w:rPr>
-          <w:rFonts w:ascii="CenturySchoolbook" w:hAnsi="CenturySchoolbook"/>
-          <w:b w:val="0"/>
-          <w:i w:val="0"/>
-          <w:sz w:val="24"/>
-        </w:rPr>
-        <w:t xml:space="preserve">Morbi lacinia molestie dui. Praesent blandit dolor. Sed non quam. In vel mi sit amet augue congue </w:t>
-      </w:r>
-      <w:r>
-        <w:rPr>
-          <w:rFonts w:ascii="CenturySchoolbook" w:hAnsi="CenturySchoolbook"/>
-          <w:b w:val="0"/>
-          <w:i w:val="0"/>
-          <w:sz w:val="24"/>
-        </w:rPr>
-        <w:t xml:space="preserve">elementum. Morbi in ipsum sit amet pede facilisis laoreet.  </w:t>
-      </w:r>
-      <w:r>
-        <w:rPr>
-          <w:rFonts w:ascii="CenturySchoolbook" w:hAnsi="CenturySchoolbook"/>
-          <w:b w:val="0"/>
-          <w:i w:val="0"/>
-          <w:sz w:val="24"/>
-        </w:rPr>
         <w:t xml:space="preserve"> </w:t>
       </w:r>
       <w:r>
@@ -629,44 +651,12 @@
           <w:rFonts w:ascii="CenturySchoolbook" w:hAnsi="CenturySchoolbook"/>
           <w:b w:val="0"/>
           <w:i w:val="0"/>
+          <w:color w:val="000000"/>
           <w:sz w:val="24"/>
         </w:rPr>
-        <w:t xml:space="preserve">Donec lacus nunc, viverra nec, blandit vel, egestas et, augue. Vestibulum tincidunt malesuada </w:t>
+        <w:t xml:space="preserve">Fusce nec tellus sed augue semper porta. Mauris massa. Vestibulum lacinia arcu eget nulla. Class </w:t>
       </w:r>
       <w:r>
-        <w:rPr>
-          <w:rFonts w:ascii="CenturySchoolbook" w:hAnsi="CenturySchoolbook"/>
-          <w:b w:val="0"/>
-          <w:i w:val="0"/>
-          <w:sz w:val="24"/>
-        </w:rPr>
-        <w:t xml:space="preserve">tellus. Ut ultrices ultrices enim. Curabitur sit amet mauris. Morbi in dui quis est pulvinar </w:t>
-      </w:r>
-      <w:r>
-        <w:rPr>
-          <w:rFonts w:ascii="CenturySchoolbook" w:hAnsi="CenturySchoolbook"/>
-          <w:b w:val="0"/>
-          <w:i w:val="0"/>
-          <w:sz w:val="24"/>
-        </w:rPr>
-        <w:t xml:space="preserve">ullamcorper. Nulla facilisi. Integer lacinia sollicitudin massa. Cras metus. Sed aliquet risus a </w:t>
-      </w:r>
-      <w:r>
-        <w:rPr>
-          <w:rFonts w:ascii="CenturySchoolbook" w:hAnsi="CenturySchoolbook"/>
-          <w:b w:val="0"/>
-          <w:i w:val="0"/>
-          <w:sz w:val="24"/>
-        </w:rPr>
-        <w:t xml:space="preserve">tortor. Integer id quam. Morbi mi.  </w:t>
-      </w:r>
-      <w:r>
-        <w:rPr>
-          <w:rFonts w:ascii="CenturySchoolbook" w:hAnsi="CenturySchoolbook"/>
-          <w:b w:val="0"/>
-          <w:i w:val="0"/>
-          <w:sz w:val="24"/>
-        </w:rPr>
         <w:t xml:space="preserve"> </w:t>
       </w:r>
       <w:r>
@@ -674,53 +664,12 @@
           <w:rFonts w:ascii="CenturySchoolbook" w:hAnsi="CenturySchoolbook"/>
           <w:b w:val="0"/>
           <w:i w:val="0"/>
+          <w:color w:val="000000"/>
           <w:sz w:val="24"/>
         </w:rPr>
-        <w:t xml:space="preserve">Lorem ipsum dolor sit amet, consectetur adipiscing elit. Integer nec odio. Praesent libero. Sed </w:t>
+        <w:t xml:space="preserve">aptent taciti sociosqu ad litora torquent per conubia nostra, per inceptos himenaeos. Curabitur </w:t>
       </w:r>
       <w:r>
-        <w:rPr>
-          <w:rFonts w:ascii="CenturySchoolbook" w:hAnsi="CenturySchoolbook"/>
-          <w:b w:val="0"/>
-          <w:i w:val="0"/>
-          <w:sz w:val="24"/>
-        </w:rPr>
-        <w:t xml:space="preserve">cursus ante dapibus diam. Sed nisi. Nulla quis sem at nibh elementum imperdiet. Duis sagittis </w:t>
-      </w:r>
-      <w:r>
-        <w:rPr>
-          <w:rFonts w:ascii="CenturySchoolbook" w:hAnsi="CenturySchoolbook"/>
-          <w:b w:val="0"/>
-          <w:i w:val="0"/>
-          <w:sz w:val="24"/>
-        </w:rPr>
-        <w:t xml:space="preserve">ipsum. Praesent mauris. Fusce nec tellus sed augue semper porta. Mauris massa. Vestibulum </w:t>
-      </w:r>
-      <w:r>
-        <w:rPr>
-          <w:rFonts w:ascii="CenturySchoolbook" w:hAnsi="CenturySchoolbook"/>
-          <w:b w:val="0"/>
-          <w:i w:val="0"/>
-          <w:sz w:val="24"/>
-        </w:rPr>
-        <w:t xml:space="preserve">lacinia arcu eget nulla. Class aptent taciti sociosqu ad litora torquent per conubia nostra, per </w:t>
-      </w:r>
-      <w:r>
-        <w:rPr>
-          <w:rFonts w:ascii="CenturySchoolbook" w:hAnsi="CenturySchoolbook"/>
-          <w:b w:val="0"/>
-          <w:i w:val="0"/>
-          <w:sz w:val="24"/>
-        </w:rPr>
-        <w:t xml:space="preserve">inceptos himenaeos. Curabitur sodales ligula in libero.  </w:t>
-      </w:r>
-      <w:r>
-        <w:rPr>
-          <w:rFonts w:ascii="CenturySchoolbook" w:hAnsi="CenturySchoolbook"/>
-          <w:b w:val="0"/>
-          <w:i w:val="0"/>
-          <w:sz w:val="24"/>
-        </w:rPr>
         <w:t xml:space="preserve"> </w:t>
       </w:r>
       <w:r>
@@ -728,44 +677,12 @@
           <w:rFonts w:ascii="CenturySchoolbook" w:hAnsi="CenturySchoolbook"/>
           <w:b w:val="0"/>
           <w:i w:val="0"/>
+          <w:color w:val="000000"/>
           <w:sz w:val="24"/>
         </w:rPr>
-        <w:t xml:space="preserve">Sed dignissim lacinia nunc. Curabitur tortor. Pellentesque nibh. Aenean quam. In scelerisque sem </w:t>
+        <w:t xml:space="preserve">sodales ligula in libero. Sed dignissim lacinia nunc. Curabitur tortor. Pellentesque nibh. Aenean </w:t>
       </w:r>
       <w:r>
-        <w:rPr>
-          <w:rFonts w:ascii="CenturySchoolbook" w:hAnsi="CenturySchoolbook"/>
-          <w:b w:val="0"/>
-          <w:i w:val="0"/>
-          <w:sz w:val="24"/>
-        </w:rPr>
-        <w:t xml:space="preserve">at dolor. Maecenas mattis. Sed convallis tristique sem. Proin ut ligula vel nunc egestas porttitor. </w:t>
-      </w:r>
-      <w:r>
-        <w:rPr>
-          <w:rFonts w:ascii="CenturySchoolbook" w:hAnsi="CenturySchoolbook"/>
-          <w:b w:val="0"/>
-          <w:i w:val="0"/>
-          <w:sz w:val="24"/>
-        </w:rPr>
-        <w:t xml:space="preserve">Morbi lectus risus, iaculis vel, suscipit quis, luctus non, massa. Fusce ac turpis quis ligula lacinia </w:t>
-      </w:r>
-      <w:r>
-        <w:rPr>
-          <w:rFonts w:ascii="CenturySchoolbook" w:hAnsi="CenturySchoolbook"/>
-          <w:b w:val="0"/>
-          <w:i w:val="0"/>
-          <w:sz w:val="24"/>
-        </w:rPr>
-        <w:t xml:space="preserve">aliquet. Mauris ipsum. Nulla metus metus, ullamcorper vel, tincidunt sed, euismod in, nibh.  </w:t>
-      </w:r>
-      <w:r>
-        <w:rPr>
-          <w:rFonts w:ascii="CenturySchoolbook" w:hAnsi="CenturySchoolbook"/>
-          <w:b w:val="0"/>
-          <w:i w:val="0"/>
-          <w:sz w:val="24"/>
-        </w:rPr>
         <w:t xml:space="preserve"> </w:t>
       </w:r>
       <w:r>
@@ -773,44 +690,12 @@
           <w:rFonts w:ascii="CenturySchoolbook" w:hAnsi="CenturySchoolbook"/>
           <w:b w:val="0"/>
           <w:i w:val="0"/>
+          <w:color w:val="000000"/>
           <w:sz w:val="24"/>
         </w:rPr>
-        <w:t xml:space="preserve">Quisque volutpat condimentum velit. Class aptent taciti sociosqu ad litora torquent per conubia </w:t>
+        <w:t xml:space="preserve">quam. In scelerisque sem at dolor. Maecenas mattis. Sed convallis tristique sem.  </w:t>
       </w:r>
       <w:r>
-        <w:rPr>
-          <w:rFonts w:ascii="CenturySchoolbook" w:hAnsi="CenturySchoolbook"/>
-          <w:b w:val="0"/>
-          <w:i w:val="0"/>
-          <w:sz w:val="24"/>
-        </w:rPr>
-        <w:t xml:space="preserve">nostra, per inceptos himenaeos. Nam nec ante. Sed lacinia, urna non tincidunt mattis, tortor neque </w:t>
-      </w:r>
-      <w:r>
-        <w:rPr>
-          <w:rFonts w:ascii="CenturySchoolbook" w:hAnsi="CenturySchoolbook"/>
-          <w:b w:val="0"/>
-          <w:i w:val="0"/>
-          <w:sz w:val="24"/>
-        </w:rPr>
-        <w:t xml:space="preserve">adipiscing diam, a cursus ipsum ante quis turpis. Nulla facilisi. Ut fringilla. Suspendisse potenti. </w:t>
-      </w:r>
-      <w:r>
-        <w:rPr>
-          <w:rFonts w:ascii="CenturySchoolbook" w:hAnsi="CenturySchoolbook"/>
-          <w:b w:val="0"/>
-          <w:i w:val="0"/>
-          <w:sz w:val="24"/>
-        </w:rPr>
-        <w:t xml:space="preserve">Nunc feugiat mi a tellus consequat imperdiet. Vestibulum sapien. Proin quam. Etiam ultrices.  </w:t>
-      </w:r>
-      <w:r>
-        <w:rPr>
-          <w:rFonts w:ascii="CenturySchoolbook" w:hAnsi="CenturySchoolbook"/>
-          <w:b w:val="0"/>
-          <w:i w:val="0"/>
-          <w:sz w:val="24"/>
-        </w:rPr>
         <w:t xml:space="preserve"> </w:t>
       </w:r>
       <w:r>
@@ -818,33 +703,514 @@
           <w:rFonts w:ascii="CenturySchoolbook" w:hAnsi="CenturySchoolbook"/>
           <w:b w:val="0"/>
           <w:i w:val="0"/>
+          <w:color w:val="000000"/>
           <w:sz w:val="24"/>
         </w:rPr>
-        <w:t xml:space="preserve">Suspendisse in justo eu magna luctus suscipit. Sed lectus. Integer euismod lacus luctus magna. </w:t>
+        <w:t xml:space="preserve"> </w:t>
+      </w:r>
+      <w:r>
+        <w:t xml:space="preserve"> </w:t>
       </w:r>
       <w:r>
         <w:rPr>
           <w:rFonts w:ascii="CenturySchoolbook" w:hAnsi="CenturySchoolbook"/>
           <w:b w:val="0"/>
           <w:i w:val="0"/>
+          <w:color w:val="000000"/>
           <w:sz w:val="24"/>
         </w:rPr>
-        <w:t xml:space="preserve">Quisque cursus, metus vitae pharetra auctor, sem massa mattis sem, at interdum magna augue </w:t>
+        <w:t xml:space="preserve">Proin ut ligula vel nunc egestas porttitor. Morbi lectus risus, iaculis vel, suscipit quis, luctus non, </w:t>
+      </w:r>
+      <w:r>
+        <w:t xml:space="preserve"> </w:t>
       </w:r>
       <w:r>
         <w:rPr>
           <w:rFonts w:ascii="CenturySchoolbook" w:hAnsi="CenturySchoolbook"/>
           <w:b w:val="0"/>
           <w:i w:val="0"/>
+          <w:color w:val="000000"/>
           <w:sz w:val="24"/>
         </w:rPr>
-        <w:t xml:space="preserve">eget diam. Vestibulum ante ipsum primis in faucibus orci luctus et ultrices posuere cubilia Curae; </w:t>
+        <w:t xml:space="preserve">massa. Fusce ac turpis quis ligula lacinia aliquet. Mauris ipsum. Nulla metus metus, ullamcorper </w:t>
+      </w:r>
+      <w:r>
+        <w:t xml:space="preserve"> </w:t>
       </w:r>
       <w:r>
         <w:rPr>
           <w:rFonts w:ascii="CenturySchoolbook" w:hAnsi="CenturySchoolbook"/>
           <w:b w:val="0"/>
           <w:i w:val="0"/>
+          <w:color w:val="000000"/>
+          <w:sz w:val="24"/>
+        </w:rPr>
+        <w:t xml:space="preserve">vel, tincidunt sed, euismod in, nibh. Quisque volutpat condimentum velit. Class aptent taciti </w:t>
+      </w:r>
+      <w:r>
+        <w:t xml:space="preserve"> </w:t>
+      </w:r>
+      <w:r>
+        <w:rPr>
+          <w:rFonts w:ascii="CenturySchoolbook" w:hAnsi="CenturySchoolbook"/>
+          <w:b w:val="0"/>
+          <w:i w:val="0"/>
+          <w:color w:val="000000"/>
+          <w:sz w:val="24"/>
+        </w:rPr>
+        <w:t xml:space="preserve">sociosqu ad litora torquent per conubia nostra, per inceptos himenaeos. Nam nec ante. Sed lacinia, </w:t>
+      </w:r>
+      <w:r>
+        <w:t xml:space="preserve"> </w:t>
+      </w:r>
+      <w:r>
+        <w:rPr>
+          <w:rFonts w:ascii="CenturySchoolbook" w:hAnsi="CenturySchoolbook"/>
+          <w:b w:val="0"/>
+          <w:i w:val="0"/>
+          <w:color w:val="000000"/>
+          <w:sz w:val="24"/>
+        </w:rPr>
+        <w:t xml:space="preserve">urna non tincidunt mattis, tortor neque adipiscing diam, a cursus ipsum ante quis turpis. Nulla </w:t>
+      </w:r>
+      <w:r>
+        <w:t xml:space="preserve"> </w:t>
+      </w:r>
+      <w:r>
+        <w:rPr>
+          <w:rFonts w:ascii="CenturySchoolbook" w:hAnsi="CenturySchoolbook"/>
+          <w:b w:val="0"/>
+          <w:i w:val="0"/>
+          <w:color w:val="000000"/>
+          <w:sz w:val="24"/>
+        </w:rPr>
+        <w:t xml:space="preserve">facilisi. Ut fringilla. Suspendisse potenti.  </w:t>
+      </w:r>
+      <w:r>
+        <w:t xml:space="preserve"> </w:t>
+      </w:r>
+      <w:r>
+        <w:rPr>
+          <w:rFonts w:ascii="CenturySchoolbook" w:hAnsi="CenturySchoolbook"/>
+          <w:b w:val="0"/>
+          <w:i w:val="0"/>
+          <w:color w:val="000000"/>
+          <w:sz w:val="24"/>
+        </w:rPr>
+        <w:t xml:space="preserve"> </w:t>
+      </w:r>
+      <w:r>
+        <w:t xml:space="preserve"> </w:t>
+      </w:r>
+      <w:r>
+        <w:rPr>
+          <w:rFonts w:ascii="CenturySchoolbook" w:hAnsi="CenturySchoolbook"/>
+          <w:b w:val="0"/>
+          <w:i w:val="0"/>
+          <w:color w:val="000000"/>
+          <w:sz w:val="24"/>
+        </w:rPr>
+        <w:t xml:space="preserve">Nunc feugiat mi a tellus consequat imperdiet. Vestibulum sapien. Proin quam. Etiam ultrices. </w:t>
+      </w:r>
+      <w:r>
+        <w:t xml:space="preserve"> </w:t>
+      </w:r>
+      <w:r>
+        <w:rPr>
+          <w:rFonts w:ascii="CenturySchoolbook" w:hAnsi="CenturySchoolbook"/>
+          <w:b w:val="0"/>
+          <w:i w:val="0"/>
+          <w:color w:val="000000"/>
+          <w:sz w:val="24"/>
+        </w:rPr>
+        <w:t xml:space="preserve">Suspendisse in justo eu magna luctus suscipit. Sed lectus. Integer euismod lacus luctus magna. </w:t>
+      </w:r>
+      <w:r>
+        <w:t xml:space="preserve"> </w:t>
+      </w:r>
+      <w:r>
+        <w:rPr>
+          <w:rFonts w:ascii="CenturySchoolbook" w:hAnsi="CenturySchoolbook"/>
+          <w:b w:val="0"/>
+          <w:i w:val="0"/>
+          <w:color w:val="000000"/>
+          <w:sz w:val="24"/>
+        </w:rPr>
+        <w:t xml:space="preserve">Quisque cursus, metus vitae pharetra auctor, sem massa mattis sem, at interdum magna augue </w:t>
+      </w:r>
+      <w:r>
+        <w:t xml:space="preserve"> </w:t>
+      </w:r>
+      <w:r>
+        <w:rPr>
+          <w:rFonts w:ascii="CenturySchoolbook" w:hAnsi="CenturySchoolbook"/>
+          <w:b w:val="0"/>
+          <w:i w:val="0"/>
+          <w:color w:val="000000"/>
+          <w:sz w:val="24"/>
+        </w:rPr>
+        <w:t xml:space="preserve">eget diam. Vestibulum ante ipsum primis in faucibus orci luctus et ultrices posuere cubilia Curae; </w:t>
+      </w:r>
+      <w:r>
+        <w:t xml:space="preserve"> </w:t>
+      </w:r>
+      <w:r>
+        <w:rPr>
+          <w:rFonts w:ascii="CenturySchoolbook" w:hAnsi="CenturySchoolbook"/>
+          <w:b w:val="0"/>
+          <w:i w:val="0"/>
+          <w:color w:val="000000"/>
+          <w:sz w:val="24"/>
+        </w:rPr>
+        <w:t xml:space="preserve">Morbi lacinia molestie dui. Praesent blandit dolor. Sed non quam. In vel mi sit amet augue congue </w:t>
+      </w:r>
+      <w:r>
+        <w:t xml:space="preserve"> </w:t>
+      </w:r>
+      <w:r>
+        <w:rPr>
+          <w:rFonts w:ascii="CenturySchoolbook" w:hAnsi="CenturySchoolbook"/>
+          <w:b w:val="0"/>
+          <w:i w:val="0"/>
+          <w:color w:val="000000"/>
+          <w:sz w:val="24"/>
+        </w:rPr>
+        <w:t xml:space="preserve">elementum. Morbi in ipsum sit amet pede facilisis laoreet.  </w:t>
+      </w:r>
+      <w:r>
+        <w:t xml:space="preserve"> </w:t>
+      </w:r>
+      <w:r>
+        <w:rPr>
+          <w:rFonts w:ascii="CenturySchoolbook" w:hAnsi="CenturySchoolbook"/>
+          <w:b w:val="0"/>
+          <w:i w:val="0"/>
+          <w:color w:val="000000"/>
+          <w:sz w:val="24"/>
+        </w:rPr>
+        <w:t xml:space="preserve"> </w:t>
+      </w:r>
+      <w:r>
+        <w:t xml:space="preserve"> </w:t>
+      </w:r>
+      <w:r>
+        <w:rPr>
+          <w:rFonts w:ascii="CenturySchoolbook" w:hAnsi="CenturySchoolbook"/>
+          <w:b w:val="0"/>
+          <w:i w:val="0"/>
+          <w:color w:val="000000"/>
+          <w:sz w:val="24"/>
+        </w:rPr>
+        <w:t xml:space="preserve">Donec lacus nunc, viverra nec, blandit vel, egestas et, augue. Vestibulum tincidunt malesuada </w:t>
+      </w:r>
+      <w:r>
+        <w:t xml:space="preserve"> </w:t>
+      </w:r>
+      <w:r>
+        <w:rPr>
+          <w:rFonts w:ascii="CenturySchoolbook" w:hAnsi="CenturySchoolbook"/>
+          <w:b w:val="0"/>
+          <w:i w:val="0"/>
+          <w:color w:val="000000"/>
+          <w:sz w:val="24"/>
+        </w:rPr>
+        <w:t xml:space="preserve">tellus. Ut ultrices ultrices enim. Curabitur sit amet mauris. Morbi in dui quis est pulvinar </w:t>
+      </w:r>
+      <w:r>
+        <w:t xml:space="preserve"> </w:t>
+      </w:r>
+      <w:r>
+        <w:rPr>
+          <w:rFonts w:ascii="CenturySchoolbook" w:hAnsi="CenturySchoolbook"/>
+          <w:b w:val="0"/>
+          <w:i w:val="0"/>
+          <w:color w:val="000000"/>
+          <w:sz w:val="24"/>
+        </w:rPr>
+        <w:t xml:space="preserve">ullamcorper. Nulla facilisi. Integer lacinia sollicitudin massa. Cras metus. Sed aliquet risus a </w:t>
+      </w:r>
+      <w:r>
+        <w:t xml:space="preserve"> </w:t>
+      </w:r>
+      <w:r>
+        <w:rPr>
+          <w:rFonts w:ascii="CenturySchoolbook" w:hAnsi="CenturySchoolbook"/>
+          <w:b w:val="0"/>
+          <w:i w:val="0"/>
+          <w:color w:val="000000"/>
+          <w:sz w:val="24"/>
+        </w:rPr>
+        <w:t xml:space="preserve">tortor. Integer id quam. Morbi mi.  </w:t>
+      </w:r>
+      <w:r>
+        <w:t xml:space="preserve"> </w:t>
+      </w:r>
+      <w:r>
+        <w:rPr>
+          <w:rFonts w:ascii="CenturySchoolbook" w:hAnsi="CenturySchoolbook"/>
+          <w:b w:val="0"/>
+          <w:i w:val="0"/>
+          <w:color w:val="000000"/>
+          <w:sz w:val="24"/>
+        </w:rPr>
+        <w:t xml:space="preserve"> </w:t>
+      </w:r>
+      <w:r>
+        <w:t xml:space="preserve"> </w:t>
+      </w:r>
+      <w:r>
+        <w:rPr>
+          <w:rFonts w:ascii="CenturySchoolbook" w:hAnsi="CenturySchoolbook"/>
+          <w:b w:val="0"/>
+          <w:i w:val="0"/>
+          <w:color w:val="000000"/>
+          <w:sz w:val="24"/>
+        </w:rPr>
+        <w:t xml:space="preserve">Lorem ipsum dolor sit amet, consectetur adipiscing elit. Integer nec odio. Praesent libero. Sed </w:t>
+      </w:r>
+      <w:r>
+        <w:t xml:space="preserve"> </w:t>
+      </w:r>
+      <w:r>
+        <w:rPr>
+          <w:rFonts w:ascii="CenturySchoolbook" w:hAnsi="CenturySchoolbook"/>
+          <w:b w:val="0"/>
+          <w:i w:val="0"/>
+          <w:color w:val="000000"/>
+          <w:sz w:val="24"/>
+        </w:rPr>
+        <w:t xml:space="preserve">cursus ante dapibus diam. Sed nisi. Nulla quis sem at nibh elementum imperdiet. Duis sagittis </w:t>
+      </w:r>
+      <w:r>
+        <w:t xml:space="preserve"> </w:t>
+      </w:r>
+      <w:r>
+        <w:rPr>
+          <w:rFonts w:ascii="CenturySchoolbook" w:hAnsi="CenturySchoolbook"/>
+          <w:b w:val="0"/>
+          <w:i w:val="0"/>
+          <w:color w:val="000000"/>
+          <w:sz w:val="24"/>
+        </w:rPr>
+        <w:t xml:space="preserve">ipsum. Praesent mauris. Fusce nec tellus sed augue semper porta. Mauris massa. Vestibulum </w:t>
+      </w:r>
+      <w:r>
+        <w:t xml:space="preserve"> </w:t>
+      </w:r>
+      <w:r>
+        <w:rPr>
+          <w:rFonts w:ascii="CenturySchoolbook" w:hAnsi="CenturySchoolbook"/>
+          <w:b w:val="0"/>
+          <w:i w:val="0"/>
+          <w:color w:val="000000"/>
+          <w:sz w:val="24"/>
+        </w:rPr>
+        <w:t xml:space="preserve">lacinia arcu eget nulla. Class aptent taciti sociosqu ad litora torquent per conubia nostra, per </w:t>
+      </w:r>
+      <w:r>
+        <w:t xml:space="preserve"> </w:t>
+      </w:r>
+      <w:r>
+        <w:rPr>
+          <w:rFonts w:ascii="CenturySchoolbook" w:hAnsi="CenturySchoolbook"/>
+          <w:b w:val="0"/>
+          <w:i w:val="0"/>
+          <w:color w:val="000000"/>
+          <w:sz w:val="24"/>
+        </w:rPr>
+        <w:t xml:space="preserve">inceptos himenaeos. Curabitur sodales ligula in libero.  </w:t>
+      </w:r>
+      <w:r>
+        <w:t xml:space="preserve"> </w:t>
+      </w:r>
+      <w:r>
+        <w:rPr>
+          <w:rFonts w:ascii="CenturySchoolbook" w:hAnsi="CenturySchoolbook"/>
+          <w:b w:val="0"/>
+          <w:i w:val="0"/>
+          <w:color w:val="000000"/>
+          <w:sz w:val="24"/>
+        </w:rPr>
+        <w:t xml:space="preserve"> </w:t>
+      </w:r>
+      <w:r>
+        <w:t xml:space="preserve"> </w:t>
+      </w:r>
+      <w:r>
+        <w:rPr>
+          <w:rFonts w:ascii="CenturySchoolbook" w:hAnsi="CenturySchoolbook"/>
+          <w:b w:val="0"/>
+          <w:i w:val="0"/>
+          <w:color w:val="000000"/>
+          <w:sz w:val="24"/>
+        </w:rPr>
+        <w:t xml:space="preserve">Sed dignissim lacinia nunc. Curabitur tortor. Pellentesque nibh. Aenean quam. In scelerisque sem </w:t>
+      </w:r>
+      <w:r>
+        <w:t xml:space="preserve"> </w:t>
+      </w:r>
+      <w:r>
+        <w:rPr>
+          <w:rFonts w:ascii="CenturySchoolbook" w:hAnsi="CenturySchoolbook"/>
+          <w:b w:val="0"/>
+          <w:i w:val="0"/>
+          <w:color w:val="000000"/>
+          <w:sz w:val="24"/>
+        </w:rPr>
+        <w:t xml:space="preserve">at dolor. Maecenas mattis. Sed convallis tristique sem. Proin ut ligula vel nunc egestas porttitor. </w:t>
+      </w:r>
+      <w:r>
+        <w:t xml:space="preserve"> </w:t>
+      </w:r>
+      <w:r>
+        <w:rPr>
+          <w:rFonts w:ascii="CenturySchoolbook" w:hAnsi="CenturySchoolbook"/>
+          <w:b w:val="0"/>
+          <w:i w:val="0"/>
+          <w:color w:val="000000"/>
+          <w:sz w:val="24"/>
+        </w:rPr>
+        <w:t xml:space="preserve">Morbi lectus risus, iaculis vel, suscipit quis, luctus non, massa. Fusce ac turpis quis ligula lacinia </w:t>
+      </w:r>
+      <w:r>
+        <w:t xml:space="preserve"> </w:t>
+      </w:r>
+      <w:r>
+        <w:rPr>
+          <w:rFonts w:ascii="CenturySchoolbook" w:hAnsi="CenturySchoolbook"/>
+          <w:b w:val="0"/>
+          <w:i w:val="0"/>
+          <w:color w:val="000000"/>
+          <w:sz w:val="24"/>
+        </w:rPr>
+        <w:t xml:space="preserve">aliquet. Mauris ipsum. Nulla metus metus, ullamcorper vel, tincidunt sed, euismod in, nibh.  </w:t>
+      </w:r>
+      <w:r>
+        <w:t xml:space="preserve"> </w:t>
+      </w:r>
+      <w:r>
+        <w:rPr>
+          <w:rFonts w:ascii="CenturySchoolbook" w:hAnsi="CenturySchoolbook"/>
+          <w:b w:val="0"/>
+          <w:i w:val="0"/>
+          <w:color w:val="000000"/>
+          <w:sz w:val="24"/>
+        </w:rPr>
+        <w:t xml:space="preserve"> </w:t>
+      </w:r>
+      <w:r>
+        <w:t xml:space="preserve"> </w:t>
+      </w:r>
+      <w:r>
+        <w:rPr>
+          <w:rFonts w:ascii="CenturySchoolbook" w:hAnsi="CenturySchoolbook"/>
+          <w:b w:val="0"/>
+          <w:i w:val="0"/>
+          <w:color w:val="000000"/>
+          <w:sz w:val="24"/>
+        </w:rPr>
+        <w:t xml:space="preserve">Quisque volutpat condimentum velit. Class aptent taciti sociosqu ad litora torquent per conubia </w:t>
+      </w:r>
+      <w:r>
+        <w:t xml:space="preserve"> </w:t>
+      </w:r>
+      <w:r>
+        <w:rPr>
+          <w:rFonts w:ascii="CenturySchoolbook" w:hAnsi="CenturySchoolbook"/>
+          <w:b w:val="0"/>
+          <w:i w:val="0"/>
+          <w:color w:val="000000"/>
+          <w:sz w:val="24"/>
+        </w:rPr>
+        <w:t xml:space="preserve">nostra, per inceptos himenaeos. Nam nec ante. Sed lacinia, urna non tincidunt mattis, tortor neque </w:t>
+      </w:r>
+      <w:r>
+        <w:t xml:space="preserve"> </w:t>
+      </w:r>
+      <w:r>
+        <w:rPr>
+          <w:rFonts w:ascii="CenturySchoolbook" w:hAnsi="CenturySchoolbook"/>
+          <w:b w:val="0"/>
+          <w:i w:val="0"/>
+          <w:color w:val="000000"/>
+          <w:sz w:val="24"/>
+        </w:rPr>
+        <w:t xml:space="preserve">adipiscing diam, a cursus ipsum ante quis turpis. Nulla facilisi. Ut fringilla. Suspendisse potenti. </w:t>
+      </w:r>
+      <w:r>
+        <w:t xml:space="preserve"> </w:t>
+      </w:r>
+      <w:r>
+        <w:rPr>
+          <w:rFonts w:ascii="CenturySchoolbook" w:hAnsi="CenturySchoolbook"/>
+          <w:b w:val="0"/>
+          <w:i w:val="0"/>
+          <w:color w:val="000000"/>
+          <w:sz w:val="24"/>
+        </w:rPr>
+        <w:t xml:space="preserve">Nunc feugiat mi a tellus consequat imperdiet. Vestibulum sapien. Proin quam. Etiam ultrices.  </w:t>
+      </w:r>
+      <w:r>
+        <w:t xml:space="preserve"> </w:t>
+      </w:r>
+      <w:r>
+        <w:rPr>
+          <w:rFonts w:ascii="CenturySchoolbook" w:hAnsi="CenturySchoolbook"/>
+          <w:b w:val="0"/>
+          <w:i w:val="0"/>
+          <w:color w:val="000000"/>
+          <w:sz w:val="24"/>
+        </w:rPr>
+        <w:t xml:space="preserve"> </w:t>
+      </w:r>
+      <w:r>
+        <w:t xml:space="preserve"> </w:t>
+      </w:r>
+      <w:r>
+        <w:rPr>
+          <w:rFonts w:ascii="CenturySchoolbook" w:hAnsi="CenturySchoolbook"/>
+          <w:b w:val="0"/>
+          <w:i w:val="0"/>
+          <w:color w:val="000000"/>
+          <w:sz w:val="24"/>
+        </w:rPr>
+        <w:t xml:space="preserve">Suspendisse in justo eu magna luctus suscipit. Sed lectus. Integer euismod lacus luctus magna. </w:t>
+      </w:r>
+      <w:r>
+        <w:t xml:space="preserve"> </w:t>
+      </w:r>
+      <w:r>
+        <w:rPr>
+          <w:rFonts w:ascii="CenturySchoolbook" w:hAnsi="CenturySchoolbook"/>
+          <w:b w:val="0"/>
+          <w:i w:val="0"/>
+          <w:color w:val="000000"/>
+          <w:sz w:val="24"/>
+        </w:rPr>
+        <w:t xml:space="preserve">Quisque cursus, metus vitae pharetra auctor, sem massa mattis sem, at interdum magna augue </w:t>
+      </w:r>
+      <w:r>
+        <w:t xml:space="preserve"> </w:t>
+      </w:r>
+      <w:r>
+        <w:rPr>
+          <w:rFonts w:ascii="CenturySchoolbook" w:hAnsi="CenturySchoolbook"/>
+          <w:b w:val="0"/>
+          <w:i w:val="0"/>
+          <w:color w:val="000000"/>
+          <w:sz w:val="24"/>
+        </w:rPr>
+        <w:t xml:space="preserve">eget diam. Vestibulum ante ipsum primis in faucibus orci luctus et ultrices posuere cubilia Curae; </w:t>
+      </w:r>
+      <w:r>
+        <w:t xml:space="preserve"> </w:t>
+      </w:r>
+      <w:r>
+        <w:rPr>
+          <w:rFonts w:ascii="CenturySchoolbook" w:hAnsi="CenturySchoolbook"/>
+          <w:b w:val="0"/>
+          <w:i w:val="0"/>
+          <w:color w:val="000000"/>
           <w:sz w:val="24"/>
         </w:rPr>
         <w:t xml:space="preserve">Morbi lacinia molestie dui. Praesent blandit dolor. Sed non quam. In vel mi sit amet augue congue </w:t>
@@ -856,40 +1222,20 @@
       </w:r>
     </w:p>
     <w:p>
+      <w:pPr>
+        <w:jc w:val="left"/>
+      </w:pPr>
       <w:r>
         <w:rPr>
           <w:rFonts w:ascii="CenturySchoolbook" w:hAnsi="CenturySchoolbook"/>
           <w:b w:val="0"/>
           <w:i w:val="0"/>
+          <w:color w:val="000000"/>
           <w:sz w:val="24"/>
         </w:rPr>
         <w:t xml:space="preserve">elementum. Morbi in ipsum sit amet pede facilisis laoreet. Donec lacus nunc, viverra nec, blandit </w:t>
       </w:r>
       <w:r>
-        <w:rPr>
-          <w:rFonts w:ascii="CenturySchoolbook" w:hAnsi="CenturySchoolbook"/>
-          <w:b w:val="0"/>
-          <w:i w:val="0"/>
-          <w:sz w:val="24"/>
-        </w:rPr>
-        <w:t xml:space="preserve">vel, egestas et, augue. Vestibulum tincidunt malesuada tellus. Ut ultrices ultrices enim. Curabitur </w:t>
-      </w:r>
-      <w:r>
-        <w:rPr>
-          <w:rFonts w:ascii="CenturySchoolbook" w:hAnsi="CenturySchoolbook"/>
-          <w:b w:val="0"/>
-          <w:i w:val="0"/>
-          <w:sz w:val="24"/>
-        </w:rPr>
-        <w:t xml:space="preserve">sit amet mauris.  </w:t>
-      </w:r>
-      <w:r>
-        <w:rPr>
-          <w:rFonts w:ascii="CenturySchoolbook" w:hAnsi="CenturySchoolbook"/>
-          <w:b w:val="0"/>
-          <w:i w:val="0"/>
-          <w:sz w:val="24"/>
-        </w:rPr>
         <w:t xml:space="preserve"> </w:t>
       </w:r>
       <w:r>
@@ -897,53 +1243,12 @@
           <w:rFonts w:ascii="CenturySchoolbook" w:hAnsi="CenturySchoolbook"/>
           <w:b w:val="0"/>
           <w:i w:val="0"/>
+          <w:color w:val="000000"/>
           <w:sz w:val="24"/>
         </w:rPr>
-        <w:t xml:space="preserve">Morbi in dui quis est pulvinar ullamcorper. Nulla facilisi. Integer lacinia sollicitudin massa. Cras </w:t>
+        <w:t xml:space="preserve">vel, egestas et, augue. Vestibulum tincidunt malesuada tellus. Ut ultrices ultrices enim. Curabitur </w:t>
       </w:r>
       <w:r>
-        <w:rPr>
-          <w:rFonts w:ascii="CenturySchoolbook" w:hAnsi="CenturySchoolbook"/>
-          <w:b w:val="0"/>
-          <w:i w:val="0"/>
-          <w:sz w:val="24"/>
-        </w:rPr>
-        <w:t xml:space="preserve">metus. Sed aliquet risus a tortor. Integer id quam. Morbi mi. Quisque nisl felis, venenatis tristique, </w:t>
-      </w:r>
-      <w:r>
-        <w:rPr>
-          <w:rFonts w:ascii="CenturySchoolbook" w:hAnsi="CenturySchoolbook"/>
-          <w:b w:val="0"/>
-          <w:i w:val="0"/>
-          <w:sz w:val="24"/>
-        </w:rPr>
-        <w:t xml:space="preserve">dignissim in, ultrices sit amet, augue. Proin sodales libero eget ante. Nulla quam. Aenean laoreet. </w:t>
-      </w:r>
-      <w:r>
-        <w:rPr>
-          <w:rFonts w:ascii="CenturySchoolbook" w:hAnsi="CenturySchoolbook"/>
-          <w:b w:val="0"/>
-          <w:i w:val="0"/>
-          <w:sz w:val="24"/>
-        </w:rPr>
-        <w:t xml:space="preserve">Vestibulum nisi lectus, commodo ac, facilisis ac, ultricies eu, pede. Ut orci risus, accumsan </w:t>
-      </w:r>
-      <w:r>
-        <w:rPr>
-          <w:rFonts w:ascii="CenturySchoolbook" w:hAnsi="CenturySchoolbook"/>
-          <w:b w:val="0"/>
-          <w:i w:val="0"/>
-          <w:sz w:val="24"/>
-        </w:rPr>
-        <w:t xml:space="preserve">porttitor, cursus quis, aliquet eget, justo. Sed pretium blandit orci.  </w:t>
-      </w:r>
-      <w:r>
-        <w:rPr>
-          <w:rFonts w:ascii="CenturySchoolbook" w:hAnsi="CenturySchoolbook"/>
-          <w:b w:val="0"/>
-          <w:i w:val="0"/>
-          <w:sz w:val="24"/>
-        </w:rPr>
         <w:t xml:space="preserve"> </w:t>
       </w:r>
       <w:r>
@@ -951,62 +1256,12 @@
           <w:rFonts w:ascii="CenturySchoolbook" w:hAnsi="CenturySchoolbook"/>
           <w:b w:val="0"/>
           <w:i w:val="0"/>
+          <w:color w:val="000000"/>
           <w:sz w:val="24"/>
         </w:rPr>
-        <w:t xml:space="preserve">Ut eu diam at pede suscipit sodales. Aenean lectus elit, fermentum non, convallis id, sagittis at, </w:t>
+        <w:t xml:space="preserve">sit amet mauris.  </w:t>
       </w:r>
       <w:r>
-        <w:rPr>
-          <w:rFonts w:ascii="CenturySchoolbook" w:hAnsi="CenturySchoolbook"/>
-          <w:b w:val="0"/>
-          <w:i w:val="0"/>
-          <w:sz w:val="24"/>
-        </w:rPr>
-        <w:t xml:space="preserve">neque. Nullam mauris orci, aliquet et, iaculis et, viverra vitae, ligula. Nulla ut felis in purus </w:t>
-      </w:r>
-      <w:r>
-        <w:rPr>
-          <w:rFonts w:ascii="CenturySchoolbook" w:hAnsi="CenturySchoolbook"/>
-          <w:b w:val="0"/>
-          <w:i w:val="0"/>
-          <w:sz w:val="24"/>
-        </w:rPr>
-        <w:t xml:space="preserve">aliquam imperdiet. Maecenas aliquet mollis lectus. Vivamus consectetuer risus et tortor. Lorem </w:t>
-      </w:r>
-      <w:r>
-        <w:rPr>
-          <w:rFonts w:ascii="CenturySchoolbook" w:hAnsi="CenturySchoolbook"/>
-          <w:b w:val="0"/>
-          <w:i w:val="0"/>
-          <w:sz w:val="24"/>
-        </w:rPr>
-        <w:t xml:space="preserve">ipsum dolor sit amet, consectetur adipiscing elit. Integer nec odio. Praesent libero. Sed cursus ante </w:t>
-      </w:r>
-      <w:r>
-        <w:rPr>
-          <w:rFonts w:ascii="CenturySchoolbook" w:hAnsi="CenturySchoolbook"/>
-          <w:b w:val="0"/>
-          <w:i w:val="0"/>
-          <w:sz w:val="24"/>
-        </w:rPr>
-        <w:t xml:space="preserve">dapibus diam. Sed nisi. Nulla quis sem at nibh elementum imperdiet. Duis sagittis ipsum. </w:t>
-      </w:r>
-      <w:r>
-        <w:rPr>
-          <w:rFonts w:ascii="CenturySchoolbook" w:hAnsi="CenturySchoolbook"/>
-          <w:b w:val="0"/>
-          <w:i w:val="0"/>
-          <w:sz w:val="24"/>
-        </w:rPr>
-        <w:t xml:space="preserve">Praesent mauris.  </w:t>
-      </w:r>
-      <w:r>
-        <w:rPr>
-          <w:rFonts w:ascii="CenturySchoolbook" w:hAnsi="CenturySchoolbook"/>
-          <w:b w:val="0"/>
-          <w:i w:val="0"/>
-          <w:sz w:val="24"/>
-        </w:rPr>
         <w:t xml:space="preserve"> </w:t>
       </w:r>
       <w:r>
@@ -1014,44 +1269,12 @@
           <w:rFonts w:ascii="CenturySchoolbook" w:hAnsi="CenturySchoolbook"/>
           <w:b w:val="0"/>
           <w:i w:val="0"/>
+          <w:color w:val="000000"/>
           <w:sz w:val="24"/>
         </w:rPr>
-        <w:t xml:space="preserve">Fusce nec tellus sed augue semper porta. Mauris massa. Vestibulum lacinia arcu eget nulla. Class </w:t>
+        <w:t xml:space="preserve"> </w:t>
       </w:r>
       <w:r>
-        <w:rPr>
-          <w:rFonts w:ascii="CenturySchoolbook" w:hAnsi="CenturySchoolbook"/>
-          <w:b w:val="0"/>
-          <w:i w:val="0"/>
-          <w:sz w:val="24"/>
-        </w:rPr>
-        <w:t xml:space="preserve">aptent taciti sociosqu ad litora torquent per conubia nostra, per inceptos himenaeos. Curabitur </w:t>
-      </w:r>
-      <w:r>
-        <w:rPr>
-          <w:rFonts w:ascii="CenturySchoolbook" w:hAnsi="CenturySchoolbook"/>
-          <w:b w:val="0"/>
-          <w:i w:val="0"/>
-          <w:sz w:val="24"/>
-        </w:rPr>
-        <w:t xml:space="preserve">sodales ligula in libero. Sed dignissim lacinia nunc. Curabitur tortor. Pellentesque nibh. Aenean </w:t>
-      </w:r>
-      <w:r>
-        <w:rPr>
-          <w:rFonts w:ascii="CenturySchoolbook" w:hAnsi="CenturySchoolbook"/>
-          <w:b w:val="0"/>
-          <w:i w:val="0"/>
-          <w:sz w:val="24"/>
-        </w:rPr>
-        <w:t xml:space="preserve">quam. In scelerisque sem at dolor. Maecenas mattis. Sed convallis tristique sem.  </w:t>
-      </w:r>
-      <w:r>
-        <w:rPr>
-          <w:rFonts w:ascii="CenturySchoolbook" w:hAnsi="CenturySchoolbook"/>
-          <w:b w:val="0"/>
-          <w:i w:val="0"/>
-          <w:sz w:val="24"/>
-        </w:rPr>
         <w:t xml:space="preserve"> </w:t>
       </w:r>
       <w:r>
@@ -1059,62 +1282,12 @@
           <w:rFonts w:ascii="CenturySchoolbook" w:hAnsi="CenturySchoolbook"/>
           <w:b w:val="0"/>
           <w:i w:val="0"/>
+          <w:color w:val="000000"/>
           <w:sz w:val="24"/>
         </w:rPr>
-        <w:t xml:space="preserve">Proin ut ligula vel nunc egestas porttitor. Morbi lectus risus, iaculis vel, suscipit quis, luctus non, </w:t>
+        <w:t xml:space="preserve">Morbi in dui quis est pulvinar ullamcorper. Nulla facilisi. Integer lacinia sollicitudin massa. Cras </w:t>
       </w:r>
       <w:r>
-        <w:rPr>
-          <w:rFonts w:ascii="CenturySchoolbook" w:hAnsi="CenturySchoolbook"/>
-          <w:b w:val="0"/>
-          <w:i w:val="0"/>
-          <w:sz w:val="24"/>
-        </w:rPr>
-        <w:t xml:space="preserve">massa. Fusce ac turpis quis ligula lacinia aliquet. Mauris ipsum. Nulla metus metus, ullamcorper </w:t>
-      </w:r>
-      <w:r>
-        <w:rPr>
-          <w:rFonts w:ascii="CenturySchoolbook" w:hAnsi="CenturySchoolbook"/>
-          <w:b w:val="0"/>
-          <w:i w:val="0"/>
-          <w:sz w:val="24"/>
-        </w:rPr>
-        <w:t xml:space="preserve">vel, tincidunt sed, euismod in, nibh. Quisque volutpat condimentum velit. Class aptent taciti </w:t>
-      </w:r>
-      <w:r>
-        <w:rPr>
-          <w:rFonts w:ascii="CenturySchoolbook" w:hAnsi="CenturySchoolbook"/>
-          <w:b w:val="0"/>
-          <w:i w:val="0"/>
-          <w:sz w:val="24"/>
-        </w:rPr>
-        <w:t xml:space="preserve">sociosqu ad litora torquent per conubia nostra, per inceptos himenaeos. Nam nec ante. Sed lacinia, </w:t>
-      </w:r>
-      <w:r>
-        <w:rPr>
-          <w:rFonts w:ascii="CenturySchoolbook" w:hAnsi="CenturySchoolbook"/>
-          <w:b w:val="0"/>
-          <w:i w:val="0"/>
-          <w:sz w:val="24"/>
-        </w:rPr>
-        <w:t xml:space="preserve">urna non tincidunt mattis, tortor neque adipiscing diam, a cursus ipsum ante quis turpis. Nulla </w:t>
-      </w:r>
-      <w:r>
-        <w:rPr>
-          <w:rFonts w:ascii="CenturySchoolbook" w:hAnsi="CenturySchoolbook"/>
-          <w:b w:val="0"/>
-          <w:i w:val="0"/>
-          <w:sz w:val="24"/>
-        </w:rPr>
-        <w:t xml:space="preserve">facilisi. Ut fringilla. Suspendisse potenti.  </w:t>
-      </w:r>
-      <w:r>
-        <w:rPr>
-          <w:rFonts w:ascii="CenturySchoolbook" w:hAnsi="CenturySchoolbook"/>
-          <w:b w:val="0"/>
-          <w:i w:val="0"/>
-          <w:sz w:val="24"/>
-        </w:rPr>
         <w:t xml:space="preserve"> </w:t>
       </w:r>
       <w:r>
@@ -1122,60 +1295,397 @@
           <w:rFonts w:ascii="CenturySchoolbook" w:hAnsi="CenturySchoolbook"/>
           <w:b w:val="0"/>
           <w:i w:val="0"/>
+          <w:color w:val="000000"/>
           <w:sz w:val="24"/>
         </w:rPr>
-        <w:t xml:space="preserve">Nunc feugiat mi a tellus consequat imperdiet. Vestibulum sapien. Proin quam. Etiam ultrices. </w:t>
+        <w:t xml:space="preserve">metus. Sed aliquet risus a tortor. Integer id quam. Morbi mi. Quisque nisl felis, venenatis tristique, </w:t>
+      </w:r>
+      <w:r>
+        <w:t xml:space="preserve"> </w:t>
       </w:r>
       <w:r>
         <w:rPr>
           <w:rFonts w:ascii="CenturySchoolbook" w:hAnsi="CenturySchoolbook"/>
           <w:b w:val="0"/>
           <w:i w:val="0"/>
+          <w:color w:val="000000"/>
           <w:sz w:val="24"/>
         </w:rPr>
-        <w:t xml:space="preserve">Suspendisse in justo eu magna luctus suscipit. Sed lectus. Integer euismod lacus luctus magna. </w:t>
+        <w:t xml:space="preserve">dignissim in, ultrices sit amet, augue. Proin sodales libero eget ante. Nulla quam. Aenean laoreet. </w:t>
+      </w:r>
+      <w:r>
+        <w:t xml:space="preserve"> </w:t>
       </w:r>
       <w:r>
         <w:rPr>
           <w:rFonts w:ascii="CenturySchoolbook" w:hAnsi="CenturySchoolbook"/>
           <w:b w:val="0"/>
           <w:i w:val="0"/>
+          <w:color w:val="000000"/>
           <w:sz w:val="24"/>
         </w:rPr>
-        <w:t xml:space="preserve">Quisque cursus, metus vitae pharetra auctor, sem massa mattis sem, at interdum magna augue </w:t>
+        <w:t xml:space="preserve">Vestibulum nisi lectus, commodo ac, facilisis ac, ultricies eu, pede. Ut orci risus, accumsan </w:t>
+      </w:r>
+      <w:r>
+        <w:t xml:space="preserve"> </w:t>
       </w:r>
       <w:r>
         <w:rPr>
           <w:rFonts w:ascii="CenturySchoolbook" w:hAnsi="CenturySchoolbook"/>
           <w:b w:val="0"/>
           <w:i w:val="0"/>
+          <w:color w:val="000000"/>
           <w:sz w:val="24"/>
         </w:rPr>
-        <w:t xml:space="preserve">eget diam. Vestibulum ante ipsum primis in faucibus orci luctus et ultrices posuere cubilia Curae; </w:t>
+        <w:t xml:space="preserve">porttitor, cursus quis, aliquet eget, justo. Sed pretium blandit orci.  </w:t>
+      </w:r>
+      <w:r>
+        <w:t xml:space="preserve"> </w:t>
       </w:r>
       <w:r>
         <w:rPr>
           <w:rFonts w:ascii="CenturySchoolbook" w:hAnsi="CenturySchoolbook"/>
           <w:b w:val="0"/>
           <w:i w:val="0"/>
+          <w:color w:val="000000"/>
           <w:sz w:val="24"/>
         </w:rPr>
-        <w:t xml:space="preserve">Morbi lacinia molestie dui. Praesent blandit dolor. Sed non quam. In vel mi sit amet augue congue </w:t>
+        <w:t xml:space="preserve"> </w:t>
+      </w:r>
+      <w:r>
+        <w:t xml:space="preserve"> </w:t>
       </w:r>
       <w:r>
         <w:rPr>
           <w:rFonts w:ascii="CenturySchoolbook" w:hAnsi="CenturySchoolbook"/>
           <w:b w:val="0"/>
           <w:i w:val="0"/>
+          <w:color w:val="000000"/>
           <w:sz w:val="24"/>
         </w:rPr>
-        <w:t xml:space="preserve">elementum. Morbi in ipsum sit amet pede facilisis laoreet.  </w:t>
+        <w:t xml:space="preserve">Ut eu diam at pede suscipit sodales. Aenean lectus elit, fermentum non, convallis id, sagittis at, </w:t>
+      </w:r>
+      <w:r>
+        <w:t xml:space="preserve"> </w:t>
       </w:r>
       <w:r>
         <w:rPr>
           <w:rFonts w:ascii="CenturySchoolbook" w:hAnsi="CenturySchoolbook"/>
           <w:b w:val="0"/>
           <w:i w:val="0"/>
+          <w:color w:val="000000"/>
+          <w:sz w:val="24"/>
+        </w:rPr>
+        <w:t xml:space="preserve">neque. Nullam mauris orci, aliquet et, iaculis et, viverra vitae, ligula. Nulla ut felis in purus </w:t>
+      </w:r>
+      <w:r>
+        <w:t xml:space="preserve"> </w:t>
+      </w:r>
+      <w:r>
+        <w:rPr>
+          <w:rFonts w:ascii="CenturySchoolbook" w:hAnsi="CenturySchoolbook"/>
+          <w:b w:val="0"/>
+          <w:i w:val="0"/>
+          <w:color w:val="000000"/>
+          <w:sz w:val="24"/>
+        </w:rPr>
+        <w:t xml:space="preserve">aliquam imperdiet. Maecenas aliquet mollis lectus. Vivamus consectetuer risus et tortor. Lorem </w:t>
+      </w:r>
+      <w:r>
+        <w:t xml:space="preserve"> </w:t>
+      </w:r>
+      <w:r>
+        <w:rPr>
+          <w:rFonts w:ascii="CenturySchoolbook" w:hAnsi="CenturySchoolbook"/>
+          <w:b w:val="0"/>
+          <w:i w:val="0"/>
+          <w:color w:val="000000"/>
+          <w:sz w:val="24"/>
+        </w:rPr>
+        <w:t xml:space="preserve">ipsum dolor sit amet, consectetur adipiscing elit. Integer nec odio. Praesent libero. Sed cursus ante </w:t>
+      </w:r>
+      <w:r>
+        <w:t xml:space="preserve"> </w:t>
+      </w:r>
+      <w:r>
+        <w:rPr>
+          <w:rFonts w:ascii="CenturySchoolbook" w:hAnsi="CenturySchoolbook"/>
+          <w:b w:val="0"/>
+          <w:i w:val="0"/>
+          <w:color w:val="000000"/>
+          <w:sz w:val="24"/>
+        </w:rPr>
+        <w:t xml:space="preserve">dapibus diam. Sed nisi. Nulla quis sem at nibh elementum imperdiet. Duis sagittis ipsum. </w:t>
+      </w:r>
+      <w:r>
+        <w:t xml:space="preserve"> </w:t>
+      </w:r>
+      <w:r>
+        <w:rPr>
+          <w:rFonts w:ascii="CenturySchoolbook" w:hAnsi="CenturySchoolbook"/>
+          <w:b w:val="0"/>
+          <w:i w:val="0"/>
+          <w:color w:val="000000"/>
+          <w:sz w:val="24"/>
+        </w:rPr>
+        <w:t xml:space="preserve">Praesent mauris.  </w:t>
+      </w:r>
+      <w:r>
+        <w:t xml:space="preserve"> </w:t>
+      </w:r>
+      <w:r>
+        <w:rPr>
+          <w:rFonts w:ascii="CenturySchoolbook" w:hAnsi="CenturySchoolbook"/>
+          <w:b w:val="0"/>
+          <w:i w:val="0"/>
+          <w:color w:val="000000"/>
+          <w:sz w:val="24"/>
+        </w:rPr>
+        <w:t xml:space="preserve"> </w:t>
+      </w:r>
+      <w:r>
+        <w:t xml:space="preserve"> </w:t>
+      </w:r>
+      <w:r>
+        <w:rPr>
+          <w:rFonts w:ascii="CenturySchoolbook" w:hAnsi="CenturySchoolbook"/>
+          <w:b w:val="0"/>
+          <w:i w:val="0"/>
+          <w:color w:val="000000"/>
+          <w:sz w:val="24"/>
+        </w:rPr>
+        <w:t xml:space="preserve">Fusce nec tellus sed augue semper porta. Mauris massa. Vestibulum lacinia arcu eget nulla. Class </w:t>
+      </w:r>
+      <w:r>
+        <w:t xml:space="preserve"> </w:t>
+      </w:r>
+      <w:r>
+        <w:rPr>
+          <w:rFonts w:ascii="CenturySchoolbook" w:hAnsi="CenturySchoolbook"/>
+          <w:b w:val="0"/>
+          <w:i w:val="0"/>
+          <w:color w:val="000000"/>
+          <w:sz w:val="24"/>
+        </w:rPr>
+        <w:t xml:space="preserve">aptent taciti sociosqu ad litora torquent per conubia nostra, per inceptos himenaeos. Curabitur </w:t>
+      </w:r>
+      <w:r>
+        <w:t xml:space="preserve"> </w:t>
+      </w:r>
+      <w:r>
+        <w:rPr>
+          <w:rFonts w:ascii="CenturySchoolbook" w:hAnsi="CenturySchoolbook"/>
+          <w:b w:val="0"/>
+          <w:i w:val="0"/>
+          <w:color w:val="000000"/>
+          <w:sz w:val="24"/>
+        </w:rPr>
+        <w:t xml:space="preserve">sodales ligula in libero. Sed dignissim lacinia nunc. Curabitur tortor. Pellentesque nibh. Aenean </w:t>
+      </w:r>
+      <w:r>
+        <w:t xml:space="preserve"> </w:t>
+      </w:r>
+      <w:r>
+        <w:rPr>
+          <w:rFonts w:ascii="CenturySchoolbook" w:hAnsi="CenturySchoolbook"/>
+          <w:b w:val="0"/>
+          <w:i w:val="0"/>
+          <w:color w:val="000000"/>
+          <w:sz w:val="24"/>
+        </w:rPr>
+        <w:t xml:space="preserve">quam. In scelerisque sem at dolor. Maecenas mattis. Sed convallis tristique sem.  </w:t>
+      </w:r>
+      <w:r>
+        <w:t xml:space="preserve"> </w:t>
+      </w:r>
+      <w:r>
+        <w:rPr>
+          <w:rFonts w:ascii="CenturySchoolbook" w:hAnsi="CenturySchoolbook"/>
+          <w:b w:val="0"/>
+          <w:i w:val="0"/>
+          <w:color w:val="000000"/>
+          <w:sz w:val="24"/>
+        </w:rPr>
+        <w:t xml:space="preserve"> </w:t>
+      </w:r>
+      <w:r>
+        <w:t xml:space="preserve"> </w:t>
+      </w:r>
+      <w:r>
+        <w:rPr>
+          <w:rFonts w:ascii="CenturySchoolbook" w:hAnsi="CenturySchoolbook"/>
+          <w:b w:val="0"/>
+          <w:i w:val="0"/>
+          <w:color w:val="000000"/>
+          <w:sz w:val="24"/>
+        </w:rPr>
+        <w:t xml:space="preserve">Proin ut ligula vel nunc egestas porttitor. Morbi lectus risus, iaculis vel, suscipit quis, luctus non, </w:t>
+      </w:r>
+      <w:r>
+        <w:t xml:space="preserve"> </w:t>
+      </w:r>
+      <w:r>
+        <w:rPr>
+          <w:rFonts w:ascii="CenturySchoolbook" w:hAnsi="CenturySchoolbook"/>
+          <w:b w:val="0"/>
+          <w:i w:val="0"/>
+          <w:color w:val="000000"/>
+          <w:sz w:val="24"/>
+        </w:rPr>
+        <w:t xml:space="preserve">massa. Fusce ac turpis quis ligula lacinia aliquet. Mauris ipsum. Nulla metus metus, ullamcorper </w:t>
+      </w:r>
+      <w:r>
+        <w:t xml:space="preserve"> </w:t>
+      </w:r>
+      <w:r>
+        <w:rPr>
+          <w:rFonts w:ascii="CenturySchoolbook" w:hAnsi="CenturySchoolbook"/>
+          <w:b w:val="0"/>
+          <w:i w:val="0"/>
+          <w:color w:val="000000"/>
+          <w:sz w:val="24"/>
+        </w:rPr>
+        <w:t xml:space="preserve">vel, tincidunt sed, euismod in, nibh. Quisque volutpat condimentum velit. Class aptent taciti </w:t>
+      </w:r>
+      <w:r>
+        <w:t xml:space="preserve"> </w:t>
+      </w:r>
+      <w:r>
+        <w:rPr>
+          <w:rFonts w:ascii="CenturySchoolbook" w:hAnsi="CenturySchoolbook"/>
+          <w:b w:val="0"/>
+          <w:i w:val="0"/>
+          <w:color w:val="000000"/>
+          <w:sz w:val="24"/>
+        </w:rPr>
+        <w:t xml:space="preserve">sociosqu ad litora torquent per conubia nostra, per inceptos himenaeos. Nam nec ante. Sed lacinia, </w:t>
+      </w:r>
+      <w:r>
+        <w:t xml:space="preserve"> </w:t>
+      </w:r>
+      <w:r>
+        <w:rPr>
+          <w:rFonts w:ascii="CenturySchoolbook" w:hAnsi="CenturySchoolbook"/>
+          <w:b w:val="0"/>
+          <w:i w:val="0"/>
+          <w:color w:val="000000"/>
+          <w:sz w:val="24"/>
+        </w:rPr>
+        <w:t xml:space="preserve">urna non tincidunt mattis, tortor neque adipiscing diam, a cursus ipsum ante quis turpis. Nulla </w:t>
+      </w:r>
+      <w:r>
+        <w:t xml:space="preserve"> </w:t>
+      </w:r>
+      <w:r>
+        <w:rPr>
+          <w:rFonts w:ascii="CenturySchoolbook" w:hAnsi="CenturySchoolbook"/>
+          <w:b w:val="0"/>
+          <w:i w:val="0"/>
+          <w:color w:val="000000"/>
+          <w:sz w:val="24"/>
+        </w:rPr>
+        <w:t xml:space="preserve">facilisi. Ut fringilla. Suspendisse potenti.  </w:t>
+      </w:r>
+      <w:r>
+        <w:t xml:space="preserve"> </w:t>
+      </w:r>
+      <w:r>
+        <w:rPr>
+          <w:rFonts w:ascii="CenturySchoolbook" w:hAnsi="CenturySchoolbook"/>
+          <w:b w:val="0"/>
+          <w:i w:val="0"/>
+          <w:color w:val="000000"/>
+          <w:sz w:val="24"/>
+        </w:rPr>
+        <w:t xml:space="preserve"> </w:t>
+      </w:r>
+      <w:r>
+        <w:t xml:space="preserve"> </w:t>
+      </w:r>
+      <w:r>
+        <w:rPr>
+          <w:rFonts w:ascii="CenturySchoolbook" w:hAnsi="CenturySchoolbook"/>
+          <w:b w:val="0"/>
+          <w:i w:val="0"/>
+          <w:color w:val="000000"/>
+          <w:sz w:val="24"/>
+        </w:rPr>
+        <w:t xml:space="preserve">Nunc feugiat mi a tellus consequat imperdiet. Vestibulum sapien. Proin quam. Etiam ultrices. </w:t>
+      </w:r>
+      <w:r>
+        <w:t xml:space="preserve"> </w:t>
+      </w:r>
+      <w:r>
+        <w:rPr>
+          <w:rFonts w:ascii="CenturySchoolbook" w:hAnsi="CenturySchoolbook"/>
+          <w:b w:val="0"/>
+          <w:i w:val="0"/>
+          <w:color w:val="000000"/>
+          <w:sz w:val="24"/>
+        </w:rPr>
+        <w:t xml:space="preserve">Suspendisse in justo eu magna luctus suscipit. Sed lectus. Integer euismod lacus luctus magna. </w:t>
+      </w:r>
+      <w:r>
+        <w:t xml:space="preserve"> </w:t>
+      </w:r>
+      <w:r>
+        <w:rPr>
+          <w:rFonts w:ascii="CenturySchoolbook" w:hAnsi="CenturySchoolbook"/>
+          <w:b w:val="0"/>
+          <w:i w:val="0"/>
+          <w:color w:val="000000"/>
+          <w:sz w:val="24"/>
+        </w:rPr>
+        <w:t xml:space="preserve">Quisque cursus, metus vitae pharetra auctor, sem massa mattis sem, at interdum magna augue </w:t>
+      </w:r>
+      <w:r>
+        <w:t xml:space="preserve"> </w:t>
+      </w:r>
+      <w:r>
+        <w:rPr>
+          <w:rFonts w:ascii="CenturySchoolbook" w:hAnsi="CenturySchoolbook"/>
+          <w:b w:val="0"/>
+          <w:i w:val="0"/>
+          <w:color w:val="000000"/>
+          <w:sz w:val="24"/>
+        </w:rPr>
+        <w:t xml:space="preserve">eget diam. Vestibulum ante ipsum primis in faucibus orci luctus et ultrices posuere cubilia Curae; </w:t>
+      </w:r>
+      <w:r>
+        <w:t xml:space="preserve"> </w:t>
+      </w:r>
+      <w:r>
+        <w:rPr>
+          <w:rFonts w:ascii="CenturySchoolbook" w:hAnsi="CenturySchoolbook"/>
+          <w:b w:val="0"/>
+          <w:i w:val="0"/>
+          <w:color w:val="000000"/>
+          <w:sz w:val="24"/>
+        </w:rPr>
+        <w:t xml:space="preserve">Morbi lacinia molestie dui. Praesent blandit dolor. Sed non quam. In vel mi sit amet augue congue </w:t>
+      </w:r>
+      <w:r>
+        <w:t xml:space="preserve"> </w:t>
+      </w:r>
+      <w:r>
+        <w:rPr>
+          <w:rFonts w:ascii="CenturySchoolbook" w:hAnsi="CenturySchoolbook"/>
+          <w:b w:val="0"/>
+          <w:i w:val="0"/>
+          <w:color w:val="000000"/>
+          <w:sz w:val="24"/>
+        </w:rPr>
+        <w:t xml:space="preserve">elementum. Morbi in ipsum sit amet pede facilisis laoreet.  </w:t>
+      </w:r>
+      <w:r>
+        <w:t xml:space="preserve"> </w:t>
+      </w:r>
+      <w:r>
+        <w:rPr>
+          <w:rFonts w:ascii="CenturySchoolbook" w:hAnsi="CenturySchoolbook"/>
+          <w:b w:val="0"/>
+          <w:i w:val="0"/>
+          <w:color w:val="000000"/>
           <w:sz w:val="24"/>
         </w:rPr>
         <w:t xml:space="preserve"> </w:t>

</xml_diff>

<commit_message>
Step 36 - Preserve PDF page size and margins
</commit_message>
<xml_diff>
--- a/output/output.docx
+++ b/output/output.docx
@@ -586,9 +586,14 @@
       </w:r>
     </w:p>
     <w:p>
-      <w:r>
-        <w:br w:type="page"/>
-      </w:r>
+      <w:pPr>
+        <w:sectPr>
+          <w:pgSz w:w="12240" w:h="15840"/>
+          <w:pgMar w:top="972" w:right="627" w:bottom="1261" w:left="723" w:header="720" w:footer="720" w:gutter="0"/>
+          <w:cols w:space="720"/>
+          <w:docGrid w:linePitch="360"/>
+        </w:sectPr>
+      </w:pPr>
     </w:p>
     <w:p>
       <w:pPr>
@@ -1217,9 +1222,14 @@
       </w:r>
     </w:p>
     <w:p>
-      <w:r>
-        <w:br w:type="page"/>
-      </w:r>
+      <w:pPr>
+        <w:sectPr>
+          <w:pgSz w:w="12240" w:h="15840"/>
+          <w:pgMar w:top="730" w:right="650" w:bottom="1261" w:left="723" w:header="720" w:footer="720" w:gutter="0"/>
+          <w:cols w:space="720"/>
+          <w:docGrid w:linePitch="360"/>
+        </w:sectPr>
+      </w:pPr>
     </w:p>
     <w:p>
       <w:pPr>
@@ -1693,7 +1703,7 @@
     </w:p>
     <w:sectPr>
       <w:pgSz w:w="12240" w:h="15840"/>
-      <w:pgMar w:top="1440" w:right="1800" w:bottom="1440" w:left="1800" w:header="720" w:footer="720" w:gutter="0"/>
+      <w:pgMar w:top="730" w:right="650" w:bottom="4722" w:left="723" w:header="720" w:footer="720" w:gutter="0"/>
       <w:cols w:space="720"/>
       <w:docGrid w:linePitch="360"/>
     </w:sectPr>

</xml_diff>

<commit_message>
Step 38 - Preserve exact PDF line spacing
</commit_message>
<xml_diff>
--- a/output/output.docx
+++ b/output/output.docx
@@ -4,6 +4,7 @@
   <w:body>
     <w:p>
       <w:pPr>
+        <w:spacing w:before="0" w:after="0" w:lineRule="exact" w:line="865"/>
         <w:jc w:val="left"/>
       </w:pPr>
       <w:r>
@@ -19,21 +20,9 @@
     </w:p>
     <w:p>
       <w:pPr>
+        <w:spacing w:before="288" w:after="0" w:lineRule="exact" w:line="433"/>
         <w:jc w:val="left"/>
       </w:pPr>
-      <w:r>
-        <w:rPr>
-          <w:rFonts w:ascii="CenturySchoolbook" w:hAnsi="CenturySchoolbook"/>
-          <w:b w:val="0"/>
-          <w:i w:val="0"/>
-          <w:color w:val="000000"/>
-          <w:sz w:val="24"/>
-        </w:rPr>
-        <w:t xml:space="preserve"> </w:t>
-      </w:r>
-      <w:r>
-        <w:t xml:space="preserve"> </w:t>
-      </w:r>
       <w:r>
         <w:rPr>
           <w:rFonts w:ascii="CenturySchoolbook" w:hAnsi="CenturySchoolbook"/>
@@ -64,22 +53,12 @@
         </w:rPr>
         <w:t xml:space="preserve"> </w:t>
       </w:r>
-      <w:r>
-        <w:t xml:space="preserve"> </w:t>
-      </w:r>
-      <w:r>
-        <w:rPr>
-          <w:rFonts w:ascii="CenturySchoolbook" w:hAnsi="CenturySchoolbook"/>
-          <w:b w:val="0"/>
-          <w:i w:val="0"/>
-          <w:color w:val="000000"/>
-          <w:sz w:val="24"/>
-        </w:rPr>
-        <w:t xml:space="preserve"> </w:t>
-      </w:r>
-      <w:r>
-        <w:t xml:space="preserve"> </w:t>
-      </w:r>
+    </w:p>
+    <w:p>
+      <w:pPr>
+        <w:spacing w:before="288" w:after="0" w:lineRule="exact" w:line="384"/>
+        <w:jc w:val="left"/>
+      </w:pPr>
       <w:r>
         <w:rPr>
           <w:rFonts w:ascii="CenturySchoolbook" w:hAnsi="CenturySchoolbook"/>
@@ -142,22 +121,12 @@
         </w:rPr>
         <w:t xml:space="preserve">longer than the other? </w:t>
       </w:r>
-      <w:r>
-        <w:t xml:space="preserve"> </w:t>
-      </w:r>
-      <w:r>
-        <w:rPr>
-          <w:rFonts w:ascii="CenturySchoolbook" w:hAnsi="CenturySchoolbook"/>
-          <w:b w:val="0"/>
-          <w:i w:val="0"/>
-          <w:color w:val="000000"/>
-          <w:sz w:val="24"/>
-        </w:rPr>
-        <w:t xml:space="preserve"> </w:t>
-      </w:r>
-      <w:r>
-        <w:t xml:space="preserve"> </w:t>
-      </w:r>
+    </w:p>
+    <w:p>
+      <w:pPr>
+        <w:spacing w:before="288" w:after="0" w:lineRule="exact" w:line="288"/>
+        <w:jc w:val="left"/>
+      </w:pPr>
       <w:r>
         <w:rPr>
           <w:rFonts w:ascii="CenturySchoolbook" w:hAnsi="CenturySchoolbook"/>
@@ -220,22 +189,12 @@
         </w:rPr>
         <w:t xml:space="preserve">conubia nostra, per inceptos himenaeos. Curabitur sodales ligula in libero.  </w:t>
       </w:r>
-      <w:r>
-        <w:t xml:space="preserve"> </w:t>
-      </w:r>
-      <w:r>
-        <w:rPr>
-          <w:rFonts w:ascii="CenturySchoolbook" w:hAnsi="CenturySchoolbook"/>
-          <w:b w:val="0"/>
-          <w:i w:val="0"/>
-          <w:color w:val="000000"/>
-          <w:sz w:val="24"/>
-        </w:rPr>
-        <w:t xml:space="preserve"> </w:t>
-      </w:r>
-      <w:r>
-        <w:t xml:space="preserve"> </w:t>
-      </w:r>
+    </w:p>
+    <w:p>
+      <w:pPr>
+        <w:spacing w:before="288" w:after="0" w:lineRule="exact" w:line="288"/>
+        <w:jc w:val="left"/>
+      </w:pPr>
       <w:r>
         <w:rPr>
           <w:rFonts w:ascii="CenturySchoolbook" w:hAnsi="CenturySchoolbook"/>
@@ -285,22 +244,12 @@
         </w:rPr>
         <w:t xml:space="preserve">aliquet. Mauris ipsum. Nulla metus metus, ullamcorper vel, tincidunt sed, euismod in, nibh.  </w:t>
       </w:r>
-      <w:r>
-        <w:t xml:space="preserve"> </w:t>
-      </w:r>
-      <w:r>
-        <w:rPr>
-          <w:rFonts w:ascii="CenturySchoolbook" w:hAnsi="CenturySchoolbook"/>
-          <w:b w:val="0"/>
-          <w:i w:val="0"/>
-          <w:color w:val="000000"/>
-          <w:sz w:val="24"/>
-        </w:rPr>
-        <w:t xml:space="preserve"> </w:t>
-      </w:r>
-      <w:r>
-        <w:t xml:space="preserve"> </w:t>
-      </w:r>
+    </w:p>
+    <w:p>
+      <w:pPr>
+        <w:spacing w:before="288" w:after="0" w:lineRule="exact" w:line="288"/>
+        <w:jc w:val="left"/>
+      </w:pPr>
       <w:r>
         <w:rPr>
           <w:rFonts w:ascii="CenturySchoolbook" w:hAnsi="CenturySchoolbook"/>
@@ -350,22 +299,12 @@
         </w:rPr>
         <w:t xml:space="preserve">Nunc feugiat mi a tellus consequat imperdiet. Vestibulum sapien. Proin quam. Etiam ultrices.  </w:t>
       </w:r>
-      <w:r>
-        <w:t xml:space="preserve"> </w:t>
-      </w:r>
-      <w:r>
-        <w:rPr>
-          <w:rFonts w:ascii="CenturySchoolbook" w:hAnsi="CenturySchoolbook"/>
-          <w:b w:val="0"/>
-          <w:i w:val="0"/>
-          <w:color w:val="000000"/>
-          <w:sz w:val="24"/>
-        </w:rPr>
-        <w:t xml:space="preserve"> </w:t>
-      </w:r>
-      <w:r>
-        <w:t xml:space="preserve"> </w:t>
-      </w:r>
+    </w:p>
+    <w:p>
+      <w:pPr>
+        <w:spacing w:before="288" w:after="0" w:lineRule="exact" w:line="288"/>
+        <w:jc w:val="left"/>
+      </w:pPr>
       <w:r>
         <w:rPr>
           <w:rFonts w:ascii="CenturySchoolbook" w:hAnsi="CenturySchoolbook"/>
@@ -454,22 +393,12 @@
         </w:rPr>
         <w:t xml:space="preserve">sit amet mauris.  </w:t>
       </w:r>
-      <w:r>
-        <w:t xml:space="preserve"> </w:t>
-      </w:r>
-      <w:r>
-        <w:rPr>
-          <w:rFonts w:ascii="CenturySchoolbook" w:hAnsi="CenturySchoolbook"/>
-          <w:b w:val="0"/>
-          <w:i w:val="0"/>
-          <w:color w:val="000000"/>
-          <w:sz w:val="24"/>
-        </w:rPr>
-        <w:t xml:space="preserve"> </w:t>
-      </w:r>
-      <w:r>
-        <w:t xml:space="preserve"> </w:t>
-      </w:r>
+    </w:p>
+    <w:p>
+      <w:pPr>
+        <w:spacing w:before="288" w:after="0" w:lineRule="exact" w:line="288"/>
+        <w:jc w:val="left"/>
+      </w:pPr>
       <w:r>
         <w:rPr>
           <w:rFonts w:ascii="CenturySchoolbook" w:hAnsi="CenturySchoolbook"/>
@@ -532,22 +461,12 @@
         </w:rPr>
         <w:t xml:space="preserve">porttitor, cursus quis, aliquet eget, justo. Sed pretium blandit orci.  </w:t>
       </w:r>
-      <w:r>
-        <w:t xml:space="preserve"> </w:t>
-      </w:r>
-      <w:r>
-        <w:rPr>
-          <w:rFonts w:ascii="CenturySchoolbook" w:hAnsi="CenturySchoolbook"/>
-          <w:b w:val="0"/>
-          <w:i w:val="0"/>
-          <w:color w:val="000000"/>
-          <w:sz w:val="24"/>
-        </w:rPr>
-        <w:t xml:space="preserve"> </w:t>
-      </w:r>
-      <w:r>
-        <w:t xml:space="preserve"> </w:t>
-      </w:r>
+    </w:p>
+    <w:p>
+      <w:pPr>
+        <w:spacing w:before="288" w:after="0" w:lineRule="exact" w:line="288"/>
+        <w:jc w:val="left"/>
+      </w:pPr>
       <w:r>
         <w:rPr>
           <w:rFonts w:ascii="CenturySchoolbook" w:hAnsi="CenturySchoolbook"/>
@@ -597,6 +516,7 @@
     </w:p>
     <w:p>
       <w:pPr>
+        <w:spacing w:before="0" w:after="0" w:lineRule="exact" w:line="288"/>
         <w:jc w:val="left"/>
       </w:pPr>
       <w:r>
@@ -635,22 +555,12 @@
         </w:rPr>
         <w:t xml:space="preserve">Praesent mauris.  </w:t>
       </w:r>
-      <w:r>
-        <w:t xml:space="preserve"> </w:t>
-      </w:r>
-      <w:r>
-        <w:rPr>
-          <w:rFonts w:ascii="CenturySchoolbook" w:hAnsi="CenturySchoolbook"/>
-          <w:b w:val="0"/>
-          <w:i w:val="0"/>
-          <w:color w:val="000000"/>
-          <w:sz w:val="24"/>
-        </w:rPr>
-        <w:t xml:space="preserve"> </w:t>
-      </w:r>
-      <w:r>
-        <w:t xml:space="preserve"> </w:t>
-      </w:r>
+    </w:p>
+    <w:p>
+      <w:pPr>
+        <w:spacing w:before="288" w:after="0" w:lineRule="exact" w:line="288"/>
+        <w:jc w:val="left"/>
+      </w:pPr>
       <w:r>
         <w:rPr>
           <w:rFonts w:ascii="CenturySchoolbook" w:hAnsi="CenturySchoolbook"/>
@@ -700,22 +610,12 @@
         </w:rPr>
         <w:t xml:space="preserve">quam. In scelerisque sem at dolor. Maecenas mattis. Sed convallis tristique sem.  </w:t>
       </w:r>
-      <w:r>
-        <w:t xml:space="preserve"> </w:t>
-      </w:r>
-      <w:r>
-        <w:rPr>
-          <w:rFonts w:ascii="CenturySchoolbook" w:hAnsi="CenturySchoolbook"/>
-          <w:b w:val="0"/>
-          <w:i w:val="0"/>
-          <w:color w:val="000000"/>
-          <w:sz w:val="24"/>
-        </w:rPr>
-        <w:t xml:space="preserve"> </w:t>
-      </w:r>
-      <w:r>
-        <w:t xml:space="preserve"> </w:t>
-      </w:r>
+    </w:p>
+    <w:p>
+      <w:pPr>
+        <w:spacing w:before="288" w:after="0" w:lineRule="exact" w:line="288"/>
+        <w:jc w:val="left"/>
+      </w:pPr>
       <w:r>
         <w:rPr>
           <w:rFonts w:ascii="CenturySchoolbook" w:hAnsi="CenturySchoolbook"/>
@@ -791,22 +691,12 @@
         </w:rPr>
         <w:t xml:space="preserve">facilisi. Ut fringilla. Suspendisse potenti.  </w:t>
       </w:r>
-      <w:r>
-        <w:t xml:space="preserve"> </w:t>
-      </w:r>
-      <w:r>
-        <w:rPr>
-          <w:rFonts w:ascii="CenturySchoolbook" w:hAnsi="CenturySchoolbook"/>
-          <w:b w:val="0"/>
-          <w:i w:val="0"/>
-          <w:color w:val="000000"/>
-          <w:sz w:val="24"/>
-        </w:rPr>
-        <w:t xml:space="preserve"> </w:t>
-      </w:r>
-      <w:r>
-        <w:t xml:space="preserve"> </w:t>
-      </w:r>
+    </w:p>
+    <w:p>
+      <w:pPr>
+        <w:spacing w:before="288" w:after="0" w:lineRule="exact" w:line="288"/>
+        <w:jc w:val="left"/>
+      </w:pPr>
       <w:r>
         <w:rPr>
           <w:rFonts w:ascii="CenturySchoolbook" w:hAnsi="CenturySchoolbook"/>
@@ -882,22 +772,12 @@
         </w:rPr>
         <w:t xml:space="preserve">elementum. Morbi in ipsum sit amet pede facilisis laoreet.  </w:t>
       </w:r>
-      <w:r>
-        <w:t xml:space="preserve"> </w:t>
-      </w:r>
-      <w:r>
-        <w:rPr>
-          <w:rFonts w:ascii="CenturySchoolbook" w:hAnsi="CenturySchoolbook"/>
-          <w:b w:val="0"/>
-          <w:i w:val="0"/>
-          <w:color w:val="000000"/>
-          <w:sz w:val="24"/>
-        </w:rPr>
-        <w:t xml:space="preserve"> </w:t>
-      </w:r>
-      <w:r>
-        <w:t xml:space="preserve"> </w:t>
-      </w:r>
+    </w:p>
+    <w:p>
+      <w:pPr>
+        <w:spacing w:before="288" w:after="0" w:lineRule="exact" w:line="288"/>
+        <w:jc w:val="left"/>
+      </w:pPr>
       <w:r>
         <w:rPr>
           <w:rFonts w:ascii="CenturySchoolbook" w:hAnsi="CenturySchoolbook"/>
@@ -947,22 +827,12 @@
         </w:rPr>
         <w:t xml:space="preserve">tortor. Integer id quam. Morbi mi.  </w:t>
       </w:r>
-      <w:r>
-        <w:t xml:space="preserve"> </w:t>
-      </w:r>
-      <w:r>
-        <w:rPr>
-          <w:rFonts w:ascii="CenturySchoolbook" w:hAnsi="CenturySchoolbook"/>
-          <w:b w:val="0"/>
-          <w:i w:val="0"/>
-          <w:color w:val="000000"/>
-          <w:sz w:val="24"/>
-        </w:rPr>
-        <w:t xml:space="preserve"> </w:t>
-      </w:r>
-      <w:r>
-        <w:t xml:space="preserve"> </w:t>
-      </w:r>
+    </w:p>
+    <w:p>
+      <w:pPr>
+        <w:spacing w:before="288" w:after="0" w:lineRule="exact" w:line="288"/>
+        <w:jc w:val="left"/>
+      </w:pPr>
       <w:r>
         <w:rPr>
           <w:rFonts w:ascii="CenturySchoolbook" w:hAnsi="CenturySchoolbook"/>
@@ -1025,22 +895,12 @@
         </w:rPr>
         <w:t xml:space="preserve">inceptos himenaeos. Curabitur sodales ligula in libero.  </w:t>
       </w:r>
-      <w:r>
-        <w:t xml:space="preserve"> </w:t>
-      </w:r>
-      <w:r>
-        <w:rPr>
-          <w:rFonts w:ascii="CenturySchoolbook" w:hAnsi="CenturySchoolbook"/>
-          <w:b w:val="0"/>
-          <w:i w:val="0"/>
-          <w:color w:val="000000"/>
-          <w:sz w:val="24"/>
-        </w:rPr>
-        <w:t xml:space="preserve"> </w:t>
-      </w:r>
-      <w:r>
-        <w:t xml:space="preserve"> </w:t>
-      </w:r>
+    </w:p>
+    <w:p>
+      <w:pPr>
+        <w:spacing w:before="288" w:after="0" w:lineRule="exact" w:line="288"/>
+        <w:jc w:val="left"/>
+      </w:pPr>
       <w:r>
         <w:rPr>
           <w:rFonts w:ascii="CenturySchoolbook" w:hAnsi="CenturySchoolbook"/>
@@ -1090,22 +950,12 @@
         </w:rPr>
         <w:t xml:space="preserve">aliquet. Mauris ipsum. Nulla metus metus, ullamcorper vel, tincidunt sed, euismod in, nibh.  </w:t>
       </w:r>
-      <w:r>
-        <w:t xml:space="preserve"> </w:t>
-      </w:r>
-      <w:r>
-        <w:rPr>
-          <w:rFonts w:ascii="CenturySchoolbook" w:hAnsi="CenturySchoolbook"/>
-          <w:b w:val="0"/>
-          <w:i w:val="0"/>
-          <w:color w:val="000000"/>
-          <w:sz w:val="24"/>
-        </w:rPr>
-        <w:t xml:space="preserve"> </w:t>
-      </w:r>
-      <w:r>
-        <w:t xml:space="preserve"> </w:t>
-      </w:r>
+    </w:p>
+    <w:p>
+      <w:pPr>
+        <w:spacing w:before="288" w:after="0" w:lineRule="exact" w:line="288"/>
+        <w:jc w:val="left"/>
+      </w:pPr>
       <w:r>
         <w:rPr>
           <w:rFonts w:ascii="CenturySchoolbook" w:hAnsi="CenturySchoolbook"/>
@@ -1155,22 +1005,12 @@
         </w:rPr>
         <w:t xml:space="preserve">Nunc feugiat mi a tellus consequat imperdiet. Vestibulum sapien. Proin quam. Etiam ultrices.  </w:t>
       </w:r>
-      <w:r>
-        <w:t xml:space="preserve"> </w:t>
-      </w:r>
-      <w:r>
-        <w:rPr>
-          <w:rFonts w:ascii="CenturySchoolbook" w:hAnsi="CenturySchoolbook"/>
-          <w:b w:val="0"/>
-          <w:i w:val="0"/>
-          <w:color w:val="000000"/>
-          <w:sz w:val="24"/>
-        </w:rPr>
-        <w:t xml:space="preserve"> </w:t>
-      </w:r>
-      <w:r>
-        <w:t xml:space="preserve"> </w:t>
-      </w:r>
+    </w:p>
+    <w:p>
+      <w:pPr>
+        <w:spacing w:before="288" w:after="0" w:lineRule="exact" w:line="288"/>
+        <w:jc w:val="left"/>
+      </w:pPr>
       <w:r>
         <w:rPr>
           <w:rFonts w:ascii="CenturySchoolbook" w:hAnsi="CenturySchoolbook"/>
@@ -1233,6 +1073,7 @@
     </w:p>
     <w:p>
       <w:pPr>
+        <w:spacing w:before="0" w:after="0" w:lineRule="exact" w:line="288"/>
         <w:jc w:val="left"/>
       </w:pPr>
       <w:r>
@@ -1271,22 +1112,12 @@
         </w:rPr>
         <w:t xml:space="preserve">sit amet mauris.  </w:t>
       </w:r>
-      <w:r>
-        <w:t xml:space="preserve"> </w:t>
-      </w:r>
-      <w:r>
-        <w:rPr>
-          <w:rFonts w:ascii="CenturySchoolbook" w:hAnsi="CenturySchoolbook"/>
-          <w:b w:val="0"/>
-          <w:i w:val="0"/>
-          <w:color w:val="000000"/>
-          <w:sz w:val="24"/>
-        </w:rPr>
-        <w:t xml:space="preserve"> </w:t>
-      </w:r>
-      <w:r>
-        <w:t xml:space="preserve"> </w:t>
-      </w:r>
+    </w:p>
+    <w:p>
+      <w:pPr>
+        <w:spacing w:before="288" w:after="0" w:lineRule="exact" w:line="288"/>
+        <w:jc w:val="left"/>
+      </w:pPr>
       <w:r>
         <w:rPr>
           <w:rFonts w:ascii="CenturySchoolbook" w:hAnsi="CenturySchoolbook"/>
@@ -1349,22 +1180,12 @@
         </w:rPr>
         <w:t xml:space="preserve">porttitor, cursus quis, aliquet eget, justo. Sed pretium blandit orci.  </w:t>
       </w:r>
-      <w:r>
-        <w:t xml:space="preserve"> </w:t>
-      </w:r>
-      <w:r>
-        <w:rPr>
-          <w:rFonts w:ascii="CenturySchoolbook" w:hAnsi="CenturySchoolbook"/>
-          <w:b w:val="0"/>
-          <w:i w:val="0"/>
-          <w:color w:val="000000"/>
-          <w:sz w:val="24"/>
-        </w:rPr>
-        <w:t xml:space="preserve"> </w:t>
-      </w:r>
-      <w:r>
-        <w:t xml:space="preserve"> </w:t>
-      </w:r>
+    </w:p>
+    <w:p>
+      <w:pPr>
+        <w:spacing w:before="288" w:after="0" w:lineRule="exact" w:line="288"/>
+        <w:jc w:val="left"/>
+      </w:pPr>
       <w:r>
         <w:rPr>
           <w:rFonts w:ascii="CenturySchoolbook" w:hAnsi="CenturySchoolbook"/>
@@ -1440,22 +1261,12 @@
         </w:rPr>
         <w:t xml:space="preserve">Praesent mauris.  </w:t>
       </w:r>
-      <w:r>
-        <w:t xml:space="preserve"> </w:t>
-      </w:r>
-      <w:r>
-        <w:rPr>
-          <w:rFonts w:ascii="CenturySchoolbook" w:hAnsi="CenturySchoolbook"/>
-          <w:b w:val="0"/>
-          <w:i w:val="0"/>
-          <w:color w:val="000000"/>
-          <w:sz w:val="24"/>
-        </w:rPr>
-        <w:t xml:space="preserve"> </w:t>
-      </w:r>
-      <w:r>
-        <w:t xml:space="preserve"> </w:t>
-      </w:r>
+    </w:p>
+    <w:p>
+      <w:pPr>
+        <w:spacing w:before="288" w:after="0" w:lineRule="exact" w:line="288"/>
+        <w:jc w:val="left"/>
+      </w:pPr>
       <w:r>
         <w:rPr>
           <w:rFonts w:ascii="CenturySchoolbook" w:hAnsi="CenturySchoolbook"/>
@@ -1505,22 +1316,12 @@
         </w:rPr>
         <w:t xml:space="preserve">quam. In scelerisque sem at dolor. Maecenas mattis. Sed convallis tristique sem.  </w:t>
       </w:r>
-      <w:r>
-        <w:t xml:space="preserve"> </w:t>
-      </w:r>
-      <w:r>
-        <w:rPr>
-          <w:rFonts w:ascii="CenturySchoolbook" w:hAnsi="CenturySchoolbook"/>
-          <w:b w:val="0"/>
-          <w:i w:val="0"/>
-          <w:color w:val="000000"/>
-          <w:sz w:val="24"/>
-        </w:rPr>
-        <w:t xml:space="preserve"> </w:t>
-      </w:r>
-      <w:r>
-        <w:t xml:space="preserve"> </w:t>
-      </w:r>
+    </w:p>
+    <w:p>
+      <w:pPr>
+        <w:spacing w:before="288" w:after="0" w:lineRule="exact" w:line="288"/>
+        <w:jc w:val="left"/>
+      </w:pPr>
       <w:r>
         <w:rPr>
           <w:rFonts w:ascii="CenturySchoolbook" w:hAnsi="CenturySchoolbook"/>
@@ -1596,22 +1397,12 @@
         </w:rPr>
         <w:t xml:space="preserve">facilisi. Ut fringilla. Suspendisse potenti.  </w:t>
       </w:r>
-      <w:r>
-        <w:t xml:space="preserve"> </w:t>
-      </w:r>
-      <w:r>
-        <w:rPr>
-          <w:rFonts w:ascii="CenturySchoolbook" w:hAnsi="CenturySchoolbook"/>
-          <w:b w:val="0"/>
-          <w:i w:val="0"/>
-          <w:color w:val="000000"/>
-          <w:sz w:val="24"/>
-        </w:rPr>
-        <w:t xml:space="preserve"> </w:t>
-      </w:r>
-      <w:r>
-        <w:t xml:space="preserve"> </w:t>
-      </w:r>
+    </w:p>
+    <w:p>
+      <w:pPr>
+        <w:spacing w:before="288" w:after="0" w:lineRule="exact" w:line="288"/>
+        <w:jc w:val="left"/>
+      </w:pPr>
       <w:r>
         <w:rPr>
           <w:rFonts w:ascii="CenturySchoolbook" w:hAnsi="CenturySchoolbook"/>
@@ -1686,19 +1477,6 @@
           <w:sz w:val="24"/>
         </w:rPr>
         <w:t xml:space="preserve">elementum. Morbi in ipsum sit amet pede facilisis laoreet.  </w:t>
-      </w:r>
-      <w:r>
-        <w:t xml:space="preserve"> </w:t>
-      </w:r>
-      <w:r>
-        <w:rPr>
-          <w:rFonts w:ascii="CenturySchoolbook" w:hAnsi="CenturySchoolbook"/>
-          <w:b w:val="0"/>
-          <w:i w:val="0"/>
-          <w:color w:val="000000"/>
-          <w:sz w:val="24"/>
-        </w:rPr>
-        <w:t xml:space="preserve"> </w:t>
       </w:r>
     </w:p>
     <w:sectPr>

</xml_diff>

<commit_message>
Step 39 - Resolve PDF font names for Word
</commit_message>
<xml_diff>
--- a/output/output.docx
+++ b/output/output.docx
@@ -9,7 +9,7 @@
       </w:pPr>
       <w:r>
         <w:rPr>
-          <w:rFonts w:ascii="CenturySchoolbook-Bold" w:hAnsi="CenturySchoolbook-Bold"/>
+          <w:rFonts w:ascii="Century Schoolbook" w:hAnsi="Century Schoolbook" w:eastAsia="Century Schoolbook" w:cs="Century Schoolbook"/>
           <w:b/>
           <w:i w:val="0"/>
           <w:color w:val="2E74B5"/>
@@ -25,7 +25,7 @@
       </w:pPr>
       <w:r>
         <w:rPr>
-          <w:rFonts w:ascii="CenturySchoolbook" w:hAnsi="CenturySchoolbook"/>
+          <w:rFonts w:ascii="Century Schoolbook" w:hAnsi="Century Schoolbook" w:eastAsia="Century Schoolbook" w:cs="Century Schoolbook"/>
           <w:b w:val="0"/>
           <w:i w:val="0"/>
           <w:color w:val="000000"/>
@@ -35,7 +35,7 @@
       </w:r>
       <w:r>
         <w:rPr>
-          <w:rFonts w:ascii="CenturySchoolbook" w:hAnsi="CenturySchoolbook"/>
+          <w:rFonts w:ascii="Century Schoolbook" w:hAnsi="Century Schoolbook" w:eastAsia="Century Schoolbook" w:cs="Century Schoolbook"/>
           <w:b w:val="0"/>
           <w:i w:val="0"/>
           <w:color w:val="5B9BD5"/>
@@ -45,7 +45,7 @@
       </w:r>
       <w:r>
         <w:rPr>
-          <w:rFonts w:ascii="CenturySchoolbook" w:hAnsi="CenturySchoolbook"/>
+          <w:rFonts w:ascii="Century Schoolbook" w:hAnsi="Century Schoolbook" w:eastAsia="Century Schoolbook" w:cs="Century Schoolbook"/>
           <w:b w:val="0"/>
           <w:i w:val="0"/>
           <w:color w:val="000000"/>
@@ -61,7 +61,7 @@
       </w:pPr>
       <w:r>
         <w:rPr>
-          <w:rFonts w:ascii="CenturySchoolbook" w:hAnsi="CenturySchoolbook"/>
+          <w:rFonts w:ascii="Century Schoolbook" w:hAnsi="Century Schoolbook" w:eastAsia="Century Schoolbook" w:cs="Century Schoolbook"/>
           <w:b w:val="0"/>
           <w:i w:val="0"/>
           <w:color w:val="000000"/>
@@ -74,7 +74,7 @@
       </w:r>
       <w:r>
         <w:rPr>
-          <w:rFonts w:ascii="CenturySchoolbook" w:hAnsi="CenturySchoolbook"/>
+          <w:rFonts w:ascii="Century Schoolbook" w:hAnsi="Century Schoolbook" w:eastAsia="Century Schoolbook" w:cs="Century Schoolbook"/>
           <w:b w:val="0"/>
           <w:i w:val="0"/>
           <w:color w:val="000000"/>
@@ -87,7 +87,7 @@
       </w:r>
       <w:r>
         <w:rPr>
-          <w:rFonts w:ascii="CenturySchoolbook" w:hAnsi="CenturySchoolbook"/>
+          <w:rFonts w:ascii="Century Schoolbook" w:hAnsi="Century Schoolbook" w:eastAsia="Century Schoolbook" w:cs="Century Schoolbook"/>
           <w:b w:val="0"/>
           <w:i w:val="0"/>
           <w:color w:val="000000"/>
@@ -100,7 +100,7 @@
       </w:r>
       <w:r>
         <w:rPr>
-          <w:rFonts w:ascii="CenturySchoolbook" w:hAnsi="CenturySchoolbook"/>
+          <w:rFonts w:ascii="Century Schoolbook" w:hAnsi="Century Schoolbook" w:eastAsia="Century Schoolbook" w:cs="Century Schoolbook"/>
           <w:b w:val="0"/>
           <w:i w:val="0"/>
           <w:color w:val="000000"/>
@@ -113,7 +113,7 @@
       </w:r>
       <w:r>
         <w:rPr>
-          <w:rFonts w:ascii="CenturySchoolbook" w:hAnsi="CenturySchoolbook"/>
+          <w:rFonts w:ascii="Century Schoolbook" w:hAnsi="Century Schoolbook" w:eastAsia="Century Schoolbook" w:cs="Century Schoolbook"/>
           <w:b w:val="0"/>
           <w:i w:val="0"/>
           <w:color w:val="000000"/>
@@ -129,7 +129,7 @@
       </w:pPr>
       <w:r>
         <w:rPr>
-          <w:rFonts w:ascii="CenturySchoolbook" w:hAnsi="CenturySchoolbook"/>
+          <w:rFonts w:ascii="Century Schoolbook" w:hAnsi="Century Schoolbook" w:eastAsia="Century Schoolbook" w:cs="Century Schoolbook"/>
           <w:b w:val="0"/>
           <w:i w:val="0"/>
           <w:color w:val="000000"/>
@@ -142,7 +142,7 @@
       </w:r>
       <w:r>
         <w:rPr>
-          <w:rFonts w:ascii="CenturySchoolbook" w:hAnsi="CenturySchoolbook"/>
+          <w:rFonts w:ascii="Century Schoolbook" w:hAnsi="Century Schoolbook" w:eastAsia="Century Schoolbook" w:cs="Century Schoolbook"/>
           <w:b w:val="0"/>
           <w:i w:val="0"/>
           <w:color w:val="000000"/>
@@ -155,7 +155,7 @@
       </w:r>
       <w:r>
         <w:rPr>
-          <w:rFonts w:ascii="CenturySchoolbook" w:hAnsi="CenturySchoolbook"/>
+          <w:rFonts w:ascii="Century Schoolbook" w:hAnsi="Century Schoolbook" w:eastAsia="Century Schoolbook" w:cs="Century Schoolbook"/>
           <w:b w:val="0"/>
           <w:i w:val="0"/>
           <w:color w:val="000000"/>
@@ -168,7 +168,7 @@
       </w:r>
       <w:r>
         <w:rPr>
-          <w:rFonts w:ascii="CenturySchoolbook" w:hAnsi="CenturySchoolbook"/>
+          <w:rFonts w:ascii="Century Schoolbook" w:hAnsi="Century Schoolbook" w:eastAsia="Century Schoolbook" w:cs="Century Schoolbook"/>
           <w:b w:val="0"/>
           <w:i w:val="0"/>
           <w:color w:val="000000"/>
@@ -181,7 +181,7 @@
       </w:r>
       <w:r>
         <w:rPr>
-          <w:rFonts w:ascii="CenturySchoolbook" w:hAnsi="CenturySchoolbook"/>
+          <w:rFonts w:ascii="Century Schoolbook" w:hAnsi="Century Schoolbook" w:eastAsia="Century Schoolbook" w:cs="Century Schoolbook"/>
           <w:b w:val="0"/>
           <w:i w:val="0"/>
           <w:color w:val="000000"/>
@@ -197,7 +197,7 @@
       </w:pPr>
       <w:r>
         <w:rPr>
-          <w:rFonts w:ascii="CenturySchoolbook" w:hAnsi="CenturySchoolbook"/>
+          <w:rFonts w:ascii="Century Schoolbook" w:hAnsi="Century Schoolbook" w:eastAsia="Century Schoolbook" w:cs="Century Schoolbook"/>
           <w:b w:val="0"/>
           <w:i w:val="0"/>
           <w:color w:val="000000"/>
@@ -210,7 +210,7 @@
       </w:r>
       <w:r>
         <w:rPr>
-          <w:rFonts w:ascii="CenturySchoolbook" w:hAnsi="CenturySchoolbook"/>
+          <w:rFonts w:ascii="Century Schoolbook" w:hAnsi="Century Schoolbook" w:eastAsia="Century Schoolbook" w:cs="Century Schoolbook"/>
           <w:b w:val="0"/>
           <w:i w:val="0"/>
           <w:color w:val="000000"/>
@@ -223,7 +223,7 @@
       </w:r>
       <w:r>
         <w:rPr>
-          <w:rFonts w:ascii="CenturySchoolbook" w:hAnsi="CenturySchoolbook"/>
+          <w:rFonts w:ascii="Century Schoolbook" w:hAnsi="Century Schoolbook" w:eastAsia="Century Schoolbook" w:cs="Century Schoolbook"/>
           <w:b w:val="0"/>
           <w:i w:val="0"/>
           <w:color w:val="000000"/>
@@ -236,7 +236,7 @@
       </w:r>
       <w:r>
         <w:rPr>
-          <w:rFonts w:ascii="CenturySchoolbook" w:hAnsi="CenturySchoolbook"/>
+          <w:rFonts w:ascii="Century Schoolbook" w:hAnsi="Century Schoolbook" w:eastAsia="Century Schoolbook" w:cs="Century Schoolbook"/>
           <w:b w:val="0"/>
           <w:i w:val="0"/>
           <w:color w:val="000000"/>
@@ -252,7 +252,7 @@
       </w:pPr>
       <w:r>
         <w:rPr>
-          <w:rFonts w:ascii="CenturySchoolbook" w:hAnsi="CenturySchoolbook"/>
+          <w:rFonts w:ascii="Century Schoolbook" w:hAnsi="Century Schoolbook" w:eastAsia="Century Schoolbook" w:cs="Century Schoolbook"/>
           <w:b w:val="0"/>
           <w:i w:val="0"/>
           <w:color w:val="000000"/>
@@ -265,7 +265,7 @@
       </w:r>
       <w:r>
         <w:rPr>
-          <w:rFonts w:ascii="CenturySchoolbook" w:hAnsi="CenturySchoolbook"/>
+          <w:rFonts w:ascii="Century Schoolbook" w:hAnsi="Century Schoolbook" w:eastAsia="Century Schoolbook" w:cs="Century Schoolbook"/>
           <w:b w:val="0"/>
           <w:i w:val="0"/>
           <w:color w:val="000000"/>
@@ -278,7 +278,7 @@
       </w:r>
       <w:r>
         <w:rPr>
-          <w:rFonts w:ascii="CenturySchoolbook" w:hAnsi="CenturySchoolbook"/>
+          <w:rFonts w:ascii="Century Schoolbook" w:hAnsi="Century Schoolbook" w:eastAsia="Century Schoolbook" w:cs="Century Schoolbook"/>
           <w:b w:val="0"/>
           <w:i w:val="0"/>
           <w:color w:val="000000"/>
@@ -291,7 +291,7 @@
       </w:r>
       <w:r>
         <w:rPr>
-          <w:rFonts w:ascii="CenturySchoolbook" w:hAnsi="CenturySchoolbook"/>
+          <w:rFonts w:ascii="Century Schoolbook" w:hAnsi="Century Schoolbook" w:eastAsia="Century Schoolbook" w:cs="Century Schoolbook"/>
           <w:b w:val="0"/>
           <w:i w:val="0"/>
           <w:color w:val="000000"/>
@@ -307,7 +307,7 @@
       </w:pPr>
       <w:r>
         <w:rPr>
-          <w:rFonts w:ascii="CenturySchoolbook" w:hAnsi="CenturySchoolbook"/>
+          <w:rFonts w:ascii="Century Schoolbook" w:hAnsi="Century Schoolbook" w:eastAsia="Century Schoolbook" w:cs="Century Schoolbook"/>
           <w:b w:val="0"/>
           <w:i w:val="0"/>
           <w:color w:val="000000"/>
@@ -320,7 +320,7 @@
       </w:r>
       <w:r>
         <w:rPr>
-          <w:rFonts w:ascii="CenturySchoolbook" w:hAnsi="CenturySchoolbook"/>
+          <w:rFonts w:ascii="Century Schoolbook" w:hAnsi="Century Schoolbook" w:eastAsia="Century Schoolbook" w:cs="Century Schoolbook"/>
           <w:b w:val="0"/>
           <w:i w:val="0"/>
           <w:color w:val="000000"/>
@@ -333,7 +333,7 @@
       </w:r>
       <w:r>
         <w:rPr>
-          <w:rFonts w:ascii="CenturySchoolbook" w:hAnsi="CenturySchoolbook"/>
+          <w:rFonts w:ascii="Century Schoolbook" w:hAnsi="Century Schoolbook" w:eastAsia="Century Schoolbook" w:cs="Century Schoolbook"/>
           <w:b w:val="0"/>
           <w:i w:val="0"/>
           <w:color w:val="000000"/>
@@ -346,7 +346,7 @@
       </w:r>
       <w:r>
         <w:rPr>
-          <w:rFonts w:ascii="CenturySchoolbook" w:hAnsi="CenturySchoolbook"/>
+          <w:rFonts w:ascii="Century Schoolbook" w:hAnsi="Century Schoolbook" w:eastAsia="Century Schoolbook" w:cs="Century Schoolbook"/>
           <w:b w:val="0"/>
           <w:i w:val="0"/>
           <w:color w:val="000000"/>
@@ -359,7 +359,7 @@
       </w:r>
       <w:r>
         <w:rPr>
-          <w:rFonts w:ascii="CenturySchoolbook" w:hAnsi="CenturySchoolbook"/>
+          <w:rFonts w:ascii="Century Schoolbook" w:hAnsi="Century Schoolbook" w:eastAsia="Century Schoolbook" w:cs="Century Schoolbook"/>
           <w:b w:val="0"/>
           <w:i w:val="0"/>
           <w:color w:val="000000"/>
@@ -372,7 +372,7 @@
       </w:r>
       <w:r>
         <w:rPr>
-          <w:rFonts w:ascii="CenturySchoolbook" w:hAnsi="CenturySchoolbook"/>
+          <w:rFonts w:ascii="Century Schoolbook" w:hAnsi="Century Schoolbook" w:eastAsia="Century Schoolbook" w:cs="Century Schoolbook"/>
           <w:b w:val="0"/>
           <w:i w:val="0"/>
           <w:color w:val="000000"/>
@@ -385,7 +385,7 @@
       </w:r>
       <w:r>
         <w:rPr>
-          <w:rFonts w:ascii="CenturySchoolbook" w:hAnsi="CenturySchoolbook"/>
+          <w:rFonts w:ascii="Century Schoolbook" w:hAnsi="Century Schoolbook" w:eastAsia="Century Schoolbook" w:cs="Century Schoolbook"/>
           <w:b w:val="0"/>
           <w:i w:val="0"/>
           <w:color w:val="000000"/>
@@ -401,7 +401,7 @@
       </w:pPr>
       <w:r>
         <w:rPr>
-          <w:rFonts w:ascii="CenturySchoolbook" w:hAnsi="CenturySchoolbook"/>
+          <w:rFonts w:ascii="Century Schoolbook" w:hAnsi="Century Schoolbook" w:eastAsia="Century Schoolbook" w:cs="Century Schoolbook"/>
           <w:b w:val="0"/>
           <w:i w:val="0"/>
           <w:color w:val="000000"/>
@@ -414,7 +414,7 @@
       </w:r>
       <w:r>
         <w:rPr>
-          <w:rFonts w:ascii="CenturySchoolbook" w:hAnsi="CenturySchoolbook"/>
+          <w:rFonts w:ascii="Century Schoolbook" w:hAnsi="Century Schoolbook" w:eastAsia="Century Schoolbook" w:cs="Century Schoolbook"/>
           <w:b w:val="0"/>
           <w:i w:val="0"/>
           <w:color w:val="000000"/>
@@ -427,7 +427,7 @@
       </w:r>
       <w:r>
         <w:rPr>
-          <w:rFonts w:ascii="CenturySchoolbook" w:hAnsi="CenturySchoolbook"/>
+          <w:rFonts w:ascii="Century Schoolbook" w:hAnsi="Century Schoolbook" w:eastAsia="Century Schoolbook" w:cs="Century Schoolbook"/>
           <w:b w:val="0"/>
           <w:i w:val="0"/>
           <w:color w:val="000000"/>
@@ -440,7 +440,7 @@
       </w:r>
       <w:r>
         <w:rPr>
-          <w:rFonts w:ascii="CenturySchoolbook" w:hAnsi="CenturySchoolbook"/>
+          <w:rFonts w:ascii="Century Schoolbook" w:hAnsi="Century Schoolbook" w:eastAsia="Century Schoolbook" w:cs="Century Schoolbook"/>
           <w:b w:val="0"/>
           <w:i w:val="0"/>
           <w:color w:val="000000"/>
@@ -453,7 +453,7 @@
       </w:r>
       <w:r>
         <w:rPr>
-          <w:rFonts w:ascii="CenturySchoolbook" w:hAnsi="CenturySchoolbook"/>
+          <w:rFonts w:ascii="Century Schoolbook" w:hAnsi="Century Schoolbook" w:eastAsia="Century Schoolbook" w:cs="Century Schoolbook"/>
           <w:b w:val="0"/>
           <w:i w:val="0"/>
           <w:color w:val="000000"/>
@@ -469,7 +469,7 @@
       </w:pPr>
       <w:r>
         <w:rPr>
-          <w:rFonts w:ascii="CenturySchoolbook" w:hAnsi="CenturySchoolbook"/>
+          <w:rFonts w:ascii="Century Schoolbook" w:hAnsi="Century Schoolbook" w:eastAsia="Century Schoolbook" w:cs="Century Schoolbook"/>
           <w:b w:val="0"/>
           <w:i w:val="0"/>
           <w:color w:val="000000"/>
@@ -482,7 +482,7 @@
       </w:r>
       <w:r>
         <w:rPr>
-          <w:rFonts w:ascii="CenturySchoolbook" w:hAnsi="CenturySchoolbook"/>
+          <w:rFonts w:ascii="Century Schoolbook" w:hAnsi="Century Schoolbook" w:eastAsia="Century Schoolbook" w:cs="Century Schoolbook"/>
           <w:b w:val="0"/>
           <w:i w:val="0"/>
           <w:color w:val="000000"/>
@@ -495,7 +495,7 @@
       </w:r>
       <w:r>
         <w:rPr>
-          <w:rFonts w:ascii="CenturySchoolbook" w:hAnsi="CenturySchoolbook"/>
+          <w:rFonts w:ascii="Century Schoolbook" w:hAnsi="Century Schoolbook" w:eastAsia="Century Schoolbook" w:cs="Century Schoolbook"/>
           <w:b w:val="0"/>
           <w:i w:val="0"/>
           <w:color w:val="000000"/>
@@ -521,7 +521,7 @@
       </w:pPr>
       <w:r>
         <w:rPr>
-          <w:rFonts w:ascii="CenturySchoolbook" w:hAnsi="CenturySchoolbook"/>
+          <w:rFonts w:ascii="Century Schoolbook" w:hAnsi="Century Schoolbook" w:eastAsia="Century Schoolbook" w:cs="Century Schoolbook"/>
           <w:b w:val="0"/>
           <w:i w:val="0"/>
           <w:color w:val="000000"/>
@@ -534,7 +534,7 @@
       </w:r>
       <w:r>
         <w:rPr>
-          <w:rFonts w:ascii="CenturySchoolbook" w:hAnsi="CenturySchoolbook"/>
+          <w:rFonts w:ascii="Century Schoolbook" w:hAnsi="Century Schoolbook" w:eastAsia="Century Schoolbook" w:cs="Century Schoolbook"/>
           <w:b w:val="0"/>
           <w:i w:val="0"/>
           <w:color w:val="000000"/>
@@ -547,7 +547,7 @@
       </w:r>
       <w:r>
         <w:rPr>
-          <w:rFonts w:ascii="CenturySchoolbook" w:hAnsi="CenturySchoolbook"/>
+          <w:rFonts w:ascii="Century Schoolbook" w:hAnsi="Century Schoolbook" w:eastAsia="Century Schoolbook" w:cs="Century Schoolbook"/>
           <w:b w:val="0"/>
           <w:i w:val="0"/>
           <w:color w:val="000000"/>
@@ -563,7 +563,7 @@
       </w:pPr>
       <w:r>
         <w:rPr>
-          <w:rFonts w:ascii="CenturySchoolbook" w:hAnsi="CenturySchoolbook"/>
+          <w:rFonts w:ascii="Century Schoolbook" w:hAnsi="Century Schoolbook" w:eastAsia="Century Schoolbook" w:cs="Century Schoolbook"/>
           <w:b w:val="0"/>
           <w:i w:val="0"/>
           <w:color w:val="000000"/>
@@ -576,7 +576,7 @@
       </w:r>
       <w:r>
         <w:rPr>
-          <w:rFonts w:ascii="CenturySchoolbook" w:hAnsi="CenturySchoolbook"/>
+          <w:rFonts w:ascii="Century Schoolbook" w:hAnsi="Century Schoolbook" w:eastAsia="Century Schoolbook" w:cs="Century Schoolbook"/>
           <w:b w:val="0"/>
           <w:i w:val="0"/>
           <w:color w:val="000000"/>
@@ -589,7 +589,7 @@
       </w:r>
       <w:r>
         <w:rPr>
-          <w:rFonts w:ascii="CenturySchoolbook" w:hAnsi="CenturySchoolbook"/>
+          <w:rFonts w:ascii="Century Schoolbook" w:hAnsi="Century Schoolbook" w:eastAsia="Century Schoolbook" w:cs="Century Schoolbook"/>
           <w:b w:val="0"/>
           <w:i w:val="0"/>
           <w:color w:val="000000"/>
@@ -602,7 +602,7 @@
       </w:r>
       <w:r>
         <w:rPr>
-          <w:rFonts w:ascii="CenturySchoolbook" w:hAnsi="CenturySchoolbook"/>
+          <w:rFonts w:ascii="Century Schoolbook" w:hAnsi="Century Schoolbook" w:eastAsia="Century Schoolbook" w:cs="Century Schoolbook"/>
           <w:b w:val="0"/>
           <w:i w:val="0"/>
           <w:color w:val="000000"/>
@@ -618,7 +618,7 @@
       </w:pPr>
       <w:r>
         <w:rPr>
-          <w:rFonts w:ascii="CenturySchoolbook" w:hAnsi="CenturySchoolbook"/>
+          <w:rFonts w:ascii="Century Schoolbook" w:hAnsi="Century Schoolbook" w:eastAsia="Century Schoolbook" w:cs="Century Schoolbook"/>
           <w:b w:val="0"/>
           <w:i w:val="0"/>
           <w:color w:val="000000"/>
@@ -631,7 +631,7 @@
       </w:r>
       <w:r>
         <w:rPr>
-          <w:rFonts w:ascii="CenturySchoolbook" w:hAnsi="CenturySchoolbook"/>
+          <w:rFonts w:ascii="Century Schoolbook" w:hAnsi="Century Schoolbook" w:eastAsia="Century Schoolbook" w:cs="Century Schoolbook"/>
           <w:b w:val="0"/>
           <w:i w:val="0"/>
           <w:color w:val="000000"/>
@@ -644,7 +644,7 @@
       </w:r>
       <w:r>
         <w:rPr>
-          <w:rFonts w:ascii="CenturySchoolbook" w:hAnsi="CenturySchoolbook"/>
+          <w:rFonts w:ascii="Century Schoolbook" w:hAnsi="Century Schoolbook" w:eastAsia="Century Schoolbook" w:cs="Century Schoolbook"/>
           <w:b w:val="0"/>
           <w:i w:val="0"/>
           <w:color w:val="000000"/>
@@ -657,7 +657,7 @@
       </w:r>
       <w:r>
         <w:rPr>
-          <w:rFonts w:ascii="CenturySchoolbook" w:hAnsi="CenturySchoolbook"/>
+          <w:rFonts w:ascii="Century Schoolbook" w:hAnsi="Century Schoolbook" w:eastAsia="Century Schoolbook" w:cs="Century Schoolbook"/>
           <w:b w:val="0"/>
           <w:i w:val="0"/>
           <w:color w:val="000000"/>
@@ -670,7 +670,7 @@
       </w:r>
       <w:r>
         <w:rPr>
-          <w:rFonts w:ascii="CenturySchoolbook" w:hAnsi="CenturySchoolbook"/>
+          <w:rFonts w:ascii="Century Schoolbook" w:hAnsi="Century Schoolbook" w:eastAsia="Century Schoolbook" w:cs="Century Schoolbook"/>
           <w:b w:val="0"/>
           <w:i w:val="0"/>
           <w:color w:val="000000"/>
@@ -683,7 +683,7 @@
       </w:r>
       <w:r>
         <w:rPr>
-          <w:rFonts w:ascii="CenturySchoolbook" w:hAnsi="CenturySchoolbook"/>
+          <w:rFonts w:ascii="Century Schoolbook" w:hAnsi="Century Schoolbook" w:eastAsia="Century Schoolbook" w:cs="Century Schoolbook"/>
           <w:b w:val="0"/>
           <w:i w:val="0"/>
           <w:color w:val="000000"/>
@@ -699,7 +699,7 @@
       </w:pPr>
       <w:r>
         <w:rPr>
-          <w:rFonts w:ascii="CenturySchoolbook" w:hAnsi="CenturySchoolbook"/>
+          <w:rFonts w:ascii="Century Schoolbook" w:hAnsi="Century Schoolbook" w:eastAsia="Century Schoolbook" w:cs="Century Schoolbook"/>
           <w:b w:val="0"/>
           <w:i w:val="0"/>
           <w:color w:val="000000"/>
@@ -712,7 +712,7 @@
       </w:r>
       <w:r>
         <w:rPr>
-          <w:rFonts w:ascii="CenturySchoolbook" w:hAnsi="CenturySchoolbook"/>
+          <w:rFonts w:ascii="Century Schoolbook" w:hAnsi="Century Schoolbook" w:eastAsia="Century Schoolbook" w:cs="Century Schoolbook"/>
           <w:b w:val="0"/>
           <w:i w:val="0"/>
           <w:color w:val="000000"/>
@@ -725,7 +725,7 @@
       </w:r>
       <w:r>
         <w:rPr>
-          <w:rFonts w:ascii="CenturySchoolbook" w:hAnsi="CenturySchoolbook"/>
+          <w:rFonts w:ascii="Century Schoolbook" w:hAnsi="Century Schoolbook" w:eastAsia="Century Schoolbook" w:cs="Century Schoolbook"/>
           <w:b w:val="0"/>
           <w:i w:val="0"/>
           <w:color w:val="000000"/>
@@ -738,7 +738,7 @@
       </w:r>
       <w:r>
         <w:rPr>
-          <w:rFonts w:ascii="CenturySchoolbook" w:hAnsi="CenturySchoolbook"/>
+          <w:rFonts w:ascii="Century Schoolbook" w:hAnsi="Century Schoolbook" w:eastAsia="Century Schoolbook" w:cs="Century Schoolbook"/>
           <w:b w:val="0"/>
           <w:i w:val="0"/>
           <w:color w:val="000000"/>
@@ -751,7 +751,7 @@
       </w:r>
       <w:r>
         <w:rPr>
-          <w:rFonts w:ascii="CenturySchoolbook" w:hAnsi="CenturySchoolbook"/>
+          <w:rFonts w:ascii="Century Schoolbook" w:hAnsi="Century Schoolbook" w:eastAsia="Century Schoolbook" w:cs="Century Schoolbook"/>
           <w:b w:val="0"/>
           <w:i w:val="0"/>
           <w:color w:val="000000"/>
@@ -764,7 +764,7 @@
       </w:r>
       <w:r>
         <w:rPr>
-          <w:rFonts w:ascii="CenturySchoolbook" w:hAnsi="CenturySchoolbook"/>
+          <w:rFonts w:ascii="Century Schoolbook" w:hAnsi="Century Schoolbook" w:eastAsia="Century Schoolbook" w:cs="Century Schoolbook"/>
           <w:b w:val="0"/>
           <w:i w:val="0"/>
           <w:color w:val="000000"/>
@@ -780,7 +780,7 @@
       </w:pPr>
       <w:r>
         <w:rPr>
-          <w:rFonts w:ascii="CenturySchoolbook" w:hAnsi="CenturySchoolbook"/>
+          <w:rFonts w:ascii="Century Schoolbook" w:hAnsi="Century Schoolbook" w:eastAsia="Century Schoolbook" w:cs="Century Schoolbook"/>
           <w:b w:val="0"/>
           <w:i w:val="0"/>
           <w:color w:val="000000"/>
@@ -793,7 +793,7 @@
       </w:r>
       <w:r>
         <w:rPr>
-          <w:rFonts w:ascii="CenturySchoolbook" w:hAnsi="CenturySchoolbook"/>
+          <w:rFonts w:ascii="Century Schoolbook" w:hAnsi="Century Schoolbook" w:eastAsia="Century Schoolbook" w:cs="Century Schoolbook"/>
           <w:b w:val="0"/>
           <w:i w:val="0"/>
           <w:color w:val="000000"/>
@@ -806,7 +806,7 @@
       </w:r>
       <w:r>
         <w:rPr>
-          <w:rFonts w:ascii="CenturySchoolbook" w:hAnsi="CenturySchoolbook"/>
+          <w:rFonts w:ascii="Century Schoolbook" w:hAnsi="Century Schoolbook" w:eastAsia="Century Schoolbook" w:cs="Century Schoolbook"/>
           <w:b w:val="0"/>
           <w:i w:val="0"/>
           <w:color w:val="000000"/>
@@ -819,7 +819,7 @@
       </w:r>
       <w:r>
         <w:rPr>
-          <w:rFonts w:ascii="CenturySchoolbook" w:hAnsi="CenturySchoolbook"/>
+          <w:rFonts w:ascii="Century Schoolbook" w:hAnsi="Century Schoolbook" w:eastAsia="Century Schoolbook" w:cs="Century Schoolbook"/>
           <w:b w:val="0"/>
           <w:i w:val="0"/>
           <w:color w:val="000000"/>
@@ -835,7 +835,7 @@
       </w:pPr>
       <w:r>
         <w:rPr>
-          <w:rFonts w:ascii="CenturySchoolbook" w:hAnsi="CenturySchoolbook"/>
+          <w:rFonts w:ascii="Century Schoolbook" w:hAnsi="Century Schoolbook" w:eastAsia="Century Schoolbook" w:cs="Century Schoolbook"/>
           <w:b w:val="0"/>
           <w:i w:val="0"/>
           <w:color w:val="000000"/>
@@ -848,7 +848,7 @@
       </w:r>
       <w:r>
         <w:rPr>
-          <w:rFonts w:ascii="CenturySchoolbook" w:hAnsi="CenturySchoolbook"/>
+          <w:rFonts w:ascii="Century Schoolbook" w:hAnsi="Century Schoolbook" w:eastAsia="Century Schoolbook" w:cs="Century Schoolbook"/>
           <w:b w:val="0"/>
           <w:i w:val="0"/>
           <w:color w:val="000000"/>
@@ -861,7 +861,7 @@
       </w:r>
       <w:r>
         <w:rPr>
-          <w:rFonts w:ascii="CenturySchoolbook" w:hAnsi="CenturySchoolbook"/>
+          <w:rFonts w:ascii="Century Schoolbook" w:hAnsi="Century Schoolbook" w:eastAsia="Century Schoolbook" w:cs="Century Schoolbook"/>
           <w:b w:val="0"/>
           <w:i w:val="0"/>
           <w:color w:val="000000"/>
@@ -874,7 +874,7 @@
       </w:r>
       <w:r>
         <w:rPr>
-          <w:rFonts w:ascii="CenturySchoolbook" w:hAnsi="CenturySchoolbook"/>
+          <w:rFonts w:ascii="Century Schoolbook" w:hAnsi="Century Schoolbook" w:eastAsia="Century Schoolbook" w:cs="Century Schoolbook"/>
           <w:b w:val="0"/>
           <w:i w:val="0"/>
           <w:color w:val="000000"/>
@@ -887,7 +887,7 @@
       </w:r>
       <w:r>
         <w:rPr>
-          <w:rFonts w:ascii="CenturySchoolbook" w:hAnsi="CenturySchoolbook"/>
+          <w:rFonts w:ascii="Century Schoolbook" w:hAnsi="Century Schoolbook" w:eastAsia="Century Schoolbook" w:cs="Century Schoolbook"/>
           <w:b w:val="0"/>
           <w:i w:val="0"/>
           <w:color w:val="000000"/>
@@ -903,7 +903,7 @@
       </w:pPr>
       <w:r>
         <w:rPr>
-          <w:rFonts w:ascii="CenturySchoolbook" w:hAnsi="CenturySchoolbook"/>
+          <w:rFonts w:ascii="Century Schoolbook" w:hAnsi="Century Schoolbook" w:eastAsia="Century Schoolbook" w:cs="Century Schoolbook"/>
           <w:b w:val="0"/>
           <w:i w:val="0"/>
           <w:color w:val="000000"/>
@@ -916,7 +916,7 @@
       </w:r>
       <w:r>
         <w:rPr>
-          <w:rFonts w:ascii="CenturySchoolbook" w:hAnsi="CenturySchoolbook"/>
+          <w:rFonts w:ascii="Century Schoolbook" w:hAnsi="Century Schoolbook" w:eastAsia="Century Schoolbook" w:cs="Century Schoolbook"/>
           <w:b w:val="0"/>
           <w:i w:val="0"/>
           <w:color w:val="000000"/>
@@ -929,7 +929,7 @@
       </w:r>
       <w:r>
         <w:rPr>
-          <w:rFonts w:ascii="CenturySchoolbook" w:hAnsi="CenturySchoolbook"/>
+          <w:rFonts w:ascii="Century Schoolbook" w:hAnsi="Century Schoolbook" w:eastAsia="Century Schoolbook" w:cs="Century Schoolbook"/>
           <w:b w:val="0"/>
           <w:i w:val="0"/>
           <w:color w:val="000000"/>
@@ -942,7 +942,7 @@
       </w:r>
       <w:r>
         <w:rPr>
-          <w:rFonts w:ascii="CenturySchoolbook" w:hAnsi="CenturySchoolbook"/>
+          <w:rFonts w:ascii="Century Schoolbook" w:hAnsi="Century Schoolbook" w:eastAsia="Century Schoolbook" w:cs="Century Schoolbook"/>
           <w:b w:val="0"/>
           <w:i w:val="0"/>
           <w:color w:val="000000"/>
@@ -958,7 +958,7 @@
       </w:pPr>
       <w:r>
         <w:rPr>
-          <w:rFonts w:ascii="CenturySchoolbook" w:hAnsi="CenturySchoolbook"/>
+          <w:rFonts w:ascii="Century Schoolbook" w:hAnsi="Century Schoolbook" w:eastAsia="Century Schoolbook" w:cs="Century Schoolbook"/>
           <w:b w:val="0"/>
           <w:i w:val="0"/>
           <w:color w:val="000000"/>
@@ -971,7 +971,7 @@
       </w:r>
       <w:r>
         <w:rPr>
-          <w:rFonts w:ascii="CenturySchoolbook" w:hAnsi="CenturySchoolbook"/>
+          <w:rFonts w:ascii="Century Schoolbook" w:hAnsi="Century Schoolbook" w:eastAsia="Century Schoolbook" w:cs="Century Schoolbook"/>
           <w:b w:val="0"/>
           <w:i w:val="0"/>
           <w:color w:val="000000"/>
@@ -984,7 +984,7 @@
       </w:r>
       <w:r>
         <w:rPr>
-          <w:rFonts w:ascii="CenturySchoolbook" w:hAnsi="CenturySchoolbook"/>
+          <w:rFonts w:ascii="Century Schoolbook" w:hAnsi="Century Schoolbook" w:eastAsia="Century Schoolbook" w:cs="Century Schoolbook"/>
           <w:b w:val="0"/>
           <w:i w:val="0"/>
           <w:color w:val="000000"/>
@@ -997,7 +997,7 @@
       </w:r>
       <w:r>
         <w:rPr>
-          <w:rFonts w:ascii="CenturySchoolbook" w:hAnsi="CenturySchoolbook"/>
+          <w:rFonts w:ascii="Century Schoolbook" w:hAnsi="Century Schoolbook" w:eastAsia="Century Schoolbook" w:cs="Century Schoolbook"/>
           <w:b w:val="0"/>
           <w:i w:val="0"/>
           <w:color w:val="000000"/>
@@ -1013,7 +1013,7 @@
       </w:pPr>
       <w:r>
         <w:rPr>
-          <w:rFonts w:ascii="CenturySchoolbook" w:hAnsi="CenturySchoolbook"/>
+          <w:rFonts w:ascii="Century Schoolbook" w:hAnsi="Century Schoolbook" w:eastAsia="Century Schoolbook" w:cs="Century Schoolbook"/>
           <w:b w:val="0"/>
           <w:i w:val="0"/>
           <w:color w:val="000000"/>
@@ -1026,7 +1026,7 @@
       </w:r>
       <w:r>
         <w:rPr>
-          <w:rFonts w:ascii="CenturySchoolbook" w:hAnsi="CenturySchoolbook"/>
+          <w:rFonts w:ascii="Century Schoolbook" w:hAnsi="Century Schoolbook" w:eastAsia="Century Schoolbook" w:cs="Century Schoolbook"/>
           <w:b w:val="0"/>
           <w:i w:val="0"/>
           <w:color w:val="000000"/>
@@ -1039,7 +1039,7 @@
       </w:r>
       <w:r>
         <w:rPr>
-          <w:rFonts w:ascii="CenturySchoolbook" w:hAnsi="CenturySchoolbook"/>
+          <w:rFonts w:ascii="Century Schoolbook" w:hAnsi="Century Schoolbook" w:eastAsia="Century Schoolbook" w:cs="Century Schoolbook"/>
           <w:b w:val="0"/>
           <w:i w:val="0"/>
           <w:color w:val="000000"/>
@@ -1052,7 +1052,7 @@
       </w:r>
       <w:r>
         <w:rPr>
-          <w:rFonts w:ascii="CenturySchoolbook" w:hAnsi="CenturySchoolbook"/>
+          <w:rFonts w:ascii="Century Schoolbook" w:hAnsi="Century Schoolbook" w:eastAsia="Century Schoolbook" w:cs="Century Schoolbook"/>
           <w:b w:val="0"/>
           <w:i w:val="0"/>
           <w:color w:val="000000"/>
@@ -1078,7 +1078,7 @@
       </w:pPr>
       <w:r>
         <w:rPr>
-          <w:rFonts w:ascii="CenturySchoolbook" w:hAnsi="CenturySchoolbook"/>
+          <w:rFonts w:ascii="Century Schoolbook" w:hAnsi="Century Schoolbook" w:eastAsia="Century Schoolbook" w:cs="Century Schoolbook"/>
           <w:b w:val="0"/>
           <w:i w:val="0"/>
           <w:color w:val="000000"/>
@@ -1091,7 +1091,7 @@
       </w:r>
       <w:r>
         <w:rPr>
-          <w:rFonts w:ascii="CenturySchoolbook" w:hAnsi="CenturySchoolbook"/>
+          <w:rFonts w:ascii="Century Schoolbook" w:hAnsi="Century Schoolbook" w:eastAsia="Century Schoolbook" w:cs="Century Schoolbook"/>
           <w:b w:val="0"/>
           <w:i w:val="0"/>
           <w:color w:val="000000"/>
@@ -1104,7 +1104,7 @@
       </w:r>
       <w:r>
         <w:rPr>
-          <w:rFonts w:ascii="CenturySchoolbook" w:hAnsi="CenturySchoolbook"/>
+          <w:rFonts w:ascii="Century Schoolbook" w:hAnsi="Century Schoolbook" w:eastAsia="Century Schoolbook" w:cs="Century Schoolbook"/>
           <w:b w:val="0"/>
           <w:i w:val="0"/>
           <w:color w:val="000000"/>
@@ -1120,7 +1120,7 @@
       </w:pPr>
       <w:r>
         <w:rPr>
-          <w:rFonts w:ascii="CenturySchoolbook" w:hAnsi="CenturySchoolbook"/>
+          <w:rFonts w:ascii="Century Schoolbook" w:hAnsi="Century Schoolbook" w:eastAsia="Century Schoolbook" w:cs="Century Schoolbook"/>
           <w:b w:val="0"/>
           <w:i w:val="0"/>
           <w:color w:val="000000"/>
@@ -1133,7 +1133,7 @@
       </w:r>
       <w:r>
         <w:rPr>
-          <w:rFonts w:ascii="CenturySchoolbook" w:hAnsi="CenturySchoolbook"/>
+          <w:rFonts w:ascii="Century Schoolbook" w:hAnsi="Century Schoolbook" w:eastAsia="Century Schoolbook" w:cs="Century Schoolbook"/>
           <w:b w:val="0"/>
           <w:i w:val="0"/>
           <w:color w:val="000000"/>
@@ -1146,7 +1146,7 @@
       </w:r>
       <w:r>
         <w:rPr>
-          <w:rFonts w:ascii="CenturySchoolbook" w:hAnsi="CenturySchoolbook"/>
+          <w:rFonts w:ascii="Century Schoolbook" w:hAnsi="Century Schoolbook" w:eastAsia="Century Schoolbook" w:cs="Century Schoolbook"/>
           <w:b w:val="0"/>
           <w:i w:val="0"/>
           <w:color w:val="000000"/>
@@ -1159,7 +1159,7 @@
       </w:r>
       <w:r>
         <w:rPr>
-          <w:rFonts w:ascii="CenturySchoolbook" w:hAnsi="CenturySchoolbook"/>
+          <w:rFonts w:ascii="Century Schoolbook" w:hAnsi="Century Schoolbook" w:eastAsia="Century Schoolbook" w:cs="Century Schoolbook"/>
           <w:b w:val="0"/>
           <w:i w:val="0"/>
           <w:color w:val="000000"/>
@@ -1172,7 +1172,7 @@
       </w:r>
       <w:r>
         <w:rPr>
-          <w:rFonts w:ascii="CenturySchoolbook" w:hAnsi="CenturySchoolbook"/>
+          <w:rFonts w:ascii="Century Schoolbook" w:hAnsi="Century Schoolbook" w:eastAsia="Century Schoolbook" w:cs="Century Schoolbook"/>
           <w:b w:val="0"/>
           <w:i w:val="0"/>
           <w:color w:val="000000"/>
@@ -1188,7 +1188,7 @@
       </w:pPr>
       <w:r>
         <w:rPr>
-          <w:rFonts w:ascii="CenturySchoolbook" w:hAnsi="CenturySchoolbook"/>
+          <w:rFonts w:ascii="Century Schoolbook" w:hAnsi="Century Schoolbook" w:eastAsia="Century Schoolbook" w:cs="Century Schoolbook"/>
           <w:b w:val="0"/>
           <w:i w:val="0"/>
           <w:color w:val="000000"/>
@@ -1201,7 +1201,7 @@
       </w:r>
       <w:r>
         <w:rPr>
-          <w:rFonts w:ascii="CenturySchoolbook" w:hAnsi="CenturySchoolbook"/>
+          <w:rFonts w:ascii="Century Schoolbook" w:hAnsi="Century Schoolbook" w:eastAsia="Century Schoolbook" w:cs="Century Schoolbook"/>
           <w:b w:val="0"/>
           <w:i w:val="0"/>
           <w:color w:val="000000"/>
@@ -1214,7 +1214,7 @@
       </w:r>
       <w:r>
         <w:rPr>
-          <w:rFonts w:ascii="CenturySchoolbook" w:hAnsi="CenturySchoolbook"/>
+          <w:rFonts w:ascii="Century Schoolbook" w:hAnsi="Century Schoolbook" w:eastAsia="Century Schoolbook" w:cs="Century Schoolbook"/>
           <w:b w:val="0"/>
           <w:i w:val="0"/>
           <w:color w:val="000000"/>
@@ -1227,7 +1227,7 @@
       </w:r>
       <w:r>
         <w:rPr>
-          <w:rFonts w:ascii="CenturySchoolbook" w:hAnsi="CenturySchoolbook"/>
+          <w:rFonts w:ascii="Century Schoolbook" w:hAnsi="Century Schoolbook" w:eastAsia="Century Schoolbook" w:cs="Century Schoolbook"/>
           <w:b w:val="0"/>
           <w:i w:val="0"/>
           <w:color w:val="000000"/>
@@ -1240,7 +1240,7 @@
       </w:r>
       <w:r>
         <w:rPr>
-          <w:rFonts w:ascii="CenturySchoolbook" w:hAnsi="CenturySchoolbook"/>
+          <w:rFonts w:ascii="Century Schoolbook" w:hAnsi="Century Schoolbook" w:eastAsia="Century Schoolbook" w:cs="Century Schoolbook"/>
           <w:b w:val="0"/>
           <w:i w:val="0"/>
           <w:color w:val="000000"/>
@@ -1253,7 +1253,7 @@
       </w:r>
       <w:r>
         <w:rPr>
-          <w:rFonts w:ascii="CenturySchoolbook" w:hAnsi="CenturySchoolbook"/>
+          <w:rFonts w:ascii="Century Schoolbook" w:hAnsi="Century Schoolbook" w:eastAsia="Century Schoolbook" w:cs="Century Schoolbook"/>
           <w:b w:val="0"/>
           <w:i w:val="0"/>
           <w:color w:val="000000"/>
@@ -1269,7 +1269,7 @@
       </w:pPr>
       <w:r>
         <w:rPr>
-          <w:rFonts w:ascii="CenturySchoolbook" w:hAnsi="CenturySchoolbook"/>
+          <w:rFonts w:ascii="Century Schoolbook" w:hAnsi="Century Schoolbook" w:eastAsia="Century Schoolbook" w:cs="Century Schoolbook"/>
           <w:b w:val="0"/>
           <w:i w:val="0"/>
           <w:color w:val="000000"/>
@@ -1282,7 +1282,7 @@
       </w:r>
       <w:r>
         <w:rPr>
-          <w:rFonts w:ascii="CenturySchoolbook" w:hAnsi="CenturySchoolbook"/>
+          <w:rFonts w:ascii="Century Schoolbook" w:hAnsi="Century Schoolbook" w:eastAsia="Century Schoolbook" w:cs="Century Schoolbook"/>
           <w:b w:val="0"/>
           <w:i w:val="0"/>
           <w:color w:val="000000"/>
@@ -1295,7 +1295,7 @@
       </w:r>
       <w:r>
         <w:rPr>
-          <w:rFonts w:ascii="CenturySchoolbook" w:hAnsi="CenturySchoolbook"/>
+          <w:rFonts w:ascii="Century Schoolbook" w:hAnsi="Century Schoolbook" w:eastAsia="Century Schoolbook" w:cs="Century Schoolbook"/>
           <w:b w:val="0"/>
           <w:i w:val="0"/>
           <w:color w:val="000000"/>
@@ -1308,7 +1308,7 @@
       </w:r>
       <w:r>
         <w:rPr>
-          <w:rFonts w:ascii="CenturySchoolbook" w:hAnsi="CenturySchoolbook"/>
+          <w:rFonts w:ascii="Century Schoolbook" w:hAnsi="Century Schoolbook" w:eastAsia="Century Schoolbook" w:cs="Century Schoolbook"/>
           <w:b w:val="0"/>
           <w:i w:val="0"/>
           <w:color w:val="000000"/>
@@ -1324,7 +1324,7 @@
       </w:pPr>
       <w:r>
         <w:rPr>
-          <w:rFonts w:ascii="CenturySchoolbook" w:hAnsi="CenturySchoolbook"/>
+          <w:rFonts w:ascii="Century Schoolbook" w:hAnsi="Century Schoolbook" w:eastAsia="Century Schoolbook" w:cs="Century Schoolbook"/>
           <w:b w:val="0"/>
           <w:i w:val="0"/>
           <w:color w:val="000000"/>
@@ -1337,7 +1337,7 @@
       </w:r>
       <w:r>
         <w:rPr>
-          <w:rFonts w:ascii="CenturySchoolbook" w:hAnsi="CenturySchoolbook"/>
+          <w:rFonts w:ascii="Century Schoolbook" w:hAnsi="Century Schoolbook" w:eastAsia="Century Schoolbook" w:cs="Century Schoolbook"/>
           <w:b w:val="0"/>
           <w:i w:val="0"/>
           <w:color w:val="000000"/>
@@ -1350,7 +1350,7 @@
       </w:r>
       <w:r>
         <w:rPr>
-          <w:rFonts w:ascii="CenturySchoolbook" w:hAnsi="CenturySchoolbook"/>
+          <w:rFonts w:ascii="Century Schoolbook" w:hAnsi="Century Schoolbook" w:eastAsia="Century Schoolbook" w:cs="Century Schoolbook"/>
           <w:b w:val="0"/>
           <w:i w:val="0"/>
           <w:color w:val="000000"/>
@@ -1363,7 +1363,7 @@
       </w:r>
       <w:r>
         <w:rPr>
-          <w:rFonts w:ascii="CenturySchoolbook" w:hAnsi="CenturySchoolbook"/>
+          <w:rFonts w:ascii="Century Schoolbook" w:hAnsi="Century Schoolbook" w:eastAsia="Century Schoolbook" w:cs="Century Schoolbook"/>
           <w:b w:val="0"/>
           <w:i w:val="0"/>
           <w:color w:val="000000"/>
@@ -1376,7 +1376,7 @@
       </w:r>
       <w:r>
         <w:rPr>
-          <w:rFonts w:ascii="CenturySchoolbook" w:hAnsi="CenturySchoolbook"/>
+          <w:rFonts w:ascii="Century Schoolbook" w:hAnsi="Century Schoolbook" w:eastAsia="Century Schoolbook" w:cs="Century Schoolbook"/>
           <w:b w:val="0"/>
           <w:i w:val="0"/>
           <w:color w:val="000000"/>
@@ -1389,7 +1389,7 @@
       </w:r>
       <w:r>
         <w:rPr>
-          <w:rFonts w:ascii="CenturySchoolbook" w:hAnsi="CenturySchoolbook"/>
+          <w:rFonts w:ascii="Century Schoolbook" w:hAnsi="Century Schoolbook" w:eastAsia="Century Schoolbook" w:cs="Century Schoolbook"/>
           <w:b w:val="0"/>
           <w:i w:val="0"/>
           <w:color w:val="000000"/>
@@ -1405,7 +1405,7 @@
       </w:pPr>
       <w:r>
         <w:rPr>
-          <w:rFonts w:ascii="CenturySchoolbook" w:hAnsi="CenturySchoolbook"/>
+          <w:rFonts w:ascii="Century Schoolbook" w:hAnsi="Century Schoolbook" w:eastAsia="Century Schoolbook" w:cs="Century Schoolbook"/>
           <w:b w:val="0"/>
           <w:i w:val="0"/>
           <w:color w:val="000000"/>
@@ -1418,7 +1418,7 @@
       </w:r>
       <w:r>
         <w:rPr>
-          <w:rFonts w:ascii="CenturySchoolbook" w:hAnsi="CenturySchoolbook"/>
+          <w:rFonts w:ascii="Century Schoolbook" w:hAnsi="Century Schoolbook" w:eastAsia="Century Schoolbook" w:cs="Century Schoolbook"/>
           <w:b w:val="0"/>
           <w:i w:val="0"/>
           <w:color w:val="000000"/>
@@ -1431,7 +1431,7 @@
       </w:r>
       <w:r>
         <w:rPr>
-          <w:rFonts w:ascii="CenturySchoolbook" w:hAnsi="CenturySchoolbook"/>
+          <w:rFonts w:ascii="Century Schoolbook" w:hAnsi="Century Schoolbook" w:eastAsia="Century Schoolbook" w:cs="Century Schoolbook"/>
           <w:b w:val="0"/>
           <w:i w:val="0"/>
           <w:color w:val="000000"/>
@@ -1444,7 +1444,7 @@
       </w:r>
       <w:r>
         <w:rPr>
-          <w:rFonts w:ascii="CenturySchoolbook" w:hAnsi="CenturySchoolbook"/>
+          <w:rFonts w:ascii="Century Schoolbook" w:hAnsi="Century Schoolbook" w:eastAsia="Century Schoolbook" w:cs="Century Schoolbook"/>
           <w:b w:val="0"/>
           <w:i w:val="0"/>
           <w:color w:val="000000"/>
@@ -1457,7 +1457,7 @@
       </w:r>
       <w:r>
         <w:rPr>
-          <w:rFonts w:ascii="CenturySchoolbook" w:hAnsi="CenturySchoolbook"/>
+          <w:rFonts w:ascii="Century Schoolbook" w:hAnsi="Century Schoolbook" w:eastAsia="Century Schoolbook" w:cs="Century Schoolbook"/>
           <w:b w:val="0"/>
           <w:i w:val="0"/>
           <w:color w:val="000000"/>
@@ -1470,7 +1470,7 @@
       </w:r>
       <w:r>
         <w:rPr>
-          <w:rFonts w:ascii="CenturySchoolbook" w:hAnsi="CenturySchoolbook"/>
+          <w:rFonts w:ascii="Century Schoolbook" w:hAnsi="Century Schoolbook" w:eastAsia="Century Schoolbook" w:cs="Century Schoolbook"/>
           <w:b w:val="0"/>
           <w:i w:val="0"/>
           <w:color w:val="000000"/>

</xml_diff>

<commit_message>
Step 40 - Preserve paragraph indentation and width
</commit_message>
<xml_diff>
--- a/output/output.docx
+++ b/output/output.docx
@@ -5,6 +5,7 @@
     <w:p>
       <w:pPr>
         <w:spacing w:before="0" w:after="0" w:lineRule="exact" w:line="865"/>
+        <w:ind w:left="3083" w:right="2967" w:firstLine="0"/>
         <w:jc w:val="left"/>
       </w:pPr>
       <w:r>
@@ -21,6 +22,7 @@
     <w:p>
       <w:pPr>
         <w:spacing w:before="288" w:after="0" w:lineRule="exact" w:line="433"/>
+        <w:ind w:left="2867" w:right="2957" w:firstLine="0"/>
         <w:jc w:val="left"/>
       </w:pPr>
       <w:r>
@@ -57,6 +59,7 @@
     <w:p>
       <w:pPr>
         <w:spacing w:before="288" w:after="0" w:lineRule="exact" w:line="384"/>
+        <w:ind w:left="0" w:right="0" w:firstLine="0"/>
         <w:jc w:val="left"/>
       </w:pPr>
       <w:r>
@@ -125,6 +128,7 @@
     <w:p>
       <w:pPr>
         <w:spacing w:before="288" w:after="0" w:lineRule="exact" w:line="288"/>
+        <w:ind w:left="0" w:right="24" w:firstLine="0"/>
         <w:jc w:val="left"/>
       </w:pPr>
       <w:r>
@@ -193,6 +197,7 @@
     <w:p>
       <w:pPr>
         <w:spacing w:before="288" w:after="0" w:lineRule="exact" w:line="288"/>
+        <w:ind w:left="0" w:right="24" w:firstLine="0"/>
         <w:jc w:val="left"/>
       </w:pPr>
       <w:r>
@@ -248,6 +253,7 @@
     <w:p>
       <w:pPr>
         <w:spacing w:before="288" w:after="0" w:lineRule="exact" w:line="288"/>
+        <w:ind w:left="0" w:right="24" w:firstLine="0"/>
         <w:jc w:val="left"/>
       </w:pPr>
       <w:r>
@@ -303,6 +309,7 @@
     <w:p>
       <w:pPr>
         <w:spacing w:before="288" w:after="0" w:lineRule="exact" w:line="288"/>
+        <w:ind w:left="0" w:right="24" w:firstLine="0"/>
         <w:jc w:val="left"/>
       </w:pPr>
       <w:r>
@@ -397,6 +404,7 @@
     <w:p>
       <w:pPr>
         <w:spacing w:before="288" w:after="0" w:lineRule="exact" w:line="288"/>
+        <w:ind w:left="0" w:right="24" w:firstLine="0"/>
         <w:jc w:val="left"/>
       </w:pPr>
       <w:r>
@@ -465,6 +473,7 @@
     <w:p>
       <w:pPr>
         <w:spacing w:before="288" w:after="0" w:lineRule="exact" w:line="288"/>
+        <w:ind w:left="0" w:right="24" w:firstLine="0"/>
         <w:jc w:val="left"/>
       </w:pPr>
       <w:r>
@@ -517,6 +526,7 @@
     <w:p>
       <w:pPr>
         <w:spacing w:before="0" w:after="0" w:lineRule="exact" w:line="288"/>
+        <w:ind w:left="0" w:right="0" w:firstLine="0"/>
         <w:jc w:val="left"/>
       </w:pPr>
       <w:r>
@@ -559,6 +569,7 @@
     <w:p>
       <w:pPr>
         <w:spacing w:before="288" w:after="0" w:lineRule="exact" w:line="288"/>
+        <w:ind w:left="0" w:right="0" w:firstLine="0"/>
         <w:jc w:val="left"/>
       </w:pPr>
       <w:r>
@@ -614,6 +625,7 @@
     <w:p>
       <w:pPr>
         <w:spacing w:before="288" w:after="0" w:lineRule="exact" w:line="288"/>
+        <w:ind w:left="0" w:right="0" w:firstLine="0"/>
         <w:jc w:val="left"/>
       </w:pPr>
       <w:r>
@@ -695,6 +707,7 @@
     <w:p>
       <w:pPr>
         <w:spacing w:before="288" w:after="0" w:lineRule="exact" w:line="288"/>
+        <w:ind w:left="0" w:right="0" w:firstLine="0"/>
         <w:jc w:val="left"/>
       </w:pPr>
       <w:r>
@@ -776,6 +789,7 @@
     <w:p>
       <w:pPr>
         <w:spacing w:before="288" w:after="0" w:lineRule="exact" w:line="288"/>
+        <w:ind w:left="0" w:right="0" w:firstLine="0"/>
         <w:jc w:val="left"/>
       </w:pPr>
       <w:r>
@@ -831,6 +845,7 @@
     <w:p>
       <w:pPr>
         <w:spacing w:before="288" w:after="0" w:lineRule="exact" w:line="288"/>
+        <w:ind w:left="0" w:right="0" w:firstLine="0"/>
         <w:jc w:val="left"/>
       </w:pPr>
       <w:r>
@@ -899,6 +914,7 @@
     <w:p>
       <w:pPr>
         <w:spacing w:before="288" w:after="0" w:lineRule="exact" w:line="288"/>
+        <w:ind w:left="0" w:right="0" w:firstLine="0"/>
         <w:jc w:val="left"/>
       </w:pPr>
       <w:r>
@@ -954,6 +970,7 @@
     <w:p>
       <w:pPr>
         <w:spacing w:before="288" w:after="0" w:lineRule="exact" w:line="288"/>
+        <w:ind w:left="0" w:right="0" w:firstLine="0"/>
         <w:jc w:val="left"/>
       </w:pPr>
       <w:r>
@@ -1009,6 +1026,7 @@
     <w:p>
       <w:pPr>
         <w:spacing w:before="288" w:after="0" w:lineRule="exact" w:line="288"/>
+        <w:ind w:left="0" w:right="0" w:firstLine="0"/>
         <w:jc w:val="left"/>
       </w:pPr>
       <w:r>
@@ -1074,6 +1092,7 @@
     <w:p>
       <w:pPr>
         <w:spacing w:before="0" w:after="0" w:lineRule="exact" w:line="288"/>
+        <w:ind w:left="0" w:right="0" w:firstLine="0"/>
         <w:jc w:val="left"/>
       </w:pPr>
       <w:r>
@@ -1116,6 +1135,7 @@
     <w:p>
       <w:pPr>
         <w:spacing w:before="288" w:after="0" w:lineRule="exact" w:line="288"/>
+        <w:ind w:left="0" w:right="0" w:firstLine="0"/>
         <w:jc w:val="left"/>
       </w:pPr>
       <w:r>
@@ -1184,6 +1204,7 @@
     <w:p>
       <w:pPr>
         <w:spacing w:before="288" w:after="0" w:lineRule="exact" w:line="288"/>
+        <w:ind w:left="0" w:right="0" w:firstLine="0"/>
         <w:jc w:val="left"/>
       </w:pPr>
       <w:r>
@@ -1265,6 +1286,7 @@
     <w:p>
       <w:pPr>
         <w:spacing w:before="288" w:after="0" w:lineRule="exact" w:line="288"/>
+        <w:ind w:left="0" w:right="0" w:firstLine="0"/>
         <w:jc w:val="left"/>
       </w:pPr>
       <w:r>
@@ -1320,6 +1342,7 @@
     <w:p>
       <w:pPr>
         <w:spacing w:before="288" w:after="0" w:lineRule="exact" w:line="288"/>
+        <w:ind w:left="0" w:right="0" w:firstLine="0"/>
         <w:jc w:val="left"/>
       </w:pPr>
       <w:r>
@@ -1401,6 +1424,7 @@
     <w:p>
       <w:pPr>
         <w:spacing w:before="288" w:after="0" w:lineRule="exact" w:line="288"/>
+        <w:ind w:left="0" w:right="0" w:firstLine="0"/>
         <w:jc w:val="left"/>
       </w:pPr>
       <w:r>

</xml_diff>

<commit_message>
Step 43 - Fit Word text lines to PDF width
</commit_message>
<xml_diff>
--- a/output/output.docx
+++ b/output/output.docx
@@ -15,13 +15,14 @@
           <w:i w:val="0"/>
           <w:color w:val="2E74B5"/>
           <w:sz w:val="72"/>
+          <w:fitText w:val="4840" w:id="1"/>
         </w:rPr>
         <w:t xml:space="preserve">Sample PDF </w:t>
       </w:r>
     </w:p>
     <w:p>
       <w:pPr>
-        <w:spacing w:before="288" w:after="0" w:lineRule="exact" w:line="433"/>
+        <w:spacing w:before="286" w:after="0" w:lineRule="exact" w:line="433"/>
         <w:ind w:left="2867" w:right="2957" w:firstLine="0"/>
         <w:jc w:val="left"/>
       </w:pPr>
@@ -32,6 +33,7 @@
           <w:i w:val="0"/>
           <w:color w:val="000000"/>
           <w:sz w:val="36"/>
+          <w:fitText w:val="5067" w:id="2"/>
         </w:rPr>
         <w:t xml:space="preserve">Created for testing </w:t>
       </w:r>
@@ -42,6 +44,7 @@
           <w:i w:val="0"/>
           <w:color w:val="5B9BD5"/>
           <w:sz w:val="36"/>
+          <w:fitText w:val="5067" w:id="2"/>
         </w:rPr>
         <w:t>PDFObject</w:t>
       </w:r>
@@ -52,13 +55,14 @@
           <w:i w:val="0"/>
           <w:color w:val="000000"/>
           <w:sz w:val="36"/>
+          <w:fitText w:val="5067" w:id="2"/>
         </w:rPr>
         <w:t xml:space="preserve"> </w:t>
       </w:r>
     </w:p>
     <w:p>
       <w:pPr>
-        <w:spacing w:before="288" w:after="0" w:lineRule="exact" w:line="384"/>
+        <w:spacing w:before="296" w:after="0" w:lineRule="exact" w:line="384"/>
         <w:ind w:left="0" w:right="0" w:firstLine="0"/>
         <w:jc w:val="left"/>
       </w:pPr>
@@ -69,11 +73,12 @@
           <w:i w:val="0"/>
           <w:color w:val="000000"/>
           <w:sz w:val="31"/>
+          <w:fitText w:val="10888" w:id="3"/>
         </w:rPr>
         <w:t xml:space="preserve">This PDF is three pages long. Three long pages. Or three short pages if </w:t>
       </w:r>
       <w:r>
-        <w:t xml:space="preserve"> </w:t>
+        <w:br/>
       </w:r>
       <w:r>
         <w:rPr>
@@ -82,11 +87,12 @@
           <w:i w:val="0"/>
           <w:color w:val="000000"/>
           <w:sz w:val="31"/>
+          <w:fitText w:val="10888" w:id="4"/>
         </w:rPr>
         <w:t xml:space="preserve">you’re optimistic. Is it the same as saying “three long minutes”, knowing </w:t>
       </w:r>
       <w:r>
-        <w:t xml:space="preserve"> </w:t>
+        <w:br/>
       </w:r>
       <w:r>
         <w:rPr>
@@ -95,11 +101,12 @@
           <w:i w:val="0"/>
           <w:color w:val="000000"/>
           <w:sz w:val="31"/>
+          <w:fitText w:val="10888" w:id="5"/>
         </w:rPr>
         <w:t xml:space="preserve">that all minutes are the same duration, and one cannot possibly be longer </w:t>
       </w:r>
       <w:r>
-        <w:t xml:space="preserve"> </w:t>
+        <w:br/>
       </w:r>
       <w:r>
         <w:rPr>
@@ -108,11 +115,12 @@
           <w:i w:val="0"/>
           <w:color w:val="000000"/>
           <w:sz w:val="31"/>
+          <w:fitText w:val="10891" w:id="6"/>
         </w:rPr>
         <w:t xml:space="preserve">than the other? If these pages are all the same size, can one possibly be </w:t>
       </w:r>
       <w:r>
-        <w:t xml:space="preserve"> </w:t>
+        <w:br/>
       </w:r>
       <w:r>
         <w:rPr>
@@ -121,13 +129,14 @@
           <w:i w:val="0"/>
           <w:color w:val="000000"/>
           <w:sz w:val="31"/>
+          <w:fitText w:val="3382" w:id="7"/>
         </w:rPr>
         <w:t xml:space="preserve">longer than the other? </w:t>
       </w:r>
     </w:p>
     <w:p>
       <w:pPr>
-        <w:spacing w:before="288" w:after="0" w:lineRule="exact" w:line="288"/>
+        <w:spacing w:before="290" w:after="0" w:lineRule="exact" w:line="288"/>
         <w:ind w:left="0" w:right="24" w:firstLine="0"/>
         <w:jc w:val="left"/>
       </w:pPr>
@@ -138,11 +147,12 @@
           <w:i w:val="0"/>
           <w:color w:val="000000"/>
           <w:sz w:val="24"/>
+          <w:fitText w:val="10867" w:id="8"/>
         </w:rPr>
         <w:t xml:space="preserve">I digress. Here’s some Latin. Lorem ipsum dolor sit amet, consectetur adipiscing elit. Integer nec </w:t>
       </w:r>
       <w:r>
-        <w:t xml:space="preserve"> </w:t>
+        <w:br/>
       </w:r>
       <w:r>
         <w:rPr>
@@ -151,11 +161,12 @@
           <w:i w:val="0"/>
           <w:color w:val="000000"/>
           <w:sz w:val="24"/>
+          <w:fitText w:val="10867" w:id="9"/>
         </w:rPr>
         <w:t xml:space="preserve">odio. Praesent libero. Sed cursus ante dapibus diam. Sed nisi. Nulla quis sem at nibh elementum </w:t>
       </w:r>
       <w:r>
-        <w:t xml:space="preserve"> </w:t>
+        <w:br/>
       </w:r>
       <w:r>
         <w:rPr>
@@ -164,11 +175,12 @@
           <w:i w:val="0"/>
           <w:color w:val="000000"/>
           <w:sz w:val="24"/>
+          <w:fitText w:val="10867" w:id="10"/>
         </w:rPr>
         <w:t xml:space="preserve">imperdiet. Duis sagittis ipsum. Praesent mauris. Fusce nec tellus sed augue semper porta. Mauris </w:t>
       </w:r>
       <w:r>
-        <w:t xml:space="preserve"> </w:t>
+        <w:br/>
       </w:r>
       <w:r>
         <w:rPr>
@@ -177,11 +189,12 @@
           <w:i w:val="0"/>
           <w:color w:val="000000"/>
           <w:sz w:val="24"/>
+          <w:fitText w:val="10867" w:id="11"/>
         </w:rPr>
         <w:t xml:space="preserve">massa. Vestibulum lacinia arcu eget nulla. Class aptent taciti sociosqu ad litora torquent per </w:t>
       </w:r>
       <w:r>
-        <w:t xml:space="preserve"> </w:t>
+        <w:br/>
       </w:r>
       <w:r>
         <w:rPr>
@@ -190,6 +203,7 @@
           <w:i w:val="0"/>
           <w:color w:val="000000"/>
           <w:sz w:val="24"/>
+          <w:fitText w:val="8383" w:id="12"/>
         </w:rPr>
         <w:t xml:space="preserve">conubia nostra, per inceptos himenaeos. Curabitur sodales ligula in libero.  </w:t>
       </w:r>
@@ -207,11 +221,12 @@
           <w:i w:val="0"/>
           <w:color w:val="000000"/>
           <w:sz w:val="24"/>
+          <w:fitText w:val="10867" w:id="13"/>
         </w:rPr>
         <w:t xml:space="preserve">Sed dignissim lacinia nunc. Curabitur tortor. Pellentesque nibh. Aenean quam. In scelerisque sem </w:t>
       </w:r>
       <w:r>
-        <w:t xml:space="preserve"> </w:t>
+        <w:br/>
       </w:r>
       <w:r>
         <w:rPr>
@@ -220,11 +235,12 @@
           <w:i w:val="0"/>
           <w:color w:val="000000"/>
           <w:sz w:val="24"/>
+          <w:fitText w:val="10867" w:id="14"/>
         </w:rPr>
         <w:t xml:space="preserve">at dolor. Maecenas mattis. Sed convallis tristique sem. Proin ut ligula vel nunc egestas porttitor. </w:t>
       </w:r>
       <w:r>
-        <w:t xml:space="preserve"> </w:t>
+        <w:br/>
       </w:r>
       <w:r>
         <w:rPr>
@@ -233,11 +249,12 @@
           <w:i w:val="0"/>
           <w:color w:val="000000"/>
           <w:sz w:val="24"/>
+          <w:fitText w:val="10867" w:id="15"/>
         </w:rPr>
         <w:t xml:space="preserve">Morbi lectus risus, iaculis vel, suscipit quis, luctus non, massa. Fusce ac turpis quis ligula lacinia </w:t>
       </w:r>
       <w:r>
-        <w:t xml:space="preserve"> </w:t>
+        <w:br/>
       </w:r>
       <w:r>
         <w:rPr>
@@ -246,13 +263,14 @@
           <w:i w:val="0"/>
           <w:color w:val="000000"/>
           <w:sz w:val="24"/>
+          <w:fitText w:val="10365" w:id="16"/>
         </w:rPr>
         <w:t xml:space="preserve">aliquet. Mauris ipsum. Nulla metus metus, ullamcorper vel, tincidunt sed, euismod in, nibh.  </w:t>
       </w:r>
     </w:p>
     <w:p>
       <w:pPr>
-        <w:spacing w:before="288" w:after="0" w:lineRule="exact" w:line="288"/>
+        <w:spacing w:before="292" w:after="0" w:lineRule="exact" w:line="288"/>
         <w:ind w:left="0" w:right="24" w:firstLine="0"/>
         <w:jc w:val="left"/>
       </w:pPr>
@@ -263,11 +281,12 @@
           <w:i w:val="0"/>
           <w:color w:val="000000"/>
           <w:sz w:val="24"/>
+          <w:fitText w:val="10867" w:id="17"/>
         </w:rPr>
         <w:t xml:space="preserve">Quisque volutpat condimentum velit. Class aptent taciti sociosqu ad litora torquent per conubia </w:t>
       </w:r>
       <w:r>
-        <w:t xml:space="preserve"> </w:t>
+        <w:br/>
       </w:r>
       <w:r>
         <w:rPr>
@@ -276,11 +295,12 @@
           <w:i w:val="0"/>
           <w:color w:val="000000"/>
           <w:sz w:val="24"/>
+          <w:fitText w:val="10867" w:id="18"/>
         </w:rPr>
         <w:t xml:space="preserve">nostra, per inceptos himenaeos. Nam nec ante. Sed lacinia, urna non tincidunt mattis, tortor neque </w:t>
       </w:r>
       <w:r>
-        <w:t xml:space="preserve"> </w:t>
+        <w:br/>
       </w:r>
       <w:r>
         <w:rPr>
@@ -289,11 +309,12 @@
           <w:i w:val="0"/>
           <w:color w:val="000000"/>
           <w:sz w:val="24"/>
+          <w:fitText w:val="10866" w:id="19"/>
         </w:rPr>
         <w:t xml:space="preserve">adipiscing diam, a cursus ipsum ante quis turpis. Nulla facilisi. Ut fringilla. Suspendisse potenti. </w:t>
       </w:r>
       <w:r>
-        <w:t xml:space="preserve"> </w:t>
+        <w:br/>
       </w:r>
       <w:r>
         <w:rPr>
@@ -302,6 +323,7 @@
           <w:i w:val="0"/>
           <w:color w:val="000000"/>
           <w:sz w:val="24"/>
+          <w:fitText w:val="10583" w:id="20"/>
         </w:rPr>
         <w:t xml:space="preserve">Nunc feugiat mi a tellus consequat imperdiet. Vestibulum sapien. Proin quam. Etiam ultrices.  </w:t>
       </w:r>
@@ -319,11 +341,12 @@
           <w:i w:val="0"/>
           <w:color w:val="000000"/>
           <w:sz w:val="24"/>
+          <w:fitText w:val="10866" w:id="21"/>
         </w:rPr>
         <w:t xml:space="preserve">Suspendisse in justo eu magna luctus suscipit. Sed lectus. Integer euismod lacus luctus magna. </w:t>
       </w:r>
       <w:r>
-        <w:t xml:space="preserve"> </w:t>
+        <w:br/>
       </w:r>
       <w:r>
         <w:rPr>
@@ -332,11 +355,12 @@
           <w:i w:val="0"/>
           <w:color w:val="000000"/>
           <w:sz w:val="24"/>
+          <w:fitText w:val="10867" w:id="22"/>
         </w:rPr>
         <w:t xml:space="preserve">Quisque cursus, metus vitae pharetra auctor, sem massa mattis sem, at interdum magna augue </w:t>
       </w:r>
       <w:r>
-        <w:t xml:space="preserve"> </w:t>
+        <w:br/>
       </w:r>
       <w:r>
         <w:rPr>
@@ -345,11 +369,12 @@
           <w:i w:val="0"/>
           <w:color w:val="000000"/>
           <w:sz w:val="24"/>
+          <w:fitText w:val="10867" w:id="23"/>
         </w:rPr>
         <w:t xml:space="preserve">eget diam. Vestibulum ante ipsum primis in faucibus orci luctus et ultrices posuere cubilia Curae; </w:t>
       </w:r>
       <w:r>
-        <w:t xml:space="preserve"> </w:t>
+        <w:br/>
       </w:r>
       <w:r>
         <w:rPr>
@@ -358,11 +383,12 @@
           <w:i w:val="0"/>
           <w:color w:val="000000"/>
           <w:sz w:val="24"/>
+          <w:fitText w:val="10867" w:id="24"/>
         </w:rPr>
         <w:t xml:space="preserve">Morbi lacinia molestie dui. Praesent blandit dolor. Sed non quam. In vel mi sit amet augue congue </w:t>
       </w:r>
       <w:r>
-        <w:t xml:space="preserve"> </w:t>
+        <w:br/>
       </w:r>
       <w:r>
         <w:rPr>
@@ -371,11 +397,12 @@
           <w:i w:val="0"/>
           <w:color w:val="000000"/>
           <w:sz w:val="24"/>
+          <w:fitText w:val="10867" w:id="25"/>
         </w:rPr>
         <w:t xml:space="preserve">elementum. Morbi in ipsum sit amet pede facilisis laoreet. Donec lacus nunc, viverra nec, blandit </w:t>
       </w:r>
       <w:r>
-        <w:t xml:space="preserve"> </w:t>
+        <w:br/>
       </w:r>
       <w:r>
         <w:rPr>
@@ -384,11 +411,12 @@
           <w:i w:val="0"/>
           <w:color w:val="000000"/>
           <w:sz w:val="24"/>
+          <w:fitText w:val="10867" w:id="26"/>
         </w:rPr>
         <w:t xml:space="preserve">vel, egestas et, augue. Vestibulum tincidunt malesuada tellus. Ut ultrices ultrices enim. Curabitur </w:t>
       </w:r>
       <w:r>
-        <w:t xml:space="preserve"> </w:t>
+        <w:br/>
       </w:r>
       <w:r>
         <w:rPr>
@@ -397,6 +425,7 @@
           <w:i w:val="0"/>
           <w:color w:val="000000"/>
           <w:sz w:val="24"/>
+          <w:fitText w:val="1960" w:id="27"/>
         </w:rPr>
         <w:t xml:space="preserve">sit amet mauris.  </w:t>
       </w:r>
@@ -414,11 +443,12 @@
           <w:i w:val="0"/>
           <w:color w:val="000000"/>
           <w:sz w:val="24"/>
+          <w:fitText w:val="10866" w:id="28"/>
         </w:rPr>
         <w:t xml:space="preserve">Morbi in dui quis est pulvinar ullamcorper. Nulla facilisi. Integer lacinia sollicitudin massa. Cras </w:t>
       </w:r>
       <w:r>
-        <w:t xml:space="preserve"> </w:t>
+        <w:br/>
       </w:r>
       <w:r>
         <w:rPr>
@@ -427,11 +457,12 @@
           <w:i w:val="0"/>
           <w:color w:val="000000"/>
           <w:sz w:val="24"/>
+          <w:fitText w:val="10867" w:id="29"/>
         </w:rPr>
         <w:t xml:space="preserve">metus. Sed aliquet risus a tortor. Integer id quam. Morbi mi. Quisque nisl felis, venenatis tristique, </w:t>
       </w:r>
       <w:r>
-        <w:t xml:space="preserve"> </w:t>
+        <w:br/>
       </w:r>
       <w:r>
         <w:rPr>
@@ -440,11 +471,12 @@
           <w:i w:val="0"/>
           <w:color w:val="000000"/>
           <w:sz w:val="24"/>
+          <w:fitText w:val="10867" w:id="30"/>
         </w:rPr>
         <w:t xml:space="preserve">dignissim in, ultrices sit amet, augue. Proin sodales libero eget ante. Nulla quam. Aenean laoreet. </w:t>
       </w:r>
       <w:r>
-        <w:t xml:space="preserve"> </w:t>
+        <w:br/>
       </w:r>
       <w:r>
         <w:rPr>
@@ -453,11 +485,12 @@
           <w:i w:val="0"/>
           <w:color w:val="000000"/>
           <w:sz w:val="24"/>
+          <w:fitText w:val="10867" w:id="31"/>
         </w:rPr>
         <w:t xml:space="preserve">Vestibulum nisi lectus, commodo ac, facilisis ac, ultricies eu, pede. Ut orci risus, accumsan </w:t>
       </w:r>
       <w:r>
-        <w:t xml:space="preserve"> </w:t>
+        <w:br/>
       </w:r>
       <w:r>
         <w:rPr>
@@ -466,6 +499,7 @@
           <w:i w:val="0"/>
           <w:color w:val="000000"/>
           <w:sz w:val="24"/>
+          <w:fitText w:val="7498" w:id="32"/>
         </w:rPr>
         <w:t xml:space="preserve">porttitor, cursus quis, aliquet eget, justo. Sed pretium blandit orci.  </w:t>
       </w:r>
@@ -483,11 +517,12 @@
           <w:i w:val="0"/>
           <w:color w:val="000000"/>
           <w:sz w:val="24"/>
+          <w:fitText w:val="10867" w:id="33"/>
         </w:rPr>
         <w:t xml:space="preserve">Ut eu diam at pede suscipit sodales. Aenean lectus elit, fermentum non, convallis id, sagittis at, </w:t>
       </w:r>
       <w:r>
-        <w:t xml:space="preserve"> </w:t>
+        <w:br/>
       </w:r>
       <w:r>
         <w:rPr>
@@ -496,11 +531,12 @@
           <w:i w:val="0"/>
           <w:color w:val="000000"/>
           <w:sz w:val="24"/>
+          <w:fitText w:val="10867" w:id="34"/>
         </w:rPr>
         <w:t xml:space="preserve">neque. Nullam mauris orci, aliquet et, iaculis et, viverra vitae, ligula. Nulla ut felis in purus </w:t>
       </w:r>
       <w:r>
-        <w:t xml:space="preserve"> </w:t>
+        <w:br/>
       </w:r>
       <w:r>
         <w:rPr>
@@ -509,6 +545,7 @@
           <w:i w:val="0"/>
           <w:color w:val="000000"/>
           <w:sz w:val="24"/>
+          <w:fitText w:val="10867" w:id="35"/>
         </w:rPr>
         <w:t xml:space="preserve">aliquam imperdiet. Maecenas aliquet mollis lectus. Vivamus consectetuer risus et tortor. Lorem </w:t>
       </w:r>
@@ -536,11 +573,12 @@
           <w:i w:val="0"/>
           <w:color w:val="000000"/>
           <w:sz w:val="24"/>
+          <w:fitText w:val="10866" w:id="36"/>
         </w:rPr>
         <w:t xml:space="preserve">ipsum dolor sit amet, consectetur adipiscing elit. Integer nec odio. Praesent libero. Sed cursus ante </w:t>
       </w:r>
       <w:r>
-        <w:t xml:space="preserve"> </w:t>
+        <w:br/>
       </w:r>
       <w:r>
         <w:rPr>
@@ -549,11 +587,12 @@
           <w:i w:val="0"/>
           <w:color w:val="000000"/>
           <w:sz w:val="24"/>
+          <w:fitText w:val="10867" w:id="37"/>
         </w:rPr>
         <w:t xml:space="preserve">dapibus diam. Sed nisi. Nulla quis sem at nibh elementum imperdiet. Duis sagittis ipsum. </w:t>
       </w:r>
       <w:r>
-        <w:t xml:space="preserve"> </w:t>
+        <w:br/>
       </w:r>
       <w:r>
         <w:rPr>
@@ -562,6 +601,7 @@
           <w:i w:val="0"/>
           <w:color w:val="000000"/>
           <w:sz w:val="24"/>
+          <w:fitText w:val="2045" w:id="38"/>
         </w:rPr>
         <w:t xml:space="preserve">Praesent mauris.  </w:t>
       </w:r>
@@ -579,11 +619,12 @@
           <w:i w:val="0"/>
           <w:color w:val="000000"/>
           <w:sz w:val="24"/>
+          <w:fitText w:val="10867" w:id="39"/>
         </w:rPr>
         <w:t xml:space="preserve">Fusce nec tellus sed augue semper porta. Mauris massa. Vestibulum lacinia arcu eget nulla. Class </w:t>
       </w:r>
       <w:r>
-        <w:t xml:space="preserve"> </w:t>
+        <w:br/>
       </w:r>
       <w:r>
         <w:rPr>
@@ -592,11 +633,12 @@
           <w:i w:val="0"/>
           <w:color w:val="000000"/>
           <w:sz w:val="24"/>
+          <w:fitText w:val="10867" w:id="40"/>
         </w:rPr>
         <w:t xml:space="preserve">aptent taciti sociosqu ad litora torquent per conubia nostra, per inceptos himenaeos. Curabitur </w:t>
       </w:r>
       <w:r>
-        <w:t xml:space="preserve"> </w:t>
+        <w:br/>
       </w:r>
       <w:r>
         <w:rPr>
@@ -605,11 +647,12 @@
           <w:i w:val="0"/>
           <w:color w:val="000000"/>
           <w:sz w:val="24"/>
+          <w:fitText w:val="10866" w:id="41"/>
         </w:rPr>
         <w:t xml:space="preserve">sodales ligula in libero. Sed dignissim lacinia nunc. Curabitur tortor. Pellentesque nibh. Aenean </w:t>
       </w:r>
       <w:r>
-        <w:t xml:space="preserve"> </w:t>
+        <w:br/>
       </w:r>
       <w:r>
         <w:rPr>
@@ -618,6 +661,7 @@
           <w:i w:val="0"/>
           <w:color w:val="000000"/>
           <w:sz w:val="24"/>
+          <w:fitText w:val="9063" w:id="42"/>
         </w:rPr>
         <w:t xml:space="preserve">quam. In scelerisque sem at dolor. Maecenas mattis. Sed convallis tristique sem.  </w:t>
       </w:r>
@@ -635,11 +679,12 @@
           <w:i w:val="0"/>
           <w:color w:val="000000"/>
           <w:sz w:val="24"/>
+          <w:fitText w:val="10867" w:id="43"/>
         </w:rPr>
         <w:t xml:space="preserve">Proin ut ligula vel nunc egestas porttitor. Morbi lectus risus, iaculis vel, suscipit quis, luctus non, </w:t>
       </w:r>
       <w:r>
-        <w:t xml:space="preserve"> </w:t>
+        <w:br/>
       </w:r>
       <w:r>
         <w:rPr>
@@ -648,11 +693,12 @@
           <w:i w:val="0"/>
           <w:color w:val="000000"/>
           <w:sz w:val="24"/>
+          <w:fitText w:val="10867" w:id="44"/>
         </w:rPr>
         <w:t xml:space="preserve">massa. Fusce ac turpis quis ligula lacinia aliquet. Mauris ipsum. Nulla metus metus, ullamcorper </w:t>
       </w:r>
       <w:r>
-        <w:t xml:space="preserve"> </w:t>
+        <w:br/>
       </w:r>
       <w:r>
         <w:rPr>
@@ -661,11 +707,12 @@
           <w:i w:val="0"/>
           <w:color w:val="000000"/>
           <w:sz w:val="24"/>
+          <w:fitText w:val="10867" w:id="45"/>
         </w:rPr>
         <w:t xml:space="preserve">vel, tincidunt sed, euismod in, nibh. Quisque volutpat condimentum velit. Class aptent taciti </w:t>
       </w:r>
       <w:r>
-        <w:t xml:space="preserve"> </w:t>
+        <w:br/>
       </w:r>
       <w:r>
         <w:rPr>
@@ -674,11 +721,12 @@
           <w:i w:val="0"/>
           <w:color w:val="000000"/>
           <w:sz w:val="24"/>
+          <w:fitText w:val="10867" w:id="46"/>
         </w:rPr>
         <w:t xml:space="preserve">sociosqu ad litora torquent per conubia nostra, per inceptos himenaeos. Nam nec ante. Sed lacinia, </w:t>
       </w:r>
       <w:r>
-        <w:t xml:space="preserve"> </w:t>
+        <w:br/>
       </w:r>
       <w:r>
         <w:rPr>
@@ -687,11 +735,12 @@
           <w:i w:val="0"/>
           <w:color w:val="000000"/>
           <w:sz w:val="24"/>
+          <w:fitText w:val="10867" w:id="47"/>
         </w:rPr>
         <w:t xml:space="preserve">urna non tincidunt mattis, tortor neque adipiscing diam, a cursus ipsum ante quis turpis. Nulla </w:t>
       </w:r>
       <w:r>
-        <w:t xml:space="preserve"> </w:t>
+        <w:br/>
       </w:r>
       <w:r>
         <w:rPr>
@@ -700,6 +749,7 @@
           <w:i w:val="0"/>
           <w:color w:val="000000"/>
           <w:sz w:val="24"/>
+          <w:fitText w:val="4676" w:id="48"/>
         </w:rPr>
         <w:t xml:space="preserve">facilisi. Ut fringilla. Suspendisse potenti.  </w:t>
       </w:r>
@@ -717,11 +767,12 @@
           <w:i w:val="0"/>
           <w:color w:val="000000"/>
           <w:sz w:val="24"/>
+          <w:fitText w:val="10867" w:id="49"/>
         </w:rPr>
         <w:t xml:space="preserve">Nunc feugiat mi a tellus consequat imperdiet. Vestibulum sapien. Proin quam. Etiam ultrices. </w:t>
       </w:r>
       <w:r>
-        <w:t xml:space="preserve"> </w:t>
+        <w:br/>
       </w:r>
       <w:r>
         <w:rPr>
@@ -730,11 +781,12 @@
           <w:i w:val="0"/>
           <w:color w:val="000000"/>
           <w:sz w:val="24"/>
+          <w:fitText w:val="10866" w:id="50"/>
         </w:rPr>
         <w:t xml:space="preserve">Suspendisse in justo eu magna luctus suscipit. Sed lectus. Integer euismod lacus luctus magna. </w:t>
       </w:r>
       <w:r>
-        <w:t xml:space="preserve"> </w:t>
+        <w:br/>
       </w:r>
       <w:r>
         <w:rPr>
@@ -743,11 +795,12 @@
           <w:i w:val="0"/>
           <w:color w:val="000000"/>
           <w:sz w:val="24"/>
+          <w:fitText w:val="10867" w:id="51"/>
         </w:rPr>
         <w:t xml:space="preserve">Quisque cursus, metus vitae pharetra auctor, sem massa mattis sem, at interdum magna augue </w:t>
       </w:r>
       <w:r>
-        <w:t xml:space="preserve"> </w:t>
+        <w:br/>
       </w:r>
       <w:r>
         <w:rPr>
@@ -756,11 +809,12 @@
           <w:i w:val="0"/>
           <w:color w:val="000000"/>
           <w:sz w:val="24"/>
+          <w:fitText w:val="10867" w:id="52"/>
         </w:rPr>
         <w:t xml:space="preserve">eget diam. Vestibulum ante ipsum primis in faucibus orci luctus et ultrices posuere cubilia Curae; </w:t>
       </w:r>
       <w:r>
-        <w:t xml:space="preserve"> </w:t>
+        <w:br/>
       </w:r>
       <w:r>
         <w:rPr>
@@ -769,11 +823,12 @@
           <w:i w:val="0"/>
           <w:color w:val="000000"/>
           <w:sz w:val="24"/>
+          <w:fitText w:val="10867" w:id="53"/>
         </w:rPr>
         <w:t xml:space="preserve">Morbi lacinia molestie dui. Praesent blandit dolor. Sed non quam. In vel mi sit amet augue congue </w:t>
       </w:r>
       <w:r>
-        <w:t xml:space="preserve"> </w:t>
+        <w:br/>
       </w:r>
       <w:r>
         <w:rPr>
@@ -782,6 +837,7 @@
           <w:i w:val="0"/>
           <w:color w:val="000000"/>
           <w:sz w:val="24"/>
+          <w:fitText w:val="6587" w:id="54"/>
         </w:rPr>
         <w:t xml:space="preserve">elementum. Morbi in ipsum sit amet pede facilisis laoreet.  </w:t>
       </w:r>
@@ -799,11 +855,12 @@
           <w:i w:val="0"/>
           <w:color w:val="000000"/>
           <w:sz w:val="24"/>
+          <w:fitText w:val="10867" w:id="55"/>
         </w:rPr>
         <w:t xml:space="preserve">Donec lacus nunc, viverra nec, blandit vel, egestas et, augue. Vestibulum tincidunt malesuada </w:t>
       </w:r>
       <w:r>
-        <w:t xml:space="preserve"> </w:t>
+        <w:br/>
       </w:r>
       <w:r>
         <w:rPr>
@@ -812,11 +869,12 @@
           <w:i w:val="0"/>
           <w:color w:val="000000"/>
           <w:sz w:val="24"/>
+          <w:fitText w:val="10867" w:id="56"/>
         </w:rPr>
         <w:t xml:space="preserve">tellus. Ut ultrices ultrices enim. Curabitur sit amet mauris. Morbi in dui quis est pulvinar </w:t>
       </w:r>
       <w:r>
-        <w:t xml:space="preserve"> </w:t>
+        <w:br/>
       </w:r>
       <w:r>
         <w:rPr>
@@ -825,11 +883,12 @@
           <w:i w:val="0"/>
           <w:color w:val="000000"/>
           <w:sz w:val="24"/>
+          <w:fitText w:val="10867" w:id="57"/>
         </w:rPr>
         <w:t xml:space="preserve">ullamcorper. Nulla facilisi. Integer lacinia sollicitudin massa. Cras metus. Sed aliquet risus a </w:t>
       </w:r>
       <w:r>
-        <w:t xml:space="preserve"> </w:t>
+        <w:br/>
       </w:r>
       <w:r>
         <w:rPr>
@@ -838,6 +897,7 @@
           <w:i w:val="0"/>
           <w:color w:val="000000"/>
           <w:sz w:val="24"/>
+          <w:fitText w:val="3911" w:id="58"/>
         </w:rPr>
         <w:t xml:space="preserve">tortor. Integer id quam. Morbi mi.  </w:t>
       </w:r>
@@ -855,11 +915,12 @@
           <w:i w:val="0"/>
           <w:color w:val="000000"/>
           <w:sz w:val="24"/>
+          <w:fitText w:val="10866" w:id="59"/>
         </w:rPr>
         <w:t xml:space="preserve">Lorem ipsum dolor sit amet, consectetur adipiscing elit. Integer nec odio. Praesent libero. Sed </w:t>
       </w:r>
       <w:r>
-        <w:t xml:space="preserve"> </w:t>
+        <w:br/>
       </w:r>
       <w:r>
         <w:rPr>
@@ -868,11 +929,12 @@
           <w:i w:val="0"/>
           <w:color w:val="000000"/>
           <w:sz w:val="24"/>
+          <w:fitText w:val="10867" w:id="60"/>
         </w:rPr>
         <w:t xml:space="preserve">cursus ante dapibus diam. Sed nisi. Nulla quis sem at nibh elementum imperdiet. Duis sagittis </w:t>
       </w:r>
       <w:r>
-        <w:t xml:space="preserve"> </w:t>
+        <w:br/>
       </w:r>
       <w:r>
         <w:rPr>
@@ -881,11 +943,12 @@
           <w:i w:val="0"/>
           <w:color w:val="000000"/>
           <w:sz w:val="24"/>
+          <w:fitText w:val="10867" w:id="61"/>
         </w:rPr>
         <w:t xml:space="preserve">ipsum. Praesent mauris. Fusce nec tellus sed augue semper porta. Mauris massa. Vestibulum </w:t>
       </w:r>
       <w:r>
-        <w:t xml:space="preserve"> </w:t>
+        <w:br/>
       </w:r>
       <w:r>
         <w:rPr>
@@ -894,11 +957,12 @@
           <w:i w:val="0"/>
           <w:color w:val="000000"/>
           <w:sz w:val="24"/>
+          <w:fitText w:val="10867" w:id="62"/>
         </w:rPr>
         <w:t xml:space="preserve">lacinia arcu eget nulla. Class aptent taciti sociosqu ad litora torquent per conubia nostra, per </w:t>
       </w:r>
       <w:r>
-        <w:t xml:space="preserve"> </w:t>
+        <w:br/>
       </w:r>
       <w:r>
         <w:rPr>
@@ -907,13 +971,14 @@
           <w:i w:val="0"/>
           <w:color w:val="000000"/>
           <w:sz w:val="24"/>
+          <w:fitText w:val="6178" w:id="63"/>
         </w:rPr>
         <w:t xml:space="preserve">inceptos himenaeos. Curabitur sodales ligula in libero.  </w:t>
       </w:r>
     </w:p>
     <w:p>
       <w:pPr>
-        <w:spacing w:before="288" w:after="0" w:lineRule="exact" w:line="288"/>
+        <w:spacing w:before="292" w:after="0" w:lineRule="exact" w:line="288"/>
         <w:ind w:left="0" w:right="0" w:firstLine="0"/>
         <w:jc w:val="left"/>
       </w:pPr>
@@ -924,11 +989,12 @@
           <w:i w:val="0"/>
           <w:color w:val="000000"/>
           <w:sz w:val="24"/>
+          <w:fitText w:val="10867" w:id="64"/>
         </w:rPr>
         <w:t xml:space="preserve">Sed dignissim lacinia nunc. Curabitur tortor. Pellentesque nibh. Aenean quam. In scelerisque sem </w:t>
       </w:r>
       <w:r>
-        <w:t xml:space="preserve"> </w:t>
+        <w:br/>
       </w:r>
       <w:r>
         <w:rPr>
@@ -937,11 +1003,12 @@
           <w:i w:val="0"/>
           <w:color w:val="000000"/>
           <w:sz w:val="24"/>
+          <w:fitText w:val="10867" w:id="65"/>
         </w:rPr>
         <w:t xml:space="preserve">at dolor. Maecenas mattis. Sed convallis tristique sem. Proin ut ligula vel nunc egestas porttitor. </w:t>
       </w:r>
       <w:r>
-        <w:t xml:space="preserve"> </w:t>
+        <w:br/>
       </w:r>
       <w:r>
         <w:rPr>
@@ -950,11 +1017,12 @@
           <w:i w:val="0"/>
           <w:color w:val="000000"/>
           <w:sz w:val="24"/>
+          <w:fitText w:val="10866" w:id="66"/>
         </w:rPr>
         <w:t xml:space="preserve">Morbi lectus risus, iaculis vel, suscipit quis, luctus non, massa. Fusce ac turpis quis ligula lacinia </w:t>
       </w:r>
       <w:r>
-        <w:t xml:space="preserve"> </w:t>
+        <w:br/>
       </w:r>
       <w:r>
         <w:rPr>
@@ -963,6 +1031,7 @@
           <w:i w:val="0"/>
           <w:color w:val="000000"/>
           <w:sz w:val="24"/>
+          <w:fitText w:val="10365" w:id="67"/>
         </w:rPr>
         <w:t xml:space="preserve">aliquet. Mauris ipsum. Nulla metus metus, ullamcorper vel, tincidunt sed, euismod in, nibh.  </w:t>
       </w:r>
@@ -980,11 +1049,12 @@
           <w:i w:val="0"/>
           <w:color w:val="000000"/>
           <w:sz w:val="24"/>
+          <w:fitText w:val="10867" w:id="68"/>
         </w:rPr>
         <w:t xml:space="preserve">Quisque volutpat condimentum velit. Class aptent taciti sociosqu ad litora torquent per conubia </w:t>
       </w:r>
       <w:r>
-        <w:t xml:space="preserve"> </w:t>
+        <w:br/>
       </w:r>
       <w:r>
         <w:rPr>
@@ -993,11 +1063,12 @@
           <w:i w:val="0"/>
           <w:color w:val="000000"/>
           <w:sz w:val="24"/>
+          <w:fitText w:val="10867" w:id="69"/>
         </w:rPr>
         <w:t xml:space="preserve">nostra, per inceptos himenaeos. Nam nec ante. Sed lacinia, urna non tincidunt mattis, tortor neque </w:t>
       </w:r>
       <w:r>
-        <w:t xml:space="preserve"> </w:t>
+        <w:br/>
       </w:r>
       <w:r>
         <w:rPr>
@@ -1006,11 +1077,12 @@
           <w:i w:val="0"/>
           <w:color w:val="000000"/>
           <w:sz w:val="24"/>
+          <w:fitText w:val="10866" w:id="70"/>
         </w:rPr>
         <w:t xml:space="preserve">adipiscing diam, a cursus ipsum ante quis turpis. Nulla facilisi. Ut fringilla. Suspendisse potenti. </w:t>
       </w:r>
       <w:r>
-        <w:t xml:space="preserve"> </w:t>
+        <w:br/>
       </w:r>
       <w:r>
         <w:rPr>
@@ -1019,6 +1091,7 @@
           <w:i w:val="0"/>
           <w:color w:val="000000"/>
           <w:sz w:val="24"/>
+          <w:fitText w:val="10583" w:id="71"/>
         </w:rPr>
         <w:t xml:space="preserve">Nunc feugiat mi a tellus consequat imperdiet. Vestibulum sapien. Proin quam. Etiam ultrices.  </w:t>
       </w:r>
@@ -1036,11 +1109,12 @@
           <w:i w:val="0"/>
           <w:color w:val="000000"/>
           <w:sz w:val="24"/>
+          <w:fitText w:val="10866" w:id="72"/>
         </w:rPr>
         <w:t xml:space="preserve">Suspendisse in justo eu magna luctus suscipit. Sed lectus. Integer euismod lacus luctus magna. </w:t>
       </w:r>
       <w:r>
-        <w:t xml:space="preserve"> </w:t>
+        <w:br/>
       </w:r>
       <w:r>
         <w:rPr>
@@ -1049,11 +1123,12 @@
           <w:i w:val="0"/>
           <w:color w:val="000000"/>
           <w:sz w:val="24"/>
+          <w:fitText w:val="10867" w:id="73"/>
         </w:rPr>
         <w:t xml:space="preserve">Quisque cursus, metus vitae pharetra auctor, sem massa mattis sem, at interdum magna augue </w:t>
       </w:r>
       <w:r>
-        <w:t xml:space="preserve"> </w:t>
+        <w:br/>
       </w:r>
       <w:r>
         <w:rPr>
@@ -1062,11 +1137,12 @@
           <w:i w:val="0"/>
           <w:color w:val="000000"/>
           <w:sz w:val="24"/>
+          <w:fitText w:val="10867" w:id="74"/>
         </w:rPr>
         <w:t xml:space="preserve">eget diam. Vestibulum ante ipsum primis in faucibus orci luctus et ultrices posuere cubilia Curae; </w:t>
       </w:r>
       <w:r>
-        <w:t xml:space="preserve"> </w:t>
+        <w:br/>
       </w:r>
       <w:r>
         <w:rPr>
@@ -1075,6 +1151,7 @@
           <w:i w:val="0"/>
           <w:color w:val="000000"/>
           <w:sz w:val="24"/>
+          <w:fitText w:val="10867" w:id="75"/>
         </w:rPr>
         <w:t xml:space="preserve">Morbi lacinia molestie dui. Praesent blandit dolor. Sed non quam. In vel mi sit amet augue congue </w:t>
       </w:r>
@@ -1102,11 +1179,12 @@
           <w:i w:val="0"/>
           <w:color w:val="000000"/>
           <w:sz w:val="24"/>
+          <w:fitText w:val="10867" w:id="76"/>
         </w:rPr>
         <w:t xml:space="preserve">elementum. Morbi in ipsum sit amet pede facilisis laoreet. Donec lacus nunc, viverra nec, blandit </w:t>
       </w:r>
       <w:r>
-        <w:t xml:space="preserve"> </w:t>
+        <w:br/>
       </w:r>
       <w:r>
         <w:rPr>
@@ -1115,11 +1193,12 @@
           <w:i w:val="0"/>
           <w:color w:val="000000"/>
           <w:sz w:val="24"/>
+          <w:fitText w:val="10867" w:id="77"/>
         </w:rPr>
         <w:t xml:space="preserve">vel, egestas et, augue. Vestibulum tincidunt malesuada tellus. Ut ultrices ultrices enim. Curabitur </w:t>
       </w:r>
       <w:r>
-        <w:t xml:space="preserve"> </w:t>
+        <w:br/>
       </w:r>
       <w:r>
         <w:rPr>
@@ -1128,6 +1207,7 @@
           <w:i w:val="0"/>
           <w:color w:val="000000"/>
           <w:sz w:val="24"/>
+          <w:fitText w:val="1960" w:id="78"/>
         </w:rPr>
         <w:t xml:space="preserve">sit amet mauris.  </w:t>
       </w:r>
@@ -1145,11 +1225,12 @@
           <w:i w:val="0"/>
           <w:color w:val="000000"/>
           <w:sz w:val="24"/>
+          <w:fitText w:val="10866" w:id="79"/>
         </w:rPr>
         <w:t xml:space="preserve">Morbi in dui quis est pulvinar ullamcorper. Nulla facilisi. Integer lacinia sollicitudin massa. Cras </w:t>
       </w:r>
       <w:r>
-        <w:t xml:space="preserve"> </w:t>
+        <w:br/>
       </w:r>
       <w:r>
         <w:rPr>
@@ -1158,11 +1239,12 @@
           <w:i w:val="0"/>
           <w:color w:val="000000"/>
           <w:sz w:val="24"/>
+          <w:fitText w:val="10867" w:id="80"/>
         </w:rPr>
         <w:t xml:space="preserve">metus. Sed aliquet risus a tortor. Integer id quam. Morbi mi. Quisque nisl felis, venenatis tristique, </w:t>
       </w:r>
       <w:r>
-        <w:t xml:space="preserve"> </w:t>
+        <w:br/>
       </w:r>
       <w:r>
         <w:rPr>
@@ -1171,11 +1253,12 @@
           <w:i w:val="0"/>
           <w:color w:val="000000"/>
           <w:sz w:val="24"/>
+          <w:fitText w:val="10867" w:id="81"/>
         </w:rPr>
         <w:t xml:space="preserve">dignissim in, ultrices sit amet, augue. Proin sodales libero eget ante. Nulla quam. Aenean laoreet. </w:t>
       </w:r>
       <w:r>
-        <w:t xml:space="preserve"> </w:t>
+        <w:br/>
       </w:r>
       <w:r>
         <w:rPr>
@@ -1184,11 +1267,12 @@
           <w:i w:val="0"/>
           <w:color w:val="000000"/>
           <w:sz w:val="24"/>
+          <w:fitText w:val="10867" w:id="82"/>
         </w:rPr>
         <w:t xml:space="preserve">Vestibulum nisi lectus, commodo ac, facilisis ac, ultricies eu, pede. Ut orci risus, accumsan </w:t>
       </w:r>
       <w:r>
-        <w:t xml:space="preserve"> </w:t>
+        <w:br/>
       </w:r>
       <w:r>
         <w:rPr>
@@ -1197,6 +1281,7 @@
           <w:i w:val="0"/>
           <w:color w:val="000000"/>
           <w:sz w:val="24"/>
+          <w:fitText w:val="7498" w:id="83"/>
         </w:rPr>
         <w:t xml:space="preserve">porttitor, cursus quis, aliquet eget, justo. Sed pretium blandit orci.  </w:t>
       </w:r>
@@ -1214,11 +1299,12 @@
           <w:i w:val="0"/>
           <w:color w:val="000000"/>
           <w:sz w:val="24"/>
+          <w:fitText w:val="10867" w:id="84"/>
         </w:rPr>
         <w:t xml:space="preserve">Ut eu diam at pede suscipit sodales. Aenean lectus elit, fermentum non, convallis id, sagittis at, </w:t>
       </w:r>
       <w:r>
-        <w:t xml:space="preserve"> </w:t>
+        <w:br/>
       </w:r>
       <w:r>
         <w:rPr>
@@ -1227,11 +1313,12 @@
           <w:i w:val="0"/>
           <w:color w:val="000000"/>
           <w:sz w:val="24"/>
+          <w:fitText w:val="10866" w:id="85"/>
         </w:rPr>
         <w:t xml:space="preserve">neque. Nullam mauris orci, aliquet et, iaculis et, viverra vitae, ligula. Nulla ut felis in purus </w:t>
       </w:r>
       <w:r>
-        <w:t xml:space="preserve"> </w:t>
+        <w:br/>
       </w:r>
       <w:r>
         <w:rPr>
@@ -1240,11 +1327,12 @@
           <w:i w:val="0"/>
           <w:color w:val="000000"/>
           <w:sz w:val="24"/>
+          <w:fitText w:val="10867" w:id="86"/>
         </w:rPr>
         <w:t xml:space="preserve">aliquam imperdiet. Maecenas aliquet mollis lectus. Vivamus consectetuer risus et tortor. Lorem </w:t>
       </w:r>
       <w:r>
-        <w:t xml:space="preserve"> </w:t>
+        <w:br/>
       </w:r>
       <w:r>
         <w:rPr>
@@ -1253,11 +1341,12 @@
           <w:i w:val="0"/>
           <w:color w:val="000000"/>
           <w:sz w:val="24"/>
+          <w:fitText w:val="10866" w:id="87"/>
         </w:rPr>
         <w:t xml:space="preserve">ipsum dolor sit amet, consectetur adipiscing elit. Integer nec odio. Praesent libero. Sed cursus ante </w:t>
       </w:r>
       <w:r>
-        <w:t xml:space="preserve"> </w:t>
+        <w:br/>
       </w:r>
       <w:r>
         <w:rPr>
@@ -1266,11 +1355,12 @@
           <w:i w:val="0"/>
           <w:color w:val="000000"/>
           <w:sz w:val="24"/>
+          <w:fitText w:val="10867" w:id="88"/>
         </w:rPr>
         <w:t xml:space="preserve">dapibus diam. Sed nisi. Nulla quis sem at nibh elementum imperdiet. Duis sagittis ipsum. </w:t>
       </w:r>
       <w:r>
-        <w:t xml:space="preserve"> </w:t>
+        <w:br/>
       </w:r>
       <w:r>
         <w:rPr>
@@ -1279,6 +1369,7 @@
           <w:i w:val="0"/>
           <w:color w:val="000000"/>
           <w:sz w:val="24"/>
+          <w:fitText w:val="2045" w:id="89"/>
         </w:rPr>
         <w:t xml:space="preserve">Praesent mauris.  </w:t>
       </w:r>
@@ -1296,11 +1387,12 @@
           <w:i w:val="0"/>
           <w:color w:val="000000"/>
           <w:sz w:val="24"/>
+          <w:fitText w:val="10867" w:id="90"/>
         </w:rPr>
         <w:t xml:space="preserve">Fusce nec tellus sed augue semper porta. Mauris massa. Vestibulum lacinia arcu eget nulla. Class </w:t>
       </w:r>
       <w:r>
-        <w:t xml:space="preserve"> </w:t>
+        <w:br/>
       </w:r>
       <w:r>
         <w:rPr>
@@ -1309,11 +1401,12 @@
           <w:i w:val="0"/>
           <w:color w:val="000000"/>
           <w:sz w:val="24"/>
+          <w:fitText w:val="10867" w:id="91"/>
         </w:rPr>
         <w:t xml:space="preserve">aptent taciti sociosqu ad litora torquent per conubia nostra, per inceptos himenaeos. Curabitur </w:t>
       </w:r>
       <w:r>
-        <w:t xml:space="preserve"> </w:t>
+        <w:br/>
       </w:r>
       <w:r>
         <w:rPr>
@@ -1322,11 +1415,12 @@
           <w:i w:val="0"/>
           <w:color w:val="000000"/>
           <w:sz w:val="24"/>
+          <w:fitText w:val="10867" w:id="92"/>
         </w:rPr>
         <w:t xml:space="preserve">sodales ligula in libero. Sed dignissim lacinia nunc. Curabitur tortor. Pellentesque nibh. Aenean </w:t>
       </w:r>
       <w:r>
-        <w:t xml:space="preserve"> </w:t>
+        <w:br/>
       </w:r>
       <w:r>
         <w:rPr>
@@ -1335,6 +1429,7 @@
           <w:i w:val="0"/>
           <w:color w:val="000000"/>
           <w:sz w:val="24"/>
+          <w:fitText w:val="9063" w:id="93"/>
         </w:rPr>
         <w:t xml:space="preserve">quam. In scelerisque sem at dolor. Maecenas mattis. Sed convallis tristique sem.  </w:t>
       </w:r>
@@ -1352,11 +1447,12 @@
           <w:i w:val="0"/>
           <w:color w:val="000000"/>
           <w:sz w:val="24"/>
+          <w:fitText w:val="10866" w:id="94"/>
         </w:rPr>
         <w:t xml:space="preserve">Proin ut ligula vel nunc egestas porttitor. Morbi lectus risus, iaculis vel, suscipit quis, luctus non, </w:t>
       </w:r>
       <w:r>
-        <w:t xml:space="preserve"> </w:t>
+        <w:br/>
       </w:r>
       <w:r>
         <w:rPr>
@@ -1365,11 +1461,12 @@
           <w:i w:val="0"/>
           <w:color w:val="000000"/>
           <w:sz w:val="24"/>
+          <w:fitText w:val="10867" w:id="95"/>
         </w:rPr>
         <w:t xml:space="preserve">massa. Fusce ac turpis quis ligula lacinia aliquet. Mauris ipsum. Nulla metus metus, ullamcorper </w:t>
       </w:r>
       <w:r>
-        <w:t xml:space="preserve"> </w:t>
+        <w:br/>
       </w:r>
       <w:r>
         <w:rPr>
@@ -1378,11 +1475,12 @@
           <w:i w:val="0"/>
           <w:color w:val="000000"/>
           <w:sz w:val="24"/>
+          <w:fitText w:val="10867" w:id="96"/>
         </w:rPr>
         <w:t xml:space="preserve">vel, tincidunt sed, euismod in, nibh. Quisque volutpat condimentum velit. Class aptent taciti </w:t>
       </w:r>
       <w:r>
-        <w:t xml:space="preserve"> </w:t>
+        <w:br/>
       </w:r>
       <w:r>
         <w:rPr>
@@ -1391,11 +1489,12 @@
           <w:i w:val="0"/>
           <w:color w:val="000000"/>
           <w:sz w:val="24"/>
+          <w:fitText w:val="10867" w:id="97"/>
         </w:rPr>
         <w:t xml:space="preserve">sociosqu ad litora torquent per conubia nostra, per inceptos himenaeos. Nam nec ante. Sed lacinia, </w:t>
       </w:r>
       <w:r>
-        <w:t xml:space="preserve"> </w:t>
+        <w:br/>
       </w:r>
       <w:r>
         <w:rPr>
@@ -1404,11 +1503,12 @@
           <w:i w:val="0"/>
           <w:color w:val="000000"/>
           <w:sz w:val="24"/>
+          <w:fitText w:val="10867" w:id="98"/>
         </w:rPr>
         <w:t xml:space="preserve">urna non tincidunt mattis, tortor neque adipiscing diam, a cursus ipsum ante quis turpis. Nulla </w:t>
       </w:r>
       <w:r>
-        <w:t xml:space="preserve"> </w:t>
+        <w:br/>
       </w:r>
       <w:r>
         <w:rPr>
@@ -1417,6 +1517,7 @@
           <w:i w:val="0"/>
           <w:color w:val="000000"/>
           <w:sz w:val="24"/>
+          <w:fitText w:val="4676" w:id="99"/>
         </w:rPr>
         <w:t xml:space="preserve">facilisi. Ut fringilla. Suspendisse potenti.  </w:t>
       </w:r>
@@ -1434,11 +1535,12 @@
           <w:i w:val="0"/>
           <w:color w:val="000000"/>
           <w:sz w:val="24"/>
+          <w:fitText w:val="10867" w:id="100"/>
         </w:rPr>
         <w:t xml:space="preserve">Nunc feugiat mi a tellus consequat imperdiet. Vestibulum sapien. Proin quam. Etiam ultrices. </w:t>
       </w:r>
       <w:r>
-        <w:t xml:space="preserve"> </w:t>
+        <w:br/>
       </w:r>
       <w:r>
         <w:rPr>
@@ -1447,11 +1549,12 @@
           <w:i w:val="0"/>
           <w:color w:val="000000"/>
           <w:sz w:val="24"/>
+          <w:fitText w:val="10866" w:id="101"/>
         </w:rPr>
         <w:t xml:space="preserve">Suspendisse in justo eu magna luctus suscipit. Sed lectus. Integer euismod lacus luctus magna. </w:t>
       </w:r>
       <w:r>
-        <w:t xml:space="preserve"> </w:t>
+        <w:br/>
       </w:r>
       <w:r>
         <w:rPr>
@@ -1460,11 +1563,12 @@
           <w:i w:val="0"/>
           <w:color w:val="000000"/>
           <w:sz w:val="24"/>
+          <w:fitText w:val="10867" w:id="102"/>
         </w:rPr>
         <w:t xml:space="preserve">Quisque cursus, metus vitae pharetra auctor, sem massa mattis sem, at interdum magna augue </w:t>
       </w:r>
       <w:r>
-        <w:t xml:space="preserve"> </w:t>
+        <w:br/>
       </w:r>
       <w:r>
         <w:rPr>
@@ -1473,11 +1577,12 @@
           <w:i w:val="0"/>
           <w:color w:val="000000"/>
           <w:sz w:val="24"/>
+          <w:fitText w:val="10867" w:id="103"/>
         </w:rPr>
         <w:t xml:space="preserve">eget diam. Vestibulum ante ipsum primis in faucibus orci luctus et ultrices posuere cubilia Curae; </w:t>
       </w:r>
       <w:r>
-        <w:t xml:space="preserve"> </w:t>
+        <w:br/>
       </w:r>
       <w:r>
         <w:rPr>
@@ -1486,11 +1591,12 @@
           <w:i w:val="0"/>
           <w:color w:val="000000"/>
           <w:sz w:val="24"/>
+          <w:fitText w:val="10867" w:id="104"/>
         </w:rPr>
         <w:t xml:space="preserve">Morbi lacinia molestie dui. Praesent blandit dolor. Sed non quam. In vel mi sit amet augue congue </w:t>
       </w:r>
       <w:r>
-        <w:t xml:space="preserve"> </w:t>
+        <w:br/>
       </w:r>
       <w:r>
         <w:rPr>
@@ -1499,6 +1605,7 @@
           <w:i w:val="0"/>
           <w:color w:val="000000"/>
           <w:sz w:val="24"/>
+          <w:fitText w:val="6587" w:id="105"/>
         </w:rPr>
         <w:t xml:space="preserve">elementum. Morbi in ipsum sit amet pede facilisis laoreet.  </w:t>
       </w:r>

</xml_diff>

<commit_message>
Step 45.1 - Fix VML namespaces in fixed-layout exporter
</commit_message>
<xml_diff>
--- a/output/output.docx
+++ b/output/output.docx
@@ -4,557 +4,1018 @@
   <w:body>
     <w:p>
       <w:pPr>
-        <w:spacing w:before="0" w:after="0" w:lineRule="exact" w:line="865"/>
-        <w:ind w:left="3083" w:right="2967" w:firstLine="0"/>
-        <w:jc w:val="left"/>
+        <w:spacing w:before="0" w:after="0" w:lineRule="exact" w:line="20"/>
       </w:pPr>
       <w:r>
         <w:rPr>
-          <w:rFonts w:ascii="Century Schoolbook" w:hAnsi="Century Schoolbook" w:eastAsia="Century Schoolbook" w:cs="Century Schoolbook"/>
-          <w:b/>
-          <w:i w:val="0"/>
-          <w:color w:val="2E74B5"/>
-          <w:sz w:val="72"/>
-          <w:fitText w:val="4840" w:id="1"/>
+          <w:sz w:val="2"/>
         </w:rPr>
-        <w:t xml:space="preserve">Sample PDF </w:t>
-      </w:r>
-    </w:p>
-    <w:p>
-      <w:pPr>
-        <w:spacing w:before="286" w:after="0" w:lineRule="exact" w:line="433"/>
-        <w:ind w:left="2867" w:right="2957" w:firstLine="0"/>
-        <w:jc w:val="left"/>
-      </w:pPr>
-      <w:r>
-        <w:rPr>
-          <w:rFonts w:ascii="Century Schoolbook" w:hAnsi="Century Schoolbook" w:eastAsia="Century Schoolbook" w:cs="Century Schoolbook"/>
-          <w:b w:val="0"/>
-          <w:i w:val="0"/>
-          <w:color w:val="000000"/>
-          <w:sz w:val="36"/>
-          <w:fitText w:val="5067" w:id="2"/>
-        </w:rPr>
-        <w:t xml:space="preserve">Created for testing </w:t>
       </w:r>
       <w:r>
-        <w:rPr>
-          <w:rFonts w:ascii="Century Schoolbook" w:hAnsi="Century Schoolbook" w:eastAsia="Century Schoolbook" w:cs="Century Schoolbook"/>
-          <w:b w:val="0"/>
-          <w:i w:val="0"/>
-          <w:color w:val="5B9BD5"/>
-          <w:sz w:val="36"/>
-          <w:fitText w:val="5067" w:id="2"/>
-        </w:rPr>
-        <w:t>PDFObject</w:t>
+        <w:pict>
+          <v:shape id="DocuMindTextBox1" type="#_x0000_t202" stroked="f" filled="f" o:allowincell="f" style="position:absolute;margin-left:303.020pt;margin-top:742.036pt;width:10.794pt;height:15.652pt;z-index:251659264;mso-position-horizontal-relative:page;mso-position-vertical-relative:page;mso-wrap-style:none;">
+            <w10:wrap type="none"/>
+            <v:textbox inset="0,0,0,0">
+              <w:txbxContent>
+                <w:p>
+                  <w:pPr>
+                    <w:spacing w:before="0" w:after="0" w:lineRule="exact" w:line="293"/>
+                    <w:ind w:left="0" w:right="0" w:firstLine="0"/>
+                  </w:pPr>
+                  <w:r>
+                    <w:rPr>
+                      <w:rFonts w:ascii="Calibri" w:hAnsi="Calibri" w:eastAsia="Calibri" w:cs="Calibri"/>
+                      <w:b w:val="0"/>
+                      <w:i w:val="0"/>
+                      <w:color w:val="000000"/>
+                      <w:sz w:val="24"/>
+                    </w:rPr>
+                    <w:t xml:space="preserve">1 </w:t>
+                  </w:r>
+                </w:p>
+              </w:txbxContent>
+            </v:textbox>
+          </v:shape>
+        </w:pict>
       </w:r>
       <w:r>
-        <w:rPr>
-          <w:rFonts w:ascii="Century Schoolbook" w:hAnsi="Century Schoolbook" w:eastAsia="Century Schoolbook" w:cs="Century Schoolbook"/>
-          <w:b w:val="0"/>
-          <w:i w:val="0"/>
-          <w:color w:val="000000"/>
-          <w:sz w:val="36"/>
-          <w:fitText w:val="5067" w:id="2"/>
-        </w:rPr>
-        <w:t xml:space="preserve"> </w:t>
-      </w:r>
-    </w:p>
-    <w:p>
-      <w:pPr>
-        <w:spacing w:before="296" w:after="0" w:lineRule="exact" w:line="384"/>
-        <w:ind w:left="0" w:right="0" w:firstLine="0"/>
-        <w:jc w:val="left"/>
-      </w:pPr>
-      <w:r>
-        <w:rPr>
-          <w:rFonts w:ascii="Century Schoolbook" w:hAnsi="Century Schoolbook" w:eastAsia="Century Schoolbook" w:cs="Century Schoolbook"/>
-          <w:b w:val="0"/>
-          <w:i w:val="0"/>
-          <w:color w:val="000000"/>
-          <w:sz w:val="31"/>
-          <w:fitText w:val="10888" w:id="3"/>
-        </w:rPr>
-        <w:t xml:space="preserve">This PDF is three pages long. Three long pages. Or three short pages if </w:t>
+        <w:pict>
+          <v:shape id="DocuMindTextBox2" type="#_x0000_t202" stroked="f" filled="f" o:allowincell="f" style="position:absolute;margin-left:190.309pt;margin-top:48.604pt;width:243.994pt;height:44.272pt;z-index:251659264;mso-position-horizontal-relative:page;mso-position-vertical-relative:page;mso-wrap-style:none;">
+            <w10:wrap type="none"/>
+            <v:textbox inset="0,0,0,0">
+              <w:txbxContent>
+                <w:p>
+                  <w:pPr>
+                    <w:spacing w:before="0" w:after="0" w:lineRule="exact" w:line="865"/>
+                    <w:ind w:left="0" w:right="0" w:firstLine="0"/>
+                  </w:pPr>
+                  <w:r>
+                    <w:rPr>
+                      <w:rFonts w:ascii="Century Schoolbook" w:hAnsi="Century Schoolbook" w:eastAsia="Century Schoolbook" w:cs="Century Schoolbook"/>
+                      <w:b/>
+                      <w:i w:val="0"/>
+                      <w:color w:val="2E74B5"/>
+                      <w:sz w:val="72"/>
+                    </w:rPr>
+                    <w:t xml:space="preserve">Sample PDF </w:t>
+                  </w:r>
+                </w:p>
+              </w:txbxContent>
+            </v:textbox>
+          </v:shape>
+        </w:pict>
       </w:r>
       <w:r>
-        <w:br/>
+        <w:pict>
+          <v:shape id="DocuMindTextBox3" type="#_x0000_t202" stroked="f" filled="f" o:allowincell="f" style="position:absolute;margin-left:179.468pt;margin-top:106.192pt;width:164.002pt;height:22.636pt;z-index:251659264;mso-position-horizontal-relative:page;mso-position-vertical-relative:page;mso-wrap-style:none;">
+            <w10:wrap type="none"/>
+            <v:textbox inset="0,0,0,0">
+              <w:txbxContent>
+                <w:p>
+                  <w:pPr>
+                    <w:spacing w:before="0" w:after="0" w:lineRule="exact" w:line="433"/>
+                    <w:ind w:left="0" w:right="0" w:firstLine="0"/>
+                  </w:pPr>
+                  <w:r>
+                    <w:rPr>
+                      <w:rFonts w:ascii="Century Schoolbook" w:hAnsi="Century Schoolbook" w:eastAsia="Century Schoolbook" w:cs="Century Schoolbook"/>
+                      <w:b w:val="0"/>
+                      <w:i w:val="0"/>
+                      <w:color w:val="000000"/>
+                      <w:sz w:val="36"/>
+                    </w:rPr>
+                    <w:t xml:space="preserve">Created for testing </w:t>
+                  </w:r>
+                </w:p>
+              </w:txbxContent>
+            </v:textbox>
+          </v:shape>
+        </w:pict>
       </w:r>
       <w:r>
-        <w:rPr>
-          <w:rFonts w:ascii="Century Schoolbook" w:hAnsi="Century Schoolbook" w:eastAsia="Century Schoolbook" w:cs="Century Schoolbook"/>
-          <w:b w:val="0"/>
-          <w:i w:val="0"/>
-          <w:color w:val="000000"/>
-          <w:sz w:val="31"/>
-          <w:fitText w:val="10888" w:id="4"/>
-        </w:rPr>
-        <w:t xml:space="preserve">you’re optimistic. Is it the same as saying “three long minutes”, knowing </w:t>
+        <w:pict>
+          <v:shape id="DocuMindTextBox4" type="#_x0000_t202" stroked="f" filled="f" o:allowincell="f" style="position:absolute;margin-left:341.468pt;margin-top:106.192pt;width:93.341pt;height:22.636pt;z-index:251659264;mso-position-horizontal-relative:page;mso-position-vertical-relative:page;mso-wrap-style:none;">
+            <w10:wrap type="none"/>
+            <v:textbox inset="0,0,0,0">
+              <w:txbxContent>
+                <w:p>
+                  <w:pPr>
+                    <w:spacing w:before="0" w:after="0" w:lineRule="exact" w:line="433"/>
+                    <w:ind w:left="0" w:right="0" w:firstLine="0"/>
+                  </w:pPr>
+                  <w:r>
+                    <w:rPr>
+                      <w:rFonts w:ascii="Century Schoolbook" w:hAnsi="Century Schoolbook" w:eastAsia="Century Schoolbook" w:cs="Century Schoolbook"/>
+                      <w:b w:val="0"/>
+                      <w:i w:val="0"/>
+                      <w:color w:val="5B9BD5"/>
+                      <w:sz w:val="36"/>
+                    </w:rPr>
+                    <w:t>PDFObject</w:t>
+                  </w:r>
+                </w:p>
+              </w:txbxContent>
+            </v:textbox>
+          </v:shape>
+        </w:pict>
       </w:r>
       <w:r>
-        <w:br/>
+        <w:pict>
+          <v:shape id="DocuMindTextBox5" type="#_x0000_t202" stroked="f" filled="f" o:allowincell="f" style="position:absolute;margin-left:36.140pt;margin-top:142.642pt;width:546.399pt;height:20.040pt;z-index:251659264;mso-position-horizontal-relative:page;mso-position-vertical-relative:page;mso-wrap-style:none;">
+            <w10:wrap type="none"/>
+            <v:textbox inset="0,0,0,0">
+              <w:txbxContent>
+                <w:p>
+                  <w:pPr>
+                    <w:spacing w:before="0" w:after="0" w:lineRule="exact" w:line="381"/>
+                    <w:ind w:left="0" w:right="0" w:firstLine="0"/>
+                  </w:pPr>
+                  <w:r>
+                    <w:rPr>
+                      <w:rFonts w:ascii="Century Schoolbook" w:hAnsi="Century Schoolbook" w:eastAsia="Century Schoolbook" w:cs="Century Schoolbook"/>
+                      <w:b w:val="0"/>
+                      <w:i w:val="0"/>
+                      <w:color w:val="000000"/>
+                      <w:sz w:val="31"/>
+                    </w:rPr>
+                    <w:t xml:space="preserve">This PDF is three pages long. Three long pages. Or three short pages if </w:t>
+                  </w:r>
+                </w:p>
+              </w:txbxContent>
+            </v:textbox>
+          </v:shape>
+        </w:pict>
       </w:r>
       <w:r>
-        <w:rPr>
-          <w:rFonts w:ascii="Century Schoolbook" w:hAnsi="Century Schoolbook" w:eastAsia="Century Schoolbook" w:cs="Century Schoolbook"/>
-          <w:b w:val="0"/>
-          <w:i w:val="0"/>
-          <w:color w:val="000000"/>
-          <w:sz w:val="31"/>
-          <w:fitText w:val="10888" w:id="5"/>
-        </w:rPr>
-        <w:t xml:space="preserve">that all minutes are the same duration, and one cannot possibly be longer </w:t>
+        <w:pict>
+          <v:shape id="DocuMindTextBox6" type="#_x0000_t202" stroked="f" filled="f" o:allowincell="f" style="position:absolute;margin-left:36.140pt;margin-top:161.842pt;width:546.410pt;height:20.040pt;z-index:251659264;mso-position-horizontal-relative:page;mso-position-vertical-relative:page;mso-wrap-style:none;">
+            <w10:wrap type="none"/>
+            <v:textbox inset="0,0,0,0">
+              <w:txbxContent>
+                <w:p>
+                  <w:pPr>
+                    <w:spacing w:before="0" w:after="0" w:lineRule="exact" w:line="381"/>
+                    <w:ind w:left="0" w:right="0" w:firstLine="0"/>
+                  </w:pPr>
+                  <w:r>
+                    <w:rPr>
+                      <w:rFonts w:ascii="Century Schoolbook" w:hAnsi="Century Schoolbook" w:eastAsia="Century Schoolbook" w:cs="Century Schoolbook"/>
+                      <w:b w:val="0"/>
+                      <w:i w:val="0"/>
+                      <w:color w:val="000000"/>
+                      <w:sz w:val="31"/>
+                    </w:rPr>
+                    <w:t xml:space="preserve">you’re optimistic. Is it the same as saying “three long minutes”, knowing </w:t>
+                  </w:r>
+                </w:p>
+              </w:txbxContent>
+            </v:textbox>
+          </v:shape>
+        </w:pict>
       </w:r>
       <w:r>
-        <w:br/>
+        <w:pict>
+          <v:shape id="DocuMindTextBox7" type="#_x0000_t202" stroked="f" filled="f" o:allowincell="f" style="position:absolute;margin-left:36.140pt;margin-top:181.042pt;width:546.410pt;height:20.040pt;z-index:251659264;mso-position-horizontal-relative:page;mso-position-vertical-relative:page;mso-wrap-style:none;">
+            <w10:wrap type="none"/>
+            <v:textbox inset="0,0,0,0">
+              <w:txbxContent>
+                <w:p>
+                  <w:pPr>
+                    <w:spacing w:before="0" w:after="0" w:lineRule="exact" w:line="381"/>
+                    <w:ind w:left="0" w:right="0" w:firstLine="0"/>
+                  </w:pPr>
+                  <w:r>
+                    <w:rPr>
+                      <w:rFonts w:ascii="Century Schoolbook" w:hAnsi="Century Schoolbook" w:eastAsia="Century Schoolbook" w:cs="Century Schoolbook"/>
+                      <w:b w:val="0"/>
+                      <w:i w:val="0"/>
+                      <w:color w:val="000000"/>
+                      <w:sz w:val="31"/>
+                    </w:rPr>
+                    <w:t xml:space="preserve">that all minutes are the same duration, and one cannot possibly be longer </w:t>
+                  </w:r>
+                </w:p>
+              </w:txbxContent>
+            </v:textbox>
+          </v:shape>
+        </w:pict>
       </w:r>
       <w:r>
-        <w:rPr>
-          <w:rFonts w:ascii="Century Schoolbook" w:hAnsi="Century Schoolbook" w:eastAsia="Century Schoolbook" w:cs="Century Schoolbook"/>
-          <w:b w:val="0"/>
-          <w:i w:val="0"/>
-          <w:color w:val="000000"/>
-          <w:sz w:val="31"/>
-          <w:fitText w:val="10891" w:id="6"/>
-        </w:rPr>
-        <w:t xml:space="preserve">than the other? If these pages are all the same size, can one possibly be </w:t>
+        <w:pict>
+          <v:shape id="DocuMindTextBox8" type="#_x0000_t202" stroked="f" filled="f" o:allowincell="f" style="position:absolute;margin-left:36.140pt;margin-top:200.242pt;width:546.529pt;height:20.040pt;z-index:251659264;mso-position-horizontal-relative:page;mso-position-vertical-relative:page;mso-wrap-style:none;">
+            <w10:wrap type="none"/>
+            <v:textbox inset="0,0,0,0">
+              <w:txbxContent>
+                <w:p>
+                  <w:pPr>
+                    <w:spacing w:before="0" w:after="0" w:lineRule="exact" w:line="381"/>
+                    <w:ind w:left="0" w:right="0" w:firstLine="0"/>
+                  </w:pPr>
+                  <w:r>
+                    <w:rPr>
+                      <w:rFonts w:ascii="Century Schoolbook" w:hAnsi="Century Schoolbook" w:eastAsia="Century Schoolbook" w:cs="Century Schoolbook"/>
+                      <w:b w:val="0"/>
+                      <w:i w:val="0"/>
+                      <w:color w:val="000000"/>
+                      <w:sz w:val="31"/>
+                    </w:rPr>
+                    <w:t xml:space="preserve">than the other? If these pages are all the same size, can one possibly be </w:t>
+                  </w:r>
+                </w:p>
+              </w:txbxContent>
+            </v:textbox>
+          </v:shape>
+        </w:pict>
       </w:r>
       <w:r>
-        <w:br/>
+        <w:pict>
+          <v:shape id="DocuMindTextBox9" type="#_x0000_t202" stroked="f" filled="f" o:allowincell="f" style="position:absolute;margin-left:36.140pt;margin-top:219.442pt;width:171.122pt;height:20.040pt;z-index:251659264;mso-position-horizontal-relative:page;mso-position-vertical-relative:page;mso-wrap-style:none;">
+            <w10:wrap type="none"/>
+            <v:textbox inset="0,0,0,0">
+              <w:txbxContent>
+                <w:p>
+                  <w:pPr>
+                    <w:spacing w:before="0" w:after="0" w:lineRule="exact" w:line="381"/>
+                    <w:ind w:left="0" w:right="0" w:firstLine="0"/>
+                  </w:pPr>
+                  <w:r>
+                    <w:rPr>
+                      <w:rFonts w:ascii="Century Schoolbook" w:hAnsi="Century Schoolbook" w:eastAsia="Century Schoolbook" w:cs="Century Schoolbook"/>
+                      <w:b w:val="0"/>
+                      <w:i w:val="0"/>
+                      <w:color w:val="000000"/>
+                      <w:sz w:val="31"/>
+                    </w:rPr>
+                    <w:t xml:space="preserve">longer than the other? </w:t>
+                  </w:r>
+                </w:p>
+              </w:txbxContent>
+            </v:textbox>
+          </v:shape>
+        </w:pict>
       </w:r>
       <w:r>
-        <w:rPr>
-          <w:rFonts w:ascii="Century Schoolbook" w:hAnsi="Century Schoolbook" w:eastAsia="Century Schoolbook" w:cs="Century Schoolbook"/>
-          <w:b w:val="0"/>
-          <w:i w:val="0"/>
-          <w:color w:val="000000"/>
-          <w:sz w:val="31"/>
-          <w:fitText w:val="3382" w:id="7"/>
-        </w:rPr>
-        <w:t xml:space="preserve">longer than the other? </w:t>
-      </w:r>
-    </w:p>
-    <w:p>
-      <w:pPr>
-        <w:spacing w:before="290" w:after="0" w:lineRule="exact" w:line="288"/>
-        <w:ind w:left="0" w:right="24" w:firstLine="0"/>
-        <w:jc w:val="left"/>
-      </w:pPr>
-      <w:r>
-        <w:rPr>
-          <w:rFonts w:ascii="Century Schoolbook" w:hAnsi="Century Schoolbook" w:eastAsia="Century Schoolbook" w:cs="Century Schoolbook"/>
-          <w:b w:val="0"/>
-          <w:i w:val="0"/>
-          <w:color w:val="000000"/>
-          <w:sz w:val="24"/>
-          <w:fitText w:val="10867" w:id="8"/>
-        </w:rPr>
-        <w:t xml:space="preserve">I digress. Here’s some Latin. Lorem ipsum dolor sit amet, consectetur adipiscing elit. Integer nec </w:t>
+        <w:pict>
+          <v:shape id="DocuMindTextBox10" type="#_x0000_t202" stroked="f" filled="f" o:allowincell="f" style="position:absolute;margin-left:36.140pt;margin-top:252.988pt;width:545.325pt;height:15.424pt;z-index:251659264;mso-position-horizontal-relative:page;mso-position-vertical-relative:page;mso-wrap-style:none;">
+            <w10:wrap type="none"/>
+            <v:textbox inset="0,0,0,0">
+              <w:txbxContent>
+                <w:p>
+                  <w:pPr>
+                    <w:spacing w:before="0" w:after="0" w:lineRule="exact" w:line="288"/>
+                    <w:ind w:left="0" w:right="0" w:firstLine="0"/>
+                  </w:pPr>
+                  <w:r>
+                    <w:rPr>
+                      <w:rFonts w:ascii="Century Schoolbook" w:hAnsi="Century Schoolbook" w:eastAsia="Century Schoolbook" w:cs="Century Schoolbook"/>
+                      <w:b w:val="0"/>
+                      <w:i w:val="0"/>
+                      <w:color w:val="000000"/>
+                      <w:sz w:val="24"/>
+                    </w:rPr>
+                    <w:t xml:space="preserve">I digress. Here’s some Latin. Lorem ipsum dolor sit amet, consectetur adipiscing elit. Integer nec </w:t>
+                  </w:r>
+                </w:p>
+              </w:txbxContent>
+            </v:textbox>
+          </v:shape>
+        </w:pict>
       </w:r>
       <w:r>
-        <w:br/>
+        <w:pict>
+          <v:shape id="DocuMindTextBox11" type="#_x0000_t202" stroked="f" filled="f" o:allowincell="f" style="position:absolute;margin-left:36.140pt;margin-top:267.388pt;width:545.337pt;height:15.424pt;z-index:251659264;mso-position-horizontal-relative:page;mso-position-vertical-relative:page;mso-wrap-style:none;">
+            <w10:wrap type="none"/>
+            <v:textbox inset="0,0,0,0">
+              <w:txbxContent>
+                <w:p>
+                  <w:pPr>
+                    <w:spacing w:before="0" w:after="0" w:lineRule="exact" w:line="288"/>
+                    <w:ind w:left="0" w:right="0" w:firstLine="0"/>
+                  </w:pPr>
+                  <w:r>
+                    <w:rPr>
+                      <w:rFonts w:ascii="Century Schoolbook" w:hAnsi="Century Schoolbook" w:eastAsia="Century Schoolbook" w:cs="Century Schoolbook"/>
+                      <w:b w:val="0"/>
+                      <w:i w:val="0"/>
+                      <w:color w:val="000000"/>
+                      <w:sz w:val="24"/>
+                    </w:rPr>
+                    <w:t xml:space="preserve">odio. Praesent libero. Sed cursus ante dapibus diam. Sed nisi. Nulla quis sem at nibh elementum </w:t>
+                  </w:r>
+                </w:p>
+              </w:txbxContent>
+            </v:textbox>
+          </v:shape>
+        </w:pict>
       </w:r>
       <w:r>
-        <w:rPr>
-          <w:rFonts w:ascii="Century Schoolbook" w:hAnsi="Century Schoolbook" w:eastAsia="Century Schoolbook" w:cs="Century Schoolbook"/>
-          <w:b w:val="0"/>
-          <w:i w:val="0"/>
-          <w:color w:val="000000"/>
-          <w:sz w:val="24"/>
-          <w:fitText w:val="10867" w:id="9"/>
-        </w:rPr>
-        <w:t xml:space="preserve">odio. Praesent libero. Sed cursus ante dapibus diam. Sed nisi. Nulla quis sem at nibh elementum </w:t>
+        <w:pict>
+          <v:shape id="DocuMindTextBox12" type="#_x0000_t202" stroked="f" filled="f" o:allowincell="f" style="position:absolute;margin-left:36.140pt;margin-top:281.788pt;width:545.352pt;height:15.424pt;z-index:251659264;mso-position-horizontal-relative:page;mso-position-vertical-relative:page;mso-wrap-style:none;">
+            <w10:wrap type="none"/>
+            <v:textbox inset="0,0,0,0">
+              <w:txbxContent>
+                <w:p>
+                  <w:pPr>
+                    <w:spacing w:before="0" w:after="0" w:lineRule="exact" w:line="288"/>
+                    <w:ind w:left="0" w:right="0" w:firstLine="0"/>
+                  </w:pPr>
+                  <w:r>
+                    <w:rPr>
+                      <w:rFonts w:ascii="Century Schoolbook" w:hAnsi="Century Schoolbook" w:eastAsia="Century Schoolbook" w:cs="Century Schoolbook"/>
+                      <w:b w:val="0"/>
+                      <w:i w:val="0"/>
+                      <w:color w:val="000000"/>
+                      <w:sz w:val="24"/>
+                    </w:rPr>
+                    <w:t xml:space="preserve">imperdiet. Duis sagittis ipsum. Praesent mauris. Fusce nec tellus sed augue semper porta. Mauris </w:t>
+                  </w:r>
+                </w:p>
+              </w:txbxContent>
+            </v:textbox>
+          </v:shape>
+        </w:pict>
       </w:r>
       <w:r>
-        <w:br/>
+        <w:pict>
+          <v:shape id="DocuMindTextBox13" type="#_x0000_t202" stroked="f" filled="f" o:allowincell="f" style="position:absolute;margin-left:36.140pt;margin-top:296.188pt;width:545.333pt;height:15.424pt;z-index:251659264;mso-position-horizontal-relative:page;mso-position-vertical-relative:page;mso-wrap-style:none;">
+            <w10:wrap type="none"/>
+            <v:textbox inset="0,0,0,0">
+              <w:txbxContent>
+                <w:p>
+                  <w:pPr>
+                    <w:spacing w:before="0" w:after="0" w:lineRule="exact" w:line="288"/>
+                    <w:ind w:left="0" w:right="0" w:firstLine="0"/>
+                  </w:pPr>
+                  <w:r>
+                    <w:rPr>
+                      <w:rFonts w:ascii="Century Schoolbook" w:hAnsi="Century Schoolbook" w:eastAsia="Century Schoolbook" w:cs="Century Schoolbook"/>
+                      <w:b w:val="0"/>
+                      <w:i w:val="0"/>
+                      <w:color w:val="000000"/>
+                      <w:sz w:val="24"/>
+                    </w:rPr>
+                    <w:t xml:space="preserve">massa. Vestibulum lacinia arcu eget nulla. Class aptent taciti sociosqu ad litora torquent per </w:t>
+                  </w:r>
+                </w:p>
+              </w:txbxContent>
+            </v:textbox>
+          </v:shape>
+        </w:pict>
       </w:r>
       <w:r>
-        <w:rPr>
-          <w:rFonts w:ascii="Century Schoolbook" w:hAnsi="Century Schoolbook" w:eastAsia="Century Schoolbook" w:cs="Century Schoolbook"/>
-          <w:b w:val="0"/>
-          <w:i w:val="0"/>
-          <w:color w:val="000000"/>
-          <w:sz w:val="24"/>
-          <w:fitText w:val="10867" w:id="10"/>
-        </w:rPr>
-        <w:t xml:space="preserve">imperdiet. Duis sagittis ipsum. Praesent mauris. Fusce nec tellus sed augue semper porta. Mauris </w:t>
+        <w:pict>
+          <v:shape id="DocuMindTextBox14" type="#_x0000_t202" stroked="f" filled="f" o:allowincell="f" style="position:absolute;margin-left:36.140pt;margin-top:310.588pt;width:421.135pt;height:15.424pt;z-index:251659264;mso-position-horizontal-relative:page;mso-position-vertical-relative:page;mso-wrap-style:none;">
+            <w10:wrap type="none"/>
+            <v:textbox inset="0,0,0,0">
+              <w:txbxContent>
+                <w:p>
+                  <w:pPr>
+                    <w:spacing w:before="0" w:after="0" w:lineRule="exact" w:line="288"/>
+                    <w:ind w:left="0" w:right="0" w:firstLine="0"/>
+                  </w:pPr>
+                  <w:r>
+                    <w:rPr>
+                      <w:rFonts w:ascii="Century Schoolbook" w:hAnsi="Century Schoolbook" w:eastAsia="Century Schoolbook" w:cs="Century Schoolbook"/>
+                      <w:b w:val="0"/>
+                      <w:i w:val="0"/>
+                      <w:color w:val="000000"/>
+                      <w:sz w:val="24"/>
+                    </w:rPr>
+                    <w:t xml:space="preserve">conubia nostra, per inceptos himenaeos. Curabitur sodales ligula in libero.  </w:t>
+                  </w:r>
+                </w:p>
+              </w:txbxContent>
+            </v:textbox>
+          </v:shape>
+        </w:pict>
       </w:r>
       <w:r>
-        <w:br/>
+        <w:pict>
+          <v:shape id="DocuMindTextBox15" type="#_x0000_t202" stroked="f" filled="f" o:allowincell="f" style="position:absolute;margin-left:36.140pt;margin-top:339.388pt;width:545.329pt;height:15.424pt;z-index:251659264;mso-position-horizontal-relative:page;mso-position-vertical-relative:page;mso-wrap-style:none;">
+            <w10:wrap type="none"/>
+            <v:textbox inset="0,0,0,0">
+              <w:txbxContent>
+                <w:p>
+                  <w:pPr>
+                    <w:spacing w:before="0" w:after="0" w:lineRule="exact" w:line="288"/>
+                    <w:ind w:left="0" w:right="0" w:firstLine="0"/>
+                  </w:pPr>
+                  <w:r>
+                    <w:rPr>
+                      <w:rFonts w:ascii="Century Schoolbook" w:hAnsi="Century Schoolbook" w:eastAsia="Century Schoolbook" w:cs="Century Schoolbook"/>
+                      <w:b w:val="0"/>
+                      <w:i w:val="0"/>
+                      <w:color w:val="000000"/>
+                      <w:sz w:val="24"/>
+                    </w:rPr>
+                    <w:t xml:space="preserve">Sed dignissim lacinia nunc. Curabitur tortor. Pellentesque nibh. Aenean quam. In scelerisque sem </w:t>
+                  </w:r>
+                </w:p>
+              </w:txbxContent>
+            </v:textbox>
+          </v:shape>
+        </w:pict>
       </w:r>
       <w:r>
-        <w:rPr>
-          <w:rFonts w:ascii="Century Schoolbook" w:hAnsi="Century Schoolbook" w:eastAsia="Century Schoolbook" w:cs="Century Schoolbook"/>
-          <w:b w:val="0"/>
-          <w:i w:val="0"/>
-          <w:color w:val="000000"/>
-          <w:sz w:val="24"/>
-          <w:fitText w:val="10867" w:id="11"/>
-        </w:rPr>
-        <w:t xml:space="preserve">massa. Vestibulum lacinia arcu eget nulla. Class aptent taciti sociosqu ad litora torquent per </w:t>
+        <w:pict>
+          <v:shape id="DocuMindTextBox16" type="#_x0000_t202" stroked="f" filled="f" o:allowincell="f" style="position:absolute;margin-left:36.140pt;margin-top:353.788pt;width:545.330pt;height:15.424pt;z-index:251659264;mso-position-horizontal-relative:page;mso-position-vertical-relative:page;mso-wrap-style:none;">
+            <w10:wrap type="none"/>
+            <v:textbox inset="0,0,0,0">
+              <w:txbxContent>
+                <w:p>
+                  <w:pPr>
+                    <w:spacing w:before="0" w:after="0" w:lineRule="exact" w:line="288"/>
+                    <w:ind w:left="0" w:right="0" w:firstLine="0"/>
+                  </w:pPr>
+                  <w:r>
+                    <w:rPr>
+                      <w:rFonts w:ascii="Century Schoolbook" w:hAnsi="Century Schoolbook" w:eastAsia="Century Schoolbook" w:cs="Century Schoolbook"/>
+                      <w:b w:val="0"/>
+                      <w:i w:val="0"/>
+                      <w:color w:val="000000"/>
+                      <w:sz w:val="24"/>
+                    </w:rPr>
+                    <w:t xml:space="preserve">at dolor. Maecenas mattis. Sed convallis tristique sem. Proin ut ligula vel nunc egestas porttitor. </w:t>
+                  </w:r>
+                </w:p>
+              </w:txbxContent>
+            </v:textbox>
+          </v:shape>
+        </w:pict>
       </w:r>
       <w:r>
-        <w:br/>
+        <w:pict>
+          <v:shape id="DocuMindTextBox17" type="#_x0000_t202" stroked="f" filled="f" o:allowincell="f" style="position:absolute;margin-left:36.140pt;margin-top:368.188pt;width:545.330pt;height:15.424pt;z-index:251659264;mso-position-horizontal-relative:page;mso-position-vertical-relative:page;mso-wrap-style:none;">
+            <w10:wrap type="none"/>
+            <v:textbox inset="0,0,0,0">
+              <w:txbxContent>
+                <w:p>
+                  <w:pPr>
+                    <w:spacing w:before="0" w:after="0" w:lineRule="exact" w:line="288"/>
+                    <w:ind w:left="0" w:right="0" w:firstLine="0"/>
+                  </w:pPr>
+                  <w:r>
+                    <w:rPr>
+                      <w:rFonts w:ascii="Century Schoolbook" w:hAnsi="Century Schoolbook" w:eastAsia="Century Schoolbook" w:cs="Century Schoolbook"/>
+                      <w:b w:val="0"/>
+                      <w:i w:val="0"/>
+                      <w:color w:val="000000"/>
+                      <w:sz w:val="24"/>
+                    </w:rPr>
+                    <w:t xml:space="preserve">Morbi lectus risus, iaculis vel, suscipit quis, luctus non, massa. Fusce ac turpis quis ligula lacinia </w:t>
+                  </w:r>
+                </w:p>
+              </w:txbxContent>
+            </v:textbox>
+          </v:shape>
+        </w:pict>
       </w:r>
       <w:r>
-        <w:rPr>
-          <w:rFonts w:ascii="Century Schoolbook" w:hAnsi="Century Schoolbook" w:eastAsia="Century Schoolbook" w:cs="Century Schoolbook"/>
-          <w:b w:val="0"/>
-          <w:i w:val="0"/>
-          <w:color w:val="000000"/>
-          <w:sz w:val="24"/>
-          <w:fitText w:val="8383" w:id="12"/>
-        </w:rPr>
-        <w:t xml:space="preserve">conubia nostra, per inceptos himenaeos. Curabitur sodales ligula in libero.  </w:t>
-      </w:r>
-    </w:p>
-    <w:p>
-      <w:pPr>
-        <w:spacing w:before="288" w:after="0" w:lineRule="exact" w:line="288"/>
-        <w:ind w:left="0" w:right="24" w:firstLine="0"/>
-        <w:jc w:val="left"/>
-      </w:pPr>
-      <w:r>
-        <w:rPr>
-          <w:rFonts w:ascii="Century Schoolbook" w:hAnsi="Century Schoolbook" w:eastAsia="Century Schoolbook" w:cs="Century Schoolbook"/>
-          <w:b w:val="0"/>
-          <w:i w:val="0"/>
-          <w:color w:val="000000"/>
-          <w:sz w:val="24"/>
-          <w:fitText w:val="10867" w:id="13"/>
-        </w:rPr>
-        <w:t xml:space="preserve">Sed dignissim lacinia nunc. Curabitur tortor. Pellentesque nibh. Aenean quam. In scelerisque sem </w:t>
+        <w:pict>
+          <v:shape id="DocuMindTextBox18" type="#_x0000_t202" stroked="f" filled="f" o:allowincell="f" style="position:absolute;margin-left:36.140pt;margin-top:382.588pt;width:520.252pt;height:15.424pt;z-index:251659264;mso-position-horizontal-relative:page;mso-position-vertical-relative:page;mso-wrap-style:none;">
+            <w10:wrap type="none"/>
+            <v:textbox inset="0,0,0,0">
+              <w:txbxContent>
+                <w:p>
+                  <w:pPr>
+                    <w:spacing w:before="0" w:after="0" w:lineRule="exact" w:line="288"/>
+                    <w:ind w:left="0" w:right="0" w:firstLine="0"/>
+                  </w:pPr>
+                  <w:r>
+                    <w:rPr>
+                      <w:rFonts w:ascii="Century Schoolbook" w:hAnsi="Century Schoolbook" w:eastAsia="Century Schoolbook" w:cs="Century Schoolbook"/>
+                      <w:b w:val="0"/>
+                      <w:i w:val="0"/>
+                      <w:color w:val="000000"/>
+                      <w:sz w:val="24"/>
+                    </w:rPr>
+                    <w:t xml:space="preserve">aliquet. Mauris ipsum. Nulla metus metus, ullamcorper vel, tincidunt sed, euismod in, nibh.  </w:t>
+                  </w:r>
+                </w:p>
+              </w:txbxContent>
+            </v:textbox>
+          </v:shape>
+        </w:pict>
       </w:r>
       <w:r>
-        <w:br/>
+        <w:pict>
+          <v:shape id="DocuMindTextBox19" type="#_x0000_t202" stroked="f" filled="f" o:allowincell="f" style="position:absolute;margin-left:36.140pt;margin-top:411.628pt;width:545.330pt;height:15.424pt;z-index:251659264;mso-position-horizontal-relative:page;mso-position-vertical-relative:page;mso-wrap-style:none;">
+            <w10:wrap type="none"/>
+            <v:textbox inset="0,0,0,0">
+              <w:txbxContent>
+                <w:p>
+                  <w:pPr>
+                    <w:spacing w:before="0" w:after="0" w:lineRule="exact" w:line="288"/>
+                    <w:ind w:left="0" w:right="0" w:firstLine="0"/>
+                  </w:pPr>
+                  <w:r>
+                    <w:rPr>
+                      <w:rFonts w:ascii="Century Schoolbook" w:hAnsi="Century Schoolbook" w:eastAsia="Century Schoolbook" w:cs="Century Schoolbook"/>
+                      <w:b w:val="0"/>
+                      <w:i w:val="0"/>
+                      <w:color w:val="000000"/>
+                      <w:sz w:val="24"/>
+                    </w:rPr>
+                    <w:t xml:space="preserve">Quisque volutpat condimentum velit. Class aptent taciti sociosqu ad litora torquent per conubia </w:t>
+                  </w:r>
+                </w:p>
+              </w:txbxContent>
+            </v:textbox>
+          </v:shape>
+        </w:pict>
       </w:r>
       <w:r>
-        <w:rPr>
-          <w:rFonts w:ascii="Century Schoolbook" w:hAnsi="Century Schoolbook" w:eastAsia="Century Schoolbook" w:cs="Century Schoolbook"/>
-          <w:b w:val="0"/>
-          <w:i w:val="0"/>
-          <w:color w:val="000000"/>
-          <w:sz w:val="24"/>
-          <w:fitText w:val="10867" w:id="14"/>
-        </w:rPr>
-        <w:t xml:space="preserve">at dolor. Maecenas mattis. Sed convallis tristique sem. Proin ut ligula vel nunc egestas porttitor. </w:t>
+        <w:pict>
+          <v:shape id="DocuMindTextBox20" type="#_x0000_t202" stroked="f" filled="f" o:allowincell="f" style="position:absolute;margin-left:36.140pt;margin-top:426.028pt;width:545.331pt;height:15.424pt;z-index:251659264;mso-position-horizontal-relative:page;mso-position-vertical-relative:page;mso-wrap-style:none;">
+            <w10:wrap type="none"/>
+            <v:textbox inset="0,0,0,0">
+              <w:txbxContent>
+                <w:p>
+                  <w:pPr>
+                    <w:spacing w:before="0" w:after="0" w:lineRule="exact" w:line="288"/>
+                    <w:ind w:left="0" w:right="0" w:firstLine="0"/>
+                  </w:pPr>
+                  <w:r>
+                    <w:rPr>
+                      <w:rFonts w:ascii="Century Schoolbook" w:hAnsi="Century Schoolbook" w:eastAsia="Century Schoolbook" w:cs="Century Schoolbook"/>
+                      <w:b w:val="0"/>
+                      <w:i w:val="0"/>
+                      <w:color w:val="000000"/>
+                      <w:sz w:val="24"/>
+                    </w:rPr>
+                    <w:t xml:space="preserve">nostra, per inceptos himenaeos. Nam nec ante. Sed lacinia, urna non tincidunt mattis, tortor neque </w:t>
+                  </w:r>
+                </w:p>
+              </w:txbxContent>
+            </v:textbox>
+          </v:shape>
+        </w:pict>
       </w:r>
       <w:r>
-        <w:br/>
+        <w:pict>
+          <v:shape id="DocuMindTextBox21" type="#_x0000_t202" stroked="f" filled="f" o:allowincell="f" style="position:absolute;margin-left:36.140pt;margin-top:440.428pt;width:545.318pt;height:15.424pt;z-index:251659264;mso-position-horizontal-relative:page;mso-position-vertical-relative:page;mso-wrap-style:none;">
+            <w10:wrap type="none"/>
+            <v:textbox inset="0,0,0,0">
+              <w:txbxContent>
+                <w:p>
+                  <w:pPr>
+                    <w:spacing w:before="0" w:after="0" w:lineRule="exact" w:line="288"/>
+                    <w:ind w:left="0" w:right="0" w:firstLine="0"/>
+                  </w:pPr>
+                  <w:r>
+                    <w:rPr>
+                      <w:rFonts w:ascii="Century Schoolbook" w:hAnsi="Century Schoolbook" w:eastAsia="Century Schoolbook" w:cs="Century Schoolbook"/>
+                      <w:b w:val="0"/>
+                      <w:i w:val="0"/>
+                      <w:color w:val="000000"/>
+                      <w:sz w:val="24"/>
+                    </w:rPr>
+                    <w:t xml:space="preserve">adipiscing diam, a cursus ipsum ante quis turpis. Nulla facilisi. Ut fringilla. Suspendisse potenti. </w:t>
+                  </w:r>
+                </w:p>
+              </w:txbxContent>
+            </v:textbox>
+          </v:shape>
+        </w:pict>
       </w:r>
       <w:r>
-        <w:rPr>
-          <w:rFonts w:ascii="Century Schoolbook" w:hAnsi="Century Schoolbook" w:eastAsia="Century Schoolbook" w:cs="Century Schoolbook"/>
-          <w:b w:val="0"/>
-          <w:i w:val="0"/>
-          <w:color w:val="000000"/>
-          <w:sz w:val="24"/>
-          <w:fitText w:val="10867" w:id="15"/>
-        </w:rPr>
-        <w:t xml:space="preserve">Morbi lectus risus, iaculis vel, suscipit quis, luctus non, massa. Fusce ac turpis quis ligula lacinia </w:t>
+        <w:pict>
+          <v:shape id="DocuMindTextBox22" type="#_x0000_t202" stroked="f" filled="f" o:allowincell="f" style="position:absolute;margin-left:36.140pt;margin-top:454.828pt;width:531.168pt;height:15.424pt;z-index:251659264;mso-position-horizontal-relative:page;mso-position-vertical-relative:page;mso-wrap-style:none;">
+            <w10:wrap type="none"/>
+            <v:textbox inset="0,0,0,0">
+              <w:txbxContent>
+                <w:p>
+                  <w:pPr>
+                    <w:spacing w:before="0" w:after="0" w:lineRule="exact" w:line="288"/>
+                    <w:ind w:left="0" w:right="0" w:firstLine="0"/>
+                  </w:pPr>
+                  <w:r>
+                    <w:rPr>
+                      <w:rFonts w:ascii="Century Schoolbook" w:hAnsi="Century Schoolbook" w:eastAsia="Century Schoolbook" w:cs="Century Schoolbook"/>
+                      <w:b w:val="0"/>
+                      <w:i w:val="0"/>
+                      <w:color w:val="000000"/>
+                      <w:sz w:val="24"/>
+                    </w:rPr>
+                    <w:t xml:space="preserve">Nunc feugiat mi a tellus consequat imperdiet. Vestibulum sapien. Proin quam. Etiam ultrices.  </w:t>
+                  </w:r>
+                </w:p>
+              </w:txbxContent>
+            </v:textbox>
+          </v:shape>
+        </w:pict>
       </w:r>
       <w:r>
-        <w:br/>
+        <w:pict>
+          <v:shape id="DocuMindTextBox23" type="#_x0000_t202" stroked="f" filled="f" o:allowincell="f" style="position:absolute;margin-left:36.140pt;margin-top:483.628pt;width:545.320pt;height:15.424pt;z-index:251659264;mso-position-horizontal-relative:page;mso-position-vertical-relative:page;mso-wrap-style:none;">
+            <w10:wrap type="none"/>
+            <v:textbox inset="0,0,0,0">
+              <w:txbxContent>
+                <w:p>
+                  <w:pPr>
+                    <w:spacing w:before="0" w:after="0" w:lineRule="exact" w:line="288"/>
+                    <w:ind w:left="0" w:right="0" w:firstLine="0"/>
+                  </w:pPr>
+                  <w:r>
+                    <w:rPr>
+                      <w:rFonts w:ascii="Century Schoolbook" w:hAnsi="Century Schoolbook" w:eastAsia="Century Schoolbook" w:cs="Century Schoolbook"/>
+                      <w:b w:val="0"/>
+                      <w:i w:val="0"/>
+                      <w:color w:val="000000"/>
+                      <w:sz w:val="24"/>
+                    </w:rPr>
+                    <w:t xml:space="preserve">Suspendisse in justo eu magna luctus suscipit. Sed lectus. Integer euismod lacus luctus magna. </w:t>
+                  </w:r>
+                </w:p>
+              </w:txbxContent>
+            </v:textbox>
+          </v:shape>
+        </w:pict>
       </w:r>
       <w:r>
-        <w:rPr>
-          <w:rFonts w:ascii="Century Schoolbook" w:hAnsi="Century Schoolbook" w:eastAsia="Century Schoolbook" w:cs="Century Schoolbook"/>
-          <w:b w:val="0"/>
-          <w:i w:val="0"/>
-          <w:color w:val="000000"/>
-          <w:sz w:val="24"/>
-          <w:fitText w:val="10365" w:id="16"/>
-        </w:rPr>
-        <w:t xml:space="preserve">aliquet. Mauris ipsum. Nulla metus metus, ullamcorper vel, tincidunt sed, euismod in, nibh.  </w:t>
-      </w:r>
-    </w:p>
-    <w:p>
-      <w:pPr>
-        <w:spacing w:before="292" w:after="0" w:lineRule="exact" w:line="288"/>
-        <w:ind w:left="0" w:right="24" w:firstLine="0"/>
-        <w:jc w:val="left"/>
-      </w:pPr>
-      <w:r>
-        <w:rPr>
-          <w:rFonts w:ascii="Century Schoolbook" w:hAnsi="Century Schoolbook" w:eastAsia="Century Schoolbook" w:cs="Century Schoolbook"/>
-          <w:b w:val="0"/>
-          <w:i w:val="0"/>
-          <w:color w:val="000000"/>
-          <w:sz w:val="24"/>
-          <w:fitText w:val="10867" w:id="17"/>
-        </w:rPr>
-        <w:t xml:space="preserve">Quisque volutpat condimentum velit. Class aptent taciti sociosqu ad litora torquent per conubia </w:t>
+        <w:pict>
+          <v:shape id="DocuMindTextBox24" type="#_x0000_t202" stroked="f" filled="f" o:allowincell="f" style="position:absolute;margin-left:36.140pt;margin-top:498.028pt;width:545.337pt;height:15.424pt;z-index:251659264;mso-position-horizontal-relative:page;mso-position-vertical-relative:page;mso-wrap-style:none;">
+            <w10:wrap type="none"/>
+            <v:textbox inset="0,0,0,0">
+              <w:txbxContent>
+                <w:p>
+                  <w:pPr>
+                    <w:spacing w:before="0" w:after="0" w:lineRule="exact" w:line="288"/>
+                    <w:ind w:left="0" w:right="0" w:firstLine="0"/>
+                  </w:pPr>
+                  <w:r>
+                    <w:rPr>
+                      <w:rFonts w:ascii="Century Schoolbook" w:hAnsi="Century Schoolbook" w:eastAsia="Century Schoolbook" w:cs="Century Schoolbook"/>
+                      <w:b w:val="0"/>
+                      <w:i w:val="0"/>
+                      <w:color w:val="000000"/>
+                      <w:sz w:val="24"/>
+                    </w:rPr>
+                    <w:t xml:space="preserve">Quisque cursus, metus vitae pharetra auctor, sem massa mattis sem, at interdum magna augue </w:t>
+                  </w:r>
+                </w:p>
+              </w:txbxContent>
+            </v:textbox>
+          </v:shape>
+        </w:pict>
       </w:r>
       <w:r>
-        <w:br/>
+        <w:pict>
+          <v:shape id="DocuMindTextBox25" type="#_x0000_t202" stroked="f" filled="f" o:allowincell="f" style="position:absolute;margin-left:36.140pt;margin-top:512.428pt;width:545.328pt;height:15.424pt;z-index:251659264;mso-position-horizontal-relative:page;mso-position-vertical-relative:page;mso-wrap-style:none;">
+            <w10:wrap type="none"/>
+            <v:textbox inset="0,0,0,0">
+              <w:txbxContent>
+                <w:p>
+                  <w:pPr>
+                    <w:spacing w:before="0" w:after="0" w:lineRule="exact" w:line="288"/>
+                    <w:ind w:left="0" w:right="0" w:firstLine="0"/>
+                  </w:pPr>
+                  <w:r>
+                    <w:rPr>
+                      <w:rFonts w:ascii="Century Schoolbook" w:hAnsi="Century Schoolbook" w:eastAsia="Century Schoolbook" w:cs="Century Schoolbook"/>
+                      <w:b w:val="0"/>
+                      <w:i w:val="0"/>
+                      <w:color w:val="000000"/>
+                      <w:sz w:val="24"/>
+                    </w:rPr>
+                    <w:t xml:space="preserve">eget diam. Vestibulum ante ipsum primis in faucibus orci luctus et ultrices posuere cubilia Curae; </w:t>
+                  </w:r>
+                </w:p>
+              </w:txbxContent>
+            </v:textbox>
+          </v:shape>
+        </w:pict>
       </w:r>
       <w:r>
-        <w:rPr>
-          <w:rFonts w:ascii="Century Schoolbook" w:hAnsi="Century Schoolbook" w:eastAsia="Century Schoolbook" w:cs="Century Schoolbook"/>
-          <w:b w:val="0"/>
-          <w:i w:val="0"/>
-          <w:color w:val="000000"/>
-          <w:sz w:val="24"/>
-          <w:fitText w:val="10867" w:id="18"/>
-        </w:rPr>
-        <w:t xml:space="preserve">nostra, per inceptos himenaeos. Nam nec ante. Sed lacinia, urna non tincidunt mattis, tortor neque </w:t>
+        <w:pict>
+          <v:shape id="DocuMindTextBox26" type="#_x0000_t202" stroked="f" filled="f" o:allowincell="f" style="position:absolute;margin-left:36.140pt;margin-top:527.068pt;width:545.331pt;height:15.424pt;z-index:251659264;mso-position-horizontal-relative:page;mso-position-vertical-relative:page;mso-wrap-style:none;">
+            <w10:wrap type="none"/>
+            <v:textbox inset="0,0,0,0">
+              <w:txbxContent>
+                <w:p>
+                  <w:pPr>
+                    <w:spacing w:before="0" w:after="0" w:lineRule="exact" w:line="288"/>
+                    <w:ind w:left="0" w:right="0" w:firstLine="0"/>
+                  </w:pPr>
+                  <w:r>
+                    <w:rPr>
+                      <w:rFonts w:ascii="Century Schoolbook" w:hAnsi="Century Schoolbook" w:eastAsia="Century Schoolbook" w:cs="Century Schoolbook"/>
+                      <w:b w:val="0"/>
+                      <w:i w:val="0"/>
+                      <w:color w:val="000000"/>
+                      <w:sz w:val="24"/>
+                    </w:rPr>
+                    <w:t xml:space="preserve">Morbi lacinia molestie dui. Praesent blandit dolor. Sed non quam. In vel mi sit amet augue congue </w:t>
+                  </w:r>
+                </w:p>
+              </w:txbxContent>
+            </v:textbox>
+          </v:shape>
+        </w:pict>
       </w:r>
       <w:r>
-        <w:br/>
+        <w:pict>
+          <v:shape id="DocuMindTextBox27" type="#_x0000_t202" stroked="f" filled="f" o:allowincell="f" style="position:absolute;margin-left:36.140pt;margin-top:541.468pt;width:545.329pt;height:15.424pt;z-index:251659264;mso-position-horizontal-relative:page;mso-position-vertical-relative:page;mso-wrap-style:none;">
+            <w10:wrap type="none"/>
+            <v:textbox inset="0,0,0,0">
+              <w:txbxContent>
+                <w:p>
+                  <w:pPr>
+                    <w:spacing w:before="0" w:after="0" w:lineRule="exact" w:line="288"/>
+                    <w:ind w:left="0" w:right="0" w:firstLine="0"/>
+                  </w:pPr>
+                  <w:r>
+                    <w:rPr>
+                      <w:rFonts w:ascii="Century Schoolbook" w:hAnsi="Century Schoolbook" w:eastAsia="Century Schoolbook" w:cs="Century Schoolbook"/>
+                      <w:b w:val="0"/>
+                      <w:i w:val="0"/>
+                      <w:color w:val="000000"/>
+                      <w:sz w:val="24"/>
+                    </w:rPr>
+                    <w:t xml:space="preserve">elementum. Morbi in ipsum sit amet pede facilisis laoreet. Donec lacus nunc, viverra nec, blandit </w:t>
+                  </w:r>
+                </w:p>
+              </w:txbxContent>
+            </v:textbox>
+          </v:shape>
+        </w:pict>
       </w:r>
       <w:r>
-        <w:rPr>
-          <w:rFonts w:ascii="Century Schoolbook" w:hAnsi="Century Schoolbook" w:eastAsia="Century Schoolbook" w:cs="Century Schoolbook"/>
-          <w:b w:val="0"/>
-          <w:i w:val="0"/>
-          <w:color w:val="000000"/>
-          <w:sz w:val="24"/>
-          <w:fitText w:val="10866" w:id="19"/>
-        </w:rPr>
-        <w:t xml:space="preserve">adipiscing diam, a cursus ipsum ante quis turpis. Nulla facilisi. Ut fringilla. Suspendisse potenti. </w:t>
+        <w:pict>
+          <v:shape id="DocuMindTextBox28" type="#_x0000_t202" stroked="f" filled="f" o:allowincell="f" style="position:absolute;margin-left:36.140pt;margin-top:555.868pt;width:545.329pt;height:15.424pt;z-index:251659264;mso-position-horizontal-relative:page;mso-position-vertical-relative:page;mso-wrap-style:none;">
+            <w10:wrap type="none"/>
+            <v:textbox inset="0,0,0,0">
+              <w:txbxContent>
+                <w:p>
+                  <w:pPr>
+                    <w:spacing w:before="0" w:after="0" w:lineRule="exact" w:line="288"/>
+                    <w:ind w:left="0" w:right="0" w:firstLine="0"/>
+                  </w:pPr>
+                  <w:r>
+                    <w:rPr>
+                      <w:rFonts w:ascii="Century Schoolbook" w:hAnsi="Century Schoolbook" w:eastAsia="Century Schoolbook" w:cs="Century Schoolbook"/>
+                      <w:b w:val="0"/>
+                      <w:i w:val="0"/>
+                      <w:color w:val="000000"/>
+                      <w:sz w:val="24"/>
+                    </w:rPr>
+                    <w:t xml:space="preserve">vel, egestas et, augue. Vestibulum tincidunt malesuada tellus. Ut ultrices ultrices enim. Curabitur </w:t>
+                  </w:r>
+                </w:p>
+              </w:txbxContent>
+            </v:textbox>
+          </v:shape>
+        </w:pict>
       </w:r>
       <w:r>
-        <w:br/>
+        <w:pict>
+          <v:shape id="DocuMindTextBox29" type="#_x0000_t202" stroked="f" filled="f" o:allowincell="f" style="position:absolute;margin-left:36.140pt;margin-top:570.268pt;width:100.023pt;height:15.424pt;z-index:251659264;mso-position-horizontal-relative:page;mso-position-vertical-relative:page;mso-wrap-style:none;">
+            <w10:wrap type="none"/>
+            <v:textbox inset="0,0,0,0">
+              <w:txbxContent>
+                <w:p>
+                  <w:pPr>
+                    <w:spacing w:before="0" w:after="0" w:lineRule="exact" w:line="288"/>
+                    <w:ind w:left="0" w:right="0" w:firstLine="0"/>
+                  </w:pPr>
+                  <w:r>
+                    <w:rPr>
+                      <w:rFonts w:ascii="Century Schoolbook" w:hAnsi="Century Schoolbook" w:eastAsia="Century Schoolbook" w:cs="Century Schoolbook"/>
+                      <w:b w:val="0"/>
+                      <w:i w:val="0"/>
+                      <w:color w:val="000000"/>
+                      <w:sz w:val="24"/>
+                    </w:rPr>
+                    <w:t xml:space="preserve">sit amet mauris.  </w:t>
+                  </w:r>
+                </w:p>
+              </w:txbxContent>
+            </v:textbox>
+          </v:shape>
+        </w:pict>
       </w:r>
       <w:r>
-        <w:rPr>
-          <w:rFonts w:ascii="Century Schoolbook" w:hAnsi="Century Schoolbook" w:eastAsia="Century Schoolbook" w:cs="Century Schoolbook"/>
-          <w:b w:val="0"/>
-          <w:i w:val="0"/>
-          <w:color w:val="000000"/>
-          <w:sz w:val="24"/>
-          <w:fitText w:val="10583" w:id="20"/>
-        </w:rPr>
-        <w:t xml:space="preserve">Nunc feugiat mi a tellus consequat imperdiet. Vestibulum sapien. Proin quam. Etiam ultrices.  </w:t>
-      </w:r>
-    </w:p>
-    <w:p>
-      <w:pPr>
-        <w:spacing w:before="288" w:after="0" w:lineRule="exact" w:line="288"/>
-        <w:ind w:left="0" w:right="24" w:firstLine="0"/>
-        <w:jc w:val="left"/>
-      </w:pPr>
-      <w:r>
-        <w:rPr>
-          <w:rFonts w:ascii="Century Schoolbook" w:hAnsi="Century Schoolbook" w:eastAsia="Century Schoolbook" w:cs="Century Schoolbook"/>
-          <w:b w:val="0"/>
-          <w:i w:val="0"/>
-          <w:color w:val="000000"/>
-          <w:sz w:val="24"/>
-          <w:fitText w:val="10866" w:id="21"/>
-        </w:rPr>
-        <w:t xml:space="preserve">Suspendisse in justo eu magna luctus suscipit. Sed lectus. Integer euismod lacus luctus magna. </w:t>
+        <w:pict>
+          <v:shape id="DocuMindTextBox30" type="#_x0000_t202" stroked="f" filled="f" o:allowincell="f" style="position:absolute;margin-left:36.140pt;margin-top:599.068pt;width:545.322pt;height:15.424pt;z-index:251659264;mso-position-horizontal-relative:page;mso-position-vertical-relative:page;mso-wrap-style:none;">
+            <w10:wrap type="none"/>
+            <v:textbox inset="0,0,0,0">
+              <w:txbxContent>
+                <w:p>
+                  <w:pPr>
+                    <w:spacing w:before="0" w:after="0" w:lineRule="exact" w:line="288"/>
+                    <w:ind w:left="0" w:right="0" w:firstLine="0"/>
+                  </w:pPr>
+                  <w:r>
+                    <w:rPr>
+                      <w:rFonts w:ascii="Century Schoolbook" w:hAnsi="Century Schoolbook" w:eastAsia="Century Schoolbook" w:cs="Century Schoolbook"/>
+                      <w:b w:val="0"/>
+                      <w:i w:val="0"/>
+                      <w:color w:val="000000"/>
+                      <w:sz w:val="24"/>
+                    </w:rPr>
+                    <w:t xml:space="preserve">Morbi in dui quis est pulvinar ullamcorper. Nulla facilisi. Integer lacinia sollicitudin massa. Cras </w:t>
+                  </w:r>
+                </w:p>
+              </w:txbxContent>
+            </v:textbox>
+          </v:shape>
+        </w:pict>
       </w:r>
       <w:r>
-        <w:br/>
+        <w:pict>
+          <v:shape id="DocuMindTextBox31" type="#_x0000_t202" stroked="f" filled="f" o:allowincell="f" style="position:absolute;margin-left:36.140pt;margin-top:613.468pt;width:545.330pt;height:15.424pt;z-index:251659264;mso-position-horizontal-relative:page;mso-position-vertical-relative:page;mso-wrap-style:none;">
+            <w10:wrap type="none"/>
+            <v:textbox inset="0,0,0,0">
+              <w:txbxContent>
+                <w:p>
+                  <w:pPr>
+                    <w:spacing w:before="0" w:after="0" w:lineRule="exact" w:line="288"/>
+                    <w:ind w:left="0" w:right="0" w:firstLine="0"/>
+                  </w:pPr>
+                  <w:r>
+                    <w:rPr>
+                      <w:rFonts w:ascii="Century Schoolbook" w:hAnsi="Century Schoolbook" w:eastAsia="Century Schoolbook" w:cs="Century Schoolbook"/>
+                      <w:b w:val="0"/>
+                      <w:i w:val="0"/>
+                      <w:color w:val="000000"/>
+                      <w:sz w:val="24"/>
+                    </w:rPr>
+                    <w:t xml:space="preserve">metus. Sed aliquet risus a tortor. Integer id quam. Morbi mi. Quisque nisl felis, venenatis tristique, </w:t>
+                  </w:r>
+                </w:p>
+              </w:txbxContent>
+            </v:textbox>
+          </v:shape>
+        </w:pict>
       </w:r>
       <w:r>
-        <w:rPr>
-          <w:rFonts w:ascii="Century Schoolbook" w:hAnsi="Century Schoolbook" w:eastAsia="Century Schoolbook" w:cs="Century Schoolbook"/>
-          <w:b w:val="0"/>
-          <w:i w:val="0"/>
-          <w:color w:val="000000"/>
-          <w:sz w:val="24"/>
-          <w:fitText w:val="10867" w:id="22"/>
-        </w:rPr>
-        <w:t xml:space="preserve">Quisque cursus, metus vitae pharetra auctor, sem massa mattis sem, at interdum magna augue </w:t>
+        <w:pict>
+          <v:shape id="DocuMindTextBox32" type="#_x0000_t202" stroked="f" filled="f" o:allowincell="f" style="position:absolute;margin-left:36.140pt;margin-top:627.868pt;width:545.334pt;height:15.424pt;z-index:251659264;mso-position-horizontal-relative:page;mso-position-vertical-relative:page;mso-wrap-style:none;">
+            <w10:wrap type="none"/>
+            <v:textbox inset="0,0,0,0">
+              <w:txbxContent>
+                <w:p>
+                  <w:pPr>
+                    <w:spacing w:before="0" w:after="0" w:lineRule="exact" w:line="288"/>
+                    <w:ind w:left="0" w:right="0" w:firstLine="0"/>
+                  </w:pPr>
+                  <w:r>
+                    <w:rPr>
+                      <w:rFonts w:ascii="Century Schoolbook" w:hAnsi="Century Schoolbook" w:eastAsia="Century Schoolbook" w:cs="Century Schoolbook"/>
+                      <w:b w:val="0"/>
+                      <w:i w:val="0"/>
+                      <w:color w:val="000000"/>
+                      <w:sz w:val="24"/>
+                    </w:rPr>
+                    <w:t xml:space="preserve">dignissim in, ultrices sit amet, augue. Proin sodales libero eget ante. Nulla quam. Aenean laoreet. </w:t>
+                  </w:r>
+                </w:p>
+              </w:txbxContent>
+            </v:textbox>
+          </v:shape>
+        </w:pict>
       </w:r>
       <w:r>
-        <w:br/>
+        <w:pict>
+          <v:shape id="DocuMindTextBox33" type="#_x0000_t202" stroked="f" filled="f" o:allowincell="f" style="position:absolute;margin-left:36.140pt;margin-top:642.268pt;width:545.325pt;height:15.424pt;z-index:251659264;mso-position-horizontal-relative:page;mso-position-vertical-relative:page;mso-wrap-style:none;">
+            <w10:wrap type="none"/>
+            <v:textbox inset="0,0,0,0">
+              <w:txbxContent>
+                <w:p>
+                  <w:pPr>
+                    <w:spacing w:before="0" w:after="0" w:lineRule="exact" w:line="288"/>
+                    <w:ind w:left="0" w:right="0" w:firstLine="0"/>
+                  </w:pPr>
+                  <w:r>
+                    <w:rPr>
+                      <w:rFonts w:ascii="Century Schoolbook" w:hAnsi="Century Schoolbook" w:eastAsia="Century Schoolbook" w:cs="Century Schoolbook"/>
+                      <w:b w:val="0"/>
+                      <w:i w:val="0"/>
+                      <w:color w:val="000000"/>
+                      <w:sz w:val="24"/>
+                    </w:rPr>
+                    <w:t xml:space="preserve">Vestibulum nisi lectus, commodo ac, facilisis ac, ultricies eu, pede. Ut orci risus, accumsan </w:t>
+                  </w:r>
+                </w:p>
+              </w:txbxContent>
+            </v:textbox>
+          </v:shape>
+        </w:pict>
       </w:r>
       <w:r>
-        <w:rPr>
-          <w:rFonts w:ascii="Century Schoolbook" w:hAnsi="Century Schoolbook" w:eastAsia="Century Schoolbook" w:cs="Century Schoolbook"/>
-          <w:b w:val="0"/>
-          <w:i w:val="0"/>
-          <w:color w:val="000000"/>
-          <w:sz w:val="24"/>
-          <w:fitText w:val="10867" w:id="23"/>
-        </w:rPr>
-        <w:t xml:space="preserve">eget diam. Vestibulum ante ipsum primis in faucibus orci luctus et ultrices posuere cubilia Curae; </w:t>
+        <w:pict>
+          <v:shape id="DocuMindTextBox34" type="#_x0000_t202" stroked="f" filled="f" o:allowincell="f" style="position:absolute;margin-left:36.140pt;margin-top:656.908pt;width:376.908pt;height:15.424pt;z-index:251659264;mso-position-horizontal-relative:page;mso-position-vertical-relative:page;mso-wrap-style:none;">
+            <w10:wrap type="none"/>
+            <v:textbox inset="0,0,0,0">
+              <w:txbxContent>
+                <w:p>
+                  <w:pPr>
+                    <w:spacing w:before="0" w:after="0" w:lineRule="exact" w:line="288"/>
+                    <w:ind w:left="0" w:right="0" w:firstLine="0"/>
+                  </w:pPr>
+                  <w:r>
+                    <w:rPr>
+                      <w:rFonts w:ascii="Century Schoolbook" w:hAnsi="Century Schoolbook" w:eastAsia="Century Schoolbook" w:cs="Century Schoolbook"/>
+                      <w:b w:val="0"/>
+                      <w:i w:val="0"/>
+                      <w:color w:val="000000"/>
+                      <w:sz w:val="24"/>
+                    </w:rPr>
+                    <w:t xml:space="preserve">porttitor, cursus quis, aliquet eget, justo. Sed pretium blandit orci.  </w:t>
+                  </w:r>
+                </w:p>
+              </w:txbxContent>
+            </v:textbox>
+          </v:shape>
+        </w:pict>
       </w:r>
       <w:r>
-        <w:br/>
+        <w:pict>
+          <v:shape id="DocuMindTextBox35" type="#_x0000_t202" stroked="f" filled="f" o:allowincell="f" style="position:absolute;margin-left:36.140pt;margin-top:685.708pt;width:545.329pt;height:15.424pt;z-index:251659264;mso-position-horizontal-relative:page;mso-position-vertical-relative:page;mso-wrap-style:none;">
+            <w10:wrap type="none"/>
+            <v:textbox inset="0,0,0,0">
+              <w:txbxContent>
+                <w:p>
+                  <w:pPr>
+                    <w:spacing w:before="0" w:after="0" w:lineRule="exact" w:line="288"/>
+                    <w:ind w:left="0" w:right="0" w:firstLine="0"/>
+                  </w:pPr>
+                  <w:r>
+                    <w:rPr>
+                      <w:rFonts w:ascii="Century Schoolbook" w:hAnsi="Century Schoolbook" w:eastAsia="Century Schoolbook" w:cs="Century Schoolbook"/>
+                      <w:b w:val="0"/>
+                      <w:i w:val="0"/>
+                      <w:color w:val="000000"/>
+                      <w:sz w:val="24"/>
+                    </w:rPr>
+                    <w:t xml:space="preserve">Ut eu diam at pede suscipit sodales. Aenean lectus elit, fermentum non, convallis id, sagittis at, </w:t>
+                  </w:r>
+                </w:p>
+              </w:txbxContent>
+            </v:textbox>
+          </v:shape>
+        </w:pict>
       </w:r>
       <w:r>
-        <w:rPr>
-          <w:rFonts w:ascii="Century Schoolbook" w:hAnsi="Century Schoolbook" w:eastAsia="Century Schoolbook" w:cs="Century Schoolbook"/>
-          <w:b w:val="0"/>
-          <w:i w:val="0"/>
-          <w:color w:val="000000"/>
-          <w:sz w:val="24"/>
-          <w:fitText w:val="10867" w:id="24"/>
-        </w:rPr>
-        <w:t xml:space="preserve">Morbi lacinia molestie dui. Praesent blandit dolor. Sed non quam. In vel mi sit amet augue congue </w:t>
+        <w:pict>
+          <v:shape id="DocuMindTextBox36" type="#_x0000_t202" stroked="f" filled="f" o:allowincell="f" style="position:absolute;margin-left:36.140pt;margin-top:700.108pt;width:545.333pt;height:15.424pt;z-index:251659264;mso-position-horizontal-relative:page;mso-position-vertical-relative:page;mso-wrap-style:none;">
+            <w10:wrap type="none"/>
+            <v:textbox inset="0,0,0,0">
+              <w:txbxContent>
+                <w:p>
+                  <w:pPr>
+                    <w:spacing w:before="0" w:after="0" w:lineRule="exact" w:line="288"/>
+                    <w:ind w:left="0" w:right="0" w:firstLine="0"/>
+                  </w:pPr>
+                  <w:r>
+                    <w:rPr>
+                      <w:rFonts w:ascii="Century Schoolbook" w:hAnsi="Century Schoolbook" w:eastAsia="Century Schoolbook" w:cs="Century Schoolbook"/>
+                      <w:b w:val="0"/>
+                      <w:i w:val="0"/>
+                      <w:color w:val="000000"/>
+                      <w:sz w:val="24"/>
+                    </w:rPr>
+                    <w:t xml:space="preserve">neque. Nullam mauris orci, aliquet et, iaculis et, viverra vitae, ligula. Nulla ut felis in purus </w:t>
+                  </w:r>
+                </w:p>
+              </w:txbxContent>
+            </v:textbox>
+          </v:shape>
+        </w:pict>
       </w:r>
       <w:r>
-        <w:br/>
-      </w:r>
-      <w:r>
-        <w:rPr>
-          <w:rFonts w:ascii="Century Schoolbook" w:hAnsi="Century Schoolbook" w:eastAsia="Century Schoolbook" w:cs="Century Schoolbook"/>
-          <w:b w:val="0"/>
-          <w:i w:val="0"/>
-          <w:color w:val="000000"/>
-          <w:sz w:val="24"/>
-          <w:fitText w:val="10867" w:id="25"/>
-        </w:rPr>
-        <w:t xml:space="preserve">elementum. Morbi in ipsum sit amet pede facilisis laoreet. Donec lacus nunc, viverra nec, blandit </w:t>
-      </w:r>
-      <w:r>
-        <w:br/>
-      </w:r>
-      <w:r>
-        <w:rPr>
-          <w:rFonts w:ascii="Century Schoolbook" w:hAnsi="Century Schoolbook" w:eastAsia="Century Schoolbook" w:cs="Century Schoolbook"/>
-          <w:b w:val="0"/>
-          <w:i w:val="0"/>
-          <w:color w:val="000000"/>
-          <w:sz w:val="24"/>
-          <w:fitText w:val="10867" w:id="26"/>
-        </w:rPr>
-        <w:t xml:space="preserve">vel, egestas et, augue. Vestibulum tincidunt malesuada tellus. Ut ultrices ultrices enim. Curabitur </w:t>
-      </w:r>
-      <w:r>
-        <w:br/>
-      </w:r>
-      <w:r>
-        <w:rPr>
-          <w:rFonts w:ascii="Century Schoolbook" w:hAnsi="Century Schoolbook" w:eastAsia="Century Schoolbook" w:cs="Century Schoolbook"/>
-          <w:b w:val="0"/>
-          <w:i w:val="0"/>
-          <w:color w:val="000000"/>
-          <w:sz w:val="24"/>
-          <w:fitText w:val="1960" w:id="27"/>
-        </w:rPr>
-        <w:t xml:space="preserve">sit amet mauris.  </w:t>
-      </w:r>
-    </w:p>
-    <w:p>
-      <w:pPr>
-        <w:spacing w:before="288" w:after="0" w:lineRule="exact" w:line="288"/>
-        <w:ind w:left="0" w:right="24" w:firstLine="0"/>
-        <w:jc w:val="left"/>
-      </w:pPr>
-      <w:r>
-        <w:rPr>
-          <w:rFonts w:ascii="Century Schoolbook" w:hAnsi="Century Schoolbook" w:eastAsia="Century Schoolbook" w:cs="Century Schoolbook"/>
-          <w:b w:val="0"/>
-          <w:i w:val="0"/>
-          <w:color w:val="000000"/>
-          <w:sz w:val="24"/>
-          <w:fitText w:val="10866" w:id="28"/>
-        </w:rPr>
-        <w:t xml:space="preserve">Morbi in dui quis est pulvinar ullamcorper. Nulla facilisi. Integer lacinia sollicitudin massa. Cras </w:t>
-      </w:r>
-      <w:r>
-        <w:br/>
-      </w:r>
-      <w:r>
-        <w:rPr>
-          <w:rFonts w:ascii="Century Schoolbook" w:hAnsi="Century Schoolbook" w:eastAsia="Century Schoolbook" w:cs="Century Schoolbook"/>
-          <w:b w:val="0"/>
-          <w:i w:val="0"/>
-          <w:color w:val="000000"/>
-          <w:sz w:val="24"/>
-          <w:fitText w:val="10867" w:id="29"/>
-        </w:rPr>
-        <w:t xml:space="preserve">metus. Sed aliquet risus a tortor. Integer id quam. Morbi mi. Quisque nisl felis, venenatis tristique, </w:t>
-      </w:r>
-      <w:r>
-        <w:br/>
-      </w:r>
-      <w:r>
-        <w:rPr>
-          <w:rFonts w:ascii="Century Schoolbook" w:hAnsi="Century Schoolbook" w:eastAsia="Century Schoolbook" w:cs="Century Schoolbook"/>
-          <w:b w:val="0"/>
-          <w:i w:val="0"/>
-          <w:color w:val="000000"/>
-          <w:sz w:val="24"/>
-          <w:fitText w:val="10867" w:id="30"/>
-        </w:rPr>
-        <w:t xml:space="preserve">dignissim in, ultrices sit amet, augue. Proin sodales libero eget ante. Nulla quam. Aenean laoreet. </w:t>
-      </w:r>
-      <w:r>
-        <w:br/>
-      </w:r>
-      <w:r>
-        <w:rPr>
-          <w:rFonts w:ascii="Century Schoolbook" w:hAnsi="Century Schoolbook" w:eastAsia="Century Schoolbook" w:cs="Century Schoolbook"/>
-          <w:b w:val="0"/>
-          <w:i w:val="0"/>
-          <w:color w:val="000000"/>
-          <w:sz w:val="24"/>
-          <w:fitText w:val="10867" w:id="31"/>
-        </w:rPr>
-        <w:t xml:space="preserve">Vestibulum nisi lectus, commodo ac, facilisis ac, ultricies eu, pede. Ut orci risus, accumsan </w:t>
-      </w:r>
-      <w:r>
-        <w:br/>
-      </w:r>
-      <w:r>
-        <w:rPr>
-          <w:rFonts w:ascii="Century Schoolbook" w:hAnsi="Century Schoolbook" w:eastAsia="Century Schoolbook" w:cs="Century Schoolbook"/>
-          <w:b w:val="0"/>
-          <w:i w:val="0"/>
-          <w:color w:val="000000"/>
-          <w:sz w:val="24"/>
-          <w:fitText w:val="7498" w:id="32"/>
-        </w:rPr>
-        <w:t xml:space="preserve">porttitor, cursus quis, aliquet eget, justo. Sed pretium blandit orci.  </w:t>
-      </w:r>
-    </w:p>
-    <w:p>
-      <w:pPr>
-        <w:spacing w:before="288" w:after="0" w:lineRule="exact" w:line="288"/>
-        <w:ind w:left="0" w:right="24" w:firstLine="0"/>
-        <w:jc w:val="left"/>
-      </w:pPr>
-      <w:r>
-        <w:rPr>
-          <w:rFonts w:ascii="Century Schoolbook" w:hAnsi="Century Schoolbook" w:eastAsia="Century Schoolbook" w:cs="Century Schoolbook"/>
-          <w:b w:val="0"/>
-          <w:i w:val="0"/>
-          <w:color w:val="000000"/>
-          <w:sz w:val="24"/>
-          <w:fitText w:val="10867" w:id="33"/>
-        </w:rPr>
-        <w:t xml:space="preserve">Ut eu diam at pede suscipit sodales. Aenean lectus elit, fermentum non, convallis id, sagittis at, </w:t>
-      </w:r>
-      <w:r>
-        <w:br/>
-      </w:r>
-      <w:r>
-        <w:rPr>
-          <w:rFonts w:ascii="Century Schoolbook" w:hAnsi="Century Schoolbook" w:eastAsia="Century Schoolbook" w:cs="Century Schoolbook"/>
-          <w:b w:val="0"/>
-          <w:i w:val="0"/>
-          <w:color w:val="000000"/>
-          <w:sz w:val="24"/>
-          <w:fitText w:val="10867" w:id="34"/>
-        </w:rPr>
-        <w:t xml:space="preserve">neque. Nullam mauris orci, aliquet et, iaculis et, viverra vitae, ligula. Nulla ut felis in purus </w:t>
-      </w:r>
-      <w:r>
-        <w:br/>
-      </w:r>
-      <w:r>
-        <w:rPr>
-          <w:rFonts w:ascii="Century Schoolbook" w:hAnsi="Century Schoolbook" w:eastAsia="Century Schoolbook" w:cs="Century Schoolbook"/>
-          <w:b w:val="0"/>
-          <w:i w:val="0"/>
-          <w:color w:val="000000"/>
-          <w:sz w:val="24"/>
-          <w:fitText w:val="10867" w:id="35"/>
-        </w:rPr>
-        <w:t xml:space="preserve">aliquam imperdiet. Maecenas aliquet mollis lectus. Vivamus consectetuer risus et tortor. Lorem </w:t>
+        <w:pict>
+          <v:shape id="DocuMindTextBox37" type="#_x0000_t202" stroked="f" filled="f" o:allowincell="f" style="position:absolute;margin-left:36.140pt;margin-top:714.508pt;width:545.331pt;height:15.424pt;z-index:251659264;mso-position-horizontal-relative:page;mso-position-vertical-relative:page;mso-wrap-style:none;">
+            <w10:wrap type="none"/>
+            <v:textbox inset="0,0,0,0">
+              <w:txbxContent>
+                <w:p>
+                  <w:pPr>
+                    <w:spacing w:before="0" w:after="0" w:lineRule="exact" w:line="288"/>
+                    <w:ind w:left="0" w:right="0" w:firstLine="0"/>
+                  </w:pPr>
+                  <w:r>
+                    <w:rPr>
+                      <w:rFonts w:ascii="Century Schoolbook" w:hAnsi="Century Schoolbook" w:eastAsia="Century Schoolbook" w:cs="Century Schoolbook"/>
+                      <w:b w:val="0"/>
+                      <w:i w:val="0"/>
+                      <w:color w:val="000000"/>
+                      <w:sz w:val="24"/>
+                    </w:rPr>
+                    <w:t xml:space="preserve">aliquam imperdiet. Maecenas aliquet mollis lectus. Vivamus consectetuer risus et tortor. Lorem </w:t>
+                  </w:r>
+                </w:p>
+              </w:txbxContent>
+            </v:textbox>
+          </v:shape>
+        </w:pict>
       </w:r>
     </w:p>
     <w:p>
       <w:pPr>
         <w:sectPr>
           <w:pgSz w:w="12240" w:h="15840"/>
-          <w:pgMar w:top="972" w:right="627" w:bottom="1261" w:left="723" w:header="720" w:footer="720" w:gutter="0"/>
+          <w:pgMar w:top="0" w:right="0" w:bottom="0" w:left="0" w:header="0" w:footer="0" w:gutter="0"/>
           <w:cols w:space="720"/>
           <w:docGrid w:linePitch="360"/>
         </w:sectPr>
@@ -562,605 +1023,1126 @@
     </w:p>
     <w:p>
       <w:pPr>
-        <w:spacing w:before="0" w:after="0" w:lineRule="exact" w:line="288"/>
-        <w:ind w:left="0" w:right="0" w:firstLine="0"/>
-        <w:jc w:val="left"/>
+        <w:spacing w:before="0" w:after="0" w:lineRule="exact" w:line="20"/>
       </w:pPr>
       <w:r>
         <w:rPr>
-          <w:rFonts w:ascii="Century Schoolbook" w:hAnsi="Century Schoolbook" w:eastAsia="Century Schoolbook" w:cs="Century Schoolbook"/>
-          <w:b w:val="0"/>
-          <w:i w:val="0"/>
-          <w:color w:val="000000"/>
-          <w:sz w:val="24"/>
-          <w:fitText w:val="10866" w:id="36"/>
+          <w:sz w:val="2"/>
         </w:rPr>
-        <w:t xml:space="preserve">ipsum dolor sit amet, consectetur adipiscing elit. Integer nec odio. Praesent libero. Sed cursus ante </w:t>
       </w:r>
       <w:r>
-        <w:br/>
+        <w:pict>
+          <v:shape id="DocuMindTextBox38" type="#_x0000_t202" stroked="f" filled="f" o:allowincell="f" style="position:absolute;margin-left:303.020pt;margin-top:742.036pt;width:10.794pt;height:15.652pt;z-index:251659264;mso-position-horizontal-relative:page;mso-position-vertical-relative:page;mso-wrap-style:none;">
+            <w10:wrap type="none"/>
+            <v:textbox inset="0,0,0,0">
+              <w:txbxContent>
+                <w:p>
+                  <w:pPr>
+                    <w:spacing w:before="0" w:after="0" w:lineRule="exact" w:line="293"/>
+                    <w:ind w:left="0" w:right="0" w:firstLine="0"/>
+                  </w:pPr>
+                  <w:r>
+                    <w:rPr>
+                      <w:rFonts w:ascii="Calibri" w:hAnsi="Calibri" w:eastAsia="Calibri" w:cs="Calibri"/>
+                      <w:b w:val="0"/>
+                      <w:i w:val="0"/>
+                      <w:color w:val="000000"/>
+                      <w:sz w:val="24"/>
+                    </w:rPr>
+                    <w:t xml:space="preserve">2 </w:t>
+                  </w:r>
+                </w:p>
+              </w:txbxContent>
+            </v:textbox>
+          </v:shape>
+        </w:pict>
       </w:r>
       <w:r>
-        <w:rPr>
-          <w:rFonts w:ascii="Century Schoolbook" w:hAnsi="Century Schoolbook" w:eastAsia="Century Schoolbook" w:cs="Century Schoolbook"/>
-          <w:b w:val="0"/>
-          <w:i w:val="0"/>
-          <w:color w:val="000000"/>
-          <w:sz w:val="24"/>
-          <w:fitText w:val="10867" w:id="37"/>
-        </w:rPr>
-        <w:t xml:space="preserve">dapibus diam. Sed nisi. Nulla quis sem at nibh elementum imperdiet. Duis sagittis ipsum. </w:t>
+        <w:pict>
+          <v:shape id="DocuMindTextBox39" type="#_x0000_t202" stroked="f" filled="f" o:allowincell="f" style="position:absolute;margin-left:36.140pt;margin-top:36.508pt;width:545.322pt;height:15.424pt;z-index:251659264;mso-position-horizontal-relative:page;mso-position-vertical-relative:page;mso-wrap-style:none;">
+            <w10:wrap type="none"/>
+            <v:textbox inset="0,0,0,0">
+              <w:txbxContent>
+                <w:p>
+                  <w:pPr>
+                    <w:spacing w:before="0" w:after="0" w:lineRule="exact" w:line="288"/>
+                    <w:ind w:left="0" w:right="0" w:firstLine="0"/>
+                  </w:pPr>
+                  <w:r>
+                    <w:rPr>
+                      <w:rFonts w:ascii="Century Schoolbook" w:hAnsi="Century Schoolbook" w:eastAsia="Century Schoolbook" w:cs="Century Schoolbook"/>
+                      <w:b w:val="0"/>
+                      <w:i w:val="0"/>
+                      <w:color w:val="000000"/>
+                      <w:sz w:val="24"/>
+                    </w:rPr>
+                    <w:t xml:space="preserve">ipsum dolor sit amet, consectetur adipiscing elit. Integer nec odio. Praesent libero. Sed cursus ante </w:t>
+                  </w:r>
+                </w:p>
+              </w:txbxContent>
+            </v:textbox>
+          </v:shape>
+        </w:pict>
       </w:r>
       <w:r>
-        <w:br/>
+        <w:pict>
+          <v:shape id="DocuMindTextBox40" type="#_x0000_t202" stroked="f" filled="f" o:allowincell="f" style="position:absolute;margin-left:36.140pt;margin-top:50.908pt;width:545.335pt;height:15.424pt;z-index:251659264;mso-position-horizontal-relative:page;mso-position-vertical-relative:page;mso-wrap-style:none;">
+            <w10:wrap type="none"/>
+            <v:textbox inset="0,0,0,0">
+              <w:txbxContent>
+                <w:p>
+                  <w:pPr>
+                    <w:spacing w:before="0" w:after="0" w:lineRule="exact" w:line="288"/>
+                    <w:ind w:left="0" w:right="0" w:firstLine="0"/>
+                  </w:pPr>
+                  <w:r>
+                    <w:rPr>
+                      <w:rFonts w:ascii="Century Schoolbook" w:hAnsi="Century Schoolbook" w:eastAsia="Century Schoolbook" w:cs="Century Schoolbook"/>
+                      <w:b w:val="0"/>
+                      <w:i w:val="0"/>
+                      <w:color w:val="000000"/>
+                      <w:sz w:val="24"/>
+                    </w:rPr>
+                    <w:t xml:space="preserve">dapibus diam. Sed nisi. Nulla quis sem at nibh elementum imperdiet. Duis sagittis ipsum. </w:t>
+                  </w:r>
+                </w:p>
+              </w:txbxContent>
+            </v:textbox>
+          </v:shape>
+        </w:pict>
       </w:r>
       <w:r>
-        <w:rPr>
-          <w:rFonts w:ascii="Century Schoolbook" w:hAnsi="Century Schoolbook" w:eastAsia="Century Schoolbook" w:cs="Century Schoolbook"/>
-          <w:b w:val="0"/>
-          <w:i w:val="0"/>
-          <w:color w:val="000000"/>
-          <w:sz w:val="24"/>
-          <w:fitText w:val="2045" w:id="38"/>
-        </w:rPr>
-        <w:t xml:space="preserve">Praesent mauris.  </w:t>
-      </w:r>
-    </w:p>
-    <w:p>
-      <w:pPr>
-        <w:spacing w:before="288" w:after="0" w:lineRule="exact" w:line="288"/>
-        <w:ind w:left="0" w:right="0" w:firstLine="0"/>
-        <w:jc w:val="left"/>
-      </w:pPr>
-      <w:r>
-        <w:rPr>
-          <w:rFonts w:ascii="Century Schoolbook" w:hAnsi="Century Schoolbook" w:eastAsia="Century Schoolbook" w:cs="Century Schoolbook"/>
-          <w:b w:val="0"/>
-          <w:i w:val="0"/>
-          <w:color w:val="000000"/>
-          <w:sz w:val="24"/>
-          <w:fitText w:val="10867" w:id="39"/>
-        </w:rPr>
-        <w:t xml:space="preserve">Fusce nec tellus sed augue semper porta. Mauris massa. Vestibulum lacinia arcu eget nulla. Class </w:t>
+        <w:pict>
+          <v:shape id="DocuMindTextBox41" type="#_x0000_t202" stroked="f" filled="f" o:allowincell="f" style="position:absolute;margin-left:36.140pt;margin-top:65.308pt;width:104.230pt;height:15.424pt;z-index:251659264;mso-position-horizontal-relative:page;mso-position-vertical-relative:page;mso-wrap-style:none;">
+            <w10:wrap type="none"/>
+            <v:textbox inset="0,0,0,0">
+              <w:txbxContent>
+                <w:p>
+                  <w:pPr>
+                    <w:spacing w:before="0" w:after="0" w:lineRule="exact" w:line="288"/>
+                    <w:ind w:left="0" w:right="0" w:firstLine="0"/>
+                  </w:pPr>
+                  <w:r>
+                    <w:rPr>
+                      <w:rFonts w:ascii="Century Schoolbook" w:hAnsi="Century Schoolbook" w:eastAsia="Century Schoolbook" w:cs="Century Schoolbook"/>
+                      <w:b w:val="0"/>
+                      <w:i w:val="0"/>
+                      <w:color w:val="000000"/>
+                      <w:sz w:val="24"/>
+                    </w:rPr>
+                    <w:t xml:space="preserve">Praesent mauris.  </w:t>
+                  </w:r>
+                </w:p>
+              </w:txbxContent>
+            </v:textbox>
+          </v:shape>
+        </w:pict>
       </w:r>
       <w:r>
-        <w:br/>
+        <w:pict>
+          <v:shape id="DocuMindTextBox42" type="#_x0000_t202" stroked="f" filled="f" o:allowincell="f" style="position:absolute;margin-left:36.140pt;margin-top:94.108pt;width:545.330pt;height:15.424pt;z-index:251659264;mso-position-horizontal-relative:page;mso-position-vertical-relative:page;mso-wrap-style:none;">
+            <w10:wrap type="none"/>
+            <v:textbox inset="0,0,0,0">
+              <w:txbxContent>
+                <w:p>
+                  <w:pPr>
+                    <w:spacing w:before="0" w:after="0" w:lineRule="exact" w:line="288"/>
+                    <w:ind w:left="0" w:right="0" w:firstLine="0"/>
+                  </w:pPr>
+                  <w:r>
+                    <w:rPr>
+                      <w:rFonts w:ascii="Century Schoolbook" w:hAnsi="Century Schoolbook" w:eastAsia="Century Schoolbook" w:cs="Century Schoolbook"/>
+                      <w:b w:val="0"/>
+                      <w:i w:val="0"/>
+                      <w:color w:val="000000"/>
+                      <w:sz w:val="24"/>
+                    </w:rPr>
+                    <w:t xml:space="preserve">Fusce nec tellus sed augue semper porta. Mauris massa. Vestibulum lacinia arcu eget nulla. Class </w:t>
+                  </w:r>
+                </w:p>
+              </w:txbxContent>
+            </v:textbox>
+          </v:shape>
+        </w:pict>
       </w:r>
       <w:r>
-        <w:rPr>
-          <w:rFonts w:ascii="Century Schoolbook" w:hAnsi="Century Schoolbook" w:eastAsia="Century Schoolbook" w:cs="Century Schoolbook"/>
-          <w:b w:val="0"/>
-          <w:i w:val="0"/>
-          <w:color w:val="000000"/>
-          <w:sz w:val="24"/>
-          <w:fitText w:val="10867" w:id="40"/>
-        </w:rPr>
-        <w:t xml:space="preserve">aptent taciti sociosqu ad litora torquent per conubia nostra, per inceptos himenaeos. Curabitur </w:t>
+        <w:pict>
+          <v:shape id="DocuMindTextBox43" type="#_x0000_t202" stroked="f" filled="f" o:allowincell="f" style="position:absolute;margin-left:36.140pt;margin-top:108.748pt;width:545.326pt;height:15.424pt;z-index:251659264;mso-position-horizontal-relative:page;mso-position-vertical-relative:page;mso-wrap-style:none;">
+            <w10:wrap type="none"/>
+            <v:textbox inset="0,0,0,0">
+              <w:txbxContent>
+                <w:p>
+                  <w:pPr>
+                    <w:spacing w:before="0" w:after="0" w:lineRule="exact" w:line="288"/>
+                    <w:ind w:left="0" w:right="0" w:firstLine="0"/>
+                  </w:pPr>
+                  <w:r>
+                    <w:rPr>
+                      <w:rFonts w:ascii="Century Schoolbook" w:hAnsi="Century Schoolbook" w:eastAsia="Century Schoolbook" w:cs="Century Schoolbook"/>
+                      <w:b w:val="0"/>
+                      <w:i w:val="0"/>
+                      <w:color w:val="000000"/>
+                      <w:sz w:val="24"/>
+                    </w:rPr>
+                    <w:t xml:space="preserve">aptent taciti sociosqu ad litora torquent per conubia nostra, per inceptos himenaeos. Curabitur </w:t>
+                  </w:r>
+                </w:p>
+              </w:txbxContent>
+            </v:textbox>
+          </v:shape>
+        </w:pict>
       </w:r>
       <w:r>
-        <w:br/>
+        <w:pict>
+          <v:shape id="DocuMindTextBox44" type="#_x0000_t202" stroked="f" filled="f" o:allowincell="f" style="position:absolute;margin-left:36.140pt;margin-top:123.148pt;width:545.319pt;height:15.424pt;z-index:251659264;mso-position-horizontal-relative:page;mso-position-vertical-relative:page;mso-wrap-style:none;">
+            <w10:wrap type="none"/>
+            <v:textbox inset="0,0,0,0">
+              <w:txbxContent>
+                <w:p>
+                  <w:pPr>
+                    <w:spacing w:before="0" w:after="0" w:lineRule="exact" w:line="288"/>
+                    <w:ind w:left="0" w:right="0" w:firstLine="0"/>
+                  </w:pPr>
+                  <w:r>
+                    <w:rPr>
+                      <w:rFonts w:ascii="Century Schoolbook" w:hAnsi="Century Schoolbook" w:eastAsia="Century Schoolbook" w:cs="Century Schoolbook"/>
+                      <w:b w:val="0"/>
+                      <w:i w:val="0"/>
+                      <w:color w:val="000000"/>
+                      <w:sz w:val="24"/>
+                    </w:rPr>
+                    <w:t xml:space="preserve">sodales ligula in libero. Sed dignissim lacinia nunc. Curabitur tortor. Pellentesque nibh. Aenean </w:t>
+                  </w:r>
+                </w:p>
+              </w:txbxContent>
+            </v:textbox>
+          </v:shape>
+        </w:pict>
       </w:r>
       <w:r>
-        <w:rPr>
-          <w:rFonts w:ascii="Century Schoolbook" w:hAnsi="Century Schoolbook" w:eastAsia="Century Schoolbook" w:cs="Century Schoolbook"/>
-          <w:b w:val="0"/>
-          <w:i w:val="0"/>
-          <w:color w:val="000000"/>
-          <w:sz w:val="24"/>
-          <w:fitText w:val="10866" w:id="41"/>
-        </w:rPr>
-        <w:t xml:space="preserve">sodales ligula in libero. Sed dignissim lacinia nunc. Curabitur tortor. Pellentesque nibh. Aenean </w:t>
+        <w:pict>
+          <v:shape id="DocuMindTextBox45" type="#_x0000_t202" stroked="f" filled="f" o:allowincell="f" style="position:absolute;margin-left:36.140pt;margin-top:137.548pt;width:455.160pt;height:15.424pt;z-index:251659264;mso-position-horizontal-relative:page;mso-position-vertical-relative:page;mso-wrap-style:none;">
+            <w10:wrap type="none"/>
+            <v:textbox inset="0,0,0,0">
+              <w:txbxContent>
+                <w:p>
+                  <w:pPr>
+                    <w:spacing w:before="0" w:after="0" w:lineRule="exact" w:line="288"/>
+                    <w:ind w:left="0" w:right="0" w:firstLine="0"/>
+                  </w:pPr>
+                  <w:r>
+                    <w:rPr>
+                      <w:rFonts w:ascii="Century Schoolbook" w:hAnsi="Century Schoolbook" w:eastAsia="Century Schoolbook" w:cs="Century Schoolbook"/>
+                      <w:b w:val="0"/>
+                      <w:i w:val="0"/>
+                      <w:color w:val="000000"/>
+                      <w:sz w:val="24"/>
+                    </w:rPr>
+                    <w:t xml:space="preserve">quam. In scelerisque sem at dolor. Maecenas mattis. Sed convallis tristique sem.  </w:t>
+                  </w:r>
+                </w:p>
+              </w:txbxContent>
+            </v:textbox>
+          </v:shape>
+        </w:pict>
       </w:r>
       <w:r>
-        <w:br/>
+        <w:pict>
+          <v:shape id="DocuMindTextBox46" type="#_x0000_t202" stroked="f" filled="f" o:allowincell="f" style="position:absolute;margin-left:36.140pt;margin-top:166.348pt;width:545.334pt;height:15.424pt;z-index:251659264;mso-position-horizontal-relative:page;mso-position-vertical-relative:page;mso-wrap-style:none;">
+            <w10:wrap type="none"/>
+            <v:textbox inset="0,0,0,0">
+              <w:txbxContent>
+                <w:p>
+                  <w:pPr>
+                    <w:spacing w:before="0" w:after="0" w:lineRule="exact" w:line="288"/>
+                    <w:ind w:left="0" w:right="0" w:firstLine="0"/>
+                  </w:pPr>
+                  <w:r>
+                    <w:rPr>
+                      <w:rFonts w:ascii="Century Schoolbook" w:hAnsi="Century Schoolbook" w:eastAsia="Century Schoolbook" w:cs="Century Schoolbook"/>
+                      <w:b w:val="0"/>
+                      <w:i w:val="0"/>
+                      <w:color w:val="000000"/>
+                      <w:sz w:val="24"/>
+                    </w:rPr>
+                    <w:t xml:space="preserve">Proin ut ligula vel nunc egestas porttitor. Morbi lectus risus, iaculis vel, suscipit quis, luctus non, </w:t>
+                  </w:r>
+                </w:p>
+              </w:txbxContent>
+            </v:textbox>
+          </v:shape>
+        </w:pict>
       </w:r>
       <w:r>
-        <w:rPr>
-          <w:rFonts w:ascii="Century Schoolbook" w:hAnsi="Century Schoolbook" w:eastAsia="Century Schoolbook" w:cs="Century Schoolbook"/>
-          <w:b w:val="0"/>
-          <w:i w:val="0"/>
-          <w:color w:val="000000"/>
-          <w:sz w:val="24"/>
-          <w:fitText w:val="9063" w:id="42"/>
-        </w:rPr>
-        <w:t xml:space="preserve">quam. In scelerisque sem at dolor. Maecenas mattis. Sed convallis tristique sem.  </w:t>
-      </w:r>
-    </w:p>
-    <w:p>
-      <w:pPr>
-        <w:spacing w:before="288" w:after="0" w:lineRule="exact" w:line="288"/>
-        <w:ind w:left="0" w:right="0" w:firstLine="0"/>
-        <w:jc w:val="left"/>
-      </w:pPr>
-      <w:r>
-        <w:rPr>
-          <w:rFonts w:ascii="Century Schoolbook" w:hAnsi="Century Schoolbook" w:eastAsia="Century Schoolbook" w:cs="Century Schoolbook"/>
-          <w:b w:val="0"/>
-          <w:i w:val="0"/>
-          <w:color w:val="000000"/>
-          <w:sz w:val="24"/>
-          <w:fitText w:val="10867" w:id="43"/>
-        </w:rPr>
-        <w:t xml:space="preserve">Proin ut ligula vel nunc egestas porttitor. Morbi lectus risus, iaculis vel, suscipit quis, luctus non, </w:t>
+        <w:pict>
+          <v:shape id="DocuMindTextBox47" type="#_x0000_t202" stroked="f" filled="f" o:allowincell="f" style="position:absolute;margin-left:36.140pt;margin-top:180.748pt;width:545.328pt;height:15.424pt;z-index:251659264;mso-position-horizontal-relative:page;mso-position-vertical-relative:page;mso-wrap-style:none;">
+            <w10:wrap type="none"/>
+            <v:textbox inset="0,0,0,0">
+              <w:txbxContent>
+                <w:p>
+                  <w:pPr>
+                    <w:spacing w:before="0" w:after="0" w:lineRule="exact" w:line="288"/>
+                    <w:ind w:left="0" w:right="0" w:firstLine="0"/>
+                  </w:pPr>
+                  <w:r>
+                    <w:rPr>
+                      <w:rFonts w:ascii="Century Schoolbook" w:hAnsi="Century Schoolbook" w:eastAsia="Century Schoolbook" w:cs="Century Schoolbook"/>
+                      <w:b w:val="0"/>
+                      <w:i w:val="0"/>
+                      <w:color w:val="000000"/>
+                      <w:sz w:val="24"/>
+                    </w:rPr>
+                    <w:t xml:space="preserve">massa. Fusce ac turpis quis ligula lacinia aliquet. Mauris ipsum. Nulla metus metus, ullamcorper </w:t>
+                  </w:r>
+                </w:p>
+              </w:txbxContent>
+            </v:textbox>
+          </v:shape>
+        </w:pict>
       </w:r>
       <w:r>
-        <w:br/>
+        <w:pict>
+          <v:shape id="DocuMindTextBox48" type="#_x0000_t202" stroked="f" filled="f" o:allowincell="f" style="position:absolute;margin-left:36.140pt;margin-top:195.148pt;width:545.326pt;height:15.424pt;z-index:251659264;mso-position-horizontal-relative:page;mso-position-vertical-relative:page;mso-wrap-style:none;">
+            <w10:wrap type="none"/>
+            <v:textbox inset="0,0,0,0">
+              <w:txbxContent>
+                <w:p>
+                  <w:pPr>
+                    <w:spacing w:before="0" w:after="0" w:lineRule="exact" w:line="288"/>
+                    <w:ind w:left="0" w:right="0" w:firstLine="0"/>
+                  </w:pPr>
+                  <w:r>
+                    <w:rPr>
+                      <w:rFonts w:ascii="Century Schoolbook" w:hAnsi="Century Schoolbook" w:eastAsia="Century Schoolbook" w:cs="Century Schoolbook"/>
+                      <w:b w:val="0"/>
+                      <w:i w:val="0"/>
+                      <w:color w:val="000000"/>
+                      <w:sz w:val="24"/>
+                    </w:rPr>
+                    <w:t xml:space="preserve">vel, tincidunt sed, euismod in, nibh. Quisque volutpat condimentum velit. Class aptent taciti </w:t>
+                  </w:r>
+                </w:p>
+              </w:txbxContent>
+            </v:textbox>
+          </v:shape>
+        </w:pict>
       </w:r>
       <w:r>
-        <w:rPr>
-          <w:rFonts w:ascii="Century Schoolbook" w:hAnsi="Century Schoolbook" w:eastAsia="Century Schoolbook" w:cs="Century Schoolbook"/>
-          <w:b w:val="0"/>
-          <w:i w:val="0"/>
-          <w:color w:val="000000"/>
-          <w:sz w:val="24"/>
-          <w:fitText w:val="10867" w:id="44"/>
-        </w:rPr>
-        <w:t xml:space="preserve">massa. Fusce ac turpis quis ligula lacinia aliquet. Mauris ipsum. Nulla metus metus, ullamcorper </w:t>
+        <w:pict>
+          <v:shape id="DocuMindTextBox49" type="#_x0000_t202" stroked="f" filled="f" o:allowincell="f" style="position:absolute;margin-left:36.140pt;margin-top:209.548pt;width:545.333pt;height:15.424pt;z-index:251659264;mso-position-horizontal-relative:page;mso-position-vertical-relative:page;mso-wrap-style:none;">
+            <w10:wrap type="none"/>
+            <v:textbox inset="0,0,0,0">
+              <w:txbxContent>
+                <w:p>
+                  <w:pPr>
+                    <w:spacing w:before="0" w:after="0" w:lineRule="exact" w:line="288"/>
+                    <w:ind w:left="0" w:right="0" w:firstLine="0"/>
+                  </w:pPr>
+                  <w:r>
+                    <w:rPr>
+                      <w:rFonts w:ascii="Century Schoolbook" w:hAnsi="Century Schoolbook" w:eastAsia="Century Schoolbook" w:cs="Century Schoolbook"/>
+                      <w:b w:val="0"/>
+                      <w:i w:val="0"/>
+                      <w:color w:val="000000"/>
+                      <w:sz w:val="24"/>
+                    </w:rPr>
+                    <w:t xml:space="preserve">sociosqu ad litora torquent per conubia nostra, per inceptos himenaeos. Nam nec ante. Sed lacinia, </w:t>
+                  </w:r>
+                </w:p>
+              </w:txbxContent>
+            </v:textbox>
+          </v:shape>
+        </w:pict>
       </w:r>
       <w:r>
-        <w:br/>
+        <w:pict>
+          <v:shape id="DocuMindTextBox50" type="#_x0000_t202" stroked="f" filled="f" o:allowincell="f" style="position:absolute;margin-left:36.140pt;margin-top:223.948pt;width:545.325pt;height:15.424pt;z-index:251659264;mso-position-horizontal-relative:page;mso-position-vertical-relative:page;mso-wrap-style:none;">
+            <w10:wrap type="none"/>
+            <v:textbox inset="0,0,0,0">
+              <w:txbxContent>
+                <w:p>
+                  <w:pPr>
+                    <w:spacing w:before="0" w:after="0" w:lineRule="exact" w:line="288"/>
+                    <w:ind w:left="0" w:right="0" w:firstLine="0"/>
+                  </w:pPr>
+                  <w:r>
+                    <w:rPr>
+                      <w:rFonts w:ascii="Century Schoolbook" w:hAnsi="Century Schoolbook" w:eastAsia="Century Schoolbook" w:cs="Century Schoolbook"/>
+                      <w:b w:val="0"/>
+                      <w:i w:val="0"/>
+                      <w:color w:val="000000"/>
+                      <w:sz w:val="24"/>
+                    </w:rPr>
+                    <w:t xml:space="preserve">urna non tincidunt mattis, tortor neque adipiscing diam, a cursus ipsum ante quis turpis. Nulla </w:t>
+                  </w:r>
+                </w:p>
+              </w:txbxContent>
+            </v:textbox>
+          </v:shape>
+        </w:pict>
       </w:r>
       <w:r>
-        <w:rPr>
-          <w:rFonts w:ascii="Century Schoolbook" w:hAnsi="Century Schoolbook" w:eastAsia="Century Schoolbook" w:cs="Century Schoolbook"/>
-          <w:b w:val="0"/>
-          <w:i w:val="0"/>
-          <w:color w:val="000000"/>
-          <w:sz w:val="24"/>
-          <w:fitText w:val="10867" w:id="45"/>
-        </w:rPr>
-        <w:t xml:space="preserve">vel, tincidunt sed, euismod in, nibh. Quisque volutpat condimentum velit. Class aptent taciti </w:t>
+        <w:pict>
+          <v:shape id="DocuMindTextBox51" type="#_x0000_t202" stroked="f" filled="f" o:allowincell="f" style="position:absolute;margin-left:36.140pt;margin-top:238.588pt;width:235.797pt;height:15.424pt;z-index:251659264;mso-position-horizontal-relative:page;mso-position-vertical-relative:page;mso-wrap-style:none;">
+            <w10:wrap type="none"/>
+            <v:textbox inset="0,0,0,0">
+              <w:txbxContent>
+                <w:p>
+                  <w:pPr>
+                    <w:spacing w:before="0" w:after="0" w:lineRule="exact" w:line="288"/>
+                    <w:ind w:left="0" w:right="0" w:firstLine="0"/>
+                  </w:pPr>
+                  <w:r>
+                    <w:rPr>
+                      <w:rFonts w:ascii="Century Schoolbook" w:hAnsi="Century Schoolbook" w:eastAsia="Century Schoolbook" w:cs="Century Schoolbook"/>
+                      <w:b w:val="0"/>
+                      <w:i w:val="0"/>
+                      <w:color w:val="000000"/>
+                      <w:sz w:val="24"/>
+                    </w:rPr>
+                    <w:t xml:space="preserve">facilisi. Ut fringilla. Suspendisse potenti.  </w:t>
+                  </w:r>
+                </w:p>
+              </w:txbxContent>
+            </v:textbox>
+          </v:shape>
+        </w:pict>
       </w:r>
       <w:r>
-        <w:br/>
+        <w:pict>
+          <v:shape id="DocuMindTextBox52" type="#_x0000_t202" stroked="f" filled="f" o:allowincell="f" style="position:absolute;margin-left:36.140pt;margin-top:267.388pt;width:545.334pt;height:15.424pt;z-index:251659264;mso-position-horizontal-relative:page;mso-position-vertical-relative:page;mso-wrap-style:none;">
+            <w10:wrap type="none"/>
+            <v:textbox inset="0,0,0,0">
+              <w:txbxContent>
+                <w:p>
+                  <w:pPr>
+                    <w:spacing w:before="0" w:after="0" w:lineRule="exact" w:line="288"/>
+                    <w:ind w:left="0" w:right="0" w:firstLine="0"/>
+                  </w:pPr>
+                  <w:r>
+                    <w:rPr>
+                      <w:rFonts w:ascii="Century Schoolbook" w:hAnsi="Century Schoolbook" w:eastAsia="Century Schoolbook" w:cs="Century Schoolbook"/>
+                      <w:b w:val="0"/>
+                      <w:i w:val="0"/>
+                      <w:color w:val="000000"/>
+                      <w:sz w:val="24"/>
+                    </w:rPr>
+                    <w:t xml:space="preserve">Nunc feugiat mi a tellus consequat imperdiet. Vestibulum sapien. Proin quam. Etiam ultrices. </w:t>
+                  </w:r>
+                </w:p>
+              </w:txbxContent>
+            </v:textbox>
+          </v:shape>
+        </w:pict>
       </w:r>
       <w:r>
-        <w:rPr>
-          <w:rFonts w:ascii="Century Schoolbook" w:hAnsi="Century Schoolbook" w:eastAsia="Century Schoolbook" w:cs="Century Schoolbook"/>
-          <w:b w:val="0"/>
-          <w:i w:val="0"/>
-          <w:color w:val="000000"/>
-          <w:sz w:val="24"/>
-          <w:fitText w:val="10867" w:id="46"/>
-        </w:rPr>
-        <w:t xml:space="preserve">sociosqu ad litora torquent per conubia nostra, per inceptos himenaeos. Nam nec ante. Sed lacinia, </w:t>
+        <w:pict>
+          <v:shape id="DocuMindTextBox53" type="#_x0000_t202" stroked="f" filled="f" o:allowincell="f" style="position:absolute;margin-left:36.140pt;margin-top:281.788pt;width:545.320pt;height:15.424pt;z-index:251659264;mso-position-horizontal-relative:page;mso-position-vertical-relative:page;mso-wrap-style:none;">
+            <w10:wrap type="none"/>
+            <v:textbox inset="0,0,0,0">
+              <w:txbxContent>
+                <w:p>
+                  <w:pPr>
+                    <w:spacing w:before="0" w:after="0" w:lineRule="exact" w:line="288"/>
+                    <w:ind w:left="0" w:right="0" w:firstLine="0"/>
+                  </w:pPr>
+                  <w:r>
+                    <w:rPr>
+                      <w:rFonts w:ascii="Century Schoolbook" w:hAnsi="Century Schoolbook" w:eastAsia="Century Schoolbook" w:cs="Century Schoolbook"/>
+                      <w:b w:val="0"/>
+                      <w:i w:val="0"/>
+                      <w:color w:val="000000"/>
+                      <w:sz w:val="24"/>
+                    </w:rPr>
+                    <w:t xml:space="preserve">Suspendisse in justo eu magna luctus suscipit. Sed lectus. Integer euismod lacus luctus magna. </w:t>
+                  </w:r>
+                </w:p>
+              </w:txbxContent>
+            </v:textbox>
+          </v:shape>
+        </w:pict>
       </w:r>
       <w:r>
-        <w:br/>
+        <w:pict>
+          <v:shape id="DocuMindTextBox54" type="#_x0000_t202" stroked="f" filled="f" o:allowincell="f" style="position:absolute;margin-left:36.140pt;margin-top:296.188pt;width:545.337pt;height:15.424pt;z-index:251659264;mso-position-horizontal-relative:page;mso-position-vertical-relative:page;mso-wrap-style:none;">
+            <w10:wrap type="none"/>
+            <v:textbox inset="0,0,0,0">
+              <w:txbxContent>
+                <w:p>
+                  <w:pPr>
+                    <w:spacing w:before="0" w:after="0" w:lineRule="exact" w:line="288"/>
+                    <w:ind w:left="0" w:right="0" w:firstLine="0"/>
+                  </w:pPr>
+                  <w:r>
+                    <w:rPr>
+                      <w:rFonts w:ascii="Century Schoolbook" w:hAnsi="Century Schoolbook" w:eastAsia="Century Schoolbook" w:cs="Century Schoolbook"/>
+                      <w:b w:val="0"/>
+                      <w:i w:val="0"/>
+                      <w:color w:val="000000"/>
+                      <w:sz w:val="24"/>
+                    </w:rPr>
+                    <w:t xml:space="preserve">Quisque cursus, metus vitae pharetra auctor, sem massa mattis sem, at interdum magna augue </w:t>
+                  </w:r>
+                </w:p>
+              </w:txbxContent>
+            </v:textbox>
+          </v:shape>
+        </w:pict>
       </w:r>
       <w:r>
-        <w:rPr>
-          <w:rFonts w:ascii="Century Schoolbook" w:hAnsi="Century Schoolbook" w:eastAsia="Century Schoolbook" w:cs="Century Schoolbook"/>
-          <w:b w:val="0"/>
-          <w:i w:val="0"/>
-          <w:color w:val="000000"/>
-          <w:sz w:val="24"/>
-          <w:fitText w:val="10867" w:id="47"/>
-        </w:rPr>
-        <w:t xml:space="preserve">urna non tincidunt mattis, tortor neque adipiscing diam, a cursus ipsum ante quis turpis. Nulla </w:t>
+        <w:pict>
+          <v:shape id="DocuMindTextBox55" type="#_x0000_t202" stroked="f" filled="f" o:allowincell="f" style="position:absolute;margin-left:36.140pt;margin-top:310.588pt;width:545.326pt;height:15.424pt;z-index:251659264;mso-position-horizontal-relative:page;mso-position-vertical-relative:page;mso-wrap-style:none;">
+            <w10:wrap type="none"/>
+            <v:textbox inset="0,0,0,0">
+              <w:txbxContent>
+                <w:p>
+                  <w:pPr>
+                    <w:spacing w:before="0" w:after="0" w:lineRule="exact" w:line="288"/>
+                    <w:ind w:left="0" w:right="0" w:firstLine="0"/>
+                  </w:pPr>
+                  <w:r>
+                    <w:rPr>
+                      <w:rFonts w:ascii="Century Schoolbook" w:hAnsi="Century Schoolbook" w:eastAsia="Century Schoolbook" w:cs="Century Schoolbook"/>
+                      <w:b w:val="0"/>
+                      <w:i w:val="0"/>
+                      <w:color w:val="000000"/>
+                      <w:sz w:val="24"/>
+                    </w:rPr>
+                    <w:t xml:space="preserve">eget diam. Vestibulum ante ipsum primis in faucibus orci luctus et ultrices posuere cubilia Curae; </w:t>
+                  </w:r>
+                </w:p>
+              </w:txbxContent>
+            </v:textbox>
+          </v:shape>
+        </w:pict>
       </w:r>
       <w:r>
-        <w:br/>
+        <w:pict>
+          <v:shape id="DocuMindTextBox56" type="#_x0000_t202" stroked="f" filled="f" o:allowincell="f" style="position:absolute;margin-left:36.140pt;margin-top:324.988pt;width:545.331pt;height:15.424pt;z-index:251659264;mso-position-horizontal-relative:page;mso-position-vertical-relative:page;mso-wrap-style:none;">
+            <w10:wrap type="none"/>
+            <v:textbox inset="0,0,0,0">
+              <w:txbxContent>
+                <w:p>
+                  <w:pPr>
+                    <w:spacing w:before="0" w:after="0" w:lineRule="exact" w:line="288"/>
+                    <w:ind w:left="0" w:right="0" w:firstLine="0"/>
+                  </w:pPr>
+                  <w:r>
+                    <w:rPr>
+                      <w:rFonts w:ascii="Century Schoolbook" w:hAnsi="Century Schoolbook" w:eastAsia="Century Schoolbook" w:cs="Century Schoolbook"/>
+                      <w:b w:val="0"/>
+                      <w:i w:val="0"/>
+                      <w:color w:val="000000"/>
+                      <w:sz w:val="24"/>
+                    </w:rPr>
+                    <w:t xml:space="preserve">Morbi lacinia molestie dui. Praesent blandit dolor. Sed non quam. In vel mi sit amet augue congue </w:t>
+                  </w:r>
+                </w:p>
+              </w:txbxContent>
+            </v:textbox>
+          </v:shape>
+        </w:pict>
       </w:r>
       <w:r>
-        <w:rPr>
-          <w:rFonts w:ascii="Century Schoolbook" w:hAnsi="Century Schoolbook" w:eastAsia="Century Schoolbook" w:cs="Century Schoolbook"/>
-          <w:b w:val="0"/>
-          <w:i w:val="0"/>
-          <w:color w:val="000000"/>
-          <w:sz w:val="24"/>
-          <w:fitText w:val="4676" w:id="48"/>
-        </w:rPr>
-        <w:t xml:space="preserve">facilisi. Ut fringilla. Suspendisse potenti.  </w:t>
-      </w:r>
-    </w:p>
-    <w:p>
-      <w:pPr>
-        <w:spacing w:before="288" w:after="0" w:lineRule="exact" w:line="288"/>
-        <w:ind w:left="0" w:right="0" w:firstLine="0"/>
-        <w:jc w:val="left"/>
-      </w:pPr>
-      <w:r>
-        <w:rPr>
-          <w:rFonts w:ascii="Century Schoolbook" w:hAnsi="Century Schoolbook" w:eastAsia="Century Schoolbook" w:cs="Century Schoolbook"/>
-          <w:b w:val="0"/>
-          <w:i w:val="0"/>
-          <w:color w:val="000000"/>
-          <w:sz w:val="24"/>
-          <w:fitText w:val="10867" w:id="49"/>
-        </w:rPr>
-        <w:t xml:space="preserve">Nunc feugiat mi a tellus consequat imperdiet. Vestibulum sapien. Proin quam. Etiam ultrices. </w:t>
+        <w:pict>
+          <v:shape id="DocuMindTextBox57" type="#_x0000_t202" stroked="f" filled="f" o:allowincell="f" style="position:absolute;margin-left:36.140pt;margin-top:339.388pt;width:331.369pt;height:15.424pt;z-index:251659264;mso-position-horizontal-relative:page;mso-position-vertical-relative:page;mso-wrap-style:none;">
+            <w10:wrap type="none"/>
+            <v:textbox inset="0,0,0,0">
+              <w:txbxContent>
+                <w:p>
+                  <w:pPr>
+                    <w:spacing w:before="0" w:after="0" w:lineRule="exact" w:line="288"/>
+                    <w:ind w:left="0" w:right="0" w:firstLine="0"/>
+                  </w:pPr>
+                  <w:r>
+                    <w:rPr>
+                      <w:rFonts w:ascii="Century Schoolbook" w:hAnsi="Century Schoolbook" w:eastAsia="Century Schoolbook" w:cs="Century Schoolbook"/>
+                      <w:b w:val="0"/>
+                      <w:i w:val="0"/>
+                      <w:color w:val="000000"/>
+                      <w:sz w:val="24"/>
+                    </w:rPr>
+                    <w:t xml:space="preserve">elementum. Morbi in ipsum sit amet pede facilisis laoreet.  </w:t>
+                  </w:r>
+                </w:p>
+              </w:txbxContent>
+            </v:textbox>
+          </v:shape>
+        </w:pict>
       </w:r>
       <w:r>
-        <w:br/>
+        <w:pict>
+          <v:shape id="DocuMindTextBox58" type="#_x0000_t202" stroked="f" filled="f" o:allowincell="f" style="position:absolute;margin-left:36.140pt;margin-top:368.188pt;width:545.331pt;height:15.424pt;z-index:251659264;mso-position-horizontal-relative:page;mso-position-vertical-relative:page;mso-wrap-style:none;">
+            <w10:wrap type="none"/>
+            <v:textbox inset="0,0,0,0">
+              <w:txbxContent>
+                <w:p>
+                  <w:pPr>
+                    <w:spacing w:before="0" w:after="0" w:lineRule="exact" w:line="288"/>
+                    <w:ind w:left="0" w:right="0" w:firstLine="0"/>
+                  </w:pPr>
+                  <w:r>
+                    <w:rPr>
+                      <w:rFonts w:ascii="Century Schoolbook" w:hAnsi="Century Schoolbook" w:eastAsia="Century Schoolbook" w:cs="Century Schoolbook"/>
+                      <w:b w:val="0"/>
+                      <w:i w:val="0"/>
+                      <w:color w:val="000000"/>
+                      <w:sz w:val="24"/>
+                    </w:rPr>
+                    <w:t xml:space="preserve">Donec lacus nunc, viverra nec, blandit vel, egestas et, augue. Vestibulum tincidunt malesuada </w:t>
+                  </w:r>
+                </w:p>
+              </w:txbxContent>
+            </v:textbox>
+          </v:shape>
+        </w:pict>
       </w:r>
       <w:r>
-        <w:rPr>
-          <w:rFonts w:ascii="Century Schoolbook" w:hAnsi="Century Schoolbook" w:eastAsia="Century Schoolbook" w:cs="Century Schoolbook"/>
-          <w:b w:val="0"/>
-          <w:i w:val="0"/>
-          <w:color w:val="000000"/>
-          <w:sz w:val="24"/>
-          <w:fitText w:val="10866" w:id="50"/>
-        </w:rPr>
-        <w:t xml:space="preserve">Suspendisse in justo eu magna luctus suscipit. Sed lectus. Integer euismod lacus luctus magna. </w:t>
+        <w:pict>
+          <v:shape id="DocuMindTextBox59" type="#_x0000_t202" stroked="f" filled="f" o:allowincell="f" style="position:absolute;margin-left:36.140pt;margin-top:382.828pt;width:545.330pt;height:15.424pt;z-index:251659264;mso-position-horizontal-relative:page;mso-position-vertical-relative:page;mso-wrap-style:none;">
+            <w10:wrap type="none"/>
+            <v:textbox inset="0,0,0,0">
+              <w:txbxContent>
+                <w:p>
+                  <w:pPr>
+                    <w:spacing w:before="0" w:after="0" w:lineRule="exact" w:line="288"/>
+                    <w:ind w:left="0" w:right="0" w:firstLine="0"/>
+                  </w:pPr>
+                  <w:r>
+                    <w:rPr>
+                      <w:rFonts w:ascii="Century Schoolbook" w:hAnsi="Century Schoolbook" w:eastAsia="Century Schoolbook" w:cs="Century Schoolbook"/>
+                      <w:b w:val="0"/>
+                      <w:i w:val="0"/>
+                      <w:color w:val="000000"/>
+                      <w:sz w:val="24"/>
+                    </w:rPr>
+                    <w:t xml:space="preserve">tellus. Ut ultrices ultrices enim. Curabitur sit amet mauris. Morbi in dui quis est pulvinar </w:t>
+                  </w:r>
+                </w:p>
+              </w:txbxContent>
+            </v:textbox>
+          </v:shape>
+        </w:pict>
       </w:r>
       <w:r>
-        <w:br/>
+        <w:pict>
+          <v:shape id="DocuMindTextBox60" type="#_x0000_t202" stroked="f" filled="f" o:allowincell="f" style="position:absolute;margin-left:36.140pt;margin-top:397.228pt;width:545.326pt;height:15.424pt;z-index:251659264;mso-position-horizontal-relative:page;mso-position-vertical-relative:page;mso-wrap-style:none;">
+            <w10:wrap type="none"/>
+            <v:textbox inset="0,0,0,0">
+              <w:txbxContent>
+                <w:p>
+                  <w:pPr>
+                    <w:spacing w:before="0" w:after="0" w:lineRule="exact" w:line="288"/>
+                    <w:ind w:left="0" w:right="0" w:firstLine="0"/>
+                  </w:pPr>
+                  <w:r>
+                    <w:rPr>
+                      <w:rFonts w:ascii="Century Schoolbook" w:hAnsi="Century Schoolbook" w:eastAsia="Century Schoolbook" w:cs="Century Schoolbook"/>
+                      <w:b w:val="0"/>
+                      <w:i w:val="0"/>
+                      <w:color w:val="000000"/>
+                      <w:sz w:val="24"/>
+                    </w:rPr>
+                    <w:t xml:space="preserve">ullamcorper. Nulla facilisi. Integer lacinia sollicitudin massa. Cras metus. Sed aliquet risus a </w:t>
+                  </w:r>
+                </w:p>
+              </w:txbxContent>
+            </v:textbox>
+          </v:shape>
+        </w:pict>
       </w:r>
       <w:r>
-        <w:rPr>
-          <w:rFonts w:ascii="Century Schoolbook" w:hAnsi="Century Schoolbook" w:eastAsia="Century Schoolbook" w:cs="Century Schoolbook"/>
-          <w:b w:val="0"/>
-          <w:i w:val="0"/>
-          <w:color w:val="000000"/>
-          <w:sz w:val="24"/>
-          <w:fitText w:val="10867" w:id="51"/>
-        </w:rPr>
-        <w:t xml:space="preserve">Quisque cursus, metus vitae pharetra auctor, sem massa mattis sem, at interdum magna augue </w:t>
+        <w:pict>
+          <v:shape id="DocuMindTextBox61" type="#_x0000_t202" stroked="f" filled="f" o:allowincell="f" style="position:absolute;margin-left:36.140pt;margin-top:411.628pt;width:197.564pt;height:15.424pt;z-index:251659264;mso-position-horizontal-relative:page;mso-position-vertical-relative:page;mso-wrap-style:none;">
+            <w10:wrap type="none"/>
+            <v:textbox inset="0,0,0,0">
+              <w:txbxContent>
+                <w:p>
+                  <w:pPr>
+                    <w:spacing w:before="0" w:after="0" w:lineRule="exact" w:line="288"/>
+                    <w:ind w:left="0" w:right="0" w:firstLine="0"/>
+                  </w:pPr>
+                  <w:r>
+                    <w:rPr>
+                      <w:rFonts w:ascii="Century Schoolbook" w:hAnsi="Century Schoolbook" w:eastAsia="Century Schoolbook" w:cs="Century Schoolbook"/>
+                      <w:b w:val="0"/>
+                      <w:i w:val="0"/>
+                      <w:color w:val="000000"/>
+                      <w:sz w:val="24"/>
+                    </w:rPr>
+                    <w:t xml:space="preserve">tortor. Integer id quam. Morbi mi.  </w:t>
+                  </w:r>
+                </w:p>
+              </w:txbxContent>
+            </v:textbox>
+          </v:shape>
+        </w:pict>
       </w:r>
       <w:r>
-        <w:br/>
+        <w:pict>
+          <v:shape id="DocuMindTextBox62" type="#_x0000_t202" stroked="f" filled="f" o:allowincell="f" style="position:absolute;margin-left:36.140pt;margin-top:440.428pt;width:545.324pt;height:15.424pt;z-index:251659264;mso-position-horizontal-relative:page;mso-position-vertical-relative:page;mso-wrap-style:none;">
+            <w10:wrap type="none"/>
+            <v:textbox inset="0,0,0,0">
+              <w:txbxContent>
+                <w:p>
+                  <w:pPr>
+                    <w:spacing w:before="0" w:after="0" w:lineRule="exact" w:line="288"/>
+                    <w:ind w:left="0" w:right="0" w:firstLine="0"/>
+                  </w:pPr>
+                  <w:r>
+                    <w:rPr>
+                      <w:rFonts w:ascii="Century Schoolbook" w:hAnsi="Century Schoolbook" w:eastAsia="Century Schoolbook" w:cs="Century Schoolbook"/>
+                      <w:b w:val="0"/>
+                      <w:i w:val="0"/>
+                      <w:color w:val="000000"/>
+                      <w:sz w:val="24"/>
+                    </w:rPr>
+                    <w:t xml:space="preserve">Lorem ipsum dolor sit amet, consectetur adipiscing elit. Integer nec odio. Praesent libero. Sed </w:t>
+                  </w:r>
+                </w:p>
+              </w:txbxContent>
+            </v:textbox>
+          </v:shape>
+        </w:pict>
       </w:r>
       <w:r>
-        <w:rPr>
-          <w:rFonts w:ascii="Century Schoolbook" w:hAnsi="Century Schoolbook" w:eastAsia="Century Schoolbook" w:cs="Century Schoolbook"/>
-          <w:b w:val="0"/>
-          <w:i w:val="0"/>
-          <w:color w:val="000000"/>
-          <w:sz w:val="24"/>
-          <w:fitText w:val="10867" w:id="52"/>
-        </w:rPr>
-        <w:t xml:space="preserve">eget diam. Vestibulum ante ipsum primis in faucibus orci luctus et ultrices posuere cubilia Curae; </w:t>
+        <w:pict>
+          <v:shape id="DocuMindTextBox63" type="#_x0000_t202" stroked="f" filled="f" o:allowincell="f" style="position:absolute;margin-left:36.140pt;margin-top:454.828pt;width:545.326pt;height:15.424pt;z-index:251659264;mso-position-horizontal-relative:page;mso-position-vertical-relative:page;mso-wrap-style:none;">
+            <w10:wrap type="none"/>
+            <v:textbox inset="0,0,0,0">
+              <w:txbxContent>
+                <w:p>
+                  <w:pPr>
+                    <w:spacing w:before="0" w:after="0" w:lineRule="exact" w:line="288"/>
+                    <w:ind w:left="0" w:right="0" w:firstLine="0"/>
+                  </w:pPr>
+                  <w:r>
+                    <w:rPr>
+                      <w:rFonts w:ascii="Century Schoolbook" w:hAnsi="Century Schoolbook" w:eastAsia="Century Schoolbook" w:cs="Century Schoolbook"/>
+                      <w:b w:val="0"/>
+                      <w:i w:val="0"/>
+                      <w:color w:val="000000"/>
+                      <w:sz w:val="24"/>
+                    </w:rPr>
+                    <w:t xml:space="preserve">cursus ante dapibus diam. Sed nisi. Nulla quis sem at nibh elementum imperdiet. Duis sagittis </w:t>
+                  </w:r>
+                </w:p>
+              </w:txbxContent>
+            </v:textbox>
+          </v:shape>
+        </w:pict>
       </w:r>
       <w:r>
-        <w:br/>
+        <w:pict>
+          <v:shape id="DocuMindTextBox64" type="#_x0000_t202" stroked="f" filled="f" o:allowincell="f" style="position:absolute;margin-left:36.140pt;margin-top:469.228pt;width:545.331pt;height:15.424pt;z-index:251659264;mso-position-horizontal-relative:page;mso-position-vertical-relative:page;mso-wrap-style:none;">
+            <w10:wrap type="none"/>
+            <v:textbox inset="0,0,0,0">
+              <w:txbxContent>
+                <w:p>
+                  <w:pPr>
+                    <w:spacing w:before="0" w:after="0" w:lineRule="exact" w:line="288"/>
+                    <w:ind w:left="0" w:right="0" w:firstLine="0"/>
+                  </w:pPr>
+                  <w:r>
+                    <w:rPr>
+                      <w:rFonts w:ascii="Century Schoolbook" w:hAnsi="Century Schoolbook" w:eastAsia="Century Schoolbook" w:cs="Century Schoolbook"/>
+                      <w:b w:val="0"/>
+                      <w:i w:val="0"/>
+                      <w:color w:val="000000"/>
+                      <w:sz w:val="24"/>
+                    </w:rPr>
+                    <w:t xml:space="preserve">ipsum. Praesent mauris. Fusce nec tellus sed augue semper porta. Mauris massa. Vestibulum </w:t>
+                  </w:r>
+                </w:p>
+              </w:txbxContent>
+            </v:textbox>
+          </v:shape>
+        </w:pict>
       </w:r>
       <w:r>
-        <w:rPr>
-          <w:rFonts w:ascii="Century Schoolbook" w:hAnsi="Century Schoolbook" w:eastAsia="Century Schoolbook" w:cs="Century Schoolbook"/>
-          <w:b w:val="0"/>
-          <w:i w:val="0"/>
-          <w:color w:val="000000"/>
-          <w:sz w:val="24"/>
-          <w:fitText w:val="10867" w:id="53"/>
-        </w:rPr>
-        <w:t xml:space="preserve">Morbi lacinia molestie dui. Praesent blandit dolor. Sed non quam. In vel mi sit amet augue congue </w:t>
+        <w:pict>
+          <v:shape id="DocuMindTextBox65" type="#_x0000_t202" stroked="f" filled="f" o:allowincell="f" style="position:absolute;margin-left:36.140pt;margin-top:483.628pt;width:545.326pt;height:15.424pt;z-index:251659264;mso-position-horizontal-relative:page;mso-position-vertical-relative:page;mso-wrap-style:none;">
+            <w10:wrap type="none"/>
+            <v:textbox inset="0,0,0,0">
+              <w:txbxContent>
+                <w:p>
+                  <w:pPr>
+                    <w:spacing w:before="0" w:after="0" w:lineRule="exact" w:line="288"/>
+                    <w:ind w:left="0" w:right="0" w:firstLine="0"/>
+                  </w:pPr>
+                  <w:r>
+                    <w:rPr>
+                      <w:rFonts w:ascii="Century Schoolbook" w:hAnsi="Century Schoolbook" w:eastAsia="Century Schoolbook" w:cs="Century Schoolbook"/>
+                      <w:b w:val="0"/>
+                      <w:i w:val="0"/>
+                      <w:color w:val="000000"/>
+                      <w:sz w:val="24"/>
+                    </w:rPr>
+                    <w:t xml:space="preserve">lacinia arcu eget nulla. Class aptent taciti sociosqu ad litora torquent per conubia nostra, per </w:t>
+                  </w:r>
+                </w:p>
+              </w:txbxContent>
+            </v:textbox>
+          </v:shape>
+        </w:pict>
       </w:r>
       <w:r>
-        <w:br/>
+        <w:pict>
+          <v:shape id="DocuMindTextBox66" type="#_x0000_t202" stroked="f" filled="f" o:allowincell="f" style="position:absolute;margin-left:36.140pt;margin-top:498.028pt;width:310.914pt;height:15.424pt;z-index:251659264;mso-position-horizontal-relative:page;mso-position-vertical-relative:page;mso-wrap-style:none;">
+            <w10:wrap type="none"/>
+            <v:textbox inset="0,0,0,0">
+              <w:txbxContent>
+                <w:p>
+                  <w:pPr>
+                    <w:spacing w:before="0" w:after="0" w:lineRule="exact" w:line="288"/>
+                    <w:ind w:left="0" w:right="0" w:firstLine="0"/>
+                  </w:pPr>
+                  <w:r>
+                    <w:rPr>
+                      <w:rFonts w:ascii="Century Schoolbook" w:hAnsi="Century Schoolbook" w:eastAsia="Century Schoolbook" w:cs="Century Schoolbook"/>
+                      <w:b w:val="0"/>
+                      <w:i w:val="0"/>
+                      <w:color w:val="000000"/>
+                      <w:sz w:val="24"/>
+                    </w:rPr>
+                    <w:t xml:space="preserve">inceptos himenaeos. Curabitur sodales ligula in libero.  </w:t>
+                  </w:r>
+                </w:p>
+              </w:txbxContent>
+            </v:textbox>
+          </v:shape>
+        </w:pict>
       </w:r>
       <w:r>
-        <w:rPr>
-          <w:rFonts w:ascii="Century Schoolbook" w:hAnsi="Century Schoolbook" w:eastAsia="Century Schoolbook" w:cs="Century Schoolbook"/>
-          <w:b w:val="0"/>
-          <w:i w:val="0"/>
-          <w:color w:val="000000"/>
-          <w:sz w:val="24"/>
-          <w:fitText w:val="6587" w:id="54"/>
-        </w:rPr>
-        <w:t xml:space="preserve">elementum. Morbi in ipsum sit amet pede facilisis laoreet.  </w:t>
-      </w:r>
-    </w:p>
-    <w:p>
-      <w:pPr>
-        <w:spacing w:before="288" w:after="0" w:lineRule="exact" w:line="288"/>
-        <w:ind w:left="0" w:right="0" w:firstLine="0"/>
-        <w:jc w:val="left"/>
-      </w:pPr>
-      <w:r>
-        <w:rPr>
-          <w:rFonts w:ascii="Century Schoolbook" w:hAnsi="Century Schoolbook" w:eastAsia="Century Schoolbook" w:cs="Century Schoolbook"/>
-          <w:b w:val="0"/>
-          <w:i w:val="0"/>
-          <w:color w:val="000000"/>
-          <w:sz w:val="24"/>
-          <w:fitText w:val="10867" w:id="55"/>
-        </w:rPr>
-        <w:t xml:space="preserve">Donec lacus nunc, viverra nec, blandit vel, egestas et, augue. Vestibulum tincidunt malesuada </w:t>
+        <w:pict>
+          <v:shape id="DocuMindTextBox67" type="#_x0000_t202" stroked="f" filled="f" o:allowincell="f" style="position:absolute;margin-left:36.140pt;margin-top:527.068pt;width:545.334pt;height:15.424pt;z-index:251659264;mso-position-horizontal-relative:page;mso-position-vertical-relative:page;mso-wrap-style:none;">
+            <w10:wrap type="none"/>
+            <v:textbox inset="0,0,0,0">
+              <w:txbxContent>
+                <w:p>
+                  <w:pPr>
+                    <w:spacing w:before="0" w:after="0" w:lineRule="exact" w:line="288"/>
+                    <w:ind w:left="0" w:right="0" w:firstLine="0"/>
+                  </w:pPr>
+                  <w:r>
+                    <w:rPr>
+                      <w:rFonts w:ascii="Century Schoolbook" w:hAnsi="Century Schoolbook" w:eastAsia="Century Schoolbook" w:cs="Century Schoolbook"/>
+                      <w:b w:val="0"/>
+                      <w:i w:val="0"/>
+                      <w:color w:val="000000"/>
+                      <w:sz w:val="24"/>
+                    </w:rPr>
+                    <w:t xml:space="preserve">Sed dignissim lacinia nunc. Curabitur tortor. Pellentesque nibh. Aenean quam. In scelerisque sem </w:t>
+                  </w:r>
+                </w:p>
+              </w:txbxContent>
+            </v:textbox>
+          </v:shape>
+        </w:pict>
       </w:r>
       <w:r>
-        <w:br/>
+        <w:pict>
+          <v:shape id="DocuMindTextBox68" type="#_x0000_t202" stroked="f" filled="f" o:allowincell="f" style="position:absolute;margin-left:36.140pt;margin-top:541.468pt;width:545.330pt;height:15.424pt;z-index:251659264;mso-position-horizontal-relative:page;mso-position-vertical-relative:page;mso-wrap-style:none;">
+            <w10:wrap type="none"/>
+            <v:textbox inset="0,0,0,0">
+              <w:txbxContent>
+                <w:p>
+                  <w:pPr>
+                    <w:spacing w:before="0" w:after="0" w:lineRule="exact" w:line="288"/>
+                    <w:ind w:left="0" w:right="0" w:firstLine="0"/>
+                  </w:pPr>
+                  <w:r>
+                    <w:rPr>
+                      <w:rFonts w:ascii="Century Schoolbook" w:hAnsi="Century Schoolbook" w:eastAsia="Century Schoolbook" w:cs="Century Schoolbook"/>
+                      <w:b w:val="0"/>
+                      <w:i w:val="0"/>
+                      <w:color w:val="000000"/>
+                      <w:sz w:val="24"/>
+                    </w:rPr>
+                    <w:t xml:space="preserve">at dolor. Maecenas mattis. Sed convallis tristique sem. Proin ut ligula vel nunc egestas porttitor. </w:t>
+                  </w:r>
+                </w:p>
+              </w:txbxContent>
+            </v:textbox>
+          </v:shape>
+        </w:pict>
       </w:r>
       <w:r>
-        <w:rPr>
-          <w:rFonts w:ascii="Century Schoolbook" w:hAnsi="Century Schoolbook" w:eastAsia="Century Schoolbook" w:cs="Century Schoolbook"/>
-          <w:b w:val="0"/>
-          <w:i w:val="0"/>
-          <w:color w:val="000000"/>
-          <w:sz w:val="24"/>
-          <w:fitText w:val="10867" w:id="56"/>
-        </w:rPr>
-        <w:t xml:space="preserve">tellus. Ut ultrices ultrices enim. Curabitur sit amet mauris. Morbi in dui quis est pulvinar </w:t>
+        <w:pict>
+          <v:shape id="DocuMindTextBox69" type="#_x0000_t202" stroked="f" filled="f" o:allowincell="f" style="position:absolute;margin-left:36.140pt;margin-top:555.868pt;width:545.317pt;height:15.424pt;z-index:251659264;mso-position-horizontal-relative:page;mso-position-vertical-relative:page;mso-wrap-style:none;">
+            <w10:wrap type="none"/>
+            <v:textbox inset="0,0,0,0">
+              <w:txbxContent>
+                <w:p>
+                  <w:pPr>
+                    <w:spacing w:before="0" w:after="0" w:lineRule="exact" w:line="288"/>
+                    <w:ind w:left="0" w:right="0" w:firstLine="0"/>
+                  </w:pPr>
+                  <w:r>
+                    <w:rPr>
+                      <w:rFonts w:ascii="Century Schoolbook" w:hAnsi="Century Schoolbook" w:eastAsia="Century Schoolbook" w:cs="Century Schoolbook"/>
+                      <w:b w:val="0"/>
+                      <w:i w:val="0"/>
+                      <w:color w:val="000000"/>
+                      <w:sz w:val="24"/>
+                    </w:rPr>
+                    <w:t xml:space="preserve">Morbi lectus risus, iaculis vel, suscipit quis, luctus non, massa. Fusce ac turpis quis ligula lacinia </w:t>
+                  </w:r>
+                </w:p>
+              </w:txbxContent>
+            </v:textbox>
+          </v:shape>
+        </w:pict>
       </w:r>
       <w:r>
-        <w:br/>
+        <w:pict>
+          <v:shape id="DocuMindTextBox70" type="#_x0000_t202" stroked="f" filled="f" o:allowincell="f" style="position:absolute;margin-left:36.140pt;margin-top:570.268pt;width:520.252pt;height:15.424pt;z-index:251659264;mso-position-horizontal-relative:page;mso-position-vertical-relative:page;mso-wrap-style:none;">
+            <w10:wrap type="none"/>
+            <v:textbox inset="0,0,0,0">
+              <w:txbxContent>
+                <w:p>
+                  <w:pPr>
+                    <w:spacing w:before="0" w:after="0" w:lineRule="exact" w:line="288"/>
+                    <w:ind w:left="0" w:right="0" w:firstLine="0"/>
+                  </w:pPr>
+                  <w:r>
+                    <w:rPr>
+                      <w:rFonts w:ascii="Century Schoolbook" w:hAnsi="Century Schoolbook" w:eastAsia="Century Schoolbook" w:cs="Century Schoolbook"/>
+                      <w:b w:val="0"/>
+                      <w:i w:val="0"/>
+                      <w:color w:val="000000"/>
+                      <w:sz w:val="24"/>
+                    </w:rPr>
+                    <w:t xml:space="preserve">aliquet. Mauris ipsum. Nulla metus metus, ullamcorper vel, tincidunt sed, euismod in, nibh.  </w:t>
+                  </w:r>
+                </w:p>
+              </w:txbxContent>
+            </v:textbox>
+          </v:shape>
+        </w:pict>
       </w:r>
       <w:r>
-        <w:rPr>
-          <w:rFonts w:ascii="Century Schoolbook" w:hAnsi="Century Schoolbook" w:eastAsia="Century Schoolbook" w:cs="Century Schoolbook"/>
-          <w:b w:val="0"/>
-          <w:i w:val="0"/>
-          <w:color w:val="000000"/>
-          <w:sz w:val="24"/>
-          <w:fitText w:val="10867" w:id="57"/>
-        </w:rPr>
-        <w:t xml:space="preserve">ullamcorper. Nulla facilisi. Integer lacinia sollicitudin massa. Cras metus. Sed aliquet risus a </w:t>
+        <w:pict>
+          <v:shape id="DocuMindTextBox71" type="#_x0000_t202" stroked="f" filled="f" o:allowincell="f" style="position:absolute;margin-left:36.140pt;margin-top:599.068pt;width:545.330pt;height:15.424pt;z-index:251659264;mso-position-horizontal-relative:page;mso-position-vertical-relative:page;mso-wrap-style:none;">
+            <w10:wrap type="none"/>
+            <v:textbox inset="0,0,0,0">
+              <w:txbxContent>
+                <w:p>
+                  <w:pPr>
+                    <w:spacing w:before="0" w:after="0" w:lineRule="exact" w:line="288"/>
+                    <w:ind w:left="0" w:right="0" w:firstLine="0"/>
+                  </w:pPr>
+                  <w:r>
+                    <w:rPr>
+                      <w:rFonts w:ascii="Century Schoolbook" w:hAnsi="Century Schoolbook" w:eastAsia="Century Schoolbook" w:cs="Century Schoolbook"/>
+                      <w:b w:val="0"/>
+                      <w:i w:val="0"/>
+                      <w:color w:val="000000"/>
+                      <w:sz w:val="24"/>
+                    </w:rPr>
+                    <w:t xml:space="preserve">Quisque volutpat condimentum velit. Class aptent taciti sociosqu ad litora torquent per conubia </w:t>
+                  </w:r>
+                </w:p>
+              </w:txbxContent>
+            </v:textbox>
+          </v:shape>
+        </w:pict>
       </w:r>
       <w:r>
-        <w:br/>
+        <w:pict>
+          <v:shape id="DocuMindTextBox72" type="#_x0000_t202" stroked="f" filled="f" o:allowincell="f" style="position:absolute;margin-left:36.140pt;margin-top:613.468pt;width:545.335pt;height:15.424pt;z-index:251659264;mso-position-horizontal-relative:page;mso-position-vertical-relative:page;mso-wrap-style:none;">
+            <w10:wrap type="none"/>
+            <v:textbox inset="0,0,0,0">
+              <w:txbxContent>
+                <w:p>
+                  <w:pPr>
+                    <w:spacing w:before="0" w:after="0" w:lineRule="exact" w:line="288"/>
+                    <w:ind w:left="0" w:right="0" w:firstLine="0"/>
+                  </w:pPr>
+                  <w:r>
+                    <w:rPr>
+                      <w:rFonts w:ascii="Century Schoolbook" w:hAnsi="Century Schoolbook" w:eastAsia="Century Schoolbook" w:cs="Century Schoolbook"/>
+                      <w:b w:val="0"/>
+                      <w:i w:val="0"/>
+                      <w:color w:val="000000"/>
+                      <w:sz w:val="24"/>
+                    </w:rPr>
+                    <w:t xml:space="preserve">nostra, per inceptos himenaeos. Nam nec ante. Sed lacinia, urna non tincidunt mattis, tortor neque </w:t>
+                  </w:r>
+                </w:p>
+              </w:txbxContent>
+            </v:textbox>
+          </v:shape>
+        </w:pict>
       </w:r>
       <w:r>
-        <w:rPr>
-          <w:rFonts w:ascii="Century Schoolbook" w:hAnsi="Century Schoolbook" w:eastAsia="Century Schoolbook" w:cs="Century Schoolbook"/>
-          <w:b w:val="0"/>
-          <w:i w:val="0"/>
-          <w:color w:val="000000"/>
-          <w:sz w:val="24"/>
-          <w:fitText w:val="3911" w:id="58"/>
-        </w:rPr>
-        <w:t xml:space="preserve">tortor. Integer id quam. Morbi mi.  </w:t>
-      </w:r>
-    </w:p>
-    <w:p>
-      <w:pPr>
-        <w:spacing w:before="288" w:after="0" w:lineRule="exact" w:line="288"/>
-        <w:ind w:left="0" w:right="0" w:firstLine="0"/>
-        <w:jc w:val="left"/>
-      </w:pPr>
-      <w:r>
-        <w:rPr>
-          <w:rFonts w:ascii="Century Schoolbook" w:hAnsi="Century Schoolbook" w:eastAsia="Century Schoolbook" w:cs="Century Schoolbook"/>
-          <w:b w:val="0"/>
-          <w:i w:val="0"/>
-          <w:color w:val="000000"/>
-          <w:sz w:val="24"/>
-          <w:fitText w:val="10866" w:id="59"/>
-        </w:rPr>
-        <w:t xml:space="preserve">Lorem ipsum dolor sit amet, consectetur adipiscing elit. Integer nec odio. Praesent libero. Sed </w:t>
+        <w:pict>
+          <v:shape id="DocuMindTextBox73" type="#_x0000_t202" stroked="f" filled="f" o:allowincell="f" style="position:absolute;margin-left:36.140pt;margin-top:627.868pt;width:545.318pt;height:15.424pt;z-index:251659264;mso-position-horizontal-relative:page;mso-position-vertical-relative:page;mso-wrap-style:none;">
+            <w10:wrap type="none"/>
+            <v:textbox inset="0,0,0,0">
+              <w:txbxContent>
+                <w:p>
+                  <w:pPr>
+                    <w:spacing w:before="0" w:after="0" w:lineRule="exact" w:line="288"/>
+                    <w:ind w:left="0" w:right="0" w:firstLine="0"/>
+                  </w:pPr>
+                  <w:r>
+                    <w:rPr>
+                      <w:rFonts w:ascii="Century Schoolbook" w:hAnsi="Century Schoolbook" w:eastAsia="Century Schoolbook" w:cs="Century Schoolbook"/>
+                      <w:b w:val="0"/>
+                      <w:i w:val="0"/>
+                      <w:color w:val="000000"/>
+                      <w:sz w:val="24"/>
+                    </w:rPr>
+                    <w:t xml:space="preserve">adipiscing diam, a cursus ipsum ante quis turpis. Nulla facilisi. Ut fringilla. Suspendisse potenti. </w:t>
+                  </w:r>
+                </w:p>
+              </w:txbxContent>
+            </v:textbox>
+          </v:shape>
+        </w:pict>
       </w:r>
       <w:r>
-        <w:br/>
+        <w:pict>
+          <v:shape id="DocuMindTextBox74" type="#_x0000_t202" stroked="f" filled="f" o:allowincell="f" style="position:absolute;margin-left:36.140pt;margin-top:642.508pt;width:531.168pt;height:15.424pt;z-index:251659264;mso-position-horizontal-relative:page;mso-position-vertical-relative:page;mso-wrap-style:none;">
+            <w10:wrap type="none"/>
+            <v:textbox inset="0,0,0,0">
+              <w:txbxContent>
+                <w:p>
+                  <w:pPr>
+                    <w:spacing w:before="0" w:after="0" w:lineRule="exact" w:line="288"/>
+                    <w:ind w:left="0" w:right="0" w:firstLine="0"/>
+                  </w:pPr>
+                  <w:r>
+                    <w:rPr>
+                      <w:rFonts w:ascii="Century Schoolbook" w:hAnsi="Century Schoolbook" w:eastAsia="Century Schoolbook" w:cs="Century Schoolbook"/>
+                      <w:b w:val="0"/>
+                      <w:i w:val="0"/>
+                      <w:color w:val="000000"/>
+                      <w:sz w:val="24"/>
+                    </w:rPr>
+                    <w:t xml:space="preserve">Nunc feugiat mi a tellus consequat imperdiet. Vestibulum sapien. Proin quam. Etiam ultrices.  </w:t>
+                  </w:r>
+                </w:p>
+              </w:txbxContent>
+            </v:textbox>
+          </v:shape>
+        </w:pict>
       </w:r>
       <w:r>
-        <w:rPr>
-          <w:rFonts w:ascii="Century Schoolbook" w:hAnsi="Century Schoolbook" w:eastAsia="Century Schoolbook" w:cs="Century Schoolbook"/>
-          <w:b w:val="0"/>
-          <w:i w:val="0"/>
-          <w:color w:val="000000"/>
-          <w:sz w:val="24"/>
-          <w:fitText w:val="10867" w:id="60"/>
-        </w:rPr>
-        <w:t xml:space="preserve">cursus ante dapibus diam. Sed nisi. Nulla quis sem at nibh elementum imperdiet. Duis sagittis </w:t>
+        <w:pict>
+          <v:shape id="DocuMindTextBox75" type="#_x0000_t202" stroked="f" filled="f" o:allowincell="f" style="position:absolute;margin-left:36.140pt;margin-top:671.308pt;width:545.324pt;height:15.424pt;z-index:251659264;mso-position-horizontal-relative:page;mso-position-vertical-relative:page;mso-wrap-style:none;">
+            <w10:wrap type="none"/>
+            <v:textbox inset="0,0,0,0">
+              <w:txbxContent>
+                <w:p>
+                  <w:pPr>
+                    <w:spacing w:before="0" w:after="0" w:lineRule="exact" w:line="288"/>
+                    <w:ind w:left="0" w:right="0" w:firstLine="0"/>
+                  </w:pPr>
+                  <w:r>
+                    <w:rPr>
+                      <w:rFonts w:ascii="Century Schoolbook" w:hAnsi="Century Schoolbook" w:eastAsia="Century Schoolbook" w:cs="Century Schoolbook"/>
+                      <w:b w:val="0"/>
+                      <w:i w:val="0"/>
+                      <w:color w:val="000000"/>
+                      <w:sz w:val="24"/>
+                    </w:rPr>
+                    <w:t xml:space="preserve">Suspendisse in justo eu magna luctus suscipit. Sed lectus. Integer euismod lacus luctus magna. </w:t>
+                  </w:r>
+                </w:p>
+              </w:txbxContent>
+            </v:textbox>
+          </v:shape>
+        </w:pict>
       </w:r>
       <w:r>
-        <w:br/>
+        <w:pict>
+          <v:shape id="DocuMindTextBox76" type="#_x0000_t202" stroked="f" filled="f" o:allowincell="f" style="position:absolute;margin-left:36.140pt;margin-top:685.708pt;width:545.337pt;height:15.424pt;z-index:251659264;mso-position-horizontal-relative:page;mso-position-vertical-relative:page;mso-wrap-style:none;">
+            <w10:wrap type="none"/>
+            <v:textbox inset="0,0,0,0">
+              <w:txbxContent>
+                <w:p>
+                  <w:pPr>
+                    <w:spacing w:before="0" w:after="0" w:lineRule="exact" w:line="288"/>
+                    <w:ind w:left="0" w:right="0" w:firstLine="0"/>
+                  </w:pPr>
+                  <w:r>
+                    <w:rPr>
+                      <w:rFonts w:ascii="Century Schoolbook" w:hAnsi="Century Schoolbook" w:eastAsia="Century Schoolbook" w:cs="Century Schoolbook"/>
+                      <w:b w:val="0"/>
+                      <w:i w:val="0"/>
+                      <w:color w:val="000000"/>
+                      <w:sz w:val="24"/>
+                    </w:rPr>
+                    <w:t xml:space="preserve">Quisque cursus, metus vitae pharetra auctor, sem massa mattis sem, at interdum magna augue </w:t>
+                  </w:r>
+                </w:p>
+              </w:txbxContent>
+            </v:textbox>
+          </v:shape>
+        </w:pict>
       </w:r>
       <w:r>
-        <w:rPr>
-          <w:rFonts w:ascii="Century Schoolbook" w:hAnsi="Century Schoolbook" w:eastAsia="Century Schoolbook" w:cs="Century Schoolbook"/>
-          <w:b w:val="0"/>
-          <w:i w:val="0"/>
-          <w:color w:val="000000"/>
-          <w:sz w:val="24"/>
-          <w:fitText w:val="10867" w:id="61"/>
-        </w:rPr>
-        <w:t xml:space="preserve">ipsum. Praesent mauris. Fusce nec tellus sed augue semper porta. Mauris massa. Vestibulum </w:t>
+        <w:pict>
+          <v:shape id="DocuMindTextBox77" type="#_x0000_t202" stroked="f" filled="f" o:allowincell="f" style="position:absolute;margin-left:36.140pt;margin-top:700.108pt;width:545.325pt;height:15.424pt;z-index:251659264;mso-position-horizontal-relative:page;mso-position-vertical-relative:page;mso-wrap-style:none;">
+            <w10:wrap type="none"/>
+            <v:textbox inset="0,0,0,0">
+              <w:txbxContent>
+                <w:p>
+                  <w:pPr>
+                    <w:spacing w:before="0" w:after="0" w:lineRule="exact" w:line="288"/>
+                    <w:ind w:left="0" w:right="0" w:firstLine="0"/>
+                  </w:pPr>
+                  <w:r>
+                    <w:rPr>
+                      <w:rFonts w:ascii="Century Schoolbook" w:hAnsi="Century Schoolbook" w:eastAsia="Century Schoolbook" w:cs="Century Schoolbook"/>
+                      <w:b w:val="0"/>
+                      <w:i w:val="0"/>
+                      <w:color w:val="000000"/>
+                      <w:sz w:val="24"/>
+                    </w:rPr>
+                    <w:t xml:space="preserve">eget diam. Vestibulum ante ipsum primis in faucibus orci luctus et ultrices posuere cubilia Curae; </w:t>
+                  </w:r>
+                </w:p>
+              </w:txbxContent>
+            </v:textbox>
+          </v:shape>
+        </w:pict>
       </w:r>
       <w:r>
-        <w:br/>
-      </w:r>
-      <w:r>
-        <w:rPr>
-          <w:rFonts w:ascii="Century Schoolbook" w:hAnsi="Century Schoolbook" w:eastAsia="Century Schoolbook" w:cs="Century Schoolbook"/>
-          <w:b w:val="0"/>
-          <w:i w:val="0"/>
-          <w:color w:val="000000"/>
-          <w:sz w:val="24"/>
-          <w:fitText w:val="10867" w:id="62"/>
-        </w:rPr>
-        <w:t xml:space="preserve">lacinia arcu eget nulla. Class aptent taciti sociosqu ad litora torquent per conubia nostra, per </w:t>
-      </w:r>
-      <w:r>
-        <w:br/>
-      </w:r>
-      <w:r>
-        <w:rPr>
-          <w:rFonts w:ascii="Century Schoolbook" w:hAnsi="Century Schoolbook" w:eastAsia="Century Schoolbook" w:cs="Century Schoolbook"/>
-          <w:b w:val="0"/>
-          <w:i w:val="0"/>
-          <w:color w:val="000000"/>
-          <w:sz w:val="24"/>
-          <w:fitText w:val="6178" w:id="63"/>
-        </w:rPr>
-        <w:t xml:space="preserve">inceptos himenaeos. Curabitur sodales ligula in libero.  </w:t>
-      </w:r>
-    </w:p>
-    <w:p>
-      <w:pPr>
-        <w:spacing w:before="292" w:after="0" w:lineRule="exact" w:line="288"/>
-        <w:ind w:left="0" w:right="0" w:firstLine="0"/>
-        <w:jc w:val="left"/>
-      </w:pPr>
-      <w:r>
-        <w:rPr>
-          <w:rFonts w:ascii="Century Schoolbook" w:hAnsi="Century Schoolbook" w:eastAsia="Century Schoolbook" w:cs="Century Schoolbook"/>
-          <w:b w:val="0"/>
-          <w:i w:val="0"/>
-          <w:color w:val="000000"/>
-          <w:sz w:val="24"/>
-          <w:fitText w:val="10867" w:id="64"/>
-        </w:rPr>
-        <w:t xml:space="preserve">Sed dignissim lacinia nunc. Curabitur tortor. Pellentesque nibh. Aenean quam. In scelerisque sem </w:t>
-      </w:r>
-      <w:r>
-        <w:br/>
-      </w:r>
-      <w:r>
-        <w:rPr>
-          <w:rFonts w:ascii="Century Schoolbook" w:hAnsi="Century Schoolbook" w:eastAsia="Century Schoolbook" w:cs="Century Schoolbook"/>
-          <w:b w:val="0"/>
-          <w:i w:val="0"/>
-          <w:color w:val="000000"/>
-          <w:sz w:val="24"/>
-          <w:fitText w:val="10867" w:id="65"/>
-        </w:rPr>
-        <w:t xml:space="preserve">at dolor. Maecenas mattis. Sed convallis tristique sem. Proin ut ligula vel nunc egestas porttitor. </w:t>
-      </w:r>
-      <w:r>
-        <w:br/>
-      </w:r>
-      <w:r>
-        <w:rPr>
-          <w:rFonts w:ascii="Century Schoolbook" w:hAnsi="Century Schoolbook" w:eastAsia="Century Schoolbook" w:cs="Century Schoolbook"/>
-          <w:b w:val="0"/>
-          <w:i w:val="0"/>
-          <w:color w:val="000000"/>
-          <w:sz w:val="24"/>
-          <w:fitText w:val="10866" w:id="66"/>
-        </w:rPr>
-        <w:t xml:space="preserve">Morbi lectus risus, iaculis vel, suscipit quis, luctus non, massa. Fusce ac turpis quis ligula lacinia </w:t>
-      </w:r>
-      <w:r>
-        <w:br/>
-      </w:r>
-      <w:r>
-        <w:rPr>
-          <w:rFonts w:ascii="Century Schoolbook" w:hAnsi="Century Schoolbook" w:eastAsia="Century Schoolbook" w:cs="Century Schoolbook"/>
-          <w:b w:val="0"/>
-          <w:i w:val="0"/>
-          <w:color w:val="000000"/>
-          <w:sz w:val="24"/>
-          <w:fitText w:val="10365" w:id="67"/>
-        </w:rPr>
-        <w:t xml:space="preserve">aliquet. Mauris ipsum. Nulla metus metus, ullamcorper vel, tincidunt sed, euismod in, nibh.  </w:t>
-      </w:r>
-    </w:p>
-    <w:p>
-      <w:pPr>
-        <w:spacing w:before="288" w:after="0" w:lineRule="exact" w:line="288"/>
-        <w:ind w:left="0" w:right="0" w:firstLine="0"/>
-        <w:jc w:val="left"/>
-      </w:pPr>
-      <w:r>
-        <w:rPr>
-          <w:rFonts w:ascii="Century Schoolbook" w:hAnsi="Century Schoolbook" w:eastAsia="Century Schoolbook" w:cs="Century Schoolbook"/>
-          <w:b w:val="0"/>
-          <w:i w:val="0"/>
-          <w:color w:val="000000"/>
-          <w:sz w:val="24"/>
-          <w:fitText w:val="10867" w:id="68"/>
-        </w:rPr>
-        <w:t xml:space="preserve">Quisque volutpat condimentum velit. Class aptent taciti sociosqu ad litora torquent per conubia </w:t>
-      </w:r>
-      <w:r>
-        <w:br/>
-      </w:r>
-      <w:r>
-        <w:rPr>
-          <w:rFonts w:ascii="Century Schoolbook" w:hAnsi="Century Schoolbook" w:eastAsia="Century Schoolbook" w:cs="Century Schoolbook"/>
-          <w:b w:val="0"/>
-          <w:i w:val="0"/>
-          <w:color w:val="000000"/>
-          <w:sz w:val="24"/>
-          <w:fitText w:val="10867" w:id="69"/>
-        </w:rPr>
-        <w:t xml:space="preserve">nostra, per inceptos himenaeos. Nam nec ante. Sed lacinia, urna non tincidunt mattis, tortor neque </w:t>
-      </w:r>
-      <w:r>
-        <w:br/>
-      </w:r>
-      <w:r>
-        <w:rPr>
-          <w:rFonts w:ascii="Century Schoolbook" w:hAnsi="Century Schoolbook" w:eastAsia="Century Schoolbook" w:cs="Century Schoolbook"/>
-          <w:b w:val="0"/>
-          <w:i w:val="0"/>
-          <w:color w:val="000000"/>
-          <w:sz w:val="24"/>
-          <w:fitText w:val="10866" w:id="70"/>
-        </w:rPr>
-        <w:t xml:space="preserve">adipiscing diam, a cursus ipsum ante quis turpis. Nulla facilisi. Ut fringilla. Suspendisse potenti. </w:t>
-      </w:r>
-      <w:r>
-        <w:br/>
-      </w:r>
-      <w:r>
-        <w:rPr>
-          <w:rFonts w:ascii="Century Schoolbook" w:hAnsi="Century Schoolbook" w:eastAsia="Century Schoolbook" w:cs="Century Schoolbook"/>
-          <w:b w:val="0"/>
-          <w:i w:val="0"/>
-          <w:color w:val="000000"/>
-          <w:sz w:val="24"/>
-          <w:fitText w:val="10583" w:id="71"/>
-        </w:rPr>
-        <w:t xml:space="preserve">Nunc feugiat mi a tellus consequat imperdiet. Vestibulum sapien. Proin quam. Etiam ultrices.  </w:t>
-      </w:r>
-    </w:p>
-    <w:p>
-      <w:pPr>
-        <w:spacing w:before="288" w:after="0" w:lineRule="exact" w:line="288"/>
-        <w:ind w:left="0" w:right="0" w:firstLine="0"/>
-        <w:jc w:val="left"/>
-      </w:pPr>
-      <w:r>
-        <w:rPr>
-          <w:rFonts w:ascii="Century Schoolbook" w:hAnsi="Century Schoolbook" w:eastAsia="Century Schoolbook" w:cs="Century Schoolbook"/>
-          <w:b w:val="0"/>
-          <w:i w:val="0"/>
-          <w:color w:val="000000"/>
-          <w:sz w:val="24"/>
-          <w:fitText w:val="10866" w:id="72"/>
-        </w:rPr>
-        <w:t xml:space="preserve">Suspendisse in justo eu magna luctus suscipit. Sed lectus. Integer euismod lacus luctus magna. </w:t>
-      </w:r>
-      <w:r>
-        <w:br/>
-      </w:r>
-      <w:r>
-        <w:rPr>
-          <w:rFonts w:ascii="Century Schoolbook" w:hAnsi="Century Schoolbook" w:eastAsia="Century Schoolbook" w:cs="Century Schoolbook"/>
-          <w:b w:val="0"/>
-          <w:i w:val="0"/>
-          <w:color w:val="000000"/>
-          <w:sz w:val="24"/>
-          <w:fitText w:val="10867" w:id="73"/>
-        </w:rPr>
-        <w:t xml:space="preserve">Quisque cursus, metus vitae pharetra auctor, sem massa mattis sem, at interdum magna augue </w:t>
-      </w:r>
-      <w:r>
-        <w:br/>
-      </w:r>
-      <w:r>
-        <w:rPr>
-          <w:rFonts w:ascii="Century Schoolbook" w:hAnsi="Century Schoolbook" w:eastAsia="Century Schoolbook" w:cs="Century Schoolbook"/>
-          <w:b w:val="0"/>
-          <w:i w:val="0"/>
-          <w:color w:val="000000"/>
-          <w:sz w:val="24"/>
-          <w:fitText w:val="10867" w:id="74"/>
-        </w:rPr>
-        <w:t xml:space="preserve">eget diam. Vestibulum ante ipsum primis in faucibus orci luctus et ultrices posuere cubilia Curae; </w:t>
-      </w:r>
-      <w:r>
-        <w:br/>
-      </w:r>
-      <w:r>
-        <w:rPr>
-          <w:rFonts w:ascii="Century Schoolbook" w:hAnsi="Century Schoolbook" w:eastAsia="Century Schoolbook" w:cs="Century Schoolbook"/>
-          <w:b w:val="0"/>
-          <w:i w:val="0"/>
-          <w:color w:val="000000"/>
-          <w:sz w:val="24"/>
-          <w:fitText w:val="10867" w:id="75"/>
-        </w:rPr>
-        <w:t xml:space="preserve">Morbi lacinia molestie dui. Praesent blandit dolor. Sed non quam. In vel mi sit amet augue congue </w:t>
+        <w:pict>
+          <v:shape id="DocuMindTextBox78" type="#_x0000_t202" stroked="f" filled="f" o:allowincell="f" style="position:absolute;margin-left:36.140pt;margin-top:714.508pt;width:545.331pt;height:15.424pt;z-index:251659264;mso-position-horizontal-relative:page;mso-position-vertical-relative:page;mso-wrap-style:none;">
+            <w10:wrap type="none"/>
+            <v:textbox inset="0,0,0,0">
+              <w:txbxContent>
+                <w:p>
+                  <w:pPr>
+                    <w:spacing w:before="0" w:after="0" w:lineRule="exact" w:line="288"/>
+                    <w:ind w:left="0" w:right="0" w:firstLine="0"/>
+                  </w:pPr>
+                  <w:r>
+                    <w:rPr>
+                      <w:rFonts w:ascii="Century Schoolbook" w:hAnsi="Century Schoolbook" w:eastAsia="Century Schoolbook" w:cs="Century Schoolbook"/>
+                      <w:b w:val="0"/>
+                      <w:i w:val="0"/>
+                      <w:color w:val="000000"/>
+                      <w:sz w:val="24"/>
+                    </w:rPr>
+                    <w:t xml:space="preserve">Morbi lacinia molestie dui. Praesent blandit dolor. Sed non quam. In vel mi sit amet augue congue </w:t>
+                  </w:r>
+                </w:p>
+              </w:txbxContent>
+            </v:textbox>
+          </v:shape>
+        </w:pict>
       </w:r>
     </w:p>
     <w:p>
       <w:pPr>
         <w:sectPr>
           <w:pgSz w:w="12240" w:h="15840"/>
-          <w:pgMar w:top="730" w:right="650" w:bottom="1261" w:left="723" w:header="720" w:footer="720" w:gutter="0"/>
+          <w:pgMar w:top="0" w:right="0" w:bottom="0" w:left="0" w:header="0" w:footer="0" w:gutter="0"/>
           <w:cols w:space="720"/>
           <w:docGrid w:linePitch="360"/>
         </w:sectPr>
@@ -1168,451 +2150,854 @@
     </w:p>
     <w:p>
       <w:pPr>
-        <w:spacing w:before="0" w:after="0" w:lineRule="exact" w:line="288"/>
-        <w:ind w:left="0" w:right="0" w:firstLine="0"/>
-        <w:jc w:val="left"/>
+        <w:spacing w:before="0" w:after="0" w:lineRule="exact" w:line="20"/>
       </w:pPr>
       <w:r>
         <w:rPr>
-          <w:rFonts w:ascii="Century Schoolbook" w:hAnsi="Century Schoolbook" w:eastAsia="Century Schoolbook" w:cs="Century Schoolbook"/>
-          <w:b w:val="0"/>
-          <w:i w:val="0"/>
-          <w:color w:val="000000"/>
-          <w:sz w:val="24"/>
-          <w:fitText w:val="10867" w:id="76"/>
+          <w:sz w:val="2"/>
         </w:rPr>
-        <w:t xml:space="preserve">elementum. Morbi in ipsum sit amet pede facilisis laoreet. Donec lacus nunc, viverra nec, blandit </w:t>
       </w:r>
       <w:r>
-        <w:br/>
+        <w:pict>
+          <v:shape id="DocuMindTextBox79" type="#_x0000_t202" stroked="f" filled="f" o:allowincell="f" style="position:absolute;margin-left:303.020pt;margin-top:742.036pt;width:10.794pt;height:15.652pt;z-index:251659264;mso-position-horizontal-relative:page;mso-position-vertical-relative:page;mso-wrap-style:none;">
+            <w10:wrap type="none"/>
+            <v:textbox inset="0,0,0,0">
+              <w:txbxContent>
+                <w:p>
+                  <w:pPr>
+                    <w:spacing w:before="0" w:after="0" w:lineRule="exact" w:line="293"/>
+                    <w:ind w:left="0" w:right="0" w:firstLine="0"/>
+                  </w:pPr>
+                  <w:r>
+                    <w:rPr>
+                      <w:rFonts w:ascii="Calibri" w:hAnsi="Calibri" w:eastAsia="Calibri" w:cs="Calibri"/>
+                      <w:b w:val="0"/>
+                      <w:i w:val="0"/>
+                      <w:color w:val="000000"/>
+                      <w:sz w:val="24"/>
+                    </w:rPr>
+                    <w:t xml:space="preserve">3 </w:t>
+                  </w:r>
+                </w:p>
+              </w:txbxContent>
+            </v:textbox>
+          </v:shape>
+        </w:pict>
       </w:r>
       <w:r>
-        <w:rPr>
-          <w:rFonts w:ascii="Century Schoolbook" w:hAnsi="Century Schoolbook" w:eastAsia="Century Schoolbook" w:cs="Century Schoolbook"/>
-          <w:b w:val="0"/>
-          <w:i w:val="0"/>
-          <w:color w:val="000000"/>
-          <w:sz w:val="24"/>
-          <w:fitText w:val="10867" w:id="77"/>
-        </w:rPr>
-        <w:t xml:space="preserve">vel, egestas et, augue. Vestibulum tincidunt malesuada tellus. Ut ultrices ultrices enim. Curabitur </w:t>
+        <w:pict>
+          <v:shape id="DocuMindTextBox80" type="#_x0000_t202" stroked="f" filled="f" o:allowincell="f" style="position:absolute;margin-left:36.140pt;margin-top:36.508pt;width:545.329pt;height:15.424pt;z-index:251659264;mso-position-horizontal-relative:page;mso-position-vertical-relative:page;mso-wrap-style:none;">
+            <w10:wrap type="none"/>
+            <v:textbox inset="0,0,0,0">
+              <w:txbxContent>
+                <w:p>
+                  <w:pPr>
+                    <w:spacing w:before="0" w:after="0" w:lineRule="exact" w:line="288"/>
+                    <w:ind w:left="0" w:right="0" w:firstLine="0"/>
+                  </w:pPr>
+                  <w:r>
+                    <w:rPr>
+                      <w:rFonts w:ascii="Century Schoolbook" w:hAnsi="Century Schoolbook" w:eastAsia="Century Schoolbook" w:cs="Century Schoolbook"/>
+                      <w:b w:val="0"/>
+                      <w:i w:val="0"/>
+                      <w:color w:val="000000"/>
+                      <w:sz w:val="24"/>
+                    </w:rPr>
+                    <w:t xml:space="preserve">elementum. Morbi in ipsum sit amet pede facilisis laoreet. Donec lacus nunc, viverra nec, blandit </w:t>
+                  </w:r>
+                </w:p>
+              </w:txbxContent>
+            </v:textbox>
+          </v:shape>
+        </w:pict>
       </w:r>
       <w:r>
-        <w:br/>
+        <w:pict>
+          <v:shape id="DocuMindTextBox81" type="#_x0000_t202" stroked="f" filled="f" o:allowincell="f" style="position:absolute;margin-left:36.140pt;margin-top:50.908pt;width:545.331pt;height:15.424pt;z-index:251659264;mso-position-horizontal-relative:page;mso-position-vertical-relative:page;mso-wrap-style:none;">
+            <w10:wrap type="none"/>
+            <v:textbox inset="0,0,0,0">
+              <w:txbxContent>
+                <w:p>
+                  <w:pPr>
+                    <w:spacing w:before="0" w:after="0" w:lineRule="exact" w:line="288"/>
+                    <w:ind w:left="0" w:right="0" w:firstLine="0"/>
+                  </w:pPr>
+                  <w:r>
+                    <w:rPr>
+                      <w:rFonts w:ascii="Century Schoolbook" w:hAnsi="Century Schoolbook" w:eastAsia="Century Schoolbook" w:cs="Century Schoolbook"/>
+                      <w:b w:val="0"/>
+                      <w:i w:val="0"/>
+                      <w:color w:val="000000"/>
+                      <w:sz w:val="24"/>
+                    </w:rPr>
+                    <w:t xml:space="preserve">vel, egestas et, augue. Vestibulum tincidunt malesuada tellus. Ut ultrices ultrices enim. Curabitur </w:t>
+                  </w:r>
+                </w:p>
+              </w:txbxContent>
+            </v:textbox>
+          </v:shape>
+        </w:pict>
       </w:r>
       <w:r>
-        <w:rPr>
-          <w:rFonts w:ascii="Century Schoolbook" w:hAnsi="Century Schoolbook" w:eastAsia="Century Schoolbook" w:cs="Century Schoolbook"/>
-          <w:b w:val="0"/>
-          <w:i w:val="0"/>
-          <w:color w:val="000000"/>
-          <w:sz w:val="24"/>
-          <w:fitText w:val="1960" w:id="78"/>
-        </w:rPr>
-        <w:t xml:space="preserve">sit amet mauris.  </w:t>
-      </w:r>
-    </w:p>
-    <w:p>
-      <w:pPr>
-        <w:spacing w:before="288" w:after="0" w:lineRule="exact" w:line="288"/>
-        <w:ind w:left="0" w:right="0" w:firstLine="0"/>
-        <w:jc w:val="left"/>
-      </w:pPr>
-      <w:r>
-        <w:rPr>
-          <w:rFonts w:ascii="Century Schoolbook" w:hAnsi="Century Schoolbook" w:eastAsia="Century Schoolbook" w:cs="Century Schoolbook"/>
-          <w:b w:val="0"/>
-          <w:i w:val="0"/>
-          <w:color w:val="000000"/>
-          <w:sz w:val="24"/>
-          <w:fitText w:val="10866" w:id="79"/>
-        </w:rPr>
-        <w:t xml:space="preserve">Morbi in dui quis est pulvinar ullamcorper. Nulla facilisi. Integer lacinia sollicitudin massa. Cras </w:t>
+        <w:pict>
+          <v:shape id="DocuMindTextBox82" type="#_x0000_t202" stroked="f" filled="f" o:allowincell="f" style="position:absolute;margin-left:36.140pt;margin-top:65.308pt;width:100.023pt;height:15.424pt;z-index:251659264;mso-position-horizontal-relative:page;mso-position-vertical-relative:page;mso-wrap-style:none;">
+            <w10:wrap type="none"/>
+            <v:textbox inset="0,0,0,0">
+              <w:txbxContent>
+                <w:p>
+                  <w:pPr>
+                    <w:spacing w:before="0" w:after="0" w:lineRule="exact" w:line="288"/>
+                    <w:ind w:left="0" w:right="0" w:firstLine="0"/>
+                  </w:pPr>
+                  <w:r>
+                    <w:rPr>
+                      <w:rFonts w:ascii="Century Schoolbook" w:hAnsi="Century Schoolbook" w:eastAsia="Century Schoolbook" w:cs="Century Schoolbook"/>
+                      <w:b w:val="0"/>
+                      <w:i w:val="0"/>
+                      <w:color w:val="000000"/>
+                      <w:sz w:val="24"/>
+                    </w:rPr>
+                    <w:t xml:space="preserve">sit amet mauris.  </w:t>
+                  </w:r>
+                </w:p>
+              </w:txbxContent>
+            </v:textbox>
+          </v:shape>
+        </w:pict>
       </w:r>
       <w:r>
-        <w:br/>
+        <w:pict>
+          <v:shape id="DocuMindTextBox83" type="#_x0000_t202" stroked="f" filled="f" o:allowincell="f" style="position:absolute;margin-left:36.140pt;margin-top:94.108pt;width:545.322pt;height:15.424pt;z-index:251659264;mso-position-horizontal-relative:page;mso-position-vertical-relative:page;mso-wrap-style:none;">
+            <w10:wrap type="none"/>
+            <v:textbox inset="0,0,0,0">
+              <w:txbxContent>
+                <w:p>
+                  <w:pPr>
+                    <w:spacing w:before="0" w:after="0" w:lineRule="exact" w:line="288"/>
+                    <w:ind w:left="0" w:right="0" w:firstLine="0"/>
+                  </w:pPr>
+                  <w:r>
+                    <w:rPr>
+                      <w:rFonts w:ascii="Century Schoolbook" w:hAnsi="Century Schoolbook" w:eastAsia="Century Schoolbook" w:cs="Century Schoolbook"/>
+                      <w:b w:val="0"/>
+                      <w:i w:val="0"/>
+                      <w:color w:val="000000"/>
+                      <w:sz w:val="24"/>
+                    </w:rPr>
+                    <w:t xml:space="preserve">Morbi in dui quis est pulvinar ullamcorper. Nulla facilisi. Integer lacinia sollicitudin massa. Cras </w:t>
+                  </w:r>
+                </w:p>
+              </w:txbxContent>
+            </v:textbox>
+          </v:shape>
+        </w:pict>
       </w:r>
       <w:r>
-        <w:rPr>
-          <w:rFonts w:ascii="Century Schoolbook" w:hAnsi="Century Schoolbook" w:eastAsia="Century Schoolbook" w:cs="Century Schoolbook"/>
-          <w:b w:val="0"/>
-          <w:i w:val="0"/>
-          <w:color w:val="000000"/>
-          <w:sz w:val="24"/>
-          <w:fitText w:val="10867" w:id="80"/>
-        </w:rPr>
-        <w:t xml:space="preserve">metus. Sed aliquet risus a tortor. Integer id quam. Morbi mi. Quisque nisl felis, venenatis tristique, </w:t>
+        <w:pict>
+          <v:shape id="DocuMindTextBox84" type="#_x0000_t202" stroked="f" filled="f" o:allowincell="f" style="position:absolute;margin-left:36.140pt;margin-top:108.748pt;width:545.336pt;height:15.424pt;z-index:251659264;mso-position-horizontal-relative:page;mso-position-vertical-relative:page;mso-wrap-style:none;">
+            <w10:wrap type="none"/>
+            <v:textbox inset="0,0,0,0">
+              <w:txbxContent>
+                <w:p>
+                  <w:pPr>
+                    <w:spacing w:before="0" w:after="0" w:lineRule="exact" w:line="288"/>
+                    <w:ind w:left="0" w:right="0" w:firstLine="0"/>
+                  </w:pPr>
+                  <w:r>
+                    <w:rPr>
+                      <w:rFonts w:ascii="Century Schoolbook" w:hAnsi="Century Schoolbook" w:eastAsia="Century Schoolbook" w:cs="Century Schoolbook"/>
+                      <w:b w:val="0"/>
+                      <w:i w:val="0"/>
+                      <w:color w:val="000000"/>
+                      <w:sz w:val="24"/>
+                    </w:rPr>
+                    <w:t xml:space="preserve">metus. Sed aliquet risus a tortor. Integer id quam. Morbi mi. Quisque nisl felis, venenatis tristique, </w:t>
+                  </w:r>
+                </w:p>
+              </w:txbxContent>
+            </v:textbox>
+          </v:shape>
+        </w:pict>
       </w:r>
       <w:r>
-        <w:br/>
+        <w:pict>
+          <v:shape id="DocuMindTextBox85" type="#_x0000_t202" stroked="f" filled="f" o:allowincell="f" style="position:absolute;margin-left:36.140pt;margin-top:123.148pt;width:545.334pt;height:15.424pt;z-index:251659264;mso-position-horizontal-relative:page;mso-position-vertical-relative:page;mso-wrap-style:none;">
+            <w10:wrap type="none"/>
+            <v:textbox inset="0,0,0,0">
+              <w:txbxContent>
+                <w:p>
+                  <w:pPr>
+                    <w:spacing w:before="0" w:after="0" w:lineRule="exact" w:line="288"/>
+                    <w:ind w:left="0" w:right="0" w:firstLine="0"/>
+                  </w:pPr>
+                  <w:r>
+                    <w:rPr>
+                      <w:rFonts w:ascii="Century Schoolbook" w:hAnsi="Century Schoolbook" w:eastAsia="Century Schoolbook" w:cs="Century Schoolbook"/>
+                      <w:b w:val="0"/>
+                      <w:i w:val="0"/>
+                      <w:color w:val="000000"/>
+                      <w:sz w:val="24"/>
+                    </w:rPr>
+                    <w:t xml:space="preserve">dignissim in, ultrices sit amet, augue. Proin sodales libero eget ante. Nulla quam. Aenean laoreet. </w:t>
+                  </w:r>
+                </w:p>
+              </w:txbxContent>
+            </v:textbox>
+          </v:shape>
+        </w:pict>
       </w:r>
       <w:r>
-        <w:rPr>
-          <w:rFonts w:ascii="Century Schoolbook" w:hAnsi="Century Schoolbook" w:eastAsia="Century Schoolbook" w:cs="Century Schoolbook"/>
-          <w:b w:val="0"/>
-          <w:i w:val="0"/>
-          <w:color w:val="000000"/>
-          <w:sz w:val="24"/>
-          <w:fitText w:val="10867" w:id="81"/>
-        </w:rPr>
-        <w:t xml:space="preserve">dignissim in, ultrices sit amet, augue. Proin sodales libero eget ante. Nulla quam. Aenean laoreet. </w:t>
+        <w:pict>
+          <v:shape id="DocuMindTextBox86" type="#_x0000_t202" stroked="f" filled="f" o:allowincell="f" style="position:absolute;margin-left:36.140pt;margin-top:137.548pt;width:545.325pt;height:15.424pt;z-index:251659264;mso-position-horizontal-relative:page;mso-position-vertical-relative:page;mso-wrap-style:none;">
+            <w10:wrap type="none"/>
+            <v:textbox inset="0,0,0,0">
+              <w:txbxContent>
+                <w:p>
+                  <w:pPr>
+                    <w:spacing w:before="0" w:after="0" w:lineRule="exact" w:line="288"/>
+                    <w:ind w:left="0" w:right="0" w:firstLine="0"/>
+                  </w:pPr>
+                  <w:r>
+                    <w:rPr>
+                      <w:rFonts w:ascii="Century Schoolbook" w:hAnsi="Century Schoolbook" w:eastAsia="Century Schoolbook" w:cs="Century Schoolbook"/>
+                      <w:b w:val="0"/>
+                      <w:i w:val="0"/>
+                      <w:color w:val="000000"/>
+                      <w:sz w:val="24"/>
+                    </w:rPr>
+                    <w:t xml:space="preserve">Vestibulum nisi lectus, commodo ac, facilisis ac, ultricies eu, pede. Ut orci risus, accumsan </w:t>
+                  </w:r>
+                </w:p>
+              </w:txbxContent>
+            </v:textbox>
+          </v:shape>
+        </w:pict>
       </w:r>
       <w:r>
-        <w:br/>
+        <w:pict>
+          <v:shape id="DocuMindTextBox87" type="#_x0000_t202" stroked="f" filled="f" o:allowincell="f" style="position:absolute;margin-left:36.140pt;margin-top:151.948pt;width:376.908pt;height:15.424pt;z-index:251659264;mso-position-horizontal-relative:page;mso-position-vertical-relative:page;mso-wrap-style:none;">
+            <w10:wrap type="none"/>
+            <v:textbox inset="0,0,0,0">
+              <w:txbxContent>
+                <w:p>
+                  <w:pPr>
+                    <w:spacing w:before="0" w:after="0" w:lineRule="exact" w:line="288"/>
+                    <w:ind w:left="0" w:right="0" w:firstLine="0"/>
+                  </w:pPr>
+                  <w:r>
+                    <w:rPr>
+                      <w:rFonts w:ascii="Century Schoolbook" w:hAnsi="Century Schoolbook" w:eastAsia="Century Schoolbook" w:cs="Century Schoolbook"/>
+                      <w:b w:val="0"/>
+                      <w:i w:val="0"/>
+                      <w:color w:val="000000"/>
+                      <w:sz w:val="24"/>
+                    </w:rPr>
+                    <w:t xml:space="preserve">porttitor, cursus quis, aliquet eget, justo. Sed pretium blandit orci.  </w:t>
+                  </w:r>
+                </w:p>
+              </w:txbxContent>
+            </v:textbox>
+          </v:shape>
+        </w:pict>
       </w:r>
       <w:r>
-        <w:rPr>
-          <w:rFonts w:ascii="Century Schoolbook" w:hAnsi="Century Schoolbook" w:eastAsia="Century Schoolbook" w:cs="Century Schoolbook"/>
-          <w:b w:val="0"/>
-          <w:i w:val="0"/>
-          <w:color w:val="000000"/>
-          <w:sz w:val="24"/>
-          <w:fitText w:val="10867" w:id="82"/>
-        </w:rPr>
-        <w:t xml:space="preserve">Vestibulum nisi lectus, commodo ac, facilisis ac, ultricies eu, pede. Ut orci risus, accumsan </w:t>
+        <w:pict>
+          <v:shape id="DocuMindTextBox88" type="#_x0000_t202" stroked="f" filled="f" o:allowincell="f" style="position:absolute;margin-left:36.140pt;margin-top:180.748pt;width:545.329pt;height:15.424pt;z-index:251659264;mso-position-horizontal-relative:page;mso-position-vertical-relative:page;mso-wrap-style:none;">
+            <w10:wrap type="none"/>
+            <v:textbox inset="0,0,0,0">
+              <w:txbxContent>
+                <w:p>
+                  <w:pPr>
+                    <w:spacing w:before="0" w:after="0" w:lineRule="exact" w:line="288"/>
+                    <w:ind w:left="0" w:right="0" w:firstLine="0"/>
+                  </w:pPr>
+                  <w:r>
+                    <w:rPr>
+                      <w:rFonts w:ascii="Century Schoolbook" w:hAnsi="Century Schoolbook" w:eastAsia="Century Schoolbook" w:cs="Century Schoolbook"/>
+                      <w:b w:val="0"/>
+                      <w:i w:val="0"/>
+                      <w:color w:val="000000"/>
+                      <w:sz w:val="24"/>
+                    </w:rPr>
+                    <w:t xml:space="preserve">Ut eu diam at pede suscipit sodales. Aenean lectus elit, fermentum non, convallis id, sagittis at, </w:t>
+                  </w:r>
+                </w:p>
+              </w:txbxContent>
+            </v:textbox>
+          </v:shape>
+        </w:pict>
       </w:r>
       <w:r>
-        <w:br/>
+        <w:pict>
+          <v:shape id="DocuMindTextBox89" type="#_x0000_t202" stroked="f" filled="f" o:allowincell="f" style="position:absolute;margin-left:36.140pt;margin-top:195.148pt;width:545.324pt;height:15.424pt;z-index:251659264;mso-position-horizontal-relative:page;mso-position-vertical-relative:page;mso-wrap-style:none;">
+            <w10:wrap type="none"/>
+            <v:textbox inset="0,0,0,0">
+              <w:txbxContent>
+                <w:p>
+                  <w:pPr>
+                    <w:spacing w:before="0" w:after="0" w:lineRule="exact" w:line="288"/>
+                    <w:ind w:left="0" w:right="0" w:firstLine="0"/>
+                  </w:pPr>
+                  <w:r>
+                    <w:rPr>
+                      <w:rFonts w:ascii="Century Schoolbook" w:hAnsi="Century Schoolbook" w:eastAsia="Century Schoolbook" w:cs="Century Schoolbook"/>
+                      <w:b w:val="0"/>
+                      <w:i w:val="0"/>
+                      <w:color w:val="000000"/>
+                      <w:sz w:val="24"/>
+                    </w:rPr>
+                    <w:t xml:space="preserve">neque. Nullam mauris orci, aliquet et, iaculis et, viverra vitae, ligula. Nulla ut felis in purus </w:t>
+                  </w:r>
+                </w:p>
+              </w:txbxContent>
+            </v:textbox>
+          </v:shape>
+        </w:pict>
       </w:r>
       <w:r>
-        <w:rPr>
-          <w:rFonts w:ascii="Century Schoolbook" w:hAnsi="Century Schoolbook" w:eastAsia="Century Schoolbook" w:cs="Century Schoolbook"/>
-          <w:b w:val="0"/>
-          <w:i w:val="0"/>
-          <w:color w:val="000000"/>
-          <w:sz w:val="24"/>
-          <w:fitText w:val="7498" w:id="83"/>
-        </w:rPr>
-        <w:t xml:space="preserve">porttitor, cursus quis, aliquet eget, justo. Sed pretium blandit orci.  </w:t>
-      </w:r>
-    </w:p>
-    <w:p>
-      <w:pPr>
-        <w:spacing w:before="288" w:after="0" w:lineRule="exact" w:line="288"/>
-        <w:ind w:left="0" w:right="0" w:firstLine="0"/>
-        <w:jc w:val="left"/>
-      </w:pPr>
-      <w:r>
-        <w:rPr>
-          <w:rFonts w:ascii="Century Schoolbook" w:hAnsi="Century Schoolbook" w:eastAsia="Century Schoolbook" w:cs="Century Schoolbook"/>
-          <w:b w:val="0"/>
-          <w:i w:val="0"/>
-          <w:color w:val="000000"/>
-          <w:sz w:val="24"/>
-          <w:fitText w:val="10867" w:id="84"/>
-        </w:rPr>
-        <w:t xml:space="preserve">Ut eu diam at pede suscipit sodales. Aenean lectus elit, fermentum non, convallis id, sagittis at, </w:t>
+        <w:pict>
+          <v:shape id="DocuMindTextBox90" type="#_x0000_t202" stroked="f" filled="f" o:allowincell="f" style="position:absolute;margin-left:36.140pt;margin-top:209.548pt;width:545.333pt;height:15.424pt;z-index:251659264;mso-position-horizontal-relative:page;mso-position-vertical-relative:page;mso-wrap-style:none;">
+            <w10:wrap type="none"/>
+            <v:textbox inset="0,0,0,0">
+              <w:txbxContent>
+                <w:p>
+                  <w:pPr>
+                    <w:spacing w:before="0" w:after="0" w:lineRule="exact" w:line="288"/>
+                    <w:ind w:left="0" w:right="0" w:firstLine="0"/>
+                  </w:pPr>
+                  <w:r>
+                    <w:rPr>
+                      <w:rFonts w:ascii="Century Schoolbook" w:hAnsi="Century Schoolbook" w:eastAsia="Century Schoolbook" w:cs="Century Schoolbook"/>
+                      <w:b w:val="0"/>
+                      <w:i w:val="0"/>
+                      <w:color w:val="000000"/>
+                      <w:sz w:val="24"/>
+                    </w:rPr>
+                    <w:t xml:space="preserve">aliquam imperdiet. Maecenas aliquet mollis lectus. Vivamus consectetuer risus et tortor. Lorem </w:t>
+                  </w:r>
+                </w:p>
+              </w:txbxContent>
+            </v:textbox>
+          </v:shape>
+        </w:pict>
       </w:r>
       <w:r>
-        <w:br/>
+        <w:pict>
+          <v:shape id="DocuMindTextBox91" type="#_x0000_t202" stroked="f" filled="f" o:allowincell="f" style="position:absolute;margin-left:36.140pt;margin-top:223.948pt;width:545.322pt;height:15.424pt;z-index:251659264;mso-position-horizontal-relative:page;mso-position-vertical-relative:page;mso-wrap-style:none;">
+            <w10:wrap type="none"/>
+            <v:textbox inset="0,0,0,0">
+              <w:txbxContent>
+                <w:p>
+                  <w:pPr>
+                    <w:spacing w:before="0" w:after="0" w:lineRule="exact" w:line="288"/>
+                    <w:ind w:left="0" w:right="0" w:firstLine="0"/>
+                  </w:pPr>
+                  <w:r>
+                    <w:rPr>
+                      <w:rFonts w:ascii="Century Schoolbook" w:hAnsi="Century Schoolbook" w:eastAsia="Century Schoolbook" w:cs="Century Schoolbook"/>
+                      <w:b w:val="0"/>
+                      <w:i w:val="0"/>
+                      <w:color w:val="000000"/>
+                      <w:sz w:val="24"/>
+                    </w:rPr>
+                    <w:t xml:space="preserve">ipsum dolor sit amet, consectetur adipiscing elit. Integer nec odio. Praesent libero. Sed cursus ante </w:t>
+                  </w:r>
+                </w:p>
+              </w:txbxContent>
+            </v:textbox>
+          </v:shape>
+        </w:pict>
       </w:r>
       <w:r>
-        <w:rPr>
-          <w:rFonts w:ascii="Century Schoolbook" w:hAnsi="Century Schoolbook" w:eastAsia="Century Schoolbook" w:cs="Century Schoolbook"/>
-          <w:b w:val="0"/>
-          <w:i w:val="0"/>
-          <w:color w:val="000000"/>
-          <w:sz w:val="24"/>
-          <w:fitText w:val="10866" w:id="85"/>
-        </w:rPr>
-        <w:t xml:space="preserve">neque. Nullam mauris orci, aliquet et, iaculis et, viverra vitae, ligula. Nulla ut felis in purus </w:t>
+        <w:pict>
+          <v:shape id="DocuMindTextBox92" type="#_x0000_t202" stroked="f" filled="f" o:allowincell="f" style="position:absolute;margin-left:36.140pt;margin-top:238.588pt;width:545.336pt;height:15.424pt;z-index:251659264;mso-position-horizontal-relative:page;mso-position-vertical-relative:page;mso-wrap-style:none;">
+            <w10:wrap type="none"/>
+            <v:textbox inset="0,0,0,0">
+              <w:txbxContent>
+                <w:p>
+                  <w:pPr>
+                    <w:spacing w:before="0" w:after="0" w:lineRule="exact" w:line="288"/>
+                    <w:ind w:left="0" w:right="0" w:firstLine="0"/>
+                  </w:pPr>
+                  <w:r>
+                    <w:rPr>
+                      <w:rFonts w:ascii="Century Schoolbook" w:hAnsi="Century Schoolbook" w:eastAsia="Century Schoolbook" w:cs="Century Schoolbook"/>
+                      <w:b w:val="0"/>
+                      <w:i w:val="0"/>
+                      <w:color w:val="000000"/>
+                      <w:sz w:val="24"/>
+                    </w:rPr>
+                    <w:t xml:space="preserve">dapibus diam. Sed nisi. Nulla quis sem at nibh elementum imperdiet. Duis sagittis ipsum. </w:t>
+                  </w:r>
+                </w:p>
+              </w:txbxContent>
+            </v:textbox>
+          </v:shape>
+        </w:pict>
       </w:r>
       <w:r>
-        <w:br/>
+        <w:pict>
+          <v:shape id="DocuMindTextBox93" type="#_x0000_t202" stroked="f" filled="f" o:allowincell="f" style="position:absolute;margin-left:36.140pt;margin-top:252.988pt;width:104.230pt;height:15.424pt;z-index:251659264;mso-position-horizontal-relative:page;mso-position-vertical-relative:page;mso-wrap-style:none;">
+            <w10:wrap type="none"/>
+            <v:textbox inset="0,0,0,0">
+              <w:txbxContent>
+                <w:p>
+                  <w:pPr>
+                    <w:spacing w:before="0" w:after="0" w:lineRule="exact" w:line="288"/>
+                    <w:ind w:left="0" w:right="0" w:firstLine="0"/>
+                  </w:pPr>
+                  <w:r>
+                    <w:rPr>
+                      <w:rFonts w:ascii="Century Schoolbook" w:hAnsi="Century Schoolbook" w:eastAsia="Century Schoolbook" w:cs="Century Schoolbook"/>
+                      <w:b w:val="0"/>
+                      <w:i w:val="0"/>
+                      <w:color w:val="000000"/>
+                      <w:sz w:val="24"/>
+                    </w:rPr>
+                    <w:t xml:space="preserve">Praesent mauris.  </w:t>
+                  </w:r>
+                </w:p>
+              </w:txbxContent>
+            </v:textbox>
+          </v:shape>
+        </w:pict>
       </w:r>
       <w:r>
-        <w:rPr>
-          <w:rFonts w:ascii="Century Schoolbook" w:hAnsi="Century Schoolbook" w:eastAsia="Century Schoolbook" w:cs="Century Schoolbook"/>
-          <w:b w:val="0"/>
-          <w:i w:val="0"/>
-          <w:color w:val="000000"/>
-          <w:sz w:val="24"/>
-          <w:fitText w:val="10867" w:id="86"/>
-        </w:rPr>
-        <w:t xml:space="preserve">aliquam imperdiet. Maecenas aliquet mollis lectus. Vivamus consectetuer risus et tortor. Lorem </w:t>
+        <w:pict>
+          <v:shape id="DocuMindTextBox94" type="#_x0000_t202" stroked="f" filled="f" o:allowincell="f" style="position:absolute;margin-left:36.140pt;margin-top:281.788pt;width:545.332pt;height:15.424pt;z-index:251659264;mso-position-horizontal-relative:page;mso-position-vertical-relative:page;mso-wrap-style:none;">
+            <w10:wrap type="none"/>
+            <v:textbox inset="0,0,0,0">
+              <w:txbxContent>
+                <w:p>
+                  <w:pPr>
+                    <w:spacing w:before="0" w:after="0" w:lineRule="exact" w:line="288"/>
+                    <w:ind w:left="0" w:right="0" w:firstLine="0"/>
+                  </w:pPr>
+                  <w:r>
+                    <w:rPr>
+                      <w:rFonts w:ascii="Century Schoolbook" w:hAnsi="Century Schoolbook" w:eastAsia="Century Schoolbook" w:cs="Century Schoolbook"/>
+                      <w:b w:val="0"/>
+                      <w:i w:val="0"/>
+                      <w:color w:val="000000"/>
+                      <w:sz w:val="24"/>
+                    </w:rPr>
+                    <w:t xml:space="preserve">Fusce nec tellus sed augue semper porta. Mauris massa. Vestibulum lacinia arcu eget nulla. Class </w:t>
+                  </w:r>
+                </w:p>
+              </w:txbxContent>
+            </v:textbox>
+          </v:shape>
+        </w:pict>
       </w:r>
       <w:r>
-        <w:br/>
+        <w:pict>
+          <v:shape id="DocuMindTextBox95" type="#_x0000_t202" stroked="f" filled="f" o:allowincell="f" style="position:absolute;margin-left:36.140pt;margin-top:296.188pt;width:545.326pt;height:15.424pt;z-index:251659264;mso-position-horizontal-relative:page;mso-position-vertical-relative:page;mso-wrap-style:none;">
+            <w10:wrap type="none"/>
+            <v:textbox inset="0,0,0,0">
+              <w:txbxContent>
+                <w:p>
+                  <w:pPr>
+                    <w:spacing w:before="0" w:after="0" w:lineRule="exact" w:line="288"/>
+                    <w:ind w:left="0" w:right="0" w:firstLine="0"/>
+                  </w:pPr>
+                  <w:r>
+                    <w:rPr>
+                      <w:rFonts w:ascii="Century Schoolbook" w:hAnsi="Century Schoolbook" w:eastAsia="Century Schoolbook" w:cs="Century Schoolbook"/>
+                      <w:b w:val="0"/>
+                      <w:i w:val="0"/>
+                      <w:color w:val="000000"/>
+                      <w:sz w:val="24"/>
+                    </w:rPr>
+                    <w:t xml:space="preserve">aptent taciti sociosqu ad litora torquent per conubia nostra, per inceptos himenaeos. Curabitur </w:t>
+                  </w:r>
+                </w:p>
+              </w:txbxContent>
+            </v:textbox>
+          </v:shape>
+        </w:pict>
       </w:r>
       <w:r>
-        <w:rPr>
-          <w:rFonts w:ascii="Century Schoolbook" w:hAnsi="Century Schoolbook" w:eastAsia="Century Schoolbook" w:cs="Century Schoolbook"/>
-          <w:b w:val="0"/>
-          <w:i w:val="0"/>
-          <w:color w:val="000000"/>
-          <w:sz w:val="24"/>
-          <w:fitText w:val="10866" w:id="87"/>
-        </w:rPr>
-        <w:t xml:space="preserve">ipsum dolor sit amet, consectetur adipiscing elit. Integer nec odio. Praesent libero. Sed cursus ante </w:t>
+        <w:pict>
+          <v:shape id="DocuMindTextBox96" type="#_x0000_t202" stroked="f" filled="f" o:allowincell="f" style="position:absolute;margin-left:36.140pt;margin-top:310.588pt;width:545.333pt;height:15.424pt;z-index:251659264;mso-position-horizontal-relative:page;mso-position-vertical-relative:page;mso-wrap-style:none;">
+            <w10:wrap type="none"/>
+            <v:textbox inset="0,0,0,0">
+              <w:txbxContent>
+                <w:p>
+                  <w:pPr>
+                    <w:spacing w:before="0" w:after="0" w:lineRule="exact" w:line="288"/>
+                    <w:ind w:left="0" w:right="0" w:firstLine="0"/>
+                  </w:pPr>
+                  <w:r>
+                    <w:rPr>
+                      <w:rFonts w:ascii="Century Schoolbook" w:hAnsi="Century Schoolbook" w:eastAsia="Century Schoolbook" w:cs="Century Schoolbook"/>
+                      <w:b w:val="0"/>
+                      <w:i w:val="0"/>
+                      <w:color w:val="000000"/>
+                      <w:sz w:val="24"/>
+                    </w:rPr>
+                    <w:t xml:space="preserve">sodales ligula in libero. Sed dignissim lacinia nunc. Curabitur tortor. Pellentesque nibh. Aenean </w:t>
+                  </w:r>
+                </w:p>
+              </w:txbxContent>
+            </v:textbox>
+          </v:shape>
+        </w:pict>
       </w:r>
       <w:r>
-        <w:br/>
+        <w:pict>
+          <v:shape id="DocuMindTextBox97" type="#_x0000_t202" stroked="f" filled="f" o:allowincell="f" style="position:absolute;margin-left:36.140pt;margin-top:324.988pt;width:455.160pt;height:15.424pt;z-index:251659264;mso-position-horizontal-relative:page;mso-position-vertical-relative:page;mso-wrap-style:none;">
+            <w10:wrap type="none"/>
+            <v:textbox inset="0,0,0,0">
+              <w:txbxContent>
+                <w:p>
+                  <w:pPr>
+                    <w:spacing w:before="0" w:after="0" w:lineRule="exact" w:line="288"/>
+                    <w:ind w:left="0" w:right="0" w:firstLine="0"/>
+                  </w:pPr>
+                  <w:r>
+                    <w:rPr>
+                      <w:rFonts w:ascii="Century Schoolbook" w:hAnsi="Century Schoolbook" w:eastAsia="Century Schoolbook" w:cs="Century Schoolbook"/>
+                      <w:b w:val="0"/>
+                      <w:i w:val="0"/>
+                      <w:color w:val="000000"/>
+                      <w:sz w:val="24"/>
+                    </w:rPr>
+                    <w:t xml:space="preserve">quam. In scelerisque sem at dolor. Maecenas mattis. Sed convallis tristique sem.  </w:t>
+                  </w:r>
+                </w:p>
+              </w:txbxContent>
+            </v:textbox>
+          </v:shape>
+        </w:pict>
       </w:r>
       <w:r>
-        <w:rPr>
-          <w:rFonts w:ascii="Century Schoolbook" w:hAnsi="Century Schoolbook" w:eastAsia="Century Schoolbook" w:cs="Century Schoolbook"/>
-          <w:b w:val="0"/>
-          <w:i w:val="0"/>
-          <w:color w:val="000000"/>
-          <w:sz w:val="24"/>
-          <w:fitText w:val="10867" w:id="88"/>
-        </w:rPr>
-        <w:t xml:space="preserve">dapibus diam. Sed nisi. Nulla quis sem at nibh elementum imperdiet. Duis sagittis ipsum. </w:t>
+        <w:pict>
+          <v:shape id="DocuMindTextBox98" type="#_x0000_t202" stroked="f" filled="f" o:allowincell="f" style="position:absolute;margin-left:36.140pt;margin-top:353.788pt;width:545.324pt;height:15.424pt;z-index:251659264;mso-position-horizontal-relative:page;mso-position-vertical-relative:page;mso-wrap-style:none;">
+            <w10:wrap type="none"/>
+            <v:textbox inset="0,0,0,0">
+              <w:txbxContent>
+                <w:p>
+                  <w:pPr>
+                    <w:spacing w:before="0" w:after="0" w:lineRule="exact" w:line="288"/>
+                    <w:ind w:left="0" w:right="0" w:firstLine="0"/>
+                  </w:pPr>
+                  <w:r>
+                    <w:rPr>
+                      <w:rFonts w:ascii="Century Schoolbook" w:hAnsi="Century Schoolbook" w:eastAsia="Century Schoolbook" w:cs="Century Schoolbook"/>
+                      <w:b w:val="0"/>
+                      <w:i w:val="0"/>
+                      <w:color w:val="000000"/>
+                      <w:sz w:val="24"/>
+                    </w:rPr>
+                    <w:t xml:space="preserve">Proin ut ligula vel nunc egestas porttitor. Morbi lectus risus, iaculis vel, suscipit quis, luctus non, </w:t>
+                  </w:r>
+                </w:p>
+              </w:txbxContent>
+            </v:textbox>
+          </v:shape>
+        </w:pict>
       </w:r>
       <w:r>
-        <w:br/>
+        <w:pict>
+          <v:shape id="DocuMindTextBox99" type="#_x0000_t202" stroked="f" filled="f" o:allowincell="f" style="position:absolute;margin-left:36.140pt;margin-top:368.188pt;width:545.331pt;height:15.424pt;z-index:251659264;mso-position-horizontal-relative:page;mso-position-vertical-relative:page;mso-wrap-style:none;">
+            <w10:wrap type="none"/>
+            <v:textbox inset="0,0,0,0">
+              <w:txbxContent>
+                <w:p>
+                  <w:pPr>
+                    <w:spacing w:before="0" w:after="0" w:lineRule="exact" w:line="288"/>
+                    <w:ind w:left="0" w:right="0" w:firstLine="0"/>
+                  </w:pPr>
+                  <w:r>
+                    <w:rPr>
+                      <w:rFonts w:ascii="Century Schoolbook" w:hAnsi="Century Schoolbook" w:eastAsia="Century Schoolbook" w:cs="Century Schoolbook"/>
+                      <w:b w:val="0"/>
+                      <w:i w:val="0"/>
+                      <w:color w:val="000000"/>
+                      <w:sz w:val="24"/>
+                    </w:rPr>
+                    <w:t xml:space="preserve">massa. Fusce ac turpis quis ligula lacinia aliquet. Mauris ipsum. Nulla metus metus, ullamcorper </w:t>
+                  </w:r>
+                </w:p>
+              </w:txbxContent>
+            </v:textbox>
+          </v:shape>
+        </w:pict>
       </w:r>
       <w:r>
-        <w:rPr>
-          <w:rFonts w:ascii="Century Schoolbook" w:hAnsi="Century Schoolbook" w:eastAsia="Century Schoolbook" w:cs="Century Schoolbook"/>
-          <w:b w:val="0"/>
-          <w:i w:val="0"/>
-          <w:color w:val="000000"/>
-          <w:sz w:val="24"/>
-          <w:fitText w:val="2045" w:id="89"/>
-        </w:rPr>
-        <w:t xml:space="preserve">Praesent mauris.  </w:t>
-      </w:r>
-    </w:p>
-    <w:p>
-      <w:pPr>
-        <w:spacing w:before="288" w:after="0" w:lineRule="exact" w:line="288"/>
-        <w:ind w:left="0" w:right="0" w:firstLine="0"/>
-        <w:jc w:val="left"/>
-      </w:pPr>
-      <w:r>
-        <w:rPr>
-          <w:rFonts w:ascii="Century Schoolbook" w:hAnsi="Century Schoolbook" w:eastAsia="Century Schoolbook" w:cs="Century Schoolbook"/>
-          <w:b w:val="0"/>
-          <w:i w:val="0"/>
-          <w:color w:val="000000"/>
-          <w:sz w:val="24"/>
-          <w:fitText w:val="10867" w:id="90"/>
-        </w:rPr>
-        <w:t xml:space="preserve">Fusce nec tellus sed augue semper porta. Mauris massa. Vestibulum lacinia arcu eget nulla. Class </w:t>
+        <w:pict>
+          <v:shape id="DocuMindTextBox100" type="#_x0000_t202" stroked="f" filled="f" o:allowincell="f" style="position:absolute;margin-left:36.140pt;margin-top:382.828pt;width:545.326pt;height:15.424pt;z-index:251659264;mso-position-horizontal-relative:page;mso-position-vertical-relative:page;mso-wrap-style:none;">
+            <w10:wrap type="none"/>
+            <v:textbox inset="0,0,0,0">
+              <w:txbxContent>
+                <w:p>
+                  <w:pPr>
+                    <w:spacing w:before="0" w:after="0" w:lineRule="exact" w:line="288"/>
+                    <w:ind w:left="0" w:right="0" w:firstLine="0"/>
+                  </w:pPr>
+                  <w:r>
+                    <w:rPr>
+                      <w:rFonts w:ascii="Century Schoolbook" w:hAnsi="Century Schoolbook" w:eastAsia="Century Schoolbook" w:cs="Century Schoolbook"/>
+                      <w:b w:val="0"/>
+                      <w:i w:val="0"/>
+                      <w:color w:val="000000"/>
+                      <w:sz w:val="24"/>
+                    </w:rPr>
+                    <w:t xml:space="preserve">vel, tincidunt sed, euismod in, nibh. Quisque volutpat condimentum velit. Class aptent taciti </w:t>
+                  </w:r>
+                </w:p>
+              </w:txbxContent>
+            </v:textbox>
+          </v:shape>
+        </w:pict>
       </w:r>
       <w:r>
-        <w:br/>
+        <w:pict>
+          <v:shape id="DocuMindTextBox101" type="#_x0000_t202" stroked="f" filled="f" o:allowincell="f" style="position:absolute;margin-left:36.140pt;margin-top:397.228pt;width:545.331pt;height:15.424pt;z-index:251659264;mso-position-horizontal-relative:page;mso-position-vertical-relative:page;mso-wrap-style:none;">
+            <w10:wrap type="none"/>
+            <v:textbox inset="0,0,0,0">
+              <w:txbxContent>
+                <w:p>
+                  <w:pPr>
+                    <w:spacing w:before="0" w:after="0" w:lineRule="exact" w:line="288"/>
+                    <w:ind w:left="0" w:right="0" w:firstLine="0"/>
+                  </w:pPr>
+                  <w:r>
+                    <w:rPr>
+                      <w:rFonts w:ascii="Century Schoolbook" w:hAnsi="Century Schoolbook" w:eastAsia="Century Schoolbook" w:cs="Century Schoolbook"/>
+                      <w:b w:val="0"/>
+                      <w:i w:val="0"/>
+                      <w:color w:val="000000"/>
+                      <w:sz w:val="24"/>
+                    </w:rPr>
+                    <w:t xml:space="preserve">sociosqu ad litora torquent per conubia nostra, per inceptos himenaeos. Nam nec ante. Sed lacinia, </w:t>
+                  </w:r>
+                </w:p>
+              </w:txbxContent>
+            </v:textbox>
+          </v:shape>
+        </w:pict>
       </w:r>
       <w:r>
-        <w:rPr>
-          <w:rFonts w:ascii="Century Schoolbook" w:hAnsi="Century Schoolbook" w:eastAsia="Century Schoolbook" w:cs="Century Schoolbook"/>
-          <w:b w:val="0"/>
-          <w:i w:val="0"/>
-          <w:color w:val="000000"/>
-          <w:sz w:val="24"/>
-          <w:fitText w:val="10867" w:id="91"/>
-        </w:rPr>
-        <w:t xml:space="preserve">aptent taciti sociosqu ad litora torquent per conubia nostra, per inceptos himenaeos. Curabitur </w:t>
+        <w:pict>
+          <v:shape id="DocuMindTextBox102" type="#_x0000_t202" stroked="f" filled="f" o:allowincell="f" style="position:absolute;margin-left:36.140pt;margin-top:411.628pt;width:545.327pt;height:15.424pt;z-index:251659264;mso-position-horizontal-relative:page;mso-position-vertical-relative:page;mso-wrap-style:none;">
+            <w10:wrap type="none"/>
+            <v:textbox inset="0,0,0,0">
+              <w:txbxContent>
+                <w:p>
+                  <w:pPr>
+                    <w:spacing w:before="0" w:after="0" w:lineRule="exact" w:line="288"/>
+                    <w:ind w:left="0" w:right="0" w:firstLine="0"/>
+                  </w:pPr>
+                  <w:r>
+                    <w:rPr>
+                      <w:rFonts w:ascii="Century Schoolbook" w:hAnsi="Century Schoolbook" w:eastAsia="Century Schoolbook" w:cs="Century Schoolbook"/>
+                      <w:b w:val="0"/>
+                      <w:i w:val="0"/>
+                      <w:color w:val="000000"/>
+                      <w:sz w:val="24"/>
+                    </w:rPr>
+                    <w:t xml:space="preserve">urna non tincidunt mattis, tortor neque adipiscing diam, a cursus ipsum ante quis turpis. Nulla </w:t>
+                  </w:r>
+                </w:p>
+              </w:txbxContent>
+            </v:textbox>
+          </v:shape>
+        </w:pict>
       </w:r>
       <w:r>
-        <w:br/>
+        <w:pict>
+          <v:shape id="DocuMindTextBox103" type="#_x0000_t202" stroked="f" filled="f" o:allowincell="f" style="position:absolute;margin-left:36.140pt;margin-top:426.028pt;width:235.797pt;height:15.424pt;z-index:251659264;mso-position-horizontal-relative:page;mso-position-vertical-relative:page;mso-wrap-style:none;">
+            <w10:wrap type="none"/>
+            <v:textbox inset="0,0,0,0">
+              <w:txbxContent>
+                <w:p>
+                  <w:pPr>
+                    <w:spacing w:before="0" w:after="0" w:lineRule="exact" w:line="288"/>
+                    <w:ind w:left="0" w:right="0" w:firstLine="0"/>
+                  </w:pPr>
+                  <w:r>
+                    <w:rPr>
+                      <w:rFonts w:ascii="Century Schoolbook" w:hAnsi="Century Schoolbook" w:eastAsia="Century Schoolbook" w:cs="Century Schoolbook"/>
+                      <w:b w:val="0"/>
+                      <w:i w:val="0"/>
+                      <w:color w:val="000000"/>
+                      <w:sz w:val="24"/>
+                    </w:rPr>
+                    <w:t xml:space="preserve">facilisi. Ut fringilla. Suspendisse potenti.  </w:t>
+                  </w:r>
+                </w:p>
+              </w:txbxContent>
+            </v:textbox>
+          </v:shape>
+        </w:pict>
       </w:r>
       <w:r>
-        <w:rPr>
-          <w:rFonts w:ascii="Century Schoolbook" w:hAnsi="Century Schoolbook" w:eastAsia="Century Schoolbook" w:cs="Century Schoolbook"/>
-          <w:b w:val="0"/>
-          <w:i w:val="0"/>
-          <w:color w:val="000000"/>
-          <w:sz w:val="24"/>
-          <w:fitText w:val="10867" w:id="92"/>
-        </w:rPr>
-        <w:t xml:space="preserve">sodales ligula in libero. Sed dignissim lacinia nunc. Curabitur tortor. Pellentesque nibh. Aenean </w:t>
+        <w:pict>
+          <v:shape id="DocuMindTextBox104" type="#_x0000_t202" stroked="f" filled="f" o:allowincell="f" style="position:absolute;margin-left:36.140pt;margin-top:454.828pt;width:545.334pt;height:15.424pt;z-index:251659264;mso-position-horizontal-relative:page;mso-position-vertical-relative:page;mso-wrap-style:none;">
+            <w10:wrap type="none"/>
+            <v:textbox inset="0,0,0,0">
+              <w:txbxContent>
+                <w:p>
+                  <w:pPr>
+                    <w:spacing w:before="0" w:after="0" w:lineRule="exact" w:line="288"/>
+                    <w:ind w:left="0" w:right="0" w:firstLine="0"/>
+                  </w:pPr>
+                  <w:r>
+                    <w:rPr>
+                      <w:rFonts w:ascii="Century Schoolbook" w:hAnsi="Century Schoolbook" w:eastAsia="Century Schoolbook" w:cs="Century Schoolbook"/>
+                      <w:b w:val="0"/>
+                      <w:i w:val="0"/>
+                      <w:color w:val="000000"/>
+                      <w:sz w:val="24"/>
+                    </w:rPr>
+                    <w:t xml:space="preserve">Nunc feugiat mi a tellus consequat imperdiet. Vestibulum sapien. Proin quam. Etiam ultrices. </w:t>
+                  </w:r>
+                </w:p>
+              </w:txbxContent>
+            </v:textbox>
+          </v:shape>
+        </w:pict>
       </w:r>
       <w:r>
-        <w:br/>
+        <w:pict>
+          <v:shape id="DocuMindTextBox105" type="#_x0000_t202" stroked="f" filled="f" o:allowincell="f" style="position:absolute;margin-left:36.140pt;margin-top:469.228pt;width:545.324pt;height:15.424pt;z-index:251659264;mso-position-horizontal-relative:page;mso-position-vertical-relative:page;mso-wrap-style:none;">
+            <w10:wrap type="none"/>
+            <v:textbox inset="0,0,0,0">
+              <w:txbxContent>
+                <w:p>
+                  <w:pPr>
+                    <w:spacing w:before="0" w:after="0" w:lineRule="exact" w:line="288"/>
+                    <w:ind w:left="0" w:right="0" w:firstLine="0"/>
+                  </w:pPr>
+                  <w:r>
+                    <w:rPr>
+                      <w:rFonts w:ascii="Century Schoolbook" w:hAnsi="Century Schoolbook" w:eastAsia="Century Schoolbook" w:cs="Century Schoolbook"/>
+                      <w:b w:val="0"/>
+                      <w:i w:val="0"/>
+                      <w:color w:val="000000"/>
+                      <w:sz w:val="24"/>
+                    </w:rPr>
+                    <w:t xml:space="preserve">Suspendisse in justo eu magna luctus suscipit. Sed lectus. Integer euismod lacus luctus magna. </w:t>
+                  </w:r>
+                </w:p>
+              </w:txbxContent>
+            </v:textbox>
+          </v:shape>
+        </w:pict>
       </w:r>
       <w:r>
-        <w:rPr>
-          <w:rFonts w:ascii="Century Schoolbook" w:hAnsi="Century Schoolbook" w:eastAsia="Century Schoolbook" w:cs="Century Schoolbook"/>
-          <w:b w:val="0"/>
-          <w:i w:val="0"/>
-          <w:color w:val="000000"/>
-          <w:sz w:val="24"/>
-          <w:fitText w:val="9063" w:id="93"/>
-        </w:rPr>
-        <w:t xml:space="preserve">quam. In scelerisque sem at dolor. Maecenas mattis. Sed convallis tristique sem.  </w:t>
-      </w:r>
-    </w:p>
-    <w:p>
-      <w:pPr>
-        <w:spacing w:before="288" w:after="0" w:lineRule="exact" w:line="288"/>
-        <w:ind w:left="0" w:right="0" w:firstLine="0"/>
-        <w:jc w:val="left"/>
-      </w:pPr>
-      <w:r>
-        <w:rPr>
-          <w:rFonts w:ascii="Century Schoolbook" w:hAnsi="Century Schoolbook" w:eastAsia="Century Schoolbook" w:cs="Century Schoolbook"/>
-          <w:b w:val="0"/>
-          <w:i w:val="0"/>
-          <w:color w:val="000000"/>
-          <w:sz w:val="24"/>
-          <w:fitText w:val="10866" w:id="94"/>
-        </w:rPr>
-        <w:t xml:space="preserve">Proin ut ligula vel nunc egestas porttitor. Morbi lectus risus, iaculis vel, suscipit quis, luctus non, </w:t>
+        <w:pict>
+          <v:shape id="DocuMindTextBox106" type="#_x0000_t202" stroked="f" filled="f" o:allowincell="f" style="position:absolute;margin-left:36.140pt;margin-top:483.628pt;width:545.337pt;height:15.424pt;z-index:251659264;mso-position-horizontal-relative:page;mso-position-vertical-relative:page;mso-wrap-style:none;">
+            <w10:wrap type="none"/>
+            <v:textbox inset="0,0,0,0">
+              <w:txbxContent>
+                <w:p>
+                  <w:pPr>
+                    <w:spacing w:before="0" w:after="0" w:lineRule="exact" w:line="288"/>
+                    <w:ind w:left="0" w:right="0" w:firstLine="0"/>
+                  </w:pPr>
+                  <w:r>
+                    <w:rPr>
+                      <w:rFonts w:ascii="Century Schoolbook" w:hAnsi="Century Schoolbook" w:eastAsia="Century Schoolbook" w:cs="Century Schoolbook"/>
+                      <w:b w:val="0"/>
+                      <w:i w:val="0"/>
+                      <w:color w:val="000000"/>
+                      <w:sz w:val="24"/>
+                    </w:rPr>
+                    <w:t xml:space="preserve">Quisque cursus, metus vitae pharetra auctor, sem massa mattis sem, at interdum magna augue </w:t>
+                  </w:r>
+                </w:p>
+              </w:txbxContent>
+            </v:textbox>
+          </v:shape>
+        </w:pict>
       </w:r>
       <w:r>
-        <w:br/>
+        <w:pict>
+          <v:shape id="DocuMindTextBox107" type="#_x0000_t202" stroked="f" filled="f" o:allowincell="f" style="position:absolute;margin-left:36.140pt;margin-top:498.028pt;width:545.325pt;height:15.424pt;z-index:251659264;mso-position-horizontal-relative:page;mso-position-vertical-relative:page;mso-wrap-style:none;">
+            <w10:wrap type="none"/>
+            <v:textbox inset="0,0,0,0">
+              <w:txbxContent>
+                <w:p>
+                  <w:pPr>
+                    <w:spacing w:before="0" w:after="0" w:lineRule="exact" w:line="288"/>
+                    <w:ind w:left="0" w:right="0" w:firstLine="0"/>
+                  </w:pPr>
+                  <w:r>
+                    <w:rPr>
+                      <w:rFonts w:ascii="Century Schoolbook" w:hAnsi="Century Schoolbook" w:eastAsia="Century Schoolbook" w:cs="Century Schoolbook"/>
+                      <w:b w:val="0"/>
+                      <w:i w:val="0"/>
+                      <w:color w:val="000000"/>
+                      <w:sz w:val="24"/>
+                    </w:rPr>
+                    <w:t xml:space="preserve">eget diam. Vestibulum ante ipsum primis in faucibus orci luctus et ultrices posuere cubilia Curae; </w:t>
+                  </w:r>
+                </w:p>
+              </w:txbxContent>
+            </v:textbox>
+          </v:shape>
+        </w:pict>
       </w:r>
       <w:r>
-        <w:rPr>
-          <w:rFonts w:ascii="Century Schoolbook" w:hAnsi="Century Schoolbook" w:eastAsia="Century Schoolbook" w:cs="Century Schoolbook"/>
-          <w:b w:val="0"/>
-          <w:i w:val="0"/>
-          <w:color w:val="000000"/>
-          <w:sz w:val="24"/>
-          <w:fitText w:val="10867" w:id="95"/>
-        </w:rPr>
-        <w:t xml:space="preserve">massa. Fusce ac turpis quis ligula lacinia aliquet. Mauris ipsum. Nulla metus metus, ullamcorper </w:t>
+        <w:pict>
+          <v:shape id="DocuMindTextBox108" type="#_x0000_t202" stroked="f" filled="f" o:allowincell="f" style="position:absolute;margin-left:36.140pt;margin-top:512.668pt;width:545.332pt;height:15.424pt;z-index:251659264;mso-position-horizontal-relative:page;mso-position-vertical-relative:page;mso-wrap-style:none;">
+            <w10:wrap type="none"/>
+            <v:textbox inset="0,0,0,0">
+              <w:txbxContent>
+                <w:p>
+                  <w:pPr>
+                    <w:spacing w:before="0" w:after="0" w:lineRule="exact" w:line="288"/>
+                    <w:ind w:left="0" w:right="0" w:firstLine="0"/>
+                  </w:pPr>
+                  <w:r>
+                    <w:rPr>
+                      <w:rFonts w:ascii="Century Schoolbook" w:hAnsi="Century Schoolbook" w:eastAsia="Century Schoolbook" w:cs="Century Schoolbook"/>
+                      <w:b w:val="0"/>
+                      <w:i w:val="0"/>
+                      <w:color w:val="000000"/>
+                      <w:sz w:val="24"/>
+                    </w:rPr>
+                    <w:t xml:space="preserve">Morbi lacinia molestie dui. Praesent blandit dolor. Sed non quam. In vel mi sit amet augue congue </w:t>
+                  </w:r>
+                </w:p>
+              </w:txbxContent>
+            </v:textbox>
+          </v:shape>
+        </w:pict>
       </w:r>
       <w:r>
-        <w:br/>
-      </w:r>
-      <w:r>
-        <w:rPr>
-          <w:rFonts w:ascii="Century Schoolbook" w:hAnsi="Century Schoolbook" w:eastAsia="Century Schoolbook" w:cs="Century Schoolbook"/>
-          <w:b w:val="0"/>
-          <w:i w:val="0"/>
-          <w:color w:val="000000"/>
-          <w:sz w:val="24"/>
-          <w:fitText w:val="10867" w:id="96"/>
-        </w:rPr>
-        <w:t xml:space="preserve">vel, tincidunt sed, euismod in, nibh. Quisque volutpat condimentum velit. Class aptent taciti </w:t>
-      </w:r>
-      <w:r>
-        <w:br/>
-      </w:r>
-      <w:r>
-        <w:rPr>
-          <w:rFonts w:ascii="Century Schoolbook" w:hAnsi="Century Schoolbook" w:eastAsia="Century Schoolbook" w:cs="Century Schoolbook"/>
-          <w:b w:val="0"/>
-          <w:i w:val="0"/>
-          <w:color w:val="000000"/>
-          <w:sz w:val="24"/>
-          <w:fitText w:val="10867" w:id="97"/>
-        </w:rPr>
-        <w:t xml:space="preserve">sociosqu ad litora torquent per conubia nostra, per inceptos himenaeos. Nam nec ante. Sed lacinia, </w:t>
-      </w:r>
-      <w:r>
-        <w:br/>
-      </w:r>
-      <w:r>
-        <w:rPr>
-          <w:rFonts w:ascii="Century Schoolbook" w:hAnsi="Century Schoolbook" w:eastAsia="Century Schoolbook" w:cs="Century Schoolbook"/>
-          <w:b w:val="0"/>
-          <w:i w:val="0"/>
-          <w:color w:val="000000"/>
-          <w:sz w:val="24"/>
-          <w:fitText w:val="10867" w:id="98"/>
-        </w:rPr>
-        <w:t xml:space="preserve">urna non tincidunt mattis, tortor neque adipiscing diam, a cursus ipsum ante quis turpis. Nulla </w:t>
-      </w:r>
-      <w:r>
-        <w:br/>
-      </w:r>
-      <w:r>
-        <w:rPr>
-          <w:rFonts w:ascii="Century Schoolbook" w:hAnsi="Century Schoolbook" w:eastAsia="Century Schoolbook" w:cs="Century Schoolbook"/>
-          <w:b w:val="0"/>
-          <w:i w:val="0"/>
-          <w:color w:val="000000"/>
-          <w:sz w:val="24"/>
-          <w:fitText w:val="4676" w:id="99"/>
-        </w:rPr>
-        <w:t xml:space="preserve">facilisi. Ut fringilla. Suspendisse potenti.  </w:t>
-      </w:r>
-    </w:p>
-    <w:p>
-      <w:pPr>
-        <w:spacing w:before="288" w:after="0" w:lineRule="exact" w:line="288"/>
-        <w:ind w:left="0" w:right="0" w:firstLine="0"/>
-        <w:jc w:val="left"/>
-      </w:pPr>
-      <w:r>
-        <w:rPr>
-          <w:rFonts w:ascii="Century Schoolbook" w:hAnsi="Century Schoolbook" w:eastAsia="Century Schoolbook" w:cs="Century Schoolbook"/>
-          <w:b w:val="0"/>
-          <w:i w:val="0"/>
-          <w:color w:val="000000"/>
-          <w:sz w:val="24"/>
-          <w:fitText w:val="10867" w:id="100"/>
-        </w:rPr>
-        <w:t xml:space="preserve">Nunc feugiat mi a tellus consequat imperdiet. Vestibulum sapien. Proin quam. Etiam ultrices. </w:t>
-      </w:r>
-      <w:r>
-        <w:br/>
-      </w:r>
-      <w:r>
-        <w:rPr>
-          <w:rFonts w:ascii="Century Schoolbook" w:hAnsi="Century Schoolbook" w:eastAsia="Century Schoolbook" w:cs="Century Schoolbook"/>
-          <w:b w:val="0"/>
-          <w:i w:val="0"/>
-          <w:color w:val="000000"/>
-          <w:sz w:val="24"/>
-          <w:fitText w:val="10866" w:id="101"/>
-        </w:rPr>
-        <w:t xml:space="preserve">Suspendisse in justo eu magna luctus suscipit. Sed lectus. Integer euismod lacus luctus magna. </w:t>
-      </w:r>
-      <w:r>
-        <w:br/>
-      </w:r>
-      <w:r>
-        <w:rPr>
-          <w:rFonts w:ascii="Century Schoolbook" w:hAnsi="Century Schoolbook" w:eastAsia="Century Schoolbook" w:cs="Century Schoolbook"/>
-          <w:b w:val="0"/>
-          <w:i w:val="0"/>
-          <w:color w:val="000000"/>
-          <w:sz w:val="24"/>
-          <w:fitText w:val="10867" w:id="102"/>
-        </w:rPr>
-        <w:t xml:space="preserve">Quisque cursus, metus vitae pharetra auctor, sem massa mattis sem, at interdum magna augue </w:t>
-      </w:r>
-      <w:r>
-        <w:br/>
-      </w:r>
-      <w:r>
-        <w:rPr>
-          <w:rFonts w:ascii="Century Schoolbook" w:hAnsi="Century Schoolbook" w:eastAsia="Century Schoolbook" w:cs="Century Schoolbook"/>
-          <w:b w:val="0"/>
-          <w:i w:val="0"/>
-          <w:color w:val="000000"/>
-          <w:sz w:val="24"/>
-          <w:fitText w:val="10867" w:id="103"/>
-        </w:rPr>
-        <w:t xml:space="preserve">eget diam. Vestibulum ante ipsum primis in faucibus orci luctus et ultrices posuere cubilia Curae; </w:t>
-      </w:r>
-      <w:r>
-        <w:br/>
-      </w:r>
-      <w:r>
-        <w:rPr>
-          <w:rFonts w:ascii="Century Schoolbook" w:hAnsi="Century Schoolbook" w:eastAsia="Century Schoolbook" w:cs="Century Schoolbook"/>
-          <w:b w:val="0"/>
-          <w:i w:val="0"/>
-          <w:color w:val="000000"/>
-          <w:sz w:val="24"/>
-          <w:fitText w:val="10867" w:id="104"/>
-        </w:rPr>
-        <w:t xml:space="preserve">Morbi lacinia molestie dui. Praesent blandit dolor. Sed non quam. In vel mi sit amet augue congue </w:t>
-      </w:r>
-      <w:r>
-        <w:br/>
-      </w:r>
-      <w:r>
-        <w:rPr>
-          <w:rFonts w:ascii="Century Schoolbook" w:hAnsi="Century Schoolbook" w:eastAsia="Century Schoolbook" w:cs="Century Schoolbook"/>
-          <w:b w:val="0"/>
-          <w:i w:val="0"/>
-          <w:color w:val="000000"/>
-          <w:sz w:val="24"/>
-          <w:fitText w:val="6587" w:id="105"/>
-        </w:rPr>
-        <w:t xml:space="preserve">elementum. Morbi in ipsum sit amet pede facilisis laoreet.  </w:t>
+        <w:pict>
+          <v:shape id="DocuMindTextBox109" type="#_x0000_t202" stroked="f" filled="f" o:allowincell="f" style="position:absolute;margin-left:36.140pt;margin-top:527.068pt;width:331.369pt;height:15.424pt;z-index:251659264;mso-position-horizontal-relative:page;mso-position-vertical-relative:page;mso-wrap-style:none;">
+            <w10:wrap type="none"/>
+            <v:textbox inset="0,0,0,0">
+              <w:txbxContent>
+                <w:p>
+                  <w:pPr>
+                    <w:spacing w:before="0" w:after="0" w:lineRule="exact" w:line="288"/>
+                    <w:ind w:left="0" w:right="0" w:firstLine="0"/>
+                  </w:pPr>
+                  <w:r>
+                    <w:rPr>
+                      <w:rFonts w:ascii="Century Schoolbook" w:hAnsi="Century Schoolbook" w:eastAsia="Century Schoolbook" w:cs="Century Schoolbook"/>
+                      <w:b w:val="0"/>
+                      <w:i w:val="0"/>
+                      <w:color w:val="000000"/>
+                      <w:sz w:val="24"/>
+                    </w:rPr>
+                    <w:t xml:space="preserve">elementum. Morbi in ipsum sit amet pede facilisis laoreet.  </w:t>
+                  </w:r>
+                </w:p>
+              </w:txbxContent>
+            </v:textbox>
+          </v:shape>
+        </w:pict>
       </w:r>
     </w:p>
     <w:sectPr>
       <w:pgSz w:w="12240" w:h="15840"/>
-      <w:pgMar w:top="730" w:right="650" w:bottom="4722" w:left="723" w:header="720" w:footer="720" w:gutter="0"/>
+      <w:pgMar w:top="0" w:right="0" w:bottom="0" w:left="0" w:header="0" w:footer="0" w:gutter="0"/>
       <w:cols w:space="720"/>
       <w:docGrid w:linePitch="360"/>
     </w:sectPr>

</xml_diff>

<commit_message>
Step 46 - Fix Helvetica font fallback and text clipping
</commit_message>
<xml_diff>
--- a/output/output.docx
+++ b/output/output.docx
@@ -13,13 +13,13 @@
       </w:r>
       <w:r>
         <w:pict>
-          <v:shape id="DocuMindTextBox1" type="#_x0000_t202" stroked="f" filled="f" o:allowincell="f" style="position:absolute;margin-left:303.020pt;margin-top:742.036pt;width:10.794pt;height:15.652pt;z-index:251659264;mso-position-horizontal-relative:page;mso-position-vertical-relative:page;mso-wrap-style:none;">
+          <v:shape id="DocuMindTextBox1" type="#_x0000_t202" stroked="f" filled="f" o:allowincell="f" style="position:absolute;margin-left:303.020pt;margin-top:740.536pt;width:11.794pt;height:21.000pt;z-index:251659264;mso-position-horizontal-relative:page;mso-position-vertical-relative:page;mso-wrap-style:none;mso-fit-shape-to-text:t;">
             <w10:wrap type="none"/>
             <v:textbox inset="0,0,0,0">
               <w:txbxContent>
                 <w:p>
                   <w:pPr>
-                    <w:spacing w:before="0" w:after="0" w:lineRule="exact" w:line="293"/>
+                    <w:spacing w:before="0" w:after="0" w:lineRule="exact" w:line="300"/>
                     <w:ind w:left="0" w:right="0" w:firstLine="0"/>
                   </w:pPr>
                   <w:r>
@@ -40,13 +40,13 @@
       </w:r>
       <w:r>
         <w:pict>
-          <v:shape id="DocuMindTextBox2" type="#_x0000_t202" stroked="f" filled="f" o:allowincell="f" style="position:absolute;margin-left:190.309pt;margin-top:48.604pt;width:243.994pt;height:44.272pt;z-index:251659264;mso-position-horizontal-relative:page;mso-position-vertical-relative:page;mso-wrap-style:none;">
+          <v:shape id="DocuMindTextBox2" type="#_x0000_t202" stroked="f" filled="f" o:allowincell="f" style="position:absolute;margin-left:190.309pt;margin-top:47.104pt;width:244.994pt;height:51.000pt;z-index:251659264;mso-position-horizontal-relative:page;mso-position-vertical-relative:page;mso-wrap-style:none;mso-fit-shape-to-text:t;">
             <w10:wrap type="none"/>
             <v:textbox inset="0,0,0,0">
               <w:txbxContent>
                 <w:p>
                   <w:pPr>
-                    <w:spacing w:before="0" w:after="0" w:lineRule="exact" w:line="865"/>
+                    <w:spacing w:before="0" w:after="0" w:lineRule="exact" w:line="900"/>
                     <w:ind w:left="0" w:right="0" w:firstLine="0"/>
                   </w:pPr>
                   <w:r>
@@ -67,13 +67,13 @@
       </w:r>
       <w:r>
         <w:pict>
-          <v:shape id="DocuMindTextBox3" type="#_x0000_t202" stroked="f" filled="f" o:allowincell="f" style="position:absolute;margin-left:179.468pt;margin-top:106.192pt;width:164.002pt;height:22.636pt;z-index:251659264;mso-position-horizontal-relative:page;mso-position-vertical-relative:page;mso-wrap-style:none;">
+          <v:shape id="DocuMindTextBox3" type="#_x0000_t202" stroked="f" filled="f" o:allowincell="f" style="position:absolute;margin-left:179.468pt;margin-top:104.692pt;width:165.002pt;height:28.500pt;z-index:251659264;mso-position-horizontal-relative:page;mso-position-vertical-relative:page;mso-wrap-style:none;mso-fit-shape-to-text:t;">
             <w10:wrap type="none"/>
             <v:textbox inset="0,0,0,0">
               <w:txbxContent>
                 <w:p>
                   <w:pPr>
-                    <w:spacing w:before="0" w:after="0" w:lineRule="exact" w:line="433"/>
+                    <w:spacing w:before="0" w:after="0" w:lineRule="exact" w:line="450"/>
                     <w:ind w:left="0" w:right="0" w:firstLine="0"/>
                   </w:pPr>
                   <w:r>
@@ -94,13 +94,13 @@
       </w:r>
       <w:r>
         <w:pict>
-          <v:shape id="DocuMindTextBox4" type="#_x0000_t202" stroked="f" filled="f" o:allowincell="f" style="position:absolute;margin-left:341.468pt;margin-top:106.192pt;width:93.341pt;height:22.636pt;z-index:251659264;mso-position-horizontal-relative:page;mso-position-vertical-relative:page;mso-wrap-style:none;">
+          <v:shape id="DocuMindTextBox4" type="#_x0000_t202" stroked="f" filled="f" o:allowincell="f" style="position:absolute;margin-left:341.468pt;margin-top:104.692pt;width:94.341pt;height:28.500pt;z-index:251659264;mso-position-horizontal-relative:page;mso-position-vertical-relative:page;mso-wrap-style:none;mso-fit-shape-to-text:t;">
             <w10:wrap type="none"/>
             <v:textbox inset="0,0,0,0">
               <w:txbxContent>
                 <w:p>
                   <w:pPr>
-                    <w:spacing w:before="0" w:after="0" w:lineRule="exact" w:line="433"/>
+                    <w:spacing w:before="0" w:after="0" w:lineRule="exact" w:line="450"/>
                     <w:ind w:left="0" w:right="0" w:firstLine="0"/>
                   </w:pPr>
                   <w:r>
@@ -121,13 +121,13 @@
       </w:r>
       <w:r>
         <w:pict>
-          <v:shape id="DocuMindTextBox5" type="#_x0000_t202" stroked="f" filled="f" o:allowincell="f" style="position:absolute;margin-left:36.140pt;margin-top:142.642pt;width:546.399pt;height:20.040pt;z-index:251659264;mso-position-horizontal-relative:page;mso-position-vertical-relative:page;mso-wrap-style:none;">
+          <v:shape id="DocuMindTextBox5" type="#_x0000_t202" stroked="f" filled="f" o:allowincell="f" style="position:absolute;margin-left:36.140pt;margin-top:141.142pt;width:547.399pt;height:25.800pt;z-index:251659264;mso-position-horizontal-relative:page;mso-position-vertical-relative:page;mso-wrap-style:none;mso-fit-shape-to-text:t;">
             <w10:wrap type="none"/>
             <v:textbox inset="0,0,0,0">
               <w:txbxContent>
                 <w:p>
                   <w:pPr>
-                    <w:spacing w:before="0" w:after="0" w:lineRule="exact" w:line="381"/>
+                    <w:spacing w:before="0" w:after="0" w:lineRule="exact" w:line="396"/>
                     <w:ind w:left="0" w:right="0" w:firstLine="0"/>
                   </w:pPr>
                   <w:r>
@@ -148,13 +148,13 @@
       </w:r>
       <w:r>
         <w:pict>
-          <v:shape id="DocuMindTextBox6" type="#_x0000_t202" stroked="f" filled="f" o:allowincell="f" style="position:absolute;margin-left:36.140pt;margin-top:161.842pt;width:546.410pt;height:20.040pt;z-index:251659264;mso-position-horizontal-relative:page;mso-position-vertical-relative:page;mso-wrap-style:none;">
+          <v:shape id="DocuMindTextBox6" type="#_x0000_t202" stroked="f" filled="f" o:allowincell="f" style="position:absolute;margin-left:36.140pt;margin-top:160.342pt;width:547.410pt;height:25.800pt;z-index:251659264;mso-position-horizontal-relative:page;mso-position-vertical-relative:page;mso-wrap-style:none;mso-fit-shape-to-text:t;">
             <w10:wrap type="none"/>
             <v:textbox inset="0,0,0,0">
               <w:txbxContent>
                 <w:p>
                   <w:pPr>
-                    <w:spacing w:before="0" w:after="0" w:lineRule="exact" w:line="381"/>
+                    <w:spacing w:before="0" w:after="0" w:lineRule="exact" w:line="396"/>
                     <w:ind w:left="0" w:right="0" w:firstLine="0"/>
                   </w:pPr>
                   <w:r>
@@ -175,13 +175,13 @@
       </w:r>
       <w:r>
         <w:pict>
-          <v:shape id="DocuMindTextBox7" type="#_x0000_t202" stroked="f" filled="f" o:allowincell="f" style="position:absolute;margin-left:36.140pt;margin-top:181.042pt;width:546.410pt;height:20.040pt;z-index:251659264;mso-position-horizontal-relative:page;mso-position-vertical-relative:page;mso-wrap-style:none;">
+          <v:shape id="DocuMindTextBox7" type="#_x0000_t202" stroked="f" filled="f" o:allowincell="f" style="position:absolute;margin-left:36.140pt;margin-top:179.542pt;width:547.410pt;height:25.800pt;z-index:251659264;mso-position-horizontal-relative:page;mso-position-vertical-relative:page;mso-wrap-style:none;mso-fit-shape-to-text:t;">
             <w10:wrap type="none"/>
             <v:textbox inset="0,0,0,0">
               <w:txbxContent>
                 <w:p>
                   <w:pPr>
-                    <w:spacing w:before="0" w:after="0" w:lineRule="exact" w:line="381"/>
+                    <w:spacing w:before="0" w:after="0" w:lineRule="exact" w:line="396"/>
                     <w:ind w:left="0" w:right="0" w:firstLine="0"/>
                   </w:pPr>
                   <w:r>
@@ -202,13 +202,13 @@
       </w:r>
       <w:r>
         <w:pict>
-          <v:shape id="DocuMindTextBox8" type="#_x0000_t202" stroked="f" filled="f" o:allowincell="f" style="position:absolute;margin-left:36.140pt;margin-top:200.242pt;width:546.529pt;height:20.040pt;z-index:251659264;mso-position-horizontal-relative:page;mso-position-vertical-relative:page;mso-wrap-style:none;">
+          <v:shape id="DocuMindTextBox8" type="#_x0000_t202" stroked="f" filled="f" o:allowincell="f" style="position:absolute;margin-left:36.140pt;margin-top:198.742pt;width:547.529pt;height:25.800pt;z-index:251659264;mso-position-horizontal-relative:page;mso-position-vertical-relative:page;mso-wrap-style:none;mso-fit-shape-to-text:t;">
             <w10:wrap type="none"/>
             <v:textbox inset="0,0,0,0">
               <w:txbxContent>
                 <w:p>
                   <w:pPr>
-                    <w:spacing w:before="0" w:after="0" w:lineRule="exact" w:line="381"/>
+                    <w:spacing w:before="0" w:after="0" w:lineRule="exact" w:line="396"/>
                     <w:ind w:left="0" w:right="0" w:firstLine="0"/>
                   </w:pPr>
                   <w:r>
@@ -229,13 +229,13 @@
       </w:r>
       <w:r>
         <w:pict>
-          <v:shape id="DocuMindTextBox9" type="#_x0000_t202" stroked="f" filled="f" o:allowincell="f" style="position:absolute;margin-left:36.140pt;margin-top:219.442pt;width:171.122pt;height:20.040pt;z-index:251659264;mso-position-horizontal-relative:page;mso-position-vertical-relative:page;mso-wrap-style:none;">
+          <v:shape id="DocuMindTextBox9" type="#_x0000_t202" stroked="f" filled="f" o:allowincell="f" style="position:absolute;margin-left:36.140pt;margin-top:217.942pt;width:172.122pt;height:25.800pt;z-index:251659264;mso-position-horizontal-relative:page;mso-position-vertical-relative:page;mso-wrap-style:none;mso-fit-shape-to-text:t;">
             <w10:wrap type="none"/>
             <v:textbox inset="0,0,0,0">
               <w:txbxContent>
                 <w:p>
                   <w:pPr>
-                    <w:spacing w:before="0" w:after="0" w:lineRule="exact" w:line="381"/>
+                    <w:spacing w:before="0" w:after="0" w:lineRule="exact" w:line="396"/>
                     <w:ind w:left="0" w:right="0" w:firstLine="0"/>
                   </w:pPr>
                   <w:r>
@@ -256,13 +256,13 @@
       </w:r>
       <w:r>
         <w:pict>
-          <v:shape id="DocuMindTextBox10" type="#_x0000_t202" stroked="f" filled="f" o:allowincell="f" style="position:absolute;margin-left:36.140pt;margin-top:252.988pt;width:545.325pt;height:15.424pt;z-index:251659264;mso-position-horizontal-relative:page;mso-position-vertical-relative:page;mso-wrap-style:none;">
+          <v:shape id="DocuMindTextBox10" type="#_x0000_t202" stroked="f" filled="f" o:allowincell="f" style="position:absolute;margin-left:36.140pt;margin-top:251.488pt;width:546.325pt;height:21.000pt;z-index:251659264;mso-position-horizontal-relative:page;mso-position-vertical-relative:page;mso-wrap-style:none;mso-fit-shape-to-text:t;">
             <w10:wrap type="none"/>
             <v:textbox inset="0,0,0,0">
               <w:txbxContent>
                 <w:p>
                   <w:pPr>
-                    <w:spacing w:before="0" w:after="0" w:lineRule="exact" w:line="288"/>
+                    <w:spacing w:before="0" w:after="0" w:lineRule="exact" w:line="300"/>
                     <w:ind w:left="0" w:right="0" w:firstLine="0"/>
                   </w:pPr>
                   <w:r>
@@ -283,13 +283,13 @@
       </w:r>
       <w:r>
         <w:pict>
-          <v:shape id="DocuMindTextBox11" type="#_x0000_t202" stroked="f" filled="f" o:allowincell="f" style="position:absolute;margin-left:36.140pt;margin-top:267.388pt;width:545.337pt;height:15.424pt;z-index:251659264;mso-position-horizontal-relative:page;mso-position-vertical-relative:page;mso-wrap-style:none;">
+          <v:shape id="DocuMindTextBox11" type="#_x0000_t202" stroked="f" filled="f" o:allowincell="f" style="position:absolute;margin-left:36.140pt;margin-top:265.888pt;width:546.337pt;height:21.000pt;z-index:251659264;mso-position-horizontal-relative:page;mso-position-vertical-relative:page;mso-wrap-style:none;mso-fit-shape-to-text:t;">
             <w10:wrap type="none"/>
             <v:textbox inset="0,0,0,0">
               <w:txbxContent>
                 <w:p>
                   <w:pPr>
-                    <w:spacing w:before="0" w:after="0" w:lineRule="exact" w:line="288"/>
+                    <w:spacing w:before="0" w:after="0" w:lineRule="exact" w:line="300"/>
                     <w:ind w:left="0" w:right="0" w:firstLine="0"/>
                   </w:pPr>
                   <w:r>
@@ -310,13 +310,13 @@
       </w:r>
       <w:r>
         <w:pict>
-          <v:shape id="DocuMindTextBox12" type="#_x0000_t202" stroked="f" filled="f" o:allowincell="f" style="position:absolute;margin-left:36.140pt;margin-top:281.788pt;width:545.352pt;height:15.424pt;z-index:251659264;mso-position-horizontal-relative:page;mso-position-vertical-relative:page;mso-wrap-style:none;">
+          <v:shape id="DocuMindTextBox12" type="#_x0000_t202" stroked="f" filled="f" o:allowincell="f" style="position:absolute;margin-left:36.140pt;margin-top:280.288pt;width:546.352pt;height:21.000pt;z-index:251659264;mso-position-horizontal-relative:page;mso-position-vertical-relative:page;mso-wrap-style:none;mso-fit-shape-to-text:t;">
             <w10:wrap type="none"/>
             <v:textbox inset="0,0,0,0">
               <w:txbxContent>
                 <w:p>
                   <w:pPr>
-                    <w:spacing w:before="0" w:after="0" w:lineRule="exact" w:line="288"/>
+                    <w:spacing w:before="0" w:after="0" w:lineRule="exact" w:line="300"/>
                     <w:ind w:left="0" w:right="0" w:firstLine="0"/>
                   </w:pPr>
                   <w:r>
@@ -337,13 +337,13 @@
       </w:r>
       <w:r>
         <w:pict>
-          <v:shape id="DocuMindTextBox13" type="#_x0000_t202" stroked="f" filled="f" o:allowincell="f" style="position:absolute;margin-left:36.140pt;margin-top:296.188pt;width:545.333pt;height:15.424pt;z-index:251659264;mso-position-horizontal-relative:page;mso-position-vertical-relative:page;mso-wrap-style:none;">
+          <v:shape id="DocuMindTextBox13" type="#_x0000_t202" stroked="f" filled="f" o:allowincell="f" style="position:absolute;margin-left:36.140pt;margin-top:294.688pt;width:546.333pt;height:21.000pt;z-index:251659264;mso-position-horizontal-relative:page;mso-position-vertical-relative:page;mso-wrap-style:none;mso-fit-shape-to-text:t;">
             <w10:wrap type="none"/>
             <v:textbox inset="0,0,0,0">
               <w:txbxContent>
                 <w:p>
                   <w:pPr>
-                    <w:spacing w:before="0" w:after="0" w:lineRule="exact" w:line="288"/>
+                    <w:spacing w:before="0" w:after="0" w:lineRule="exact" w:line="300"/>
                     <w:ind w:left="0" w:right="0" w:firstLine="0"/>
                   </w:pPr>
                   <w:r>
@@ -364,13 +364,13 @@
       </w:r>
       <w:r>
         <w:pict>
-          <v:shape id="DocuMindTextBox14" type="#_x0000_t202" stroked="f" filled="f" o:allowincell="f" style="position:absolute;margin-left:36.140pt;margin-top:310.588pt;width:421.135pt;height:15.424pt;z-index:251659264;mso-position-horizontal-relative:page;mso-position-vertical-relative:page;mso-wrap-style:none;">
+          <v:shape id="DocuMindTextBox14" type="#_x0000_t202" stroked="f" filled="f" o:allowincell="f" style="position:absolute;margin-left:36.140pt;margin-top:309.088pt;width:422.135pt;height:21.000pt;z-index:251659264;mso-position-horizontal-relative:page;mso-position-vertical-relative:page;mso-wrap-style:none;mso-fit-shape-to-text:t;">
             <w10:wrap type="none"/>
             <v:textbox inset="0,0,0,0">
               <w:txbxContent>
                 <w:p>
                   <w:pPr>
-                    <w:spacing w:before="0" w:after="0" w:lineRule="exact" w:line="288"/>
+                    <w:spacing w:before="0" w:after="0" w:lineRule="exact" w:line="300"/>
                     <w:ind w:left="0" w:right="0" w:firstLine="0"/>
                   </w:pPr>
                   <w:r>
@@ -391,13 +391,13 @@
       </w:r>
       <w:r>
         <w:pict>
-          <v:shape id="DocuMindTextBox15" type="#_x0000_t202" stroked="f" filled="f" o:allowincell="f" style="position:absolute;margin-left:36.140pt;margin-top:339.388pt;width:545.329pt;height:15.424pt;z-index:251659264;mso-position-horizontal-relative:page;mso-position-vertical-relative:page;mso-wrap-style:none;">
+          <v:shape id="DocuMindTextBox15" type="#_x0000_t202" stroked="f" filled="f" o:allowincell="f" style="position:absolute;margin-left:36.140pt;margin-top:337.888pt;width:546.329pt;height:21.000pt;z-index:251659264;mso-position-horizontal-relative:page;mso-position-vertical-relative:page;mso-wrap-style:none;mso-fit-shape-to-text:t;">
             <w10:wrap type="none"/>
             <v:textbox inset="0,0,0,0">
               <w:txbxContent>
                 <w:p>
                   <w:pPr>
-                    <w:spacing w:before="0" w:after="0" w:lineRule="exact" w:line="288"/>
+                    <w:spacing w:before="0" w:after="0" w:lineRule="exact" w:line="300"/>
                     <w:ind w:left="0" w:right="0" w:firstLine="0"/>
                   </w:pPr>
                   <w:r>
@@ -418,13 +418,13 @@
       </w:r>
       <w:r>
         <w:pict>
-          <v:shape id="DocuMindTextBox16" type="#_x0000_t202" stroked="f" filled="f" o:allowincell="f" style="position:absolute;margin-left:36.140pt;margin-top:353.788pt;width:545.330pt;height:15.424pt;z-index:251659264;mso-position-horizontal-relative:page;mso-position-vertical-relative:page;mso-wrap-style:none;">
+          <v:shape id="DocuMindTextBox16" type="#_x0000_t202" stroked="f" filled="f" o:allowincell="f" style="position:absolute;margin-left:36.140pt;margin-top:352.288pt;width:546.330pt;height:21.000pt;z-index:251659264;mso-position-horizontal-relative:page;mso-position-vertical-relative:page;mso-wrap-style:none;mso-fit-shape-to-text:t;">
             <w10:wrap type="none"/>
             <v:textbox inset="0,0,0,0">
               <w:txbxContent>
                 <w:p>
                   <w:pPr>
-                    <w:spacing w:before="0" w:after="0" w:lineRule="exact" w:line="288"/>
+                    <w:spacing w:before="0" w:after="0" w:lineRule="exact" w:line="300"/>
                     <w:ind w:left="0" w:right="0" w:firstLine="0"/>
                   </w:pPr>
                   <w:r>
@@ -445,13 +445,13 @@
       </w:r>
       <w:r>
         <w:pict>
-          <v:shape id="DocuMindTextBox17" type="#_x0000_t202" stroked="f" filled="f" o:allowincell="f" style="position:absolute;margin-left:36.140pt;margin-top:368.188pt;width:545.330pt;height:15.424pt;z-index:251659264;mso-position-horizontal-relative:page;mso-position-vertical-relative:page;mso-wrap-style:none;">
+          <v:shape id="DocuMindTextBox17" type="#_x0000_t202" stroked="f" filled="f" o:allowincell="f" style="position:absolute;margin-left:36.140pt;margin-top:366.688pt;width:546.330pt;height:21.000pt;z-index:251659264;mso-position-horizontal-relative:page;mso-position-vertical-relative:page;mso-wrap-style:none;mso-fit-shape-to-text:t;">
             <w10:wrap type="none"/>
             <v:textbox inset="0,0,0,0">
               <w:txbxContent>
                 <w:p>
                   <w:pPr>
-                    <w:spacing w:before="0" w:after="0" w:lineRule="exact" w:line="288"/>
+                    <w:spacing w:before="0" w:after="0" w:lineRule="exact" w:line="300"/>
                     <w:ind w:left="0" w:right="0" w:firstLine="0"/>
                   </w:pPr>
                   <w:r>
@@ -472,13 +472,13 @@
       </w:r>
       <w:r>
         <w:pict>
-          <v:shape id="DocuMindTextBox18" type="#_x0000_t202" stroked="f" filled="f" o:allowincell="f" style="position:absolute;margin-left:36.140pt;margin-top:382.588pt;width:520.252pt;height:15.424pt;z-index:251659264;mso-position-horizontal-relative:page;mso-position-vertical-relative:page;mso-wrap-style:none;">
+          <v:shape id="DocuMindTextBox18" type="#_x0000_t202" stroked="f" filled="f" o:allowincell="f" style="position:absolute;margin-left:36.140pt;margin-top:381.088pt;width:521.252pt;height:21.000pt;z-index:251659264;mso-position-horizontal-relative:page;mso-position-vertical-relative:page;mso-wrap-style:none;mso-fit-shape-to-text:t;">
             <w10:wrap type="none"/>
             <v:textbox inset="0,0,0,0">
               <w:txbxContent>
                 <w:p>
                   <w:pPr>
-                    <w:spacing w:before="0" w:after="0" w:lineRule="exact" w:line="288"/>
+                    <w:spacing w:before="0" w:after="0" w:lineRule="exact" w:line="300"/>
                     <w:ind w:left="0" w:right="0" w:firstLine="0"/>
                   </w:pPr>
                   <w:r>
@@ -499,13 +499,13 @@
       </w:r>
       <w:r>
         <w:pict>
-          <v:shape id="DocuMindTextBox19" type="#_x0000_t202" stroked="f" filled="f" o:allowincell="f" style="position:absolute;margin-left:36.140pt;margin-top:411.628pt;width:545.330pt;height:15.424pt;z-index:251659264;mso-position-horizontal-relative:page;mso-position-vertical-relative:page;mso-wrap-style:none;">
+          <v:shape id="DocuMindTextBox19" type="#_x0000_t202" stroked="f" filled="f" o:allowincell="f" style="position:absolute;margin-left:36.140pt;margin-top:410.128pt;width:546.330pt;height:21.000pt;z-index:251659264;mso-position-horizontal-relative:page;mso-position-vertical-relative:page;mso-wrap-style:none;mso-fit-shape-to-text:t;">
             <w10:wrap type="none"/>
             <v:textbox inset="0,0,0,0">
               <w:txbxContent>
                 <w:p>
                   <w:pPr>
-                    <w:spacing w:before="0" w:after="0" w:lineRule="exact" w:line="288"/>
+                    <w:spacing w:before="0" w:after="0" w:lineRule="exact" w:line="300"/>
                     <w:ind w:left="0" w:right="0" w:firstLine="0"/>
                   </w:pPr>
                   <w:r>
@@ -526,13 +526,13 @@
       </w:r>
       <w:r>
         <w:pict>
-          <v:shape id="DocuMindTextBox20" type="#_x0000_t202" stroked="f" filled="f" o:allowincell="f" style="position:absolute;margin-left:36.140pt;margin-top:426.028pt;width:545.331pt;height:15.424pt;z-index:251659264;mso-position-horizontal-relative:page;mso-position-vertical-relative:page;mso-wrap-style:none;">
+          <v:shape id="DocuMindTextBox20" type="#_x0000_t202" stroked="f" filled="f" o:allowincell="f" style="position:absolute;margin-left:36.140pt;margin-top:424.528pt;width:546.331pt;height:21.000pt;z-index:251659264;mso-position-horizontal-relative:page;mso-position-vertical-relative:page;mso-wrap-style:none;mso-fit-shape-to-text:t;">
             <w10:wrap type="none"/>
             <v:textbox inset="0,0,0,0">
               <w:txbxContent>
                 <w:p>
                   <w:pPr>
-                    <w:spacing w:before="0" w:after="0" w:lineRule="exact" w:line="288"/>
+                    <w:spacing w:before="0" w:after="0" w:lineRule="exact" w:line="300"/>
                     <w:ind w:left="0" w:right="0" w:firstLine="0"/>
                   </w:pPr>
                   <w:r>
@@ -553,13 +553,13 @@
       </w:r>
       <w:r>
         <w:pict>
-          <v:shape id="DocuMindTextBox21" type="#_x0000_t202" stroked="f" filled="f" o:allowincell="f" style="position:absolute;margin-left:36.140pt;margin-top:440.428pt;width:545.318pt;height:15.424pt;z-index:251659264;mso-position-horizontal-relative:page;mso-position-vertical-relative:page;mso-wrap-style:none;">
+          <v:shape id="DocuMindTextBox21" type="#_x0000_t202" stroked="f" filled="f" o:allowincell="f" style="position:absolute;margin-left:36.140pt;margin-top:438.928pt;width:546.318pt;height:21.000pt;z-index:251659264;mso-position-horizontal-relative:page;mso-position-vertical-relative:page;mso-wrap-style:none;mso-fit-shape-to-text:t;">
             <w10:wrap type="none"/>
             <v:textbox inset="0,0,0,0">
               <w:txbxContent>
                 <w:p>
                   <w:pPr>
-                    <w:spacing w:before="0" w:after="0" w:lineRule="exact" w:line="288"/>
+                    <w:spacing w:before="0" w:after="0" w:lineRule="exact" w:line="300"/>
                     <w:ind w:left="0" w:right="0" w:firstLine="0"/>
                   </w:pPr>
                   <w:r>
@@ -580,13 +580,13 @@
       </w:r>
       <w:r>
         <w:pict>
-          <v:shape id="DocuMindTextBox22" type="#_x0000_t202" stroked="f" filled="f" o:allowincell="f" style="position:absolute;margin-left:36.140pt;margin-top:454.828pt;width:531.168pt;height:15.424pt;z-index:251659264;mso-position-horizontal-relative:page;mso-position-vertical-relative:page;mso-wrap-style:none;">
+          <v:shape id="DocuMindTextBox22" type="#_x0000_t202" stroked="f" filled="f" o:allowincell="f" style="position:absolute;margin-left:36.140pt;margin-top:453.328pt;width:532.168pt;height:21.000pt;z-index:251659264;mso-position-horizontal-relative:page;mso-position-vertical-relative:page;mso-wrap-style:none;mso-fit-shape-to-text:t;">
             <w10:wrap type="none"/>
             <v:textbox inset="0,0,0,0">
               <w:txbxContent>
                 <w:p>
                   <w:pPr>
-                    <w:spacing w:before="0" w:after="0" w:lineRule="exact" w:line="288"/>
+                    <w:spacing w:before="0" w:after="0" w:lineRule="exact" w:line="300"/>
                     <w:ind w:left="0" w:right="0" w:firstLine="0"/>
                   </w:pPr>
                   <w:r>
@@ -607,13 +607,13 @@
       </w:r>
       <w:r>
         <w:pict>
-          <v:shape id="DocuMindTextBox23" type="#_x0000_t202" stroked="f" filled="f" o:allowincell="f" style="position:absolute;margin-left:36.140pt;margin-top:483.628pt;width:545.320pt;height:15.424pt;z-index:251659264;mso-position-horizontal-relative:page;mso-position-vertical-relative:page;mso-wrap-style:none;">
+          <v:shape id="DocuMindTextBox23" type="#_x0000_t202" stroked="f" filled="f" o:allowincell="f" style="position:absolute;margin-left:36.140pt;margin-top:482.128pt;width:546.320pt;height:21.000pt;z-index:251659264;mso-position-horizontal-relative:page;mso-position-vertical-relative:page;mso-wrap-style:none;mso-fit-shape-to-text:t;">
             <w10:wrap type="none"/>
             <v:textbox inset="0,0,0,0">
               <w:txbxContent>
                 <w:p>
                   <w:pPr>
-                    <w:spacing w:before="0" w:after="0" w:lineRule="exact" w:line="288"/>
+                    <w:spacing w:before="0" w:after="0" w:lineRule="exact" w:line="300"/>
                     <w:ind w:left="0" w:right="0" w:firstLine="0"/>
                   </w:pPr>
                   <w:r>
@@ -634,13 +634,13 @@
       </w:r>
       <w:r>
         <w:pict>
-          <v:shape id="DocuMindTextBox24" type="#_x0000_t202" stroked="f" filled="f" o:allowincell="f" style="position:absolute;margin-left:36.140pt;margin-top:498.028pt;width:545.337pt;height:15.424pt;z-index:251659264;mso-position-horizontal-relative:page;mso-position-vertical-relative:page;mso-wrap-style:none;">
+          <v:shape id="DocuMindTextBox24" type="#_x0000_t202" stroked="f" filled="f" o:allowincell="f" style="position:absolute;margin-left:36.140pt;margin-top:496.528pt;width:546.337pt;height:21.000pt;z-index:251659264;mso-position-horizontal-relative:page;mso-position-vertical-relative:page;mso-wrap-style:none;mso-fit-shape-to-text:t;">
             <w10:wrap type="none"/>
             <v:textbox inset="0,0,0,0">
               <w:txbxContent>
                 <w:p>
                   <w:pPr>
-                    <w:spacing w:before="0" w:after="0" w:lineRule="exact" w:line="288"/>
+                    <w:spacing w:before="0" w:after="0" w:lineRule="exact" w:line="300"/>
                     <w:ind w:left="0" w:right="0" w:firstLine="0"/>
                   </w:pPr>
                   <w:r>
@@ -661,13 +661,13 @@
       </w:r>
       <w:r>
         <w:pict>
-          <v:shape id="DocuMindTextBox25" type="#_x0000_t202" stroked="f" filled="f" o:allowincell="f" style="position:absolute;margin-left:36.140pt;margin-top:512.428pt;width:545.328pt;height:15.424pt;z-index:251659264;mso-position-horizontal-relative:page;mso-position-vertical-relative:page;mso-wrap-style:none;">
+          <v:shape id="DocuMindTextBox25" type="#_x0000_t202" stroked="f" filled="f" o:allowincell="f" style="position:absolute;margin-left:36.140pt;margin-top:510.928pt;width:546.328pt;height:21.000pt;z-index:251659264;mso-position-horizontal-relative:page;mso-position-vertical-relative:page;mso-wrap-style:none;mso-fit-shape-to-text:t;">
             <w10:wrap type="none"/>
             <v:textbox inset="0,0,0,0">
               <w:txbxContent>
                 <w:p>
                   <w:pPr>
-                    <w:spacing w:before="0" w:after="0" w:lineRule="exact" w:line="288"/>
+                    <w:spacing w:before="0" w:after="0" w:lineRule="exact" w:line="300"/>
                     <w:ind w:left="0" w:right="0" w:firstLine="0"/>
                   </w:pPr>
                   <w:r>
@@ -688,13 +688,13 @@
       </w:r>
       <w:r>
         <w:pict>
-          <v:shape id="DocuMindTextBox26" type="#_x0000_t202" stroked="f" filled="f" o:allowincell="f" style="position:absolute;margin-left:36.140pt;margin-top:527.068pt;width:545.331pt;height:15.424pt;z-index:251659264;mso-position-horizontal-relative:page;mso-position-vertical-relative:page;mso-wrap-style:none;">
+          <v:shape id="DocuMindTextBox26" type="#_x0000_t202" stroked="f" filled="f" o:allowincell="f" style="position:absolute;margin-left:36.140pt;margin-top:525.568pt;width:546.331pt;height:21.000pt;z-index:251659264;mso-position-horizontal-relative:page;mso-position-vertical-relative:page;mso-wrap-style:none;mso-fit-shape-to-text:t;">
             <w10:wrap type="none"/>
             <v:textbox inset="0,0,0,0">
               <w:txbxContent>
                 <w:p>
                   <w:pPr>
-                    <w:spacing w:before="0" w:after="0" w:lineRule="exact" w:line="288"/>
+                    <w:spacing w:before="0" w:after="0" w:lineRule="exact" w:line="300"/>
                     <w:ind w:left="0" w:right="0" w:firstLine="0"/>
                   </w:pPr>
                   <w:r>
@@ -715,13 +715,13 @@
       </w:r>
       <w:r>
         <w:pict>
-          <v:shape id="DocuMindTextBox27" type="#_x0000_t202" stroked="f" filled="f" o:allowincell="f" style="position:absolute;margin-left:36.140pt;margin-top:541.468pt;width:545.329pt;height:15.424pt;z-index:251659264;mso-position-horizontal-relative:page;mso-position-vertical-relative:page;mso-wrap-style:none;">
+          <v:shape id="DocuMindTextBox27" type="#_x0000_t202" stroked="f" filled="f" o:allowincell="f" style="position:absolute;margin-left:36.140pt;margin-top:539.968pt;width:546.329pt;height:21.000pt;z-index:251659264;mso-position-horizontal-relative:page;mso-position-vertical-relative:page;mso-wrap-style:none;mso-fit-shape-to-text:t;">
             <w10:wrap type="none"/>
             <v:textbox inset="0,0,0,0">
               <w:txbxContent>
                 <w:p>
                   <w:pPr>
-                    <w:spacing w:before="0" w:after="0" w:lineRule="exact" w:line="288"/>
+                    <w:spacing w:before="0" w:after="0" w:lineRule="exact" w:line="300"/>
                     <w:ind w:left="0" w:right="0" w:firstLine="0"/>
                   </w:pPr>
                   <w:r>
@@ -742,13 +742,13 @@
       </w:r>
       <w:r>
         <w:pict>
-          <v:shape id="DocuMindTextBox28" type="#_x0000_t202" stroked="f" filled="f" o:allowincell="f" style="position:absolute;margin-left:36.140pt;margin-top:555.868pt;width:545.329pt;height:15.424pt;z-index:251659264;mso-position-horizontal-relative:page;mso-position-vertical-relative:page;mso-wrap-style:none;">
+          <v:shape id="DocuMindTextBox28" type="#_x0000_t202" stroked="f" filled="f" o:allowincell="f" style="position:absolute;margin-left:36.140pt;margin-top:554.368pt;width:546.329pt;height:21.000pt;z-index:251659264;mso-position-horizontal-relative:page;mso-position-vertical-relative:page;mso-wrap-style:none;mso-fit-shape-to-text:t;">
             <w10:wrap type="none"/>
             <v:textbox inset="0,0,0,0">
               <w:txbxContent>
                 <w:p>
                   <w:pPr>
-                    <w:spacing w:before="0" w:after="0" w:lineRule="exact" w:line="288"/>
+                    <w:spacing w:before="0" w:after="0" w:lineRule="exact" w:line="300"/>
                     <w:ind w:left="0" w:right="0" w:firstLine="0"/>
                   </w:pPr>
                   <w:r>
@@ -769,13 +769,13 @@
       </w:r>
       <w:r>
         <w:pict>
-          <v:shape id="DocuMindTextBox29" type="#_x0000_t202" stroked="f" filled="f" o:allowincell="f" style="position:absolute;margin-left:36.140pt;margin-top:570.268pt;width:100.023pt;height:15.424pt;z-index:251659264;mso-position-horizontal-relative:page;mso-position-vertical-relative:page;mso-wrap-style:none;">
+          <v:shape id="DocuMindTextBox29" type="#_x0000_t202" stroked="f" filled="f" o:allowincell="f" style="position:absolute;margin-left:36.140pt;margin-top:568.768pt;width:101.023pt;height:21.000pt;z-index:251659264;mso-position-horizontal-relative:page;mso-position-vertical-relative:page;mso-wrap-style:none;mso-fit-shape-to-text:t;">
             <w10:wrap type="none"/>
             <v:textbox inset="0,0,0,0">
               <w:txbxContent>
                 <w:p>
                   <w:pPr>
-                    <w:spacing w:before="0" w:after="0" w:lineRule="exact" w:line="288"/>
+                    <w:spacing w:before="0" w:after="0" w:lineRule="exact" w:line="300"/>
                     <w:ind w:left="0" w:right="0" w:firstLine="0"/>
                   </w:pPr>
                   <w:r>
@@ -796,13 +796,13 @@
       </w:r>
       <w:r>
         <w:pict>
-          <v:shape id="DocuMindTextBox30" type="#_x0000_t202" stroked="f" filled="f" o:allowincell="f" style="position:absolute;margin-left:36.140pt;margin-top:599.068pt;width:545.322pt;height:15.424pt;z-index:251659264;mso-position-horizontal-relative:page;mso-position-vertical-relative:page;mso-wrap-style:none;">
+          <v:shape id="DocuMindTextBox30" type="#_x0000_t202" stroked="f" filled="f" o:allowincell="f" style="position:absolute;margin-left:36.140pt;margin-top:597.568pt;width:546.322pt;height:21.000pt;z-index:251659264;mso-position-horizontal-relative:page;mso-position-vertical-relative:page;mso-wrap-style:none;mso-fit-shape-to-text:t;">
             <w10:wrap type="none"/>
             <v:textbox inset="0,0,0,0">
               <w:txbxContent>
                 <w:p>
                   <w:pPr>
-                    <w:spacing w:before="0" w:after="0" w:lineRule="exact" w:line="288"/>
+                    <w:spacing w:before="0" w:after="0" w:lineRule="exact" w:line="300"/>
                     <w:ind w:left="0" w:right="0" w:firstLine="0"/>
                   </w:pPr>
                   <w:r>
@@ -823,13 +823,13 @@
       </w:r>
       <w:r>
         <w:pict>
-          <v:shape id="DocuMindTextBox31" type="#_x0000_t202" stroked="f" filled="f" o:allowincell="f" style="position:absolute;margin-left:36.140pt;margin-top:613.468pt;width:545.330pt;height:15.424pt;z-index:251659264;mso-position-horizontal-relative:page;mso-position-vertical-relative:page;mso-wrap-style:none;">
+          <v:shape id="DocuMindTextBox31" type="#_x0000_t202" stroked="f" filled="f" o:allowincell="f" style="position:absolute;margin-left:36.140pt;margin-top:611.968pt;width:546.330pt;height:21.000pt;z-index:251659264;mso-position-horizontal-relative:page;mso-position-vertical-relative:page;mso-wrap-style:none;mso-fit-shape-to-text:t;">
             <w10:wrap type="none"/>
             <v:textbox inset="0,0,0,0">
               <w:txbxContent>
                 <w:p>
                   <w:pPr>
-                    <w:spacing w:before="0" w:after="0" w:lineRule="exact" w:line="288"/>
+                    <w:spacing w:before="0" w:after="0" w:lineRule="exact" w:line="300"/>
                     <w:ind w:left="0" w:right="0" w:firstLine="0"/>
                   </w:pPr>
                   <w:r>
@@ -850,13 +850,13 @@
       </w:r>
       <w:r>
         <w:pict>
-          <v:shape id="DocuMindTextBox32" type="#_x0000_t202" stroked="f" filled="f" o:allowincell="f" style="position:absolute;margin-left:36.140pt;margin-top:627.868pt;width:545.334pt;height:15.424pt;z-index:251659264;mso-position-horizontal-relative:page;mso-position-vertical-relative:page;mso-wrap-style:none;">
+          <v:shape id="DocuMindTextBox32" type="#_x0000_t202" stroked="f" filled="f" o:allowincell="f" style="position:absolute;margin-left:36.140pt;margin-top:626.368pt;width:546.334pt;height:21.000pt;z-index:251659264;mso-position-horizontal-relative:page;mso-position-vertical-relative:page;mso-wrap-style:none;mso-fit-shape-to-text:t;">
             <w10:wrap type="none"/>
             <v:textbox inset="0,0,0,0">
               <w:txbxContent>
                 <w:p>
                   <w:pPr>
-                    <w:spacing w:before="0" w:after="0" w:lineRule="exact" w:line="288"/>
+                    <w:spacing w:before="0" w:after="0" w:lineRule="exact" w:line="300"/>
                     <w:ind w:left="0" w:right="0" w:firstLine="0"/>
                   </w:pPr>
                   <w:r>
@@ -877,13 +877,13 @@
       </w:r>
       <w:r>
         <w:pict>
-          <v:shape id="DocuMindTextBox33" type="#_x0000_t202" stroked="f" filled="f" o:allowincell="f" style="position:absolute;margin-left:36.140pt;margin-top:642.268pt;width:545.325pt;height:15.424pt;z-index:251659264;mso-position-horizontal-relative:page;mso-position-vertical-relative:page;mso-wrap-style:none;">
+          <v:shape id="DocuMindTextBox33" type="#_x0000_t202" stroked="f" filled="f" o:allowincell="f" style="position:absolute;margin-left:36.140pt;margin-top:640.768pt;width:546.325pt;height:21.000pt;z-index:251659264;mso-position-horizontal-relative:page;mso-position-vertical-relative:page;mso-wrap-style:none;mso-fit-shape-to-text:t;">
             <w10:wrap type="none"/>
             <v:textbox inset="0,0,0,0">
               <w:txbxContent>
                 <w:p>
                   <w:pPr>
-                    <w:spacing w:before="0" w:after="0" w:lineRule="exact" w:line="288"/>
+                    <w:spacing w:before="0" w:after="0" w:lineRule="exact" w:line="300"/>
                     <w:ind w:left="0" w:right="0" w:firstLine="0"/>
                   </w:pPr>
                   <w:r>
@@ -904,13 +904,13 @@
       </w:r>
       <w:r>
         <w:pict>
-          <v:shape id="DocuMindTextBox34" type="#_x0000_t202" stroked="f" filled="f" o:allowincell="f" style="position:absolute;margin-left:36.140pt;margin-top:656.908pt;width:376.908pt;height:15.424pt;z-index:251659264;mso-position-horizontal-relative:page;mso-position-vertical-relative:page;mso-wrap-style:none;">
+          <v:shape id="DocuMindTextBox34" type="#_x0000_t202" stroked="f" filled="f" o:allowincell="f" style="position:absolute;margin-left:36.140pt;margin-top:655.408pt;width:377.908pt;height:21.000pt;z-index:251659264;mso-position-horizontal-relative:page;mso-position-vertical-relative:page;mso-wrap-style:none;mso-fit-shape-to-text:t;">
             <w10:wrap type="none"/>
             <v:textbox inset="0,0,0,0">
               <w:txbxContent>
                 <w:p>
                   <w:pPr>
-                    <w:spacing w:before="0" w:after="0" w:lineRule="exact" w:line="288"/>
+                    <w:spacing w:before="0" w:after="0" w:lineRule="exact" w:line="300"/>
                     <w:ind w:left="0" w:right="0" w:firstLine="0"/>
                   </w:pPr>
                   <w:r>
@@ -931,13 +931,13 @@
       </w:r>
       <w:r>
         <w:pict>
-          <v:shape id="DocuMindTextBox35" type="#_x0000_t202" stroked="f" filled="f" o:allowincell="f" style="position:absolute;margin-left:36.140pt;margin-top:685.708pt;width:545.329pt;height:15.424pt;z-index:251659264;mso-position-horizontal-relative:page;mso-position-vertical-relative:page;mso-wrap-style:none;">
+          <v:shape id="DocuMindTextBox35" type="#_x0000_t202" stroked="f" filled="f" o:allowincell="f" style="position:absolute;margin-left:36.140pt;margin-top:684.208pt;width:546.329pt;height:21.000pt;z-index:251659264;mso-position-horizontal-relative:page;mso-position-vertical-relative:page;mso-wrap-style:none;mso-fit-shape-to-text:t;">
             <w10:wrap type="none"/>
             <v:textbox inset="0,0,0,0">
               <w:txbxContent>
                 <w:p>
                   <w:pPr>
-                    <w:spacing w:before="0" w:after="0" w:lineRule="exact" w:line="288"/>
+                    <w:spacing w:before="0" w:after="0" w:lineRule="exact" w:line="300"/>
                     <w:ind w:left="0" w:right="0" w:firstLine="0"/>
                   </w:pPr>
                   <w:r>
@@ -958,13 +958,13 @@
       </w:r>
       <w:r>
         <w:pict>
-          <v:shape id="DocuMindTextBox36" type="#_x0000_t202" stroked="f" filled="f" o:allowincell="f" style="position:absolute;margin-left:36.140pt;margin-top:700.108pt;width:545.333pt;height:15.424pt;z-index:251659264;mso-position-horizontal-relative:page;mso-position-vertical-relative:page;mso-wrap-style:none;">
+          <v:shape id="DocuMindTextBox36" type="#_x0000_t202" stroked="f" filled="f" o:allowincell="f" style="position:absolute;margin-left:36.140pt;margin-top:698.608pt;width:546.333pt;height:21.000pt;z-index:251659264;mso-position-horizontal-relative:page;mso-position-vertical-relative:page;mso-wrap-style:none;mso-fit-shape-to-text:t;">
             <w10:wrap type="none"/>
             <v:textbox inset="0,0,0,0">
               <w:txbxContent>
                 <w:p>
                   <w:pPr>
-                    <w:spacing w:before="0" w:after="0" w:lineRule="exact" w:line="288"/>
+                    <w:spacing w:before="0" w:after="0" w:lineRule="exact" w:line="300"/>
                     <w:ind w:left="0" w:right="0" w:firstLine="0"/>
                   </w:pPr>
                   <w:r>
@@ -985,13 +985,13 @@
       </w:r>
       <w:r>
         <w:pict>
-          <v:shape id="DocuMindTextBox37" type="#_x0000_t202" stroked="f" filled="f" o:allowincell="f" style="position:absolute;margin-left:36.140pt;margin-top:714.508pt;width:545.331pt;height:15.424pt;z-index:251659264;mso-position-horizontal-relative:page;mso-position-vertical-relative:page;mso-wrap-style:none;">
+          <v:shape id="DocuMindTextBox37" type="#_x0000_t202" stroked="f" filled="f" o:allowincell="f" style="position:absolute;margin-left:36.140pt;margin-top:713.008pt;width:546.331pt;height:21.000pt;z-index:251659264;mso-position-horizontal-relative:page;mso-position-vertical-relative:page;mso-wrap-style:none;mso-fit-shape-to-text:t;">
             <w10:wrap type="none"/>
             <v:textbox inset="0,0,0,0">
               <w:txbxContent>
                 <w:p>
                   <w:pPr>
-                    <w:spacing w:before="0" w:after="0" w:lineRule="exact" w:line="288"/>
+                    <w:spacing w:before="0" w:after="0" w:lineRule="exact" w:line="300"/>
                     <w:ind w:left="0" w:right="0" w:firstLine="0"/>
                   </w:pPr>
                   <w:r>
@@ -1032,13 +1032,13 @@
       </w:r>
       <w:r>
         <w:pict>
-          <v:shape id="DocuMindTextBox38" type="#_x0000_t202" stroked="f" filled="f" o:allowincell="f" style="position:absolute;margin-left:303.020pt;margin-top:742.036pt;width:10.794pt;height:15.652pt;z-index:251659264;mso-position-horizontal-relative:page;mso-position-vertical-relative:page;mso-wrap-style:none;">
+          <v:shape id="DocuMindTextBox38" type="#_x0000_t202" stroked="f" filled="f" o:allowincell="f" style="position:absolute;margin-left:303.020pt;margin-top:740.536pt;width:11.794pt;height:21.000pt;z-index:251659264;mso-position-horizontal-relative:page;mso-position-vertical-relative:page;mso-wrap-style:none;mso-fit-shape-to-text:t;">
             <w10:wrap type="none"/>
             <v:textbox inset="0,0,0,0">
               <w:txbxContent>
                 <w:p>
                   <w:pPr>
-                    <w:spacing w:before="0" w:after="0" w:lineRule="exact" w:line="293"/>
+                    <w:spacing w:before="0" w:after="0" w:lineRule="exact" w:line="300"/>
                     <w:ind w:left="0" w:right="0" w:firstLine="0"/>
                   </w:pPr>
                   <w:r>
@@ -1059,13 +1059,13 @@
       </w:r>
       <w:r>
         <w:pict>
-          <v:shape id="DocuMindTextBox39" type="#_x0000_t202" stroked="f" filled="f" o:allowincell="f" style="position:absolute;margin-left:36.140pt;margin-top:36.508pt;width:545.322pt;height:15.424pt;z-index:251659264;mso-position-horizontal-relative:page;mso-position-vertical-relative:page;mso-wrap-style:none;">
+          <v:shape id="DocuMindTextBox39" type="#_x0000_t202" stroked="f" filled="f" o:allowincell="f" style="position:absolute;margin-left:36.140pt;margin-top:35.008pt;width:546.322pt;height:21.000pt;z-index:251659264;mso-position-horizontal-relative:page;mso-position-vertical-relative:page;mso-wrap-style:none;mso-fit-shape-to-text:t;">
             <w10:wrap type="none"/>
             <v:textbox inset="0,0,0,0">
               <w:txbxContent>
                 <w:p>
                   <w:pPr>
-                    <w:spacing w:before="0" w:after="0" w:lineRule="exact" w:line="288"/>
+                    <w:spacing w:before="0" w:after="0" w:lineRule="exact" w:line="300"/>
                     <w:ind w:left="0" w:right="0" w:firstLine="0"/>
                   </w:pPr>
                   <w:r>
@@ -1086,13 +1086,13 @@
       </w:r>
       <w:r>
         <w:pict>
-          <v:shape id="DocuMindTextBox40" type="#_x0000_t202" stroked="f" filled="f" o:allowincell="f" style="position:absolute;margin-left:36.140pt;margin-top:50.908pt;width:545.335pt;height:15.424pt;z-index:251659264;mso-position-horizontal-relative:page;mso-position-vertical-relative:page;mso-wrap-style:none;">
+          <v:shape id="DocuMindTextBox40" type="#_x0000_t202" stroked="f" filled="f" o:allowincell="f" style="position:absolute;margin-left:36.140pt;margin-top:49.408pt;width:546.335pt;height:21.000pt;z-index:251659264;mso-position-horizontal-relative:page;mso-position-vertical-relative:page;mso-wrap-style:none;mso-fit-shape-to-text:t;">
             <w10:wrap type="none"/>
             <v:textbox inset="0,0,0,0">
               <w:txbxContent>
                 <w:p>
                   <w:pPr>
-                    <w:spacing w:before="0" w:after="0" w:lineRule="exact" w:line="288"/>
+                    <w:spacing w:before="0" w:after="0" w:lineRule="exact" w:line="300"/>
                     <w:ind w:left="0" w:right="0" w:firstLine="0"/>
                   </w:pPr>
                   <w:r>
@@ -1113,13 +1113,13 @@
       </w:r>
       <w:r>
         <w:pict>
-          <v:shape id="DocuMindTextBox41" type="#_x0000_t202" stroked="f" filled="f" o:allowincell="f" style="position:absolute;margin-left:36.140pt;margin-top:65.308pt;width:104.230pt;height:15.424pt;z-index:251659264;mso-position-horizontal-relative:page;mso-position-vertical-relative:page;mso-wrap-style:none;">
+          <v:shape id="DocuMindTextBox41" type="#_x0000_t202" stroked="f" filled="f" o:allowincell="f" style="position:absolute;margin-left:36.140pt;margin-top:63.808pt;width:105.230pt;height:21.000pt;z-index:251659264;mso-position-horizontal-relative:page;mso-position-vertical-relative:page;mso-wrap-style:none;mso-fit-shape-to-text:t;">
             <w10:wrap type="none"/>
             <v:textbox inset="0,0,0,0">
               <w:txbxContent>
                 <w:p>
                   <w:pPr>
-                    <w:spacing w:before="0" w:after="0" w:lineRule="exact" w:line="288"/>
+                    <w:spacing w:before="0" w:after="0" w:lineRule="exact" w:line="300"/>
                     <w:ind w:left="0" w:right="0" w:firstLine="0"/>
                   </w:pPr>
                   <w:r>
@@ -1140,13 +1140,13 @@
       </w:r>
       <w:r>
         <w:pict>
-          <v:shape id="DocuMindTextBox42" type="#_x0000_t202" stroked="f" filled="f" o:allowincell="f" style="position:absolute;margin-left:36.140pt;margin-top:94.108pt;width:545.330pt;height:15.424pt;z-index:251659264;mso-position-horizontal-relative:page;mso-position-vertical-relative:page;mso-wrap-style:none;">
+          <v:shape id="DocuMindTextBox42" type="#_x0000_t202" stroked="f" filled="f" o:allowincell="f" style="position:absolute;margin-left:36.140pt;margin-top:92.608pt;width:546.330pt;height:21.000pt;z-index:251659264;mso-position-horizontal-relative:page;mso-position-vertical-relative:page;mso-wrap-style:none;mso-fit-shape-to-text:t;">
             <w10:wrap type="none"/>
             <v:textbox inset="0,0,0,0">
               <w:txbxContent>
                 <w:p>
                   <w:pPr>
-                    <w:spacing w:before="0" w:after="0" w:lineRule="exact" w:line="288"/>
+                    <w:spacing w:before="0" w:after="0" w:lineRule="exact" w:line="300"/>
                     <w:ind w:left="0" w:right="0" w:firstLine="0"/>
                   </w:pPr>
                   <w:r>
@@ -1167,13 +1167,13 @@
       </w:r>
       <w:r>
         <w:pict>
-          <v:shape id="DocuMindTextBox43" type="#_x0000_t202" stroked="f" filled="f" o:allowincell="f" style="position:absolute;margin-left:36.140pt;margin-top:108.748pt;width:545.326pt;height:15.424pt;z-index:251659264;mso-position-horizontal-relative:page;mso-position-vertical-relative:page;mso-wrap-style:none;">
+          <v:shape id="DocuMindTextBox43" type="#_x0000_t202" stroked="f" filled="f" o:allowincell="f" style="position:absolute;margin-left:36.140pt;margin-top:107.248pt;width:546.326pt;height:21.000pt;z-index:251659264;mso-position-horizontal-relative:page;mso-position-vertical-relative:page;mso-wrap-style:none;mso-fit-shape-to-text:t;">
             <w10:wrap type="none"/>
             <v:textbox inset="0,0,0,0">
               <w:txbxContent>
                 <w:p>
                   <w:pPr>
-                    <w:spacing w:before="0" w:after="0" w:lineRule="exact" w:line="288"/>
+                    <w:spacing w:before="0" w:after="0" w:lineRule="exact" w:line="300"/>
                     <w:ind w:left="0" w:right="0" w:firstLine="0"/>
                   </w:pPr>
                   <w:r>
@@ -1194,13 +1194,13 @@
       </w:r>
       <w:r>
         <w:pict>
-          <v:shape id="DocuMindTextBox44" type="#_x0000_t202" stroked="f" filled="f" o:allowincell="f" style="position:absolute;margin-left:36.140pt;margin-top:123.148pt;width:545.319pt;height:15.424pt;z-index:251659264;mso-position-horizontal-relative:page;mso-position-vertical-relative:page;mso-wrap-style:none;">
+          <v:shape id="DocuMindTextBox44" type="#_x0000_t202" stroked="f" filled="f" o:allowincell="f" style="position:absolute;margin-left:36.140pt;margin-top:121.648pt;width:546.319pt;height:21.000pt;z-index:251659264;mso-position-horizontal-relative:page;mso-position-vertical-relative:page;mso-wrap-style:none;mso-fit-shape-to-text:t;">
             <w10:wrap type="none"/>
             <v:textbox inset="0,0,0,0">
               <w:txbxContent>
                 <w:p>
                   <w:pPr>
-                    <w:spacing w:before="0" w:after="0" w:lineRule="exact" w:line="288"/>
+                    <w:spacing w:before="0" w:after="0" w:lineRule="exact" w:line="300"/>
                     <w:ind w:left="0" w:right="0" w:firstLine="0"/>
                   </w:pPr>
                   <w:r>
@@ -1221,13 +1221,13 @@
       </w:r>
       <w:r>
         <w:pict>
-          <v:shape id="DocuMindTextBox45" type="#_x0000_t202" stroked="f" filled="f" o:allowincell="f" style="position:absolute;margin-left:36.140pt;margin-top:137.548pt;width:455.160pt;height:15.424pt;z-index:251659264;mso-position-horizontal-relative:page;mso-position-vertical-relative:page;mso-wrap-style:none;">
+          <v:shape id="DocuMindTextBox45" type="#_x0000_t202" stroked="f" filled="f" o:allowincell="f" style="position:absolute;margin-left:36.140pt;margin-top:136.048pt;width:456.160pt;height:21.000pt;z-index:251659264;mso-position-horizontal-relative:page;mso-position-vertical-relative:page;mso-wrap-style:none;mso-fit-shape-to-text:t;">
             <w10:wrap type="none"/>
             <v:textbox inset="0,0,0,0">
               <w:txbxContent>
                 <w:p>
                   <w:pPr>
-                    <w:spacing w:before="0" w:after="0" w:lineRule="exact" w:line="288"/>
+                    <w:spacing w:before="0" w:after="0" w:lineRule="exact" w:line="300"/>
                     <w:ind w:left="0" w:right="0" w:firstLine="0"/>
                   </w:pPr>
                   <w:r>
@@ -1248,13 +1248,13 @@
       </w:r>
       <w:r>
         <w:pict>
-          <v:shape id="DocuMindTextBox46" type="#_x0000_t202" stroked="f" filled="f" o:allowincell="f" style="position:absolute;margin-left:36.140pt;margin-top:166.348pt;width:545.334pt;height:15.424pt;z-index:251659264;mso-position-horizontal-relative:page;mso-position-vertical-relative:page;mso-wrap-style:none;">
+          <v:shape id="DocuMindTextBox46" type="#_x0000_t202" stroked="f" filled="f" o:allowincell="f" style="position:absolute;margin-left:36.140pt;margin-top:164.848pt;width:546.334pt;height:21.000pt;z-index:251659264;mso-position-horizontal-relative:page;mso-position-vertical-relative:page;mso-wrap-style:none;mso-fit-shape-to-text:t;">
             <w10:wrap type="none"/>
             <v:textbox inset="0,0,0,0">
               <w:txbxContent>
                 <w:p>
                   <w:pPr>
-                    <w:spacing w:before="0" w:after="0" w:lineRule="exact" w:line="288"/>
+                    <w:spacing w:before="0" w:after="0" w:lineRule="exact" w:line="300"/>
                     <w:ind w:left="0" w:right="0" w:firstLine="0"/>
                   </w:pPr>
                   <w:r>
@@ -1275,13 +1275,13 @@
       </w:r>
       <w:r>
         <w:pict>
-          <v:shape id="DocuMindTextBox47" type="#_x0000_t202" stroked="f" filled="f" o:allowincell="f" style="position:absolute;margin-left:36.140pt;margin-top:180.748pt;width:545.328pt;height:15.424pt;z-index:251659264;mso-position-horizontal-relative:page;mso-position-vertical-relative:page;mso-wrap-style:none;">
+          <v:shape id="DocuMindTextBox47" type="#_x0000_t202" stroked="f" filled="f" o:allowincell="f" style="position:absolute;margin-left:36.140pt;margin-top:179.248pt;width:546.328pt;height:21.000pt;z-index:251659264;mso-position-horizontal-relative:page;mso-position-vertical-relative:page;mso-wrap-style:none;mso-fit-shape-to-text:t;">
             <w10:wrap type="none"/>
             <v:textbox inset="0,0,0,0">
               <w:txbxContent>
                 <w:p>
                   <w:pPr>
-                    <w:spacing w:before="0" w:after="0" w:lineRule="exact" w:line="288"/>
+                    <w:spacing w:before="0" w:after="0" w:lineRule="exact" w:line="300"/>
                     <w:ind w:left="0" w:right="0" w:firstLine="0"/>
                   </w:pPr>
                   <w:r>
@@ -1302,13 +1302,13 @@
       </w:r>
       <w:r>
         <w:pict>
-          <v:shape id="DocuMindTextBox48" type="#_x0000_t202" stroked="f" filled="f" o:allowincell="f" style="position:absolute;margin-left:36.140pt;margin-top:195.148pt;width:545.326pt;height:15.424pt;z-index:251659264;mso-position-horizontal-relative:page;mso-position-vertical-relative:page;mso-wrap-style:none;">
+          <v:shape id="DocuMindTextBox48" type="#_x0000_t202" stroked="f" filled="f" o:allowincell="f" style="position:absolute;margin-left:36.140pt;margin-top:193.648pt;width:546.326pt;height:21.000pt;z-index:251659264;mso-position-horizontal-relative:page;mso-position-vertical-relative:page;mso-wrap-style:none;mso-fit-shape-to-text:t;">
             <w10:wrap type="none"/>
             <v:textbox inset="0,0,0,0">
               <w:txbxContent>
                 <w:p>
                   <w:pPr>
-                    <w:spacing w:before="0" w:after="0" w:lineRule="exact" w:line="288"/>
+                    <w:spacing w:before="0" w:after="0" w:lineRule="exact" w:line="300"/>
                     <w:ind w:left="0" w:right="0" w:firstLine="0"/>
                   </w:pPr>
                   <w:r>
@@ -1329,13 +1329,13 @@
       </w:r>
       <w:r>
         <w:pict>
-          <v:shape id="DocuMindTextBox49" type="#_x0000_t202" stroked="f" filled="f" o:allowincell="f" style="position:absolute;margin-left:36.140pt;margin-top:209.548pt;width:545.333pt;height:15.424pt;z-index:251659264;mso-position-horizontal-relative:page;mso-position-vertical-relative:page;mso-wrap-style:none;">
+          <v:shape id="DocuMindTextBox49" type="#_x0000_t202" stroked="f" filled="f" o:allowincell="f" style="position:absolute;margin-left:36.140pt;margin-top:208.048pt;width:546.333pt;height:21.000pt;z-index:251659264;mso-position-horizontal-relative:page;mso-position-vertical-relative:page;mso-wrap-style:none;mso-fit-shape-to-text:t;">
             <w10:wrap type="none"/>
             <v:textbox inset="0,0,0,0">
               <w:txbxContent>
                 <w:p>
                   <w:pPr>
-                    <w:spacing w:before="0" w:after="0" w:lineRule="exact" w:line="288"/>
+                    <w:spacing w:before="0" w:after="0" w:lineRule="exact" w:line="300"/>
                     <w:ind w:left="0" w:right="0" w:firstLine="0"/>
                   </w:pPr>
                   <w:r>
@@ -1356,13 +1356,13 @@
       </w:r>
       <w:r>
         <w:pict>
-          <v:shape id="DocuMindTextBox50" type="#_x0000_t202" stroked="f" filled="f" o:allowincell="f" style="position:absolute;margin-left:36.140pt;margin-top:223.948pt;width:545.325pt;height:15.424pt;z-index:251659264;mso-position-horizontal-relative:page;mso-position-vertical-relative:page;mso-wrap-style:none;">
+          <v:shape id="DocuMindTextBox50" type="#_x0000_t202" stroked="f" filled="f" o:allowincell="f" style="position:absolute;margin-left:36.140pt;margin-top:222.448pt;width:546.325pt;height:21.000pt;z-index:251659264;mso-position-horizontal-relative:page;mso-position-vertical-relative:page;mso-wrap-style:none;mso-fit-shape-to-text:t;">
             <w10:wrap type="none"/>
             <v:textbox inset="0,0,0,0">
               <w:txbxContent>
                 <w:p>
                   <w:pPr>
-                    <w:spacing w:before="0" w:after="0" w:lineRule="exact" w:line="288"/>
+                    <w:spacing w:before="0" w:after="0" w:lineRule="exact" w:line="300"/>
                     <w:ind w:left="0" w:right="0" w:firstLine="0"/>
                   </w:pPr>
                   <w:r>
@@ -1383,13 +1383,13 @@
       </w:r>
       <w:r>
         <w:pict>
-          <v:shape id="DocuMindTextBox51" type="#_x0000_t202" stroked="f" filled="f" o:allowincell="f" style="position:absolute;margin-left:36.140pt;margin-top:238.588pt;width:235.797pt;height:15.424pt;z-index:251659264;mso-position-horizontal-relative:page;mso-position-vertical-relative:page;mso-wrap-style:none;">
+          <v:shape id="DocuMindTextBox51" type="#_x0000_t202" stroked="f" filled="f" o:allowincell="f" style="position:absolute;margin-left:36.140pt;margin-top:237.088pt;width:236.797pt;height:21.000pt;z-index:251659264;mso-position-horizontal-relative:page;mso-position-vertical-relative:page;mso-wrap-style:none;mso-fit-shape-to-text:t;">
             <w10:wrap type="none"/>
             <v:textbox inset="0,0,0,0">
               <w:txbxContent>
                 <w:p>
                   <w:pPr>
-                    <w:spacing w:before="0" w:after="0" w:lineRule="exact" w:line="288"/>
+                    <w:spacing w:before="0" w:after="0" w:lineRule="exact" w:line="300"/>
                     <w:ind w:left="0" w:right="0" w:firstLine="0"/>
                   </w:pPr>
                   <w:r>
@@ -1410,13 +1410,13 @@
       </w:r>
       <w:r>
         <w:pict>
-          <v:shape id="DocuMindTextBox52" type="#_x0000_t202" stroked="f" filled="f" o:allowincell="f" style="position:absolute;margin-left:36.140pt;margin-top:267.388pt;width:545.334pt;height:15.424pt;z-index:251659264;mso-position-horizontal-relative:page;mso-position-vertical-relative:page;mso-wrap-style:none;">
+          <v:shape id="DocuMindTextBox52" type="#_x0000_t202" stroked="f" filled="f" o:allowincell="f" style="position:absolute;margin-left:36.140pt;margin-top:265.888pt;width:546.334pt;height:21.000pt;z-index:251659264;mso-position-horizontal-relative:page;mso-position-vertical-relative:page;mso-wrap-style:none;mso-fit-shape-to-text:t;">
             <w10:wrap type="none"/>
             <v:textbox inset="0,0,0,0">
               <w:txbxContent>
                 <w:p>
                   <w:pPr>
-                    <w:spacing w:before="0" w:after="0" w:lineRule="exact" w:line="288"/>
+                    <w:spacing w:before="0" w:after="0" w:lineRule="exact" w:line="300"/>
                     <w:ind w:left="0" w:right="0" w:firstLine="0"/>
                   </w:pPr>
                   <w:r>
@@ -1437,13 +1437,13 @@
       </w:r>
       <w:r>
         <w:pict>
-          <v:shape id="DocuMindTextBox53" type="#_x0000_t202" stroked="f" filled="f" o:allowincell="f" style="position:absolute;margin-left:36.140pt;margin-top:281.788pt;width:545.320pt;height:15.424pt;z-index:251659264;mso-position-horizontal-relative:page;mso-position-vertical-relative:page;mso-wrap-style:none;">
+          <v:shape id="DocuMindTextBox53" type="#_x0000_t202" stroked="f" filled="f" o:allowincell="f" style="position:absolute;margin-left:36.140pt;margin-top:280.288pt;width:546.320pt;height:21.000pt;z-index:251659264;mso-position-horizontal-relative:page;mso-position-vertical-relative:page;mso-wrap-style:none;mso-fit-shape-to-text:t;">
             <w10:wrap type="none"/>
             <v:textbox inset="0,0,0,0">
               <w:txbxContent>
                 <w:p>
                   <w:pPr>
-                    <w:spacing w:before="0" w:after="0" w:lineRule="exact" w:line="288"/>
+                    <w:spacing w:before="0" w:after="0" w:lineRule="exact" w:line="300"/>
                     <w:ind w:left="0" w:right="0" w:firstLine="0"/>
                   </w:pPr>
                   <w:r>
@@ -1464,13 +1464,13 @@
       </w:r>
       <w:r>
         <w:pict>
-          <v:shape id="DocuMindTextBox54" type="#_x0000_t202" stroked="f" filled="f" o:allowincell="f" style="position:absolute;margin-left:36.140pt;margin-top:296.188pt;width:545.337pt;height:15.424pt;z-index:251659264;mso-position-horizontal-relative:page;mso-position-vertical-relative:page;mso-wrap-style:none;">
+          <v:shape id="DocuMindTextBox54" type="#_x0000_t202" stroked="f" filled="f" o:allowincell="f" style="position:absolute;margin-left:36.140pt;margin-top:294.688pt;width:546.337pt;height:21.000pt;z-index:251659264;mso-position-horizontal-relative:page;mso-position-vertical-relative:page;mso-wrap-style:none;mso-fit-shape-to-text:t;">
             <w10:wrap type="none"/>
             <v:textbox inset="0,0,0,0">
               <w:txbxContent>
                 <w:p>
                   <w:pPr>
-                    <w:spacing w:before="0" w:after="0" w:lineRule="exact" w:line="288"/>
+                    <w:spacing w:before="0" w:after="0" w:lineRule="exact" w:line="300"/>
                     <w:ind w:left="0" w:right="0" w:firstLine="0"/>
                   </w:pPr>
                   <w:r>
@@ -1491,13 +1491,13 @@
       </w:r>
       <w:r>
         <w:pict>
-          <v:shape id="DocuMindTextBox55" type="#_x0000_t202" stroked="f" filled="f" o:allowincell="f" style="position:absolute;margin-left:36.140pt;margin-top:310.588pt;width:545.326pt;height:15.424pt;z-index:251659264;mso-position-horizontal-relative:page;mso-position-vertical-relative:page;mso-wrap-style:none;">
+          <v:shape id="DocuMindTextBox55" type="#_x0000_t202" stroked="f" filled="f" o:allowincell="f" style="position:absolute;margin-left:36.140pt;margin-top:309.088pt;width:546.326pt;height:21.000pt;z-index:251659264;mso-position-horizontal-relative:page;mso-position-vertical-relative:page;mso-wrap-style:none;mso-fit-shape-to-text:t;">
             <w10:wrap type="none"/>
             <v:textbox inset="0,0,0,0">
               <w:txbxContent>
                 <w:p>
                   <w:pPr>
-                    <w:spacing w:before="0" w:after="0" w:lineRule="exact" w:line="288"/>
+                    <w:spacing w:before="0" w:after="0" w:lineRule="exact" w:line="300"/>
                     <w:ind w:left="0" w:right="0" w:firstLine="0"/>
                   </w:pPr>
                   <w:r>
@@ -1518,13 +1518,13 @@
       </w:r>
       <w:r>
         <w:pict>
-          <v:shape id="DocuMindTextBox56" type="#_x0000_t202" stroked="f" filled="f" o:allowincell="f" style="position:absolute;margin-left:36.140pt;margin-top:324.988pt;width:545.331pt;height:15.424pt;z-index:251659264;mso-position-horizontal-relative:page;mso-position-vertical-relative:page;mso-wrap-style:none;">
+          <v:shape id="DocuMindTextBox56" type="#_x0000_t202" stroked="f" filled="f" o:allowincell="f" style="position:absolute;margin-left:36.140pt;margin-top:323.488pt;width:546.331pt;height:21.000pt;z-index:251659264;mso-position-horizontal-relative:page;mso-position-vertical-relative:page;mso-wrap-style:none;mso-fit-shape-to-text:t;">
             <w10:wrap type="none"/>
             <v:textbox inset="0,0,0,0">
               <w:txbxContent>
                 <w:p>
                   <w:pPr>
-                    <w:spacing w:before="0" w:after="0" w:lineRule="exact" w:line="288"/>
+                    <w:spacing w:before="0" w:after="0" w:lineRule="exact" w:line="300"/>
                     <w:ind w:left="0" w:right="0" w:firstLine="0"/>
                   </w:pPr>
                   <w:r>
@@ -1545,13 +1545,13 @@
       </w:r>
       <w:r>
         <w:pict>
-          <v:shape id="DocuMindTextBox57" type="#_x0000_t202" stroked="f" filled="f" o:allowincell="f" style="position:absolute;margin-left:36.140pt;margin-top:339.388pt;width:331.369pt;height:15.424pt;z-index:251659264;mso-position-horizontal-relative:page;mso-position-vertical-relative:page;mso-wrap-style:none;">
+          <v:shape id="DocuMindTextBox57" type="#_x0000_t202" stroked="f" filled="f" o:allowincell="f" style="position:absolute;margin-left:36.140pt;margin-top:337.888pt;width:332.369pt;height:21.000pt;z-index:251659264;mso-position-horizontal-relative:page;mso-position-vertical-relative:page;mso-wrap-style:none;mso-fit-shape-to-text:t;">
             <w10:wrap type="none"/>
             <v:textbox inset="0,0,0,0">
               <w:txbxContent>
                 <w:p>
                   <w:pPr>
-                    <w:spacing w:before="0" w:after="0" w:lineRule="exact" w:line="288"/>
+                    <w:spacing w:before="0" w:after="0" w:lineRule="exact" w:line="300"/>
                     <w:ind w:left="0" w:right="0" w:firstLine="0"/>
                   </w:pPr>
                   <w:r>
@@ -1572,13 +1572,13 @@
       </w:r>
       <w:r>
         <w:pict>
-          <v:shape id="DocuMindTextBox58" type="#_x0000_t202" stroked="f" filled="f" o:allowincell="f" style="position:absolute;margin-left:36.140pt;margin-top:368.188pt;width:545.331pt;height:15.424pt;z-index:251659264;mso-position-horizontal-relative:page;mso-position-vertical-relative:page;mso-wrap-style:none;">
+          <v:shape id="DocuMindTextBox58" type="#_x0000_t202" stroked="f" filled="f" o:allowincell="f" style="position:absolute;margin-left:36.140pt;margin-top:366.688pt;width:546.331pt;height:21.000pt;z-index:251659264;mso-position-horizontal-relative:page;mso-position-vertical-relative:page;mso-wrap-style:none;mso-fit-shape-to-text:t;">
             <w10:wrap type="none"/>
             <v:textbox inset="0,0,0,0">
               <w:txbxContent>
                 <w:p>
                   <w:pPr>
-                    <w:spacing w:before="0" w:after="0" w:lineRule="exact" w:line="288"/>
+                    <w:spacing w:before="0" w:after="0" w:lineRule="exact" w:line="300"/>
                     <w:ind w:left="0" w:right="0" w:firstLine="0"/>
                   </w:pPr>
                   <w:r>
@@ -1599,13 +1599,13 @@
       </w:r>
       <w:r>
         <w:pict>
-          <v:shape id="DocuMindTextBox59" type="#_x0000_t202" stroked="f" filled="f" o:allowincell="f" style="position:absolute;margin-left:36.140pt;margin-top:382.828pt;width:545.330pt;height:15.424pt;z-index:251659264;mso-position-horizontal-relative:page;mso-position-vertical-relative:page;mso-wrap-style:none;">
+          <v:shape id="DocuMindTextBox59" type="#_x0000_t202" stroked="f" filled="f" o:allowincell="f" style="position:absolute;margin-left:36.140pt;margin-top:381.328pt;width:546.330pt;height:21.000pt;z-index:251659264;mso-position-horizontal-relative:page;mso-position-vertical-relative:page;mso-wrap-style:none;mso-fit-shape-to-text:t;">
             <w10:wrap type="none"/>
             <v:textbox inset="0,0,0,0">
               <w:txbxContent>
                 <w:p>
                   <w:pPr>
-                    <w:spacing w:before="0" w:after="0" w:lineRule="exact" w:line="288"/>
+                    <w:spacing w:before="0" w:after="0" w:lineRule="exact" w:line="300"/>
                     <w:ind w:left="0" w:right="0" w:firstLine="0"/>
                   </w:pPr>
                   <w:r>
@@ -1626,13 +1626,13 @@
       </w:r>
       <w:r>
         <w:pict>
-          <v:shape id="DocuMindTextBox60" type="#_x0000_t202" stroked="f" filled="f" o:allowincell="f" style="position:absolute;margin-left:36.140pt;margin-top:397.228pt;width:545.326pt;height:15.424pt;z-index:251659264;mso-position-horizontal-relative:page;mso-position-vertical-relative:page;mso-wrap-style:none;">
+          <v:shape id="DocuMindTextBox60" type="#_x0000_t202" stroked="f" filled="f" o:allowincell="f" style="position:absolute;margin-left:36.140pt;margin-top:395.728pt;width:546.326pt;height:21.000pt;z-index:251659264;mso-position-horizontal-relative:page;mso-position-vertical-relative:page;mso-wrap-style:none;mso-fit-shape-to-text:t;">
             <w10:wrap type="none"/>
             <v:textbox inset="0,0,0,0">
               <w:txbxContent>
                 <w:p>
                   <w:pPr>
-                    <w:spacing w:before="0" w:after="0" w:lineRule="exact" w:line="288"/>
+                    <w:spacing w:before="0" w:after="0" w:lineRule="exact" w:line="300"/>
                     <w:ind w:left="0" w:right="0" w:firstLine="0"/>
                   </w:pPr>
                   <w:r>
@@ -1653,13 +1653,13 @@
       </w:r>
       <w:r>
         <w:pict>
-          <v:shape id="DocuMindTextBox61" type="#_x0000_t202" stroked="f" filled="f" o:allowincell="f" style="position:absolute;margin-left:36.140pt;margin-top:411.628pt;width:197.564pt;height:15.424pt;z-index:251659264;mso-position-horizontal-relative:page;mso-position-vertical-relative:page;mso-wrap-style:none;">
+          <v:shape id="DocuMindTextBox61" type="#_x0000_t202" stroked="f" filled="f" o:allowincell="f" style="position:absolute;margin-left:36.140pt;margin-top:410.128pt;width:198.564pt;height:21.000pt;z-index:251659264;mso-position-horizontal-relative:page;mso-position-vertical-relative:page;mso-wrap-style:none;mso-fit-shape-to-text:t;">
             <w10:wrap type="none"/>
             <v:textbox inset="0,0,0,0">
               <w:txbxContent>
                 <w:p>
                   <w:pPr>
-                    <w:spacing w:before="0" w:after="0" w:lineRule="exact" w:line="288"/>
+                    <w:spacing w:before="0" w:after="0" w:lineRule="exact" w:line="300"/>
                     <w:ind w:left="0" w:right="0" w:firstLine="0"/>
                   </w:pPr>
                   <w:r>
@@ -1680,13 +1680,13 @@
       </w:r>
       <w:r>
         <w:pict>
-          <v:shape id="DocuMindTextBox62" type="#_x0000_t202" stroked="f" filled="f" o:allowincell="f" style="position:absolute;margin-left:36.140pt;margin-top:440.428pt;width:545.324pt;height:15.424pt;z-index:251659264;mso-position-horizontal-relative:page;mso-position-vertical-relative:page;mso-wrap-style:none;">
+          <v:shape id="DocuMindTextBox62" type="#_x0000_t202" stroked="f" filled="f" o:allowincell="f" style="position:absolute;margin-left:36.140pt;margin-top:438.928pt;width:546.324pt;height:21.000pt;z-index:251659264;mso-position-horizontal-relative:page;mso-position-vertical-relative:page;mso-wrap-style:none;mso-fit-shape-to-text:t;">
             <w10:wrap type="none"/>
             <v:textbox inset="0,0,0,0">
               <w:txbxContent>
                 <w:p>
                   <w:pPr>
-                    <w:spacing w:before="0" w:after="0" w:lineRule="exact" w:line="288"/>
+                    <w:spacing w:before="0" w:after="0" w:lineRule="exact" w:line="300"/>
                     <w:ind w:left="0" w:right="0" w:firstLine="0"/>
                   </w:pPr>
                   <w:r>
@@ -1707,13 +1707,13 @@
       </w:r>
       <w:r>
         <w:pict>
-          <v:shape id="DocuMindTextBox63" type="#_x0000_t202" stroked="f" filled="f" o:allowincell="f" style="position:absolute;margin-left:36.140pt;margin-top:454.828pt;width:545.326pt;height:15.424pt;z-index:251659264;mso-position-horizontal-relative:page;mso-position-vertical-relative:page;mso-wrap-style:none;">
+          <v:shape id="DocuMindTextBox63" type="#_x0000_t202" stroked="f" filled="f" o:allowincell="f" style="position:absolute;margin-left:36.140pt;margin-top:453.328pt;width:546.326pt;height:21.000pt;z-index:251659264;mso-position-horizontal-relative:page;mso-position-vertical-relative:page;mso-wrap-style:none;mso-fit-shape-to-text:t;">
             <w10:wrap type="none"/>
             <v:textbox inset="0,0,0,0">
               <w:txbxContent>
                 <w:p>
                   <w:pPr>
-                    <w:spacing w:before="0" w:after="0" w:lineRule="exact" w:line="288"/>
+                    <w:spacing w:before="0" w:after="0" w:lineRule="exact" w:line="300"/>
                     <w:ind w:left="0" w:right="0" w:firstLine="0"/>
                   </w:pPr>
                   <w:r>
@@ -1734,13 +1734,13 @@
       </w:r>
       <w:r>
         <w:pict>
-          <v:shape id="DocuMindTextBox64" type="#_x0000_t202" stroked="f" filled="f" o:allowincell="f" style="position:absolute;margin-left:36.140pt;margin-top:469.228pt;width:545.331pt;height:15.424pt;z-index:251659264;mso-position-horizontal-relative:page;mso-position-vertical-relative:page;mso-wrap-style:none;">
+          <v:shape id="DocuMindTextBox64" type="#_x0000_t202" stroked="f" filled="f" o:allowincell="f" style="position:absolute;margin-left:36.140pt;margin-top:467.728pt;width:546.331pt;height:21.000pt;z-index:251659264;mso-position-horizontal-relative:page;mso-position-vertical-relative:page;mso-wrap-style:none;mso-fit-shape-to-text:t;">
             <w10:wrap type="none"/>
             <v:textbox inset="0,0,0,0">
               <w:txbxContent>
                 <w:p>
                   <w:pPr>
-                    <w:spacing w:before="0" w:after="0" w:lineRule="exact" w:line="288"/>
+                    <w:spacing w:before="0" w:after="0" w:lineRule="exact" w:line="300"/>
                     <w:ind w:left="0" w:right="0" w:firstLine="0"/>
                   </w:pPr>
                   <w:r>
@@ -1761,13 +1761,13 @@
       </w:r>
       <w:r>
         <w:pict>
-          <v:shape id="DocuMindTextBox65" type="#_x0000_t202" stroked="f" filled="f" o:allowincell="f" style="position:absolute;margin-left:36.140pt;margin-top:483.628pt;width:545.326pt;height:15.424pt;z-index:251659264;mso-position-horizontal-relative:page;mso-position-vertical-relative:page;mso-wrap-style:none;">
+          <v:shape id="DocuMindTextBox65" type="#_x0000_t202" stroked="f" filled="f" o:allowincell="f" style="position:absolute;margin-left:36.140pt;margin-top:482.128pt;width:546.326pt;height:21.000pt;z-index:251659264;mso-position-horizontal-relative:page;mso-position-vertical-relative:page;mso-wrap-style:none;mso-fit-shape-to-text:t;">
             <w10:wrap type="none"/>
             <v:textbox inset="0,0,0,0">
               <w:txbxContent>
                 <w:p>
                   <w:pPr>
-                    <w:spacing w:before="0" w:after="0" w:lineRule="exact" w:line="288"/>
+                    <w:spacing w:before="0" w:after="0" w:lineRule="exact" w:line="300"/>
                     <w:ind w:left="0" w:right="0" w:firstLine="0"/>
                   </w:pPr>
                   <w:r>
@@ -1788,13 +1788,13 @@
       </w:r>
       <w:r>
         <w:pict>
-          <v:shape id="DocuMindTextBox66" type="#_x0000_t202" stroked="f" filled="f" o:allowincell="f" style="position:absolute;margin-left:36.140pt;margin-top:498.028pt;width:310.914pt;height:15.424pt;z-index:251659264;mso-position-horizontal-relative:page;mso-position-vertical-relative:page;mso-wrap-style:none;">
+          <v:shape id="DocuMindTextBox66" type="#_x0000_t202" stroked="f" filled="f" o:allowincell="f" style="position:absolute;margin-left:36.140pt;margin-top:496.528pt;width:311.914pt;height:21.000pt;z-index:251659264;mso-position-horizontal-relative:page;mso-position-vertical-relative:page;mso-wrap-style:none;mso-fit-shape-to-text:t;">
             <w10:wrap type="none"/>
             <v:textbox inset="0,0,0,0">
               <w:txbxContent>
                 <w:p>
                   <w:pPr>
-                    <w:spacing w:before="0" w:after="0" w:lineRule="exact" w:line="288"/>
+                    <w:spacing w:before="0" w:after="0" w:lineRule="exact" w:line="300"/>
                     <w:ind w:left="0" w:right="0" w:firstLine="0"/>
                   </w:pPr>
                   <w:r>
@@ -1815,13 +1815,13 @@
       </w:r>
       <w:r>
         <w:pict>
-          <v:shape id="DocuMindTextBox67" type="#_x0000_t202" stroked="f" filled="f" o:allowincell="f" style="position:absolute;margin-left:36.140pt;margin-top:527.068pt;width:545.334pt;height:15.424pt;z-index:251659264;mso-position-horizontal-relative:page;mso-position-vertical-relative:page;mso-wrap-style:none;">
+          <v:shape id="DocuMindTextBox67" type="#_x0000_t202" stroked="f" filled="f" o:allowincell="f" style="position:absolute;margin-left:36.140pt;margin-top:525.568pt;width:546.334pt;height:21.000pt;z-index:251659264;mso-position-horizontal-relative:page;mso-position-vertical-relative:page;mso-wrap-style:none;mso-fit-shape-to-text:t;">
             <w10:wrap type="none"/>
             <v:textbox inset="0,0,0,0">
               <w:txbxContent>
                 <w:p>
                   <w:pPr>
-                    <w:spacing w:before="0" w:after="0" w:lineRule="exact" w:line="288"/>
+                    <w:spacing w:before="0" w:after="0" w:lineRule="exact" w:line="300"/>
                     <w:ind w:left="0" w:right="0" w:firstLine="0"/>
                   </w:pPr>
                   <w:r>
@@ -1842,13 +1842,13 @@
       </w:r>
       <w:r>
         <w:pict>
-          <v:shape id="DocuMindTextBox68" type="#_x0000_t202" stroked="f" filled="f" o:allowincell="f" style="position:absolute;margin-left:36.140pt;margin-top:541.468pt;width:545.330pt;height:15.424pt;z-index:251659264;mso-position-horizontal-relative:page;mso-position-vertical-relative:page;mso-wrap-style:none;">
+          <v:shape id="DocuMindTextBox68" type="#_x0000_t202" stroked="f" filled="f" o:allowincell="f" style="position:absolute;margin-left:36.140pt;margin-top:539.968pt;width:546.330pt;height:21.000pt;z-index:251659264;mso-position-horizontal-relative:page;mso-position-vertical-relative:page;mso-wrap-style:none;mso-fit-shape-to-text:t;">
             <w10:wrap type="none"/>
             <v:textbox inset="0,0,0,0">
               <w:txbxContent>
                 <w:p>
                   <w:pPr>
-                    <w:spacing w:before="0" w:after="0" w:lineRule="exact" w:line="288"/>
+                    <w:spacing w:before="0" w:after="0" w:lineRule="exact" w:line="300"/>
                     <w:ind w:left="0" w:right="0" w:firstLine="0"/>
                   </w:pPr>
                   <w:r>
@@ -1869,13 +1869,13 @@
       </w:r>
       <w:r>
         <w:pict>
-          <v:shape id="DocuMindTextBox69" type="#_x0000_t202" stroked="f" filled="f" o:allowincell="f" style="position:absolute;margin-left:36.140pt;margin-top:555.868pt;width:545.317pt;height:15.424pt;z-index:251659264;mso-position-horizontal-relative:page;mso-position-vertical-relative:page;mso-wrap-style:none;">
+          <v:shape id="DocuMindTextBox69" type="#_x0000_t202" stroked="f" filled="f" o:allowincell="f" style="position:absolute;margin-left:36.140pt;margin-top:554.368pt;width:546.317pt;height:21.000pt;z-index:251659264;mso-position-horizontal-relative:page;mso-position-vertical-relative:page;mso-wrap-style:none;mso-fit-shape-to-text:t;">
             <w10:wrap type="none"/>
             <v:textbox inset="0,0,0,0">
               <w:txbxContent>
                 <w:p>
                   <w:pPr>
-                    <w:spacing w:before="0" w:after="0" w:lineRule="exact" w:line="288"/>
+                    <w:spacing w:before="0" w:after="0" w:lineRule="exact" w:line="300"/>
                     <w:ind w:left="0" w:right="0" w:firstLine="0"/>
                   </w:pPr>
                   <w:r>
@@ -1896,13 +1896,13 @@
       </w:r>
       <w:r>
         <w:pict>
-          <v:shape id="DocuMindTextBox70" type="#_x0000_t202" stroked="f" filled="f" o:allowincell="f" style="position:absolute;margin-left:36.140pt;margin-top:570.268pt;width:520.252pt;height:15.424pt;z-index:251659264;mso-position-horizontal-relative:page;mso-position-vertical-relative:page;mso-wrap-style:none;">
+          <v:shape id="DocuMindTextBox70" type="#_x0000_t202" stroked="f" filled="f" o:allowincell="f" style="position:absolute;margin-left:36.140pt;margin-top:568.768pt;width:521.252pt;height:21.000pt;z-index:251659264;mso-position-horizontal-relative:page;mso-position-vertical-relative:page;mso-wrap-style:none;mso-fit-shape-to-text:t;">
             <w10:wrap type="none"/>
             <v:textbox inset="0,0,0,0">
               <w:txbxContent>
                 <w:p>
                   <w:pPr>
-                    <w:spacing w:before="0" w:after="0" w:lineRule="exact" w:line="288"/>
+                    <w:spacing w:before="0" w:after="0" w:lineRule="exact" w:line="300"/>
                     <w:ind w:left="0" w:right="0" w:firstLine="0"/>
                   </w:pPr>
                   <w:r>
@@ -1923,13 +1923,13 @@
       </w:r>
       <w:r>
         <w:pict>
-          <v:shape id="DocuMindTextBox71" type="#_x0000_t202" stroked="f" filled="f" o:allowincell="f" style="position:absolute;margin-left:36.140pt;margin-top:599.068pt;width:545.330pt;height:15.424pt;z-index:251659264;mso-position-horizontal-relative:page;mso-position-vertical-relative:page;mso-wrap-style:none;">
+          <v:shape id="DocuMindTextBox71" type="#_x0000_t202" stroked="f" filled="f" o:allowincell="f" style="position:absolute;margin-left:36.140pt;margin-top:597.568pt;width:546.330pt;height:21.000pt;z-index:251659264;mso-position-horizontal-relative:page;mso-position-vertical-relative:page;mso-wrap-style:none;mso-fit-shape-to-text:t;">
             <w10:wrap type="none"/>
             <v:textbox inset="0,0,0,0">
               <w:txbxContent>
                 <w:p>
                   <w:pPr>
-                    <w:spacing w:before="0" w:after="0" w:lineRule="exact" w:line="288"/>
+                    <w:spacing w:before="0" w:after="0" w:lineRule="exact" w:line="300"/>
                     <w:ind w:left="0" w:right="0" w:firstLine="0"/>
                   </w:pPr>
                   <w:r>
@@ -1950,13 +1950,13 @@
       </w:r>
       <w:r>
         <w:pict>
-          <v:shape id="DocuMindTextBox72" type="#_x0000_t202" stroked="f" filled="f" o:allowincell="f" style="position:absolute;margin-left:36.140pt;margin-top:613.468pt;width:545.335pt;height:15.424pt;z-index:251659264;mso-position-horizontal-relative:page;mso-position-vertical-relative:page;mso-wrap-style:none;">
+          <v:shape id="DocuMindTextBox72" type="#_x0000_t202" stroked="f" filled="f" o:allowincell="f" style="position:absolute;margin-left:36.140pt;margin-top:611.968pt;width:546.335pt;height:21.000pt;z-index:251659264;mso-position-horizontal-relative:page;mso-position-vertical-relative:page;mso-wrap-style:none;mso-fit-shape-to-text:t;">
             <w10:wrap type="none"/>
             <v:textbox inset="0,0,0,0">
               <w:txbxContent>
                 <w:p>
                   <w:pPr>
-                    <w:spacing w:before="0" w:after="0" w:lineRule="exact" w:line="288"/>
+                    <w:spacing w:before="0" w:after="0" w:lineRule="exact" w:line="300"/>
                     <w:ind w:left="0" w:right="0" w:firstLine="0"/>
                   </w:pPr>
                   <w:r>
@@ -1977,13 +1977,13 @@
       </w:r>
       <w:r>
         <w:pict>
-          <v:shape id="DocuMindTextBox73" type="#_x0000_t202" stroked="f" filled="f" o:allowincell="f" style="position:absolute;margin-left:36.140pt;margin-top:627.868pt;width:545.318pt;height:15.424pt;z-index:251659264;mso-position-horizontal-relative:page;mso-position-vertical-relative:page;mso-wrap-style:none;">
+          <v:shape id="DocuMindTextBox73" type="#_x0000_t202" stroked="f" filled="f" o:allowincell="f" style="position:absolute;margin-left:36.140pt;margin-top:626.368pt;width:546.318pt;height:21.000pt;z-index:251659264;mso-position-horizontal-relative:page;mso-position-vertical-relative:page;mso-wrap-style:none;mso-fit-shape-to-text:t;">
             <w10:wrap type="none"/>
             <v:textbox inset="0,0,0,0">
               <w:txbxContent>
                 <w:p>
                   <w:pPr>
-                    <w:spacing w:before="0" w:after="0" w:lineRule="exact" w:line="288"/>
+                    <w:spacing w:before="0" w:after="0" w:lineRule="exact" w:line="300"/>
                     <w:ind w:left="0" w:right="0" w:firstLine="0"/>
                   </w:pPr>
                   <w:r>
@@ -2004,13 +2004,13 @@
       </w:r>
       <w:r>
         <w:pict>
-          <v:shape id="DocuMindTextBox74" type="#_x0000_t202" stroked="f" filled="f" o:allowincell="f" style="position:absolute;margin-left:36.140pt;margin-top:642.508pt;width:531.168pt;height:15.424pt;z-index:251659264;mso-position-horizontal-relative:page;mso-position-vertical-relative:page;mso-wrap-style:none;">
+          <v:shape id="DocuMindTextBox74" type="#_x0000_t202" stroked="f" filled="f" o:allowincell="f" style="position:absolute;margin-left:36.140pt;margin-top:641.008pt;width:532.168pt;height:21.000pt;z-index:251659264;mso-position-horizontal-relative:page;mso-position-vertical-relative:page;mso-wrap-style:none;mso-fit-shape-to-text:t;">
             <w10:wrap type="none"/>
             <v:textbox inset="0,0,0,0">
               <w:txbxContent>
                 <w:p>
                   <w:pPr>
-                    <w:spacing w:before="0" w:after="0" w:lineRule="exact" w:line="288"/>
+                    <w:spacing w:before="0" w:after="0" w:lineRule="exact" w:line="300"/>
                     <w:ind w:left="0" w:right="0" w:firstLine="0"/>
                   </w:pPr>
                   <w:r>
@@ -2031,13 +2031,13 @@
       </w:r>
       <w:r>
         <w:pict>
-          <v:shape id="DocuMindTextBox75" type="#_x0000_t202" stroked="f" filled="f" o:allowincell="f" style="position:absolute;margin-left:36.140pt;margin-top:671.308pt;width:545.324pt;height:15.424pt;z-index:251659264;mso-position-horizontal-relative:page;mso-position-vertical-relative:page;mso-wrap-style:none;">
+          <v:shape id="DocuMindTextBox75" type="#_x0000_t202" stroked="f" filled="f" o:allowincell="f" style="position:absolute;margin-left:36.140pt;margin-top:669.808pt;width:546.324pt;height:21.000pt;z-index:251659264;mso-position-horizontal-relative:page;mso-position-vertical-relative:page;mso-wrap-style:none;mso-fit-shape-to-text:t;">
             <w10:wrap type="none"/>
             <v:textbox inset="0,0,0,0">
               <w:txbxContent>
                 <w:p>
                   <w:pPr>
-                    <w:spacing w:before="0" w:after="0" w:lineRule="exact" w:line="288"/>
+                    <w:spacing w:before="0" w:after="0" w:lineRule="exact" w:line="300"/>
                     <w:ind w:left="0" w:right="0" w:firstLine="0"/>
                   </w:pPr>
                   <w:r>
@@ -2058,13 +2058,13 @@
       </w:r>
       <w:r>
         <w:pict>
-          <v:shape id="DocuMindTextBox76" type="#_x0000_t202" stroked="f" filled="f" o:allowincell="f" style="position:absolute;margin-left:36.140pt;margin-top:685.708pt;width:545.337pt;height:15.424pt;z-index:251659264;mso-position-horizontal-relative:page;mso-position-vertical-relative:page;mso-wrap-style:none;">
+          <v:shape id="DocuMindTextBox76" type="#_x0000_t202" stroked="f" filled="f" o:allowincell="f" style="position:absolute;margin-left:36.140pt;margin-top:684.208pt;width:546.337pt;height:21.000pt;z-index:251659264;mso-position-horizontal-relative:page;mso-position-vertical-relative:page;mso-wrap-style:none;mso-fit-shape-to-text:t;">
             <w10:wrap type="none"/>
             <v:textbox inset="0,0,0,0">
               <w:txbxContent>
                 <w:p>
                   <w:pPr>
-                    <w:spacing w:before="0" w:after="0" w:lineRule="exact" w:line="288"/>
+                    <w:spacing w:before="0" w:after="0" w:lineRule="exact" w:line="300"/>
                     <w:ind w:left="0" w:right="0" w:firstLine="0"/>
                   </w:pPr>
                   <w:r>
@@ -2085,13 +2085,13 @@
       </w:r>
       <w:r>
         <w:pict>
-          <v:shape id="DocuMindTextBox77" type="#_x0000_t202" stroked="f" filled="f" o:allowincell="f" style="position:absolute;margin-left:36.140pt;margin-top:700.108pt;width:545.325pt;height:15.424pt;z-index:251659264;mso-position-horizontal-relative:page;mso-position-vertical-relative:page;mso-wrap-style:none;">
+          <v:shape id="DocuMindTextBox77" type="#_x0000_t202" stroked="f" filled="f" o:allowincell="f" style="position:absolute;margin-left:36.140pt;margin-top:698.608pt;width:546.325pt;height:21.000pt;z-index:251659264;mso-position-horizontal-relative:page;mso-position-vertical-relative:page;mso-wrap-style:none;mso-fit-shape-to-text:t;">
             <w10:wrap type="none"/>
             <v:textbox inset="0,0,0,0">
               <w:txbxContent>
                 <w:p>
                   <w:pPr>
-                    <w:spacing w:before="0" w:after="0" w:lineRule="exact" w:line="288"/>
+                    <w:spacing w:before="0" w:after="0" w:lineRule="exact" w:line="300"/>
                     <w:ind w:left="0" w:right="0" w:firstLine="0"/>
                   </w:pPr>
                   <w:r>
@@ -2112,13 +2112,13 @@
       </w:r>
       <w:r>
         <w:pict>
-          <v:shape id="DocuMindTextBox78" type="#_x0000_t202" stroked="f" filled="f" o:allowincell="f" style="position:absolute;margin-left:36.140pt;margin-top:714.508pt;width:545.331pt;height:15.424pt;z-index:251659264;mso-position-horizontal-relative:page;mso-position-vertical-relative:page;mso-wrap-style:none;">
+          <v:shape id="DocuMindTextBox78" type="#_x0000_t202" stroked="f" filled="f" o:allowincell="f" style="position:absolute;margin-left:36.140pt;margin-top:713.008pt;width:546.331pt;height:21.000pt;z-index:251659264;mso-position-horizontal-relative:page;mso-position-vertical-relative:page;mso-wrap-style:none;mso-fit-shape-to-text:t;">
             <w10:wrap type="none"/>
             <v:textbox inset="0,0,0,0">
               <w:txbxContent>
                 <w:p>
                   <w:pPr>
-                    <w:spacing w:before="0" w:after="0" w:lineRule="exact" w:line="288"/>
+                    <w:spacing w:before="0" w:after="0" w:lineRule="exact" w:line="300"/>
                     <w:ind w:left="0" w:right="0" w:firstLine="0"/>
                   </w:pPr>
                   <w:r>
@@ -2159,13 +2159,13 @@
       </w:r>
       <w:r>
         <w:pict>
-          <v:shape id="DocuMindTextBox79" type="#_x0000_t202" stroked="f" filled="f" o:allowincell="f" style="position:absolute;margin-left:303.020pt;margin-top:742.036pt;width:10.794pt;height:15.652pt;z-index:251659264;mso-position-horizontal-relative:page;mso-position-vertical-relative:page;mso-wrap-style:none;">
+          <v:shape id="DocuMindTextBox79" type="#_x0000_t202" stroked="f" filled="f" o:allowincell="f" style="position:absolute;margin-left:303.020pt;margin-top:740.536pt;width:11.794pt;height:21.000pt;z-index:251659264;mso-position-horizontal-relative:page;mso-position-vertical-relative:page;mso-wrap-style:none;mso-fit-shape-to-text:t;">
             <w10:wrap type="none"/>
             <v:textbox inset="0,0,0,0">
               <w:txbxContent>
                 <w:p>
                   <w:pPr>
-                    <w:spacing w:before="0" w:after="0" w:lineRule="exact" w:line="293"/>
+                    <w:spacing w:before="0" w:after="0" w:lineRule="exact" w:line="300"/>
                     <w:ind w:left="0" w:right="0" w:firstLine="0"/>
                   </w:pPr>
                   <w:r>
@@ -2186,13 +2186,13 @@
       </w:r>
       <w:r>
         <w:pict>
-          <v:shape id="DocuMindTextBox80" type="#_x0000_t202" stroked="f" filled="f" o:allowincell="f" style="position:absolute;margin-left:36.140pt;margin-top:36.508pt;width:545.329pt;height:15.424pt;z-index:251659264;mso-position-horizontal-relative:page;mso-position-vertical-relative:page;mso-wrap-style:none;">
+          <v:shape id="DocuMindTextBox80" type="#_x0000_t202" stroked="f" filled="f" o:allowincell="f" style="position:absolute;margin-left:36.140pt;margin-top:35.008pt;width:546.329pt;height:21.000pt;z-index:251659264;mso-position-horizontal-relative:page;mso-position-vertical-relative:page;mso-wrap-style:none;mso-fit-shape-to-text:t;">
             <w10:wrap type="none"/>
             <v:textbox inset="0,0,0,0">
               <w:txbxContent>
                 <w:p>
                   <w:pPr>
-                    <w:spacing w:before="0" w:after="0" w:lineRule="exact" w:line="288"/>
+                    <w:spacing w:before="0" w:after="0" w:lineRule="exact" w:line="300"/>
                     <w:ind w:left="0" w:right="0" w:firstLine="0"/>
                   </w:pPr>
                   <w:r>
@@ -2213,13 +2213,13 @@
       </w:r>
       <w:r>
         <w:pict>
-          <v:shape id="DocuMindTextBox81" type="#_x0000_t202" stroked="f" filled="f" o:allowincell="f" style="position:absolute;margin-left:36.140pt;margin-top:50.908pt;width:545.331pt;height:15.424pt;z-index:251659264;mso-position-horizontal-relative:page;mso-position-vertical-relative:page;mso-wrap-style:none;">
+          <v:shape id="DocuMindTextBox81" type="#_x0000_t202" stroked="f" filled="f" o:allowincell="f" style="position:absolute;margin-left:36.140pt;margin-top:49.408pt;width:546.331pt;height:21.000pt;z-index:251659264;mso-position-horizontal-relative:page;mso-position-vertical-relative:page;mso-wrap-style:none;mso-fit-shape-to-text:t;">
             <w10:wrap type="none"/>
             <v:textbox inset="0,0,0,0">
               <w:txbxContent>
                 <w:p>
                   <w:pPr>
-                    <w:spacing w:before="0" w:after="0" w:lineRule="exact" w:line="288"/>
+                    <w:spacing w:before="0" w:after="0" w:lineRule="exact" w:line="300"/>
                     <w:ind w:left="0" w:right="0" w:firstLine="0"/>
                   </w:pPr>
                   <w:r>
@@ -2240,13 +2240,13 @@
       </w:r>
       <w:r>
         <w:pict>
-          <v:shape id="DocuMindTextBox82" type="#_x0000_t202" stroked="f" filled="f" o:allowincell="f" style="position:absolute;margin-left:36.140pt;margin-top:65.308pt;width:100.023pt;height:15.424pt;z-index:251659264;mso-position-horizontal-relative:page;mso-position-vertical-relative:page;mso-wrap-style:none;">
+          <v:shape id="DocuMindTextBox82" type="#_x0000_t202" stroked="f" filled="f" o:allowincell="f" style="position:absolute;margin-left:36.140pt;margin-top:63.808pt;width:101.023pt;height:21.000pt;z-index:251659264;mso-position-horizontal-relative:page;mso-position-vertical-relative:page;mso-wrap-style:none;mso-fit-shape-to-text:t;">
             <w10:wrap type="none"/>
             <v:textbox inset="0,0,0,0">
               <w:txbxContent>
                 <w:p>
                   <w:pPr>
-                    <w:spacing w:before="0" w:after="0" w:lineRule="exact" w:line="288"/>
+                    <w:spacing w:before="0" w:after="0" w:lineRule="exact" w:line="300"/>
                     <w:ind w:left="0" w:right="0" w:firstLine="0"/>
                   </w:pPr>
                   <w:r>
@@ -2267,13 +2267,13 @@
       </w:r>
       <w:r>
         <w:pict>
-          <v:shape id="DocuMindTextBox83" type="#_x0000_t202" stroked="f" filled="f" o:allowincell="f" style="position:absolute;margin-left:36.140pt;margin-top:94.108pt;width:545.322pt;height:15.424pt;z-index:251659264;mso-position-horizontal-relative:page;mso-position-vertical-relative:page;mso-wrap-style:none;">
+          <v:shape id="DocuMindTextBox83" type="#_x0000_t202" stroked="f" filled="f" o:allowincell="f" style="position:absolute;margin-left:36.140pt;margin-top:92.608pt;width:546.322pt;height:21.000pt;z-index:251659264;mso-position-horizontal-relative:page;mso-position-vertical-relative:page;mso-wrap-style:none;mso-fit-shape-to-text:t;">
             <w10:wrap type="none"/>
             <v:textbox inset="0,0,0,0">
               <w:txbxContent>
                 <w:p>
                   <w:pPr>
-                    <w:spacing w:before="0" w:after="0" w:lineRule="exact" w:line="288"/>
+                    <w:spacing w:before="0" w:after="0" w:lineRule="exact" w:line="300"/>
                     <w:ind w:left="0" w:right="0" w:firstLine="0"/>
                   </w:pPr>
                   <w:r>
@@ -2294,13 +2294,13 @@
       </w:r>
       <w:r>
         <w:pict>
-          <v:shape id="DocuMindTextBox84" type="#_x0000_t202" stroked="f" filled="f" o:allowincell="f" style="position:absolute;margin-left:36.140pt;margin-top:108.748pt;width:545.336pt;height:15.424pt;z-index:251659264;mso-position-horizontal-relative:page;mso-position-vertical-relative:page;mso-wrap-style:none;">
+          <v:shape id="DocuMindTextBox84" type="#_x0000_t202" stroked="f" filled="f" o:allowincell="f" style="position:absolute;margin-left:36.140pt;margin-top:107.248pt;width:546.336pt;height:21.000pt;z-index:251659264;mso-position-horizontal-relative:page;mso-position-vertical-relative:page;mso-wrap-style:none;mso-fit-shape-to-text:t;">
             <w10:wrap type="none"/>
             <v:textbox inset="0,0,0,0">
               <w:txbxContent>
                 <w:p>
                   <w:pPr>
-                    <w:spacing w:before="0" w:after="0" w:lineRule="exact" w:line="288"/>
+                    <w:spacing w:before="0" w:after="0" w:lineRule="exact" w:line="300"/>
                     <w:ind w:left="0" w:right="0" w:firstLine="0"/>
                   </w:pPr>
                   <w:r>
@@ -2321,13 +2321,13 @@
       </w:r>
       <w:r>
         <w:pict>
-          <v:shape id="DocuMindTextBox85" type="#_x0000_t202" stroked="f" filled="f" o:allowincell="f" style="position:absolute;margin-left:36.140pt;margin-top:123.148pt;width:545.334pt;height:15.424pt;z-index:251659264;mso-position-horizontal-relative:page;mso-position-vertical-relative:page;mso-wrap-style:none;">
+          <v:shape id="DocuMindTextBox85" type="#_x0000_t202" stroked="f" filled="f" o:allowincell="f" style="position:absolute;margin-left:36.140pt;margin-top:121.648pt;width:546.334pt;height:21.000pt;z-index:251659264;mso-position-horizontal-relative:page;mso-position-vertical-relative:page;mso-wrap-style:none;mso-fit-shape-to-text:t;">
             <w10:wrap type="none"/>
             <v:textbox inset="0,0,0,0">
               <w:txbxContent>
                 <w:p>
                   <w:pPr>
-                    <w:spacing w:before="0" w:after="0" w:lineRule="exact" w:line="288"/>
+                    <w:spacing w:before="0" w:after="0" w:lineRule="exact" w:line="300"/>
                     <w:ind w:left="0" w:right="0" w:firstLine="0"/>
                   </w:pPr>
                   <w:r>
@@ -2348,13 +2348,13 @@
       </w:r>
       <w:r>
         <w:pict>
-          <v:shape id="DocuMindTextBox86" type="#_x0000_t202" stroked="f" filled="f" o:allowincell="f" style="position:absolute;margin-left:36.140pt;margin-top:137.548pt;width:545.325pt;height:15.424pt;z-index:251659264;mso-position-horizontal-relative:page;mso-position-vertical-relative:page;mso-wrap-style:none;">
+          <v:shape id="DocuMindTextBox86" type="#_x0000_t202" stroked="f" filled="f" o:allowincell="f" style="position:absolute;margin-left:36.140pt;margin-top:136.048pt;width:546.325pt;height:21.000pt;z-index:251659264;mso-position-horizontal-relative:page;mso-position-vertical-relative:page;mso-wrap-style:none;mso-fit-shape-to-text:t;">
             <w10:wrap type="none"/>
             <v:textbox inset="0,0,0,0">
               <w:txbxContent>
                 <w:p>
                   <w:pPr>
-                    <w:spacing w:before="0" w:after="0" w:lineRule="exact" w:line="288"/>
+                    <w:spacing w:before="0" w:after="0" w:lineRule="exact" w:line="300"/>
                     <w:ind w:left="0" w:right="0" w:firstLine="0"/>
                   </w:pPr>
                   <w:r>
@@ -2375,13 +2375,13 @@
       </w:r>
       <w:r>
         <w:pict>
-          <v:shape id="DocuMindTextBox87" type="#_x0000_t202" stroked="f" filled="f" o:allowincell="f" style="position:absolute;margin-left:36.140pt;margin-top:151.948pt;width:376.908pt;height:15.424pt;z-index:251659264;mso-position-horizontal-relative:page;mso-position-vertical-relative:page;mso-wrap-style:none;">
+          <v:shape id="DocuMindTextBox87" type="#_x0000_t202" stroked="f" filled="f" o:allowincell="f" style="position:absolute;margin-left:36.140pt;margin-top:150.448pt;width:377.908pt;height:21.000pt;z-index:251659264;mso-position-horizontal-relative:page;mso-position-vertical-relative:page;mso-wrap-style:none;mso-fit-shape-to-text:t;">
             <w10:wrap type="none"/>
             <v:textbox inset="0,0,0,0">
               <w:txbxContent>
                 <w:p>
                   <w:pPr>
-                    <w:spacing w:before="0" w:after="0" w:lineRule="exact" w:line="288"/>
+                    <w:spacing w:before="0" w:after="0" w:lineRule="exact" w:line="300"/>
                     <w:ind w:left="0" w:right="0" w:firstLine="0"/>
                   </w:pPr>
                   <w:r>
@@ -2402,13 +2402,13 @@
       </w:r>
       <w:r>
         <w:pict>
-          <v:shape id="DocuMindTextBox88" type="#_x0000_t202" stroked="f" filled="f" o:allowincell="f" style="position:absolute;margin-left:36.140pt;margin-top:180.748pt;width:545.329pt;height:15.424pt;z-index:251659264;mso-position-horizontal-relative:page;mso-position-vertical-relative:page;mso-wrap-style:none;">
+          <v:shape id="DocuMindTextBox88" type="#_x0000_t202" stroked="f" filled="f" o:allowincell="f" style="position:absolute;margin-left:36.140pt;margin-top:179.248pt;width:546.329pt;height:21.000pt;z-index:251659264;mso-position-horizontal-relative:page;mso-position-vertical-relative:page;mso-wrap-style:none;mso-fit-shape-to-text:t;">
             <w10:wrap type="none"/>
             <v:textbox inset="0,0,0,0">
               <w:txbxContent>
                 <w:p>
                   <w:pPr>
-                    <w:spacing w:before="0" w:after="0" w:lineRule="exact" w:line="288"/>
+                    <w:spacing w:before="0" w:after="0" w:lineRule="exact" w:line="300"/>
                     <w:ind w:left="0" w:right="0" w:firstLine="0"/>
                   </w:pPr>
                   <w:r>
@@ -2429,13 +2429,13 @@
       </w:r>
       <w:r>
         <w:pict>
-          <v:shape id="DocuMindTextBox89" type="#_x0000_t202" stroked="f" filled="f" o:allowincell="f" style="position:absolute;margin-left:36.140pt;margin-top:195.148pt;width:545.324pt;height:15.424pt;z-index:251659264;mso-position-horizontal-relative:page;mso-position-vertical-relative:page;mso-wrap-style:none;">
+          <v:shape id="DocuMindTextBox89" type="#_x0000_t202" stroked="f" filled="f" o:allowincell="f" style="position:absolute;margin-left:36.140pt;margin-top:193.648pt;width:546.324pt;height:21.000pt;z-index:251659264;mso-position-horizontal-relative:page;mso-position-vertical-relative:page;mso-wrap-style:none;mso-fit-shape-to-text:t;">
             <w10:wrap type="none"/>
             <v:textbox inset="0,0,0,0">
               <w:txbxContent>
                 <w:p>
                   <w:pPr>
-                    <w:spacing w:before="0" w:after="0" w:lineRule="exact" w:line="288"/>
+                    <w:spacing w:before="0" w:after="0" w:lineRule="exact" w:line="300"/>
                     <w:ind w:left="0" w:right="0" w:firstLine="0"/>
                   </w:pPr>
                   <w:r>
@@ -2456,13 +2456,13 @@
       </w:r>
       <w:r>
         <w:pict>
-          <v:shape id="DocuMindTextBox90" type="#_x0000_t202" stroked="f" filled="f" o:allowincell="f" style="position:absolute;margin-left:36.140pt;margin-top:209.548pt;width:545.333pt;height:15.424pt;z-index:251659264;mso-position-horizontal-relative:page;mso-position-vertical-relative:page;mso-wrap-style:none;">
+          <v:shape id="DocuMindTextBox90" type="#_x0000_t202" stroked="f" filled="f" o:allowincell="f" style="position:absolute;margin-left:36.140pt;margin-top:208.048pt;width:546.333pt;height:21.000pt;z-index:251659264;mso-position-horizontal-relative:page;mso-position-vertical-relative:page;mso-wrap-style:none;mso-fit-shape-to-text:t;">
             <w10:wrap type="none"/>
             <v:textbox inset="0,0,0,0">
               <w:txbxContent>
                 <w:p>
                   <w:pPr>
-                    <w:spacing w:before="0" w:after="0" w:lineRule="exact" w:line="288"/>
+                    <w:spacing w:before="0" w:after="0" w:lineRule="exact" w:line="300"/>
                     <w:ind w:left="0" w:right="0" w:firstLine="0"/>
                   </w:pPr>
                   <w:r>
@@ -2483,13 +2483,13 @@
       </w:r>
       <w:r>
         <w:pict>
-          <v:shape id="DocuMindTextBox91" type="#_x0000_t202" stroked="f" filled="f" o:allowincell="f" style="position:absolute;margin-left:36.140pt;margin-top:223.948pt;width:545.322pt;height:15.424pt;z-index:251659264;mso-position-horizontal-relative:page;mso-position-vertical-relative:page;mso-wrap-style:none;">
+          <v:shape id="DocuMindTextBox91" type="#_x0000_t202" stroked="f" filled="f" o:allowincell="f" style="position:absolute;margin-left:36.140pt;margin-top:222.448pt;width:546.322pt;height:21.000pt;z-index:251659264;mso-position-horizontal-relative:page;mso-position-vertical-relative:page;mso-wrap-style:none;mso-fit-shape-to-text:t;">
             <w10:wrap type="none"/>
             <v:textbox inset="0,0,0,0">
               <w:txbxContent>
                 <w:p>
                   <w:pPr>
-                    <w:spacing w:before="0" w:after="0" w:lineRule="exact" w:line="288"/>
+                    <w:spacing w:before="0" w:after="0" w:lineRule="exact" w:line="300"/>
                     <w:ind w:left="0" w:right="0" w:firstLine="0"/>
                   </w:pPr>
                   <w:r>
@@ -2510,13 +2510,13 @@
       </w:r>
       <w:r>
         <w:pict>
-          <v:shape id="DocuMindTextBox92" type="#_x0000_t202" stroked="f" filled="f" o:allowincell="f" style="position:absolute;margin-left:36.140pt;margin-top:238.588pt;width:545.336pt;height:15.424pt;z-index:251659264;mso-position-horizontal-relative:page;mso-position-vertical-relative:page;mso-wrap-style:none;">
+          <v:shape id="DocuMindTextBox92" type="#_x0000_t202" stroked="f" filled="f" o:allowincell="f" style="position:absolute;margin-left:36.140pt;margin-top:237.088pt;width:546.336pt;height:21.000pt;z-index:251659264;mso-position-horizontal-relative:page;mso-position-vertical-relative:page;mso-wrap-style:none;mso-fit-shape-to-text:t;">
             <w10:wrap type="none"/>
             <v:textbox inset="0,0,0,0">
               <w:txbxContent>
                 <w:p>
                   <w:pPr>
-                    <w:spacing w:before="0" w:after="0" w:lineRule="exact" w:line="288"/>
+                    <w:spacing w:before="0" w:after="0" w:lineRule="exact" w:line="300"/>
                     <w:ind w:left="0" w:right="0" w:firstLine="0"/>
                   </w:pPr>
                   <w:r>
@@ -2537,13 +2537,13 @@
       </w:r>
       <w:r>
         <w:pict>
-          <v:shape id="DocuMindTextBox93" type="#_x0000_t202" stroked="f" filled="f" o:allowincell="f" style="position:absolute;margin-left:36.140pt;margin-top:252.988pt;width:104.230pt;height:15.424pt;z-index:251659264;mso-position-horizontal-relative:page;mso-position-vertical-relative:page;mso-wrap-style:none;">
+          <v:shape id="DocuMindTextBox93" type="#_x0000_t202" stroked="f" filled="f" o:allowincell="f" style="position:absolute;margin-left:36.140pt;margin-top:251.488pt;width:105.230pt;height:21.000pt;z-index:251659264;mso-position-horizontal-relative:page;mso-position-vertical-relative:page;mso-wrap-style:none;mso-fit-shape-to-text:t;">
             <w10:wrap type="none"/>
             <v:textbox inset="0,0,0,0">
               <w:txbxContent>
                 <w:p>
                   <w:pPr>
-                    <w:spacing w:before="0" w:after="0" w:lineRule="exact" w:line="288"/>
+                    <w:spacing w:before="0" w:after="0" w:lineRule="exact" w:line="300"/>
                     <w:ind w:left="0" w:right="0" w:firstLine="0"/>
                   </w:pPr>
                   <w:r>
@@ -2564,13 +2564,13 @@
       </w:r>
       <w:r>
         <w:pict>
-          <v:shape id="DocuMindTextBox94" type="#_x0000_t202" stroked="f" filled="f" o:allowincell="f" style="position:absolute;margin-left:36.140pt;margin-top:281.788pt;width:545.332pt;height:15.424pt;z-index:251659264;mso-position-horizontal-relative:page;mso-position-vertical-relative:page;mso-wrap-style:none;">
+          <v:shape id="DocuMindTextBox94" type="#_x0000_t202" stroked="f" filled="f" o:allowincell="f" style="position:absolute;margin-left:36.140pt;margin-top:280.288pt;width:546.332pt;height:21.000pt;z-index:251659264;mso-position-horizontal-relative:page;mso-position-vertical-relative:page;mso-wrap-style:none;mso-fit-shape-to-text:t;">
             <w10:wrap type="none"/>
             <v:textbox inset="0,0,0,0">
               <w:txbxContent>
                 <w:p>
                   <w:pPr>
-                    <w:spacing w:before="0" w:after="0" w:lineRule="exact" w:line="288"/>
+                    <w:spacing w:before="0" w:after="0" w:lineRule="exact" w:line="300"/>
                     <w:ind w:left="0" w:right="0" w:firstLine="0"/>
                   </w:pPr>
                   <w:r>
@@ -2591,13 +2591,13 @@
       </w:r>
       <w:r>
         <w:pict>
-          <v:shape id="DocuMindTextBox95" type="#_x0000_t202" stroked="f" filled="f" o:allowincell="f" style="position:absolute;margin-left:36.140pt;margin-top:296.188pt;width:545.326pt;height:15.424pt;z-index:251659264;mso-position-horizontal-relative:page;mso-position-vertical-relative:page;mso-wrap-style:none;">
+          <v:shape id="DocuMindTextBox95" type="#_x0000_t202" stroked="f" filled="f" o:allowincell="f" style="position:absolute;margin-left:36.140pt;margin-top:294.688pt;width:546.326pt;height:21.000pt;z-index:251659264;mso-position-horizontal-relative:page;mso-position-vertical-relative:page;mso-wrap-style:none;mso-fit-shape-to-text:t;">
             <w10:wrap type="none"/>
             <v:textbox inset="0,0,0,0">
               <w:txbxContent>
                 <w:p>
                   <w:pPr>
-                    <w:spacing w:before="0" w:after="0" w:lineRule="exact" w:line="288"/>
+                    <w:spacing w:before="0" w:after="0" w:lineRule="exact" w:line="300"/>
                     <w:ind w:left="0" w:right="0" w:firstLine="0"/>
                   </w:pPr>
                   <w:r>
@@ -2618,13 +2618,13 @@
       </w:r>
       <w:r>
         <w:pict>
-          <v:shape id="DocuMindTextBox96" type="#_x0000_t202" stroked="f" filled="f" o:allowincell="f" style="position:absolute;margin-left:36.140pt;margin-top:310.588pt;width:545.333pt;height:15.424pt;z-index:251659264;mso-position-horizontal-relative:page;mso-position-vertical-relative:page;mso-wrap-style:none;">
+          <v:shape id="DocuMindTextBox96" type="#_x0000_t202" stroked="f" filled="f" o:allowincell="f" style="position:absolute;margin-left:36.140pt;margin-top:309.088pt;width:546.333pt;height:21.000pt;z-index:251659264;mso-position-horizontal-relative:page;mso-position-vertical-relative:page;mso-wrap-style:none;mso-fit-shape-to-text:t;">
             <w10:wrap type="none"/>
             <v:textbox inset="0,0,0,0">
               <w:txbxContent>
                 <w:p>
                   <w:pPr>
-                    <w:spacing w:before="0" w:after="0" w:lineRule="exact" w:line="288"/>
+                    <w:spacing w:before="0" w:after="0" w:lineRule="exact" w:line="300"/>
                     <w:ind w:left="0" w:right="0" w:firstLine="0"/>
                   </w:pPr>
                   <w:r>
@@ -2645,13 +2645,13 @@
       </w:r>
       <w:r>
         <w:pict>
-          <v:shape id="DocuMindTextBox97" type="#_x0000_t202" stroked="f" filled="f" o:allowincell="f" style="position:absolute;margin-left:36.140pt;margin-top:324.988pt;width:455.160pt;height:15.424pt;z-index:251659264;mso-position-horizontal-relative:page;mso-position-vertical-relative:page;mso-wrap-style:none;">
+          <v:shape id="DocuMindTextBox97" type="#_x0000_t202" stroked="f" filled="f" o:allowincell="f" style="position:absolute;margin-left:36.140pt;margin-top:323.488pt;width:456.160pt;height:21.000pt;z-index:251659264;mso-position-horizontal-relative:page;mso-position-vertical-relative:page;mso-wrap-style:none;mso-fit-shape-to-text:t;">
             <w10:wrap type="none"/>
             <v:textbox inset="0,0,0,0">
               <w:txbxContent>
                 <w:p>
                   <w:pPr>
-                    <w:spacing w:before="0" w:after="0" w:lineRule="exact" w:line="288"/>
+                    <w:spacing w:before="0" w:after="0" w:lineRule="exact" w:line="300"/>
                     <w:ind w:left="0" w:right="0" w:firstLine="0"/>
                   </w:pPr>
                   <w:r>
@@ -2672,13 +2672,13 @@
       </w:r>
       <w:r>
         <w:pict>
-          <v:shape id="DocuMindTextBox98" type="#_x0000_t202" stroked="f" filled="f" o:allowincell="f" style="position:absolute;margin-left:36.140pt;margin-top:353.788pt;width:545.324pt;height:15.424pt;z-index:251659264;mso-position-horizontal-relative:page;mso-position-vertical-relative:page;mso-wrap-style:none;">
+          <v:shape id="DocuMindTextBox98" type="#_x0000_t202" stroked="f" filled="f" o:allowincell="f" style="position:absolute;margin-left:36.140pt;margin-top:352.288pt;width:546.324pt;height:21.000pt;z-index:251659264;mso-position-horizontal-relative:page;mso-position-vertical-relative:page;mso-wrap-style:none;mso-fit-shape-to-text:t;">
             <w10:wrap type="none"/>
             <v:textbox inset="0,0,0,0">
               <w:txbxContent>
                 <w:p>
                   <w:pPr>
-                    <w:spacing w:before="0" w:after="0" w:lineRule="exact" w:line="288"/>
+                    <w:spacing w:before="0" w:after="0" w:lineRule="exact" w:line="300"/>
                     <w:ind w:left="0" w:right="0" w:firstLine="0"/>
                   </w:pPr>
                   <w:r>
@@ -2699,13 +2699,13 @@
       </w:r>
       <w:r>
         <w:pict>
-          <v:shape id="DocuMindTextBox99" type="#_x0000_t202" stroked="f" filled="f" o:allowincell="f" style="position:absolute;margin-left:36.140pt;margin-top:368.188pt;width:545.331pt;height:15.424pt;z-index:251659264;mso-position-horizontal-relative:page;mso-position-vertical-relative:page;mso-wrap-style:none;">
+          <v:shape id="DocuMindTextBox99" type="#_x0000_t202" stroked="f" filled="f" o:allowincell="f" style="position:absolute;margin-left:36.140pt;margin-top:366.688pt;width:546.331pt;height:21.000pt;z-index:251659264;mso-position-horizontal-relative:page;mso-position-vertical-relative:page;mso-wrap-style:none;mso-fit-shape-to-text:t;">
             <w10:wrap type="none"/>
             <v:textbox inset="0,0,0,0">
               <w:txbxContent>
                 <w:p>
                   <w:pPr>
-                    <w:spacing w:before="0" w:after="0" w:lineRule="exact" w:line="288"/>
+                    <w:spacing w:before="0" w:after="0" w:lineRule="exact" w:line="300"/>
                     <w:ind w:left="0" w:right="0" w:firstLine="0"/>
                   </w:pPr>
                   <w:r>
@@ -2726,13 +2726,13 @@
       </w:r>
       <w:r>
         <w:pict>
-          <v:shape id="DocuMindTextBox100" type="#_x0000_t202" stroked="f" filled="f" o:allowincell="f" style="position:absolute;margin-left:36.140pt;margin-top:382.828pt;width:545.326pt;height:15.424pt;z-index:251659264;mso-position-horizontal-relative:page;mso-position-vertical-relative:page;mso-wrap-style:none;">
+          <v:shape id="DocuMindTextBox100" type="#_x0000_t202" stroked="f" filled="f" o:allowincell="f" style="position:absolute;margin-left:36.140pt;margin-top:381.328pt;width:546.326pt;height:21.000pt;z-index:251659264;mso-position-horizontal-relative:page;mso-position-vertical-relative:page;mso-wrap-style:none;mso-fit-shape-to-text:t;">
             <w10:wrap type="none"/>
             <v:textbox inset="0,0,0,0">
               <w:txbxContent>
                 <w:p>
                   <w:pPr>
-                    <w:spacing w:before="0" w:after="0" w:lineRule="exact" w:line="288"/>
+                    <w:spacing w:before="0" w:after="0" w:lineRule="exact" w:line="300"/>
                     <w:ind w:left="0" w:right="0" w:firstLine="0"/>
                   </w:pPr>
                   <w:r>
@@ -2753,13 +2753,13 @@
       </w:r>
       <w:r>
         <w:pict>
-          <v:shape id="DocuMindTextBox101" type="#_x0000_t202" stroked="f" filled="f" o:allowincell="f" style="position:absolute;margin-left:36.140pt;margin-top:397.228pt;width:545.331pt;height:15.424pt;z-index:251659264;mso-position-horizontal-relative:page;mso-position-vertical-relative:page;mso-wrap-style:none;">
+          <v:shape id="DocuMindTextBox101" type="#_x0000_t202" stroked="f" filled="f" o:allowincell="f" style="position:absolute;margin-left:36.140pt;margin-top:395.728pt;width:546.331pt;height:21.000pt;z-index:251659264;mso-position-horizontal-relative:page;mso-position-vertical-relative:page;mso-wrap-style:none;mso-fit-shape-to-text:t;">
             <w10:wrap type="none"/>
             <v:textbox inset="0,0,0,0">
               <w:txbxContent>
                 <w:p>
                   <w:pPr>
-                    <w:spacing w:before="0" w:after="0" w:lineRule="exact" w:line="288"/>
+                    <w:spacing w:before="0" w:after="0" w:lineRule="exact" w:line="300"/>
                     <w:ind w:left="0" w:right="0" w:firstLine="0"/>
                   </w:pPr>
                   <w:r>
@@ -2780,13 +2780,13 @@
       </w:r>
       <w:r>
         <w:pict>
-          <v:shape id="DocuMindTextBox102" type="#_x0000_t202" stroked="f" filled="f" o:allowincell="f" style="position:absolute;margin-left:36.140pt;margin-top:411.628pt;width:545.327pt;height:15.424pt;z-index:251659264;mso-position-horizontal-relative:page;mso-position-vertical-relative:page;mso-wrap-style:none;">
+          <v:shape id="DocuMindTextBox102" type="#_x0000_t202" stroked="f" filled="f" o:allowincell="f" style="position:absolute;margin-left:36.140pt;margin-top:410.128pt;width:546.327pt;height:21.000pt;z-index:251659264;mso-position-horizontal-relative:page;mso-position-vertical-relative:page;mso-wrap-style:none;mso-fit-shape-to-text:t;">
             <w10:wrap type="none"/>
             <v:textbox inset="0,0,0,0">
               <w:txbxContent>
                 <w:p>
                   <w:pPr>
-                    <w:spacing w:before="0" w:after="0" w:lineRule="exact" w:line="288"/>
+                    <w:spacing w:before="0" w:after="0" w:lineRule="exact" w:line="300"/>
                     <w:ind w:left="0" w:right="0" w:firstLine="0"/>
                   </w:pPr>
                   <w:r>
@@ -2807,13 +2807,13 @@
       </w:r>
       <w:r>
         <w:pict>
-          <v:shape id="DocuMindTextBox103" type="#_x0000_t202" stroked="f" filled="f" o:allowincell="f" style="position:absolute;margin-left:36.140pt;margin-top:426.028pt;width:235.797pt;height:15.424pt;z-index:251659264;mso-position-horizontal-relative:page;mso-position-vertical-relative:page;mso-wrap-style:none;">
+          <v:shape id="DocuMindTextBox103" type="#_x0000_t202" stroked="f" filled="f" o:allowincell="f" style="position:absolute;margin-left:36.140pt;margin-top:424.528pt;width:236.797pt;height:21.000pt;z-index:251659264;mso-position-horizontal-relative:page;mso-position-vertical-relative:page;mso-wrap-style:none;mso-fit-shape-to-text:t;">
             <w10:wrap type="none"/>
             <v:textbox inset="0,0,0,0">
               <w:txbxContent>
                 <w:p>
                   <w:pPr>
-                    <w:spacing w:before="0" w:after="0" w:lineRule="exact" w:line="288"/>
+                    <w:spacing w:before="0" w:after="0" w:lineRule="exact" w:line="300"/>
                     <w:ind w:left="0" w:right="0" w:firstLine="0"/>
                   </w:pPr>
                   <w:r>
@@ -2834,13 +2834,13 @@
       </w:r>
       <w:r>
         <w:pict>
-          <v:shape id="DocuMindTextBox104" type="#_x0000_t202" stroked="f" filled="f" o:allowincell="f" style="position:absolute;margin-left:36.140pt;margin-top:454.828pt;width:545.334pt;height:15.424pt;z-index:251659264;mso-position-horizontal-relative:page;mso-position-vertical-relative:page;mso-wrap-style:none;">
+          <v:shape id="DocuMindTextBox104" type="#_x0000_t202" stroked="f" filled="f" o:allowincell="f" style="position:absolute;margin-left:36.140pt;margin-top:453.328pt;width:546.334pt;height:21.000pt;z-index:251659264;mso-position-horizontal-relative:page;mso-position-vertical-relative:page;mso-wrap-style:none;mso-fit-shape-to-text:t;">
             <w10:wrap type="none"/>
             <v:textbox inset="0,0,0,0">
               <w:txbxContent>
                 <w:p>
                   <w:pPr>
-                    <w:spacing w:before="0" w:after="0" w:lineRule="exact" w:line="288"/>
+                    <w:spacing w:before="0" w:after="0" w:lineRule="exact" w:line="300"/>
                     <w:ind w:left="0" w:right="0" w:firstLine="0"/>
                   </w:pPr>
                   <w:r>
@@ -2861,13 +2861,13 @@
       </w:r>
       <w:r>
         <w:pict>
-          <v:shape id="DocuMindTextBox105" type="#_x0000_t202" stroked="f" filled="f" o:allowincell="f" style="position:absolute;margin-left:36.140pt;margin-top:469.228pt;width:545.324pt;height:15.424pt;z-index:251659264;mso-position-horizontal-relative:page;mso-position-vertical-relative:page;mso-wrap-style:none;">
+          <v:shape id="DocuMindTextBox105" type="#_x0000_t202" stroked="f" filled="f" o:allowincell="f" style="position:absolute;margin-left:36.140pt;margin-top:467.728pt;width:546.324pt;height:21.000pt;z-index:251659264;mso-position-horizontal-relative:page;mso-position-vertical-relative:page;mso-wrap-style:none;mso-fit-shape-to-text:t;">
             <w10:wrap type="none"/>
             <v:textbox inset="0,0,0,0">
               <w:txbxContent>
                 <w:p>
                   <w:pPr>
-                    <w:spacing w:before="0" w:after="0" w:lineRule="exact" w:line="288"/>
+                    <w:spacing w:before="0" w:after="0" w:lineRule="exact" w:line="300"/>
                     <w:ind w:left="0" w:right="0" w:firstLine="0"/>
                   </w:pPr>
                   <w:r>
@@ -2888,13 +2888,13 @@
       </w:r>
       <w:r>
         <w:pict>
-          <v:shape id="DocuMindTextBox106" type="#_x0000_t202" stroked="f" filled="f" o:allowincell="f" style="position:absolute;margin-left:36.140pt;margin-top:483.628pt;width:545.337pt;height:15.424pt;z-index:251659264;mso-position-horizontal-relative:page;mso-position-vertical-relative:page;mso-wrap-style:none;">
+          <v:shape id="DocuMindTextBox106" type="#_x0000_t202" stroked="f" filled="f" o:allowincell="f" style="position:absolute;margin-left:36.140pt;margin-top:482.128pt;width:546.337pt;height:21.000pt;z-index:251659264;mso-position-horizontal-relative:page;mso-position-vertical-relative:page;mso-wrap-style:none;mso-fit-shape-to-text:t;">
             <w10:wrap type="none"/>
             <v:textbox inset="0,0,0,0">
               <w:txbxContent>
                 <w:p>
                   <w:pPr>
-                    <w:spacing w:before="0" w:after="0" w:lineRule="exact" w:line="288"/>
+                    <w:spacing w:before="0" w:after="0" w:lineRule="exact" w:line="300"/>
                     <w:ind w:left="0" w:right="0" w:firstLine="0"/>
                   </w:pPr>
                   <w:r>
@@ -2915,13 +2915,13 @@
       </w:r>
       <w:r>
         <w:pict>
-          <v:shape id="DocuMindTextBox107" type="#_x0000_t202" stroked="f" filled="f" o:allowincell="f" style="position:absolute;margin-left:36.140pt;margin-top:498.028pt;width:545.325pt;height:15.424pt;z-index:251659264;mso-position-horizontal-relative:page;mso-position-vertical-relative:page;mso-wrap-style:none;">
+          <v:shape id="DocuMindTextBox107" type="#_x0000_t202" stroked="f" filled="f" o:allowincell="f" style="position:absolute;margin-left:36.140pt;margin-top:496.528pt;width:546.325pt;height:21.000pt;z-index:251659264;mso-position-horizontal-relative:page;mso-position-vertical-relative:page;mso-wrap-style:none;mso-fit-shape-to-text:t;">
             <w10:wrap type="none"/>
             <v:textbox inset="0,0,0,0">
               <w:txbxContent>
                 <w:p>
                   <w:pPr>
-                    <w:spacing w:before="0" w:after="0" w:lineRule="exact" w:line="288"/>
+                    <w:spacing w:before="0" w:after="0" w:lineRule="exact" w:line="300"/>
                     <w:ind w:left="0" w:right="0" w:firstLine="0"/>
                   </w:pPr>
                   <w:r>
@@ -2942,13 +2942,13 @@
       </w:r>
       <w:r>
         <w:pict>
-          <v:shape id="DocuMindTextBox108" type="#_x0000_t202" stroked="f" filled="f" o:allowincell="f" style="position:absolute;margin-left:36.140pt;margin-top:512.668pt;width:545.332pt;height:15.424pt;z-index:251659264;mso-position-horizontal-relative:page;mso-position-vertical-relative:page;mso-wrap-style:none;">
+          <v:shape id="DocuMindTextBox108" type="#_x0000_t202" stroked="f" filled="f" o:allowincell="f" style="position:absolute;margin-left:36.140pt;margin-top:511.168pt;width:546.332pt;height:21.000pt;z-index:251659264;mso-position-horizontal-relative:page;mso-position-vertical-relative:page;mso-wrap-style:none;mso-fit-shape-to-text:t;">
             <w10:wrap type="none"/>
             <v:textbox inset="0,0,0,0">
               <w:txbxContent>
                 <w:p>
                   <w:pPr>
-                    <w:spacing w:before="0" w:after="0" w:lineRule="exact" w:line="288"/>
+                    <w:spacing w:before="0" w:after="0" w:lineRule="exact" w:line="300"/>
                     <w:ind w:left="0" w:right="0" w:firstLine="0"/>
                   </w:pPr>
                   <w:r>
@@ -2969,13 +2969,13 @@
       </w:r>
       <w:r>
         <w:pict>
-          <v:shape id="DocuMindTextBox109" type="#_x0000_t202" stroked="f" filled="f" o:allowincell="f" style="position:absolute;margin-left:36.140pt;margin-top:527.068pt;width:331.369pt;height:15.424pt;z-index:251659264;mso-position-horizontal-relative:page;mso-position-vertical-relative:page;mso-wrap-style:none;">
+          <v:shape id="DocuMindTextBox109" type="#_x0000_t202" stroked="f" filled="f" o:allowincell="f" style="position:absolute;margin-left:36.140pt;margin-top:525.568pt;width:332.369pt;height:21.000pt;z-index:251659264;mso-position-horizontal-relative:page;mso-position-vertical-relative:page;mso-wrap-style:none;mso-fit-shape-to-text:t;">
             <w10:wrap type="none"/>
             <v:textbox inset="0,0,0,0">
               <w:txbxContent>
                 <w:p>
                   <w:pPr>
-                    <w:spacing w:before="0" w:after="0" w:lineRule="exact" w:line="288"/>
+                    <w:spacing w:before="0" w:after="0" w:lineRule="exact" w:line="300"/>
                     <w:ind w:left="0" w:right="0" w:firstLine="0"/>
                   </w:pPr>
                   <w:r>

</xml_diff>

<commit_message>
Step 48 - Render PDF images in fixed-layout DOCX
</commit_message>
<xml_diff>
--- a/output/output.docx
+++ b/output/output.docx
@@ -13,7 +13,23 @@
       </w:r>
       <w:r>
         <w:pict>
-          <v:shape id="DocuMindTextBox1" type="#_x0000_t202" stroked="f" filled="f" o:allowincell="f" style="position:absolute;margin-left:57.636pt;margin-top:734.050pt;width:99.713pt;height:17.249pt;z-index:251659264;mso-position-horizontal-relative:page;mso-position-vertical-relative:page;mso-wrap-style:none;mso-fit-shape-to-text:t;">
+          <v:shape id="DocuMindImage1" type="#_x0000_t75" stroked="f" o:allowincell="f" style="position:absolute;margin-left:57.636pt;margin-top:35.997pt;width:70.914pt;height:48.236pt;z-index:1;mso-position-horizontal-relative:page;mso-position-vertical-relative:page;mso-wrap-style:none;">
+            <w10:wrap type="none"/>
+            <v:imagedata r:id="rId9" o:title=""/>
+          </v:shape>
+        </w:pict>
+      </w:r>
+      <w:r>
+        <w:pict>
+          <v:shape id="DocuMindImage2" type="#_x0000_t75" stroked="f" o:allowincell="f" style="position:absolute;margin-left:57.636pt;margin-top:410.486pt;width:464.001pt;height:228.101pt;z-index:1;mso-position-horizontal-relative:page;mso-position-vertical-relative:page;mso-wrap-style:none;">
+            <w10:wrap type="none"/>
+            <v:imagedata r:id="rId10" o:title=""/>
+          </v:shape>
+        </w:pict>
+      </w:r>
+      <w:r>
+        <w:pict>
+          <v:shape id="DocuMindTextBox3" type="#_x0000_t202" stroked="f" filled="f" o:allowincell="f" style="position:absolute;margin-left:57.636pt;margin-top:734.050pt;width:99.713pt;height:17.249pt;z-index:251659264;mso-position-horizontal-relative:page;mso-position-vertical-relative:page;mso-wrap-style:none;mso-fit-shape-to-text:t;">
             <w10:wrap type="none"/>
             <v:textbox inset="0,0,0,0">
               <w:txbxContent>
@@ -40,7 +56,7 @@
       </w:r>
       <w:r>
         <w:pict>
-          <v:shape id="DocuMindTextBox2" type="#_x0000_t202" stroked="f" filled="f" o:allowincell="f" style="position:absolute;margin-left:475.799pt;margin-top:734.050pt;width:51.695pt;height:17.249pt;z-index:251659264;mso-position-horizontal-relative:page;mso-position-vertical-relative:page;mso-wrap-style:none;mso-fit-shape-to-text:t;">
+          <v:shape id="DocuMindTextBox4" type="#_x0000_t202" stroked="f" filled="f" o:allowincell="f" style="position:absolute;margin-left:475.799pt;margin-top:734.050pt;width:51.695pt;height:17.249pt;z-index:251659264;mso-position-horizontal-relative:page;mso-position-vertical-relative:page;mso-wrap-style:none;mso-fit-shape-to-text:t;">
             <w10:wrap type="none"/>
             <v:textbox inset="0,0,0,0">
               <w:txbxContent>
@@ -67,7 +83,7 @@
       </w:r>
       <w:r>
         <w:pict>
-          <v:shape id="DocuMindTextBox3" type="#_x0000_t202" stroked="f" filled="f" o:allowincell="f" style="position:absolute;margin-left:191.185pt;margin-top:117.080pt;width:57.068pt;height:28.498pt;z-index:251659264;mso-position-horizontal-relative:page;mso-position-vertical-relative:page;mso-wrap-style:none;mso-fit-shape-to-text:t;">
+          <v:shape id="DocuMindTextBox5" type="#_x0000_t202" stroked="f" filled="f" o:allowincell="f" style="position:absolute;margin-left:191.185pt;margin-top:117.080pt;width:57.068pt;height:28.498pt;z-index:251659264;mso-position-horizontal-relative:page;mso-position-vertical-relative:page;mso-wrap-style:none;mso-fit-shape-to-text:t;">
             <w10:wrap type="none"/>
             <v:textbox inset="0,0,0,0">
               <w:txbxContent>
@@ -94,7 +110,7 @@
       </w:r>
       <w:r>
         <w:pict>
-          <v:shape id="DocuMindTextBox4" type="#_x0000_t202" stroked="f" filled="f" o:allowincell="f" style="position:absolute;margin-left:245.180pt;margin-top:120.229pt;width:83.465pt;height:24.148pt;z-index:251659264;mso-position-horizontal-relative:page;mso-position-vertical-relative:page;mso-wrap-style:none;mso-fit-shape-to-text:t;">
+          <v:shape id="DocuMindTextBox6" type="#_x0000_t202" stroked="f" filled="f" o:allowincell="f" style="position:absolute;margin-left:245.180pt;margin-top:120.229pt;width:83.465pt;height:24.148pt;z-index:251659264;mso-position-horizontal-relative:page;mso-position-vertical-relative:page;mso-wrap-style:none;mso-fit-shape-to-text:t;">
             <w10:wrap type="none"/>
             <v:textbox inset="0,0,0,0">
               <w:txbxContent>
@@ -121,7 +137,7 @@
       </w:r>
       <w:r>
         <w:pict>
-          <v:shape id="DocuMindTextBox5" type="#_x0000_t202" stroked="f" filled="f" o:allowincell="f" style="position:absolute;margin-left:325.694pt;margin-top:117.080pt;width:15.005pt;height:28.498pt;z-index:251659264;mso-position-horizontal-relative:page;mso-position-vertical-relative:page;mso-wrap-style:none;mso-fit-shape-to-text:t;">
+          <v:shape id="DocuMindTextBox7" type="#_x0000_t202" stroked="f" filled="f" o:allowincell="f" style="position:absolute;margin-left:325.694pt;margin-top:117.080pt;width:15.005pt;height:28.498pt;z-index:251659264;mso-position-horizontal-relative:page;mso-position-vertical-relative:page;mso-wrap-style:none;mso-fit-shape-to-text:t;">
             <w10:wrap type="none"/>
             <v:textbox inset="0,0,0,0">
               <w:txbxContent>
@@ -148,7 +164,7 @@
       </w:r>
       <w:r>
         <w:pict>
-          <v:shape id="DocuMindTextBox6" type="#_x0000_t202" stroked="f" filled="f" o:allowincell="f" style="position:absolute;margin-left:337.812pt;margin-top:120.229pt;width:53.599pt;height:24.148pt;z-index:251659264;mso-position-horizontal-relative:page;mso-position-vertical-relative:page;mso-wrap-style:none;mso-fit-shape-to-text:t;">
+          <v:shape id="DocuMindTextBox8" type="#_x0000_t202" stroked="f" filled="f" o:allowincell="f" style="position:absolute;margin-left:337.812pt;margin-top:120.229pt;width:53.599pt;height:24.148pt;z-index:251659264;mso-position-horizontal-relative:page;mso-position-vertical-relative:page;mso-wrap-style:none;mso-fit-shape-to-text:t;">
             <w10:wrap type="none"/>
             <v:textbox inset="0,0,0,0">
               <w:txbxContent>
@@ -175,7 +191,7 @@
       </w:r>
       <w:r>
         <w:pict>
-          <v:shape id="DocuMindTextBox7" type="#_x0000_t202" stroked="f" filled="f" o:allowincell="f" style="position:absolute;margin-left:63.395pt;margin-top:162.735pt;width:75.903pt;height:19.799pt;z-index:251659264;mso-position-horizontal-relative:page;mso-position-vertical-relative:page;mso-wrap-style:none;mso-fit-shape-to-text:t;">
+          <v:shape id="DocuMindTextBox9" type="#_x0000_t202" stroked="f" filled="f" o:allowincell="f" style="position:absolute;margin-left:63.395pt;margin-top:162.735pt;width:75.903pt;height:19.799pt;z-index:251659264;mso-position-horizontal-relative:page;mso-position-vertical-relative:page;mso-wrap-style:none;mso-fit-shape-to-text:t;">
             <w10:wrap type="none"/>
             <v:textbox inset="0,0,0,0">
               <w:txbxContent>
@@ -202,7 +218,7 @@
       </w:r>
       <w:r>
         <w:pict>
-          <v:shape id="DocuMindTextBox8" type="#_x0000_t202" stroked="f" filled="f" o:allowincell="f" style="position:absolute;margin-left:234.381pt;margin-top:162.855pt;width:54.299pt;height:19.799pt;z-index:251659264;mso-position-horizontal-relative:page;mso-position-vertical-relative:page;mso-wrap-style:none;mso-fit-shape-to-text:t;">
+          <v:shape id="DocuMindTextBox10" type="#_x0000_t202" stroked="f" filled="f" o:allowincell="f" style="position:absolute;margin-left:234.381pt;margin-top:162.855pt;width:54.299pt;height:19.799pt;z-index:251659264;mso-position-horizontal-relative:page;mso-position-vertical-relative:page;mso-wrap-style:none;mso-fit-shape-to-text:t;">
             <w10:wrap type="none"/>
             <v:textbox inset="0,0,0,0">
               <w:txbxContent>
@@ -229,7 +245,7 @@
       </w:r>
       <w:r>
         <w:pict>
-          <v:shape id="DocuMindTextBox9" type="#_x0000_t202" stroked="f" filled="f" o:allowincell="f" style="position:absolute;margin-left:63.395pt;margin-top:185.773pt;width:73.248pt;height:19.799pt;z-index:251659264;mso-position-horizontal-relative:page;mso-position-vertical-relative:page;mso-wrap-style:none;mso-fit-shape-to-text:t;">
+          <v:shape id="DocuMindTextBox11" type="#_x0000_t202" stroked="f" filled="f" o:allowincell="f" style="position:absolute;margin-left:63.395pt;margin-top:185.773pt;width:73.248pt;height:19.799pt;z-index:251659264;mso-position-horizontal-relative:page;mso-position-vertical-relative:page;mso-wrap-style:none;mso-fit-shape-to-text:t;">
             <w10:wrap type="none"/>
             <v:textbox inset="0,0,0,0">
               <w:txbxContent>
@@ -256,7 +272,7 @@
       </w:r>
       <w:r>
         <w:pict>
-          <v:shape id="DocuMindTextBox10" type="#_x0000_t202" stroked="f" filled="f" o:allowincell="f" style="position:absolute;margin-left:234.381pt;margin-top:185.893pt;width:182.171pt;height:19.799pt;z-index:251659264;mso-position-horizontal-relative:page;mso-position-vertical-relative:page;mso-wrap-style:none;mso-fit-shape-to-text:t;">
+          <v:shape id="DocuMindTextBox12" type="#_x0000_t202" stroked="f" filled="f" o:allowincell="f" style="position:absolute;margin-left:234.381pt;margin-top:185.893pt;width:182.171pt;height:19.799pt;z-index:251659264;mso-position-horizontal-relative:page;mso-position-vertical-relative:page;mso-wrap-style:none;mso-fit-shape-to-text:t;">
             <w10:wrap type="none"/>
             <v:textbox inset="0,0,0,0">
               <w:txbxContent>
@@ -283,7 +299,7 @@
       </w:r>
       <w:r>
         <w:pict>
-          <v:shape id="DocuMindTextBox11" type="#_x0000_t202" stroked="f" filled="f" o:allowincell="f" style="position:absolute;margin-left:63.395pt;margin-top:208.691pt;width:145.514pt;height:19.799pt;z-index:251659264;mso-position-horizontal-relative:page;mso-position-vertical-relative:page;mso-wrap-style:none;mso-fit-shape-to-text:t;">
+          <v:shape id="DocuMindTextBox13" type="#_x0000_t202" stroked="f" filled="f" o:allowincell="f" style="position:absolute;margin-left:63.395pt;margin-top:208.691pt;width:145.514pt;height:19.799pt;z-index:251659264;mso-position-horizontal-relative:page;mso-position-vertical-relative:page;mso-wrap-style:none;mso-fit-shape-to-text:t;">
             <w10:wrap type="none"/>
             <v:textbox inset="0,0,0,0">
               <w:txbxContent>
@@ -310,7 +326,7 @@
       </w:r>
       <w:r>
         <w:pict>
-          <v:shape id="DocuMindTextBox12" type="#_x0000_t202" stroked="f" filled="f" o:allowincell="f" style="position:absolute;margin-left:234.381pt;margin-top:210.783pt;width:10.049pt;height:18.977pt;z-index:251659264;mso-position-horizontal-relative:page;mso-position-vertical-relative:page;mso-wrap-style:none;mso-fit-shape-to-text:t;">
+          <v:shape id="DocuMindTextBox14" type="#_x0000_t202" stroked="f" filled="f" o:allowincell="f" style="position:absolute;margin-left:234.381pt;margin-top:210.783pt;width:10.049pt;height:18.977pt;z-index:251659264;mso-position-horizontal-relative:page;mso-position-vertical-relative:page;mso-wrap-style:none;mso-fit-shape-to-text:t;">
             <w10:wrap type="none"/>
             <v:textbox inset="0,0,0,0">
               <w:txbxContent>
@@ -337,7 +353,7 @@
       </w:r>
       <w:r>
         <w:pict>
-          <v:shape id="DocuMindTextBox13" type="#_x0000_t202" stroked="f" filled="f" o:allowincell="f" style="position:absolute;margin-left:252.380pt;margin-top:210.851pt;width:139.362pt;height:19.799pt;z-index:251659264;mso-position-horizontal-relative:page;mso-position-vertical-relative:page;mso-wrap-style:none;mso-fit-shape-to-text:t;">
+          <v:shape id="DocuMindTextBox15" type="#_x0000_t202" stroked="f" filled="f" o:allowincell="f" style="position:absolute;margin-left:252.380pt;margin-top:210.851pt;width:139.362pt;height:19.799pt;z-index:251659264;mso-position-horizontal-relative:page;mso-position-vertical-relative:page;mso-wrap-style:none;mso-fit-shape-to-text:t;">
             <w10:wrap type="none"/>
             <v:textbox inset="0,0,0,0">
               <w:txbxContent>
@@ -364,7 +380,7 @@
       </w:r>
       <w:r>
         <w:pict>
-          <v:shape id="DocuMindTextBox14" type="#_x0000_t202" stroked="f" filled="f" o:allowincell="f" style="position:absolute;margin-left:234.381pt;margin-top:231.421pt;width:10.049pt;height:18.977pt;z-index:251659264;mso-position-horizontal-relative:page;mso-position-vertical-relative:page;mso-wrap-style:none;mso-fit-shape-to-text:t;">
+          <v:shape id="DocuMindTextBox16" type="#_x0000_t202" stroked="f" filled="f" o:allowincell="f" style="position:absolute;margin-left:234.381pt;margin-top:231.421pt;width:10.049pt;height:18.977pt;z-index:251659264;mso-position-horizontal-relative:page;mso-position-vertical-relative:page;mso-wrap-style:none;mso-fit-shape-to-text:t;">
             <w10:wrap type="none"/>
             <v:textbox inset="0,0,0,0">
               <w:txbxContent>
@@ -391,7 +407,7 @@
       </w:r>
       <w:r>
         <w:pict>
-          <v:shape id="DocuMindTextBox15" type="#_x0000_t202" stroked="f" filled="f" o:allowincell="f" style="position:absolute;margin-left:252.380pt;margin-top:231.489pt;width:184.105pt;height:19.799pt;z-index:251659264;mso-position-horizontal-relative:page;mso-position-vertical-relative:page;mso-wrap-style:none;mso-fit-shape-to-text:t;">
+          <v:shape id="DocuMindTextBox17" type="#_x0000_t202" stroked="f" filled="f" o:allowincell="f" style="position:absolute;margin-left:252.380pt;margin-top:231.489pt;width:184.105pt;height:19.799pt;z-index:251659264;mso-position-horizontal-relative:page;mso-position-vertical-relative:page;mso-wrap-style:none;mso-fit-shape-to-text:t;">
             <w10:wrap type="none"/>
             <v:textbox inset="0,0,0,0">
               <w:txbxContent>
@@ -418,7 +434,7 @@
       </w:r>
       <w:r>
         <w:pict>
-          <v:shape id="DocuMindTextBox16" type="#_x0000_t202" stroked="f" filled="f" o:allowincell="f" style="position:absolute;margin-left:63.395pt;margin-top:254.407pt;width:132.610pt;height:19.799pt;z-index:251659264;mso-position-horizontal-relative:page;mso-position-vertical-relative:page;mso-wrap-style:none;mso-fit-shape-to-text:t;">
+          <v:shape id="DocuMindTextBox18" type="#_x0000_t202" stroked="f" filled="f" o:allowincell="f" style="position:absolute;margin-left:63.395pt;margin-top:254.407pt;width:132.610pt;height:19.799pt;z-index:251659264;mso-position-horizontal-relative:page;mso-position-vertical-relative:page;mso-wrap-style:none;mso-fit-shape-to-text:t;">
             <w10:wrap type="none"/>
             <v:textbox inset="0,0,0,0">
               <w:txbxContent>
@@ -445,7 +461,7 @@
       </w:r>
       <w:r>
         <w:pict>
-          <v:shape id="DocuMindTextBox17" type="#_x0000_t202" stroked="f" filled="f" o:allowincell="f" style="position:absolute;margin-left:234.381pt;margin-top:256.499pt;width:10.049pt;height:18.977pt;z-index:251659264;mso-position-horizontal-relative:page;mso-position-vertical-relative:page;mso-wrap-style:none;mso-fit-shape-to-text:t;">
+          <v:shape id="DocuMindTextBox19" type="#_x0000_t202" stroked="f" filled="f" o:allowincell="f" style="position:absolute;margin-left:234.381pt;margin-top:256.499pt;width:10.049pt;height:18.977pt;z-index:251659264;mso-position-horizontal-relative:page;mso-position-vertical-relative:page;mso-wrap-style:none;mso-fit-shape-to-text:t;">
             <w10:wrap type="none"/>
             <v:textbox inset="0,0,0,0">
               <w:txbxContent>
@@ -472,7 +488,7 @@
       </w:r>
       <w:r>
         <w:pict>
-          <v:shape id="DocuMindTextBox18" type="#_x0000_t202" stroked="f" filled="f" o:allowincell="f" style="position:absolute;margin-left:252.380pt;margin-top:256.567pt;width:166.879pt;height:19.799pt;z-index:251659264;mso-position-horizontal-relative:page;mso-position-vertical-relative:page;mso-wrap-style:none;mso-fit-shape-to-text:t;">
+          <v:shape id="DocuMindTextBox20" type="#_x0000_t202" stroked="f" filled="f" o:allowincell="f" style="position:absolute;margin-left:252.380pt;margin-top:256.567pt;width:166.879pt;height:19.799pt;z-index:251659264;mso-position-horizontal-relative:page;mso-position-vertical-relative:page;mso-wrap-style:none;mso-fit-shape-to-text:t;">
             <w10:wrap type="none"/>
             <v:textbox inset="0,0,0,0">
               <w:txbxContent>
@@ -499,7 +515,7 @@
       </w:r>
       <w:r>
         <w:pict>
-          <v:shape id="DocuMindTextBox19" type="#_x0000_t202" stroked="f" filled="f" o:allowincell="f" style="position:absolute;margin-left:234.381pt;margin-top:277.137pt;width:10.049pt;height:18.977pt;z-index:251659264;mso-position-horizontal-relative:page;mso-position-vertical-relative:page;mso-wrap-style:none;mso-fit-shape-to-text:t;">
+          <v:shape id="DocuMindTextBox21" type="#_x0000_t202" stroked="f" filled="f" o:allowincell="f" style="position:absolute;margin-left:234.381pt;margin-top:277.137pt;width:10.049pt;height:18.977pt;z-index:251659264;mso-position-horizontal-relative:page;mso-position-vertical-relative:page;mso-wrap-style:none;mso-fit-shape-to-text:t;">
             <w10:wrap type="none"/>
             <v:textbox inset="0,0,0,0">
               <w:txbxContent>
@@ -526,7 +542,7 @@
       </w:r>
       <w:r>
         <w:pict>
-          <v:shape id="DocuMindTextBox20" type="#_x0000_t202" stroked="f" filled="f" o:allowincell="f" style="position:absolute;margin-left:252.380pt;margin-top:277.206pt;width:181.599pt;height:19.799pt;z-index:251659264;mso-position-horizontal-relative:page;mso-position-vertical-relative:page;mso-wrap-style:none;mso-fit-shape-to-text:t;">
+          <v:shape id="DocuMindTextBox22" type="#_x0000_t202" stroked="f" filled="f" o:allowincell="f" style="position:absolute;margin-left:252.380pt;margin-top:277.206pt;width:181.599pt;height:19.799pt;z-index:251659264;mso-position-horizontal-relative:page;mso-position-vertical-relative:page;mso-wrap-style:none;mso-fit-shape-to-text:t;">
             <w10:wrap type="none"/>
             <v:textbox inset="0,0,0,0">
               <w:txbxContent>
@@ -553,7 +569,7 @@
       </w:r>
       <w:r>
         <w:pict>
-          <v:shape id="DocuMindTextBox21" type="#_x0000_t202" stroked="f" filled="f" o:allowincell="f" style="position:absolute;margin-left:57.636pt;margin-top:311.928pt;width:69.295pt;height:23.549pt;z-index:251659264;mso-position-horizontal-relative:page;mso-position-vertical-relative:page;mso-wrap-style:none;mso-fit-shape-to-text:t;">
+          <v:shape id="DocuMindTextBox23" type="#_x0000_t202" stroked="f" filled="f" o:allowincell="f" style="position:absolute;margin-left:57.636pt;margin-top:311.928pt;width:69.295pt;height:23.549pt;z-index:251659264;mso-position-horizontal-relative:page;mso-position-vertical-relative:page;mso-wrap-style:none;mso-fit-shape-to-text:t;">
             <w10:wrap type="none"/>
             <v:textbox inset="0,0,0,0">
               <w:txbxContent>
@@ -580,7 +596,7 @@
       </w:r>
       <w:r>
         <w:pict>
-          <v:shape id="DocuMindTextBox22" type="#_x0000_t202" stroked="f" filled="f" o:allowincell="f" style="position:absolute;margin-left:57.636pt;margin-top:333.961pt;width:468.114pt;height:19.799pt;z-index:251659264;mso-position-horizontal-relative:page;mso-position-vertical-relative:page;mso-wrap-style:none;mso-fit-shape-to-text:t;">
+          <v:shape id="DocuMindTextBox24" type="#_x0000_t202" stroked="f" filled="f" o:allowincell="f" style="position:absolute;margin-left:57.636pt;margin-top:333.961pt;width:468.114pt;height:19.799pt;z-index:251659264;mso-position-horizontal-relative:page;mso-position-vertical-relative:page;mso-wrap-style:none;mso-fit-shape-to-text:t;">
             <w10:wrap type="none"/>
             <v:textbox inset="0,0,0,0">
               <w:txbxContent>
@@ -607,7 +623,7 @@
       </w:r>
       <w:r>
         <w:pict>
-          <v:shape id="DocuMindTextBox23" type="#_x0000_t202" stroked="f" filled="f" o:allowincell="f" style="position:absolute;margin-left:57.636pt;margin-top:346.680pt;width:91.732pt;height:19.799pt;z-index:251659264;mso-position-horizontal-relative:page;mso-position-vertical-relative:page;mso-wrap-style:none;mso-fit-shape-to-text:t;">
+          <v:shape id="DocuMindTextBox25" type="#_x0000_t202" stroked="f" filled="f" o:allowincell="f" style="position:absolute;margin-left:57.636pt;margin-top:346.680pt;width:91.732pt;height:19.799pt;z-index:251659264;mso-position-horizontal-relative:page;mso-position-vertical-relative:page;mso-wrap-style:none;mso-fit-shape-to-text:t;">
             <w10:wrap type="none"/>
             <v:textbox inset="0,0,0,0">
               <w:txbxContent>
@@ -634,7 +650,7 @@
       </w:r>
       <w:r>
         <w:pict>
-          <v:shape id="DocuMindTextBox24" type="#_x0000_t202" stroked="f" filled="f" o:allowincell="f" style="position:absolute;margin-left:57.636pt;margin-top:365.279pt;width:460.240pt;height:19.799pt;z-index:251659264;mso-position-horizontal-relative:page;mso-position-vertical-relative:page;mso-wrap-style:none;mso-fit-shape-to-text:t;">
+          <v:shape id="DocuMindTextBox26" type="#_x0000_t202" stroked="f" filled="f" o:allowincell="f" style="position:absolute;margin-left:57.636pt;margin-top:365.279pt;width:460.240pt;height:19.799pt;z-index:251659264;mso-position-horizontal-relative:page;mso-position-vertical-relative:page;mso-wrap-style:none;mso-fit-shape-to-text:t;">
             <w10:wrap type="none"/>
             <v:textbox inset="0,0,0,0">
               <w:txbxContent>
@@ -661,7 +677,7 @@
       </w:r>
       <w:r>
         <w:pict>
-          <v:shape id="DocuMindTextBox25" type="#_x0000_t202" stroked="f" filled="f" o:allowincell="f" style="position:absolute;margin-left:57.636pt;margin-top:377.998pt;width:415.803pt;height:19.799pt;z-index:251659264;mso-position-horizontal-relative:page;mso-position-vertical-relative:page;mso-wrap-style:none;mso-fit-shape-to-text:t;">
+          <v:shape id="DocuMindTextBox27" type="#_x0000_t202" stroked="f" filled="f" o:allowincell="f" style="position:absolute;margin-left:57.636pt;margin-top:377.998pt;width:415.803pt;height:19.799pt;z-index:251659264;mso-position-horizontal-relative:page;mso-position-vertical-relative:page;mso-wrap-style:none;mso-fit-shape-to-text:t;">
             <w10:wrap type="none"/>
             <v:textbox inset="0,0,0,0">
               <w:txbxContent>
@@ -688,7 +704,7 @@
       </w:r>
       <w:r>
         <w:pict>
-          <v:shape id="DocuMindTextBox26" type="#_x0000_t202" stroked="f" filled="f" o:allowincell="f" style="position:absolute;margin-left:57.636pt;margin-top:390.597pt;width:414.594pt;height:19.799pt;z-index:251659264;mso-position-horizontal-relative:page;mso-position-vertical-relative:page;mso-wrap-style:none;mso-fit-shape-to-text:t;">
+          <v:shape id="DocuMindTextBox28" type="#_x0000_t202" stroked="f" filled="f" o:allowincell="f" style="position:absolute;margin-left:57.636pt;margin-top:390.597pt;width:414.594pt;height:19.799pt;z-index:251659264;mso-position-horizontal-relative:page;mso-position-vertical-relative:page;mso-wrap-style:none;mso-fit-shape-to-text:t;">
             <w10:wrap type="none"/>
             <v:textbox inset="0,0,0,0">
               <w:txbxContent>
@@ -715,7 +731,7 @@
       </w:r>
       <w:r>
         <w:pict>
-          <v:shape id="DocuMindTextBox27" type="#_x0000_t202" stroked="f" filled="f" o:allowincell="f" style="position:absolute;margin-left:57.635pt;margin-top:643.295pt;width:439.731pt;height:19.799pt;z-index:251659264;mso-position-horizontal-relative:page;mso-position-vertical-relative:page;mso-wrap-style:none;mso-fit-shape-to-text:t;">
+          <v:shape id="DocuMindTextBox29" type="#_x0000_t202" stroked="f" filled="f" o:allowincell="f" style="position:absolute;margin-left:57.635pt;margin-top:643.295pt;width:439.731pt;height:19.799pt;z-index:251659264;mso-position-horizontal-relative:page;mso-position-vertical-relative:page;mso-wrap-style:none;mso-fit-shape-to-text:t;">
             <w10:wrap type="none"/>
             <v:textbox inset="0,0,0,0">
               <w:txbxContent>
@@ -742,7 +758,7 @@
       </w:r>
       <w:r>
         <w:pict>
-          <v:shape id="DocuMindTextBox28" type="#_x0000_t202" stroked="f" filled="f" o:allowincell="f" style="position:absolute;margin-left:57.635pt;margin-top:655.894pt;width:152.733pt;height:19.799pt;z-index:251659264;mso-position-horizontal-relative:page;mso-position-vertical-relative:page;mso-wrap-style:none;mso-fit-shape-to-text:t;">
+          <v:shape id="DocuMindTextBox30" type="#_x0000_t202" stroked="f" filled="f" o:allowincell="f" style="position:absolute;margin-left:57.635pt;margin-top:655.894pt;width:152.733pt;height:19.799pt;z-index:251659264;mso-position-horizontal-relative:page;mso-position-vertical-relative:page;mso-wrap-style:none;mso-fit-shape-to-text:t;">
             <w10:wrap type="none"/>
             <v:textbox inset="0,0,0,0">
               <w:txbxContent>
@@ -769,7 +785,7 @@
       </w:r>
       <w:r>
         <w:pict>
-          <v:shape id="DocuMindTextBox29" type="#_x0000_t202" stroked="f" filled="f" o:allowincell="f" style="position:absolute;margin-left:207.383pt;margin-top:656.840pt;width:10.109pt;height:17.249pt;z-index:251659264;mso-position-horizontal-relative:page;mso-position-vertical-relative:page;mso-wrap-style:none;mso-fit-shape-to-text:t;">
+          <v:shape id="DocuMindTextBox31" type="#_x0000_t202" stroked="f" filled="f" o:allowincell="f" style="position:absolute;margin-left:207.383pt;margin-top:656.840pt;width:10.109pt;height:17.249pt;z-index:251659264;mso-position-horizontal-relative:page;mso-position-vertical-relative:page;mso-wrap-style:none;mso-fit-shape-to-text:t;">
             <w10:wrap type="none"/>
             <v:textbox inset="0,0,0,0">
               <w:txbxContent>
@@ -796,7 +812,7 @@
       </w:r>
       <w:r>
         <w:pict>
-          <v:shape id="DocuMindTextBox30" type="#_x0000_t202" stroked="f" filled="f" o:allowincell="f" style="position:absolute;margin-left:214.463pt;margin-top:655.894pt;width:44.102pt;height:19.799pt;z-index:251659264;mso-position-horizontal-relative:page;mso-position-vertical-relative:page;mso-wrap-style:none;mso-fit-shape-to-text:t;">
+          <v:shape id="DocuMindTextBox32" type="#_x0000_t202" stroked="f" filled="f" o:allowincell="f" style="position:absolute;margin-left:214.463pt;margin-top:655.894pt;width:44.102pt;height:19.799pt;z-index:251659264;mso-position-horizontal-relative:page;mso-position-vertical-relative:page;mso-wrap-style:none;mso-fit-shape-to-text:t;">
             <w10:wrap type="none"/>
             <v:textbox inset="0,0,0,0">
               <w:txbxContent>
@@ -823,7 +839,7 @@
       </w:r>
       <w:r>
         <w:pict>
-          <v:shape id="DocuMindTextBox31" type="#_x0000_t202" stroked="f" filled="f" o:allowincell="f" style="position:absolute;margin-left:255.619pt;margin-top:656.840pt;width:10.109pt;height:17.249pt;z-index:251659264;mso-position-horizontal-relative:page;mso-position-vertical-relative:page;mso-wrap-style:none;mso-fit-shape-to-text:t;">
+          <v:shape id="DocuMindTextBox33" type="#_x0000_t202" stroked="f" filled="f" o:allowincell="f" style="position:absolute;margin-left:255.619pt;margin-top:656.840pt;width:10.109pt;height:17.249pt;z-index:251659264;mso-position-horizontal-relative:page;mso-position-vertical-relative:page;mso-wrap-style:none;mso-fit-shape-to-text:t;">
             <w10:wrap type="none"/>
             <v:textbox inset="0,0,0,0">
               <w:txbxContent>
@@ -850,7 +866,7 @@
       </w:r>
       <w:r>
         <w:pict>
-          <v:shape id="DocuMindTextBox32" type="#_x0000_t202" stroked="f" filled="f" o:allowincell="f" style="position:absolute;margin-left:262.579pt;margin-top:655.894pt;width:99.052pt;height:19.799pt;z-index:251659264;mso-position-horizontal-relative:page;mso-position-vertical-relative:page;mso-wrap-style:none;mso-fit-shape-to-text:t;">
+          <v:shape id="DocuMindTextBox34" type="#_x0000_t202" stroked="f" filled="f" o:allowincell="f" style="position:absolute;margin-left:262.579pt;margin-top:655.894pt;width:99.052pt;height:19.799pt;z-index:251659264;mso-position-horizontal-relative:page;mso-position-vertical-relative:page;mso-wrap-style:none;mso-fit-shape-to-text:t;">
             <w10:wrap type="none"/>
             <v:textbox inset="0,0,0,0">
               <w:txbxContent>
@@ -877,7 +893,7 @@
       </w:r>
       <w:r>
         <w:pict>
-          <v:shape id="DocuMindTextBox33" type="#_x0000_t202" stroked="f" filled="f" o:allowincell="f" style="position:absolute;margin-left:358.691pt;margin-top:655.894pt;width:150.014pt;height:19.799pt;z-index:251659264;mso-position-horizontal-relative:page;mso-position-vertical-relative:page;mso-wrap-style:none;mso-fit-shape-to-text:t;">
+          <v:shape id="DocuMindTextBox35" type="#_x0000_t202" stroked="f" filled="f" o:allowincell="f" style="position:absolute;margin-left:358.691pt;margin-top:655.894pt;width:150.014pt;height:19.799pt;z-index:251659264;mso-position-horizontal-relative:page;mso-position-vertical-relative:page;mso-wrap-style:none;mso-fit-shape-to-text:t;">
             <w10:wrap type="none"/>
             <v:textbox inset="0,0,0,0">
               <w:txbxContent>
@@ -904,7 +920,7 @@
       </w:r>
       <w:r>
         <w:pict>
-          <v:shape id="DocuMindTextBox34" type="#_x0000_t202" stroked="f" filled="f" o:allowincell="f" style="position:absolute;margin-left:505.679pt;margin-top:655.894pt;width:9.070pt;height:19.799pt;z-index:251659264;mso-position-horizontal-relative:page;mso-position-vertical-relative:page;mso-wrap-style:none;mso-fit-shape-to-text:t;">
+          <v:shape id="DocuMindTextBox36" type="#_x0000_t202" stroked="f" filled="f" o:allowincell="f" style="position:absolute;margin-left:505.679pt;margin-top:655.894pt;width:9.070pt;height:19.799pt;z-index:251659264;mso-position-horizontal-relative:page;mso-position-vertical-relative:page;mso-wrap-style:none;mso-fit-shape-to-text:t;">
             <w10:wrap type="none"/>
             <v:textbox inset="0,0,0,0">
               <w:txbxContent>
@@ -931,7 +947,7 @@
       </w:r>
       <w:r>
         <w:pict>
-          <v:shape id="DocuMindTextBox35" type="#_x0000_t202" stroked="f" filled="f" o:allowincell="f" style="position:absolute;margin-left:57.635pt;margin-top:668.613pt;width:439.022pt;height:19.799pt;z-index:251659264;mso-position-horizontal-relative:page;mso-position-vertical-relative:page;mso-wrap-style:none;mso-fit-shape-to-text:t;">
+          <v:shape id="DocuMindTextBox37" type="#_x0000_t202" stroked="f" filled="f" o:allowincell="f" style="position:absolute;margin-left:57.635pt;margin-top:668.613pt;width:439.022pt;height:19.799pt;z-index:251659264;mso-position-horizontal-relative:page;mso-position-vertical-relative:page;mso-wrap-style:none;mso-fit-shape-to-text:t;">
             <w10:wrap type="none"/>
             <v:textbox inset="0,0,0,0">
               <w:txbxContent>
@@ -958,7 +974,7 @@
       </w:r>
       <w:r>
         <w:pict>
-          <v:shape id="DocuMindTextBox36" type="#_x0000_t202" stroked="f" filled="f" o:allowincell="f" style="position:absolute;margin-left:57.635pt;margin-top:687.212pt;width:469.486pt;height:19.799pt;z-index:251659264;mso-position-horizontal-relative:page;mso-position-vertical-relative:page;mso-wrap-style:none;mso-fit-shape-to-text:t;">
+          <v:shape id="DocuMindTextBox38" type="#_x0000_t202" stroked="f" filled="f" o:allowincell="f" style="position:absolute;margin-left:57.635pt;margin-top:687.212pt;width:469.486pt;height:19.799pt;z-index:251659264;mso-position-horizontal-relative:page;mso-position-vertical-relative:page;mso-wrap-style:none;mso-fit-shape-to-text:t;">
             <w10:wrap type="none"/>
             <v:textbox inset="0,0,0,0">
               <w:txbxContent>
@@ -985,7 +1001,7 @@
       </w:r>
       <w:r>
         <w:pict>
-          <v:shape id="DocuMindTextBox37" type="#_x0000_t202" stroked="f" filled="f" o:allowincell="f" style="position:absolute;margin-left:57.635pt;margin-top:699.931pt;width:384.808pt;height:19.799pt;z-index:251659264;mso-position-horizontal-relative:page;mso-position-vertical-relative:page;mso-wrap-style:none;mso-fit-shape-to-text:t;">
+          <v:shape id="DocuMindTextBox39" type="#_x0000_t202" stroked="f" filled="f" o:allowincell="f" style="position:absolute;margin-left:57.635pt;margin-top:699.931pt;width:384.808pt;height:19.799pt;z-index:251659264;mso-position-horizontal-relative:page;mso-position-vertical-relative:page;mso-wrap-style:none;mso-fit-shape-to-text:t;">
             <w10:wrap type="none"/>
             <v:textbox inset="0,0,0,0">
               <w:txbxContent>
@@ -1032,7 +1048,15 @@
       </w:r>
       <w:r>
         <w:pict>
-          <v:shape id="DocuMindTextBox38" type="#_x0000_t202" stroked="f" filled="f" o:allowincell="f" style="position:absolute;margin-left:57.636pt;margin-top:734.050pt;width:99.713pt;height:17.249pt;z-index:251659264;mso-position-horizontal-relative:page;mso-position-vertical-relative:page;mso-wrap-style:none;mso-fit-shape-to-text:t;">
+          <v:shape id="DocuMindImage40" type="#_x0000_t75" stroked="f" o:allowincell="f" style="position:absolute;margin-left:57.636pt;margin-top:35.997pt;width:70.914pt;height:48.236pt;z-index:1;mso-position-horizontal-relative:page;mso-position-vertical-relative:page;mso-wrap-style:none;">
+            <w10:wrap type="none"/>
+            <v:imagedata r:id="rId9" o:title=""/>
+          </v:shape>
+        </w:pict>
+      </w:r>
+      <w:r>
+        <w:pict>
+          <v:shape id="DocuMindTextBox41" type="#_x0000_t202" stroked="f" filled="f" o:allowincell="f" style="position:absolute;margin-left:57.636pt;margin-top:734.050pt;width:99.713pt;height:17.249pt;z-index:251659264;mso-position-horizontal-relative:page;mso-position-vertical-relative:page;mso-wrap-style:none;mso-fit-shape-to-text:t;">
             <w10:wrap type="none"/>
             <v:textbox inset="0,0,0,0">
               <w:txbxContent>
@@ -1059,7 +1083,7 @@
       </w:r>
       <w:r>
         <w:pict>
-          <v:shape id="DocuMindTextBox39" type="#_x0000_t202" stroked="f" filled="f" o:allowincell="f" style="position:absolute;margin-left:475.799pt;margin-top:734.050pt;width:51.695pt;height:17.249pt;z-index:251659264;mso-position-horizontal-relative:page;mso-position-vertical-relative:page;mso-wrap-style:none;mso-fit-shape-to-text:t;">
+          <v:shape id="DocuMindTextBox42" type="#_x0000_t202" stroked="f" filled="f" o:allowincell="f" style="position:absolute;margin-left:475.799pt;margin-top:734.050pt;width:51.695pt;height:17.249pt;z-index:251659264;mso-position-horizontal-relative:page;mso-position-vertical-relative:page;mso-wrap-style:none;mso-fit-shape-to-text:t;">
             <w10:wrap type="none"/>
             <v:textbox inset="0,0,0,0">
               <w:txbxContent>
@@ -1086,7 +1110,7 @@
       </w:r>
       <w:r>
         <w:pict>
-          <v:shape id="DocuMindTextBox40" type="#_x0000_t202" stroked="f" filled="f" o:allowincell="f" style="position:absolute;margin-left:57.636pt;margin-top:110.991pt;width:102.462pt;height:20.999pt;z-index:251659264;mso-position-horizontal-relative:page;mso-position-vertical-relative:page;mso-wrap-style:none;mso-fit-shape-to-text:t;">
+          <v:shape id="DocuMindTextBox43" type="#_x0000_t202" stroked="f" filled="f" o:allowincell="f" style="position:absolute;margin-left:57.636pt;margin-top:110.991pt;width:102.462pt;height:20.999pt;z-index:251659264;mso-position-horizontal-relative:page;mso-position-vertical-relative:page;mso-wrap-style:none;mso-fit-shape-to-text:t;">
             <w10:wrap type="none"/>
             <v:textbox inset="0,0,0,0">
               <w:txbxContent>
@@ -1113,7 +1137,7 @@
       </w:r>
       <w:r>
         <w:pict>
-          <v:shape id="DocuMindTextBox41" type="#_x0000_t202" stroked="f" filled="f" o:allowincell="f" style="position:absolute;margin-left:57.636pt;margin-top:129.846pt;width:56.971pt;height:18.449pt;z-index:251659264;mso-position-horizontal-relative:page;mso-position-vertical-relative:page;mso-wrap-style:none;mso-fit-shape-to-text:t;">
+          <v:shape id="DocuMindTextBox44" type="#_x0000_t202" stroked="f" filled="f" o:allowincell="f" style="position:absolute;margin-left:57.636pt;margin-top:129.846pt;width:56.971pt;height:18.449pt;z-index:251659264;mso-position-horizontal-relative:page;mso-position-vertical-relative:page;mso-wrap-style:none;mso-fit-shape-to-text:t;">
             <w10:wrap type="none"/>
             <v:textbox inset="0,0,0,0">
               <w:txbxContent>
@@ -1140,7 +1164,7 @@
       </w:r>
       <w:r>
         <w:pict>
-          <v:shape id="DocuMindTextBox42" type="#_x0000_t202" stroked="f" filled="f" o:allowincell="f" style="position:absolute;margin-left:117.630pt;margin-top:129.846pt;width:32.973pt;height:18.449pt;z-index:251659264;mso-position-horizontal-relative:page;mso-position-vertical-relative:page;mso-wrap-style:none;mso-fit-shape-to-text:t;">
+          <v:shape id="DocuMindTextBox45" type="#_x0000_t202" stroked="f" filled="f" o:allowincell="f" style="position:absolute;margin-left:117.630pt;margin-top:129.846pt;width:32.973pt;height:18.449pt;z-index:251659264;mso-position-horizontal-relative:page;mso-position-vertical-relative:page;mso-wrap-style:none;mso-fit-shape-to-text:t;">
             <w10:wrap type="none"/>
             <v:textbox inset="0,0,0,0">
               <w:txbxContent>
@@ -1167,7 +1191,7 @@
       </w:r>
       <w:r>
         <w:pict>
-          <v:shape id="DocuMindTextBox43" type="#_x0000_t202" stroked="f" filled="f" o:allowincell="f" style="position:absolute;margin-left:57.636pt;margin-top:141.245pt;width:62.970pt;height:18.449pt;z-index:251659264;mso-position-horizontal-relative:page;mso-position-vertical-relative:page;mso-wrap-style:none;mso-fit-shape-to-text:t;">
+          <v:shape id="DocuMindTextBox46" type="#_x0000_t202" stroked="f" filled="f" o:allowincell="f" style="position:absolute;margin-left:57.636pt;margin-top:141.245pt;width:62.970pt;height:18.449pt;z-index:251659264;mso-position-horizontal-relative:page;mso-position-vertical-relative:page;mso-wrap-style:none;mso-fit-shape-to-text:t;">
             <w10:wrap type="none"/>
             <v:textbox inset="0,0,0,0">
               <w:txbxContent>
@@ -1194,7 +1218,7 @@
       </w:r>
       <w:r>
         <w:pict>
-          <v:shape id="DocuMindTextBox44" type="#_x0000_t202" stroked="f" filled="f" o:allowincell="f" style="position:absolute;margin-left:123.630pt;margin-top:141.245pt;width:56.971pt;height:18.449pt;z-index:251659264;mso-position-horizontal-relative:page;mso-position-vertical-relative:page;mso-wrap-style:none;mso-fit-shape-to-text:t;">
+          <v:shape id="DocuMindTextBox47" type="#_x0000_t202" stroked="f" filled="f" o:allowincell="f" style="position:absolute;margin-left:123.630pt;margin-top:141.245pt;width:56.971pt;height:18.449pt;z-index:251659264;mso-position-horizontal-relative:page;mso-position-vertical-relative:page;mso-wrap-style:none;mso-fit-shape-to-text:t;">
             <w10:wrap type="none"/>
             <v:textbox inset="0,0,0,0">
               <w:txbxContent>
@@ -1221,7 +1245,7 @@
       </w:r>
       <w:r>
         <w:pict>
-          <v:shape id="DocuMindTextBox45" type="#_x0000_t202" stroked="f" filled="f" o:allowincell="f" style="position:absolute;margin-left:57.636pt;margin-top:152.524pt;width:38.973pt;height:18.449pt;z-index:251659264;mso-position-horizontal-relative:page;mso-position-vertical-relative:page;mso-wrap-style:none;mso-fit-shape-to-text:t;">
+          <v:shape id="DocuMindTextBox48" type="#_x0000_t202" stroked="f" filled="f" o:allowincell="f" style="position:absolute;margin-left:57.636pt;margin-top:152.524pt;width:38.973pt;height:18.449pt;z-index:251659264;mso-position-horizontal-relative:page;mso-position-vertical-relative:page;mso-wrap-style:none;mso-fit-shape-to-text:t;">
             <w10:wrap type="none"/>
             <v:textbox inset="0,0,0,0">
               <w:txbxContent>
@@ -1248,7 +1272,7 @@
       </w:r>
       <w:r>
         <w:pict>
-          <v:shape id="DocuMindTextBox46" type="#_x0000_t202" stroked="f" filled="f" o:allowincell="f" style="position:absolute;margin-left:99.632pt;margin-top:152.524pt;width:62.970pt;height:18.449pt;z-index:251659264;mso-position-horizontal-relative:page;mso-position-vertical-relative:page;mso-wrap-style:none;mso-fit-shape-to-text:t;">
+          <v:shape id="DocuMindTextBox49" type="#_x0000_t202" stroked="f" filled="f" o:allowincell="f" style="position:absolute;margin-left:99.632pt;margin-top:152.524pt;width:62.970pt;height:18.449pt;z-index:251659264;mso-position-horizontal-relative:page;mso-position-vertical-relative:page;mso-wrap-style:none;mso-fit-shape-to-text:t;">
             <w10:wrap type="none"/>
             <v:textbox inset="0,0,0,0">
               <w:txbxContent>
@@ -1275,7 +1299,7 @@
       </w:r>
       <w:r>
         <w:pict>
-          <v:shape id="DocuMindTextBox47" type="#_x0000_t202" stroked="f" filled="f" o:allowincell="f" style="position:absolute;margin-left:57.636pt;margin-top:163.803pt;width:56.971pt;height:18.449pt;z-index:251659264;mso-position-horizontal-relative:page;mso-position-vertical-relative:page;mso-wrap-style:none;mso-fit-shape-to-text:t;">
+          <v:shape id="DocuMindTextBox50" type="#_x0000_t202" stroked="f" filled="f" o:allowincell="f" style="position:absolute;margin-left:57.636pt;margin-top:163.803pt;width:56.971pt;height:18.449pt;z-index:251659264;mso-position-horizontal-relative:page;mso-position-vertical-relative:page;mso-wrap-style:none;mso-fit-shape-to-text:t;">
             <w10:wrap type="none"/>
             <v:textbox inset="0,0,0,0">
               <w:txbxContent>
@@ -1302,7 +1326,7 @@
       </w:r>
       <w:r>
         <w:pict>
-          <v:shape id="DocuMindTextBox48" type="#_x0000_t202" stroked="f" filled="f" o:allowincell="f" style="position:absolute;margin-left:57.636pt;margin-top:175.202pt;width:38.973pt;height:18.449pt;z-index:251659264;mso-position-horizontal-relative:page;mso-position-vertical-relative:page;mso-wrap-style:none;mso-fit-shape-to-text:t;">
+          <v:shape id="DocuMindTextBox51" type="#_x0000_t202" stroked="f" filled="f" o:allowincell="f" style="position:absolute;margin-left:57.636pt;margin-top:175.202pt;width:38.973pt;height:18.449pt;z-index:251659264;mso-position-horizontal-relative:page;mso-position-vertical-relative:page;mso-wrap-style:none;mso-fit-shape-to-text:t;">
             <w10:wrap type="none"/>
             <v:textbox inset="0,0,0,0">
               <w:txbxContent>
@@ -1329,7 +1353,7 @@
       </w:r>
       <w:r>
         <w:pict>
-          <v:shape id="DocuMindTextBox49" type="#_x0000_t202" stroked="f" filled="f" o:allowincell="f" style="position:absolute;margin-left:99.632pt;margin-top:175.202pt;width:68.970pt;height:18.449pt;z-index:251659264;mso-position-horizontal-relative:page;mso-position-vertical-relative:page;mso-wrap-style:none;mso-fit-shape-to-text:t;">
+          <v:shape id="DocuMindTextBox52" type="#_x0000_t202" stroked="f" filled="f" o:allowincell="f" style="position:absolute;margin-left:99.632pt;margin-top:175.202pt;width:68.970pt;height:18.449pt;z-index:251659264;mso-position-horizontal-relative:page;mso-position-vertical-relative:page;mso-wrap-style:none;mso-fit-shape-to-text:t;">
             <w10:wrap type="none"/>
             <v:textbox inset="0,0,0,0">
               <w:txbxContent>
@@ -1356,7 +1380,7 @@
       </w:r>
       <w:r>
         <w:pict>
-          <v:shape id="DocuMindTextBox50" type="#_x0000_t202" stroked="f" filled="f" o:allowincell="f" style="position:absolute;margin-left:57.636pt;margin-top:186.481pt;width:68.970pt;height:18.449pt;z-index:251659264;mso-position-horizontal-relative:page;mso-position-vertical-relative:page;mso-wrap-style:none;mso-fit-shape-to-text:t;">
+          <v:shape id="DocuMindTextBox53" type="#_x0000_t202" stroked="f" filled="f" o:allowincell="f" style="position:absolute;margin-left:57.636pt;margin-top:186.481pt;width:68.970pt;height:18.449pt;z-index:251659264;mso-position-horizontal-relative:page;mso-position-vertical-relative:page;mso-wrap-style:none;mso-fit-shape-to-text:t;">
             <w10:wrap type="none"/>
             <v:textbox inset="0,0,0,0">
               <w:txbxContent>
@@ -1383,7 +1407,7 @@
       </w:r>
       <w:r>
         <w:pict>
-          <v:shape id="DocuMindTextBox51" type="#_x0000_t202" stroked="f" filled="f" o:allowincell="f" style="position:absolute;margin-left:129.629pt;margin-top:186.481pt;width:20.974pt;height:18.449pt;z-index:251659264;mso-position-horizontal-relative:page;mso-position-vertical-relative:page;mso-wrap-style:none;mso-fit-shape-to-text:t;">
+          <v:shape id="DocuMindTextBox54" type="#_x0000_t202" stroked="f" filled="f" o:allowincell="f" style="position:absolute;margin-left:129.629pt;margin-top:186.481pt;width:20.974pt;height:18.449pt;z-index:251659264;mso-position-horizontal-relative:page;mso-position-vertical-relative:page;mso-wrap-style:none;mso-fit-shape-to-text:t;">
             <w10:wrap type="none"/>
             <v:textbox inset="0,0,0,0">
               <w:txbxContent>
@@ -1410,7 +1434,7 @@
       </w:r>
       <w:r>
         <w:pict>
-          <v:shape id="DocuMindTextBox52" type="#_x0000_t202" stroked="f" filled="f" o:allowincell="f" style="position:absolute;margin-left:153.627pt;margin-top:186.481pt;width:26.974pt;height:18.449pt;z-index:251659264;mso-position-horizontal-relative:page;mso-position-vertical-relative:page;mso-wrap-style:none;mso-fit-shape-to-text:t;">
+          <v:shape id="DocuMindTextBox55" type="#_x0000_t202" stroked="f" filled="f" o:allowincell="f" style="position:absolute;margin-left:153.627pt;margin-top:186.481pt;width:26.974pt;height:18.449pt;z-index:251659264;mso-position-horizontal-relative:page;mso-position-vertical-relative:page;mso-wrap-style:none;mso-fit-shape-to-text:t;">
             <w10:wrap type="none"/>
             <v:textbox inset="0,0,0,0">
               <w:txbxContent>
@@ -1437,7 +1461,7 @@
       </w:r>
       <w:r>
         <w:pict>
-          <v:shape id="DocuMindTextBox53" type="#_x0000_t202" stroked="f" filled="f" o:allowincell="f" style="position:absolute;margin-left:183.624pt;margin-top:186.481pt;width:14.975pt;height:18.449pt;z-index:251659264;mso-position-horizontal-relative:page;mso-position-vertical-relative:page;mso-wrap-style:none;mso-fit-shape-to-text:t;">
+          <v:shape id="DocuMindTextBox56" type="#_x0000_t202" stroked="f" filled="f" o:allowincell="f" style="position:absolute;margin-left:183.624pt;margin-top:186.481pt;width:14.975pt;height:18.449pt;z-index:251659264;mso-position-horizontal-relative:page;mso-position-vertical-relative:page;mso-wrap-style:none;mso-fit-shape-to-text:t;">
             <w10:wrap type="none"/>
             <v:textbox inset="0,0,0,0">
               <w:txbxContent>
@@ -1464,7 +1488,7 @@
       </w:r>
       <w:r>
         <w:pict>
-          <v:shape id="DocuMindTextBox54" type="#_x0000_t202" stroked="f" filled="f" o:allowincell="f" style="position:absolute;margin-left:57.636pt;margin-top:197.881pt;width:38.973pt;height:18.449pt;z-index:251659264;mso-position-horizontal-relative:page;mso-position-vertical-relative:page;mso-wrap-style:none;mso-fit-shape-to-text:t;">
+          <v:shape id="DocuMindTextBox57" type="#_x0000_t202" stroked="f" filled="f" o:allowincell="f" style="position:absolute;margin-left:57.636pt;margin-top:197.881pt;width:38.973pt;height:18.449pt;z-index:251659264;mso-position-horizontal-relative:page;mso-position-vertical-relative:page;mso-wrap-style:none;mso-fit-shape-to-text:t;">
             <w10:wrap type="none"/>
             <v:textbox inset="0,0,0,0">
               <w:txbxContent>
@@ -1491,7 +1515,7 @@
       </w:r>
       <w:r>
         <w:pict>
-          <v:shape id="DocuMindTextBox55" type="#_x0000_t202" stroked="f" filled="f" o:allowincell="f" style="position:absolute;margin-left:99.632pt;margin-top:197.881pt;width:62.970pt;height:18.449pt;z-index:251659264;mso-position-horizontal-relative:page;mso-position-vertical-relative:page;mso-wrap-style:none;mso-fit-shape-to-text:t;">
+          <v:shape id="DocuMindTextBox58" type="#_x0000_t202" stroked="f" filled="f" o:allowincell="f" style="position:absolute;margin-left:99.632pt;margin-top:197.881pt;width:62.970pt;height:18.449pt;z-index:251659264;mso-position-horizontal-relative:page;mso-position-vertical-relative:page;mso-wrap-style:none;mso-fit-shape-to-text:t;">
             <w10:wrap type="none"/>
             <v:textbox inset="0,0,0,0">
               <w:txbxContent>
@@ -1518,7 +1542,7 @@
       </w:r>
       <w:r>
         <w:pict>
-          <v:shape id="DocuMindTextBox56" type="#_x0000_t202" stroked="f" filled="f" o:allowincell="f" style="position:absolute;margin-left:57.636pt;margin-top:209.159pt;width:32.973pt;height:18.449pt;z-index:251659264;mso-position-horizontal-relative:page;mso-position-vertical-relative:page;mso-wrap-style:none;mso-fit-shape-to-text:t;">
+          <v:shape id="DocuMindTextBox59" type="#_x0000_t202" stroked="f" filled="f" o:allowincell="f" style="position:absolute;margin-left:57.636pt;margin-top:209.159pt;width:32.973pt;height:18.449pt;z-index:251659264;mso-position-horizontal-relative:page;mso-position-vertical-relative:page;mso-wrap-style:none;mso-fit-shape-to-text:t;">
             <w10:wrap type="none"/>
             <v:textbox inset="0,0,0,0">
               <w:txbxContent>
@@ -1545,7 +1569,7 @@
       </w:r>
       <w:r>
         <w:pict>
-          <v:shape id="DocuMindTextBox57" type="#_x0000_t202" stroked="f" filled="f" o:allowincell="f" style="position:absolute;margin-left:57.636pt;margin-top:220.438pt;width:38.973pt;height:18.449pt;z-index:251659264;mso-position-horizontal-relative:page;mso-position-vertical-relative:page;mso-wrap-style:none;mso-fit-shape-to-text:t;">
+          <v:shape id="DocuMindTextBox60" type="#_x0000_t202" stroked="f" filled="f" o:allowincell="f" style="position:absolute;margin-left:57.636pt;margin-top:220.438pt;width:38.973pt;height:18.449pt;z-index:251659264;mso-position-horizontal-relative:page;mso-position-vertical-relative:page;mso-wrap-style:none;mso-fit-shape-to-text:t;">
             <w10:wrap type="none"/>
             <v:textbox inset="0,0,0,0">
               <w:txbxContent>
@@ -1572,7 +1596,7 @@
       </w:r>
       <w:r>
         <w:pict>
-          <v:shape id="DocuMindTextBox58" type="#_x0000_t202" stroked="f" filled="f" o:allowincell="f" style="position:absolute;margin-left:99.632pt;margin-top:220.438pt;width:74.969pt;height:18.449pt;z-index:251659264;mso-position-horizontal-relative:page;mso-position-vertical-relative:page;mso-wrap-style:none;mso-fit-shape-to-text:t;">
+          <v:shape id="DocuMindTextBox61" type="#_x0000_t202" stroked="f" filled="f" o:allowincell="f" style="position:absolute;margin-left:99.632pt;margin-top:220.438pt;width:74.969pt;height:18.449pt;z-index:251659264;mso-position-horizontal-relative:page;mso-position-vertical-relative:page;mso-wrap-style:none;mso-fit-shape-to-text:t;">
             <w10:wrap type="none"/>
             <v:textbox inset="0,0,0,0">
               <w:txbxContent>
@@ -1599,7 +1623,7 @@
       </w:r>
       <w:r>
         <w:pict>
-          <v:shape id="DocuMindTextBox59" type="#_x0000_t202" stroked="f" filled="f" o:allowincell="f" style="position:absolute;margin-left:57.636pt;margin-top:231.837pt;width:32.973pt;height:18.449pt;z-index:251659264;mso-position-horizontal-relative:page;mso-position-vertical-relative:page;mso-wrap-style:none;mso-fit-shape-to-text:t;">
+          <v:shape id="DocuMindTextBox62" type="#_x0000_t202" stroked="f" filled="f" o:allowincell="f" style="position:absolute;margin-left:57.636pt;margin-top:231.837pt;width:32.973pt;height:18.449pt;z-index:251659264;mso-position-horizontal-relative:page;mso-position-vertical-relative:page;mso-wrap-style:none;mso-fit-shape-to-text:t;">
             <w10:wrap type="none"/>
             <v:textbox inset="0,0,0,0">
               <w:txbxContent>
@@ -1626,7 +1650,7 @@
       </w:r>
       <w:r>
         <w:pict>
-          <v:shape id="DocuMindTextBox60" type="#_x0000_t202" stroked="f" filled="f" o:allowincell="f" style="position:absolute;margin-left:57.636pt;margin-top:243.116pt;width:32.973pt;height:18.449pt;z-index:251659264;mso-position-horizontal-relative:page;mso-position-vertical-relative:page;mso-wrap-style:none;mso-fit-shape-to-text:t;">
+          <v:shape id="DocuMindTextBox63" type="#_x0000_t202" stroked="f" filled="f" o:allowincell="f" style="position:absolute;margin-left:57.636pt;margin-top:243.116pt;width:32.973pt;height:18.449pt;z-index:251659264;mso-position-horizontal-relative:page;mso-position-vertical-relative:page;mso-wrap-style:none;mso-fit-shape-to-text:t;">
             <w10:wrap type="none"/>
             <v:textbox inset="0,0,0,0">
               <w:txbxContent>
@@ -1653,7 +1677,7 @@
       </w:r>
       <w:r>
         <w:pict>
-          <v:shape id="DocuMindTextBox61" type="#_x0000_t202" stroked="f" filled="f" o:allowincell="f" style="position:absolute;margin-left:93.632pt;margin-top:243.116pt;width:8.976pt;height:18.449pt;z-index:251659264;mso-position-horizontal-relative:page;mso-position-vertical-relative:page;mso-wrap-style:none;mso-fit-shape-to-text:t;">
+          <v:shape id="DocuMindTextBox64" type="#_x0000_t202" stroked="f" filled="f" o:allowincell="f" style="position:absolute;margin-left:93.632pt;margin-top:243.116pt;width:8.976pt;height:18.449pt;z-index:251659264;mso-position-horizontal-relative:page;mso-position-vertical-relative:page;mso-wrap-style:none;mso-fit-shape-to-text:t;">
             <w10:wrap type="none"/>
             <v:textbox inset="0,0,0,0">
               <w:txbxContent>
@@ -1680,7 +1704,7 @@
       </w:r>
       <w:r>
         <w:pict>
-          <v:shape id="DocuMindTextBox62" type="#_x0000_t202" stroked="f" filled="f" o:allowincell="f" style="position:absolute;margin-left:57.636pt;margin-top:254.516pt;width:38.973pt;height:18.449pt;z-index:251659264;mso-position-horizontal-relative:page;mso-position-vertical-relative:page;mso-wrap-style:none;mso-fit-shape-to-text:t;">
+          <v:shape id="DocuMindTextBox65" type="#_x0000_t202" stroked="f" filled="f" o:allowincell="f" style="position:absolute;margin-left:57.636pt;margin-top:254.516pt;width:38.973pt;height:18.449pt;z-index:251659264;mso-position-horizontal-relative:page;mso-position-vertical-relative:page;mso-wrap-style:none;mso-fit-shape-to-text:t;">
             <w10:wrap type="none"/>
             <v:textbox inset="0,0,0,0">
               <w:txbxContent>
@@ -1707,7 +1731,7 @@
       </w:r>
       <w:r>
         <w:pict>
-          <v:shape id="DocuMindTextBox63" type="#_x0000_t202" stroked="f" filled="f" o:allowincell="f" style="position:absolute;margin-left:99.632pt;margin-top:254.516pt;width:62.970pt;height:18.449pt;z-index:251659264;mso-position-horizontal-relative:page;mso-position-vertical-relative:page;mso-wrap-style:none;mso-fit-shape-to-text:t;">
+          <v:shape id="DocuMindTextBox66" type="#_x0000_t202" stroked="f" filled="f" o:allowincell="f" style="position:absolute;margin-left:99.632pt;margin-top:254.516pt;width:62.970pt;height:18.449pt;z-index:251659264;mso-position-horizontal-relative:page;mso-position-vertical-relative:page;mso-wrap-style:none;mso-fit-shape-to-text:t;">
             <w10:wrap type="none"/>
             <v:textbox inset="0,0,0,0">
               <w:txbxContent>
@@ -1734,7 +1758,7 @@
       </w:r>
       <w:r>
         <w:pict>
-          <v:shape id="DocuMindTextBox64" type="#_x0000_t202" stroked="f" filled="f" o:allowincell="f" style="position:absolute;margin-left:57.636pt;margin-top:265.794pt;width:56.971pt;height:18.449pt;z-index:251659264;mso-position-horizontal-relative:page;mso-position-vertical-relative:page;mso-wrap-style:none;mso-fit-shape-to-text:t;">
+          <v:shape id="DocuMindTextBox67" type="#_x0000_t202" stroked="f" filled="f" o:allowincell="f" style="position:absolute;margin-left:57.636pt;margin-top:265.794pt;width:56.971pt;height:18.449pt;z-index:251659264;mso-position-horizontal-relative:page;mso-position-vertical-relative:page;mso-wrap-style:none;mso-fit-shape-to-text:t;">
             <w10:wrap type="none"/>
             <v:textbox inset="0,0,0,0">
               <w:txbxContent>
@@ -1761,7 +1785,7 @@
       </w:r>
       <w:r>
         <w:pict>
-          <v:shape id="DocuMindTextBox65" type="#_x0000_t202" stroked="f" filled="f" o:allowincell="f" style="position:absolute;margin-left:57.636pt;margin-top:277.073pt;width:38.973pt;height:18.449pt;z-index:251659264;mso-position-horizontal-relative:page;mso-position-vertical-relative:page;mso-wrap-style:none;mso-fit-shape-to-text:t;">
+          <v:shape id="DocuMindTextBox68" type="#_x0000_t202" stroked="f" filled="f" o:allowincell="f" style="position:absolute;margin-left:57.636pt;margin-top:277.073pt;width:38.973pt;height:18.449pt;z-index:251659264;mso-position-horizontal-relative:page;mso-position-vertical-relative:page;mso-wrap-style:none;mso-fit-shape-to-text:t;">
             <w10:wrap type="none"/>
             <v:textbox inset="0,0,0,0">
               <w:txbxContent>
@@ -1788,7 +1812,7 @@
       </w:r>
       <w:r>
         <w:pict>
-          <v:shape id="DocuMindTextBox66" type="#_x0000_t202" stroked="f" filled="f" o:allowincell="f" style="position:absolute;margin-left:99.632pt;margin-top:277.073pt;width:68.970pt;height:18.449pt;z-index:251659264;mso-position-horizontal-relative:page;mso-position-vertical-relative:page;mso-wrap-style:none;mso-fit-shape-to-text:t;">
+          <v:shape id="DocuMindTextBox69" type="#_x0000_t202" stroked="f" filled="f" o:allowincell="f" style="position:absolute;margin-left:99.632pt;margin-top:277.073pt;width:68.970pt;height:18.449pt;z-index:251659264;mso-position-horizontal-relative:page;mso-position-vertical-relative:page;mso-wrap-style:none;mso-fit-shape-to-text:t;">
             <w10:wrap type="none"/>
             <v:textbox inset="0,0,0,0">
               <w:txbxContent>
@@ -1815,7 +1839,7 @@
       </w:r>
       <w:r>
         <w:pict>
-          <v:shape id="DocuMindTextBox67" type="#_x0000_t202" stroked="f" filled="f" o:allowincell="f" style="position:absolute;margin-left:57.636pt;margin-top:288.472pt;width:68.970pt;height:18.449pt;z-index:251659264;mso-position-horizontal-relative:page;mso-position-vertical-relative:page;mso-wrap-style:none;mso-fit-shape-to-text:t;">
+          <v:shape id="DocuMindTextBox70" type="#_x0000_t202" stroked="f" filled="f" o:allowincell="f" style="position:absolute;margin-left:57.636pt;margin-top:288.472pt;width:68.970pt;height:18.449pt;z-index:251659264;mso-position-horizontal-relative:page;mso-position-vertical-relative:page;mso-wrap-style:none;mso-fit-shape-to-text:t;">
             <w10:wrap type="none"/>
             <v:textbox inset="0,0,0,0">
               <w:txbxContent>
@@ -1842,7 +1866,7 @@
       </w:r>
       <w:r>
         <w:pict>
-          <v:shape id="DocuMindTextBox68" type="#_x0000_t202" stroked="f" filled="f" o:allowincell="f" style="position:absolute;margin-left:129.629pt;margin-top:288.472pt;width:20.974pt;height:18.449pt;z-index:251659264;mso-position-horizontal-relative:page;mso-position-vertical-relative:page;mso-wrap-style:none;mso-fit-shape-to-text:t;">
+          <v:shape id="DocuMindTextBox71" type="#_x0000_t202" stroked="f" filled="f" o:allowincell="f" style="position:absolute;margin-left:129.629pt;margin-top:288.472pt;width:20.974pt;height:18.449pt;z-index:251659264;mso-position-horizontal-relative:page;mso-position-vertical-relative:page;mso-wrap-style:none;mso-fit-shape-to-text:t;">
             <w10:wrap type="none"/>
             <v:textbox inset="0,0,0,0">
               <w:txbxContent>
@@ -1869,7 +1893,7 @@
       </w:r>
       <w:r>
         <w:pict>
-          <v:shape id="DocuMindTextBox69" type="#_x0000_t202" stroked="f" filled="f" o:allowincell="f" style="position:absolute;margin-left:153.627pt;margin-top:288.472pt;width:26.974pt;height:18.449pt;z-index:251659264;mso-position-horizontal-relative:page;mso-position-vertical-relative:page;mso-wrap-style:none;mso-fit-shape-to-text:t;">
+          <v:shape id="DocuMindTextBox72" type="#_x0000_t202" stroked="f" filled="f" o:allowincell="f" style="position:absolute;margin-left:153.627pt;margin-top:288.472pt;width:26.974pt;height:18.449pt;z-index:251659264;mso-position-horizontal-relative:page;mso-position-vertical-relative:page;mso-wrap-style:none;mso-fit-shape-to-text:t;">
             <w10:wrap type="none"/>
             <v:textbox inset="0,0,0,0">
               <w:txbxContent>
@@ -1896,7 +1920,7 @@
       </w:r>
       <w:r>
         <w:pict>
-          <v:shape id="DocuMindTextBox70" type="#_x0000_t202" stroked="f" filled="f" o:allowincell="f" style="position:absolute;margin-left:183.624pt;margin-top:288.472pt;width:14.975pt;height:18.449pt;z-index:251659264;mso-position-horizontal-relative:page;mso-position-vertical-relative:page;mso-wrap-style:none;mso-fit-shape-to-text:t;">
+          <v:shape id="DocuMindTextBox73" type="#_x0000_t202" stroked="f" filled="f" o:allowincell="f" style="position:absolute;margin-left:183.624pt;margin-top:288.472pt;width:14.975pt;height:18.449pt;z-index:251659264;mso-position-horizontal-relative:page;mso-position-vertical-relative:page;mso-wrap-style:none;mso-fit-shape-to-text:t;">
             <w10:wrap type="none"/>
             <v:textbox inset="0,0,0,0">
               <w:txbxContent>
@@ -1923,7 +1947,7 @@
       </w:r>
       <w:r>
         <w:pict>
-          <v:shape id="DocuMindTextBox71" type="#_x0000_t202" stroked="f" filled="f" o:allowincell="f" style="position:absolute;margin-left:57.636pt;margin-top:299.751pt;width:38.973pt;height:18.449pt;z-index:251659264;mso-position-horizontal-relative:page;mso-position-vertical-relative:page;mso-wrap-style:none;mso-fit-shape-to-text:t;">
+          <v:shape id="DocuMindTextBox74" type="#_x0000_t202" stroked="f" filled="f" o:allowincell="f" style="position:absolute;margin-left:57.636pt;margin-top:299.751pt;width:38.973pt;height:18.449pt;z-index:251659264;mso-position-horizontal-relative:page;mso-position-vertical-relative:page;mso-wrap-style:none;mso-fit-shape-to-text:t;">
             <w10:wrap type="none"/>
             <v:textbox inset="0,0,0,0">
               <w:txbxContent>
@@ -1950,7 +1974,7 @@
       </w:r>
       <w:r>
         <w:pict>
-          <v:shape id="DocuMindTextBox72" type="#_x0000_t202" stroked="f" filled="f" o:allowincell="f" style="position:absolute;margin-left:99.632pt;margin-top:299.751pt;width:62.970pt;height:18.449pt;z-index:251659264;mso-position-horizontal-relative:page;mso-position-vertical-relative:page;mso-wrap-style:none;mso-fit-shape-to-text:t;">
+          <v:shape id="DocuMindTextBox75" type="#_x0000_t202" stroked="f" filled="f" o:allowincell="f" style="position:absolute;margin-left:99.632pt;margin-top:299.751pt;width:62.970pt;height:18.449pt;z-index:251659264;mso-position-horizontal-relative:page;mso-position-vertical-relative:page;mso-wrap-style:none;mso-fit-shape-to-text:t;">
             <w10:wrap type="none"/>
             <v:textbox inset="0,0,0,0">
               <w:txbxContent>
@@ -1977,7 +2001,7 @@
       </w:r>
       <w:r>
         <w:pict>
-          <v:shape id="DocuMindTextBox73" type="#_x0000_t202" stroked="f" filled="f" o:allowincell="f" style="position:absolute;margin-left:57.636pt;margin-top:311.151pt;width:32.973pt;height:18.449pt;z-index:251659264;mso-position-horizontal-relative:page;mso-position-vertical-relative:page;mso-wrap-style:none;mso-fit-shape-to-text:t;">
+          <v:shape id="DocuMindTextBox76" type="#_x0000_t202" stroked="f" filled="f" o:allowincell="f" style="position:absolute;margin-left:57.636pt;margin-top:311.151pt;width:32.973pt;height:18.449pt;z-index:251659264;mso-position-horizontal-relative:page;mso-position-vertical-relative:page;mso-wrap-style:none;mso-fit-shape-to-text:t;">
             <w10:wrap type="none"/>
             <v:textbox inset="0,0,0,0">
               <w:txbxContent>
@@ -2004,7 +2028,7 @@
       </w:r>
       <w:r>
         <w:pict>
-          <v:shape id="DocuMindTextBox74" type="#_x0000_t202" stroked="f" filled="f" o:allowincell="f" style="position:absolute;margin-left:57.636pt;margin-top:322.429pt;width:38.973pt;height:18.449pt;z-index:251659264;mso-position-horizontal-relative:page;mso-position-vertical-relative:page;mso-wrap-style:none;mso-fit-shape-to-text:t;">
+          <v:shape id="DocuMindTextBox77" type="#_x0000_t202" stroked="f" filled="f" o:allowincell="f" style="position:absolute;margin-left:57.636pt;margin-top:322.429pt;width:38.973pt;height:18.449pt;z-index:251659264;mso-position-horizontal-relative:page;mso-position-vertical-relative:page;mso-wrap-style:none;mso-fit-shape-to-text:t;">
             <w10:wrap type="none"/>
             <v:textbox inset="0,0,0,0">
               <w:txbxContent>
@@ -2031,7 +2055,7 @@
       </w:r>
       <w:r>
         <w:pict>
-          <v:shape id="DocuMindTextBox75" type="#_x0000_t202" stroked="f" filled="f" o:allowincell="f" style="position:absolute;margin-left:99.632pt;margin-top:322.429pt;width:74.969pt;height:18.449pt;z-index:251659264;mso-position-horizontal-relative:page;mso-position-vertical-relative:page;mso-wrap-style:none;mso-fit-shape-to-text:t;">
+          <v:shape id="DocuMindTextBox78" type="#_x0000_t202" stroked="f" filled="f" o:allowincell="f" style="position:absolute;margin-left:99.632pt;margin-top:322.429pt;width:74.969pt;height:18.449pt;z-index:251659264;mso-position-horizontal-relative:page;mso-position-vertical-relative:page;mso-wrap-style:none;mso-fit-shape-to-text:t;">
             <w10:wrap type="none"/>
             <v:textbox inset="0,0,0,0">
               <w:txbxContent>
@@ -2058,7 +2082,7 @@
       </w:r>
       <w:r>
         <w:pict>
-          <v:shape id="DocuMindTextBox76" type="#_x0000_t202" stroked="f" filled="f" o:allowincell="f" style="position:absolute;margin-left:57.636pt;margin-top:333.708pt;width:32.973pt;height:18.449pt;z-index:251659264;mso-position-horizontal-relative:page;mso-position-vertical-relative:page;mso-wrap-style:none;mso-fit-shape-to-text:t;">
+          <v:shape id="DocuMindTextBox79" type="#_x0000_t202" stroked="f" filled="f" o:allowincell="f" style="position:absolute;margin-left:57.636pt;margin-top:333.708pt;width:32.973pt;height:18.449pt;z-index:251659264;mso-position-horizontal-relative:page;mso-position-vertical-relative:page;mso-wrap-style:none;mso-fit-shape-to-text:t;">
             <w10:wrap type="none"/>
             <v:textbox inset="0,0,0,0">
               <w:txbxContent>
@@ -2085,7 +2109,7 @@
       </w:r>
       <w:r>
         <w:pict>
-          <v:shape id="DocuMindTextBox77" type="#_x0000_t202" stroked="f" filled="f" o:allowincell="f" style="position:absolute;margin-left:57.636pt;margin-top:345.107pt;width:32.973pt;height:18.449pt;z-index:251659264;mso-position-horizontal-relative:page;mso-position-vertical-relative:page;mso-wrap-style:none;mso-fit-shape-to-text:t;">
+          <v:shape id="DocuMindTextBox80" type="#_x0000_t202" stroked="f" filled="f" o:allowincell="f" style="position:absolute;margin-left:57.636pt;margin-top:345.107pt;width:32.973pt;height:18.449pt;z-index:251659264;mso-position-horizontal-relative:page;mso-position-vertical-relative:page;mso-wrap-style:none;mso-fit-shape-to-text:t;">
             <w10:wrap type="none"/>
             <v:textbox inset="0,0,0,0">
               <w:txbxContent>
@@ -2112,7 +2136,7 @@
       </w:r>
       <w:r>
         <w:pict>
-          <v:shape id="DocuMindTextBox78" type="#_x0000_t202" stroked="f" filled="f" o:allowincell="f" style="position:absolute;margin-left:93.632pt;margin-top:345.107pt;width:8.976pt;height:18.449pt;z-index:251659264;mso-position-horizontal-relative:page;mso-position-vertical-relative:page;mso-wrap-style:none;mso-fit-shape-to-text:t;">
+          <v:shape id="DocuMindTextBox81" type="#_x0000_t202" stroked="f" filled="f" o:allowincell="f" style="position:absolute;margin-left:93.632pt;margin-top:345.107pt;width:8.976pt;height:18.449pt;z-index:251659264;mso-position-horizontal-relative:page;mso-position-vertical-relative:page;mso-wrap-style:none;mso-fit-shape-to-text:t;">
             <w10:wrap type="none"/>
             <v:textbox inset="0,0,0,0">
               <w:txbxContent>
@@ -2139,7 +2163,7 @@
       </w:r>
       <w:r>
         <w:pict>
-          <v:shape id="DocuMindTextBox79" type="#_x0000_t202" stroked="f" filled="f" o:allowincell="f" style="position:absolute;margin-left:57.636pt;margin-top:356.386pt;width:38.973pt;height:18.449pt;z-index:251659264;mso-position-horizontal-relative:page;mso-position-vertical-relative:page;mso-wrap-style:none;mso-fit-shape-to-text:t;">
+          <v:shape id="DocuMindTextBox82" type="#_x0000_t202" stroked="f" filled="f" o:allowincell="f" style="position:absolute;margin-left:57.636pt;margin-top:356.386pt;width:38.973pt;height:18.449pt;z-index:251659264;mso-position-horizontal-relative:page;mso-position-vertical-relative:page;mso-wrap-style:none;mso-fit-shape-to-text:t;">
             <w10:wrap type="none"/>
             <v:textbox inset="0,0,0,0">
               <w:txbxContent>
@@ -2166,7 +2190,7 @@
       </w:r>
       <w:r>
         <w:pict>
-          <v:shape id="DocuMindTextBox80" type="#_x0000_t202" stroked="f" filled="f" o:allowincell="f" style="position:absolute;margin-left:99.632pt;margin-top:356.386pt;width:62.970pt;height:18.449pt;z-index:251659264;mso-position-horizontal-relative:page;mso-position-vertical-relative:page;mso-wrap-style:none;mso-fit-shape-to-text:t;">
+          <v:shape id="DocuMindTextBox83" type="#_x0000_t202" stroked="f" filled="f" o:allowincell="f" style="position:absolute;margin-left:99.632pt;margin-top:356.386pt;width:62.970pt;height:18.449pt;z-index:251659264;mso-position-horizontal-relative:page;mso-position-vertical-relative:page;mso-wrap-style:none;mso-fit-shape-to-text:t;">
             <w10:wrap type="none"/>
             <v:textbox inset="0,0,0,0">
               <w:txbxContent>
@@ -2193,7 +2217,7 @@
       </w:r>
       <w:r>
         <w:pict>
-          <v:shape id="DocuMindTextBox81" type="#_x0000_t202" stroked="f" filled="f" o:allowincell="f" style="position:absolute;margin-left:57.636pt;margin-top:367.786pt;width:56.971pt;height:18.449pt;z-index:251659264;mso-position-horizontal-relative:page;mso-position-vertical-relative:page;mso-wrap-style:none;mso-fit-shape-to-text:t;">
+          <v:shape id="DocuMindTextBox84" type="#_x0000_t202" stroked="f" filled="f" o:allowincell="f" style="position:absolute;margin-left:57.636pt;margin-top:367.786pt;width:56.971pt;height:18.449pt;z-index:251659264;mso-position-horizontal-relative:page;mso-position-vertical-relative:page;mso-wrap-style:none;mso-fit-shape-to-text:t;">
             <w10:wrap type="none"/>
             <v:textbox inset="0,0,0,0">
               <w:txbxContent>
@@ -2220,7 +2244,7 @@
       </w:r>
       <w:r>
         <w:pict>
-          <v:shape id="DocuMindTextBox82" type="#_x0000_t202" stroked="f" filled="f" o:allowincell="f" style="position:absolute;margin-left:57.636pt;margin-top:379.064pt;width:38.973pt;height:18.449pt;z-index:251659264;mso-position-horizontal-relative:page;mso-position-vertical-relative:page;mso-wrap-style:none;mso-fit-shape-to-text:t;">
+          <v:shape id="DocuMindTextBox85" type="#_x0000_t202" stroked="f" filled="f" o:allowincell="f" style="position:absolute;margin-left:57.636pt;margin-top:379.064pt;width:38.973pt;height:18.449pt;z-index:251659264;mso-position-horizontal-relative:page;mso-position-vertical-relative:page;mso-wrap-style:none;mso-fit-shape-to-text:t;">
             <w10:wrap type="none"/>
             <v:textbox inset="0,0,0,0">
               <w:txbxContent>
@@ -2247,7 +2271,7 @@
       </w:r>
       <w:r>
         <w:pict>
-          <v:shape id="DocuMindTextBox83" type="#_x0000_t202" stroked="f" filled="f" o:allowincell="f" style="position:absolute;margin-left:99.632pt;margin-top:379.064pt;width:68.970pt;height:18.449pt;z-index:251659264;mso-position-horizontal-relative:page;mso-position-vertical-relative:page;mso-wrap-style:none;mso-fit-shape-to-text:t;">
+          <v:shape id="DocuMindTextBox86" type="#_x0000_t202" stroked="f" filled="f" o:allowincell="f" style="position:absolute;margin-left:99.632pt;margin-top:379.064pt;width:68.970pt;height:18.449pt;z-index:251659264;mso-position-horizontal-relative:page;mso-position-vertical-relative:page;mso-wrap-style:none;mso-fit-shape-to-text:t;">
             <w10:wrap type="none"/>
             <v:textbox inset="0,0,0,0">
               <w:txbxContent>
@@ -2274,7 +2298,7 @@
       </w:r>
       <w:r>
         <w:pict>
-          <v:shape id="DocuMindTextBox84" type="#_x0000_t202" stroked="f" filled="f" o:allowincell="f" style="position:absolute;margin-left:57.636pt;margin-top:390.343pt;width:68.970pt;height:18.449pt;z-index:251659264;mso-position-horizontal-relative:page;mso-position-vertical-relative:page;mso-wrap-style:none;mso-fit-shape-to-text:t;">
+          <v:shape id="DocuMindTextBox87" type="#_x0000_t202" stroked="f" filled="f" o:allowincell="f" style="position:absolute;margin-left:57.636pt;margin-top:390.343pt;width:68.970pt;height:18.449pt;z-index:251659264;mso-position-horizontal-relative:page;mso-position-vertical-relative:page;mso-wrap-style:none;mso-fit-shape-to-text:t;">
             <w10:wrap type="none"/>
             <v:textbox inset="0,0,0,0">
               <w:txbxContent>
@@ -2301,7 +2325,7 @@
       </w:r>
       <w:r>
         <w:pict>
-          <v:shape id="DocuMindTextBox85" type="#_x0000_t202" stroked="f" filled="f" o:allowincell="f" style="position:absolute;margin-left:129.629pt;margin-top:390.343pt;width:20.974pt;height:18.449pt;z-index:251659264;mso-position-horizontal-relative:page;mso-position-vertical-relative:page;mso-wrap-style:none;mso-fit-shape-to-text:t;">
+          <v:shape id="DocuMindTextBox88" type="#_x0000_t202" stroked="f" filled="f" o:allowincell="f" style="position:absolute;margin-left:129.629pt;margin-top:390.343pt;width:20.974pt;height:18.449pt;z-index:251659264;mso-position-horizontal-relative:page;mso-position-vertical-relative:page;mso-wrap-style:none;mso-fit-shape-to-text:t;">
             <w10:wrap type="none"/>
             <v:textbox inset="0,0,0,0">
               <w:txbxContent>
@@ -2328,7 +2352,7 @@
       </w:r>
       <w:r>
         <w:pict>
-          <v:shape id="DocuMindTextBox86" type="#_x0000_t202" stroked="f" filled="f" o:allowincell="f" style="position:absolute;margin-left:153.627pt;margin-top:390.343pt;width:26.974pt;height:18.449pt;z-index:251659264;mso-position-horizontal-relative:page;mso-position-vertical-relative:page;mso-wrap-style:none;mso-fit-shape-to-text:t;">
+          <v:shape id="DocuMindTextBox89" type="#_x0000_t202" stroked="f" filled="f" o:allowincell="f" style="position:absolute;margin-left:153.627pt;margin-top:390.343pt;width:26.974pt;height:18.449pt;z-index:251659264;mso-position-horizontal-relative:page;mso-position-vertical-relative:page;mso-wrap-style:none;mso-fit-shape-to-text:t;">
             <w10:wrap type="none"/>
             <v:textbox inset="0,0,0,0">
               <w:txbxContent>
@@ -2355,7 +2379,7 @@
       </w:r>
       <w:r>
         <w:pict>
-          <v:shape id="DocuMindTextBox87" type="#_x0000_t202" stroked="f" filled="f" o:allowincell="f" style="position:absolute;margin-left:183.624pt;margin-top:390.343pt;width:14.975pt;height:18.449pt;z-index:251659264;mso-position-horizontal-relative:page;mso-position-vertical-relative:page;mso-wrap-style:none;mso-fit-shape-to-text:t;">
+          <v:shape id="DocuMindTextBox90" type="#_x0000_t202" stroked="f" filled="f" o:allowincell="f" style="position:absolute;margin-left:183.624pt;margin-top:390.343pt;width:14.975pt;height:18.449pt;z-index:251659264;mso-position-horizontal-relative:page;mso-position-vertical-relative:page;mso-wrap-style:none;mso-fit-shape-to-text:t;">
             <w10:wrap type="none"/>
             <v:textbox inset="0,0,0,0">
               <w:txbxContent>
@@ -2382,7 +2406,7 @@
       </w:r>
       <w:r>
         <w:pict>
-          <v:shape id="DocuMindTextBox88" type="#_x0000_t202" stroked="f" filled="f" o:allowincell="f" style="position:absolute;margin-left:57.636pt;margin-top:401.742pt;width:38.973pt;height:18.449pt;z-index:251659264;mso-position-horizontal-relative:page;mso-position-vertical-relative:page;mso-wrap-style:none;mso-fit-shape-to-text:t;">
+          <v:shape id="DocuMindTextBox91" type="#_x0000_t202" stroked="f" filled="f" o:allowincell="f" style="position:absolute;margin-left:57.636pt;margin-top:401.742pt;width:38.973pt;height:18.449pt;z-index:251659264;mso-position-horizontal-relative:page;mso-position-vertical-relative:page;mso-wrap-style:none;mso-fit-shape-to-text:t;">
             <w10:wrap type="none"/>
             <v:textbox inset="0,0,0,0">
               <w:txbxContent>
@@ -2409,7 +2433,7 @@
       </w:r>
       <w:r>
         <w:pict>
-          <v:shape id="DocuMindTextBox89" type="#_x0000_t202" stroked="f" filled="f" o:allowincell="f" style="position:absolute;margin-left:99.632pt;margin-top:401.742pt;width:62.970pt;height:18.449pt;z-index:251659264;mso-position-horizontal-relative:page;mso-position-vertical-relative:page;mso-wrap-style:none;mso-fit-shape-to-text:t;">
+          <v:shape id="DocuMindTextBox92" type="#_x0000_t202" stroked="f" filled="f" o:allowincell="f" style="position:absolute;margin-left:99.632pt;margin-top:401.742pt;width:62.970pt;height:18.449pt;z-index:251659264;mso-position-horizontal-relative:page;mso-position-vertical-relative:page;mso-wrap-style:none;mso-fit-shape-to-text:t;">
             <w10:wrap type="none"/>
             <v:textbox inset="0,0,0,0">
               <w:txbxContent>
@@ -2436,7 +2460,7 @@
       </w:r>
       <w:r>
         <w:pict>
-          <v:shape id="DocuMindTextBox90" type="#_x0000_t202" stroked="f" filled="f" o:allowincell="f" style="position:absolute;margin-left:57.636pt;margin-top:413.021pt;width:32.973pt;height:18.449pt;z-index:251659264;mso-position-horizontal-relative:page;mso-position-vertical-relative:page;mso-wrap-style:none;mso-fit-shape-to-text:t;">
+          <v:shape id="DocuMindTextBox93" type="#_x0000_t202" stroked="f" filled="f" o:allowincell="f" style="position:absolute;margin-left:57.636pt;margin-top:413.021pt;width:32.973pt;height:18.449pt;z-index:251659264;mso-position-horizontal-relative:page;mso-position-vertical-relative:page;mso-wrap-style:none;mso-fit-shape-to-text:t;">
             <w10:wrap type="none"/>
             <v:textbox inset="0,0,0,0">
               <w:txbxContent>
@@ -2463,7 +2487,7 @@
       </w:r>
       <w:r>
         <w:pict>
-          <v:shape id="DocuMindTextBox91" type="#_x0000_t202" stroked="f" filled="f" o:allowincell="f" style="position:absolute;margin-left:307.815pt;margin-top:112.790pt;width:135.080pt;height:20.999pt;z-index:251659264;mso-position-horizontal-relative:page;mso-position-vertical-relative:page;mso-wrap-style:none;mso-fit-shape-to-text:t;">
+          <v:shape id="DocuMindTextBox94" type="#_x0000_t202" stroked="f" filled="f" o:allowincell="f" style="position:absolute;margin-left:307.815pt;margin-top:112.790pt;width:135.080pt;height:20.999pt;z-index:251659264;mso-position-horizontal-relative:page;mso-position-vertical-relative:page;mso-wrap-style:none;mso-fit-shape-to-text:t;">
             <w10:wrap type="none"/>
             <v:textbox inset="0,0,0,0">
               <w:txbxContent>
@@ -2490,7 +2514,7 @@
       </w:r>
       <w:r>
         <w:pict>
-          <v:shape id="DocuMindTextBox92" type="#_x0000_t202" stroked="f" filled="f" o:allowincell="f" style="position:absolute;margin-left:307.815pt;margin-top:131.646pt;width:62.970pt;height:18.449pt;z-index:251659264;mso-position-horizontal-relative:page;mso-position-vertical-relative:page;mso-wrap-style:none;mso-fit-shape-to-text:t;">
+          <v:shape id="DocuMindTextBox95" type="#_x0000_t202" stroked="f" filled="f" o:allowincell="f" style="position:absolute;margin-left:307.815pt;margin-top:131.646pt;width:62.970pt;height:18.449pt;z-index:251659264;mso-position-horizontal-relative:page;mso-position-vertical-relative:page;mso-wrap-style:none;mso-fit-shape-to-text:t;">
             <w10:wrap type="none"/>
             <v:textbox inset="0,0,0,0">
               <w:txbxContent>
@@ -2517,7 +2541,7 @@
       </w:r>
       <w:r>
         <w:pict>
-          <v:shape id="DocuMindTextBox93" type="#_x0000_t202" stroked="f" filled="f" o:allowincell="f" style="position:absolute;margin-left:307.815pt;margin-top:143.045pt;width:50.971pt;height:18.449pt;z-index:251659264;mso-position-horizontal-relative:page;mso-position-vertical-relative:page;mso-wrap-style:none;mso-fit-shape-to-text:t;">
+          <v:shape id="DocuMindTextBox96" type="#_x0000_t202" stroked="f" filled="f" o:allowincell="f" style="position:absolute;margin-left:307.815pt;margin-top:143.045pt;width:50.971pt;height:18.449pt;z-index:251659264;mso-position-horizontal-relative:page;mso-position-vertical-relative:page;mso-wrap-style:none;mso-fit-shape-to-text:t;">
             <w10:wrap type="none"/>
             <v:textbox inset="0,0,0,0">
               <w:txbxContent>
@@ -2544,7 +2568,7 @@
       </w:r>
       <w:r>
         <w:pict>
-          <v:shape id="DocuMindTextBox94" type="#_x0000_t202" stroked="f" filled="f" o:allowincell="f" style="position:absolute;margin-left:361.810pt;margin-top:143.045pt;width:14.975pt;height:18.449pt;z-index:251659264;mso-position-horizontal-relative:page;mso-position-vertical-relative:page;mso-wrap-style:none;mso-fit-shape-to-text:t;">
+          <v:shape id="DocuMindTextBox97" type="#_x0000_t202" stroked="f" filled="f" o:allowincell="f" style="position:absolute;margin-left:361.810pt;margin-top:143.045pt;width:14.975pt;height:18.449pt;z-index:251659264;mso-position-horizontal-relative:page;mso-position-vertical-relative:page;mso-wrap-style:none;mso-fit-shape-to-text:t;">
             <w10:wrap type="none"/>
             <v:textbox inset="0,0,0,0">
               <w:txbxContent>
@@ -2571,7 +2595,7 @@
       </w:r>
       <w:r>
         <w:pict>
-          <v:shape id="DocuMindTextBox95" type="#_x0000_t202" stroked="f" filled="f" o:allowincell="f" style="position:absolute;margin-left:379.808pt;margin-top:143.045pt;width:38.973pt;height:18.449pt;z-index:251659264;mso-position-horizontal-relative:page;mso-position-vertical-relative:page;mso-wrap-style:none;mso-fit-shape-to-text:t;">
+          <v:shape id="DocuMindTextBox98" type="#_x0000_t202" stroked="f" filled="f" o:allowincell="f" style="position:absolute;margin-left:379.808pt;margin-top:143.045pt;width:38.973pt;height:18.449pt;z-index:251659264;mso-position-horizontal-relative:page;mso-position-vertical-relative:page;mso-wrap-style:none;mso-fit-shape-to-text:t;">
             <w10:wrap type="none"/>
             <v:textbox inset="0,0,0,0">
               <w:txbxContent>
@@ -2598,7 +2622,7 @@
       </w:r>
       <w:r>
         <w:pict>
-          <v:shape id="DocuMindTextBox96" type="#_x0000_t202" stroked="f" filled="f" o:allowincell="f" style="position:absolute;margin-left:307.815pt;margin-top:154.324pt;width:86.968pt;height:18.449pt;z-index:251659264;mso-position-horizontal-relative:page;mso-position-vertical-relative:page;mso-wrap-style:none;mso-fit-shape-to-text:t;">
+          <v:shape id="DocuMindTextBox99" type="#_x0000_t202" stroked="f" filled="f" o:allowincell="f" style="position:absolute;margin-left:307.815pt;margin-top:154.324pt;width:86.968pt;height:18.449pt;z-index:251659264;mso-position-horizontal-relative:page;mso-position-vertical-relative:page;mso-wrap-style:none;mso-fit-shape-to-text:t;">
             <w10:wrap type="none"/>
             <v:textbox inset="0,0,0,0">
               <w:txbxContent>
@@ -2625,7 +2649,7 @@
       </w:r>
       <w:r>
         <w:pict>
-          <v:shape id="DocuMindTextBox97" type="#_x0000_t202" stroked="f" filled="f" o:allowincell="f" style="position:absolute;margin-left:307.815pt;margin-top:165.603pt;width:38.973pt;height:18.449pt;z-index:251659264;mso-position-horizontal-relative:page;mso-position-vertical-relative:page;mso-wrap-style:none;mso-fit-shape-to-text:t;">
+          <v:shape id="DocuMindTextBox100" type="#_x0000_t202" stroked="f" filled="f" o:allowincell="f" style="position:absolute;margin-left:307.815pt;margin-top:165.603pt;width:38.973pt;height:18.449pt;z-index:251659264;mso-position-horizontal-relative:page;mso-position-vertical-relative:page;mso-wrap-style:none;mso-fit-shape-to-text:t;">
             <w10:wrap type="none"/>
             <v:textbox inset="0,0,0,0">
               <w:txbxContent>
@@ -2652,7 +2676,7 @@
       </w:r>
       <w:r>
         <w:pict>
-          <v:shape id="DocuMindTextBox98" type="#_x0000_t202" stroked="f" filled="f" o:allowincell="f" style="position:absolute;margin-left:307.815pt;margin-top:177.002pt;width:50.971pt;height:18.449pt;z-index:251659264;mso-position-horizontal-relative:page;mso-position-vertical-relative:page;mso-wrap-style:none;mso-fit-shape-to-text:t;">
+          <v:shape id="DocuMindTextBox101" type="#_x0000_t202" stroked="f" filled="f" o:allowincell="f" style="position:absolute;margin-left:307.815pt;margin-top:177.002pt;width:50.971pt;height:18.449pt;z-index:251659264;mso-position-horizontal-relative:page;mso-position-vertical-relative:page;mso-wrap-style:none;mso-fit-shape-to-text:t;">
             <w10:wrap type="none"/>
             <v:textbox inset="0,0,0,0">
               <w:txbxContent>
@@ -2679,7 +2703,7 @@
       </w:r>
       <w:r>
         <w:pict>
-          <v:shape id="DocuMindTextBox99" type="#_x0000_t202" stroked="f" filled="f" o:allowincell="f" style="position:absolute;margin-left:361.810pt;margin-top:177.002pt;width:14.975pt;height:18.449pt;z-index:251659264;mso-position-horizontal-relative:page;mso-position-vertical-relative:page;mso-wrap-style:none;mso-fit-shape-to-text:t;">
+          <v:shape id="DocuMindTextBox102" type="#_x0000_t202" stroked="f" filled="f" o:allowincell="f" style="position:absolute;margin-left:361.810pt;margin-top:177.002pt;width:14.975pt;height:18.449pt;z-index:251659264;mso-position-horizontal-relative:page;mso-position-vertical-relative:page;mso-wrap-style:none;mso-fit-shape-to-text:t;">
             <w10:wrap type="none"/>
             <v:textbox inset="0,0,0,0">
               <w:txbxContent>
@@ -2706,7 +2730,7 @@
       </w:r>
       <w:r>
         <w:pict>
-          <v:shape id="DocuMindTextBox100" type="#_x0000_t202" stroked="f" filled="f" o:allowincell="f" style="position:absolute;margin-left:379.808pt;margin-top:177.002pt;width:26.974pt;height:18.449pt;z-index:251659264;mso-position-horizontal-relative:page;mso-position-vertical-relative:page;mso-wrap-style:none;mso-fit-shape-to-text:t;">
+          <v:shape id="DocuMindTextBox103" type="#_x0000_t202" stroked="f" filled="f" o:allowincell="f" style="position:absolute;margin-left:379.808pt;margin-top:177.002pt;width:26.974pt;height:18.449pt;z-index:251659264;mso-position-horizontal-relative:page;mso-position-vertical-relative:page;mso-wrap-style:none;mso-fit-shape-to-text:t;">
             <w10:wrap type="none"/>
             <v:textbox inset="0,0,0,0">
               <w:txbxContent>
@@ -2733,7 +2757,7 @@
       </w:r>
       <w:r>
         <w:pict>
-          <v:shape id="DocuMindTextBox101" type="#_x0000_t202" stroked="f" filled="f" o:allowincell="f" style="position:absolute;margin-left:409.805pt;margin-top:177.002pt;width:38.973pt;height:18.449pt;z-index:251659264;mso-position-horizontal-relative:page;mso-position-vertical-relative:page;mso-wrap-style:none;mso-fit-shape-to-text:t;">
+          <v:shape id="DocuMindTextBox104" type="#_x0000_t202" stroked="f" filled="f" o:allowincell="f" style="position:absolute;margin-left:409.805pt;margin-top:177.002pt;width:38.973pt;height:18.449pt;z-index:251659264;mso-position-horizontal-relative:page;mso-position-vertical-relative:page;mso-wrap-style:none;mso-fit-shape-to-text:t;">
             <w10:wrap type="none"/>
             <v:textbox inset="0,0,0,0">
               <w:txbxContent>
@@ -2760,7 +2784,7 @@
       </w:r>
       <w:r>
         <w:pict>
-          <v:shape id="DocuMindTextBox102" type="#_x0000_t202" stroked="f" filled="f" o:allowincell="f" style="position:absolute;margin-left:307.815pt;margin-top:188.281pt;width:86.968pt;height:18.449pt;z-index:251659264;mso-position-horizontal-relative:page;mso-position-vertical-relative:page;mso-wrap-style:none;mso-fit-shape-to-text:t;">
+          <v:shape id="DocuMindTextBox105" type="#_x0000_t202" stroked="f" filled="f" o:allowincell="f" style="position:absolute;margin-left:307.815pt;margin-top:188.281pt;width:86.968pt;height:18.449pt;z-index:251659264;mso-position-horizontal-relative:page;mso-position-vertical-relative:page;mso-wrap-style:none;mso-fit-shape-to-text:t;">
             <w10:wrap type="none"/>
             <v:textbox inset="0,0,0,0">
               <w:txbxContent>
@@ -2787,7 +2811,7 @@
       </w:r>
       <w:r>
         <w:pict>
-          <v:shape id="DocuMindTextBox103" type="#_x0000_t202" stroked="f" filled="f" o:allowincell="f" style="position:absolute;margin-left:307.815pt;margin-top:199.680pt;width:50.971pt;height:18.449pt;z-index:251659264;mso-position-horizontal-relative:page;mso-position-vertical-relative:page;mso-wrap-style:none;mso-fit-shape-to-text:t;">
+          <v:shape id="DocuMindTextBox106" type="#_x0000_t202" stroked="f" filled="f" o:allowincell="f" style="position:absolute;margin-left:307.815pt;margin-top:199.680pt;width:50.971pt;height:18.449pt;z-index:251659264;mso-position-horizontal-relative:page;mso-position-vertical-relative:page;mso-wrap-style:none;mso-fit-shape-to-text:t;">
             <w10:wrap type="none"/>
             <v:textbox inset="0,0,0,0">
               <w:txbxContent>
@@ -2814,7 +2838,7 @@
       </w:r>
       <w:r>
         <w:pict>
-          <v:shape id="DocuMindTextBox104" type="#_x0000_t202" stroked="f" filled="f" o:allowincell="f" style="position:absolute;margin-left:307.815pt;margin-top:210.959pt;width:50.971pt;height:18.449pt;z-index:251659264;mso-position-horizontal-relative:page;mso-position-vertical-relative:page;mso-wrap-style:none;mso-fit-shape-to-text:t;">
+          <v:shape id="DocuMindTextBox107" type="#_x0000_t202" stroked="f" filled="f" o:allowincell="f" style="position:absolute;margin-left:307.815pt;margin-top:210.959pt;width:50.971pt;height:18.449pt;z-index:251659264;mso-position-horizontal-relative:page;mso-position-vertical-relative:page;mso-wrap-style:none;mso-fit-shape-to-text:t;">
             <w10:wrap type="none"/>
             <v:textbox inset="0,0,0,0">
               <w:txbxContent>
@@ -2841,7 +2865,7 @@
       </w:r>
       <w:r>
         <w:pict>
-          <v:shape id="DocuMindTextBox105" type="#_x0000_t202" stroked="f" filled="f" o:allowincell="f" style="position:absolute;margin-left:361.810pt;margin-top:210.959pt;width:14.975pt;height:18.449pt;z-index:251659264;mso-position-horizontal-relative:page;mso-position-vertical-relative:page;mso-wrap-style:none;mso-fit-shape-to-text:t;">
+          <v:shape id="DocuMindTextBox108" type="#_x0000_t202" stroked="f" filled="f" o:allowincell="f" style="position:absolute;margin-left:361.810pt;margin-top:210.959pt;width:14.975pt;height:18.449pt;z-index:251659264;mso-position-horizontal-relative:page;mso-position-vertical-relative:page;mso-wrap-style:none;mso-fit-shape-to-text:t;">
             <w10:wrap type="none"/>
             <v:textbox inset="0,0,0,0">
               <w:txbxContent>
@@ -2868,7 +2892,7 @@
       </w:r>
       <w:r>
         <w:pict>
-          <v:shape id="DocuMindTextBox106" type="#_x0000_t202" stroked="f" filled="f" o:allowincell="f" style="position:absolute;margin-left:379.808pt;margin-top:210.959pt;width:68.970pt;height:18.449pt;z-index:251659264;mso-position-horizontal-relative:page;mso-position-vertical-relative:page;mso-wrap-style:none;mso-fit-shape-to-text:t;">
+          <v:shape id="DocuMindTextBox109" type="#_x0000_t202" stroked="f" filled="f" o:allowincell="f" style="position:absolute;margin-left:379.808pt;margin-top:210.959pt;width:68.970pt;height:18.449pt;z-index:251659264;mso-position-horizontal-relative:page;mso-position-vertical-relative:page;mso-wrap-style:none;mso-fit-shape-to-text:t;">
             <w10:wrap type="none"/>
             <v:textbox inset="0,0,0,0">
               <w:txbxContent>
@@ -2895,7 +2919,7 @@
       </w:r>
       <w:r>
         <w:pict>
-          <v:shape id="DocuMindTextBox107" type="#_x0000_t202" stroked="f" filled="f" o:allowincell="f" style="position:absolute;margin-left:451.801pt;margin-top:210.959pt;width:50.971pt;height:18.449pt;z-index:251659264;mso-position-horizontal-relative:page;mso-position-vertical-relative:page;mso-wrap-style:none;mso-fit-shape-to-text:t;">
+          <v:shape id="DocuMindTextBox110" type="#_x0000_t202" stroked="f" filled="f" o:allowincell="f" style="position:absolute;margin-left:451.801pt;margin-top:210.959pt;width:50.971pt;height:18.449pt;z-index:251659264;mso-position-horizontal-relative:page;mso-position-vertical-relative:page;mso-wrap-style:none;mso-fit-shape-to-text:t;">
             <w10:wrap type="none"/>
             <v:textbox inset="0,0,0,0">
               <w:txbxContent>
@@ -2922,7 +2946,7 @@
       </w:r>
       <w:r>
         <w:pict>
-          <v:shape id="DocuMindTextBox108" type="#_x0000_t202" stroked="f" filled="f" o:allowincell="f" style="position:absolute;margin-left:307.815pt;margin-top:222.238pt;width:98.967pt;height:18.449pt;z-index:251659264;mso-position-horizontal-relative:page;mso-position-vertical-relative:page;mso-wrap-style:none;mso-fit-shape-to-text:t;">
+          <v:shape id="DocuMindTextBox111" type="#_x0000_t202" stroked="f" filled="f" o:allowincell="f" style="position:absolute;margin-left:307.815pt;margin-top:222.238pt;width:98.967pt;height:18.449pt;z-index:251659264;mso-position-horizontal-relative:page;mso-position-vertical-relative:page;mso-wrap-style:none;mso-fit-shape-to-text:t;">
             <w10:wrap type="none"/>
             <v:textbox inset="0,0,0,0">
               <w:txbxContent>
@@ -2949,7 +2973,7 @@
       </w:r>
       <w:r>
         <w:pict>
-          <v:shape id="DocuMindTextBox109" type="#_x0000_t202" stroked="f" filled="f" o:allowincell="f" style="position:absolute;margin-left:57.636pt;margin-top:433.193pt;width:293.605pt;height:19.799pt;z-index:251659264;mso-position-horizontal-relative:page;mso-position-vertical-relative:page;mso-wrap-style:none;mso-fit-shape-to-text:t;">
+          <v:shape id="DocuMindTextBox112" type="#_x0000_t202" stroked="f" filled="f" o:allowincell="f" style="position:absolute;margin-left:57.636pt;margin-top:433.193pt;width:293.605pt;height:19.799pt;z-index:251659264;mso-position-horizontal-relative:page;mso-position-vertical-relative:page;mso-wrap-style:none;mso-fit-shape-to-text:t;">
             <w10:wrap type="none"/>
             <v:textbox inset="0,0,0,0">
               <w:txbxContent>
@@ -2976,7 +3000,7 @@
       </w:r>
       <w:r>
         <w:pict>
-          <v:shape id="DocuMindTextBox110" type="#_x0000_t202" stroked="f" filled="f" o:allowincell="f" style="position:absolute;margin-left:57.636pt;margin-top:453.762pt;width:10.049pt;height:18.977pt;z-index:251659264;mso-position-horizontal-relative:page;mso-position-vertical-relative:page;mso-wrap-style:none;mso-fit-shape-to-text:t;">
+          <v:shape id="DocuMindTextBox113" type="#_x0000_t202" stroked="f" filled="f" o:allowincell="f" style="position:absolute;margin-left:57.636pt;margin-top:453.762pt;width:10.049pt;height:18.977pt;z-index:251659264;mso-position-horizontal-relative:page;mso-position-vertical-relative:page;mso-wrap-style:none;mso-fit-shape-to-text:t;">
             <w10:wrap type="none"/>
             <v:textbox inset="0,0,0,0">
               <w:txbxContent>
@@ -3003,7 +3027,7 @@
       </w:r>
       <w:r>
         <w:pict>
-          <v:shape id="DocuMindTextBox111" type="#_x0000_t202" stroked="f" filled="f" o:allowincell="f" style="position:absolute;margin-left:75.634pt;margin-top:453.831pt;width:181.597pt;height:19.799pt;z-index:251659264;mso-position-horizontal-relative:page;mso-position-vertical-relative:page;mso-wrap-style:none;mso-fit-shape-to-text:t;">
+          <v:shape id="DocuMindTextBox114" type="#_x0000_t202" stroked="f" filled="f" o:allowincell="f" style="position:absolute;margin-left:75.634pt;margin-top:453.831pt;width:181.597pt;height:19.799pt;z-index:251659264;mso-position-horizontal-relative:page;mso-position-vertical-relative:page;mso-wrap-style:none;mso-fit-shape-to-text:t;">
             <w10:wrap type="none"/>
             <v:textbox inset="0,0,0,0">
               <w:txbxContent>
@@ -3030,7 +3054,7 @@
       </w:r>
       <w:r>
         <w:pict>
-          <v:shape id="DocuMindTextBox112" type="#_x0000_t202" stroked="f" filled="f" o:allowincell="f" style="position:absolute;margin-left:57.636pt;margin-top:474.401pt;width:10.049pt;height:18.977pt;z-index:251659264;mso-position-horizontal-relative:page;mso-position-vertical-relative:page;mso-wrap-style:none;mso-fit-shape-to-text:t;">
+          <v:shape id="DocuMindTextBox115" type="#_x0000_t202" stroked="f" filled="f" o:allowincell="f" style="position:absolute;margin-left:57.636pt;margin-top:474.401pt;width:10.049pt;height:18.977pt;z-index:251659264;mso-position-horizontal-relative:page;mso-position-vertical-relative:page;mso-wrap-style:none;mso-fit-shape-to-text:t;">
             <w10:wrap type="none"/>
             <v:textbox inset="0,0,0,0">
               <w:txbxContent>
@@ -3057,7 +3081,7 @@
       </w:r>
       <w:r>
         <w:pict>
-          <v:shape id="DocuMindTextBox113" type="#_x0000_t202" stroked="f" filled="f" o:allowincell="f" style="position:absolute;margin-left:75.634pt;margin-top:474.469pt;width:204.689pt;height:19.799pt;z-index:251659264;mso-position-horizontal-relative:page;mso-position-vertical-relative:page;mso-wrap-style:none;mso-fit-shape-to-text:t;">
+          <v:shape id="DocuMindTextBox116" type="#_x0000_t202" stroked="f" filled="f" o:allowincell="f" style="position:absolute;margin-left:75.634pt;margin-top:474.469pt;width:204.689pt;height:19.799pt;z-index:251659264;mso-position-horizontal-relative:page;mso-position-vertical-relative:page;mso-wrap-style:none;mso-fit-shape-to-text:t;">
             <w10:wrap type="none"/>
             <v:textbox inset="0,0,0,0">
               <w:txbxContent>
@@ -3084,7 +3108,7 @@
       </w:r>
       <w:r>
         <w:pict>
-          <v:shape id="DocuMindTextBox114" type="#_x0000_t202" stroked="f" filled="f" o:allowincell="f" style="position:absolute;margin-left:57.636pt;margin-top:495.039pt;width:10.049pt;height:18.977pt;z-index:251659264;mso-position-horizontal-relative:page;mso-position-vertical-relative:page;mso-wrap-style:none;mso-fit-shape-to-text:t;">
+          <v:shape id="DocuMindTextBox117" type="#_x0000_t202" stroked="f" filled="f" o:allowincell="f" style="position:absolute;margin-left:57.636pt;margin-top:495.039pt;width:10.049pt;height:18.977pt;z-index:251659264;mso-position-horizontal-relative:page;mso-position-vertical-relative:page;mso-wrap-style:none;mso-fit-shape-to-text:t;">
             <w10:wrap type="none"/>
             <v:textbox inset="0,0,0,0">
               <w:txbxContent>
@@ -3111,7 +3135,7 @@
       </w:r>
       <w:r>
         <w:pict>
-          <v:shape id="DocuMindTextBox115" type="#_x0000_t202" stroked="f" filled="f" o:allowincell="f" style="position:absolute;margin-left:75.634pt;margin-top:495.107pt;width:259.964pt;height:19.799pt;z-index:251659264;mso-position-horizontal-relative:page;mso-position-vertical-relative:page;mso-wrap-style:none;mso-fit-shape-to-text:t;">
+          <v:shape id="DocuMindTextBox118" type="#_x0000_t202" stroked="f" filled="f" o:allowincell="f" style="position:absolute;margin-left:75.634pt;margin-top:495.107pt;width:259.964pt;height:19.799pt;z-index:251659264;mso-position-horizontal-relative:page;mso-position-vertical-relative:page;mso-wrap-style:none;mso-fit-shape-to-text:t;">
             <w10:wrap type="none"/>
             <v:textbox inset="0,0,0,0">
               <w:txbxContent>
@@ -3158,7 +3182,15 @@
       </w:r>
       <w:r>
         <w:pict>
-          <v:shape id="DocuMindTextBox116" type="#_x0000_t202" stroked="f" filled="f" o:allowincell="f" style="position:absolute;margin-left:57.636pt;margin-top:734.050pt;width:99.713pt;height:17.249pt;z-index:251659264;mso-position-horizontal-relative:page;mso-position-vertical-relative:page;mso-wrap-style:none;mso-fit-shape-to-text:t;">
+          <v:shape id="DocuMindImage119" type="#_x0000_t75" stroked="f" o:allowincell="f" style="position:absolute;margin-left:57.636pt;margin-top:35.997pt;width:70.914pt;height:48.236pt;z-index:1;mso-position-horizontal-relative:page;mso-position-vertical-relative:page;mso-wrap-style:none;">
+            <w10:wrap type="none"/>
+            <v:imagedata r:id="rId9" o:title=""/>
+          </v:shape>
+        </w:pict>
+      </w:r>
+      <w:r>
+        <w:pict>
+          <v:shape id="DocuMindTextBox120" type="#_x0000_t202" stroked="f" filled="f" o:allowincell="f" style="position:absolute;margin-left:57.636pt;margin-top:734.050pt;width:99.713pt;height:17.249pt;z-index:251659264;mso-position-horizontal-relative:page;mso-position-vertical-relative:page;mso-wrap-style:none;mso-fit-shape-to-text:t;">
             <w10:wrap type="none"/>
             <v:textbox inset="0,0,0,0">
               <w:txbxContent>
@@ -3185,7 +3217,7 @@
       </w:r>
       <w:r>
         <w:pict>
-          <v:shape id="DocuMindTextBox117" type="#_x0000_t202" stroked="f" filled="f" o:allowincell="f" style="position:absolute;margin-left:475.799pt;margin-top:734.050pt;width:51.695pt;height:17.249pt;z-index:251659264;mso-position-horizontal-relative:page;mso-position-vertical-relative:page;mso-wrap-style:none;mso-fit-shape-to-text:t;">
+          <v:shape id="DocuMindTextBox121" type="#_x0000_t202" stroked="f" filled="f" o:allowincell="f" style="position:absolute;margin-left:475.799pt;margin-top:734.050pt;width:51.695pt;height:17.249pt;z-index:251659264;mso-position-horizontal-relative:page;mso-position-vertical-relative:page;mso-wrap-style:none;mso-fit-shape-to-text:t;">
             <w10:wrap type="none"/>
             <v:textbox inset="0,0,0,0">
               <w:txbxContent>
@@ -3212,7 +3244,7 @@
       </w:r>
       <w:r>
         <w:pict>
-          <v:shape id="DocuMindTextBox118" type="#_x0000_t202" stroked="f" filled="f" o:allowincell="f" style="position:absolute;margin-left:57.636pt;margin-top:117.064pt;width:92.681pt;height:23.549pt;z-index:251659264;mso-position-horizontal-relative:page;mso-position-vertical-relative:page;mso-wrap-style:none;mso-fit-shape-to-text:t;">
+          <v:shape id="DocuMindTextBox122" type="#_x0000_t202" stroked="f" filled="f" o:allowincell="f" style="position:absolute;margin-left:57.636pt;margin-top:117.064pt;width:92.681pt;height:23.549pt;z-index:251659264;mso-position-horizontal-relative:page;mso-position-vertical-relative:page;mso-wrap-style:none;mso-fit-shape-to-text:t;">
             <w10:wrap type="none"/>
             <v:textbox inset="0,0,0,0">
               <w:txbxContent>
@@ -3239,7 +3271,7 @@
       </w:r>
       <w:r>
         <w:pict>
-          <v:shape id="DocuMindTextBox119" type="#_x0000_t202" stroked="f" filled="f" o:allowincell="f" style="position:absolute;margin-left:57.636pt;margin-top:139.097pt;width:157.228pt;height:19.799pt;z-index:251659264;mso-position-horizontal-relative:page;mso-position-vertical-relative:page;mso-wrap-style:none;mso-fit-shape-to-text:t;">
+          <v:shape id="DocuMindTextBox123" type="#_x0000_t202" stroked="f" filled="f" o:allowincell="f" style="position:absolute;margin-left:57.636pt;margin-top:139.097pt;width:157.228pt;height:19.799pt;z-index:251659264;mso-position-horizontal-relative:page;mso-position-vertical-relative:page;mso-wrap-style:none;mso-fit-shape-to-text:t;">
             <w10:wrap type="none"/>
             <v:textbox inset="0,0,0,0">
               <w:txbxContent>
@@ -3266,7 +3298,7 @@
       </w:r>
       <w:r>
         <w:pict>
-          <v:shape id="DocuMindTextBox120" type="#_x0000_t202" stroked="f" filled="f" o:allowincell="f" style="position:absolute;margin-left:63.035pt;margin-top:171.014pt;width:53.820pt;height:19.799pt;z-index:251659264;mso-position-horizontal-relative:page;mso-position-vertical-relative:page;mso-wrap-style:none;mso-fit-shape-to-text:t;">
+          <v:shape id="DocuMindTextBox124" type="#_x0000_t202" stroked="f" filled="f" o:allowincell="f" style="position:absolute;margin-left:63.035pt;margin-top:171.014pt;width:53.820pt;height:19.799pt;z-index:251659264;mso-position-horizontal-relative:page;mso-position-vertical-relative:page;mso-wrap-style:none;mso-fit-shape-to-text:t;">
             <w10:wrap type="none"/>
             <v:textbox inset="0,0,0,0">
               <w:txbxContent>
@@ -3293,7 +3325,7 @@
       </w:r>
       <w:r>
         <w:pict>
-          <v:shape id="DocuMindTextBox121" type="#_x0000_t202" stroked="f" filled="f" o:allowincell="f" style="position:absolute;margin-left:225.022pt;margin-top:171.014pt;width:66.662pt;height:19.799pt;z-index:251659264;mso-position-horizontal-relative:page;mso-position-vertical-relative:page;mso-wrap-style:none;mso-fit-shape-to-text:t;">
+          <v:shape id="DocuMindTextBox125" type="#_x0000_t202" stroked="f" filled="f" o:allowincell="f" style="position:absolute;margin-left:225.022pt;margin-top:171.014pt;width:66.662pt;height:19.799pt;z-index:251659264;mso-position-horizontal-relative:page;mso-position-vertical-relative:page;mso-wrap-style:none;mso-fit-shape-to-text:t;">
             <w10:wrap type="none"/>
             <v:textbox inset="0,0,0,0">
               <w:txbxContent>
@@ -3320,7 +3352,7 @@
       </w:r>
       <w:r>
         <w:pict>
-          <v:shape id="DocuMindTextBox122" type="#_x0000_t202" stroked="f" filled="f" o:allowincell="f" style="position:absolute;margin-left:63.035pt;margin-top:194.172pt;width:93.489pt;height:19.799pt;z-index:251659264;mso-position-horizontal-relative:page;mso-position-vertical-relative:page;mso-wrap-style:none;mso-fit-shape-to-text:t;">
+          <v:shape id="DocuMindTextBox126" type="#_x0000_t202" stroked="f" filled="f" o:allowincell="f" style="position:absolute;margin-left:63.035pt;margin-top:194.172pt;width:93.489pt;height:19.799pt;z-index:251659264;mso-position-horizontal-relative:page;mso-position-vertical-relative:page;mso-wrap-style:none;mso-fit-shape-to-text:t;">
             <w10:wrap type="none"/>
             <v:textbox inset="0,0,0,0">
               <w:txbxContent>
@@ -3347,7 +3379,7 @@
       </w:r>
       <w:r>
         <w:pict>
-          <v:shape id="DocuMindTextBox123" type="#_x0000_t202" stroked="f" filled="f" o:allowincell="f" style="position:absolute;margin-left:224.971pt;margin-top:194.172pt;width:108.893pt;height:19.799pt;z-index:251659264;mso-position-horizontal-relative:page;mso-position-vertical-relative:page;mso-wrap-style:none;mso-fit-shape-to-text:t;">
+          <v:shape id="DocuMindTextBox127" type="#_x0000_t202" stroked="f" filled="f" o:allowincell="f" style="position:absolute;margin-left:224.971pt;margin-top:194.172pt;width:108.893pt;height:19.799pt;z-index:251659264;mso-position-horizontal-relative:page;mso-position-vertical-relative:page;mso-wrap-style:none;mso-fit-shape-to-text:t;">
             <w10:wrap type="none"/>
             <v:textbox inset="0,0,0,0">
               <w:txbxContent>
@@ -3374,7 +3406,7 @@
       </w:r>
       <w:r>
         <w:pict>
-          <v:shape id="DocuMindTextBox124" type="#_x0000_t202" stroked="f" filled="f" o:allowincell="f" style="position:absolute;margin-left:63.035pt;margin-top:217.211pt;width:94.183pt;height:19.799pt;z-index:251659264;mso-position-horizontal-relative:page;mso-position-vertical-relative:page;mso-wrap-style:none;mso-fit-shape-to-text:t;">
+          <v:shape id="DocuMindTextBox128" type="#_x0000_t202" stroked="f" filled="f" o:allowincell="f" style="position:absolute;margin-left:63.035pt;margin-top:217.211pt;width:94.183pt;height:19.799pt;z-index:251659264;mso-position-horizontal-relative:page;mso-position-vertical-relative:page;mso-wrap-style:none;mso-fit-shape-to-text:t;">
             <w10:wrap type="none"/>
             <v:textbox inset="0,0,0,0">
               <w:txbxContent>
@@ -3401,7 +3433,7 @@
       </w:r>
       <w:r>
         <w:pict>
-          <v:shape id="DocuMindTextBox125" type="#_x0000_t202" stroked="f" filled="f" o:allowincell="f" style="position:absolute;margin-left:224.945pt;margin-top:217.211pt;width:191.441pt;height:19.799pt;z-index:251659264;mso-position-horizontal-relative:page;mso-position-vertical-relative:page;mso-wrap-style:none;mso-fit-shape-to-text:t;">
+          <v:shape id="DocuMindTextBox129" type="#_x0000_t202" stroked="f" filled="f" o:allowincell="f" style="position:absolute;margin-left:224.945pt;margin-top:217.211pt;width:191.441pt;height:19.799pt;z-index:251659264;mso-position-horizontal-relative:page;mso-position-vertical-relative:page;mso-wrap-style:none;mso-fit-shape-to-text:t;">
             <w10:wrap type="none"/>
             <v:textbox inset="0,0,0,0">
               <w:txbxContent>
@@ -3428,7 +3460,7 @@
       </w:r>
       <w:r>
         <w:pict>
-          <v:shape id="DocuMindTextBox126" type="#_x0000_t202" stroked="f" filled="f" o:allowincell="f" style="position:absolute;margin-left:63.035pt;margin-top:240.129pt;width:91.041pt;height:19.799pt;z-index:251659264;mso-position-horizontal-relative:page;mso-position-vertical-relative:page;mso-wrap-style:none;mso-fit-shape-to-text:t;">
+          <v:shape id="DocuMindTextBox130" type="#_x0000_t202" stroked="f" filled="f" o:allowincell="f" style="position:absolute;margin-left:63.035pt;margin-top:240.129pt;width:91.041pt;height:19.799pt;z-index:251659264;mso-position-horizontal-relative:page;mso-position-vertical-relative:page;mso-wrap-style:none;mso-fit-shape-to-text:t;">
             <w10:wrap type="none"/>
             <v:textbox inset="0,0,0,0">
               <w:txbxContent>
@@ -3455,7 +3487,7 @@
       </w:r>
       <w:r>
         <w:pict>
-          <v:shape id="DocuMindTextBox127" type="#_x0000_t202" stroked="f" filled="f" o:allowincell="f" style="position:absolute;margin-left:224.924pt;margin-top:240.129pt;width:167.616pt;height:19.799pt;z-index:251659264;mso-position-horizontal-relative:page;mso-position-vertical-relative:page;mso-wrap-style:none;mso-fit-shape-to-text:t;">
+          <v:shape id="DocuMindTextBox131" type="#_x0000_t202" stroked="f" filled="f" o:allowincell="f" style="position:absolute;margin-left:224.924pt;margin-top:240.129pt;width:167.616pt;height:19.799pt;z-index:251659264;mso-position-horizontal-relative:page;mso-position-vertical-relative:page;mso-wrap-style:none;mso-fit-shape-to-text:t;">
             <w10:wrap type="none"/>
             <v:textbox inset="0,0,0,0">
               <w:txbxContent>
@@ -3482,7 +3514,7 @@
       </w:r>
       <w:r>
         <w:pict>
-          <v:shape id="DocuMindTextBox128" type="#_x0000_t202" stroked="f" filled="f" o:allowincell="f" style="position:absolute;margin-left:63.035pt;margin-top:263.167pt;width:96.584pt;height:19.799pt;z-index:251659264;mso-position-horizontal-relative:page;mso-position-vertical-relative:page;mso-wrap-style:none;mso-fit-shape-to-text:t;">
+          <v:shape id="DocuMindTextBox132" type="#_x0000_t202" stroked="f" filled="f" o:allowincell="f" style="position:absolute;margin-left:63.035pt;margin-top:263.167pt;width:96.584pt;height:19.799pt;z-index:251659264;mso-position-horizontal-relative:page;mso-position-vertical-relative:page;mso-wrap-style:none;mso-fit-shape-to-text:t;">
             <w10:wrap type="none"/>
             <v:textbox inset="0,0,0,0">
               <w:txbxContent>
@@ -3509,7 +3541,7 @@
       </w:r>
       <w:r>
         <w:pict>
-          <v:shape id="DocuMindTextBox129" type="#_x0000_t202" stroked="f" filled="f" o:allowincell="f" style="position:absolute;margin-left:224.947pt;margin-top:263.167pt;width:123.462pt;height:19.799pt;z-index:251659264;mso-position-horizontal-relative:page;mso-position-vertical-relative:page;mso-wrap-style:none;mso-fit-shape-to-text:t;">
+          <v:shape id="DocuMindTextBox133" type="#_x0000_t202" stroked="f" filled="f" o:allowincell="f" style="position:absolute;margin-left:224.947pt;margin-top:263.167pt;width:123.462pt;height:19.799pt;z-index:251659264;mso-position-horizontal-relative:page;mso-position-vertical-relative:page;mso-wrap-style:none;mso-fit-shape-to-text:t;">
             <w10:wrap type="none"/>
             <v:textbox inset="0,0,0,0">
               <w:txbxContent>
@@ -3536,7 +3568,7 @@
       </w:r>
       <w:r>
         <w:pict>
-          <v:shape id="DocuMindTextBox130" type="#_x0000_t202" stroked="f" filled="f" o:allowincell="f" style="position:absolute;margin-left:63.035pt;margin-top:286.205pt;width:91.049pt;height:19.799pt;z-index:251659264;mso-position-horizontal-relative:page;mso-position-vertical-relative:page;mso-wrap-style:none;mso-fit-shape-to-text:t;">
+          <v:shape id="DocuMindTextBox134" type="#_x0000_t202" stroked="f" filled="f" o:allowincell="f" style="position:absolute;margin-left:63.035pt;margin-top:286.205pt;width:91.049pt;height:19.799pt;z-index:251659264;mso-position-horizontal-relative:page;mso-position-vertical-relative:page;mso-wrap-style:none;mso-fit-shape-to-text:t;">
             <w10:wrap type="none"/>
             <v:textbox inset="0,0,0,0">
               <w:txbxContent>
@@ -3563,7 +3595,7 @@
       </w:r>
       <w:r>
         <w:pict>
-          <v:shape id="DocuMindTextBox131" type="#_x0000_t202" stroked="f" filled="f" o:allowincell="f" style="position:absolute;margin-left:224.932pt;margin-top:286.205pt;width:105.244pt;height:19.799pt;z-index:251659264;mso-position-horizontal-relative:page;mso-position-vertical-relative:page;mso-wrap-style:none;mso-fit-shape-to-text:t;">
+          <v:shape id="DocuMindTextBox135" type="#_x0000_t202" stroked="f" filled="f" o:allowincell="f" style="position:absolute;margin-left:224.932pt;margin-top:286.205pt;width:105.244pt;height:19.799pt;z-index:251659264;mso-position-horizontal-relative:page;mso-position-vertical-relative:page;mso-wrap-style:none;mso-fit-shape-to-text:t;">
             <w10:wrap type="none"/>
             <v:textbox inset="0,0,0,0">
               <w:txbxContent>
@@ -3590,7 +3622,7 @@
       </w:r>
       <w:r>
         <w:pict>
-          <v:shape id="DocuMindTextBox132" type="#_x0000_t202" stroked="f" filled="f" o:allowincell="f" style="position:absolute;margin-left:63.035pt;margin-top:309.123pt;width:114.940pt;height:19.799pt;z-index:251659264;mso-position-horizontal-relative:page;mso-position-vertical-relative:page;mso-wrap-style:none;mso-fit-shape-to-text:t;">
+          <v:shape id="DocuMindTextBox136" type="#_x0000_t202" stroked="f" filled="f" o:allowincell="f" style="position:absolute;margin-left:63.035pt;margin-top:309.123pt;width:114.940pt;height:19.799pt;z-index:251659264;mso-position-horizontal-relative:page;mso-position-vertical-relative:page;mso-wrap-style:none;mso-fit-shape-to-text:t;">
             <w10:wrap type="none"/>
             <v:textbox inset="0,0,0,0">
               <w:txbxContent>
@@ -3617,7 +3649,7 @@
       </w:r>
       <w:r>
         <w:pict>
-          <v:shape id="DocuMindTextBox133" type="#_x0000_t202" stroked="f" filled="f" o:allowincell="f" style="position:absolute;margin-left:224.944pt;margin-top:309.123pt;width:177.924pt;height:19.799pt;z-index:251659264;mso-position-horizontal-relative:page;mso-position-vertical-relative:page;mso-wrap-style:none;mso-fit-shape-to-text:t;">
+          <v:shape id="DocuMindTextBox137" type="#_x0000_t202" stroked="f" filled="f" o:allowincell="f" style="position:absolute;margin-left:224.944pt;margin-top:309.123pt;width:177.924pt;height:19.799pt;z-index:251659264;mso-position-horizontal-relative:page;mso-position-vertical-relative:page;mso-wrap-style:none;mso-fit-shape-to-text:t;">
             <w10:wrap type="none"/>
             <v:textbox inset="0,0,0,0">
               <w:txbxContent>
@@ -3644,7 +3676,7 @@
       </w:r>
       <w:r>
         <w:pict>
-          <v:shape id="DocuMindTextBox134" type="#_x0000_t202" stroked="f" filled="f" o:allowincell="f" style="position:absolute;margin-left:57.636pt;margin-top:344.205pt;width:153.280pt;height:23.549pt;z-index:251659264;mso-position-horizontal-relative:page;mso-position-vertical-relative:page;mso-wrap-style:none;mso-fit-shape-to-text:t;">
+          <v:shape id="DocuMindTextBox138" type="#_x0000_t202" stroked="f" filled="f" o:allowincell="f" style="position:absolute;margin-left:57.636pt;margin-top:344.205pt;width:153.280pt;height:23.549pt;z-index:251659264;mso-position-horizontal-relative:page;mso-position-vertical-relative:page;mso-wrap-style:none;mso-fit-shape-to-text:t;">
             <w10:wrap type="none"/>
             <v:textbox inset="0,0,0,0">
               <w:txbxContent>
@@ -3671,7 +3703,7 @@
       </w:r>
       <w:r>
         <w:pict>
-          <v:shape id="DocuMindTextBox135" type="#_x0000_t202" stroked="f" filled="f" o:allowincell="f" style="position:absolute;margin-left:57.636pt;margin-top:366.238pt;width:215.892pt;height:19.799pt;z-index:251659264;mso-position-horizontal-relative:page;mso-position-vertical-relative:page;mso-wrap-style:none;mso-fit-shape-to-text:t;">
+          <v:shape id="DocuMindTextBox139" type="#_x0000_t202" stroked="f" filled="f" o:allowincell="f" style="position:absolute;margin-left:57.636pt;margin-top:366.238pt;width:215.892pt;height:19.799pt;z-index:251659264;mso-position-horizontal-relative:page;mso-position-vertical-relative:page;mso-wrap-style:none;mso-fit-shape-to-text:t;">
             <w10:wrap type="none"/>
             <v:textbox inset="0,0,0,0">
               <w:txbxContent>
@@ -3698,7 +3730,7 @@
       </w:r>
       <w:r>
         <w:pict>
-          <v:shape id="DocuMindTextBox136" type="#_x0000_t202" stroked="f" filled="f" o:allowincell="f" style="position:absolute;margin-left:57.636pt;margin-top:386.877pt;width:150.063pt;height:19.799pt;z-index:251659264;mso-position-horizontal-relative:page;mso-position-vertical-relative:page;mso-wrap-style:none;mso-fit-shape-to-text:t;">
+          <v:shape id="DocuMindTextBox140" type="#_x0000_t202" stroked="f" filled="f" o:allowincell="f" style="position:absolute;margin-left:57.636pt;margin-top:386.877pt;width:150.063pt;height:19.799pt;z-index:251659264;mso-position-horizontal-relative:page;mso-position-vertical-relative:page;mso-wrap-style:none;mso-fit-shape-to-text:t;">
             <w10:wrap type="none"/>
             <v:textbox inset="0,0,0,0">
               <w:txbxContent>
@@ -3725,7 +3757,7 @@
       </w:r>
       <w:r>
         <w:pict>
-          <v:shape id="DocuMindTextBox137" type="#_x0000_t202" stroked="f" filled="f" o:allowincell="f" style="position:absolute;margin-left:204.744pt;margin-top:386.877pt;width:95.317pt;height:19.799pt;z-index:251659264;mso-position-horizontal-relative:page;mso-position-vertical-relative:page;mso-wrap-style:none;mso-fit-shape-to-text:t;">
+          <v:shape id="DocuMindTextBox141" type="#_x0000_t202" stroked="f" filled="f" o:allowincell="f" style="position:absolute;margin-left:204.744pt;margin-top:386.877pt;width:95.317pt;height:19.799pt;z-index:251659264;mso-position-horizontal-relative:page;mso-position-vertical-relative:page;mso-wrap-style:none;mso-fit-shape-to-text:t;">
             <w10:wrap type="none"/>
             <v:textbox inset="0,0,0,0">
               <w:txbxContent>
@@ -3752,7 +3784,7 @@
       </w:r>
       <w:r>
         <w:pict>
-          <v:shape id="DocuMindTextBox138" type="#_x0000_t202" stroked="f" filled="f" o:allowincell="f" style="position:absolute;margin-left:297.017pt;margin-top:386.877pt;width:191.302pt;height:19.799pt;z-index:251659264;mso-position-horizontal-relative:page;mso-position-vertical-relative:page;mso-wrap-style:none;mso-fit-shape-to-text:t;">
+          <v:shape id="DocuMindTextBox142" type="#_x0000_t202" stroked="f" filled="f" o:allowincell="f" style="position:absolute;margin-left:297.017pt;margin-top:386.877pt;width:191.302pt;height:19.799pt;z-index:251659264;mso-position-horizontal-relative:page;mso-position-vertical-relative:page;mso-wrap-style:none;mso-fit-shape-to-text:t;">
             <w10:wrap type="none"/>
             <v:textbox inset="0,0,0,0">
               <w:txbxContent>
@@ -3779,7 +3811,7 @@
       </w:r>
       <w:r>
         <w:pict>
-          <v:shape id="DocuMindTextBox139" type="#_x0000_t202" stroked="f" filled="f" o:allowincell="f" style="position:absolute;margin-left:75.635pt;margin-top:399.596pt;width:239.757pt;height:19.799pt;z-index:251659264;mso-position-horizontal-relative:page;mso-position-vertical-relative:page;mso-wrap-style:none;mso-fit-shape-to-text:t;">
+          <v:shape id="DocuMindTextBox143" type="#_x0000_t202" stroked="f" filled="f" o:allowincell="f" style="position:absolute;margin-left:75.635pt;margin-top:399.596pt;width:239.757pt;height:19.799pt;z-index:251659264;mso-position-horizontal-relative:page;mso-position-vertical-relative:page;mso-wrap-style:none;mso-fit-shape-to-text:t;">
             <w10:wrap type="none"/>
             <v:textbox inset="0,0,0,0">
               <w:txbxContent>
@@ -3806,7 +3838,7 @@
       </w:r>
       <w:r>
         <w:pict>
-          <v:shape id="DocuMindTextBox140" type="#_x0000_t202" stroked="f" filled="f" o:allowincell="f" style="position:absolute;margin-left:57.637pt;margin-top:420.114pt;width:74.812pt;height:19.799pt;z-index:251659264;mso-position-horizontal-relative:page;mso-position-vertical-relative:page;mso-wrap-style:none;mso-fit-shape-to-text:t;">
+          <v:shape id="DocuMindTextBox144" type="#_x0000_t202" stroked="f" filled="f" o:allowincell="f" style="position:absolute;margin-left:57.637pt;margin-top:420.114pt;width:74.812pt;height:19.799pt;z-index:251659264;mso-position-horizontal-relative:page;mso-position-vertical-relative:page;mso-wrap-style:none;mso-fit-shape-to-text:t;">
             <w10:wrap type="none"/>
             <v:textbox inset="0,0,0,0">
               <w:txbxContent>
@@ -3833,7 +3865,7 @@
       </w:r>
       <w:r>
         <w:pict>
-          <v:shape id="DocuMindTextBox141" type="#_x0000_t202" stroked="f" filled="f" o:allowincell="f" style="position:absolute;margin-left:129.511pt;margin-top:420.114pt;width:12.239pt;height:19.799pt;z-index:251659264;mso-position-horizontal-relative:page;mso-position-vertical-relative:page;mso-wrap-style:none;mso-fit-shape-to-text:t;">
+          <v:shape id="DocuMindTextBox145" type="#_x0000_t202" stroked="f" filled="f" o:allowincell="f" style="position:absolute;margin-left:129.511pt;margin-top:420.114pt;width:12.239pt;height:19.799pt;z-index:251659264;mso-position-horizontal-relative:page;mso-position-vertical-relative:page;mso-wrap-style:none;mso-fit-shape-to-text:t;">
             <w10:wrap type="none"/>
             <v:textbox inset="0,0,0,0">
               <w:txbxContent>
@@ -3860,7 +3892,7 @@
       </w:r>
       <w:r>
         <w:pict>
-          <v:shape id="DocuMindTextBox142" type="#_x0000_t202" stroked="f" filled="f" o:allowincell="f" style="position:absolute;margin-left:138.631pt;margin-top:420.114pt;width:69.070pt;height:19.799pt;z-index:251659264;mso-position-horizontal-relative:page;mso-position-vertical-relative:page;mso-wrap-style:none;mso-fit-shape-to-text:t;">
+          <v:shape id="DocuMindTextBox146" type="#_x0000_t202" stroked="f" filled="f" o:allowincell="f" style="position:absolute;margin-left:138.631pt;margin-top:420.114pt;width:69.070pt;height:19.799pt;z-index:251659264;mso-position-horizontal-relative:page;mso-position-vertical-relative:page;mso-wrap-style:none;mso-fit-shape-to-text:t;">
             <w10:wrap type="none"/>
             <v:textbox inset="0,0,0,0">
               <w:txbxContent>
@@ -3887,7 +3919,7 @@
       </w:r>
       <w:r>
         <w:pict>
-          <v:shape id="DocuMindTextBox143" type="#_x0000_t202" stroked="f" filled="f" o:allowincell="f" style="position:absolute;margin-left:204.745pt;margin-top:420.114pt;width:25.948pt;height:19.799pt;z-index:251659264;mso-position-horizontal-relative:page;mso-position-vertical-relative:page;mso-wrap-style:none;mso-fit-shape-to-text:t;">
+          <v:shape id="DocuMindTextBox147" type="#_x0000_t202" stroked="f" filled="f" o:allowincell="f" style="position:absolute;margin-left:204.745pt;margin-top:420.114pt;width:25.948pt;height:19.799pt;z-index:251659264;mso-position-horizontal-relative:page;mso-position-vertical-relative:page;mso-wrap-style:none;mso-fit-shape-to-text:t;">
             <w10:wrap type="none"/>
             <v:textbox inset="0,0,0,0">
               <w:txbxContent>
@@ -3914,7 +3946,7 @@
       </w:r>
       <w:r>
         <w:pict>
-          <v:shape id="DocuMindTextBox144" type="#_x0000_t202" stroked="f" filled="f" o:allowincell="f" style="position:absolute;margin-left:227.663pt;margin-top:420.114pt;width:129.020pt;height:19.799pt;z-index:251659264;mso-position-horizontal-relative:page;mso-position-vertical-relative:page;mso-wrap-style:none;mso-fit-shape-to-text:t;">
+          <v:shape id="DocuMindTextBox148" type="#_x0000_t202" stroked="f" filled="f" o:allowincell="f" style="position:absolute;margin-left:227.663pt;margin-top:420.114pt;width:129.020pt;height:19.799pt;z-index:251659264;mso-position-horizontal-relative:page;mso-position-vertical-relative:page;mso-wrap-style:none;mso-fit-shape-to-text:t;">
             <w10:wrap type="none"/>
             <v:textbox inset="0,0,0,0">
               <w:txbxContent>
@@ -3941,7 +3973,7 @@
       </w:r>
       <w:r>
         <w:pict>
-          <v:shape id="DocuMindTextBox145" type="#_x0000_t202" stroked="f" filled="f" o:allowincell="f" style="position:absolute;margin-left:353.773pt;margin-top:420.114pt;width:93.923pt;height:19.799pt;z-index:251659264;mso-position-horizontal-relative:page;mso-position-vertical-relative:page;mso-wrap-style:none;mso-fit-shape-to-text:t;">
+          <v:shape id="DocuMindTextBox149" type="#_x0000_t202" stroked="f" filled="f" o:allowincell="f" style="position:absolute;margin-left:353.773pt;margin-top:420.114pt;width:93.923pt;height:19.799pt;z-index:251659264;mso-position-horizontal-relative:page;mso-position-vertical-relative:page;mso-wrap-style:none;mso-fit-shape-to-text:t;">
             <w10:wrap type="none"/>
             <v:textbox inset="0,0,0,0">
               <w:txbxContent>
@@ -3968,7 +4000,7 @@
       </w:r>
       <w:r>
         <w:pict>
-          <v:shape id="DocuMindTextBox146" type="#_x0000_t202" stroked="f" filled="f" o:allowincell="f" style="position:absolute;margin-left:444.725pt;margin-top:420.114pt;width:21.432pt;height:19.799pt;z-index:251659264;mso-position-horizontal-relative:page;mso-position-vertical-relative:page;mso-wrap-style:none;mso-fit-shape-to-text:t;">
+          <v:shape id="DocuMindTextBox150" type="#_x0000_t202" stroked="f" filled="f" o:allowincell="f" style="position:absolute;margin-left:444.725pt;margin-top:420.114pt;width:21.432pt;height:19.799pt;z-index:251659264;mso-position-horizontal-relative:page;mso-position-vertical-relative:page;mso-wrap-style:none;mso-fit-shape-to-text:t;">
             <w10:wrap type="none"/>
             <v:textbox inset="0,0,0,0">
               <w:txbxContent>
@@ -3995,7 +4027,7 @@
       </w:r>
       <w:r>
         <w:pict>
-          <v:shape id="DocuMindTextBox147" type="#_x0000_t202" stroked="f" filled="f" o:allowincell="f" style="position:absolute;margin-left:75.635pt;margin-top:440.433pt;width:10.799pt;height:20.384pt;z-index:251659264;mso-position-horizontal-relative:page;mso-position-vertical-relative:page;mso-wrap-style:none;mso-fit-shape-to-text:t;">
+          <v:shape id="DocuMindTextBox151" type="#_x0000_t202" stroked="f" filled="f" o:allowincell="f" style="position:absolute;margin-left:75.635pt;margin-top:440.433pt;width:10.799pt;height:20.384pt;z-index:251659264;mso-position-horizontal-relative:page;mso-position-vertical-relative:page;mso-wrap-style:none;mso-fit-shape-to-text:t;">
             <w10:wrap type="none"/>
             <v:textbox inset="0,0,0,0">
               <w:txbxContent>
@@ -4022,7 +4054,7 @@
       </w:r>
       <w:r>
         <w:pict>
-          <v:shape id="DocuMindTextBox148" type="#_x0000_t202" stroked="f" filled="f" o:allowincell="f" style="position:absolute;margin-left:93.633pt;margin-top:441.592pt;width:162.523pt;height:19.799pt;z-index:251659264;mso-position-horizontal-relative:page;mso-position-vertical-relative:page;mso-wrap-style:none;mso-fit-shape-to-text:t;">
+          <v:shape id="DocuMindTextBox152" type="#_x0000_t202" stroked="f" filled="f" o:allowincell="f" style="position:absolute;margin-left:93.633pt;margin-top:441.592pt;width:162.523pt;height:19.799pt;z-index:251659264;mso-position-horizontal-relative:page;mso-position-vertical-relative:page;mso-wrap-style:none;mso-fit-shape-to-text:t;">
             <w10:wrap type="none"/>
             <v:textbox inset="0,0,0,0">
               <w:txbxContent>
@@ -4049,7 +4081,7 @@
       </w:r>
       <w:r>
         <w:pict>
-          <v:shape id="DocuMindTextBox149" type="#_x0000_t202" stroked="f" filled="f" o:allowincell="f" style="position:absolute;margin-left:75.635pt;margin-top:461.671pt;width:10.799pt;height:20.384pt;z-index:251659264;mso-position-horizontal-relative:page;mso-position-vertical-relative:page;mso-wrap-style:none;mso-fit-shape-to-text:t;">
+          <v:shape id="DocuMindTextBox153" type="#_x0000_t202" stroked="f" filled="f" o:allowincell="f" style="position:absolute;margin-left:75.635pt;margin-top:461.671pt;width:10.799pt;height:20.384pt;z-index:251659264;mso-position-horizontal-relative:page;mso-position-vertical-relative:page;mso-wrap-style:none;mso-fit-shape-to-text:t;">
             <w10:wrap type="none"/>
             <v:textbox inset="0,0,0,0">
               <w:txbxContent>
@@ -4076,7 +4108,7 @@
       </w:r>
       <w:r>
         <w:pict>
-          <v:shape id="DocuMindTextBox150" type="#_x0000_t202" stroked="f" filled="f" o:allowincell="f" style="position:absolute;margin-left:93.633pt;margin-top:462.830pt;width:176.111pt;height:19.799pt;z-index:251659264;mso-position-horizontal-relative:page;mso-position-vertical-relative:page;mso-wrap-style:none;mso-fit-shape-to-text:t;">
+          <v:shape id="DocuMindTextBox154" type="#_x0000_t202" stroked="f" filled="f" o:allowincell="f" style="position:absolute;margin-left:93.633pt;margin-top:462.830pt;width:176.111pt;height:19.799pt;z-index:251659264;mso-position-horizontal-relative:page;mso-position-vertical-relative:page;mso-wrap-style:none;mso-fit-shape-to-text:t;">
             <w10:wrap type="none"/>
             <v:textbox inset="0,0,0,0">
               <w:txbxContent>
@@ -4103,7 +4135,7 @@
       </w:r>
       <w:r>
         <w:pict>
-          <v:shape id="DocuMindTextBox151" type="#_x0000_t202" stroked="f" filled="f" o:allowincell="f" style="position:absolute;margin-left:266.779pt;margin-top:462.830pt;width:35.415pt;height:19.799pt;z-index:251659264;mso-position-horizontal-relative:page;mso-position-vertical-relative:page;mso-wrap-style:none;mso-fit-shape-to-text:t;">
+          <v:shape id="DocuMindTextBox155" type="#_x0000_t202" stroked="f" filled="f" o:allowincell="f" style="position:absolute;margin-left:266.779pt;margin-top:462.830pt;width:35.415pt;height:19.799pt;z-index:251659264;mso-position-horizontal-relative:page;mso-position-vertical-relative:page;mso-wrap-style:none;mso-fit-shape-to-text:t;">
             <w10:wrap type="none"/>
             <v:textbox inset="0,0,0,0">
               <w:txbxContent>
@@ -4130,7 +4162,7 @@
       </w:r>
       <w:r>
         <w:pict>
-          <v:shape id="DocuMindTextBox152" type="#_x0000_t202" stroked="f" filled="f" o:allowincell="f" style="position:absolute;margin-left:299.057pt;margin-top:462.830pt;width:60.539pt;height:19.799pt;z-index:251659264;mso-position-horizontal-relative:page;mso-position-vertical-relative:page;mso-wrap-style:none;mso-fit-shape-to-text:t;">
+          <v:shape id="DocuMindTextBox156" type="#_x0000_t202" stroked="f" filled="f" o:allowincell="f" style="position:absolute;margin-left:299.057pt;margin-top:462.830pt;width:60.539pt;height:19.799pt;z-index:251659264;mso-position-horizontal-relative:page;mso-position-vertical-relative:page;mso-wrap-style:none;mso-fit-shape-to-text:t;">
             <w10:wrap type="none"/>
             <v:textbox inset="0,0,0,0">
               <w:txbxContent>
@@ -4157,7 +4189,7 @@
       </w:r>
       <w:r>
         <w:pict>
-          <v:shape id="DocuMindTextBox153" type="#_x0000_t202" stroked="f" filled="f" o:allowincell="f" style="position:absolute;margin-left:75.635pt;margin-top:483.149pt;width:10.799pt;height:20.384pt;z-index:251659264;mso-position-horizontal-relative:page;mso-position-vertical-relative:page;mso-wrap-style:none;mso-fit-shape-to-text:t;">
+          <v:shape id="DocuMindTextBox157" type="#_x0000_t202" stroked="f" filled="f" o:allowincell="f" style="position:absolute;margin-left:75.635pt;margin-top:483.149pt;width:10.799pt;height:20.384pt;z-index:251659264;mso-position-horizontal-relative:page;mso-position-vertical-relative:page;mso-wrap-style:none;mso-fit-shape-to-text:t;">
             <w10:wrap type="none"/>
             <v:textbox inset="0,0,0,0">
               <w:txbxContent>
@@ -4184,7 +4216,7 @@
       </w:r>
       <w:r>
         <w:pict>
-          <v:shape id="DocuMindTextBox154" type="#_x0000_t202" stroked="f" filled="f" o:allowincell="f" style="position:absolute;margin-left:93.633pt;margin-top:484.308pt;width:362.007pt;height:19.799pt;z-index:251659264;mso-position-horizontal-relative:page;mso-position-vertical-relative:page;mso-wrap-style:none;mso-fit-shape-to-text:t;">
+          <v:shape id="DocuMindTextBox158" type="#_x0000_t202" stroked="f" filled="f" o:allowincell="f" style="position:absolute;margin-left:93.633pt;margin-top:484.308pt;width:362.007pt;height:19.799pt;z-index:251659264;mso-position-horizontal-relative:page;mso-position-vertical-relative:page;mso-wrap-style:none;mso-fit-shape-to-text:t;">
             <w10:wrap type="none"/>
             <v:textbox inset="0,0,0,0">
               <w:txbxContent>
@@ -4211,7 +4243,7 @@
       </w:r>
       <w:r>
         <w:pict>
-          <v:shape id="DocuMindTextBox155" type="#_x0000_t202" stroked="f" filled="f" o:allowincell="f" style="position:absolute;margin-left:452.644pt;margin-top:484.308pt;width:35.533pt;height:19.799pt;z-index:251659264;mso-position-horizontal-relative:page;mso-position-vertical-relative:page;mso-wrap-style:none;mso-fit-shape-to-text:t;">
+          <v:shape id="DocuMindTextBox159" type="#_x0000_t202" stroked="f" filled="f" o:allowincell="f" style="position:absolute;margin-left:452.644pt;margin-top:484.308pt;width:35.533pt;height:19.799pt;z-index:251659264;mso-position-horizontal-relative:page;mso-position-vertical-relative:page;mso-wrap-style:none;mso-fit-shape-to-text:t;">
             <w10:wrap type="none"/>
             <v:textbox inset="0,0,0,0">
               <w:txbxContent>
@@ -4238,7 +4270,7 @@
       </w:r>
       <w:r>
         <w:pict>
-          <v:shape id="DocuMindTextBox156" type="#_x0000_t202" stroked="f" filled="f" o:allowincell="f" style="position:absolute;margin-left:93.633pt;margin-top:497.027pt;width:57.538pt;height:19.799pt;z-index:251659264;mso-position-horizontal-relative:page;mso-position-vertical-relative:page;mso-wrap-style:none;mso-fit-shape-to-text:t;">
+          <v:shape id="DocuMindTextBox160" type="#_x0000_t202" stroked="f" filled="f" o:allowincell="f" style="position:absolute;margin-left:93.633pt;margin-top:497.027pt;width:57.538pt;height:19.799pt;z-index:251659264;mso-position-horizontal-relative:page;mso-position-vertical-relative:page;mso-wrap-style:none;mso-fit-shape-to-text:t;">
             <w10:wrap type="none"/>
             <v:textbox inset="0,0,0,0">
               <w:txbxContent>
@@ -4265,7 +4297,7 @@
       </w:r>
       <w:r>
         <w:pict>
-          <v:shape id="DocuMindTextBox157" type="#_x0000_t202" stroked="f" filled="f" o:allowincell="f" style="position:absolute;margin-left:75.635pt;margin-top:515.626pt;width:70.393pt;height:19.799pt;z-index:251659264;mso-position-horizontal-relative:page;mso-position-vertical-relative:page;mso-wrap-style:none;mso-fit-shape-to-text:t;">
+          <v:shape id="DocuMindTextBox161" type="#_x0000_t202" stroked="f" filled="f" o:allowincell="f" style="position:absolute;margin-left:75.635pt;margin-top:515.626pt;width:70.393pt;height:19.799pt;z-index:251659264;mso-position-horizontal-relative:page;mso-position-vertical-relative:page;mso-wrap-style:none;mso-fit-shape-to-text:t;">
             <w10:wrap type="none"/>
             <v:textbox inset="0,0,0,0">
               <w:txbxContent>
@@ -4292,7 +4324,7 @@
       </w:r>
       <w:r>
         <w:pict>
-          <v:shape id="DocuMindTextBox158" type="#_x0000_t202" stroked="f" filled="f" o:allowincell="f" style="position:absolute;margin-left:81.394pt;margin-top:547.304pt;width:108.150pt;height:19.799pt;z-index:251659264;mso-position-horizontal-relative:page;mso-position-vertical-relative:page;mso-wrap-style:none;mso-fit-shape-to-text:t;">
+          <v:shape id="DocuMindTextBox162" type="#_x0000_t202" stroked="f" filled="f" o:allowincell="f" style="position:absolute;margin-left:81.394pt;margin-top:547.304pt;width:108.150pt;height:19.799pt;z-index:251659264;mso-position-horizontal-relative:page;mso-position-vertical-relative:page;mso-wrap-style:none;mso-fit-shape-to-text:t;">
             <w10:wrap type="none"/>
             <v:textbox inset="0,0,0,0">
               <w:txbxContent>
@@ -4319,7 +4351,7 @@
       </w:r>
       <w:r>
         <w:pict>
-          <v:shape id="DocuMindTextBox159" type="#_x0000_t202" stroked="f" filled="f" o:allowincell="f" style="position:absolute;margin-left:220.794pt;margin-top:547.304pt;width:196.208pt;height:19.799pt;z-index:251659264;mso-position-horizontal-relative:page;mso-position-vertical-relative:page;mso-wrap-style:none;mso-fit-shape-to-text:t;">
+          <v:shape id="DocuMindTextBox163" type="#_x0000_t202" stroked="f" filled="f" o:allowincell="f" style="position:absolute;margin-left:220.794pt;margin-top:547.304pt;width:196.208pt;height:19.799pt;z-index:251659264;mso-position-horizontal-relative:page;mso-position-vertical-relative:page;mso-wrap-style:none;mso-fit-shape-to-text:t;">
             <w10:wrap type="none"/>
             <v:textbox inset="0,0,0,0">
               <w:txbxContent>
@@ -4346,7 +4378,7 @@
       </w:r>
       <w:r>
         <w:pict>
-          <v:shape id="DocuMindTextBox160" type="#_x0000_t202" stroked="f" filled="f" o:allowincell="f" style="position:absolute;margin-left:81.394pt;margin-top:570.221pt;width:46.380pt;height:19.799pt;z-index:251659264;mso-position-horizontal-relative:page;mso-position-vertical-relative:page;mso-wrap-style:none;mso-fit-shape-to-text:t;">
+          <v:shape id="DocuMindTextBox164" type="#_x0000_t202" stroked="f" filled="f" o:allowincell="f" style="position:absolute;margin-left:81.394pt;margin-top:570.221pt;width:46.380pt;height:19.799pt;z-index:251659264;mso-position-horizontal-relative:page;mso-position-vertical-relative:page;mso-wrap-style:none;mso-fit-shape-to-text:t;">
             <w10:wrap type="none"/>
             <v:textbox inset="0,0,0,0">
               <w:txbxContent>
@@ -4373,7 +4405,7 @@
       </w:r>
       <w:r>
         <w:pict>
-          <v:shape id="DocuMindTextBox161" type="#_x0000_t202" stroked="f" filled="f" o:allowincell="f" style="position:absolute;margin-left:220.822pt;margin-top:568.263pt;width:32.973pt;height:19.943pt;z-index:251659264;mso-position-horizontal-relative:page;mso-position-vertical-relative:page;mso-wrap-style:none;mso-fit-shape-to-text:t;">
+          <v:shape id="DocuMindTextBox165" type="#_x0000_t202" stroked="f" filled="f" o:allowincell="f" style="position:absolute;margin-left:220.822pt;margin-top:568.263pt;width:32.973pt;height:19.943pt;z-index:251659264;mso-position-horizontal-relative:page;mso-position-vertical-relative:page;mso-wrap-style:none;mso-fit-shape-to-text:t;">
             <w10:wrap type="none"/>
             <v:textbox inset="0,0,0,0">
               <w:txbxContent>
@@ -4400,7 +4432,7 @@
       </w:r>
       <w:r>
         <w:pict>
-          <v:shape id="DocuMindTextBox162" type="#_x0000_t202" stroked="f" filled="f" o:allowincell="f" style="position:absolute;margin-left:250.820pt;margin-top:569.010pt;width:92.967pt;height:18.449pt;z-index:251659264;mso-position-horizontal-relative:page;mso-position-vertical-relative:page;mso-wrap-style:none;mso-fit-shape-to-text:t;">
+          <v:shape id="DocuMindTextBox166" type="#_x0000_t202" stroked="f" filled="f" o:allowincell="f" style="position:absolute;margin-left:250.820pt;margin-top:569.010pt;width:92.967pt;height:18.449pt;z-index:251659264;mso-position-horizontal-relative:page;mso-position-vertical-relative:page;mso-wrap-style:none;mso-fit-shape-to-text:t;">
             <w10:wrap type="none"/>
             <v:textbox inset="0,0,0,0">
               <w:txbxContent>
@@ -4427,7 +4459,7 @@
       </w:r>
       <w:r>
         <w:pict>
-          <v:shape id="DocuMindTextBox163" type="#_x0000_t202" stroked="f" filled="f" o:allowincell="f" style="position:absolute;margin-left:346.813pt;margin-top:568.263pt;width:32.973pt;height:19.943pt;z-index:251659264;mso-position-horizontal-relative:page;mso-position-vertical-relative:page;mso-wrap-style:none;mso-fit-shape-to-text:t;">
+          <v:shape id="DocuMindTextBox167" type="#_x0000_t202" stroked="f" filled="f" o:allowincell="f" style="position:absolute;margin-left:346.813pt;margin-top:568.263pt;width:32.973pt;height:19.943pt;z-index:251659264;mso-position-horizontal-relative:page;mso-position-vertical-relative:page;mso-wrap-style:none;mso-fit-shape-to-text:t;">
             <w10:wrap type="none"/>
             <v:textbox inset="0,0,0,0">
               <w:txbxContent>
@@ -4454,7 +4486,7 @@
       </w:r>
       <w:r>
         <w:pict>
-          <v:shape id="DocuMindTextBox164" type="#_x0000_t202" stroked="f" filled="f" o:allowincell="f" style="position:absolute;margin-left:376.810pt;margin-top:569.010pt;width:50.971pt;height:18.449pt;z-index:251659264;mso-position-horizontal-relative:page;mso-position-vertical-relative:page;mso-wrap-style:none;mso-fit-shape-to-text:t;">
+          <v:shape id="DocuMindTextBox168" type="#_x0000_t202" stroked="f" filled="f" o:allowincell="f" style="position:absolute;margin-left:376.810pt;margin-top:569.010pt;width:50.971pt;height:18.449pt;z-index:251659264;mso-position-horizontal-relative:page;mso-position-vertical-relative:page;mso-wrap-style:none;mso-fit-shape-to-text:t;">
             <w10:wrap type="none"/>
             <v:textbox inset="0,0,0,0">
               <w:txbxContent>
@@ -4481,7 +4513,7 @@
       </w:r>
       <w:r>
         <w:pict>
-          <v:shape id="DocuMindTextBox165" type="#_x0000_t202" stroked="f" filled="f" o:allowincell="f" style="position:absolute;margin-left:81.394pt;margin-top:592.899pt;width:30.545pt;height:19.799pt;z-index:251659264;mso-position-horizontal-relative:page;mso-position-vertical-relative:page;mso-wrap-style:none;mso-fit-shape-to-text:t;">
+          <v:shape id="DocuMindTextBox169" type="#_x0000_t202" stroked="f" filled="f" o:allowincell="f" style="position:absolute;margin-left:81.394pt;margin-top:592.899pt;width:30.545pt;height:19.799pt;z-index:251659264;mso-position-horizontal-relative:page;mso-position-vertical-relative:page;mso-wrap-style:none;mso-fit-shape-to-text:t;">
             <w10:wrap type="none"/>
             <v:textbox inset="0,0,0,0">
               <w:txbxContent>
@@ -4508,7 +4540,7 @@
       </w:r>
       <w:r>
         <w:pict>
-          <v:shape id="DocuMindTextBox166" type="#_x0000_t202" stroked="f" filled="f" o:allowincell="f" style="position:absolute;margin-left:220.822pt;margin-top:590.941pt;width:32.973pt;height:19.943pt;z-index:251659264;mso-position-horizontal-relative:page;mso-position-vertical-relative:page;mso-wrap-style:none;mso-fit-shape-to-text:t;">
+          <v:shape id="DocuMindTextBox170" type="#_x0000_t202" stroked="f" filled="f" o:allowincell="f" style="position:absolute;margin-left:220.822pt;margin-top:590.941pt;width:32.973pt;height:19.943pt;z-index:251659264;mso-position-horizontal-relative:page;mso-position-vertical-relative:page;mso-wrap-style:none;mso-fit-shape-to-text:t;">
             <w10:wrap type="none"/>
             <v:textbox inset="0,0,0,0">
               <w:txbxContent>
@@ -4535,7 +4567,7 @@
       </w:r>
       <w:r>
         <w:pict>
-          <v:shape id="DocuMindTextBox167" type="#_x0000_t202" stroked="f" filled="f" o:allowincell="f" style="position:absolute;margin-left:250.820pt;margin-top:591.688pt;width:92.967pt;height:18.449pt;z-index:251659264;mso-position-horizontal-relative:page;mso-position-vertical-relative:page;mso-wrap-style:none;mso-fit-shape-to-text:t;">
+          <v:shape id="DocuMindTextBox171" type="#_x0000_t202" stroked="f" filled="f" o:allowincell="f" style="position:absolute;margin-left:250.820pt;margin-top:591.688pt;width:92.967pt;height:18.449pt;z-index:251659264;mso-position-horizontal-relative:page;mso-position-vertical-relative:page;mso-wrap-style:none;mso-fit-shape-to-text:t;">
             <w10:wrap type="none"/>
             <v:textbox inset="0,0,0,0">
               <w:txbxContent>
@@ -4562,7 +4594,7 @@
       </w:r>
       <w:r>
         <w:pict>
-          <v:shape id="DocuMindTextBox168" type="#_x0000_t202" stroked="f" filled="f" o:allowincell="f" style="position:absolute;margin-left:346.813pt;margin-top:590.941pt;width:32.973pt;height:19.943pt;z-index:251659264;mso-position-horizontal-relative:page;mso-position-vertical-relative:page;mso-wrap-style:none;mso-fit-shape-to-text:t;">
+          <v:shape id="DocuMindTextBox172" type="#_x0000_t202" stroked="f" filled="f" o:allowincell="f" style="position:absolute;margin-left:346.813pt;margin-top:590.941pt;width:32.973pt;height:19.943pt;z-index:251659264;mso-position-horizontal-relative:page;mso-position-vertical-relative:page;mso-wrap-style:none;mso-fit-shape-to-text:t;">
             <w10:wrap type="none"/>
             <v:textbox inset="0,0,0,0">
               <w:txbxContent>
@@ -4589,7 +4621,7 @@
       </w:r>
       <w:r>
         <w:pict>
-          <v:shape id="DocuMindTextBox169" type="#_x0000_t202" stroked="f" filled="f" o:allowincell="f" style="position:absolute;margin-left:376.810pt;margin-top:591.688pt;width:26.974pt;height:18.449pt;z-index:251659264;mso-position-horizontal-relative:page;mso-position-vertical-relative:page;mso-wrap-style:none;mso-fit-shape-to-text:t;">
+          <v:shape id="DocuMindTextBox173" type="#_x0000_t202" stroked="f" filled="f" o:allowincell="f" style="position:absolute;margin-left:376.810pt;margin-top:591.688pt;width:26.974pt;height:18.449pt;z-index:251659264;mso-position-horizontal-relative:page;mso-position-vertical-relative:page;mso-wrap-style:none;mso-fit-shape-to-text:t;">
             <w10:wrap type="none"/>
             <v:textbox inset="0,0,0,0">
               <w:txbxContent>
@@ -4616,7 +4648,7 @@
       </w:r>
       <w:r>
         <w:pict>
-          <v:shape id="DocuMindTextBox170" type="#_x0000_t202" stroked="f" filled="f" o:allowincell="f" style="position:absolute;margin-left:81.394pt;margin-top:615.697pt;width:44.096pt;height:19.799pt;z-index:251659264;mso-position-horizontal-relative:page;mso-position-vertical-relative:page;mso-wrap-style:none;mso-fit-shape-to-text:t;">
+          <v:shape id="DocuMindTextBox174" type="#_x0000_t202" stroked="f" filled="f" o:allowincell="f" style="position:absolute;margin-left:81.394pt;margin-top:615.697pt;width:44.096pt;height:19.799pt;z-index:251659264;mso-position-horizontal-relative:page;mso-position-vertical-relative:page;mso-wrap-style:none;mso-fit-shape-to-text:t;">
             <w10:wrap type="none"/>
             <v:textbox inset="0,0,0,0">
               <w:txbxContent>
@@ -4643,7 +4675,7 @@
       </w:r>
       <w:r>
         <w:pict>
-          <v:shape id="DocuMindTextBox171" type="#_x0000_t202" stroked="f" filled="f" o:allowincell="f" style="position:absolute;margin-left:220.822pt;margin-top:613.739pt;width:32.973pt;height:19.943pt;z-index:251659264;mso-position-horizontal-relative:page;mso-position-vertical-relative:page;mso-wrap-style:none;mso-fit-shape-to-text:t;">
+          <v:shape id="DocuMindTextBox175" type="#_x0000_t202" stroked="f" filled="f" o:allowincell="f" style="position:absolute;margin-left:220.822pt;margin-top:613.739pt;width:32.973pt;height:19.943pt;z-index:251659264;mso-position-horizontal-relative:page;mso-position-vertical-relative:page;mso-wrap-style:none;mso-fit-shape-to-text:t;">
             <w10:wrap type="none"/>
             <v:textbox inset="0,0,0,0">
               <w:txbxContent>
@@ -4670,7 +4702,7 @@
       </w:r>
       <w:r>
         <w:pict>
-          <v:shape id="DocuMindTextBox172" type="#_x0000_t202" stroked="f" filled="f" o:allowincell="f" style="position:absolute;margin-left:250.820pt;margin-top:614.486pt;width:92.967pt;height:18.449pt;z-index:251659264;mso-position-horizontal-relative:page;mso-position-vertical-relative:page;mso-wrap-style:none;mso-fit-shape-to-text:t;">
+          <v:shape id="DocuMindTextBox176" type="#_x0000_t202" stroked="f" filled="f" o:allowincell="f" style="position:absolute;margin-left:250.820pt;margin-top:614.486pt;width:92.967pt;height:18.449pt;z-index:251659264;mso-position-horizontal-relative:page;mso-position-vertical-relative:page;mso-wrap-style:none;mso-fit-shape-to-text:t;">
             <w10:wrap type="none"/>
             <v:textbox inset="0,0,0,0">
               <w:txbxContent>
@@ -4697,7 +4729,7 @@
       </w:r>
       <w:r>
         <w:pict>
-          <v:shape id="DocuMindTextBox173" type="#_x0000_t202" stroked="f" filled="f" o:allowincell="f" style="position:absolute;margin-left:346.813pt;margin-top:613.739pt;width:32.973pt;height:19.943pt;z-index:251659264;mso-position-horizontal-relative:page;mso-position-vertical-relative:page;mso-wrap-style:none;mso-fit-shape-to-text:t;">
+          <v:shape id="DocuMindTextBox177" type="#_x0000_t202" stroked="f" filled="f" o:allowincell="f" style="position:absolute;margin-left:346.813pt;margin-top:613.739pt;width:32.973pt;height:19.943pt;z-index:251659264;mso-position-horizontal-relative:page;mso-position-vertical-relative:page;mso-wrap-style:none;mso-fit-shape-to-text:t;">
             <w10:wrap type="none"/>
             <v:textbox inset="0,0,0,0">
               <w:txbxContent>
@@ -4724,7 +4756,7 @@
       </w:r>
       <w:r>
         <w:pict>
-          <v:shape id="DocuMindTextBox174" type="#_x0000_t202" stroked="f" filled="f" o:allowincell="f" style="position:absolute;margin-left:376.810pt;margin-top:614.486pt;width:38.973pt;height:18.449pt;z-index:251659264;mso-position-horizontal-relative:page;mso-position-vertical-relative:page;mso-wrap-style:none;mso-fit-shape-to-text:t;">
+          <v:shape id="DocuMindTextBox178" type="#_x0000_t202" stroked="f" filled="f" o:allowincell="f" style="position:absolute;margin-left:376.810pt;margin-top:614.486pt;width:38.973pt;height:18.449pt;z-index:251659264;mso-position-horizontal-relative:page;mso-position-vertical-relative:page;mso-wrap-style:none;mso-fit-shape-to-text:t;">
             <w10:wrap type="none"/>
             <v:textbox inset="0,0,0,0">
               <w:txbxContent>
@@ -4771,7 +4803,15 @@
       </w:r>
       <w:r>
         <w:pict>
-          <v:shape id="DocuMindTextBox175" type="#_x0000_t202" stroked="f" filled="f" o:allowincell="f" style="position:absolute;margin-left:57.636pt;margin-top:734.050pt;width:99.713pt;height:17.249pt;z-index:251659264;mso-position-horizontal-relative:page;mso-position-vertical-relative:page;mso-wrap-style:none;mso-fit-shape-to-text:t;">
+          <v:shape id="DocuMindImage179" type="#_x0000_t75" stroked="f" o:allowincell="f" style="position:absolute;margin-left:57.636pt;margin-top:35.997pt;width:70.914pt;height:48.236pt;z-index:1;mso-position-horizontal-relative:page;mso-position-vertical-relative:page;mso-wrap-style:none;">
+            <w10:wrap type="none"/>
+            <v:imagedata r:id="rId9" o:title=""/>
+          </v:shape>
+        </w:pict>
+      </w:r>
+      <w:r>
+        <w:pict>
+          <v:shape id="DocuMindTextBox180" type="#_x0000_t202" stroked="f" filled="f" o:allowincell="f" style="position:absolute;margin-left:57.636pt;margin-top:734.050pt;width:99.713pt;height:17.249pt;z-index:251659264;mso-position-horizontal-relative:page;mso-position-vertical-relative:page;mso-wrap-style:none;mso-fit-shape-to-text:t;">
             <w10:wrap type="none"/>
             <v:textbox inset="0,0,0,0">
               <w:txbxContent>
@@ -4798,7 +4838,7 @@
       </w:r>
       <w:r>
         <w:pict>
-          <v:shape id="DocuMindTextBox176" type="#_x0000_t202" stroked="f" filled="f" o:allowincell="f" style="position:absolute;margin-left:475.799pt;margin-top:734.050pt;width:51.695pt;height:17.249pt;z-index:251659264;mso-position-horizontal-relative:page;mso-position-vertical-relative:page;mso-wrap-style:none;mso-fit-shape-to-text:t;">
+          <v:shape id="DocuMindTextBox181" type="#_x0000_t202" stroked="f" filled="f" o:allowincell="f" style="position:absolute;margin-left:475.799pt;margin-top:734.050pt;width:51.695pt;height:17.249pt;z-index:251659264;mso-position-horizontal-relative:page;mso-position-vertical-relative:page;mso-wrap-style:none;mso-fit-shape-to-text:t;">
             <w10:wrap type="none"/>
             <v:textbox inset="0,0,0,0">
               <w:txbxContent>
@@ -4825,7 +4865,7 @@
       </w:r>
       <w:r>
         <w:pict>
-          <v:shape id="DocuMindTextBox177" type="#_x0000_t202" stroked="f" filled="f" o:allowincell="f" style="position:absolute;margin-left:57.636pt;margin-top:107.060pt;width:412.488pt;height:19.799pt;z-index:251659264;mso-position-horizontal-relative:page;mso-position-vertical-relative:page;mso-wrap-style:none;mso-fit-shape-to-text:t;">
+          <v:shape id="DocuMindTextBox182" type="#_x0000_t202" stroked="f" filled="f" o:allowincell="f" style="position:absolute;margin-left:57.636pt;margin-top:107.060pt;width:412.488pt;height:19.799pt;z-index:251659264;mso-position-horizontal-relative:page;mso-position-vertical-relative:page;mso-wrap-style:none;mso-fit-shape-to-text:t;">
             <w10:wrap type="none"/>
             <v:textbox inset="0,0,0,0">
               <w:txbxContent>
@@ -4852,7 +4892,7 @@
       </w:r>
       <w:r>
         <w:pict>
-          <v:shape id="DocuMindTextBox178" type="#_x0000_t202" stroked="f" filled="f" o:allowincell="f" style="position:absolute;margin-left:75.634pt;margin-top:127.139pt;width:10.799pt;height:20.384pt;z-index:251659264;mso-position-horizontal-relative:page;mso-position-vertical-relative:page;mso-wrap-style:none;mso-fit-shape-to-text:t;">
+          <v:shape id="DocuMindTextBox183" type="#_x0000_t202" stroked="f" filled="f" o:allowincell="f" style="position:absolute;margin-left:75.634pt;margin-top:127.139pt;width:10.799pt;height:20.384pt;z-index:251659264;mso-position-horizontal-relative:page;mso-position-vertical-relative:page;mso-wrap-style:none;mso-fit-shape-to-text:t;">
             <w10:wrap type="none"/>
             <v:textbox inset="0,0,0,0">
               <w:txbxContent>
@@ -4879,7 +4919,7 @@
       </w:r>
       <w:r>
         <w:pict>
-          <v:shape id="DocuMindTextBox179" type="#_x0000_t202" stroked="f" filled="f" o:allowincell="f" style="position:absolute;margin-left:93.632pt;margin-top:128.298pt;width:33.545pt;height:19.799pt;z-index:251659264;mso-position-horizontal-relative:page;mso-position-vertical-relative:page;mso-wrap-style:none;mso-fit-shape-to-text:t;">
+          <v:shape id="DocuMindTextBox184" type="#_x0000_t202" stroked="f" filled="f" o:allowincell="f" style="position:absolute;margin-left:93.632pt;margin-top:128.298pt;width:33.545pt;height:19.799pt;z-index:251659264;mso-position-horizontal-relative:page;mso-position-vertical-relative:page;mso-wrap-style:none;mso-fit-shape-to-text:t;">
             <w10:wrap type="none"/>
             <v:textbox inset="0,0,0,0">
               <w:txbxContent>
@@ -4906,7 +4946,7 @@
       </w:r>
       <w:r>
         <w:pict>
-          <v:shape id="DocuMindTextBox180" type="#_x0000_t202" stroked="f" filled="f" o:allowincell="f" style="position:absolute;margin-left:124.229pt;margin-top:128.298pt;width:95.363pt;height:19.799pt;z-index:251659264;mso-position-horizontal-relative:page;mso-position-vertical-relative:page;mso-wrap-style:none;mso-fit-shape-to-text:t;">
+          <v:shape id="DocuMindTextBox185" type="#_x0000_t202" stroked="f" filled="f" o:allowincell="f" style="position:absolute;margin-left:124.229pt;margin-top:128.298pt;width:95.363pt;height:19.799pt;z-index:251659264;mso-position-horizontal-relative:page;mso-position-vertical-relative:page;mso-wrap-style:none;mso-fit-shape-to-text:t;">
             <w10:wrap type="none"/>
             <v:textbox inset="0,0,0,0">
               <w:txbxContent>
@@ -4933,7 +4973,7 @@
       </w:r>
       <w:r>
         <w:pict>
-          <v:shape id="DocuMindTextBox181" type="#_x0000_t202" stroked="f" filled="f" o:allowincell="f" style="position:absolute;margin-left:216.502pt;margin-top:128.298pt;width:36.065pt;height:19.799pt;z-index:251659264;mso-position-horizontal-relative:page;mso-position-vertical-relative:page;mso-wrap-style:none;mso-fit-shape-to-text:t;">
+          <v:shape id="DocuMindTextBox186" type="#_x0000_t202" stroked="f" filled="f" o:allowincell="f" style="position:absolute;margin-left:216.502pt;margin-top:128.298pt;width:36.065pt;height:19.799pt;z-index:251659264;mso-position-horizontal-relative:page;mso-position-vertical-relative:page;mso-wrap-style:none;mso-fit-shape-to-text:t;">
             <w10:wrap type="none"/>
             <v:textbox inset="0,0,0,0">
               <w:txbxContent>
@@ -4960,7 +5000,7 @@
       </w:r>
       <w:r>
         <w:pict>
-          <v:shape id="DocuMindTextBox182" type="#_x0000_t202" stroked="f" filled="f" o:allowincell="f" style="position:absolute;margin-left:249.619pt;margin-top:128.298pt;width:45.863pt;height:19.799pt;z-index:251659264;mso-position-horizontal-relative:page;mso-position-vertical-relative:page;mso-wrap-style:none;mso-fit-shape-to-text:t;">
+          <v:shape id="DocuMindTextBox187" type="#_x0000_t202" stroked="f" filled="f" o:allowincell="f" style="position:absolute;margin-left:249.619pt;margin-top:128.298pt;width:45.863pt;height:19.799pt;z-index:251659264;mso-position-horizontal-relative:page;mso-position-vertical-relative:page;mso-wrap-style:none;mso-fit-shape-to-text:t;">
             <w10:wrap type="none"/>
             <v:textbox inset="0,0,0,0">
               <w:txbxContent>
@@ -4987,7 +5027,7 @@
       </w:r>
       <w:r>
         <w:pict>
-          <v:shape id="DocuMindTextBox183" type="#_x0000_t202" stroked="f" filled="f" o:allowincell="f" style="position:absolute;margin-left:292.336pt;margin-top:128.298pt;width:171.325pt;height:19.799pt;z-index:251659264;mso-position-horizontal-relative:page;mso-position-vertical-relative:page;mso-wrap-style:none;mso-fit-shape-to-text:t;">
+          <v:shape id="DocuMindTextBox188" type="#_x0000_t202" stroked="f" filled="f" o:allowincell="f" style="position:absolute;margin-left:292.336pt;margin-top:128.298pt;width:171.325pt;height:19.799pt;z-index:251659264;mso-position-horizontal-relative:page;mso-position-vertical-relative:page;mso-wrap-style:none;mso-fit-shape-to-text:t;">
             <w10:wrap type="none"/>
             <v:textbox inset="0,0,0,0">
               <w:txbxContent>
@@ -5014,7 +5054,7 @@
       </w:r>
       <w:r>
         <w:pict>
-          <v:shape id="DocuMindTextBox184" type="#_x0000_t202" stroked="f" filled="f" o:allowincell="f" style="position:absolute;margin-left:75.634pt;margin-top:148.616pt;width:10.799pt;height:20.384pt;z-index:251659264;mso-position-horizontal-relative:page;mso-position-vertical-relative:page;mso-wrap-style:none;mso-fit-shape-to-text:t;">
+          <v:shape id="DocuMindTextBox189" type="#_x0000_t202" stroked="f" filled="f" o:allowincell="f" style="position:absolute;margin-left:75.634pt;margin-top:148.616pt;width:10.799pt;height:20.384pt;z-index:251659264;mso-position-horizontal-relative:page;mso-position-vertical-relative:page;mso-wrap-style:none;mso-fit-shape-to-text:t;">
             <w10:wrap type="none"/>
             <v:textbox inset="0,0,0,0">
               <w:txbxContent>
@@ -5041,7 +5081,7 @@
       </w:r>
       <w:r>
         <w:pict>
-          <v:shape id="DocuMindTextBox185" type="#_x0000_t202" stroked="f" filled="f" o:allowincell="f" style="position:absolute;margin-left:93.632pt;margin-top:149.775pt;width:33.545pt;height:19.799pt;z-index:251659264;mso-position-horizontal-relative:page;mso-position-vertical-relative:page;mso-wrap-style:none;mso-fit-shape-to-text:t;">
+          <v:shape id="DocuMindTextBox190" type="#_x0000_t202" stroked="f" filled="f" o:allowincell="f" style="position:absolute;margin-left:93.632pt;margin-top:149.775pt;width:33.545pt;height:19.799pt;z-index:251659264;mso-position-horizontal-relative:page;mso-position-vertical-relative:page;mso-wrap-style:none;mso-fit-shape-to-text:t;">
             <w10:wrap type="none"/>
             <v:textbox inset="0,0,0,0">
               <w:txbxContent>
@@ -5068,7 +5108,7 @@
       </w:r>
       <w:r>
         <w:pict>
-          <v:shape id="DocuMindTextBox186" type="#_x0000_t202" stroked="f" filled="f" o:allowincell="f" style="position:absolute;margin-left:124.229pt;margin-top:149.775pt;width:97.784pt;height:19.799pt;z-index:251659264;mso-position-horizontal-relative:page;mso-position-vertical-relative:page;mso-wrap-style:none;mso-fit-shape-to-text:t;">
+          <v:shape id="DocuMindTextBox191" type="#_x0000_t202" stroked="f" filled="f" o:allowincell="f" style="position:absolute;margin-left:124.229pt;margin-top:149.775pt;width:97.784pt;height:19.799pt;z-index:251659264;mso-position-horizontal-relative:page;mso-position-vertical-relative:page;mso-wrap-style:none;mso-fit-shape-to-text:t;">
             <w10:wrap type="none"/>
             <v:textbox inset="0,0,0,0">
               <w:txbxContent>
@@ -5095,7 +5135,7 @@
       </w:r>
       <w:r>
         <w:pict>
-          <v:shape id="DocuMindTextBox187" type="#_x0000_t202" stroked="f" filled="f" o:allowincell="f" style="position:absolute;margin-left:219.022pt;margin-top:149.775pt;width:237.821pt;height:19.799pt;z-index:251659264;mso-position-horizontal-relative:page;mso-position-vertical-relative:page;mso-wrap-style:none;mso-fit-shape-to-text:t;">
+          <v:shape id="DocuMindTextBox192" type="#_x0000_t202" stroked="f" filled="f" o:allowincell="f" style="position:absolute;margin-left:219.022pt;margin-top:149.775pt;width:237.821pt;height:19.799pt;z-index:251659264;mso-position-horizontal-relative:page;mso-position-vertical-relative:page;mso-wrap-style:none;mso-fit-shape-to-text:t;">
             <w10:wrap type="none"/>
             <v:textbox inset="0,0,0,0">
               <w:txbxContent>
@@ -5122,7 +5162,7 @@
       </w:r>
       <w:r>
         <w:pict>
-          <v:shape id="DocuMindTextBox188" type="#_x0000_t202" stroked="f" filled="f" o:allowincell="f" style="position:absolute;margin-left:75.634pt;margin-top:169.975pt;width:10.799pt;height:20.384pt;z-index:251659264;mso-position-horizontal-relative:page;mso-position-vertical-relative:page;mso-wrap-style:none;mso-fit-shape-to-text:t;">
+          <v:shape id="DocuMindTextBox193" type="#_x0000_t202" stroked="f" filled="f" o:allowincell="f" style="position:absolute;margin-left:75.634pt;margin-top:169.975pt;width:10.799pt;height:20.384pt;z-index:251659264;mso-position-horizontal-relative:page;mso-position-vertical-relative:page;mso-wrap-style:none;mso-fit-shape-to-text:t;">
             <w10:wrap type="none"/>
             <v:textbox inset="0,0,0,0">
               <w:txbxContent>
@@ -5149,7 +5189,7 @@
       </w:r>
       <w:r>
         <w:pict>
-          <v:shape id="DocuMindTextBox189" type="#_x0000_t202" stroked="f" filled="f" o:allowincell="f" style="position:absolute;margin-left:93.632pt;margin-top:171.134pt;width:33.545pt;height:19.799pt;z-index:251659264;mso-position-horizontal-relative:page;mso-position-vertical-relative:page;mso-wrap-style:none;mso-fit-shape-to-text:t;">
+          <v:shape id="DocuMindTextBox194" type="#_x0000_t202" stroked="f" filled="f" o:allowincell="f" style="position:absolute;margin-left:93.632pt;margin-top:171.134pt;width:33.545pt;height:19.799pt;z-index:251659264;mso-position-horizontal-relative:page;mso-position-vertical-relative:page;mso-wrap-style:none;mso-fit-shape-to-text:t;">
             <w10:wrap type="none"/>
             <v:textbox inset="0,0,0,0">
               <w:txbxContent>
@@ -5176,7 +5216,7 @@
       </w:r>
       <w:r>
         <w:pict>
-          <v:shape id="DocuMindTextBox190" type="#_x0000_t202" stroked="f" filled="f" o:allowincell="f" style="position:absolute;margin-left:124.229pt;margin-top:171.134pt;width:100.247pt;height:19.799pt;z-index:251659264;mso-position-horizontal-relative:page;mso-position-vertical-relative:page;mso-wrap-style:none;mso-fit-shape-to-text:t;">
+          <v:shape id="DocuMindTextBox195" type="#_x0000_t202" stroked="f" filled="f" o:allowincell="f" style="position:absolute;margin-left:124.229pt;margin-top:171.134pt;width:100.247pt;height:19.799pt;z-index:251659264;mso-position-horizontal-relative:page;mso-position-vertical-relative:page;mso-wrap-style:none;mso-fit-shape-to-text:t;">
             <w10:wrap type="none"/>
             <v:textbox inset="0,0,0,0">
               <w:txbxContent>
@@ -5203,7 +5243,7 @@
       </w:r>
       <w:r>
         <w:pict>
-          <v:shape id="DocuMindTextBox191" type="#_x0000_t202" stroked="f" filled="f" o:allowincell="f" style="position:absolute;margin-left:221.421pt;margin-top:171.134pt;width:144.423pt;height:19.799pt;z-index:251659264;mso-position-horizontal-relative:page;mso-position-vertical-relative:page;mso-wrap-style:none;mso-fit-shape-to-text:t;">
+          <v:shape id="DocuMindTextBox196" type="#_x0000_t202" stroked="f" filled="f" o:allowincell="f" style="position:absolute;margin-left:221.421pt;margin-top:171.134pt;width:144.423pt;height:19.799pt;z-index:251659264;mso-position-horizontal-relative:page;mso-position-vertical-relative:page;mso-wrap-style:none;mso-fit-shape-to-text:t;">
             <w10:wrap type="none"/>
             <v:textbox inset="0,0,0,0">
               <w:txbxContent>
@@ -5230,7 +5270,7 @@
       </w:r>
       <w:r>
         <w:pict>
-          <v:shape id="DocuMindTextBox192" type="#_x0000_t202" stroked="f" filled="f" o:allowincell="f" style="position:absolute;margin-left:57.636pt;margin-top:201.897pt;width:142.272pt;height:23.549pt;z-index:251659264;mso-position-horizontal-relative:page;mso-position-vertical-relative:page;mso-wrap-style:none;mso-fit-shape-to-text:t;">
+          <v:shape id="DocuMindTextBox197" type="#_x0000_t202" stroked="f" filled="f" o:allowincell="f" style="position:absolute;margin-left:57.636pt;margin-top:201.897pt;width:142.272pt;height:23.549pt;z-index:251659264;mso-position-horizontal-relative:page;mso-position-vertical-relative:page;mso-wrap-style:none;mso-fit-shape-to-text:t;">
             <w10:wrap type="none"/>
             <v:textbox inset="0,0,0,0">
               <w:txbxContent>
@@ -5257,7 +5297,7 @@
       </w:r>
       <w:r>
         <w:pict>
-          <v:shape id="DocuMindTextBox193" type="#_x0000_t202" stroked="f" filled="f" o:allowincell="f" style="position:absolute;margin-left:57.636pt;margin-top:225.781pt;width:10.049pt;height:18.977pt;z-index:251659264;mso-position-horizontal-relative:page;mso-position-vertical-relative:page;mso-wrap-style:none;mso-fit-shape-to-text:t;">
+          <v:shape id="DocuMindTextBox198" type="#_x0000_t202" stroked="f" filled="f" o:allowincell="f" style="position:absolute;margin-left:57.636pt;margin-top:225.781pt;width:10.049pt;height:18.977pt;z-index:251659264;mso-position-horizontal-relative:page;mso-position-vertical-relative:page;mso-wrap-style:none;mso-fit-shape-to-text:t;">
             <w10:wrap type="none"/>
             <v:textbox inset="0,0,0,0">
               <w:txbxContent>
@@ -5284,7 +5324,7 @@
       </w:r>
       <w:r>
         <w:pict>
-          <v:shape id="DocuMindTextBox194" type="#_x0000_t202" stroked="f" filled="f" o:allowincell="f" style="position:absolute;margin-left:75.634pt;margin-top:225.850pt;width:128.891pt;height:19.799pt;z-index:251659264;mso-position-horizontal-relative:page;mso-position-vertical-relative:page;mso-wrap-style:none;mso-fit-shape-to-text:t;">
+          <v:shape id="DocuMindTextBox199" type="#_x0000_t202" stroked="f" filled="f" o:allowincell="f" style="position:absolute;margin-left:75.634pt;margin-top:225.850pt;width:128.891pt;height:19.799pt;z-index:251659264;mso-position-horizontal-relative:page;mso-position-vertical-relative:page;mso-wrap-style:none;mso-fit-shape-to-text:t;">
             <w10:wrap type="none"/>
             <v:textbox inset="0,0,0,0">
               <w:txbxContent>
@@ -5311,7 +5351,7 @@
       </w:r>
       <w:r>
         <w:pict>
-          <v:shape id="DocuMindTextBox195" type="#_x0000_t202" stroked="f" filled="f" o:allowincell="f" style="position:absolute;margin-left:201.624pt;margin-top:225.850pt;width:94.172pt;height:19.799pt;z-index:251659264;mso-position-horizontal-relative:page;mso-position-vertical-relative:page;mso-wrap-style:none;mso-fit-shape-to-text:t;">
+          <v:shape id="DocuMindTextBox200" type="#_x0000_t202" stroked="f" filled="f" o:allowincell="f" style="position:absolute;margin-left:201.624pt;margin-top:225.850pt;width:94.172pt;height:19.799pt;z-index:251659264;mso-position-horizontal-relative:page;mso-position-vertical-relative:page;mso-wrap-style:none;mso-fit-shape-to-text:t;">
             <w10:wrap type="none"/>
             <v:textbox inset="0,0,0,0">
               <w:txbxContent>
@@ -5338,7 +5378,7 @@
       </w:r>
       <w:r>
         <w:pict>
-          <v:shape id="DocuMindTextBox196" type="#_x0000_t202" stroked="f" filled="f" o:allowincell="f" style="position:absolute;margin-left:292.696pt;margin-top:225.850pt;width:226.255pt;height:19.799pt;z-index:251659264;mso-position-horizontal-relative:page;mso-position-vertical-relative:page;mso-wrap-style:none;mso-fit-shape-to-text:t;">
+          <v:shape id="DocuMindTextBox201" type="#_x0000_t202" stroked="f" filled="f" o:allowincell="f" style="position:absolute;margin-left:292.696pt;margin-top:225.850pt;width:226.255pt;height:19.799pt;z-index:251659264;mso-position-horizontal-relative:page;mso-position-vertical-relative:page;mso-wrap-style:none;mso-fit-shape-to-text:t;">
             <w10:wrap type="none"/>
             <v:textbox inset="0,0,0,0">
               <w:txbxContent>

</xml_diff>

<commit_message>
Step 50 - Render detected PDF tables
</commit_message>
<xml_diff>
--- a/output/output.docx
+++ b/output/output.docx
@@ -1167,7 +1167,1305 @@
       </w:r>
       <w:r>
         <w:pict>
-          <v:shape id="DocuMindTextBox43" type="#_x0000_t202" stroked="f" filled="f" o:allowincell="f" style="position:absolute;margin-left:56.800pt;margin-top:81.156pt;width:483.669pt;height:19.125pt;z-index:251659264;mso-position-horizontal-relative:page;mso-position-vertical-relative:page;mso-wrap-style:none;mso-fit-shape-to-text:t;">
+          <v:shape id="DocuMindTableCell43" type="#_x0000_t202" filled="f" stroked="t" strokecolor="#000000" strokeweight="0.75pt" o:allowincell="f" style="position:absolute;margin-left:56.743pt;margin-top:56.700pt;width:482.371pt;height:321.600pt;z-index:100;mso-position-horizontal-relative:page;mso-position-vertical-relative:page;mso-wrap-style:none;">
+            <w10:wrap type="none"/>
+            <v:textbox inset="2.0pt,1.0pt,2.0pt,1.0pt">
+              <w:txbxContent>
+                <w:p>
+                  <w:pPr>
+                    <w:spacing w:before="0" w:after="0" w:line="240" w:lineRule="auto"/>
+                    <w:ind w:left="0" w:right="0" w:firstLine="0"/>
+                  </w:pPr>
+                  <w:r>
+                    <w:rPr>
+                      <w:rFonts w:ascii="Deja Vu Sans" w:hAnsi="Deja Vu Sans" w:eastAsia="Deja Vu Sans" w:cs="Deja Vu Sans"/>
+                      <w:b w:val="0"/>
+                      <w:i w:val="0"/>
+                      <w:color w:val="000000"/>
+                      <w:sz w:val="21"/>
+                    </w:rPr>
+                    <w:t>In non mauris justo. Duis vehicula mi vel mi pretium, a viverra erat efcfi itur. Cras aliquam</w:t>
+                    <w:br/>
+                  </w:r>
+                  <w:r>
+                    <w:rPr>
+                      <w:rFonts w:ascii="Deja Vu Sans" w:hAnsi="Deja Vu Sans" w:eastAsia="Deja Vu Sans" w:cs="Deja Vu Sans"/>
+                      <w:b w:val="0"/>
+                      <w:i w:val="0"/>
+                      <w:color w:val="000000"/>
+                      <w:sz w:val="21"/>
+                    </w:rPr>
+                    <w:t>est ac eros varius, id iaculis dui auctor. Duis pretium neque ligula, et pulvinar mi placerat</w:t>
+                    <w:br/>
+                  </w:r>
+                  <w:r>
+                    <w:rPr>
+                      <w:rFonts w:ascii="Deja Vu Sans" w:hAnsi="Deja Vu Sans" w:eastAsia="Deja Vu Sans" w:cs="Deja Vu Sans"/>
+                      <w:b w:val="0"/>
+                      <w:i w:val="0"/>
+                      <w:color w:val="000000"/>
+                      <w:sz w:val="21"/>
+                    </w:rPr>
+                    <w:t>et. Nulla nec nunc sit amet nunc posuere vestibulum. Ut id neque eget tortor mattis</w:t>
+                    <w:br/>
+                  </w:r>
+                  <w:r>
+                    <w:rPr>
+                      <w:rFonts w:ascii="Deja Vu Sans" w:hAnsi="Deja Vu Sans" w:eastAsia="Deja Vu Sans" w:cs="Deja Vu Sans"/>
+                      <w:b w:val="0"/>
+                      <w:i w:val="0"/>
+                      <w:color w:val="000000"/>
+                      <w:sz w:val="21"/>
+                    </w:rPr>
+                    <w:t>tristique. Donec ante est, blandit sit amet tristique vel, lacinia pulvinar arcu. Pellentesque</w:t>
+                    <w:br/>
+                  </w:r>
+                  <w:r>
+                    <w:rPr>
+                      <w:rFonts w:ascii="Deja Vu Sans" w:hAnsi="Deja Vu Sans" w:eastAsia="Deja Vu Sans" w:cs="Deja Vu Sans"/>
+                      <w:b w:val="0"/>
+                      <w:i w:val="0"/>
+                      <w:color w:val="000000"/>
+                      <w:sz w:val="21"/>
+                    </w:rPr>
+                    <w:t>scelerisque fermentum erat, id posuere justo pulvinar ut. Cras id eros sed enim aliquam</w:t>
+                    <w:br/>
+                  </w:r>
+                  <w:r>
+                    <w:rPr>
+                      <w:rFonts w:ascii="Deja Vu Sans" w:hAnsi="Deja Vu Sans" w:eastAsia="Deja Vu Sans" w:cs="Deja Vu Sans"/>
+                      <w:b w:val="0"/>
+                      <w:i w:val="0"/>
+                      <w:color w:val="000000"/>
+                      <w:sz w:val="21"/>
+                    </w:rPr>
+                    <w:t>lobortis. Sed lobortis nisl ut eros efcfi itur tincidunt. Cras justo mi, porttitor quis mattis vel,</w:t>
+                    <w:br/>
+                  </w:r>
+                  <w:r>
+                    <w:rPr>
+                      <w:rFonts w:ascii="Deja Vu Sans" w:hAnsi="Deja Vu Sans" w:eastAsia="Deja Vu Sans" w:cs="Deja Vu Sans"/>
+                      <w:b w:val="0"/>
+                      <w:i w:val="0"/>
+                      <w:color w:val="000000"/>
+                      <w:sz w:val="21"/>
+                    </w:rPr>
+                    <w:t>ultricies ut purus. Ut facilisis et lacus eu cursus.</w:t>
+                    <w:br/>
+                  </w:r>
+                  <w:r>
+                    <w:rPr>
+                      <w:rFonts w:ascii="Deja Vu Sans" w:hAnsi="Deja Vu Sans" w:eastAsia="Deja Vu Sans" w:cs="Deja Vu Sans"/>
+                      <w:b w:val="0"/>
+                      <w:i w:val="0"/>
+                      <w:color w:val="000000"/>
+                      <w:sz w:val="21"/>
+                    </w:rPr>
+                    <w:t>In eleifend velit vitae libero sollicitudin euismod. Fusce vitae vestibulum velit. Pellentesque</w:t>
+                    <w:br/>
+                  </w:r>
+                  <w:r>
+                    <w:rPr>
+                      <w:rFonts w:ascii="Deja Vu Sans" w:hAnsi="Deja Vu Sans" w:eastAsia="Deja Vu Sans" w:cs="Deja Vu Sans"/>
+                      <w:b w:val="0"/>
+                      <w:i w:val="0"/>
+                      <w:color w:val="000000"/>
+                      <w:sz w:val="21"/>
+                    </w:rPr>
+                    <w:t>vulputate lectus quis pellentesque commodo. Aliquam erat volutpat. Vestibulum in egestas</w:t>
+                    <w:br/>
+                  </w:r>
+                  <w:r>
+                    <w:rPr>
+                      <w:rFonts w:ascii="Deja Vu Sans" w:hAnsi="Deja Vu Sans" w:eastAsia="Deja Vu Sans" w:cs="Deja Vu Sans"/>
+                      <w:b w:val="0"/>
+                      <w:i w:val="0"/>
+                      <w:color w:val="000000"/>
+                      <w:sz w:val="21"/>
+                    </w:rPr>
+                    <w:t>velit. Pellentesque fermentum nisl vitae fringilla venenatis. Etiam id mauris vitae orci</w:t>
+                    <w:br/>
+                  </w:r>
+                  <w:r>
+                    <w:rPr>
+                      <w:rFonts w:ascii="Deja Vu Sans" w:hAnsi="Deja Vu Sans" w:eastAsia="Deja Vu Sans" w:cs="Deja Vu Sans"/>
+                      <w:b w:val="0"/>
+                      <w:i w:val="0"/>
+                      <w:color w:val="000000"/>
+                      <w:sz w:val="21"/>
+                    </w:rPr>
+                    <w:t>maximus ultricies.</w:t>
+                    <w:br/>
+                  </w:r>
+                  <w:r>
+                    <w:rPr>
+                      <w:rFonts w:ascii="Deja Vu Sans" w:hAnsi="Deja Vu Sans" w:eastAsia="Deja Vu Sans" w:cs="Deja Vu Sans"/>
+                      <w:b w:val="0"/>
+                      <w:i w:val="0"/>
+                      <w:color w:val="000000"/>
+                      <w:sz w:val="21"/>
+                    </w:rPr>
+                    <w:t>Cras fringilla ipsum magna, in fringilla dui commodo</w:t>
+                    <w:br/>
+                  </w:r>
+                  <w:r>
+                    <w:rPr>
+                      <w:rFonts w:ascii="Deja Vu Sans" w:hAnsi="Deja Vu Sans" w:eastAsia="Deja Vu Sans" w:cs="Deja Vu Sans"/>
+                      <w:b w:val="0"/>
+                      <w:i w:val="0"/>
+                      <w:color w:val="000000"/>
+                      <w:sz w:val="21"/>
+                    </w:rPr>
+                    <w:t>a.</w:t>
+                  </w:r>
+                </w:p>
+              </w:txbxContent>
+            </v:textbox>
+          </v:shape>
+        </w:pict>
+      </w:r>
+      <w:r>
+        <w:pict>
+          <v:shape id="DocuMindTableCell44" type="#_x0000_t202" filled="f" stroked="t" strokecolor="#000000" strokeweight="0.75pt" o:allowincell="f" style="position:absolute;margin-left:56.743pt;margin-top:378.300pt;width:36.007pt;height:29.100pt;z-index:100;mso-position-horizontal-relative:page;mso-position-vertical-relative:page;mso-wrap-style:none;">
+            <w10:wrap type="none"/>
+            <v:textbox inset="2.0pt,1.0pt,2.0pt,1.0pt">
+              <w:txbxContent>
+                <w:p>
+                  <w:pPr>
+                    <w:spacing w:before="0" w:after="0" w:line="240" w:lineRule="auto"/>
+                    <w:ind w:left="0" w:right="0" w:firstLine="0"/>
+                  </w:pPr>
+                  <w:r>
+                    <w:rPr>
+                      <w:rFonts w:ascii="Arial" w:hAnsi="Arial" w:eastAsia="Arial" w:cs="Arial"/>
+                      <w:sz w:val="18"/>
+                    </w:rPr>
+                  </w:r>
+                </w:p>
+              </w:txbxContent>
+            </v:textbox>
+          </v:shape>
+        </w:pict>
+      </w:r>
+      <w:r>
+        <w:pict>
+          <v:shape id="DocuMindTableCell45" type="#_x0000_t202" filled="f" stroked="t" strokecolor="#000000" strokeweight="0.75pt" o:allowincell="f" style="position:absolute;margin-left:56.743pt;margin-top:407.400pt;width:36.007pt;height:29.100pt;z-index:100;mso-position-horizontal-relative:page;mso-position-vertical-relative:page;mso-wrap-style:none;">
+            <w10:wrap type="none"/>
+            <v:textbox inset="2.0pt,1.0pt,2.0pt,1.0pt">
+              <w:txbxContent>
+                <w:p>
+                  <w:pPr>
+                    <w:spacing w:before="0" w:after="0" w:line="240" w:lineRule="auto"/>
+                    <w:ind w:left="0" w:right="0" w:firstLine="0"/>
+                  </w:pPr>
+                  <w:r>
+                    <w:rPr>
+                      <w:rFonts w:ascii="Deja Vu Sans" w:hAnsi="Deja Vu Sans" w:eastAsia="Deja Vu Sans" w:cs="Deja Vu Sans"/>
+                      <w:b w:val="0"/>
+                      <w:i w:val="0"/>
+                      <w:color w:val="000000"/>
+                      <w:sz w:val="21"/>
+                    </w:rPr>
+                  </w:r>
+                </w:p>
+              </w:txbxContent>
+            </v:textbox>
+          </v:shape>
+        </w:pict>
+      </w:r>
+      <w:r>
+        <w:pict>
+          <v:shape id="DocuMindTableCell46" type="#_x0000_t202" filled="f" stroked="t" strokecolor="#000000" strokeweight="0.75pt" o:allowincell="f" style="position:absolute;margin-left:56.743pt;margin-top:436.500pt;width:36.007pt;height:43.800pt;z-index:100;mso-position-horizontal-relative:page;mso-position-vertical-relative:page;mso-wrap-style:none;">
+            <w10:wrap type="none"/>
+            <v:textbox inset="2.0pt,1.0pt,2.0pt,1.0pt">
+              <w:txbxContent>
+                <w:p>
+                  <w:pPr>
+                    <w:spacing w:before="0" w:after="0" w:line="240" w:lineRule="auto"/>
+                    <w:ind w:left="0" w:right="0" w:firstLine="0"/>
+                  </w:pPr>
+                  <w:r>
+                    <w:rPr>
+                      <w:rFonts w:ascii="Deja Vu Sans" w:hAnsi="Deja Vu Sans" w:eastAsia="Deja Vu Sans" w:cs="Deja Vu Sans"/>
+                      <w:b w:val="0"/>
+                      <w:i w:val="0"/>
+                      <w:color w:val="000000"/>
+                      <w:sz w:val="21"/>
+                    </w:rPr>
+                  </w:r>
+                </w:p>
+              </w:txbxContent>
+            </v:textbox>
+          </v:shape>
+        </w:pict>
+      </w:r>
+      <w:r>
+        <w:pict>
+          <v:shape id="DocuMindTableCell47" type="#_x0000_t202" filled="f" stroked="t" strokecolor="#000000" strokeweight="0.75pt" o:allowincell="f" style="position:absolute;margin-left:56.743pt;margin-top:480.300pt;width:36.007pt;height:29.100pt;z-index:100;mso-position-horizontal-relative:page;mso-position-vertical-relative:page;mso-wrap-style:none;">
+            <w10:wrap type="none"/>
+            <v:textbox inset="2.0pt,1.0pt,2.0pt,1.0pt">
+              <w:txbxContent>
+                <w:p>
+                  <w:pPr>
+                    <w:spacing w:before="0" w:after="0" w:line="240" w:lineRule="auto"/>
+                    <w:ind w:left="0" w:right="0" w:firstLine="0"/>
+                  </w:pPr>
+                  <w:r>
+                    <w:rPr>
+                      <w:rFonts w:ascii="Deja Vu Sans" w:hAnsi="Deja Vu Sans" w:eastAsia="Deja Vu Sans" w:cs="Deja Vu Sans"/>
+                      <w:b w:val="0"/>
+                      <w:i w:val="0"/>
+                      <w:color w:val="000000"/>
+                      <w:sz w:val="21"/>
+                    </w:rPr>
+                  </w:r>
+                </w:p>
+              </w:txbxContent>
+            </v:textbox>
+          </v:shape>
+        </w:pict>
+      </w:r>
+      <w:r>
+        <w:pict>
+          <v:shape id="DocuMindTableCell48" type="#_x0000_t202" filled="f" stroked="t" strokecolor="#000000" strokeweight="0.75pt" o:allowincell="f" style="position:absolute;margin-left:56.743pt;margin-top:509.400pt;width:36.007pt;height:29.100pt;z-index:100;mso-position-horizontal-relative:page;mso-position-vertical-relative:page;mso-wrap-style:none;">
+            <w10:wrap type="none"/>
+            <v:textbox inset="2.0pt,1.0pt,2.0pt,1.0pt">
+              <w:txbxContent>
+                <w:p>
+                  <w:pPr>
+                    <w:spacing w:before="0" w:after="0" w:line="240" w:lineRule="auto"/>
+                    <w:ind w:left="0" w:right="0" w:firstLine="0"/>
+                  </w:pPr>
+                  <w:r>
+                    <w:rPr>
+                      <w:rFonts w:ascii="Deja Vu Sans" w:hAnsi="Deja Vu Sans" w:eastAsia="Deja Vu Sans" w:cs="Deja Vu Sans"/>
+                      <w:b w:val="0"/>
+                      <w:i w:val="0"/>
+                      <w:color w:val="000000"/>
+                      <w:sz w:val="21"/>
+                    </w:rPr>
+                    <w:t>Lorem ipsum</w:t>
+                  </w:r>
+                </w:p>
+              </w:txbxContent>
+            </v:textbox>
+          </v:shape>
+        </w:pict>
+      </w:r>
+      <w:r>
+        <w:pict>
+          <v:shape id="DocuMindTableCell49" type="#_x0000_t202" filled="f" stroked="t" strokecolor="#000000" strokeweight="0.75pt" o:allowincell="f" style="position:absolute;margin-left:56.743pt;margin-top:538.500pt;width:36.007pt;height:29.100pt;z-index:100;mso-position-horizontal-relative:page;mso-position-vertical-relative:page;mso-wrap-style:none;">
+            <w10:wrap type="none"/>
+            <v:textbox inset="2.0pt,1.0pt,2.0pt,1.0pt">
+              <w:txbxContent>
+                <w:p>
+                  <w:pPr>
+                    <w:spacing w:before="0" w:after="0" w:line="240" w:lineRule="auto"/>
+                    <w:ind w:left="0" w:right="0" w:firstLine="0"/>
+                  </w:pPr>
+                  <w:r>
+                    <w:rPr>
+                      <w:rFonts w:ascii="Deja Vu Sans" w:hAnsi="Deja Vu Sans" w:eastAsia="Deja Vu Sans" w:cs="Deja Vu Sans"/>
+                      <w:b w:val="0"/>
+                      <w:i w:val="0"/>
+                      <w:color w:val="000000"/>
+                      <w:sz w:val="21"/>
+                    </w:rPr>
+                    <w:t>Lorem ipsum</w:t>
+                  </w:r>
+                </w:p>
+              </w:txbxContent>
+            </v:textbox>
+          </v:shape>
+        </w:pict>
+      </w:r>
+      <w:r>
+        <w:pict>
+          <v:shape id="DocuMindTableCell50" type="#_x0000_t202" filled="f" stroked="t" strokecolor="#000000" strokeweight="0.75pt" o:allowincell="f" style="position:absolute;margin-left:56.743pt;margin-top:567.600pt;width:482.371pt;height:217.600pt;z-index:100;mso-position-horizontal-relative:page;mso-position-vertical-relative:page;mso-wrap-style:none;">
+            <w10:wrap type="none"/>
+            <v:textbox inset="2.0pt,1.0pt,2.0pt,1.0pt">
+              <w:txbxContent>
+                <w:p>
+                  <w:pPr>
+                    <w:spacing w:before="0" w:after="0" w:line="240" w:lineRule="auto"/>
+                    <w:ind w:left="0" w:right="0" w:firstLine="0"/>
+                  </w:pPr>
+                  <w:r>
+                    <w:rPr>
+                      <w:rFonts w:ascii="Deja Vu Sans" w:hAnsi="Deja Vu Sans" w:eastAsia="Deja Vu Sans" w:cs="Deja Vu Sans"/>
+                      <w:b w:val="0"/>
+                      <w:i w:val="0"/>
+                      <w:color w:val="000000"/>
+                      <w:sz w:val="21"/>
+                    </w:rPr>
+                    <w:t>Lorem ipsum</w:t>
+                  </w:r>
+                </w:p>
+              </w:txbxContent>
+            </v:textbox>
+          </v:shape>
+        </w:pict>
+      </w:r>
+      <w:r>
+        <w:pict>
+          <v:shape id="DocuMindTableCell51" type="#_x0000_t202" filled="f" stroked="t" strokecolor="#000000" strokeweight="0.75pt" o:allowincell="f" style="position:absolute;margin-left:92.750pt;margin-top:378.300pt;width:283.500pt;height:29.100pt;z-index:100;mso-position-horizontal-relative:page;mso-position-vertical-relative:page;mso-wrap-style:none;">
+            <w10:wrap type="none"/>
+            <v:textbox inset="2.0pt,1.0pt,2.0pt,1.0pt">
+              <w:txbxContent>
+                <w:p>
+                  <w:pPr>
+                    <w:spacing w:before="0" w:after="0" w:line="240" w:lineRule="auto"/>
+                    <w:ind w:left="0" w:right="0" w:firstLine="0"/>
+                  </w:pPr>
+                  <w:r>
+                    <w:rPr>
+                      <w:rFonts w:ascii="Deja Vu Sans" w:hAnsi="Deja Vu Sans" w:eastAsia="Deja Vu Sans" w:cs="Deja Vu Sans"/>
+                      <w:b w:val="0"/>
+                      <w:i w:val="0"/>
+                      <w:color w:val="000000"/>
+                      <w:sz w:val="21"/>
+                    </w:rPr>
+                    <w:t>1</w:t>
+                  </w:r>
+                </w:p>
+              </w:txbxContent>
+            </v:textbox>
+          </v:shape>
+        </w:pict>
+      </w:r>
+      <w:r>
+        <w:pict>
+          <v:shape id="DocuMindTableCell52" type="#_x0000_t202" filled="f" stroked="t" strokecolor="#000000" strokeweight="0.75pt" o:allowincell="f" style="position:absolute;margin-left:92.750pt;margin-top:407.400pt;width:283.500pt;height:29.100pt;z-index:100;mso-position-horizontal-relative:page;mso-position-vertical-relative:page;mso-wrap-style:none;">
+            <w10:wrap type="none"/>
+            <v:textbox inset="2.0pt,1.0pt,2.0pt,1.0pt">
+              <w:txbxContent>
+                <w:p>
+                  <w:pPr>
+                    <w:spacing w:before="0" w:after="0" w:line="240" w:lineRule="auto"/>
+                    <w:ind w:left="0" w:right="0" w:firstLine="0"/>
+                  </w:pPr>
+                  <w:r>
+                    <w:rPr>
+                      <w:rFonts w:ascii="Deja Vu Sans" w:hAnsi="Deja Vu Sans" w:eastAsia="Deja Vu Sans" w:cs="Deja Vu Sans"/>
+                      <w:b w:val="0"/>
+                      <w:i w:val="0"/>
+                      <w:color w:val="000000"/>
+                      <w:sz w:val="21"/>
+                    </w:rPr>
+                    <w:t>In eleifend velit vitae libero sollicitudin euismod.</w:t>
+                  </w:r>
+                </w:p>
+              </w:txbxContent>
+            </v:textbox>
+          </v:shape>
+        </w:pict>
+      </w:r>
+      <w:r>
+        <w:pict>
+          <v:shape id="DocuMindTableCell53" type="#_x0000_t202" filled="f" stroked="t" strokecolor="#000000" strokeweight="0.75pt" o:allowincell="f" style="position:absolute;margin-left:92.750pt;margin-top:436.500pt;width:283.500pt;height:43.800pt;z-index:100;mso-position-horizontal-relative:page;mso-position-vertical-relative:page;mso-wrap-style:none;">
+            <w10:wrap type="none"/>
+            <v:textbox inset="2.0pt,1.0pt,2.0pt,1.0pt">
+              <w:txbxContent>
+                <w:p>
+                  <w:pPr>
+                    <w:spacing w:before="0" w:after="0" w:line="240" w:lineRule="auto"/>
+                    <w:ind w:left="0" w:right="0" w:firstLine="0"/>
+                  </w:pPr>
+                  <w:r>
+                    <w:rPr>
+                      <w:rFonts w:ascii="Deja Vu Sans" w:hAnsi="Deja Vu Sans" w:eastAsia="Deja Vu Sans" w:cs="Deja Vu Sans"/>
+                      <w:b w:val="0"/>
+                      <w:i w:val="0"/>
+                      <w:color w:val="000000"/>
+                      <w:sz w:val="21"/>
+                    </w:rPr>
+                    <w:t>Lorem</w:t>
+                  </w:r>
+                </w:p>
+              </w:txbxContent>
+            </v:textbox>
+          </v:shape>
+        </w:pict>
+      </w:r>
+      <w:r>
+        <w:pict>
+          <v:shape id="DocuMindTableCell54" type="#_x0000_t202" filled="f" stroked="t" strokecolor="#000000" strokeweight="0.75pt" o:allowincell="f" style="position:absolute;margin-left:92.750pt;margin-top:480.300pt;width:283.500pt;height:29.100pt;z-index:100;mso-position-horizontal-relative:page;mso-position-vertical-relative:page;mso-wrap-style:none;">
+            <w10:wrap type="none"/>
+            <v:textbox inset="2.0pt,1.0pt,2.0pt,1.0pt">
+              <w:txbxContent>
+                <w:p>
+                  <w:pPr>
+                    <w:spacing w:before="0" w:after="0" w:line="240" w:lineRule="auto"/>
+                    <w:ind w:left="0" w:right="0" w:firstLine="0"/>
+                  </w:pPr>
+                  <w:r>
+                    <w:rPr>
+                      <w:rFonts w:ascii="Deja Vu Sans" w:hAnsi="Deja Vu Sans" w:eastAsia="Deja Vu Sans" w:cs="Deja Vu Sans"/>
+                      <w:b w:val="0"/>
+                      <w:i w:val="0"/>
+                      <w:color w:val="000000"/>
+                      <w:sz w:val="21"/>
+                    </w:rPr>
+                  </w:r>
+                </w:p>
+              </w:txbxContent>
+            </v:textbox>
+          </v:shape>
+        </w:pict>
+      </w:r>
+      <w:r>
+        <w:pict>
+          <v:shape id="DocuMindTableCell55" type="#_x0000_t202" filled="f" stroked="t" strokecolor="#000000" strokeweight="0.75pt" o:allowincell="f" style="position:absolute;margin-left:92.750pt;margin-top:509.400pt;width:283.500pt;height:29.100pt;z-index:100;mso-position-horizontal-relative:page;mso-position-vertical-relative:page;mso-wrap-style:none;">
+            <w10:wrap type="none"/>
+            <v:textbox inset="2.0pt,1.0pt,2.0pt,1.0pt">
+              <w:txbxContent>
+                <w:p>
+                  <w:pPr>
+                    <w:spacing w:before="0" w:after="0" w:line="240" w:lineRule="auto"/>
+                    <w:ind w:left="0" w:right="0" w:firstLine="0"/>
+                  </w:pPr>
+                  <w:r>
+                    <w:rPr>
+                      <w:rFonts w:ascii="Deja Vu Sans" w:hAnsi="Deja Vu Sans" w:eastAsia="Deja Vu Sans" w:cs="Deja Vu Sans"/>
+                      <w:b w:val="0"/>
+                      <w:i w:val="0"/>
+                      <w:color w:val="000000"/>
+                      <w:sz w:val="21"/>
+                    </w:rPr>
+                    <w:t>2</w:t>
+                  </w:r>
+                </w:p>
+              </w:txbxContent>
+            </v:textbox>
+          </v:shape>
+        </w:pict>
+      </w:r>
+      <w:r>
+        <w:pict>
+          <v:shape id="DocuMindTableCell56" type="#_x0000_t202" filled="f" stroked="t" strokecolor="#000000" strokeweight="0.75pt" o:allowincell="f" style="position:absolute;margin-left:92.750pt;margin-top:538.500pt;width:283.500pt;height:29.100pt;z-index:100;mso-position-horizontal-relative:page;mso-position-vertical-relative:page;mso-wrap-style:none;">
+            <w10:wrap type="none"/>
+            <v:textbox inset="2.0pt,1.0pt,2.0pt,1.0pt">
+              <w:txbxContent>
+                <w:p>
+                  <w:pPr>
+                    <w:spacing w:before="0" w:after="0" w:line="240" w:lineRule="auto"/>
+                    <w:ind w:left="0" w:right="0" w:firstLine="0"/>
+                  </w:pPr>
+                  <w:r>
+                    <w:rPr>
+                      <w:rFonts w:ascii="Deja Vu Sans" w:hAnsi="Deja Vu Sans" w:eastAsia="Deja Vu Sans" w:cs="Deja Vu Sans"/>
+                      <w:b w:val="0"/>
+                      <w:i w:val="0"/>
+                      <w:color w:val="000000"/>
+                      <w:sz w:val="21"/>
+                    </w:rPr>
+                    <w:t>Cras fringilla ipsum magna, in fringilla dui commodo</w:t>
+                    <w:br/>
+                  </w:r>
+                  <w:r>
+                    <w:rPr>
+                      <w:rFonts w:ascii="Deja Vu Sans" w:hAnsi="Deja Vu Sans" w:eastAsia="Deja Vu Sans" w:cs="Deja Vu Sans"/>
+                      <w:b w:val="0"/>
+                      <w:i w:val="0"/>
+                      <w:color w:val="000000"/>
+                      <w:sz w:val="21"/>
+                    </w:rPr>
+                    <w:t>a.</w:t>
+                  </w:r>
+                </w:p>
+              </w:txbxContent>
+            </v:textbox>
+          </v:shape>
+        </w:pict>
+      </w:r>
+      <w:r>
+        <w:pict>
+          <v:shape id="DocuMindTableCell57" type="#_x0000_t202" filled="f" stroked="t" strokecolor="#000000" strokeweight="0.75pt" o:allowincell="f" style="position:absolute;margin-left:376.250pt;margin-top:378.300pt;width:78.000pt;height:29.100pt;z-index:100;mso-position-horizontal-relative:page;mso-position-vertical-relative:page;mso-wrap-style:none;">
+            <w10:wrap type="none"/>
+            <v:textbox inset="2.0pt,1.0pt,2.0pt,1.0pt">
+              <w:txbxContent>
+                <w:p>
+                  <w:pPr>
+                    <w:spacing w:before="0" w:after="0" w:line="240" w:lineRule="auto"/>
+                    <w:ind w:left="0" w:right="0" w:firstLine="0"/>
+                  </w:pPr>
+                  <w:r>
+                    <w:rPr>
+                      <w:rFonts w:ascii="Deja Vu Sans" w:hAnsi="Deja Vu Sans" w:eastAsia="Deja Vu Sans" w:cs="Deja Vu Sans"/>
+                      <w:b w:val="0"/>
+                      <w:i w:val="0"/>
+                      <w:color w:val="000000"/>
+                      <w:sz w:val="21"/>
+                    </w:rPr>
+                    <w:t>Ipsum</w:t>
+                  </w:r>
+                </w:p>
+              </w:txbxContent>
+            </v:textbox>
+          </v:shape>
+        </w:pict>
+      </w:r>
+      <w:r>
+        <w:pict>
+          <v:shape id="DocuMindTableCell58" type="#_x0000_t202" filled="f" stroked="t" strokecolor="#000000" strokeweight="0.75pt" o:allowincell="f" style="position:absolute;margin-left:376.250pt;margin-top:407.400pt;width:78.000pt;height:29.100pt;z-index:100;mso-position-horizontal-relative:page;mso-position-vertical-relative:page;mso-wrap-style:none;">
+            <w10:wrap type="none"/>
+            <v:textbox inset="2.0pt,1.0pt,2.0pt,1.0pt">
+              <w:txbxContent>
+                <w:p>
+                  <w:pPr>
+                    <w:spacing w:before="0" w:after="0" w:line="240" w:lineRule="auto"/>
+                    <w:ind w:left="0" w:right="0" w:firstLine="0"/>
+                  </w:pPr>
+                  <w:r>
+                    <w:rPr>
+                      <w:rFonts w:ascii="Deja Vu Sans" w:hAnsi="Deja Vu Sans" w:eastAsia="Deja Vu Sans" w:cs="Deja Vu Sans"/>
+                      <w:b w:val="0"/>
+                      <w:i w:val="0"/>
+                      <w:color w:val="000000"/>
+                      <w:sz w:val="21"/>
+                    </w:rPr>
+                  </w:r>
+                </w:p>
+              </w:txbxContent>
+            </v:textbox>
+          </v:shape>
+        </w:pict>
+      </w:r>
+      <w:r>
+        <w:pict>
+          <v:shape id="DocuMindTableCell59" type="#_x0000_t202" filled="f" stroked="t" strokecolor="#000000" strokeweight="0.75pt" o:allowincell="f" style="position:absolute;margin-left:376.250pt;margin-top:436.500pt;width:78.000pt;height:43.800pt;z-index:100;mso-position-horizontal-relative:page;mso-position-vertical-relative:page;mso-wrap-style:none;">
+            <w10:wrap type="none"/>
+            <v:textbox inset="2.0pt,1.0pt,2.0pt,1.0pt">
+              <w:txbxContent>
+                <w:p>
+                  <w:pPr>
+                    <w:spacing w:before="0" w:after="0" w:line="240" w:lineRule="auto"/>
+                    <w:ind w:left="0" w:right="0" w:firstLine="0"/>
+                  </w:pPr>
+                  <w:r>
+                    <w:rPr>
+                      <w:rFonts w:ascii="Deja Vu Sans" w:hAnsi="Deja Vu Sans" w:eastAsia="Deja Vu Sans" w:cs="Deja Vu Sans"/>
+                      <w:b w:val="0"/>
+                      <w:i w:val="0"/>
+                      <w:color w:val="000000"/>
+                      <w:sz w:val="21"/>
+                    </w:rPr>
+                    <w:t>3</w:t>
+                  </w:r>
+                </w:p>
+              </w:txbxContent>
+            </v:textbox>
+          </v:shape>
+        </w:pict>
+      </w:r>
+      <w:r>
+        <w:pict>
+          <v:shape id="DocuMindTableCell60" type="#_x0000_t202" filled="f" stroked="t" strokecolor="#000000" strokeweight="0.75pt" o:allowincell="f" style="position:absolute;margin-left:376.250pt;margin-top:480.300pt;width:78.000pt;height:29.100pt;z-index:100;mso-position-horizontal-relative:page;mso-position-vertical-relative:page;mso-wrap-style:none;">
+            <w10:wrap type="none"/>
+            <v:textbox inset="2.0pt,1.0pt,2.0pt,1.0pt">
+              <w:txbxContent>
+                <w:p>
+                  <w:pPr>
+                    <w:spacing w:before="0" w:after="0" w:line="240" w:lineRule="auto"/>
+                    <w:ind w:left="0" w:right="0" w:firstLine="0"/>
+                  </w:pPr>
+                  <w:r>
+                    <w:rPr>
+                      <w:rFonts w:ascii="Deja Vu Sans" w:hAnsi="Deja Vu Sans" w:eastAsia="Deja Vu Sans" w:cs="Deja Vu Sans"/>
+                      <w:b w:val="0"/>
+                      <w:i w:val="0"/>
+                      <w:color w:val="000000"/>
+                      <w:sz w:val="21"/>
+                    </w:rPr>
+                    <w:t>Aliquam erat volutpat.</w:t>
+                  </w:r>
+                </w:p>
+              </w:txbxContent>
+            </v:textbox>
+          </v:shape>
+        </w:pict>
+      </w:r>
+      <w:r>
+        <w:pict>
+          <v:shape id="DocuMindTableCell61" type="#_x0000_t202" filled="f" stroked="t" strokecolor="#000000" strokeweight="0.75pt" o:allowincell="f" style="position:absolute;margin-left:376.250pt;margin-top:509.400pt;width:78.000pt;height:29.100pt;z-index:100;mso-position-horizontal-relative:page;mso-position-vertical-relative:page;mso-wrap-style:none;">
+            <w10:wrap type="none"/>
+            <v:textbox inset="2.0pt,1.0pt,2.0pt,1.0pt">
+              <w:txbxContent>
+                <w:p>
+                  <w:pPr>
+                    <w:spacing w:before="0" w:after="0" w:line="240" w:lineRule="auto"/>
+                    <w:ind w:left="0" w:right="0" w:firstLine="0"/>
+                  </w:pPr>
+                  <w:r>
+                    <w:rPr>
+                      <w:rFonts w:ascii="Deja Vu Sans" w:hAnsi="Deja Vu Sans" w:eastAsia="Deja Vu Sans" w:cs="Deja Vu Sans"/>
+                      <w:b w:val="0"/>
+                      <w:i w:val="0"/>
+                      <w:color w:val="000000"/>
+                      <w:sz w:val="21"/>
+                    </w:rPr>
+                    <w:t>Lorem</w:t>
+                  </w:r>
+                </w:p>
+              </w:txbxContent>
+            </v:textbox>
+          </v:shape>
+        </w:pict>
+      </w:r>
+      <w:r>
+        <w:pict>
+          <v:shape id="DocuMindTableCell62" type="#_x0000_t202" filled="f" stroked="t" strokecolor="#000000" strokeweight="0.75pt" o:allowincell="f" style="position:absolute;margin-left:376.250pt;margin-top:538.500pt;width:78.000pt;height:29.100pt;z-index:100;mso-position-horizontal-relative:page;mso-position-vertical-relative:page;mso-wrap-style:none;">
+            <w10:wrap type="none"/>
+            <v:textbox inset="2.0pt,1.0pt,2.0pt,1.0pt">
+              <w:txbxContent>
+                <w:p>
+                  <w:pPr>
+                    <w:spacing w:before="0" w:after="0" w:line="240" w:lineRule="auto"/>
+                    <w:ind w:left="0" w:right="0" w:firstLine="0"/>
+                  </w:pPr>
+                  <w:r>
+                    <w:rPr>
+                      <w:rFonts w:ascii="Deja Vu Sans" w:hAnsi="Deja Vu Sans" w:eastAsia="Deja Vu Sans" w:cs="Deja Vu Sans"/>
+                      <w:b w:val="0"/>
+                      <w:i w:val="0"/>
+                      <w:color w:val="000000"/>
+                      <w:sz w:val="21"/>
+                    </w:rPr>
+                  </w:r>
+                </w:p>
+              </w:txbxContent>
+            </v:textbox>
+          </v:shape>
+        </w:pict>
+      </w:r>
+      <w:r>
+        <w:pict>
+          <v:shape id="DocuMindTableCell63" type="#_x0000_t202" filled="f" stroked="t" strokecolor="#000000" strokeweight="0.75pt" o:allowincell="f" style="position:absolute;margin-left:454.250pt;margin-top:378.300pt;width:84.864pt;height:29.100pt;z-index:100;mso-position-horizontal-relative:page;mso-position-vertical-relative:page;mso-wrap-style:none;">
+            <w10:wrap type="none"/>
+            <v:textbox inset="2.0pt,1.0pt,2.0pt,1.0pt">
+              <w:txbxContent>
+                <w:p>
+                  <w:pPr>
+                    <w:spacing w:before="0" w:after="0" w:line="240" w:lineRule="auto"/>
+                    <w:ind w:left="0" w:right="0" w:firstLine="0"/>
+                  </w:pPr>
+                  <w:r>
+                    <w:rPr>
+                      <w:rFonts w:ascii="Deja Vu Sans" w:hAnsi="Deja Vu Sans" w:eastAsia="Deja Vu Sans" w:cs="Deja Vu Sans"/>
+                      <w:b w:val="0"/>
+                      <w:i w:val="0"/>
+                      <w:color w:val="000000"/>
+                      <w:sz w:val="21"/>
+                    </w:rPr>
+                    <w:t>4</w:t>
+                  </w:r>
+                </w:p>
+              </w:txbxContent>
+            </v:textbox>
+          </v:shape>
+        </w:pict>
+      </w:r>
+      <w:r>
+        <w:pict>
+          <v:shape id="DocuMindTableCell64" type="#_x0000_t202" filled="f" stroked="t" strokecolor="#000000" strokeweight="0.75pt" o:allowincell="f" style="position:absolute;margin-left:454.250pt;margin-top:407.400pt;width:84.864pt;height:29.100pt;z-index:100;mso-position-horizontal-relative:page;mso-position-vertical-relative:page;mso-wrap-style:none;">
+            <w10:wrap type="none"/>
+            <v:textbox inset="2.0pt,1.0pt,2.0pt,1.0pt">
+              <w:txbxContent>
+                <w:p>
+                  <w:pPr>
+                    <w:spacing w:before="0" w:after="0" w:line="240" w:lineRule="auto"/>
+                    <w:ind w:left="0" w:right="0" w:firstLine="0"/>
+                  </w:pPr>
+                  <w:r>
+                    <w:rPr>
+                      <w:rFonts w:ascii="Arial" w:hAnsi="Arial" w:eastAsia="Arial" w:cs="Arial"/>
+                      <w:sz w:val="18"/>
+                    </w:rPr>
+                    <w:t>Fusce vitae vestibulum velit.</w:t>
+                  </w:r>
+                </w:p>
+              </w:txbxContent>
+            </v:textbox>
+          </v:shape>
+        </w:pict>
+      </w:r>
+      <w:r>
+        <w:pict>
+          <v:shape id="DocuMindTableCell65" type="#_x0000_t202" filled="f" stroked="t" strokecolor="#000000" strokeweight="0.75pt" o:allowincell="f" style="position:absolute;margin-left:454.250pt;margin-top:436.500pt;width:84.864pt;height:43.800pt;z-index:100;mso-position-horizontal-relative:page;mso-position-vertical-relative:page;mso-wrap-style:none;">
+            <w10:wrap type="none"/>
+            <v:textbox inset="2.0pt,1.0pt,2.0pt,1.0pt">
+              <w:txbxContent>
+                <w:p>
+                  <w:pPr>
+                    <w:spacing w:before="0" w:after="0" w:line="240" w:lineRule="auto"/>
+                    <w:ind w:left="0" w:right="0" w:firstLine="0"/>
+                  </w:pPr>
+                  <w:r>
+                    <w:rPr>
+                      <w:rFonts w:ascii="Arial" w:hAnsi="Arial" w:eastAsia="Arial" w:cs="Arial"/>
+                      <w:sz w:val="18"/>
+                    </w:rPr>
+                    <w:t>Lorem</w:t>
+                  </w:r>
+                </w:p>
+              </w:txbxContent>
+            </v:textbox>
+          </v:shape>
+        </w:pict>
+      </w:r>
+      <w:r>
+        <w:pict>
+          <v:shape id="DocuMindTableCell66" type="#_x0000_t202" filled="f" stroked="t" strokecolor="#000000" strokeweight="0.75pt" o:allowincell="f" style="position:absolute;margin-left:454.250pt;margin-top:480.300pt;width:84.864pt;height:29.100pt;z-index:100;mso-position-horizontal-relative:page;mso-position-vertical-relative:page;mso-wrap-style:none;">
+            <w10:wrap type="none"/>
+            <v:textbox inset="2.0pt,1.0pt,2.0pt,1.0pt">
+              <w:txbxContent>
+                <w:p>
+                  <w:pPr>
+                    <w:spacing w:before="0" w:after="0" w:line="240" w:lineRule="auto"/>
+                    <w:ind w:left="0" w:right="0" w:firstLine="0"/>
+                  </w:pPr>
+                  <w:r>
+                    <w:rPr>
+                      <w:rFonts w:ascii="Arial" w:hAnsi="Arial" w:eastAsia="Arial" w:cs="Arial"/>
+                      <w:sz w:val="18"/>
+                    </w:rPr>
+                  </w:r>
+                </w:p>
+              </w:txbxContent>
+            </v:textbox>
+          </v:shape>
+        </w:pict>
+      </w:r>
+      <w:r>
+        <w:pict>
+          <v:shape id="DocuMindTableCell67" type="#_x0000_t202" filled="f" stroked="t" strokecolor="#000000" strokeweight="0.75pt" o:allowincell="f" style="position:absolute;margin-left:454.250pt;margin-top:509.400pt;width:84.864pt;height:29.100pt;z-index:100;mso-position-horizontal-relative:page;mso-position-vertical-relative:page;mso-wrap-style:none;">
+            <w10:wrap type="none"/>
+            <v:textbox inset="2.0pt,1.0pt,2.0pt,1.0pt">
+              <w:txbxContent>
+                <w:p>
+                  <w:pPr>
+                    <w:spacing w:before="0" w:after="0" w:line="240" w:lineRule="auto"/>
+                    <w:ind w:left="0" w:right="0" w:firstLine="0"/>
+                  </w:pPr>
+                  <w:r>
+                    <w:rPr>
+                      <w:rFonts w:ascii="Arial" w:hAnsi="Arial" w:eastAsia="Arial" w:cs="Arial"/>
+                      <w:sz w:val="18"/>
+                    </w:rPr>
+                    <w:t>5</w:t>
+                  </w:r>
+                </w:p>
+              </w:txbxContent>
+            </v:textbox>
+          </v:shape>
+        </w:pict>
+      </w:r>
+      <w:r>
+        <w:pict>
+          <v:shape id="DocuMindTableCell68" type="#_x0000_t202" filled="f" stroked="t" strokecolor="#000000" strokeweight="0.75pt" o:allowincell="f" style="position:absolute;margin-left:454.250pt;margin-top:538.500pt;width:84.864pt;height:29.100pt;z-index:100;mso-position-horizontal-relative:page;mso-position-vertical-relative:page;mso-wrap-style:none;">
+            <w10:wrap type="none"/>
+            <v:textbox inset="2.0pt,1.0pt,2.0pt,1.0pt">
+              <w:txbxContent>
+                <w:p>
+                  <w:pPr>
+                    <w:spacing w:before="0" w:after="0" w:line="240" w:lineRule="auto"/>
+                    <w:ind w:left="0" w:right="0" w:firstLine="0"/>
+                  </w:pPr>
+                  <w:r>
+                    <w:rPr>
+                      <w:rFonts w:ascii="Arial" w:hAnsi="Arial" w:eastAsia="Arial" w:cs="Arial"/>
+                      <w:sz w:val="18"/>
+                    </w:rPr>
+                    <w:t>Etiam vehicula luctus fermentum.</w:t>
+                  </w:r>
+                </w:p>
+              </w:txbxContent>
+            </v:textbox>
+          </v:shape>
+        </w:pict>
+      </w:r>
+    </w:p>
+    <w:p>
+      <w:pPr>
+        <w:sectPr>
+          <w:pgSz w:w="11900" w:h="16840"/>
+          <w:pgMar w:top="0" w:right="0" w:bottom="0" w:left="0" w:header="0" w:footer="0" w:gutter="0"/>
+          <w:cols w:space="720"/>
+          <w:docGrid w:linePitch="360"/>
+        </w:sectPr>
+      </w:pPr>
+    </w:p>
+    <w:p>
+      <w:pPr>
+        <w:spacing w:before="0" w:after="0" w:lineRule="exact" w:line="20"/>
+      </w:pPr>
+      <w:r>
+        <w:rPr>
+          <w:sz w:val="2"/>
+        </w:rPr>
+      </w:r>
+      <w:r>
+        <w:pict>
+          <v:shape id="DocuMindTextBox69" type="#_x0000_t202" stroked="f" filled="f" o:allowincell="f" style="position:absolute;margin-left:74.800pt;margin-top:55.810pt;width:449.616pt;height:28.500pt;z-index:251659264;mso-position-horizontal-relative:page;mso-position-vertical-relative:page;mso-wrap-style:none;mso-fit-shape-to-text:t;">
+            <w10:wrap type="none"/>
+            <v:textbox inset="0,0,0,0">
+              <w:txbxContent>
+                <w:p>
+                  <w:pPr>
+                    <w:spacing w:before="0" w:after="0" w:lineRule="exact" w:line="450"/>
+                    <w:ind w:left="0" w:right="0" w:firstLine="0"/>
+                  </w:pPr>
+                  <w:r>
+                    <w:rPr>
+                      <w:rFonts w:ascii="Liberation Sans" w:hAnsi="Liberation Sans" w:eastAsia="Liberation Sans" w:cs="Liberation Sans"/>
+                      <w:b/>
+                      <w:i w:val="0"/>
+                      <w:color w:val="000000"/>
+                      <w:sz w:val="36"/>
+                    </w:rPr>
+                    <w:t xml:space="preserve">Lorem ipsum dolor sit amet, consectetur adipiscing </w:t>
+                  </w:r>
+                </w:p>
+              </w:txbxContent>
+            </v:textbox>
+          </v:shape>
+        </w:pict>
+      </w:r>
+      <w:r>
+        <w:pict>
+          <v:shape id="DocuMindTextBox70" type="#_x0000_t202" stroked="f" filled="f" o:allowincell="f" style="position:absolute;margin-left:96.400pt;margin-top:76.510pt;width:38.946pt;height:28.500pt;z-index:251659264;mso-position-horizontal-relative:page;mso-position-vertical-relative:page;mso-wrap-style:none;mso-fit-shape-to-text:t;">
+            <w10:wrap type="none"/>
+            <v:textbox inset="0,0,0,0">
+              <w:txbxContent>
+                <w:p>
+                  <w:pPr>
+                    <w:spacing w:before="0" w:after="0" w:lineRule="exact" w:line="450"/>
+                    <w:ind w:left="0" w:right="0" w:firstLine="0"/>
+                  </w:pPr>
+                  <w:r>
+                    <w:rPr>
+                      <w:rFonts w:ascii="Liberation Sans" w:hAnsi="Liberation Sans" w:eastAsia="Liberation Sans" w:cs="Liberation Sans"/>
+                      <w:b/>
+                      <w:i w:val="0"/>
+                      <w:color w:val="000000"/>
+                      <w:sz w:val="36"/>
+                    </w:rPr>
+                    <w:t xml:space="preserve">elit. </w:t>
+                  </w:r>
+                </w:p>
+              </w:txbxContent>
+            </v:textbox>
+          </v:shape>
+        </w:pict>
+      </w:r>
+      <w:r>
+        <w:pict>
+          <v:shape id="DocuMindTextBox71" type="#_x0000_t202" stroked="f" filled="f" o:allowincell="f" style="position:absolute;margin-left:56.800pt;margin-top:128.556pt;width:484.141pt;height:19.125pt;z-index:251659264;mso-position-horizontal-relative:page;mso-position-vertical-relative:page;mso-wrap-style:none;mso-fit-shape-to-text:t;">
+            <w10:wrap type="none"/>
+            <v:textbox inset="0,0,0,0">
+              <w:txbxContent>
+                <w:p>
+                  <w:pPr>
+                    <w:spacing w:before="0" w:after="0" w:lineRule="exact" w:line="262"/>
+                    <w:ind w:left="0" w:right="0" w:firstLine="0"/>
+                  </w:pPr>
+                  <w:r>
+                    <w:rPr>
+                      <w:rFonts w:ascii="Deja Vu Sans" w:hAnsi="Deja Vu Sans" w:eastAsia="Deja Vu Sans" w:cs="Deja Vu Sans"/>
+                      <w:b w:val="0"/>
+                      <w:i w:val="0"/>
+                      <w:color w:val="000000"/>
+                      <w:sz w:val="21"/>
+                    </w:rPr>
+                    <w:t>Nunc ac faucibus odio. Vestibulum neque massa, scelerisque sit amet ligula eu, congue</w:t>
+                  </w:r>
+                </w:p>
+              </w:txbxContent>
+            </v:textbox>
+          </v:shape>
+        </w:pict>
+      </w:r>
+      <w:r>
+        <w:pict>
+          <v:shape id="DocuMindTextBox72" type="#_x0000_t202" stroked="f" filled="f" o:allowincell="f" style="position:absolute;margin-left:56.800pt;margin-top:143.256pt;width:484.068pt;height:19.125pt;z-index:251659264;mso-position-horizontal-relative:page;mso-position-vertical-relative:page;mso-wrap-style:none;mso-fit-shape-to-text:t;">
+            <w10:wrap type="none"/>
+            <v:textbox inset="0,0,0,0">
+              <w:txbxContent>
+                <w:p>
+                  <w:pPr>
+                    <w:spacing w:before="0" w:after="0" w:lineRule="exact" w:line="262"/>
+                    <w:ind w:left="0" w:right="0" w:firstLine="0"/>
+                  </w:pPr>
+                  <w:r>
+                    <w:rPr>
+                      <w:rFonts w:ascii="Deja Vu Sans" w:hAnsi="Deja Vu Sans" w:eastAsia="Deja Vu Sans" w:cs="Deja Vu Sans"/>
+                      <w:b w:val="0"/>
+                      <w:i w:val="0"/>
+                      <w:color w:val="000000"/>
+                      <w:sz w:val="21"/>
+                    </w:rPr>
+                    <w:t>molestie mi. Praesent ut varius sem. Nullam at porttitor arcu, nec lacinia nisi. Ut ac dolor</w:t>
+                  </w:r>
+                </w:p>
+              </w:txbxContent>
+            </v:textbox>
+          </v:shape>
+        </w:pict>
+      </w:r>
+      <w:r>
+        <w:pict>
+          <v:shape id="DocuMindTextBox73" type="#_x0000_t202" stroked="f" filled="f" o:allowincell="f" style="position:absolute;margin-left:56.800pt;margin-top:157.956pt;width:484.278pt;height:19.125pt;z-index:251659264;mso-position-horizontal-relative:page;mso-position-vertical-relative:page;mso-wrap-style:none;mso-fit-shape-to-text:t;">
+            <w10:wrap type="none"/>
+            <v:textbox inset="0,0,0,0">
+              <w:txbxContent>
+                <w:p>
+                  <w:pPr>
+                    <w:spacing w:before="0" w:after="0" w:lineRule="exact" w:line="262"/>
+                    <w:ind w:left="0" w:right="0" w:firstLine="0"/>
+                  </w:pPr>
+                  <w:r>
+                    <w:rPr>
+                      <w:rFonts w:ascii="Deja Vu Sans" w:hAnsi="Deja Vu Sans" w:eastAsia="Deja Vu Sans" w:cs="Deja Vu Sans"/>
+                      <w:b w:val="0"/>
+                      <w:i w:val="0"/>
+                      <w:color w:val="000000"/>
+                      <w:sz w:val="21"/>
+                    </w:rPr>
+                    <w:t>vitae odio interdum condimentum. Vivamus dapibus sodales ex, vitae malesuada ipsum</w:t>
+                  </w:r>
+                </w:p>
+              </w:txbxContent>
+            </v:textbox>
+          </v:shape>
+        </w:pict>
+      </w:r>
+      <w:r>
+        <w:pict>
+          <v:shape id="DocuMindTextBox74" type="#_x0000_t202" stroked="f" filled="f" o:allowincell="f" style="position:absolute;margin-left:56.800pt;margin-top:172.656pt;width:484.341pt;height:19.125pt;z-index:251659264;mso-position-horizontal-relative:page;mso-position-vertical-relative:page;mso-wrap-style:none;mso-fit-shape-to-text:t;">
+            <w10:wrap type="none"/>
+            <v:textbox inset="0,0,0,0">
+              <w:txbxContent>
+                <w:p>
+                  <w:pPr>
+                    <w:spacing w:before="0" w:after="0" w:lineRule="exact" w:line="262"/>
+                    <w:ind w:left="0" w:right="0" w:firstLine="0"/>
+                  </w:pPr>
+                  <w:r>
+                    <w:rPr>
+                      <w:rFonts w:ascii="Deja Vu Sans" w:hAnsi="Deja Vu Sans" w:eastAsia="Deja Vu Sans" w:cs="Deja Vu Sans"/>
+                      <w:b w:val="0"/>
+                      <w:i w:val="0"/>
+                      <w:color w:val="000000"/>
+                      <w:sz w:val="21"/>
+                    </w:rPr>
+                    <w:t>cursus convallis. Maecenas sed egestas nulla, ac condimentum orci. Mauris diam felis,</w:t>
+                  </w:r>
+                </w:p>
+              </w:txbxContent>
+            </v:textbox>
+          </v:shape>
+        </w:pict>
+      </w:r>
+      <w:r>
+        <w:pict>
+          <v:shape id="DocuMindTextBox75" type="#_x0000_t202" stroked="f" filled="f" o:allowincell="f" style="position:absolute;margin-left:56.800pt;margin-top:187.356pt;width:483.847pt;height:19.125pt;z-index:251659264;mso-position-horizontal-relative:page;mso-position-vertical-relative:page;mso-wrap-style:none;mso-fit-shape-to-text:t;">
+            <w10:wrap type="none"/>
+            <v:textbox inset="0,0,0,0">
+              <w:txbxContent>
+                <w:p>
+                  <w:pPr>
+                    <w:spacing w:before="0" w:after="0" w:lineRule="exact" w:line="262"/>
+                    <w:ind w:left="0" w:right="0" w:firstLine="0"/>
+                  </w:pPr>
+                  <w:r>
+                    <w:rPr>
+                      <w:rFonts w:ascii="Deja Vu Sans" w:hAnsi="Deja Vu Sans" w:eastAsia="Deja Vu Sans" w:cs="Deja Vu Sans"/>
+                      <w:b w:val="0"/>
+                      <w:i w:val="0"/>
+                      <w:color w:val="000000"/>
+                      <w:sz w:val="21"/>
+                    </w:rPr>
+                    <w:t>vulputate ac suscipit et, iaculis non est. Curabitur semper arcu ac ligula semper, nec luctus</w:t>
+                  </w:r>
+                </w:p>
+              </w:txbxContent>
+            </v:textbox>
+          </v:shape>
+        </w:pict>
+      </w:r>
+      <w:r>
+        <w:pict>
+          <v:shape id="DocuMindTextBox76" type="#_x0000_t202" stroked="f" filled="f" o:allowincell="f" style="position:absolute;margin-left:56.800pt;margin-top:202.056pt;width:484.152pt;height:19.125pt;z-index:251659264;mso-position-horizontal-relative:page;mso-position-vertical-relative:page;mso-wrap-style:none;mso-fit-shape-to-text:t;">
+            <w10:wrap type="none"/>
+            <v:textbox inset="0,0,0,0">
+              <w:txbxContent>
+                <w:p>
+                  <w:pPr>
+                    <w:spacing w:before="0" w:after="0" w:lineRule="exact" w:line="262"/>
+                    <w:ind w:left="0" w:right="0" w:firstLine="0"/>
+                  </w:pPr>
+                  <w:r>
+                    <w:rPr>
+                      <w:rFonts w:ascii="Deja Vu Sans" w:hAnsi="Deja Vu Sans" w:eastAsia="Deja Vu Sans" w:cs="Deja Vu Sans"/>
+                      <w:b w:val="0"/>
+                      <w:i w:val="0"/>
+                      <w:color w:val="000000"/>
+                      <w:sz w:val="21"/>
+                    </w:rPr>
+                    <w:t>nisl blandit. Integer lacinia ante ac libero lobortis imperdiet. Nullam mollis convallis ipsum,</w:t>
+                  </w:r>
+                </w:p>
+              </w:txbxContent>
+            </v:textbox>
+          </v:shape>
+        </w:pict>
+      </w:r>
+      <w:r>
+        <w:pict>
+          <v:shape id="DocuMindTextBox77" type="#_x0000_t202" stroked="f" filled="f" o:allowincell="f" style="position:absolute;margin-left:56.800pt;margin-top:216.756pt;width:483.795pt;height:19.125pt;z-index:251659264;mso-position-horizontal-relative:page;mso-position-vertical-relative:page;mso-wrap-style:none;mso-fit-shape-to-text:t;">
+            <w10:wrap type="none"/>
+            <v:textbox inset="0,0,0,0">
+              <w:txbxContent>
+                <w:p>
+                  <w:pPr>
+                    <w:spacing w:before="0" w:after="0" w:lineRule="exact" w:line="262"/>
+                    <w:ind w:left="0" w:right="0" w:firstLine="0"/>
+                  </w:pPr>
+                  <w:r>
+                    <w:rPr>
+                      <w:rFonts w:ascii="Deja Vu Sans" w:hAnsi="Deja Vu Sans" w:eastAsia="Deja Vu Sans" w:cs="Deja Vu Sans"/>
+                      <w:b w:val="0"/>
+                      <w:i w:val="0"/>
+                      <w:color w:val="000000"/>
+                      <w:sz w:val="21"/>
+                    </w:rPr>
+                    <w:t>ac accumsan nunc vehicula vitae. Nulla eget justo in felis tristique fringilla. Morbi sit amet</w:t>
+                  </w:r>
+                </w:p>
+              </w:txbxContent>
+            </v:textbox>
+          </v:shape>
+        </w:pict>
+      </w:r>
+      <w:r>
+        <w:pict>
+          <v:shape id="DocuMindTextBox78" type="#_x0000_t202" stroked="f" filled="f" o:allowincell="f" style="position:absolute;margin-left:56.800pt;margin-top:231.456pt;width:483.879pt;height:19.125pt;z-index:251659264;mso-position-horizontal-relative:page;mso-position-vertical-relative:page;mso-wrap-style:none;mso-fit-shape-to-text:t;">
+            <w10:wrap type="none"/>
+            <v:textbox inset="0,0,0,0">
+              <w:txbxContent>
+                <w:p>
+                  <w:pPr>
+                    <w:spacing w:before="0" w:after="0" w:lineRule="exact" w:line="262"/>
+                    <w:ind w:left="0" w:right="0" w:firstLine="0"/>
+                  </w:pPr>
+                  <w:r>
+                    <w:rPr>
+                      <w:rFonts w:ascii="Deja Vu Sans" w:hAnsi="Deja Vu Sans" w:eastAsia="Deja Vu Sans" w:cs="Deja Vu Sans"/>
+                      <w:b w:val="0"/>
+                      <w:i w:val="0"/>
+                      <w:color w:val="000000"/>
+                      <w:sz w:val="21"/>
+                    </w:rPr>
+                    <w:t>tortor quis risus auctor condimentum. Morbi in ullamcorper elit. Nulla iaculis tellus sit amet</w:t>
+                  </w:r>
+                </w:p>
+              </w:txbxContent>
+            </v:textbox>
+          </v:shape>
+        </w:pict>
+      </w:r>
+      <w:r>
+        <w:pict>
+          <v:shape id="DocuMindTextBox79" type="#_x0000_t202" stroked="f" filled="f" o:allowincell="f" style="position:absolute;margin-left:56.800pt;margin-top:246.156pt;width:127.950pt;height:19.125pt;z-index:251659264;mso-position-horizontal-relative:page;mso-position-vertical-relative:page;mso-wrap-style:none;mso-fit-shape-to-text:t;">
+            <w10:wrap type="none"/>
+            <v:textbox inset="0,0,0,0">
+              <w:txbxContent>
+                <w:p>
+                  <w:pPr>
+                    <w:spacing w:before="0" w:after="0" w:lineRule="exact" w:line="262"/>
+                    <w:ind w:left="0" w:right="0" w:firstLine="0"/>
+                  </w:pPr>
+                  <w:r>
+                    <w:rPr>
+                      <w:rFonts w:ascii="Deja Vu Sans" w:hAnsi="Deja Vu Sans" w:eastAsia="Deja Vu Sans" w:cs="Deja Vu Sans"/>
+                      <w:b w:val="0"/>
+                      <w:i w:val="0"/>
+                      <w:color w:val="000000"/>
+                      <w:sz w:val="21"/>
+                    </w:rPr>
+                    <w:t>mauris tempus fringilla.</w:t>
+                  </w:r>
+                </w:p>
+              </w:txbxContent>
+            </v:textbox>
+          </v:shape>
+        </w:pict>
+      </w:r>
+      <w:r>
+        <w:pict>
+          <v:shape id="DocuMindTextBox80" type="#_x0000_t202" stroked="f" filled="f" o:allowincell="f" style="position:absolute;margin-left:74.800pt;margin-top:282.620pt;width:439.128pt;height:26.000pt;z-index:251659264;mso-position-horizontal-relative:page;mso-position-vertical-relative:page;mso-wrap-style:none;mso-fit-shape-to-text:t;">
+            <w10:wrap type="none"/>
+            <v:textbox inset="0,0,0,0">
+              <w:txbxContent>
+                <w:p>
+                  <w:pPr>
+                    <w:spacing w:before="0" w:after="0" w:lineRule="exact" w:line="400"/>
+                    <w:ind w:left="0" w:right="0" w:firstLine="0"/>
+                  </w:pPr>
+                  <w:r>
+                    <w:rPr>
+                      <w:rFonts w:ascii="Liberation Sans" w:hAnsi="Liberation Sans" w:eastAsia="Liberation Sans" w:cs="Liberation Sans"/>
+                      <w:b/>
+                      <w:i w:val="0"/>
+                      <w:color w:val="000000"/>
+                      <w:sz w:val="32"/>
+                    </w:rPr>
+                    <w:t xml:space="preserve">Maecenas mauris lectus, lobortis et purus mattis, blandit </w:t>
+                  </w:r>
+                </w:p>
+              </w:txbxContent>
+            </v:textbox>
+          </v:shape>
+        </w:pict>
+      </w:r>
+      <w:r>
+        <w:pict>
+          <v:shape id="DocuMindTextBox81" type="#_x0000_t202" stroked="f" filled="f" o:allowincell="f" style="position:absolute;margin-left:103.600pt;margin-top:301.020pt;width:110.440pt;height:26.000pt;z-index:251659264;mso-position-horizontal-relative:page;mso-position-vertical-relative:page;mso-wrap-style:none;mso-fit-shape-to-text:t;">
+            <w10:wrap type="none"/>
+            <v:textbox inset="0,0,0,0">
+              <w:txbxContent>
+                <w:p>
+                  <w:pPr>
+                    <w:spacing w:before="0" w:after="0" w:lineRule="exact" w:line="400"/>
+                    <w:ind w:left="0" w:right="0" w:firstLine="0"/>
+                  </w:pPr>
+                  <w:r>
+                    <w:rPr>
+                      <w:rFonts w:ascii="Liberation Sans" w:hAnsi="Liberation Sans" w:eastAsia="Liberation Sans" w:cs="Liberation Sans"/>
+                      <w:b/>
+                      <w:i w:val="0"/>
+                      <w:color w:val="000000"/>
+                      <w:sz w:val="32"/>
+                    </w:rPr>
+                    <w:t xml:space="preserve">dictum tellus. </w:t>
+                  </w:r>
+                </w:p>
+              </w:txbxContent>
+            </v:textbox>
+          </v:shape>
+        </w:pict>
+      </w:r>
+      <w:r>
+        <w:pict>
+          <v:shape id="DocuMindTextBox82" type="#_x0000_t202" stroked="f" filled="f" o:allowincell="f" style="position:absolute;margin-left:56.800pt;margin-top:324.956pt;width:483.890pt;height:19.125pt;z-index:251659264;mso-position-horizontal-relative:page;mso-position-vertical-relative:page;mso-wrap-style:none;mso-fit-shape-to-text:t;">
+            <w10:wrap type="none"/>
+            <v:textbox inset="0,0,0,0">
+              <w:txbxContent>
+                <w:p>
+                  <w:pPr>
+                    <w:spacing w:before="0" w:after="0" w:lineRule="exact" w:line="262"/>
+                    <w:ind w:left="0" w:right="0" w:firstLine="0"/>
+                  </w:pPr>
+                  <w:r>
+                    <w:rPr>
+                      <w:rFonts w:ascii="Deja Vu Sans" w:hAnsi="Deja Vu Sans" w:eastAsia="Deja Vu Sans" w:cs="Deja Vu Sans"/>
+                      <w:b w:val="0"/>
+                      <w:i w:val="0"/>
+                      <w:color w:val="000000"/>
+                      <w:sz w:val="21"/>
+                    </w:rPr>
+                    <w:t>Maecenas non lorem quis tellus placerat varius. Nulla facilisi. Aenean congue fringilla justo</w:t>
+                  </w:r>
+                </w:p>
+              </w:txbxContent>
+            </v:textbox>
+          </v:shape>
+        </w:pict>
+      </w:r>
+      <w:r>
+        <w:pict>
+          <v:shape id="DocuMindTextBox83" type="#_x0000_t202" stroked="f" filled="f" o:allowincell="f" style="position:absolute;margin-left:56.800pt;margin-top:339.656pt;width:483.858pt;height:19.125pt;z-index:251659264;mso-position-horizontal-relative:page;mso-position-vertical-relative:page;mso-wrap-style:none;mso-fit-shape-to-text:t;">
+            <w10:wrap type="none"/>
+            <v:textbox inset="0,0,0,0">
+              <w:txbxContent>
+                <w:p>
+                  <w:pPr>
+                    <w:spacing w:before="0" w:after="0" w:lineRule="exact" w:line="262"/>
+                    <w:ind w:left="0" w:right="0" w:firstLine="0"/>
+                  </w:pPr>
+                  <w:r>
+                    <w:rPr>
+                      <w:rFonts w:ascii="Deja Vu Sans" w:hAnsi="Deja Vu Sans" w:eastAsia="Deja Vu Sans" w:cs="Deja Vu Sans"/>
+                      <w:b w:val="0"/>
+                      <w:i w:val="0"/>
+                      <w:color w:val="000000"/>
+                      <w:sz w:val="21"/>
+                    </w:rPr>
+                    <w:t>ut aliquam. Mauris id ex erat. Nunc vulputate neque vitae justo facilisis, non condimentum</w:t>
+                  </w:r>
+                </w:p>
+              </w:txbxContent>
+            </v:textbox>
+          </v:shape>
+        </w:pict>
+      </w:r>
+      <w:r>
+        <w:pict>
+          <v:shape id="DocuMindTextBox84" type="#_x0000_t202" stroked="f" filled="f" o:allowincell="f" style="position:absolute;margin-left:56.800pt;margin-top:354.356pt;width:484.404pt;height:19.125pt;z-index:251659264;mso-position-horizontal-relative:page;mso-position-vertical-relative:page;mso-wrap-style:none;mso-fit-shape-to-text:t;">
+            <w10:wrap type="none"/>
+            <v:textbox inset="0,0,0,0">
+              <w:txbxContent>
+                <w:p>
+                  <w:pPr>
+                    <w:spacing w:before="0" w:after="0" w:lineRule="exact" w:line="262"/>
+                    <w:ind w:left="0" w:right="0" w:firstLine="0"/>
+                  </w:pPr>
+                  <w:r>
+                    <w:rPr>
+                      <w:rFonts w:ascii="Deja Vu Sans" w:hAnsi="Deja Vu Sans" w:eastAsia="Deja Vu Sans" w:cs="Deja Vu Sans"/>
+                      <w:b w:val="0"/>
+                      <w:i w:val="0"/>
+                      <w:color w:val="000000"/>
+                      <w:sz w:val="21"/>
+                    </w:rPr>
+                    <w:t>ante sagittis. Morbi viverra semper lorem nec molestie. Maecenas tincidunt est efficitur</w:t>
+                  </w:r>
+                </w:p>
+              </w:txbxContent>
+            </v:textbox>
+          </v:shape>
+        </w:pict>
+      </w:r>
+      <w:r>
+        <w:pict>
+          <v:shape id="DocuMindTextBox85" type="#_x0000_t202" stroked="f" filled="f" o:allowincell="f" style="position:absolute;margin-left:56.800pt;margin-top:369.056pt;width:242.999pt;height:19.125pt;z-index:251659264;mso-position-horizontal-relative:page;mso-position-vertical-relative:page;mso-wrap-style:none;mso-fit-shape-to-text:t;">
+            <w10:wrap type="none"/>
+            <v:textbox inset="0,0,0,0">
+              <w:txbxContent>
+                <w:p>
+                  <w:pPr>
+                    <w:spacing w:before="0" w:after="0" w:lineRule="exact" w:line="262"/>
+                    <w:ind w:left="0" w:right="0" w:firstLine="0"/>
+                  </w:pPr>
+                  <w:r>
+                    <w:rPr>
+                      <w:rFonts w:ascii="Deja Vu Sans" w:hAnsi="Deja Vu Sans" w:eastAsia="Deja Vu Sans" w:cs="Deja Vu Sans"/>
+                      <w:b w:val="0"/>
+                      <w:i w:val="0"/>
+                      <w:color w:val="000000"/>
+                      <w:sz w:val="21"/>
+                    </w:rPr>
+                    <w:t>ligula euismod, sit amet ornare est vulputate.</w:t>
+                  </w:r>
+                </w:p>
+              </w:txbxContent>
+            </v:textbox>
+          </v:shape>
+        </w:pict>
+      </w:r>
+      <w:r>
+        <w:pict>
+          <v:shape id="DocuMindTextBox86" type="#_x0000_t202" stroked="f" filled="f" o:allowincell="f" style="position:absolute;margin-left:56.800pt;margin-top:394.956pt;width:483.669pt;height:19.125pt;z-index:251659264;mso-position-horizontal-relative:page;mso-position-vertical-relative:page;mso-wrap-style:none;mso-fit-shape-to-text:t;">
             <w10:wrap type="none"/>
             <v:textbox inset="0,0,0,0">
               <w:txbxContent>
@@ -1194,7 +2492,7 @@
       </w:r>
       <w:r>
         <w:pict>
-          <v:shape id="DocuMindTextBox44" type="#_x0000_t202" stroked="f" filled="f" o:allowincell="f" style="position:absolute;margin-left:56.800pt;margin-top:95.856pt;width:484.110pt;height:19.125pt;z-index:251659264;mso-position-horizontal-relative:page;mso-position-vertical-relative:page;mso-wrap-style:none;mso-fit-shape-to-text:t;">
+          <v:shape id="DocuMindTextBox87" type="#_x0000_t202" stroked="f" filled="f" o:allowincell="f" style="position:absolute;margin-left:56.800pt;margin-top:409.656pt;width:484.110pt;height:19.125pt;z-index:251659264;mso-position-horizontal-relative:page;mso-position-vertical-relative:page;mso-wrap-style:none;mso-fit-shape-to-text:t;">
             <w10:wrap type="none"/>
             <v:textbox inset="0,0,0,0">
               <w:txbxContent>
@@ -1221,7 +2519,7 @@
       </w:r>
       <w:r>
         <w:pict>
-          <v:shape id="DocuMindTextBox45" type="#_x0000_t202" stroked="f" filled="f" o:allowincell="f" style="position:absolute;margin-left:56.800pt;margin-top:110.556pt;width:484.036pt;height:19.125pt;z-index:251659264;mso-position-horizontal-relative:page;mso-position-vertical-relative:page;mso-wrap-style:none;mso-fit-shape-to-text:t;">
+          <v:shape id="DocuMindTextBox88" type="#_x0000_t202" stroked="f" filled="f" o:allowincell="f" style="position:absolute;margin-left:56.800pt;margin-top:424.356pt;width:484.036pt;height:19.125pt;z-index:251659264;mso-position-horizontal-relative:page;mso-position-vertical-relative:page;mso-wrap-style:none;mso-fit-shape-to-text:t;">
             <w10:wrap type="none"/>
             <v:textbox inset="0,0,0,0">
               <w:txbxContent>
@@ -1248,7 +2546,7 @@
       </w:r>
       <w:r>
         <w:pict>
-          <v:shape id="DocuMindTextBox46" type="#_x0000_t202" stroked="f" filled="f" o:allowincell="f" style="position:absolute;margin-left:56.800pt;margin-top:125.256pt;width:483.837pt;height:19.125pt;z-index:251659264;mso-position-horizontal-relative:page;mso-position-vertical-relative:page;mso-wrap-style:none;mso-fit-shape-to-text:t;">
+          <v:shape id="DocuMindTextBox89" type="#_x0000_t202" stroked="f" filled="f" o:allowincell="f" style="position:absolute;margin-left:56.800pt;margin-top:439.056pt;width:483.837pt;height:19.125pt;z-index:251659264;mso-position-horizontal-relative:page;mso-position-vertical-relative:page;mso-wrap-style:none;mso-fit-shape-to-text:t;">
             <w10:wrap type="none"/>
             <v:textbox inset="0,0,0,0">
               <w:txbxContent>
@@ -1275,7 +2573,7 @@
       </w:r>
       <w:r>
         <w:pict>
-          <v:shape id="DocuMindTextBox47" type="#_x0000_t202" stroked="f" filled="f" o:allowincell="f" style="position:absolute;margin-left:56.800pt;margin-top:139.956pt;width:483.847pt;height:19.125pt;z-index:251659264;mso-position-horizontal-relative:page;mso-position-vertical-relative:page;mso-wrap-style:none;mso-fit-shape-to-text:t;">
+          <v:shape id="DocuMindTextBox90" type="#_x0000_t202" stroked="f" filled="f" o:allowincell="f" style="position:absolute;margin-left:56.800pt;margin-top:453.756pt;width:483.847pt;height:19.125pt;z-index:251659264;mso-position-horizontal-relative:page;mso-position-vertical-relative:page;mso-wrap-style:none;mso-fit-shape-to-text:t;">
             <w10:wrap type="none"/>
             <v:textbox inset="0,0,0,0">
               <w:txbxContent>
@@ -1302,7 +2600,7 @@
       </w:r>
       <w:r>
         <w:pict>
-          <v:shape id="DocuMindTextBox48" type="#_x0000_t202" stroked="f" filled="f" o:allowincell="f" style="position:absolute;margin-left:56.800pt;margin-top:154.656pt;width:484.173pt;height:19.125pt;z-index:251659264;mso-position-horizontal-relative:page;mso-position-vertical-relative:page;mso-wrap-style:none;mso-fit-shape-to-text:t;">
+          <v:shape id="DocuMindTextBox91" type="#_x0000_t202" stroked="f" filled="f" o:allowincell="f" style="position:absolute;margin-left:56.800pt;margin-top:468.456pt;width:484.173pt;height:19.125pt;z-index:251659264;mso-position-horizontal-relative:page;mso-position-vertical-relative:page;mso-wrap-style:none;mso-fit-shape-to-text:t;">
             <w10:wrap type="none"/>
             <v:textbox inset="0,0,0,0">
               <w:txbxContent>
@@ -1329,7 +2627,7 @@
       </w:r>
       <w:r>
         <w:pict>
-          <v:shape id="DocuMindTextBox49" type="#_x0000_t202" stroked="f" filled="f" o:allowincell="f" style="position:absolute;margin-left:56.800pt;margin-top:169.356pt;width:253.803pt;height:19.125pt;z-index:251659264;mso-position-horizontal-relative:page;mso-position-vertical-relative:page;mso-wrap-style:none;mso-fit-shape-to-text:t;">
+          <v:shape id="DocuMindTextBox92" type="#_x0000_t202" stroked="f" filled="f" o:allowincell="f" style="position:absolute;margin-left:56.800pt;margin-top:483.156pt;width:253.803pt;height:19.125pt;z-index:251659264;mso-position-horizontal-relative:page;mso-position-vertical-relative:page;mso-wrap-style:none;mso-fit-shape-to-text:t;">
             <w10:wrap type="none"/>
             <v:textbox inset="0,0,0,0">
               <w:txbxContent>
@@ -1356,7 +2654,34 @@
       </w:r>
       <w:r>
         <w:pict>
-          <v:shape id="DocuMindTextBox50" type="#_x0000_t202" stroked="f" filled="f" o:allowincell="f" style="position:absolute;margin-left:56.800pt;margin-top:195.356pt;width:484.005pt;height:19.125pt;z-index:251659264;mso-position-horizontal-relative:page;mso-position-vertical-relative:page;mso-wrap-style:none;mso-fit-shape-to-text:t;">
+          <v:shape id="DocuMindTextBox93" type="#_x0000_t202" stroked="f" filled="f" o:allowincell="f" style="position:absolute;margin-left:74.800pt;margin-top:519.620pt;width:375.176pt;height:26.000pt;z-index:251659264;mso-position-horizontal-relative:page;mso-position-vertical-relative:page;mso-wrap-style:none;mso-fit-shape-to-text:t;">
+            <w10:wrap type="none"/>
+            <v:textbox inset="0,0,0,0">
+              <w:txbxContent>
+                <w:p>
+                  <w:pPr>
+                    <w:spacing w:before="0" w:after="0" w:lineRule="exact" w:line="400"/>
+                    <w:ind w:left="0" w:right="0" w:firstLine="0"/>
+                  </w:pPr>
+                  <w:r>
+                    <w:rPr>
+                      <w:rFonts w:ascii="Liberation Sans" w:hAnsi="Liberation Sans" w:eastAsia="Liberation Sans" w:cs="Liberation Sans"/>
+                      <w:b/>
+                      <w:i w:val="0"/>
+                      <w:color w:val="000000"/>
+                      <w:sz w:val="32"/>
+                    </w:rPr>
+                    <w:t xml:space="preserve">In eleifend velit vitae libero sollicitudin euismod. </w:t>
+                  </w:r>
+                </w:p>
+              </w:txbxContent>
+            </v:textbox>
+          </v:shape>
+        </w:pict>
+      </w:r>
+      <w:r>
+        <w:pict>
+          <v:shape id="DocuMindTextBox94" type="#_x0000_t202" stroked="f" filled="f" o:allowincell="f" style="position:absolute;margin-left:56.800pt;margin-top:543.556pt;width:484.036pt;height:19.125pt;z-index:251659264;mso-position-horizontal-relative:page;mso-position-vertical-relative:page;mso-wrap-style:none;mso-fit-shape-to-text:t;">
             <w10:wrap type="none"/>
             <v:textbox inset="0,0,0,0">
               <w:txbxContent>
@@ -1373,7 +2698,7 @@
                       <w:color w:val="000000"/>
                       <w:sz w:val="21"/>
                     </w:rPr>
-                    <w:t>In eleifend velit vitae libero sollicitudin euismod. Fusce vitae vestibulum velit. Pellentesque</w:t>
+                    <w:t>Fusce vitae vestibulum velit. Pellentesque vulputate lectus quis pellentesque commodo.</w:t>
                   </w:r>
                 </w:p>
               </w:txbxContent>
@@ -1383,7 +2708,7 @@
       </w:r>
       <w:r>
         <w:pict>
-          <v:shape id="DocuMindTextBox51" type="#_x0000_t202" stroked="f" filled="f" o:allowincell="f" style="position:absolute;margin-left:56.800pt;margin-top:210.056pt;width:484.184pt;height:19.125pt;z-index:251659264;mso-position-horizontal-relative:page;mso-position-vertical-relative:page;mso-wrap-style:none;mso-fit-shape-to-text:t;">
+          <v:shape id="DocuMindTextBox95" type="#_x0000_t202" stroked="f" filled="f" o:allowincell="f" style="position:absolute;margin-left:56.800pt;margin-top:558.256pt;width:484.047pt;height:19.125pt;z-index:251659264;mso-position-horizontal-relative:page;mso-position-vertical-relative:page;mso-wrap-style:none;mso-fit-shape-to-text:t;">
             <w10:wrap type="none"/>
             <v:textbox inset="0,0,0,0">
               <w:txbxContent>
@@ -1400,7 +2725,7 @@
                       <w:color w:val="000000"/>
                       <w:sz w:val="21"/>
                     </w:rPr>
-                    <w:t>vulputate lectus quis pellentesque commodo. Aliquam erat volutpat. Vestibulum in egestas</w:t>
+                    <w:t>Aliquam erat volutpat. Vestibulum in egestas velit. Pellentesque fermentum nisl vitae</w:t>
                   </w:r>
                 </w:p>
               </w:txbxContent>
@@ -1410,7 +2735,7 @@
       </w:r>
       <w:r>
         <w:pict>
-          <v:shape id="DocuMindTextBox52" type="#_x0000_t202" stroked="f" filled="f" o:allowincell="f" style="position:absolute;margin-left:56.800pt;margin-top:224.756pt;width:484.163pt;height:19.125pt;z-index:251659264;mso-position-horizontal-relative:page;mso-position-vertical-relative:page;mso-wrap-style:none;mso-fit-shape-to-text:t;">
+          <v:shape id="DocuMindTextBox96" type="#_x0000_t202" stroked="f" filled="f" o:allowincell="f" style="position:absolute;margin-left:56.800pt;margin-top:572.956pt;width:484.520pt;height:19.125pt;z-index:251659264;mso-position-horizontal-relative:page;mso-position-vertical-relative:page;mso-wrap-style:none;mso-fit-shape-to-text:t;">
             <w10:wrap type="none"/>
             <v:textbox inset="0,0,0,0">
               <w:txbxContent>
@@ -1427,7 +2752,7 @@
                       <w:color w:val="000000"/>
                       <w:sz w:val="21"/>
                     </w:rPr>
-                    <w:t>velit. Pellentesque fermentum nisl vitae fringilla venenatis. Etiam id mauris vitae orci</w:t>
+                    <w:t>fringilla venenatis. Etiam id mauris vitae orci maximus ultricies. Cras fringilla ipsum</w:t>
                   </w:r>
                 </w:p>
               </w:txbxContent>
@@ -1437,7 +2762,7 @@
       </w:r>
       <w:r>
         <w:pict>
-          <v:shape id="DocuMindTextBox53" type="#_x0000_t202" stroked="f" filled="f" o:allowincell="f" style="position:absolute;margin-left:56.800pt;margin-top:239.456pt;width:102.550pt;height:19.125pt;z-index:251659264;mso-position-horizontal-relative:page;mso-position-vertical-relative:page;mso-wrap-style:none;mso-fit-shape-to-text:t;">
+          <v:shape id="DocuMindTextBox97" type="#_x0000_t202" stroked="f" filled="f" o:allowincell="f" style="position:absolute;margin-left:56.800pt;margin-top:587.656pt;width:186.509pt;height:19.125pt;z-index:251659264;mso-position-horizontal-relative:page;mso-position-vertical-relative:page;mso-wrap-style:none;mso-fit-shape-to-text:t;">
             <w10:wrap type="none"/>
             <v:textbox inset="0,0,0,0">
               <w:txbxContent>
@@ -1454,7 +2779,7 @@
                       <w:color w:val="000000"/>
                       <w:sz w:val="21"/>
                     </w:rPr>
-                    <w:t xml:space="preserve">maximus ultricies. </w:t>
+                    <w:t>magna, in fringilla dui commodo a.</w:t>
                   </w:r>
                 </w:p>
               </w:txbxContent>
@@ -1464,574 +2789,7 @@
       </w:r>
       <w:r>
         <w:pict>
-          <v:shape id="DocuMindTextBox54" type="#_x0000_t202" stroked="f" filled="f" o:allowincell="f" style="position:absolute;margin-left:74.800pt;margin-top:303.910pt;width:457.482pt;height:28.500pt;z-index:251659264;mso-position-horizontal-relative:page;mso-position-vertical-relative:page;mso-wrap-style:none;mso-fit-shape-to-text:t;">
-            <w10:wrap type="none"/>
-            <v:textbox inset="0,0,0,0">
-              <w:txbxContent>
-                <w:p>
-                  <w:pPr>
-                    <w:spacing w:before="0" w:after="0" w:lineRule="exact" w:line="450"/>
-                    <w:ind w:left="0" w:right="0" w:firstLine="0"/>
-                  </w:pPr>
-                  <w:r>
-                    <w:rPr>
-                      <w:rFonts w:ascii="Liberation Sans" w:hAnsi="Liberation Sans" w:eastAsia="Liberation Sans" w:cs="Liberation Sans"/>
-                      <w:b/>
-                      <w:i w:val="0"/>
-                      <w:color w:val="000000"/>
-                      <w:sz w:val="36"/>
-                    </w:rPr>
-                    <w:t xml:space="preserve">Cras fringilla ipsum magna, in fringilla dui commodo </w:t>
-                  </w:r>
-                </w:p>
-              </w:txbxContent>
-            </v:textbox>
-          </v:shape>
-        </w:pict>
-      </w:r>
-      <w:r>
-        <w:pict>
-          <v:shape id="DocuMindTextBox55" type="#_x0000_t202" stroked="f" filled="f" o:allowincell="f" style="position:absolute;margin-left:56.800pt;margin-top:324.610pt;width:17.994pt;height:28.500pt;z-index:251659264;mso-position-horizontal-relative:page;mso-position-vertical-relative:page;mso-wrap-style:none;mso-fit-shape-to-text:t;">
-            <w10:wrap type="none"/>
-            <v:textbox inset="0,0,0,0">
-              <w:txbxContent>
-                <w:p>
-                  <w:pPr>
-                    <w:spacing w:before="0" w:after="0" w:lineRule="exact" w:line="450"/>
-                    <w:ind w:left="0" w:right="0" w:firstLine="0"/>
-                  </w:pPr>
-                  <w:r>
-                    <w:rPr>
-                      <w:rFonts w:ascii="Liberation Sans" w:hAnsi="Liberation Sans" w:eastAsia="Liberation Sans" w:cs="Liberation Sans"/>
-                      <w:b/>
-                      <w:i w:val="0"/>
-                      <w:color w:val="000000"/>
-                      <w:sz w:val="36"/>
-                    </w:rPr>
-                    <w:t>a.</w:t>
-                  </w:r>
-                </w:p>
-              </w:txbxContent>
-            </v:textbox>
-          </v:shape>
-        </w:pict>
-      </w:r>
-      <w:r>
-        <w:pict>
-          <v:shape id="DocuMindTextBox56" type="#_x0000_t202" stroked="f" filled="f" o:allowincell="f" style="position:absolute;margin-left:95.600pt;margin-top:379.556pt;width:71.082pt;height:19.125pt;z-index:251659264;mso-position-horizontal-relative:page;mso-position-vertical-relative:page;mso-wrap-style:none;mso-fit-shape-to-text:t;">
-            <w10:wrap type="none"/>
-            <v:textbox inset="0,0,0,0">
-              <w:txbxContent>
-                <w:p>
-                  <w:pPr>
-                    <w:spacing w:before="0" w:after="0" w:lineRule="exact" w:line="262"/>
-                    <w:ind w:left="0" w:right="0" w:firstLine="0"/>
-                  </w:pPr>
-                  <w:r>
-                    <w:rPr>
-                      <w:rFonts w:ascii="Deja Vu Sans" w:hAnsi="Deja Vu Sans" w:eastAsia="Deja Vu Sans" w:cs="Deja Vu Sans"/>
-                      <w:b w:val="0"/>
-                      <w:i w:val="0"/>
-                      <w:color w:val="000000"/>
-                      <w:sz w:val="21"/>
-                    </w:rPr>
-                    <w:t>Lorem ipsum</w:t>
-                  </w:r>
-                </w:p>
-              </w:txbxContent>
-            </v:textbox>
-          </v:shape>
-        </w:pict>
-      </w:r>
-      <w:r>
-        <w:pict>
-          <v:shape id="DocuMindTextBox57" type="#_x0000_t202" stroked="f" filled="f" o:allowincell="f" style="position:absolute;margin-left:379.100pt;margin-top:379.556pt;width:71.082pt;height:19.125pt;z-index:251659264;mso-position-horizontal-relative:page;mso-position-vertical-relative:page;mso-wrap-style:none;mso-fit-shape-to-text:t;">
-            <w10:wrap type="none"/>
-            <v:textbox inset="0,0,0,0">
-              <w:txbxContent>
-                <w:p>
-                  <w:pPr>
-                    <w:spacing w:before="0" w:after="0" w:lineRule="exact" w:line="262"/>
-                    <w:ind w:left="0" w:right="0" w:firstLine="0"/>
-                  </w:pPr>
-                  <w:r>
-                    <w:rPr>
-                      <w:rFonts w:ascii="Deja Vu Sans" w:hAnsi="Deja Vu Sans" w:eastAsia="Deja Vu Sans" w:cs="Deja Vu Sans"/>
-                      <w:b w:val="0"/>
-                      <w:i w:val="0"/>
-                      <w:color w:val="000000"/>
-                      <w:sz w:val="21"/>
-                    </w:rPr>
-                    <w:t>Lorem ipsum</w:t>
-                  </w:r>
-                </w:p>
-              </w:txbxContent>
-            </v:textbox>
-          </v:shape>
-        </w:pict>
-      </w:r>
-      <w:r>
-        <w:pict>
-          <v:shape id="DocuMindTextBox58" type="#_x0000_t202" stroked="f" filled="f" o:allowincell="f" style="position:absolute;margin-left:457.100pt;margin-top:379.556pt;width:71.082pt;height:19.125pt;z-index:251659264;mso-position-horizontal-relative:page;mso-position-vertical-relative:page;mso-wrap-style:none;mso-fit-shape-to-text:t;">
-            <w10:wrap type="none"/>
-            <v:textbox inset="0,0,0,0">
-              <w:txbxContent>
-                <w:p>
-                  <w:pPr>
-                    <w:spacing w:before="0" w:after="0" w:lineRule="exact" w:line="262"/>
-                    <w:ind w:left="0" w:right="0" w:firstLine="0"/>
-                  </w:pPr>
-                  <w:r>
-                    <w:rPr>
-                      <w:rFonts w:ascii="Deja Vu Sans" w:hAnsi="Deja Vu Sans" w:eastAsia="Deja Vu Sans" w:cs="Deja Vu Sans"/>
-                      <w:b w:val="0"/>
-                      <w:i w:val="0"/>
-                      <w:color w:val="000000"/>
-                      <w:sz w:val="21"/>
-                    </w:rPr>
-                    <w:t>Lorem ipsum</w:t>
-                  </w:r>
-                </w:p>
-              </w:txbxContent>
-            </v:textbox>
-          </v:shape>
-        </w:pict>
-      </w:r>
-      <w:r>
-        <w:pict>
-          <v:shape id="DocuMindTextBox59" type="#_x0000_t202" stroked="f" filled="f" o:allowincell="f" style="position:absolute;margin-left:59.600pt;margin-top:408.656pt;width:9.678pt;height:19.125pt;z-index:251659264;mso-position-horizontal-relative:page;mso-position-vertical-relative:page;mso-wrap-style:none;mso-fit-shape-to-text:t;">
-            <w10:wrap type="none"/>
-            <v:textbox inset="0,0,0,0">
-              <w:txbxContent>
-                <w:p>
-                  <w:pPr>
-                    <w:spacing w:before="0" w:after="0" w:lineRule="exact" w:line="262"/>
-                    <w:ind w:left="0" w:right="0" w:firstLine="0"/>
-                  </w:pPr>
-                  <w:r>
-                    <w:rPr>
-                      <w:rFonts w:ascii="Deja Vu Sans" w:hAnsi="Deja Vu Sans" w:eastAsia="Deja Vu Sans" w:cs="Deja Vu Sans"/>
-                      <w:b w:val="0"/>
-                      <w:i w:val="0"/>
-                      <w:color w:val="000000"/>
-                      <w:sz w:val="21"/>
-                    </w:rPr>
-                    <w:t>1</w:t>
-                  </w:r>
-                </w:p>
-              </w:txbxContent>
-            </v:textbox>
-          </v:shape>
-        </w:pict>
-      </w:r>
-      <w:r>
-        <w:pict>
-          <v:shape id="DocuMindTextBox60" type="#_x0000_t202" stroked="f" filled="f" o:allowincell="f" style="position:absolute;margin-left:95.600pt;margin-top:408.656pt;width:257.573pt;height:19.125pt;z-index:251659264;mso-position-horizontal-relative:page;mso-position-vertical-relative:page;mso-wrap-style:none;mso-fit-shape-to-text:t;">
-            <w10:wrap type="none"/>
-            <v:textbox inset="0,0,0,0">
-              <w:txbxContent>
-                <w:p>
-                  <w:pPr>
-                    <w:spacing w:before="0" w:after="0" w:lineRule="exact" w:line="262"/>
-                    <w:ind w:left="0" w:right="0" w:firstLine="0"/>
-                  </w:pPr>
-                  <w:r>
-                    <w:rPr>
-                      <w:rFonts w:ascii="Deja Vu Sans" w:hAnsi="Deja Vu Sans" w:eastAsia="Deja Vu Sans" w:cs="Deja Vu Sans"/>
-                      <w:b w:val="0"/>
-                      <w:i w:val="0"/>
-                      <w:color w:val="000000"/>
-                      <w:sz w:val="21"/>
-                    </w:rPr>
-                    <w:t>In eleifend velit vitae libero sollicitudin euismod.</w:t>
-                  </w:r>
-                </w:p>
-              </w:txbxContent>
-            </v:textbox>
-          </v:shape>
-        </w:pict>
-      </w:r>
-      <w:r>
-        <w:pict>
-          <v:shape id="DocuMindTextBox61" type="#_x0000_t202" stroked="f" filled="f" o:allowincell="f" style="position:absolute;margin-left:379.100pt;margin-top:408.656pt;width:35.823pt;height:19.125pt;z-index:251659264;mso-position-horizontal-relative:page;mso-position-vertical-relative:page;mso-wrap-style:none;mso-fit-shape-to-text:t;">
-            <w10:wrap type="none"/>
-            <v:textbox inset="0,0,0,0">
-              <w:txbxContent>
-                <w:p>
-                  <w:pPr>
-                    <w:spacing w:before="0" w:after="0" w:lineRule="exact" w:line="262"/>
-                    <w:ind w:left="0" w:right="0" w:firstLine="0"/>
-                  </w:pPr>
-                  <w:r>
-                    <w:rPr>
-                      <w:rFonts w:ascii="Deja Vu Sans" w:hAnsi="Deja Vu Sans" w:eastAsia="Deja Vu Sans" w:cs="Deja Vu Sans"/>
-                      <w:b w:val="0"/>
-                      <w:i w:val="0"/>
-                      <w:color w:val="000000"/>
-                      <w:sz w:val="21"/>
-                    </w:rPr>
-                    <w:t>Lorem</w:t>
-                  </w:r>
-                </w:p>
-              </w:txbxContent>
-            </v:textbox>
-          </v:shape>
-        </w:pict>
-      </w:r>
-      <w:r>
-        <w:pict>
-          <v:shape id="DocuMindTextBox62" type="#_x0000_t202" stroked="f" filled="f" o:allowincell="f" style="position:absolute;margin-left:59.600pt;margin-top:437.756pt;width:9.678pt;height:19.125pt;z-index:251659264;mso-position-horizontal-relative:page;mso-position-vertical-relative:page;mso-wrap-style:none;mso-fit-shape-to-text:t;">
-            <w10:wrap type="none"/>
-            <v:textbox inset="0,0,0,0">
-              <w:txbxContent>
-                <w:p>
-                  <w:pPr>
-                    <w:spacing w:before="0" w:after="0" w:lineRule="exact" w:line="262"/>
-                    <w:ind w:left="0" w:right="0" w:firstLine="0"/>
-                  </w:pPr>
-                  <w:r>
-                    <w:rPr>
-                      <w:rFonts w:ascii="Deja Vu Sans" w:hAnsi="Deja Vu Sans" w:eastAsia="Deja Vu Sans" w:cs="Deja Vu Sans"/>
-                      <w:b w:val="0"/>
-                      <w:i w:val="0"/>
-                      <w:color w:val="000000"/>
-                      <w:sz w:val="21"/>
-                    </w:rPr>
-                    <w:t>2</w:t>
-                  </w:r>
-                </w:p>
-              </w:txbxContent>
-            </v:textbox>
-          </v:shape>
-        </w:pict>
-      </w:r>
-      <w:r>
-        <w:pict>
-          <v:shape id="DocuMindTextBox63" type="#_x0000_t202" stroked="f" filled="f" o:allowincell="f" style="position:absolute;margin-left:95.600pt;margin-top:437.756pt;width:278.289pt;height:19.125pt;z-index:251659264;mso-position-horizontal-relative:page;mso-position-vertical-relative:page;mso-wrap-style:none;mso-fit-shape-to-text:t;">
-            <w10:wrap type="none"/>
-            <v:textbox inset="0,0,0,0">
-              <w:txbxContent>
-                <w:p>
-                  <w:pPr>
-                    <w:spacing w:before="0" w:after="0" w:lineRule="exact" w:line="262"/>
-                    <w:ind w:left="0" w:right="0" w:firstLine="0"/>
-                  </w:pPr>
-                  <w:r>
-                    <w:rPr>
-                      <w:rFonts w:ascii="Deja Vu Sans" w:hAnsi="Deja Vu Sans" w:eastAsia="Deja Vu Sans" w:cs="Deja Vu Sans"/>
-                      <w:b w:val="0"/>
-                      <w:i w:val="0"/>
-                      <w:color w:val="000000"/>
-                      <w:sz w:val="21"/>
-                    </w:rPr>
-                    <w:t>Cras fringilla ipsum magna, in fringilla dui commodo</w:t>
-                  </w:r>
-                </w:p>
-              </w:txbxContent>
-            </v:textbox>
-          </v:shape>
-        </w:pict>
-      </w:r>
-      <w:r>
-        <w:pict>
-          <v:shape id="DocuMindTextBox64" type="#_x0000_t202" stroked="f" filled="f" o:allowincell="f" style="position:absolute;margin-left:95.600pt;margin-top:452.456pt;width:12.818pt;height:19.125pt;z-index:251659264;mso-position-horizontal-relative:page;mso-position-vertical-relative:page;mso-wrap-style:none;mso-fit-shape-to-text:t;">
-            <w10:wrap type="none"/>
-            <v:textbox inset="0,0,0,0">
-              <w:txbxContent>
-                <w:p>
-                  <w:pPr>
-                    <w:spacing w:before="0" w:after="0" w:lineRule="exact" w:line="262"/>
-                    <w:ind w:left="0" w:right="0" w:firstLine="0"/>
-                  </w:pPr>
-                  <w:r>
-                    <w:rPr>
-                      <w:rFonts w:ascii="Deja Vu Sans" w:hAnsi="Deja Vu Sans" w:eastAsia="Deja Vu Sans" w:cs="Deja Vu Sans"/>
-                      <w:b w:val="0"/>
-                      <w:i w:val="0"/>
-                      <w:color w:val="000000"/>
-                      <w:sz w:val="21"/>
-                    </w:rPr>
-                    <w:t>a.</w:t>
-                  </w:r>
-                </w:p>
-              </w:txbxContent>
-            </v:textbox>
-          </v:shape>
-        </w:pict>
-      </w:r>
-      <w:r>
-        <w:pict>
-          <v:shape id="DocuMindTextBox65" type="#_x0000_t202" stroked="f" filled="f" o:allowincell="f" style="position:absolute;margin-left:379.100pt;margin-top:437.756pt;width:35.088pt;height:19.125pt;z-index:251659264;mso-position-horizontal-relative:page;mso-position-vertical-relative:page;mso-wrap-style:none;mso-fit-shape-to-text:t;">
-            <w10:wrap type="none"/>
-            <v:textbox inset="0,0,0,0">
-              <w:txbxContent>
-                <w:p>
-                  <w:pPr>
-                    <w:spacing w:before="0" w:after="0" w:lineRule="exact" w:line="262"/>
-                    <w:ind w:left="0" w:right="0" w:firstLine="0"/>
-                  </w:pPr>
-                  <w:r>
-                    <w:rPr>
-                      <w:rFonts w:ascii="Deja Vu Sans" w:hAnsi="Deja Vu Sans" w:eastAsia="Deja Vu Sans" w:cs="Deja Vu Sans"/>
-                      <w:b w:val="0"/>
-                      <w:i w:val="0"/>
-                      <w:color w:val="000000"/>
-                      <w:sz w:val="21"/>
-                    </w:rPr>
-                    <w:t>Ipsum</w:t>
-                  </w:r>
-                </w:p>
-              </w:txbxContent>
-            </v:textbox>
-          </v:shape>
-        </w:pict>
-      </w:r>
-      <w:r>
-        <w:pict>
-          <v:shape id="DocuMindTextBox66" type="#_x0000_t202" stroked="f" filled="f" o:allowincell="f" style="position:absolute;margin-left:59.600pt;margin-top:481.556pt;width:9.678pt;height:19.125pt;z-index:251659264;mso-position-horizontal-relative:page;mso-position-vertical-relative:page;mso-wrap-style:none;mso-fit-shape-to-text:t;">
-            <w10:wrap type="none"/>
-            <v:textbox inset="0,0,0,0">
-              <w:txbxContent>
-                <w:p>
-                  <w:pPr>
-                    <w:spacing w:before="0" w:after="0" w:lineRule="exact" w:line="262"/>
-                    <w:ind w:left="0" w:right="0" w:firstLine="0"/>
-                  </w:pPr>
-                  <w:r>
-                    <w:rPr>
-                      <w:rFonts w:ascii="Deja Vu Sans" w:hAnsi="Deja Vu Sans" w:eastAsia="Deja Vu Sans" w:cs="Deja Vu Sans"/>
-                      <w:b w:val="0"/>
-                      <w:i w:val="0"/>
-                      <w:color w:val="000000"/>
-                      <w:sz w:val="21"/>
-                    </w:rPr>
-                    <w:t>3</w:t>
-                  </w:r>
-                </w:p>
-              </w:txbxContent>
-            </v:textbox>
-          </v:shape>
-        </w:pict>
-      </w:r>
-      <w:r>
-        <w:pict>
-          <v:shape id="DocuMindTextBox67" type="#_x0000_t202" stroked="f" filled="f" o:allowincell="f" style="position:absolute;margin-left:95.600pt;margin-top:481.556pt;width:124.149pt;height:19.125pt;z-index:251659264;mso-position-horizontal-relative:page;mso-position-vertical-relative:page;mso-wrap-style:none;mso-fit-shape-to-text:t;">
-            <w10:wrap type="none"/>
-            <v:textbox inset="0,0,0,0">
-              <w:txbxContent>
-                <w:p>
-                  <w:pPr>
-                    <w:spacing w:before="0" w:after="0" w:lineRule="exact" w:line="262"/>
-                    <w:ind w:left="0" w:right="0" w:firstLine="0"/>
-                  </w:pPr>
-                  <w:r>
-                    <w:rPr>
-                      <w:rFonts w:ascii="Deja Vu Sans" w:hAnsi="Deja Vu Sans" w:eastAsia="Deja Vu Sans" w:cs="Deja Vu Sans"/>
-                      <w:b w:val="0"/>
-                      <w:i w:val="0"/>
-                      <w:color w:val="000000"/>
-                      <w:sz w:val="21"/>
-                    </w:rPr>
-                    <w:t xml:space="preserve">Aliquam erat volutpat. </w:t>
-                  </w:r>
-                </w:p>
-              </w:txbxContent>
-            </v:textbox>
-          </v:shape>
-        </w:pict>
-      </w:r>
-      <w:r>
-        <w:pict>
-          <v:shape id="DocuMindTextBox68" type="#_x0000_t202" stroked="f" filled="f" o:allowincell="f" style="position:absolute;margin-left:379.100pt;margin-top:481.556pt;width:35.823pt;height:19.125pt;z-index:251659264;mso-position-horizontal-relative:page;mso-position-vertical-relative:page;mso-wrap-style:none;mso-fit-shape-to-text:t;">
-            <w10:wrap type="none"/>
-            <v:textbox inset="0,0,0,0">
-              <w:txbxContent>
-                <w:p>
-                  <w:pPr>
-                    <w:spacing w:before="0" w:after="0" w:lineRule="exact" w:line="262"/>
-                    <w:ind w:left="0" w:right="0" w:firstLine="0"/>
-                  </w:pPr>
-                  <w:r>
-                    <w:rPr>
-                      <w:rFonts w:ascii="Deja Vu Sans" w:hAnsi="Deja Vu Sans" w:eastAsia="Deja Vu Sans" w:cs="Deja Vu Sans"/>
-                      <w:b w:val="0"/>
-                      <w:i w:val="0"/>
-                      <w:color w:val="000000"/>
-                      <w:sz w:val="21"/>
-                    </w:rPr>
-                    <w:t>Lorem</w:t>
-                  </w:r>
-                </w:p>
-              </w:txbxContent>
-            </v:textbox>
-          </v:shape>
-        </w:pict>
-      </w:r>
-      <w:r>
-        <w:pict>
-          <v:shape id="DocuMindTextBox69" type="#_x0000_t202" stroked="f" filled="f" o:allowincell="f" style="position:absolute;margin-left:59.600pt;margin-top:510.656pt;width:9.678pt;height:19.125pt;z-index:251659264;mso-position-horizontal-relative:page;mso-position-vertical-relative:page;mso-wrap-style:none;mso-fit-shape-to-text:t;">
-            <w10:wrap type="none"/>
-            <v:textbox inset="0,0,0,0">
-              <w:txbxContent>
-                <w:p>
-                  <w:pPr>
-                    <w:spacing w:before="0" w:after="0" w:lineRule="exact" w:line="262"/>
-                    <w:ind w:left="0" w:right="0" w:firstLine="0"/>
-                  </w:pPr>
-                  <w:r>
-                    <w:rPr>
-                      <w:rFonts w:ascii="Deja Vu Sans" w:hAnsi="Deja Vu Sans" w:eastAsia="Deja Vu Sans" w:cs="Deja Vu Sans"/>
-                      <w:b w:val="0"/>
-                      <w:i w:val="0"/>
-                      <w:color w:val="000000"/>
-                      <w:sz w:val="21"/>
-                    </w:rPr>
-                    <w:t>4</w:t>
-                  </w:r>
-                </w:p>
-              </w:txbxContent>
-            </v:textbox>
-          </v:shape>
-        </w:pict>
-      </w:r>
-      <w:r>
-        <w:pict>
-          <v:shape id="DocuMindTextBox70" type="#_x0000_t202" stroked="f" filled="f" o:allowincell="f" style="position:absolute;margin-left:95.600pt;margin-top:510.656pt;width:156.458pt;height:19.125pt;z-index:251659264;mso-position-horizontal-relative:page;mso-position-vertical-relative:page;mso-wrap-style:none;mso-fit-shape-to-text:t;">
-            <w10:wrap type="none"/>
-            <v:textbox inset="0,0,0,0">
-              <w:txbxContent>
-                <w:p>
-                  <w:pPr>
-                    <w:spacing w:before="0" w:after="0" w:lineRule="exact" w:line="262"/>
-                    <w:ind w:left="0" w:right="0" w:firstLine="0"/>
-                  </w:pPr>
-                  <w:r>
-                    <w:rPr>
-                      <w:rFonts w:ascii="Deja Vu Sans" w:hAnsi="Deja Vu Sans" w:eastAsia="Deja Vu Sans" w:cs="Deja Vu Sans"/>
-                      <w:b w:val="0"/>
-                      <w:i w:val="0"/>
-                      <w:color w:val="000000"/>
-                      <w:sz w:val="21"/>
-                    </w:rPr>
-                    <w:t xml:space="preserve">Fusce vitae vestibulum velit. </w:t>
-                  </w:r>
-                </w:p>
-              </w:txbxContent>
-            </v:textbox>
-          </v:shape>
-        </w:pict>
-      </w:r>
-      <w:r>
-        <w:pict>
-          <v:shape id="DocuMindTextBox71" type="#_x0000_t202" stroked="f" filled="f" o:allowincell="f" style="position:absolute;margin-left:379.100pt;margin-top:510.656pt;width:35.823pt;height:19.125pt;z-index:251659264;mso-position-horizontal-relative:page;mso-position-vertical-relative:page;mso-wrap-style:none;mso-fit-shape-to-text:t;">
-            <w10:wrap type="none"/>
-            <v:textbox inset="0,0,0,0">
-              <w:txbxContent>
-                <w:p>
-                  <w:pPr>
-                    <w:spacing w:before="0" w:after="0" w:lineRule="exact" w:line="262"/>
-                    <w:ind w:left="0" w:right="0" w:firstLine="0"/>
-                  </w:pPr>
-                  <w:r>
-                    <w:rPr>
-                      <w:rFonts w:ascii="Deja Vu Sans" w:hAnsi="Deja Vu Sans" w:eastAsia="Deja Vu Sans" w:cs="Deja Vu Sans"/>
-                      <w:b w:val="0"/>
-                      <w:i w:val="0"/>
-                      <w:color w:val="000000"/>
-                      <w:sz w:val="21"/>
-                    </w:rPr>
-                    <w:t>Lorem</w:t>
-                  </w:r>
-                </w:p>
-              </w:txbxContent>
-            </v:textbox>
-          </v:shape>
-        </w:pict>
-      </w:r>
-      <w:r>
-        <w:pict>
-          <v:shape id="DocuMindTextBox72" type="#_x0000_t202" stroked="f" filled="f" o:allowincell="f" style="position:absolute;margin-left:59.600pt;margin-top:539.756pt;width:9.678pt;height:19.125pt;z-index:251659264;mso-position-horizontal-relative:page;mso-position-vertical-relative:page;mso-wrap-style:none;mso-fit-shape-to-text:t;">
-            <w10:wrap type="none"/>
-            <v:textbox inset="0,0,0,0">
-              <w:txbxContent>
-                <w:p>
-                  <w:pPr>
-                    <w:spacing w:before="0" w:after="0" w:lineRule="exact" w:line="262"/>
-                    <w:ind w:left="0" w:right="0" w:firstLine="0"/>
-                  </w:pPr>
-                  <w:r>
-                    <w:rPr>
-                      <w:rFonts w:ascii="Deja Vu Sans" w:hAnsi="Deja Vu Sans" w:eastAsia="Deja Vu Sans" w:cs="Deja Vu Sans"/>
-                      <w:b w:val="0"/>
-                      <w:i w:val="0"/>
-                      <w:color w:val="000000"/>
-                      <w:sz w:val="21"/>
-                    </w:rPr>
-                    <w:t>5</w:t>
-                  </w:r>
-                </w:p>
-              </w:txbxContent>
-            </v:textbox>
-          </v:shape>
-        </w:pict>
-      </w:r>
-      <w:r>
-        <w:pict>
-          <v:shape id="DocuMindTextBox73" type="#_x0000_t202" stroked="f" filled="f" o:allowincell="f" style="position:absolute;margin-left:95.600pt;margin-top:539.756pt;width:180.765pt;height:19.125pt;z-index:251659264;mso-position-horizontal-relative:page;mso-position-vertical-relative:page;mso-wrap-style:none;mso-fit-shape-to-text:t;">
-            <w10:wrap type="none"/>
-            <v:textbox inset="0,0,0,0">
-              <w:txbxContent>
-                <w:p>
-                  <w:pPr>
-                    <w:spacing w:before="0" w:after="0" w:lineRule="exact" w:line="262"/>
-                    <w:ind w:left="0" w:right="0" w:firstLine="0"/>
-                  </w:pPr>
-                  <w:r>
-                    <w:rPr>
-                      <w:rFonts w:ascii="Deja Vu Sans" w:hAnsi="Deja Vu Sans" w:eastAsia="Deja Vu Sans" w:cs="Deja Vu Sans"/>
-                      <w:b w:val="0"/>
-                      <w:i w:val="0"/>
-                      <w:color w:val="000000"/>
-                      <w:sz w:val="21"/>
-                    </w:rPr>
-                    <w:t>Etiam vehicula luctus fermentum.</w:t>
-                  </w:r>
-                </w:p>
-              </w:txbxContent>
-            </v:textbox>
-          </v:shape>
-        </w:pict>
-      </w:r>
-      <w:r>
-        <w:pict>
-          <v:shape id="DocuMindTextBox74" type="#_x0000_t202" stroked="f" filled="f" o:allowincell="f" style="position:absolute;margin-left:379.100pt;margin-top:539.756pt;width:35.088pt;height:19.125pt;z-index:251659264;mso-position-horizontal-relative:page;mso-position-vertical-relative:page;mso-wrap-style:none;mso-fit-shape-to-text:t;">
-            <w10:wrap type="none"/>
-            <v:textbox inset="0,0,0,0">
-              <w:txbxContent>
-                <w:p>
-                  <w:pPr>
-                    <w:spacing w:before="0" w:after="0" w:lineRule="exact" w:line="262"/>
-                    <w:ind w:left="0" w:right="0" w:firstLine="0"/>
-                  </w:pPr>
-                  <w:r>
-                    <w:rPr>
-                      <w:rFonts w:ascii="Deja Vu Sans" w:hAnsi="Deja Vu Sans" w:eastAsia="Deja Vu Sans" w:cs="Deja Vu Sans"/>
-                      <w:b w:val="0"/>
-                      <w:i w:val="0"/>
-                      <w:color w:val="000000"/>
-                      <w:sz w:val="21"/>
-                    </w:rPr>
-                    <w:t>Ipsum</w:t>
-                  </w:r>
-                </w:p>
-              </w:txbxContent>
-            </v:textbox>
-          </v:shape>
-        </w:pict>
-      </w:r>
-      <w:r>
-        <w:pict>
-          <v:shape id="DocuMindTextBox75" type="#_x0000_t202" stroked="f" filled="f" o:allowincell="f" style="position:absolute;margin-left:56.800pt;margin-top:592.056pt;width:483.732pt;height:19.125pt;z-index:251659264;mso-position-horizontal-relative:page;mso-position-vertical-relative:page;mso-wrap-style:none;mso-fit-shape-to-text:t;">
+          <v:shape id="DocuMindTextBox98" type="#_x0000_t202" stroked="f" filled="f" o:allowincell="f" style="position:absolute;margin-left:56.800pt;margin-top:613.556pt;width:483.732pt;height:19.125pt;z-index:251659264;mso-position-horizontal-relative:page;mso-position-vertical-relative:page;mso-wrap-style:none;mso-fit-shape-to-text:t;">
             <w10:wrap type="none"/>
             <v:textbox inset="0,0,0,0">
               <w:txbxContent>
@@ -2058,7 +2816,7 @@
       </w:r>
       <w:r>
         <w:pict>
-          <v:shape id="DocuMindTextBox76" type="#_x0000_t202" stroked="f" filled="f" o:allowincell="f" style="position:absolute;margin-left:56.800pt;margin-top:606.756pt;width:484.299pt;height:19.125pt;z-index:251659264;mso-position-horizontal-relative:page;mso-position-vertical-relative:page;mso-wrap-style:none;mso-fit-shape-to-text:t;">
+          <v:shape id="DocuMindTextBox99" type="#_x0000_t202" stroked="f" filled="f" o:allowincell="f" style="position:absolute;margin-left:56.800pt;margin-top:628.256pt;width:484.299pt;height:19.125pt;z-index:251659264;mso-position-horizontal-relative:page;mso-position-vertical-relative:page;mso-wrap-style:none;mso-fit-shape-to-text:t;">
             <w10:wrap type="none"/>
             <v:textbox inset="0,0,0,0">
               <w:txbxContent>
@@ -2085,7 +2843,7 @@
       </w:r>
       <w:r>
         <w:pict>
-          <v:shape id="DocuMindTextBox77" type="#_x0000_t202" stroked="f" filled="f" o:allowincell="f" style="position:absolute;margin-left:56.800pt;margin-top:621.456pt;width:484.047pt;height:19.125pt;z-index:251659264;mso-position-horizontal-relative:page;mso-position-vertical-relative:page;mso-wrap-style:none;mso-fit-shape-to-text:t;">
+          <v:shape id="DocuMindTextBox100" type="#_x0000_t202" stroked="f" filled="f" o:allowincell="f" style="position:absolute;margin-left:56.800pt;margin-top:642.956pt;width:484.047pt;height:19.125pt;z-index:251659264;mso-position-horizontal-relative:page;mso-position-vertical-relative:page;mso-wrap-style:none;mso-fit-shape-to-text:t;">
             <w10:wrap type="none"/>
             <v:textbox inset="0,0,0,0">
               <w:txbxContent>
@@ -2112,7 +2870,7 @@
       </w:r>
       <w:r>
         <w:pict>
-          <v:shape id="DocuMindTextBox78" type="#_x0000_t202" stroked="f" filled="f" o:allowincell="f" style="position:absolute;margin-left:56.800pt;margin-top:636.156pt;width:484.498pt;height:19.125pt;z-index:251659264;mso-position-horizontal-relative:page;mso-position-vertical-relative:page;mso-wrap-style:none;mso-fit-shape-to-text:t;">
+          <v:shape id="DocuMindTextBox101" type="#_x0000_t202" stroked="f" filled="f" o:allowincell="f" style="position:absolute;margin-left:56.800pt;margin-top:657.656pt;width:484.498pt;height:19.125pt;z-index:251659264;mso-position-horizontal-relative:page;mso-position-vertical-relative:page;mso-wrap-style:none;mso-fit-shape-to-text:t;">
             <w10:wrap type="none"/>
             <v:textbox inset="0,0,0,0">
               <w:txbxContent>
@@ -2139,7 +2897,7 @@
       </w:r>
       <w:r>
         <w:pict>
-          <v:shape id="DocuMindTextBox79" type="#_x0000_t202" stroked="f" filled="f" o:allowincell="f" style="position:absolute;margin-left:56.800pt;margin-top:650.856pt;width:484.299pt;height:19.125pt;z-index:251659264;mso-position-horizontal-relative:page;mso-position-vertical-relative:page;mso-wrap-style:none;mso-fit-shape-to-text:t;">
+          <v:shape id="DocuMindTextBox102" type="#_x0000_t202" stroked="f" filled="f" o:allowincell="f" style="position:absolute;margin-left:56.800pt;margin-top:672.356pt;width:484.299pt;height:19.125pt;z-index:251659264;mso-position-horizontal-relative:page;mso-position-vertical-relative:page;mso-wrap-style:none;mso-fit-shape-to-text:t;">
             <w10:wrap type="none"/>
             <v:textbox inset="0,0,0,0">
               <w:txbxContent>
@@ -2166,7 +2924,7 @@
       </w:r>
       <w:r>
         <w:pict>
-          <v:shape id="DocuMindTextBox80" type="#_x0000_t202" stroked="f" filled="f" o:allowincell="f" style="position:absolute;margin-left:56.800pt;margin-top:665.556pt;width:483.858pt;height:19.125pt;z-index:251659264;mso-position-horizontal-relative:page;mso-position-vertical-relative:page;mso-wrap-style:none;mso-fit-shape-to-text:t;">
+          <v:shape id="DocuMindTextBox103" type="#_x0000_t202" stroked="f" filled="f" o:allowincell="f" style="position:absolute;margin-left:56.800pt;margin-top:687.056pt;width:483.858pt;height:19.125pt;z-index:251659264;mso-position-horizontal-relative:page;mso-position-vertical-relative:page;mso-wrap-style:none;mso-fit-shape-to-text:t;">
             <w10:wrap type="none"/>
             <v:textbox inset="0,0,0,0">
               <w:txbxContent>
@@ -2193,7 +2951,7 @@
       </w:r>
       <w:r>
         <w:pict>
-          <v:shape id="DocuMindTextBox81" type="#_x0000_t202" stroked="f" filled="f" o:allowincell="f" style="position:absolute;margin-left:56.800pt;margin-top:680.256pt;width:484.457pt;height:19.125pt;z-index:251659264;mso-position-horizontal-relative:page;mso-position-vertical-relative:page;mso-wrap-style:none;mso-fit-shape-to-text:t;">
+          <v:shape id="DocuMindTextBox104" type="#_x0000_t202" stroked="f" filled="f" o:allowincell="f" style="position:absolute;margin-left:56.800pt;margin-top:701.756pt;width:484.457pt;height:19.125pt;z-index:251659264;mso-position-horizontal-relative:page;mso-position-vertical-relative:page;mso-wrap-style:none;mso-fit-shape-to-text:t;">
             <w10:wrap type="none"/>
             <v:textbox inset="0,0,0,0">
               <w:txbxContent>
@@ -2220,7 +2978,7 @@
       </w:r>
       <w:r>
         <w:pict>
-          <v:shape id="DocuMindTextBox82" type="#_x0000_t202" stroked="f" filled="f" o:allowincell="f" style="position:absolute;margin-left:56.800pt;margin-top:694.956pt;width:484.278pt;height:19.125pt;z-index:251659264;mso-position-horizontal-relative:page;mso-position-vertical-relative:page;mso-wrap-style:none;mso-fit-shape-to-text:t;">
+          <v:shape id="DocuMindTextBox105" type="#_x0000_t202" stroked="f" filled="f" o:allowincell="f" style="position:absolute;margin-left:56.800pt;margin-top:716.456pt;width:484.278pt;height:19.125pt;z-index:251659264;mso-position-horizontal-relative:page;mso-position-vertical-relative:page;mso-wrap-style:none;mso-fit-shape-to-text:t;">
             <w10:wrap type="none"/>
             <v:textbox inset="0,0,0,0">
               <w:txbxContent>
@@ -2247,7 +3005,7 @@
       </w:r>
       <w:r>
         <w:pict>
-          <v:shape id="DocuMindTextBox83" type="#_x0000_t202" stroked="f" filled="f" o:allowincell="f" style="position:absolute;margin-left:56.800pt;margin-top:709.656pt;width:254.853pt;height:19.125pt;z-index:251659264;mso-position-horizontal-relative:page;mso-position-vertical-relative:page;mso-wrap-style:none;mso-fit-shape-to-text:t;">
+          <v:shape id="DocuMindTextBox106" type="#_x0000_t202" stroked="f" filled="f" o:allowincell="f" style="position:absolute;margin-left:56.800pt;margin-top:731.156pt;width:254.853pt;height:19.125pt;z-index:251659264;mso-position-horizontal-relative:page;mso-position-vertical-relative:page;mso-wrap-style:none;mso-fit-shape-to-text:t;">
             <w10:wrap type="none"/>
             <v:textbox inset="0,0,0,0">
               <w:txbxContent>
@@ -2294,304 +3052,15 @@
       </w:r>
       <w:r>
         <w:pict>
-          <v:shape id="DocuMindTextBox84" type="#_x0000_t202" stroked="f" filled="f" o:allowincell="f" style="position:absolute;margin-left:74.800pt;margin-top:55.810pt;width:449.616pt;height:28.500pt;z-index:251659264;mso-position-horizontal-relative:page;mso-position-vertical-relative:page;mso-wrap-style:none;mso-fit-shape-to-text:t;">
+          <v:shape id="DocuMindImage107" type="#_x0000_t75" stroked="f" o:allowincell="f" style="position:absolute;margin-left:56.800pt;margin-top:56.700pt;width:481.700pt;height:321.300pt;z-index:1;mso-position-horizontal-relative:page;mso-position-vertical-relative:page;mso-wrap-style:none;">
             <w10:wrap type="none"/>
-            <v:textbox inset="0,0,0,0">
-              <w:txbxContent>
-                <w:p>
-                  <w:pPr>
-                    <w:spacing w:before="0" w:after="0" w:lineRule="exact" w:line="450"/>
-                    <w:ind w:left="0" w:right="0" w:firstLine="0"/>
-                  </w:pPr>
-                  <w:r>
-                    <w:rPr>
-                      <w:rFonts w:ascii="Liberation Sans" w:hAnsi="Liberation Sans" w:eastAsia="Liberation Sans" w:cs="Liberation Sans"/>
-                      <w:b/>
-                      <w:i w:val="0"/>
-                      <w:color w:val="000000"/>
-                      <w:sz w:val="36"/>
-                    </w:rPr>
-                    <w:t xml:space="preserve">Lorem ipsum dolor sit amet, consectetur adipiscing </w:t>
-                  </w:r>
-                </w:p>
-              </w:txbxContent>
-            </v:textbox>
+            <v:imagedata r:id="rId9" o:title=""/>
           </v:shape>
         </w:pict>
       </w:r>
       <w:r>
         <w:pict>
-          <v:shape id="DocuMindTextBox85" type="#_x0000_t202" stroked="f" filled="f" o:allowincell="f" style="position:absolute;margin-left:96.400pt;margin-top:76.510pt;width:38.946pt;height:28.500pt;z-index:251659264;mso-position-horizontal-relative:page;mso-position-vertical-relative:page;mso-wrap-style:none;mso-fit-shape-to-text:t;">
-            <w10:wrap type="none"/>
-            <v:textbox inset="0,0,0,0">
-              <w:txbxContent>
-                <w:p>
-                  <w:pPr>
-                    <w:spacing w:before="0" w:after="0" w:lineRule="exact" w:line="450"/>
-                    <w:ind w:left="0" w:right="0" w:firstLine="0"/>
-                  </w:pPr>
-                  <w:r>
-                    <w:rPr>
-                      <w:rFonts w:ascii="Liberation Sans" w:hAnsi="Liberation Sans" w:eastAsia="Liberation Sans" w:cs="Liberation Sans"/>
-                      <w:b/>
-                      <w:i w:val="0"/>
-                      <w:color w:val="000000"/>
-                      <w:sz w:val="36"/>
-                    </w:rPr>
-                    <w:t xml:space="preserve">elit. </w:t>
-                  </w:r>
-                </w:p>
-              </w:txbxContent>
-            </v:textbox>
-          </v:shape>
-        </w:pict>
-      </w:r>
-      <w:r>
-        <w:pict>
-          <v:shape id="DocuMindTextBox86" type="#_x0000_t202" stroked="f" filled="f" o:allowincell="f" style="position:absolute;margin-left:56.800pt;margin-top:128.556pt;width:484.141pt;height:19.125pt;z-index:251659264;mso-position-horizontal-relative:page;mso-position-vertical-relative:page;mso-wrap-style:none;mso-fit-shape-to-text:t;">
-            <w10:wrap type="none"/>
-            <v:textbox inset="0,0,0,0">
-              <w:txbxContent>
-                <w:p>
-                  <w:pPr>
-                    <w:spacing w:before="0" w:after="0" w:lineRule="exact" w:line="262"/>
-                    <w:ind w:left="0" w:right="0" w:firstLine="0"/>
-                  </w:pPr>
-                  <w:r>
-                    <w:rPr>
-                      <w:rFonts w:ascii="Deja Vu Sans" w:hAnsi="Deja Vu Sans" w:eastAsia="Deja Vu Sans" w:cs="Deja Vu Sans"/>
-                      <w:b w:val="0"/>
-                      <w:i w:val="0"/>
-                      <w:color w:val="000000"/>
-                      <w:sz w:val="21"/>
-                    </w:rPr>
-                    <w:t>Nunc ac faucibus odio. Vestibulum neque massa, scelerisque sit amet ligula eu, congue</w:t>
-                  </w:r>
-                </w:p>
-              </w:txbxContent>
-            </v:textbox>
-          </v:shape>
-        </w:pict>
-      </w:r>
-      <w:r>
-        <w:pict>
-          <v:shape id="DocuMindTextBox87" type="#_x0000_t202" stroked="f" filled="f" o:allowincell="f" style="position:absolute;margin-left:56.800pt;margin-top:143.256pt;width:484.068pt;height:19.125pt;z-index:251659264;mso-position-horizontal-relative:page;mso-position-vertical-relative:page;mso-wrap-style:none;mso-fit-shape-to-text:t;">
-            <w10:wrap type="none"/>
-            <v:textbox inset="0,0,0,0">
-              <w:txbxContent>
-                <w:p>
-                  <w:pPr>
-                    <w:spacing w:before="0" w:after="0" w:lineRule="exact" w:line="262"/>
-                    <w:ind w:left="0" w:right="0" w:firstLine="0"/>
-                  </w:pPr>
-                  <w:r>
-                    <w:rPr>
-                      <w:rFonts w:ascii="Deja Vu Sans" w:hAnsi="Deja Vu Sans" w:eastAsia="Deja Vu Sans" w:cs="Deja Vu Sans"/>
-                      <w:b w:val="0"/>
-                      <w:i w:val="0"/>
-                      <w:color w:val="000000"/>
-                      <w:sz w:val="21"/>
-                    </w:rPr>
-                    <w:t>molestie mi. Praesent ut varius sem. Nullam at porttitor arcu, nec lacinia nisi. Ut ac dolor</w:t>
-                  </w:r>
-                </w:p>
-              </w:txbxContent>
-            </v:textbox>
-          </v:shape>
-        </w:pict>
-      </w:r>
-      <w:r>
-        <w:pict>
-          <v:shape id="DocuMindTextBox88" type="#_x0000_t202" stroked="f" filled="f" o:allowincell="f" style="position:absolute;margin-left:56.800pt;margin-top:157.956pt;width:484.278pt;height:19.125pt;z-index:251659264;mso-position-horizontal-relative:page;mso-position-vertical-relative:page;mso-wrap-style:none;mso-fit-shape-to-text:t;">
-            <w10:wrap type="none"/>
-            <v:textbox inset="0,0,0,0">
-              <w:txbxContent>
-                <w:p>
-                  <w:pPr>
-                    <w:spacing w:before="0" w:after="0" w:lineRule="exact" w:line="262"/>
-                    <w:ind w:left="0" w:right="0" w:firstLine="0"/>
-                  </w:pPr>
-                  <w:r>
-                    <w:rPr>
-                      <w:rFonts w:ascii="Deja Vu Sans" w:hAnsi="Deja Vu Sans" w:eastAsia="Deja Vu Sans" w:cs="Deja Vu Sans"/>
-                      <w:b w:val="0"/>
-                      <w:i w:val="0"/>
-                      <w:color w:val="000000"/>
-                      <w:sz w:val="21"/>
-                    </w:rPr>
-                    <w:t>vitae odio interdum condimentum. Vivamus dapibus sodales ex, vitae malesuada ipsum</w:t>
-                  </w:r>
-                </w:p>
-              </w:txbxContent>
-            </v:textbox>
-          </v:shape>
-        </w:pict>
-      </w:r>
-      <w:r>
-        <w:pict>
-          <v:shape id="DocuMindTextBox89" type="#_x0000_t202" stroked="f" filled="f" o:allowincell="f" style="position:absolute;margin-left:56.800pt;margin-top:172.656pt;width:484.341pt;height:19.125pt;z-index:251659264;mso-position-horizontal-relative:page;mso-position-vertical-relative:page;mso-wrap-style:none;mso-fit-shape-to-text:t;">
-            <w10:wrap type="none"/>
-            <v:textbox inset="0,0,0,0">
-              <w:txbxContent>
-                <w:p>
-                  <w:pPr>
-                    <w:spacing w:before="0" w:after="0" w:lineRule="exact" w:line="262"/>
-                    <w:ind w:left="0" w:right="0" w:firstLine="0"/>
-                  </w:pPr>
-                  <w:r>
-                    <w:rPr>
-                      <w:rFonts w:ascii="Deja Vu Sans" w:hAnsi="Deja Vu Sans" w:eastAsia="Deja Vu Sans" w:cs="Deja Vu Sans"/>
-                      <w:b w:val="0"/>
-                      <w:i w:val="0"/>
-                      <w:color w:val="000000"/>
-                      <w:sz w:val="21"/>
-                    </w:rPr>
-                    <w:t>cursus convallis. Maecenas sed egestas nulla, ac condimentum orci. Mauris diam felis,</w:t>
-                  </w:r>
-                </w:p>
-              </w:txbxContent>
-            </v:textbox>
-          </v:shape>
-        </w:pict>
-      </w:r>
-      <w:r>
-        <w:pict>
-          <v:shape id="DocuMindTextBox90" type="#_x0000_t202" stroked="f" filled="f" o:allowincell="f" style="position:absolute;margin-left:56.800pt;margin-top:187.356pt;width:483.847pt;height:19.125pt;z-index:251659264;mso-position-horizontal-relative:page;mso-position-vertical-relative:page;mso-wrap-style:none;mso-fit-shape-to-text:t;">
-            <w10:wrap type="none"/>
-            <v:textbox inset="0,0,0,0">
-              <w:txbxContent>
-                <w:p>
-                  <w:pPr>
-                    <w:spacing w:before="0" w:after="0" w:lineRule="exact" w:line="262"/>
-                    <w:ind w:left="0" w:right="0" w:firstLine="0"/>
-                  </w:pPr>
-                  <w:r>
-                    <w:rPr>
-                      <w:rFonts w:ascii="Deja Vu Sans" w:hAnsi="Deja Vu Sans" w:eastAsia="Deja Vu Sans" w:cs="Deja Vu Sans"/>
-                      <w:b w:val="0"/>
-                      <w:i w:val="0"/>
-                      <w:color w:val="000000"/>
-                      <w:sz w:val="21"/>
-                    </w:rPr>
-                    <w:t>vulputate ac suscipit et, iaculis non est. Curabitur semper arcu ac ligula semper, nec luctus</w:t>
-                  </w:r>
-                </w:p>
-              </w:txbxContent>
-            </v:textbox>
-          </v:shape>
-        </w:pict>
-      </w:r>
-      <w:r>
-        <w:pict>
-          <v:shape id="DocuMindTextBox91" type="#_x0000_t202" stroked="f" filled="f" o:allowincell="f" style="position:absolute;margin-left:56.800pt;margin-top:202.056pt;width:484.152pt;height:19.125pt;z-index:251659264;mso-position-horizontal-relative:page;mso-position-vertical-relative:page;mso-wrap-style:none;mso-fit-shape-to-text:t;">
-            <w10:wrap type="none"/>
-            <v:textbox inset="0,0,0,0">
-              <w:txbxContent>
-                <w:p>
-                  <w:pPr>
-                    <w:spacing w:before="0" w:after="0" w:lineRule="exact" w:line="262"/>
-                    <w:ind w:left="0" w:right="0" w:firstLine="0"/>
-                  </w:pPr>
-                  <w:r>
-                    <w:rPr>
-                      <w:rFonts w:ascii="Deja Vu Sans" w:hAnsi="Deja Vu Sans" w:eastAsia="Deja Vu Sans" w:cs="Deja Vu Sans"/>
-                      <w:b w:val="0"/>
-                      <w:i w:val="0"/>
-                      <w:color w:val="000000"/>
-                      <w:sz w:val="21"/>
-                    </w:rPr>
-                    <w:t>nisl blandit. Integer lacinia ante ac libero lobortis imperdiet. Nullam mollis convallis ipsum,</w:t>
-                  </w:r>
-                </w:p>
-              </w:txbxContent>
-            </v:textbox>
-          </v:shape>
-        </w:pict>
-      </w:r>
-      <w:r>
-        <w:pict>
-          <v:shape id="DocuMindTextBox92" type="#_x0000_t202" stroked="f" filled="f" o:allowincell="f" style="position:absolute;margin-left:56.800pt;margin-top:216.756pt;width:483.795pt;height:19.125pt;z-index:251659264;mso-position-horizontal-relative:page;mso-position-vertical-relative:page;mso-wrap-style:none;mso-fit-shape-to-text:t;">
-            <w10:wrap type="none"/>
-            <v:textbox inset="0,0,0,0">
-              <w:txbxContent>
-                <w:p>
-                  <w:pPr>
-                    <w:spacing w:before="0" w:after="0" w:lineRule="exact" w:line="262"/>
-                    <w:ind w:left="0" w:right="0" w:firstLine="0"/>
-                  </w:pPr>
-                  <w:r>
-                    <w:rPr>
-                      <w:rFonts w:ascii="Deja Vu Sans" w:hAnsi="Deja Vu Sans" w:eastAsia="Deja Vu Sans" w:cs="Deja Vu Sans"/>
-                      <w:b w:val="0"/>
-                      <w:i w:val="0"/>
-                      <w:color w:val="000000"/>
-                      <w:sz w:val="21"/>
-                    </w:rPr>
-                    <w:t>ac accumsan nunc vehicula vitae. Nulla eget justo in felis tristique fringilla. Morbi sit amet</w:t>
-                  </w:r>
-                </w:p>
-              </w:txbxContent>
-            </v:textbox>
-          </v:shape>
-        </w:pict>
-      </w:r>
-      <w:r>
-        <w:pict>
-          <v:shape id="DocuMindTextBox93" type="#_x0000_t202" stroked="f" filled="f" o:allowincell="f" style="position:absolute;margin-left:56.800pt;margin-top:231.456pt;width:483.879pt;height:19.125pt;z-index:251659264;mso-position-horizontal-relative:page;mso-position-vertical-relative:page;mso-wrap-style:none;mso-fit-shape-to-text:t;">
-            <w10:wrap type="none"/>
-            <v:textbox inset="0,0,0,0">
-              <w:txbxContent>
-                <w:p>
-                  <w:pPr>
-                    <w:spacing w:before="0" w:after="0" w:lineRule="exact" w:line="262"/>
-                    <w:ind w:left="0" w:right="0" w:firstLine="0"/>
-                  </w:pPr>
-                  <w:r>
-                    <w:rPr>
-                      <w:rFonts w:ascii="Deja Vu Sans" w:hAnsi="Deja Vu Sans" w:eastAsia="Deja Vu Sans" w:cs="Deja Vu Sans"/>
-                      <w:b w:val="0"/>
-                      <w:i w:val="0"/>
-                      <w:color w:val="000000"/>
-                      <w:sz w:val="21"/>
-                    </w:rPr>
-                    <w:t>tortor quis risus auctor condimentum. Morbi in ullamcorper elit. Nulla iaculis tellus sit amet</w:t>
-                  </w:r>
-                </w:p>
-              </w:txbxContent>
-            </v:textbox>
-          </v:shape>
-        </w:pict>
-      </w:r>
-      <w:r>
-        <w:pict>
-          <v:shape id="DocuMindTextBox94" type="#_x0000_t202" stroked="f" filled="f" o:allowincell="f" style="position:absolute;margin-left:56.800pt;margin-top:246.156pt;width:127.950pt;height:19.125pt;z-index:251659264;mso-position-horizontal-relative:page;mso-position-vertical-relative:page;mso-wrap-style:none;mso-fit-shape-to-text:t;">
-            <w10:wrap type="none"/>
-            <v:textbox inset="0,0,0,0">
-              <w:txbxContent>
-                <w:p>
-                  <w:pPr>
-                    <w:spacing w:before="0" w:after="0" w:lineRule="exact" w:line="262"/>
-                    <w:ind w:left="0" w:right="0" w:firstLine="0"/>
-                  </w:pPr>
-                  <w:r>
-                    <w:rPr>
-                      <w:rFonts w:ascii="Deja Vu Sans" w:hAnsi="Deja Vu Sans" w:eastAsia="Deja Vu Sans" w:cs="Deja Vu Sans"/>
-                      <w:b w:val="0"/>
-                      <w:i w:val="0"/>
-                      <w:color w:val="000000"/>
-                      <w:sz w:val="21"/>
-                    </w:rPr>
-                    <w:t>mauris tempus fringilla.</w:t>
-                  </w:r>
-                </w:p>
-              </w:txbxContent>
-            </v:textbox>
-          </v:shape>
-        </w:pict>
-      </w:r>
-      <w:r>
-        <w:pict>
-          <v:shape id="DocuMindTextBox95" type="#_x0000_t202" stroked="f" filled="f" o:allowincell="f" style="position:absolute;margin-left:74.800pt;margin-top:282.620pt;width:439.128pt;height:26.000pt;z-index:251659264;mso-position-horizontal-relative:page;mso-position-vertical-relative:page;mso-wrap-style:none;mso-fit-shape-to-text:t;">
+          <v:shape id="DocuMindTextBox108" type="#_x0000_t202" stroked="f" filled="f" o:allowincell="f" style="position:absolute;margin-left:74.800pt;margin-top:413.420pt;width:439.128pt;height:26.000pt;z-index:251659264;mso-position-horizontal-relative:page;mso-position-vertical-relative:page;mso-wrap-style:none;mso-fit-shape-to-text:t;">
             <w10:wrap type="none"/>
             <v:textbox inset="0,0,0,0">
               <w:txbxContent>
@@ -2618,7 +3087,7 @@
       </w:r>
       <w:r>
         <w:pict>
-          <v:shape id="DocuMindTextBox96" type="#_x0000_t202" stroked="f" filled="f" o:allowincell="f" style="position:absolute;margin-left:103.600pt;margin-top:301.020pt;width:110.440pt;height:26.000pt;z-index:251659264;mso-position-horizontal-relative:page;mso-position-vertical-relative:page;mso-wrap-style:none;mso-fit-shape-to-text:t;">
+          <v:shape id="DocuMindTextBox109" type="#_x0000_t202" stroked="f" filled="f" o:allowincell="f" style="position:absolute;margin-left:103.600pt;margin-top:431.820pt;width:110.440pt;height:26.000pt;z-index:251659264;mso-position-horizontal-relative:page;mso-position-vertical-relative:page;mso-wrap-style:none;mso-fit-shape-to-text:t;">
             <w10:wrap type="none"/>
             <v:textbox inset="0,0,0,0">
               <w:txbxContent>
@@ -2645,7 +3114,7 @@
       </w:r>
       <w:r>
         <w:pict>
-          <v:shape id="DocuMindTextBox97" type="#_x0000_t202" stroked="f" filled="f" o:allowincell="f" style="position:absolute;margin-left:56.800pt;margin-top:324.956pt;width:483.890pt;height:19.125pt;z-index:251659264;mso-position-horizontal-relative:page;mso-position-vertical-relative:page;mso-wrap-style:none;mso-fit-shape-to-text:t;">
+          <v:shape id="DocuMindTextBox110" type="#_x0000_t202" stroked="f" filled="f" o:allowincell="f" style="position:absolute;margin-left:56.800pt;margin-top:455.656pt;width:483.890pt;height:19.125pt;z-index:251659264;mso-position-horizontal-relative:page;mso-position-vertical-relative:page;mso-wrap-style:none;mso-fit-shape-to-text:t;">
             <w10:wrap type="none"/>
             <v:textbox inset="0,0,0,0">
               <w:txbxContent>
@@ -2672,7 +3141,7 @@
       </w:r>
       <w:r>
         <w:pict>
-          <v:shape id="DocuMindTextBox98" type="#_x0000_t202" stroked="f" filled="f" o:allowincell="f" style="position:absolute;margin-left:56.800pt;margin-top:339.656pt;width:483.858pt;height:19.125pt;z-index:251659264;mso-position-horizontal-relative:page;mso-position-vertical-relative:page;mso-wrap-style:none;mso-fit-shape-to-text:t;">
+          <v:shape id="DocuMindTextBox111" type="#_x0000_t202" stroked="f" filled="f" o:allowincell="f" style="position:absolute;margin-left:56.800pt;margin-top:470.356pt;width:483.858pt;height:19.125pt;z-index:251659264;mso-position-horizontal-relative:page;mso-position-vertical-relative:page;mso-wrap-style:none;mso-fit-shape-to-text:t;">
             <w10:wrap type="none"/>
             <v:textbox inset="0,0,0,0">
               <w:txbxContent>
@@ -2699,7 +3168,7 @@
       </w:r>
       <w:r>
         <w:pict>
-          <v:shape id="DocuMindTextBox99" type="#_x0000_t202" stroked="f" filled="f" o:allowincell="f" style="position:absolute;margin-left:56.800pt;margin-top:354.356pt;width:484.404pt;height:19.125pt;z-index:251659264;mso-position-horizontal-relative:page;mso-position-vertical-relative:page;mso-wrap-style:none;mso-fit-shape-to-text:t;">
+          <v:shape id="DocuMindTextBox112" type="#_x0000_t202" stroked="f" filled="f" o:allowincell="f" style="position:absolute;margin-left:56.800pt;margin-top:485.056pt;width:484.404pt;height:19.125pt;z-index:251659264;mso-position-horizontal-relative:page;mso-position-vertical-relative:page;mso-wrap-style:none;mso-fit-shape-to-text:t;">
             <w10:wrap type="none"/>
             <v:textbox inset="0,0,0,0">
               <w:txbxContent>
@@ -2726,7 +3195,7 @@
       </w:r>
       <w:r>
         <w:pict>
-          <v:shape id="DocuMindTextBox100" type="#_x0000_t202" stroked="f" filled="f" o:allowincell="f" style="position:absolute;margin-left:56.800pt;margin-top:369.056pt;width:242.999pt;height:19.125pt;z-index:251659264;mso-position-horizontal-relative:page;mso-position-vertical-relative:page;mso-wrap-style:none;mso-fit-shape-to-text:t;">
+          <v:shape id="DocuMindTextBox113" type="#_x0000_t202" stroked="f" filled="f" o:allowincell="f" style="position:absolute;margin-left:56.800pt;margin-top:499.756pt;width:242.999pt;height:19.125pt;z-index:251659264;mso-position-horizontal-relative:page;mso-position-vertical-relative:page;mso-wrap-style:none;mso-fit-shape-to-text:t;">
             <w10:wrap type="none"/>
             <v:textbox inset="0,0,0,0">
               <w:txbxContent>
@@ -2753,7 +3222,7 @@
       </w:r>
       <w:r>
         <w:pict>
-          <v:shape id="DocuMindTextBox101" type="#_x0000_t202" stroked="f" filled="f" o:allowincell="f" style="position:absolute;margin-left:56.800pt;margin-top:394.956pt;width:483.669pt;height:19.125pt;z-index:251659264;mso-position-horizontal-relative:page;mso-position-vertical-relative:page;mso-wrap-style:none;mso-fit-shape-to-text:t;">
+          <v:shape id="DocuMindTextBox114" type="#_x0000_t202" stroked="f" filled="f" o:allowincell="f" style="position:absolute;margin-left:56.800pt;margin-top:525.756pt;width:483.669pt;height:19.125pt;z-index:251659264;mso-position-horizontal-relative:page;mso-position-vertical-relative:page;mso-wrap-style:none;mso-fit-shape-to-text:t;">
             <w10:wrap type="none"/>
             <v:textbox inset="0,0,0,0">
               <w:txbxContent>
@@ -2780,7 +3249,7 @@
       </w:r>
       <w:r>
         <w:pict>
-          <v:shape id="DocuMindTextBox102" type="#_x0000_t202" stroked="f" filled="f" o:allowincell="f" style="position:absolute;margin-left:56.800pt;margin-top:409.656pt;width:484.110pt;height:19.125pt;z-index:251659264;mso-position-horizontal-relative:page;mso-position-vertical-relative:page;mso-wrap-style:none;mso-fit-shape-to-text:t;">
+          <v:shape id="DocuMindTextBox115" type="#_x0000_t202" stroked="f" filled="f" o:allowincell="f" style="position:absolute;margin-left:56.800pt;margin-top:540.456pt;width:484.110pt;height:19.125pt;z-index:251659264;mso-position-horizontal-relative:page;mso-position-vertical-relative:page;mso-wrap-style:none;mso-fit-shape-to-text:t;">
             <w10:wrap type="none"/>
             <v:textbox inset="0,0,0,0">
               <w:txbxContent>
@@ -2807,7 +3276,7 @@
       </w:r>
       <w:r>
         <w:pict>
-          <v:shape id="DocuMindTextBox103" type="#_x0000_t202" stroked="f" filled="f" o:allowincell="f" style="position:absolute;margin-left:56.800pt;margin-top:424.356pt;width:484.036pt;height:19.125pt;z-index:251659264;mso-position-horizontal-relative:page;mso-position-vertical-relative:page;mso-wrap-style:none;mso-fit-shape-to-text:t;">
+          <v:shape id="DocuMindTextBox116" type="#_x0000_t202" stroked="f" filled="f" o:allowincell="f" style="position:absolute;margin-left:56.800pt;margin-top:555.156pt;width:484.036pt;height:19.125pt;z-index:251659264;mso-position-horizontal-relative:page;mso-position-vertical-relative:page;mso-wrap-style:none;mso-fit-shape-to-text:t;">
             <w10:wrap type="none"/>
             <v:textbox inset="0,0,0,0">
               <w:txbxContent>
@@ -2834,7 +3303,7 @@
       </w:r>
       <w:r>
         <w:pict>
-          <v:shape id="DocuMindTextBox104" type="#_x0000_t202" stroked="f" filled="f" o:allowincell="f" style="position:absolute;margin-left:56.800pt;margin-top:439.056pt;width:483.837pt;height:19.125pt;z-index:251659264;mso-position-horizontal-relative:page;mso-position-vertical-relative:page;mso-wrap-style:none;mso-fit-shape-to-text:t;">
+          <v:shape id="DocuMindTextBox117" type="#_x0000_t202" stroked="f" filled="f" o:allowincell="f" style="position:absolute;margin-left:56.800pt;margin-top:569.856pt;width:483.837pt;height:19.125pt;z-index:251659264;mso-position-horizontal-relative:page;mso-position-vertical-relative:page;mso-wrap-style:none;mso-fit-shape-to-text:t;">
             <w10:wrap type="none"/>
             <v:textbox inset="0,0,0,0">
               <w:txbxContent>
@@ -2861,7 +3330,7 @@
       </w:r>
       <w:r>
         <w:pict>
-          <v:shape id="DocuMindTextBox105" type="#_x0000_t202" stroked="f" filled="f" o:allowincell="f" style="position:absolute;margin-left:56.800pt;margin-top:453.756pt;width:483.847pt;height:19.125pt;z-index:251659264;mso-position-horizontal-relative:page;mso-position-vertical-relative:page;mso-wrap-style:none;mso-fit-shape-to-text:t;">
+          <v:shape id="DocuMindTextBox118" type="#_x0000_t202" stroked="f" filled="f" o:allowincell="f" style="position:absolute;margin-left:56.800pt;margin-top:584.556pt;width:483.847pt;height:19.125pt;z-index:251659264;mso-position-horizontal-relative:page;mso-position-vertical-relative:page;mso-wrap-style:none;mso-fit-shape-to-text:t;">
             <w10:wrap type="none"/>
             <v:textbox inset="0,0,0,0">
               <w:txbxContent>
@@ -2888,7 +3357,7 @@
       </w:r>
       <w:r>
         <w:pict>
-          <v:shape id="DocuMindTextBox106" type="#_x0000_t202" stroked="f" filled="f" o:allowincell="f" style="position:absolute;margin-left:56.800pt;margin-top:468.456pt;width:484.173pt;height:19.125pt;z-index:251659264;mso-position-horizontal-relative:page;mso-position-vertical-relative:page;mso-wrap-style:none;mso-fit-shape-to-text:t;">
+          <v:shape id="DocuMindTextBox119" type="#_x0000_t202" stroked="f" filled="f" o:allowincell="f" style="position:absolute;margin-left:56.800pt;margin-top:599.256pt;width:484.173pt;height:19.125pt;z-index:251659264;mso-position-horizontal-relative:page;mso-position-vertical-relative:page;mso-wrap-style:none;mso-fit-shape-to-text:t;">
             <w10:wrap type="none"/>
             <v:textbox inset="0,0,0,0">
               <w:txbxContent>
@@ -2915,7 +3384,7 @@
       </w:r>
       <w:r>
         <w:pict>
-          <v:shape id="DocuMindTextBox107" type="#_x0000_t202" stroked="f" filled="f" o:allowincell="f" style="position:absolute;margin-left:56.800pt;margin-top:483.156pt;width:253.803pt;height:19.125pt;z-index:251659264;mso-position-horizontal-relative:page;mso-position-vertical-relative:page;mso-wrap-style:none;mso-fit-shape-to-text:t;">
+          <v:shape id="DocuMindTextBox120" type="#_x0000_t202" stroked="f" filled="f" o:allowincell="f" style="position:absolute;margin-left:56.800pt;margin-top:613.956pt;width:253.803pt;height:19.125pt;z-index:251659264;mso-position-horizontal-relative:page;mso-position-vertical-relative:page;mso-wrap-style:none;mso-fit-shape-to-text:t;">
             <w10:wrap type="none"/>
             <v:textbox inset="0,0,0,0">
               <w:txbxContent>
@@ -2942,7 +3411,7 @@
       </w:r>
       <w:r>
         <w:pict>
-          <v:shape id="DocuMindTextBox108" type="#_x0000_t202" stroked="f" filled="f" o:allowincell="f" style="position:absolute;margin-left:74.800pt;margin-top:519.620pt;width:375.176pt;height:26.000pt;z-index:251659264;mso-position-horizontal-relative:page;mso-position-vertical-relative:page;mso-wrap-style:none;mso-fit-shape-to-text:t;">
+          <v:shape id="DocuMindTextBox121" type="#_x0000_t202" stroked="f" filled="f" o:allowincell="f" style="position:absolute;margin-left:74.800pt;margin-top:650.420pt;width:375.176pt;height:26.000pt;z-index:251659264;mso-position-horizontal-relative:page;mso-position-vertical-relative:page;mso-wrap-style:none;mso-fit-shape-to-text:t;">
             <w10:wrap type="none"/>
             <v:textbox inset="0,0,0,0">
               <w:txbxContent>
@@ -2969,7 +3438,7 @@
       </w:r>
       <w:r>
         <w:pict>
-          <v:shape id="DocuMindTextBox109" type="#_x0000_t202" stroked="f" filled="f" o:allowincell="f" style="position:absolute;margin-left:56.800pt;margin-top:543.556pt;width:484.036pt;height:19.125pt;z-index:251659264;mso-position-horizontal-relative:page;mso-position-vertical-relative:page;mso-wrap-style:none;mso-fit-shape-to-text:t;">
+          <v:shape id="DocuMindTextBox122" type="#_x0000_t202" stroked="f" filled="f" o:allowincell="f" style="position:absolute;margin-left:56.800pt;margin-top:674.256pt;width:484.036pt;height:19.125pt;z-index:251659264;mso-position-horizontal-relative:page;mso-position-vertical-relative:page;mso-wrap-style:none;mso-fit-shape-to-text:t;">
             <w10:wrap type="none"/>
             <v:textbox inset="0,0,0,0">
               <w:txbxContent>
@@ -2996,7 +3465,7 @@
       </w:r>
       <w:r>
         <w:pict>
-          <v:shape id="DocuMindTextBox110" type="#_x0000_t202" stroked="f" filled="f" o:allowincell="f" style="position:absolute;margin-left:56.800pt;margin-top:558.256pt;width:484.047pt;height:19.125pt;z-index:251659264;mso-position-horizontal-relative:page;mso-position-vertical-relative:page;mso-wrap-style:none;mso-fit-shape-to-text:t;">
+          <v:shape id="DocuMindTextBox123" type="#_x0000_t202" stroked="f" filled="f" o:allowincell="f" style="position:absolute;margin-left:56.800pt;margin-top:688.956pt;width:484.047pt;height:19.125pt;z-index:251659264;mso-position-horizontal-relative:page;mso-position-vertical-relative:page;mso-wrap-style:none;mso-fit-shape-to-text:t;">
             <w10:wrap type="none"/>
             <v:textbox inset="0,0,0,0">
               <w:txbxContent>
@@ -3023,7 +3492,7 @@
       </w:r>
       <w:r>
         <w:pict>
-          <v:shape id="DocuMindTextBox111" type="#_x0000_t202" stroked="f" filled="f" o:allowincell="f" style="position:absolute;margin-left:56.800pt;margin-top:572.956pt;width:484.520pt;height:19.125pt;z-index:251659264;mso-position-horizontal-relative:page;mso-position-vertical-relative:page;mso-wrap-style:none;mso-fit-shape-to-text:t;">
+          <v:shape id="DocuMindTextBox124" type="#_x0000_t202" stroked="f" filled="f" o:allowincell="f" style="position:absolute;margin-left:56.800pt;margin-top:703.656pt;width:484.520pt;height:19.125pt;z-index:251659264;mso-position-horizontal-relative:page;mso-position-vertical-relative:page;mso-wrap-style:none;mso-fit-shape-to-text:t;">
             <w10:wrap type="none"/>
             <v:textbox inset="0,0,0,0">
               <w:txbxContent>
@@ -3050,7 +3519,7 @@
       </w:r>
       <w:r>
         <w:pict>
-          <v:shape id="DocuMindTextBox112" type="#_x0000_t202" stroked="f" filled="f" o:allowincell="f" style="position:absolute;margin-left:56.800pt;margin-top:587.656pt;width:186.509pt;height:19.125pt;z-index:251659264;mso-position-horizontal-relative:page;mso-position-vertical-relative:page;mso-wrap-style:none;mso-fit-shape-to-text:t;">
+          <v:shape id="DocuMindTextBox125" type="#_x0000_t202" stroked="f" filled="f" o:allowincell="f" style="position:absolute;margin-left:56.800pt;margin-top:718.356pt;width:186.509pt;height:19.125pt;z-index:251659264;mso-position-horizontal-relative:page;mso-position-vertical-relative:page;mso-wrap-style:none;mso-fit-shape-to-text:t;">
             <w10:wrap type="none"/>
             <v:textbox inset="0,0,0,0">
               <w:txbxContent>
@@ -3077,7 +3546,7 @@
       </w:r>
       <w:r>
         <w:pict>
-          <v:shape id="DocuMindTextBox113" type="#_x0000_t202" stroked="f" filled="f" o:allowincell="f" style="position:absolute;margin-left:56.800pt;margin-top:613.556pt;width:483.732pt;height:19.125pt;z-index:251659264;mso-position-horizontal-relative:page;mso-position-vertical-relative:page;mso-wrap-style:none;mso-fit-shape-to-text:t;">
+          <v:shape id="DocuMindTextBox126" type="#_x0000_t202" stroked="f" filled="f" o:allowincell="f" style="position:absolute;margin-left:56.800pt;margin-top:744.356pt;width:483.732pt;height:19.125pt;z-index:251659264;mso-position-horizontal-relative:page;mso-position-vertical-relative:page;mso-wrap-style:none;mso-fit-shape-to-text:t;">
             <w10:wrap type="none"/>
             <v:textbox inset="0,0,0,0">
               <w:txbxContent>
@@ -3104,764 +3573,7 @@
       </w:r>
       <w:r>
         <w:pict>
-          <v:shape id="DocuMindTextBox114" type="#_x0000_t202" stroked="f" filled="f" o:allowincell="f" style="position:absolute;margin-left:56.800pt;margin-top:628.256pt;width:484.299pt;height:19.125pt;z-index:251659264;mso-position-horizontal-relative:page;mso-position-vertical-relative:page;mso-wrap-style:none;mso-fit-shape-to-text:t;">
-            <w10:wrap type="none"/>
-            <v:textbox inset="0,0,0,0">
-              <w:txbxContent>
-                <w:p>
-                  <w:pPr>
-                    <w:spacing w:before="0" w:after="0" w:lineRule="exact" w:line="262"/>
-                    <w:ind w:left="0" w:right="0" w:firstLine="0"/>
-                  </w:pPr>
-                  <w:r>
-                    <w:rPr>
-                      <w:rFonts w:ascii="Deja Vu Sans" w:hAnsi="Deja Vu Sans" w:eastAsia="Deja Vu Sans" w:cs="Deja Vu Sans"/>
-                      <w:b w:val="0"/>
-                      <w:i w:val="0"/>
-                      <w:color w:val="000000"/>
-                      <w:sz w:val="21"/>
-                    </w:rPr>
-                    <w:t>Maecenas ante orci, egestas ut aliquet sit amet, sagittis a magna. Aliquam ante quam,</w:t>
-                  </w:r>
-                </w:p>
-              </w:txbxContent>
-            </v:textbox>
-          </v:shape>
-        </w:pict>
-      </w:r>
-      <w:r>
-        <w:pict>
-          <v:shape id="DocuMindTextBox115" type="#_x0000_t202" stroked="f" filled="f" o:allowincell="f" style="position:absolute;margin-left:56.800pt;margin-top:642.956pt;width:484.047pt;height:19.125pt;z-index:251659264;mso-position-horizontal-relative:page;mso-position-vertical-relative:page;mso-wrap-style:none;mso-fit-shape-to-text:t;">
-            <w10:wrap type="none"/>
-            <v:textbox inset="0,0,0,0">
-              <w:txbxContent>
-                <w:p>
-                  <w:pPr>
-                    <w:spacing w:before="0" w:after="0" w:lineRule="exact" w:line="262"/>
-                    <w:ind w:left="0" w:right="0" w:firstLine="0"/>
-                  </w:pPr>
-                  <w:r>
-                    <w:rPr>
-                      <w:rFonts w:ascii="Deja Vu Sans" w:hAnsi="Deja Vu Sans" w:eastAsia="Deja Vu Sans" w:cs="Deja Vu Sans"/>
-                      <w:b w:val="0"/>
-                      <w:i w:val="0"/>
-                      <w:color w:val="000000"/>
-                      <w:sz w:val="21"/>
-                    </w:rPr>
-                    <w:t>pellentesque ut dignissim quis, laoreet eget est. Aliquam erat volutpat. Class aptent taciti</w:t>
-                  </w:r>
-                </w:p>
-              </w:txbxContent>
-            </v:textbox>
-          </v:shape>
-        </w:pict>
-      </w:r>
-      <w:r>
-        <w:pict>
-          <v:shape id="DocuMindTextBox116" type="#_x0000_t202" stroked="f" filled="f" o:allowincell="f" style="position:absolute;margin-left:56.800pt;margin-top:657.656pt;width:484.498pt;height:19.125pt;z-index:251659264;mso-position-horizontal-relative:page;mso-position-vertical-relative:page;mso-wrap-style:none;mso-fit-shape-to-text:t;">
-            <w10:wrap type="none"/>
-            <v:textbox inset="0,0,0,0">
-              <w:txbxContent>
-                <w:p>
-                  <w:pPr>
-                    <w:spacing w:before="0" w:after="0" w:lineRule="exact" w:line="262"/>
-                    <w:ind w:left="0" w:right="0" w:firstLine="0"/>
-                  </w:pPr>
-                  <w:r>
-                    <w:rPr>
-                      <w:rFonts w:ascii="Deja Vu Sans" w:hAnsi="Deja Vu Sans" w:eastAsia="Deja Vu Sans" w:cs="Deja Vu Sans"/>
-                      <w:b w:val="0"/>
-                      <w:i w:val="0"/>
-                      <w:color w:val="000000"/>
-                      <w:sz w:val="21"/>
-                    </w:rPr>
-                    <w:t>sociosqu ad litora torquent per conubia nostra, per inceptos himenaeos. Ut ullamcorper</w:t>
-                  </w:r>
-                </w:p>
-              </w:txbxContent>
-            </v:textbox>
-          </v:shape>
-        </w:pict>
-      </w:r>
-      <w:r>
-        <w:pict>
-          <v:shape id="DocuMindTextBox117" type="#_x0000_t202" stroked="f" filled="f" o:allowincell="f" style="position:absolute;margin-left:56.800pt;margin-top:672.356pt;width:484.299pt;height:19.125pt;z-index:251659264;mso-position-horizontal-relative:page;mso-position-vertical-relative:page;mso-wrap-style:none;mso-fit-shape-to-text:t;">
-            <w10:wrap type="none"/>
-            <v:textbox inset="0,0,0,0">
-              <w:txbxContent>
-                <w:p>
-                  <w:pPr>
-                    <w:spacing w:before="0" w:after="0" w:lineRule="exact" w:line="262"/>
-                    <w:ind w:left="0" w:right="0" w:firstLine="0"/>
-                  </w:pPr>
-                  <w:r>
-                    <w:rPr>
-                      <w:rFonts w:ascii="Deja Vu Sans" w:hAnsi="Deja Vu Sans" w:eastAsia="Deja Vu Sans" w:cs="Deja Vu Sans"/>
-                      <w:b w:val="0"/>
-                      <w:i w:val="0"/>
-                      <w:color w:val="000000"/>
-                      <w:sz w:val="21"/>
-                    </w:rPr>
-                    <w:t>justo sapien, in cursus libero viverra eget. Vivamus auctor imperdiet urna, at pulvinar leo</w:t>
-                  </w:r>
-                </w:p>
-              </w:txbxContent>
-            </v:textbox>
-          </v:shape>
-        </w:pict>
-      </w:r>
-      <w:r>
-        <w:pict>
-          <v:shape id="DocuMindTextBox118" type="#_x0000_t202" stroked="f" filled="f" o:allowincell="f" style="position:absolute;margin-left:56.800pt;margin-top:687.056pt;width:483.858pt;height:19.125pt;z-index:251659264;mso-position-horizontal-relative:page;mso-position-vertical-relative:page;mso-wrap-style:none;mso-fit-shape-to-text:t;">
-            <w10:wrap type="none"/>
-            <v:textbox inset="0,0,0,0">
-              <w:txbxContent>
-                <w:p>
-                  <w:pPr>
-                    <w:spacing w:before="0" w:after="0" w:lineRule="exact" w:line="262"/>
-                    <w:ind w:left="0" w:right="0" w:firstLine="0"/>
-                  </w:pPr>
-                  <w:r>
-                    <w:rPr>
-                      <w:rFonts w:ascii="Deja Vu Sans" w:hAnsi="Deja Vu Sans" w:eastAsia="Deja Vu Sans" w:cs="Deja Vu Sans"/>
-                      <w:b w:val="0"/>
-                      <w:i w:val="0"/>
-                      <w:color w:val="000000"/>
-                      <w:sz w:val="21"/>
-                    </w:rPr>
-                    <w:t>posuere laoreet. Suspendisse neque nisl, fringilla at iaculis scelerisque, ornare vel dolor. Ut</w:t>
-                  </w:r>
-                </w:p>
-              </w:txbxContent>
-            </v:textbox>
-          </v:shape>
-        </w:pict>
-      </w:r>
-      <w:r>
-        <w:pict>
-          <v:shape id="DocuMindTextBox119" type="#_x0000_t202" stroked="f" filled="f" o:allowincell="f" style="position:absolute;margin-left:56.800pt;margin-top:701.756pt;width:484.457pt;height:19.125pt;z-index:251659264;mso-position-horizontal-relative:page;mso-position-vertical-relative:page;mso-wrap-style:none;mso-fit-shape-to-text:t;">
-            <w10:wrap type="none"/>
-            <v:textbox inset="0,0,0,0">
-              <w:txbxContent>
-                <w:p>
-                  <w:pPr>
-                    <w:spacing w:before="0" w:after="0" w:lineRule="exact" w:line="262"/>
-                    <w:ind w:left="0" w:right="0" w:firstLine="0"/>
-                  </w:pPr>
-                  <w:r>
-                    <w:rPr>
-                      <w:rFonts w:ascii="Deja Vu Sans" w:hAnsi="Deja Vu Sans" w:eastAsia="Deja Vu Sans" w:cs="Deja Vu Sans"/>
-                      <w:b w:val="0"/>
-                      <w:i w:val="0"/>
-                      <w:color w:val="000000"/>
-                      <w:sz w:val="21"/>
-                    </w:rPr>
-                    <w:t>et pulvinar nunc. Pellentesque fringilla mollis efficitur. Nullam venenatis commodo</w:t>
-                  </w:r>
-                </w:p>
-              </w:txbxContent>
-            </v:textbox>
-          </v:shape>
-        </w:pict>
-      </w:r>
-      <w:r>
-        <w:pict>
-          <v:shape id="DocuMindTextBox120" type="#_x0000_t202" stroked="f" filled="f" o:allowincell="f" style="position:absolute;margin-left:56.800pt;margin-top:716.456pt;width:484.278pt;height:19.125pt;z-index:251659264;mso-position-horizontal-relative:page;mso-position-vertical-relative:page;mso-wrap-style:none;mso-fit-shape-to-text:t;">
-            <w10:wrap type="none"/>
-            <v:textbox inset="0,0,0,0">
-              <w:txbxContent>
-                <w:p>
-                  <w:pPr>
-                    <w:spacing w:before="0" w:after="0" w:lineRule="exact" w:line="262"/>
-                    <w:ind w:left="0" w:right="0" w:firstLine="0"/>
-                  </w:pPr>
-                  <w:r>
-                    <w:rPr>
-                      <w:rFonts w:ascii="Deja Vu Sans" w:hAnsi="Deja Vu Sans" w:eastAsia="Deja Vu Sans" w:cs="Deja Vu Sans"/>
-                      <w:b w:val="0"/>
-                      <w:i w:val="0"/>
-                      <w:color w:val="000000"/>
-                      <w:sz w:val="21"/>
-                    </w:rPr>
-                    <w:t>imperdiet. Morbi velit neque, semper quis lorem quis, efficitur dignissim ipsum. Ut ac lorem</w:t>
-                  </w:r>
-                </w:p>
-              </w:txbxContent>
-            </v:textbox>
-          </v:shape>
-        </w:pict>
-      </w:r>
-      <w:r>
-        <w:pict>
-          <v:shape id="DocuMindTextBox121" type="#_x0000_t202" stroked="f" filled="f" o:allowincell="f" style="position:absolute;margin-left:56.800pt;margin-top:731.156pt;width:254.853pt;height:19.125pt;z-index:251659264;mso-position-horizontal-relative:page;mso-position-vertical-relative:page;mso-wrap-style:none;mso-fit-shape-to-text:t;">
-            <w10:wrap type="none"/>
-            <v:textbox inset="0,0,0,0">
-              <w:txbxContent>
-                <w:p>
-                  <w:pPr>
-                    <w:spacing w:before="0" w:after="0" w:lineRule="exact" w:line="262"/>
-                    <w:ind w:left="0" w:right="0" w:firstLine="0"/>
-                  </w:pPr>
-                  <w:r>
-                    <w:rPr>
-                      <w:rFonts w:ascii="Deja Vu Sans" w:hAnsi="Deja Vu Sans" w:eastAsia="Deja Vu Sans" w:cs="Deja Vu Sans"/>
-                      <w:b w:val="0"/>
-                      <w:i w:val="0"/>
-                      <w:color w:val="000000"/>
-                      <w:sz w:val="21"/>
-                    </w:rPr>
-                    <w:t>sed turpis imperdiet eleifend sit amet id sapien.</w:t>
-                  </w:r>
-                </w:p>
-              </w:txbxContent>
-            </v:textbox>
-          </v:shape>
-        </w:pict>
-      </w:r>
-    </w:p>
-    <w:p>
-      <w:pPr>
-        <w:sectPr>
-          <w:pgSz w:w="11900" w:h="16840"/>
-          <w:pgMar w:top="0" w:right="0" w:bottom="0" w:left="0" w:header="0" w:footer="0" w:gutter="0"/>
-          <w:cols w:space="720"/>
-          <w:docGrid w:linePitch="360"/>
-        </w:sectPr>
-      </w:pPr>
-    </w:p>
-    <w:p>
-      <w:pPr>
-        <w:spacing w:before="0" w:after="0" w:lineRule="exact" w:line="20"/>
-      </w:pPr>
-      <w:r>
-        <w:rPr>
-          <w:sz w:val="2"/>
-        </w:rPr>
-      </w:r>
-      <w:r>
-        <w:pict>
-          <v:shape id="DocuMindImage122" type="#_x0000_t75" stroked="f" o:allowincell="f" style="position:absolute;margin-left:56.800pt;margin-top:56.700pt;width:481.700pt;height:321.300pt;z-index:1;mso-position-horizontal-relative:page;mso-position-vertical-relative:page;mso-wrap-style:none;">
-            <w10:wrap type="none"/>
-            <v:imagedata r:id="rId9" o:title=""/>
-          </v:shape>
-        </w:pict>
-      </w:r>
-      <w:r>
-        <w:pict>
-          <v:shape id="DocuMindTextBox123" type="#_x0000_t202" stroked="f" filled="f" o:allowincell="f" style="position:absolute;margin-left:74.800pt;margin-top:413.420pt;width:439.128pt;height:26.000pt;z-index:251659264;mso-position-horizontal-relative:page;mso-position-vertical-relative:page;mso-wrap-style:none;mso-fit-shape-to-text:t;">
-            <w10:wrap type="none"/>
-            <v:textbox inset="0,0,0,0">
-              <w:txbxContent>
-                <w:p>
-                  <w:pPr>
-                    <w:spacing w:before="0" w:after="0" w:lineRule="exact" w:line="400"/>
-                    <w:ind w:left="0" w:right="0" w:firstLine="0"/>
-                  </w:pPr>
-                  <w:r>
-                    <w:rPr>
-                      <w:rFonts w:ascii="Liberation Sans" w:hAnsi="Liberation Sans" w:eastAsia="Liberation Sans" w:cs="Liberation Sans"/>
-                      <w:b/>
-                      <w:i w:val="0"/>
-                      <w:color w:val="000000"/>
-                      <w:sz w:val="32"/>
-                    </w:rPr>
-                    <w:t xml:space="preserve">Maecenas mauris lectus, lobortis et purus mattis, blandit </w:t>
-                  </w:r>
-                </w:p>
-              </w:txbxContent>
-            </v:textbox>
-          </v:shape>
-        </w:pict>
-      </w:r>
-      <w:r>
-        <w:pict>
-          <v:shape id="DocuMindTextBox124" type="#_x0000_t202" stroked="f" filled="f" o:allowincell="f" style="position:absolute;margin-left:103.600pt;margin-top:431.820pt;width:110.440pt;height:26.000pt;z-index:251659264;mso-position-horizontal-relative:page;mso-position-vertical-relative:page;mso-wrap-style:none;mso-fit-shape-to-text:t;">
-            <w10:wrap type="none"/>
-            <v:textbox inset="0,0,0,0">
-              <w:txbxContent>
-                <w:p>
-                  <w:pPr>
-                    <w:spacing w:before="0" w:after="0" w:lineRule="exact" w:line="400"/>
-                    <w:ind w:left="0" w:right="0" w:firstLine="0"/>
-                  </w:pPr>
-                  <w:r>
-                    <w:rPr>
-                      <w:rFonts w:ascii="Liberation Sans" w:hAnsi="Liberation Sans" w:eastAsia="Liberation Sans" w:cs="Liberation Sans"/>
-                      <w:b/>
-                      <w:i w:val="0"/>
-                      <w:color w:val="000000"/>
-                      <w:sz w:val="32"/>
-                    </w:rPr>
-                    <w:t xml:space="preserve">dictum tellus. </w:t>
-                  </w:r>
-                </w:p>
-              </w:txbxContent>
-            </v:textbox>
-          </v:shape>
-        </w:pict>
-      </w:r>
-      <w:r>
-        <w:pict>
-          <v:shape id="DocuMindTextBox125" type="#_x0000_t202" stroked="f" filled="f" o:allowincell="f" style="position:absolute;margin-left:56.800pt;margin-top:455.656pt;width:483.890pt;height:19.125pt;z-index:251659264;mso-position-horizontal-relative:page;mso-position-vertical-relative:page;mso-wrap-style:none;mso-fit-shape-to-text:t;">
-            <w10:wrap type="none"/>
-            <v:textbox inset="0,0,0,0">
-              <w:txbxContent>
-                <w:p>
-                  <w:pPr>
-                    <w:spacing w:before="0" w:after="0" w:lineRule="exact" w:line="262"/>
-                    <w:ind w:left="0" w:right="0" w:firstLine="0"/>
-                  </w:pPr>
-                  <w:r>
-                    <w:rPr>
-                      <w:rFonts w:ascii="Deja Vu Sans" w:hAnsi="Deja Vu Sans" w:eastAsia="Deja Vu Sans" w:cs="Deja Vu Sans"/>
-                      <w:b w:val="0"/>
-                      <w:i w:val="0"/>
-                      <w:color w:val="000000"/>
-                      <w:sz w:val="21"/>
-                    </w:rPr>
-                    <w:t>Maecenas non lorem quis tellus placerat varius. Nulla facilisi. Aenean congue fringilla justo</w:t>
-                  </w:r>
-                </w:p>
-              </w:txbxContent>
-            </v:textbox>
-          </v:shape>
-        </w:pict>
-      </w:r>
-      <w:r>
-        <w:pict>
-          <v:shape id="DocuMindTextBox126" type="#_x0000_t202" stroked="f" filled="f" o:allowincell="f" style="position:absolute;margin-left:56.800pt;margin-top:470.356pt;width:483.858pt;height:19.125pt;z-index:251659264;mso-position-horizontal-relative:page;mso-position-vertical-relative:page;mso-wrap-style:none;mso-fit-shape-to-text:t;">
-            <w10:wrap type="none"/>
-            <v:textbox inset="0,0,0,0">
-              <w:txbxContent>
-                <w:p>
-                  <w:pPr>
-                    <w:spacing w:before="0" w:after="0" w:lineRule="exact" w:line="262"/>
-                    <w:ind w:left="0" w:right="0" w:firstLine="0"/>
-                  </w:pPr>
-                  <w:r>
-                    <w:rPr>
-                      <w:rFonts w:ascii="Deja Vu Sans" w:hAnsi="Deja Vu Sans" w:eastAsia="Deja Vu Sans" w:cs="Deja Vu Sans"/>
-                      <w:b w:val="0"/>
-                      <w:i w:val="0"/>
-                      <w:color w:val="000000"/>
-                      <w:sz w:val="21"/>
-                    </w:rPr>
-                    <w:t>ut aliquam. Mauris id ex erat. Nunc vulputate neque vitae justo facilisis, non condimentum</w:t>
-                  </w:r>
-                </w:p>
-              </w:txbxContent>
-            </v:textbox>
-          </v:shape>
-        </w:pict>
-      </w:r>
-      <w:r>
-        <w:pict>
-          <v:shape id="DocuMindTextBox127" type="#_x0000_t202" stroked="f" filled="f" o:allowincell="f" style="position:absolute;margin-left:56.800pt;margin-top:485.056pt;width:484.404pt;height:19.125pt;z-index:251659264;mso-position-horizontal-relative:page;mso-position-vertical-relative:page;mso-wrap-style:none;mso-fit-shape-to-text:t;">
-            <w10:wrap type="none"/>
-            <v:textbox inset="0,0,0,0">
-              <w:txbxContent>
-                <w:p>
-                  <w:pPr>
-                    <w:spacing w:before="0" w:after="0" w:lineRule="exact" w:line="262"/>
-                    <w:ind w:left="0" w:right="0" w:firstLine="0"/>
-                  </w:pPr>
-                  <w:r>
-                    <w:rPr>
-                      <w:rFonts w:ascii="Deja Vu Sans" w:hAnsi="Deja Vu Sans" w:eastAsia="Deja Vu Sans" w:cs="Deja Vu Sans"/>
-                      <w:b w:val="0"/>
-                      <w:i w:val="0"/>
-                      <w:color w:val="000000"/>
-                      <w:sz w:val="21"/>
-                    </w:rPr>
-                    <w:t>ante sagittis. Morbi viverra semper lorem nec molestie. Maecenas tincidunt est efficitur</w:t>
-                  </w:r>
-                </w:p>
-              </w:txbxContent>
-            </v:textbox>
-          </v:shape>
-        </w:pict>
-      </w:r>
-      <w:r>
-        <w:pict>
-          <v:shape id="DocuMindTextBox128" type="#_x0000_t202" stroked="f" filled="f" o:allowincell="f" style="position:absolute;margin-left:56.800pt;margin-top:499.756pt;width:242.999pt;height:19.125pt;z-index:251659264;mso-position-horizontal-relative:page;mso-position-vertical-relative:page;mso-wrap-style:none;mso-fit-shape-to-text:t;">
-            <w10:wrap type="none"/>
-            <v:textbox inset="0,0,0,0">
-              <w:txbxContent>
-                <w:p>
-                  <w:pPr>
-                    <w:spacing w:before="0" w:after="0" w:lineRule="exact" w:line="262"/>
-                    <w:ind w:left="0" w:right="0" w:firstLine="0"/>
-                  </w:pPr>
-                  <w:r>
-                    <w:rPr>
-                      <w:rFonts w:ascii="Deja Vu Sans" w:hAnsi="Deja Vu Sans" w:eastAsia="Deja Vu Sans" w:cs="Deja Vu Sans"/>
-                      <w:b w:val="0"/>
-                      <w:i w:val="0"/>
-                      <w:color w:val="000000"/>
-                      <w:sz w:val="21"/>
-                    </w:rPr>
-                    <w:t>ligula euismod, sit amet ornare est vulputate.</w:t>
-                  </w:r>
-                </w:p>
-              </w:txbxContent>
-            </v:textbox>
-          </v:shape>
-        </w:pict>
-      </w:r>
-      <w:r>
-        <w:pict>
-          <v:shape id="DocuMindTextBox129" type="#_x0000_t202" stroked="f" filled="f" o:allowincell="f" style="position:absolute;margin-left:56.800pt;margin-top:525.756pt;width:483.669pt;height:19.125pt;z-index:251659264;mso-position-horizontal-relative:page;mso-position-vertical-relative:page;mso-wrap-style:none;mso-fit-shape-to-text:t;">
-            <w10:wrap type="none"/>
-            <v:textbox inset="0,0,0,0">
-              <w:txbxContent>
-                <w:p>
-                  <w:pPr>
-                    <w:spacing w:before="0" w:after="0" w:lineRule="exact" w:line="262"/>
-                    <w:ind w:left="0" w:right="0" w:firstLine="0"/>
-                  </w:pPr>
-                  <w:r>
-                    <w:rPr>
-                      <w:rFonts w:ascii="Deja Vu Sans" w:hAnsi="Deja Vu Sans" w:eastAsia="Deja Vu Sans" w:cs="Deja Vu Sans"/>
-                      <w:b w:val="0"/>
-                      <w:i w:val="0"/>
-                      <w:color w:val="000000"/>
-                      <w:sz w:val="21"/>
-                    </w:rPr>
-                    <w:t>In non mauris justo. Duis vehicula mi vel mi pretium, a viverra erat efficitur. Cras aliquam</w:t>
-                  </w:r>
-                </w:p>
-              </w:txbxContent>
-            </v:textbox>
-          </v:shape>
-        </w:pict>
-      </w:r>
-      <w:r>
-        <w:pict>
-          <v:shape id="DocuMindTextBox130" type="#_x0000_t202" stroked="f" filled="f" o:allowincell="f" style="position:absolute;margin-left:56.800pt;margin-top:540.456pt;width:484.110pt;height:19.125pt;z-index:251659264;mso-position-horizontal-relative:page;mso-position-vertical-relative:page;mso-wrap-style:none;mso-fit-shape-to-text:t;">
-            <w10:wrap type="none"/>
-            <v:textbox inset="0,0,0,0">
-              <w:txbxContent>
-                <w:p>
-                  <w:pPr>
-                    <w:spacing w:before="0" w:after="0" w:lineRule="exact" w:line="262"/>
-                    <w:ind w:left="0" w:right="0" w:firstLine="0"/>
-                  </w:pPr>
-                  <w:r>
-                    <w:rPr>
-                      <w:rFonts w:ascii="Deja Vu Sans" w:hAnsi="Deja Vu Sans" w:eastAsia="Deja Vu Sans" w:cs="Deja Vu Sans"/>
-                      <w:b w:val="0"/>
-                      <w:i w:val="0"/>
-                      <w:color w:val="000000"/>
-                      <w:sz w:val="21"/>
-                    </w:rPr>
-                    <w:t>est ac eros varius, id iaculis dui auctor. Duis pretium neque ligula, et pulvinar mi placerat</w:t>
-                  </w:r>
-                </w:p>
-              </w:txbxContent>
-            </v:textbox>
-          </v:shape>
-        </w:pict>
-      </w:r>
-      <w:r>
-        <w:pict>
-          <v:shape id="DocuMindTextBox131" type="#_x0000_t202" stroked="f" filled="f" o:allowincell="f" style="position:absolute;margin-left:56.800pt;margin-top:555.156pt;width:484.036pt;height:19.125pt;z-index:251659264;mso-position-horizontal-relative:page;mso-position-vertical-relative:page;mso-wrap-style:none;mso-fit-shape-to-text:t;">
-            <w10:wrap type="none"/>
-            <v:textbox inset="0,0,0,0">
-              <w:txbxContent>
-                <w:p>
-                  <w:pPr>
-                    <w:spacing w:before="0" w:after="0" w:lineRule="exact" w:line="262"/>
-                    <w:ind w:left="0" w:right="0" w:firstLine="0"/>
-                  </w:pPr>
-                  <w:r>
-                    <w:rPr>
-                      <w:rFonts w:ascii="Deja Vu Sans" w:hAnsi="Deja Vu Sans" w:eastAsia="Deja Vu Sans" w:cs="Deja Vu Sans"/>
-                      <w:b w:val="0"/>
-                      <w:i w:val="0"/>
-                      <w:color w:val="000000"/>
-                      <w:sz w:val="21"/>
-                    </w:rPr>
-                    <w:t>et. Nulla nec nunc sit amet nunc posuere vestibulum. Ut id neque eget tortor mattis</w:t>
-                  </w:r>
-                </w:p>
-              </w:txbxContent>
-            </v:textbox>
-          </v:shape>
-        </w:pict>
-      </w:r>
-      <w:r>
-        <w:pict>
-          <v:shape id="DocuMindTextBox132" type="#_x0000_t202" stroked="f" filled="f" o:allowincell="f" style="position:absolute;margin-left:56.800pt;margin-top:569.856pt;width:483.837pt;height:19.125pt;z-index:251659264;mso-position-horizontal-relative:page;mso-position-vertical-relative:page;mso-wrap-style:none;mso-fit-shape-to-text:t;">
-            <w10:wrap type="none"/>
-            <v:textbox inset="0,0,0,0">
-              <w:txbxContent>
-                <w:p>
-                  <w:pPr>
-                    <w:spacing w:before="0" w:after="0" w:lineRule="exact" w:line="262"/>
-                    <w:ind w:left="0" w:right="0" w:firstLine="0"/>
-                  </w:pPr>
-                  <w:r>
-                    <w:rPr>
-                      <w:rFonts w:ascii="Deja Vu Sans" w:hAnsi="Deja Vu Sans" w:eastAsia="Deja Vu Sans" w:cs="Deja Vu Sans"/>
-                      <w:b w:val="0"/>
-                      <w:i w:val="0"/>
-                      <w:color w:val="000000"/>
-                      <w:sz w:val="21"/>
-                    </w:rPr>
-                    <w:t>tristique. Donec ante est, blandit sit amet tristique vel, lacinia pulvinar arcu. Pellentesque</w:t>
-                  </w:r>
-                </w:p>
-              </w:txbxContent>
-            </v:textbox>
-          </v:shape>
-        </w:pict>
-      </w:r>
-      <w:r>
-        <w:pict>
-          <v:shape id="DocuMindTextBox133" type="#_x0000_t202" stroked="f" filled="f" o:allowincell="f" style="position:absolute;margin-left:56.800pt;margin-top:584.556pt;width:483.847pt;height:19.125pt;z-index:251659264;mso-position-horizontal-relative:page;mso-position-vertical-relative:page;mso-wrap-style:none;mso-fit-shape-to-text:t;">
-            <w10:wrap type="none"/>
-            <v:textbox inset="0,0,0,0">
-              <w:txbxContent>
-                <w:p>
-                  <w:pPr>
-                    <w:spacing w:before="0" w:after="0" w:lineRule="exact" w:line="262"/>
-                    <w:ind w:left="0" w:right="0" w:firstLine="0"/>
-                  </w:pPr>
-                  <w:r>
-                    <w:rPr>
-                      <w:rFonts w:ascii="Deja Vu Sans" w:hAnsi="Deja Vu Sans" w:eastAsia="Deja Vu Sans" w:cs="Deja Vu Sans"/>
-                      <w:b w:val="0"/>
-                      <w:i w:val="0"/>
-                      <w:color w:val="000000"/>
-                      <w:sz w:val="21"/>
-                    </w:rPr>
-                    <w:t>scelerisque fermentum erat, id posuere justo pulvinar ut. Cras id eros sed enim aliquam</w:t>
-                  </w:r>
-                </w:p>
-              </w:txbxContent>
-            </v:textbox>
-          </v:shape>
-        </w:pict>
-      </w:r>
-      <w:r>
-        <w:pict>
-          <v:shape id="DocuMindTextBox134" type="#_x0000_t202" stroked="f" filled="f" o:allowincell="f" style="position:absolute;margin-left:56.800pt;margin-top:599.256pt;width:484.173pt;height:19.125pt;z-index:251659264;mso-position-horizontal-relative:page;mso-position-vertical-relative:page;mso-wrap-style:none;mso-fit-shape-to-text:t;">
-            <w10:wrap type="none"/>
-            <v:textbox inset="0,0,0,0">
-              <w:txbxContent>
-                <w:p>
-                  <w:pPr>
-                    <w:spacing w:before="0" w:after="0" w:lineRule="exact" w:line="262"/>
-                    <w:ind w:left="0" w:right="0" w:firstLine="0"/>
-                  </w:pPr>
-                  <w:r>
-                    <w:rPr>
-                      <w:rFonts w:ascii="Deja Vu Sans" w:hAnsi="Deja Vu Sans" w:eastAsia="Deja Vu Sans" w:cs="Deja Vu Sans"/>
-                      <w:b w:val="0"/>
-                      <w:i w:val="0"/>
-                      <w:color w:val="000000"/>
-                      <w:sz w:val="21"/>
-                    </w:rPr>
-                    <w:t>lobortis. Sed lobortis nisl ut eros efficitur tincidunt. Cras justo mi, porttitor quis mattis vel,</w:t>
-                  </w:r>
-                </w:p>
-              </w:txbxContent>
-            </v:textbox>
-          </v:shape>
-        </w:pict>
-      </w:r>
-      <w:r>
-        <w:pict>
-          <v:shape id="DocuMindTextBox135" type="#_x0000_t202" stroked="f" filled="f" o:allowincell="f" style="position:absolute;margin-left:56.800pt;margin-top:613.956pt;width:253.803pt;height:19.125pt;z-index:251659264;mso-position-horizontal-relative:page;mso-position-vertical-relative:page;mso-wrap-style:none;mso-fit-shape-to-text:t;">
-            <w10:wrap type="none"/>
-            <v:textbox inset="0,0,0,0">
-              <w:txbxContent>
-                <w:p>
-                  <w:pPr>
-                    <w:spacing w:before="0" w:after="0" w:lineRule="exact" w:line="262"/>
-                    <w:ind w:left="0" w:right="0" w:firstLine="0"/>
-                  </w:pPr>
-                  <w:r>
-                    <w:rPr>
-                      <w:rFonts w:ascii="Deja Vu Sans" w:hAnsi="Deja Vu Sans" w:eastAsia="Deja Vu Sans" w:cs="Deja Vu Sans"/>
-                      <w:b w:val="0"/>
-                      <w:i w:val="0"/>
-                      <w:color w:val="000000"/>
-                      <w:sz w:val="21"/>
-                    </w:rPr>
-                    <w:t>ultricies ut purus. Ut facilisis et lacus eu cursus.</w:t>
-                  </w:r>
-                </w:p>
-              </w:txbxContent>
-            </v:textbox>
-          </v:shape>
-        </w:pict>
-      </w:r>
-      <w:r>
-        <w:pict>
-          <v:shape id="DocuMindTextBox136" type="#_x0000_t202" stroked="f" filled="f" o:allowincell="f" style="position:absolute;margin-left:74.800pt;margin-top:650.420pt;width:375.176pt;height:26.000pt;z-index:251659264;mso-position-horizontal-relative:page;mso-position-vertical-relative:page;mso-wrap-style:none;mso-fit-shape-to-text:t;">
-            <w10:wrap type="none"/>
-            <v:textbox inset="0,0,0,0">
-              <w:txbxContent>
-                <w:p>
-                  <w:pPr>
-                    <w:spacing w:before="0" w:after="0" w:lineRule="exact" w:line="400"/>
-                    <w:ind w:left="0" w:right="0" w:firstLine="0"/>
-                  </w:pPr>
-                  <w:r>
-                    <w:rPr>
-                      <w:rFonts w:ascii="Liberation Sans" w:hAnsi="Liberation Sans" w:eastAsia="Liberation Sans" w:cs="Liberation Sans"/>
-                      <w:b/>
-                      <w:i w:val="0"/>
-                      <w:color w:val="000000"/>
-                      <w:sz w:val="32"/>
-                    </w:rPr>
-                    <w:t xml:space="preserve">In eleifend velit vitae libero sollicitudin euismod. </w:t>
-                  </w:r>
-                </w:p>
-              </w:txbxContent>
-            </v:textbox>
-          </v:shape>
-        </w:pict>
-      </w:r>
-      <w:r>
-        <w:pict>
-          <v:shape id="DocuMindTextBox137" type="#_x0000_t202" stroked="f" filled="f" o:allowincell="f" style="position:absolute;margin-left:56.800pt;margin-top:674.256pt;width:484.036pt;height:19.125pt;z-index:251659264;mso-position-horizontal-relative:page;mso-position-vertical-relative:page;mso-wrap-style:none;mso-fit-shape-to-text:t;">
-            <w10:wrap type="none"/>
-            <v:textbox inset="0,0,0,0">
-              <w:txbxContent>
-                <w:p>
-                  <w:pPr>
-                    <w:spacing w:before="0" w:after="0" w:lineRule="exact" w:line="262"/>
-                    <w:ind w:left="0" w:right="0" w:firstLine="0"/>
-                  </w:pPr>
-                  <w:r>
-                    <w:rPr>
-                      <w:rFonts w:ascii="Deja Vu Sans" w:hAnsi="Deja Vu Sans" w:eastAsia="Deja Vu Sans" w:cs="Deja Vu Sans"/>
-                      <w:b w:val="0"/>
-                      <w:i w:val="0"/>
-                      <w:color w:val="000000"/>
-                      <w:sz w:val="21"/>
-                    </w:rPr>
-                    <w:t>Fusce vitae vestibulum velit. Pellentesque vulputate lectus quis pellentesque commodo.</w:t>
-                  </w:r>
-                </w:p>
-              </w:txbxContent>
-            </v:textbox>
-          </v:shape>
-        </w:pict>
-      </w:r>
-      <w:r>
-        <w:pict>
-          <v:shape id="DocuMindTextBox138" type="#_x0000_t202" stroked="f" filled="f" o:allowincell="f" style="position:absolute;margin-left:56.800pt;margin-top:688.956pt;width:484.047pt;height:19.125pt;z-index:251659264;mso-position-horizontal-relative:page;mso-position-vertical-relative:page;mso-wrap-style:none;mso-fit-shape-to-text:t;">
-            <w10:wrap type="none"/>
-            <v:textbox inset="0,0,0,0">
-              <w:txbxContent>
-                <w:p>
-                  <w:pPr>
-                    <w:spacing w:before="0" w:after="0" w:lineRule="exact" w:line="262"/>
-                    <w:ind w:left="0" w:right="0" w:firstLine="0"/>
-                  </w:pPr>
-                  <w:r>
-                    <w:rPr>
-                      <w:rFonts w:ascii="Deja Vu Sans" w:hAnsi="Deja Vu Sans" w:eastAsia="Deja Vu Sans" w:cs="Deja Vu Sans"/>
-                      <w:b w:val="0"/>
-                      <w:i w:val="0"/>
-                      <w:color w:val="000000"/>
-                      <w:sz w:val="21"/>
-                    </w:rPr>
-                    <w:t>Aliquam erat volutpat. Vestibulum in egestas velit. Pellentesque fermentum nisl vitae</w:t>
-                  </w:r>
-                </w:p>
-              </w:txbxContent>
-            </v:textbox>
-          </v:shape>
-        </w:pict>
-      </w:r>
-      <w:r>
-        <w:pict>
-          <v:shape id="DocuMindTextBox139" type="#_x0000_t202" stroked="f" filled="f" o:allowincell="f" style="position:absolute;margin-left:56.800pt;margin-top:703.656pt;width:484.520pt;height:19.125pt;z-index:251659264;mso-position-horizontal-relative:page;mso-position-vertical-relative:page;mso-wrap-style:none;mso-fit-shape-to-text:t;">
-            <w10:wrap type="none"/>
-            <v:textbox inset="0,0,0,0">
-              <w:txbxContent>
-                <w:p>
-                  <w:pPr>
-                    <w:spacing w:before="0" w:after="0" w:lineRule="exact" w:line="262"/>
-                    <w:ind w:left="0" w:right="0" w:firstLine="0"/>
-                  </w:pPr>
-                  <w:r>
-                    <w:rPr>
-                      <w:rFonts w:ascii="Deja Vu Sans" w:hAnsi="Deja Vu Sans" w:eastAsia="Deja Vu Sans" w:cs="Deja Vu Sans"/>
-                      <w:b w:val="0"/>
-                      <w:i w:val="0"/>
-                      <w:color w:val="000000"/>
-                      <w:sz w:val="21"/>
-                    </w:rPr>
-                    <w:t>fringilla venenatis. Etiam id mauris vitae orci maximus ultricies. Cras fringilla ipsum</w:t>
-                  </w:r>
-                </w:p>
-              </w:txbxContent>
-            </v:textbox>
-          </v:shape>
-        </w:pict>
-      </w:r>
-      <w:r>
-        <w:pict>
-          <v:shape id="DocuMindTextBox140" type="#_x0000_t202" stroked="f" filled="f" o:allowincell="f" style="position:absolute;margin-left:56.800pt;margin-top:718.356pt;width:186.509pt;height:19.125pt;z-index:251659264;mso-position-horizontal-relative:page;mso-position-vertical-relative:page;mso-wrap-style:none;mso-fit-shape-to-text:t;">
-            <w10:wrap type="none"/>
-            <v:textbox inset="0,0,0,0">
-              <w:txbxContent>
-                <w:p>
-                  <w:pPr>
-                    <w:spacing w:before="0" w:after="0" w:lineRule="exact" w:line="262"/>
-                    <w:ind w:left="0" w:right="0" w:firstLine="0"/>
-                  </w:pPr>
-                  <w:r>
-                    <w:rPr>
-                      <w:rFonts w:ascii="Deja Vu Sans" w:hAnsi="Deja Vu Sans" w:eastAsia="Deja Vu Sans" w:cs="Deja Vu Sans"/>
-                      <w:b w:val="0"/>
-                      <w:i w:val="0"/>
-                      <w:color w:val="000000"/>
-                      <w:sz w:val="21"/>
-                    </w:rPr>
-                    <w:t>magna, in fringilla dui commodo a.</w:t>
-                  </w:r>
-                </w:p>
-              </w:txbxContent>
-            </v:textbox>
-          </v:shape>
-        </w:pict>
-      </w:r>
-      <w:r>
-        <w:pict>
-          <v:shape id="DocuMindTextBox141" type="#_x0000_t202" stroked="f" filled="f" o:allowincell="f" style="position:absolute;margin-left:56.800pt;margin-top:744.356pt;width:483.732pt;height:19.125pt;z-index:251659264;mso-position-horizontal-relative:page;mso-position-vertical-relative:page;mso-wrap-style:none;mso-fit-shape-to-text:t;">
-            <w10:wrap type="none"/>
-            <v:textbox inset="0,0,0,0">
-              <w:txbxContent>
-                <w:p>
-                  <w:pPr>
-                    <w:spacing w:before="0" w:after="0" w:lineRule="exact" w:line="262"/>
-                    <w:ind w:left="0" w:right="0" w:firstLine="0"/>
-                  </w:pPr>
-                  <w:r>
-                    <w:rPr>
-                      <w:rFonts w:ascii="Deja Vu Sans" w:hAnsi="Deja Vu Sans" w:eastAsia="Deja Vu Sans" w:cs="Deja Vu Sans"/>
-                      <w:b w:val="0"/>
-                      <w:i w:val="0"/>
-                      <w:color w:val="000000"/>
-                      <w:sz w:val="21"/>
-                    </w:rPr>
-                    <w:t>Etiam vehicula luctus fermentum. In vel metus congue, pulvinar lectus vel, fermentum dui.</w:t>
-                  </w:r>
-                </w:p>
-              </w:txbxContent>
-            </v:textbox>
-          </v:shape>
-        </w:pict>
-      </w:r>
-      <w:r>
-        <w:pict>
-          <v:shape id="DocuMindTextBox142" type="#_x0000_t202" stroked="f" filled="f" o:allowincell="f" style="position:absolute;margin-left:56.800pt;margin-top:759.056pt;width:484.299pt;height:19.125pt;z-index:251659264;mso-position-horizontal-relative:page;mso-position-vertical-relative:page;mso-wrap-style:none;mso-fit-shape-to-text:t;">
+          <v:shape id="DocuMindTextBox127" type="#_x0000_t202" stroked="f" filled="f" o:allowincell="f" style="position:absolute;margin-left:56.800pt;margin-top:759.056pt;width:484.299pt;height:19.125pt;z-index:251659264;mso-position-horizontal-relative:page;mso-position-vertical-relative:page;mso-wrap-style:none;mso-fit-shape-to-text:t;">
             <w10:wrap type="none"/>
             <v:textbox inset="0,0,0,0">
               <w:txbxContent>
@@ -3908,7 +3620,7 @@
       </w:r>
       <w:r>
         <w:pict>
-          <v:shape id="DocuMindTextBox143" type="#_x0000_t202" stroked="f" filled="f" o:allowincell="f" style="position:absolute;margin-left:56.800pt;margin-top:55.256pt;width:484.047pt;height:19.125pt;z-index:251659264;mso-position-horizontal-relative:page;mso-position-vertical-relative:page;mso-wrap-style:none;mso-fit-shape-to-text:t;">
+          <v:shape id="DocuMindTextBox128" type="#_x0000_t202" stroked="f" filled="f" o:allowincell="f" style="position:absolute;margin-left:56.800pt;margin-top:55.256pt;width:484.047pt;height:19.125pt;z-index:251659264;mso-position-horizontal-relative:page;mso-position-vertical-relative:page;mso-wrap-style:none;mso-fit-shape-to-text:t;">
             <w10:wrap type="none"/>
             <v:textbox inset="0,0,0,0">
               <w:txbxContent>
@@ -3935,7 +3647,7 @@
       </w:r>
       <w:r>
         <w:pict>
-          <v:shape id="DocuMindTextBox144" type="#_x0000_t202" stroked="f" filled="f" o:allowincell="f" style="position:absolute;margin-left:56.800pt;margin-top:69.956pt;width:484.498pt;height:19.125pt;z-index:251659264;mso-position-horizontal-relative:page;mso-position-vertical-relative:page;mso-wrap-style:none;mso-fit-shape-to-text:t;">
+          <v:shape id="DocuMindTextBox129" type="#_x0000_t202" stroked="f" filled="f" o:allowincell="f" style="position:absolute;margin-left:56.800pt;margin-top:69.956pt;width:484.498pt;height:19.125pt;z-index:251659264;mso-position-horizontal-relative:page;mso-position-vertical-relative:page;mso-wrap-style:none;mso-fit-shape-to-text:t;">
             <w10:wrap type="none"/>
             <v:textbox inset="0,0,0,0">
               <w:txbxContent>
@@ -3962,7 +3674,7 @@
       </w:r>
       <w:r>
         <w:pict>
-          <v:shape id="DocuMindTextBox145" type="#_x0000_t202" stroked="f" filled="f" o:allowincell="f" style="position:absolute;margin-left:56.800pt;margin-top:84.656pt;width:484.299pt;height:19.125pt;z-index:251659264;mso-position-horizontal-relative:page;mso-position-vertical-relative:page;mso-wrap-style:none;mso-fit-shape-to-text:t;">
+          <v:shape id="DocuMindTextBox130" type="#_x0000_t202" stroked="f" filled="f" o:allowincell="f" style="position:absolute;margin-left:56.800pt;margin-top:84.656pt;width:484.299pt;height:19.125pt;z-index:251659264;mso-position-horizontal-relative:page;mso-position-vertical-relative:page;mso-wrap-style:none;mso-fit-shape-to-text:t;">
             <w10:wrap type="none"/>
             <v:textbox inset="0,0,0,0">
               <w:txbxContent>
@@ -3989,7 +3701,7 @@
       </w:r>
       <w:r>
         <w:pict>
-          <v:shape id="DocuMindTextBox146" type="#_x0000_t202" stroked="f" filled="f" o:allowincell="f" style="position:absolute;margin-left:56.800pt;margin-top:99.356pt;width:483.858pt;height:19.125pt;z-index:251659264;mso-position-horizontal-relative:page;mso-position-vertical-relative:page;mso-wrap-style:none;mso-fit-shape-to-text:t;">
+          <v:shape id="DocuMindTextBox131" type="#_x0000_t202" stroked="f" filled="f" o:allowincell="f" style="position:absolute;margin-left:56.800pt;margin-top:99.356pt;width:483.858pt;height:19.125pt;z-index:251659264;mso-position-horizontal-relative:page;mso-position-vertical-relative:page;mso-wrap-style:none;mso-fit-shape-to-text:t;">
             <w10:wrap type="none"/>
             <v:textbox inset="0,0,0,0">
               <w:txbxContent>
@@ -4016,7 +3728,7 @@
       </w:r>
       <w:r>
         <w:pict>
-          <v:shape id="DocuMindTextBox147" type="#_x0000_t202" stroked="f" filled="f" o:allowincell="f" style="position:absolute;margin-left:56.800pt;margin-top:114.056pt;width:484.457pt;height:19.125pt;z-index:251659264;mso-position-horizontal-relative:page;mso-position-vertical-relative:page;mso-wrap-style:none;mso-fit-shape-to-text:t;">
+          <v:shape id="DocuMindTextBox132" type="#_x0000_t202" stroked="f" filled="f" o:allowincell="f" style="position:absolute;margin-left:56.800pt;margin-top:114.056pt;width:484.457pt;height:19.125pt;z-index:251659264;mso-position-horizontal-relative:page;mso-position-vertical-relative:page;mso-wrap-style:none;mso-fit-shape-to-text:t;">
             <w10:wrap type="none"/>
             <v:textbox inset="0,0,0,0">
               <w:txbxContent>
@@ -4043,7 +3755,7 @@
       </w:r>
       <w:r>
         <w:pict>
-          <v:shape id="DocuMindTextBox148" type="#_x0000_t202" stroked="f" filled="f" o:allowincell="f" style="position:absolute;margin-left:56.800pt;margin-top:128.756pt;width:484.278pt;height:19.125pt;z-index:251659264;mso-position-horizontal-relative:page;mso-position-vertical-relative:page;mso-wrap-style:none;mso-fit-shape-to-text:t;">
+          <v:shape id="DocuMindTextBox133" type="#_x0000_t202" stroked="f" filled="f" o:allowincell="f" style="position:absolute;margin-left:56.800pt;margin-top:128.756pt;width:484.278pt;height:19.125pt;z-index:251659264;mso-position-horizontal-relative:page;mso-position-vertical-relative:page;mso-wrap-style:none;mso-fit-shape-to-text:t;">
             <w10:wrap type="none"/>
             <v:textbox inset="0,0,0,0">
               <w:txbxContent>
@@ -4070,7 +3782,7 @@
       </w:r>
       <w:r>
         <w:pict>
-          <v:shape id="DocuMindTextBox149" type="#_x0000_t202" stroked="f" filled="f" o:allowincell="f" style="position:absolute;margin-left:56.800pt;margin-top:143.456pt;width:254.853pt;height:19.125pt;z-index:251659264;mso-position-horizontal-relative:page;mso-position-vertical-relative:page;mso-wrap-style:none;mso-fit-shape-to-text:t;">
+          <v:shape id="DocuMindTextBox134" type="#_x0000_t202" stroked="f" filled="f" o:allowincell="f" style="position:absolute;margin-left:56.800pt;margin-top:143.456pt;width:254.853pt;height:19.125pt;z-index:251659264;mso-position-horizontal-relative:page;mso-position-vertical-relative:page;mso-wrap-style:none;mso-fit-shape-to-text:t;">
             <w10:wrap type="none"/>
             <v:textbox inset="0,0,0,0">
               <w:txbxContent>

</xml_diff>

<commit_message>
Step 51 - Correct PDF table row and cell mapping
</commit_message>
<xml_diff>
--- a/output/output.docx
+++ b/output/output.docx
@@ -1167,166 +1167,7 @@
       </w:r>
       <w:r>
         <w:pict>
-          <v:shape id="DocuMindTableCell43" type="#_x0000_t202" filled="f" stroked="t" strokecolor="#000000" strokeweight="0.75pt" o:allowincell="f" style="position:absolute;margin-left:56.743pt;margin-top:56.700pt;width:482.371pt;height:321.600pt;z-index:100;mso-position-horizontal-relative:page;mso-position-vertical-relative:page;mso-wrap-style:none;">
-            <w10:wrap type="none"/>
-            <v:textbox inset="2.0pt,1.0pt,2.0pt,1.0pt">
-              <w:txbxContent>
-                <w:p>
-                  <w:pPr>
-                    <w:spacing w:before="0" w:after="0" w:line="240" w:lineRule="auto"/>
-                    <w:ind w:left="0" w:right="0" w:firstLine="0"/>
-                  </w:pPr>
-                  <w:r>
-                    <w:rPr>
-                      <w:rFonts w:ascii="Deja Vu Sans" w:hAnsi="Deja Vu Sans" w:eastAsia="Deja Vu Sans" w:cs="Deja Vu Sans"/>
-                      <w:b w:val="0"/>
-                      <w:i w:val="0"/>
-                      <w:color w:val="000000"/>
-                      <w:sz w:val="21"/>
-                    </w:rPr>
-                    <w:t>In non mauris justo. Duis vehicula mi vel mi pretium, a viverra erat efcfi itur. Cras aliquam</w:t>
-                    <w:br/>
-                  </w:r>
-                  <w:r>
-                    <w:rPr>
-                      <w:rFonts w:ascii="Deja Vu Sans" w:hAnsi="Deja Vu Sans" w:eastAsia="Deja Vu Sans" w:cs="Deja Vu Sans"/>
-                      <w:b w:val="0"/>
-                      <w:i w:val="0"/>
-                      <w:color w:val="000000"/>
-                      <w:sz w:val="21"/>
-                    </w:rPr>
-                    <w:t>est ac eros varius, id iaculis dui auctor. Duis pretium neque ligula, et pulvinar mi placerat</w:t>
-                    <w:br/>
-                  </w:r>
-                  <w:r>
-                    <w:rPr>
-                      <w:rFonts w:ascii="Deja Vu Sans" w:hAnsi="Deja Vu Sans" w:eastAsia="Deja Vu Sans" w:cs="Deja Vu Sans"/>
-                      <w:b w:val="0"/>
-                      <w:i w:val="0"/>
-                      <w:color w:val="000000"/>
-                      <w:sz w:val="21"/>
-                    </w:rPr>
-                    <w:t>et. Nulla nec nunc sit amet nunc posuere vestibulum. Ut id neque eget tortor mattis</w:t>
-                    <w:br/>
-                  </w:r>
-                  <w:r>
-                    <w:rPr>
-                      <w:rFonts w:ascii="Deja Vu Sans" w:hAnsi="Deja Vu Sans" w:eastAsia="Deja Vu Sans" w:cs="Deja Vu Sans"/>
-                      <w:b w:val="0"/>
-                      <w:i w:val="0"/>
-                      <w:color w:val="000000"/>
-                      <w:sz w:val="21"/>
-                    </w:rPr>
-                    <w:t>tristique. Donec ante est, blandit sit amet tristique vel, lacinia pulvinar arcu. Pellentesque</w:t>
-                    <w:br/>
-                  </w:r>
-                  <w:r>
-                    <w:rPr>
-                      <w:rFonts w:ascii="Deja Vu Sans" w:hAnsi="Deja Vu Sans" w:eastAsia="Deja Vu Sans" w:cs="Deja Vu Sans"/>
-                      <w:b w:val="0"/>
-                      <w:i w:val="0"/>
-                      <w:color w:val="000000"/>
-                      <w:sz w:val="21"/>
-                    </w:rPr>
-                    <w:t>scelerisque fermentum erat, id posuere justo pulvinar ut. Cras id eros sed enim aliquam</w:t>
-                    <w:br/>
-                  </w:r>
-                  <w:r>
-                    <w:rPr>
-                      <w:rFonts w:ascii="Deja Vu Sans" w:hAnsi="Deja Vu Sans" w:eastAsia="Deja Vu Sans" w:cs="Deja Vu Sans"/>
-                      <w:b w:val="0"/>
-                      <w:i w:val="0"/>
-                      <w:color w:val="000000"/>
-                      <w:sz w:val="21"/>
-                    </w:rPr>
-                    <w:t>lobortis. Sed lobortis nisl ut eros efcfi itur tincidunt. Cras justo mi, porttitor quis mattis vel,</w:t>
-                    <w:br/>
-                  </w:r>
-                  <w:r>
-                    <w:rPr>
-                      <w:rFonts w:ascii="Deja Vu Sans" w:hAnsi="Deja Vu Sans" w:eastAsia="Deja Vu Sans" w:cs="Deja Vu Sans"/>
-                      <w:b w:val="0"/>
-                      <w:i w:val="0"/>
-                      <w:color w:val="000000"/>
-                      <w:sz w:val="21"/>
-                    </w:rPr>
-                    <w:t>ultricies ut purus. Ut facilisis et lacus eu cursus.</w:t>
-                    <w:br/>
-                  </w:r>
-                  <w:r>
-                    <w:rPr>
-                      <w:rFonts w:ascii="Deja Vu Sans" w:hAnsi="Deja Vu Sans" w:eastAsia="Deja Vu Sans" w:cs="Deja Vu Sans"/>
-                      <w:b w:val="0"/>
-                      <w:i w:val="0"/>
-                      <w:color w:val="000000"/>
-                      <w:sz w:val="21"/>
-                    </w:rPr>
-                    <w:t>In eleifend velit vitae libero sollicitudin euismod. Fusce vitae vestibulum velit. Pellentesque</w:t>
-                    <w:br/>
-                  </w:r>
-                  <w:r>
-                    <w:rPr>
-                      <w:rFonts w:ascii="Deja Vu Sans" w:hAnsi="Deja Vu Sans" w:eastAsia="Deja Vu Sans" w:cs="Deja Vu Sans"/>
-                      <w:b w:val="0"/>
-                      <w:i w:val="0"/>
-                      <w:color w:val="000000"/>
-                      <w:sz w:val="21"/>
-                    </w:rPr>
-                    <w:t>vulputate lectus quis pellentesque commodo. Aliquam erat volutpat. Vestibulum in egestas</w:t>
-                    <w:br/>
-                  </w:r>
-                  <w:r>
-                    <w:rPr>
-                      <w:rFonts w:ascii="Deja Vu Sans" w:hAnsi="Deja Vu Sans" w:eastAsia="Deja Vu Sans" w:cs="Deja Vu Sans"/>
-                      <w:b w:val="0"/>
-                      <w:i w:val="0"/>
-                      <w:color w:val="000000"/>
-                      <w:sz w:val="21"/>
-                    </w:rPr>
-                    <w:t>velit. Pellentesque fermentum nisl vitae fringilla venenatis. Etiam id mauris vitae orci</w:t>
-                    <w:br/>
-                  </w:r>
-                  <w:r>
-                    <w:rPr>
-                      <w:rFonts w:ascii="Deja Vu Sans" w:hAnsi="Deja Vu Sans" w:eastAsia="Deja Vu Sans" w:cs="Deja Vu Sans"/>
-                      <w:b w:val="0"/>
-                      <w:i w:val="0"/>
-                      <w:color w:val="000000"/>
-                      <w:sz w:val="21"/>
-                    </w:rPr>
-                    <w:t>maximus ultricies.</w:t>
-                    <w:br/>
-                  </w:r>
-                  <w:r>
-                    <w:rPr>
-                      <w:rFonts w:ascii="Deja Vu Sans" w:hAnsi="Deja Vu Sans" w:eastAsia="Deja Vu Sans" w:cs="Deja Vu Sans"/>
-                      <w:b w:val="0"/>
-                      <w:i w:val="0"/>
-                      <w:color w:val="000000"/>
-                      <w:sz w:val="21"/>
-                    </w:rPr>
-                    <w:t>Cras fringilla ipsum magna, in fringilla dui commodo</w:t>
-                    <w:br/>
-                  </w:r>
-                  <w:r>
-                    <w:rPr>
-                      <w:rFonts w:ascii="Deja Vu Sans" w:hAnsi="Deja Vu Sans" w:eastAsia="Deja Vu Sans" w:cs="Deja Vu Sans"/>
-                      <w:b w:val="0"/>
-                      <w:i w:val="0"/>
-                      <w:color w:val="000000"/>
-                      <w:sz w:val="21"/>
-                    </w:rPr>
-                    <w:t>a.</w:t>
-                  </w:r>
-                </w:p>
-              </w:txbxContent>
-            </v:textbox>
-          </v:shape>
-        </w:pict>
-      </w:r>
-      <w:r>
-        <w:pict>
-          <v:shape id="DocuMindTableCell44" type="#_x0000_t202" filled="f" stroked="t" strokecolor="#000000" strokeweight="0.75pt" o:allowincell="f" style="position:absolute;margin-left:56.743pt;margin-top:378.300pt;width:36.007pt;height:29.100pt;z-index:100;mso-position-horizontal-relative:page;mso-position-vertical-relative:page;mso-wrap-style:none;">
+          <v:shape id="DocuMindTableCell43" type="#_x0000_t202" filled="f" stroked="t" strokecolor="#000000" strokeweight="0.75pt" o:allowincell="f" style="position:absolute;margin-left:56.743pt;margin-top:378.300pt;width:36.007pt;height:29.100pt;z-index:100;mso-position-horizontal-relative:page;mso-position-vertical-relative:page;mso-wrap-style:none;">
             <w10:wrap type="none"/>
             <v:textbox inset="2.0pt,1.0pt,2.0pt,1.0pt">
               <w:txbxContent>
@@ -1349,85 +1190,7 @@
       </w:r>
       <w:r>
         <w:pict>
-          <v:shape id="DocuMindTableCell45" type="#_x0000_t202" filled="f" stroked="t" strokecolor="#000000" strokeweight="0.75pt" o:allowincell="f" style="position:absolute;margin-left:56.743pt;margin-top:407.400pt;width:36.007pt;height:29.100pt;z-index:100;mso-position-horizontal-relative:page;mso-position-vertical-relative:page;mso-wrap-style:none;">
-            <w10:wrap type="none"/>
-            <v:textbox inset="2.0pt,1.0pt,2.0pt,1.0pt">
-              <w:txbxContent>
-                <w:p>
-                  <w:pPr>
-                    <w:spacing w:before="0" w:after="0" w:line="240" w:lineRule="auto"/>
-                    <w:ind w:left="0" w:right="0" w:firstLine="0"/>
-                  </w:pPr>
-                  <w:r>
-                    <w:rPr>
-                      <w:rFonts w:ascii="Deja Vu Sans" w:hAnsi="Deja Vu Sans" w:eastAsia="Deja Vu Sans" w:cs="Deja Vu Sans"/>
-                      <w:b w:val="0"/>
-                      <w:i w:val="0"/>
-                      <w:color w:val="000000"/>
-                      <w:sz w:val="21"/>
-                    </w:rPr>
-                  </w:r>
-                </w:p>
-              </w:txbxContent>
-            </v:textbox>
-          </v:shape>
-        </w:pict>
-      </w:r>
-      <w:r>
-        <w:pict>
-          <v:shape id="DocuMindTableCell46" type="#_x0000_t202" filled="f" stroked="t" strokecolor="#000000" strokeweight="0.75pt" o:allowincell="f" style="position:absolute;margin-left:56.743pt;margin-top:436.500pt;width:36.007pt;height:43.800pt;z-index:100;mso-position-horizontal-relative:page;mso-position-vertical-relative:page;mso-wrap-style:none;">
-            <w10:wrap type="none"/>
-            <v:textbox inset="2.0pt,1.0pt,2.0pt,1.0pt">
-              <w:txbxContent>
-                <w:p>
-                  <w:pPr>
-                    <w:spacing w:before="0" w:after="0" w:line="240" w:lineRule="auto"/>
-                    <w:ind w:left="0" w:right="0" w:firstLine="0"/>
-                  </w:pPr>
-                  <w:r>
-                    <w:rPr>
-                      <w:rFonts w:ascii="Deja Vu Sans" w:hAnsi="Deja Vu Sans" w:eastAsia="Deja Vu Sans" w:cs="Deja Vu Sans"/>
-                      <w:b w:val="0"/>
-                      <w:i w:val="0"/>
-                      <w:color w:val="000000"/>
-                      <w:sz w:val="21"/>
-                    </w:rPr>
-                  </w:r>
-                </w:p>
-              </w:txbxContent>
-            </v:textbox>
-          </v:shape>
-        </w:pict>
-      </w:r>
-      <w:r>
-        <w:pict>
-          <v:shape id="DocuMindTableCell47" type="#_x0000_t202" filled="f" stroked="t" strokecolor="#000000" strokeweight="0.75pt" o:allowincell="f" style="position:absolute;margin-left:56.743pt;margin-top:480.300pt;width:36.007pt;height:29.100pt;z-index:100;mso-position-horizontal-relative:page;mso-position-vertical-relative:page;mso-wrap-style:none;">
-            <w10:wrap type="none"/>
-            <v:textbox inset="2.0pt,1.0pt,2.0pt,1.0pt">
-              <w:txbxContent>
-                <w:p>
-                  <w:pPr>
-                    <w:spacing w:before="0" w:after="0" w:line="240" w:lineRule="auto"/>
-                    <w:ind w:left="0" w:right="0" w:firstLine="0"/>
-                  </w:pPr>
-                  <w:r>
-                    <w:rPr>
-                      <w:rFonts w:ascii="Deja Vu Sans" w:hAnsi="Deja Vu Sans" w:eastAsia="Deja Vu Sans" w:cs="Deja Vu Sans"/>
-                      <w:b w:val="0"/>
-                      <w:i w:val="0"/>
-                      <w:color w:val="000000"/>
-                      <w:sz w:val="21"/>
-                    </w:rPr>
-                  </w:r>
-                </w:p>
-              </w:txbxContent>
-            </v:textbox>
-          </v:shape>
-        </w:pict>
-      </w:r>
-      <w:r>
-        <w:pict>
-          <v:shape id="DocuMindTableCell48" type="#_x0000_t202" filled="f" stroked="t" strokecolor="#000000" strokeweight="0.75pt" o:allowincell="f" style="position:absolute;margin-left:56.743pt;margin-top:509.400pt;width:36.007pt;height:29.100pt;z-index:100;mso-position-horizontal-relative:page;mso-position-vertical-relative:page;mso-wrap-style:none;">
+          <v:shape id="DocuMindTableCell44" type="#_x0000_t202" filled="f" stroked="t" strokecolor="#000000" strokeweight="0.75pt" o:allowincell="f" style="position:absolute;margin-left:92.750pt;margin-top:378.300pt;width:283.500pt;height:29.100pt;z-index:100;mso-position-horizontal-relative:page;mso-position-vertical-relative:page;mso-wrap-style:none;">
             <w10:wrap type="none"/>
             <v:textbox inset="2.0pt,1.0pt,2.0pt,1.0pt">
               <w:txbxContent>
@@ -1454,7 +1217,7 @@
       </w:r>
       <w:r>
         <w:pict>
-          <v:shape id="DocuMindTableCell49" type="#_x0000_t202" filled="f" stroked="t" strokecolor="#000000" strokeweight="0.75pt" o:allowincell="f" style="position:absolute;margin-left:56.743pt;margin-top:538.500pt;width:36.007pt;height:29.100pt;z-index:100;mso-position-horizontal-relative:page;mso-position-vertical-relative:page;mso-wrap-style:none;">
+          <v:shape id="DocuMindTableCell45" type="#_x0000_t202" filled="f" stroked="t" strokecolor="#000000" strokeweight="0.75pt" o:allowincell="f" style="position:absolute;margin-left:376.250pt;margin-top:378.300pt;width:78.000pt;height:29.100pt;z-index:100;mso-position-horizontal-relative:page;mso-position-vertical-relative:page;mso-wrap-style:none;">
             <w10:wrap type="none"/>
             <v:textbox inset="2.0pt,1.0pt,2.0pt,1.0pt">
               <w:txbxContent>
@@ -1481,7 +1244,7 @@
       </w:r>
       <w:r>
         <w:pict>
-          <v:shape id="DocuMindTableCell50" type="#_x0000_t202" filled="f" stroked="t" strokecolor="#000000" strokeweight="0.75pt" o:allowincell="f" style="position:absolute;margin-left:56.743pt;margin-top:567.600pt;width:482.371pt;height:217.600pt;z-index:100;mso-position-horizontal-relative:page;mso-position-vertical-relative:page;mso-wrap-style:none;">
+          <v:shape id="DocuMindTableCell46" type="#_x0000_t202" filled="f" stroked="t" strokecolor="#000000" strokeweight="0.75pt" o:allowincell="f" style="position:absolute;margin-left:454.250pt;margin-top:378.300pt;width:84.864pt;height:29.100pt;z-index:100;mso-position-horizontal-relative:page;mso-position-vertical-relative:page;mso-wrap-style:none;">
             <w10:wrap type="none"/>
             <v:textbox inset="2.0pt,1.0pt,2.0pt,1.0pt">
               <w:txbxContent>
@@ -1508,7 +1271,7 @@
       </w:r>
       <w:r>
         <w:pict>
-          <v:shape id="DocuMindTableCell51" type="#_x0000_t202" filled="f" stroked="t" strokecolor="#000000" strokeweight="0.75pt" o:allowincell="f" style="position:absolute;margin-left:92.750pt;margin-top:378.300pt;width:283.500pt;height:29.100pt;z-index:100;mso-position-horizontal-relative:page;mso-position-vertical-relative:page;mso-wrap-style:none;">
+          <v:shape id="DocuMindTableCell47" type="#_x0000_t202" filled="f" stroked="t" strokecolor="#000000" strokeweight="0.75pt" o:allowincell="f" style="position:absolute;margin-left:56.743pt;margin-top:407.400pt;width:36.007pt;height:29.100pt;z-index:100;mso-position-horizontal-relative:page;mso-position-vertical-relative:page;mso-wrap-style:none;">
             <w10:wrap type="none"/>
             <v:textbox inset="2.0pt,1.0pt,2.0pt,1.0pt">
               <w:txbxContent>
@@ -1535,7 +1298,7 @@
       </w:r>
       <w:r>
         <w:pict>
-          <v:shape id="DocuMindTableCell52" type="#_x0000_t202" filled="f" stroked="t" strokecolor="#000000" strokeweight="0.75pt" o:allowincell="f" style="position:absolute;margin-left:92.750pt;margin-top:407.400pt;width:283.500pt;height:29.100pt;z-index:100;mso-position-horizontal-relative:page;mso-position-vertical-relative:page;mso-wrap-style:none;">
+          <v:shape id="DocuMindTableCell48" type="#_x0000_t202" filled="f" stroked="t" strokecolor="#000000" strokeweight="0.75pt" o:allowincell="f" style="position:absolute;margin-left:92.750pt;margin-top:407.400pt;width:283.500pt;height:29.100pt;z-index:100;mso-position-horizontal-relative:page;mso-position-vertical-relative:page;mso-wrap-style:none;">
             <w10:wrap type="none"/>
             <v:textbox inset="2.0pt,1.0pt,2.0pt,1.0pt">
               <w:txbxContent>
@@ -1562,7 +1325,7 @@
       </w:r>
       <w:r>
         <w:pict>
-          <v:shape id="DocuMindTableCell53" type="#_x0000_t202" filled="f" stroked="t" strokecolor="#000000" strokeweight="0.75pt" o:allowincell="f" style="position:absolute;margin-left:92.750pt;margin-top:436.500pt;width:283.500pt;height:43.800pt;z-index:100;mso-position-horizontal-relative:page;mso-position-vertical-relative:page;mso-wrap-style:none;">
+          <v:shape id="DocuMindTableCell49" type="#_x0000_t202" filled="f" stroked="t" strokecolor="#000000" strokeweight="0.75pt" o:allowincell="f" style="position:absolute;margin-left:376.250pt;margin-top:407.400pt;width:78.000pt;height:29.100pt;z-index:100;mso-position-horizontal-relative:page;mso-position-vertical-relative:page;mso-wrap-style:none;">
             <w10:wrap type="none"/>
             <v:textbox inset="2.0pt,1.0pt,2.0pt,1.0pt">
               <w:txbxContent>
@@ -1589,7 +1352,7 @@
       </w:r>
       <w:r>
         <w:pict>
-          <v:shape id="DocuMindTableCell54" type="#_x0000_t202" filled="f" stroked="t" strokecolor="#000000" strokeweight="0.75pt" o:allowincell="f" style="position:absolute;margin-left:92.750pt;margin-top:480.300pt;width:283.500pt;height:29.100pt;z-index:100;mso-position-horizontal-relative:page;mso-position-vertical-relative:page;mso-wrap-style:none;">
+          <v:shape id="DocuMindTableCell50" type="#_x0000_t202" filled="f" stroked="t" strokecolor="#000000" strokeweight="0.75pt" o:allowincell="f" style="position:absolute;margin-left:454.250pt;margin-top:407.400pt;width:84.864pt;height:29.100pt;z-index:100;mso-position-horizontal-relative:page;mso-position-vertical-relative:page;mso-wrap-style:none;">
             <w10:wrap type="none"/>
             <v:textbox inset="2.0pt,1.0pt,2.0pt,1.0pt">
               <w:txbxContent>
@@ -1600,11 +1363,8 @@
                   </w:pPr>
                   <w:r>
                     <w:rPr>
-                      <w:rFonts w:ascii="Deja Vu Sans" w:hAnsi="Deja Vu Sans" w:eastAsia="Deja Vu Sans" w:cs="Deja Vu Sans"/>
-                      <w:b w:val="0"/>
-                      <w:i w:val="0"/>
-                      <w:color w:val="000000"/>
-                      <w:sz w:val="21"/>
+                      <w:rFonts w:ascii="Arial" w:hAnsi="Arial" w:eastAsia="Arial" w:cs="Arial"/>
+                      <w:sz w:val="18"/>
                     </w:rPr>
                   </w:r>
                 </w:p>
@@ -1615,7 +1375,7 @@
       </w:r>
       <w:r>
         <w:pict>
-          <v:shape id="DocuMindTableCell55" type="#_x0000_t202" filled="f" stroked="t" strokecolor="#000000" strokeweight="0.75pt" o:allowincell="f" style="position:absolute;margin-left:92.750pt;margin-top:509.400pt;width:283.500pt;height:29.100pt;z-index:100;mso-position-horizontal-relative:page;mso-position-vertical-relative:page;mso-wrap-style:none;">
+          <v:shape id="DocuMindTableCell51" type="#_x0000_t202" filled="f" stroked="t" strokecolor="#000000" strokeweight="0.75pt" o:allowincell="f" style="position:absolute;margin-left:56.743pt;margin-top:436.500pt;width:36.007pt;height:43.800pt;z-index:100;mso-position-horizontal-relative:page;mso-position-vertical-relative:page;mso-wrap-style:none;">
             <w10:wrap type="none"/>
             <v:textbox inset="2.0pt,1.0pt,2.0pt,1.0pt">
               <w:txbxContent>
@@ -1642,7 +1402,7 @@
       </w:r>
       <w:r>
         <w:pict>
-          <v:shape id="DocuMindTableCell56" type="#_x0000_t202" filled="f" stroked="t" strokecolor="#000000" strokeweight="0.75pt" o:allowincell="f" style="position:absolute;margin-left:92.750pt;margin-top:538.500pt;width:283.500pt;height:29.100pt;z-index:100;mso-position-horizontal-relative:page;mso-position-vertical-relative:page;mso-wrap-style:none;">
+          <v:shape id="DocuMindTableCell52" type="#_x0000_t202" filled="f" stroked="t" strokecolor="#000000" strokeweight="0.75pt" o:allowincell="f" style="position:absolute;margin-left:92.750pt;margin-top:436.500pt;width:283.500pt;height:43.800pt;z-index:100;mso-position-horizontal-relative:page;mso-position-vertical-relative:page;mso-wrap-style:none;">
             <w10:wrap type="none"/>
             <v:textbox inset="2.0pt,1.0pt,2.0pt,1.0pt">
               <w:txbxContent>
@@ -1680,7 +1440,7 @@
       </w:r>
       <w:r>
         <w:pict>
-          <v:shape id="DocuMindTableCell57" type="#_x0000_t202" filled="f" stroked="t" strokecolor="#000000" strokeweight="0.75pt" o:allowincell="f" style="position:absolute;margin-left:376.250pt;margin-top:378.300pt;width:78.000pt;height:29.100pt;z-index:100;mso-position-horizontal-relative:page;mso-position-vertical-relative:page;mso-wrap-style:none;">
+          <v:shape id="DocuMindTableCell53" type="#_x0000_t202" filled="f" stroked="t" strokecolor="#000000" strokeweight="0.75pt" o:allowincell="f" style="position:absolute;margin-left:376.250pt;margin-top:436.500pt;width:78.000pt;height:43.800pt;z-index:100;mso-position-horizontal-relative:page;mso-position-vertical-relative:page;mso-wrap-style:none;">
             <w10:wrap type="none"/>
             <v:textbox inset="2.0pt,1.0pt,2.0pt,1.0pt">
               <w:txbxContent>
@@ -1707,7 +1467,7 @@
       </w:r>
       <w:r>
         <w:pict>
-          <v:shape id="DocuMindTableCell58" type="#_x0000_t202" filled="f" stroked="t" strokecolor="#000000" strokeweight="0.75pt" o:allowincell="f" style="position:absolute;margin-left:376.250pt;margin-top:407.400pt;width:78.000pt;height:29.100pt;z-index:100;mso-position-horizontal-relative:page;mso-position-vertical-relative:page;mso-wrap-style:none;">
+          <v:shape id="DocuMindTableCell54" type="#_x0000_t202" filled="f" stroked="t" strokecolor="#000000" strokeweight="0.75pt" o:allowincell="f" style="position:absolute;margin-left:454.250pt;margin-top:436.500pt;width:84.864pt;height:43.800pt;z-index:100;mso-position-horizontal-relative:page;mso-position-vertical-relative:page;mso-wrap-style:none;">
             <w10:wrap type="none"/>
             <v:textbox inset="2.0pt,1.0pt,2.0pt,1.0pt">
               <w:txbxContent>
@@ -1718,11 +1478,8 @@
                   </w:pPr>
                   <w:r>
                     <w:rPr>
-                      <w:rFonts w:ascii="Deja Vu Sans" w:hAnsi="Deja Vu Sans" w:eastAsia="Deja Vu Sans" w:cs="Deja Vu Sans"/>
-                      <w:b w:val="0"/>
-                      <w:i w:val="0"/>
-                      <w:color w:val="000000"/>
-                      <w:sz w:val="21"/>
+                      <w:rFonts w:ascii="Arial" w:hAnsi="Arial" w:eastAsia="Arial" w:cs="Arial"/>
+                      <w:sz w:val="18"/>
                     </w:rPr>
                   </w:r>
                 </w:p>
@@ -1733,7 +1490,7 @@
       </w:r>
       <w:r>
         <w:pict>
-          <v:shape id="DocuMindTableCell59" type="#_x0000_t202" filled="f" stroked="t" strokecolor="#000000" strokeweight="0.75pt" o:allowincell="f" style="position:absolute;margin-left:376.250pt;margin-top:436.500pt;width:78.000pt;height:43.800pt;z-index:100;mso-position-horizontal-relative:page;mso-position-vertical-relative:page;mso-wrap-style:none;">
+          <v:shape id="DocuMindTableCell55" type="#_x0000_t202" filled="f" stroked="t" strokecolor="#000000" strokeweight="0.75pt" o:allowincell="f" style="position:absolute;margin-left:56.743pt;margin-top:480.300pt;width:36.007pt;height:29.100pt;z-index:100;mso-position-horizontal-relative:page;mso-position-vertical-relative:page;mso-wrap-style:none;">
             <w10:wrap type="none"/>
             <v:textbox inset="2.0pt,1.0pt,2.0pt,1.0pt">
               <w:txbxContent>
@@ -1760,7 +1517,7 @@
       </w:r>
       <w:r>
         <w:pict>
-          <v:shape id="DocuMindTableCell60" type="#_x0000_t202" filled="f" stroked="t" strokecolor="#000000" strokeweight="0.75pt" o:allowincell="f" style="position:absolute;margin-left:376.250pt;margin-top:480.300pt;width:78.000pt;height:29.100pt;z-index:100;mso-position-horizontal-relative:page;mso-position-vertical-relative:page;mso-wrap-style:none;">
+          <v:shape id="DocuMindTableCell56" type="#_x0000_t202" filled="f" stroked="t" strokecolor="#000000" strokeweight="0.75pt" o:allowincell="f" style="position:absolute;margin-left:92.750pt;margin-top:480.300pt;width:283.500pt;height:29.100pt;z-index:100;mso-position-horizontal-relative:page;mso-position-vertical-relative:page;mso-wrap-style:none;">
             <w10:wrap type="none"/>
             <v:textbox inset="2.0pt,1.0pt,2.0pt,1.0pt">
               <w:txbxContent>
@@ -1778,6 +1535,110 @@
                       <w:sz w:val="21"/>
                     </w:rPr>
                     <w:t>Aliquam erat volutpat.</w:t>
+                  </w:r>
+                </w:p>
+              </w:txbxContent>
+            </v:textbox>
+          </v:shape>
+        </w:pict>
+      </w:r>
+      <w:r>
+        <w:pict>
+          <v:shape id="DocuMindTableCell57" type="#_x0000_t202" filled="f" stroked="t" strokecolor="#000000" strokeweight="0.75pt" o:allowincell="f" style="position:absolute;margin-left:376.250pt;margin-top:480.300pt;width:78.000pt;height:29.100pt;z-index:100;mso-position-horizontal-relative:page;mso-position-vertical-relative:page;mso-wrap-style:none;">
+            <w10:wrap type="none"/>
+            <v:textbox inset="2.0pt,1.0pt,2.0pt,1.0pt">
+              <w:txbxContent>
+                <w:p>
+                  <w:pPr>
+                    <w:spacing w:before="0" w:after="0" w:line="240" w:lineRule="auto"/>
+                    <w:ind w:left="0" w:right="0" w:firstLine="0"/>
+                  </w:pPr>
+                  <w:r>
+                    <w:rPr>
+                      <w:rFonts w:ascii="Deja Vu Sans" w:hAnsi="Deja Vu Sans" w:eastAsia="Deja Vu Sans" w:cs="Deja Vu Sans"/>
+                      <w:b w:val="0"/>
+                      <w:i w:val="0"/>
+                      <w:color w:val="000000"/>
+                      <w:sz w:val="21"/>
+                    </w:rPr>
+                    <w:t>Lorem</w:t>
+                  </w:r>
+                </w:p>
+              </w:txbxContent>
+            </v:textbox>
+          </v:shape>
+        </w:pict>
+      </w:r>
+      <w:r>
+        <w:pict>
+          <v:shape id="DocuMindTableCell58" type="#_x0000_t202" filled="f" stroked="t" strokecolor="#000000" strokeweight="0.75pt" o:allowincell="f" style="position:absolute;margin-left:454.250pt;margin-top:480.300pt;width:84.864pt;height:29.100pt;z-index:100;mso-position-horizontal-relative:page;mso-position-vertical-relative:page;mso-wrap-style:none;">
+            <w10:wrap type="none"/>
+            <v:textbox inset="2.0pt,1.0pt,2.0pt,1.0pt">
+              <w:txbxContent>
+                <w:p>
+                  <w:pPr>
+                    <w:spacing w:before="0" w:after="0" w:line="240" w:lineRule="auto"/>
+                    <w:ind w:left="0" w:right="0" w:firstLine="0"/>
+                  </w:pPr>
+                  <w:r>
+                    <w:rPr>
+                      <w:rFonts w:ascii="Arial" w:hAnsi="Arial" w:eastAsia="Arial" w:cs="Arial"/>
+                      <w:sz w:val="18"/>
+                    </w:rPr>
+                  </w:r>
+                </w:p>
+              </w:txbxContent>
+            </v:textbox>
+          </v:shape>
+        </w:pict>
+      </w:r>
+      <w:r>
+        <w:pict>
+          <v:shape id="DocuMindTableCell59" type="#_x0000_t202" filled="f" stroked="t" strokecolor="#000000" strokeweight="0.75pt" o:allowincell="f" style="position:absolute;margin-left:56.743pt;margin-top:509.400pt;width:36.007pt;height:29.100pt;z-index:100;mso-position-horizontal-relative:page;mso-position-vertical-relative:page;mso-wrap-style:none;">
+            <w10:wrap type="none"/>
+            <v:textbox inset="2.0pt,1.0pt,2.0pt,1.0pt">
+              <w:txbxContent>
+                <w:p>
+                  <w:pPr>
+                    <w:spacing w:before="0" w:after="0" w:line="240" w:lineRule="auto"/>
+                    <w:ind w:left="0" w:right="0" w:firstLine="0"/>
+                  </w:pPr>
+                  <w:r>
+                    <w:rPr>
+                      <w:rFonts w:ascii="Deja Vu Sans" w:hAnsi="Deja Vu Sans" w:eastAsia="Deja Vu Sans" w:cs="Deja Vu Sans"/>
+                      <w:b w:val="0"/>
+                      <w:i w:val="0"/>
+                      <w:color w:val="000000"/>
+                      <w:sz w:val="21"/>
+                    </w:rPr>
+                    <w:t>4</w:t>
+                  </w:r>
+                </w:p>
+              </w:txbxContent>
+            </v:textbox>
+          </v:shape>
+        </w:pict>
+      </w:r>
+      <w:r>
+        <w:pict>
+          <v:shape id="DocuMindTableCell60" type="#_x0000_t202" filled="f" stroked="t" strokecolor="#000000" strokeweight="0.75pt" o:allowincell="f" style="position:absolute;margin-left:92.750pt;margin-top:509.400pt;width:283.500pt;height:29.100pt;z-index:100;mso-position-horizontal-relative:page;mso-position-vertical-relative:page;mso-wrap-style:none;">
+            <w10:wrap type="none"/>
+            <v:textbox inset="2.0pt,1.0pt,2.0pt,1.0pt">
+              <w:txbxContent>
+                <w:p>
+                  <w:pPr>
+                    <w:spacing w:before="0" w:after="0" w:line="240" w:lineRule="auto"/>
+                    <w:ind w:left="0" w:right="0" w:firstLine="0"/>
+                  </w:pPr>
+                  <w:r>
+                    <w:rPr>
+                      <w:rFonts w:ascii="Deja Vu Sans" w:hAnsi="Deja Vu Sans" w:eastAsia="Deja Vu Sans" w:cs="Deja Vu Sans"/>
+                      <w:b w:val="0"/>
+                      <w:i w:val="0"/>
+                      <w:color w:val="000000"/>
+                      <w:sz w:val="21"/>
+                    </w:rPr>
+                    <w:t>Fusce vitae vestibulum velit.</w:t>
                   </w:r>
                 </w:p>
               </w:txbxContent>
@@ -1814,108 +1675,7 @@
       </w:r>
       <w:r>
         <w:pict>
-          <v:shape id="DocuMindTableCell62" type="#_x0000_t202" filled="f" stroked="t" strokecolor="#000000" strokeweight="0.75pt" o:allowincell="f" style="position:absolute;margin-left:376.250pt;margin-top:538.500pt;width:78.000pt;height:29.100pt;z-index:100;mso-position-horizontal-relative:page;mso-position-vertical-relative:page;mso-wrap-style:none;">
-            <w10:wrap type="none"/>
-            <v:textbox inset="2.0pt,1.0pt,2.0pt,1.0pt">
-              <w:txbxContent>
-                <w:p>
-                  <w:pPr>
-                    <w:spacing w:before="0" w:after="0" w:line="240" w:lineRule="auto"/>
-                    <w:ind w:left="0" w:right="0" w:firstLine="0"/>
-                  </w:pPr>
-                  <w:r>
-                    <w:rPr>
-                      <w:rFonts w:ascii="Deja Vu Sans" w:hAnsi="Deja Vu Sans" w:eastAsia="Deja Vu Sans" w:cs="Deja Vu Sans"/>
-                      <w:b w:val="0"/>
-                      <w:i w:val="0"/>
-                      <w:color w:val="000000"/>
-                      <w:sz w:val="21"/>
-                    </w:rPr>
-                  </w:r>
-                </w:p>
-              </w:txbxContent>
-            </v:textbox>
-          </v:shape>
-        </w:pict>
-      </w:r>
-      <w:r>
-        <w:pict>
-          <v:shape id="DocuMindTableCell63" type="#_x0000_t202" filled="f" stroked="t" strokecolor="#000000" strokeweight="0.75pt" o:allowincell="f" style="position:absolute;margin-left:454.250pt;margin-top:378.300pt;width:84.864pt;height:29.100pt;z-index:100;mso-position-horizontal-relative:page;mso-position-vertical-relative:page;mso-wrap-style:none;">
-            <w10:wrap type="none"/>
-            <v:textbox inset="2.0pt,1.0pt,2.0pt,1.0pt">
-              <w:txbxContent>
-                <w:p>
-                  <w:pPr>
-                    <w:spacing w:before="0" w:after="0" w:line="240" w:lineRule="auto"/>
-                    <w:ind w:left="0" w:right="0" w:firstLine="0"/>
-                  </w:pPr>
-                  <w:r>
-                    <w:rPr>
-                      <w:rFonts w:ascii="Deja Vu Sans" w:hAnsi="Deja Vu Sans" w:eastAsia="Deja Vu Sans" w:cs="Deja Vu Sans"/>
-                      <w:b w:val="0"/>
-                      <w:i w:val="0"/>
-                      <w:color w:val="000000"/>
-                      <w:sz w:val="21"/>
-                    </w:rPr>
-                    <w:t>4</w:t>
-                  </w:r>
-                </w:p>
-              </w:txbxContent>
-            </v:textbox>
-          </v:shape>
-        </w:pict>
-      </w:r>
-      <w:r>
-        <w:pict>
-          <v:shape id="DocuMindTableCell64" type="#_x0000_t202" filled="f" stroked="t" strokecolor="#000000" strokeweight="0.75pt" o:allowincell="f" style="position:absolute;margin-left:454.250pt;margin-top:407.400pt;width:84.864pt;height:29.100pt;z-index:100;mso-position-horizontal-relative:page;mso-position-vertical-relative:page;mso-wrap-style:none;">
-            <w10:wrap type="none"/>
-            <v:textbox inset="2.0pt,1.0pt,2.0pt,1.0pt">
-              <w:txbxContent>
-                <w:p>
-                  <w:pPr>
-                    <w:spacing w:before="0" w:after="0" w:line="240" w:lineRule="auto"/>
-                    <w:ind w:left="0" w:right="0" w:firstLine="0"/>
-                  </w:pPr>
-                  <w:r>
-                    <w:rPr>
-                      <w:rFonts w:ascii="Arial" w:hAnsi="Arial" w:eastAsia="Arial" w:cs="Arial"/>
-                      <w:sz w:val="18"/>
-                    </w:rPr>
-                    <w:t>Fusce vitae vestibulum velit.</w:t>
-                  </w:r>
-                </w:p>
-              </w:txbxContent>
-            </v:textbox>
-          </v:shape>
-        </w:pict>
-      </w:r>
-      <w:r>
-        <w:pict>
-          <v:shape id="DocuMindTableCell65" type="#_x0000_t202" filled="f" stroked="t" strokecolor="#000000" strokeweight="0.75pt" o:allowincell="f" style="position:absolute;margin-left:454.250pt;margin-top:436.500pt;width:84.864pt;height:43.800pt;z-index:100;mso-position-horizontal-relative:page;mso-position-vertical-relative:page;mso-wrap-style:none;">
-            <w10:wrap type="none"/>
-            <v:textbox inset="2.0pt,1.0pt,2.0pt,1.0pt">
-              <w:txbxContent>
-                <w:p>
-                  <w:pPr>
-                    <w:spacing w:before="0" w:after="0" w:line="240" w:lineRule="auto"/>
-                    <w:ind w:left="0" w:right="0" w:firstLine="0"/>
-                  </w:pPr>
-                  <w:r>
-                    <w:rPr>
-                      <w:rFonts w:ascii="Arial" w:hAnsi="Arial" w:eastAsia="Arial" w:cs="Arial"/>
-                      <w:sz w:val="18"/>
-                    </w:rPr>
-                    <w:t>Lorem</w:t>
-                  </w:r>
-                </w:p>
-              </w:txbxContent>
-            </v:textbox>
-          </v:shape>
-        </w:pict>
-      </w:r>
-      <w:r>
-        <w:pict>
-          <v:shape id="DocuMindTableCell66" type="#_x0000_t202" filled="f" stroked="t" strokecolor="#000000" strokeweight="0.75pt" o:allowincell="f" style="position:absolute;margin-left:454.250pt;margin-top:480.300pt;width:84.864pt;height:29.100pt;z-index:100;mso-position-horizontal-relative:page;mso-position-vertical-relative:page;mso-wrap-style:none;">
+          <v:shape id="DocuMindTableCell62" type="#_x0000_t202" filled="f" stroked="t" strokecolor="#000000" strokeweight="0.75pt" o:allowincell="f" style="position:absolute;margin-left:454.250pt;margin-top:509.400pt;width:84.864pt;height:29.100pt;z-index:100;mso-position-horizontal-relative:page;mso-position-vertical-relative:page;mso-wrap-style:none;">
             <w10:wrap type="none"/>
             <v:textbox inset="2.0pt,1.0pt,2.0pt,1.0pt">
               <w:txbxContent>
@@ -1938,7 +1698,88 @@
       </w:r>
       <w:r>
         <w:pict>
-          <v:shape id="DocuMindTableCell67" type="#_x0000_t202" filled="f" stroked="t" strokecolor="#000000" strokeweight="0.75pt" o:allowincell="f" style="position:absolute;margin-left:454.250pt;margin-top:509.400pt;width:84.864pt;height:29.100pt;z-index:100;mso-position-horizontal-relative:page;mso-position-vertical-relative:page;mso-wrap-style:none;">
+          <v:shape id="DocuMindTableCell63" type="#_x0000_t202" filled="f" stroked="t" strokecolor="#000000" strokeweight="0.75pt" o:allowincell="f" style="position:absolute;margin-left:56.743pt;margin-top:538.500pt;width:36.007pt;height:29.100pt;z-index:100;mso-position-horizontal-relative:page;mso-position-vertical-relative:page;mso-wrap-style:none;">
+            <w10:wrap type="none"/>
+            <v:textbox inset="2.0pt,1.0pt,2.0pt,1.0pt">
+              <w:txbxContent>
+                <w:p>
+                  <w:pPr>
+                    <w:spacing w:before="0" w:after="0" w:line="240" w:lineRule="auto"/>
+                    <w:ind w:left="0" w:right="0" w:firstLine="0"/>
+                  </w:pPr>
+                  <w:r>
+                    <w:rPr>
+                      <w:rFonts w:ascii="Deja Vu Sans" w:hAnsi="Deja Vu Sans" w:eastAsia="Deja Vu Sans" w:cs="Deja Vu Sans"/>
+                      <w:b w:val="0"/>
+                      <w:i w:val="0"/>
+                      <w:color w:val="000000"/>
+                      <w:sz w:val="21"/>
+                    </w:rPr>
+                    <w:t>5</w:t>
+                  </w:r>
+                </w:p>
+              </w:txbxContent>
+            </v:textbox>
+          </v:shape>
+        </w:pict>
+      </w:r>
+      <w:r>
+        <w:pict>
+          <v:shape id="DocuMindTableCell64" type="#_x0000_t202" filled="f" stroked="t" strokecolor="#000000" strokeweight="0.75pt" o:allowincell="f" style="position:absolute;margin-left:92.750pt;margin-top:538.500pt;width:283.500pt;height:29.100pt;z-index:100;mso-position-horizontal-relative:page;mso-position-vertical-relative:page;mso-wrap-style:none;">
+            <w10:wrap type="none"/>
+            <v:textbox inset="2.0pt,1.0pt,2.0pt,1.0pt">
+              <w:txbxContent>
+                <w:p>
+                  <w:pPr>
+                    <w:spacing w:before="0" w:after="0" w:line="240" w:lineRule="auto"/>
+                    <w:ind w:left="0" w:right="0" w:firstLine="0"/>
+                  </w:pPr>
+                  <w:r>
+                    <w:rPr>
+                      <w:rFonts w:ascii="Deja Vu Sans" w:hAnsi="Deja Vu Sans" w:eastAsia="Deja Vu Sans" w:cs="Deja Vu Sans"/>
+                      <w:b w:val="0"/>
+                      <w:i w:val="0"/>
+                      <w:color w:val="000000"/>
+                      <w:sz w:val="21"/>
+                    </w:rPr>
+                    <w:t>Etiam vehicula luctus fermentum.</w:t>
+                  </w:r>
+                </w:p>
+              </w:txbxContent>
+            </v:textbox>
+          </v:shape>
+        </w:pict>
+      </w:r>
+      <w:r>
+        <w:pict>
+          <v:shape id="DocuMindTableCell65" type="#_x0000_t202" filled="f" stroked="t" strokecolor="#000000" strokeweight="0.75pt" o:allowincell="f" style="position:absolute;margin-left:376.250pt;margin-top:538.500pt;width:78.000pt;height:29.100pt;z-index:100;mso-position-horizontal-relative:page;mso-position-vertical-relative:page;mso-wrap-style:none;">
+            <w10:wrap type="none"/>
+            <v:textbox inset="2.0pt,1.0pt,2.0pt,1.0pt">
+              <w:txbxContent>
+                <w:p>
+                  <w:pPr>
+                    <w:spacing w:before="0" w:after="0" w:line="240" w:lineRule="auto"/>
+                    <w:ind w:left="0" w:right="0" w:firstLine="0"/>
+                  </w:pPr>
+                  <w:r>
+                    <w:rPr>
+                      <w:rFonts w:ascii="Deja Vu Sans" w:hAnsi="Deja Vu Sans" w:eastAsia="Deja Vu Sans" w:cs="Deja Vu Sans"/>
+                      <w:b w:val="0"/>
+                      <w:i w:val="0"/>
+                      <w:color w:val="000000"/>
+                      <w:sz w:val="21"/>
+                    </w:rPr>
+                    <w:t>Ipsum</w:t>
+                  </w:r>
+                </w:p>
+              </w:txbxContent>
+            </v:textbox>
+          </v:shape>
+        </w:pict>
+      </w:r>
+      <w:r>
+        <w:pict>
+          <v:shape id="DocuMindTableCell66" type="#_x0000_t202" filled="f" stroked="t" strokecolor="#000000" strokeweight="0.75pt" o:allowincell="f" style="position:absolute;margin-left:454.250pt;margin-top:538.500pt;width:84.864pt;height:29.100pt;z-index:100;mso-position-horizontal-relative:page;mso-position-vertical-relative:page;mso-wrap-style:none;">
             <w10:wrap type="none"/>
             <v:textbox inset="2.0pt,1.0pt,2.0pt,1.0pt">
               <w:txbxContent>
@@ -1952,7 +1793,6 @@
                       <w:rFonts w:ascii="Arial" w:hAnsi="Arial" w:eastAsia="Arial" w:cs="Arial"/>
                       <w:sz w:val="18"/>
                     </w:rPr>
-                    <w:t>5</w:t>
                   </w:r>
                 </w:p>
               </w:txbxContent>
@@ -1962,510 +1802,7 @@
       </w:r>
       <w:r>
         <w:pict>
-          <v:shape id="DocuMindTableCell68" type="#_x0000_t202" filled="f" stroked="t" strokecolor="#000000" strokeweight="0.75pt" o:allowincell="f" style="position:absolute;margin-left:454.250pt;margin-top:538.500pt;width:84.864pt;height:29.100pt;z-index:100;mso-position-horizontal-relative:page;mso-position-vertical-relative:page;mso-wrap-style:none;">
-            <w10:wrap type="none"/>
-            <v:textbox inset="2.0pt,1.0pt,2.0pt,1.0pt">
-              <w:txbxContent>
-                <w:p>
-                  <w:pPr>
-                    <w:spacing w:before="0" w:after="0" w:line="240" w:lineRule="auto"/>
-                    <w:ind w:left="0" w:right="0" w:firstLine="0"/>
-                  </w:pPr>
-                  <w:r>
-                    <w:rPr>
-                      <w:rFonts w:ascii="Arial" w:hAnsi="Arial" w:eastAsia="Arial" w:cs="Arial"/>
-                      <w:sz w:val="18"/>
-                    </w:rPr>
-                    <w:t>Etiam vehicula luctus fermentum.</w:t>
-                  </w:r>
-                </w:p>
-              </w:txbxContent>
-            </v:textbox>
-          </v:shape>
-        </w:pict>
-      </w:r>
-    </w:p>
-    <w:p>
-      <w:pPr>
-        <w:sectPr>
-          <w:pgSz w:w="11900" w:h="16840"/>
-          <w:pgMar w:top="0" w:right="0" w:bottom="0" w:left="0" w:header="0" w:footer="0" w:gutter="0"/>
-          <w:cols w:space="720"/>
-          <w:docGrid w:linePitch="360"/>
-        </w:sectPr>
-      </w:pPr>
-    </w:p>
-    <w:p>
-      <w:pPr>
-        <w:spacing w:before="0" w:after="0" w:lineRule="exact" w:line="20"/>
-      </w:pPr>
-      <w:r>
-        <w:rPr>
-          <w:sz w:val="2"/>
-        </w:rPr>
-      </w:r>
-      <w:r>
-        <w:pict>
-          <v:shape id="DocuMindTextBox69" type="#_x0000_t202" stroked="f" filled="f" o:allowincell="f" style="position:absolute;margin-left:74.800pt;margin-top:55.810pt;width:449.616pt;height:28.500pt;z-index:251659264;mso-position-horizontal-relative:page;mso-position-vertical-relative:page;mso-wrap-style:none;mso-fit-shape-to-text:t;">
-            <w10:wrap type="none"/>
-            <v:textbox inset="0,0,0,0">
-              <w:txbxContent>
-                <w:p>
-                  <w:pPr>
-                    <w:spacing w:before="0" w:after="0" w:lineRule="exact" w:line="450"/>
-                    <w:ind w:left="0" w:right="0" w:firstLine="0"/>
-                  </w:pPr>
-                  <w:r>
-                    <w:rPr>
-                      <w:rFonts w:ascii="Liberation Sans" w:hAnsi="Liberation Sans" w:eastAsia="Liberation Sans" w:cs="Liberation Sans"/>
-                      <w:b/>
-                      <w:i w:val="0"/>
-                      <w:color w:val="000000"/>
-                      <w:sz w:val="36"/>
-                    </w:rPr>
-                    <w:t xml:space="preserve">Lorem ipsum dolor sit amet, consectetur adipiscing </w:t>
-                  </w:r>
-                </w:p>
-              </w:txbxContent>
-            </v:textbox>
-          </v:shape>
-        </w:pict>
-      </w:r>
-      <w:r>
-        <w:pict>
-          <v:shape id="DocuMindTextBox70" type="#_x0000_t202" stroked="f" filled="f" o:allowincell="f" style="position:absolute;margin-left:96.400pt;margin-top:76.510pt;width:38.946pt;height:28.500pt;z-index:251659264;mso-position-horizontal-relative:page;mso-position-vertical-relative:page;mso-wrap-style:none;mso-fit-shape-to-text:t;">
-            <w10:wrap type="none"/>
-            <v:textbox inset="0,0,0,0">
-              <w:txbxContent>
-                <w:p>
-                  <w:pPr>
-                    <w:spacing w:before="0" w:after="0" w:lineRule="exact" w:line="450"/>
-                    <w:ind w:left="0" w:right="0" w:firstLine="0"/>
-                  </w:pPr>
-                  <w:r>
-                    <w:rPr>
-                      <w:rFonts w:ascii="Liberation Sans" w:hAnsi="Liberation Sans" w:eastAsia="Liberation Sans" w:cs="Liberation Sans"/>
-                      <w:b/>
-                      <w:i w:val="0"/>
-                      <w:color w:val="000000"/>
-                      <w:sz w:val="36"/>
-                    </w:rPr>
-                    <w:t xml:space="preserve">elit. </w:t>
-                  </w:r>
-                </w:p>
-              </w:txbxContent>
-            </v:textbox>
-          </v:shape>
-        </w:pict>
-      </w:r>
-      <w:r>
-        <w:pict>
-          <v:shape id="DocuMindTextBox71" type="#_x0000_t202" stroked="f" filled="f" o:allowincell="f" style="position:absolute;margin-left:56.800pt;margin-top:128.556pt;width:484.141pt;height:19.125pt;z-index:251659264;mso-position-horizontal-relative:page;mso-position-vertical-relative:page;mso-wrap-style:none;mso-fit-shape-to-text:t;">
-            <w10:wrap type="none"/>
-            <v:textbox inset="0,0,0,0">
-              <w:txbxContent>
-                <w:p>
-                  <w:pPr>
-                    <w:spacing w:before="0" w:after="0" w:lineRule="exact" w:line="262"/>
-                    <w:ind w:left="0" w:right="0" w:firstLine="0"/>
-                  </w:pPr>
-                  <w:r>
-                    <w:rPr>
-                      <w:rFonts w:ascii="Deja Vu Sans" w:hAnsi="Deja Vu Sans" w:eastAsia="Deja Vu Sans" w:cs="Deja Vu Sans"/>
-                      <w:b w:val="0"/>
-                      <w:i w:val="0"/>
-                      <w:color w:val="000000"/>
-                      <w:sz w:val="21"/>
-                    </w:rPr>
-                    <w:t>Nunc ac faucibus odio. Vestibulum neque massa, scelerisque sit amet ligula eu, congue</w:t>
-                  </w:r>
-                </w:p>
-              </w:txbxContent>
-            </v:textbox>
-          </v:shape>
-        </w:pict>
-      </w:r>
-      <w:r>
-        <w:pict>
-          <v:shape id="DocuMindTextBox72" type="#_x0000_t202" stroked="f" filled="f" o:allowincell="f" style="position:absolute;margin-left:56.800pt;margin-top:143.256pt;width:484.068pt;height:19.125pt;z-index:251659264;mso-position-horizontal-relative:page;mso-position-vertical-relative:page;mso-wrap-style:none;mso-fit-shape-to-text:t;">
-            <w10:wrap type="none"/>
-            <v:textbox inset="0,0,0,0">
-              <w:txbxContent>
-                <w:p>
-                  <w:pPr>
-                    <w:spacing w:before="0" w:after="0" w:lineRule="exact" w:line="262"/>
-                    <w:ind w:left="0" w:right="0" w:firstLine="0"/>
-                  </w:pPr>
-                  <w:r>
-                    <w:rPr>
-                      <w:rFonts w:ascii="Deja Vu Sans" w:hAnsi="Deja Vu Sans" w:eastAsia="Deja Vu Sans" w:cs="Deja Vu Sans"/>
-                      <w:b w:val="0"/>
-                      <w:i w:val="0"/>
-                      <w:color w:val="000000"/>
-                      <w:sz w:val="21"/>
-                    </w:rPr>
-                    <w:t>molestie mi. Praesent ut varius sem. Nullam at porttitor arcu, nec lacinia nisi. Ut ac dolor</w:t>
-                  </w:r>
-                </w:p>
-              </w:txbxContent>
-            </v:textbox>
-          </v:shape>
-        </w:pict>
-      </w:r>
-      <w:r>
-        <w:pict>
-          <v:shape id="DocuMindTextBox73" type="#_x0000_t202" stroked="f" filled="f" o:allowincell="f" style="position:absolute;margin-left:56.800pt;margin-top:157.956pt;width:484.278pt;height:19.125pt;z-index:251659264;mso-position-horizontal-relative:page;mso-position-vertical-relative:page;mso-wrap-style:none;mso-fit-shape-to-text:t;">
-            <w10:wrap type="none"/>
-            <v:textbox inset="0,0,0,0">
-              <w:txbxContent>
-                <w:p>
-                  <w:pPr>
-                    <w:spacing w:before="0" w:after="0" w:lineRule="exact" w:line="262"/>
-                    <w:ind w:left="0" w:right="0" w:firstLine="0"/>
-                  </w:pPr>
-                  <w:r>
-                    <w:rPr>
-                      <w:rFonts w:ascii="Deja Vu Sans" w:hAnsi="Deja Vu Sans" w:eastAsia="Deja Vu Sans" w:cs="Deja Vu Sans"/>
-                      <w:b w:val="0"/>
-                      <w:i w:val="0"/>
-                      <w:color w:val="000000"/>
-                      <w:sz w:val="21"/>
-                    </w:rPr>
-                    <w:t>vitae odio interdum condimentum. Vivamus dapibus sodales ex, vitae malesuada ipsum</w:t>
-                  </w:r>
-                </w:p>
-              </w:txbxContent>
-            </v:textbox>
-          </v:shape>
-        </w:pict>
-      </w:r>
-      <w:r>
-        <w:pict>
-          <v:shape id="DocuMindTextBox74" type="#_x0000_t202" stroked="f" filled="f" o:allowincell="f" style="position:absolute;margin-left:56.800pt;margin-top:172.656pt;width:484.341pt;height:19.125pt;z-index:251659264;mso-position-horizontal-relative:page;mso-position-vertical-relative:page;mso-wrap-style:none;mso-fit-shape-to-text:t;">
-            <w10:wrap type="none"/>
-            <v:textbox inset="0,0,0,0">
-              <w:txbxContent>
-                <w:p>
-                  <w:pPr>
-                    <w:spacing w:before="0" w:after="0" w:lineRule="exact" w:line="262"/>
-                    <w:ind w:left="0" w:right="0" w:firstLine="0"/>
-                  </w:pPr>
-                  <w:r>
-                    <w:rPr>
-                      <w:rFonts w:ascii="Deja Vu Sans" w:hAnsi="Deja Vu Sans" w:eastAsia="Deja Vu Sans" w:cs="Deja Vu Sans"/>
-                      <w:b w:val="0"/>
-                      <w:i w:val="0"/>
-                      <w:color w:val="000000"/>
-                      <w:sz w:val="21"/>
-                    </w:rPr>
-                    <w:t>cursus convallis. Maecenas sed egestas nulla, ac condimentum orci. Mauris diam felis,</w:t>
-                  </w:r>
-                </w:p>
-              </w:txbxContent>
-            </v:textbox>
-          </v:shape>
-        </w:pict>
-      </w:r>
-      <w:r>
-        <w:pict>
-          <v:shape id="DocuMindTextBox75" type="#_x0000_t202" stroked="f" filled="f" o:allowincell="f" style="position:absolute;margin-left:56.800pt;margin-top:187.356pt;width:483.847pt;height:19.125pt;z-index:251659264;mso-position-horizontal-relative:page;mso-position-vertical-relative:page;mso-wrap-style:none;mso-fit-shape-to-text:t;">
-            <w10:wrap type="none"/>
-            <v:textbox inset="0,0,0,0">
-              <w:txbxContent>
-                <w:p>
-                  <w:pPr>
-                    <w:spacing w:before="0" w:after="0" w:lineRule="exact" w:line="262"/>
-                    <w:ind w:left="0" w:right="0" w:firstLine="0"/>
-                  </w:pPr>
-                  <w:r>
-                    <w:rPr>
-                      <w:rFonts w:ascii="Deja Vu Sans" w:hAnsi="Deja Vu Sans" w:eastAsia="Deja Vu Sans" w:cs="Deja Vu Sans"/>
-                      <w:b w:val="0"/>
-                      <w:i w:val="0"/>
-                      <w:color w:val="000000"/>
-                      <w:sz w:val="21"/>
-                    </w:rPr>
-                    <w:t>vulputate ac suscipit et, iaculis non est. Curabitur semper arcu ac ligula semper, nec luctus</w:t>
-                  </w:r>
-                </w:p>
-              </w:txbxContent>
-            </v:textbox>
-          </v:shape>
-        </w:pict>
-      </w:r>
-      <w:r>
-        <w:pict>
-          <v:shape id="DocuMindTextBox76" type="#_x0000_t202" stroked="f" filled="f" o:allowincell="f" style="position:absolute;margin-left:56.800pt;margin-top:202.056pt;width:484.152pt;height:19.125pt;z-index:251659264;mso-position-horizontal-relative:page;mso-position-vertical-relative:page;mso-wrap-style:none;mso-fit-shape-to-text:t;">
-            <w10:wrap type="none"/>
-            <v:textbox inset="0,0,0,0">
-              <w:txbxContent>
-                <w:p>
-                  <w:pPr>
-                    <w:spacing w:before="0" w:after="0" w:lineRule="exact" w:line="262"/>
-                    <w:ind w:left="0" w:right="0" w:firstLine="0"/>
-                  </w:pPr>
-                  <w:r>
-                    <w:rPr>
-                      <w:rFonts w:ascii="Deja Vu Sans" w:hAnsi="Deja Vu Sans" w:eastAsia="Deja Vu Sans" w:cs="Deja Vu Sans"/>
-                      <w:b w:val="0"/>
-                      <w:i w:val="0"/>
-                      <w:color w:val="000000"/>
-                      <w:sz w:val="21"/>
-                    </w:rPr>
-                    <w:t>nisl blandit. Integer lacinia ante ac libero lobortis imperdiet. Nullam mollis convallis ipsum,</w:t>
-                  </w:r>
-                </w:p>
-              </w:txbxContent>
-            </v:textbox>
-          </v:shape>
-        </w:pict>
-      </w:r>
-      <w:r>
-        <w:pict>
-          <v:shape id="DocuMindTextBox77" type="#_x0000_t202" stroked="f" filled="f" o:allowincell="f" style="position:absolute;margin-left:56.800pt;margin-top:216.756pt;width:483.795pt;height:19.125pt;z-index:251659264;mso-position-horizontal-relative:page;mso-position-vertical-relative:page;mso-wrap-style:none;mso-fit-shape-to-text:t;">
-            <w10:wrap type="none"/>
-            <v:textbox inset="0,0,0,0">
-              <w:txbxContent>
-                <w:p>
-                  <w:pPr>
-                    <w:spacing w:before="0" w:after="0" w:lineRule="exact" w:line="262"/>
-                    <w:ind w:left="0" w:right="0" w:firstLine="0"/>
-                  </w:pPr>
-                  <w:r>
-                    <w:rPr>
-                      <w:rFonts w:ascii="Deja Vu Sans" w:hAnsi="Deja Vu Sans" w:eastAsia="Deja Vu Sans" w:cs="Deja Vu Sans"/>
-                      <w:b w:val="0"/>
-                      <w:i w:val="0"/>
-                      <w:color w:val="000000"/>
-                      <w:sz w:val="21"/>
-                    </w:rPr>
-                    <w:t>ac accumsan nunc vehicula vitae. Nulla eget justo in felis tristique fringilla. Morbi sit amet</w:t>
-                  </w:r>
-                </w:p>
-              </w:txbxContent>
-            </v:textbox>
-          </v:shape>
-        </w:pict>
-      </w:r>
-      <w:r>
-        <w:pict>
-          <v:shape id="DocuMindTextBox78" type="#_x0000_t202" stroked="f" filled="f" o:allowincell="f" style="position:absolute;margin-left:56.800pt;margin-top:231.456pt;width:483.879pt;height:19.125pt;z-index:251659264;mso-position-horizontal-relative:page;mso-position-vertical-relative:page;mso-wrap-style:none;mso-fit-shape-to-text:t;">
-            <w10:wrap type="none"/>
-            <v:textbox inset="0,0,0,0">
-              <w:txbxContent>
-                <w:p>
-                  <w:pPr>
-                    <w:spacing w:before="0" w:after="0" w:lineRule="exact" w:line="262"/>
-                    <w:ind w:left="0" w:right="0" w:firstLine="0"/>
-                  </w:pPr>
-                  <w:r>
-                    <w:rPr>
-                      <w:rFonts w:ascii="Deja Vu Sans" w:hAnsi="Deja Vu Sans" w:eastAsia="Deja Vu Sans" w:cs="Deja Vu Sans"/>
-                      <w:b w:val="0"/>
-                      <w:i w:val="0"/>
-                      <w:color w:val="000000"/>
-                      <w:sz w:val="21"/>
-                    </w:rPr>
-                    <w:t>tortor quis risus auctor condimentum. Morbi in ullamcorper elit. Nulla iaculis tellus sit amet</w:t>
-                  </w:r>
-                </w:p>
-              </w:txbxContent>
-            </v:textbox>
-          </v:shape>
-        </w:pict>
-      </w:r>
-      <w:r>
-        <w:pict>
-          <v:shape id="DocuMindTextBox79" type="#_x0000_t202" stroked="f" filled="f" o:allowincell="f" style="position:absolute;margin-left:56.800pt;margin-top:246.156pt;width:127.950pt;height:19.125pt;z-index:251659264;mso-position-horizontal-relative:page;mso-position-vertical-relative:page;mso-wrap-style:none;mso-fit-shape-to-text:t;">
-            <w10:wrap type="none"/>
-            <v:textbox inset="0,0,0,0">
-              <w:txbxContent>
-                <w:p>
-                  <w:pPr>
-                    <w:spacing w:before="0" w:after="0" w:lineRule="exact" w:line="262"/>
-                    <w:ind w:left="0" w:right="0" w:firstLine="0"/>
-                  </w:pPr>
-                  <w:r>
-                    <w:rPr>
-                      <w:rFonts w:ascii="Deja Vu Sans" w:hAnsi="Deja Vu Sans" w:eastAsia="Deja Vu Sans" w:cs="Deja Vu Sans"/>
-                      <w:b w:val="0"/>
-                      <w:i w:val="0"/>
-                      <w:color w:val="000000"/>
-                      <w:sz w:val="21"/>
-                    </w:rPr>
-                    <w:t>mauris tempus fringilla.</w:t>
-                  </w:r>
-                </w:p>
-              </w:txbxContent>
-            </v:textbox>
-          </v:shape>
-        </w:pict>
-      </w:r>
-      <w:r>
-        <w:pict>
-          <v:shape id="DocuMindTextBox80" type="#_x0000_t202" stroked="f" filled="f" o:allowincell="f" style="position:absolute;margin-left:74.800pt;margin-top:282.620pt;width:439.128pt;height:26.000pt;z-index:251659264;mso-position-horizontal-relative:page;mso-position-vertical-relative:page;mso-wrap-style:none;mso-fit-shape-to-text:t;">
-            <w10:wrap type="none"/>
-            <v:textbox inset="0,0,0,0">
-              <w:txbxContent>
-                <w:p>
-                  <w:pPr>
-                    <w:spacing w:before="0" w:after="0" w:lineRule="exact" w:line="400"/>
-                    <w:ind w:left="0" w:right="0" w:firstLine="0"/>
-                  </w:pPr>
-                  <w:r>
-                    <w:rPr>
-                      <w:rFonts w:ascii="Liberation Sans" w:hAnsi="Liberation Sans" w:eastAsia="Liberation Sans" w:cs="Liberation Sans"/>
-                      <w:b/>
-                      <w:i w:val="0"/>
-                      <w:color w:val="000000"/>
-                      <w:sz w:val="32"/>
-                    </w:rPr>
-                    <w:t xml:space="preserve">Maecenas mauris lectus, lobortis et purus mattis, blandit </w:t>
-                  </w:r>
-                </w:p>
-              </w:txbxContent>
-            </v:textbox>
-          </v:shape>
-        </w:pict>
-      </w:r>
-      <w:r>
-        <w:pict>
-          <v:shape id="DocuMindTextBox81" type="#_x0000_t202" stroked="f" filled="f" o:allowincell="f" style="position:absolute;margin-left:103.600pt;margin-top:301.020pt;width:110.440pt;height:26.000pt;z-index:251659264;mso-position-horizontal-relative:page;mso-position-vertical-relative:page;mso-wrap-style:none;mso-fit-shape-to-text:t;">
-            <w10:wrap type="none"/>
-            <v:textbox inset="0,0,0,0">
-              <w:txbxContent>
-                <w:p>
-                  <w:pPr>
-                    <w:spacing w:before="0" w:after="0" w:lineRule="exact" w:line="400"/>
-                    <w:ind w:left="0" w:right="0" w:firstLine="0"/>
-                  </w:pPr>
-                  <w:r>
-                    <w:rPr>
-                      <w:rFonts w:ascii="Liberation Sans" w:hAnsi="Liberation Sans" w:eastAsia="Liberation Sans" w:cs="Liberation Sans"/>
-                      <w:b/>
-                      <w:i w:val="0"/>
-                      <w:color w:val="000000"/>
-                      <w:sz w:val="32"/>
-                    </w:rPr>
-                    <w:t xml:space="preserve">dictum tellus. </w:t>
-                  </w:r>
-                </w:p>
-              </w:txbxContent>
-            </v:textbox>
-          </v:shape>
-        </w:pict>
-      </w:r>
-      <w:r>
-        <w:pict>
-          <v:shape id="DocuMindTextBox82" type="#_x0000_t202" stroked="f" filled="f" o:allowincell="f" style="position:absolute;margin-left:56.800pt;margin-top:324.956pt;width:483.890pt;height:19.125pt;z-index:251659264;mso-position-horizontal-relative:page;mso-position-vertical-relative:page;mso-wrap-style:none;mso-fit-shape-to-text:t;">
-            <w10:wrap type="none"/>
-            <v:textbox inset="0,0,0,0">
-              <w:txbxContent>
-                <w:p>
-                  <w:pPr>
-                    <w:spacing w:before="0" w:after="0" w:lineRule="exact" w:line="262"/>
-                    <w:ind w:left="0" w:right="0" w:firstLine="0"/>
-                  </w:pPr>
-                  <w:r>
-                    <w:rPr>
-                      <w:rFonts w:ascii="Deja Vu Sans" w:hAnsi="Deja Vu Sans" w:eastAsia="Deja Vu Sans" w:cs="Deja Vu Sans"/>
-                      <w:b w:val="0"/>
-                      <w:i w:val="0"/>
-                      <w:color w:val="000000"/>
-                      <w:sz w:val="21"/>
-                    </w:rPr>
-                    <w:t>Maecenas non lorem quis tellus placerat varius. Nulla facilisi. Aenean congue fringilla justo</w:t>
-                  </w:r>
-                </w:p>
-              </w:txbxContent>
-            </v:textbox>
-          </v:shape>
-        </w:pict>
-      </w:r>
-      <w:r>
-        <w:pict>
-          <v:shape id="DocuMindTextBox83" type="#_x0000_t202" stroked="f" filled="f" o:allowincell="f" style="position:absolute;margin-left:56.800pt;margin-top:339.656pt;width:483.858pt;height:19.125pt;z-index:251659264;mso-position-horizontal-relative:page;mso-position-vertical-relative:page;mso-wrap-style:none;mso-fit-shape-to-text:t;">
-            <w10:wrap type="none"/>
-            <v:textbox inset="0,0,0,0">
-              <w:txbxContent>
-                <w:p>
-                  <w:pPr>
-                    <w:spacing w:before="0" w:after="0" w:lineRule="exact" w:line="262"/>
-                    <w:ind w:left="0" w:right="0" w:firstLine="0"/>
-                  </w:pPr>
-                  <w:r>
-                    <w:rPr>
-                      <w:rFonts w:ascii="Deja Vu Sans" w:hAnsi="Deja Vu Sans" w:eastAsia="Deja Vu Sans" w:cs="Deja Vu Sans"/>
-                      <w:b w:val="0"/>
-                      <w:i w:val="0"/>
-                      <w:color w:val="000000"/>
-                      <w:sz w:val="21"/>
-                    </w:rPr>
-                    <w:t>ut aliquam. Mauris id ex erat. Nunc vulputate neque vitae justo facilisis, non condimentum</w:t>
-                  </w:r>
-                </w:p>
-              </w:txbxContent>
-            </v:textbox>
-          </v:shape>
-        </w:pict>
-      </w:r>
-      <w:r>
-        <w:pict>
-          <v:shape id="DocuMindTextBox84" type="#_x0000_t202" stroked="f" filled="f" o:allowincell="f" style="position:absolute;margin-left:56.800pt;margin-top:354.356pt;width:484.404pt;height:19.125pt;z-index:251659264;mso-position-horizontal-relative:page;mso-position-vertical-relative:page;mso-wrap-style:none;mso-fit-shape-to-text:t;">
-            <w10:wrap type="none"/>
-            <v:textbox inset="0,0,0,0">
-              <w:txbxContent>
-                <w:p>
-                  <w:pPr>
-                    <w:spacing w:before="0" w:after="0" w:lineRule="exact" w:line="262"/>
-                    <w:ind w:left="0" w:right="0" w:firstLine="0"/>
-                  </w:pPr>
-                  <w:r>
-                    <w:rPr>
-                      <w:rFonts w:ascii="Deja Vu Sans" w:hAnsi="Deja Vu Sans" w:eastAsia="Deja Vu Sans" w:cs="Deja Vu Sans"/>
-                      <w:b w:val="0"/>
-                      <w:i w:val="0"/>
-                      <w:color w:val="000000"/>
-                      <w:sz w:val="21"/>
-                    </w:rPr>
-                    <w:t>ante sagittis. Morbi viverra semper lorem nec molestie. Maecenas tincidunt est efficitur</w:t>
-                  </w:r>
-                </w:p>
-              </w:txbxContent>
-            </v:textbox>
-          </v:shape>
-        </w:pict>
-      </w:r>
-      <w:r>
-        <w:pict>
-          <v:shape id="DocuMindTextBox85" type="#_x0000_t202" stroked="f" filled="f" o:allowincell="f" style="position:absolute;margin-left:56.800pt;margin-top:369.056pt;width:242.999pt;height:19.125pt;z-index:251659264;mso-position-horizontal-relative:page;mso-position-vertical-relative:page;mso-wrap-style:none;mso-fit-shape-to-text:t;">
-            <w10:wrap type="none"/>
-            <v:textbox inset="0,0,0,0">
-              <w:txbxContent>
-                <w:p>
-                  <w:pPr>
-                    <w:spacing w:before="0" w:after="0" w:lineRule="exact" w:line="262"/>
-                    <w:ind w:left="0" w:right="0" w:firstLine="0"/>
-                  </w:pPr>
-                  <w:r>
-                    <w:rPr>
-                      <w:rFonts w:ascii="Deja Vu Sans" w:hAnsi="Deja Vu Sans" w:eastAsia="Deja Vu Sans" w:cs="Deja Vu Sans"/>
-                      <w:b w:val="0"/>
-                      <w:i w:val="0"/>
-                      <w:color w:val="000000"/>
-                      <w:sz w:val="21"/>
-                    </w:rPr>
-                    <w:t>ligula euismod, sit amet ornare est vulputate.</w:t>
-                  </w:r>
-                </w:p>
-              </w:txbxContent>
-            </v:textbox>
-          </v:shape>
-        </w:pict>
-      </w:r>
-      <w:r>
-        <w:pict>
-          <v:shape id="DocuMindTextBox86" type="#_x0000_t202" stroked="f" filled="f" o:allowincell="f" style="position:absolute;margin-left:56.800pt;margin-top:394.956pt;width:483.669pt;height:19.125pt;z-index:251659264;mso-position-horizontal-relative:page;mso-position-vertical-relative:page;mso-wrap-style:none;mso-fit-shape-to-text:t;">
+          <v:shape id="DocuMindTextBox67" type="#_x0000_t202" stroked="f" filled="f" o:allowincell="f" style="position:absolute;margin-left:56.800pt;margin-top:81.156pt;width:483.669pt;height:19.125pt;z-index:251659264;mso-position-horizontal-relative:page;mso-position-vertical-relative:page;mso-wrap-style:none;mso-fit-shape-to-text:t;">
             <w10:wrap type="none"/>
             <v:textbox inset="0,0,0,0">
               <w:txbxContent>
@@ -2492,7 +1829,7 @@
       </w:r>
       <w:r>
         <w:pict>
-          <v:shape id="DocuMindTextBox87" type="#_x0000_t202" stroked="f" filled="f" o:allowincell="f" style="position:absolute;margin-left:56.800pt;margin-top:409.656pt;width:484.110pt;height:19.125pt;z-index:251659264;mso-position-horizontal-relative:page;mso-position-vertical-relative:page;mso-wrap-style:none;mso-fit-shape-to-text:t;">
+          <v:shape id="DocuMindTextBox68" type="#_x0000_t202" stroked="f" filled="f" o:allowincell="f" style="position:absolute;margin-left:56.800pt;margin-top:95.856pt;width:484.110pt;height:19.125pt;z-index:251659264;mso-position-horizontal-relative:page;mso-position-vertical-relative:page;mso-wrap-style:none;mso-fit-shape-to-text:t;">
             <w10:wrap type="none"/>
             <v:textbox inset="0,0,0,0">
               <w:txbxContent>
@@ -2519,7 +1856,7 @@
       </w:r>
       <w:r>
         <w:pict>
-          <v:shape id="DocuMindTextBox88" type="#_x0000_t202" stroked="f" filled="f" o:allowincell="f" style="position:absolute;margin-left:56.800pt;margin-top:424.356pt;width:484.036pt;height:19.125pt;z-index:251659264;mso-position-horizontal-relative:page;mso-position-vertical-relative:page;mso-wrap-style:none;mso-fit-shape-to-text:t;">
+          <v:shape id="DocuMindTextBox69" type="#_x0000_t202" stroked="f" filled="f" o:allowincell="f" style="position:absolute;margin-left:56.800pt;margin-top:110.556pt;width:484.036pt;height:19.125pt;z-index:251659264;mso-position-horizontal-relative:page;mso-position-vertical-relative:page;mso-wrap-style:none;mso-fit-shape-to-text:t;">
             <w10:wrap type="none"/>
             <v:textbox inset="0,0,0,0">
               <w:txbxContent>
@@ -2546,7 +1883,7 @@
       </w:r>
       <w:r>
         <w:pict>
-          <v:shape id="DocuMindTextBox89" type="#_x0000_t202" stroked="f" filled="f" o:allowincell="f" style="position:absolute;margin-left:56.800pt;margin-top:439.056pt;width:483.837pt;height:19.125pt;z-index:251659264;mso-position-horizontal-relative:page;mso-position-vertical-relative:page;mso-wrap-style:none;mso-fit-shape-to-text:t;">
+          <v:shape id="DocuMindTextBox70" type="#_x0000_t202" stroked="f" filled="f" o:allowincell="f" style="position:absolute;margin-left:56.800pt;margin-top:125.256pt;width:483.837pt;height:19.125pt;z-index:251659264;mso-position-horizontal-relative:page;mso-position-vertical-relative:page;mso-wrap-style:none;mso-fit-shape-to-text:t;">
             <w10:wrap type="none"/>
             <v:textbox inset="0,0,0,0">
               <w:txbxContent>
@@ -2573,7 +1910,7 @@
       </w:r>
       <w:r>
         <w:pict>
-          <v:shape id="DocuMindTextBox90" type="#_x0000_t202" stroked="f" filled="f" o:allowincell="f" style="position:absolute;margin-left:56.800pt;margin-top:453.756pt;width:483.847pt;height:19.125pt;z-index:251659264;mso-position-horizontal-relative:page;mso-position-vertical-relative:page;mso-wrap-style:none;mso-fit-shape-to-text:t;">
+          <v:shape id="DocuMindTextBox71" type="#_x0000_t202" stroked="f" filled="f" o:allowincell="f" style="position:absolute;margin-left:56.800pt;margin-top:139.956pt;width:483.847pt;height:19.125pt;z-index:251659264;mso-position-horizontal-relative:page;mso-position-vertical-relative:page;mso-wrap-style:none;mso-fit-shape-to-text:t;">
             <w10:wrap type="none"/>
             <v:textbox inset="0,0,0,0">
               <w:txbxContent>
@@ -2600,7 +1937,7 @@
       </w:r>
       <w:r>
         <w:pict>
-          <v:shape id="DocuMindTextBox91" type="#_x0000_t202" stroked="f" filled="f" o:allowincell="f" style="position:absolute;margin-left:56.800pt;margin-top:468.456pt;width:484.173pt;height:19.125pt;z-index:251659264;mso-position-horizontal-relative:page;mso-position-vertical-relative:page;mso-wrap-style:none;mso-fit-shape-to-text:t;">
+          <v:shape id="DocuMindTextBox72" type="#_x0000_t202" stroked="f" filled="f" o:allowincell="f" style="position:absolute;margin-left:56.800pt;margin-top:154.656pt;width:484.173pt;height:19.125pt;z-index:251659264;mso-position-horizontal-relative:page;mso-position-vertical-relative:page;mso-wrap-style:none;mso-fit-shape-to-text:t;">
             <w10:wrap type="none"/>
             <v:textbox inset="0,0,0,0">
               <w:txbxContent>
@@ -2627,7 +1964,7 @@
       </w:r>
       <w:r>
         <w:pict>
-          <v:shape id="DocuMindTextBox92" type="#_x0000_t202" stroked="f" filled="f" o:allowincell="f" style="position:absolute;margin-left:56.800pt;margin-top:483.156pt;width:253.803pt;height:19.125pt;z-index:251659264;mso-position-horizontal-relative:page;mso-position-vertical-relative:page;mso-wrap-style:none;mso-fit-shape-to-text:t;">
+          <v:shape id="DocuMindTextBox73" type="#_x0000_t202" stroked="f" filled="f" o:allowincell="f" style="position:absolute;margin-left:56.800pt;margin-top:169.356pt;width:253.803pt;height:19.125pt;z-index:251659264;mso-position-horizontal-relative:page;mso-position-vertical-relative:page;mso-wrap-style:none;mso-fit-shape-to-text:t;">
             <w10:wrap type="none"/>
             <v:textbox inset="0,0,0,0">
               <w:txbxContent>
@@ -2654,34 +1991,7 @@
       </w:r>
       <w:r>
         <w:pict>
-          <v:shape id="DocuMindTextBox93" type="#_x0000_t202" stroked="f" filled="f" o:allowincell="f" style="position:absolute;margin-left:74.800pt;margin-top:519.620pt;width:375.176pt;height:26.000pt;z-index:251659264;mso-position-horizontal-relative:page;mso-position-vertical-relative:page;mso-wrap-style:none;mso-fit-shape-to-text:t;">
-            <w10:wrap type="none"/>
-            <v:textbox inset="0,0,0,0">
-              <w:txbxContent>
-                <w:p>
-                  <w:pPr>
-                    <w:spacing w:before="0" w:after="0" w:lineRule="exact" w:line="400"/>
-                    <w:ind w:left="0" w:right="0" w:firstLine="0"/>
-                  </w:pPr>
-                  <w:r>
-                    <w:rPr>
-                      <w:rFonts w:ascii="Liberation Sans" w:hAnsi="Liberation Sans" w:eastAsia="Liberation Sans" w:cs="Liberation Sans"/>
-                      <w:b/>
-                      <w:i w:val="0"/>
-                      <w:color w:val="000000"/>
-                      <w:sz w:val="32"/>
-                    </w:rPr>
-                    <w:t xml:space="preserve">In eleifend velit vitae libero sollicitudin euismod. </w:t>
-                  </w:r>
-                </w:p>
-              </w:txbxContent>
-            </v:textbox>
-          </v:shape>
-        </w:pict>
-      </w:r>
-      <w:r>
-        <w:pict>
-          <v:shape id="DocuMindTextBox94" type="#_x0000_t202" stroked="f" filled="f" o:allowincell="f" style="position:absolute;margin-left:56.800pt;margin-top:543.556pt;width:484.036pt;height:19.125pt;z-index:251659264;mso-position-horizontal-relative:page;mso-position-vertical-relative:page;mso-wrap-style:none;mso-fit-shape-to-text:t;">
+          <v:shape id="DocuMindTextBox74" type="#_x0000_t202" stroked="f" filled="f" o:allowincell="f" style="position:absolute;margin-left:56.800pt;margin-top:195.356pt;width:484.005pt;height:19.125pt;z-index:251659264;mso-position-horizontal-relative:page;mso-position-vertical-relative:page;mso-wrap-style:none;mso-fit-shape-to-text:t;">
             <w10:wrap type="none"/>
             <v:textbox inset="0,0,0,0">
               <w:txbxContent>
@@ -2698,7 +2008,7 @@
                       <w:color w:val="000000"/>
                       <w:sz w:val="21"/>
                     </w:rPr>
-                    <w:t>Fusce vitae vestibulum velit. Pellentesque vulputate lectus quis pellentesque commodo.</w:t>
+                    <w:t>In eleifend velit vitae libero sollicitudin euismod. Fusce vitae vestibulum velit. Pellentesque</w:t>
                   </w:r>
                 </w:p>
               </w:txbxContent>
@@ -2708,7 +2018,7 @@
       </w:r>
       <w:r>
         <w:pict>
-          <v:shape id="DocuMindTextBox95" type="#_x0000_t202" stroked="f" filled="f" o:allowincell="f" style="position:absolute;margin-left:56.800pt;margin-top:558.256pt;width:484.047pt;height:19.125pt;z-index:251659264;mso-position-horizontal-relative:page;mso-position-vertical-relative:page;mso-wrap-style:none;mso-fit-shape-to-text:t;">
+          <v:shape id="DocuMindTextBox75" type="#_x0000_t202" stroked="f" filled="f" o:allowincell="f" style="position:absolute;margin-left:56.800pt;margin-top:210.056pt;width:484.184pt;height:19.125pt;z-index:251659264;mso-position-horizontal-relative:page;mso-position-vertical-relative:page;mso-wrap-style:none;mso-fit-shape-to-text:t;">
             <w10:wrap type="none"/>
             <v:textbox inset="0,0,0,0">
               <w:txbxContent>
@@ -2725,7 +2035,7 @@
                       <w:color w:val="000000"/>
                       <w:sz w:val="21"/>
                     </w:rPr>
-                    <w:t>Aliquam erat volutpat. Vestibulum in egestas velit. Pellentesque fermentum nisl vitae</w:t>
+                    <w:t>vulputate lectus quis pellentesque commodo. Aliquam erat volutpat. Vestibulum in egestas</w:t>
                   </w:r>
                 </w:p>
               </w:txbxContent>
@@ -2735,7 +2045,7 @@
       </w:r>
       <w:r>
         <w:pict>
-          <v:shape id="DocuMindTextBox96" type="#_x0000_t202" stroked="f" filled="f" o:allowincell="f" style="position:absolute;margin-left:56.800pt;margin-top:572.956pt;width:484.520pt;height:19.125pt;z-index:251659264;mso-position-horizontal-relative:page;mso-position-vertical-relative:page;mso-wrap-style:none;mso-fit-shape-to-text:t;">
+          <v:shape id="DocuMindTextBox76" type="#_x0000_t202" stroked="f" filled="f" o:allowincell="f" style="position:absolute;margin-left:56.800pt;margin-top:224.756pt;width:484.163pt;height:19.125pt;z-index:251659264;mso-position-horizontal-relative:page;mso-position-vertical-relative:page;mso-wrap-style:none;mso-fit-shape-to-text:t;">
             <w10:wrap type="none"/>
             <v:textbox inset="0,0,0,0">
               <w:txbxContent>
@@ -2752,7 +2062,7 @@
                       <w:color w:val="000000"/>
                       <w:sz w:val="21"/>
                     </w:rPr>
-                    <w:t>fringilla venenatis. Etiam id mauris vitae orci maximus ultricies. Cras fringilla ipsum</w:t>
+                    <w:t>velit. Pellentesque fermentum nisl vitae fringilla venenatis. Etiam id mauris vitae orci</w:t>
                   </w:r>
                 </w:p>
               </w:txbxContent>
@@ -2762,7 +2072,7 @@
       </w:r>
       <w:r>
         <w:pict>
-          <v:shape id="DocuMindTextBox97" type="#_x0000_t202" stroked="f" filled="f" o:allowincell="f" style="position:absolute;margin-left:56.800pt;margin-top:587.656pt;width:186.509pt;height:19.125pt;z-index:251659264;mso-position-horizontal-relative:page;mso-position-vertical-relative:page;mso-wrap-style:none;mso-fit-shape-to-text:t;">
+          <v:shape id="DocuMindTextBox77" type="#_x0000_t202" stroked="f" filled="f" o:allowincell="f" style="position:absolute;margin-left:56.800pt;margin-top:239.456pt;width:102.550pt;height:19.125pt;z-index:251659264;mso-position-horizontal-relative:page;mso-position-vertical-relative:page;mso-wrap-style:none;mso-fit-shape-to-text:t;">
             <w10:wrap type="none"/>
             <v:textbox inset="0,0,0,0">
               <w:txbxContent>
@@ -2779,7 +2089,7 @@
                       <w:color w:val="000000"/>
                       <w:sz w:val="21"/>
                     </w:rPr>
-                    <w:t>magna, in fringilla dui commodo a.</w:t>
+                    <w:t xml:space="preserve">maximus ultricies. </w:t>
                   </w:r>
                 </w:p>
               </w:txbxContent>
@@ -2789,7 +2099,61 @@
       </w:r>
       <w:r>
         <w:pict>
-          <v:shape id="DocuMindTextBox98" type="#_x0000_t202" stroked="f" filled="f" o:allowincell="f" style="position:absolute;margin-left:56.800pt;margin-top:613.556pt;width:483.732pt;height:19.125pt;z-index:251659264;mso-position-horizontal-relative:page;mso-position-vertical-relative:page;mso-wrap-style:none;mso-fit-shape-to-text:t;">
+          <v:shape id="DocuMindTextBox78" type="#_x0000_t202" stroked="f" filled="f" o:allowincell="f" style="position:absolute;margin-left:74.800pt;margin-top:303.910pt;width:457.482pt;height:28.500pt;z-index:251659264;mso-position-horizontal-relative:page;mso-position-vertical-relative:page;mso-wrap-style:none;mso-fit-shape-to-text:t;">
+            <w10:wrap type="none"/>
+            <v:textbox inset="0,0,0,0">
+              <w:txbxContent>
+                <w:p>
+                  <w:pPr>
+                    <w:spacing w:before="0" w:after="0" w:lineRule="exact" w:line="450"/>
+                    <w:ind w:left="0" w:right="0" w:firstLine="0"/>
+                  </w:pPr>
+                  <w:r>
+                    <w:rPr>
+                      <w:rFonts w:ascii="Liberation Sans" w:hAnsi="Liberation Sans" w:eastAsia="Liberation Sans" w:cs="Liberation Sans"/>
+                      <w:b/>
+                      <w:i w:val="0"/>
+                      <w:color w:val="000000"/>
+                      <w:sz w:val="36"/>
+                    </w:rPr>
+                    <w:t xml:space="preserve">Cras fringilla ipsum magna, in fringilla dui commodo </w:t>
+                  </w:r>
+                </w:p>
+              </w:txbxContent>
+            </v:textbox>
+          </v:shape>
+        </w:pict>
+      </w:r>
+      <w:r>
+        <w:pict>
+          <v:shape id="DocuMindTextBox79" type="#_x0000_t202" stroked="f" filled="f" o:allowincell="f" style="position:absolute;margin-left:56.800pt;margin-top:324.610pt;width:17.994pt;height:28.500pt;z-index:251659264;mso-position-horizontal-relative:page;mso-position-vertical-relative:page;mso-wrap-style:none;mso-fit-shape-to-text:t;">
+            <w10:wrap type="none"/>
+            <v:textbox inset="0,0,0,0">
+              <w:txbxContent>
+                <w:p>
+                  <w:pPr>
+                    <w:spacing w:before="0" w:after="0" w:lineRule="exact" w:line="450"/>
+                    <w:ind w:left="0" w:right="0" w:firstLine="0"/>
+                  </w:pPr>
+                  <w:r>
+                    <w:rPr>
+                      <w:rFonts w:ascii="Liberation Sans" w:hAnsi="Liberation Sans" w:eastAsia="Liberation Sans" w:cs="Liberation Sans"/>
+                      <w:b/>
+                      <w:i w:val="0"/>
+                      <w:color w:val="000000"/>
+                      <w:sz w:val="36"/>
+                    </w:rPr>
+                    <w:t>a.</w:t>
+                  </w:r>
+                </w:p>
+              </w:txbxContent>
+            </v:textbox>
+          </v:shape>
+        </w:pict>
+      </w:r>
+      <w:r>
+        <w:pict>
+          <v:shape id="DocuMindTextBox80" type="#_x0000_t202" stroked="f" filled="f" o:allowincell="f" style="position:absolute;margin-left:56.800pt;margin-top:592.056pt;width:483.732pt;height:19.125pt;z-index:251659264;mso-position-horizontal-relative:page;mso-position-vertical-relative:page;mso-wrap-style:none;mso-fit-shape-to-text:t;">
             <w10:wrap type="none"/>
             <v:textbox inset="0,0,0,0">
               <w:txbxContent>
@@ -2816,7 +2180,7 @@
       </w:r>
       <w:r>
         <w:pict>
-          <v:shape id="DocuMindTextBox99" type="#_x0000_t202" stroked="f" filled="f" o:allowincell="f" style="position:absolute;margin-left:56.800pt;margin-top:628.256pt;width:484.299pt;height:19.125pt;z-index:251659264;mso-position-horizontal-relative:page;mso-position-vertical-relative:page;mso-wrap-style:none;mso-fit-shape-to-text:t;">
+          <v:shape id="DocuMindTextBox81" type="#_x0000_t202" stroked="f" filled="f" o:allowincell="f" style="position:absolute;margin-left:56.800pt;margin-top:606.756pt;width:484.299pt;height:19.125pt;z-index:251659264;mso-position-horizontal-relative:page;mso-position-vertical-relative:page;mso-wrap-style:none;mso-fit-shape-to-text:t;">
             <w10:wrap type="none"/>
             <v:textbox inset="0,0,0,0">
               <w:txbxContent>
@@ -2843,7 +2207,7 @@
       </w:r>
       <w:r>
         <w:pict>
-          <v:shape id="DocuMindTextBox100" type="#_x0000_t202" stroked="f" filled="f" o:allowincell="f" style="position:absolute;margin-left:56.800pt;margin-top:642.956pt;width:484.047pt;height:19.125pt;z-index:251659264;mso-position-horizontal-relative:page;mso-position-vertical-relative:page;mso-wrap-style:none;mso-fit-shape-to-text:t;">
+          <v:shape id="DocuMindTextBox82" type="#_x0000_t202" stroked="f" filled="f" o:allowincell="f" style="position:absolute;margin-left:56.800pt;margin-top:621.456pt;width:484.047pt;height:19.125pt;z-index:251659264;mso-position-horizontal-relative:page;mso-position-vertical-relative:page;mso-wrap-style:none;mso-fit-shape-to-text:t;">
             <w10:wrap type="none"/>
             <v:textbox inset="0,0,0,0">
               <w:txbxContent>
@@ -2870,7 +2234,7 @@
       </w:r>
       <w:r>
         <w:pict>
-          <v:shape id="DocuMindTextBox101" type="#_x0000_t202" stroked="f" filled="f" o:allowincell="f" style="position:absolute;margin-left:56.800pt;margin-top:657.656pt;width:484.498pt;height:19.125pt;z-index:251659264;mso-position-horizontal-relative:page;mso-position-vertical-relative:page;mso-wrap-style:none;mso-fit-shape-to-text:t;">
+          <v:shape id="DocuMindTextBox83" type="#_x0000_t202" stroked="f" filled="f" o:allowincell="f" style="position:absolute;margin-left:56.800pt;margin-top:636.156pt;width:484.498pt;height:19.125pt;z-index:251659264;mso-position-horizontal-relative:page;mso-position-vertical-relative:page;mso-wrap-style:none;mso-fit-shape-to-text:t;">
             <w10:wrap type="none"/>
             <v:textbox inset="0,0,0,0">
               <w:txbxContent>
@@ -2897,7 +2261,7 @@
       </w:r>
       <w:r>
         <w:pict>
-          <v:shape id="DocuMindTextBox102" type="#_x0000_t202" stroked="f" filled="f" o:allowincell="f" style="position:absolute;margin-left:56.800pt;margin-top:672.356pt;width:484.299pt;height:19.125pt;z-index:251659264;mso-position-horizontal-relative:page;mso-position-vertical-relative:page;mso-wrap-style:none;mso-fit-shape-to-text:t;">
+          <v:shape id="DocuMindTextBox84" type="#_x0000_t202" stroked="f" filled="f" o:allowincell="f" style="position:absolute;margin-left:56.800pt;margin-top:650.856pt;width:484.299pt;height:19.125pt;z-index:251659264;mso-position-horizontal-relative:page;mso-position-vertical-relative:page;mso-wrap-style:none;mso-fit-shape-to-text:t;">
             <w10:wrap type="none"/>
             <v:textbox inset="0,0,0,0">
               <w:txbxContent>
@@ -2924,7 +2288,7 @@
       </w:r>
       <w:r>
         <w:pict>
-          <v:shape id="DocuMindTextBox103" type="#_x0000_t202" stroked="f" filled="f" o:allowincell="f" style="position:absolute;margin-left:56.800pt;margin-top:687.056pt;width:483.858pt;height:19.125pt;z-index:251659264;mso-position-horizontal-relative:page;mso-position-vertical-relative:page;mso-wrap-style:none;mso-fit-shape-to-text:t;">
+          <v:shape id="DocuMindTextBox85" type="#_x0000_t202" stroked="f" filled="f" o:allowincell="f" style="position:absolute;margin-left:56.800pt;margin-top:665.556pt;width:483.858pt;height:19.125pt;z-index:251659264;mso-position-horizontal-relative:page;mso-position-vertical-relative:page;mso-wrap-style:none;mso-fit-shape-to-text:t;">
             <w10:wrap type="none"/>
             <v:textbox inset="0,0,0,0">
               <w:txbxContent>
@@ -2951,7 +2315,7 @@
       </w:r>
       <w:r>
         <w:pict>
-          <v:shape id="DocuMindTextBox104" type="#_x0000_t202" stroked="f" filled="f" o:allowincell="f" style="position:absolute;margin-left:56.800pt;margin-top:701.756pt;width:484.457pt;height:19.125pt;z-index:251659264;mso-position-horizontal-relative:page;mso-position-vertical-relative:page;mso-wrap-style:none;mso-fit-shape-to-text:t;">
+          <v:shape id="DocuMindTextBox86" type="#_x0000_t202" stroked="f" filled="f" o:allowincell="f" style="position:absolute;margin-left:56.800pt;margin-top:680.256pt;width:484.457pt;height:19.125pt;z-index:251659264;mso-position-horizontal-relative:page;mso-position-vertical-relative:page;mso-wrap-style:none;mso-fit-shape-to-text:t;">
             <w10:wrap type="none"/>
             <v:textbox inset="0,0,0,0">
               <w:txbxContent>
@@ -2978,7 +2342,7 @@
       </w:r>
       <w:r>
         <w:pict>
-          <v:shape id="DocuMindTextBox105" type="#_x0000_t202" stroked="f" filled="f" o:allowincell="f" style="position:absolute;margin-left:56.800pt;margin-top:716.456pt;width:484.278pt;height:19.125pt;z-index:251659264;mso-position-horizontal-relative:page;mso-position-vertical-relative:page;mso-wrap-style:none;mso-fit-shape-to-text:t;">
+          <v:shape id="DocuMindTextBox87" type="#_x0000_t202" stroked="f" filled="f" o:allowincell="f" style="position:absolute;margin-left:56.800pt;margin-top:694.956pt;width:484.278pt;height:19.125pt;z-index:251659264;mso-position-horizontal-relative:page;mso-position-vertical-relative:page;mso-wrap-style:none;mso-fit-shape-to-text:t;">
             <w10:wrap type="none"/>
             <v:textbox inset="0,0,0,0">
               <w:txbxContent>
@@ -3005,7 +2369,7 @@
       </w:r>
       <w:r>
         <w:pict>
-          <v:shape id="DocuMindTextBox106" type="#_x0000_t202" stroked="f" filled="f" o:allowincell="f" style="position:absolute;margin-left:56.800pt;margin-top:731.156pt;width:254.853pt;height:19.125pt;z-index:251659264;mso-position-horizontal-relative:page;mso-position-vertical-relative:page;mso-wrap-style:none;mso-fit-shape-to-text:t;">
+          <v:shape id="DocuMindTextBox88" type="#_x0000_t202" stroked="f" filled="f" o:allowincell="f" style="position:absolute;margin-left:56.800pt;margin-top:709.656pt;width:254.853pt;height:19.125pt;z-index:251659264;mso-position-horizontal-relative:page;mso-position-vertical-relative:page;mso-wrap-style:none;mso-fit-shape-to-text:t;">
             <w10:wrap type="none"/>
             <v:textbox inset="0,0,0,0">
               <w:txbxContent>
@@ -3052,15 +2416,304 @@
       </w:r>
       <w:r>
         <w:pict>
-          <v:shape id="DocuMindImage107" type="#_x0000_t75" stroked="f" o:allowincell="f" style="position:absolute;margin-left:56.800pt;margin-top:56.700pt;width:481.700pt;height:321.300pt;z-index:1;mso-position-horizontal-relative:page;mso-position-vertical-relative:page;mso-wrap-style:none;">
+          <v:shape id="DocuMindTextBox89" type="#_x0000_t202" stroked="f" filled="f" o:allowincell="f" style="position:absolute;margin-left:74.800pt;margin-top:55.810pt;width:449.616pt;height:28.500pt;z-index:251659264;mso-position-horizontal-relative:page;mso-position-vertical-relative:page;mso-wrap-style:none;mso-fit-shape-to-text:t;">
             <w10:wrap type="none"/>
-            <v:imagedata r:id="rId9" o:title=""/>
+            <v:textbox inset="0,0,0,0">
+              <w:txbxContent>
+                <w:p>
+                  <w:pPr>
+                    <w:spacing w:before="0" w:after="0" w:lineRule="exact" w:line="450"/>
+                    <w:ind w:left="0" w:right="0" w:firstLine="0"/>
+                  </w:pPr>
+                  <w:r>
+                    <w:rPr>
+                      <w:rFonts w:ascii="Liberation Sans" w:hAnsi="Liberation Sans" w:eastAsia="Liberation Sans" w:cs="Liberation Sans"/>
+                      <w:b/>
+                      <w:i w:val="0"/>
+                      <w:color w:val="000000"/>
+                      <w:sz w:val="36"/>
+                    </w:rPr>
+                    <w:t xml:space="preserve">Lorem ipsum dolor sit amet, consectetur adipiscing </w:t>
+                  </w:r>
+                </w:p>
+              </w:txbxContent>
+            </v:textbox>
           </v:shape>
         </w:pict>
       </w:r>
       <w:r>
         <w:pict>
-          <v:shape id="DocuMindTextBox108" type="#_x0000_t202" stroked="f" filled="f" o:allowincell="f" style="position:absolute;margin-left:74.800pt;margin-top:413.420pt;width:439.128pt;height:26.000pt;z-index:251659264;mso-position-horizontal-relative:page;mso-position-vertical-relative:page;mso-wrap-style:none;mso-fit-shape-to-text:t;">
+          <v:shape id="DocuMindTextBox90" type="#_x0000_t202" stroked="f" filled="f" o:allowincell="f" style="position:absolute;margin-left:96.400pt;margin-top:76.510pt;width:38.946pt;height:28.500pt;z-index:251659264;mso-position-horizontal-relative:page;mso-position-vertical-relative:page;mso-wrap-style:none;mso-fit-shape-to-text:t;">
+            <w10:wrap type="none"/>
+            <v:textbox inset="0,0,0,0">
+              <w:txbxContent>
+                <w:p>
+                  <w:pPr>
+                    <w:spacing w:before="0" w:after="0" w:lineRule="exact" w:line="450"/>
+                    <w:ind w:left="0" w:right="0" w:firstLine="0"/>
+                  </w:pPr>
+                  <w:r>
+                    <w:rPr>
+                      <w:rFonts w:ascii="Liberation Sans" w:hAnsi="Liberation Sans" w:eastAsia="Liberation Sans" w:cs="Liberation Sans"/>
+                      <w:b/>
+                      <w:i w:val="0"/>
+                      <w:color w:val="000000"/>
+                      <w:sz w:val="36"/>
+                    </w:rPr>
+                    <w:t xml:space="preserve">elit. </w:t>
+                  </w:r>
+                </w:p>
+              </w:txbxContent>
+            </v:textbox>
+          </v:shape>
+        </w:pict>
+      </w:r>
+      <w:r>
+        <w:pict>
+          <v:shape id="DocuMindTextBox91" type="#_x0000_t202" stroked="f" filled="f" o:allowincell="f" style="position:absolute;margin-left:56.800pt;margin-top:128.556pt;width:484.141pt;height:19.125pt;z-index:251659264;mso-position-horizontal-relative:page;mso-position-vertical-relative:page;mso-wrap-style:none;mso-fit-shape-to-text:t;">
+            <w10:wrap type="none"/>
+            <v:textbox inset="0,0,0,0">
+              <w:txbxContent>
+                <w:p>
+                  <w:pPr>
+                    <w:spacing w:before="0" w:after="0" w:lineRule="exact" w:line="262"/>
+                    <w:ind w:left="0" w:right="0" w:firstLine="0"/>
+                  </w:pPr>
+                  <w:r>
+                    <w:rPr>
+                      <w:rFonts w:ascii="Deja Vu Sans" w:hAnsi="Deja Vu Sans" w:eastAsia="Deja Vu Sans" w:cs="Deja Vu Sans"/>
+                      <w:b w:val="0"/>
+                      <w:i w:val="0"/>
+                      <w:color w:val="000000"/>
+                      <w:sz w:val="21"/>
+                    </w:rPr>
+                    <w:t>Nunc ac faucibus odio. Vestibulum neque massa, scelerisque sit amet ligula eu, congue</w:t>
+                  </w:r>
+                </w:p>
+              </w:txbxContent>
+            </v:textbox>
+          </v:shape>
+        </w:pict>
+      </w:r>
+      <w:r>
+        <w:pict>
+          <v:shape id="DocuMindTextBox92" type="#_x0000_t202" stroked="f" filled="f" o:allowincell="f" style="position:absolute;margin-left:56.800pt;margin-top:143.256pt;width:484.068pt;height:19.125pt;z-index:251659264;mso-position-horizontal-relative:page;mso-position-vertical-relative:page;mso-wrap-style:none;mso-fit-shape-to-text:t;">
+            <w10:wrap type="none"/>
+            <v:textbox inset="0,0,0,0">
+              <w:txbxContent>
+                <w:p>
+                  <w:pPr>
+                    <w:spacing w:before="0" w:after="0" w:lineRule="exact" w:line="262"/>
+                    <w:ind w:left="0" w:right="0" w:firstLine="0"/>
+                  </w:pPr>
+                  <w:r>
+                    <w:rPr>
+                      <w:rFonts w:ascii="Deja Vu Sans" w:hAnsi="Deja Vu Sans" w:eastAsia="Deja Vu Sans" w:cs="Deja Vu Sans"/>
+                      <w:b w:val="0"/>
+                      <w:i w:val="0"/>
+                      <w:color w:val="000000"/>
+                      <w:sz w:val="21"/>
+                    </w:rPr>
+                    <w:t>molestie mi. Praesent ut varius sem. Nullam at porttitor arcu, nec lacinia nisi. Ut ac dolor</w:t>
+                  </w:r>
+                </w:p>
+              </w:txbxContent>
+            </v:textbox>
+          </v:shape>
+        </w:pict>
+      </w:r>
+      <w:r>
+        <w:pict>
+          <v:shape id="DocuMindTextBox93" type="#_x0000_t202" stroked="f" filled="f" o:allowincell="f" style="position:absolute;margin-left:56.800pt;margin-top:157.956pt;width:484.278pt;height:19.125pt;z-index:251659264;mso-position-horizontal-relative:page;mso-position-vertical-relative:page;mso-wrap-style:none;mso-fit-shape-to-text:t;">
+            <w10:wrap type="none"/>
+            <v:textbox inset="0,0,0,0">
+              <w:txbxContent>
+                <w:p>
+                  <w:pPr>
+                    <w:spacing w:before="0" w:after="0" w:lineRule="exact" w:line="262"/>
+                    <w:ind w:left="0" w:right="0" w:firstLine="0"/>
+                  </w:pPr>
+                  <w:r>
+                    <w:rPr>
+                      <w:rFonts w:ascii="Deja Vu Sans" w:hAnsi="Deja Vu Sans" w:eastAsia="Deja Vu Sans" w:cs="Deja Vu Sans"/>
+                      <w:b w:val="0"/>
+                      <w:i w:val="0"/>
+                      <w:color w:val="000000"/>
+                      <w:sz w:val="21"/>
+                    </w:rPr>
+                    <w:t>vitae odio interdum condimentum. Vivamus dapibus sodales ex, vitae malesuada ipsum</w:t>
+                  </w:r>
+                </w:p>
+              </w:txbxContent>
+            </v:textbox>
+          </v:shape>
+        </w:pict>
+      </w:r>
+      <w:r>
+        <w:pict>
+          <v:shape id="DocuMindTextBox94" type="#_x0000_t202" stroked="f" filled="f" o:allowincell="f" style="position:absolute;margin-left:56.800pt;margin-top:172.656pt;width:484.341pt;height:19.125pt;z-index:251659264;mso-position-horizontal-relative:page;mso-position-vertical-relative:page;mso-wrap-style:none;mso-fit-shape-to-text:t;">
+            <w10:wrap type="none"/>
+            <v:textbox inset="0,0,0,0">
+              <w:txbxContent>
+                <w:p>
+                  <w:pPr>
+                    <w:spacing w:before="0" w:after="0" w:lineRule="exact" w:line="262"/>
+                    <w:ind w:left="0" w:right="0" w:firstLine="0"/>
+                  </w:pPr>
+                  <w:r>
+                    <w:rPr>
+                      <w:rFonts w:ascii="Deja Vu Sans" w:hAnsi="Deja Vu Sans" w:eastAsia="Deja Vu Sans" w:cs="Deja Vu Sans"/>
+                      <w:b w:val="0"/>
+                      <w:i w:val="0"/>
+                      <w:color w:val="000000"/>
+                      <w:sz w:val="21"/>
+                    </w:rPr>
+                    <w:t>cursus convallis. Maecenas sed egestas nulla, ac condimentum orci. Mauris diam felis,</w:t>
+                  </w:r>
+                </w:p>
+              </w:txbxContent>
+            </v:textbox>
+          </v:shape>
+        </w:pict>
+      </w:r>
+      <w:r>
+        <w:pict>
+          <v:shape id="DocuMindTextBox95" type="#_x0000_t202" stroked="f" filled="f" o:allowincell="f" style="position:absolute;margin-left:56.800pt;margin-top:187.356pt;width:483.847pt;height:19.125pt;z-index:251659264;mso-position-horizontal-relative:page;mso-position-vertical-relative:page;mso-wrap-style:none;mso-fit-shape-to-text:t;">
+            <w10:wrap type="none"/>
+            <v:textbox inset="0,0,0,0">
+              <w:txbxContent>
+                <w:p>
+                  <w:pPr>
+                    <w:spacing w:before="0" w:after="0" w:lineRule="exact" w:line="262"/>
+                    <w:ind w:left="0" w:right="0" w:firstLine="0"/>
+                  </w:pPr>
+                  <w:r>
+                    <w:rPr>
+                      <w:rFonts w:ascii="Deja Vu Sans" w:hAnsi="Deja Vu Sans" w:eastAsia="Deja Vu Sans" w:cs="Deja Vu Sans"/>
+                      <w:b w:val="0"/>
+                      <w:i w:val="0"/>
+                      <w:color w:val="000000"/>
+                      <w:sz w:val="21"/>
+                    </w:rPr>
+                    <w:t>vulputate ac suscipit et, iaculis non est. Curabitur semper arcu ac ligula semper, nec luctus</w:t>
+                  </w:r>
+                </w:p>
+              </w:txbxContent>
+            </v:textbox>
+          </v:shape>
+        </w:pict>
+      </w:r>
+      <w:r>
+        <w:pict>
+          <v:shape id="DocuMindTextBox96" type="#_x0000_t202" stroked="f" filled="f" o:allowincell="f" style="position:absolute;margin-left:56.800pt;margin-top:202.056pt;width:484.152pt;height:19.125pt;z-index:251659264;mso-position-horizontal-relative:page;mso-position-vertical-relative:page;mso-wrap-style:none;mso-fit-shape-to-text:t;">
+            <w10:wrap type="none"/>
+            <v:textbox inset="0,0,0,0">
+              <w:txbxContent>
+                <w:p>
+                  <w:pPr>
+                    <w:spacing w:before="0" w:after="0" w:lineRule="exact" w:line="262"/>
+                    <w:ind w:left="0" w:right="0" w:firstLine="0"/>
+                  </w:pPr>
+                  <w:r>
+                    <w:rPr>
+                      <w:rFonts w:ascii="Deja Vu Sans" w:hAnsi="Deja Vu Sans" w:eastAsia="Deja Vu Sans" w:cs="Deja Vu Sans"/>
+                      <w:b w:val="0"/>
+                      <w:i w:val="0"/>
+                      <w:color w:val="000000"/>
+                      <w:sz w:val="21"/>
+                    </w:rPr>
+                    <w:t>nisl blandit. Integer lacinia ante ac libero lobortis imperdiet. Nullam mollis convallis ipsum,</w:t>
+                  </w:r>
+                </w:p>
+              </w:txbxContent>
+            </v:textbox>
+          </v:shape>
+        </w:pict>
+      </w:r>
+      <w:r>
+        <w:pict>
+          <v:shape id="DocuMindTextBox97" type="#_x0000_t202" stroked="f" filled="f" o:allowincell="f" style="position:absolute;margin-left:56.800pt;margin-top:216.756pt;width:483.795pt;height:19.125pt;z-index:251659264;mso-position-horizontal-relative:page;mso-position-vertical-relative:page;mso-wrap-style:none;mso-fit-shape-to-text:t;">
+            <w10:wrap type="none"/>
+            <v:textbox inset="0,0,0,0">
+              <w:txbxContent>
+                <w:p>
+                  <w:pPr>
+                    <w:spacing w:before="0" w:after="0" w:lineRule="exact" w:line="262"/>
+                    <w:ind w:left="0" w:right="0" w:firstLine="0"/>
+                  </w:pPr>
+                  <w:r>
+                    <w:rPr>
+                      <w:rFonts w:ascii="Deja Vu Sans" w:hAnsi="Deja Vu Sans" w:eastAsia="Deja Vu Sans" w:cs="Deja Vu Sans"/>
+                      <w:b w:val="0"/>
+                      <w:i w:val="0"/>
+                      <w:color w:val="000000"/>
+                      <w:sz w:val="21"/>
+                    </w:rPr>
+                    <w:t>ac accumsan nunc vehicula vitae. Nulla eget justo in felis tristique fringilla. Morbi sit amet</w:t>
+                  </w:r>
+                </w:p>
+              </w:txbxContent>
+            </v:textbox>
+          </v:shape>
+        </w:pict>
+      </w:r>
+      <w:r>
+        <w:pict>
+          <v:shape id="DocuMindTextBox98" type="#_x0000_t202" stroked="f" filled="f" o:allowincell="f" style="position:absolute;margin-left:56.800pt;margin-top:231.456pt;width:483.879pt;height:19.125pt;z-index:251659264;mso-position-horizontal-relative:page;mso-position-vertical-relative:page;mso-wrap-style:none;mso-fit-shape-to-text:t;">
+            <w10:wrap type="none"/>
+            <v:textbox inset="0,0,0,0">
+              <w:txbxContent>
+                <w:p>
+                  <w:pPr>
+                    <w:spacing w:before="0" w:after="0" w:lineRule="exact" w:line="262"/>
+                    <w:ind w:left="0" w:right="0" w:firstLine="0"/>
+                  </w:pPr>
+                  <w:r>
+                    <w:rPr>
+                      <w:rFonts w:ascii="Deja Vu Sans" w:hAnsi="Deja Vu Sans" w:eastAsia="Deja Vu Sans" w:cs="Deja Vu Sans"/>
+                      <w:b w:val="0"/>
+                      <w:i w:val="0"/>
+                      <w:color w:val="000000"/>
+                      <w:sz w:val="21"/>
+                    </w:rPr>
+                    <w:t>tortor quis risus auctor condimentum. Morbi in ullamcorper elit. Nulla iaculis tellus sit amet</w:t>
+                  </w:r>
+                </w:p>
+              </w:txbxContent>
+            </v:textbox>
+          </v:shape>
+        </w:pict>
+      </w:r>
+      <w:r>
+        <w:pict>
+          <v:shape id="DocuMindTextBox99" type="#_x0000_t202" stroked="f" filled="f" o:allowincell="f" style="position:absolute;margin-left:56.800pt;margin-top:246.156pt;width:127.950pt;height:19.125pt;z-index:251659264;mso-position-horizontal-relative:page;mso-position-vertical-relative:page;mso-wrap-style:none;mso-fit-shape-to-text:t;">
+            <w10:wrap type="none"/>
+            <v:textbox inset="0,0,0,0">
+              <w:txbxContent>
+                <w:p>
+                  <w:pPr>
+                    <w:spacing w:before="0" w:after="0" w:lineRule="exact" w:line="262"/>
+                    <w:ind w:left="0" w:right="0" w:firstLine="0"/>
+                  </w:pPr>
+                  <w:r>
+                    <w:rPr>
+                      <w:rFonts w:ascii="Deja Vu Sans" w:hAnsi="Deja Vu Sans" w:eastAsia="Deja Vu Sans" w:cs="Deja Vu Sans"/>
+                      <w:b w:val="0"/>
+                      <w:i w:val="0"/>
+                      <w:color w:val="000000"/>
+                      <w:sz w:val="21"/>
+                    </w:rPr>
+                    <w:t>mauris tempus fringilla.</w:t>
+                  </w:r>
+                </w:p>
+              </w:txbxContent>
+            </v:textbox>
+          </v:shape>
+        </w:pict>
+      </w:r>
+      <w:r>
+        <w:pict>
+          <v:shape id="DocuMindTextBox100" type="#_x0000_t202" stroked="f" filled="f" o:allowincell="f" style="position:absolute;margin-left:74.800pt;margin-top:282.620pt;width:439.128pt;height:26.000pt;z-index:251659264;mso-position-horizontal-relative:page;mso-position-vertical-relative:page;mso-wrap-style:none;mso-fit-shape-to-text:t;">
             <w10:wrap type="none"/>
             <v:textbox inset="0,0,0,0">
               <w:txbxContent>
@@ -3087,7 +2740,7 @@
       </w:r>
       <w:r>
         <w:pict>
-          <v:shape id="DocuMindTextBox109" type="#_x0000_t202" stroked="f" filled="f" o:allowincell="f" style="position:absolute;margin-left:103.600pt;margin-top:431.820pt;width:110.440pt;height:26.000pt;z-index:251659264;mso-position-horizontal-relative:page;mso-position-vertical-relative:page;mso-wrap-style:none;mso-fit-shape-to-text:t;">
+          <v:shape id="DocuMindTextBox101" type="#_x0000_t202" stroked="f" filled="f" o:allowincell="f" style="position:absolute;margin-left:103.600pt;margin-top:301.020pt;width:110.440pt;height:26.000pt;z-index:251659264;mso-position-horizontal-relative:page;mso-position-vertical-relative:page;mso-wrap-style:none;mso-fit-shape-to-text:t;">
             <w10:wrap type="none"/>
             <v:textbox inset="0,0,0,0">
               <w:txbxContent>
@@ -3114,7 +2767,7 @@
       </w:r>
       <w:r>
         <w:pict>
-          <v:shape id="DocuMindTextBox110" type="#_x0000_t202" stroked="f" filled="f" o:allowincell="f" style="position:absolute;margin-left:56.800pt;margin-top:455.656pt;width:483.890pt;height:19.125pt;z-index:251659264;mso-position-horizontal-relative:page;mso-position-vertical-relative:page;mso-wrap-style:none;mso-fit-shape-to-text:t;">
+          <v:shape id="DocuMindTextBox102" type="#_x0000_t202" stroked="f" filled="f" o:allowincell="f" style="position:absolute;margin-left:56.800pt;margin-top:324.956pt;width:483.890pt;height:19.125pt;z-index:251659264;mso-position-horizontal-relative:page;mso-position-vertical-relative:page;mso-wrap-style:none;mso-fit-shape-to-text:t;">
             <w10:wrap type="none"/>
             <v:textbox inset="0,0,0,0">
               <w:txbxContent>
@@ -3141,7 +2794,7 @@
       </w:r>
       <w:r>
         <w:pict>
-          <v:shape id="DocuMindTextBox111" type="#_x0000_t202" stroked="f" filled="f" o:allowincell="f" style="position:absolute;margin-left:56.800pt;margin-top:470.356pt;width:483.858pt;height:19.125pt;z-index:251659264;mso-position-horizontal-relative:page;mso-position-vertical-relative:page;mso-wrap-style:none;mso-fit-shape-to-text:t;">
+          <v:shape id="DocuMindTextBox103" type="#_x0000_t202" stroked="f" filled="f" o:allowincell="f" style="position:absolute;margin-left:56.800pt;margin-top:339.656pt;width:483.858pt;height:19.125pt;z-index:251659264;mso-position-horizontal-relative:page;mso-position-vertical-relative:page;mso-wrap-style:none;mso-fit-shape-to-text:t;">
             <w10:wrap type="none"/>
             <v:textbox inset="0,0,0,0">
               <w:txbxContent>
@@ -3168,7 +2821,7 @@
       </w:r>
       <w:r>
         <w:pict>
-          <v:shape id="DocuMindTextBox112" type="#_x0000_t202" stroked="f" filled="f" o:allowincell="f" style="position:absolute;margin-left:56.800pt;margin-top:485.056pt;width:484.404pt;height:19.125pt;z-index:251659264;mso-position-horizontal-relative:page;mso-position-vertical-relative:page;mso-wrap-style:none;mso-fit-shape-to-text:t;">
+          <v:shape id="DocuMindTextBox104" type="#_x0000_t202" stroked="f" filled="f" o:allowincell="f" style="position:absolute;margin-left:56.800pt;margin-top:354.356pt;width:484.404pt;height:19.125pt;z-index:251659264;mso-position-horizontal-relative:page;mso-position-vertical-relative:page;mso-wrap-style:none;mso-fit-shape-to-text:t;">
             <w10:wrap type="none"/>
             <v:textbox inset="0,0,0,0">
               <w:txbxContent>
@@ -3195,7 +2848,7 @@
       </w:r>
       <w:r>
         <w:pict>
-          <v:shape id="DocuMindTextBox113" type="#_x0000_t202" stroked="f" filled="f" o:allowincell="f" style="position:absolute;margin-left:56.800pt;margin-top:499.756pt;width:242.999pt;height:19.125pt;z-index:251659264;mso-position-horizontal-relative:page;mso-position-vertical-relative:page;mso-wrap-style:none;mso-fit-shape-to-text:t;">
+          <v:shape id="DocuMindTextBox105" type="#_x0000_t202" stroked="f" filled="f" o:allowincell="f" style="position:absolute;margin-left:56.800pt;margin-top:369.056pt;width:242.999pt;height:19.125pt;z-index:251659264;mso-position-horizontal-relative:page;mso-position-vertical-relative:page;mso-wrap-style:none;mso-fit-shape-to-text:t;">
             <w10:wrap type="none"/>
             <v:textbox inset="0,0,0,0">
               <w:txbxContent>
@@ -3222,7 +2875,7 @@
       </w:r>
       <w:r>
         <w:pict>
-          <v:shape id="DocuMindTextBox114" type="#_x0000_t202" stroked="f" filled="f" o:allowincell="f" style="position:absolute;margin-left:56.800pt;margin-top:525.756pt;width:483.669pt;height:19.125pt;z-index:251659264;mso-position-horizontal-relative:page;mso-position-vertical-relative:page;mso-wrap-style:none;mso-fit-shape-to-text:t;">
+          <v:shape id="DocuMindTextBox106" type="#_x0000_t202" stroked="f" filled="f" o:allowincell="f" style="position:absolute;margin-left:56.800pt;margin-top:394.956pt;width:483.669pt;height:19.125pt;z-index:251659264;mso-position-horizontal-relative:page;mso-position-vertical-relative:page;mso-wrap-style:none;mso-fit-shape-to-text:t;">
             <w10:wrap type="none"/>
             <v:textbox inset="0,0,0,0">
               <w:txbxContent>
@@ -3249,7 +2902,7 @@
       </w:r>
       <w:r>
         <w:pict>
-          <v:shape id="DocuMindTextBox115" type="#_x0000_t202" stroked="f" filled="f" o:allowincell="f" style="position:absolute;margin-left:56.800pt;margin-top:540.456pt;width:484.110pt;height:19.125pt;z-index:251659264;mso-position-horizontal-relative:page;mso-position-vertical-relative:page;mso-wrap-style:none;mso-fit-shape-to-text:t;">
+          <v:shape id="DocuMindTextBox107" type="#_x0000_t202" stroked="f" filled="f" o:allowincell="f" style="position:absolute;margin-left:56.800pt;margin-top:409.656pt;width:484.110pt;height:19.125pt;z-index:251659264;mso-position-horizontal-relative:page;mso-position-vertical-relative:page;mso-wrap-style:none;mso-fit-shape-to-text:t;">
             <w10:wrap type="none"/>
             <v:textbox inset="0,0,0,0">
               <w:txbxContent>
@@ -3276,7 +2929,7 @@
       </w:r>
       <w:r>
         <w:pict>
-          <v:shape id="DocuMindTextBox116" type="#_x0000_t202" stroked="f" filled="f" o:allowincell="f" style="position:absolute;margin-left:56.800pt;margin-top:555.156pt;width:484.036pt;height:19.125pt;z-index:251659264;mso-position-horizontal-relative:page;mso-position-vertical-relative:page;mso-wrap-style:none;mso-fit-shape-to-text:t;">
+          <v:shape id="DocuMindTextBox108" type="#_x0000_t202" stroked="f" filled="f" o:allowincell="f" style="position:absolute;margin-left:56.800pt;margin-top:424.356pt;width:484.036pt;height:19.125pt;z-index:251659264;mso-position-horizontal-relative:page;mso-position-vertical-relative:page;mso-wrap-style:none;mso-fit-shape-to-text:t;">
             <w10:wrap type="none"/>
             <v:textbox inset="0,0,0,0">
               <w:txbxContent>
@@ -3303,7 +2956,7 @@
       </w:r>
       <w:r>
         <w:pict>
-          <v:shape id="DocuMindTextBox117" type="#_x0000_t202" stroked="f" filled="f" o:allowincell="f" style="position:absolute;margin-left:56.800pt;margin-top:569.856pt;width:483.837pt;height:19.125pt;z-index:251659264;mso-position-horizontal-relative:page;mso-position-vertical-relative:page;mso-wrap-style:none;mso-fit-shape-to-text:t;">
+          <v:shape id="DocuMindTextBox109" type="#_x0000_t202" stroked="f" filled="f" o:allowincell="f" style="position:absolute;margin-left:56.800pt;margin-top:439.056pt;width:483.837pt;height:19.125pt;z-index:251659264;mso-position-horizontal-relative:page;mso-position-vertical-relative:page;mso-wrap-style:none;mso-fit-shape-to-text:t;">
             <w10:wrap type="none"/>
             <v:textbox inset="0,0,0,0">
               <w:txbxContent>
@@ -3330,7 +2983,7 @@
       </w:r>
       <w:r>
         <w:pict>
-          <v:shape id="DocuMindTextBox118" type="#_x0000_t202" stroked="f" filled="f" o:allowincell="f" style="position:absolute;margin-left:56.800pt;margin-top:584.556pt;width:483.847pt;height:19.125pt;z-index:251659264;mso-position-horizontal-relative:page;mso-position-vertical-relative:page;mso-wrap-style:none;mso-fit-shape-to-text:t;">
+          <v:shape id="DocuMindTextBox110" type="#_x0000_t202" stroked="f" filled="f" o:allowincell="f" style="position:absolute;margin-left:56.800pt;margin-top:453.756pt;width:483.847pt;height:19.125pt;z-index:251659264;mso-position-horizontal-relative:page;mso-position-vertical-relative:page;mso-wrap-style:none;mso-fit-shape-to-text:t;">
             <w10:wrap type="none"/>
             <v:textbox inset="0,0,0,0">
               <w:txbxContent>
@@ -3357,7 +3010,7 @@
       </w:r>
       <w:r>
         <w:pict>
-          <v:shape id="DocuMindTextBox119" type="#_x0000_t202" stroked="f" filled="f" o:allowincell="f" style="position:absolute;margin-left:56.800pt;margin-top:599.256pt;width:484.173pt;height:19.125pt;z-index:251659264;mso-position-horizontal-relative:page;mso-position-vertical-relative:page;mso-wrap-style:none;mso-fit-shape-to-text:t;">
+          <v:shape id="DocuMindTextBox111" type="#_x0000_t202" stroked="f" filled="f" o:allowincell="f" style="position:absolute;margin-left:56.800pt;margin-top:468.456pt;width:484.173pt;height:19.125pt;z-index:251659264;mso-position-horizontal-relative:page;mso-position-vertical-relative:page;mso-wrap-style:none;mso-fit-shape-to-text:t;">
             <w10:wrap type="none"/>
             <v:textbox inset="0,0,0,0">
               <w:txbxContent>
@@ -3384,7 +3037,7 @@
       </w:r>
       <w:r>
         <w:pict>
-          <v:shape id="DocuMindTextBox120" type="#_x0000_t202" stroked="f" filled="f" o:allowincell="f" style="position:absolute;margin-left:56.800pt;margin-top:613.956pt;width:253.803pt;height:19.125pt;z-index:251659264;mso-position-horizontal-relative:page;mso-position-vertical-relative:page;mso-wrap-style:none;mso-fit-shape-to-text:t;">
+          <v:shape id="DocuMindTextBox112" type="#_x0000_t202" stroked="f" filled="f" o:allowincell="f" style="position:absolute;margin-left:56.800pt;margin-top:483.156pt;width:253.803pt;height:19.125pt;z-index:251659264;mso-position-horizontal-relative:page;mso-position-vertical-relative:page;mso-wrap-style:none;mso-fit-shape-to-text:t;">
             <w10:wrap type="none"/>
             <v:textbox inset="0,0,0,0">
               <w:txbxContent>
@@ -3411,7 +3064,7 @@
       </w:r>
       <w:r>
         <w:pict>
-          <v:shape id="DocuMindTextBox121" type="#_x0000_t202" stroked="f" filled="f" o:allowincell="f" style="position:absolute;margin-left:74.800pt;margin-top:650.420pt;width:375.176pt;height:26.000pt;z-index:251659264;mso-position-horizontal-relative:page;mso-position-vertical-relative:page;mso-wrap-style:none;mso-fit-shape-to-text:t;">
+          <v:shape id="DocuMindTextBox113" type="#_x0000_t202" stroked="f" filled="f" o:allowincell="f" style="position:absolute;margin-left:74.800pt;margin-top:519.620pt;width:375.176pt;height:26.000pt;z-index:251659264;mso-position-horizontal-relative:page;mso-position-vertical-relative:page;mso-wrap-style:none;mso-fit-shape-to-text:t;">
             <w10:wrap type="none"/>
             <v:textbox inset="0,0,0,0">
               <w:txbxContent>
@@ -3438,7 +3091,7 @@
       </w:r>
       <w:r>
         <w:pict>
-          <v:shape id="DocuMindTextBox122" type="#_x0000_t202" stroked="f" filled="f" o:allowincell="f" style="position:absolute;margin-left:56.800pt;margin-top:674.256pt;width:484.036pt;height:19.125pt;z-index:251659264;mso-position-horizontal-relative:page;mso-position-vertical-relative:page;mso-wrap-style:none;mso-fit-shape-to-text:t;">
+          <v:shape id="DocuMindTextBox114" type="#_x0000_t202" stroked="f" filled="f" o:allowincell="f" style="position:absolute;margin-left:56.800pt;margin-top:543.556pt;width:484.036pt;height:19.125pt;z-index:251659264;mso-position-horizontal-relative:page;mso-position-vertical-relative:page;mso-wrap-style:none;mso-fit-shape-to-text:t;">
             <w10:wrap type="none"/>
             <v:textbox inset="0,0,0,0">
               <w:txbxContent>
@@ -3465,7 +3118,7 @@
       </w:r>
       <w:r>
         <w:pict>
-          <v:shape id="DocuMindTextBox123" type="#_x0000_t202" stroked="f" filled="f" o:allowincell="f" style="position:absolute;margin-left:56.800pt;margin-top:688.956pt;width:484.047pt;height:19.125pt;z-index:251659264;mso-position-horizontal-relative:page;mso-position-vertical-relative:page;mso-wrap-style:none;mso-fit-shape-to-text:t;">
+          <v:shape id="DocuMindTextBox115" type="#_x0000_t202" stroked="f" filled="f" o:allowincell="f" style="position:absolute;margin-left:56.800pt;margin-top:558.256pt;width:484.047pt;height:19.125pt;z-index:251659264;mso-position-horizontal-relative:page;mso-position-vertical-relative:page;mso-wrap-style:none;mso-fit-shape-to-text:t;">
             <w10:wrap type="none"/>
             <v:textbox inset="0,0,0,0">
               <w:txbxContent>
@@ -3492,7 +3145,7 @@
       </w:r>
       <w:r>
         <w:pict>
-          <v:shape id="DocuMindTextBox124" type="#_x0000_t202" stroked="f" filled="f" o:allowincell="f" style="position:absolute;margin-left:56.800pt;margin-top:703.656pt;width:484.520pt;height:19.125pt;z-index:251659264;mso-position-horizontal-relative:page;mso-position-vertical-relative:page;mso-wrap-style:none;mso-fit-shape-to-text:t;">
+          <v:shape id="DocuMindTextBox116" type="#_x0000_t202" stroked="f" filled="f" o:allowincell="f" style="position:absolute;margin-left:56.800pt;margin-top:572.956pt;width:484.520pt;height:19.125pt;z-index:251659264;mso-position-horizontal-relative:page;mso-position-vertical-relative:page;mso-wrap-style:none;mso-fit-shape-to-text:t;">
             <w10:wrap type="none"/>
             <v:textbox inset="0,0,0,0">
               <w:txbxContent>
@@ -3519,7 +3172,7 @@
       </w:r>
       <w:r>
         <w:pict>
-          <v:shape id="DocuMindTextBox125" type="#_x0000_t202" stroked="f" filled="f" o:allowincell="f" style="position:absolute;margin-left:56.800pt;margin-top:718.356pt;width:186.509pt;height:19.125pt;z-index:251659264;mso-position-horizontal-relative:page;mso-position-vertical-relative:page;mso-wrap-style:none;mso-fit-shape-to-text:t;">
+          <v:shape id="DocuMindTextBox117" type="#_x0000_t202" stroked="f" filled="f" o:allowincell="f" style="position:absolute;margin-left:56.800pt;margin-top:587.656pt;width:186.509pt;height:19.125pt;z-index:251659264;mso-position-horizontal-relative:page;mso-position-vertical-relative:page;mso-wrap-style:none;mso-fit-shape-to-text:t;">
             <w10:wrap type="none"/>
             <v:textbox inset="0,0,0,0">
               <w:txbxContent>
@@ -3546,7 +3199,7 @@
       </w:r>
       <w:r>
         <w:pict>
-          <v:shape id="DocuMindTextBox126" type="#_x0000_t202" stroked="f" filled="f" o:allowincell="f" style="position:absolute;margin-left:56.800pt;margin-top:744.356pt;width:483.732pt;height:19.125pt;z-index:251659264;mso-position-horizontal-relative:page;mso-position-vertical-relative:page;mso-wrap-style:none;mso-fit-shape-to-text:t;">
+          <v:shape id="DocuMindTextBox118" type="#_x0000_t202" stroked="f" filled="f" o:allowincell="f" style="position:absolute;margin-left:56.800pt;margin-top:613.556pt;width:483.732pt;height:19.125pt;z-index:251659264;mso-position-horizontal-relative:page;mso-position-vertical-relative:page;mso-wrap-style:none;mso-fit-shape-to-text:t;">
             <w10:wrap type="none"/>
             <v:textbox inset="0,0,0,0">
               <w:txbxContent>
@@ -3573,7 +3226,764 @@
       </w:r>
       <w:r>
         <w:pict>
-          <v:shape id="DocuMindTextBox127" type="#_x0000_t202" stroked="f" filled="f" o:allowincell="f" style="position:absolute;margin-left:56.800pt;margin-top:759.056pt;width:484.299pt;height:19.125pt;z-index:251659264;mso-position-horizontal-relative:page;mso-position-vertical-relative:page;mso-wrap-style:none;mso-fit-shape-to-text:t;">
+          <v:shape id="DocuMindTextBox119" type="#_x0000_t202" stroked="f" filled="f" o:allowincell="f" style="position:absolute;margin-left:56.800pt;margin-top:628.256pt;width:484.299pt;height:19.125pt;z-index:251659264;mso-position-horizontal-relative:page;mso-position-vertical-relative:page;mso-wrap-style:none;mso-fit-shape-to-text:t;">
+            <w10:wrap type="none"/>
+            <v:textbox inset="0,0,0,0">
+              <w:txbxContent>
+                <w:p>
+                  <w:pPr>
+                    <w:spacing w:before="0" w:after="0" w:lineRule="exact" w:line="262"/>
+                    <w:ind w:left="0" w:right="0" w:firstLine="0"/>
+                  </w:pPr>
+                  <w:r>
+                    <w:rPr>
+                      <w:rFonts w:ascii="Deja Vu Sans" w:hAnsi="Deja Vu Sans" w:eastAsia="Deja Vu Sans" w:cs="Deja Vu Sans"/>
+                      <w:b w:val="0"/>
+                      <w:i w:val="0"/>
+                      <w:color w:val="000000"/>
+                      <w:sz w:val="21"/>
+                    </w:rPr>
+                    <w:t>Maecenas ante orci, egestas ut aliquet sit amet, sagittis a magna. Aliquam ante quam,</w:t>
+                  </w:r>
+                </w:p>
+              </w:txbxContent>
+            </v:textbox>
+          </v:shape>
+        </w:pict>
+      </w:r>
+      <w:r>
+        <w:pict>
+          <v:shape id="DocuMindTextBox120" type="#_x0000_t202" stroked="f" filled="f" o:allowincell="f" style="position:absolute;margin-left:56.800pt;margin-top:642.956pt;width:484.047pt;height:19.125pt;z-index:251659264;mso-position-horizontal-relative:page;mso-position-vertical-relative:page;mso-wrap-style:none;mso-fit-shape-to-text:t;">
+            <w10:wrap type="none"/>
+            <v:textbox inset="0,0,0,0">
+              <w:txbxContent>
+                <w:p>
+                  <w:pPr>
+                    <w:spacing w:before="0" w:after="0" w:lineRule="exact" w:line="262"/>
+                    <w:ind w:left="0" w:right="0" w:firstLine="0"/>
+                  </w:pPr>
+                  <w:r>
+                    <w:rPr>
+                      <w:rFonts w:ascii="Deja Vu Sans" w:hAnsi="Deja Vu Sans" w:eastAsia="Deja Vu Sans" w:cs="Deja Vu Sans"/>
+                      <w:b w:val="0"/>
+                      <w:i w:val="0"/>
+                      <w:color w:val="000000"/>
+                      <w:sz w:val="21"/>
+                    </w:rPr>
+                    <w:t>pellentesque ut dignissim quis, laoreet eget est. Aliquam erat volutpat. Class aptent taciti</w:t>
+                  </w:r>
+                </w:p>
+              </w:txbxContent>
+            </v:textbox>
+          </v:shape>
+        </w:pict>
+      </w:r>
+      <w:r>
+        <w:pict>
+          <v:shape id="DocuMindTextBox121" type="#_x0000_t202" stroked="f" filled="f" o:allowincell="f" style="position:absolute;margin-left:56.800pt;margin-top:657.656pt;width:484.498pt;height:19.125pt;z-index:251659264;mso-position-horizontal-relative:page;mso-position-vertical-relative:page;mso-wrap-style:none;mso-fit-shape-to-text:t;">
+            <w10:wrap type="none"/>
+            <v:textbox inset="0,0,0,0">
+              <w:txbxContent>
+                <w:p>
+                  <w:pPr>
+                    <w:spacing w:before="0" w:after="0" w:lineRule="exact" w:line="262"/>
+                    <w:ind w:left="0" w:right="0" w:firstLine="0"/>
+                  </w:pPr>
+                  <w:r>
+                    <w:rPr>
+                      <w:rFonts w:ascii="Deja Vu Sans" w:hAnsi="Deja Vu Sans" w:eastAsia="Deja Vu Sans" w:cs="Deja Vu Sans"/>
+                      <w:b w:val="0"/>
+                      <w:i w:val="0"/>
+                      <w:color w:val="000000"/>
+                      <w:sz w:val="21"/>
+                    </w:rPr>
+                    <w:t>sociosqu ad litora torquent per conubia nostra, per inceptos himenaeos. Ut ullamcorper</w:t>
+                  </w:r>
+                </w:p>
+              </w:txbxContent>
+            </v:textbox>
+          </v:shape>
+        </w:pict>
+      </w:r>
+      <w:r>
+        <w:pict>
+          <v:shape id="DocuMindTextBox122" type="#_x0000_t202" stroked="f" filled="f" o:allowincell="f" style="position:absolute;margin-left:56.800pt;margin-top:672.356pt;width:484.299pt;height:19.125pt;z-index:251659264;mso-position-horizontal-relative:page;mso-position-vertical-relative:page;mso-wrap-style:none;mso-fit-shape-to-text:t;">
+            <w10:wrap type="none"/>
+            <v:textbox inset="0,0,0,0">
+              <w:txbxContent>
+                <w:p>
+                  <w:pPr>
+                    <w:spacing w:before="0" w:after="0" w:lineRule="exact" w:line="262"/>
+                    <w:ind w:left="0" w:right="0" w:firstLine="0"/>
+                  </w:pPr>
+                  <w:r>
+                    <w:rPr>
+                      <w:rFonts w:ascii="Deja Vu Sans" w:hAnsi="Deja Vu Sans" w:eastAsia="Deja Vu Sans" w:cs="Deja Vu Sans"/>
+                      <w:b w:val="0"/>
+                      <w:i w:val="0"/>
+                      <w:color w:val="000000"/>
+                      <w:sz w:val="21"/>
+                    </w:rPr>
+                    <w:t>justo sapien, in cursus libero viverra eget. Vivamus auctor imperdiet urna, at pulvinar leo</w:t>
+                  </w:r>
+                </w:p>
+              </w:txbxContent>
+            </v:textbox>
+          </v:shape>
+        </w:pict>
+      </w:r>
+      <w:r>
+        <w:pict>
+          <v:shape id="DocuMindTextBox123" type="#_x0000_t202" stroked="f" filled="f" o:allowincell="f" style="position:absolute;margin-left:56.800pt;margin-top:687.056pt;width:483.858pt;height:19.125pt;z-index:251659264;mso-position-horizontal-relative:page;mso-position-vertical-relative:page;mso-wrap-style:none;mso-fit-shape-to-text:t;">
+            <w10:wrap type="none"/>
+            <v:textbox inset="0,0,0,0">
+              <w:txbxContent>
+                <w:p>
+                  <w:pPr>
+                    <w:spacing w:before="0" w:after="0" w:lineRule="exact" w:line="262"/>
+                    <w:ind w:left="0" w:right="0" w:firstLine="0"/>
+                  </w:pPr>
+                  <w:r>
+                    <w:rPr>
+                      <w:rFonts w:ascii="Deja Vu Sans" w:hAnsi="Deja Vu Sans" w:eastAsia="Deja Vu Sans" w:cs="Deja Vu Sans"/>
+                      <w:b w:val="0"/>
+                      <w:i w:val="0"/>
+                      <w:color w:val="000000"/>
+                      <w:sz w:val="21"/>
+                    </w:rPr>
+                    <w:t>posuere laoreet. Suspendisse neque nisl, fringilla at iaculis scelerisque, ornare vel dolor. Ut</w:t>
+                  </w:r>
+                </w:p>
+              </w:txbxContent>
+            </v:textbox>
+          </v:shape>
+        </w:pict>
+      </w:r>
+      <w:r>
+        <w:pict>
+          <v:shape id="DocuMindTextBox124" type="#_x0000_t202" stroked="f" filled="f" o:allowincell="f" style="position:absolute;margin-left:56.800pt;margin-top:701.756pt;width:484.457pt;height:19.125pt;z-index:251659264;mso-position-horizontal-relative:page;mso-position-vertical-relative:page;mso-wrap-style:none;mso-fit-shape-to-text:t;">
+            <w10:wrap type="none"/>
+            <v:textbox inset="0,0,0,0">
+              <w:txbxContent>
+                <w:p>
+                  <w:pPr>
+                    <w:spacing w:before="0" w:after="0" w:lineRule="exact" w:line="262"/>
+                    <w:ind w:left="0" w:right="0" w:firstLine="0"/>
+                  </w:pPr>
+                  <w:r>
+                    <w:rPr>
+                      <w:rFonts w:ascii="Deja Vu Sans" w:hAnsi="Deja Vu Sans" w:eastAsia="Deja Vu Sans" w:cs="Deja Vu Sans"/>
+                      <w:b w:val="0"/>
+                      <w:i w:val="0"/>
+                      <w:color w:val="000000"/>
+                      <w:sz w:val="21"/>
+                    </w:rPr>
+                    <w:t>et pulvinar nunc. Pellentesque fringilla mollis efficitur. Nullam venenatis commodo</w:t>
+                  </w:r>
+                </w:p>
+              </w:txbxContent>
+            </v:textbox>
+          </v:shape>
+        </w:pict>
+      </w:r>
+      <w:r>
+        <w:pict>
+          <v:shape id="DocuMindTextBox125" type="#_x0000_t202" stroked="f" filled="f" o:allowincell="f" style="position:absolute;margin-left:56.800pt;margin-top:716.456pt;width:484.278pt;height:19.125pt;z-index:251659264;mso-position-horizontal-relative:page;mso-position-vertical-relative:page;mso-wrap-style:none;mso-fit-shape-to-text:t;">
+            <w10:wrap type="none"/>
+            <v:textbox inset="0,0,0,0">
+              <w:txbxContent>
+                <w:p>
+                  <w:pPr>
+                    <w:spacing w:before="0" w:after="0" w:lineRule="exact" w:line="262"/>
+                    <w:ind w:left="0" w:right="0" w:firstLine="0"/>
+                  </w:pPr>
+                  <w:r>
+                    <w:rPr>
+                      <w:rFonts w:ascii="Deja Vu Sans" w:hAnsi="Deja Vu Sans" w:eastAsia="Deja Vu Sans" w:cs="Deja Vu Sans"/>
+                      <w:b w:val="0"/>
+                      <w:i w:val="0"/>
+                      <w:color w:val="000000"/>
+                      <w:sz w:val="21"/>
+                    </w:rPr>
+                    <w:t>imperdiet. Morbi velit neque, semper quis lorem quis, efficitur dignissim ipsum. Ut ac lorem</w:t>
+                  </w:r>
+                </w:p>
+              </w:txbxContent>
+            </v:textbox>
+          </v:shape>
+        </w:pict>
+      </w:r>
+      <w:r>
+        <w:pict>
+          <v:shape id="DocuMindTextBox126" type="#_x0000_t202" stroked="f" filled="f" o:allowincell="f" style="position:absolute;margin-left:56.800pt;margin-top:731.156pt;width:254.853pt;height:19.125pt;z-index:251659264;mso-position-horizontal-relative:page;mso-position-vertical-relative:page;mso-wrap-style:none;mso-fit-shape-to-text:t;">
+            <w10:wrap type="none"/>
+            <v:textbox inset="0,0,0,0">
+              <w:txbxContent>
+                <w:p>
+                  <w:pPr>
+                    <w:spacing w:before="0" w:after="0" w:lineRule="exact" w:line="262"/>
+                    <w:ind w:left="0" w:right="0" w:firstLine="0"/>
+                  </w:pPr>
+                  <w:r>
+                    <w:rPr>
+                      <w:rFonts w:ascii="Deja Vu Sans" w:hAnsi="Deja Vu Sans" w:eastAsia="Deja Vu Sans" w:cs="Deja Vu Sans"/>
+                      <w:b w:val="0"/>
+                      <w:i w:val="0"/>
+                      <w:color w:val="000000"/>
+                      <w:sz w:val="21"/>
+                    </w:rPr>
+                    <w:t>sed turpis imperdiet eleifend sit amet id sapien.</w:t>
+                  </w:r>
+                </w:p>
+              </w:txbxContent>
+            </v:textbox>
+          </v:shape>
+        </w:pict>
+      </w:r>
+    </w:p>
+    <w:p>
+      <w:pPr>
+        <w:sectPr>
+          <w:pgSz w:w="11900" w:h="16840"/>
+          <w:pgMar w:top="0" w:right="0" w:bottom="0" w:left="0" w:header="0" w:footer="0" w:gutter="0"/>
+          <w:cols w:space="720"/>
+          <w:docGrid w:linePitch="360"/>
+        </w:sectPr>
+      </w:pPr>
+    </w:p>
+    <w:p>
+      <w:pPr>
+        <w:spacing w:before="0" w:after="0" w:lineRule="exact" w:line="20"/>
+      </w:pPr>
+      <w:r>
+        <w:rPr>
+          <w:sz w:val="2"/>
+        </w:rPr>
+      </w:r>
+      <w:r>
+        <w:pict>
+          <v:shape id="DocuMindImage127" type="#_x0000_t75" stroked="f" o:allowincell="f" style="position:absolute;margin-left:56.800pt;margin-top:56.700pt;width:481.700pt;height:321.300pt;z-index:1;mso-position-horizontal-relative:page;mso-position-vertical-relative:page;mso-wrap-style:none;">
+            <w10:wrap type="none"/>
+            <v:imagedata r:id="rId9" o:title=""/>
+          </v:shape>
+        </w:pict>
+      </w:r>
+      <w:r>
+        <w:pict>
+          <v:shape id="DocuMindTextBox128" type="#_x0000_t202" stroked="f" filled="f" o:allowincell="f" style="position:absolute;margin-left:74.800pt;margin-top:413.420pt;width:439.128pt;height:26.000pt;z-index:251659264;mso-position-horizontal-relative:page;mso-position-vertical-relative:page;mso-wrap-style:none;mso-fit-shape-to-text:t;">
+            <w10:wrap type="none"/>
+            <v:textbox inset="0,0,0,0">
+              <w:txbxContent>
+                <w:p>
+                  <w:pPr>
+                    <w:spacing w:before="0" w:after="0" w:lineRule="exact" w:line="400"/>
+                    <w:ind w:left="0" w:right="0" w:firstLine="0"/>
+                  </w:pPr>
+                  <w:r>
+                    <w:rPr>
+                      <w:rFonts w:ascii="Liberation Sans" w:hAnsi="Liberation Sans" w:eastAsia="Liberation Sans" w:cs="Liberation Sans"/>
+                      <w:b/>
+                      <w:i w:val="0"/>
+                      <w:color w:val="000000"/>
+                      <w:sz w:val="32"/>
+                    </w:rPr>
+                    <w:t xml:space="preserve">Maecenas mauris lectus, lobortis et purus mattis, blandit </w:t>
+                  </w:r>
+                </w:p>
+              </w:txbxContent>
+            </v:textbox>
+          </v:shape>
+        </w:pict>
+      </w:r>
+      <w:r>
+        <w:pict>
+          <v:shape id="DocuMindTextBox129" type="#_x0000_t202" stroked="f" filled="f" o:allowincell="f" style="position:absolute;margin-left:103.600pt;margin-top:431.820pt;width:110.440pt;height:26.000pt;z-index:251659264;mso-position-horizontal-relative:page;mso-position-vertical-relative:page;mso-wrap-style:none;mso-fit-shape-to-text:t;">
+            <w10:wrap type="none"/>
+            <v:textbox inset="0,0,0,0">
+              <w:txbxContent>
+                <w:p>
+                  <w:pPr>
+                    <w:spacing w:before="0" w:after="0" w:lineRule="exact" w:line="400"/>
+                    <w:ind w:left="0" w:right="0" w:firstLine="0"/>
+                  </w:pPr>
+                  <w:r>
+                    <w:rPr>
+                      <w:rFonts w:ascii="Liberation Sans" w:hAnsi="Liberation Sans" w:eastAsia="Liberation Sans" w:cs="Liberation Sans"/>
+                      <w:b/>
+                      <w:i w:val="0"/>
+                      <w:color w:val="000000"/>
+                      <w:sz w:val="32"/>
+                    </w:rPr>
+                    <w:t xml:space="preserve">dictum tellus. </w:t>
+                  </w:r>
+                </w:p>
+              </w:txbxContent>
+            </v:textbox>
+          </v:shape>
+        </w:pict>
+      </w:r>
+      <w:r>
+        <w:pict>
+          <v:shape id="DocuMindTextBox130" type="#_x0000_t202" stroked="f" filled="f" o:allowincell="f" style="position:absolute;margin-left:56.800pt;margin-top:455.656pt;width:483.890pt;height:19.125pt;z-index:251659264;mso-position-horizontal-relative:page;mso-position-vertical-relative:page;mso-wrap-style:none;mso-fit-shape-to-text:t;">
+            <w10:wrap type="none"/>
+            <v:textbox inset="0,0,0,0">
+              <w:txbxContent>
+                <w:p>
+                  <w:pPr>
+                    <w:spacing w:before="0" w:after="0" w:lineRule="exact" w:line="262"/>
+                    <w:ind w:left="0" w:right="0" w:firstLine="0"/>
+                  </w:pPr>
+                  <w:r>
+                    <w:rPr>
+                      <w:rFonts w:ascii="Deja Vu Sans" w:hAnsi="Deja Vu Sans" w:eastAsia="Deja Vu Sans" w:cs="Deja Vu Sans"/>
+                      <w:b w:val="0"/>
+                      <w:i w:val="0"/>
+                      <w:color w:val="000000"/>
+                      <w:sz w:val="21"/>
+                    </w:rPr>
+                    <w:t>Maecenas non lorem quis tellus placerat varius. Nulla facilisi. Aenean congue fringilla justo</w:t>
+                  </w:r>
+                </w:p>
+              </w:txbxContent>
+            </v:textbox>
+          </v:shape>
+        </w:pict>
+      </w:r>
+      <w:r>
+        <w:pict>
+          <v:shape id="DocuMindTextBox131" type="#_x0000_t202" stroked="f" filled="f" o:allowincell="f" style="position:absolute;margin-left:56.800pt;margin-top:470.356pt;width:483.858pt;height:19.125pt;z-index:251659264;mso-position-horizontal-relative:page;mso-position-vertical-relative:page;mso-wrap-style:none;mso-fit-shape-to-text:t;">
+            <w10:wrap type="none"/>
+            <v:textbox inset="0,0,0,0">
+              <w:txbxContent>
+                <w:p>
+                  <w:pPr>
+                    <w:spacing w:before="0" w:after="0" w:lineRule="exact" w:line="262"/>
+                    <w:ind w:left="0" w:right="0" w:firstLine="0"/>
+                  </w:pPr>
+                  <w:r>
+                    <w:rPr>
+                      <w:rFonts w:ascii="Deja Vu Sans" w:hAnsi="Deja Vu Sans" w:eastAsia="Deja Vu Sans" w:cs="Deja Vu Sans"/>
+                      <w:b w:val="0"/>
+                      <w:i w:val="0"/>
+                      <w:color w:val="000000"/>
+                      <w:sz w:val="21"/>
+                    </w:rPr>
+                    <w:t>ut aliquam. Mauris id ex erat. Nunc vulputate neque vitae justo facilisis, non condimentum</w:t>
+                  </w:r>
+                </w:p>
+              </w:txbxContent>
+            </v:textbox>
+          </v:shape>
+        </w:pict>
+      </w:r>
+      <w:r>
+        <w:pict>
+          <v:shape id="DocuMindTextBox132" type="#_x0000_t202" stroked="f" filled="f" o:allowincell="f" style="position:absolute;margin-left:56.800pt;margin-top:485.056pt;width:484.404pt;height:19.125pt;z-index:251659264;mso-position-horizontal-relative:page;mso-position-vertical-relative:page;mso-wrap-style:none;mso-fit-shape-to-text:t;">
+            <w10:wrap type="none"/>
+            <v:textbox inset="0,0,0,0">
+              <w:txbxContent>
+                <w:p>
+                  <w:pPr>
+                    <w:spacing w:before="0" w:after="0" w:lineRule="exact" w:line="262"/>
+                    <w:ind w:left="0" w:right="0" w:firstLine="0"/>
+                  </w:pPr>
+                  <w:r>
+                    <w:rPr>
+                      <w:rFonts w:ascii="Deja Vu Sans" w:hAnsi="Deja Vu Sans" w:eastAsia="Deja Vu Sans" w:cs="Deja Vu Sans"/>
+                      <w:b w:val="0"/>
+                      <w:i w:val="0"/>
+                      <w:color w:val="000000"/>
+                      <w:sz w:val="21"/>
+                    </w:rPr>
+                    <w:t>ante sagittis. Morbi viverra semper lorem nec molestie. Maecenas tincidunt est efficitur</w:t>
+                  </w:r>
+                </w:p>
+              </w:txbxContent>
+            </v:textbox>
+          </v:shape>
+        </w:pict>
+      </w:r>
+      <w:r>
+        <w:pict>
+          <v:shape id="DocuMindTextBox133" type="#_x0000_t202" stroked="f" filled="f" o:allowincell="f" style="position:absolute;margin-left:56.800pt;margin-top:499.756pt;width:242.999pt;height:19.125pt;z-index:251659264;mso-position-horizontal-relative:page;mso-position-vertical-relative:page;mso-wrap-style:none;mso-fit-shape-to-text:t;">
+            <w10:wrap type="none"/>
+            <v:textbox inset="0,0,0,0">
+              <w:txbxContent>
+                <w:p>
+                  <w:pPr>
+                    <w:spacing w:before="0" w:after="0" w:lineRule="exact" w:line="262"/>
+                    <w:ind w:left="0" w:right="0" w:firstLine="0"/>
+                  </w:pPr>
+                  <w:r>
+                    <w:rPr>
+                      <w:rFonts w:ascii="Deja Vu Sans" w:hAnsi="Deja Vu Sans" w:eastAsia="Deja Vu Sans" w:cs="Deja Vu Sans"/>
+                      <w:b w:val="0"/>
+                      <w:i w:val="0"/>
+                      <w:color w:val="000000"/>
+                      <w:sz w:val="21"/>
+                    </w:rPr>
+                    <w:t>ligula euismod, sit amet ornare est vulputate.</w:t>
+                  </w:r>
+                </w:p>
+              </w:txbxContent>
+            </v:textbox>
+          </v:shape>
+        </w:pict>
+      </w:r>
+      <w:r>
+        <w:pict>
+          <v:shape id="DocuMindTextBox134" type="#_x0000_t202" stroked="f" filled="f" o:allowincell="f" style="position:absolute;margin-left:56.800pt;margin-top:525.756pt;width:483.669pt;height:19.125pt;z-index:251659264;mso-position-horizontal-relative:page;mso-position-vertical-relative:page;mso-wrap-style:none;mso-fit-shape-to-text:t;">
+            <w10:wrap type="none"/>
+            <v:textbox inset="0,0,0,0">
+              <w:txbxContent>
+                <w:p>
+                  <w:pPr>
+                    <w:spacing w:before="0" w:after="0" w:lineRule="exact" w:line="262"/>
+                    <w:ind w:left="0" w:right="0" w:firstLine="0"/>
+                  </w:pPr>
+                  <w:r>
+                    <w:rPr>
+                      <w:rFonts w:ascii="Deja Vu Sans" w:hAnsi="Deja Vu Sans" w:eastAsia="Deja Vu Sans" w:cs="Deja Vu Sans"/>
+                      <w:b w:val="0"/>
+                      <w:i w:val="0"/>
+                      <w:color w:val="000000"/>
+                      <w:sz w:val="21"/>
+                    </w:rPr>
+                    <w:t>In non mauris justo. Duis vehicula mi vel mi pretium, a viverra erat efficitur. Cras aliquam</w:t>
+                  </w:r>
+                </w:p>
+              </w:txbxContent>
+            </v:textbox>
+          </v:shape>
+        </w:pict>
+      </w:r>
+      <w:r>
+        <w:pict>
+          <v:shape id="DocuMindTextBox135" type="#_x0000_t202" stroked="f" filled="f" o:allowincell="f" style="position:absolute;margin-left:56.800pt;margin-top:540.456pt;width:484.110pt;height:19.125pt;z-index:251659264;mso-position-horizontal-relative:page;mso-position-vertical-relative:page;mso-wrap-style:none;mso-fit-shape-to-text:t;">
+            <w10:wrap type="none"/>
+            <v:textbox inset="0,0,0,0">
+              <w:txbxContent>
+                <w:p>
+                  <w:pPr>
+                    <w:spacing w:before="0" w:after="0" w:lineRule="exact" w:line="262"/>
+                    <w:ind w:left="0" w:right="0" w:firstLine="0"/>
+                  </w:pPr>
+                  <w:r>
+                    <w:rPr>
+                      <w:rFonts w:ascii="Deja Vu Sans" w:hAnsi="Deja Vu Sans" w:eastAsia="Deja Vu Sans" w:cs="Deja Vu Sans"/>
+                      <w:b w:val="0"/>
+                      <w:i w:val="0"/>
+                      <w:color w:val="000000"/>
+                      <w:sz w:val="21"/>
+                    </w:rPr>
+                    <w:t>est ac eros varius, id iaculis dui auctor. Duis pretium neque ligula, et pulvinar mi placerat</w:t>
+                  </w:r>
+                </w:p>
+              </w:txbxContent>
+            </v:textbox>
+          </v:shape>
+        </w:pict>
+      </w:r>
+      <w:r>
+        <w:pict>
+          <v:shape id="DocuMindTextBox136" type="#_x0000_t202" stroked="f" filled="f" o:allowincell="f" style="position:absolute;margin-left:56.800pt;margin-top:555.156pt;width:484.036pt;height:19.125pt;z-index:251659264;mso-position-horizontal-relative:page;mso-position-vertical-relative:page;mso-wrap-style:none;mso-fit-shape-to-text:t;">
+            <w10:wrap type="none"/>
+            <v:textbox inset="0,0,0,0">
+              <w:txbxContent>
+                <w:p>
+                  <w:pPr>
+                    <w:spacing w:before="0" w:after="0" w:lineRule="exact" w:line="262"/>
+                    <w:ind w:left="0" w:right="0" w:firstLine="0"/>
+                  </w:pPr>
+                  <w:r>
+                    <w:rPr>
+                      <w:rFonts w:ascii="Deja Vu Sans" w:hAnsi="Deja Vu Sans" w:eastAsia="Deja Vu Sans" w:cs="Deja Vu Sans"/>
+                      <w:b w:val="0"/>
+                      <w:i w:val="0"/>
+                      <w:color w:val="000000"/>
+                      <w:sz w:val="21"/>
+                    </w:rPr>
+                    <w:t>et. Nulla nec nunc sit amet nunc posuere vestibulum. Ut id neque eget tortor mattis</w:t>
+                  </w:r>
+                </w:p>
+              </w:txbxContent>
+            </v:textbox>
+          </v:shape>
+        </w:pict>
+      </w:r>
+      <w:r>
+        <w:pict>
+          <v:shape id="DocuMindTextBox137" type="#_x0000_t202" stroked="f" filled="f" o:allowincell="f" style="position:absolute;margin-left:56.800pt;margin-top:569.856pt;width:483.837pt;height:19.125pt;z-index:251659264;mso-position-horizontal-relative:page;mso-position-vertical-relative:page;mso-wrap-style:none;mso-fit-shape-to-text:t;">
+            <w10:wrap type="none"/>
+            <v:textbox inset="0,0,0,0">
+              <w:txbxContent>
+                <w:p>
+                  <w:pPr>
+                    <w:spacing w:before="0" w:after="0" w:lineRule="exact" w:line="262"/>
+                    <w:ind w:left="0" w:right="0" w:firstLine="0"/>
+                  </w:pPr>
+                  <w:r>
+                    <w:rPr>
+                      <w:rFonts w:ascii="Deja Vu Sans" w:hAnsi="Deja Vu Sans" w:eastAsia="Deja Vu Sans" w:cs="Deja Vu Sans"/>
+                      <w:b w:val="0"/>
+                      <w:i w:val="0"/>
+                      <w:color w:val="000000"/>
+                      <w:sz w:val="21"/>
+                    </w:rPr>
+                    <w:t>tristique. Donec ante est, blandit sit amet tristique vel, lacinia pulvinar arcu. Pellentesque</w:t>
+                  </w:r>
+                </w:p>
+              </w:txbxContent>
+            </v:textbox>
+          </v:shape>
+        </w:pict>
+      </w:r>
+      <w:r>
+        <w:pict>
+          <v:shape id="DocuMindTextBox138" type="#_x0000_t202" stroked="f" filled="f" o:allowincell="f" style="position:absolute;margin-left:56.800pt;margin-top:584.556pt;width:483.847pt;height:19.125pt;z-index:251659264;mso-position-horizontal-relative:page;mso-position-vertical-relative:page;mso-wrap-style:none;mso-fit-shape-to-text:t;">
+            <w10:wrap type="none"/>
+            <v:textbox inset="0,0,0,0">
+              <w:txbxContent>
+                <w:p>
+                  <w:pPr>
+                    <w:spacing w:before="0" w:after="0" w:lineRule="exact" w:line="262"/>
+                    <w:ind w:left="0" w:right="0" w:firstLine="0"/>
+                  </w:pPr>
+                  <w:r>
+                    <w:rPr>
+                      <w:rFonts w:ascii="Deja Vu Sans" w:hAnsi="Deja Vu Sans" w:eastAsia="Deja Vu Sans" w:cs="Deja Vu Sans"/>
+                      <w:b w:val="0"/>
+                      <w:i w:val="0"/>
+                      <w:color w:val="000000"/>
+                      <w:sz w:val="21"/>
+                    </w:rPr>
+                    <w:t>scelerisque fermentum erat, id posuere justo pulvinar ut. Cras id eros sed enim aliquam</w:t>
+                  </w:r>
+                </w:p>
+              </w:txbxContent>
+            </v:textbox>
+          </v:shape>
+        </w:pict>
+      </w:r>
+      <w:r>
+        <w:pict>
+          <v:shape id="DocuMindTextBox139" type="#_x0000_t202" stroked="f" filled="f" o:allowincell="f" style="position:absolute;margin-left:56.800pt;margin-top:599.256pt;width:484.173pt;height:19.125pt;z-index:251659264;mso-position-horizontal-relative:page;mso-position-vertical-relative:page;mso-wrap-style:none;mso-fit-shape-to-text:t;">
+            <w10:wrap type="none"/>
+            <v:textbox inset="0,0,0,0">
+              <w:txbxContent>
+                <w:p>
+                  <w:pPr>
+                    <w:spacing w:before="0" w:after="0" w:lineRule="exact" w:line="262"/>
+                    <w:ind w:left="0" w:right="0" w:firstLine="0"/>
+                  </w:pPr>
+                  <w:r>
+                    <w:rPr>
+                      <w:rFonts w:ascii="Deja Vu Sans" w:hAnsi="Deja Vu Sans" w:eastAsia="Deja Vu Sans" w:cs="Deja Vu Sans"/>
+                      <w:b w:val="0"/>
+                      <w:i w:val="0"/>
+                      <w:color w:val="000000"/>
+                      <w:sz w:val="21"/>
+                    </w:rPr>
+                    <w:t>lobortis. Sed lobortis nisl ut eros efficitur tincidunt. Cras justo mi, porttitor quis mattis vel,</w:t>
+                  </w:r>
+                </w:p>
+              </w:txbxContent>
+            </v:textbox>
+          </v:shape>
+        </w:pict>
+      </w:r>
+      <w:r>
+        <w:pict>
+          <v:shape id="DocuMindTextBox140" type="#_x0000_t202" stroked="f" filled="f" o:allowincell="f" style="position:absolute;margin-left:56.800pt;margin-top:613.956pt;width:253.803pt;height:19.125pt;z-index:251659264;mso-position-horizontal-relative:page;mso-position-vertical-relative:page;mso-wrap-style:none;mso-fit-shape-to-text:t;">
+            <w10:wrap type="none"/>
+            <v:textbox inset="0,0,0,0">
+              <w:txbxContent>
+                <w:p>
+                  <w:pPr>
+                    <w:spacing w:before="0" w:after="0" w:lineRule="exact" w:line="262"/>
+                    <w:ind w:left="0" w:right="0" w:firstLine="0"/>
+                  </w:pPr>
+                  <w:r>
+                    <w:rPr>
+                      <w:rFonts w:ascii="Deja Vu Sans" w:hAnsi="Deja Vu Sans" w:eastAsia="Deja Vu Sans" w:cs="Deja Vu Sans"/>
+                      <w:b w:val="0"/>
+                      <w:i w:val="0"/>
+                      <w:color w:val="000000"/>
+                      <w:sz w:val="21"/>
+                    </w:rPr>
+                    <w:t>ultricies ut purus. Ut facilisis et lacus eu cursus.</w:t>
+                  </w:r>
+                </w:p>
+              </w:txbxContent>
+            </v:textbox>
+          </v:shape>
+        </w:pict>
+      </w:r>
+      <w:r>
+        <w:pict>
+          <v:shape id="DocuMindTextBox141" type="#_x0000_t202" stroked="f" filled="f" o:allowincell="f" style="position:absolute;margin-left:74.800pt;margin-top:650.420pt;width:375.176pt;height:26.000pt;z-index:251659264;mso-position-horizontal-relative:page;mso-position-vertical-relative:page;mso-wrap-style:none;mso-fit-shape-to-text:t;">
+            <w10:wrap type="none"/>
+            <v:textbox inset="0,0,0,0">
+              <w:txbxContent>
+                <w:p>
+                  <w:pPr>
+                    <w:spacing w:before="0" w:after="0" w:lineRule="exact" w:line="400"/>
+                    <w:ind w:left="0" w:right="0" w:firstLine="0"/>
+                  </w:pPr>
+                  <w:r>
+                    <w:rPr>
+                      <w:rFonts w:ascii="Liberation Sans" w:hAnsi="Liberation Sans" w:eastAsia="Liberation Sans" w:cs="Liberation Sans"/>
+                      <w:b/>
+                      <w:i w:val="0"/>
+                      <w:color w:val="000000"/>
+                      <w:sz w:val="32"/>
+                    </w:rPr>
+                    <w:t xml:space="preserve">In eleifend velit vitae libero sollicitudin euismod. </w:t>
+                  </w:r>
+                </w:p>
+              </w:txbxContent>
+            </v:textbox>
+          </v:shape>
+        </w:pict>
+      </w:r>
+      <w:r>
+        <w:pict>
+          <v:shape id="DocuMindTextBox142" type="#_x0000_t202" stroked="f" filled="f" o:allowincell="f" style="position:absolute;margin-left:56.800pt;margin-top:674.256pt;width:484.036pt;height:19.125pt;z-index:251659264;mso-position-horizontal-relative:page;mso-position-vertical-relative:page;mso-wrap-style:none;mso-fit-shape-to-text:t;">
+            <w10:wrap type="none"/>
+            <v:textbox inset="0,0,0,0">
+              <w:txbxContent>
+                <w:p>
+                  <w:pPr>
+                    <w:spacing w:before="0" w:after="0" w:lineRule="exact" w:line="262"/>
+                    <w:ind w:left="0" w:right="0" w:firstLine="0"/>
+                  </w:pPr>
+                  <w:r>
+                    <w:rPr>
+                      <w:rFonts w:ascii="Deja Vu Sans" w:hAnsi="Deja Vu Sans" w:eastAsia="Deja Vu Sans" w:cs="Deja Vu Sans"/>
+                      <w:b w:val="0"/>
+                      <w:i w:val="0"/>
+                      <w:color w:val="000000"/>
+                      <w:sz w:val="21"/>
+                    </w:rPr>
+                    <w:t>Fusce vitae vestibulum velit. Pellentesque vulputate lectus quis pellentesque commodo.</w:t>
+                  </w:r>
+                </w:p>
+              </w:txbxContent>
+            </v:textbox>
+          </v:shape>
+        </w:pict>
+      </w:r>
+      <w:r>
+        <w:pict>
+          <v:shape id="DocuMindTextBox143" type="#_x0000_t202" stroked="f" filled="f" o:allowincell="f" style="position:absolute;margin-left:56.800pt;margin-top:688.956pt;width:484.047pt;height:19.125pt;z-index:251659264;mso-position-horizontal-relative:page;mso-position-vertical-relative:page;mso-wrap-style:none;mso-fit-shape-to-text:t;">
+            <w10:wrap type="none"/>
+            <v:textbox inset="0,0,0,0">
+              <w:txbxContent>
+                <w:p>
+                  <w:pPr>
+                    <w:spacing w:before="0" w:after="0" w:lineRule="exact" w:line="262"/>
+                    <w:ind w:left="0" w:right="0" w:firstLine="0"/>
+                  </w:pPr>
+                  <w:r>
+                    <w:rPr>
+                      <w:rFonts w:ascii="Deja Vu Sans" w:hAnsi="Deja Vu Sans" w:eastAsia="Deja Vu Sans" w:cs="Deja Vu Sans"/>
+                      <w:b w:val="0"/>
+                      <w:i w:val="0"/>
+                      <w:color w:val="000000"/>
+                      <w:sz w:val="21"/>
+                    </w:rPr>
+                    <w:t>Aliquam erat volutpat. Vestibulum in egestas velit. Pellentesque fermentum nisl vitae</w:t>
+                  </w:r>
+                </w:p>
+              </w:txbxContent>
+            </v:textbox>
+          </v:shape>
+        </w:pict>
+      </w:r>
+      <w:r>
+        <w:pict>
+          <v:shape id="DocuMindTextBox144" type="#_x0000_t202" stroked="f" filled="f" o:allowincell="f" style="position:absolute;margin-left:56.800pt;margin-top:703.656pt;width:484.520pt;height:19.125pt;z-index:251659264;mso-position-horizontal-relative:page;mso-position-vertical-relative:page;mso-wrap-style:none;mso-fit-shape-to-text:t;">
+            <w10:wrap type="none"/>
+            <v:textbox inset="0,0,0,0">
+              <w:txbxContent>
+                <w:p>
+                  <w:pPr>
+                    <w:spacing w:before="0" w:after="0" w:lineRule="exact" w:line="262"/>
+                    <w:ind w:left="0" w:right="0" w:firstLine="0"/>
+                  </w:pPr>
+                  <w:r>
+                    <w:rPr>
+                      <w:rFonts w:ascii="Deja Vu Sans" w:hAnsi="Deja Vu Sans" w:eastAsia="Deja Vu Sans" w:cs="Deja Vu Sans"/>
+                      <w:b w:val="0"/>
+                      <w:i w:val="0"/>
+                      <w:color w:val="000000"/>
+                      <w:sz w:val="21"/>
+                    </w:rPr>
+                    <w:t>fringilla venenatis. Etiam id mauris vitae orci maximus ultricies. Cras fringilla ipsum</w:t>
+                  </w:r>
+                </w:p>
+              </w:txbxContent>
+            </v:textbox>
+          </v:shape>
+        </w:pict>
+      </w:r>
+      <w:r>
+        <w:pict>
+          <v:shape id="DocuMindTextBox145" type="#_x0000_t202" stroked="f" filled="f" o:allowincell="f" style="position:absolute;margin-left:56.800pt;margin-top:718.356pt;width:186.509pt;height:19.125pt;z-index:251659264;mso-position-horizontal-relative:page;mso-position-vertical-relative:page;mso-wrap-style:none;mso-fit-shape-to-text:t;">
+            <w10:wrap type="none"/>
+            <v:textbox inset="0,0,0,0">
+              <w:txbxContent>
+                <w:p>
+                  <w:pPr>
+                    <w:spacing w:before="0" w:after="0" w:lineRule="exact" w:line="262"/>
+                    <w:ind w:left="0" w:right="0" w:firstLine="0"/>
+                  </w:pPr>
+                  <w:r>
+                    <w:rPr>
+                      <w:rFonts w:ascii="Deja Vu Sans" w:hAnsi="Deja Vu Sans" w:eastAsia="Deja Vu Sans" w:cs="Deja Vu Sans"/>
+                      <w:b w:val="0"/>
+                      <w:i w:val="0"/>
+                      <w:color w:val="000000"/>
+                      <w:sz w:val="21"/>
+                    </w:rPr>
+                    <w:t>magna, in fringilla dui commodo a.</w:t>
+                  </w:r>
+                </w:p>
+              </w:txbxContent>
+            </v:textbox>
+          </v:shape>
+        </w:pict>
+      </w:r>
+      <w:r>
+        <w:pict>
+          <v:shape id="DocuMindTextBox146" type="#_x0000_t202" stroked="f" filled="f" o:allowincell="f" style="position:absolute;margin-left:56.800pt;margin-top:744.356pt;width:483.732pt;height:19.125pt;z-index:251659264;mso-position-horizontal-relative:page;mso-position-vertical-relative:page;mso-wrap-style:none;mso-fit-shape-to-text:t;">
+            <w10:wrap type="none"/>
+            <v:textbox inset="0,0,0,0">
+              <w:txbxContent>
+                <w:p>
+                  <w:pPr>
+                    <w:spacing w:before="0" w:after="0" w:lineRule="exact" w:line="262"/>
+                    <w:ind w:left="0" w:right="0" w:firstLine="0"/>
+                  </w:pPr>
+                  <w:r>
+                    <w:rPr>
+                      <w:rFonts w:ascii="Deja Vu Sans" w:hAnsi="Deja Vu Sans" w:eastAsia="Deja Vu Sans" w:cs="Deja Vu Sans"/>
+                      <w:b w:val="0"/>
+                      <w:i w:val="0"/>
+                      <w:color w:val="000000"/>
+                      <w:sz w:val="21"/>
+                    </w:rPr>
+                    <w:t>Etiam vehicula luctus fermentum. In vel metus congue, pulvinar lectus vel, fermentum dui.</w:t>
+                  </w:r>
+                </w:p>
+              </w:txbxContent>
+            </v:textbox>
+          </v:shape>
+        </w:pict>
+      </w:r>
+      <w:r>
+        <w:pict>
+          <v:shape id="DocuMindTextBox147" type="#_x0000_t202" stroked="f" filled="f" o:allowincell="f" style="position:absolute;margin-left:56.800pt;margin-top:759.056pt;width:484.299pt;height:19.125pt;z-index:251659264;mso-position-horizontal-relative:page;mso-position-vertical-relative:page;mso-wrap-style:none;mso-fit-shape-to-text:t;">
             <w10:wrap type="none"/>
             <v:textbox inset="0,0,0,0">
               <w:txbxContent>
@@ -3620,7 +4030,7 @@
       </w:r>
       <w:r>
         <w:pict>
-          <v:shape id="DocuMindTextBox128" type="#_x0000_t202" stroked="f" filled="f" o:allowincell="f" style="position:absolute;margin-left:56.800pt;margin-top:55.256pt;width:484.047pt;height:19.125pt;z-index:251659264;mso-position-horizontal-relative:page;mso-position-vertical-relative:page;mso-wrap-style:none;mso-fit-shape-to-text:t;">
+          <v:shape id="DocuMindTextBox148" type="#_x0000_t202" stroked="f" filled="f" o:allowincell="f" style="position:absolute;margin-left:56.800pt;margin-top:55.256pt;width:484.047pt;height:19.125pt;z-index:251659264;mso-position-horizontal-relative:page;mso-position-vertical-relative:page;mso-wrap-style:none;mso-fit-shape-to-text:t;">
             <w10:wrap type="none"/>
             <v:textbox inset="0,0,0,0">
               <w:txbxContent>
@@ -3647,7 +4057,7 @@
       </w:r>
       <w:r>
         <w:pict>
-          <v:shape id="DocuMindTextBox129" type="#_x0000_t202" stroked="f" filled="f" o:allowincell="f" style="position:absolute;margin-left:56.800pt;margin-top:69.956pt;width:484.498pt;height:19.125pt;z-index:251659264;mso-position-horizontal-relative:page;mso-position-vertical-relative:page;mso-wrap-style:none;mso-fit-shape-to-text:t;">
+          <v:shape id="DocuMindTextBox149" type="#_x0000_t202" stroked="f" filled="f" o:allowincell="f" style="position:absolute;margin-left:56.800pt;margin-top:69.956pt;width:484.498pt;height:19.125pt;z-index:251659264;mso-position-horizontal-relative:page;mso-position-vertical-relative:page;mso-wrap-style:none;mso-fit-shape-to-text:t;">
             <w10:wrap type="none"/>
             <v:textbox inset="0,0,0,0">
               <w:txbxContent>
@@ -3674,7 +4084,7 @@
       </w:r>
       <w:r>
         <w:pict>
-          <v:shape id="DocuMindTextBox130" type="#_x0000_t202" stroked="f" filled="f" o:allowincell="f" style="position:absolute;margin-left:56.800pt;margin-top:84.656pt;width:484.299pt;height:19.125pt;z-index:251659264;mso-position-horizontal-relative:page;mso-position-vertical-relative:page;mso-wrap-style:none;mso-fit-shape-to-text:t;">
+          <v:shape id="DocuMindTextBox150" type="#_x0000_t202" stroked="f" filled="f" o:allowincell="f" style="position:absolute;margin-left:56.800pt;margin-top:84.656pt;width:484.299pt;height:19.125pt;z-index:251659264;mso-position-horizontal-relative:page;mso-position-vertical-relative:page;mso-wrap-style:none;mso-fit-shape-to-text:t;">
             <w10:wrap type="none"/>
             <v:textbox inset="0,0,0,0">
               <w:txbxContent>
@@ -3701,7 +4111,7 @@
       </w:r>
       <w:r>
         <w:pict>
-          <v:shape id="DocuMindTextBox131" type="#_x0000_t202" stroked="f" filled="f" o:allowincell="f" style="position:absolute;margin-left:56.800pt;margin-top:99.356pt;width:483.858pt;height:19.125pt;z-index:251659264;mso-position-horizontal-relative:page;mso-position-vertical-relative:page;mso-wrap-style:none;mso-fit-shape-to-text:t;">
+          <v:shape id="DocuMindTextBox151" type="#_x0000_t202" stroked="f" filled="f" o:allowincell="f" style="position:absolute;margin-left:56.800pt;margin-top:99.356pt;width:483.858pt;height:19.125pt;z-index:251659264;mso-position-horizontal-relative:page;mso-position-vertical-relative:page;mso-wrap-style:none;mso-fit-shape-to-text:t;">
             <w10:wrap type="none"/>
             <v:textbox inset="0,0,0,0">
               <w:txbxContent>
@@ -3728,7 +4138,7 @@
       </w:r>
       <w:r>
         <w:pict>
-          <v:shape id="DocuMindTextBox132" type="#_x0000_t202" stroked="f" filled="f" o:allowincell="f" style="position:absolute;margin-left:56.800pt;margin-top:114.056pt;width:484.457pt;height:19.125pt;z-index:251659264;mso-position-horizontal-relative:page;mso-position-vertical-relative:page;mso-wrap-style:none;mso-fit-shape-to-text:t;">
+          <v:shape id="DocuMindTextBox152" type="#_x0000_t202" stroked="f" filled="f" o:allowincell="f" style="position:absolute;margin-left:56.800pt;margin-top:114.056pt;width:484.457pt;height:19.125pt;z-index:251659264;mso-position-horizontal-relative:page;mso-position-vertical-relative:page;mso-wrap-style:none;mso-fit-shape-to-text:t;">
             <w10:wrap type="none"/>
             <v:textbox inset="0,0,0,0">
               <w:txbxContent>
@@ -3755,7 +4165,7 @@
       </w:r>
       <w:r>
         <w:pict>
-          <v:shape id="DocuMindTextBox133" type="#_x0000_t202" stroked="f" filled="f" o:allowincell="f" style="position:absolute;margin-left:56.800pt;margin-top:128.756pt;width:484.278pt;height:19.125pt;z-index:251659264;mso-position-horizontal-relative:page;mso-position-vertical-relative:page;mso-wrap-style:none;mso-fit-shape-to-text:t;">
+          <v:shape id="DocuMindTextBox153" type="#_x0000_t202" stroked="f" filled="f" o:allowincell="f" style="position:absolute;margin-left:56.800pt;margin-top:128.756pt;width:484.278pt;height:19.125pt;z-index:251659264;mso-position-horizontal-relative:page;mso-position-vertical-relative:page;mso-wrap-style:none;mso-fit-shape-to-text:t;">
             <w10:wrap type="none"/>
             <v:textbox inset="0,0,0,0">
               <w:txbxContent>
@@ -3782,7 +4192,7 @@
       </w:r>
       <w:r>
         <w:pict>
-          <v:shape id="DocuMindTextBox134" type="#_x0000_t202" stroked="f" filled="f" o:allowincell="f" style="position:absolute;margin-left:56.800pt;margin-top:143.456pt;width:254.853pt;height:19.125pt;z-index:251659264;mso-position-horizontal-relative:page;mso-position-vertical-relative:page;mso-wrap-style:none;mso-fit-shape-to-text:t;">
+          <v:shape id="DocuMindTextBox154" type="#_x0000_t202" stroked="f" filled="f" o:allowincell="f" style="position:absolute;margin-left:56.800pt;margin-top:143.456pt;width:254.853pt;height:19.125pt;z-index:251659264;mso-position-horizontal-relative:page;mso-position-vertical-relative:page;mso-wrap-style:none;mso-fit-shape-to-text:t;">
             <w10:wrap type="none"/>
             <v:textbox inset="0,0,0,0">
               <w:txbxContent>

</xml_diff>

<commit_message>
Step 52 - Preserve table cell typography and alignment
</commit_message>
<xml_diff>
--- a/output/output.docx
+++ b/output/output.docx
@@ -1175,6 +1175,7 @@
                   <w:pPr>
                     <w:spacing w:before="0" w:after="0" w:line="240" w:lineRule="auto"/>
                     <w:ind w:left="0" w:right="0" w:firstLine="0"/>
+                    <w:jc w:val="left"/>
                   </w:pPr>
                   <w:r>
                     <w:rPr>
@@ -1198,6 +1199,7 @@
                   <w:pPr>
                     <w:spacing w:before="0" w:after="0" w:line="240" w:lineRule="auto"/>
                     <w:ind w:left="0" w:right="0" w:firstLine="0"/>
+                    <w:jc w:val="left"/>
                   </w:pPr>
                   <w:r>
                     <w:rPr>
@@ -1225,6 +1227,7 @@
                   <w:pPr>
                     <w:spacing w:before="0" w:after="0" w:line="240" w:lineRule="auto"/>
                     <w:ind w:left="0" w:right="0" w:firstLine="0"/>
+                    <w:jc w:val="center"/>
                   </w:pPr>
                   <w:r>
                     <w:rPr>
@@ -1252,6 +1255,7 @@
                   <w:pPr>
                     <w:spacing w:before="0" w:after="0" w:line="240" w:lineRule="auto"/>
                     <w:ind w:left="0" w:right="0" w:firstLine="0"/>
+                    <w:jc w:val="left"/>
                   </w:pPr>
                   <w:r>
                     <w:rPr>
@@ -1279,6 +1283,7 @@
                   <w:pPr>
                     <w:spacing w:before="0" w:after="0" w:line="240" w:lineRule="auto"/>
                     <w:ind w:left="0" w:right="0" w:firstLine="0"/>
+                    <w:jc w:val="left"/>
                   </w:pPr>
                   <w:r>
                     <w:rPr>
@@ -1306,6 +1311,7 @@
                   <w:pPr>
                     <w:spacing w:before="0" w:after="0" w:line="240" w:lineRule="auto"/>
                     <w:ind w:left="0" w:right="0" w:firstLine="0"/>
+                    <w:jc w:val="left"/>
                   </w:pPr>
                   <w:r>
                     <w:rPr>
@@ -1333,6 +1339,7 @@
                   <w:pPr>
                     <w:spacing w:before="0" w:after="0" w:line="240" w:lineRule="auto"/>
                     <w:ind w:left="0" w:right="0" w:firstLine="0"/>
+                    <w:jc w:val="left"/>
                   </w:pPr>
                   <w:r>
                     <w:rPr>
@@ -1360,6 +1367,7 @@
                   <w:pPr>
                     <w:spacing w:before="0" w:after="0" w:line="240" w:lineRule="auto"/>
                     <w:ind w:left="0" w:right="0" w:firstLine="0"/>
+                    <w:jc w:val="left"/>
                   </w:pPr>
                   <w:r>
                     <w:rPr>
@@ -1383,6 +1391,7 @@
                   <w:pPr>
                     <w:spacing w:before="0" w:after="0" w:line="240" w:lineRule="auto"/>
                     <w:ind w:left="0" w:right="0" w:firstLine="0"/>
+                    <w:jc w:val="left"/>
                   </w:pPr>
                   <w:r>
                     <w:rPr>
@@ -1410,6 +1419,7 @@
                   <w:pPr>
                     <w:spacing w:before="0" w:after="0" w:line="240" w:lineRule="auto"/>
                     <w:ind w:left="0" w:right="0" w:firstLine="0"/>
+                    <w:jc w:val="center"/>
                   </w:pPr>
                   <w:r>
                     <w:rPr>
@@ -1420,6 +1430,8 @@
                       <w:sz w:val="21"/>
                     </w:rPr>
                     <w:t>Cras fringilla ipsum magna, in fringilla dui commodo</w:t>
+                  </w:r>
+                  <w:r>
                     <w:br/>
                   </w:r>
                   <w:r>
@@ -1448,6 +1460,7 @@
                   <w:pPr>
                     <w:spacing w:before="0" w:after="0" w:line="240" w:lineRule="auto"/>
                     <w:ind w:left="0" w:right="0" w:firstLine="0"/>
+                    <w:jc w:val="left"/>
                   </w:pPr>
                   <w:r>
                     <w:rPr>
@@ -1475,6 +1488,7 @@
                   <w:pPr>
                     <w:spacing w:before="0" w:after="0" w:line="240" w:lineRule="auto"/>
                     <w:ind w:left="0" w:right="0" w:firstLine="0"/>
+                    <w:jc w:val="left"/>
                   </w:pPr>
                   <w:r>
                     <w:rPr>
@@ -1498,6 +1512,7 @@
                   <w:pPr>
                     <w:spacing w:before="0" w:after="0" w:line="240" w:lineRule="auto"/>
                     <w:ind w:left="0" w:right="0" w:firstLine="0"/>
+                    <w:jc w:val="left"/>
                   </w:pPr>
                   <w:r>
                     <w:rPr>
@@ -1525,6 +1540,7 @@
                   <w:pPr>
                     <w:spacing w:before="0" w:after="0" w:line="240" w:lineRule="auto"/>
                     <w:ind w:left="0" w:right="0" w:firstLine="0"/>
+                    <w:jc w:val="left"/>
                   </w:pPr>
                   <w:r>
                     <w:rPr>
@@ -1534,7 +1550,7 @@
                       <w:color w:val="000000"/>
                       <w:sz w:val="21"/>
                     </w:rPr>
-                    <w:t>Aliquam erat volutpat.</w:t>
+                    <w:t xml:space="preserve">Aliquam erat volutpat. </w:t>
                   </w:r>
                 </w:p>
               </w:txbxContent>
@@ -1552,6 +1568,7 @@
                   <w:pPr>
                     <w:spacing w:before="0" w:after="0" w:line="240" w:lineRule="auto"/>
                     <w:ind w:left="0" w:right="0" w:firstLine="0"/>
+                    <w:jc w:val="left"/>
                   </w:pPr>
                   <w:r>
                     <w:rPr>
@@ -1579,6 +1596,7 @@
                   <w:pPr>
                     <w:spacing w:before="0" w:after="0" w:line="240" w:lineRule="auto"/>
                     <w:ind w:left="0" w:right="0" w:firstLine="0"/>
+                    <w:jc w:val="left"/>
                   </w:pPr>
                   <w:r>
                     <w:rPr>
@@ -1602,6 +1620,7 @@
                   <w:pPr>
                     <w:spacing w:before="0" w:after="0" w:line="240" w:lineRule="auto"/>
                     <w:ind w:left="0" w:right="0" w:firstLine="0"/>
+                    <w:jc w:val="left"/>
                   </w:pPr>
                   <w:r>
                     <w:rPr>
@@ -1629,6 +1648,7 @@
                   <w:pPr>
                     <w:spacing w:before="0" w:after="0" w:line="240" w:lineRule="auto"/>
                     <w:ind w:left="0" w:right="0" w:firstLine="0"/>
+                    <w:jc w:val="left"/>
                   </w:pPr>
                   <w:r>
                     <w:rPr>
@@ -1638,7 +1658,7 @@
                       <w:color w:val="000000"/>
                       <w:sz w:val="21"/>
                     </w:rPr>
-                    <w:t>Fusce vitae vestibulum velit.</w:t>
+                    <w:t xml:space="preserve">Fusce vitae vestibulum velit. </w:t>
                   </w:r>
                 </w:p>
               </w:txbxContent>
@@ -1656,6 +1676,7 @@
                   <w:pPr>
                     <w:spacing w:before="0" w:after="0" w:line="240" w:lineRule="auto"/>
                     <w:ind w:left="0" w:right="0" w:firstLine="0"/>
+                    <w:jc w:val="left"/>
                   </w:pPr>
                   <w:r>
                     <w:rPr>
@@ -1683,6 +1704,7 @@
                   <w:pPr>
                     <w:spacing w:before="0" w:after="0" w:line="240" w:lineRule="auto"/>
                     <w:ind w:left="0" w:right="0" w:firstLine="0"/>
+                    <w:jc w:val="left"/>
                   </w:pPr>
                   <w:r>
                     <w:rPr>
@@ -1706,6 +1728,7 @@
                   <w:pPr>
                     <w:spacing w:before="0" w:after="0" w:line="240" w:lineRule="auto"/>
                     <w:ind w:left="0" w:right="0" w:firstLine="0"/>
+                    <w:jc w:val="left"/>
                   </w:pPr>
                   <w:r>
                     <w:rPr>
@@ -1733,6 +1756,7 @@
                   <w:pPr>
                     <w:spacing w:before="0" w:after="0" w:line="240" w:lineRule="auto"/>
                     <w:ind w:left="0" w:right="0" w:firstLine="0"/>
+                    <w:jc w:val="left"/>
                   </w:pPr>
                   <w:r>
                     <w:rPr>
@@ -1760,6 +1784,7 @@
                   <w:pPr>
                     <w:spacing w:before="0" w:after="0" w:line="240" w:lineRule="auto"/>
                     <w:ind w:left="0" w:right="0" w:firstLine="0"/>
+                    <w:jc w:val="left"/>
                   </w:pPr>
                   <w:r>
                     <w:rPr>
@@ -1787,6 +1812,7 @@
                   <w:pPr>
                     <w:spacing w:before="0" w:after="0" w:line="240" w:lineRule="auto"/>
                     <w:ind w:left="0" w:right="0" w:firstLine="0"/>
+                    <w:jc w:val="left"/>
                   </w:pPr>
                   <w:r>
                     <w:rPr>

</xml_diff>

<commit_message>
Step 53 - Render table grid lines without duplicate borders
</commit_message>
<xml_diff>
--- a/output/output.docx
+++ b/output/output.docx
@@ -1167,7 +1167,91 @@
       </w:r>
       <w:r>
         <w:pict>
-          <v:shape id="DocuMindTableCell43" type="#_x0000_t202" filled="f" stroked="t" strokecolor="#000000" strokeweight="0.75pt" o:allowincell="f" style="position:absolute;margin-left:56.743pt;margin-top:378.300pt;width:36.007pt;height:29.100pt;z-index:100;mso-position-horizontal-relative:page;mso-position-vertical-relative:page;mso-wrap-style:none;">
+          <v:line id="DocuMindTableLine43" from="0,0" to="482.371pt,0.000pt" strokecolor="#B7B7B7" strokeweight="0.50pt" o:allowincell="f" style="position:absolute;margin-left:56.743pt;margin-top:378.300pt;width:1pt;height:1pt;z-index:90;mso-position-horizontal-relative:page;mso-position-vertical-relative:page;mso-wrap-style:none;">
+            <w10:wrap type="none"/>
+          </v:line>
+        </w:pict>
+      </w:r>
+      <w:r>
+        <w:pict>
+          <v:line id="DocuMindTableLine44" from="0,0" to="482.371pt,0.000pt" strokecolor="#B7B7B7" strokeweight="0.50pt" o:allowincell="f" style="position:absolute;margin-left:56.743pt;margin-top:407.400pt;width:1pt;height:1pt;z-index:90;mso-position-horizontal-relative:page;mso-position-vertical-relative:page;mso-wrap-style:none;">
+            <w10:wrap type="none"/>
+          </v:line>
+        </w:pict>
+      </w:r>
+      <w:r>
+        <w:pict>
+          <v:line id="DocuMindTableLine45" from="0,0" to="482.371pt,0.000pt" strokecolor="#B7B7B7" strokeweight="0.50pt" o:allowincell="f" style="position:absolute;margin-left:56.743pt;margin-top:436.500pt;width:1pt;height:1pt;z-index:90;mso-position-horizontal-relative:page;mso-position-vertical-relative:page;mso-wrap-style:none;">
+            <w10:wrap type="none"/>
+          </v:line>
+        </w:pict>
+      </w:r>
+      <w:r>
+        <w:pict>
+          <v:line id="DocuMindTableLine46" from="0,0" to="482.371pt,0.000pt" strokecolor="#B7B7B7" strokeweight="0.50pt" o:allowincell="f" style="position:absolute;margin-left:56.743pt;margin-top:480.300pt;width:1pt;height:1pt;z-index:90;mso-position-horizontal-relative:page;mso-position-vertical-relative:page;mso-wrap-style:none;">
+            <w10:wrap type="none"/>
+          </v:line>
+        </w:pict>
+      </w:r>
+      <w:r>
+        <w:pict>
+          <v:line id="DocuMindTableLine47" from="0,0" to="482.371pt,0.000pt" strokecolor="#B7B7B7" strokeweight="0.50pt" o:allowincell="f" style="position:absolute;margin-left:56.743pt;margin-top:509.400pt;width:1pt;height:1pt;z-index:90;mso-position-horizontal-relative:page;mso-position-vertical-relative:page;mso-wrap-style:none;">
+            <w10:wrap type="none"/>
+          </v:line>
+        </w:pict>
+      </w:r>
+      <w:r>
+        <w:pict>
+          <v:line id="DocuMindTableLine48" from="0,0" to="482.371pt,0.000pt" strokecolor="#B7B7B7" strokeweight="0.50pt" o:allowincell="f" style="position:absolute;margin-left:56.743pt;margin-top:538.500pt;width:1pt;height:1pt;z-index:90;mso-position-horizontal-relative:page;mso-position-vertical-relative:page;mso-wrap-style:none;">
+            <w10:wrap type="none"/>
+          </v:line>
+        </w:pict>
+      </w:r>
+      <w:r>
+        <w:pict>
+          <v:line id="DocuMindTableLine49" from="0,0" to="482.371pt,0.000pt" strokecolor="#B7B7B7" strokeweight="0.50pt" o:allowincell="f" style="position:absolute;margin-left:56.743pt;margin-top:567.600pt;width:1pt;height:1pt;z-index:90;mso-position-horizontal-relative:page;mso-position-vertical-relative:page;mso-wrap-style:none;">
+            <w10:wrap type="none"/>
+          </v:line>
+        </w:pict>
+      </w:r>
+      <w:r>
+        <w:pict>
+          <v:line id="DocuMindTableLine50" from="0,0" to="0.000pt,189.300pt" strokecolor="#B7B7B7" strokeweight="0.50pt" o:allowincell="f" style="position:absolute;margin-left:56.743pt;margin-top:378.300pt;width:1pt;height:1pt;z-index:90;mso-position-horizontal-relative:page;mso-position-vertical-relative:page;mso-wrap-style:none;">
+            <w10:wrap type="none"/>
+          </v:line>
+        </w:pict>
+      </w:r>
+      <w:r>
+        <w:pict>
+          <v:line id="DocuMindTableLine51" from="0,0" to="0.000pt,189.300pt" strokecolor="#B7B7B7" strokeweight="0.50pt" o:allowincell="f" style="position:absolute;margin-left:92.750pt;margin-top:378.300pt;width:1pt;height:1pt;z-index:90;mso-position-horizontal-relative:page;mso-position-vertical-relative:page;mso-wrap-style:none;">
+            <w10:wrap type="none"/>
+          </v:line>
+        </w:pict>
+      </w:r>
+      <w:r>
+        <w:pict>
+          <v:line id="DocuMindTableLine52" from="0,0" to="0.000pt,189.300pt" strokecolor="#B7B7B7" strokeweight="0.50pt" o:allowincell="f" style="position:absolute;margin-left:376.250pt;margin-top:378.300pt;width:1pt;height:1pt;z-index:90;mso-position-horizontal-relative:page;mso-position-vertical-relative:page;mso-wrap-style:none;">
+            <w10:wrap type="none"/>
+          </v:line>
+        </w:pict>
+      </w:r>
+      <w:r>
+        <w:pict>
+          <v:line id="DocuMindTableLine53" from="0,0" to="0.000pt,189.300pt" strokecolor="#B7B7B7" strokeweight="0.50pt" o:allowincell="f" style="position:absolute;margin-left:454.250pt;margin-top:378.300pt;width:1pt;height:1pt;z-index:90;mso-position-horizontal-relative:page;mso-position-vertical-relative:page;mso-wrap-style:none;">
+            <w10:wrap type="none"/>
+          </v:line>
+        </w:pict>
+      </w:r>
+      <w:r>
+        <w:pict>
+          <v:line id="DocuMindTableLine54" from="0,0" to="0.000pt,189.300pt" strokecolor="#B7B7B7" strokeweight="0.50pt" o:allowincell="f" style="position:absolute;margin-left:539.114pt;margin-top:378.300pt;width:1pt;height:1pt;z-index:90;mso-position-horizontal-relative:page;mso-position-vertical-relative:page;mso-wrap-style:none;">
+            <w10:wrap type="none"/>
+          </v:line>
+        </w:pict>
+      </w:r>
+      <w:r>
+        <w:pict>
+          <v:shape id="DocuMindTableCell55" type="#_x0000_t202" filled="f" stroked="f" o:allowincell="f" style="position:absolute;margin-left:56.743pt;margin-top:378.300pt;width:36.007pt;height:29.100pt;z-index:100;mso-position-horizontal-relative:page;mso-position-vertical-relative:page;mso-wrap-style:none;">
             <w10:wrap type="none"/>
             <v:textbox inset="2.0pt,1.0pt,2.0pt,1.0pt">
               <w:txbxContent>
@@ -1191,7 +1275,7 @@
       </w:r>
       <w:r>
         <w:pict>
-          <v:shape id="DocuMindTableCell44" type="#_x0000_t202" filled="f" stroked="t" strokecolor="#000000" strokeweight="0.75pt" o:allowincell="f" style="position:absolute;margin-left:92.750pt;margin-top:378.300pt;width:283.500pt;height:29.100pt;z-index:100;mso-position-horizontal-relative:page;mso-position-vertical-relative:page;mso-wrap-style:none;">
+          <v:shape id="DocuMindTableCell56" type="#_x0000_t202" filled="f" stroked="f" o:allowincell="f" style="position:absolute;margin-left:92.750pt;margin-top:378.300pt;width:283.500pt;height:29.100pt;z-index:100;mso-position-horizontal-relative:page;mso-position-vertical-relative:page;mso-wrap-style:none;">
             <w10:wrap type="none"/>
             <v:textbox inset="2.0pt,1.0pt,2.0pt,1.0pt">
               <w:txbxContent>
@@ -1219,7 +1303,7 @@
       </w:r>
       <w:r>
         <w:pict>
-          <v:shape id="DocuMindTableCell45" type="#_x0000_t202" filled="f" stroked="t" strokecolor="#000000" strokeweight="0.75pt" o:allowincell="f" style="position:absolute;margin-left:376.250pt;margin-top:378.300pt;width:78.000pt;height:29.100pt;z-index:100;mso-position-horizontal-relative:page;mso-position-vertical-relative:page;mso-wrap-style:none;">
+          <v:shape id="DocuMindTableCell57" type="#_x0000_t202" filled="f" stroked="f" o:allowincell="f" style="position:absolute;margin-left:376.250pt;margin-top:378.300pt;width:78.000pt;height:29.100pt;z-index:100;mso-position-horizontal-relative:page;mso-position-vertical-relative:page;mso-wrap-style:none;">
             <w10:wrap type="none"/>
             <v:textbox inset="2.0pt,1.0pt,2.0pt,1.0pt">
               <w:txbxContent>
@@ -1247,7 +1331,7 @@
       </w:r>
       <w:r>
         <w:pict>
-          <v:shape id="DocuMindTableCell46" type="#_x0000_t202" filled="f" stroked="t" strokecolor="#000000" strokeweight="0.75pt" o:allowincell="f" style="position:absolute;margin-left:454.250pt;margin-top:378.300pt;width:84.864pt;height:29.100pt;z-index:100;mso-position-horizontal-relative:page;mso-position-vertical-relative:page;mso-wrap-style:none;">
+          <v:shape id="DocuMindTableCell58" type="#_x0000_t202" filled="f" stroked="f" o:allowincell="f" style="position:absolute;margin-left:454.250pt;margin-top:378.300pt;width:84.864pt;height:29.100pt;z-index:100;mso-position-horizontal-relative:page;mso-position-vertical-relative:page;mso-wrap-style:none;">
             <w10:wrap type="none"/>
             <v:textbox inset="2.0pt,1.0pt,2.0pt,1.0pt">
               <w:txbxContent>
@@ -1275,7 +1359,7 @@
       </w:r>
       <w:r>
         <w:pict>
-          <v:shape id="DocuMindTableCell47" type="#_x0000_t202" filled="f" stroked="t" strokecolor="#000000" strokeweight="0.75pt" o:allowincell="f" style="position:absolute;margin-left:56.743pt;margin-top:407.400pt;width:36.007pt;height:29.100pt;z-index:100;mso-position-horizontal-relative:page;mso-position-vertical-relative:page;mso-wrap-style:none;">
+          <v:shape id="DocuMindTableCell59" type="#_x0000_t202" filled="f" stroked="f" o:allowincell="f" style="position:absolute;margin-left:56.743pt;margin-top:407.400pt;width:36.007pt;height:29.100pt;z-index:100;mso-position-horizontal-relative:page;mso-position-vertical-relative:page;mso-wrap-style:none;">
             <w10:wrap type="none"/>
             <v:textbox inset="2.0pt,1.0pt,2.0pt,1.0pt">
               <w:txbxContent>
@@ -1303,7 +1387,7 @@
       </w:r>
       <w:r>
         <w:pict>
-          <v:shape id="DocuMindTableCell48" type="#_x0000_t202" filled="f" stroked="t" strokecolor="#000000" strokeweight="0.75pt" o:allowincell="f" style="position:absolute;margin-left:92.750pt;margin-top:407.400pt;width:283.500pt;height:29.100pt;z-index:100;mso-position-horizontal-relative:page;mso-position-vertical-relative:page;mso-wrap-style:none;">
+          <v:shape id="DocuMindTableCell60" type="#_x0000_t202" filled="f" stroked="f" o:allowincell="f" style="position:absolute;margin-left:92.750pt;margin-top:407.400pt;width:283.500pt;height:29.100pt;z-index:100;mso-position-horizontal-relative:page;mso-position-vertical-relative:page;mso-wrap-style:none;">
             <w10:wrap type="none"/>
             <v:textbox inset="2.0pt,1.0pt,2.0pt,1.0pt">
               <w:txbxContent>
@@ -1331,7 +1415,7 @@
       </w:r>
       <w:r>
         <w:pict>
-          <v:shape id="DocuMindTableCell49" type="#_x0000_t202" filled="f" stroked="t" strokecolor="#000000" strokeweight="0.75pt" o:allowincell="f" style="position:absolute;margin-left:376.250pt;margin-top:407.400pt;width:78.000pt;height:29.100pt;z-index:100;mso-position-horizontal-relative:page;mso-position-vertical-relative:page;mso-wrap-style:none;">
+          <v:shape id="DocuMindTableCell61" type="#_x0000_t202" filled="f" stroked="f" o:allowincell="f" style="position:absolute;margin-left:376.250pt;margin-top:407.400pt;width:78.000pt;height:29.100pt;z-index:100;mso-position-horizontal-relative:page;mso-position-vertical-relative:page;mso-wrap-style:none;">
             <w10:wrap type="none"/>
             <v:textbox inset="2.0pt,1.0pt,2.0pt,1.0pt">
               <w:txbxContent>
@@ -1359,7 +1443,7 @@
       </w:r>
       <w:r>
         <w:pict>
-          <v:shape id="DocuMindTableCell50" type="#_x0000_t202" filled="f" stroked="t" strokecolor="#000000" strokeweight="0.75pt" o:allowincell="f" style="position:absolute;margin-left:454.250pt;margin-top:407.400pt;width:84.864pt;height:29.100pt;z-index:100;mso-position-horizontal-relative:page;mso-position-vertical-relative:page;mso-wrap-style:none;">
+          <v:shape id="DocuMindTableCell62" type="#_x0000_t202" filled="f" stroked="f" o:allowincell="f" style="position:absolute;margin-left:454.250pt;margin-top:407.400pt;width:84.864pt;height:29.100pt;z-index:100;mso-position-horizontal-relative:page;mso-position-vertical-relative:page;mso-wrap-style:none;">
             <w10:wrap type="none"/>
             <v:textbox inset="2.0pt,1.0pt,2.0pt,1.0pt">
               <w:txbxContent>
@@ -1383,7 +1467,7 @@
       </w:r>
       <w:r>
         <w:pict>
-          <v:shape id="DocuMindTableCell51" type="#_x0000_t202" filled="f" stroked="t" strokecolor="#000000" strokeweight="0.75pt" o:allowincell="f" style="position:absolute;margin-left:56.743pt;margin-top:436.500pt;width:36.007pt;height:43.800pt;z-index:100;mso-position-horizontal-relative:page;mso-position-vertical-relative:page;mso-wrap-style:none;">
+          <v:shape id="DocuMindTableCell63" type="#_x0000_t202" filled="f" stroked="f" o:allowincell="f" style="position:absolute;margin-left:56.743pt;margin-top:436.500pt;width:36.007pt;height:43.800pt;z-index:100;mso-position-horizontal-relative:page;mso-position-vertical-relative:page;mso-wrap-style:none;">
             <w10:wrap type="none"/>
             <v:textbox inset="2.0pt,1.0pt,2.0pt,1.0pt">
               <w:txbxContent>
@@ -1411,7 +1495,7 @@
       </w:r>
       <w:r>
         <w:pict>
-          <v:shape id="DocuMindTableCell52" type="#_x0000_t202" filled="f" stroked="t" strokecolor="#000000" strokeweight="0.75pt" o:allowincell="f" style="position:absolute;margin-left:92.750pt;margin-top:436.500pt;width:283.500pt;height:43.800pt;z-index:100;mso-position-horizontal-relative:page;mso-position-vertical-relative:page;mso-wrap-style:none;">
+          <v:shape id="DocuMindTableCell64" type="#_x0000_t202" filled="f" stroked="f" o:allowincell="f" style="position:absolute;margin-left:92.750pt;margin-top:436.500pt;width:283.500pt;height:43.800pt;z-index:100;mso-position-horizontal-relative:page;mso-position-vertical-relative:page;mso-wrap-style:none;">
             <w10:wrap type="none"/>
             <v:textbox inset="2.0pt,1.0pt,2.0pt,1.0pt">
               <w:txbxContent>
@@ -1452,7 +1536,7 @@
       </w:r>
       <w:r>
         <w:pict>
-          <v:shape id="DocuMindTableCell53" type="#_x0000_t202" filled="f" stroked="t" strokecolor="#000000" strokeweight="0.75pt" o:allowincell="f" style="position:absolute;margin-left:376.250pt;margin-top:436.500pt;width:78.000pt;height:43.800pt;z-index:100;mso-position-horizontal-relative:page;mso-position-vertical-relative:page;mso-wrap-style:none;">
+          <v:shape id="DocuMindTableCell65" type="#_x0000_t202" filled="f" stroked="f" o:allowincell="f" style="position:absolute;margin-left:376.250pt;margin-top:436.500pt;width:78.000pt;height:43.800pt;z-index:100;mso-position-horizontal-relative:page;mso-position-vertical-relative:page;mso-wrap-style:none;">
             <w10:wrap type="none"/>
             <v:textbox inset="2.0pt,1.0pt,2.0pt,1.0pt">
               <w:txbxContent>
@@ -1480,7 +1564,7 @@
       </w:r>
       <w:r>
         <w:pict>
-          <v:shape id="DocuMindTableCell54" type="#_x0000_t202" filled="f" stroked="t" strokecolor="#000000" strokeweight="0.75pt" o:allowincell="f" style="position:absolute;margin-left:454.250pt;margin-top:436.500pt;width:84.864pt;height:43.800pt;z-index:100;mso-position-horizontal-relative:page;mso-position-vertical-relative:page;mso-wrap-style:none;">
+          <v:shape id="DocuMindTableCell66" type="#_x0000_t202" filled="f" stroked="f" o:allowincell="f" style="position:absolute;margin-left:454.250pt;margin-top:436.500pt;width:84.864pt;height:43.800pt;z-index:100;mso-position-horizontal-relative:page;mso-position-vertical-relative:page;mso-wrap-style:none;">
             <w10:wrap type="none"/>
             <v:textbox inset="2.0pt,1.0pt,2.0pt,1.0pt">
               <w:txbxContent>
@@ -1504,7 +1588,7 @@
       </w:r>
       <w:r>
         <w:pict>
-          <v:shape id="DocuMindTableCell55" type="#_x0000_t202" filled="f" stroked="t" strokecolor="#000000" strokeweight="0.75pt" o:allowincell="f" style="position:absolute;margin-left:56.743pt;margin-top:480.300pt;width:36.007pt;height:29.100pt;z-index:100;mso-position-horizontal-relative:page;mso-position-vertical-relative:page;mso-wrap-style:none;">
+          <v:shape id="DocuMindTableCell67" type="#_x0000_t202" filled="f" stroked="f" o:allowincell="f" style="position:absolute;margin-left:56.743pt;margin-top:480.300pt;width:36.007pt;height:29.100pt;z-index:100;mso-position-horizontal-relative:page;mso-position-vertical-relative:page;mso-wrap-style:none;">
             <w10:wrap type="none"/>
             <v:textbox inset="2.0pt,1.0pt,2.0pt,1.0pt">
               <w:txbxContent>
@@ -1532,7 +1616,7 @@
       </w:r>
       <w:r>
         <w:pict>
-          <v:shape id="DocuMindTableCell56" type="#_x0000_t202" filled="f" stroked="t" strokecolor="#000000" strokeweight="0.75pt" o:allowincell="f" style="position:absolute;margin-left:92.750pt;margin-top:480.300pt;width:283.500pt;height:29.100pt;z-index:100;mso-position-horizontal-relative:page;mso-position-vertical-relative:page;mso-wrap-style:none;">
+          <v:shape id="DocuMindTableCell68" type="#_x0000_t202" filled="f" stroked="f" o:allowincell="f" style="position:absolute;margin-left:92.750pt;margin-top:480.300pt;width:283.500pt;height:29.100pt;z-index:100;mso-position-horizontal-relative:page;mso-position-vertical-relative:page;mso-wrap-style:none;">
             <w10:wrap type="none"/>
             <v:textbox inset="2.0pt,1.0pt,2.0pt,1.0pt">
               <w:txbxContent>
@@ -1560,7 +1644,7 @@
       </w:r>
       <w:r>
         <w:pict>
-          <v:shape id="DocuMindTableCell57" type="#_x0000_t202" filled="f" stroked="t" strokecolor="#000000" strokeweight="0.75pt" o:allowincell="f" style="position:absolute;margin-left:376.250pt;margin-top:480.300pt;width:78.000pt;height:29.100pt;z-index:100;mso-position-horizontal-relative:page;mso-position-vertical-relative:page;mso-wrap-style:none;">
+          <v:shape id="DocuMindTableCell69" type="#_x0000_t202" filled="f" stroked="f" o:allowincell="f" style="position:absolute;margin-left:376.250pt;margin-top:480.300pt;width:78.000pt;height:29.100pt;z-index:100;mso-position-horizontal-relative:page;mso-position-vertical-relative:page;mso-wrap-style:none;">
             <w10:wrap type="none"/>
             <v:textbox inset="2.0pt,1.0pt,2.0pt,1.0pt">
               <w:txbxContent>
@@ -1588,7 +1672,7 @@
       </w:r>
       <w:r>
         <w:pict>
-          <v:shape id="DocuMindTableCell58" type="#_x0000_t202" filled="f" stroked="t" strokecolor="#000000" strokeweight="0.75pt" o:allowincell="f" style="position:absolute;margin-left:454.250pt;margin-top:480.300pt;width:84.864pt;height:29.100pt;z-index:100;mso-position-horizontal-relative:page;mso-position-vertical-relative:page;mso-wrap-style:none;">
+          <v:shape id="DocuMindTableCell70" type="#_x0000_t202" filled="f" stroked="f" o:allowincell="f" style="position:absolute;margin-left:454.250pt;margin-top:480.300pt;width:84.864pt;height:29.100pt;z-index:100;mso-position-horizontal-relative:page;mso-position-vertical-relative:page;mso-wrap-style:none;">
             <w10:wrap type="none"/>
             <v:textbox inset="2.0pt,1.0pt,2.0pt,1.0pt">
               <w:txbxContent>
@@ -1612,7 +1696,7 @@
       </w:r>
       <w:r>
         <w:pict>
-          <v:shape id="DocuMindTableCell59" type="#_x0000_t202" filled="f" stroked="t" strokecolor="#000000" strokeweight="0.75pt" o:allowincell="f" style="position:absolute;margin-left:56.743pt;margin-top:509.400pt;width:36.007pt;height:29.100pt;z-index:100;mso-position-horizontal-relative:page;mso-position-vertical-relative:page;mso-wrap-style:none;">
+          <v:shape id="DocuMindTableCell71" type="#_x0000_t202" filled="f" stroked="f" o:allowincell="f" style="position:absolute;margin-left:56.743pt;margin-top:509.400pt;width:36.007pt;height:29.100pt;z-index:100;mso-position-horizontal-relative:page;mso-position-vertical-relative:page;mso-wrap-style:none;">
             <w10:wrap type="none"/>
             <v:textbox inset="2.0pt,1.0pt,2.0pt,1.0pt">
               <w:txbxContent>
@@ -1640,7 +1724,7 @@
       </w:r>
       <w:r>
         <w:pict>
-          <v:shape id="DocuMindTableCell60" type="#_x0000_t202" filled="f" stroked="t" strokecolor="#000000" strokeweight="0.75pt" o:allowincell="f" style="position:absolute;margin-left:92.750pt;margin-top:509.400pt;width:283.500pt;height:29.100pt;z-index:100;mso-position-horizontal-relative:page;mso-position-vertical-relative:page;mso-wrap-style:none;">
+          <v:shape id="DocuMindTableCell72" type="#_x0000_t202" filled="f" stroked="f" o:allowincell="f" style="position:absolute;margin-left:92.750pt;margin-top:509.400pt;width:283.500pt;height:29.100pt;z-index:100;mso-position-horizontal-relative:page;mso-position-vertical-relative:page;mso-wrap-style:none;">
             <w10:wrap type="none"/>
             <v:textbox inset="2.0pt,1.0pt,2.0pt,1.0pt">
               <w:txbxContent>
@@ -1668,7 +1752,7 @@
       </w:r>
       <w:r>
         <w:pict>
-          <v:shape id="DocuMindTableCell61" type="#_x0000_t202" filled="f" stroked="t" strokecolor="#000000" strokeweight="0.75pt" o:allowincell="f" style="position:absolute;margin-left:376.250pt;margin-top:509.400pt;width:78.000pt;height:29.100pt;z-index:100;mso-position-horizontal-relative:page;mso-position-vertical-relative:page;mso-wrap-style:none;">
+          <v:shape id="DocuMindTableCell73" type="#_x0000_t202" filled="f" stroked="f" o:allowincell="f" style="position:absolute;margin-left:376.250pt;margin-top:509.400pt;width:78.000pt;height:29.100pt;z-index:100;mso-position-horizontal-relative:page;mso-position-vertical-relative:page;mso-wrap-style:none;">
             <w10:wrap type="none"/>
             <v:textbox inset="2.0pt,1.0pt,2.0pt,1.0pt">
               <w:txbxContent>
@@ -1696,7 +1780,7 @@
       </w:r>
       <w:r>
         <w:pict>
-          <v:shape id="DocuMindTableCell62" type="#_x0000_t202" filled="f" stroked="t" strokecolor="#000000" strokeweight="0.75pt" o:allowincell="f" style="position:absolute;margin-left:454.250pt;margin-top:509.400pt;width:84.864pt;height:29.100pt;z-index:100;mso-position-horizontal-relative:page;mso-position-vertical-relative:page;mso-wrap-style:none;">
+          <v:shape id="DocuMindTableCell74" type="#_x0000_t202" filled="f" stroked="f" o:allowincell="f" style="position:absolute;margin-left:454.250pt;margin-top:509.400pt;width:84.864pt;height:29.100pt;z-index:100;mso-position-horizontal-relative:page;mso-position-vertical-relative:page;mso-wrap-style:none;">
             <w10:wrap type="none"/>
             <v:textbox inset="2.0pt,1.0pt,2.0pt,1.0pt">
               <w:txbxContent>
@@ -1720,7 +1804,7 @@
       </w:r>
       <w:r>
         <w:pict>
-          <v:shape id="DocuMindTableCell63" type="#_x0000_t202" filled="f" stroked="t" strokecolor="#000000" strokeweight="0.75pt" o:allowincell="f" style="position:absolute;margin-left:56.743pt;margin-top:538.500pt;width:36.007pt;height:29.100pt;z-index:100;mso-position-horizontal-relative:page;mso-position-vertical-relative:page;mso-wrap-style:none;">
+          <v:shape id="DocuMindTableCell75" type="#_x0000_t202" filled="f" stroked="f" o:allowincell="f" style="position:absolute;margin-left:56.743pt;margin-top:538.500pt;width:36.007pt;height:29.100pt;z-index:100;mso-position-horizontal-relative:page;mso-position-vertical-relative:page;mso-wrap-style:none;">
             <w10:wrap type="none"/>
             <v:textbox inset="2.0pt,1.0pt,2.0pt,1.0pt">
               <w:txbxContent>
@@ -1748,7 +1832,7 @@
       </w:r>
       <w:r>
         <w:pict>
-          <v:shape id="DocuMindTableCell64" type="#_x0000_t202" filled="f" stroked="t" strokecolor="#000000" strokeweight="0.75pt" o:allowincell="f" style="position:absolute;margin-left:92.750pt;margin-top:538.500pt;width:283.500pt;height:29.100pt;z-index:100;mso-position-horizontal-relative:page;mso-position-vertical-relative:page;mso-wrap-style:none;">
+          <v:shape id="DocuMindTableCell76" type="#_x0000_t202" filled="f" stroked="f" o:allowincell="f" style="position:absolute;margin-left:92.750pt;margin-top:538.500pt;width:283.500pt;height:29.100pt;z-index:100;mso-position-horizontal-relative:page;mso-position-vertical-relative:page;mso-wrap-style:none;">
             <w10:wrap type="none"/>
             <v:textbox inset="2.0pt,1.0pt,2.0pt,1.0pt">
               <w:txbxContent>
@@ -1776,7 +1860,7 @@
       </w:r>
       <w:r>
         <w:pict>
-          <v:shape id="DocuMindTableCell65" type="#_x0000_t202" filled="f" stroked="t" strokecolor="#000000" strokeweight="0.75pt" o:allowincell="f" style="position:absolute;margin-left:376.250pt;margin-top:538.500pt;width:78.000pt;height:29.100pt;z-index:100;mso-position-horizontal-relative:page;mso-position-vertical-relative:page;mso-wrap-style:none;">
+          <v:shape id="DocuMindTableCell77" type="#_x0000_t202" filled="f" stroked="f" o:allowincell="f" style="position:absolute;margin-left:376.250pt;margin-top:538.500pt;width:78.000pt;height:29.100pt;z-index:100;mso-position-horizontal-relative:page;mso-position-vertical-relative:page;mso-wrap-style:none;">
             <w10:wrap type="none"/>
             <v:textbox inset="2.0pt,1.0pt,2.0pt,1.0pt">
               <w:txbxContent>
@@ -1804,7 +1888,7 @@
       </w:r>
       <w:r>
         <w:pict>
-          <v:shape id="DocuMindTableCell66" type="#_x0000_t202" filled="f" stroked="t" strokecolor="#000000" strokeweight="0.75pt" o:allowincell="f" style="position:absolute;margin-left:454.250pt;margin-top:538.500pt;width:84.864pt;height:29.100pt;z-index:100;mso-position-horizontal-relative:page;mso-position-vertical-relative:page;mso-wrap-style:none;">
+          <v:shape id="DocuMindTableCell78" type="#_x0000_t202" filled="f" stroked="f" o:allowincell="f" style="position:absolute;margin-left:454.250pt;margin-top:538.500pt;width:84.864pt;height:29.100pt;z-index:100;mso-position-horizontal-relative:page;mso-position-vertical-relative:page;mso-wrap-style:none;">
             <w10:wrap type="none"/>
             <v:textbox inset="2.0pt,1.0pt,2.0pt,1.0pt">
               <w:txbxContent>
@@ -1828,7 +1912,7 @@
       </w:r>
       <w:r>
         <w:pict>
-          <v:shape id="DocuMindTextBox67" type="#_x0000_t202" stroked="f" filled="f" o:allowincell="f" style="position:absolute;margin-left:56.800pt;margin-top:81.156pt;width:483.669pt;height:19.125pt;z-index:251659264;mso-position-horizontal-relative:page;mso-position-vertical-relative:page;mso-wrap-style:none;mso-fit-shape-to-text:t;">
+          <v:shape id="DocuMindTextBox79" type="#_x0000_t202" stroked="f" filled="f" o:allowincell="f" style="position:absolute;margin-left:56.800pt;margin-top:81.156pt;width:483.669pt;height:19.125pt;z-index:251659264;mso-position-horizontal-relative:page;mso-position-vertical-relative:page;mso-wrap-style:none;mso-fit-shape-to-text:t;">
             <w10:wrap type="none"/>
             <v:textbox inset="0,0,0,0">
               <w:txbxContent>
@@ -1855,7 +1939,7 @@
       </w:r>
       <w:r>
         <w:pict>
-          <v:shape id="DocuMindTextBox68" type="#_x0000_t202" stroked="f" filled="f" o:allowincell="f" style="position:absolute;margin-left:56.800pt;margin-top:95.856pt;width:484.110pt;height:19.125pt;z-index:251659264;mso-position-horizontal-relative:page;mso-position-vertical-relative:page;mso-wrap-style:none;mso-fit-shape-to-text:t;">
+          <v:shape id="DocuMindTextBox80" type="#_x0000_t202" stroked="f" filled="f" o:allowincell="f" style="position:absolute;margin-left:56.800pt;margin-top:95.856pt;width:484.110pt;height:19.125pt;z-index:251659264;mso-position-horizontal-relative:page;mso-position-vertical-relative:page;mso-wrap-style:none;mso-fit-shape-to-text:t;">
             <w10:wrap type="none"/>
             <v:textbox inset="0,0,0,0">
               <w:txbxContent>
@@ -1882,7 +1966,7 @@
       </w:r>
       <w:r>
         <w:pict>
-          <v:shape id="DocuMindTextBox69" type="#_x0000_t202" stroked="f" filled="f" o:allowincell="f" style="position:absolute;margin-left:56.800pt;margin-top:110.556pt;width:484.036pt;height:19.125pt;z-index:251659264;mso-position-horizontal-relative:page;mso-position-vertical-relative:page;mso-wrap-style:none;mso-fit-shape-to-text:t;">
+          <v:shape id="DocuMindTextBox81" type="#_x0000_t202" stroked="f" filled="f" o:allowincell="f" style="position:absolute;margin-left:56.800pt;margin-top:110.556pt;width:484.036pt;height:19.125pt;z-index:251659264;mso-position-horizontal-relative:page;mso-position-vertical-relative:page;mso-wrap-style:none;mso-fit-shape-to-text:t;">
             <w10:wrap type="none"/>
             <v:textbox inset="0,0,0,0">
               <w:txbxContent>
@@ -1909,7 +1993,7 @@
       </w:r>
       <w:r>
         <w:pict>
-          <v:shape id="DocuMindTextBox70" type="#_x0000_t202" stroked="f" filled="f" o:allowincell="f" style="position:absolute;margin-left:56.800pt;margin-top:125.256pt;width:483.837pt;height:19.125pt;z-index:251659264;mso-position-horizontal-relative:page;mso-position-vertical-relative:page;mso-wrap-style:none;mso-fit-shape-to-text:t;">
+          <v:shape id="DocuMindTextBox82" type="#_x0000_t202" stroked="f" filled="f" o:allowincell="f" style="position:absolute;margin-left:56.800pt;margin-top:125.256pt;width:483.837pt;height:19.125pt;z-index:251659264;mso-position-horizontal-relative:page;mso-position-vertical-relative:page;mso-wrap-style:none;mso-fit-shape-to-text:t;">
             <w10:wrap type="none"/>
             <v:textbox inset="0,0,0,0">
               <w:txbxContent>
@@ -1936,7 +2020,7 @@
       </w:r>
       <w:r>
         <w:pict>
-          <v:shape id="DocuMindTextBox71" type="#_x0000_t202" stroked="f" filled="f" o:allowincell="f" style="position:absolute;margin-left:56.800pt;margin-top:139.956pt;width:483.847pt;height:19.125pt;z-index:251659264;mso-position-horizontal-relative:page;mso-position-vertical-relative:page;mso-wrap-style:none;mso-fit-shape-to-text:t;">
+          <v:shape id="DocuMindTextBox83" type="#_x0000_t202" stroked="f" filled="f" o:allowincell="f" style="position:absolute;margin-left:56.800pt;margin-top:139.956pt;width:483.847pt;height:19.125pt;z-index:251659264;mso-position-horizontal-relative:page;mso-position-vertical-relative:page;mso-wrap-style:none;mso-fit-shape-to-text:t;">
             <w10:wrap type="none"/>
             <v:textbox inset="0,0,0,0">
               <w:txbxContent>
@@ -1963,7 +2047,7 @@
       </w:r>
       <w:r>
         <w:pict>
-          <v:shape id="DocuMindTextBox72" type="#_x0000_t202" stroked="f" filled="f" o:allowincell="f" style="position:absolute;margin-left:56.800pt;margin-top:154.656pt;width:484.173pt;height:19.125pt;z-index:251659264;mso-position-horizontal-relative:page;mso-position-vertical-relative:page;mso-wrap-style:none;mso-fit-shape-to-text:t;">
+          <v:shape id="DocuMindTextBox84" type="#_x0000_t202" stroked="f" filled="f" o:allowincell="f" style="position:absolute;margin-left:56.800pt;margin-top:154.656pt;width:484.173pt;height:19.125pt;z-index:251659264;mso-position-horizontal-relative:page;mso-position-vertical-relative:page;mso-wrap-style:none;mso-fit-shape-to-text:t;">
             <w10:wrap type="none"/>
             <v:textbox inset="0,0,0,0">
               <w:txbxContent>
@@ -1990,7 +2074,7 @@
       </w:r>
       <w:r>
         <w:pict>
-          <v:shape id="DocuMindTextBox73" type="#_x0000_t202" stroked="f" filled="f" o:allowincell="f" style="position:absolute;margin-left:56.800pt;margin-top:169.356pt;width:253.803pt;height:19.125pt;z-index:251659264;mso-position-horizontal-relative:page;mso-position-vertical-relative:page;mso-wrap-style:none;mso-fit-shape-to-text:t;">
+          <v:shape id="DocuMindTextBox85" type="#_x0000_t202" stroked="f" filled="f" o:allowincell="f" style="position:absolute;margin-left:56.800pt;margin-top:169.356pt;width:253.803pt;height:19.125pt;z-index:251659264;mso-position-horizontal-relative:page;mso-position-vertical-relative:page;mso-wrap-style:none;mso-fit-shape-to-text:t;">
             <w10:wrap type="none"/>
             <v:textbox inset="0,0,0,0">
               <w:txbxContent>
@@ -2017,7 +2101,7 @@
       </w:r>
       <w:r>
         <w:pict>
-          <v:shape id="DocuMindTextBox74" type="#_x0000_t202" stroked="f" filled="f" o:allowincell="f" style="position:absolute;margin-left:56.800pt;margin-top:195.356pt;width:484.005pt;height:19.125pt;z-index:251659264;mso-position-horizontal-relative:page;mso-position-vertical-relative:page;mso-wrap-style:none;mso-fit-shape-to-text:t;">
+          <v:shape id="DocuMindTextBox86" type="#_x0000_t202" stroked="f" filled="f" o:allowincell="f" style="position:absolute;margin-left:56.800pt;margin-top:195.356pt;width:484.005pt;height:19.125pt;z-index:251659264;mso-position-horizontal-relative:page;mso-position-vertical-relative:page;mso-wrap-style:none;mso-fit-shape-to-text:t;">
             <w10:wrap type="none"/>
             <v:textbox inset="0,0,0,0">
               <w:txbxContent>
@@ -2044,7 +2128,7 @@
       </w:r>
       <w:r>
         <w:pict>
-          <v:shape id="DocuMindTextBox75" type="#_x0000_t202" stroked="f" filled="f" o:allowincell="f" style="position:absolute;margin-left:56.800pt;margin-top:210.056pt;width:484.184pt;height:19.125pt;z-index:251659264;mso-position-horizontal-relative:page;mso-position-vertical-relative:page;mso-wrap-style:none;mso-fit-shape-to-text:t;">
+          <v:shape id="DocuMindTextBox87" type="#_x0000_t202" stroked="f" filled="f" o:allowincell="f" style="position:absolute;margin-left:56.800pt;margin-top:210.056pt;width:484.184pt;height:19.125pt;z-index:251659264;mso-position-horizontal-relative:page;mso-position-vertical-relative:page;mso-wrap-style:none;mso-fit-shape-to-text:t;">
             <w10:wrap type="none"/>
             <v:textbox inset="0,0,0,0">
               <w:txbxContent>
@@ -2071,7 +2155,7 @@
       </w:r>
       <w:r>
         <w:pict>
-          <v:shape id="DocuMindTextBox76" type="#_x0000_t202" stroked="f" filled="f" o:allowincell="f" style="position:absolute;margin-left:56.800pt;margin-top:224.756pt;width:484.163pt;height:19.125pt;z-index:251659264;mso-position-horizontal-relative:page;mso-position-vertical-relative:page;mso-wrap-style:none;mso-fit-shape-to-text:t;">
+          <v:shape id="DocuMindTextBox88" type="#_x0000_t202" stroked="f" filled="f" o:allowincell="f" style="position:absolute;margin-left:56.800pt;margin-top:224.756pt;width:484.163pt;height:19.125pt;z-index:251659264;mso-position-horizontal-relative:page;mso-position-vertical-relative:page;mso-wrap-style:none;mso-fit-shape-to-text:t;">
             <w10:wrap type="none"/>
             <v:textbox inset="0,0,0,0">
               <w:txbxContent>
@@ -2098,7 +2182,7 @@
       </w:r>
       <w:r>
         <w:pict>
-          <v:shape id="DocuMindTextBox77" type="#_x0000_t202" stroked="f" filled="f" o:allowincell="f" style="position:absolute;margin-left:56.800pt;margin-top:239.456pt;width:102.550pt;height:19.125pt;z-index:251659264;mso-position-horizontal-relative:page;mso-position-vertical-relative:page;mso-wrap-style:none;mso-fit-shape-to-text:t;">
+          <v:shape id="DocuMindTextBox89" type="#_x0000_t202" stroked="f" filled="f" o:allowincell="f" style="position:absolute;margin-left:56.800pt;margin-top:239.456pt;width:102.550pt;height:19.125pt;z-index:251659264;mso-position-horizontal-relative:page;mso-position-vertical-relative:page;mso-wrap-style:none;mso-fit-shape-to-text:t;">
             <w10:wrap type="none"/>
             <v:textbox inset="0,0,0,0">
               <w:txbxContent>
@@ -2125,7 +2209,7 @@
       </w:r>
       <w:r>
         <w:pict>
-          <v:shape id="DocuMindTextBox78" type="#_x0000_t202" stroked="f" filled="f" o:allowincell="f" style="position:absolute;margin-left:74.800pt;margin-top:303.910pt;width:457.482pt;height:28.500pt;z-index:251659264;mso-position-horizontal-relative:page;mso-position-vertical-relative:page;mso-wrap-style:none;mso-fit-shape-to-text:t;">
+          <v:shape id="DocuMindTextBox90" type="#_x0000_t202" stroked="f" filled="f" o:allowincell="f" style="position:absolute;margin-left:74.800pt;margin-top:303.910pt;width:457.482pt;height:28.500pt;z-index:251659264;mso-position-horizontal-relative:page;mso-position-vertical-relative:page;mso-wrap-style:none;mso-fit-shape-to-text:t;">
             <w10:wrap type="none"/>
             <v:textbox inset="0,0,0,0">
               <w:txbxContent>
@@ -2152,7 +2236,7 @@
       </w:r>
       <w:r>
         <w:pict>
-          <v:shape id="DocuMindTextBox79" type="#_x0000_t202" stroked="f" filled="f" o:allowincell="f" style="position:absolute;margin-left:56.800pt;margin-top:324.610pt;width:17.994pt;height:28.500pt;z-index:251659264;mso-position-horizontal-relative:page;mso-position-vertical-relative:page;mso-wrap-style:none;mso-fit-shape-to-text:t;">
+          <v:shape id="DocuMindTextBox91" type="#_x0000_t202" stroked="f" filled="f" o:allowincell="f" style="position:absolute;margin-left:56.800pt;margin-top:324.610pt;width:17.994pt;height:28.500pt;z-index:251659264;mso-position-horizontal-relative:page;mso-position-vertical-relative:page;mso-wrap-style:none;mso-fit-shape-to-text:t;">
             <w10:wrap type="none"/>
             <v:textbox inset="0,0,0,0">
               <w:txbxContent>
@@ -2179,7 +2263,7 @@
       </w:r>
       <w:r>
         <w:pict>
-          <v:shape id="DocuMindTextBox80" type="#_x0000_t202" stroked="f" filled="f" o:allowincell="f" style="position:absolute;margin-left:56.800pt;margin-top:592.056pt;width:483.732pt;height:19.125pt;z-index:251659264;mso-position-horizontal-relative:page;mso-position-vertical-relative:page;mso-wrap-style:none;mso-fit-shape-to-text:t;">
+          <v:shape id="DocuMindTextBox92" type="#_x0000_t202" stroked="f" filled="f" o:allowincell="f" style="position:absolute;margin-left:56.800pt;margin-top:592.056pt;width:483.732pt;height:19.125pt;z-index:251659264;mso-position-horizontal-relative:page;mso-position-vertical-relative:page;mso-wrap-style:none;mso-fit-shape-to-text:t;">
             <w10:wrap type="none"/>
             <v:textbox inset="0,0,0,0">
               <w:txbxContent>
@@ -2206,7 +2290,7 @@
       </w:r>
       <w:r>
         <w:pict>
-          <v:shape id="DocuMindTextBox81" type="#_x0000_t202" stroked="f" filled="f" o:allowincell="f" style="position:absolute;margin-left:56.800pt;margin-top:606.756pt;width:484.299pt;height:19.125pt;z-index:251659264;mso-position-horizontal-relative:page;mso-position-vertical-relative:page;mso-wrap-style:none;mso-fit-shape-to-text:t;">
+          <v:shape id="DocuMindTextBox93" type="#_x0000_t202" stroked="f" filled="f" o:allowincell="f" style="position:absolute;margin-left:56.800pt;margin-top:606.756pt;width:484.299pt;height:19.125pt;z-index:251659264;mso-position-horizontal-relative:page;mso-position-vertical-relative:page;mso-wrap-style:none;mso-fit-shape-to-text:t;">
             <w10:wrap type="none"/>
             <v:textbox inset="0,0,0,0">
               <w:txbxContent>
@@ -2233,7 +2317,7 @@
       </w:r>
       <w:r>
         <w:pict>
-          <v:shape id="DocuMindTextBox82" type="#_x0000_t202" stroked="f" filled="f" o:allowincell="f" style="position:absolute;margin-left:56.800pt;margin-top:621.456pt;width:484.047pt;height:19.125pt;z-index:251659264;mso-position-horizontal-relative:page;mso-position-vertical-relative:page;mso-wrap-style:none;mso-fit-shape-to-text:t;">
+          <v:shape id="DocuMindTextBox94" type="#_x0000_t202" stroked="f" filled="f" o:allowincell="f" style="position:absolute;margin-left:56.800pt;margin-top:621.456pt;width:484.047pt;height:19.125pt;z-index:251659264;mso-position-horizontal-relative:page;mso-position-vertical-relative:page;mso-wrap-style:none;mso-fit-shape-to-text:t;">
             <w10:wrap type="none"/>
             <v:textbox inset="0,0,0,0">
               <w:txbxContent>
@@ -2260,7 +2344,7 @@
       </w:r>
       <w:r>
         <w:pict>
-          <v:shape id="DocuMindTextBox83" type="#_x0000_t202" stroked="f" filled="f" o:allowincell="f" style="position:absolute;margin-left:56.800pt;margin-top:636.156pt;width:484.498pt;height:19.125pt;z-index:251659264;mso-position-horizontal-relative:page;mso-position-vertical-relative:page;mso-wrap-style:none;mso-fit-shape-to-text:t;">
+          <v:shape id="DocuMindTextBox95" type="#_x0000_t202" stroked="f" filled="f" o:allowincell="f" style="position:absolute;margin-left:56.800pt;margin-top:636.156pt;width:484.498pt;height:19.125pt;z-index:251659264;mso-position-horizontal-relative:page;mso-position-vertical-relative:page;mso-wrap-style:none;mso-fit-shape-to-text:t;">
             <w10:wrap type="none"/>
             <v:textbox inset="0,0,0,0">
               <w:txbxContent>
@@ -2287,7 +2371,7 @@
       </w:r>
       <w:r>
         <w:pict>
-          <v:shape id="DocuMindTextBox84" type="#_x0000_t202" stroked="f" filled="f" o:allowincell="f" style="position:absolute;margin-left:56.800pt;margin-top:650.856pt;width:484.299pt;height:19.125pt;z-index:251659264;mso-position-horizontal-relative:page;mso-position-vertical-relative:page;mso-wrap-style:none;mso-fit-shape-to-text:t;">
+          <v:shape id="DocuMindTextBox96" type="#_x0000_t202" stroked="f" filled="f" o:allowincell="f" style="position:absolute;margin-left:56.800pt;margin-top:650.856pt;width:484.299pt;height:19.125pt;z-index:251659264;mso-position-horizontal-relative:page;mso-position-vertical-relative:page;mso-wrap-style:none;mso-fit-shape-to-text:t;">
             <w10:wrap type="none"/>
             <v:textbox inset="0,0,0,0">
               <w:txbxContent>
@@ -2314,7 +2398,7 @@
       </w:r>
       <w:r>
         <w:pict>
-          <v:shape id="DocuMindTextBox85" type="#_x0000_t202" stroked="f" filled="f" o:allowincell="f" style="position:absolute;margin-left:56.800pt;margin-top:665.556pt;width:483.858pt;height:19.125pt;z-index:251659264;mso-position-horizontal-relative:page;mso-position-vertical-relative:page;mso-wrap-style:none;mso-fit-shape-to-text:t;">
+          <v:shape id="DocuMindTextBox97" type="#_x0000_t202" stroked="f" filled="f" o:allowincell="f" style="position:absolute;margin-left:56.800pt;margin-top:665.556pt;width:483.858pt;height:19.125pt;z-index:251659264;mso-position-horizontal-relative:page;mso-position-vertical-relative:page;mso-wrap-style:none;mso-fit-shape-to-text:t;">
             <w10:wrap type="none"/>
             <v:textbox inset="0,0,0,0">
               <w:txbxContent>
@@ -2341,7 +2425,7 @@
       </w:r>
       <w:r>
         <w:pict>
-          <v:shape id="DocuMindTextBox86" type="#_x0000_t202" stroked="f" filled="f" o:allowincell="f" style="position:absolute;margin-left:56.800pt;margin-top:680.256pt;width:484.457pt;height:19.125pt;z-index:251659264;mso-position-horizontal-relative:page;mso-position-vertical-relative:page;mso-wrap-style:none;mso-fit-shape-to-text:t;">
+          <v:shape id="DocuMindTextBox98" type="#_x0000_t202" stroked="f" filled="f" o:allowincell="f" style="position:absolute;margin-left:56.800pt;margin-top:680.256pt;width:484.457pt;height:19.125pt;z-index:251659264;mso-position-horizontal-relative:page;mso-position-vertical-relative:page;mso-wrap-style:none;mso-fit-shape-to-text:t;">
             <w10:wrap type="none"/>
             <v:textbox inset="0,0,0,0">
               <w:txbxContent>
@@ -2368,7 +2452,7 @@
       </w:r>
       <w:r>
         <w:pict>
-          <v:shape id="DocuMindTextBox87" type="#_x0000_t202" stroked="f" filled="f" o:allowincell="f" style="position:absolute;margin-left:56.800pt;margin-top:694.956pt;width:484.278pt;height:19.125pt;z-index:251659264;mso-position-horizontal-relative:page;mso-position-vertical-relative:page;mso-wrap-style:none;mso-fit-shape-to-text:t;">
+          <v:shape id="DocuMindTextBox99" type="#_x0000_t202" stroked="f" filled="f" o:allowincell="f" style="position:absolute;margin-left:56.800pt;margin-top:694.956pt;width:484.278pt;height:19.125pt;z-index:251659264;mso-position-horizontal-relative:page;mso-position-vertical-relative:page;mso-wrap-style:none;mso-fit-shape-to-text:t;">
             <w10:wrap type="none"/>
             <v:textbox inset="0,0,0,0">
               <w:txbxContent>
@@ -2395,7 +2479,7 @@
       </w:r>
       <w:r>
         <w:pict>
-          <v:shape id="DocuMindTextBox88" type="#_x0000_t202" stroked="f" filled="f" o:allowincell="f" style="position:absolute;margin-left:56.800pt;margin-top:709.656pt;width:254.853pt;height:19.125pt;z-index:251659264;mso-position-horizontal-relative:page;mso-position-vertical-relative:page;mso-wrap-style:none;mso-fit-shape-to-text:t;">
+          <v:shape id="DocuMindTextBox100" type="#_x0000_t202" stroked="f" filled="f" o:allowincell="f" style="position:absolute;margin-left:56.800pt;margin-top:709.656pt;width:254.853pt;height:19.125pt;z-index:251659264;mso-position-horizontal-relative:page;mso-position-vertical-relative:page;mso-wrap-style:none;mso-fit-shape-to-text:t;">
             <w10:wrap type="none"/>
             <v:textbox inset="0,0,0,0">
               <w:txbxContent>
@@ -2442,7 +2526,7 @@
       </w:r>
       <w:r>
         <w:pict>
-          <v:shape id="DocuMindTextBox89" type="#_x0000_t202" stroked="f" filled="f" o:allowincell="f" style="position:absolute;margin-left:74.800pt;margin-top:55.810pt;width:449.616pt;height:28.500pt;z-index:251659264;mso-position-horizontal-relative:page;mso-position-vertical-relative:page;mso-wrap-style:none;mso-fit-shape-to-text:t;">
+          <v:shape id="DocuMindTextBox101" type="#_x0000_t202" stroked="f" filled="f" o:allowincell="f" style="position:absolute;margin-left:74.800pt;margin-top:55.810pt;width:449.616pt;height:28.500pt;z-index:251659264;mso-position-horizontal-relative:page;mso-position-vertical-relative:page;mso-wrap-style:none;mso-fit-shape-to-text:t;">
             <w10:wrap type="none"/>
             <v:textbox inset="0,0,0,0">
               <w:txbxContent>
@@ -2469,7 +2553,7 @@
       </w:r>
       <w:r>
         <w:pict>
-          <v:shape id="DocuMindTextBox90" type="#_x0000_t202" stroked="f" filled="f" o:allowincell="f" style="position:absolute;margin-left:96.400pt;margin-top:76.510pt;width:38.946pt;height:28.500pt;z-index:251659264;mso-position-horizontal-relative:page;mso-position-vertical-relative:page;mso-wrap-style:none;mso-fit-shape-to-text:t;">
+          <v:shape id="DocuMindTextBox102" type="#_x0000_t202" stroked="f" filled="f" o:allowincell="f" style="position:absolute;margin-left:96.400pt;margin-top:76.510pt;width:38.946pt;height:28.500pt;z-index:251659264;mso-position-horizontal-relative:page;mso-position-vertical-relative:page;mso-wrap-style:none;mso-fit-shape-to-text:t;">
             <w10:wrap type="none"/>
             <v:textbox inset="0,0,0,0">
               <w:txbxContent>
@@ -2496,7 +2580,7 @@
       </w:r>
       <w:r>
         <w:pict>
-          <v:shape id="DocuMindTextBox91" type="#_x0000_t202" stroked="f" filled="f" o:allowincell="f" style="position:absolute;margin-left:56.800pt;margin-top:128.556pt;width:484.141pt;height:19.125pt;z-index:251659264;mso-position-horizontal-relative:page;mso-position-vertical-relative:page;mso-wrap-style:none;mso-fit-shape-to-text:t;">
+          <v:shape id="DocuMindTextBox103" type="#_x0000_t202" stroked="f" filled="f" o:allowincell="f" style="position:absolute;margin-left:56.800pt;margin-top:128.556pt;width:484.141pt;height:19.125pt;z-index:251659264;mso-position-horizontal-relative:page;mso-position-vertical-relative:page;mso-wrap-style:none;mso-fit-shape-to-text:t;">
             <w10:wrap type="none"/>
             <v:textbox inset="0,0,0,0">
               <w:txbxContent>
@@ -2523,7 +2607,7 @@
       </w:r>
       <w:r>
         <w:pict>
-          <v:shape id="DocuMindTextBox92" type="#_x0000_t202" stroked="f" filled="f" o:allowincell="f" style="position:absolute;margin-left:56.800pt;margin-top:143.256pt;width:484.068pt;height:19.125pt;z-index:251659264;mso-position-horizontal-relative:page;mso-position-vertical-relative:page;mso-wrap-style:none;mso-fit-shape-to-text:t;">
+          <v:shape id="DocuMindTextBox104" type="#_x0000_t202" stroked="f" filled="f" o:allowincell="f" style="position:absolute;margin-left:56.800pt;margin-top:143.256pt;width:484.068pt;height:19.125pt;z-index:251659264;mso-position-horizontal-relative:page;mso-position-vertical-relative:page;mso-wrap-style:none;mso-fit-shape-to-text:t;">
             <w10:wrap type="none"/>
             <v:textbox inset="0,0,0,0">
               <w:txbxContent>
@@ -2550,7 +2634,7 @@
       </w:r>
       <w:r>
         <w:pict>
-          <v:shape id="DocuMindTextBox93" type="#_x0000_t202" stroked="f" filled="f" o:allowincell="f" style="position:absolute;margin-left:56.800pt;margin-top:157.956pt;width:484.278pt;height:19.125pt;z-index:251659264;mso-position-horizontal-relative:page;mso-position-vertical-relative:page;mso-wrap-style:none;mso-fit-shape-to-text:t;">
+          <v:shape id="DocuMindTextBox105" type="#_x0000_t202" stroked="f" filled="f" o:allowincell="f" style="position:absolute;margin-left:56.800pt;margin-top:157.956pt;width:484.278pt;height:19.125pt;z-index:251659264;mso-position-horizontal-relative:page;mso-position-vertical-relative:page;mso-wrap-style:none;mso-fit-shape-to-text:t;">
             <w10:wrap type="none"/>
             <v:textbox inset="0,0,0,0">
               <w:txbxContent>
@@ -2577,7 +2661,7 @@
       </w:r>
       <w:r>
         <w:pict>
-          <v:shape id="DocuMindTextBox94" type="#_x0000_t202" stroked="f" filled="f" o:allowincell="f" style="position:absolute;margin-left:56.800pt;margin-top:172.656pt;width:484.341pt;height:19.125pt;z-index:251659264;mso-position-horizontal-relative:page;mso-position-vertical-relative:page;mso-wrap-style:none;mso-fit-shape-to-text:t;">
+          <v:shape id="DocuMindTextBox106" type="#_x0000_t202" stroked="f" filled="f" o:allowincell="f" style="position:absolute;margin-left:56.800pt;margin-top:172.656pt;width:484.341pt;height:19.125pt;z-index:251659264;mso-position-horizontal-relative:page;mso-position-vertical-relative:page;mso-wrap-style:none;mso-fit-shape-to-text:t;">
             <w10:wrap type="none"/>
             <v:textbox inset="0,0,0,0">
               <w:txbxContent>
@@ -2604,7 +2688,7 @@
       </w:r>
       <w:r>
         <w:pict>
-          <v:shape id="DocuMindTextBox95" type="#_x0000_t202" stroked="f" filled="f" o:allowincell="f" style="position:absolute;margin-left:56.800pt;margin-top:187.356pt;width:483.847pt;height:19.125pt;z-index:251659264;mso-position-horizontal-relative:page;mso-position-vertical-relative:page;mso-wrap-style:none;mso-fit-shape-to-text:t;">
+          <v:shape id="DocuMindTextBox107" type="#_x0000_t202" stroked="f" filled="f" o:allowincell="f" style="position:absolute;margin-left:56.800pt;margin-top:187.356pt;width:483.847pt;height:19.125pt;z-index:251659264;mso-position-horizontal-relative:page;mso-position-vertical-relative:page;mso-wrap-style:none;mso-fit-shape-to-text:t;">
             <w10:wrap type="none"/>
             <v:textbox inset="0,0,0,0">
               <w:txbxContent>
@@ -2631,7 +2715,7 @@
       </w:r>
       <w:r>
         <w:pict>
-          <v:shape id="DocuMindTextBox96" type="#_x0000_t202" stroked="f" filled="f" o:allowincell="f" style="position:absolute;margin-left:56.800pt;margin-top:202.056pt;width:484.152pt;height:19.125pt;z-index:251659264;mso-position-horizontal-relative:page;mso-position-vertical-relative:page;mso-wrap-style:none;mso-fit-shape-to-text:t;">
+          <v:shape id="DocuMindTextBox108" type="#_x0000_t202" stroked="f" filled="f" o:allowincell="f" style="position:absolute;margin-left:56.800pt;margin-top:202.056pt;width:484.152pt;height:19.125pt;z-index:251659264;mso-position-horizontal-relative:page;mso-position-vertical-relative:page;mso-wrap-style:none;mso-fit-shape-to-text:t;">
             <w10:wrap type="none"/>
             <v:textbox inset="0,0,0,0">
               <w:txbxContent>
@@ -2658,7 +2742,7 @@
       </w:r>
       <w:r>
         <w:pict>
-          <v:shape id="DocuMindTextBox97" type="#_x0000_t202" stroked="f" filled="f" o:allowincell="f" style="position:absolute;margin-left:56.800pt;margin-top:216.756pt;width:483.795pt;height:19.125pt;z-index:251659264;mso-position-horizontal-relative:page;mso-position-vertical-relative:page;mso-wrap-style:none;mso-fit-shape-to-text:t;">
+          <v:shape id="DocuMindTextBox109" type="#_x0000_t202" stroked="f" filled="f" o:allowincell="f" style="position:absolute;margin-left:56.800pt;margin-top:216.756pt;width:483.795pt;height:19.125pt;z-index:251659264;mso-position-horizontal-relative:page;mso-position-vertical-relative:page;mso-wrap-style:none;mso-fit-shape-to-text:t;">
             <w10:wrap type="none"/>
             <v:textbox inset="0,0,0,0">
               <w:txbxContent>
@@ -2685,7 +2769,7 @@
       </w:r>
       <w:r>
         <w:pict>
-          <v:shape id="DocuMindTextBox98" type="#_x0000_t202" stroked="f" filled="f" o:allowincell="f" style="position:absolute;margin-left:56.800pt;margin-top:231.456pt;width:483.879pt;height:19.125pt;z-index:251659264;mso-position-horizontal-relative:page;mso-position-vertical-relative:page;mso-wrap-style:none;mso-fit-shape-to-text:t;">
+          <v:shape id="DocuMindTextBox110" type="#_x0000_t202" stroked="f" filled="f" o:allowincell="f" style="position:absolute;margin-left:56.800pt;margin-top:231.456pt;width:483.879pt;height:19.125pt;z-index:251659264;mso-position-horizontal-relative:page;mso-position-vertical-relative:page;mso-wrap-style:none;mso-fit-shape-to-text:t;">
             <w10:wrap type="none"/>
             <v:textbox inset="0,0,0,0">
               <w:txbxContent>
@@ -2712,7 +2796,7 @@
       </w:r>
       <w:r>
         <w:pict>
-          <v:shape id="DocuMindTextBox99" type="#_x0000_t202" stroked="f" filled="f" o:allowincell="f" style="position:absolute;margin-left:56.800pt;margin-top:246.156pt;width:127.950pt;height:19.125pt;z-index:251659264;mso-position-horizontal-relative:page;mso-position-vertical-relative:page;mso-wrap-style:none;mso-fit-shape-to-text:t;">
+          <v:shape id="DocuMindTextBox111" type="#_x0000_t202" stroked="f" filled="f" o:allowincell="f" style="position:absolute;margin-left:56.800pt;margin-top:246.156pt;width:127.950pt;height:19.125pt;z-index:251659264;mso-position-horizontal-relative:page;mso-position-vertical-relative:page;mso-wrap-style:none;mso-fit-shape-to-text:t;">
             <w10:wrap type="none"/>
             <v:textbox inset="0,0,0,0">
               <w:txbxContent>
@@ -2739,7 +2823,7 @@
       </w:r>
       <w:r>
         <w:pict>
-          <v:shape id="DocuMindTextBox100" type="#_x0000_t202" stroked="f" filled="f" o:allowincell="f" style="position:absolute;margin-left:74.800pt;margin-top:282.620pt;width:439.128pt;height:26.000pt;z-index:251659264;mso-position-horizontal-relative:page;mso-position-vertical-relative:page;mso-wrap-style:none;mso-fit-shape-to-text:t;">
+          <v:shape id="DocuMindTextBox112" type="#_x0000_t202" stroked="f" filled="f" o:allowincell="f" style="position:absolute;margin-left:74.800pt;margin-top:282.620pt;width:439.128pt;height:26.000pt;z-index:251659264;mso-position-horizontal-relative:page;mso-position-vertical-relative:page;mso-wrap-style:none;mso-fit-shape-to-text:t;">
             <w10:wrap type="none"/>
             <v:textbox inset="0,0,0,0">
               <w:txbxContent>
@@ -2766,7 +2850,7 @@
       </w:r>
       <w:r>
         <w:pict>
-          <v:shape id="DocuMindTextBox101" type="#_x0000_t202" stroked="f" filled="f" o:allowincell="f" style="position:absolute;margin-left:103.600pt;margin-top:301.020pt;width:110.440pt;height:26.000pt;z-index:251659264;mso-position-horizontal-relative:page;mso-position-vertical-relative:page;mso-wrap-style:none;mso-fit-shape-to-text:t;">
+          <v:shape id="DocuMindTextBox113" type="#_x0000_t202" stroked="f" filled="f" o:allowincell="f" style="position:absolute;margin-left:103.600pt;margin-top:301.020pt;width:110.440pt;height:26.000pt;z-index:251659264;mso-position-horizontal-relative:page;mso-position-vertical-relative:page;mso-wrap-style:none;mso-fit-shape-to-text:t;">
             <w10:wrap type="none"/>
             <v:textbox inset="0,0,0,0">
               <w:txbxContent>
@@ -2793,7 +2877,7 @@
       </w:r>
       <w:r>
         <w:pict>
-          <v:shape id="DocuMindTextBox102" type="#_x0000_t202" stroked="f" filled="f" o:allowincell="f" style="position:absolute;margin-left:56.800pt;margin-top:324.956pt;width:483.890pt;height:19.125pt;z-index:251659264;mso-position-horizontal-relative:page;mso-position-vertical-relative:page;mso-wrap-style:none;mso-fit-shape-to-text:t;">
+          <v:shape id="DocuMindTextBox114" type="#_x0000_t202" stroked="f" filled="f" o:allowincell="f" style="position:absolute;margin-left:56.800pt;margin-top:324.956pt;width:483.890pt;height:19.125pt;z-index:251659264;mso-position-horizontal-relative:page;mso-position-vertical-relative:page;mso-wrap-style:none;mso-fit-shape-to-text:t;">
             <w10:wrap type="none"/>
             <v:textbox inset="0,0,0,0">
               <w:txbxContent>
@@ -2820,7 +2904,7 @@
       </w:r>
       <w:r>
         <w:pict>
-          <v:shape id="DocuMindTextBox103" type="#_x0000_t202" stroked="f" filled="f" o:allowincell="f" style="position:absolute;margin-left:56.800pt;margin-top:339.656pt;width:483.858pt;height:19.125pt;z-index:251659264;mso-position-horizontal-relative:page;mso-position-vertical-relative:page;mso-wrap-style:none;mso-fit-shape-to-text:t;">
+          <v:shape id="DocuMindTextBox115" type="#_x0000_t202" stroked="f" filled="f" o:allowincell="f" style="position:absolute;margin-left:56.800pt;margin-top:339.656pt;width:483.858pt;height:19.125pt;z-index:251659264;mso-position-horizontal-relative:page;mso-position-vertical-relative:page;mso-wrap-style:none;mso-fit-shape-to-text:t;">
             <w10:wrap type="none"/>
             <v:textbox inset="0,0,0,0">
               <w:txbxContent>
@@ -2847,7 +2931,7 @@
       </w:r>
       <w:r>
         <w:pict>
-          <v:shape id="DocuMindTextBox104" type="#_x0000_t202" stroked="f" filled="f" o:allowincell="f" style="position:absolute;margin-left:56.800pt;margin-top:354.356pt;width:484.404pt;height:19.125pt;z-index:251659264;mso-position-horizontal-relative:page;mso-position-vertical-relative:page;mso-wrap-style:none;mso-fit-shape-to-text:t;">
+          <v:shape id="DocuMindTextBox116" type="#_x0000_t202" stroked="f" filled="f" o:allowincell="f" style="position:absolute;margin-left:56.800pt;margin-top:354.356pt;width:484.404pt;height:19.125pt;z-index:251659264;mso-position-horizontal-relative:page;mso-position-vertical-relative:page;mso-wrap-style:none;mso-fit-shape-to-text:t;">
             <w10:wrap type="none"/>
             <v:textbox inset="0,0,0,0">
               <w:txbxContent>
@@ -2874,7 +2958,7 @@
       </w:r>
       <w:r>
         <w:pict>
-          <v:shape id="DocuMindTextBox105" type="#_x0000_t202" stroked="f" filled="f" o:allowincell="f" style="position:absolute;margin-left:56.800pt;margin-top:369.056pt;width:242.999pt;height:19.125pt;z-index:251659264;mso-position-horizontal-relative:page;mso-position-vertical-relative:page;mso-wrap-style:none;mso-fit-shape-to-text:t;">
+          <v:shape id="DocuMindTextBox117" type="#_x0000_t202" stroked="f" filled="f" o:allowincell="f" style="position:absolute;margin-left:56.800pt;margin-top:369.056pt;width:242.999pt;height:19.125pt;z-index:251659264;mso-position-horizontal-relative:page;mso-position-vertical-relative:page;mso-wrap-style:none;mso-fit-shape-to-text:t;">
             <w10:wrap type="none"/>
             <v:textbox inset="0,0,0,0">
               <w:txbxContent>
@@ -2901,7 +2985,7 @@
       </w:r>
       <w:r>
         <w:pict>
-          <v:shape id="DocuMindTextBox106" type="#_x0000_t202" stroked="f" filled="f" o:allowincell="f" style="position:absolute;margin-left:56.800pt;margin-top:394.956pt;width:483.669pt;height:19.125pt;z-index:251659264;mso-position-horizontal-relative:page;mso-position-vertical-relative:page;mso-wrap-style:none;mso-fit-shape-to-text:t;">
+          <v:shape id="DocuMindTextBox118" type="#_x0000_t202" stroked="f" filled="f" o:allowincell="f" style="position:absolute;margin-left:56.800pt;margin-top:394.956pt;width:483.669pt;height:19.125pt;z-index:251659264;mso-position-horizontal-relative:page;mso-position-vertical-relative:page;mso-wrap-style:none;mso-fit-shape-to-text:t;">
             <w10:wrap type="none"/>
             <v:textbox inset="0,0,0,0">
               <w:txbxContent>
@@ -2928,7 +3012,7 @@
       </w:r>
       <w:r>
         <w:pict>
-          <v:shape id="DocuMindTextBox107" type="#_x0000_t202" stroked="f" filled="f" o:allowincell="f" style="position:absolute;margin-left:56.800pt;margin-top:409.656pt;width:484.110pt;height:19.125pt;z-index:251659264;mso-position-horizontal-relative:page;mso-position-vertical-relative:page;mso-wrap-style:none;mso-fit-shape-to-text:t;">
+          <v:shape id="DocuMindTextBox119" type="#_x0000_t202" stroked="f" filled="f" o:allowincell="f" style="position:absolute;margin-left:56.800pt;margin-top:409.656pt;width:484.110pt;height:19.125pt;z-index:251659264;mso-position-horizontal-relative:page;mso-position-vertical-relative:page;mso-wrap-style:none;mso-fit-shape-to-text:t;">
             <w10:wrap type="none"/>
             <v:textbox inset="0,0,0,0">
               <w:txbxContent>
@@ -2955,7 +3039,7 @@
       </w:r>
       <w:r>
         <w:pict>
-          <v:shape id="DocuMindTextBox108" type="#_x0000_t202" stroked="f" filled="f" o:allowincell="f" style="position:absolute;margin-left:56.800pt;margin-top:424.356pt;width:484.036pt;height:19.125pt;z-index:251659264;mso-position-horizontal-relative:page;mso-position-vertical-relative:page;mso-wrap-style:none;mso-fit-shape-to-text:t;">
+          <v:shape id="DocuMindTextBox120" type="#_x0000_t202" stroked="f" filled="f" o:allowincell="f" style="position:absolute;margin-left:56.800pt;margin-top:424.356pt;width:484.036pt;height:19.125pt;z-index:251659264;mso-position-horizontal-relative:page;mso-position-vertical-relative:page;mso-wrap-style:none;mso-fit-shape-to-text:t;">
             <w10:wrap type="none"/>
             <v:textbox inset="0,0,0,0">
               <w:txbxContent>
@@ -2982,7 +3066,7 @@
       </w:r>
       <w:r>
         <w:pict>
-          <v:shape id="DocuMindTextBox109" type="#_x0000_t202" stroked="f" filled="f" o:allowincell="f" style="position:absolute;margin-left:56.800pt;margin-top:439.056pt;width:483.837pt;height:19.125pt;z-index:251659264;mso-position-horizontal-relative:page;mso-position-vertical-relative:page;mso-wrap-style:none;mso-fit-shape-to-text:t;">
+          <v:shape id="DocuMindTextBox121" type="#_x0000_t202" stroked="f" filled="f" o:allowincell="f" style="position:absolute;margin-left:56.800pt;margin-top:439.056pt;width:483.837pt;height:19.125pt;z-index:251659264;mso-position-horizontal-relative:page;mso-position-vertical-relative:page;mso-wrap-style:none;mso-fit-shape-to-text:t;">
             <w10:wrap type="none"/>
             <v:textbox inset="0,0,0,0">
               <w:txbxContent>
@@ -3009,7 +3093,7 @@
       </w:r>
       <w:r>
         <w:pict>
-          <v:shape id="DocuMindTextBox110" type="#_x0000_t202" stroked="f" filled="f" o:allowincell="f" style="position:absolute;margin-left:56.800pt;margin-top:453.756pt;width:483.847pt;height:19.125pt;z-index:251659264;mso-position-horizontal-relative:page;mso-position-vertical-relative:page;mso-wrap-style:none;mso-fit-shape-to-text:t;">
+          <v:shape id="DocuMindTextBox122" type="#_x0000_t202" stroked="f" filled="f" o:allowincell="f" style="position:absolute;margin-left:56.800pt;margin-top:453.756pt;width:483.847pt;height:19.125pt;z-index:251659264;mso-position-horizontal-relative:page;mso-position-vertical-relative:page;mso-wrap-style:none;mso-fit-shape-to-text:t;">
             <w10:wrap type="none"/>
             <v:textbox inset="0,0,0,0">
               <w:txbxContent>
@@ -3036,7 +3120,7 @@
       </w:r>
       <w:r>
         <w:pict>
-          <v:shape id="DocuMindTextBox111" type="#_x0000_t202" stroked="f" filled="f" o:allowincell="f" style="position:absolute;margin-left:56.800pt;margin-top:468.456pt;width:484.173pt;height:19.125pt;z-index:251659264;mso-position-horizontal-relative:page;mso-position-vertical-relative:page;mso-wrap-style:none;mso-fit-shape-to-text:t;">
+          <v:shape id="DocuMindTextBox123" type="#_x0000_t202" stroked="f" filled="f" o:allowincell="f" style="position:absolute;margin-left:56.800pt;margin-top:468.456pt;width:484.173pt;height:19.125pt;z-index:251659264;mso-position-horizontal-relative:page;mso-position-vertical-relative:page;mso-wrap-style:none;mso-fit-shape-to-text:t;">
             <w10:wrap type="none"/>
             <v:textbox inset="0,0,0,0">
               <w:txbxContent>
@@ -3063,7 +3147,7 @@
       </w:r>
       <w:r>
         <w:pict>
-          <v:shape id="DocuMindTextBox112" type="#_x0000_t202" stroked="f" filled="f" o:allowincell="f" style="position:absolute;margin-left:56.800pt;margin-top:483.156pt;width:253.803pt;height:19.125pt;z-index:251659264;mso-position-horizontal-relative:page;mso-position-vertical-relative:page;mso-wrap-style:none;mso-fit-shape-to-text:t;">
+          <v:shape id="DocuMindTextBox124" type="#_x0000_t202" stroked="f" filled="f" o:allowincell="f" style="position:absolute;margin-left:56.800pt;margin-top:483.156pt;width:253.803pt;height:19.125pt;z-index:251659264;mso-position-horizontal-relative:page;mso-position-vertical-relative:page;mso-wrap-style:none;mso-fit-shape-to-text:t;">
             <w10:wrap type="none"/>
             <v:textbox inset="0,0,0,0">
               <w:txbxContent>
@@ -3090,7 +3174,7 @@
       </w:r>
       <w:r>
         <w:pict>
-          <v:shape id="DocuMindTextBox113" type="#_x0000_t202" stroked="f" filled="f" o:allowincell="f" style="position:absolute;margin-left:74.800pt;margin-top:519.620pt;width:375.176pt;height:26.000pt;z-index:251659264;mso-position-horizontal-relative:page;mso-position-vertical-relative:page;mso-wrap-style:none;mso-fit-shape-to-text:t;">
+          <v:shape id="DocuMindTextBox125" type="#_x0000_t202" stroked="f" filled="f" o:allowincell="f" style="position:absolute;margin-left:74.800pt;margin-top:519.620pt;width:375.176pt;height:26.000pt;z-index:251659264;mso-position-horizontal-relative:page;mso-position-vertical-relative:page;mso-wrap-style:none;mso-fit-shape-to-text:t;">
             <w10:wrap type="none"/>
             <v:textbox inset="0,0,0,0">
               <w:txbxContent>
@@ -3117,7 +3201,7 @@
       </w:r>
       <w:r>
         <w:pict>
-          <v:shape id="DocuMindTextBox114" type="#_x0000_t202" stroked="f" filled="f" o:allowincell="f" style="position:absolute;margin-left:56.800pt;margin-top:543.556pt;width:484.036pt;height:19.125pt;z-index:251659264;mso-position-horizontal-relative:page;mso-position-vertical-relative:page;mso-wrap-style:none;mso-fit-shape-to-text:t;">
+          <v:shape id="DocuMindTextBox126" type="#_x0000_t202" stroked="f" filled="f" o:allowincell="f" style="position:absolute;margin-left:56.800pt;margin-top:543.556pt;width:484.036pt;height:19.125pt;z-index:251659264;mso-position-horizontal-relative:page;mso-position-vertical-relative:page;mso-wrap-style:none;mso-fit-shape-to-text:t;">
             <w10:wrap type="none"/>
             <v:textbox inset="0,0,0,0">
               <w:txbxContent>
@@ -3144,7 +3228,7 @@
       </w:r>
       <w:r>
         <w:pict>
-          <v:shape id="DocuMindTextBox115" type="#_x0000_t202" stroked="f" filled="f" o:allowincell="f" style="position:absolute;margin-left:56.800pt;margin-top:558.256pt;width:484.047pt;height:19.125pt;z-index:251659264;mso-position-horizontal-relative:page;mso-position-vertical-relative:page;mso-wrap-style:none;mso-fit-shape-to-text:t;">
+          <v:shape id="DocuMindTextBox127" type="#_x0000_t202" stroked="f" filled="f" o:allowincell="f" style="position:absolute;margin-left:56.800pt;margin-top:558.256pt;width:484.047pt;height:19.125pt;z-index:251659264;mso-position-horizontal-relative:page;mso-position-vertical-relative:page;mso-wrap-style:none;mso-fit-shape-to-text:t;">
             <w10:wrap type="none"/>
             <v:textbox inset="0,0,0,0">
               <w:txbxContent>
@@ -3171,7 +3255,7 @@
       </w:r>
       <w:r>
         <w:pict>
-          <v:shape id="DocuMindTextBox116" type="#_x0000_t202" stroked="f" filled="f" o:allowincell="f" style="position:absolute;margin-left:56.800pt;margin-top:572.956pt;width:484.520pt;height:19.125pt;z-index:251659264;mso-position-horizontal-relative:page;mso-position-vertical-relative:page;mso-wrap-style:none;mso-fit-shape-to-text:t;">
+          <v:shape id="DocuMindTextBox128" type="#_x0000_t202" stroked="f" filled="f" o:allowincell="f" style="position:absolute;margin-left:56.800pt;margin-top:572.956pt;width:484.520pt;height:19.125pt;z-index:251659264;mso-position-horizontal-relative:page;mso-position-vertical-relative:page;mso-wrap-style:none;mso-fit-shape-to-text:t;">
             <w10:wrap type="none"/>
             <v:textbox inset="0,0,0,0">
               <w:txbxContent>
@@ -3198,7 +3282,7 @@
       </w:r>
       <w:r>
         <w:pict>
-          <v:shape id="DocuMindTextBox117" type="#_x0000_t202" stroked="f" filled="f" o:allowincell="f" style="position:absolute;margin-left:56.800pt;margin-top:587.656pt;width:186.509pt;height:19.125pt;z-index:251659264;mso-position-horizontal-relative:page;mso-position-vertical-relative:page;mso-wrap-style:none;mso-fit-shape-to-text:t;">
+          <v:shape id="DocuMindTextBox129" type="#_x0000_t202" stroked="f" filled="f" o:allowincell="f" style="position:absolute;margin-left:56.800pt;margin-top:587.656pt;width:186.509pt;height:19.125pt;z-index:251659264;mso-position-horizontal-relative:page;mso-position-vertical-relative:page;mso-wrap-style:none;mso-fit-shape-to-text:t;">
             <w10:wrap type="none"/>
             <v:textbox inset="0,0,0,0">
               <w:txbxContent>
@@ -3225,7 +3309,7 @@
       </w:r>
       <w:r>
         <w:pict>
-          <v:shape id="DocuMindTextBox118" type="#_x0000_t202" stroked="f" filled="f" o:allowincell="f" style="position:absolute;margin-left:56.800pt;margin-top:613.556pt;width:483.732pt;height:19.125pt;z-index:251659264;mso-position-horizontal-relative:page;mso-position-vertical-relative:page;mso-wrap-style:none;mso-fit-shape-to-text:t;">
+          <v:shape id="DocuMindTextBox130" type="#_x0000_t202" stroked="f" filled="f" o:allowincell="f" style="position:absolute;margin-left:56.800pt;margin-top:613.556pt;width:483.732pt;height:19.125pt;z-index:251659264;mso-position-horizontal-relative:page;mso-position-vertical-relative:page;mso-wrap-style:none;mso-fit-shape-to-text:t;">
             <w10:wrap type="none"/>
             <v:textbox inset="0,0,0,0">
               <w:txbxContent>
@@ -3252,7 +3336,7 @@
       </w:r>
       <w:r>
         <w:pict>
-          <v:shape id="DocuMindTextBox119" type="#_x0000_t202" stroked="f" filled="f" o:allowincell="f" style="position:absolute;margin-left:56.800pt;margin-top:628.256pt;width:484.299pt;height:19.125pt;z-index:251659264;mso-position-horizontal-relative:page;mso-position-vertical-relative:page;mso-wrap-style:none;mso-fit-shape-to-text:t;">
+          <v:shape id="DocuMindTextBox131" type="#_x0000_t202" stroked="f" filled="f" o:allowincell="f" style="position:absolute;margin-left:56.800pt;margin-top:628.256pt;width:484.299pt;height:19.125pt;z-index:251659264;mso-position-horizontal-relative:page;mso-position-vertical-relative:page;mso-wrap-style:none;mso-fit-shape-to-text:t;">
             <w10:wrap type="none"/>
             <v:textbox inset="0,0,0,0">
               <w:txbxContent>
@@ -3279,7 +3363,7 @@
       </w:r>
       <w:r>
         <w:pict>
-          <v:shape id="DocuMindTextBox120" type="#_x0000_t202" stroked="f" filled="f" o:allowincell="f" style="position:absolute;margin-left:56.800pt;margin-top:642.956pt;width:484.047pt;height:19.125pt;z-index:251659264;mso-position-horizontal-relative:page;mso-position-vertical-relative:page;mso-wrap-style:none;mso-fit-shape-to-text:t;">
+          <v:shape id="DocuMindTextBox132" type="#_x0000_t202" stroked="f" filled="f" o:allowincell="f" style="position:absolute;margin-left:56.800pt;margin-top:642.956pt;width:484.047pt;height:19.125pt;z-index:251659264;mso-position-horizontal-relative:page;mso-position-vertical-relative:page;mso-wrap-style:none;mso-fit-shape-to-text:t;">
             <w10:wrap type="none"/>
             <v:textbox inset="0,0,0,0">
               <w:txbxContent>
@@ -3306,7 +3390,7 @@
       </w:r>
       <w:r>
         <w:pict>
-          <v:shape id="DocuMindTextBox121" type="#_x0000_t202" stroked="f" filled="f" o:allowincell="f" style="position:absolute;margin-left:56.800pt;margin-top:657.656pt;width:484.498pt;height:19.125pt;z-index:251659264;mso-position-horizontal-relative:page;mso-position-vertical-relative:page;mso-wrap-style:none;mso-fit-shape-to-text:t;">
+          <v:shape id="DocuMindTextBox133" type="#_x0000_t202" stroked="f" filled="f" o:allowincell="f" style="position:absolute;margin-left:56.800pt;margin-top:657.656pt;width:484.498pt;height:19.125pt;z-index:251659264;mso-position-horizontal-relative:page;mso-position-vertical-relative:page;mso-wrap-style:none;mso-fit-shape-to-text:t;">
             <w10:wrap type="none"/>
             <v:textbox inset="0,0,0,0">
               <w:txbxContent>
@@ -3333,7 +3417,7 @@
       </w:r>
       <w:r>
         <w:pict>
-          <v:shape id="DocuMindTextBox122" type="#_x0000_t202" stroked="f" filled="f" o:allowincell="f" style="position:absolute;margin-left:56.800pt;margin-top:672.356pt;width:484.299pt;height:19.125pt;z-index:251659264;mso-position-horizontal-relative:page;mso-position-vertical-relative:page;mso-wrap-style:none;mso-fit-shape-to-text:t;">
+          <v:shape id="DocuMindTextBox134" type="#_x0000_t202" stroked="f" filled="f" o:allowincell="f" style="position:absolute;margin-left:56.800pt;margin-top:672.356pt;width:484.299pt;height:19.125pt;z-index:251659264;mso-position-horizontal-relative:page;mso-position-vertical-relative:page;mso-wrap-style:none;mso-fit-shape-to-text:t;">
             <w10:wrap type="none"/>
             <v:textbox inset="0,0,0,0">
               <w:txbxContent>
@@ -3360,7 +3444,7 @@
       </w:r>
       <w:r>
         <w:pict>
-          <v:shape id="DocuMindTextBox123" type="#_x0000_t202" stroked="f" filled="f" o:allowincell="f" style="position:absolute;margin-left:56.800pt;margin-top:687.056pt;width:483.858pt;height:19.125pt;z-index:251659264;mso-position-horizontal-relative:page;mso-position-vertical-relative:page;mso-wrap-style:none;mso-fit-shape-to-text:t;">
+          <v:shape id="DocuMindTextBox135" type="#_x0000_t202" stroked="f" filled="f" o:allowincell="f" style="position:absolute;margin-left:56.800pt;margin-top:687.056pt;width:483.858pt;height:19.125pt;z-index:251659264;mso-position-horizontal-relative:page;mso-position-vertical-relative:page;mso-wrap-style:none;mso-fit-shape-to-text:t;">
             <w10:wrap type="none"/>
             <v:textbox inset="0,0,0,0">
               <w:txbxContent>
@@ -3387,7 +3471,7 @@
       </w:r>
       <w:r>
         <w:pict>
-          <v:shape id="DocuMindTextBox124" type="#_x0000_t202" stroked="f" filled="f" o:allowincell="f" style="position:absolute;margin-left:56.800pt;margin-top:701.756pt;width:484.457pt;height:19.125pt;z-index:251659264;mso-position-horizontal-relative:page;mso-position-vertical-relative:page;mso-wrap-style:none;mso-fit-shape-to-text:t;">
+          <v:shape id="DocuMindTextBox136" type="#_x0000_t202" stroked="f" filled="f" o:allowincell="f" style="position:absolute;margin-left:56.800pt;margin-top:701.756pt;width:484.457pt;height:19.125pt;z-index:251659264;mso-position-horizontal-relative:page;mso-position-vertical-relative:page;mso-wrap-style:none;mso-fit-shape-to-text:t;">
             <w10:wrap type="none"/>
             <v:textbox inset="0,0,0,0">
               <w:txbxContent>
@@ -3414,7 +3498,7 @@
       </w:r>
       <w:r>
         <w:pict>
-          <v:shape id="DocuMindTextBox125" type="#_x0000_t202" stroked="f" filled="f" o:allowincell="f" style="position:absolute;margin-left:56.800pt;margin-top:716.456pt;width:484.278pt;height:19.125pt;z-index:251659264;mso-position-horizontal-relative:page;mso-position-vertical-relative:page;mso-wrap-style:none;mso-fit-shape-to-text:t;">
+          <v:shape id="DocuMindTextBox137" type="#_x0000_t202" stroked="f" filled="f" o:allowincell="f" style="position:absolute;margin-left:56.800pt;margin-top:716.456pt;width:484.278pt;height:19.125pt;z-index:251659264;mso-position-horizontal-relative:page;mso-position-vertical-relative:page;mso-wrap-style:none;mso-fit-shape-to-text:t;">
             <w10:wrap type="none"/>
             <v:textbox inset="0,0,0,0">
               <w:txbxContent>
@@ -3441,7 +3525,7 @@
       </w:r>
       <w:r>
         <w:pict>
-          <v:shape id="DocuMindTextBox126" type="#_x0000_t202" stroked="f" filled="f" o:allowincell="f" style="position:absolute;margin-left:56.800pt;margin-top:731.156pt;width:254.853pt;height:19.125pt;z-index:251659264;mso-position-horizontal-relative:page;mso-position-vertical-relative:page;mso-wrap-style:none;mso-fit-shape-to-text:t;">
+          <v:shape id="DocuMindTextBox138" type="#_x0000_t202" stroked="f" filled="f" o:allowincell="f" style="position:absolute;margin-left:56.800pt;margin-top:731.156pt;width:254.853pt;height:19.125pt;z-index:251659264;mso-position-horizontal-relative:page;mso-position-vertical-relative:page;mso-wrap-style:none;mso-fit-shape-to-text:t;">
             <w10:wrap type="none"/>
             <v:textbox inset="0,0,0,0">
               <w:txbxContent>
@@ -3488,7 +3572,7 @@
       </w:r>
       <w:r>
         <w:pict>
-          <v:shape id="DocuMindImage127" type="#_x0000_t75" stroked="f" o:allowincell="f" style="position:absolute;margin-left:56.800pt;margin-top:56.700pt;width:481.700pt;height:321.300pt;z-index:1;mso-position-horizontal-relative:page;mso-position-vertical-relative:page;mso-wrap-style:none;">
+          <v:shape id="DocuMindImage139" type="#_x0000_t75" stroked="f" o:allowincell="f" style="position:absolute;margin-left:56.800pt;margin-top:56.700pt;width:481.700pt;height:321.300pt;z-index:1;mso-position-horizontal-relative:page;mso-position-vertical-relative:page;mso-wrap-style:none;">
             <w10:wrap type="none"/>
             <v:imagedata r:id="rId9" o:title=""/>
           </v:shape>
@@ -3496,7 +3580,7 @@
       </w:r>
       <w:r>
         <w:pict>
-          <v:shape id="DocuMindTextBox128" type="#_x0000_t202" stroked="f" filled="f" o:allowincell="f" style="position:absolute;margin-left:74.800pt;margin-top:413.420pt;width:439.128pt;height:26.000pt;z-index:251659264;mso-position-horizontal-relative:page;mso-position-vertical-relative:page;mso-wrap-style:none;mso-fit-shape-to-text:t;">
+          <v:shape id="DocuMindTextBox140" type="#_x0000_t202" stroked="f" filled="f" o:allowincell="f" style="position:absolute;margin-left:74.800pt;margin-top:413.420pt;width:439.128pt;height:26.000pt;z-index:251659264;mso-position-horizontal-relative:page;mso-position-vertical-relative:page;mso-wrap-style:none;mso-fit-shape-to-text:t;">
             <w10:wrap type="none"/>
             <v:textbox inset="0,0,0,0">
               <w:txbxContent>
@@ -3523,7 +3607,7 @@
       </w:r>
       <w:r>
         <w:pict>
-          <v:shape id="DocuMindTextBox129" type="#_x0000_t202" stroked="f" filled="f" o:allowincell="f" style="position:absolute;margin-left:103.600pt;margin-top:431.820pt;width:110.440pt;height:26.000pt;z-index:251659264;mso-position-horizontal-relative:page;mso-position-vertical-relative:page;mso-wrap-style:none;mso-fit-shape-to-text:t;">
+          <v:shape id="DocuMindTextBox141" type="#_x0000_t202" stroked="f" filled="f" o:allowincell="f" style="position:absolute;margin-left:103.600pt;margin-top:431.820pt;width:110.440pt;height:26.000pt;z-index:251659264;mso-position-horizontal-relative:page;mso-position-vertical-relative:page;mso-wrap-style:none;mso-fit-shape-to-text:t;">
             <w10:wrap type="none"/>
             <v:textbox inset="0,0,0,0">
               <w:txbxContent>
@@ -3550,7 +3634,7 @@
       </w:r>
       <w:r>
         <w:pict>
-          <v:shape id="DocuMindTextBox130" type="#_x0000_t202" stroked="f" filled="f" o:allowincell="f" style="position:absolute;margin-left:56.800pt;margin-top:455.656pt;width:483.890pt;height:19.125pt;z-index:251659264;mso-position-horizontal-relative:page;mso-position-vertical-relative:page;mso-wrap-style:none;mso-fit-shape-to-text:t;">
+          <v:shape id="DocuMindTextBox142" type="#_x0000_t202" stroked="f" filled="f" o:allowincell="f" style="position:absolute;margin-left:56.800pt;margin-top:455.656pt;width:483.890pt;height:19.125pt;z-index:251659264;mso-position-horizontal-relative:page;mso-position-vertical-relative:page;mso-wrap-style:none;mso-fit-shape-to-text:t;">
             <w10:wrap type="none"/>
             <v:textbox inset="0,0,0,0">
               <w:txbxContent>
@@ -3577,7 +3661,7 @@
       </w:r>
       <w:r>
         <w:pict>
-          <v:shape id="DocuMindTextBox131" type="#_x0000_t202" stroked="f" filled="f" o:allowincell="f" style="position:absolute;margin-left:56.800pt;margin-top:470.356pt;width:483.858pt;height:19.125pt;z-index:251659264;mso-position-horizontal-relative:page;mso-position-vertical-relative:page;mso-wrap-style:none;mso-fit-shape-to-text:t;">
+          <v:shape id="DocuMindTextBox143" type="#_x0000_t202" stroked="f" filled="f" o:allowincell="f" style="position:absolute;margin-left:56.800pt;margin-top:470.356pt;width:483.858pt;height:19.125pt;z-index:251659264;mso-position-horizontal-relative:page;mso-position-vertical-relative:page;mso-wrap-style:none;mso-fit-shape-to-text:t;">
             <w10:wrap type="none"/>
             <v:textbox inset="0,0,0,0">
               <w:txbxContent>
@@ -3604,7 +3688,7 @@
       </w:r>
       <w:r>
         <w:pict>
-          <v:shape id="DocuMindTextBox132" type="#_x0000_t202" stroked="f" filled="f" o:allowincell="f" style="position:absolute;margin-left:56.800pt;margin-top:485.056pt;width:484.404pt;height:19.125pt;z-index:251659264;mso-position-horizontal-relative:page;mso-position-vertical-relative:page;mso-wrap-style:none;mso-fit-shape-to-text:t;">
+          <v:shape id="DocuMindTextBox144" type="#_x0000_t202" stroked="f" filled="f" o:allowincell="f" style="position:absolute;margin-left:56.800pt;margin-top:485.056pt;width:484.404pt;height:19.125pt;z-index:251659264;mso-position-horizontal-relative:page;mso-position-vertical-relative:page;mso-wrap-style:none;mso-fit-shape-to-text:t;">
             <w10:wrap type="none"/>
             <v:textbox inset="0,0,0,0">
               <w:txbxContent>
@@ -3631,7 +3715,7 @@
       </w:r>
       <w:r>
         <w:pict>
-          <v:shape id="DocuMindTextBox133" type="#_x0000_t202" stroked="f" filled="f" o:allowincell="f" style="position:absolute;margin-left:56.800pt;margin-top:499.756pt;width:242.999pt;height:19.125pt;z-index:251659264;mso-position-horizontal-relative:page;mso-position-vertical-relative:page;mso-wrap-style:none;mso-fit-shape-to-text:t;">
+          <v:shape id="DocuMindTextBox145" type="#_x0000_t202" stroked="f" filled="f" o:allowincell="f" style="position:absolute;margin-left:56.800pt;margin-top:499.756pt;width:242.999pt;height:19.125pt;z-index:251659264;mso-position-horizontal-relative:page;mso-position-vertical-relative:page;mso-wrap-style:none;mso-fit-shape-to-text:t;">
             <w10:wrap type="none"/>
             <v:textbox inset="0,0,0,0">
               <w:txbxContent>
@@ -3658,7 +3742,7 @@
       </w:r>
       <w:r>
         <w:pict>
-          <v:shape id="DocuMindTextBox134" type="#_x0000_t202" stroked="f" filled="f" o:allowincell="f" style="position:absolute;margin-left:56.800pt;margin-top:525.756pt;width:483.669pt;height:19.125pt;z-index:251659264;mso-position-horizontal-relative:page;mso-position-vertical-relative:page;mso-wrap-style:none;mso-fit-shape-to-text:t;">
+          <v:shape id="DocuMindTextBox146" type="#_x0000_t202" stroked="f" filled="f" o:allowincell="f" style="position:absolute;margin-left:56.800pt;margin-top:525.756pt;width:483.669pt;height:19.125pt;z-index:251659264;mso-position-horizontal-relative:page;mso-position-vertical-relative:page;mso-wrap-style:none;mso-fit-shape-to-text:t;">
             <w10:wrap type="none"/>
             <v:textbox inset="0,0,0,0">
               <w:txbxContent>
@@ -3685,7 +3769,7 @@
       </w:r>
       <w:r>
         <w:pict>
-          <v:shape id="DocuMindTextBox135" type="#_x0000_t202" stroked="f" filled="f" o:allowincell="f" style="position:absolute;margin-left:56.800pt;margin-top:540.456pt;width:484.110pt;height:19.125pt;z-index:251659264;mso-position-horizontal-relative:page;mso-position-vertical-relative:page;mso-wrap-style:none;mso-fit-shape-to-text:t;">
+          <v:shape id="DocuMindTextBox147" type="#_x0000_t202" stroked="f" filled="f" o:allowincell="f" style="position:absolute;margin-left:56.800pt;margin-top:540.456pt;width:484.110pt;height:19.125pt;z-index:251659264;mso-position-horizontal-relative:page;mso-position-vertical-relative:page;mso-wrap-style:none;mso-fit-shape-to-text:t;">
             <w10:wrap type="none"/>
             <v:textbox inset="0,0,0,0">
               <w:txbxContent>
@@ -3712,7 +3796,7 @@
       </w:r>
       <w:r>
         <w:pict>
-          <v:shape id="DocuMindTextBox136" type="#_x0000_t202" stroked="f" filled="f" o:allowincell="f" style="position:absolute;margin-left:56.800pt;margin-top:555.156pt;width:484.036pt;height:19.125pt;z-index:251659264;mso-position-horizontal-relative:page;mso-position-vertical-relative:page;mso-wrap-style:none;mso-fit-shape-to-text:t;">
+          <v:shape id="DocuMindTextBox148" type="#_x0000_t202" stroked="f" filled="f" o:allowincell="f" style="position:absolute;margin-left:56.800pt;margin-top:555.156pt;width:484.036pt;height:19.125pt;z-index:251659264;mso-position-horizontal-relative:page;mso-position-vertical-relative:page;mso-wrap-style:none;mso-fit-shape-to-text:t;">
             <w10:wrap type="none"/>
             <v:textbox inset="0,0,0,0">
               <w:txbxContent>
@@ -3739,7 +3823,7 @@
       </w:r>
       <w:r>
         <w:pict>
-          <v:shape id="DocuMindTextBox137" type="#_x0000_t202" stroked="f" filled="f" o:allowincell="f" style="position:absolute;margin-left:56.800pt;margin-top:569.856pt;width:483.837pt;height:19.125pt;z-index:251659264;mso-position-horizontal-relative:page;mso-position-vertical-relative:page;mso-wrap-style:none;mso-fit-shape-to-text:t;">
+          <v:shape id="DocuMindTextBox149" type="#_x0000_t202" stroked="f" filled="f" o:allowincell="f" style="position:absolute;margin-left:56.800pt;margin-top:569.856pt;width:483.837pt;height:19.125pt;z-index:251659264;mso-position-horizontal-relative:page;mso-position-vertical-relative:page;mso-wrap-style:none;mso-fit-shape-to-text:t;">
             <w10:wrap type="none"/>
             <v:textbox inset="0,0,0,0">
               <w:txbxContent>
@@ -3766,7 +3850,7 @@
       </w:r>
       <w:r>
         <w:pict>
-          <v:shape id="DocuMindTextBox138" type="#_x0000_t202" stroked="f" filled="f" o:allowincell="f" style="position:absolute;margin-left:56.800pt;margin-top:584.556pt;width:483.847pt;height:19.125pt;z-index:251659264;mso-position-horizontal-relative:page;mso-position-vertical-relative:page;mso-wrap-style:none;mso-fit-shape-to-text:t;">
+          <v:shape id="DocuMindTextBox150" type="#_x0000_t202" stroked="f" filled="f" o:allowincell="f" style="position:absolute;margin-left:56.800pt;margin-top:584.556pt;width:483.847pt;height:19.125pt;z-index:251659264;mso-position-horizontal-relative:page;mso-position-vertical-relative:page;mso-wrap-style:none;mso-fit-shape-to-text:t;">
             <w10:wrap type="none"/>
             <v:textbox inset="0,0,0,0">
               <w:txbxContent>
@@ -3793,7 +3877,7 @@
       </w:r>
       <w:r>
         <w:pict>
-          <v:shape id="DocuMindTextBox139" type="#_x0000_t202" stroked="f" filled="f" o:allowincell="f" style="position:absolute;margin-left:56.800pt;margin-top:599.256pt;width:484.173pt;height:19.125pt;z-index:251659264;mso-position-horizontal-relative:page;mso-position-vertical-relative:page;mso-wrap-style:none;mso-fit-shape-to-text:t;">
+          <v:shape id="DocuMindTextBox151" type="#_x0000_t202" stroked="f" filled="f" o:allowincell="f" style="position:absolute;margin-left:56.800pt;margin-top:599.256pt;width:484.173pt;height:19.125pt;z-index:251659264;mso-position-horizontal-relative:page;mso-position-vertical-relative:page;mso-wrap-style:none;mso-fit-shape-to-text:t;">
             <w10:wrap type="none"/>
             <v:textbox inset="0,0,0,0">
               <w:txbxContent>
@@ -3820,7 +3904,7 @@
       </w:r>
       <w:r>
         <w:pict>
-          <v:shape id="DocuMindTextBox140" type="#_x0000_t202" stroked="f" filled="f" o:allowincell="f" style="position:absolute;margin-left:56.800pt;margin-top:613.956pt;width:253.803pt;height:19.125pt;z-index:251659264;mso-position-horizontal-relative:page;mso-position-vertical-relative:page;mso-wrap-style:none;mso-fit-shape-to-text:t;">
+          <v:shape id="DocuMindTextBox152" type="#_x0000_t202" stroked="f" filled="f" o:allowincell="f" style="position:absolute;margin-left:56.800pt;margin-top:613.956pt;width:253.803pt;height:19.125pt;z-index:251659264;mso-position-horizontal-relative:page;mso-position-vertical-relative:page;mso-wrap-style:none;mso-fit-shape-to-text:t;">
             <w10:wrap type="none"/>
             <v:textbox inset="0,0,0,0">
               <w:txbxContent>
@@ -3847,7 +3931,7 @@
       </w:r>
       <w:r>
         <w:pict>
-          <v:shape id="DocuMindTextBox141" type="#_x0000_t202" stroked="f" filled="f" o:allowincell="f" style="position:absolute;margin-left:74.800pt;margin-top:650.420pt;width:375.176pt;height:26.000pt;z-index:251659264;mso-position-horizontal-relative:page;mso-position-vertical-relative:page;mso-wrap-style:none;mso-fit-shape-to-text:t;">
+          <v:shape id="DocuMindTextBox153" type="#_x0000_t202" stroked="f" filled="f" o:allowincell="f" style="position:absolute;margin-left:74.800pt;margin-top:650.420pt;width:375.176pt;height:26.000pt;z-index:251659264;mso-position-horizontal-relative:page;mso-position-vertical-relative:page;mso-wrap-style:none;mso-fit-shape-to-text:t;">
             <w10:wrap type="none"/>
             <v:textbox inset="0,0,0,0">
               <w:txbxContent>
@@ -3874,7 +3958,7 @@
       </w:r>
       <w:r>
         <w:pict>
-          <v:shape id="DocuMindTextBox142" type="#_x0000_t202" stroked="f" filled="f" o:allowincell="f" style="position:absolute;margin-left:56.800pt;margin-top:674.256pt;width:484.036pt;height:19.125pt;z-index:251659264;mso-position-horizontal-relative:page;mso-position-vertical-relative:page;mso-wrap-style:none;mso-fit-shape-to-text:t;">
+          <v:shape id="DocuMindTextBox154" type="#_x0000_t202" stroked="f" filled="f" o:allowincell="f" style="position:absolute;margin-left:56.800pt;margin-top:674.256pt;width:484.036pt;height:19.125pt;z-index:251659264;mso-position-horizontal-relative:page;mso-position-vertical-relative:page;mso-wrap-style:none;mso-fit-shape-to-text:t;">
             <w10:wrap type="none"/>
             <v:textbox inset="0,0,0,0">
               <w:txbxContent>
@@ -3901,7 +3985,7 @@
       </w:r>
       <w:r>
         <w:pict>
-          <v:shape id="DocuMindTextBox143" type="#_x0000_t202" stroked="f" filled="f" o:allowincell="f" style="position:absolute;margin-left:56.800pt;margin-top:688.956pt;width:484.047pt;height:19.125pt;z-index:251659264;mso-position-horizontal-relative:page;mso-position-vertical-relative:page;mso-wrap-style:none;mso-fit-shape-to-text:t;">
+          <v:shape id="DocuMindTextBox155" type="#_x0000_t202" stroked="f" filled="f" o:allowincell="f" style="position:absolute;margin-left:56.800pt;margin-top:688.956pt;width:484.047pt;height:19.125pt;z-index:251659264;mso-position-horizontal-relative:page;mso-position-vertical-relative:page;mso-wrap-style:none;mso-fit-shape-to-text:t;">
             <w10:wrap type="none"/>
             <v:textbox inset="0,0,0,0">
               <w:txbxContent>
@@ -3928,7 +4012,7 @@
       </w:r>
       <w:r>
         <w:pict>
-          <v:shape id="DocuMindTextBox144" type="#_x0000_t202" stroked="f" filled="f" o:allowincell="f" style="position:absolute;margin-left:56.800pt;margin-top:703.656pt;width:484.520pt;height:19.125pt;z-index:251659264;mso-position-horizontal-relative:page;mso-position-vertical-relative:page;mso-wrap-style:none;mso-fit-shape-to-text:t;">
+          <v:shape id="DocuMindTextBox156" type="#_x0000_t202" stroked="f" filled="f" o:allowincell="f" style="position:absolute;margin-left:56.800pt;margin-top:703.656pt;width:484.520pt;height:19.125pt;z-index:251659264;mso-position-horizontal-relative:page;mso-position-vertical-relative:page;mso-wrap-style:none;mso-fit-shape-to-text:t;">
             <w10:wrap type="none"/>
             <v:textbox inset="0,0,0,0">
               <w:txbxContent>
@@ -3955,7 +4039,7 @@
       </w:r>
       <w:r>
         <w:pict>
-          <v:shape id="DocuMindTextBox145" type="#_x0000_t202" stroked="f" filled="f" o:allowincell="f" style="position:absolute;margin-left:56.800pt;margin-top:718.356pt;width:186.509pt;height:19.125pt;z-index:251659264;mso-position-horizontal-relative:page;mso-position-vertical-relative:page;mso-wrap-style:none;mso-fit-shape-to-text:t;">
+          <v:shape id="DocuMindTextBox157" type="#_x0000_t202" stroked="f" filled="f" o:allowincell="f" style="position:absolute;margin-left:56.800pt;margin-top:718.356pt;width:186.509pt;height:19.125pt;z-index:251659264;mso-position-horizontal-relative:page;mso-position-vertical-relative:page;mso-wrap-style:none;mso-fit-shape-to-text:t;">
             <w10:wrap type="none"/>
             <v:textbox inset="0,0,0,0">
               <w:txbxContent>
@@ -3982,7 +4066,7 @@
       </w:r>
       <w:r>
         <w:pict>
-          <v:shape id="DocuMindTextBox146" type="#_x0000_t202" stroked="f" filled="f" o:allowincell="f" style="position:absolute;margin-left:56.800pt;margin-top:744.356pt;width:483.732pt;height:19.125pt;z-index:251659264;mso-position-horizontal-relative:page;mso-position-vertical-relative:page;mso-wrap-style:none;mso-fit-shape-to-text:t;">
+          <v:shape id="DocuMindTextBox158" type="#_x0000_t202" stroked="f" filled="f" o:allowincell="f" style="position:absolute;margin-left:56.800pt;margin-top:744.356pt;width:483.732pt;height:19.125pt;z-index:251659264;mso-position-horizontal-relative:page;mso-position-vertical-relative:page;mso-wrap-style:none;mso-fit-shape-to-text:t;">
             <w10:wrap type="none"/>
             <v:textbox inset="0,0,0,0">
               <w:txbxContent>
@@ -4009,7 +4093,7 @@
       </w:r>
       <w:r>
         <w:pict>
-          <v:shape id="DocuMindTextBox147" type="#_x0000_t202" stroked="f" filled="f" o:allowincell="f" style="position:absolute;margin-left:56.800pt;margin-top:759.056pt;width:484.299pt;height:19.125pt;z-index:251659264;mso-position-horizontal-relative:page;mso-position-vertical-relative:page;mso-wrap-style:none;mso-fit-shape-to-text:t;">
+          <v:shape id="DocuMindTextBox159" type="#_x0000_t202" stroked="f" filled="f" o:allowincell="f" style="position:absolute;margin-left:56.800pt;margin-top:759.056pt;width:484.299pt;height:19.125pt;z-index:251659264;mso-position-horizontal-relative:page;mso-position-vertical-relative:page;mso-wrap-style:none;mso-fit-shape-to-text:t;">
             <w10:wrap type="none"/>
             <v:textbox inset="0,0,0,0">
               <w:txbxContent>
@@ -4056,7 +4140,7 @@
       </w:r>
       <w:r>
         <w:pict>
-          <v:shape id="DocuMindTextBox148" type="#_x0000_t202" stroked="f" filled="f" o:allowincell="f" style="position:absolute;margin-left:56.800pt;margin-top:55.256pt;width:484.047pt;height:19.125pt;z-index:251659264;mso-position-horizontal-relative:page;mso-position-vertical-relative:page;mso-wrap-style:none;mso-fit-shape-to-text:t;">
+          <v:shape id="DocuMindTextBox160" type="#_x0000_t202" stroked="f" filled="f" o:allowincell="f" style="position:absolute;margin-left:56.800pt;margin-top:55.256pt;width:484.047pt;height:19.125pt;z-index:251659264;mso-position-horizontal-relative:page;mso-position-vertical-relative:page;mso-wrap-style:none;mso-fit-shape-to-text:t;">
             <w10:wrap type="none"/>
             <v:textbox inset="0,0,0,0">
               <w:txbxContent>
@@ -4083,7 +4167,7 @@
       </w:r>
       <w:r>
         <w:pict>
-          <v:shape id="DocuMindTextBox149" type="#_x0000_t202" stroked="f" filled="f" o:allowincell="f" style="position:absolute;margin-left:56.800pt;margin-top:69.956pt;width:484.498pt;height:19.125pt;z-index:251659264;mso-position-horizontal-relative:page;mso-position-vertical-relative:page;mso-wrap-style:none;mso-fit-shape-to-text:t;">
+          <v:shape id="DocuMindTextBox161" type="#_x0000_t202" stroked="f" filled="f" o:allowincell="f" style="position:absolute;margin-left:56.800pt;margin-top:69.956pt;width:484.498pt;height:19.125pt;z-index:251659264;mso-position-horizontal-relative:page;mso-position-vertical-relative:page;mso-wrap-style:none;mso-fit-shape-to-text:t;">
             <w10:wrap type="none"/>
             <v:textbox inset="0,0,0,0">
               <w:txbxContent>
@@ -4110,7 +4194,7 @@
       </w:r>
       <w:r>
         <w:pict>
-          <v:shape id="DocuMindTextBox150" type="#_x0000_t202" stroked="f" filled="f" o:allowincell="f" style="position:absolute;margin-left:56.800pt;margin-top:84.656pt;width:484.299pt;height:19.125pt;z-index:251659264;mso-position-horizontal-relative:page;mso-position-vertical-relative:page;mso-wrap-style:none;mso-fit-shape-to-text:t;">
+          <v:shape id="DocuMindTextBox162" type="#_x0000_t202" stroked="f" filled="f" o:allowincell="f" style="position:absolute;margin-left:56.800pt;margin-top:84.656pt;width:484.299pt;height:19.125pt;z-index:251659264;mso-position-horizontal-relative:page;mso-position-vertical-relative:page;mso-wrap-style:none;mso-fit-shape-to-text:t;">
             <w10:wrap type="none"/>
             <v:textbox inset="0,0,0,0">
               <w:txbxContent>
@@ -4137,7 +4221,7 @@
       </w:r>
       <w:r>
         <w:pict>
-          <v:shape id="DocuMindTextBox151" type="#_x0000_t202" stroked="f" filled="f" o:allowincell="f" style="position:absolute;margin-left:56.800pt;margin-top:99.356pt;width:483.858pt;height:19.125pt;z-index:251659264;mso-position-horizontal-relative:page;mso-position-vertical-relative:page;mso-wrap-style:none;mso-fit-shape-to-text:t;">
+          <v:shape id="DocuMindTextBox163" type="#_x0000_t202" stroked="f" filled="f" o:allowincell="f" style="position:absolute;margin-left:56.800pt;margin-top:99.356pt;width:483.858pt;height:19.125pt;z-index:251659264;mso-position-horizontal-relative:page;mso-position-vertical-relative:page;mso-wrap-style:none;mso-fit-shape-to-text:t;">
             <w10:wrap type="none"/>
             <v:textbox inset="0,0,0,0">
               <w:txbxContent>
@@ -4164,7 +4248,7 @@
       </w:r>
       <w:r>
         <w:pict>
-          <v:shape id="DocuMindTextBox152" type="#_x0000_t202" stroked="f" filled="f" o:allowincell="f" style="position:absolute;margin-left:56.800pt;margin-top:114.056pt;width:484.457pt;height:19.125pt;z-index:251659264;mso-position-horizontal-relative:page;mso-position-vertical-relative:page;mso-wrap-style:none;mso-fit-shape-to-text:t;">
+          <v:shape id="DocuMindTextBox164" type="#_x0000_t202" stroked="f" filled="f" o:allowincell="f" style="position:absolute;margin-left:56.800pt;margin-top:114.056pt;width:484.457pt;height:19.125pt;z-index:251659264;mso-position-horizontal-relative:page;mso-position-vertical-relative:page;mso-wrap-style:none;mso-fit-shape-to-text:t;">
             <w10:wrap type="none"/>
             <v:textbox inset="0,0,0,0">
               <w:txbxContent>
@@ -4191,7 +4275,7 @@
       </w:r>
       <w:r>
         <w:pict>
-          <v:shape id="DocuMindTextBox153" type="#_x0000_t202" stroked="f" filled="f" o:allowincell="f" style="position:absolute;margin-left:56.800pt;margin-top:128.756pt;width:484.278pt;height:19.125pt;z-index:251659264;mso-position-horizontal-relative:page;mso-position-vertical-relative:page;mso-wrap-style:none;mso-fit-shape-to-text:t;">
+          <v:shape id="DocuMindTextBox165" type="#_x0000_t202" stroked="f" filled="f" o:allowincell="f" style="position:absolute;margin-left:56.800pt;margin-top:128.756pt;width:484.278pt;height:19.125pt;z-index:251659264;mso-position-horizontal-relative:page;mso-position-vertical-relative:page;mso-wrap-style:none;mso-fit-shape-to-text:t;">
             <w10:wrap type="none"/>
             <v:textbox inset="0,0,0,0">
               <w:txbxContent>
@@ -4218,7 +4302,7 @@
       </w:r>
       <w:r>
         <w:pict>
-          <v:shape id="DocuMindTextBox154" type="#_x0000_t202" stroked="f" filled="f" o:allowincell="f" style="position:absolute;margin-left:56.800pt;margin-top:143.456pt;width:254.853pt;height:19.125pt;z-index:251659264;mso-position-horizontal-relative:page;mso-position-vertical-relative:page;mso-wrap-style:none;mso-fit-shape-to-text:t;">
+          <v:shape id="DocuMindTextBox166" type="#_x0000_t202" stroked="f" filled="f" o:allowincell="f" style="position:absolute;margin-left:56.800pt;margin-top:143.456pt;width:254.853pt;height:19.125pt;z-index:251659264;mso-position-horizontal-relative:page;mso-position-vertical-relative:page;mso-wrap-style:none;mso-fit-shape-to-text:t;">
             <w10:wrap type="none"/>
             <v:textbox inset="0,0,0,0">
               <w:txbxContent>

</xml_diff>

<commit_message>
Step 54 - Render table borders as filled rectangles
</commit_message>
<xml_diff>
--- a/output/output.docx
+++ b/output/output.docx
@@ -1167,86 +1167,86 @@
       </w:r>
       <w:r>
         <w:pict>
-          <v:line id="DocuMindTableLine43" from="0,0" to="482.371pt,0.000pt" strokecolor="#B7B7B7" strokeweight="0.50pt" o:allowincell="f" style="position:absolute;margin-left:56.743pt;margin-top:378.300pt;width:1pt;height:1pt;z-index:90;mso-position-horizontal-relative:page;mso-position-vertical-relative:page;mso-wrap-style:none;">
+          <v:rect id="DocuMindTableBorder43" filled="t" fillcolor="#B7B7B7" stroked="f" o:allowincell="f" style="position:absolute;margin-left:56.743pt;margin-top:378.050pt;width:482.371pt;height:0.500pt;z-index:90;mso-position-horizontal-relative:page;mso-position-vertical-relative:page;mso-wrap-style:none;">
             <w10:wrap type="none"/>
-          </v:line>
+          </v:rect>
         </w:pict>
       </w:r>
       <w:r>
         <w:pict>
-          <v:line id="DocuMindTableLine44" from="0,0" to="482.371pt,0.000pt" strokecolor="#B7B7B7" strokeweight="0.50pt" o:allowincell="f" style="position:absolute;margin-left:56.743pt;margin-top:407.400pt;width:1pt;height:1pt;z-index:90;mso-position-horizontal-relative:page;mso-position-vertical-relative:page;mso-wrap-style:none;">
+          <v:rect id="DocuMindTableBorder44" filled="t" fillcolor="#B7B7B7" stroked="f" o:allowincell="f" style="position:absolute;margin-left:56.743pt;margin-top:407.150pt;width:482.371pt;height:0.500pt;z-index:90;mso-position-horizontal-relative:page;mso-position-vertical-relative:page;mso-wrap-style:none;">
             <w10:wrap type="none"/>
-          </v:line>
+          </v:rect>
         </w:pict>
       </w:r>
       <w:r>
         <w:pict>
-          <v:line id="DocuMindTableLine45" from="0,0" to="482.371pt,0.000pt" strokecolor="#B7B7B7" strokeweight="0.50pt" o:allowincell="f" style="position:absolute;margin-left:56.743pt;margin-top:436.500pt;width:1pt;height:1pt;z-index:90;mso-position-horizontal-relative:page;mso-position-vertical-relative:page;mso-wrap-style:none;">
+          <v:rect id="DocuMindTableBorder45" filled="t" fillcolor="#B7B7B7" stroked="f" o:allowincell="f" style="position:absolute;margin-left:56.743pt;margin-top:436.250pt;width:482.371pt;height:0.500pt;z-index:90;mso-position-horizontal-relative:page;mso-position-vertical-relative:page;mso-wrap-style:none;">
             <w10:wrap type="none"/>
-          </v:line>
+          </v:rect>
         </w:pict>
       </w:r>
       <w:r>
         <w:pict>
-          <v:line id="DocuMindTableLine46" from="0,0" to="482.371pt,0.000pt" strokecolor="#B7B7B7" strokeweight="0.50pt" o:allowincell="f" style="position:absolute;margin-left:56.743pt;margin-top:480.300pt;width:1pt;height:1pt;z-index:90;mso-position-horizontal-relative:page;mso-position-vertical-relative:page;mso-wrap-style:none;">
+          <v:rect id="DocuMindTableBorder46" filled="t" fillcolor="#B7B7B7" stroked="f" o:allowincell="f" style="position:absolute;margin-left:56.743pt;margin-top:480.050pt;width:482.371pt;height:0.500pt;z-index:90;mso-position-horizontal-relative:page;mso-position-vertical-relative:page;mso-wrap-style:none;">
             <w10:wrap type="none"/>
-          </v:line>
+          </v:rect>
         </w:pict>
       </w:r>
       <w:r>
         <w:pict>
-          <v:line id="DocuMindTableLine47" from="0,0" to="482.371pt,0.000pt" strokecolor="#B7B7B7" strokeweight="0.50pt" o:allowincell="f" style="position:absolute;margin-left:56.743pt;margin-top:509.400pt;width:1pt;height:1pt;z-index:90;mso-position-horizontal-relative:page;mso-position-vertical-relative:page;mso-wrap-style:none;">
+          <v:rect id="DocuMindTableBorder47" filled="t" fillcolor="#B7B7B7" stroked="f" o:allowincell="f" style="position:absolute;margin-left:56.743pt;margin-top:509.150pt;width:482.371pt;height:0.500pt;z-index:90;mso-position-horizontal-relative:page;mso-position-vertical-relative:page;mso-wrap-style:none;">
             <w10:wrap type="none"/>
-          </v:line>
+          </v:rect>
         </w:pict>
       </w:r>
       <w:r>
         <w:pict>
-          <v:line id="DocuMindTableLine48" from="0,0" to="482.371pt,0.000pt" strokecolor="#B7B7B7" strokeweight="0.50pt" o:allowincell="f" style="position:absolute;margin-left:56.743pt;margin-top:538.500pt;width:1pt;height:1pt;z-index:90;mso-position-horizontal-relative:page;mso-position-vertical-relative:page;mso-wrap-style:none;">
+          <v:rect id="DocuMindTableBorder48" filled="t" fillcolor="#B7B7B7" stroked="f" o:allowincell="f" style="position:absolute;margin-left:56.743pt;margin-top:538.250pt;width:482.371pt;height:0.500pt;z-index:90;mso-position-horizontal-relative:page;mso-position-vertical-relative:page;mso-wrap-style:none;">
             <w10:wrap type="none"/>
-          </v:line>
+          </v:rect>
         </w:pict>
       </w:r>
       <w:r>
         <w:pict>
-          <v:line id="DocuMindTableLine49" from="0,0" to="482.371pt,0.000pt" strokecolor="#B7B7B7" strokeweight="0.50pt" o:allowincell="f" style="position:absolute;margin-left:56.743pt;margin-top:567.600pt;width:1pt;height:1pt;z-index:90;mso-position-horizontal-relative:page;mso-position-vertical-relative:page;mso-wrap-style:none;">
+          <v:rect id="DocuMindTableBorder49" filled="t" fillcolor="#B7B7B7" stroked="f" o:allowincell="f" style="position:absolute;margin-left:56.743pt;margin-top:567.350pt;width:482.371pt;height:0.500pt;z-index:90;mso-position-horizontal-relative:page;mso-position-vertical-relative:page;mso-wrap-style:none;">
             <w10:wrap type="none"/>
-          </v:line>
+          </v:rect>
         </w:pict>
       </w:r>
       <w:r>
         <w:pict>
-          <v:line id="DocuMindTableLine50" from="0,0" to="0.000pt,189.300pt" strokecolor="#B7B7B7" strokeweight="0.50pt" o:allowincell="f" style="position:absolute;margin-left:56.743pt;margin-top:378.300pt;width:1pt;height:1pt;z-index:90;mso-position-horizontal-relative:page;mso-position-vertical-relative:page;mso-wrap-style:none;">
+          <v:rect id="DocuMindTableBorder50" filled="t" fillcolor="#B7B7B7" stroked="f" o:allowincell="f" style="position:absolute;margin-left:56.493pt;margin-top:378.300pt;width:0.500pt;height:189.300pt;z-index:90;mso-position-horizontal-relative:page;mso-position-vertical-relative:page;mso-wrap-style:none;">
             <w10:wrap type="none"/>
-          </v:line>
+          </v:rect>
         </w:pict>
       </w:r>
       <w:r>
         <w:pict>
-          <v:line id="DocuMindTableLine51" from="0,0" to="0.000pt,189.300pt" strokecolor="#B7B7B7" strokeweight="0.50pt" o:allowincell="f" style="position:absolute;margin-left:92.750pt;margin-top:378.300pt;width:1pt;height:1pt;z-index:90;mso-position-horizontal-relative:page;mso-position-vertical-relative:page;mso-wrap-style:none;">
+          <v:rect id="DocuMindTableBorder51" filled="t" fillcolor="#B7B7B7" stroked="f" o:allowincell="f" style="position:absolute;margin-left:92.500pt;margin-top:378.300pt;width:0.500pt;height:189.300pt;z-index:90;mso-position-horizontal-relative:page;mso-position-vertical-relative:page;mso-wrap-style:none;">
             <w10:wrap type="none"/>
-          </v:line>
+          </v:rect>
         </w:pict>
       </w:r>
       <w:r>
         <w:pict>
-          <v:line id="DocuMindTableLine52" from="0,0" to="0.000pt,189.300pt" strokecolor="#B7B7B7" strokeweight="0.50pt" o:allowincell="f" style="position:absolute;margin-left:376.250pt;margin-top:378.300pt;width:1pt;height:1pt;z-index:90;mso-position-horizontal-relative:page;mso-position-vertical-relative:page;mso-wrap-style:none;">
+          <v:rect id="DocuMindTableBorder52" filled="t" fillcolor="#B7B7B7" stroked="f" o:allowincell="f" style="position:absolute;margin-left:376.000pt;margin-top:378.300pt;width:0.500pt;height:189.300pt;z-index:90;mso-position-horizontal-relative:page;mso-position-vertical-relative:page;mso-wrap-style:none;">
             <w10:wrap type="none"/>
-          </v:line>
+          </v:rect>
         </w:pict>
       </w:r>
       <w:r>
         <w:pict>
-          <v:line id="DocuMindTableLine53" from="0,0" to="0.000pt,189.300pt" strokecolor="#B7B7B7" strokeweight="0.50pt" o:allowincell="f" style="position:absolute;margin-left:454.250pt;margin-top:378.300pt;width:1pt;height:1pt;z-index:90;mso-position-horizontal-relative:page;mso-position-vertical-relative:page;mso-wrap-style:none;">
+          <v:rect id="DocuMindTableBorder53" filled="t" fillcolor="#B7B7B7" stroked="f" o:allowincell="f" style="position:absolute;margin-left:454.000pt;margin-top:378.300pt;width:0.500pt;height:189.300pt;z-index:90;mso-position-horizontal-relative:page;mso-position-vertical-relative:page;mso-wrap-style:none;">
             <w10:wrap type="none"/>
-          </v:line>
+          </v:rect>
         </w:pict>
       </w:r>
       <w:r>
         <w:pict>
-          <v:line id="DocuMindTableLine54" from="0,0" to="0.000pt,189.300pt" strokecolor="#B7B7B7" strokeweight="0.50pt" o:allowincell="f" style="position:absolute;margin-left:539.114pt;margin-top:378.300pt;width:1pt;height:1pt;z-index:90;mso-position-horizontal-relative:page;mso-position-vertical-relative:page;mso-wrap-style:none;">
+          <v:rect id="DocuMindTableBorder54" filled="t" fillcolor="#B7B7B7" stroked="f" o:allowincell="f" style="position:absolute;margin-left:538.864pt;margin-top:378.300pt;width:0.500pt;height:189.300pt;z-index:90;mso-position-horizontal-relative:page;mso-position-vertical-relative:page;mso-wrap-style:none;">
             <w10:wrap type="none"/>
-          </v:line>
+          </v:rect>
         </w:pict>
       </w:r>
       <w:r>

</xml_diff>

<commit_message>
Step 55 - Preserve table cell vertical alignment
</commit_message>
<xml_diff>
--- a/output/output.docx
+++ b/output/output.docx
@@ -1251,7 +1251,7 @@
       </w:r>
       <w:r>
         <w:pict>
-          <v:shape id="DocuMindTableCell55" type="#_x0000_t202" filled="f" stroked="f" o:allowincell="f" style="position:absolute;margin-left:56.743pt;margin-top:378.300pt;width:36.007pt;height:29.100pt;z-index:100;mso-position-horizontal-relative:page;mso-position-vertical-relative:page;mso-wrap-style:none;">
+          <v:shape id="DocuMindTableCell55" type="#_x0000_t202" filled="f" stroked="f" o:allowincell="f" style="position:absolute;margin-left:56.743pt;margin-top:378.300pt;width:36.007pt;height:29.100pt;z-index:100;mso-position-horizontal-relative:page;mso-position-vertical-relative:page;mso-wrap-style:none;v-text-anchor:top;">
             <w10:wrap type="none"/>
             <v:textbox inset="2.0pt,1.0pt,2.0pt,1.0pt">
               <w:txbxContent>
@@ -1275,7 +1275,7 @@
       </w:r>
       <w:r>
         <w:pict>
-          <v:shape id="DocuMindTableCell56" type="#_x0000_t202" filled="f" stroked="f" o:allowincell="f" style="position:absolute;margin-left:92.750pt;margin-top:378.300pt;width:283.500pt;height:29.100pt;z-index:100;mso-position-horizontal-relative:page;mso-position-vertical-relative:page;mso-wrap-style:none;">
+          <v:shape id="DocuMindTableCell56" type="#_x0000_t202" filled="f" stroked="f" o:allowincell="f" style="position:absolute;margin-left:92.750pt;margin-top:378.300pt;width:283.500pt;height:29.100pt;z-index:100;mso-position-horizontal-relative:page;mso-position-vertical-relative:page;mso-wrap-style:none;v-text-anchor:top;">
             <w10:wrap type="none"/>
             <v:textbox inset="2.0pt,1.0pt,2.0pt,1.0pt">
               <w:txbxContent>
@@ -1303,7 +1303,7 @@
       </w:r>
       <w:r>
         <w:pict>
-          <v:shape id="DocuMindTableCell57" type="#_x0000_t202" filled="f" stroked="f" o:allowincell="f" style="position:absolute;margin-left:376.250pt;margin-top:378.300pt;width:78.000pt;height:29.100pt;z-index:100;mso-position-horizontal-relative:page;mso-position-vertical-relative:page;mso-wrap-style:none;">
+          <v:shape id="DocuMindTableCell57" type="#_x0000_t202" filled="f" stroked="f" o:allowincell="f" style="position:absolute;margin-left:376.250pt;margin-top:378.300pt;width:78.000pt;height:29.100pt;z-index:100;mso-position-horizontal-relative:page;mso-position-vertical-relative:page;mso-wrap-style:none;v-text-anchor:top;">
             <w10:wrap type="none"/>
             <v:textbox inset="2.0pt,1.0pt,2.0pt,1.0pt">
               <w:txbxContent>
@@ -1331,7 +1331,7 @@
       </w:r>
       <w:r>
         <w:pict>
-          <v:shape id="DocuMindTableCell58" type="#_x0000_t202" filled="f" stroked="f" o:allowincell="f" style="position:absolute;margin-left:454.250pt;margin-top:378.300pt;width:84.864pt;height:29.100pt;z-index:100;mso-position-horizontal-relative:page;mso-position-vertical-relative:page;mso-wrap-style:none;">
+          <v:shape id="DocuMindTableCell58" type="#_x0000_t202" filled="f" stroked="f" o:allowincell="f" style="position:absolute;margin-left:454.250pt;margin-top:378.300pt;width:84.864pt;height:29.100pt;z-index:100;mso-position-horizontal-relative:page;mso-position-vertical-relative:page;mso-wrap-style:none;v-text-anchor:top;">
             <w10:wrap type="none"/>
             <v:textbox inset="2.0pt,1.0pt,2.0pt,1.0pt">
               <w:txbxContent>
@@ -1359,7 +1359,7 @@
       </w:r>
       <w:r>
         <w:pict>
-          <v:shape id="DocuMindTableCell59" type="#_x0000_t202" filled="f" stroked="f" o:allowincell="f" style="position:absolute;margin-left:56.743pt;margin-top:407.400pt;width:36.007pt;height:29.100pt;z-index:100;mso-position-horizontal-relative:page;mso-position-vertical-relative:page;mso-wrap-style:none;">
+          <v:shape id="DocuMindTableCell59" type="#_x0000_t202" filled="f" stroked="f" o:allowincell="f" style="position:absolute;margin-left:56.743pt;margin-top:407.400pt;width:36.007pt;height:29.100pt;z-index:100;mso-position-horizontal-relative:page;mso-position-vertical-relative:page;mso-wrap-style:none;v-text-anchor:top;">
             <w10:wrap type="none"/>
             <v:textbox inset="2.0pt,1.0pt,2.0pt,1.0pt">
               <w:txbxContent>
@@ -1387,7 +1387,7 @@
       </w:r>
       <w:r>
         <w:pict>
-          <v:shape id="DocuMindTableCell60" type="#_x0000_t202" filled="f" stroked="f" o:allowincell="f" style="position:absolute;margin-left:92.750pt;margin-top:407.400pt;width:283.500pt;height:29.100pt;z-index:100;mso-position-horizontal-relative:page;mso-position-vertical-relative:page;mso-wrap-style:none;">
+          <v:shape id="DocuMindTableCell60" type="#_x0000_t202" filled="f" stroked="f" o:allowincell="f" style="position:absolute;margin-left:92.750pt;margin-top:407.400pt;width:283.500pt;height:29.100pt;z-index:100;mso-position-horizontal-relative:page;mso-position-vertical-relative:page;mso-wrap-style:none;v-text-anchor:top;">
             <w10:wrap type="none"/>
             <v:textbox inset="2.0pt,1.0pt,2.0pt,1.0pt">
               <w:txbxContent>
@@ -1415,7 +1415,7 @@
       </w:r>
       <w:r>
         <w:pict>
-          <v:shape id="DocuMindTableCell61" type="#_x0000_t202" filled="f" stroked="f" o:allowincell="f" style="position:absolute;margin-left:376.250pt;margin-top:407.400pt;width:78.000pt;height:29.100pt;z-index:100;mso-position-horizontal-relative:page;mso-position-vertical-relative:page;mso-wrap-style:none;">
+          <v:shape id="DocuMindTableCell61" type="#_x0000_t202" filled="f" stroked="f" o:allowincell="f" style="position:absolute;margin-left:376.250pt;margin-top:407.400pt;width:78.000pt;height:29.100pt;z-index:100;mso-position-horizontal-relative:page;mso-position-vertical-relative:page;mso-wrap-style:none;v-text-anchor:top;">
             <w10:wrap type="none"/>
             <v:textbox inset="2.0pt,1.0pt,2.0pt,1.0pt">
               <w:txbxContent>
@@ -1443,7 +1443,7 @@
       </w:r>
       <w:r>
         <w:pict>
-          <v:shape id="DocuMindTableCell62" type="#_x0000_t202" filled="f" stroked="f" o:allowincell="f" style="position:absolute;margin-left:454.250pt;margin-top:407.400pt;width:84.864pt;height:29.100pt;z-index:100;mso-position-horizontal-relative:page;mso-position-vertical-relative:page;mso-wrap-style:none;">
+          <v:shape id="DocuMindTableCell62" type="#_x0000_t202" filled="f" stroked="f" o:allowincell="f" style="position:absolute;margin-left:454.250pt;margin-top:407.400pt;width:84.864pt;height:29.100pt;z-index:100;mso-position-horizontal-relative:page;mso-position-vertical-relative:page;mso-wrap-style:none;v-text-anchor:top;">
             <w10:wrap type="none"/>
             <v:textbox inset="2.0pt,1.0pt,2.0pt,1.0pt">
               <w:txbxContent>
@@ -1467,7 +1467,7 @@
       </w:r>
       <w:r>
         <w:pict>
-          <v:shape id="DocuMindTableCell63" type="#_x0000_t202" filled="f" stroked="f" o:allowincell="f" style="position:absolute;margin-left:56.743pt;margin-top:436.500pt;width:36.007pt;height:43.800pt;z-index:100;mso-position-horizontal-relative:page;mso-position-vertical-relative:page;mso-wrap-style:none;">
+          <v:shape id="DocuMindTableCell63" type="#_x0000_t202" filled="f" stroked="f" o:allowincell="f" style="position:absolute;margin-left:56.743pt;margin-top:436.500pt;width:36.007pt;height:43.800pt;z-index:100;mso-position-horizontal-relative:page;mso-position-vertical-relative:page;mso-wrap-style:none;v-text-anchor:top;">
             <w10:wrap type="none"/>
             <v:textbox inset="2.0pt,1.0pt,2.0pt,1.0pt">
               <w:txbxContent>
@@ -1495,7 +1495,7 @@
       </w:r>
       <w:r>
         <w:pict>
-          <v:shape id="DocuMindTableCell64" type="#_x0000_t202" filled="f" stroked="f" o:allowincell="f" style="position:absolute;margin-left:92.750pt;margin-top:436.500pt;width:283.500pt;height:43.800pt;z-index:100;mso-position-horizontal-relative:page;mso-position-vertical-relative:page;mso-wrap-style:none;">
+          <v:shape id="DocuMindTableCell64" type="#_x0000_t202" filled="f" stroked="f" o:allowincell="f" style="position:absolute;margin-left:92.750pt;margin-top:436.500pt;width:283.500pt;height:43.800pt;z-index:100;mso-position-horizontal-relative:page;mso-position-vertical-relative:page;mso-wrap-style:none;v-text-anchor:top;">
             <w10:wrap type="none"/>
             <v:textbox inset="2.0pt,1.0pt,2.0pt,1.0pt">
               <w:txbxContent>
@@ -1536,7 +1536,7 @@
       </w:r>
       <w:r>
         <w:pict>
-          <v:shape id="DocuMindTableCell65" type="#_x0000_t202" filled="f" stroked="f" o:allowincell="f" style="position:absolute;margin-left:376.250pt;margin-top:436.500pt;width:78.000pt;height:43.800pt;z-index:100;mso-position-horizontal-relative:page;mso-position-vertical-relative:page;mso-wrap-style:none;">
+          <v:shape id="DocuMindTableCell65" type="#_x0000_t202" filled="f" stroked="f" o:allowincell="f" style="position:absolute;margin-left:376.250pt;margin-top:436.500pt;width:78.000pt;height:43.800pt;z-index:100;mso-position-horizontal-relative:page;mso-position-vertical-relative:page;mso-wrap-style:none;v-text-anchor:top;">
             <w10:wrap type="none"/>
             <v:textbox inset="2.0pt,1.0pt,2.0pt,1.0pt">
               <w:txbxContent>
@@ -1564,7 +1564,7 @@
       </w:r>
       <w:r>
         <w:pict>
-          <v:shape id="DocuMindTableCell66" type="#_x0000_t202" filled="f" stroked="f" o:allowincell="f" style="position:absolute;margin-left:454.250pt;margin-top:436.500pt;width:84.864pt;height:43.800pt;z-index:100;mso-position-horizontal-relative:page;mso-position-vertical-relative:page;mso-wrap-style:none;">
+          <v:shape id="DocuMindTableCell66" type="#_x0000_t202" filled="f" stroked="f" o:allowincell="f" style="position:absolute;margin-left:454.250pt;margin-top:436.500pt;width:84.864pt;height:43.800pt;z-index:100;mso-position-horizontal-relative:page;mso-position-vertical-relative:page;mso-wrap-style:none;v-text-anchor:top;">
             <w10:wrap type="none"/>
             <v:textbox inset="2.0pt,1.0pt,2.0pt,1.0pt">
               <w:txbxContent>
@@ -1588,7 +1588,7 @@
       </w:r>
       <w:r>
         <w:pict>
-          <v:shape id="DocuMindTableCell67" type="#_x0000_t202" filled="f" stroked="f" o:allowincell="f" style="position:absolute;margin-left:56.743pt;margin-top:480.300pt;width:36.007pt;height:29.100pt;z-index:100;mso-position-horizontal-relative:page;mso-position-vertical-relative:page;mso-wrap-style:none;">
+          <v:shape id="DocuMindTableCell67" type="#_x0000_t202" filled="f" stroked="f" o:allowincell="f" style="position:absolute;margin-left:56.743pt;margin-top:480.300pt;width:36.007pt;height:29.100pt;z-index:100;mso-position-horizontal-relative:page;mso-position-vertical-relative:page;mso-wrap-style:none;v-text-anchor:top;">
             <w10:wrap type="none"/>
             <v:textbox inset="2.0pt,1.0pt,2.0pt,1.0pt">
               <w:txbxContent>
@@ -1616,7 +1616,7 @@
       </w:r>
       <w:r>
         <w:pict>
-          <v:shape id="DocuMindTableCell68" type="#_x0000_t202" filled="f" stroked="f" o:allowincell="f" style="position:absolute;margin-left:92.750pt;margin-top:480.300pt;width:283.500pt;height:29.100pt;z-index:100;mso-position-horizontal-relative:page;mso-position-vertical-relative:page;mso-wrap-style:none;">
+          <v:shape id="DocuMindTableCell68" type="#_x0000_t202" filled="f" stroked="f" o:allowincell="f" style="position:absolute;margin-left:92.750pt;margin-top:480.300pt;width:283.500pt;height:29.100pt;z-index:100;mso-position-horizontal-relative:page;mso-position-vertical-relative:page;mso-wrap-style:none;v-text-anchor:top;">
             <w10:wrap type="none"/>
             <v:textbox inset="2.0pt,1.0pt,2.0pt,1.0pt">
               <w:txbxContent>
@@ -1644,7 +1644,7 @@
       </w:r>
       <w:r>
         <w:pict>
-          <v:shape id="DocuMindTableCell69" type="#_x0000_t202" filled="f" stroked="f" o:allowincell="f" style="position:absolute;margin-left:376.250pt;margin-top:480.300pt;width:78.000pt;height:29.100pt;z-index:100;mso-position-horizontal-relative:page;mso-position-vertical-relative:page;mso-wrap-style:none;">
+          <v:shape id="DocuMindTableCell69" type="#_x0000_t202" filled="f" stroked="f" o:allowincell="f" style="position:absolute;margin-left:376.250pt;margin-top:480.300pt;width:78.000pt;height:29.100pt;z-index:100;mso-position-horizontal-relative:page;mso-position-vertical-relative:page;mso-wrap-style:none;v-text-anchor:top;">
             <w10:wrap type="none"/>
             <v:textbox inset="2.0pt,1.0pt,2.0pt,1.0pt">
               <w:txbxContent>
@@ -1672,7 +1672,7 @@
       </w:r>
       <w:r>
         <w:pict>
-          <v:shape id="DocuMindTableCell70" type="#_x0000_t202" filled="f" stroked="f" o:allowincell="f" style="position:absolute;margin-left:454.250pt;margin-top:480.300pt;width:84.864pt;height:29.100pt;z-index:100;mso-position-horizontal-relative:page;mso-position-vertical-relative:page;mso-wrap-style:none;">
+          <v:shape id="DocuMindTableCell70" type="#_x0000_t202" filled="f" stroked="f" o:allowincell="f" style="position:absolute;margin-left:454.250pt;margin-top:480.300pt;width:84.864pt;height:29.100pt;z-index:100;mso-position-horizontal-relative:page;mso-position-vertical-relative:page;mso-wrap-style:none;v-text-anchor:top;">
             <w10:wrap type="none"/>
             <v:textbox inset="2.0pt,1.0pt,2.0pt,1.0pt">
               <w:txbxContent>
@@ -1696,7 +1696,7 @@
       </w:r>
       <w:r>
         <w:pict>
-          <v:shape id="DocuMindTableCell71" type="#_x0000_t202" filled="f" stroked="f" o:allowincell="f" style="position:absolute;margin-left:56.743pt;margin-top:509.400pt;width:36.007pt;height:29.100pt;z-index:100;mso-position-horizontal-relative:page;mso-position-vertical-relative:page;mso-wrap-style:none;">
+          <v:shape id="DocuMindTableCell71" type="#_x0000_t202" filled="f" stroked="f" o:allowincell="f" style="position:absolute;margin-left:56.743pt;margin-top:509.400pt;width:36.007pt;height:29.100pt;z-index:100;mso-position-horizontal-relative:page;mso-position-vertical-relative:page;mso-wrap-style:none;v-text-anchor:top;">
             <w10:wrap type="none"/>
             <v:textbox inset="2.0pt,1.0pt,2.0pt,1.0pt">
               <w:txbxContent>
@@ -1724,7 +1724,7 @@
       </w:r>
       <w:r>
         <w:pict>
-          <v:shape id="DocuMindTableCell72" type="#_x0000_t202" filled="f" stroked="f" o:allowincell="f" style="position:absolute;margin-left:92.750pt;margin-top:509.400pt;width:283.500pt;height:29.100pt;z-index:100;mso-position-horizontal-relative:page;mso-position-vertical-relative:page;mso-wrap-style:none;">
+          <v:shape id="DocuMindTableCell72" type="#_x0000_t202" filled="f" stroked="f" o:allowincell="f" style="position:absolute;margin-left:92.750pt;margin-top:509.400pt;width:283.500pt;height:29.100pt;z-index:100;mso-position-horizontal-relative:page;mso-position-vertical-relative:page;mso-wrap-style:none;v-text-anchor:top;">
             <w10:wrap type="none"/>
             <v:textbox inset="2.0pt,1.0pt,2.0pt,1.0pt">
               <w:txbxContent>
@@ -1752,7 +1752,7 @@
       </w:r>
       <w:r>
         <w:pict>
-          <v:shape id="DocuMindTableCell73" type="#_x0000_t202" filled="f" stroked="f" o:allowincell="f" style="position:absolute;margin-left:376.250pt;margin-top:509.400pt;width:78.000pt;height:29.100pt;z-index:100;mso-position-horizontal-relative:page;mso-position-vertical-relative:page;mso-wrap-style:none;">
+          <v:shape id="DocuMindTableCell73" type="#_x0000_t202" filled="f" stroked="f" o:allowincell="f" style="position:absolute;margin-left:376.250pt;margin-top:509.400pt;width:78.000pt;height:29.100pt;z-index:100;mso-position-horizontal-relative:page;mso-position-vertical-relative:page;mso-wrap-style:none;v-text-anchor:top;">
             <w10:wrap type="none"/>
             <v:textbox inset="2.0pt,1.0pt,2.0pt,1.0pt">
               <w:txbxContent>
@@ -1780,7 +1780,7 @@
       </w:r>
       <w:r>
         <w:pict>
-          <v:shape id="DocuMindTableCell74" type="#_x0000_t202" filled="f" stroked="f" o:allowincell="f" style="position:absolute;margin-left:454.250pt;margin-top:509.400pt;width:84.864pt;height:29.100pt;z-index:100;mso-position-horizontal-relative:page;mso-position-vertical-relative:page;mso-wrap-style:none;">
+          <v:shape id="DocuMindTableCell74" type="#_x0000_t202" filled="f" stroked="f" o:allowincell="f" style="position:absolute;margin-left:454.250pt;margin-top:509.400pt;width:84.864pt;height:29.100pt;z-index:100;mso-position-horizontal-relative:page;mso-position-vertical-relative:page;mso-wrap-style:none;v-text-anchor:top;">
             <w10:wrap type="none"/>
             <v:textbox inset="2.0pt,1.0pt,2.0pt,1.0pt">
               <w:txbxContent>
@@ -1804,7 +1804,7 @@
       </w:r>
       <w:r>
         <w:pict>
-          <v:shape id="DocuMindTableCell75" type="#_x0000_t202" filled="f" stroked="f" o:allowincell="f" style="position:absolute;margin-left:56.743pt;margin-top:538.500pt;width:36.007pt;height:29.100pt;z-index:100;mso-position-horizontal-relative:page;mso-position-vertical-relative:page;mso-wrap-style:none;">
+          <v:shape id="DocuMindTableCell75" type="#_x0000_t202" filled="f" stroked="f" o:allowincell="f" style="position:absolute;margin-left:56.743pt;margin-top:538.500pt;width:36.007pt;height:29.100pt;z-index:100;mso-position-horizontal-relative:page;mso-position-vertical-relative:page;mso-wrap-style:none;v-text-anchor:top;">
             <w10:wrap type="none"/>
             <v:textbox inset="2.0pt,1.0pt,2.0pt,1.0pt">
               <w:txbxContent>
@@ -1832,7 +1832,7 @@
       </w:r>
       <w:r>
         <w:pict>
-          <v:shape id="DocuMindTableCell76" type="#_x0000_t202" filled="f" stroked="f" o:allowincell="f" style="position:absolute;margin-left:92.750pt;margin-top:538.500pt;width:283.500pt;height:29.100pt;z-index:100;mso-position-horizontal-relative:page;mso-position-vertical-relative:page;mso-wrap-style:none;">
+          <v:shape id="DocuMindTableCell76" type="#_x0000_t202" filled="f" stroked="f" o:allowincell="f" style="position:absolute;margin-left:92.750pt;margin-top:538.500pt;width:283.500pt;height:29.100pt;z-index:100;mso-position-horizontal-relative:page;mso-position-vertical-relative:page;mso-wrap-style:none;v-text-anchor:top;">
             <w10:wrap type="none"/>
             <v:textbox inset="2.0pt,1.0pt,2.0pt,1.0pt">
               <w:txbxContent>
@@ -1860,7 +1860,7 @@
       </w:r>
       <w:r>
         <w:pict>
-          <v:shape id="DocuMindTableCell77" type="#_x0000_t202" filled="f" stroked="f" o:allowincell="f" style="position:absolute;margin-left:376.250pt;margin-top:538.500pt;width:78.000pt;height:29.100pt;z-index:100;mso-position-horizontal-relative:page;mso-position-vertical-relative:page;mso-wrap-style:none;">
+          <v:shape id="DocuMindTableCell77" type="#_x0000_t202" filled="f" stroked="f" o:allowincell="f" style="position:absolute;margin-left:376.250pt;margin-top:538.500pt;width:78.000pt;height:29.100pt;z-index:100;mso-position-horizontal-relative:page;mso-position-vertical-relative:page;mso-wrap-style:none;v-text-anchor:top;">
             <w10:wrap type="none"/>
             <v:textbox inset="2.0pt,1.0pt,2.0pt,1.0pt">
               <w:txbxContent>
@@ -1888,7 +1888,7 @@
       </w:r>
       <w:r>
         <w:pict>
-          <v:shape id="DocuMindTableCell78" type="#_x0000_t202" filled="f" stroked="f" o:allowincell="f" style="position:absolute;margin-left:454.250pt;margin-top:538.500pt;width:84.864pt;height:29.100pt;z-index:100;mso-position-horizontal-relative:page;mso-position-vertical-relative:page;mso-wrap-style:none;">
+          <v:shape id="DocuMindTableCell78" type="#_x0000_t202" filled="f" stroked="f" o:allowincell="f" style="position:absolute;margin-left:454.250pt;margin-top:538.500pt;width:84.864pt;height:29.100pt;z-index:100;mso-position-horizontal-relative:page;mso-position-vertical-relative:page;mso-wrap-style:none;v-text-anchor:top;">
             <w10:wrap type="none"/>
             <v:textbox inset="2.0pt,1.0pt,2.0pt,1.0pt">
               <w:txbxContent>

</xml_diff>

<commit_message>
Step 57.1 - Detect filled rectangle table borders
</commit_message>
<xml_diff>
--- a/output/output.docx
+++ b/output/output.docx
@@ -29,56 +29,56 @@
       </w:r>
       <w:r>
         <w:pict>
-          <v:rect id="DocuMindTableBorder3" filled="t" fillcolor="#B7B7B7" stroked="f" o:allowincell="f" style="position:absolute;margin-left:57.636pt;margin-top:157.657pt;width:456.802pt;height:0.500pt;z-index:90;mso-position-horizontal-relative:page;mso-position-vertical-relative:page;mso-wrap-style:none;">
+          <v:rect id="DocuMindTableBorder3" filled="t" fillcolor="#000000" stroked="f" o:allowincell="f" style="position:absolute;margin-left:57.636pt;margin-top:157.667pt;width:456.802pt;height:0.480pt;z-index:90;mso-position-horizontal-relative:page;mso-position-vertical-relative:page;mso-wrap-style:none;">
             <w10:wrap type="none"/>
           </v:rect>
         </w:pict>
       </w:r>
       <w:r>
         <w:pict>
-          <v:rect id="DocuMindTableBorder4" filled="t" fillcolor="#B7B7B7" stroked="f" o:allowincell="f" style="position:absolute;margin-left:57.636pt;margin-top:180.575pt;width:456.802pt;height:0.500pt;z-index:90;mso-position-horizontal-relative:page;mso-position-vertical-relative:page;mso-wrap-style:none;">
+          <v:rect id="DocuMindTableBorder4" filled="t" fillcolor="#000000" stroked="f" o:allowincell="f" style="position:absolute;margin-left:57.636pt;margin-top:180.585pt;width:456.802pt;height:0.480pt;z-index:90;mso-position-horizontal-relative:page;mso-position-vertical-relative:page;mso-wrap-style:none;">
             <w10:wrap type="none"/>
           </v:rect>
         </w:pict>
       </w:r>
       <w:r>
         <w:pict>
-          <v:rect id="DocuMindTableBorder5" filled="t" fillcolor="#B7B7B7" stroked="f" o:allowincell="f" style="position:absolute;margin-left:57.636pt;margin-top:203.493pt;width:456.802pt;height:0.500pt;z-index:90;mso-position-horizontal-relative:page;mso-position-vertical-relative:page;mso-wrap-style:none;">
+          <v:rect id="DocuMindTableBorder5" filled="t" fillcolor="#000000" stroked="f" o:allowincell="f" style="position:absolute;margin-left:57.636pt;margin-top:203.503pt;width:456.802pt;height:0.480pt;z-index:90;mso-position-horizontal-relative:page;mso-position-vertical-relative:page;mso-wrap-style:none;">
             <w10:wrap type="none"/>
           </v:rect>
         </w:pict>
       </w:r>
       <w:r>
         <w:pict>
-          <v:rect id="DocuMindTableBorder6" filled="t" fillcolor="#B7B7B7" stroked="f" o:allowincell="f" style="position:absolute;margin-left:57.636pt;margin-top:249.209pt;width:456.802pt;height:0.500pt;z-index:90;mso-position-horizontal-relative:page;mso-position-vertical-relative:page;mso-wrap-style:none;">
+          <v:rect id="DocuMindTableBorder6" filled="t" fillcolor="#000000" stroked="f" o:allowincell="f" style="position:absolute;margin-left:57.636pt;margin-top:249.219pt;width:456.802pt;height:0.480pt;z-index:90;mso-position-horizontal-relative:page;mso-position-vertical-relative:page;mso-wrap-style:none;">
             <w10:wrap type="none"/>
           </v:rect>
         </w:pict>
       </w:r>
       <w:r>
         <w:pict>
-          <v:rect id="DocuMindTableBorder7" filled="t" fillcolor="#B7B7B7" stroked="f" o:allowincell="f" style="position:absolute;margin-left:57.636pt;margin-top:294.685pt;width:456.802pt;height:0.500pt;z-index:90;mso-position-horizontal-relative:page;mso-position-vertical-relative:page;mso-wrap-style:none;">
+          <v:rect id="DocuMindTableBorder7" filled="t" fillcolor="#000000" stroked="f" o:allowincell="f" style="position:absolute;margin-left:57.636pt;margin-top:294.695pt;width:456.802pt;height:0.480pt;z-index:90;mso-position-horizontal-relative:page;mso-position-vertical-relative:page;mso-wrap-style:none;">
             <w10:wrap type="none"/>
           </v:rect>
         </w:pict>
       </w:r>
       <w:r>
         <w:pict>
-          <v:rect id="DocuMindTableBorder8" filled="t" fillcolor="#B7B7B7" stroked="f" o:allowincell="f" style="position:absolute;margin-left:57.386pt;margin-top:157.907pt;width:0.500pt;height:137.028pt;z-index:90;mso-position-horizontal-relative:page;mso-position-vertical-relative:page;mso-wrap-style:none;">
+          <v:rect id="DocuMindTableBorder8" filled="t" fillcolor="#000000" stroked="f" o:allowincell="f" style="position:absolute;margin-left:57.396pt;margin-top:157.907pt;width:0.480pt;height:137.028pt;z-index:90;mso-position-horizontal-relative:page;mso-position-vertical-relative:page;mso-wrap-style:none;">
             <w10:wrap type="none"/>
           </v:rect>
         </w:pict>
       </w:r>
       <w:r>
         <w:pict>
-          <v:rect id="DocuMindTableBorder9" filled="t" fillcolor="#B7B7B7" stroked="f" o:allowincell="f" style="position:absolute;margin-left:228.372pt;margin-top:157.907pt;width:0.500pt;height:137.028pt;z-index:90;mso-position-horizontal-relative:page;mso-position-vertical-relative:page;mso-wrap-style:none;">
+          <v:rect id="DocuMindTableBorder9" filled="t" fillcolor="#000000" stroked="f" o:allowincell="f" style="position:absolute;margin-left:228.382pt;margin-top:157.907pt;width:0.480pt;height:137.028pt;z-index:90;mso-position-horizontal-relative:page;mso-position-vertical-relative:page;mso-wrap-style:none;">
             <w10:wrap type="none"/>
           </v:rect>
         </w:pict>
       </w:r>
       <w:r>
         <w:pict>
-          <v:rect id="DocuMindTableBorder10" filled="t" fillcolor="#B7B7B7" stroked="f" o:allowincell="f" style="position:absolute;margin-left:514.188pt;margin-top:157.907pt;width:0.500pt;height:137.028pt;z-index:90;mso-position-horizontal-relative:page;mso-position-vertical-relative:page;mso-wrap-style:none;">
+          <v:rect id="DocuMindTableBorder10" filled="t" fillcolor="#000000" stroked="f" o:allowincell="f" style="position:absolute;margin-left:514.198pt;margin-top:157.907pt;width:0.480pt;height:137.028pt;z-index:90;mso-position-horizontal-relative:page;mso-position-vertical-relative:page;mso-wrap-style:none;">
             <w10:wrap type="none"/>
           </v:rect>
         </w:pict>
@@ -3158,77 +3158,77 @@
       </w:r>
       <w:r>
         <w:pict>
-          <v:rect id="DocuMindTableBorder122" filled="t" fillcolor="#B7B7B7" stroked="f" o:allowincell="f" style="position:absolute;margin-left:57.276pt;margin-top:165.970pt;width:459.108pt;height:0.500pt;z-index:90;mso-position-horizontal-relative:page;mso-position-vertical-relative:page;mso-wrap-style:none;">
+          <v:rect id="DocuMindTableBorder122" filled="t" fillcolor="#000000" stroked="f" o:allowincell="f" style="position:absolute;margin-left:57.276pt;margin-top:165.860pt;width:459.108pt;height:0.720pt;z-index:90;mso-position-horizontal-relative:page;mso-position-vertical-relative:page;mso-wrap-style:none;">
             <w10:wrap type="none"/>
           </v:rect>
         </w:pict>
       </w:r>
       <w:r>
         <w:pict>
-          <v:rect id="DocuMindTableBorder123" filled="t" fillcolor="#B7B7B7" stroked="f" o:allowincell="f" style="position:absolute;margin-left:57.276pt;margin-top:188.674pt;width:459.108pt;height:0.500pt;z-index:90;mso-position-horizontal-relative:page;mso-position-vertical-relative:page;mso-wrap-style:none;">
+          <v:rect id="DocuMindTableBorder123" filled="t" fillcolor="#000000" stroked="f" o:allowincell="f" style="position:absolute;margin-left:57.276pt;margin-top:188.564pt;width:459.108pt;height:0.720pt;z-index:90;mso-position-horizontal-relative:page;mso-position-vertical-relative:page;mso-wrap-style:none;">
             <w10:wrap type="none"/>
           </v:rect>
         </w:pict>
       </w:r>
       <w:r>
         <w:pict>
-          <v:rect id="DocuMindTableBorder124" filled="t" fillcolor="#B7B7B7" stroked="f" o:allowincell="f" style="position:absolute;margin-left:57.276pt;margin-top:211.892pt;width:459.108pt;height:0.500pt;z-index:90;mso-position-horizontal-relative:page;mso-position-vertical-relative:page;mso-wrap-style:none;">
+          <v:rect id="DocuMindTableBorder124" filled="t" fillcolor="#000000" stroked="f" o:allowincell="f" style="position:absolute;margin-left:57.276pt;margin-top:211.782pt;width:459.108pt;height:0.720pt;z-index:90;mso-position-horizontal-relative:page;mso-position-vertical-relative:page;mso-wrap-style:none;">
             <w10:wrap type="none"/>
           </v:rect>
         </w:pict>
       </w:r>
       <w:r>
         <w:pict>
-          <v:rect id="DocuMindTableBorder125" filled="t" fillcolor="#B7B7B7" stroked="f" o:allowincell="f" style="position:absolute;margin-left:57.276pt;margin-top:234.810pt;width:459.108pt;height:0.500pt;z-index:90;mso-position-horizontal-relative:page;mso-position-vertical-relative:page;mso-wrap-style:none;">
+          <v:rect id="DocuMindTableBorder125" filled="t" fillcolor="#000000" stroked="f" o:allowincell="f" style="position:absolute;margin-left:57.276pt;margin-top:234.700pt;width:459.108pt;height:0.720pt;z-index:90;mso-position-horizontal-relative:page;mso-position-vertical-relative:page;mso-wrap-style:none;">
             <w10:wrap type="none"/>
           </v:rect>
         </w:pict>
       </w:r>
       <w:r>
         <w:pict>
-          <v:rect id="DocuMindTableBorder126" filled="t" fillcolor="#B7B7B7" stroked="f" o:allowincell="f" style="position:absolute;margin-left:57.276pt;margin-top:257.849pt;width:459.108pt;height:0.500pt;z-index:90;mso-position-horizontal-relative:page;mso-position-vertical-relative:page;mso-wrap-style:none;">
+          <v:rect id="DocuMindTableBorder126" filled="t" fillcolor="#000000" stroked="f" o:allowincell="f" style="position:absolute;margin-left:57.276pt;margin-top:257.739pt;width:459.108pt;height:0.720pt;z-index:90;mso-position-horizontal-relative:page;mso-position-vertical-relative:page;mso-wrap-style:none;">
             <w10:wrap type="none"/>
           </v:rect>
         </w:pict>
       </w:r>
       <w:r>
         <w:pict>
-          <v:rect id="DocuMindTableBorder127" filled="t" fillcolor="#B7B7B7" stroked="f" o:allowincell="f" style="position:absolute;margin-left:57.276pt;margin-top:280.887pt;width:459.108pt;height:0.500pt;z-index:90;mso-position-horizontal-relative:page;mso-position-vertical-relative:page;mso-wrap-style:none;">
+          <v:rect id="DocuMindTableBorder127" filled="t" fillcolor="#000000" stroked="f" o:allowincell="f" style="position:absolute;margin-left:57.276pt;margin-top:280.777pt;width:459.108pt;height:0.720pt;z-index:90;mso-position-horizontal-relative:page;mso-position-vertical-relative:page;mso-wrap-style:none;">
             <w10:wrap type="none"/>
           </v:rect>
         </w:pict>
       </w:r>
       <w:r>
         <w:pict>
-          <v:rect id="DocuMindTableBorder128" filled="t" fillcolor="#B7B7B7" stroked="f" o:allowincell="f" style="position:absolute;margin-left:57.276pt;margin-top:303.805pt;width:459.108pt;height:0.500pt;z-index:90;mso-position-horizontal-relative:page;mso-position-vertical-relative:page;mso-wrap-style:none;">
+          <v:rect id="DocuMindTableBorder128" filled="t" fillcolor="#000000" stroked="f" o:allowincell="f" style="position:absolute;margin-left:57.276pt;margin-top:303.695pt;width:459.108pt;height:0.720pt;z-index:90;mso-position-horizontal-relative:page;mso-position-vertical-relative:page;mso-wrap-style:none;">
             <w10:wrap type="none"/>
           </v:rect>
         </w:pict>
       </w:r>
       <w:r>
         <w:pict>
-          <v:rect id="DocuMindTableBorder129" filled="t" fillcolor="#B7B7B7" stroked="f" o:allowincell="f" style="position:absolute;margin-left:57.276pt;margin-top:326.963pt;width:459.108pt;height:0.500pt;z-index:90;mso-position-horizontal-relative:page;mso-position-vertical-relative:page;mso-wrap-style:none;">
+          <v:rect id="DocuMindTableBorder129" filled="t" fillcolor="#000000" stroked="f" o:allowincell="f" style="position:absolute;margin-left:57.276pt;margin-top:326.853pt;width:459.108pt;height:0.720pt;z-index:90;mso-position-horizontal-relative:page;mso-position-vertical-relative:page;mso-wrap-style:none;">
             <w10:wrap type="none"/>
           </v:rect>
         </w:pict>
       </w:r>
       <w:r>
         <w:pict>
-          <v:rect id="DocuMindTableBorder130" filled="t" fillcolor="#B7B7B7" stroked="f" o:allowincell="f" style="position:absolute;margin-left:57.026pt;margin-top:166.220pt;width:0.500pt;height:160.993pt;z-index:90;mso-position-horizontal-relative:page;mso-position-vertical-relative:page;mso-wrap-style:none;">
+          <v:rect id="DocuMindTableBorder130" filled="t" fillcolor="#000000" stroked="f" o:allowincell="f" style="position:absolute;margin-left:56.916pt;margin-top:166.220pt;width:0.720pt;height:160.993pt;z-index:90;mso-position-horizontal-relative:page;mso-position-vertical-relative:page;mso-wrap-style:none;">
             <w10:wrap type="none"/>
           </v:rect>
         </w:pict>
       </w:r>
       <w:r>
         <w:pict>
-          <v:rect id="DocuMindTableBorder131" filled="t" fillcolor="#B7B7B7" stroked="f" o:allowincell="f" style="position:absolute;margin-left:219.012pt;margin-top:166.220pt;width:0.500pt;height:160.993pt;z-index:90;mso-position-horizontal-relative:page;mso-position-vertical-relative:page;mso-wrap-style:none;">
+          <v:rect id="DocuMindTableBorder131" filled="t" fillcolor="#000000" stroked="f" o:allowincell="f" style="position:absolute;margin-left:218.902pt;margin-top:166.220pt;width:0.720pt;height:160.993pt;z-index:90;mso-position-horizontal-relative:page;mso-position-vertical-relative:page;mso-wrap-style:none;">
             <w10:wrap type="none"/>
           </v:rect>
         </w:pict>
       </w:r>
       <w:r>
         <w:pict>
-          <v:rect id="DocuMindTableBorder132" filled="t" fillcolor="#B7B7B7" stroked="f" o:allowincell="f" style="position:absolute;margin-left:516.134pt;margin-top:166.220pt;width:0.500pt;height:160.993pt;z-index:90;mso-position-horizontal-relative:page;mso-position-vertical-relative:page;mso-wrap-style:none;">
+          <v:rect id="DocuMindTableBorder132" filled="t" fillcolor="#000000" stroked="f" o:allowincell="f" style="position:absolute;margin-left:516.024pt;margin-top:166.220pt;width:0.720pt;height:160.993pt;z-index:90;mso-position-horizontal-relative:page;mso-position-vertical-relative:page;mso-wrap-style:none;">
             <w10:wrap type="none"/>
           </v:rect>
         </w:pict>
@@ -3627,56 +3627,56 @@
       </w:r>
       <w:r>
         <w:pict>
-          <v:rect id="DocuMindTableBorder147" filled="t" fillcolor="#B7B7B7" stroked="f" o:allowincell="f" style="position:absolute;margin-left:75.586pt;margin-top:542.145pt;width:440.798pt;height:0.500pt;z-index:90;mso-position-horizontal-relative:page;mso-position-vertical-relative:page;mso-wrap-style:none;">
+          <v:rect id="DocuMindTableBorder147" filled="t" fillcolor="#000000" stroked="f" o:allowincell="f" style="position:absolute;margin-left:75.586pt;margin-top:542.155pt;width:440.798pt;height:0.480pt;z-index:90;mso-position-horizontal-relative:page;mso-position-vertical-relative:page;mso-wrap-style:none;">
             <w10:wrap type="none"/>
           </v:rect>
         </w:pict>
       </w:r>
       <w:r>
         <w:pict>
-          <v:rect id="DocuMindTableBorder148" filled="t" fillcolor="#B7B7B7" stroked="f" o:allowincell="f" style="position:absolute;margin-left:75.586pt;margin-top:565.023pt;width:440.798pt;height:0.500pt;z-index:90;mso-position-horizontal-relative:page;mso-position-vertical-relative:page;mso-wrap-style:none;">
+          <v:rect id="DocuMindTableBorder148" filled="t" fillcolor="#000000" stroked="f" o:allowincell="f" style="position:absolute;margin-left:75.586pt;margin-top:565.033pt;width:440.798pt;height:0.480pt;z-index:90;mso-position-horizontal-relative:page;mso-position-vertical-relative:page;mso-wrap-style:none;">
             <w10:wrap type="none"/>
           </v:rect>
         </w:pict>
       </w:r>
       <w:r>
         <w:pict>
-          <v:rect id="DocuMindTableBorder149" filled="t" fillcolor="#B7B7B7" stroked="f" o:allowincell="f" style="position:absolute;margin-left:75.586pt;margin-top:587.701pt;width:440.798pt;height:0.500pt;z-index:90;mso-position-horizontal-relative:page;mso-position-vertical-relative:page;mso-wrap-style:none;">
+          <v:rect id="DocuMindTableBorder149" filled="t" fillcolor="#000000" stroked="f" o:allowincell="f" style="position:absolute;margin-left:75.586pt;margin-top:587.711pt;width:440.798pt;height:0.480pt;z-index:90;mso-position-horizontal-relative:page;mso-position-vertical-relative:page;mso-wrap-style:none;">
             <w10:wrap type="none"/>
           </v:rect>
         </w:pict>
       </w:r>
       <w:r>
         <w:pict>
-          <v:rect id="DocuMindTableBorder150" filled="t" fillcolor="#B7B7B7" stroked="f" o:allowincell="f" style="position:absolute;margin-left:75.586pt;margin-top:610.499pt;width:440.798pt;height:0.500pt;z-index:90;mso-position-horizontal-relative:page;mso-position-vertical-relative:page;mso-wrap-style:none;">
+          <v:rect id="DocuMindTableBorder150" filled="t" fillcolor="#000000" stroked="f" o:allowincell="f" style="position:absolute;margin-left:75.586pt;margin-top:610.509pt;width:440.798pt;height:0.480pt;z-index:90;mso-position-horizontal-relative:page;mso-position-vertical-relative:page;mso-wrap-style:none;">
             <w10:wrap type="none"/>
           </v:rect>
         </w:pict>
       </w:r>
       <w:r>
         <w:pict>
-          <v:rect id="DocuMindTableBorder151" filled="t" fillcolor="#B7B7B7" stroked="f" o:allowincell="f" style="position:absolute;margin-left:75.586pt;margin-top:633.377pt;width:440.798pt;height:0.500pt;z-index:90;mso-position-horizontal-relative:page;mso-position-vertical-relative:page;mso-wrap-style:none;">
+          <v:rect id="DocuMindTableBorder151" filled="t" fillcolor="#000000" stroked="f" o:allowincell="f" style="position:absolute;margin-left:75.586pt;margin-top:633.387pt;width:440.798pt;height:0.480pt;z-index:90;mso-position-horizontal-relative:page;mso-position-vertical-relative:page;mso-wrap-style:none;">
             <w10:wrap type="none"/>
           </v:rect>
         </w:pict>
       </w:r>
       <w:r>
         <w:pict>
-          <v:rect id="DocuMindTableBorder152" filled="t" fillcolor="#B7B7B7" stroked="f" o:allowincell="f" style="position:absolute;margin-left:75.336pt;margin-top:542.395pt;width:0.500pt;height:91.232pt;z-index:90;mso-position-horizontal-relative:page;mso-position-vertical-relative:page;mso-wrap-style:none;">
+          <v:rect id="DocuMindTableBorder152" filled="t" fillcolor="#000000" stroked="f" o:allowincell="f" style="position:absolute;margin-left:75.346pt;margin-top:542.395pt;width:0.480pt;height:91.232pt;z-index:90;mso-position-horizontal-relative:page;mso-position-vertical-relative:page;mso-wrap-style:none;">
             <w10:wrap type="none"/>
           </v:rect>
         </w:pict>
       </w:r>
       <w:r>
         <w:pict>
-          <v:rect id="DocuMindTableBorder153" filled="t" fillcolor="#B7B7B7" stroked="f" o:allowincell="f" style="position:absolute;margin-left:214.597pt;margin-top:542.395pt;width:0.500pt;height:91.232pt;z-index:90;mso-position-horizontal-relative:page;mso-position-vertical-relative:page;mso-wrap-style:none;">
+          <v:rect id="DocuMindTableBorder153" filled="t" fillcolor="#000000" stroked="f" o:allowincell="f" style="position:absolute;margin-left:214.607pt;margin-top:542.395pt;width:0.480pt;height:91.232pt;z-index:90;mso-position-horizontal-relative:page;mso-position-vertical-relative:page;mso-wrap-style:none;">
             <w10:wrap type="none"/>
           </v:rect>
         </w:pict>
       </w:r>
       <w:r>
         <w:pict>
-          <v:rect id="DocuMindTableBorder154" filled="t" fillcolor="#B7B7B7" stroked="f" o:allowincell="f" style="position:absolute;margin-left:516.134pt;margin-top:542.395pt;width:0.500pt;height:91.232pt;z-index:90;mso-position-horizontal-relative:page;mso-position-vertical-relative:page;mso-wrap-style:none;">
+          <v:rect id="DocuMindTableBorder154" filled="t" fillcolor="#000000" stroked="f" o:allowincell="f" style="position:absolute;margin-left:516.144pt;margin-top:542.395pt;width:0.480pt;height:91.232pt;z-index:90;mso-position-horizontal-relative:page;mso-position-vertical-relative:page;mso-wrap-style:none;">
             <w10:wrap type="none"/>
           </v:rect>
         </w:pict>

</xml_diff>

<commit_message>
Step 59 - Normalize and preserve PDF bullet glyphs
</commit_message>
<xml_diff>
--- a/output/output.docx
+++ b/output/output.docx
@@ -237,7 +237,7 @@
                   </w:pPr>
                   <w:r>
                     <w:rPr>
-                      <w:rFonts w:ascii="Symbol" w:hAnsi="Symbol" w:eastAsia="Symbol" w:cs="Symbol"/>
+                      <w:rFonts w:ascii="Arial" w:hAnsi="Arial" w:eastAsia="Arial" w:cs="Arial"/>
                       <w:b w:val="0"/>
                       <w:i w:val="0"/>
                       <w:color w:val="000000"/>
@@ -260,7 +260,7 @@
                   </w:r>
                   <w:r>
                     <w:rPr>
-                      <w:rFonts w:ascii="Symbol" w:hAnsi="Symbol" w:eastAsia="Symbol" w:cs="Symbol"/>
+                      <w:rFonts w:ascii="Arial" w:hAnsi="Arial" w:eastAsia="Arial" w:cs="Arial"/>
                       <w:b w:val="0"/>
                       <w:i w:val="0"/>
                       <w:color w:val="000000"/>
@@ -326,7 +326,7 @@
                   </w:pPr>
                   <w:r>
                     <w:rPr>
-                      <w:rFonts w:ascii="Symbol" w:hAnsi="Symbol" w:eastAsia="Symbol" w:cs="Symbol"/>
+                      <w:rFonts w:ascii="Arial" w:hAnsi="Arial" w:eastAsia="Arial" w:cs="Arial"/>
                       <w:b w:val="0"/>
                       <w:i w:val="0"/>
                       <w:color w:val="000000"/>
@@ -349,7 +349,7 @@
                   </w:r>
                   <w:r>
                     <w:rPr>
-                      <w:rFonts w:ascii="Symbol" w:hAnsi="Symbol" w:eastAsia="Symbol" w:cs="Symbol"/>
+                      <w:rFonts w:ascii="Arial" w:hAnsi="Arial" w:eastAsia="Arial" w:cs="Arial"/>
                       <w:b w:val="0"/>
                       <w:i w:val="0"/>
                       <w:color w:val="000000"/>
@@ -2979,7 +2979,7 @@
                   </w:pPr>
                   <w:r>
                     <w:rPr>
-                      <w:rFonts w:ascii="Symbol" w:hAnsi="Symbol" w:eastAsia="Symbol" w:cs="Symbol"/>
+                      <w:rFonts w:ascii="Arial" w:hAnsi="Arial" w:eastAsia="Arial" w:cs="Arial"/>
                       <w:b w:val="0"/>
                       <w:i w:val="0"/>
                       <w:color w:val="000000"/>
@@ -3033,7 +3033,7 @@
                   </w:pPr>
                   <w:r>
                     <w:rPr>
-                      <w:rFonts w:ascii="Symbol" w:hAnsi="Symbol" w:eastAsia="Symbol" w:cs="Symbol"/>
+                      <w:rFonts w:ascii="Arial" w:hAnsi="Arial" w:eastAsia="Arial" w:cs="Arial"/>
                       <w:b w:val="0"/>
                       <w:i w:val="0"/>
                       <w:color w:val="000000"/>
@@ -3087,7 +3087,7 @@
                   </w:pPr>
                   <w:r>
                     <w:rPr>
-                      <w:rFonts w:ascii="Symbol" w:hAnsi="Symbol" w:eastAsia="Symbol" w:cs="Symbol"/>
+                      <w:rFonts w:ascii="Arial" w:hAnsi="Arial" w:eastAsia="Arial" w:cs="Arial"/>
                       <w:b w:val="0"/>
                       <w:i w:val="0"/>
                       <w:color w:val="000000"/>
@@ -4467,7 +4467,7 @@
                   </w:pPr>
                   <w:r>
                     <w:rPr>
-                      <w:rFonts w:ascii="Symbol" w:hAnsi="Symbol" w:eastAsia="Symbol" w:cs="Symbol"/>
+                      <w:rFonts w:ascii="Arial" w:hAnsi="Arial" w:eastAsia="Arial" w:cs="Arial"/>
                       <w:b w:val="0"/>
                       <w:i w:val="0"/>
                       <w:color w:val="000000"/>
@@ -4521,7 +4521,7 @@
                   </w:pPr>
                   <w:r>
                     <w:rPr>
-                      <w:rFonts w:ascii="Symbol" w:hAnsi="Symbol" w:eastAsia="Symbol" w:cs="Symbol"/>
+                      <w:rFonts w:ascii="Arial" w:hAnsi="Arial" w:eastAsia="Arial" w:cs="Arial"/>
                       <w:b w:val="0"/>
                       <w:i w:val="0"/>
                       <w:color w:val="000000"/>
@@ -4629,7 +4629,7 @@
                   </w:pPr>
                   <w:r>
                     <w:rPr>
-                      <w:rFonts w:ascii="Symbol" w:hAnsi="Symbol" w:eastAsia="Symbol" w:cs="Symbol"/>
+                      <w:rFonts w:ascii="Arial" w:hAnsi="Arial" w:eastAsia="Arial" w:cs="Arial"/>
                       <w:b w:val="0"/>
                       <w:i w:val="0"/>
                       <w:color w:val="000000"/>
@@ -4873,7 +4873,7 @@
                   </w:pPr>
                   <w:r>
                     <w:rPr>
-                      <w:rFonts w:ascii="Symbol" w:hAnsi="Symbol" w:eastAsia="Symbol" w:cs="Symbol"/>
+                      <w:rFonts w:ascii="Arial" w:hAnsi="Arial" w:eastAsia="Arial" w:cs="Arial"/>
                       <w:b w:val="0"/>
                       <w:i w:val="0"/>
                       <w:color w:val="000000"/>
@@ -5035,7 +5035,7 @@
                   </w:pPr>
                   <w:r>
                     <w:rPr>
-                      <w:rFonts w:ascii="Symbol" w:hAnsi="Symbol" w:eastAsia="Symbol" w:cs="Symbol"/>
+                      <w:rFonts w:ascii="Arial" w:hAnsi="Arial" w:eastAsia="Arial" w:cs="Arial"/>
                       <w:b w:val="0"/>
                       <w:i w:val="0"/>
                       <w:color w:val="000000"/>
@@ -5143,7 +5143,7 @@
                   </w:pPr>
                   <w:r>
                     <w:rPr>
-                      <w:rFonts w:ascii="Symbol" w:hAnsi="Symbol" w:eastAsia="Symbol" w:cs="Symbol"/>
+                      <w:rFonts w:ascii="Arial" w:hAnsi="Arial" w:eastAsia="Arial" w:cs="Arial"/>
                       <w:b w:val="0"/>
                       <w:i w:val="0"/>
                       <w:color w:val="000000"/>
@@ -5278,7 +5278,7 @@
                   </w:pPr>
                   <w:r>
                     <w:rPr>
-                      <w:rFonts w:ascii="Symbol" w:hAnsi="Symbol" w:eastAsia="Symbol" w:cs="Symbol"/>
+                      <w:rFonts w:ascii="Arial" w:hAnsi="Arial" w:eastAsia="Arial" w:cs="Arial"/>
                       <w:b w:val="0"/>
                       <w:i w:val="0"/>
                       <w:color w:val="000000"/>

</xml_diff>

<commit_message>
Step 61.3 - Render vector graphic regions in fixed layout DOCX
</commit_message>
<xml_diff>
--- a/output/output.docx
+++ b/output/output.docx
@@ -13,7 +13,63 @@
       </w:r>
       <w:r>
         <w:pict>
-          <v:shape id="DocuMindTextBox1" type="#_x0000_t202" stroked="f" filled="f" o:allowincell="f" style="position:absolute;margin-left:50.427pt;margin-top:196.565pt;width:282.814pt;height:106.314pt;z-index:251659264;mso-position-horizontal-relative:page;mso-position-vertical-relative:page;mso-wrap-style:none;mso-fit-shape-to-text:t;">
+          <v:shape id="DocuMindVector1" type="#_x0000_t75" stroked="f" o:allowincell="f" style="position:absolute;margin-left:349.731pt;margin-top:-9.864pt;width:284.418pt;height:480.710pt;z-index:0;mso-position-horizontal-relative:page;mso-position-vertical-relative:page;mso-wrap-style:none;">
+            <w10:wrap type="none"/>
+            <v:imagedata r:id="rId9" o:title=""/>
+          </v:shape>
+        </w:pict>
+      </w:r>
+      <w:r>
+        <w:pict>
+          <v:shape id="DocuMindVector2" type="#_x0000_t75" stroked="f" o:allowincell="f" style="position:absolute;margin-left:48.433pt;margin-top:68.380pt;width:42.426pt;height:44.109pt;z-index:0;mso-position-horizontal-relative:page;mso-position-vertical-relative:page;mso-wrap-style:none;">
+            <w10:wrap type="none"/>
+            <v:imagedata r:id="rId10" o:title=""/>
+          </v:shape>
+        </w:pict>
+      </w:r>
+      <w:r>
+        <w:pict>
+          <v:shape id="DocuMindVector3" type="#_x0000_t75" stroked="f" o:allowincell="f" style="position:absolute;margin-left:-90.982pt;margin-top:427.146pt;width:1000.298pt;height:360.466pt;z-index:0;mso-position-horizontal-relative:page;mso-position-vertical-relative:page;mso-wrap-style:none;">
+            <w10:wrap type="none"/>
+            <v:imagedata r:id="rId11" o:title=""/>
+          </v:shape>
+        </w:pict>
+      </w:r>
+      <w:r>
+        <w:pict>
+          <v:shape id="DocuMindVector4" type="#_x0000_t75" stroked="f" o:allowincell="f" style="position:absolute;margin-left:48.427pt;margin-top:801.888pt;width:41.126pt;height:41.126pt;z-index:0;mso-position-horizontal-relative:page;mso-position-vertical-relative:page;mso-wrap-style:none;">
+            <w10:wrap type="none"/>
+            <v:imagedata r:id="rId12" o:title=""/>
+          </v:shape>
+        </w:pict>
+      </w:r>
+      <w:r>
+        <w:pict>
+          <v:shape id="DocuMindVector5" type="#_x0000_t75" stroked="f" o:allowincell="f" style="position:absolute;margin-left:308.500pt;margin-top:801.888pt;width:41.125pt;height:41.125pt;z-index:0;mso-position-horizontal-relative:page;mso-position-vertical-relative:page;mso-wrap-style:none;">
+            <w10:wrap type="none"/>
+            <v:imagedata r:id="rId13" o:title=""/>
+          </v:shape>
+        </w:pict>
+      </w:r>
+      <w:r>
+        <w:pict>
+          <v:shape id="DocuMindVector6" type="#_x0000_t75" stroked="f" o:allowincell="f" style="position:absolute;margin-left:318.695pt;margin-top:835.814pt;width:309.960pt;height:183.977pt;z-index:0;mso-position-horizontal-relative:page;mso-position-vertical-relative:page;mso-wrap-style:none;">
+            <w10:wrap type="none"/>
+            <v:imagedata r:id="rId14" o:title=""/>
+          </v:shape>
+        </w:pict>
+      </w:r>
+      <w:r>
+        <w:pict>
+          <v:shape id="DocuMindVector7" type="#_x0000_t75" stroked="f" o:allowincell="f" style="position:absolute;margin-left:-29.891pt;margin-top:871.886pt;width:253.282pt;height:150.637pt;z-index:0;mso-position-horizontal-relative:page;mso-position-vertical-relative:page;mso-wrap-style:none;">
+            <w10:wrap type="none"/>
+            <v:imagedata r:id="rId15" o:title=""/>
+          </v:shape>
+        </w:pict>
+      </w:r>
+      <w:r>
+        <w:pict>
+          <v:shape id="DocuMindTextBox8" type="#_x0000_t202" stroked="f" filled="f" o:allowincell="f" style="position:absolute;margin-left:50.427pt;margin-top:196.565pt;width:282.814pt;height:106.314pt;z-index:251659264;mso-position-horizontal-relative:page;mso-position-vertical-relative:page;mso-wrap-style:none;mso-fit-shape-to-text:t;">
             <w10:wrap type="none"/>
             <v:textbox inset="0,0,0,0">
               <w:txbxContent>
@@ -40,7 +96,7 @@
       </w:r>
       <w:r>
         <w:pict>
-          <v:shape id="DocuMindTextBox2" type="#_x0000_t202" stroked="f" filled="f" o:allowincell="f" style="position:absolute;margin-left:50.427pt;margin-top:272.315pt;width:155.947pt;height:106.314pt;z-index:251659264;mso-position-horizontal-relative:page;mso-position-vertical-relative:page;mso-wrap-style:none;mso-fit-shape-to-text:t;">
+          <v:shape id="DocuMindTextBox9" type="#_x0000_t202" stroked="f" filled="f" o:allowincell="f" style="position:absolute;margin-left:50.427pt;margin-top:272.315pt;width:155.947pt;height:106.314pt;z-index:251659264;mso-position-horizontal-relative:page;mso-position-vertical-relative:page;mso-wrap-style:none;mso-fit-shape-to-text:t;">
             <w10:wrap type="none"/>
             <v:textbox inset="0,0,0,0">
               <w:txbxContent>
@@ -67,7 +123,7 @@
       </w:r>
       <w:r>
         <w:pict>
-          <v:shape id="DocuMindTextBox3" type="#_x0000_t202" stroked="f" filled="f" o:allowincell="f" style="position:absolute;margin-left:104.608pt;margin-top:75.631pt;width:125.533pt;height:30.955pt;z-index:251659264;mso-position-horizontal-relative:page;mso-position-vertical-relative:page;mso-wrap-style:none;mso-fit-shape-to-text:t;">
+          <v:shape id="DocuMindTextBox10" type="#_x0000_t202" stroked="f" filled="f" o:allowincell="f" style="position:absolute;margin-left:104.608pt;margin-top:75.631pt;width:125.533pt;height:30.955pt;z-index:251659264;mso-position-horizontal-relative:page;mso-position-vertical-relative:page;mso-wrap-style:none;mso-fit-shape-to-text:t;">
             <w10:wrap type="none"/>
             <v:textbox inset="0,0,0,0">
               <w:txbxContent>
@@ -94,7 +150,7 @@
       </w:r>
       <w:r>
         <w:pict>
-          <v:shape id="DocuMindTextBox4" type="#_x0000_t202" stroked="f" filled="f" o:allowincell="f" style="position:absolute;margin-left:50.427pt;margin-top:698.729pt;width:188.482pt;height:36.740pt;z-index:251659264;mso-position-horizontal-relative:page;mso-position-vertical-relative:page;mso-wrap-style:none;mso-fit-shape-to-text:t;">
+          <v:shape id="DocuMindTextBox11" type="#_x0000_t202" stroked="f" filled="f" o:allowincell="f" style="position:absolute;margin-left:50.427pt;margin-top:698.729pt;width:188.482pt;height:36.740pt;z-index:251659264;mso-position-horizontal-relative:page;mso-position-vertical-relative:page;mso-wrap-style:none;mso-fit-shape-to-text:t;">
             <w10:wrap type="none"/>
             <v:textbox inset="0,0,0,0">
               <w:txbxContent>
@@ -121,7 +177,7 @@
       </w:r>
       <w:r>
         <w:pict>
-          <v:shape id="DocuMindTextBox5" type="#_x0000_t202" stroked="f" filled="f" o:allowincell="f" style="position:absolute;margin-left:50.427pt;margin-top:661.557pt;width:134.295pt;height:36.740pt;z-index:251659264;mso-position-horizontal-relative:page;mso-position-vertical-relative:page;mso-wrap-style:none;mso-fit-shape-to-text:t;">
+          <v:shape id="DocuMindTextBox12" type="#_x0000_t202" stroked="f" filled="f" o:allowincell="f" style="position:absolute;margin-left:50.427pt;margin-top:661.557pt;width:134.295pt;height:36.740pt;z-index:251659264;mso-position-horizontal-relative:page;mso-position-vertical-relative:page;mso-wrap-style:none;mso-fit-shape-to-text:t;">
             <w10:wrap type="none"/>
             <v:textbox inset="0,0,0,0">
               <w:txbxContent>
@@ -148,7 +204,7 @@
       </w:r>
       <w:r>
         <w:pict>
-          <v:shape id="DocuMindTextBox6" type="#_x0000_t202" stroked="f" filled="f" o:allowincell="f" style="position:absolute;margin-left:360.726pt;margin-top:810.582pt;width:176.345pt;height:26.141pt;z-index:251659264;mso-position-horizontal-relative:page;mso-position-vertical-relative:page;mso-wrap-style:none;mso-fit-shape-to-text:t;">
+          <v:shape id="DocuMindTextBox13" type="#_x0000_t202" stroked="f" filled="f" o:allowincell="f" style="position:absolute;margin-left:360.726pt;margin-top:810.582pt;width:176.345pt;height:26.141pt;z-index:251659264;mso-position-horizontal-relative:page;mso-position-vertical-relative:page;mso-wrap-style:none;mso-fit-shape-to-text:t;">
             <w10:wrap type="none"/>
             <v:textbox inset="0,0,0,0">
               <w:txbxContent>
@@ -175,7 +231,7 @@
       </w:r>
       <w:r>
         <w:pict>
-          <v:shape id="DocuMindTextBox7" type="#_x0000_t202" stroked="f" filled="f" o:allowincell="f" style="position:absolute;margin-left:101.969pt;margin-top:810.582pt;width:115.347pt;height:26.141pt;z-index:251659264;mso-position-horizontal-relative:page;mso-position-vertical-relative:page;mso-wrap-style:none;mso-fit-shape-to-text:t;">
+          <v:shape id="DocuMindTextBox14" type="#_x0000_t202" stroked="f" filled="f" o:allowincell="f" style="position:absolute;margin-left:101.969pt;margin-top:810.582pt;width:115.347pt;height:26.141pt;z-index:251659264;mso-position-horizontal-relative:page;mso-position-vertical-relative:page;mso-wrap-style:none;mso-fit-shape-to-text:t;">
             <w10:wrap type="none"/>
             <v:textbox inset="0,0,0,0">
               <w:txbxContent>
@@ -222,7 +278,7 @@
       </w:r>
       <w:r>
         <w:pict>
-          <v:shape id="DocuMindTextBox8" type="#_x0000_t202" stroked="f" filled="f" o:allowincell="f" style="position:absolute;margin-left:60.364pt;margin-top:56.251pt;width:412.719pt;height:58.013pt;z-index:251659264;mso-position-horizontal-relative:page;mso-position-vertical-relative:page;mso-wrap-style:none;mso-fit-shape-to-text:t;">
+          <v:shape id="DocuMindTextBox15" type="#_x0000_t202" stroked="f" filled="f" o:allowincell="f" style="position:absolute;margin-left:60.364pt;margin-top:56.251pt;width:412.719pt;height:58.013pt;z-index:251659264;mso-position-horizontal-relative:page;mso-position-vertical-relative:page;mso-wrap-style:none;mso-fit-shape-to-text:t;">
             <w10:wrap type="none"/>
             <v:textbox inset="0,0,0,0">
               <w:txbxContent>
@@ -249,7 +305,7 @@
       </w:r>
       <w:r>
         <w:pict>
-          <v:shape id="DocuMindTextBox9" type="#_x0000_t202" stroked="f" filled="f" o:allowincell="f" style="position:absolute;margin-left:60.364pt;margin-top:139.476pt;width:167.446pt;height:42.003pt;z-index:251659264;mso-position-horizontal-relative:page;mso-position-vertical-relative:page;mso-wrap-style:none;mso-fit-shape-to-text:t;">
+          <v:shape id="DocuMindTextBox16" type="#_x0000_t202" stroked="f" filled="f" o:allowincell="f" style="position:absolute;margin-left:60.364pt;margin-top:139.476pt;width:167.446pt;height:42.003pt;z-index:251659264;mso-position-horizontal-relative:page;mso-position-vertical-relative:page;mso-wrap-style:none;mso-fit-shape-to-text:t;">
             <w10:wrap type="none"/>
             <v:textbox inset="0,0,0,0">
               <w:txbxContent>
@@ -276,7 +332,7 @@
       </w:r>
       <w:r>
         <w:pict>
-          <v:shape id="DocuMindTextBox10" type="#_x0000_t202" stroked="f" filled="f" o:allowincell="f" style="position:absolute;margin-left:60.364pt;margin-top:193.557pt;width:466.462pt;height:29.998pt;z-index:251659264;mso-position-horizontal-relative:page;mso-position-vertical-relative:page;mso-wrap-style:none;mso-fit-shape-to-text:t;">
+          <v:shape id="DocuMindTextBox17" type="#_x0000_t202" stroked="f" filled="f" o:allowincell="f" style="position:absolute;margin-left:60.364pt;margin-top:193.557pt;width:466.462pt;height:29.998pt;z-index:251659264;mso-position-horizontal-relative:page;mso-position-vertical-relative:page;mso-wrap-style:none;mso-fit-shape-to-text:t;">
             <w10:wrap type="none"/>
             <v:textbox inset="0,0,0,0">
               <w:txbxContent>
@@ -303,7 +359,7 @@
       </w:r>
       <w:r>
         <w:pict>
-          <v:shape id="DocuMindTextBox11" type="#_x0000_t202" stroked="f" filled="f" o:allowincell="f" style="position:absolute;margin-left:60.364pt;margin-top:215.160pt;width:487.638pt;height:29.998pt;z-index:251659264;mso-position-horizontal-relative:page;mso-position-vertical-relative:page;mso-wrap-style:none;mso-fit-shape-to-text:t;">
+          <v:shape id="DocuMindTextBox18" type="#_x0000_t202" stroked="f" filled="f" o:allowincell="f" style="position:absolute;margin-left:60.364pt;margin-top:215.160pt;width:487.638pt;height:29.998pt;z-index:251659264;mso-position-horizontal-relative:page;mso-position-vertical-relative:page;mso-wrap-style:none;mso-fit-shape-to-text:t;">
             <w10:wrap type="none"/>
             <v:textbox inset="0,0,0,0">
               <w:txbxContent>
@@ -330,7 +386,7 @@
       </w:r>
       <w:r>
         <w:pict>
-          <v:shape id="DocuMindTextBox12" type="#_x0000_t202" stroked="f" filled="f" o:allowincell="f" style="position:absolute;margin-left:60.364pt;margin-top:236.763pt;width:408.574pt;height:29.998pt;z-index:251659264;mso-position-horizontal-relative:page;mso-position-vertical-relative:page;mso-wrap-style:none;mso-fit-shape-to-text:t;">
+          <v:shape id="DocuMindTextBox19" type="#_x0000_t202" stroked="f" filled="f" o:allowincell="f" style="position:absolute;margin-left:60.364pt;margin-top:236.763pt;width:408.574pt;height:29.998pt;z-index:251659264;mso-position-horizontal-relative:page;mso-position-vertical-relative:page;mso-wrap-style:none;mso-fit-shape-to-text:t;">
             <w10:wrap type="none"/>
             <v:textbox inset="0,0,0,0">
               <w:txbxContent>
@@ -357,7 +413,7 @@
       </w:r>
       <w:r>
         <w:pict>
-          <v:shape id="DocuMindTextBox13" type="#_x0000_t202" stroked="f" filled="f" o:allowincell="f" style="position:absolute;margin-left:60.364pt;margin-top:258.366pt;width:88.184pt;height:29.998pt;z-index:251659264;mso-position-horizontal-relative:page;mso-position-vertical-relative:page;mso-wrap-style:none;mso-fit-shape-to-text:t;">
+          <v:shape id="DocuMindTextBox20" type="#_x0000_t202" stroked="f" filled="f" o:allowincell="f" style="position:absolute;margin-left:60.364pt;margin-top:258.366pt;width:88.184pt;height:29.998pt;z-index:251659264;mso-position-horizontal-relative:page;mso-position-vertical-relative:page;mso-wrap-style:none;mso-fit-shape-to-text:t;">
             <w10:wrap type="none"/>
             <v:textbox inset="0,0,0,0">
               <w:txbxContent>
@@ -384,7 +440,7 @@
       </w:r>
       <w:r>
         <w:pict>
-          <v:shape id="DocuMindTextBox14" type="#_x0000_t202" stroked="f" filled="f" o:allowincell="f" style="position:absolute;margin-left:60.364pt;margin-top:313.165pt;width:146.320pt;height:42.003pt;z-index:251659264;mso-position-horizontal-relative:page;mso-position-vertical-relative:page;mso-wrap-style:none;mso-fit-shape-to-text:t;">
+          <v:shape id="DocuMindTextBox21" type="#_x0000_t202" stroked="f" filled="f" o:allowincell="f" style="position:absolute;margin-left:60.364pt;margin-top:313.165pt;width:146.320pt;height:42.003pt;z-index:251659264;mso-position-horizontal-relative:page;mso-position-vertical-relative:page;mso-wrap-style:none;mso-fit-shape-to-text:t;">
             <w10:wrap type="none"/>
             <v:textbox inset="0,0,0,0">
               <w:txbxContent>
@@ -411,7 +467,7 @@
       </w:r>
       <w:r>
         <w:pict>
-          <v:shape id="DocuMindTextBox15" type="#_x0000_t202" stroked="f" filled="f" o:allowincell="f" style="position:absolute;margin-left:60.364pt;margin-top:367.246pt;width:353.817pt;height:29.998pt;z-index:251659264;mso-position-horizontal-relative:page;mso-position-vertical-relative:page;mso-wrap-style:none;mso-fit-shape-to-text:t;">
+          <v:shape id="DocuMindTextBox22" type="#_x0000_t202" stroked="f" filled="f" o:allowincell="f" style="position:absolute;margin-left:60.364pt;margin-top:367.246pt;width:353.817pt;height:29.998pt;z-index:251659264;mso-position-horizontal-relative:page;mso-position-vertical-relative:page;mso-wrap-style:none;mso-fit-shape-to-text:t;">
             <w10:wrap type="none"/>
             <v:textbox inset="0,0,0,0">
               <w:txbxContent>
@@ -438,7 +494,7 @@
       </w:r>
       <w:r>
         <w:pict>
-          <v:shape id="DocuMindTextBox16" type="#_x0000_t202" stroked="f" filled="f" o:allowincell="f" style="position:absolute;margin-left:91.702pt;margin-top:414.773pt;width:381.702pt;height:29.998pt;z-index:251659264;mso-position-horizontal-relative:page;mso-position-vertical-relative:page;mso-wrap-style:none;mso-fit-shape-to-text:t;">
+          <v:shape id="DocuMindTextBox23" type="#_x0000_t202" stroked="f" filled="f" o:allowincell="f" style="position:absolute;margin-left:91.702pt;margin-top:414.773pt;width:381.702pt;height:29.998pt;z-index:251659264;mso-position-horizontal-relative:page;mso-position-vertical-relative:page;mso-wrap-style:none;mso-fit-shape-to-text:t;">
             <w10:wrap type="none"/>
             <v:textbox inset="0,0,0,0">
               <w:txbxContent>
@@ -465,7 +521,7 @@
       </w:r>
       <w:r>
         <w:pict>
-          <v:shape id="DocuMindTextBox17" type="#_x0000_t202" stroked="f" filled="f" o:allowincell="f" style="position:absolute;margin-left:91.702pt;margin-top:444.153pt;width:460.656pt;height:29.998pt;z-index:251659264;mso-position-horizontal-relative:page;mso-position-vertical-relative:page;mso-wrap-style:none;mso-fit-shape-to-text:t;">
+          <v:shape id="DocuMindTextBox24" type="#_x0000_t202" stroked="f" filled="f" o:allowincell="f" style="position:absolute;margin-left:91.702pt;margin-top:444.153pt;width:460.656pt;height:29.998pt;z-index:251659264;mso-position-horizontal-relative:page;mso-position-vertical-relative:page;mso-wrap-style:none;mso-fit-shape-to-text:t;">
             <w10:wrap type="none"/>
             <v:textbox inset="0,0,0,0">
               <w:txbxContent>
@@ -492,7 +548,7 @@
       </w:r>
       <w:r>
         <w:pict>
-          <v:shape id="DocuMindTextBox18" type="#_x0000_t202" stroked="f" filled="f" o:allowincell="f" style="position:absolute;margin-left:91.702pt;margin-top:473.533pt;width:372.321pt;height:29.998pt;z-index:251659264;mso-position-horizontal-relative:page;mso-position-vertical-relative:page;mso-wrap-style:none;mso-fit-shape-to-text:t;">
+          <v:shape id="DocuMindTextBox25" type="#_x0000_t202" stroked="f" filled="f" o:allowincell="f" style="position:absolute;margin-left:91.702pt;margin-top:473.533pt;width:372.321pt;height:29.998pt;z-index:251659264;mso-position-horizontal-relative:page;mso-position-vertical-relative:page;mso-wrap-style:none;mso-fit-shape-to-text:t;">
             <w10:wrap type="none"/>
             <v:textbox inset="0,0,0,0">
               <w:txbxContent>
@@ -519,7 +575,7 @@
       </w:r>
       <w:r>
         <w:pict>
-          <v:shape id="DocuMindTextBox19" type="#_x0000_t202" stroked="f" filled="f" o:allowincell="f" style="position:absolute;margin-left:60.364pt;margin-top:531.797pt;width:169.108pt;height:41.992pt;z-index:251659264;mso-position-horizontal-relative:page;mso-position-vertical-relative:page;mso-wrap-style:none;mso-fit-shape-to-text:t;">
+          <v:shape id="DocuMindTextBox26" type="#_x0000_t202" stroked="f" filled="f" o:allowincell="f" style="position:absolute;margin-left:60.364pt;margin-top:531.797pt;width:169.108pt;height:41.992pt;z-index:251659264;mso-position-horizontal-relative:page;mso-position-vertical-relative:page;mso-wrap-style:none;mso-fit-shape-to-text:t;">
             <w10:wrap type="none"/>
             <v:textbox inset="0,0,0,0">
               <w:txbxContent>
@@ -546,7 +602,7 @@
       </w:r>
       <w:r>
         <w:pict>
-          <v:shape id="DocuMindTextBox20" type="#_x0000_t202" stroked="f" filled="f" o:allowincell="f" style="position:absolute;margin-left:96.414pt;margin-top:590.189pt;width:147.345pt;height:29.998pt;z-index:251659264;mso-position-horizontal-relative:page;mso-position-vertical-relative:page;mso-wrap-style:none;mso-fit-shape-to-text:t;">
+          <v:shape id="DocuMindTextBox27" type="#_x0000_t202" stroked="f" filled="f" o:allowincell="f" style="position:absolute;margin-left:96.414pt;margin-top:590.189pt;width:147.345pt;height:29.998pt;z-index:251659264;mso-position-horizontal-relative:page;mso-position-vertical-relative:page;mso-wrap-style:none;mso-fit-shape-to-text:t;">
             <w10:wrap type="none"/>
             <v:textbox inset="0,0,0,0">
               <w:txbxContent>
@@ -573,7 +629,7 @@
       </w:r>
       <w:r>
         <w:pict>
-          <v:shape id="DocuMindTextBox21" type="#_x0000_t202" stroked="f" filled="f" o:allowincell="f" style="position:absolute;margin-left:240.587pt;margin-top:590.189pt;width:241.228pt;height:29.998pt;z-index:251659264;mso-position-horizontal-relative:page;mso-position-vertical-relative:page;mso-wrap-style:none;mso-fit-shape-to-text:t;">
+          <v:shape id="DocuMindTextBox28" type="#_x0000_t202" stroked="f" filled="f" o:allowincell="f" style="position:absolute;margin-left:240.587pt;margin-top:590.189pt;width:241.228pt;height:29.998pt;z-index:251659264;mso-position-horizontal-relative:page;mso-position-vertical-relative:page;mso-wrap-style:none;mso-fit-shape-to-text:t;">
             <w10:wrap type="none"/>
             <v:textbox inset="0,0,0,0">
               <w:txbxContent>
@@ -600,7 +656,7 @@
       </w:r>
       <w:r>
         <w:pict>
-          <v:shape id="DocuMindTextBox22" type="#_x0000_t202" stroked="f" filled="f" o:allowincell="f" style="position:absolute;margin-left:91.702pt;margin-top:619.570pt;width:228.419pt;height:29.998pt;z-index:251659264;mso-position-horizontal-relative:page;mso-position-vertical-relative:page;mso-wrap-style:none;mso-fit-shape-to-text:t;">
+          <v:shape id="DocuMindTextBox29" type="#_x0000_t202" stroked="f" filled="f" o:allowincell="f" style="position:absolute;margin-left:91.702pt;margin-top:619.570pt;width:228.419pt;height:29.998pt;z-index:251659264;mso-position-horizontal-relative:page;mso-position-vertical-relative:page;mso-wrap-style:none;mso-fit-shape-to-text:t;">
             <w10:wrap type="none"/>
             <v:textbox inset="0,0,0,0">
               <w:txbxContent>
@@ -627,7 +683,7 @@
       </w:r>
       <w:r>
         <w:pict>
-          <v:shape id="DocuMindTextBox23" type="#_x0000_t202" stroked="f" filled="f" o:allowincell="f" style="position:absolute;margin-left:81.062pt;margin-top:590.189pt;width:11.981pt;height:29.998pt;z-index:251659264;mso-position-horizontal-relative:page;mso-position-vertical-relative:page;mso-wrap-style:none;mso-fit-shape-to-text:t;">
+          <v:shape id="DocuMindTextBox30" type="#_x0000_t202" stroked="f" filled="f" o:allowincell="f" style="position:absolute;margin-left:81.062pt;margin-top:590.189pt;width:11.981pt;height:29.998pt;z-index:251659264;mso-position-horizontal-relative:page;mso-position-vertical-relative:page;mso-wrap-style:none;mso-fit-shape-to-text:t;">
             <w10:wrap type="none"/>
             <v:textbox inset="0,0,0,0">
               <w:txbxContent>
@@ -654,7 +710,7 @@
       </w:r>
       <w:r>
         <w:pict>
-          <v:shape id="DocuMindTextBox24" type="#_x0000_t202" stroked="f" filled="f" o:allowincell="f" style="position:absolute;margin-left:96.414pt;margin-top:648.950pt;width:119.792pt;height:29.998pt;z-index:251659264;mso-position-horizontal-relative:page;mso-position-vertical-relative:page;mso-wrap-style:none;mso-fit-shape-to-text:t;">
+          <v:shape id="DocuMindTextBox31" type="#_x0000_t202" stroked="f" filled="f" o:allowincell="f" style="position:absolute;margin-left:96.414pt;margin-top:648.950pt;width:119.792pt;height:29.998pt;z-index:251659264;mso-position-horizontal-relative:page;mso-position-vertical-relative:page;mso-wrap-style:none;mso-fit-shape-to-text:t;">
             <w10:wrap type="none"/>
             <v:textbox inset="0,0,0,0">
               <w:txbxContent>
@@ -681,7 +737,7 @@
       </w:r>
       <w:r>
         <w:pict>
-          <v:shape id="DocuMindTextBox25" type="#_x0000_t202" stroked="f" filled="f" o:allowincell="f" style="position:absolute;margin-left:213.030pt;margin-top:648.950pt;width:317.676pt;height:29.998pt;z-index:251659264;mso-position-horizontal-relative:page;mso-position-vertical-relative:page;mso-wrap-style:none;mso-fit-shape-to-text:t;">
+          <v:shape id="DocuMindTextBox32" type="#_x0000_t202" stroked="f" filled="f" o:allowincell="f" style="position:absolute;margin-left:213.030pt;margin-top:648.950pt;width:317.676pt;height:29.998pt;z-index:251659264;mso-position-horizontal-relative:page;mso-position-vertical-relative:page;mso-wrap-style:none;mso-fit-shape-to-text:t;">
             <w10:wrap type="none"/>
             <v:textbox inset="0,0,0,0">
               <w:txbxContent>
@@ -708,7 +764,7 @@
       </w:r>
       <w:r>
         <w:pict>
-          <v:shape id="DocuMindTextBox26" type="#_x0000_t202" stroked="f" filled="f" o:allowincell="f" style="position:absolute;margin-left:91.702pt;margin-top:678.330pt;width:222.964pt;height:29.998pt;z-index:251659264;mso-position-horizontal-relative:page;mso-position-vertical-relative:page;mso-wrap-style:none;mso-fit-shape-to-text:t;">
+          <v:shape id="DocuMindTextBox33" type="#_x0000_t202" stroked="f" filled="f" o:allowincell="f" style="position:absolute;margin-left:91.702pt;margin-top:678.330pt;width:222.964pt;height:29.998pt;z-index:251659264;mso-position-horizontal-relative:page;mso-position-vertical-relative:page;mso-wrap-style:none;mso-fit-shape-to-text:t;">
             <w10:wrap type="none"/>
             <v:textbox inset="0,0,0,0">
               <w:txbxContent>
@@ -735,7 +791,7 @@
       </w:r>
       <w:r>
         <w:pict>
-          <v:shape id="DocuMindTextBox27" type="#_x0000_t202" stroked="f" filled="f" o:allowincell="f" style="position:absolute;margin-left:76.080pt;margin-top:648.950pt;width:16.964pt;height:29.998pt;z-index:251659264;mso-position-horizontal-relative:page;mso-position-vertical-relative:page;mso-wrap-style:none;mso-fit-shape-to-text:t;">
+          <v:shape id="DocuMindTextBox34" type="#_x0000_t202" stroked="f" filled="f" o:allowincell="f" style="position:absolute;margin-left:76.080pt;margin-top:648.950pt;width:16.964pt;height:29.998pt;z-index:251659264;mso-position-horizontal-relative:page;mso-position-vertical-relative:page;mso-wrap-style:none;mso-fit-shape-to-text:t;">
             <w10:wrap type="none"/>
             <v:textbox inset="0,0,0,0">
               <w:txbxContent>
@@ -762,7 +818,7 @@
       </w:r>
       <w:r>
         <w:pict>
-          <v:shape id="DocuMindTextBox28" type="#_x0000_t202" stroked="f" filled="f" o:allowincell="f" style="position:absolute;margin-left:96.414pt;margin-top:707.710pt;width:186.546pt;height:29.998pt;z-index:251659264;mso-position-horizontal-relative:page;mso-position-vertical-relative:page;mso-wrap-style:none;mso-fit-shape-to-text:t;">
+          <v:shape id="DocuMindTextBox35" type="#_x0000_t202" stroked="f" filled="f" o:allowincell="f" style="position:absolute;margin-left:96.414pt;margin-top:707.710pt;width:186.546pt;height:29.998pt;z-index:251659264;mso-position-horizontal-relative:page;mso-position-vertical-relative:page;mso-wrap-style:none;mso-fit-shape-to-text:t;">
             <w10:wrap type="none"/>
             <v:textbox inset="0,0,0,0">
               <w:txbxContent>
@@ -789,7 +845,7 @@
       </w:r>
       <w:r>
         <w:pict>
-          <v:shape id="DocuMindTextBox29" type="#_x0000_t202" stroked="f" filled="f" o:allowincell="f" style="position:absolute;margin-left:279.783pt;margin-top:707.710pt;width:263.658pt;height:29.998pt;z-index:251659264;mso-position-horizontal-relative:page;mso-position-vertical-relative:page;mso-wrap-style:none;mso-fit-shape-to-text:t;">
+          <v:shape id="DocuMindTextBox36" type="#_x0000_t202" stroked="f" filled="f" o:allowincell="f" style="position:absolute;margin-left:279.783pt;margin-top:707.710pt;width:263.658pt;height:29.998pt;z-index:251659264;mso-position-horizontal-relative:page;mso-position-vertical-relative:page;mso-wrap-style:none;mso-fit-shape-to-text:t;">
             <w10:wrap type="none"/>
             <v:textbox inset="0,0,0,0">
               <w:txbxContent>
@@ -816,7 +872,7 @@
       </w:r>
       <w:r>
         <w:pict>
-          <v:shape id="DocuMindTextBox30" type="#_x0000_t202" stroked="f" filled="f" o:allowincell="f" style="position:absolute;margin-left:91.702pt;margin-top:737.090pt;width:353.227pt;height:29.998pt;z-index:251659264;mso-position-horizontal-relative:page;mso-position-vertical-relative:page;mso-wrap-style:none;mso-fit-shape-to-text:t;">
+          <v:shape id="DocuMindTextBox37" type="#_x0000_t202" stroked="f" filled="f" o:allowincell="f" style="position:absolute;margin-left:91.702pt;margin-top:737.090pt;width:353.227pt;height:29.998pt;z-index:251659264;mso-position-horizontal-relative:page;mso-position-vertical-relative:page;mso-wrap-style:none;mso-fit-shape-to-text:t;">
             <w10:wrap type="none"/>
             <v:textbox inset="0,0,0,0">
               <w:txbxContent>
@@ -843,7 +899,7 @@
       </w:r>
       <w:r>
         <w:pict>
-          <v:shape id="DocuMindTextBox31" type="#_x0000_t202" stroked="f" filled="f" o:allowincell="f" style="position:absolute;margin-left:75.796pt;margin-top:707.710pt;width:17.247pt;height:29.998pt;z-index:251659264;mso-position-horizontal-relative:page;mso-position-vertical-relative:page;mso-wrap-style:none;mso-fit-shape-to-text:t;">
+          <v:shape id="DocuMindTextBox38" type="#_x0000_t202" stroked="f" filled="f" o:allowincell="f" style="position:absolute;margin-left:75.796pt;margin-top:707.710pt;width:17.247pt;height:29.998pt;z-index:251659264;mso-position-horizontal-relative:page;mso-position-vertical-relative:page;mso-wrap-style:none;mso-fit-shape-to-text:t;">
             <w10:wrap type="none"/>
             <v:textbox inset="0,0,0,0">
               <w:txbxContent>
@@ -870,7 +926,7 @@
       </w:r>
       <w:r>
         <w:pict>
-          <v:shape id="DocuMindTextBox32" type="#_x0000_t202" stroked="f" filled="f" o:allowincell="f" style="position:absolute;margin-left:60.364pt;margin-top:795.354pt;width:177.262pt;height:41.992pt;z-index:251659264;mso-position-horizontal-relative:page;mso-position-vertical-relative:page;mso-wrap-style:none;mso-fit-shape-to-text:t;">
+          <v:shape id="DocuMindTextBox39" type="#_x0000_t202" stroked="f" filled="f" o:allowincell="f" style="position:absolute;margin-left:60.364pt;margin-top:795.354pt;width:177.262pt;height:41.992pt;z-index:251659264;mso-position-horizontal-relative:page;mso-position-vertical-relative:page;mso-wrap-style:none;mso-fit-shape-to-text:t;">
             <w10:wrap type="none"/>
             <v:textbox inset="0,0,0,0">
               <w:txbxContent>
@@ -897,7 +953,7 @@
       </w:r>
       <w:r>
         <w:pict>
-          <v:shape id="DocuMindTextBox33" type="#_x0000_t202" stroked="f" filled="f" o:allowincell="f" style="position:absolute;margin-left:60.364pt;margin-top:849.426pt;width:466.462pt;height:29.998pt;z-index:251659264;mso-position-horizontal-relative:page;mso-position-vertical-relative:page;mso-wrap-style:none;mso-fit-shape-to-text:t;">
+          <v:shape id="DocuMindTextBox40" type="#_x0000_t202" stroked="f" filled="f" o:allowincell="f" style="position:absolute;margin-left:60.364pt;margin-top:849.426pt;width:466.462pt;height:29.998pt;z-index:251659264;mso-position-horizontal-relative:page;mso-position-vertical-relative:page;mso-wrap-style:none;mso-fit-shape-to-text:t;">
             <w10:wrap type="none"/>
             <v:textbox inset="0,0,0,0">
               <w:txbxContent>
@@ -924,7 +980,7 @@
       </w:r>
       <w:r>
         <w:pict>
-          <v:shape id="DocuMindTextBox34" type="#_x0000_t202" stroked="f" filled="f" o:allowincell="f" style="position:absolute;margin-left:60.364pt;margin-top:871.029pt;width:487.638pt;height:29.998pt;z-index:251659264;mso-position-horizontal-relative:page;mso-position-vertical-relative:page;mso-wrap-style:none;mso-fit-shape-to-text:t;">
+          <v:shape id="DocuMindTextBox41" type="#_x0000_t202" stroked="f" filled="f" o:allowincell="f" style="position:absolute;margin-left:60.364pt;margin-top:871.029pt;width:487.638pt;height:29.998pt;z-index:251659264;mso-position-horizontal-relative:page;mso-position-vertical-relative:page;mso-wrap-style:none;mso-fit-shape-to-text:t;">
             <w10:wrap type="none"/>
             <v:textbox inset="0,0,0,0">
               <w:txbxContent>
@@ -951,7 +1007,7 @@
       </w:r>
       <w:r>
         <w:pict>
-          <v:shape id="DocuMindTextBox35" type="#_x0000_t202" stroked="f" filled="f" o:allowincell="f" style="position:absolute;margin-left:60.364pt;margin-top:892.632pt;width:48.302pt;height:29.998pt;z-index:251659264;mso-position-horizontal-relative:page;mso-position-vertical-relative:page;mso-wrap-style:none;mso-fit-shape-to-text:t;">
+          <v:shape id="DocuMindTextBox42" type="#_x0000_t202" stroked="f" filled="f" o:allowincell="f" style="position:absolute;margin-left:60.364pt;margin-top:892.632pt;width:48.302pt;height:29.998pt;z-index:251659264;mso-position-horizontal-relative:page;mso-position-vertical-relative:page;mso-wrap-style:none;mso-fit-shape-to-text:t;">
             <w10:wrap type="none"/>
             <v:textbox inset="0,0,0,0">
               <w:txbxContent>
@@ -998,63 +1054,63 @@
       </w:r>
       <w:r>
         <w:pict>
-          <v:rect id="DocuMindTableBorder36" filled="t" fillcolor="#000000" stroked="f" o:allowincell="f" style="position:absolute;margin-left:60.730pt;margin-top:654.770pt;width:490.530pt;height:0.930pt;z-index:110;mso-position-horizontal-relative:page;mso-position-vertical-relative:page;mso-wrap-style:none;">
+          <v:rect id="DocuMindTableBorder43" filled="t" fillcolor="#000000" stroked="f" o:allowincell="f" style="position:absolute;margin-left:60.730pt;margin-top:654.770pt;width:490.530pt;height:0.930pt;z-index:110;mso-position-horizontal-relative:page;mso-position-vertical-relative:page;mso-wrap-style:none;">
             <w10:wrap type="none"/>
           </v:rect>
         </w:pict>
       </w:r>
       <w:r>
         <w:pict>
-          <v:rect id="DocuMindTableBorder37" filled="t" fillcolor="#000000" stroked="f" o:allowincell="f" style="position:absolute;margin-left:60.730pt;margin-top:713.050pt;width:490.530pt;height:0.930pt;z-index:110;mso-position-horizontal-relative:page;mso-position-vertical-relative:page;mso-wrap-style:none;">
+          <v:rect id="DocuMindTableBorder44" filled="t" fillcolor="#000000" stroked="f" o:allowincell="f" style="position:absolute;margin-left:60.730pt;margin-top:713.050pt;width:490.530pt;height:0.930pt;z-index:110;mso-position-horizontal-relative:page;mso-position-vertical-relative:page;mso-wrap-style:none;">
             <w10:wrap type="none"/>
           </v:rect>
         </w:pict>
       </w:r>
       <w:r>
         <w:pict>
-          <v:rect id="DocuMindTableBorder38" filled="t" fillcolor="#000000" stroked="f" o:allowincell="f" style="position:absolute;margin-left:60.730pt;margin-top:767.150pt;width:490.530pt;height:0.930pt;z-index:110;mso-position-horizontal-relative:page;mso-position-vertical-relative:page;mso-wrap-style:none;">
+          <v:rect id="DocuMindTableBorder45" filled="t" fillcolor="#000000" stroked="f" o:allowincell="f" style="position:absolute;margin-left:60.730pt;margin-top:767.150pt;width:490.530pt;height:0.930pt;z-index:110;mso-position-horizontal-relative:page;mso-position-vertical-relative:page;mso-wrap-style:none;">
             <w10:wrap type="none"/>
           </v:rect>
         </w:pict>
       </w:r>
       <w:r>
         <w:pict>
-          <v:rect id="DocuMindTableBorder39" filled="t" fillcolor="#000000" stroked="f" o:allowincell="f" style="position:absolute;margin-left:60.730pt;margin-top:821.370pt;width:490.530pt;height:0.930pt;z-index:110;mso-position-horizontal-relative:page;mso-position-vertical-relative:page;mso-wrap-style:none;">
+          <v:rect id="DocuMindTableBorder46" filled="t" fillcolor="#000000" stroked="f" o:allowincell="f" style="position:absolute;margin-left:60.730pt;margin-top:821.370pt;width:490.530pt;height:0.930pt;z-index:110;mso-position-horizontal-relative:page;mso-position-vertical-relative:page;mso-wrap-style:none;">
             <w10:wrap type="none"/>
           </v:rect>
         </w:pict>
       </w:r>
       <w:r>
         <w:pict>
-          <v:rect id="DocuMindTableBorder40" filled="t" fillcolor="#000000" stroked="f" o:allowincell="f" style="position:absolute;margin-left:60.730pt;margin-top:875.600pt;width:490.530pt;height:0.930pt;z-index:110;mso-position-horizontal-relative:page;mso-position-vertical-relative:page;mso-wrap-style:none;">
+          <v:rect id="DocuMindTableBorder47" filled="t" fillcolor="#000000" stroked="f" o:allowincell="f" style="position:absolute;margin-left:60.730pt;margin-top:875.600pt;width:490.530pt;height:0.930pt;z-index:110;mso-position-horizontal-relative:page;mso-position-vertical-relative:page;mso-wrap-style:none;">
             <w10:wrap type="none"/>
           </v:rect>
         </w:pict>
       </w:r>
       <w:r>
         <w:pict>
-          <v:rect id="DocuMindTableBorder41" filled="t" fillcolor="#000000" stroked="f" o:allowincell="f" style="position:absolute;margin-left:60.270pt;margin-top:655.230pt;width:0.930pt;height:220.830pt;z-index:110;mso-position-horizontal-relative:page;mso-position-vertical-relative:page;mso-wrap-style:none;">
+          <v:rect id="DocuMindTableBorder48" filled="t" fillcolor="#000000" stroked="f" o:allowincell="f" style="position:absolute;margin-left:60.270pt;margin-top:655.230pt;width:0.930pt;height:220.830pt;z-index:110;mso-position-horizontal-relative:page;mso-position-vertical-relative:page;mso-wrap-style:none;">
             <w10:wrap type="none"/>
           </v:rect>
         </w:pict>
       </w:r>
       <w:r>
         <w:pict>
-          <v:rect id="DocuMindTableBorder42" filled="t" fillcolor="#000000" stroked="f" o:allowincell="f" style="position:absolute;margin-left:305.540pt;margin-top:655.230pt;width:0.930pt;height:220.830pt;z-index:110;mso-position-horizontal-relative:page;mso-position-vertical-relative:page;mso-wrap-style:none;">
+          <v:rect id="DocuMindTableBorder49" filled="t" fillcolor="#000000" stroked="f" o:allowincell="f" style="position:absolute;margin-left:305.540pt;margin-top:655.230pt;width:0.930pt;height:220.830pt;z-index:110;mso-position-horizontal-relative:page;mso-position-vertical-relative:page;mso-wrap-style:none;">
             <w10:wrap type="none"/>
           </v:rect>
         </w:pict>
       </w:r>
       <w:r>
         <w:pict>
-          <v:rect id="DocuMindTableBorder43" filled="t" fillcolor="#000000" stroked="f" o:allowincell="f" style="position:absolute;margin-left:550.800pt;margin-top:655.230pt;width:0.930pt;height:220.830pt;z-index:110;mso-position-horizontal-relative:page;mso-position-vertical-relative:page;mso-wrap-style:none;">
+          <v:rect id="DocuMindTableBorder50" filled="t" fillcolor="#000000" stroked="f" o:allowincell="f" style="position:absolute;margin-left:550.800pt;margin-top:655.230pt;width:0.930pt;height:220.830pt;z-index:110;mso-position-horizontal-relative:page;mso-position-vertical-relative:page;mso-wrap-style:none;">
             <w10:wrap type="none"/>
           </v:rect>
         </w:pict>
       </w:r>
       <w:r>
         <w:pict>
-          <v:shape id="DocuMindTableCell44" type="#_x0000_t202" filled="f" stroked="f" o:allowincell="f" style="position:absolute;margin-left:60.734pt;margin-top:655.234pt;width:245.266pt;height:58.279pt;z-index:100;mso-position-horizontal-relative:page;mso-position-vertical-relative:page;mso-wrap-style:none;v-text-anchor:middle;">
+          <v:shape id="DocuMindTableCell51" type="#_x0000_t202" filled="f" stroked="f" o:allowincell="f" style="position:absolute;margin-left:60.734pt;margin-top:655.234pt;width:245.266pt;height:58.279pt;z-index:100;mso-position-horizontal-relative:page;mso-position-vertical-relative:page;mso-wrap-style:none;v-text-anchor:middle;">
             <w10:wrap type="none"/>
             <v:textbox inset="2.0pt,1.0pt,2.0pt,1.0pt">
               <w:txbxContent>
@@ -1082,7 +1138,7 @@
       </w:r>
       <w:r>
         <w:pict>
-          <v:shape id="DocuMindTableCell45" type="#_x0000_t202" filled="f" stroked="f" o:allowincell="f" style="position:absolute;margin-left:306.000pt;margin-top:655.234pt;width:245.266pt;height:58.279pt;z-index:100;mso-position-horizontal-relative:page;mso-position-vertical-relative:page;mso-wrap-style:none;v-text-anchor:middle;">
+          <v:shape id="DocuMindTableCell52" type="#_x0000_t202" filled="f" stroked="f" o:allowincell="f" style="position:absolute;margin-left:306.000pt;margin-top:655.234pt;width:245.266pt;height:58.279pt;z-index:100;mso-position-horizontal-relative:page;mso-position-vertical-relative:page;mso-wrap-style:none;v-text-anchor:middle;">
             <w10:wrap type="none"/>
             <v:textbox inset="2.0pt,1.0pt,2.0pt,1.0pt">
               <w:txbxContent>
@@ -1110,7 +1166,7 @@
       </w:r>
       <w:r>
         <w:pict>
-          <v:shape id="DocuMindTableCell46" type="#_x0000_t202" filled="f" stroked="f" o:allowincell="f" style="position:absolute;margin-left:60.734pt;margin-top:713.514pt;width:245.266pt;height:54.099pt;z-index:100;mso-position-horizontal-relative:page;mso-position-vertical-relative:page;mso-wrap-style:none;v-text-anchor:middle;">
+          <v:shape id="DocuMindTableCell53" type="#_x0000_t202" filled="f" stroked="f" o:allowincell="f" style="position:absolute;margin-left:60.734pt;margin-top:713.514pt;width:245.266pt;height:54.099pt;z-index:100;mso-position-horizontal-relative:page;mso-position-vertical-relative:page;mso-wrap-style:none;v-text-anchor:middle;">
             <w10:wrap type="none"/>
             <v:textbox inset="2.0pt,1.0pt,2.0pt,1.0pt">
               <w:txbxContent>
@@ -1138,7 +1194,7 @@
       </w:r>
       <w:r>
         <w:pict>
-          <v:shape id="DocuMindTableCell47" type="#_x0000_t202" filled="f" stroked="f" o:allowincell="f" style="position:absolute;margin-left:306.000pt;margin-top:713.514pt;width:245.266pt;height:54.099pt;z-index:100;mso-position-horizontal-relative:page;mso-position-vertical-relative:page;mso-wrap-style:none;v-text-anchor:middle;">
+          <v:shape id="DocuMindTableCell54" type="#_x0000_t202" filled="f" stroked="f" o:allowincell="f" style="position:absolute;margin-left:306.000pt;margin-top:713.514pt;width:245.266pt;height:54.099pt;z-index:100;mso-position-horizontal-relative:page;mso-position-vertical-relative:page;mso-wrap-style:none;v-text-anchor:middle;">
             <w10:wrap type="none"/>
             <v:textbox inset="2.0pt,1.0pt,2.0pt,1.0pt">
               <w:txbxContent>
@@ -1166,7 +1222,7 @@
       </w:r>
       <w:r>
         <w:pict>
-          <v:shape id="DocuMindTableCell48" type="#_x0000_t202" filled="f" stroked="f" o:allowincell="f" style="position:absolute;margin-left:60.734pt;margin-top:767.613pt;width:245.266pt;height:54.224pt;z-index:100;mso-position-horizontal-relative:page;mso-position-vertical-relative:page;mso-wrap-style:none;v-text-anchor:middle;">
+          <v:shape id="DocuMindTableCell55" type="#_x0000_t202" filled="f" stroked="f" o:allowincell="f" style="position:absolute;margin-left:60.734pt;margin-top:767.613pt;width:245.266pt;height:54.224pt;z-index:100;mso-position-horizontal-relative:page;mso-position-vertical-relative:page;mso-wrap-style:none;v-text-anchor:middle;">
             <w10:wrap type="none"/>
             <v:textbox inset="2.0pt,1.0pt,2.0pt,1.0pt">
               <w:txbxContent>
@@ -1194,7 +1250,7 @@
       </w:r>
       <w:r>
         <w:pict>
-          <v:shape id="DocuMindTableCell49" type="#_x0000_t202" filled="f" stroked="f" o:allowincell="f" style="position:absolute;margin-left:306.000pt;margin-top:767.613pt;width:245.266pt;height:54.224pt;z-index:100;mso-position-horizontal-relative:page;mso-position-vertical-relative:page;mso-wrap-style:none;v-text-anchor:middle;">
+          <v:shape id="DocuMindTableCell56" type="#_x0000_t202" filled="f" stroked="f" o:allowincell="f" style="position:absolute;margin-left:306.000pt;margin-top:767.613pt;width:245.266pt;height:54.224pt;z-index:100;mso-position-horizontal-relative:page;mso-position-vertical-relative:page;mso-wrap-style:none;v-text-anchor:middle;">
             <w10:wrap type="none"/>
             <v:textbox inset="2.0pt,1.0pt,2.0pt,1.0pt">
               <w:txbxContent>
@@ -1222,7 +1278,7 @@
       </w:r>
       <w:r>
         <w:pict>
-          <v:shape id="DocuMindTableCell50" type="#_x0000_t202" filled="f" stroked="f" o:allowincell="f" style="position:absolute;margin-left:60.734pt;margin-top:821.837pt;width:245.266pt;height:54.224pt;z-index:100;mso-position-horizontal-relative:page;mso-position-vertical-relative:page;mso-wrap-style:none;v-text-anchor:middle;">
+          <v:shape id="DocuMindTableCell57" type="#_x0000_t202" filled="f" stroked="f" o:allowincell="f" style="position:absolute;margin-left:60.734pt;margin-top:821.837pt;width:245.266pt;height:54.224pt;z-index:100;mso-position-horizontal-relative:page;mso-position-vertical-relative:page;mso-wrap-style:none;v-text-anchor:middle;">
             <w10:wrap type="none"/>
             <v:textbox inset="2.0pt,1.0pt,2.0pt,1.0pt">
               <w:txbxContent>
@@ -1250,7 +1306,7 @@
       </w:r>
       <w:r>
         <w:pict>
-          <v:shape id="DocuMindTableCell51" type="#_x0000_t202" filled="f" stroked="f" o:allowincell="f" style="position:absolute;margin-left:306.000pt;margin-top:821.837pt;width:245.266pt;height:54.224pt;z-index:100;mso-position-horizontal-relative:page;mso-position-vertical-relative:page;mso-wrap-style:none;v-text-anchor:middle;">
+          <v:shape id="DocuMindTableCell58" type="#_x0000_t202" filled="f" stroked="f" o:allowincell="f" style="position:absolute;margin-left:306.000pt;margin-top:821.837pt;width:245.266pt;height:54.224pt;z-index:100;mso-position-horizontal-relative:page;mso-position-vertical-relative:page;mso-wrap-style:none;v-text-anchor:middle;">
             <w10:wrap type="none"/>
             <v:textbox inset="2.0pt,1.0pt,2.0pt,1.0pt">
               <w:txbxContent>
@@ -1278,7 +1334,7 @@
       </w:r>
       <w:r>
         <w:pict>
-          <v:shape id="DocuMindTextBox52" type="#_x0000_t202" stroked="f" filled="f" o:allowincell="f" style="position:absolute;margin-left:60.364pt;margin-top:56.410pt;width:225.148pt;height:44.642pt;z-index:251659264;mso-position-horizontal-relative:page;mso-position-vertical-relative:page;mso-wrap-style:none;mso-fit-shape-to-text:t;">
+          <v:shape id="DocuMindTextBox59" type="#_x0000_t202" stroked="f" filled="f" o:allowincell="f" style="position:absolute;margin-left:60.364pt;margin-top:56.410pt;width:225.148pt;height:44.642pt;z-index:251659264;mso-position-horizontal-relative:page;mso-position-vertical-relative:page;mso-wrap-style:none;mso-fit-shape-to-text:t;">
             <w10:wrap type="none"/>
             <v:textbox inset="0,0,0,0">
               <w:txbxContent>
@@ -1305,7 +1361,7 @@
       </w:r>
       <w:r>
         <w:pict>
-          <v:shape id="DocuMindTextBox53" type="#_x0000_t202" stroked="f" filled="f" o:allowincell="f" style="position:absolute;margin-left:93.999pt;margin-top:119.093pt;width:83.035pt;height:31.757pt;z-index:251659264;mso-position-horizontal-relative:page;mso-position-vertical-relative:page;mso-wrap-style:none;mso-fit-shape-to-text:t;">
+          <v:shape id="DocuMindTextBox60" type="#_x0000_t202" stroked="f" filled="f" o:allowincell="f" style="position:absolute;margin-left:93.999pt;margin-top:119.093pt;width:83.035pt;height:31.757pt;z-index:251659264;mso-position-horizontal-relative:page;mso-position-vertical-relative:page;mso-wrap-style:none;mso-fit-shape-to-text:t;">
             <w10:wrap type="none"/>
             <v:textbox inset="0,0,0,0">
               <w:txbxContent>
@@ -1332,7 +1388,7 @@
       </w:r>
       <w:r>
         <w:pict>
-          <v:shape id="DocuMindTextBox54" type="#_x0000_t202" stroked="f" filled="f" o:allowincell="f" style="position:absolute;margin-left:173.848pt;margin-top:119.093pt;width:373.343pt;height:31.757pt;z-index:251659264;mso-position-horizontal-relative:page;mso-position-vertical-relative:page;mso-wrap-style:none;mso-fit-shape-to-text:t;">
+          <v:shape id="DocuMindTextBox61" type="#_x0000_t202" stroked="f" filled="f" o:allowincell="f" style="position:absolute;margin-left:173.848pt;margin-top:119.093pt;width:373.343pt;height:31.757pt;z-index:251659264;mso-position-horizontal-relative:page;mso-position-vertical-relative:page;mso-wrap-style:none;mso-fit-shape-to-text:t;">
             <w10:wrap type="none"/>
             <v:textbox inset="0,0,0,0">
               <w:txbxContent>
@@ -1359,7 +1415,7 @@
       </w:r>
       <w:r>
         <w:pict>
-          <v:shape id="DocuMindTextBox55" type="#_x0000_t202" stroked="f" filled="f" o:allowincell="f" style="position:absolute;margin-left:93.999pt;margin-top:150.627pt;width:130.292pt;height:31.757pt;z-index:251659264;mso-position-horizontal-relative:page;mso-position-vertical-relative:page;mso-wrap-style:none;mso-fit-shape-to-text:t;">
+          <v:shape id="DocuMindTextBox62" type="#_x0000_t202" stroked="f" filled="f" o:allowincell="f" style="position:absolute;margin-left:93.999pt;margin-top:150.627pt;width:130.292pt;height:31.757pt;z-index:251659264;mso-position-horizontal-relative:page;mso-position-vertical-relative:page;mso-wrap-style:none;mso-fit-shape-to-text:t;">
             <w10:wrap type="none"/>
             <v:textbox inset="0,0,0,0">
               <w:txbxContent>
@@ -1386,7 +1442,7 @@
       </w:r>
       <w:r>
         <w:pict>
-          <v:shape id="DocuMindTextBox56" type="#_x0000_t202" stroked="f" filled="f" o:allowincell="f" style="position:absolute;margin-left:93.999pt;margin-top:182.161pt;width:105.348pt;height:31.757pt;z-index:251659264;mso-position-horizontal-relative:page;mso-position-vertical-relative:page;mso-wrap-style:none;mso-fit-shape-to-text:t;">
+          <v:shape id="DocuMindTextBox63" type="#_x0000_t202" stroked="f" filled="f" o:allowincell="f" style="position:absolute;margin-left:93.999pt;margin-top:182.161pt;width:105.348pt;height:31.757pt;z-index:251659264;mso-position-horizontal-relative:page;mso-position-vertical-relative:page;mso-wrap-style:none;mso-fit-shape-to-text:t;">
             <w10:wrap type="none"/>
             <v:textbox inset="0,0,0,0">
               <w:txbxContent>
@@ -1413,7 +1469,7 @@
       </w:r>
       <w:r>
         <w:pict>
-          <v:shape id="DocuMindTextBox57" type="#_x0000_t202" stroked="f" filled="f" o:allowincell="f" style="position:absolute;margin-left:196.151pt;margin-top:182.161pt;width:340.744pt;height:31.757pt;z-index:251659264;mso-position-horizontal-relative:page;mso-position-vertical-relative:page;mso-wrap-style:none;mso-fit-shape-to-text:t;">
+          <v:shape id="DocuMindTextBox64" type="#_x0000_t202" stroked="f" filled="f" o:allowincell="f" style="position:absolute;margin-left:196.151pt;margin-top:182.161pt;width:340.744pt;height:31.757pt;z-index:251659264;mso-position-horizontal-relative:page;mso-position-vertical-relative:page;mso-wrap-style:none;mso-fit-shape-to-text:t;">
             <w10:wrap type="none"/>
             <v:textbox inset="0,0,0,0">
               <w:txbxContent>
@@ -1440,7 +1496,7 @@
       </w:r>
       <w:r>
         <w:pict>
-          <v:shape id="DocuMindTextBox58" type="#_x0000_t202" stroked="f" filled="f" o:allowincell="f" style="position:absolute;margin-left:93.999pt;margin-top:213.695pt;width:239.089pt;height:31.757pt;z-index:251659264;mso-position-horizontal-relative:page;mso-position-vertical-relative:page;mso-wrap-style:none;mso-fit-shape-to-text:t;">
+          <v:shape id="DocuMindTextBox65" type="#_x0000_t202" stroked="f" filled="f" o:allowincell="f" style="position:absolute;margin-left:93.999pt;margin-top:213.695pt;width:239.089pt;height:31.757pt;z-index:251659264;mso-position-horizontal-relative:page;mso-position-vertical-relative:page;mso-wrap-style:none;mso-fit-shape-to-text:t;">
             <w10:wrap type="none"/>
             <v:textbox inset="0,0,0,0">
               <w:txbxContent>
@@ -1467,7 +1523,7 @@
       </w:r>
       <w:r>
         <w:pict>
-          <v:shape id="DocuMindTextBox59" type="#_x0000_t202" stroked="f" filled="f" o:allowincell="f" style="position:absolute;margin-left:93.999pt;margin-top:245.229pt;width:134.367pt;height:31.757pt;z-index:251659264;mso-position-horizontal-relative:page;mso-position-vertical-relative:page;mso-wrap-style:none;mso-fit-shape-to-text:t;">
+          <v:shape id="DocuMindTextBox66" type="#_x0000_t202" stroked="f" filled="f" o:allowincell="f" style="position:absolute;margin-left:93.999pt;margin-top:245.229pt;width:134.367pt;height:31.757pt;z-index:251659264;mso-position-horizontal-relative:page;mso-position-vertical-relative:page;mso-wrap-style:none;mso-fit-shape-to-text:t;">
             <w10:wrap type="none"/>
             <v:textbox inset="0,0,0,0">
               <w:txbxContent>
@@ -1494,7 +1550,7 @@
       </w:r>
       <w:r>
         <w:pict>
-          <v:shape id="DocuMindTextBox60" type="#_x0000_t202" stroked="f" filled="f" o:allowincell="f" style="position:absolute;margin-left:225.178pt;margin-top:245.229pt;width:282.766pt;height:31.757pt;z-index:251659264;mso-position-horizontal-relative:page;mso-position-vertical-relative:page;mso-wrap-style:none;mso-fit-shape-to-text:t;">
+          <v:shape id="DocuMindTextBox67" type="#_x0000_t202" stroked="f" filled="f" o:allowincell="f" style="position:absolute;margin-left:225.178pt;margin-top:245.229pt;width:282.766pt;height:31.757pt;z-index:251659264;mso-position-horizontal-relative:page;mso-position-vertical-relative:page;mso-wrap-style:none;mso-fit-shape-to-text:t;">
             <w10:wrap type="none"/>
             <v:textbox inset="0,0,0,0">
               <w:txbxContent>
@@ -1521,7 +1577,7 @@
       </w:r>
       <w:r>
         <w:pict>
-          <v:shape id="DocuMindTextBox61" type="#_x0000_t202" stroked="f" filled="f" o:allowincell="f" style="position:absolute;margin-left:93.999pt;margin-top:276.763pt;width:201.544pt;height:31.757pt;z-index:251659264;mso-position-horizontal-relative:page;mso-position-vertical-relative:page;mso-wrap-style:none;mso-fit-shape-to-text:t;">
+          <v:shape id="DocuMindTextBox68" type="#_x0000_t202" stroked="f" filled="f" o:allowincell="f" style="position:absolute;margin-left:93.999pt;margin-top:276.763pt;width:201.544pt;height:31.757pt;z-index:251659264;mso-position-horizontal-relative:page;mso-position-vertical-relative:page;mso-wrap-style:none;mso-fit-shape-to-text:t;">
             <w10:wrap type="none"/>
             <v:textbox inset="0,0,0,0">
               <w:txbxContent>
@@ -1548,7 +1604,7 @@
       </w:r>
       <w:r>
         <w:pict>
-          <v:shape id="DocuMindTextBox62" type="#_x0000_t202" stroked="f" filled="f" o:allowincell="f" style="position:absolute;margin-left:60.364pt;margin-top:339.297pt;width:198.284pt;height:44.630pt;z-index:251659264;mso-position-horizontal-relative:page;mso-position-vertical-relative:page;mso-wrap-style:none;mso-fit-shape-to-text:t;">
+          <v:shape id="DocuMindTextBox69" type="#_x0000_t202" stroked="f" filled="f" o:allowincell="f" style="position:absolute;margin-left:60.364pt;margin-top:339.297pt;width:198.284pt;height:44.630pt;z-index:251659264;mso-position-horizontal-relative:page;mso-position-vertical-relative:page;mso-wrap-style:none;mso-fit-shape-to-text:t;">
             <w10:wrap type="none"/>
             <v:textbox inset="0,0,0,0">
               <w:txbxContent>
@@ -1575,7 +1631,7 @@
       </w:r>
       <w:r>
         <w:pict>
-          <v:shape id="DocuMindTextBox63" type="#_x0000_t202" stroked="f" filled="f" o:allowincell="f" style="position:absolute;margin-left:93.999pt;margin-top:401.971pt;width:209.417pt;height:31.757pt;z-index:251659264;mso-position-horizontal-relative:page;mso-position-vertical-relative:page;mso-wrap-style:none;mso-fit-shape-to-text:t;">
+          <v:shape id="DocuMindTextBox70" type="#_x0000_t202" stroked="f" filled="f" o:allowincell="f" style="position:absolute;margin-left:93.999pt;margin-top:401.971pt;width:209.417pt;height:31.757pt;z-index:251659264;mso-position-horizontal-relative:page;mso-position-vertical-relative:page;mso-wrap-style:none;mso-fit-shape-to-text:t;">
             <w10:wrap type="none"/>
             <v:textbox inset="0,0,0,0">
               <w:txbxContent>
@@ -1602,7 +1658,7 @@
       </w:r>
       <w:r>
         <w:pict>
-          <v:shape id="DocuMindTextBox64" type="#_x0000_t202" stroked="f" filled="f" o:allowincell="f" style="position:absolute;margin-left:300.231pt;margin-top:401.971pt;width:203.799pt;height:31.757pt;z-index:251659264;mso-position-horizontal-relative:page;mso-position-vertical-relative:page;mso-wrap-style:none;mso-fit-shape-to-text:t;">
+          <v:shape id="DocuMindTextBox71" type="#_x0000_t202" stroked="f" filled="f" o:allowincell="f" style="position:absolute;margin-left:300.231pt;margin-top:401.971pt;width:203.799pt;height:31.757pt;z-index:251659264;mso-position-horizontal-relative:page;mso-position-vertical-relative:page;mso-wrap-style:none;mso-fit-shape-to-text:t;">
             <w10:wrap type="none"/>
             <v:textbox inset="0,0,0,0">
               <w:txbxContent>
@@ -1629,7 +1685,7 @@
       </w:r>
       <w:r>
         <w:pict>
-          <v:shape id="DocuMindTextBox65" type="#_x0000_t202" stroked="f" filled="f" o:allowincell="f" style="position:absolute;margin-left:93.999pt;margin-top:433.505pt;width:299.836pt;height:31.757pt;z-index:251659264;mso-position-horizontal-relative:page;mso-position-vertical-relative:page;mso-wrap-style:none;mso-fit-shape-to-text:t;">
+          <v:shape id="DocuMindTextBox72" type="#_x0000_t202" stroked="f" filled="f" o:allowincell="f" style="position:absolute;margin-left:93.999pt;margin-top:433.505pt;width:299.836pt;height:31.757pt;z-index:251659264;mso-position-horizontal-relative:page;mso-position-vertical-relative:page;mso-wrap-style:none;mso-fit-shape-to-text:t;">
             <w10:wrap type="none"/>
             <v:textbox inset="0,0,0,0">
               <w:txbxContent>
@@ -1656,7 +1712,7 @@
       </w:r>
       <w:r>
         <w:pict>
-          <v:shape id="DocuMindTextBox66" type="#_x0000_t202" stroked="f" filled="f" o:allowincell="f" style="position:absolute;margin-left:93.999pt;margin-top:465.039pt;width:194.383pt;height:31.757pt;z-index:251659264;mso-position-horizontal-relative:page;mso-position-vertical-relative:page;mso-wrap-style:none;mso-fit-shape-to-text:t;">
+          <v:shape id="DocuMindTextBox73" type="#_x0000_t202" stroked="f" filled="f" o:allowincell="f" style="position:absolute;margin-left:93.999pt;margin-top:465.039pt;width:194.383pt;height:31.757pt;z-index:251659264;mso-position-horizontal-relative:page;mso-position-vertical-relative:page;mso-wrap-style:none;mso-fit-shape-to-text:t;">
             <w10:wrap type="none"/>
             <v:textbox inset="0,0,0,0">
               <w:txbxContent>
@@ -1683,7 +1739,7 @@
       </w:r>
       <w:r>
         <w:pict>
-          <v:shape id="DocuMindTextBox67" type="#_x0000_t202" stroked="f" filled="f" o:allowincell="f" style="position:absolute;margin-left:285.188pt;margin-top:465.039pt;width:241.977pt;height:31.757pt;z-index:251659264;mso-position-horizontal-relative:page;mso-position-vertical-relative:page;mso-wrap-style:none;mso-fit-shape-to-text:t;">
+          <v:shape id="DocuMindTextBox74" type="#_x0000_t202" stroked="f" filled="f" o:allowincell="f" style="position:absolute;margin-left:285.188pt;margin-top:465.039pt;width:241.977pt;height:31.757pt;z-index:251659264;mso-position-horizontal-relative:page;mso-position-vertical-relative:page;mso-wrap-style:none;mso-fit-shape-to-text:t;">
             <w10:wrap type="none"/>
             <v:textbox inset="0,0,0,0">
               <w:txbxContent>
@@ -1710,7 +1766,7 @@
       </w:r>
       <w:r>
         <w:pict>
-          <v:shape id="DocuMindTextBox68" type="#_x0000_t202" stroked="f" filled="f" o:allowincell="f" style="position:absolute;margin-left:93.999pt;margin-top:496.573pt;width:337.856pt;height:31.757pt;z-index:251659264;mso-position-horizontal-relative:page;mso-position-vertical-relative:page;mso-wrap-style:none;mso-fit-shape-to-text:t;">
+          <v:shape id="DocuMindTextBox75" type="#_x0000_t202" stroked="f" filled="f" o:allowincell="f" style="position:absolute;margin-left:93.999pt;margin-top:496.573pt;width:337.856pt;height:31.757pt;z-index:251659264;mso-position-horizontal-relative:page;mso-position-vertical-relative:page;mso-wrap-style:none;mso-fit-shape-to-text:t;">
             <w10:wrap type="none"/>
             <v:textbox inset="0,0,0,0">
               <w:txbxContent>
@@ -1737,7 +1793,7 @@
       </w:r>
       <w:r>
         <w:pict>
-          <v:shape id="DocuMindTextBox69" type="#_x0000_t202" stroked="f" filled="f" o:allowincell="f" style="position:absolute;margin-left:60.364pt;margin-top:559.098pt;width:108.628pt;height:44.642pt;z-index:251659264;mso-position-horizontal-relative:page;mso-position-vertical-relative:page;mso-wrap-style:none;mso-fit-shape-to-text:t;">
+          <v:shape id="DocuMindTextBox76" type="#_x0000_t202" stroked="f" filled="f" o:allowincell="f" style="position:absolute;margin-left:60.364pt;margin-top:559.098pt;width:108.628pt;height:44.642pt;z-index:251659264;mso-position-horizontal-relative:page;mso-position-vertical-relative:page;mso-wrap-style:none;mso-fit-shape-to-text:t;">
             <w10:wrap type="none"/>
             <v:textbox inset="0,0,0,0">
               <w:txbxContent>
@@ -1764,7 +1820,7 @@
       </w:r>
       <w:r>
         <w:pict>
-          <v:shape id="DocuMindTextBox70" type="#_x0000_t202" stroked="f" filled="f" o:allowincell="f" style="position:absolute;margin-left:60.364pt;margin-top:617.144pt;width:465.444pt;height:31.757pt;z-index:251659264;mso-position-horizontal-relative:page;mso-position-vertical-relative:page;mso-wrap-style:none;mso-fit-shape-to-text:t;">
+          <v:shape id="DocuMindTextBox77" type="#_x0000_t202" stroked="f" filled="f" o:allowincell="f" style="position:absolute;margin-left:60.364pt;margin-top:617.144pt;width:465.444pt;height:31.757pt;z-index:251659264;mso-position-horizontal-relative:page;mso-position-vertical-relative:page;mso-wrap-style:none;mso-fit-shape-to-text:t;">
             <w10:wrap type="none"/>
             <v:textbox inset="0,0,0,0">
               <w:txbxContent>
@@ -1791,7 +1847,7 @@
       </w:r>
       <w:r>
         <w:pict>
-          <v:shape id="DocuMindTextBox71" type="#_x0000_t202" stroked="f" filled="f" o:allowincell="f" style="position:absolute;margin-left:60.364pt;margin-top:895.385pt;width:342.663pt;height:31.757pt;z-index:251659264;mso-position-horizontal-relative:page;mso-position-vertical-relative:page;mso-wrap-style:none;mso-fit-shape-to-text:t;">
+          <v:shape id="DocuMindTextBox78" type="#_x0000_t202" stroked="f" filled="f" o:allowincell="f" style="position:absolute;margin-left:60.364pt;margin-top:895.385pt;width:342.663pt;height:31.757pt;z-index:251659264;mso-position-horizontal-relative:page;mso-position-vertical-relative:page;mso-wrap-style:none;mso-fit-shape-to-text:t;">
             <w10:wrap type="none"/>
             <v:textbox inset="0,0,0,0">
               <w:txbxContent>
@@ -1838,7 +1894,7 @@
       </w:r>
       <w:r>
         <w:pict>
-          <v:shape id="DocuMindTextBox72" type="#_x0000_t202" stroked="f" filled="f" o:allowincell="f" style="position:absolute;margin-left:60.431pt;margin-top:56.457pt;width:260.830pt;height:43.516pt;z-index:251659264;mso-position-horizontal-relative:page;mso-position-vertical-relative:page;mso-wrap-style:none;mso-fit-shape-to-text:t;">
+          <v:shape id="DocuMindTextBox79" type="#_x0000_t202" stroked="f" filled="f" o:allowincell="f" style="position:absolute;margin-left:60.431pt;margin-top:56.457pt;width:260.830pt;height:43.516pt;z-index:251659264;mso-position-horizontal-relative:page;mso-position-vertical-relative:page;mso-wrap-style:none;mso-fit-shape-to-text:t;">
             <w10:wrap type="none"/>
             <v:textbox inset="0,0,0,0">
               <w:txbxContent>
@@ -1865,7 +1921,7 @@
       </w:r>
       <w:r>
         <w:pict>
-          <v:shape id="DocuMindTextBox73" type="#_x0000_t202" stroked="f" filled="f" o:allowincell="f" style="position:absolute;margin-left:60.431pt;margin-top:112.811pt;width:467.641pt;height:31.007pt;z-index:251659264;mso-position-horizontal-relative:page;mso-position-vertical-relative:page;mso-wrap-style:none;mso-fit-shape-to-text:t;">
+          <v:shape id="DocuMindTextBox80" type="#_x0000_t202" stroked="f" filled="f" o:allowincell="f" style="position:absolute;margin-left:60.431pt;margin-top:112.811pt;width:467.641pt;height:31.007pt;z-index:251659264;mso-position-horizontal-relative:page;mso-position-vertical-relative:page;mso-wrap-style:none;mso-fit-shape-to-text:t;">
             <w10:wrap type="none"/>
             <v:textbox inset="0,0,0,0">
               <w:txbxContent>
@@ -1892,7 +1948,7 @@
       </w:r>
       <w:r>
         <w:pict>
-          <v:shape id="DocuMindTextBox74" type="#_x0000_t202" stroked="f" filled="f" o:allowincell="f" style="position:absolute;margin-left:60.431pt;margin-top:135.322pt;width:276.745pt;height:31.007pt;z-index:251659264;mso-position-horizontal-relative:page;mso-position-vertical-relative:page;mso-wrap-style:none;mso-fit-shape-to-text:t;">
+          <v:shape id="DocuMindTextBox81" type="#_x0000_t202" stroked="f" filled="f" o:allowincell="f" style="position:absolute;margin-left:60.431pt;margin-top:135.322pt;width:276.745pt;height:31.007pt;z-index:251659264;mso-position-horizontal-relative:page;mso-position-vertical-relative:page;mso-wrap-style:none;mso-fit-shape-to-text:t;">
             <w10:wrap type="none"/>
             <v:textbox inset="0,0,0,0">
               <w:txbxContent>
@@ -1919,7 +1975,7 @@
       </w:r>
       <w:r>
         <w:pict>
-          <v:shape id="DocuMindTextBox75" type="#_x0000_t202" stroked="f" filled="f" o:allowincell="f" style="position:absolute;margin-left:60.431pt;margin-top:878.189pt;width:439.160pt;height:31.007pt;z-index:251659264;mso-position-horizontal-relative:page;mso-position-vertical-relative:page;mso-wrap-style:none;mso-fit-shape-to-text:t;">
+          <v:shape id="DocuMindTextBox82" type="#_x0000_t202" stroked="f" filled="f" o:allowincell="f" style="position:absolute;margin-left:60.431pt;margin-top:878.189pt;width:439.160pt;height:31.007pt;z-index:251659264;mso-position-horizontal-relative:page;mso-position-vertical-relative:page;mso-wrap-style:none;mso-fit-shape-to-text:t;">
             <w10:wrap type="none"/>
             <v:textbox inset="0,0,0,0">
               <w:txbxContent>
@@ -1946,7 +2002,7 @@
       </w:r>
       <w:r>
         <w:pict>
-          <v:shape id="DocuMindTextBox76" type="#_x0000_t202" stroked="f" filled="f" o:allowincell="f" style="position:absolute;margin-left:232.051pt;margin-top:210.436pt;width:74.451pt;height:33.483pt;z-index:251659264;mso-position-horizontal-relative:page;mso-position-vertical-relative:page;mso-wrap-style:none;mso-fit-shape-to-text:t;">
+          <v:shape id="DocuMindTextBox83" type="#_x0000_t202" stroked="f" filled="f" o:allowincell="f" style="position:absolute;margin-left:232.051pt;margin-top:210.436pt;width:74.451pt;height:33.483pt;z-index:251659264;mso-position-horizontal-relative:page;mso-position-vertical-relative:page;mso-wrap-style:none;mso-fit-shape-to-text:t;">
             <w10:wrap type="none"/>
             <v:textbox inset="0,0,0,0">
               <w:txbxContent>
@@ -1973,7 +2029,7 @@
       </w:r>
       <w:r>
         <w:pict>
-          <v:shape id="DocuMindTextBox77" type="#_x0000_t202" stroked="f" filled="f" o:allowincell="f" style="position:absolute;margin-left:366.967pt;margin-top:210.436pt;width:80.150pt;height:33.483pt;z-index:251659264;mso-position-horizontal-relative:page;mso-position-vertical-relative:page;mso-wrap-style:none;mso-fit-shape-to-text:t;">
+          <v:shape id="DocuMindTextBox84" type="#_x0000_t202" stroked="f" filled="f" o:allowincell="f" style="position:absolute;margin-left:366.967pt;margin-top:210.436pt;width:80.150pt;height:33.483pt;z-index:251659264;mso-position-horizontal-relative:page;mso-position-vertical-relative:page;mso-wrap-style:none;mso-fit-shape-to-text:t;">
             <w10:wrap type="none"/>
             <v:textbox inset="0,0,0,0">
               <w:txbxContent>
@@ -2000,7 +2056,7 @@
       </w:r>
       <w:r>
         <w:pict>
-          <v:shape id="DocuMindTextBox78" type="#_x0000_t202" stroked="f" filled="f" o:allowincell="f" style="position:absolute;margin-left:139.976pt;margin-top:458.497pt;width:58.641pt;height:33.483pt;z-index:251659264;mso-position-horizontal-relative:page;mso-position-vertical-relative:page;mso-wrap-style:none;mso-fit-shape-to-text:t;">
+          <v:shape id="DocuMindTextBox85" type="#_x0000_t202" stroked="f" filled="f" o:allowincell="f" style="position:absolute;margin-left:139.976pt;margin-top:458.497pt;width:58.641pt;height:33.483pt;z-index:251659264;mso-position-horizontal-relative:page;mso-position-vertical-relative:page;mso-wrap-style:none;mso-fit-shape-to-text:t;">
             <w10:wrap type="none"/>
             <v:textbox inset="0,0,0,0">
               <w:txbxContent>
@@ -2027,7 +2083,7 @@
       </w:r>
       <w:r>
         <w:pict>
-          <v:shape id="DocuMindTextBox79" type="#_x0000_t202" stroked="f" filled="f" o:allowincell="f" style="position:absolute;margin-left:293.456pt;margin-top:458.497pt;width:64.340pt;height:33.483pt;z-index:251659264;mso-position-horizontal-relative:page;mso-position-vertical-relative:page;mso-wrap-style:none;mso-fit-shape-to-text:t;">
+          <v:shape id="DocuMindTextBox86" type="#_x0000_t202" stroked="f" filled="f" o:allowincell="f" style="position:absolute;margin-left:293.456pt;margin-top:458.497pt;width:64.340pt;height:33.483pt;z-index:251659264;mso-position-horizontal-relative:page;mso-position-vertical-relative:page;mso-wrap-style:none;mso-fit-shape-to-text:t;">
             <w10:wrap type="none"/>
             <v:textbox inset="0,0,0,0">
               <w:txbxContent>
@@ -2054,7 +2110,7 @@
       </w:r>
       <w:r>
         <w:pict>
-          <v:shape id="DocuMindTextBox80" type="#_x0000_t202" stroked="f" filled="f" o:allowincell="f" style="position:absolute;margin-left:449.618pt;margin-top:458.497pt;width:64.678pt;height:33.483pt;z-index:251659264;mso-position-horizontal-relative:page;mso-position-vertical-relative:page;mso-wrap-style:none;mso-fit-shape-to-text:t;">
+          <v:shape id="DocuMindTextBox87" type="#_x0000_t202" stroked="f" filled="f" o:allowincell="f" style="position:absolute;margin-left:449.618pt;margin-top:458.497pt;width:64.678pt;height:33.483pt;z-index:251659264;mso-position-horizontal-relative:page;mso-position-vertical-relative:page;mso-wrap-style:none;mso-fit-shape-to-text:t;">
             <w10:wrap type="none"/>
             <v:textbox inset="0,0,0,0">
               <w:txbxContent>
@@ -2081,7 +2137,7 @@
       </w:r>
       <w:r>
         <w:pict>
-          <v:shape id="DocuMindTextBox81" type="#_x0000_t202" stroked="f" filled="f" o:allowincell="f" style="position:absolute;margin-left:66.799pt;margin-top:438.961pt;width:17.628pt;height:33.483pt;z-index:251659264;mso-position-horizontal-relative:page;mso-position-vertical-relative:page;mso-wrap-style:none;mso-fit-shape-to-text:t;">
+          <v:shape id="DocuMindTextBox88" type="#_x0000_t202" stroked="f" filled="f" o:allowincell="f" style="position:absolute;margin-left:66.799pt;margin-top:438.961pt;width:17.628pt;height:33.483pt;z-index:251659264;mso-position-horizontal-relative:page;mso-position-vertical-relative:page;mso-wrap-style:none;mso-fit-shape-to-text:t;">
             <w10:wrap type="none"/>
             <v:textbox inset="0,0,0,0">
               <w:txbxContent>
@@ -2108,7 +2164,7 @@
       </w:r>
       <w:r>
         <w:pict>
-          <v:shape id="DocuMindTextBox82" type="#_x0000_t202" stroked="f" filled="f" o:allowincell="f" style="position:absolute;margin-left:68.553pt;margin-top:389.488pt;width:15.918pt;height:33.483pt;z-index:251659264;mso-position-horizontal-relative:page;mso-position-vertical-relative:page;mso-wrap-style:none;mso-fit-shape-to-text:t;">
+          <v:shape id="DocuMindTextBox89" type="#_x0000_t202" stroked="f" filled="f" o:allowincell="f" style="position:absolute;margin-left:68.553pt;margin-top:389.488pt;width:15.918pt;height:33.483pt;z-index:251659264;mso-position-horizontal-relative:page;mso-position-vertical-relative:page;mso-wrap-style:none;mso-fit-shape-to-text:t;">
             <w10:wrap type="none"/>
             <v:textbox inset="0,0,0,0">
               <w:txbxContent>
@@ -2135,7 +2191,7 @@
       </w:r>
       <w:r>
         <w:pict>
-          <v:shape id="DocuMindTextBox83" type="#_x0000_t202" stroked="f" filled="f" o:allowincell="f" style="position:absolute;margin-left:60.020pt;margin-top:340.016pt;width:24.003pt;height:33.483pt;z-index:251659264;mso-position-horizontal-relative:page;mso-position-vertical-relative:page;mso-wrap-style:none;mso-fit-shape-to-text:t;">
+          <v:shape id="DocuMindTextBox90" type="#_x0000_t202" stroked="f" filled="f" o:allowincell="f" style="position:absolute;margin-left:60.020pt;margin-top:340.016pt;width:24.003pt;height:33.483pt;z-index:251659264;mso-position-horizontal-relative:page;mso-position-vertical-relative:page;mso-wrap-style:none;mso-fit-shape-to-text:t;">
             <w10:wrap type="none"/>
             <v:textbox inset="0,0,0,0">
               <w:txbxContent>
@@ -2162,7 +2218,7 @@
       </w:r>
       <w:r>
         <w:pict>
-          <v:shape id="DocuMindTextBox84" type="#_x0000_t202" stroked="f" filled="f" o:allowincell="f" style="position:absolute;margin-left:61.775pt;margin-top:290.543pt;width:22.293pt;height:33.483pt;z-index:251659264;mso-position-horizontal-relative:page;mso-position-vertical-relative:page;mso-wrap-style:none;mso-fit-shape-to-text:t;">
+          <v:shape id="DocuMindTextBox91" type="#_x0000_t202" stroked="f" filled="f" o:allowincell="f" style="position:absolute;margin-left:61.775pt;margin-top:290.543pt;width:22.293pt;height:33.483pt;z-index:251659264;mso-position-horizontal-relative:page;mso-position-vertical-relative:page;mso-wrap-style:none;mso-fit-shape-to-text:t;">
             <w10:wrap type="none"/>
             <v:textbox inset="0,0,0,0">
               <w:txbxContent>
@@ -2189,7 +2245,7 @@
       </w:r>
       <w:r>
         <w:pict>
-          <v:shape id="DocuMindTextBox85" type="#_x0000_t202" stroked="f" filled="f" o:allowincell="f" style="position:absolute;margin-left:54.575pt;margin-top:241.071pt;width:29.491pt;height:33.483pt;z-index:251659264;mso-position-horizontal-relative:page;mso-position-vertical-relative:page;mso-wrap-style:none;mso-fit-shape-to-text:t;">
+          <v:shape id="DocuMindTextBox92" type="#_x0000_t202" stroked="f" filled="f" o:allowincell="f" style="position:absolute;margin-left:54.575pt;margin-top:241.071pt;width:29.491pt;height:33.483pt;z-index:251659264;mso-position-horizontal-relative:page;mso-position-vertical-relative:page;mso-wrap-style:none;mso-fit-shape-to-text:t;">
             <w10:wrap type="none"/>
             <v:textbox inset="0,0,0,0">
               <w:txbxContent>
@@ -2216,7 +2272,7 @@
       </w:r>
       <w:r>
         <w:pict>
-          <v:shape id="DocuMindTextBox86" type="#_x0000_t202" stroked="f" filled="f" o:allowincell="f" style="position:absolute;margin-left:162.789pt;margin-top:548.528pt;width:74.227pt;height:33.397pt;z-index:251659264;mso-position-horizontal-relative:page;mso-position-vertical-relative:page;mso-wrap-style:none;mso-fit-shape-to-text:t;">
+          <v:shape id="DocuMindTextBox93" type="#_x0000_t202" stroked="f" filled="f" o:allowincell="f" style="position:absolute;margin-left:162.789pt;margin-top:548.528pt;width:74.227pt;height:33.397pt;z-index:251659264;mso-position-horizontal-relative:page;mso-position-vertical-relative:page;mso-wrap-style:none;mso-fit-shape-to-text:t;">
             <w10:wrap type="none"/>
             <v:textbox inset="0,0,0,0">
               <w:txbxContent>
@@ -2243,7 +2299,7 @@
       </w:r>
       <w:r>
         <w:pict>
-          <v:shape id="DocuMindTextBox87" type="#_x0000_t202" stroked="f" filled="f" o:allowincell="f" style="position:absolute;margin-left:297.282pt;margin-top:548.528pt;width:79.909pt;height:33.397pt;z-index:251659264;mso-position-horizontal-relative:page;mso-position-vertical-relative:page;mso-wrap-style:none;mso-fit-shape-to-text:t;">
+          <v:shape id="DocuMindTextBox94" type="#_x0000_t202" stroked="f" filled="f" o:allowincell="f" style="position:absolute;margin-left:297.282pt;margin-top:548.528pt;width:79.909pt;height:33.397pt;z-index:251659264;mso-position-horizontal-relative:page;mso-position-vertical-relative:page;mso-wrap-style:none;mso-fit-shape-to-text:t;">
             <w10:wrap type="none"/>
             <v:textbox inset="0,0,0,0">
               <w:txbxContent>
@@ -2270,7 +2326,7 @@
       </w:r>
       <w:r>
         <w:pict>
-          <v:shape id="DocuMindTextBox88" type="#_x0000_t202" stroked="f" filled="f" o:allowincell="f" style="position:absolute;margin-left:438.042pt;margin-top:548.528pt;width:80.245pt;height:33.397pt;z-index:251659264;mso-position-horizontal-relative:page;mso-position-vertical-relative:page;mso-wrap-style:none;mso-fit-shape-to-text:t;">
+          <v:shape id="DocuMindTextBox95" type="#_x0000_t202" stroked="f" filled="f" o:allowincell="f" style="position:absolute;margin-left:438.042pt;margin-top:548.528pt;width:80.245pt;height:33.397pt;z-index:251659264;mso-position-horizontal-relative:page;mso-position-vertical-relative:page;mso-wrap-style:none;mso-fit-shape-to-text:t;">
             <w10:wrap type="none"/>
             <v:textbox inset="0,0,0,0">
               <w:txbxContent>
@@ -2297,7 +2353,7 @@
       </w:r>
       <w:r>
         <w:pict>
-          <v:shape id="DocuMindTextBox89" type="#_x0000_t202" stroked="f" filled="f" o:allowincell="f" style="position:absolute;margin-left:116.556pt;margin-top:807.689pt;width:58.467pt;height:33.397pt;z-index:251659264;mso-position-horizontal-relative:page;mso-position-vertical-relative:page;mso-wrap-style:none;mso-fit-shape-to-text:t;">
+          <v:shape id="DocuMindTextBox96" type="#_x0000_t202" stroked="f" filled="f" o:allowincell="f" style="position:absolute;margin-left:116.556pt;margin-top:807.689pt;width:58.467pt;height:33.397pt;z-index:251659264;mso-position-horizontal-relative:page;mso-position-vertical-relative:page;mso-wrap-style:none;mso-fit-shape-to-text:t;">
             <w10:wrap type="none"/>
             <v:textbox inset="0,0,0,0">
               <w:txbxContent>
@@ -2324,7 +2380,7 @@
       </w:r>
       <w:r>
         <w:pict>
-          <v:shape id="DocuMindTextBox90" type="#_x0000_t202" stroked="f" filled="f" o:allowincell="f" style="position:absolute;margin-left:204.052pt;margin-top:807.689pt;width:64.148pt;height:33.397pt;z-index:251659264;mso-position-horizontal-relative:page;mso-position-vertical-relative:page;mso-wrap-style:none;mso-fit-shape-to-text:t;">
+          <v:shape id="DocuMindTextBox97" type="#_x0000_t202" stroked="f" filled="f" o:allowincell="f" style="position:absolute;margin-left:204.052pt;margin-top:807.689pt;width:64.148pt;height:33.397pt;z-index:251659264;mso-position-horizontal-relative:page;mso-position-vertical-relative:page;mso-wrap-style:none;mso-fit-shape-to-text:t;">
             <w10:wrap type="none"/>
             <v:textbox inset="0,0,0,0">
               <w:txbxContent>
@@ -2351,7 +2407,7 @@
       </w:r>
       <w:r>
         <w:pict>
-          <v:shape id="DocuMindTextBox91" type="#_x0000_t202" stroked="f" filled="f" o:allowincell="f" style="position:absolute;margin-left:294.221pt;margin-top:807.689pt;width:64.485pt;height:33.397pt;z-index:251659264;mso-position-horizontal-relative:page;mso-position-vertical-relative:page;mso-wrap-style:none;mso-fit-shape-to-text:t;">
+          <v:shape id="DocuMindTextBox98" type="#_x0000_t202" stroked="f" filled="f" o:allowincell="f" style="position:absolute;margin-left:294.221pt;margin-top:807.689pt;width:64.485pt;height:33.397pt;z-index:251659264;mso-position-horizontal-relative:page;mso-position-vertical-relative:page;mso-wrap-style:none;mso-fit-shape-to-text:t;">
             <w10:wrap type="none"/>
             <v:textbox inset="0,0,0,0">
               <w:txbxContent>
@@ -2378,7 +2434,7 @@
       </w:r>
       <w:r>
         <w:pict>
-          <v:shape id="DocuMindTextBox92" type="#_x0000_t202" stroked="f" filled="f" o:allowincell="f" style="position:absolute;margin-left:383.928pt;margin-top:807.689pt;width:64.842pt;height:33.397pt;z-index:251659264;mso-position-horizontal-relative:page;mso-position-vertical-relative:page;mso-wrap-style:none;mso-fit-shape-to-text:t;">
+          <v:shape id="DocuMindTextBox99" type="#_x0000_t202" stroked="f" filled="f" o:allowincell="f" style="position:absolute;margin-left:383.928pt;margin-top:807.689pt;width:64.842pt;height:33.397pt;z-index:251659264;mso-position-horizontal-relative:page;mso-position-vertical-relative:page;mso-wrap-style:none;mso-fit-shape-to-text:t;">
             <w10:wrap type="none"/>
             <v:textbox inset="0,0,0,0">
               <w:txbxContent>
@@ -2405,7 +2461,7 @@
       </w:r>
       <w:r>
         <w:pict>
-          <v:shape id="DocuMindTextBox93" type="#_x0000_t202" stroked="f" filled="f" o:allowincell="f" style="position:absolute;margin-left:474.194pt;margin-top:807.689pt;width:64.990pt;height:33.397pt;z-index:251659264;mso-position-horizontal-relative:page;mso-position-vertical-relative:page;mso-wrap-style:none;mso-fit-shape-to-text:t;">
+          <v:shape id="DocuMindTextBox100" type="#_x0000_t202" stroked="f" filled="f" o:allowincell="f" style="position:absolute;margin-left:474.194pt;margin-top:807.689pt;width:64.990pt;height:33.397pt;z-index:251659264;mso-position-horizontal-relative:page;mso-position-vertical-relative:page;mso-wrap-style:none;mso-fit-shape-to-text:t;">
             <w10:wrap type="none"/>
             <v:textbox inset="0,0,0,0">
               <w:txbxContent>
@@ -2432,7 +2488,7 @@
       </w:r>
       <w:r>
         <w:pict>
-          <v:shape id="DocuMindTextBox94" type="#_x0000_t202" stroked="f" filled="f" o:allowincell="f" style="position:absolute;margin-left:68.567pt;margin-top:788.214pt;width:17.582pt;height:33.397pt;z-index:251659264;mso-position-horizontal-relative:page;mso-position-vertical-relative:page;mso-wrap-style:none;mso-fit-shape-to-text:t;">
+          <v:shape id="DocuMindTextBox101" type="#_x0000_t202" stroked="f" filled="f" o:allowincell="f" style="position:absolute;margin-left:68.567pt;margin-top:788.214pt;width:17.582pt;height:33.397pt;z-index:251659264;mso-position-horizontal-relative:page;mso-position-vertical-relative:page;mso-wrap-style:none;mso-fit-shape-to-text:t;">
             <w10:wrap type="none"/>
             <v:textbox inset="0,0,0,0">
               <w:txbxContent>
@@ -2459,7 +2515,7 @@
       </w:r>
       <w:r>
         <w:pict>
-          <v:shape id="DocuMindTextBox95" type="#_x0000_t202" stroked="f" filled="f" o:allowincell="f" style="position:absolute;margin-left:61.810pt;margin-top:746.384pt;width:23.937pt;height:33.397pt;z-index:251659264;mso-position-horizontal-relative:page;mso-position-vertical-relative:page;mso-wrap-style:none;mso-fit-shape-to-text:t;">
+          <v:shape id="DocuMindTextBox102" type="#_x0000_t202" stroked="f" filled="f" o:allowincell="f" style="position:absolute;margin-left:61.810pt;margin-top:746.384pt;width:23.937pt;height:33.397pt;z-index:251659264;mso-position-horizontal-relative:page;mso-position-vertical-relative:page;mso-wrap-style:none;mso-fit-shape-to-text:t;">
             <w10:wrap type="none"/>
             <v:textbox inset="0,0,0,0">
               <w:txbxContent>
@@ -2486,7 +2542,7 @@
       </w:r>
       <w:r>
         <w:pict>
-          <v:shape id="DocuMindTextBox96" type="#_x0000_t202" stroked="f" filled="f" o:allowincell="f" style="position:absolute;margin-left:56.381pt;margin-top:704.555pt;width:29.408pt;height:33.397pt;z-index:251659264;mso-position-horizontal-relative:page;mso-position-vertical-relative:page;mso-wrap-style:none;mso-fit-shape-to-text:t;">
+          <v:shape id="DocuMindTextBox103" type="#_x0000_t202" stroked="f" filled="f" o:allowincell="f" style="position:absolute;margin-left:56.381pt;margin-top:704.555pt;width:29.408pt;height:33.397pt;z-index:251659264;mso-position-horizontal-relative:page;mso-position-vertical-relative:page;mso-wrap-style:none;mso-fit-shape-to-text:t;">
             <w10:wrap type="none"/>
             <v:textbox inset="0,0,0,0">
               <w:txbxContent>
@@ -2513,7 +2569,7 @@
       </w:r>
       <w:r>
         <w:pict>
-          <v:shape id="DocuMindTextBox97" type="#_x0000_t202" stroked="f" filled="f" o:allowincell="f" style="position:absolute;margin-left:56.116pt;margin-top:662.726pt;width:29.955pt;height:33.397pt;z-index:251659264;mso-position-horizontal-relative:page;mso-position-vertical-relative:page;mso-wrap-style:none;mso-fit-shape-to-text:t;">
+          <v:shape id="DocuMindTextBox104" type="#_x0000_t202" stroked="f" filled="f" o:allowincell="f" style="position:absolute;margin-left:56.116pt;margin-top:662.726pt;width:29.955pt;height:33.397pt;z-index:251659264;mso-position-horizontal-relative:page;mso-position-vertical-relative:page;mso-wrap-style:none;mso-fit-shape-to-text:t;">
             <w10:wrap type="none"/>
             <v:textbox inset="0,0,0,0">
               <w:txbxContent>
@@ -2540,7 +2596,7 @@
       </w:r>
       <w:r>
         <w:pict>
-          <v:shape id="DocuMindTextBox98" type="#_x0000_t202" stroked="f" filled="f" o:allowincell="f" style="position:absolute;margin-left:55.934pt;margin-top:620.896pt;width:30.313pt;height:33.397pt;z-index:251659264;mso-position-horizontal-relative:page;mso-position-vertical-relative:page;mso-wrap-style:none;mso-fit-shape-to-text:t;">
+          <v:shape id="DocuMindTextBox105" type="#_x0000_t202" stroked="f" filled="f" o:allowincell="f" style="position:absolute;margin-left:55.934pt;margin-top:620.896pt;width:30.313pt;height:33.397pt;z-index:251659264;mso-position-horizontal-relative:page;mso-position-vertical-relative:page;mso-wrap-style:none;mso-fit-shape-to-text:t;">
             <w10:wrap type="none"/>
             <v:textbox inset="0,0,0,0">
               <w:txbxContent>
@@ -2567,7 +2623,7 @@
       </w:r>
       <w:r>
         <w:pict>
-          <v:shape id="DocuMindTextBox99" type="#_x0000_t202" stroked="f" filled="f" o:allowincell="f" style="position:absolute;margin-left:54.968pt;margin-top:579.067pt;width:30.460pt;height:33.397pt;z-index:251659264;mso-position-horizontal-relative:page;mso-position-vertical-relative:page;mso-wrap-style:none;mso-fit-shape-to-text:t;">
+          <v:shape id="DocuMindTextBox106" type="#_x0000_t202" stroked="f" filled="f" o:allowincell="f" style="position:absolute;margin-left:54.968pt;margin-top:579.067pt;width:30.460pt;height:33.397pt;z-index:251659264;mso-position-horizontal-relative:page;mso-position-vertical-relative:page;mso-wrap-style:none;mso-fit-shape-to-text:t;">
             <w10:wrap type="none"/>
             <v:textbox inset="0,0,0,0">
               <w:txbxContent>
@@ -2614,7 +2670,15 @@
       </w:r>
       <w:r>
         <w:pict>
-          <v:shape id="DocuMindTextBox100" type="#_x0000_t202" stroked="f" filled="f" o:allowincell="f" style="position:absolute;margin-left:67.299pt;margin-top:56.415pt;width:160.847pt;height:44.529pt;z-index:251659264;mso-position-horizontal-relative:page;mso-position-vertical-relative:page;mso-wrap-style:none;mso-fit-shape-to-text:t;">
+          <v:shape id="DocuMindVector107" type="#_x0000_t75" stroked="f" o:allowincell="f" style="position:absolute;margin-left:-1.336pt;margin-top:674.270pt;width:735.909pt;height:351.919pt;z-index:0;mso-position-horizontal-relative:page;mso-position-vertical-relative:page;mso-wrap-style:none;">
+            <w10:wrap type="none"/>
+            <v:imagedata r:id="rId16" o:title=""/>
+          </v:shape>
+        </w:pict>
+      </w:r>
+      <w:r>
+        <w:pict>
+          <v:shape id="DocuMindTextBox108" type="#_x0000_t202" stroked="f" filled="f" o:allowincell="f" style="position:absolute;margin-left:67.299pt;margin-top:56.415pt;width:160.847pt;height:44.529pt;z-index:251659264;mso-position-horizontal-relative:page;mso-position-vertical-relative:page;mso-wrap-style:none;mso-fit-shape-to-text:t;">
             <w10:wrap type="none"/>
             <v:textbox inset="0,0,0,0">
               <w:txbxContent>
@@ -2641,7 +2705,7 @@
       </w:r>
       <w:r>
         <w:pict>
-          <v:shape id="DocuMindTextBox101" type="#_x0000_t202" stroked="f" filled="f" o:allowincell="f" style="position:absolute;margin-left:67.299pt;margin-top:114.291pt;width:463.150pt;height:31.682pt;z-index:251659264;mso-position-horizontal-relative:page;mso-position-vertical-relative:page;mso-wrap-style:none;mso-fit-shape-to-text:t;">
+          <v:shape id="DocuMindTextBox109" type="#_x0000_t202" stroked="f" filled="f" o:allowincell="f" style="position:absolute;margin-left:67.299pt;margin-top:114.291pt;width:463.150pt;height:31.682pt;z-index:251659264;mso-position-horizontal-relative:page;mso-position-vertical-relative:page;mso-wrap-style:none;mso-fit-shape-to-text:t;">
             <w10:wrap type="none"/>
             <v:textbox inset="0,0,0,0">
               <w:txbxContent>
@@ -2668,7 +2732,7 @@
       </w:r>
       <w:r>
         <w:pict>
-          <v:shape id="DocuMindTextBox102" type="#_x0000_t202" stroked="f" filled="f" o:allowincell="f" style="position:absolute;margin-left:67.299pt;margin-top:137.410pt;width:480.152pt;height:31.682pt;z-index:251659264;mso-position-horizontal-relative:page;mso-position-vertical-relative:page;mso-wrap-style:none;mso-fit-shape-to-text:t;">
+          <v:shape id="DocuMindTextBox110" type="#_x0000_t202" stroked="f" filled="f" o:allowincell="f" style="position:absolute;margin-left:67.299pt;margin-top:137.410pt;width:480.152pt;height:31.682pt;z-index:251659264;mso-position-horizontal-relative:page;mso-position-vertical-relative:page;mso-wrap-style:none;mso-fit-shape-to-text:t;">
             <w10:wrap type="none"/>
             <v:textbox inset="0,0,0,0">
               <w:txbxContent>
@@ -2695,7 +2759,7 @@
       </w:r>
       <w:r>
         <w:pict>
-          <v:shape id="DocuMindTextBox103" type="#_x0000_t202" stroked="f" filled="f" o:allowincell="f" style="position:absolute;margin-left:67.299pt;margin-top:160.529pt;width:407.570pt;height:31.682pt;z-index:251659264;mso-position-horizontal-relative:page;mso-position-vertical-relative:page;mso-wrap-style:none;mso-fit-shape-to-text:t;">
+          <v:shape id="DocuMindTextBox111" type="#_x0000_t202" stroked="f" filled="f" o:allowincell="f" style="position:absolute;margin-left:67.299pt;margin-top:160.529pt;width:407.570pt;height:31.682pt;z-index:251659264;mso-position-horizontal-relative:page;mso-position-vertical-relative:page;mso-wrap-style:none;mso-fit-shape-to-text:t;">
             <w10:wrap type="none"/>
             <v:textbox inset="0,0,0,0">
               <w:txbxContent>
@@ -2722,7 +2786,7 @@
       </w:r>
       <w:r>
         <w:pict>
-          <v:shape id="DocuMindTextBox104" type="#_x0000_t202" stroked="f" filled="f" o:allowincell="f" style="position:absolute;margin-left:67.299pt;margin-top:183.648pt;width:200.965pt;height:31.682pt;z-index:251659264;mso-position-horizontal-relative:page;mso-position-vertical-relative:page;mso-wrap-style:none;mso-fit-shape-to-text:t;">
+          <v:shape id="DocuMindTextBox112" type="#_x0000_t202" stroked="f" filled="f" o:allowincell="f" style="position:absolute;margin-left:67.299pt;margin-top:183.648pt;width:200.965pt;height:31.682pt;z-index:251659264;mso-position-horizontal-relative:page;mso-position-vertical-relative:page;mso-wrap-style:none;mso-fit-shape-to-text:t;">
             <w10:wrap type="none"/>
             <v:textbox inset="0,0,0,0">
               <w:txbxContent>
@@ -2749,7 +2813,7 @@
       </w:r>
       <w:r>
         <w:pict>
-          <v:shape id="DocuMindTextBox105" type="#_x0000_t202" stroked="f" filled="f" o:allowincell="f" style="position:absolute;margin-left:67.299pt;margin-top:277.434pt;width:164.990pt;height:44.529pt;z-index:251659264;mso-position-horizontal-relative:page;mso-position-vertical-relative:page;mso-wrap-style:none;mso-fit-shape-to-text:t;">
+          <v:shape id="DocuMindTextBox113" type="#_x0000_t202" stroked="f" filled="f" o:allowincell="f" style="position:absolute;margin-left:67.299pt;margin-top:277.434pt;width:164.990pt;height:44.529pt;z-index:251659264;mso-position-horizontal-relative:page;mso-position-vertical-relative:page;mso-wrap-style:none;mso-fit-shape-to-text:t;">
             <w10:wrap type="none"/>
             <v:textbox inset="0,0,0,0">
               <w:txbxContent>
@@ -2776,7 +2840,7 @@
       </w:r>
       <w:r>
         <w:pict>
-          <v:shape id="DocuMindTextBox106" type="#_x0000_t202" stroked="f" filled="f" o:allowincell="f" style="position:absolute;margin-left:100.837pt;margin-top:339.934pt;width:242.142pt;height:31.682pt;z-index:251659264;mso-position-horizontal-relative:page;mso-position-vertical-relative:page;mso-wrap-style:none;mso-fit-shape-to-text:t;">
+          <v:shape id="DocuMindTextBox114" type="#_x0000_t202" stroked="f" filled="f" o:allowincell="f" style="position:absolute;margin-left:100.837pt;margin-top:339.934pt;width:242.142pt;height:31.682pt;z-index:251659264;mso-position-horizontal-relative:page;mso-position-vertical-relative:page;mso-wrap-style:none;mso-fit-shape-to-text:t;">
             <w10:wrap type="none"/>
             <v:textbox inset="0,0,0,0">
               <w:txbxContent>
@@ -2803,7 +2867,7 @@
       </w:r>
       <w:r>
         <w:pict>
-          <v:shape id="DocuMindTextBox107" type="#_x0000_t202" stroked="f" filled="f" o:allowincell="f" style="position:absolute;margin-left:89.450pt;margin-top:339.934pt;width:12.612pt;height:31.682pt;z-index:251659264;mso-position-horizontal-relative:page;mso-position-vertical-relative:page;mso-wrap-style:none;mso-fit-shape-to-text:t;">
+          <v:shape id="DocuMindTextBox115" type="#_x0000_t202" stroked="f" filled="f" o:allowincell="f" style="position:absolute;margin-left:89.450pt;margin-top:339.934pt;width:12.612pt;height:31.682pt;z-index:251659264;mso-position-horizontal-relative:page;mso-position-vertical-relative:page;mso-wrap-style:none;mso-fit-shape-to-text:t;">
             <w10:wrap type="none"/>
             <v:textbox inset="0,0,0,0">
               <w:txbxContent>
@@ -2830,7 +2894,7 @@
       </w:r>
       <w:r>
         <w:pict>
-          <v:shape id="DocuMindTextBox108" type="#_x0000_t202" stroked="f" filled="f" o:allowincell="f" style="position:absolute;margin-left:100.837pt;margin-top:371.376pt;width:313.166pt;height:31.682pt;z-index:251659264;mso-position-horizontal-relative:page;mso-position-vertical-relative:page;mso-wrap-style:none;mso-fit-shape-to-text:t;">
+          <v:shape id="DocuMindTextBox116" type="#_x0000_t202" stroked="f" filled="f" o:allowincell="f" style="position:absolute;margin-left:100.837pt;margin-top:371.376pt;width:313.166pt;height:31.682pt;z-index:251659264;mso-position-horizontal-relative:page;mso-position-vertical-relative:page;mso-wrap-style:none;mso-fit-shape-to-text:t;">
             <w10:wrap type="none"/>
             <v:textbox inset="0,0,0,0">
               <w:txbxContent>
@@ -2857,7 +2921,7 @@
       </w:r>
       <w:r>
         <w:pict>
-          <v:shape id="DocuMindTextBox109" type="#_x0000_t202" stroked="f" filled="f" o:allowincell="f" style="position:absolute;margin-left:84.119pt;margin-top:371.376pt;width:17.944pt;height:31.682pt;z-index:251659264;mso-position-horizontal-relative:page;mso-position-vertical-relative:page;mso-wrap-style:none;mso-fit-shape-to-text:t;">
+          <v:shape id="DocuMindTextBox117" type="#_x0000_t202" stroked="f" filled="f" o:allowincell="f" style="position:absolute;margin-left:84.119pt;margin-top:371.376pt;width:17.944pt;height:31.682pt;z-index:251659264;mso-position-horizontal-relative:page;mso-position-vertical-relative:page;mso-wrap-style:none;mso-fit-shape-to-text:t;">
             <w10:wrap type="none"/>
             <v:textbox inset="0,0,0,0">
               <w:txbxContent>
@@ -2884,7 +2948,7 @@
       </w:r>
       <w:r>
         <w:pict>
-          <v:shape id="DocuMindTextBox110" type="#_x0000_t202" stroked="f" filled="f" o:allowincell="f" style="position:absolute;margin-left:100.837pt;margin-top:402.818pt;width:361.528pt;height:31.682pt;z-index:251659264;mso-position-horizontal-relative:page;mso-position-vertical-relative:page;mso-wrap-style:none;mso-fit-shape-to-text:t;">
+          <v:shape id="DocuMindTextBox118" type="#_x0000_t202" stroked="f" filled="f" o:allowincell="f" style="position:absolute;margin-left:100.837pt;margin-top:402.818pt;width:361.528pt;height:31.682pt;z-index:251659264;mso-position-horizontal-relative:page;mso-position-vertical-relative:page;mso-wrap-style:none;mso-fit-shape-to-text:t;">
             <w10:wrap type="none"/>
             <v:textbox inset="0,0,0,0">
               <w:txbxContent>
@@ -2911,7 +2975,7 @@
       </w:r>
       <w:r>
         <w:pict>
-          <v:shape id="DocuMindTextBox111" type="#_x0000_t202" stroked="f" filled="f" o:allowincell="f" style="position:absolute;margin-left:83.815pt;margin-top:402.818pt;width:18.247pt;height:31.682pt;z-index:251659264;mso-position-horizontal-relative:page;mso-position-vertical-relative:page;mso-wrap-style:none;mso-fit-shape-to-text:t;">
+          <v:shape id="DocuMindTextBox119" type="#_x0000_t202" stroked="f" filled="f" o:allowincell="f" style="position:absolute;margin-left:83.815pt;margin-top:402.818pt;width:18.247pt;height:31.682pt;z-index:251659264;mso-position-horizontal-relative:page;mso-position-vertical-relative:page;mso-wrap-style:none;mso-fit-shape-to-text:t;">
             <w10:wrap type="none"/>
             <v:textbox inset="0,0,0,0">
               <w:txbxContent>
@@ -2938,7 +3002,7 @@
       </w:r>
       <w:r>
         <w:pict>
-          <v:shape id="DocuMindTextBox112" type="#_x0000_t202" stroked="f" filled="f" o:allowincell="f" style="position:absolute;margin-left:67.299pt;margin-top:482.732pt;width:163.185pt;height:44.530pt;z-index:251659264;mso-position-horizontal-relative:page;mso-position-vertical-relative:page;mso-wrap-style:none;mso-fit-shape-to-text:t;">
+          <v:shape id="DocuMindTextBox120" type="#_x0000_t202" stroked="f" filled="f" o:allowincell="f" style="position:absolute;margin-left:67.299pt;margin-top:482.732pt;width:163.185pt;height:44.530pt;z-index:251659264;mso-position-horizontal-relative:page;mso-position-vertical-relative:page;mso-wrap-style:none;mso-fit-shape-to-text:t;">
             <w10:wrap type="none"/>
             <v:textbox inset="0,0,0,0">
               <w:txbxContent>
@@ -2965,7 +3029,7 @@
       </w:r>
       <w:r>
         <w:pict>
-          <v:shape id="DocuMindTextBox113" type="#_x0000_t202" stroked="f" filled="f" o:allowincell="f" style="position:absolute;margin-left:67.299pt;margin-top:560.029pt;width:463.150pt;height:31.682pt;z-index:251659264;mso-position-horizontal-relative:page;mso-position-vertical-relative:page;mso-wrap-style:none;mso-fit-shape-to-text:t;">
+          <v:shape id="DocuMindTextBox121" type="#_x0000_t202" stroked="f" filled="f" o:allowincell="f" style="position:absolute;margin-left:67.299pt;margin-top:560.029pt;width:463.150pt;height:31.682pt;z-index:251659264;mso-position-horizontal-relative:page;mso-position-vertical-relative:page;mso-wrap-style:none;mso-fit-shape-to-text:t;">
             <w10:wrap type="none"/>
             <v:textbox inset="0,0,0,0">
               <w:txbxContent>
@@ -2992,7 +3056,7 @@
       </w:r>
       <w:r>
         <w:pict>
-          <v:shape id="DocuMindTextBox114" type="#_x0000_t202" stroked="f" filled="f" o:allowincell="f" style="position:absolute;margin-left:67.299pt;margin-top:591.471pt;width:480.152pt;height:31.682pt;z-index:251659264;mso-position-horizontal-relative:page;mso-position-vertical-relative:page;mso-wrap-style:none;mso-fit-shape-to-text:t;">
+          <v:shape id="DocuMindTextBox122" type="#_x0000_t202" stroked="f" filled="f" o:allowincell="f" style="position:absolute;margin-left:67.299pt;margin-top:591.471pt;width:480.152pt;height:31.682pt;z-index:251659264;mso-position-horizontal-relative:page;mso-position-vertical-relative:page;mso-wrap-style:none;mso-fit-shape-to-text:t;">
             <w10:wrap type="none"/>
             <v:textbox inset="0,0,0,0">
               <w:txbxContent>
@@ -3019,7 +3083,7 @@
       </w:r>
       <w:r>
         <w:pict>
-          <v:shape id="DocuMindTextBox115" type="#_x0000_t202" stroked="f" filled="f" o:allowincell="f" style="position:absolute;margin-left:67.299pt;margin-top:622.913pt;width:407.570pt;height:31.682pt;z-index:251659264;mso-position-horizontal-relative:page;mso-position-vertical-relative:page;mso-wrap-style:none;mso-fit-shape-to-text:t;">
+          <v:shape id="DocuMindTextBox123" type="#_x0000_t202" stroked="f" filled="f" o:allowincell="f" style="position:absolute;margin-left:67.299pt;margin-top:622.913pt;width:407.570pt;height:31.682pt;z-index:251659264;mso-position-horizontal-relative:page;mso-position-vertical-relative:page;mso-wrap-style:none;mso-fit-shape-to-text:t;">
             <w10:wrap type="none"/>
             <v:textbox inset="0,0,0,0">
               <w:txbxContent>
@@ -3046,7 +3110,7 @@
       </w:r>
       <w:r>
         <w:pict>
-          <v:shape id="DocuMindTextBox116" type="#_x0000_t202" stroked="f" filled="f" o:allowincell="f" style="position:absolute;margin-left:67.299pt;margin-top:654.355pt;width:200.965pt;height:31.682pt;z-index:251659264;mso-position-horizontal-relative:page;mso-position-vertical-relative:page;mso-wrap-style:none;mso-fit-shape-to-text:t;">
+          <v:shape id="DocuMindTextBox124" type="#_x0000_t202" stroked="f" filled="f" o:allowincell="f" style="position:absolute;margin-left:67.299pt;margin-top:654.355pt;width:200.965pt;height:31.682pt;z-index:251659264;mso-position-horizontal-relative:page;mso-position-vertical-relative:page;mso-wrap-style:none;mso-fit-shape-to-text:t;">
             <w10:wrap type="none"/>
             <v:textbox inset="0,0,0,0">
               <w:txbxContent>

</xml_diff>

<commit_message>
Step 62.2 - Build page-level editable paragraph regions
</commit_message>
<xml_diff>
--- a/output/output.docx
+++ b/output/output.docx
@@ -69,61 +69,7 @@
       </w:r>
       <w:r>
         <w:pict>
-          <v:shape id="DocuMindTextBox8" type="#_x0000_t202" stroked="f" filled="f" o:allowincell="f" style="position:absolute;margin-left:50.427pt;margin-top:196.565pt;width:282.814pt;height:106.314pt;z-index:251659264;mso-position-horizontal-relative:page;mso-position-vertical-relative:page;mso-wrap-style:none;mso-fit-shape-to-text:t;">
-            <w10:wrap type="none"/>
-            <v:textbox inset="0,0,0,0">
-              <w:txbxContent>
-                <w:p>
-                  <w:pPr>
-                    <w:spacing w:before="0" w:after="0" w:lineRule="exact" w:line="2006"/>
-                    <w:ind w:left="0" w:right="0" w:firstLine="0"/>
-                  </w:pPr>
-                  <w:r>
-                    <w:rPr>
-                      <w:rFonts w:ascii="Repo-Extra Bold" w:hAnsi="Repo-Extra Bold" w:eastAsia="Repo-Extra Bold" w:cs="Repo-Extra Bold"/>
-                      <w:b/>
-                      <w:i w:val="0"/>
-                      <w:color w:val="000000"/>
-                      <w:sz w:val="159"/>
-                    </w:rPr>
-                    <w:t>Sample</w:t>
-                  </w:r>
-                </w:p>
-              </w:txbxContent>
-            </v:textbox>
-          </v:shape>
-        </w:pict>
-      </w:r>
-      <w:r>
-        <w:pict>
-          <v:shape id="DocuMindTextBox9" type="#_x0000_t202" stroked="f" filled="f" o:allowincell="f" style="position:absolute;margin-left:50.427pt;margin-top:272.315pt;width:155.947pt;height:106.314pt;z-index:251659264;mso-position-horizontal-relative:page;mso-position-vertical-relative:page;mso-wrap-style:none;mso-fit-shape-to-text:t;">
-            <w10:wrap type="none"/>
-            <v:textbox inset="0,0,0,0">
-              <w:txbxContent>
-                <w:p>
-                  <w:pPr>
-                    <w:spacing w:before="0" w:after="0" w:lineRule="exact" w:line="2006"/>
-                    <w:ind w:left="0" w:right="0" w:firstLine="0"/>
-                  </w:pPr>
-                  <w:r>
-                    <w:rPr>
-                      <w:rFonts w:ascii="Repo-Extra Bold" w:hAnsi="Repo-Extra Bold" w:eastAsia="Repo-Extra Bold" w:cs="Repo-Extra Bold"/>
-                      <w:b/>
-                      <w:i w:val="0"/>
-                      <w:color w:val="000000"/>
-                      <w:sz w:val="159"/>
-                    </w:rPr>
-                    <w:t>PDF</w:t>
-                  </w:r>
-                </w:p>
-              </w:txbxContent>
-            </v:textbox>
-          </v:shape>
-        </w:pict>
-      </w:r>
-      <w:r>
-        <w:pict>
-          <v:shape id="DocuMindTextBox10" type="#_x0000_t202" stroked="f" filled="f" o:allowincell="f" style="position:absolute;margin-left:104.608pt;margin-top:75.631pt;width:125.533pt;height:30.955pt;z-index:251659264;mso-position-horizontal-relative:page;mso-position-vertical-relative:page;mso-wrap-style:none;mso-fit-shape-to-text:t;">
+          <v:shape id="DocuMindTextBox8" type="#_x0000_t202" stroked="f" filled="f" o:allowincell="f" style="position:absolute;margin-left:104.608pt;margin-top:76.131pt;width:130.533pt;height:29.955pt;z-index:251659264;mso-position-horizontal-relative:page;mso-position-vertical-relative:page;mso-wrap-style:none;mso-fit-shape-to-text:t;">
             <w10:wrap type="none"/>
             <v:textbox inset="0,0,0,0">
               <w:txbxContent>
@@ -131,6 +77,7 @@
                   <w:pPr>
                     <w:spacing w:before="0" w:after="0" w:lineRule="exact" w:line="499"/>
                     <w:ind w:left="0" w:right="0" w:firstLine="0"/>
+                    <w:jc w:val="left"/>
                   </w:pPr>
                   <w:r>
                     <w:rPr>
@@ -150,15 +97,70 @@
       </w:r>
       <w:r>
         <w:pict>
-          <v:shape id="DocuMindTextBox11" type="#_x0000_t202" stroked="f" filled="f" o:allowincell="f" style="position:absolute;margin-left:50.427pt;margin-top:698.729pt;width:188.482pt;height:36.740pt;z-index:251659264;mso-position-horizontal-relative:page;mso-position-vertical-relative:page;mso-wrap-style:none;mso-fit-shape-to-text:t;">
+          <v:shape id="DocuMindTextBox9" type="#_x0000_t202" stroked="f" filled="f" o:allowincell="f" style="position:absolute;margin-left:50.427pt;margin-top:197.065pt;width:287.814pt;height:205.627pt;z-index:251659264;mso-position-horizontal-relative:page;mso-position-vertical-relative:page;mso-wrap-style:none;mso-fit-shape-to-text:t;">
             <w10:wrap type="none"/>
             <v:textbox inset="0,0,0,0">
               <w:txbxContent>
                 <w:p>
                   <w:pPr>
-                    <w:spacing w:before="0" w:after="0" w:lineRule="exact" w:line="615"/>
+                    <w:spacing w:before="0" w:after="0" w:lineRule="exact" w:line="2006"/>
                     <w:ind w:left="0" w:right="0" w:firstLine="0"/>
+                    <w:jc w:val="left"/>
                   </w:pPr>
+                  <w:r>
+                    <w:rPr>
+                      <w:rFonts w:ascii="Repo-Extra Bold" w:hAnsi="Repo-Extra Bold" w:eastAsia="Repo-Extra Bold" w:cs="Repo-Extra Bold"/>
+                      <w:b/>
+                      <w:i w:val="0"/>
+                      <w:color w:val="000000"/>
+                      <w:sz w:val="159"/>
+                    </w:rPr>
+                    <w:t>Sample</w:t>
+                  </w:r>
+                  <w:r>
+                    <w:br/>
+                  </w:r>
+                  <w:r>
+                    <w:rPr>
+                      <w:rFonts w:ascii="Repo-Extra Bold" w:hAnsi="Repo-Extra Bold" w:eastAsia="Repo-Extra Bold" w:cs="Repo-Extra Bold"/>
+                      <w:b/>
+                      <w:i w:val="0"/>
+                      <w:color w:val="000000"/>
+                      <w:sz w:val="159"/>
+                    </w:rPr>
+                    <w:t>PDF</w:t>
+                  </w:r>
+                </w:p>
+              </w:txbxContent>
+            </v:textbox>
+          </v:shape>
+        </w:pict>
+      </w:r>
+      <w:r>
+        <w:pict>
+          <v:shape id="DocuMindTextBox10" type="#_x0000_t202" stroked="f" filled="f" o:allowincell="f" style="position:absolute;margin-left:50.427pt;margin-top:662.057pt;width:193.482pt;height:79.345pt;z-index:251659264;mso-position-horizontal-relative:page;mso-position-vertical-relative:page;mso-wrap-style:none;mso-fit-shape-to-text:t;">
+            <w10:wrap type="none"/>
+            <v:textbox inset="0,0,0,0">
+              <w:txbxContent>
+                <w:p>
+                  <w:pPr>
+                    <w:spacing w:before="0" w:after="0" w:lineRule="exact" w:line="743"/>
+                    <w:ind w:left="0" w:right="0" w:firstLine="0"/>
+                    <w:jc w:val="left"/>
+                  </w:pPr>
+                  <w:r>
+                    <w:rPr>
+                      <w:rFonts w:ascii="DMSans-Regular" w:hAnsi="DMSans-Regular" w:eastAsia="DMSans-Regular" w:cs="DMSans-Regular"/>
+                      <w:b w:val="0"/>
+                      <w:i w:val="0"/>
+                      <w:color w:val="000000"/>
+                      <w:sz w:val="47"/>
+                    </w:rPr>
+                    <w:t>Prepared By</w:t>
+                  </w:r>
+                  <w:r>
+                    <w:br/>
+                  </w:r>
                   <w:r>
                     <w:rPr>
                       <w:rFonts w:ascii="DMSans-Regular" w:hAnsi="DMSans-Regular" w:eastAsia="DMSans-Regular" w:cs="DMSans-Regular"/>
@@ -177,14 +179,15 @@
       </w:r>
       <w:r>
         <w:pict>
-          <v:shape id="DocuMindTextBox12" type="#_x0000_t202" stroked="f" filled="f" o:allowincell="f" style="position:absolute;margin-left:50.427pt;margin-top:661.557pt;width:134.295pt;height:36.740pt;z-index:251659264;mso-position-horizontal-relative:page;mso-position-vertical-relative:page;mso-wrap-style:none;mso-fit-shape-to-text:t;">
+          <v:shape id="DocuMindTextBox11" type="#_x0000_t202" stroked="f" filled="f" o:allowincell="f" style="position:absolute;margin-left:101.969pt;margin-top:811.082pt;width:120.347pt;height:25.141pt;z-index:251659264;mso-position-horizontal-relative:page;mso-position-vertical-relative:page;mso-wrap-style:none;mso-fit-shape-to-text:t;">
             <w10:wrap type="none"/>
             <v:textbox inset="0,0,0,0">
               <w:txbxContent>
                 <w:p>
                   <w:pPr>
-                    <w:spacing w:before="0" w:after="0" w:lineRule="exact" w:line="615"/>
+                    <w:spacing w:before="0" w:after="0" w:lineRule="exact" w:line="403"/>
                     <w:ind w:left="0" w:right="0" w:firstLine="0"/>
+                    <w:jc w:val="left"/>
                   </w:pPr>
                   <w:r>
                     <w:rPr>
@@ -192,9 +195,9 @@
                       <w:b w:val="0"/>
                       <w:i w:val="0"/>
                       <w:color w:val="000000"/>
-                      <w:sz w:val="47"/>
+                      <w:sz w:val="30"/>
                     </w:rPr>
-                    <w:t>Prepared By</w:t>
+                    <w:t>+123-456-7890</w:t>
                   </w:r>
                 </w:p>
               </w:txbxContent>
@@ -204,7 +207,7 @@
       </w:r>
       <w:r>
         <w:pict>
-          <v:shape id="DocuMindTextBox13" type="#_x0000_t202" stroked="f" filled="f" o:allowincell="f" style="position:absolute;margin-left:360.726pt;margin-top:810.582pt;width:176.345pt;height:26.141pt;z-index:251659264;mso-position-horizontal-relative:page;mso-position-vertical-relative:page;mso-wrap-style:none;mso-fit-shape-to-text:t;">
+          <v:shape id="DocuMindTextBox12" type="#_x0000_t202" stroked="f" filled="f" o:allowincell="f" style="position:absolute;margin-left:360.726pt;margin-top:811.082pt;width:181.345pt;height:25.141pt;z-index:251659264;mso-position-horizontal-relative:page;mso-position-vertical-relative:page;mso-wrap-style:none;mso-fit-shape-to-text:t;">
             <w10:wrap type="none"/>
             <v:textbox inset="0,0,0,0">
               <w:txbxContent>
@@ -212,6 +215,7 @@
                   <w:pPr>
                     <w:spacing w:before="0" w:after="0" w:lineRule="exact" w:line="403"/>
                     <w:ind w:left="0" w:right="0" w:firstLine="0"/>
+                    <w:jc w:val="left"/>
                   </w:pPr>
                   <w:r>
                     <w:rPr>
@@ -222,33 +226,6 @@
                       <w:sz w:val="30"/>
                     </w:rPr>
                     <w:t>https://sample-files.com</w:t>
-                  </w:r>
-                </w:p>
-              </w:txbxContent>
-            </v:textbox>
-          </v:shape>
-        </w:pict>
-      </w:r>
-      <w:r>
-        <w:pict>
-          <v:shape id="DocuMindTextBox14" type="#_x0000_t202" stroked="f" filled="f" o:allowincell="f" style="position:absolute;margin-left:101.969pt;margin-top:810.582pt;width:115.347pt;height:26.141pt;z-index:251659264;mso-position-horizontal-relative:page;mso-position-vertical-relative:page;mso-wrap-style:none;mso-fit-shape-to-text:t;">
-            <w10:wrap type="none"/>
-            <v:textbox inset="0,0,0,0">
-              <w:txbxContent>
-                <w:p>
-                  <w:pPr>
-                    <w:spacing w:before="0" w:after="0" w:lineRule="exact" w:line="403"/>
-                    <w:ind w:left="0" w:right="0" w:firstLine="0"/>
-                  </w:pPr>
-                  <w:r>
-                    <w:rPr>
-                      <w:rFonts w:ascii="DMSans-Regular" w:hAnsi="DMSans-Regular" w:eastAsia="DMSans-Regular" w:cs="DMSans-Regular"/>
-                      <w:b w:val="0"/>
-                      <w:i w:val="0"/>
-                      <w:color w:val="000000"/>
-                      <w:sz w:val="30"/>
-                    </w:rPr>
-                    <w:t>+123-456-7890</w:t>
                   </w:r>
                 </w:p>
               </w:txbxContent>
@@ -278,7 +255,7 @@
       </w:r>
       <w:r>
         <w:pict>
-          <v:shape id="DocuMindTextBox15" type="#_x0000_t202" stroked="f" filled="f" o:allowincell="f" style="position:absolute;margin-left:60.364pt;margin-top:56.251pt;width:412.719pt;height:58.013pt;z-index:251659264;mso-position-horizontal-relative:page;mso-position-vertical-relative:page;mso-wrap-style:none;mso-fit-shape-to-text:t;">
+          <v:shape id="DocuMindTextBox13" type="#_x0000_t202" stroked="f" filled="f" o:allowincell="f" style="position:absolute;margin-left:60.364pt;margin-top:56.751pt;width:417.719pt;height:57.013pt;z-index:251659264;mso-position-horizontal-relative:page;mso-position-vertical-relative:page;mso-wrap-style:none;mso-fit-shape-to-text:t;">
             <w10:wrap type="none"/>
             <v:textbox inset="0,0,0,0">
               <w:txbxContent>
@@ -286,6 +263,7 @@
                   <w:pPr>
                     <w:spacing w:before="0" w:after="0" w:lineRule="exact" w:line="1040"/>
                     <w:ind w:left="0" w:right="0" w:firstLine="0"/>
+                    <w:jc w:val="left"/>
                   </w:pPr>
                   <w:r>
                     <w:rPr>
@@ -305,7 +283,7 @@
       </w:r>
       <w:r>
         <w:pict>
-          <v:shape id="DocuMindTextBox16" type="#_x0000_t202" stroked="f" filled="f" o:allowincell="f" style="position:absolute;margin-left:60.364pt;margin-top:139.476pt;width:167.446pt;height:42.003pt;z-index:251659264;mso-position-horizontal-relative:page;mso-position-vertical-relative:page;mso-wrap-style:none;mso-fit-shape-to-text:t;">
+          <v:shape id="DocuMindTextBox14" type="#_x0000_t202" stroked="f" filled="f" o:allowincell="f" style="position:absolute;margin-left:60.364pt;margin-top:139.976pt;width:172.446pt;height:41.003pt;z-index:251659264;mso-position-horizontal-relative:page;mso-position-vertical-relative:page;mso-wrap-style:none;mso-fit-shape-to-text:t;">
             <w10:wrap type="none"/>
             <v:textbox inset="0,0,0,0">
               <w:txbxContent>
@@ -313,6 +291,7 @@
                   <w:pPr>
                     <w:spacing w:before="0" w:after="0" w:lineRule="exact" w:line="720"/>
                     <w:ind w:left="0" w:right="0" w:firstLine="0"/>
+                    <w:jc w:val="left"/>
                   </w:pPr>
                   <w:r>
                     <w:rPr>
@@ -332,7 +311,7 @@
       </w:r>
       <w:r>
         <w:pict>
-          <v:shape id="DocuMindTextBox17" type="#_x0000_t202" stroked="f" filled="f" o:allowincell="f" style="position:absolute;margin-left:60.364pt;margin-top:193.557pt;width:466.462pt;height:29.998pt;z-index:251659264;mso-position-horizontal-relative:page;mso-position-vertical-relative:page;mso-wrap-style:none;mso-fit-shape-to-text:t;">
+          <v:shape id="DocuMindTextBox15" type="#_x0000_t202" stroked="f" filled="f" o:allowincell="f" style="position:absolute;margin-left:60.364pt;margin-top:194.057pt;width:492.638pt;height:100.992pt;z-index:251659264;mso-position-horizontal-relative:page;mso-position-vertical-relative:page;mso-wrap-style:none;mso-fit-shape-to-text:t;">
             <w10:wrap type="none"/>
             <v:textbox inset="0,0,0,0">
               <w:txbxContent>
@@ -340,6 +319,7 @@
                   <w:pPr>
                     <w:spacing w:before="0" w:after="0" w:lineRule="exact" w:line="480"/>
                     <w:ind w:left="0" w:right="0" w:firstLine="0"/>
+                    <w:jc w:val="left"/>
                   </w:pPr>
                   <w:r>
                     <w:rPr>
@@ -351,23 +331,9 @@
                     </w:rPr>
                     <w:t>Lorem ipsum dolor sit amet, consectetur adipiscing elit.</w:t>
                   </w:r>
-                </w:p>
-              </w:txbxContent>
-            </v:textbox>
-          </v:shape>
-        </w:pict>
-      </w:r>
-      <w:r>
-        <w:pict>
-          <v:shape id="DocuMindTextBox18" type="#_x0000_t202" stroked="f" filled="f" o:allowincell="f" style="position:absolute;margin-left:60.364pt;margin-top:215.160pt;width:487.638pt;height:29.998pt;z-index:251659264;mso-position-horizontal-relative:page;mso-position-vertical-relative:page;mso-wrap-style:none;mso-fit-shape-to-text:t;">
-            <w10:wrap type="none"/>
-            <v:textbox inset="0,0,0,0">
-              <w:txbxContent>
-                <w:p>
-                  <w:pPr>
-                    <w:spacing w:before="0" w:after="0" w:lineRule="exact" w:line="480"/>
-                    <w:ind w:left="0" w:right="0" w:firstLine="0"/>
-                  </w:pPr>
+                  <w:r>
+                    <w:br/>
+                  </w:r>
                   <w:r>
                     <w:rPr>
                       <w:rFonts w:ascii="DMSans-Regular" w:hAnsi="DMSans-Regular" w:eastAsia="DMSans-Regular" w:cs="DMSans-Regular"/>
@@ -376,25 +342,11 @@
                       <w:color w:val="000000"/>
                       <w:sz w:val="36"/>
                     </w:rPr>
-                    <w:t xml:space="preserve"> Integer nec odio. Praesent libero. Sed cursus ante dapibu</w:t>
+                    <w:t>Integer nec odio. Praesent libero. Sed cursus ante dapibus</w:t>
                   </w:r>
-                </w:p>
-              </w:txbxContent>
-            </v:textbox>
-          </v:shape>
-        </w:pict>
-      </w:r>
-      <w:r>
-        <w:pict>
-          <v:shape id="DocuMindTextBox19" type="#_x0000_t202" stroked="f" filled="f" o:allowincell="f" style="position:absolute;margin-left:60.364pt;margin-top:236.763pt;width:408.574pt;height:29.998pt;z-index:251659264;mso-position-horizontal-relative:page;mso-position-vertical-relative:page;mso-wrap-style:none;mso-fit-shape-to-text:t;">
-            <w10:wrap type="none"/>
-            <v:textbox inset="0,0,0,0">
-              <w:txbxContent>
-                <w:p>
-                  <w:pPr>
-                    <w:spacing w:before="0" w:after="0" w:lineRule="exact" w:line="480"/>
-                    <w:ind w:left="0" w:right="0" w:firstLine="0"/>
-                  </w:pPr>
+                  <w:r>
+                    <w:br/>
+                  </w:r>
                   <w:r>
                     <w:rPr>
                       <w:rFonts w:ascii="DMSans-Regular" w:hAnsi="DMSans-Regular" w:eastAsia="DMSans-Regular" w:cs="DMSans-Regular"/>
@@ -403,25 +355,11 @@
                       <w:color w:val="000000"/>
                       <w:sz w:val="36"/>
                     </w:rPr>
-                    <w:t>s diam. Sed nisi. Nulla quis sem at nibh element</w:t>
+                    <w:t>diam. Sed nisi. Nulla quis sem at nibh element</w:t>
                   </w:r>
-                </w:p>
-              </w:txbxContent>
-            </v:textbox>
-          </v:shape>
-        </w:pict>
-      </w:r>
-      <w:r>
-        <w:pict>
-          <v:shape id="DocuMindTextBox20" type="#_x0000_t202" stroked="f" filled="f" o:allowincell="f" style="position:absolute;margin-left:60.364pt;margin-top:258.366pt;width:88.184pt;height:29.998pt;z-index:251659264;mso-position-horizontal-relative:page;mso-position-vertical-relative:page;mso-wrap-style:none;mso-fit-shape-to-text:t;">
-            <w10:wrap type="none"/>
-            <v:textbox inset="0,0,0,0">
-              <w:txbxContent>
-                <w:p>
-                  <w:pPr>
-                    <w:spacing w:before="0" w:after="0" w:lineRule="exact" w:line="480"/>
-                    <w:ind w:left="0" w:right="0" w:firstLine="0"/>
-                  </w:pPr>
+                  <w:r>
+                    <w:br/>
+                  </w:r>
                   <w:r>
                     <w:rPr>
                       <w:rFonts w:ascii="DMSans-Regular" w:hAnsi="DMSans-Regular" w:eastAsia="DMSans-Regular" w:cs="DMSans-Regular"/>
@@ -440,7 +378,7 @@
       </w:r>
       <w:r>
         <w:pict>
-          <v:shape id="DocuMindTextBox21" type="#_x0000_t202" stroked="f" filled="f" o:allowincell="f" style="position:absolute;margin-left:60.364pt;margin-top:313.165pt;width:146.320pt;height:42.003pt;z-index:251659264;mso-position-horizontal-relative:page;mso-position-vertical-relative:page;mso-wrap-style:none;mso-fit-shape-to-text:t;">
+          <v:shape id="DocuMindTextBox16" type="#_x0000_t202" stroked="f" filled="f" o:allowincell="f" style="position:absolute;margin-left:60.364pt;margin-top:313.665pt;width:151.320pt;height:41.003pt;z-index:251659264;mso-position-horizontal-relative:page;mso-position-vertical-relative:page;mso-wrap-style:none;mso-fit-shape-to-text:t;">
             <w10:wrap type="none"/>
             <v:textbox inset="0,0,0,0">
               <w:txbxContent>
@@ -448,6 +386,7 @@
                   <w:pPr>
                     <w:spacing w:before="0" w:after="0" w:lineRule="exact" w:line="720"/>
                     <w:ind w:left="0" w:right="0" w:firstLine="0"/>
+                    <w:jc w:val="left"/>
                   </w:pPr>
                   <w:r>
                     <w:rPr>
@@ -467,7 +406,7 @@
       </w:r>
       <w:r>
         <w:pict>
-          <v:shape id="DocuMindTextBox22" type="#_x0000_t202" stroked="f" filled="f" o:allowincell="f" style="position:absolute;margin-left:60.364pt;margin-top:367.246pt;width:353.817pt;height:29.998pt;z-index:251659264;mso-position-horizontal-relative:page;mso-position-vertical-relative:page;mso-wrap-style:none;mso-fit-shape-to-text:t;">
+          <v:shape id="DocuMindTextBox17" type="#_x0000_t202" stroked="f" filled="f" o:allowincell="f" style="position:absolute;margin-left:60.364pt;margin-top:367.746pt;width:358.817pt;height:28.998pt;z-index:251659264;mso-position-horizontal-relative:page;mso-position-vertical-relative:page;mso-wrap-style:none;mso-fit-shape-to-text:t;">
             <w10:wrap type="none"/>
             <v:textbox inset="0,0,0,0">
               <w:txbxContent>
@@ -475,6 +414,7 @@
                   <w:pPr>
                     <w:spacing w:before="0" w:after="0" w:lineRule="exact" w:line="480"/>
                     <w:ind w:left="0" w:right="0" w:firstLine="0"/>
+                    <w:jc w:val="left"/>
                   </w:pPr>
                   <w:r>
                     <w:rPr>
@@ -494,7 +434,7 @@
       </w:r>
       <w:r>
         <w:pict>
-          <v:shape id="DocuMindTextBox23" type="#_x0000_t202" stroked="f" filled="f" o:allowincell="f" style="position:absolute;margin-left:91.702pt;margin-top:414.773pt;width:381.702pt;height:29.998pt;z-index:251659264;mso-position-horizontal-relative:page;mso-position-vertical-relative:page;mso-wrap-style:none;mso-fit-shape-to-text:t;">
+          <v:shape id="DocuMindTextBox18" type="#_x0000_t202" stroked="f" filled="f" o:allowincell="f" style="position:absolute;margin-left:91.702pt;margin-top:415.273pt;width:386.702pt;height:28.998pt;z-index:251659264;mso-position-horizontal-relative:page;mso-position-vertical-relative:page;mso-wrap-style:none;mso-fit-shape-to-text:t;">
             <w10:wrap type="none"/>
             <v:textbox inset="0,0,0,0">
               <w:txbxContent>
@@ -502,6 +442,7 @@
                   <w:pPr>
                     <w:spacing w:before="0" w:after="0" w:lineRule="exact" w:line="480"/>
                     <w:ind w:left="0" w:right="0" w:firstLine="0"/>
+                    <w:jc w:val="left"/>
                   </w:pPr>
                   <w:r>
                     <w:rPr>
@@ -521,7 +462,7 @@
       </w:r>
       <w:r>
         <w:pict>
-          <v:shape id="DocuMindTextBox24" type="#_x0000_t202" stroked="f" filled="f" o:allowincell="f" style="position:absolute;margin-left:91.702pt;margin-top:444.153pt;width:460.656pt;height:29.998pt;z-index:251659264;mso-position-horizontal-relative:page;mso-position-vertical-relative:page;mso-wrap-style:none;mso-fit-shape-to-text:t;">
+          <v:shape id="DocuMindTextBox19" type="#_x0000_t202" stroked="f" filled="f" o:allowincell="f" style="position:absolute;margin-left:91.702pt;margin-top:444.653pt;width:465.656pt;height:28.998pt;z-index:251659264;mso-position-horizontal-relative:page;mso-position-vertical-relative:page;mso-wrap-style:none;mso-fit-shape-to-text:t;">
             <w10:wrap type="none"/>
             <v:textbox inset="0,0,0,0">
               <w:txbxContent>
@@ -529,6 +470,7 @@
                   <w:pPr>
                     <w:spacing w:before="0" w:after="0" w:lineRule="exact" w:line="480"/>
                     <w:ind w:left="0" w:right="0" w:firstLine="0"/>
+                    <w:jc w:val="left"/>
                   </w:pPr>
                   <w:r>
                     <w:rPr>
@@ -548,7 +490,7 @@
       </w:r>
       <w:r>
         <w:pict>
-          <v:shape id="DocuMindTextBox25" type="#_x0000_t202" stroked="f" filled="f" o:allowincell="f" style="position:absolute;margin-left:91.702pt;margin-top:473.533pt;width:372.321pt;height:29.998pt;z-index:251659264;mso-position-horizontal-relative:page;mso-position-vertical-relative:page;mso-wrap-style:none;mso-fit-shape-to-text:t;">
+          <v:shape id="DocuMindTextBox20" type="#_x0000_t202" stroked="f" filled="f" o:allowincell="f" style="position:absolute;margin-left:91.702pt;margin-top:474.033pt;width:377.321pt;height:28.998pt;z-index:251659264;mso-position-horizontal-relative:page;mso-position-vertical-relative:page;mso-wrap-style:none;mso-fit-shape-to-text:t;">
             <w10:wrap type="none"/>
             <v:textbox inset="0,0,0,0">
               <w:txbxContent>
@@ -556,6 +498,7 @@
                   <w:pPr>
                     <w:spacing w:before="0" w:after="0" w:lineRule="exact" w:line="480"/>
                     <w:ind w:left="0" w:right="0" w:firstLine="0"/>
+                    <w:jc w:val="left"/>
                   </w:pPr>
                   <w:r>
                     <w:rPr>
@@ -575,7 +518,7 @@
       </w:r>
       <w:r>
         <w:pict>
-          <v:shape id="DocuMindTextBox26" type="#_x0000_t202" stroked="f" filled="f" o:allowincell="f" style="position:absolute;margin-left:60.364pt;margin-top:531.797pt;width:169.108pt;height:41.992pt;z-index:251659264;mso-position-horizontal-relative:page;mso-position-vertical-relative:page;mso-wrap-style:none;mso-fit-shape-to-text:t;">
+          <v:shape id="DocuMindTextBox21" type="#_x0000_t202" stroked="f" filled="f" o:allowincell="f" style="position:absolute;margin-left:60.364pt;margin-top:532.297pt;width:174.108pt;height:40.992pt;z-index:251659264;mso-position-horizontal-relative:page;mso-position-vertical-relative:page;mso-wrap-style:none;mso-fit-shape-to-text:t;">
             <w10:wrap type="none"/>
             <v:textbox inset="0,0,0,0">
               <w:txbxContent>
@@ -583,6 +526,7 @@
                   <w:pPr>
                     <w:spacing w:before="0" w:after="0" w:lineRule="exact" w:line="720"/>
                     <w:ind w:left="0" w:right="0" w:firstLine="0"/>
+                    <w:jc w:val="left"/>
                   </w:pPr>
                   <w:r>
                     <w:rPr>
@@ -602,15 +546,36 @@
       </w:r>
       <w:r>
         <w:pict>
-          <v:shape id="DocuMindTextBox27" type="#_x0000_t202" stroked="f" filled="f" o:allowincell="f" style="position:absolute;margin-left:96.414pt;margin-top:590.189pt;width:147.345pt;height:29.998pt;z-index:251659264;mso-position-horizontal-relative:page;mso-position-vertical-relative:page;mso-wrap-style:none;mso-fit-shape-to-text:t;">
+          <v:shape id="DocuMindTextBox22" type="#_x0000_t202" stroked="f" filled="f" o:allowincell="f" style="position:absolute;margin-left:81.062pt;margin-top:590.689pt;width:405.753pt;height:63.760pt;z-index:251659264;mso-position-horizontal-relative:page;mso-position-vertical-relative:page;mso-wrap-style:none;mso-fit-shape-to-text:t;">
             <w10:wrap type="none"/>
             <v:textbox inset="0,0,0,0">
               <w:txbxContent>
                 <w:p>
                   <w:pPr>
-                    <w:spacing w:before="0" w:after="0" w:lineRule="exact" w:line="480"/>
+                    <w:spacing w:before="0" w:after="0" w:lineRule="exact" w:line="588"/>
                     <w:ind w:left="0" w:right="0" w:firstLine="0"/>
+                    <w:jc w:val="left"/>
                   </w:pPr>
+                  <w:r>
+                    <w:rPr>
+                      <w:rFonts w:ascii="DMSans-Regular" w:hAnsi="DMSans-Regular" w:eastAsia="DMSans-Regular" w:cs="DMSans-Regular"/>
+                      <w:b w:val="0"/>
+                      <w:i w:val="0"/>
+                      <w:color w:val="000000"/>
+                      <w:sz w:val="36"/>
+                    </w:rPr>
+                    <w:t>1.</w:t>
+                  </w:r>
+                  <w:r>
+                    <w:rPr>
+                      <w:rFonts w:ascii="DMSans-Regular" w:hAnsi="DMSans-Regular" w:eastAsia="DMSans-Regular" w:cs="DMSans-Regular"/>
+                      <w:b w:val="0"/>
+                      <w:i w:val="0"/>
+                      <w:color w:val="000000"/>
+                      <w:sz w:val="36"/>
+                    </w:rPr>
+                    <w:t xml:space="preserve"> </w:t>
+                  </w:r>
                   <w:r>
                     <w:rPr>
                       <w:rFonts w:ascii="DMSans" w:hAnsi="DMSans" w:eastAsia="DMSans" w:cs="DMSans"/>
@@ -621,23 +586,16 @@
                     </w:rPr>
                     <w:t>Market Analysis:</w:t>
                   </w:r>
-                </w:p>
-              </w:txbxContent>
-            </v:textbox>
-          </v:shape>
-        </w:pict>
-      </w:r>
-      <w:r>
-        <w:pict>
-          <v:shape id="DocuMindTextBox28" type="#_x0000_t202" stroked="f" filled="f" o:allowincell="f" style="position:absolute;margin-left:240.587pt;margin-top:590.189pt;width:241.228pt;height:29.998pt;z-index:251659264;mso-position-horizontal-relative:page;mso-position-vertical-relative:page;mso-wrap-style:none;mso-fit-shape-to-text:t;">
-            <w10:wrap type="none"/>
-            <v:textbox inset="0,0,0,0">
-              <w:txbxContent>
-                <w:p>
-                  <w:pPr>
-                    <w:spacing w:before="0" w:after="0" w:lineRule="exact" w:line="480"/>
-                    <w:ind w:left="0" w:right="0" w:firstLine="0"/>
-                  </w:pPr>
+                  <w:r>
+                    <w:rPr>
+                      <w:rFonts w:ascii="DMSans" w:hAnsi="DMSans" w:eastAsia="DMSans" w:cs="DMSans"/>
+                      <w:b/>
+                      <w:i w:val="0"/>
+                      <w:color w:val="000000"/>
+                      <w:sz w:val="36"/>
+                    </w:rPr>
+                    <w:t xml:space="preserve"> </w:t>
+                  </w:r>
                   <w:r>
                     <w:rPr>
                       <w:rFonts w:ascii="DMSans-Regular" w:hAnsi="DMSans-Regular" w:eastAsia="DMSans-Regular" w:cs="DMSans-Regular"/>
@@ -646,25 +604,11 @@
                       <w:color w:val="000000"/>
                       <w:sz w:val="36"/>
                     </w:rPr>
-                    <w:t xml:space="preserve"> Lorem ipsum dolor sit amet, </w:t>
+                    <w:t>Lorem ipsum dolor sit amet,</w:t>
                   </w:r>
-                </w:p>
-              </w:txbxContent>
-            </v:textbox>
-          </v:shape>
-        </w:pict>
-      </w:r>
-      <w:r>
-        <w:pict>
-          <v:shape id="DocuMindTextBox29" type="#_x0000_t202" stroked="f" filled="f" o:allowincell="f" style="position:absolute;margin-left:91.702pt;margin-top:619.570pt;width:228.419pt;height:29.998pt;z-index:251659264;mso-position-horizontal-relative:page;mso-position-vertical-relative:page;mso-wrap-style:none;mso-fit-shape-to-text:t;">
-            <w10:wrap type="none"/>
-            <v:textbox inset="0,0,0,0">
-              <w:txbxContent>
-                <w:p>
-                  <w:pPr>
-                    <w:spacing w:before="0" w:after="0" w:lineRule="exact" w:line="480"/>
-                    <w:ind w:left="0" w:right="0" w:firstLine="0"/>
-                  </w:pPr>
+                  <w:r>
+                    <w:br/>
+                  </w:r>
                   <w:r>
                     <w:rPr>
                       <w:rFonts w:ascii="DMSans-Regular" w:hAnsi="DMSans-Regular" w:eastAsia="DMSans-Regular" w:cs="DMSans-Regular"/>
@@ -683,14 +627,15 @@
       </w:r>
       <w:r>
         <w:pict>
-          <v:shape id="DocuMindTextBox30" type="#_x0000_t202" stroked="f" filled="f" o:allowincell="f" style="position:absolute;margin-left:81.062pt;margin-top:590.189pt;width:11.981pt;height:29.998pt;z-index:251659264;mso-position-horizontal-relative:page;mso-position-vertical-relative:page;mso-wrap-style:none;mso-fit-shape-to-text:t;">
+          <v:shape id="DocuMindTextBox23" type="#_x0000_t202" stroked="f" filled="f" o:allowincell="f" style="position:absolute;margin-left:76.080pt;margin-top:649.450pt;width:459.626pt;height:63.760pt;z-index:251659264;mso-position-horizontal-relative:page;mso-position-vertical-relative:page;mso-wrap-style:none;mso-fit-shape-to-text:t;">
             <w10:wrap type="none"/>
             <v:textbox inset="0,0,0,0">
               <w:txbxContent>
                 <w:p>
                   <w:pPr>
-                    <w:spacing w:before="0" w:after="0" w:lineRule="exact" w:line="480"/>
+                    <w:spacing w:before="0" w:after="0" w:lineRule="exact" w:line="588"/>
                     <w:ind w:left="0" w:right="0" w:firstLine="0"/>
+                    <w:jc w:val="left"/>
                   </w:pPr>
                   <w:r>
                     <w:rPr>
@@ -700,25 +645,18 @@
                       <w:color w:val="000000"/>
                       <w:sz w:val="36"/>
                     </w:rPr>
-                    <w:t>1.</w:t>
+                    <w:t>2.</w:t>
                   </w:r>
-                </w:p>
-              </w:txbxContent>
-            </v:textbox>
-          </v:shape>
-        </w:pict>
-      </w:r>
-      <w:r>
-        <w:pict>
-          <v:shape id="DocuMindTextBox31" type="#_x0000_t202" stroked="f" filled="f" o:allowincell="f" style="position:absolute;margin-left:96.414pt;margin-top:648.950pt;width:119.792pt;height:29.998pt;z-index:251659264;mso-position-horizontal-relative:page;mso-position-vertical-relative:page;mso-wrap-style:none;mso-fit-shape-to-text:t;">
-            <w10:wrap type="none"/>
-            <v:textbox inset="0,0,0,0">
-              <w:txbxContent>
-                <w:p>
-                  <w:pPr>
-                    <w:spacing w:before="0" w:after="0" w:lineRule="exact" w:line="480"/>
-                    <w:ind w:left="0" w:right="0" w:firstLine="0"/>
-                  </w:pPr>
+                  <w:r>
+                    <w:rPr>
+                      <w:rFonts w:ascii="DMSans-Regular" w:hAnsi="DMSans-Regular" w:eastAsia="DMSans-Regular" w:cs="DMSans-Regular"/>
+                      <w:b w:val="0"/>
+                      <w:i w:val="0"/>
+                      <w:color w:val="000000"/>
+                      <w:sz w:val="36"/>
+                    </w:rPr>
+                    <w:t xml:space="preserve"> </w:t>
+                  </w:r>
                   <w:r>
                     <w:rPr>
                       <w:rFonts w:ascii="DMSans" w:hAnsi="DMSans" w:eastAsia="DMSans" w:cs="DMSans"/>
@@ -729,23 +667,16 @@
                     </w:rPr>
                     <w:t>User Insights:</w:t>
                   </w:r>
-                </w:p>
-              </w:txbxContent>
-            </v:textbox>
-          </v:shape>
-        </w:pict>
-      </w:r>
-      <w:r>
-        <w:pict>
-          <v:shape id="DocuMindTextBox32" type="#_x0000_t202" stroked="f" filled="f" o:allowincell="f" style="position:absolute;margin-left:213.030pt;margin-top:648.950pt;width:317.676pt;height:29.998pt;z-index:251659264;mso-position-horizontal-relative:page;mso-position-vertical-relative:page;mso-wrap-style:none;mso-fit-shape-to-text:t;">
-            <w10:wrap type="none"/>
-            <v:textbox inset="0,0,0,0">
-              <w:txbxContent>
-                <w:p>
-                  <w:pPr>
-                    <w:spacing w:before="0" w:after="0" w:lineRule="exact" w:line="480"/>
-                    <w:ind w:left="0" w:right="0" w:firstLine="0"/>
-                  </w:pPr>
+                  <w:r>
+                    <w:rPr>
+                      <w:rFonts w:ascii="DMSans" w:hAnsi="DMSans" w:eastAsia="DMSans" w:cs="DMSans"/>
+                      <w:b/>
+                      <w:i w:val="0"/>
+                      <w:color w:val="000000"/>
+                      <w:sz w:val="36"/>
+                    </w:rPr>
+                    <w:t xml:space="preserve"> </w:t>
+                  </w:r>
                   <w:r>
                     <w:rPr>
                       <w:rFonts w:ascii="DMSans-Regular" w:hAnsi="DMSans-Regular" w:eastAsia="DMSans-Regular" w:cs="DMSans-Regular"/>
@@ -754,25 +685,11 @@
                       <w:color w:val="000000"/>
                       <w:sz w:val="36"/>
                     </w:rPr>
-                    <w:t xml:space="preserve"> Integer nec odio. Praesent libero. Sed </w:t>
+                    <w:t>Integer nec odio. Praesent libero. Sed</w:t>
                   </w:r>
-                </w:p>
-              </w:txbxContent>
-            </v:textbox>
-          </v:shape>
-        </w:pict>
-      </w:r>
-      <w:r>
-        <w:pict>
-          <v:shape id="DocuMindTextBox33" type="#_x0000_t202" stroked="f" filled="f" o:allowincell="f" style="position:absolute;margin-left:91.702pt;margin-top:678.330pt;width:222.964pt;height:29.998pt;z-index:251659264;mso-position-horizontal-relative:page;mso-position-vertical-relative:page;mso-wrap-style:none;mso-fit-shape-to-text:t;">
-            <w10:wrap type="none"/>
-            <v:textbox inset="0,0,0,0">
-              <w:txbxContent>
-                <w:p>
-                  <w:pPr>
-                    <w:spacing w:before="0" w:after="0" w:lineRule="exact" w:line="480"/>
-                    <w:ind w:left="0" w:right="0" w:firstLine="0"/>
-                  </w:pPr>
+                  <w:r>
+                    <w:br/>
+                  </w:r>
                   <w:r>
                     <w:rPr>
                       <w:rFonts w:ascii="DMSans-Regular" w:hAnsi="DMSans-Regular" w:eastAsia="DMSans-Regular" w:cs="DMSans-Regular"/>
@@ -791,14 +708,15 @@
       </w:r>
       <w:r>
         <w:pict>
-          <v:shape id="DocuMindTextBox34" type="#_x0000_t202" stroked="f" filled="f" o:allowincell="f" style="position:absolute;margin-left:76.080pt;margin-top:648.950pt;width:16.964pt;height:29.998pt;z-index:251659264;mso-position-horizontal-relative:page;mso-position-vertical-relative:page;mso-wrap-style:none;mso-fit-shape-to-text:t;">
+          <v:shape id="DocuMindTextBox24" type="#_x0000_t202" stroked="f" filled="f" o:allowincell="f" style="position:absolute;margin-left:75.796pt;margin-top:708.210pt;width:472.645pt;height:63.760pt;z-index:251659264;mso-position-horizontal-relative:page;mso-position-vertical-relative:page;mso-wrap-style:none;mso-fit-shape-to-text:t;">
             <w10:wrap type="none"/>
             <v:textbox inset="0,0,0,0">
               <w:txbxContent>
                 <w:p>
                   <w:pPr>
-                    <w:spacing w:before="0" w:after="0" w:lineRule="exact" w:line="480"/>
+                    <w:spacing w:before="0" w:after="0" w:lineRule="exact" w:line="588"/>
                     <w:ind w:left="0" w:right="0" w:firstLine="0"/>
+                    <w:jc w:val="left"/>
                   </w:pPr>
                   <w:r>
                     <w:rPr>
@@ -808,25 +726,18 @@
                       <w:color w:val="000000"/>
                       <w:sz w:val="36"/>
                     </w:rPr>
-                    <w:t>2.</w:t>
+                    <w:t>3.</w:t>
                   </w:r>
-                </w:p>
-              </w:txbxContent>
-            </v:textbox>
-          </v:shape>
-        </w:pict>
-      </w:r>
-      <w:r>
-        <w:pict>
-          <v:shape id="DocuMindTextBox35" type="#_x0000_t202" stroked="f" filled="f" o:allowincell="f" style="position:absolute;margin-left:96.414pt;margin-top:707.710pt;width:186.546pt;height:29.998pt;z-index:251659264;mso-position-horizontal-relative:page;mso-position-vertical-relative:page;mso-wrap-style:none;mso-fit-shape-to-text:t;">
-            <w10:wrap type="none"/>
-            <v:textbox inset="0,0,0,0">
-              <w:txbxContent>
-                <w:p>
-                  <w:pPr>
-                    <w:spacing w:before="0" w:after="0" w:lineRule="exact" w:line="480"/>
-                    <w:ind w:left="0" w:right="0" w:firstLine="0"/>
-                  </w:pPr>
+                  <w:r>
+                    <w:rPr>
+                      <w:rFonts w:ascii="DMSans-Regular" w:hAnsi="DMSans-Regular" w:eastAsia="DMSans-Regular" w:cs="DMSans-Regular"/>
+                      <w:b w:val="0"/>
+                      <w:i w:val="0"/>
+                      <w:color w:val="000000"/>
+                      <w:sz w:val="36"/>
+                    </w:rPr>
+                    <w:t xml:space="preserve"> </w:t>
+                  </w:r>
                   <w:r>
                     <w:rPr>
                       <w:rFonts w:ascii="DMSans" w:hAnsi="DMSans" w:eastAsia="DMSans" w:cs="DMSans"/>
@@ -837,23 +748,16 @@
                     </w:rPr>
                     <w:t>Technical Feasibility:</w:t>
                   </w:r>
-                </w:p>
-              </w:txbxContent>
-            </v:textbox>
-          </v:shape>
-        </w:pict>
-      </w:r>
-      <w:r>
-        <w:pict>
-          <v:shape id="DocuMindTextBox36" type="#_x0000_t202" stroked="f" filled="f" o:allowincell="f" style="position:absolute;margin-left:279.783pt;margin-top:707.710pt;width:263.658pt;height:29.998pt;z-index:251659264;mso-position-horizontal-relative:page;mso-position-vertical-relative:page;mso-wrap-style:none;mso-fit-shape-to-text:t;">
-            <w10:wrap type="none"/>
-            <v:textbox inset="0,0,0,0">
-              <w:txbxContent>
-                <w:p>
-                  <w:pPr>
-                    <w:spacing w:before="0" w:after="0" w:lineRule="exact" w:line="480"/>
-                    <w:ind w:left="0" w:right="0" w:firstLine="0"/>
-                  </w:pPr>
+                  <w:r>
+                    <w:rPr>
+                      <w:rFonts w:ascii="DMSans" w:hAnsi="DMSans" w:eastAsia="DMSans" w:cs="DMSans"/>
+                      <w:b/>
+                      <w:i w:val="0"/>
+                      <w:color w:val="000000"/>
+                      <w:sz w:val="36"/>
+                    </w:rPr>
+                    <w:t xml:space="preserve"> </w:t>
+                  </w:r>
                   <w:r>
                     <w:rPr>
                       <w:rFonts w:ascii="DMSans-Regular" w:hAnsi="DMSans-Regular" w:eastAsia="DMSans-Regular" w:cs="DMSans-Regular"/>
@@ -862,25 +766,11 @@
                       <w:color w:val="000000"/>
                       <w:sz w:val="36"/>
                     </w:rPr>
-                    <w:t xml:space="preserve"> Sed nisi. Nulla quis sem at nibh </w:t>
+                    <w:t>Sed nisi. Nulla quis sem at nibh</w:t>
                   </w:r>
-                </w:p>
-              </w:txbxContent>
-            </v:textbox>
-          </v:shape>
-        </w:pict>
-      </w:r>
-      <w:r>
-        <w:pict>
-          <v:shape id="DocuMindTextBox37" type="#_x0000_t202" stroked="f" filled="f" o:allowincell="f" style="position:absolute;margin-left:91.702pt;margin-top:737.090pt;width:353.227pt;height:29.998pt;z-index:251659264;mso-position-horizontal-relative:page;mso-position-vertical-relative:page;mso-wrap-style:none;mso-fit-shape-to-text:t;">
-            <w10:wrap type="none"/>
-            <v:textbox inset="0,0,0,0">
-              <w:txbxContent>
-                <w:p>
-                  <w:pPr>
-                    <w:spacing w:before="0" w:after="0" w:lineRule="exact" w:line="480"/>
-                    <w:ind w:left="0" w:right="0" w:firstLine="0"/>
-                  </w:pPr>
+                  <w:r>
+                    <w:br/>
+                  </w:r>
                   <w:r>
                     <w:rPr>
                       <w:rFonts w:ascii="DMSans-Regular" w:hAnsi="DMSans-Regular" w:eastAsia="DMSans-Regular" w:cs="DMSans-Regular"/>
@@ -899,34 +789,7 @@
       </w:r>
       <w:r>
         <w:pict>
-          <v:shape id="DocuMindTextBox38" type="#_x0000_t202" stroked="f" filled="f" o:allowincell="f" style="position:absolute;margin-left:75.796pt;margin-top:707.710pt;width:17.247pt;height:29.998pt;z-index:251659264;mso-position-horizontal-relative:page;mso-position-vertical-relative:page;mso-wrap-style:none;mso-fit-shape-to-text:t;">
-            <w10:wrap type="none"/>
-            <v:textbox inset="0,0,0,0">
-              <w:txbxContent>
-                <w:p>
-                  <w:pPr>
-                    <w:spacing w:before="0" w:after="0" w:lineRule="exact" w:line="480"/>
-                    <w:ind w:left="0" w:right="0" w:firstLine="0"/>
-                  </w:pPr>
-                  <w:r>
-                    <w:rPr>
-                      <w:rFonts w:ascii="DMSans-Regular" w:hAnsi="DMSans-Regular" w:eastAsia="DMSans-Regular" w:cs="DMSans-Regular"/>
-                      <w:b w:val="0"/>
-                      <w:i w:val="0"/>
-                      <w:color w:val="000000"/>
-                      <w:sz w:val="36"/>
-                    </w:rPr>
-                    <w:t>3.</w:t>
-                  </w:r>
-                </w:p>
-              </w:txbxContent>
-            </v:textbox>
-          </v:shape>
-        </w:pict>
-      </w:r>
-      <w:r>
-        <w:pict>
-          <v:shape id="DocuMindTextBox39" type="#_x0000_t202" stroked="f" filled="f" o:allowincell="f" style="position:absolute;margin-left:60.364pt;margin-top:795.354pt;width:177.262pt;height:41.992pt;z-index:251659264;mso-position-horizontal-relative:page;mso-position-vertical-relative:page;mso-wrap-style:none;mso-fit-shape-to-text:t;">
+          <v:shape id="DocuMindTextBox25" type="#_x0000_t202" stroked="f" filled="f" o:allowincell="f" style="position:absolute;margin-left:60.364pt;margin-top:795.854pt;width:182.262pt;height:40.992pt;z-index:251659264;mso-position-horizontal-relative:page;mso-position-vertical-relative:page;mso-wrap-style:none;mso-fit-shape-to-text:t;">
             <w10:wrap type="none"/>
             <v:textbox inset="0,0,0,0">
               <w:txbxContent>
@@ -934,6 +797,7 @@
                   <w:pPr>
                     <w:spacing w:before="0" w:after="0" w:lineRule="exact" w:line="720"/>
                     <w:ind w:left="0" w:right="0" w:firstLine="0"/>
+                    <w:jc w:val="left"/>
                   </w:pPr>
                   <w:r>
                     <w:rPr>
@@ -953,7 +817,7 @@
       </w:r>
       <w:r>
         <w:pict>
-          <v:shape id="DocuMindTextBox40" type="#_x0000_t202" stroked="f" filled="f" o:allowincell="f" style="position:absolute;margin-left:60.364pt;margin-top:849.426pt;width:466.462pt;height:29.998pt;z-index:251659264;mso-position-horizontal-relative:page;mso-position-vertical-relative:page;mso-wrap-style:none;mso-fit-shape-to-text:t;">
+          <v:shape id="DocuMindTextBox26" type="#_x0000_t202" stroked="f" filled="f" o:allowincell="f" style="position:absolute;margin-left:60.364pt;margin-top:849.926pt;width:492.638pt;height:76.995pt;z-index:251659264;mso-position-horizontal-relative:page;mso-position-vertical-relative:page;mso-wrap-style:none;mso-fit-shape-to-text:t;">
             <w10:wrap type="none"/>
             <v:textbox inset="0,0,0,0">
               <w:txbxContent>
@@ -961,6 +825,7 @@
                   <w:pPr>
                     <w:spacing w:before="0" w:after="0" w:lineRule="exact" w:line="480"/>
                     <w:ind w:left="0" w:right="0" w:firstLine="0"/>
+                    <w:jc w:val="left"/>
                   </w:pPr>
                   <w:r>
                     <w:rPr>
@@ -972,23 +837,9 @@
                     </w:rPr>
                     <w:t>Lorem ipsum dolor sit amet, consectetur adipiscing elit.</w:t>
                   </w:r>
-                </w:p>
-              </w:txbxContent>
-            </v:textbox>
-          </v:shape>
-        </w:pict>
-      </w:r>
-      <w:r>
-        <w:pict>
-          <v:shape id="DocuMindTextBox41" type="#_x0000_t202" stroked="f" filled="f" o:allowincell="f" style="position:absolute;margin-left:60.364pt;margin-top:871.029pt;width:487.638pt;height:29.998pt;z-index:251659264;mso-position-horizontal-relative:page;mso-position-vertical-relative:page;mso-wrap-style:none;mso-fit-shape-to-text:t;">
-            <w10:wrap type="none"/>
-            <v:textbox inset="0,0,0,0">
-              <w:txbxContent>
-                <w:p>
-                  <w:pPr>
-                    <w:spacing w:before="0" w:after="0" w:lineRule="exact" w:line="480"/>
-                    <w:ind w:left="0" w:right="0" w:firstLine="0"/>
-                  </w:pPr>
+                  <w:r>
+                    <w:br/>
+                  </w:r>
                   <w:r>
                     <w:rPr>
                       <w:rFonts w:ascii="DMSans-Regular" w:hAnsi="DMSans-Regular" w:eastAsia="DMSans-Regular" w:cs="DMSans-Regular"/>
@@ -997,25 +848,11 @@
                       <w:color w:val="000000"/>
                       <w:sz w:val="36"/>
                     </w:rPr>
-                    <w:t xml:space="preserve"> Integer nec odio. Praesent libero. Sed cursus ante dapibus </w:t>
+                    <w:t>Integer nec odio. Praesent libero. Sed cursus ante dapibus</w:t>
                   </w:r>
-                </w:p>
-              </w:txbxContent>
-            </v:textbox>
-          </v:shape>
-        </w:pict>
-      </w:r>
-      <w:r>
-        <w:pict>
-          <v:shape id="DocuMindTextBox42" type="#_x0000_t202" stroked="f" filled="f" o:allowincell="f" style="position:absolute;margin-left:60.364pt;margin-top:892.632pt;width:48.302pt;height:29.998pt;z-index:251659264;mso-position-horizontal-relative:page;mso-position-vertical-relative:page;mso-wrap-style:none;mso-fit-shape-to-text:t;">
-            <w10:wrap type="none"/>
-            <v:textbox inset="0,0,0,0">
-              <w:txbxContent>
-                <w:p>
-                  <w:pPr>
-                    <w:spacing w:before="0" w:after="0" w:lineRule="exact" w:line="480"/>
-                    <w:ind w:left="0" w:right="0" w:firstLine="0"/>
-                  </w:pPr>
+                  <w:r>
+                    <w:br/>
+                  </w:r>
                   <w:r>
                     <w:rPr>
                       <w:rFonts w:ascii="DMSans-Regular" w:hAnsi="DMSans-Regular" w:eastAsia="DMSans-Regular" w:cs="DMSans-Regular"/>
@@ -1054,63 +891,63 @@
       </w:r>
       <w:r>
         <w:pict>
-          <v:rect id="DocuMindTableBorder43" filled="t" fillcolor="#000000" stroked="f" o:allowincell="f" style="position:absolute;margin-left:60.730pt;margin-top:654.770pt;width:490.530pt;height:0.930pt;z-index:110;mso-position-horizontal-relative:page;mso-position-vertical-relative:page;mso-wrap-style:none;">
+          <v:rect id="DocuMindTableBorder27" filled="t" fillcolor="#000000" stroked="f" o:allowincell="f" style="position:absolute;margin-left:60.730pt;margin-top:654.770pt;width:490.530pt;height:0.930pt;z-index:110;mso-position-horizontal-relative:page;mso-position-vertical-relative:page;mso-wrap-style:none;">
             <w10:wrap type="none"/>
           </v:rect>
         </w:pict>
       </w:r>
       <w:r>
         <w:pict>
-          <v:rect id="DocuMindTableBorder44" filled="t" fillcolor="#000000" stroked="f" o:allowincell="f" style="position:absolute;margin-left:60.730pt;margin-top:713.050pt;width:490.530pt;height:0.930pt;z-index:110;mso-position-horizontal-relative:page;mso-position-vertical-relative:page;mso-wrap-style:none;">
+          <v:rect id="DocuMindTableBorder28" filled="t" fillcolor="#000000" stroked="f" o:allowincell="f" style="position:absolute;margin-left:60.730pt;margin-top:713.050pt;width:490.530pt;height:0.930pt;z-index:110;mso-position-horizontal-relative:page;mso-position-vertical-relative:page;mso-wrap-style:none;">
             <w10:wrap type="none"/>
           </v:rect>
         </w:pict>
       </w:r>
       <w:r>
         <w:pict>
-          <v:rect id="DocuMindTableBorder45" filled="t" fillcolor="#000000" stroked="f" o:allowincell="f" style="position:absolute;margin-left:60.730pt;margin-top:767.150pt;width:490.530pt;height:0.930pt;z-index:110;mso-position-horizontal-relative:page;mso-position-vertical-relative:page;mso-wrap-style:none;">
+          <v:rect id="DocuMindTableBorder29" filled="t" fillcolor="#000000" stroked="f" o:allowincell="f" style="position:absolute;margin-left:60.730pt;margin-top:767.150pt;width:490.530pt;height:0.930pt;z-index:110;mso-position-horizontal-relative:page;mso-position-vertical-relative:page;mso-wrap-style:none;">
             <w10:wrap type="none"/>
           </v:rect>
         </w:pict>
       </w:r>
       <w:r>
         <w:pict>
-          <v:rect id="DocuMindTableBorder46" filled="t" fillcolor="#000000" stroked="f" o:allowincell="f" style="position:absolute;margin-left:60.730pt;margin-top:821.370pt;width:490.530pt;height:0.930pt;z-index:110;mso-position-horizontal-relative:page;mso-position-vertical-relative:page;mso-wrap-style:none;">
+          <v:rect id="DocuMindTableBorder30" filled="t" fillcolor="#000000" stroked="f" o:allowincell="f" style="position:absolute;margin-left:60.730pt;margin-top:821.370pt;width:490.530pt;height:0.930pt;z-index:110;mso-position-horizontal-relative:page;mso-position-vertical-relative:page;mso-wrap-style:none;">
             <w10:wrap type="none"/>
           </v:rect>
         </w:pict>
       </w:r>
       <w:r>
         <w:pict>
-          <v:rect id="DocuMindTableBorder47" filled="t" fillcolor="#000000" stroked="f" o:allowincell="f" style="position:absolute;margin-left:60.730pt;margin-top:875.600pt;width:490.530pt;height:0.930pt;z-index:110;mso-position-horizontal-relative:page;mso-position-vertical-relative:page;mso-wrap-style:none;">
+          <v:rect id="DocuMindTableBorder31" filled="t" fillcolor="#000000" stroked="f" o:allowincell="f" style="position:absolute;margin-left:60.730pt;margin-top:875.600pt;width:490.530pt;height:0.930pt;z-index:110;mso-position-horizontal-relative:page;mso-position-vertical-relative:page;mso-wrap-style:none;">
             <w10:wrap type="none"/>
           </v:rect>
         </w:pict>
       </w:r>
       <w:r>
         <w:pict>
-          <v:rect id="DocuMindTableBorder48" filled="t" fillcolor="#000000" stroked="f" o:allowincell="f" style="position:absolute;margin-left:60.270pt;margin-top:655.230pt;width:0.930pt;height:220.830pt;z-index:110;mso-position-horizontal-relative:page;mso-position-vertical-relative:page;mso-wrap-style:none;">
+          <v:rect id="DocuMindTableBorder32" filled="t" fillcolor="#000000" stroked="f" o:allowincell="f" style="position:absolute;margin-left:60.270pt;margin-top:655.230pt;width:0.930pt;height:220.830pt;z-index:110;mso-position-horizontal-relative:page;mso-position-vertical-relative:page;mso-wrap-style:none;">
             <w10:wrap type="none"/>
           </v:rect>
         </w:pict>
       </w:r>
       <w:r>
         <w:pict>
-          <v:rect id="DocuMindTableBorder49" filled="t" fillcolor="#000000" stroked="f" o:allowincell="f" style="position:absolute;margin-left:305.540pt;margin-top:655.230pt;width:0.930pt;height:220.830pt;z-index:110;mso-position-horizontal-relative:page;mso-position-vertical-relative:page;mso-wrap-style:none;">
+          <v:rect id="DocuMindTableBorder33" filled="t" fillcolor="#000000" stroked="f" o:allowincell="f" style="position:absolute;margin-left:305.540pt;margin-top:655.230pt;width:0.930pt;height:220.830pt;z-index:110;mso-position-horizontal-relative:page;mso-position-vertical-relative:page;mso-wrap-style:none;">
             <w10:wrap type="none"/>
           </v:rect>
         </w:pict>
       </w:r>
       <w:r>
         <w:pict>
-          <v:rect id="DocuMindTableBorder50" filled="t" fillcolor="#000000" stroked="f" o:allowincell="f" style="position:absolute;margin-left:550.800pt;margin-top:655.230pt;width:0.930pt;height:220.830pt;z-index:110;mso-position-horizontal-relative:page;mso-position-vertical-relative:page;mso-wrap-style:none;">
+          <v:rect id="DocuMindTableBorder34" filled="t" fillcolor="#000000" stroked="f" o:allowincell="f" style="position:absolute;margin-left:550.800pt;margin-top:655.230pt;width:0.930pt;height:220.830pt;z-index:110;mso-position-horizontal-relative:page;mso-position-vertical-relative:page;mso-wrap-style:none;">
             <w10:wrap type="none"/>
           </v:rect>
         </w:pict>
       </w:r>
       <w:r>
         <w:pict>
-          <v:shape id="DocuMindTableCell51" type="#_x0000_t202" filled="f" stroked="f" o:allowincell="f" style="position:absolute;margin-left:60.734pt;margin-top:655.234pt;width:245.266pt;height:58.279pt;z-index:100;mso-position-horizontal-relative:page;mso-position-vertical-relative:page;mso-wrap-style:none;v-text-anchor:middle;">
+          <v:shape id="DocuMindTableCell35" type="#_x0000_t202" filled="f" stroked="f" o:allowincell="f" style="position:absolute;margin-left:60.734pt;margin-top:655.234pt;width:245.266pt;height:58.279pt;z-index:100;mso-position-horizontal-relative:page;mso-position-vertical-relative:page;mso-wrap-style:none;v-text-anchor:middle;">
             <w10:wrap type="none"/>
             <v:textbox inset="2.0pt,1.0pt,2.0pt,1.0pt">
               <w:txbxContent>
@@ -1138,7 +975,7 @@
       </w:r>
       <w:r>
         <w:pict>
-          <v:shape id="DocuMindTableCell52" type="#_x0000_t202" filled="f" stroked="f" o:allowincell="f" style="position:absolute;margin-left:306.000pt;margin-top:655.234pt;width:245.266pt;height:58.279pt;z-index:100;mso-position-horizontal-relative:page;mso-position-vertical-relative:page;mso-wrap-style:none;v-text-anchor:middle;">
+          <v:shape id="DocuMindTableCell36" type="#_x0000_t202" filled="f" stroked="f" o:allowincell="f" style="position:absolute;margin-left:306.000pt;margin-top:655.234pt;width:245.266pt;height:58.279pt;z-index:100;mso-position-horizontal-relative:page;mso-position-vertical-relative:page;mso-wrap-style:none;v-text-anchor:middle;">
             <w10:wrap type="none"/>
             <v:textbox inset="2.0pt,1.0pt,2.0pt,1.0pt">
               <w:txbxContent>
@@ -1166,7 +1003,7 @@
       </w:r>
       <w:r>
         <w:pict>
-          <v:shape id="DocuMindTableCell53" type="#_x0000_t202" filled="f" stroked="f" o:allowincell="f" style="position:absolute;margin-left:60.734pt;margin-top:713.514pt;width:245.266pt;height:54.099pt;z-index:100;mso-position-horizontal-relative:page;mso-position-vertical-relative:page;mso-wrap-style:none;v-text-anchor:middle;">
+          <v:shape id="DocuMindTableCell37" type="#_x0000_t202" filled="f" stroked="f" o:allowincell="f" style="position:absolute;margin-left:60.734pt;margin-top:713.514pt;width:245.266pt;height:54.099pt;z-index:100;mso-position-horizontal-relative:page;mso-position-vertical-relative:page;mso-wrap-style:none;v-text-anchor:middle;">
             <w10:wrap type="none"/>
             <v:textbox inset="2.0pt,1.0pt,2.0pt,1.0pt">
               <w:txbxContent>
@@ -1194,7 +1031,7 @@
       </w:r>
       <w:r>
         <w:pict>
-          <v:shape id="DocuMindTableCell54" type="#_x0000_t202" filled="f" stroked="f" o:allowincell="f" style="position:absolute;margin-left:306.000pt;margin-top:713.514pt;width:245.266pt;height:54.099pt;z-index:100;mso-position-horizontal-relative:page;mso-position-vertical-relative:page;mso-wrap-style:none;v-text-anchor:middle;">
+          <v:shape id="DocuMindTableCell38" type="#_x0000_t202" filled="f" stroked="f" o:allowincell="f" style="position:absolute;margin-left:306.000pt;margin-top:713.514pt;width:245.266pt;height:54.099pt;z-index:100;mso-position-horizontal-relative:page;mso-position-vertical-relative:page;mso-wrap-style:none;v-text-anchor:middle;">
             <w10:wrap type="none"/>
             <v:textbox inset="2.0pt,1.0pt,2.0pt,1.0pt">
               <w:txbxContent>
@@ -1222,7 +1059,7 @@
       </w:r>
       <w:r>
         <w:pict>
-          <v:shape id="DocuMindTableCell55" type="#_x0000_t202" filled="f" stroked="f" o:allowincell="f" style="position:absolute;margin-left:60.734pt;margin-top:767.613pt;width:245.266pt;height:54.224pt;z-index:100;mso-position-horizontal-relative:page;mso-position-vertical-relative:page;mso-wrap-style:none;v-text-anchor:middle;">
+          <v:shape id="DocuMindTableCell39" type="#_x0000_t202" filled="f" stroked="f" o:allowincell="f" style="position:absolute;margin-left:60.734pt;margin-top:767.613pt;width:245.266pt;height:54.224pt;z-index:100;mso-position-horizontal-relative:page;mso-position-vertical-relative:page;mso-wrap-style:none;v-text-anchor:middle;">
             <w10:wrap type="none"/>
             <v:textbox inset="2.0pt,1.0pt,2.0pt,1.0pt">
               <w:txbxContent>
@@ -1250,7 +1087,7 @@
       </w:r>
       <w:r>
         <w:pict>
-          <v:shape id="DocuMindTableCell56" type="#_x0000_t202" filled="f" stroked="f" o:allowincell="f" style="position:absolute;margin-left:306.000pt;margin-top:767.613pt;width:245.266pt;height:54.224pt;z-index:100;mso-position-horizontal-relative:page;mso-position-vertical-relative:page;mso-wrap-style:none;v-text-anchor:middle;">
+          <v:shape id="DocuMindTableCell40" type="#_x0000_t202" filled="f" stroked="f" o:allowincell="f" style="position:absolute;margin-left:306.000pt;margin-top:767.613pt;width:245.266pt;height:54.224pt;z-index:100;mso-position-horizontal-relative:page;mso-position-vertical-relative:page;mso-wrap-style:none;v-text-anchor:middle;">
             <w10:wrap type="none"/>
             <v:textbox inset="2.0pt,1.0pt,2.0pt,1.0pt">
               <w:txbxContent>
@@ -1278,7 +1115,7 @@
       </w:r>
       <w:r>
         <w:pict>
-          <v:shape id="DocuMindTableCell57" type="#_x0000_t202" filled="f" stroked="f" o:allowincell="f" style="position:absolute;margin-left:60.734pt;margin-top:821.837pt;width:245.266pt;height:54.224pt;z-index:100;mso-position-horizontal-relative:page;mso-position-vertical-relative:page;mso-wrap-style:none;v-text-anchor:middle;">
+          <v:shape id="DocuMindTableCell41" type="#_x0000_t202" filled="f" stroked="f" o:allowincell="f" style="position:absolute;margin-left:60.734pt;margin-top:821.837pt;width:245.266pt;height:54.224pt;z-index:100;mso-position-horizontal-relative:page;mso-position-vertical-relative:page;mso-wrap-style:none;v-text-anchor:middle;">
             <w10:wrap type="none"/>
             <v:textbox inset="2.0pt,1.0pt,2.0pt,1.0pt">
               <w:txbxContent>
@@ -1306,7 +1143,7 @@
       </w:r>
       <w:r>
         <w:pict>
-          <v:shape id="DocuMindTableCell58" type="#_x0000_t202" filled="f" stroked="f" o:allowincell="f" style="position:absolute;margin-left:306.000pt;margin-top:821.837pt;width:245.266pt;height:54.224pt;z-index:100;mso-position-horizontal-relative:page;mso-position-vertical-relative:page;mso-wrap-style:none;v-text-anchor:middle;">
+          <v:shape id="DocuMindTableCell42" type="#_x0000_t202" filled="f" stroked="f" o:allowincell="f" style="position:absolute;margin-left:306.000pt;margin-top:821.837pt;width:245.266pt;height:54.224pt;z-index:100;mso-position-horizontal-relative:page;mso-position-vertical-relative:page;mso-wrap-style:none;v-text-anchor:middle;">
             <w10:wrap type="none"/>
             <v:textbox inset="2.0pt,1.0pt,2.0pt,1.0pt">
               <w:txbxContent>
@@ -1334,7 +1171,7 @@
       </w:r>
       <w:r>
         <w:pict>
-          <v:shape id="DocuMindTextBox59" type="#_x0000_t202" stroked="f" filled="f" o:allowincell="f" style="position:absolute;margin-left:60.364pt;margin-top:56.410pt;width:225.148pt;height:44.642pt;z-index:251659264;mso-position-horizontal-relative:page;mso-position-vertical-relative:page;mso-wrap-style:none;mso-fit-shape-to-text:t;">
+          <v:shape id="DocuMindTextBox43" type="#_x0000_t202" stroked="f" filled="f" o:allowincell="f" style="position:absolute;margin-left:60.364pt;margin-top:56.910pt;width:230.148pt;height:43.642pt;z-index:251659264;mso-position-horizontal-relative:page;mso-position-vertical-relative:page;mso-wrap-style:none;mso-fit-shape-to-text:t;">
             <w10:wrap type="none"/>
             <v:textbox inset="0,0,0,0">
               <w:txbxContent>
@@ -1342,6 +1179,7 @@
                   <w:pPr>
                     <w:spacing w:before="0" w:after="0" w:lineRule="exact" w:line="773"/>
                     <w:ind w:left="0" w:right="0" w:firstLine="0"/>
+                    <w:jc w:val="left"/>
                   </w:pPr>
                   <w:r>
                     <w:rPr>
@@ -1361,14 +1199,15 @@
       </w:r>
       <w:r>
         <w:pict>
-          <v:shape id="DocuMindTextBox60" type="#_x0000_t202" stroked="f" filled="f" o:allowincell="f" style="position:absolute;margin-left:93.999pt;margin-top:119.093pt;width:83.035pt;height:31.757pt;z-index:251659264;mso-position-horizontal-relative:page;mso-position-vertical-relative:page;mso-wrap-style:none;mso-fit-shape-to-text:t;">
+          <v:shape id="DocuMindTextBox44" type="#_x0000_t202" stroked="f" filled="f" o:allowincell="f" style="position:absolute;margin-left:93.999pt;margin-top:119.593pt;width:458.193pt;height:68.068pt;z-index:251659264;mso-position-horizontal-relative:page;mso-position-vertical-relative:page;mso-wrap-style:none;mso-fit-shape-to-text:t;">
             <w10:wrap type="none"/>
             <v:textbox inset="0,0,0,0">
               <w:txbxContent>
                 <w:p>
                   <w:pPr>
-                    <w:spacing w:before="0" w:after="0" w:lineRule="exact" w:line="515"/>
+                    <w:spacing w:before="0" w:after="0" w:lineRule="exact" w:line="631"/>
                     <w:ind w:left="0" w:right="0" w:firstLine="0"/>
+                    <w:jc w:val="left"/>
                   </w:pPr>
                   <w:r>
                     <w:rPr>
@@ -1380,23 +1219,16 @@
                     </w:rPr>
                     <w:t>Surveys:</w:t>
                   </w:r>
-                </w:p>
-              </w:txbxContent>
-            </v:textbox>
-          </v:shape>
-        </w:pict>
-      </w:r>
-      <w:r>
-        <w:pict>
-          <v:shape id="DocuMindTextBox61" type="#_x0000_t202" stroked="f" filled="f" o:allowincell="f" style="position:absolute;margin-left:173.848pt;margin-top:119.093pt;width:373.343pt;height:31.757pt;z-index:251659264;mso-position-horizontal-relative:page;mso-position-vertical-relative:page;mso-wrap-style:none;mso-fit-shape-to-text:t;">
-            <w10:wrap type="none"/>
-            <v:textbox inset="0,0,0,0">
-              <w:txbxContent>
-                <w:p>
-                  <w:pPr>
-                    <w:spacing w:before="0" w:after="0" w:lineRule="exact" w:line="515"/>
-                    <w:ind w:left="0" w:right="0" w:firstLine="0"/>
-                  </w:pPr>
+                  <w:r>
+                    <w:rPr>
+                      <w:rFonts w:ascii="DMSans" w:hAnsi="DMSans" w:eastAsia="DMSans" w:cs="DMSans"/>
+                      <w:b/>
+                      <w:i w:val="0"/>
+                      <w:color w:val="000000"/>
+                      <w:sz w:val="39"/>
+                    </w:rPr>
+                    <w:t xml:space="preserve"> </w:t>
+                  </w:r>
                   <w:r>
                     <w:rPr>
                       <w:rFonts w:ascii="DMSans-Regular" w:hAnsi="DMSans-Regular" w:eastAsia="DMSans-Regular" w:cs="DMSans-Regular"/>
@@ -1405,25 +1237,11 @@
                       <w:color w:val="000000"/>
                       <w:sz w:val="39"/>
                     </w:rPr>
-                    <w:t xml:space="preserve"> Lorem ipsum dolor sit amet, consectetur </w:t>
+                    <w:t>Lorem ipsum dolor sit amet, consectetur</w:t>
                   </w:r>
-                </w:p>
-              </w:txbxContent>
-            </v:textbox>
-          </v:shape>
-        </w:pict>
-      </w:r>
-      <w:r>
-        <w:pict>
-          <v:shape id="DocuMindTextBox62" type="#_x0000_t202" stroked="f" filled="f" o:allowincell="f" style="position:absolute;margin-left:93.999pt;margin-top:150.627pt;width:130.292pt;height:31.757pt;z-index:251659264;mso-position-horizontal-relative:page;mso-position-vertical-relative:page;mso-wrap-style:none;mso-fit-shape-to-text:t;">
-            <w10:wrap type="none"/>
-            <v:textbox inset="0,0,0,0">
-              <w:txbxContent>
-                <w:p>
-                  <w:pPr>
-                    <w:spacing w:before="0" w:after="0" w:lineRule="exact" w:line="515"/>
-                    <w:ind w:left="0" w:right="0" w:firstLine="0"/>
-                  </w:pPr>
+                  <w:r>
+                    <w:br/>
+                  </w:r>
                   <w:r>
                     <w:rPr>
                       <w:rFonts w:ascii="DMSans-Regular" w:hAnsi="DMSans-Regular" w:eastAsia="DMSans-Regular" w:cs="DMSans-Regular"/>
@@ -1442,14 +1260,15 @@
       </w:r>
       <w:r>
         <w:pict>
-          <v:shape id="DocuMindTextBox63" type="#_x0000_t202" stroked="f" filled="f" o:allowincell="f" style="position:absolute;margin-left:93.999pt;margin-top:182.161pt;width:105.348pt;height:31.757pt;z-index:251659264;mso-position-horizontal-relative:page;mso-position-vertical-relative:page;mso-wrap-style:none;mso-fit-shape-to-text:t;">
+          <v:shape id="DocuMindTextBox45" type="#_x0000_t202" stroked="f" filled="f" o:allowincell="f" style="position:absolute;margin-left:93.999pt;margin-top:182.661pt;width:447.896pt;height:68.068pt;z-index:251659264;mso-position-horizontal-relative:page;mso-position-vertical-relative:page;mso-wrap-style:none;mso-fit-shape-to-text:t;">
             <w10:wrap type="none"/>
             <v:textbox inset="0,0,0,0">
               <w:txbxContent>
                 <w:p>
                   <w:pPr>
-                    <w:spacing w:before="0" w:after="0" w:lineRule="exact" w:line="515"/>
+                    <w:spacing w:before="0" w:after="0" w:lineRule="exact" w:line="631"/>
                     <w:ind w:left="0" w:right="0" w:firstLine="0"/>
+                    <w:jc w:val="left"/>
                   </w:pPr>
                   <w:r>
                     <w:rPr>
@@ -1461,23 +1280,16 @@
                     </w:rPr>
                     <w:t>Interviews:</w:t>
                   </w:r>
-                </w:p>
-              </w:txbxContent>
-            </v:textbox>
-          </v:shape>
-        </w:pict>
-      </w:r>
-      <w:r>
-        <w:pict>
-          <v:shape id="DocuMindTextBox64" type="#_x0000_t202" stroked="f" filled="f" o:allowincell="f" style="position:absolute;margin-left:196.151pt;margin-top:182.161pt;width:340.744pt;height:31.757pt;z-index:251659264;mso-position-horizontal-relative:page;mso-position-vertical-relative:page;mso-wrap-style:none;mso-fit-shape-to-text:t;">
-            <w10:wrap type="none"/>
-            <v:textbox inset="0,0,0,0">
-              <w:txbxContent>
-                <w:p>
-                  <w:pPr>
-                    <w:spacing w:before="0" w:after="0" w:lineRule="exact" w:line="515"/>
-                    <w:ind w:left="0" w:right="0" w:firstLine="0"/>
-                  </w:pPr>
+                  <w:r>
+                    <w:rPr>
+                      <w:rFonts w:ascii="DMSans" w:hAnsi="DMSans" w:eastAsia="DMSans" w:cs="DMSans"/>
+                      <w:b/>
+                      <w:i w:val="0"/>
+                      <w:color w:val="000000"/>
+                      <w:sz w:val="39"/>
+                    </w:rPr>
+                    <w:t xml:space="preserve"> </w:t>
+                  </w:r>
                   <w:r>
                     <w:rPr>
                       <w:rFonts w:ascii="DMSans-Regular" w:hAnsi="DMSans-Regular" w:eastAsia="DMSans-Regular" w:cs="DMSans-Regular"/>
@@ -1486,25 +1298,11 @@
                       <w:color w:val="000000"/>
                       <w:sz w:val="39"/>
                     </w:rPr>
-                    <w:t xml:space="preserve"> Integer nec odio. Praesent libero. Sed </w:t>
+                    <w:t>Integer nec odio. Praesent libero. Sed</w:t>
                   </w:r>
-                </w:p>
-              </w:txbxContent>
-            </v:textbox>
-          </v:shape>
-        </w:pict>
-      </w:r>
-      <w:r>
-        <w:pict>
-          <v:shape id="DocuMindTextBox65" type="#_x0000_t202" stroked="f" filled="f" o:allowincell="f" style="position:absolute;margin-left:93.999pt;margin-top:213.695pt;width:239.089pt;height:31.757pt;z-index:251659264;mso-position-horizontal-relative:page;mso-position-vertical-relative:page;mso-wrap-style:none;mso-fit-shape-to-text:t;">
-            <w10:wrap type="none"/>
-            <v:textbox inset="0,0,0,0">
-              <w:txbxContent>
-                <w:p>
-                  <w:pPr>
-                    <w:spacing w:before="0" w:after="0" w:lineRule="exact" w:line="515"/>
-                    <w:ind w:left="0" w:right="0" w:firstLine="0"/>
-                  </w:pPr>
+                  <w:r>
+                    <w:br/>
+                  </w:r>
                   <w:r>
                     <w:rPr>
                       <w:rFonts w:ascii="DMSans-Regular" w:hAnsi="DMSans-Regular" w:eastAsia="DMSans-Regular" w:cs="DMSans-Regular"/>
@@ -1523,14 +1321,15 @@
       </w:r>
       <w:r>
         <w:pict>
-          <v:shape id="DocuMindTextBox66" type="#_x0000_t202" stroked="f" filled="f" o:allowincell="f" style="position:absolute;margin-left:93.999pt;margin-top:245.229pt;width:134.367pt;height:31.757pt;z-index:251659264;mso-position-horizontal-relative:page;mso-position-vertical-relative:page;mso-wrap-style:none;mso-fit-shape-to-text:t;">
+          <v:shape id="DocuMindTextBox46" type="#_x0000_t202" stroked="f" filled="f" o:allowincell="f" style="position:absolute;margin-left:93.999pt;margin-top:245.729pt;width:418.945pt;height:68.068pt;z-index:251659264;mso-position-horizontal-relative:page;mso-position-vertical-relative:page;mso-wrap-style:none;mso-fit-shape-to-text:t;">
             <w10:wrap type="none"/>
             <v:textbox inset="0,0,0,0">
               <w:txbxContent>
                 <w:p>
                   <w:pPr>
-                    <w:spacing w:before="0" w:after="0" w:lineRule="exact" w:line="515"/>
+                    <w:spacing w:before="0" w:after="0" w:lineRule="exact" w:line="631"/>
                     <w:ind w:left="0" w:right="0" w:firstLine="0"/>
+                    <w:jc w:val="left"/>
                   </w:pPr>
                   <w:r>
                     <w:rPr>
@@ -1542,23 +1341,16 @@
                     </w:rPr>
                     <w:t>Observations:</w:t>
                   </w:r>
-                </w:p>
-              </w:txbxContent>
-            </v:textbox>
-          </v:shape>
-        </w:pict>
-      </w:r>
-      <w:r>
-        <w:pict>
-          <v:shape id="DocuMindTextBox67" type="#_x0000_t202" stroked="f" filled="f" o:allowincell="f" style="position:absolute;margin-left:225.178pt;margin-top:245.229pt;width:282.766pt;height:31.757pt;z-index:251659264;mso-position-horizontal-relative:page;mso-position-vertical-relative:page;mso-wrap-style:none;mso-fit-shape-to-text:t;">
-            <w10:wrap type="none"/>
-            <v:textbox inset="0,0,0,0">
-              <w:txbxContent>
-                <w:p>
-                  <w:pPr>
-                    <w:spacing w:before="0" w:after="0" w:lineRule="exact" w:line="515"/>
-                    <w:ind w:left="0" w:right="0" w:firstLine="0"/>
-                  </w:pPr>
+                  <w:r>
+                    <w:rPr>
+                      <w:rFonts w:ascii="DMSans" w:hAnsi="DMSans" w:eastAsia="DMSans" w:cs="DMSans"/>
+                      <w:b/>
+                      <w:i w:val="0"/>
+                      <w:color w:val="000000"/>
+                      <w:sz w:val="39"/>
+                    </w:rPr>
+                    <w:t xml:space="preserve"> </w:t>
+                  </w:r>
                   <w:r>
                     <w:rPr>
                       <w:rFonts w:ascii="DMSans-Regular" w:hAnsi="DMSans-Regular" w:eastAsia="DMSans-Regular" w:cs="DMSans-Regular"/>
@@ -1567,25 +1359,11 @@
                       <w:color w:val="000000"/>
                       <w:sz w:val="39"/>
                     </w:rPr>
-                    <w:t xml:space="preserve"> Sed nisi. Nulla quis sem at nibh </w:t>
+                    <w:t>Sed nisi. Nulla quis sem at nibh</w:t>
                   </w:r>
-                </w:p>
-              </w:txbxContent>
-            </v:textbox>
-          </v:shape>
-        </w:pict>
-      </w:r>
-      <w:r>
-        <w:pict>
-          <v:shape id="DocuMindTextBox68" type="#_x0000_t202" stroked="f" filled="f" o:allowincell="f" style="position:absolute;margin-left:93.999pt;margin-top:276.763pt;width:201.544pt;height:31.757pt;z-index:251659264;mso-position-horizontal-relative:page;mso-position-vertical-relative:page;mso-wrap-style:none;mso-fit-shape-to-text:t;">
-            <w10:wrap type="none"/>
-            <v:textbox inset="0,0,0,0">
-              <w:txbxContent>
-                <w:p>
-                  <w:pPr>
-                    <w:spacing w:before="0" w:after="0" w:lineRule="exact" w:line="515"/>
-                    <w:ind w:left="0" w:right="0" w:firstLine="0"/>
-                  </w:pPr>
+                  <w:r>
+                    <w:br/>
+                  </w:r>
                   <w:r>
                     <w:rPr>
                       <w:rFonts w:ascii="DMSans-Regular" w:hAnsi="DMSans-Regular" w:eastAsia="DMSans-Regular" w:cs="DMSans-Regular"/>
@@ -1604,7 +1382,7 @@
       </w:r>
       <w:r>
         <w:pict>
-          <v:shape id="DocuMindTextBox69" type="#_x0000_t202" stroked="f" filled="f" o:allowincell="f" style="position:absolute;margin-left:60.364pt;margin-top:339.297pt;width:198.284pt;height:44.630pt;z-index:251659264;mso-position-horizontal-relative:page;mso-position-vertical-relative:page;mso-wrap-style:none;mso-fit-shape-to-text:t;">
+          <v:shape id="DocuMindTextBox47" type="#_x0000_t202" stroked="f" filled="f" o:allowincell="f" style="position:absolute;margin-left:60.364pt;margin-top:339.797pt;width:203.284pt;height:43.630pt;z-index:251659264;mso-position-horizontal-relative:page;mso-position-vertical-relative:page;mso-wrap-style:none;mso-fit-shape-to-text:t;">
             <w10:wrap type="none"/>
             <v:textbox inset="0,0,0,0">
               <w:txbxContent>
@@ -1612,6 +1390,7 @@
                   <w:pPr>
                     <w:spacing w:before="0" w:after="0" w:lineRule="exact" w:line="773"/>
                     <w:ind w:left="0" w:right="0" w:firstLine="0"/>
+                    <w:jc w:val="left"/>
                   </w:pPr>
                   <w:r>
                     <w:rPr>
@@ -1631,14 +1410,15 @@
       </w:r>
       <w:r>
         <w:pict>
-          <v:shape id="DocuMindTextBox70" type="#_x0000_t202" stroked="f" filled="f" o:allowincell="f" style="position:absolute;margin-left:93.999pt;margin-top:401.971pt;width:209.417pt;height:31.757pt;z-index:251659264;mso-position-horizontal-relative:page;mso-position-vertical-relative:page;mso-wrap-style:none;mso-fit-shape-to-text:t;">
+          <v:shape id="DocuMindTextBox48" type="#_x0000_t202" stroked="f" filled="f" o:allowincell="f" style="position:absolute;margin-left:93.999pt;margin-top:402.471pt;width:415.031pt;height:68.068pt;z-index:251659264;mso-position-horizontal-relative:page;mso-position-vertical-relative:page;mso-wrap-style:none;mso-fit-shape-to-text:t;">
             <w10:wrap type="none"/>
             <v:textbox inset="0,0,0,0">
               <w:txbxContent>
                 <w:p>
                   <w:pPr>
-                    <w:spacing w:before="0" w:after="0" w:lineRule="exact" w:line="515"/>
+                    <w:spacing w:before="0" w:after="0" w:lineRule="exact" w:line="631"/>
                     <w:ind w:left="0" w:right="0" w:firstLine="0"/>
+                    <w:jc w:val="left"/>
                   </w:pPr>
                   <w:r>
                     <w:rPr>
@@ -1650,23 +1430,16 @@
                     </w:rPr>
                     <w:t>Quantitative Analysis:</w:t>
                   </w:r>
-                </w:p>
-              </w:txbxContent>
-            </v:textbox>
-          </v:shape>
-        </w:pict>
-      </w:r>
-      <w:r>
-        <w:pict>
-          <v:shape id="DocuMindTextBox71" type="#_x0000_t202" stroked="f" filled="f" o:allowincell="f" style="position:absolute;margin-left:300.231pt;margin-top:401.971pt;width:203.799pt;height:31.757pt;z-index:251659264;mso-position-horizontal-relative:page;mso-position-vertical-relative:page;mso-wrap-style:none;mso-fit-shape-to-text:t;">
-            <w10:wrap type="none"/>
-            <v:textbox inset="0,0,0,0">
-              <w:txbxContent>
-                <w:p>
-                  <w:pPr>
-                    <w:spacing w:before="0" w:after="0" w:lineRule="exact" w:line="515"/>
-                    <w:ind w:left="0" w:right="0" w:firstLine="0"/>
-                  </w:pPr>
+                  <w:r>
+                    <w:rPr>
+                      <w:rFonts w:ascii="DMSans" w:hAnsi="DMSans" w:eastAsia="DMSans" w:cs="DMSans"/>
+                      <w:b/>
+                      <w:i w:val="0"/>
+                      <w:color w:val="000000"/>
+                      <w:sz w:val="39"/>
+                    </w:rPr>
+                    <w:t xml:space="preserve"> </w:t>
+                  </w:r>
                   <w:r>
                     <w:rPr>
                       <w:rFonts w:ascii="DMSans-Regular" w:hAnsi="DMSans-Regular" w:eastAsia="DMSans-Regular" w:cs="DMSans-Regular"/>
@@ -1675,25 +1448,11 @@
                       <w:color w:val="000000"/>
                       <w:sz w:val="39"/>
                     </w:rPr>
-                    <w:t xml:space="preserve"> Lorem ipsum dolor sit </w:t>
+                    <w:t>Lorem ipsum dolor sit</w:t>
                   </w:r>
-                </w:p>
-              </w:txbxContent>
-            </v:textbox>
-          </v:shape>
-        </w:pict>
-      </w:r>
-      <w:r>
-        <w:pict>
-          <v:shape id="DocuMindTextBox72" type="#_x0000_t202" stroked="f" filled="f" o:allowincell="f" style="position:absolute;margin-left:93.999pt;margin-top:433.505pt;width:299.836pt;height:31.757pt;z-index:251659264;mso-position-horizontal-relative:page;mso-position-vertical-relative:page;mso-wrap-style:none;mso-fit-shape-to-text:t;">
-            <w10:wrap type="none"/>
-            <v:textbox inset="0,0,0,0">
-              <w:txbxContent>
-                <w:p>
-                  <w:pPr>
-                    <w:spacing w:before="0" w:after="0" w:lineRule="exact" w:line="515"/>
-                    <w:ind w:left="0" w:right="0" w:firstLine="0"/>
-                  </w:pPr>
+                  <w:r>
+                    <w:br/>
+                  </w:r>
                   <w:r>
                     <w:rPr>
                       <w:rFonts w:ascii="DMSans-Regular" w:hAnsi="DMSans-Regular" w:eastAsia="DMSans-Regular" w:cs="DMSans-Regular"/>
@@ -1712,14 +1471,15 @@
       </w:r>
       <w:r>
         <w:pict>
-          <v:shape id="DocuMindTextBox73" type="#_x0000_t202" stroked="f" filled="f" o:allowincell="f" style="position:absolute;margin-left:93.999pt;margin-top:465.039pt;width:194.383pt;height:31.757pt;z-index:251659264;mso-position-horizontal-relative:page;mso-position-vertical-relative:page;mso-wrap-style:none;mso-fit-shape-to-text:t;">
+          <v:shape id="DocuMindTextBox49" type="#_x0000_t202" stroked="f" filled="f" o:allowincell="f" style="position:absolute;margin-left:93.999pt;margin-top:465.539pt;width:438.166pt;height:68.068pt;z-index:251659264;mso-position-horizontal-relative:page;mso-position-vertical-relative:page;mso-wrap-style:none;mso-fit-shape-to-text:t;">
             <w10:wrap type="none"/>
             <v:textbox inset="0,0,0,0">
               <w:txbxContent>
                 <w:p>
                   <w:pPr>
-                    <w:spacing w:before="0" w:after="0" w:lineRule="exact" w:line="515"/>
+                    <w:spacing w:before="0" w:after="0" w:lineRule="exact" w:line="631"/>
                     <w:ind w:left="0" w:right="0" w:firstLine="0"/>
+                    <w:jc w:val="left"/>
                   </w:pPr>
                   <w:r>
                     <w:rPr>
@@ -1731,23 +1491,16 @@
                     </w:rPr>
                     <w:t>Qualitative Analysis:</w:t>
                   </w:r>
-                </w:p>
-              </w:txbxContent>
-            </v:textbox>
-          </v:shape>
-        </w:pict>
-      </w:r>
-      <w:r>
-        <w:pict>
-          <v:shape id="DocuMindTextBox74" type="#_x0000_t202" stroked="f" filled="f" o:allowincell="f" style="position:absolute;margin-left:285.188pt;margin-top:465.039pt;width:241.977pt;height:31.757pt;z-index:251659264;mso-position-horizontal-relative:page;mso-position-vertical-relative:page;mso-wrap-style:none;mso-fit-shape-to-text:t;">
-            <w10:wrap type="none"/>
-            <v:textbox inset="0,0,0,0">
-              <w:txbxContent>
-                <w:p>
-                  <w:pPr>
-                    <w:spacing w:before="0" w:after="0" w:lineRule="exact" w:line="515"/>
-                    <w:ind w:left="0" w:right="0" w:firstLine="0"/>
-                  </w:pPr>
+                  <w:r>
+                    <w:rPr>
+                      <w:rFonts w:ascii="DMSans" w:hAnsi="DMSans" w:eastAsia="DMSans" w:cs="DMSans"/>
+                      <w:b/>
+                      <w:i w:val="0"/>
+                      <w:color w:val="000000"/>
+                      <w:sz w:val="39"/>
+                    </w:rPr>
+                    <w:t xml:space="preserve"> </w:t>
+                  </w:r>
                   <w:r>
                     <w:rPr>
                       <w:rFonts w:ascii="DMSans-Regular" w:hAnsi="DMSans-Regular" w:eastAsia="DMSans-Regular" w:cs="DMSans-Regular"/>
@@ -1756,25 +1509,11 @@
                       <w:color w:val="000000"/>
                       <w:sz w:val="39"/>
                     </w:rPr>
-                    <w:t xml:space="preserve"> Integer nec odio. Praesent </w:t>
+                    <w:t>Integer nec odio. Praesent</w:t>
                   </w:r>
-                </w:p>
-              </w:txbxContent>
-            </v:textbox>
-          </v:shape>
-        </w:pict>
-      </w:r>
-      <w:r>
-        <w:pict>
-          <v:shape id="DocuMindTextBox75" type="#_x0000_t202" stroked="f" filled="f" o:allowincell="f" style="position:absolute;margin-left:93.999pt;margin-top:496.573pt;width:337.856pt;height:31.757pt;z-index:251659264;mso-position-horizontal-relative:page;mso-position-vertical-relative:page;mso-wrap-style:none;mso-fit-shape-to-text:t;">
-            <w10:wrap type="none"/>
-            <v:textbox inset="0,0,0,0">
-              <w:txbxContent>
-                <w:p>
-                  <w:pPr>
-                    <w:spacing w:before="0" w:after="0" w:lineRule="exact" w:line="515"/>
-                    <w:ind w:left="0" w:right="0" w:firstLine="0"/>
-                  </w:pPr>
+                  <w:r>
+                    <w:br/>
+                  </w:r>
                   <w:r>
                     <w:rPr>
                       <w:rFonts w:ascii="DMSans-Regular" w:hAnsi="DMSans-Regular" w:eastAsia="DMSans-Regular" w:cs="DMSans-Regular"/>
@@ -1793,7 +1532,7 @@
       </w:r>
       <w:r>
         <w:pict>
-          <v:shape id="DocuMindTextBox76" type="#_x0000_t202" stroked="f" filled="f" o:allowincell="f" style="position:absolute;margin-left:60.364pt;margin-top:559.098pt;width:108.628pt;height:44.642pt;z-index:251659264;mso-position-horizontal-relative:page;mso-position-vertical-relative:page;mso-wrap-style:none;mso-fit-shape-to-text:t;">
+          <v:shape id="DocuMindTextBox50" type="#_x0000_t202" stroked="f" filled="f" o:allowincell="f" style="position:absolute;margin-left:60.364pt;margin-top:559.598pt;width:113.628pt;height:43.642pt;z-index:251659264;mso-position-horizontal-relative:page;mso-position-vertical-relative:page;mso-wrap-style:none;mso-fit-shape-to-text:t;">
             <w10:wrap type="none"/>
             <v:textbox inset="0,0,0,0">
               <w:txbxContent>
@@ -1801,6 +1540,7 @@
                   <w:pPr>
                     <w:spacing w:before="0" w:after="0" w:lineRule="exact" w:line="773"/>
                     <w:ind w:left="0" w:right="0" w:firstLine="0"/>
+                    <w:jc w:val="left"/>
                   </w:pPr>
                   <w:r>
                     <w:rPr>
@@ -1820,7 +1560,7 @@
       </w:r>
       <w:r>
         <w:pict>
-          <v:shape id="DocuMindTextBox77" type="#_x0000_t202" stroked="f" filled="f" o:allowincell="f" style="position:absolute;margin-left:60.364pt;margin-top:617.144pt;width:465.444pt;height:31.757pt;z-index:251659264;mso-position-horizontal-relative:page;mso-position-vertical-relative:page;mso-wrap-style:none;mso-fit-shape-to-text:t;">
+          <v:shape id="DocuMindTextBox51" type="#_x0000_t202" stroked="f" filled="f" o:allowincell="f" style="position:absolute;margin-left:60.364pt;margin-top:617.644pt;width:470.444pt;height:30.757pt;z-index:251659264;mso-position-horizontal-relative:page;mso-position-vertical-relative:page;mso-wrap-style:none;mso-fit-shape-to-text:t;">
             <w10:wrap type="none"/>
             <v:textbox inset="0,0,0,0">
               <w:txbxContent>
@@ -1828,6 +1568,7 @@
                   <w:pPr>
                     <w:spacing w:before="0" w:after="0" w:lineRule="exact" w:line="515"/>
                     <w:ind w:left="0" w:right="0" w:firstLine="0"/>
+                    <w:jc w:val="left"/>
                   </w:pPr>
                   <w:r>
                     <w:rPr>
@@ -1847,7 +1588,7 @@
       </w:r>
       <w:r>
         <w:pict>
-          <v:shape id="DocuMindTextBox78" type="#_x0000_t202" stroked="f" filled="f" o:allowincell="f" style="position:absolute;margin-left:60.364pt;margin-top:895.385pt;width:342.663pt;height:31.757pt;z-index:251659264;mso-position-horizontal-relative:page;mso-position-vertical-relative:page;mso-wrap-style:none;mso-fit-shape-to-text:t;">
+          <v:shape id="DocuMindTextBox52" type="#_x0000_t202" stroked="f" filled="f" o:allowincell="f" style="position:absolute;margin-left:60.364pt;margin-top:895.885pt;width:347.663pt;height:30.757pt;z-index:251659264;mso-position-horizontal-relative:page;mso-position-vertical-relative:page;mso-wrap-style:none;mso-fit-shape-to-text:t;">
             <w10:wrap type="none"/>
             <v:textbox inset="0,0,0,0">
               <w:txbxContent>
@@ -1855,6 +1596,7 @@
                   <w:pPr>
                     <w:spacing w:before="0" w:after="0" w:lineRule="exact" w:line="515"/>
                     <w:ind w:left="0" w:right="0" w:firstLine="0"/>
+                    <w:jc w:val="left"/>
                   </w:pPr>
                   <w:r>
                     <w:rPr>
@@ -1894,7 +1636,7 @@
       </w:r>
       <w:r>
         <w:pict>
-          <v:shape id="DocuMindTextBox79" type="#_x0000_t202" stroked="f" filled="f" o:allowincell="f" style="position:absolute;margin-left:60.431pt;margin-top:56.457pt;width:260.830pt;height:43.516pt;z-index:251659264;mso-position-horizontal-relative:page;mso-position-vertical-relative:page;mso-wrap-style:none;mso-fit-shape-to-text:t;">
+          <v:shape id="DocuMindTextBox53" type="#_x0000_t202" stroked="f" filled="f" o:allowincell="f" style="position:absolute;margin-left:60.431pt;margin-top:56.957pt;width:265.830pt;height:42.516pt;z-index:251659264;mso-position-horizontal-relative:page;mso-position-vertical-relative:page;mso-wrap-style:none;mso-fit-shape-to-text:t;">
             <w10:wrap type="none"/>
             <v:textbox inset="0,0,0,0">
               <w:txbxContent>
@@ -1902,6 +1644,7 @@
                   <w:pPr>
                     <w:spacing w:before="0" w:after="0" w:lineRule="exact" w:line="750"/>
                     <w:ind w:left="0" w:right="0" w:firstLine="0"/>
+                    <w:jc w:val="left"/>
                   </w:pPr>
                   <w:r>
                     <w:rPr>
@@ -1921,7 +1664,7 @@
       </w:r>
       <w:r>
         <w:pict>
-          <v:shape id="DocuMindTextBox80" type="#_x0000_t202" stroked="f" filled="f" o:allowincell="f" style="position:absolute;margin-left:60.431pt;margin-top:112.811pt;width:467.641pt;height:31.007pt;z-index:251659264;mso-position-horizontal-relative:page;mso-position-vertical-relative:page;mso-wrap-style:none;mso-fit-shape-to-text:t;">
+          <v:shape id="DocuMindTextBox54" type="#_x0000_t202" stroked="f" filled="f" o:allowincell="f" style="position:absolute;margin-left:60.431pt;margin-top:113.311pt;width:472.641pt;height:55.014pt;z-index:251659264;mso-position-horizontal-relative:page;mso-position-vertical-relative:page;mso-wrap-style:none;mso-fit-shape-to-text:t;">
             <w10:wrap type="none"/>
             <v:textbox inset="0,0,0,0">
               <w:txbxContent>
@@ -1929,6 +1672,7 @@
                   <w:pPr>
                     <w:spacing w:before="0" w:after="0" w:lineRule="exact" w:line="500"/>
                     <w:ind w:left="0" w:right="0" w:firstLine="0"/>
+                    <w:jc w:val="left"/>
                   </w:pPr>
                   <w:r>
                     <w:rPr>
@@ -1938,25 +1682,11 @@
                       <w:color w:val="000000"/>
                       <w:sz w:val="38"/>
                     </w:rPr>
-                    <w:t xml:space="preserve">Below is a placeholder for a bar chart showing market </w:t>
+                    <w:t>Below is a placeholder for a bar chart showing market</w:t>
                   </w:r>
-                </w:p>
-              </w:txbxContent>
-            </v:textbox>
-          </v:shape>
-        </w:pict>
-      </w:r>
-      <w:r>
-        <w:pict>
-          <v:shape id="DocuMindTextBox81" type="#_x0000_t202" stroked="f" filled="f" o:allowincell="f" style="position:absolute;margin-left:60.431pt;margin-top:135.322pt;width:276.745pt;height:31.007pt;z-index:251659264;mso-position-horizontal-relative:page;mso-position-vertical-relative:page;mso-wrap-style:none;mso-fit-shape-to-text:t;">
-            <w10:wrap type="none"/>
-            <v:textbox inset="0,0,0,0">
-              <w:txbxContent>
-                <w:p>
-                  <w:pPr>
-                    <w:spacing w:before="0" w:after="0" w:lineRule="exact" w:line="500"/>
-                    <w:ind w:left="0" w:right="0" w:firstLine="0"/>
-                  </w:pPr>
+                  <w:r>
+                    <w:br/>
+                  </w:r>
                   <w:r>
                     <w:rPr>
                       <w:rFonts w:ascii="DMSans-Regular" w:hAnsi="DMSans-Regular" w:eastAsia="DMSans-Regular" w:cs="DMSans-Regular"/>
@@ -1975,7 +1705,7 @@
       </w:r>
       <w:r>
         <w:pict>
-          <v:shape id="DocuMindTextBox82" type="#_x0000_t202" stroked="f" filled="f" o:allowincell="f" style="position:absolute;margin-left:60.431pt;margin-top:878.189pt;width:439.160pt;height:31.007pt;z-index:251659264;mso-position-horizontal-relative:page;mso-position-vertical-relative:page;mso-wrap-style:none;mso-fit-shape-to-text:t;">
+          <v:shape id="DocuMindTextBox55" type="#_x0000_t202" stroked="f" filled="f" o:allowincell="f" style="position:absolute;margin-left:60.431pt;margin-top:878.689pt;width:444.160pt;height:30.007pt;z-index:251659264;mso-position-horizontal-relative:page;mso-position-vertical-relative:page;mso-wrap-style:none;mso-fit-shape-to-text:t;">
             <w10:wrap type="none"/>
             <v:textbox inset="0,0,0,0">
               <w:txbxContent>
@@ -1983,6 +1713,7 @@
                   <w:pPr>
                     <w:spacing w:before="0" w:after="0" w:lineRule="exact" w:line="500"/>
                     <w:ind w:left="0" w:right="0" w:firstLine="0"/>
+                    <w:jc w:val="left"/>
                   </w:pPr>
                   <w:r>
                     <w:rPr>
@@ -1993,654 +1724,6 @@
                       <w:sz w:val="38"/>
                     </w:rPr>
                     <w:t>(Figure 1: Market Growth Over the Past Five Years)</w:t>
-                  </w:r>
-                </w:p>
-              </w:txbxContent>
-            </v:textbox>
-          </v:shape>
-        </w:pict>
-      </w:r>
-      <w:r>
-        <w:pict>
-          <v:shape id="DocuMindTextBox83" type="#_x0000_t202" stroked="f" filled="f" o:allowincell="f" style="position:absolute;margin-left:232.051pt;margin-top:210.436pt;width:74.451pt;height:33.483pt;z-index:251659264;mso-position-horizontal-relative:page;mso-position-vertical-relative:page;mso-wrap-style:none;mso-fit-shape-to-text:t;">
-            <w10:wrap type="none"/>
-            <v:textbox inset="0,0,0,0">
-              <w:txbxContent>
-                <w:p>
-                  <w:pPr>
-                    <w:spacing w:before="0" w:after="0" w:lineRule="exact" w:line="550"/>
-                    <w:ind w:left="0" w:right="0" w:firstLine="0"/>
-                  </w:pPr>
-                  <w:r>
-                    <w:rPr>
-                      <w:rFonts w:ascii="DMSans-Regular" w:hAnsi="DMSans-Regular" w:eastAsia="DMSans-Regular" w:cs="DMSans-Regular"/>
-                      <w:b w:val="0"/>
-                      <w:i w:val="0"/>
-                      <w:color w:val="000000"/>
-                      <w:sz w:val="42"/>
-                    </w:rPr>
-                    <w:t>Series 1</w:t>
-                  </w:r>
-                </w:p>
-              </w:txbxContent>
-            </v:textbox>
-          </v:shape>
-        </w:pict>
-      </w:r>
-      <w:r>
-        <w:pict>
-          <v:shape id="DocuMindTextBox84" type="#_x0000_t202" stroked="f" filled="f" o:allowincell="f" style="position:absolute;margin-left:366.967pt;margin-top:210.436pt;width:80.150pt;height:33.483pt;z-index:251659264;mso-position-horizontal-relative:page;mso-position-vertical-relative:page;mso-wrap-style:none;mso-fit-shape-to-text:t;">
-            <w10:wrap type="none"/>
-            <v:textbox inset="0,0,0,0">
-              <w:txbxContent>
-                <w:p>
-                  <w:pPr>
-                    <w:spacing w:before="0" w:after="0" w:lineRule="exact" w:line="550"/>
-                    <w:ind w:left="0" w:right="0" w:firstLine="0"/>
-                  </w:pPr>
-                  <w:r>
-                    <w:rPr>
-                      <w:rFonts w:ascii="DMSans-Regular" w:hAnsi="DMSans-Regular" w:eastAsia="DMSans-Regular" w:cs="DMSans-Regular"/>
-                      <w:b w:val="0"/>
-                      <w:i w:val="0"/>
-                      <w:color w:val="000000"/>
-                      <w:sz w:val="42"/>
-                    </w:rPr>
-                    <w:t>Series 2</w:t>
-                  </w:r>
-                </w:p>
-              </w:txbxContent>
-            </v:textbox>
-          </v:shape>
-        </w:pict>
-      </w:r>
-      <w:r>
-        <w:pict>
-          <v:shape id="DocuMindTextBox85" type="#_x0000_t202" stroked="f" filled="f" o:allowincell="f" style="position:absolute;margin-left:139.976pt;margin-top:458.497pt;width:58.641pt;height:33.483pt;z-index:251659264;mso-position-horizontal-relative:page;mso-position-vertical-relative:page;mso-wrap-style:none;mso-fit-shape-to-text:t;">
-            <w10:wrap type="none"/>
-            <v:textbox inset="0,0,0,0">
-              <w:txbxContent>
-                <w:p>
-                  <w:pPr>
-                    <w:spacing w:before="0" w:after="0" w:lineRule="exact" w:line="550"/>
-                    <w:ind w:left="0" w:right="0" w:firstLine="0"/>
-                  </w:pPr>
-                  <w:r>
-                    <w:rPr>
-                      <w:rFonts w:ascii="DMSans-Regular" w:hAnsi="DMSans-Regular" w:eastAsia="DMSans-Regular" w:cs="DMSans-Regular"/>
-                      <w:b w:val="0"/>
-                      <w:i w:val="0"/>
-                      <w:color w:val="000000"/>
-                      <w:sz w:val="42"/>
-                    </w:rPr>
-                    <w:t>Item 1</w:t>
-                  </w:r>
-                </w:p>
-              </w:txbxContent>
-            </v:textbox>
-          </v:shape>
-        </w:pict>
-      </w:r>
-      <w:r>
-        <w:pict>
-          <v:shape id="DocuMindTextBox86" type="#_x0000_t202" stroked="f" filled="f" o:allowincell="f" style="position:absolute;margin-left:293.456pt;margin-top:458.497pt;width:64.340pt;height:33.483pt;z-index:251659264;mso-position-horizontal-relative:page;mso-position-vertical-relative:page;mso-wrap-style:none;mso-fit-shape-to-text:t;">
-            <w10:wrap type="none"/>
-            <v:textbox inset="0,0,0,0">
-              <w:txbxContent>
-                <w:p>
-                  <w:pPr>
-                    <w:spacing w:before="0" w:after="0" w:lineRule="exact" w:line="550"/>
-                    <w:ind w:left="0" w:right="0" w:firstLine="0"/>
-                  </w:pPr>
-                  <w:r>
-                    <w:rPr>
-                      <w:rFonts w:ascii="DMSans-Regular" w:hAnsi="DMSans-Regular" w:eastAsia="DMSans-Regular" w:cs="DMSans-Regular"/>
-                      <w:b w:val="0"/>
-                      <w:i w:val="0"/>
-                      <w:color w:val="000000"/>
-                      <w:sz w:val="42"/>
-                    </w:rPr>
-                    <w:t>Item 2</w:t>
-                  </w:r>
-                </w:p>
-              </w:txbxContent>
-            </v:textbox>
-          </v:shape>
-        </w:pict>
-      </w:r>
-      <w:r>
-        <w:pict>
-          <v:shape id="DocuMindTextBox87" type="#_x0000_t202" stroked="f" filled="f" o:allowincell="f" style="position:absolute;margin-left:449.618pt;margin-top:458.497pt;width:64.678pt;height:33.483pt;z-index:251659264;mso-position-horizontal-relative:page;mso-position-vertical-relative:page;mso-wrap-style:none;mso-fit-shape-to-text:t;">
-            <w10:wrap type="none"/>
-            <v:textbox inset="0,0,0,0">
-              <w:txbxContent>
-                <w:p>
-                  <w:pPr>
-                    <w:spacing w:before="0" w:after="0" w:lineRule="exact" w:line="550"/>
-                    <w:ind w:left="0" w:right="0" w:firstLine="0"/>
-                  </w:pPr>
-                  <w:r>
-                    <w:rPr>
-                      <w:rFonts w:ascii="DMSans-Regular" w:hAnsi="DMSans-Regular" w:eastAsia="DMSans-Regular" w:cs="DMSans-Regular"/>
-                      <w:b w:val="0"/>
-                      <w:i w:val="0"/>
-                      <w:color w:val="000000"/>
-                      <w:sz w:val="42"/>
-                    </w:rPr>
-                    <w:t>Item 3</w:t>
-                  </w:r>
-                </w:p>
-              </w:txbxContent>
-            </v:textbox>
-          </v:shape>
-        </w:pict>
-      </w:r>
-      <w:r>
-        <w:pict>
-          <v:shape id="DocuMindTextBox88" type="#_x0000_t202" stroked="f" filled="f" o:allowincell="f" style="position:absolute;margin-left:66.799pt;margin-top:438.961pt;width:17.628pt;height:33.483pt;z-index:251659264;mso-position-horizontal-relative:page;mso-position-vertical-relative:page;mso-wrap-style:none;mso-fit-shape-to-text:t;">
-            <w10:wrap type="none"/>
-            <v:textbox inset="0,0,0,0">
-              <w:txbxContent>
-                <w:p>
-                  <w:pPr>
-                    <w:spacing w:before="0" w:after="0" w:lineRule="exact" w:line="550"/>
-                    <w:ind w:left="0" w:right="0" w:firstLine="0"/>
-                  </w:pPr>
-                  <w:r>
-                    <w:rPr>
-                      <w:rFonts w:ascii="DMSans-Regular" w:hAnsi="DMSans-Regular" w:eastAsia="DMSans-Regular" w:cs="DMSans-Regular"/>
-                      <w:b w:val="0"/>
-                      <w:i w:val="0"/>
-                      <w:color w:val="000000"/>
-                      <w:sz w:val="42"/>
-                    </w:rPr>
-                    <w:t>0</w:t>
-                  </w:r>
-                </w:p>
-              </w:txbxContent>
-            </v:textbox>
-          </v:shape>
-        </w:pict>
-      </w:r>
-      <w:r>
-        <w:pict>
-          <v:shape id="DocuMindTextBox89" type="#_x0000_t202" stroked="f" filled="f" o:allowincell="f" style="position:absolute;margin-left:68.553pt;margin-top:389.488pt;width:15.918pt;height:33.483pt;z-index:251659264;mso-position-horizontal-relative:page;mso-position-vertical-relative:page;mso-wrap-style:none;mso-fit-shape-to-text:t;">
-            <w10:wrap type="none"/>
-            <v:textbox inset="0,0,0,0">
-              <w:txbxContent>
-                <w:p>
-                  <w:pPr>
-                    <w:spacing w:before="0" w:after="0" w:lineRule="exact" w:line="550"/>
-                    <w:ind w:left="0" w:right="0" w:firstLine="0"/>
-                  </w:pPr>
-                  <w:r>
-                    <w:rPr>
-                      <w:rFonts w:ascii="DMSans-Regular" w:hAnsi="DMSans-Regular" w:eastAsia="DMSans-Regular" w:cs="DMSans-Regular"/>
-                      <w:b w:val="0"/>
-                      <w:i w:val="0"/>
-                      <w:color w:val="000000"/>
-                      <w:sz w:val="42"/>
-                    </w:rPr>
-                    <w:t>5</w:t>
-                  </w:r>
-                </w:p>
-              </w:txbxContent>
-            </v:textbox>
-          </v:shape>
-        </w:pict>
-      </w:r>
-      <w:r>
-        <w:pict>
-          <v:shape id="DocuMindTextBox90" type="#_x0000_t202" stroked="f" filled="f" o:allowincell="f" style="position:absolute;margin-left:60.020pt;margin-top:340.016pt;width:24.003pt;height:33.483pt;z-index:251659264;mso-position-horizontal-relative:page;mso-position-vertical-relative:page;mso-wrap-style:none;mso-fit-shape-to-text:t;">
-            <w10:wrap type="none"/>
-            <v:textbox inset="0,0,0,0">
-              <w:txbxContent>
-                <w:p>
-                  <w:pPr>
-                    <w:spacing w:before="0" w:after="0" w:lineRule="exact" w:line="550"/>
-                    <w:ind w:left="0" w:right="0" w:firstLine="0"/>
-                  </w:pPr>
-                  <w:r>
-                    <w:rPr>
-                      <w:rFonts w:ascii="DMSans-Regular" w:hAnsi="DMSans-Regular" w:eastAsia="DMSans-Regular" w:cs="DMSans-Regular"/>
-                      <w:b w:val="0"/>
-                      <w:i w:val="0"/>
-                      <w:color w:val="000000"/>
-                      <w:sz w:val="42"/>
-                    </w:rPr>
-                    <w:t>10</w:t>
-                  </w:r>
-                </w:p>
-              </w:txbxContent>
-            </v:textbox>
-          </v:shape>
-        </w:pict>
-      </w:r>
-      <w:r>
-        <w:pict>
-          <v:shape id="DocuMindTextBox91" type="#_x0000_t202" stroked="f" filled="f" o:allowincell="f" style="position:absolute;margin-left:61.775pt;margin-top:290.543pt;width:22.293pt;height:33.483pt;z-index:251659264;mso-position-horizontal-relative:page;mso-position-vertical-relative:page;mso-wrap-style:none;mso-fit-shape-to-text:t;">
-            <w10:wrap type="none"/>
-            <v:textbox inset="0,0,0,0">
-              <w:txbxContent>
-                <w:p>
-                  <w:pPr>
-                    <w:spacing w:before="0" w:after="0" w:lineRule="exact" w:line="550"/>
-                    <w:ind w:left="0" w:right="0" w:firstLine="0"/>
-                  </w:pPr>
-                  <w:r>
-                    <w:rPr>
-                      <w:rFonts w:ascii="DMSans-Regular" w:hAnsi="DMSans-Regular" w:eastAsia="DMSans-Regular" w:cs="DMSans-Regular"/>
-                      <w:b w:val="0"/>
-                      <w:i w:val="0"/>
-                      <w:color w:val="000000"/>
-                      <w:sz w:val="42"/>
-                    </w:rPr>
-                    <w:t>15</w:t>
-                  </w:r>
-                </w:p>
-              </w:txbxContent>
-            </v:textbox>
-          </v:shape>
-        </w:pict>
-      </w:r>
-      <w:r>
-        <w:pict>
-          <v:shape id="DocuMindTextBox92" type="#_x0000_t202" stroked="f" filled="f" o:allowincell="f" style="position:absolute;margin-left:54.575pt;margin-top:241.071pt;width:29.491pt;height:33.483pt;z-index:251659264;mso-position-horizontal-relative:page;mso-position-vertical-relative:page;mso-wrap-style:none;mso-fit-shape-to-text:t;">
-            <w10:wrap type="none"/>
-            <v:textbox inset="0,0,0,0">
-              <w:txbxContent>
-                <w:p>
-                  <w:pPr>
-                    <w:spacing w:before="0" w:after="0" w:lineRule="exact" w:line="550"/>
-                    <w:ind w:left="0" w:right="0" w:firstLine="0"/>
-                  </w:pPr>
-                  <w:r>
-                    <w:rPr>
-                      <w:rFonts w:ascii="DMSans-Regular" w:hAnsi="DMSans-Regular" w:eastAsia="DMSans-Regular" w:cs="DMSans-Regular"/>
-                      <w:b w:val="0"/>
-                      <w:i w:val="0"/>
-                      <w:color w:val="000000"/>
-                      <w:sz w:val="42"/>
-                    </w:rPr>
-                    <w:t>20</w:t>
-                  </w:r>
-                </w:p>
-              </w:txbxContent>
-            </v:textbox>
-          </v:shape>
-        </w:pict>
-      </w:r>
-      <w:r>
-        <w:pict>
-          <v:shape id="DocuMindTextBox93" type="#_x0000_t202" stroked="f" filled="f" o:allowincell="f" style="position:absolute;margin-left:162.789pt;margin-top:548.528pt;width:74.227pt;height:33.397pt;z-index:251659264;mso-position-horizontal-relative:page;mso-position-vertical-relative:page;mso-wrap-style:none;mso-fit-shape-to-text:t;">
-            <w10:wrap type="none"/>
-            <v:textbox inset="0,0,0,0">
-              <w:txbxContent>
-                <w:p>
-                  <w:pPr>
-                    <w:spacing w:before="0" w:after="0" w:lineRule="exact" w:line="548"/>
-                    <w:ind w:left="0" w:right="0" w:firstLine="0"/>
-                  </w:pPr>
-                  <w:r>
-                    <w:rPr>
-                      <w:rFonts w:ascii="DMSans-Regular" w:hAnsi="DMSans-Regular" w:eastAsia="DMSans-Regular" w:cs="DMSans-Regular"/>
-                      <w:b w:val="0"/>
-                      <w:i w:val="0"/>
-                      <w:color w:val="000000"/>
-                      <w:sz w:val="42"/>
-                    </w:rPr>
-                    <w:t>Series 1</w:t>
-                  </w:r>
-                </w:p>
-              </w:txbxContent>
-            </v:textbox>
-          </v:shape>
-        </w:pict>
-      </w:r>
-      <w:r>
-        <w:pict>
-          <v:shape id="DocuMindTextBox94" type="#_x0000_t202" stroked="f" filled="f" o:allowincell="f" style="position:absolute;margin-left:297.282pt;margin-top:548.528pt;width:79.909pt;height:33.397pt;z-index:251659264;mso-position-horizontal-relative:page;mso-position-vertical-relative:page;mso-wrap-style:none;mso-fit-shape-to-text:t;">
-            <w10:wrap type="none"/>
-            <v:textbox inset="0,0,0,0">
-              <w:txbxContent>
-                <w:p>
-                  <w:pPr>
-                    <w:spacing w:before="0" w:after="0" w:lineRule="exact" w:line="548"/>
-                    <w:ind w:left="0" w:right="0" w:firstLine="0"/>
-                  </w:pPr>
-                  <w:r>
-                    <w:rPr>
-                      <w:rFonts w:ascii="DMSans-Regular" w:hAnsi="DMSans-Regular" w:eastAsia="DMSans-Regular" w:cs="DMSans-Regular"/>
-                      <w:b w:val="0"/>
-                      <w:i w:val="0"/>
-                      <w:color w:val="000000"/>
-                      <w:sz w:val="42"/>
-                    </w:rPr>
-                    <w:t>Series 2</w:t>
-                  </w:r>
-                </w:p>
-              </w:txbxContent>
-            </v:textbox>
-          </v:shape>
-        </w:pict>
-      </w:r>
-      <w:r>
-        <w:pict>
-          <v:shape id="DocuMindTextBox95" type="#_x0000_t202" stroked="f" filled="f" o:allowincell="f" style="position:absolute;margin-left:438.042pt;margin-top:548.528pt;width:80.245pt;height:33.397pt;z-index:251659264;mso-position-horizontal-relative:page;mso-position-vertical-relative:page;mso-wrap-style:none;mso-fit-shape-to-text:t;">
-            <w10:wrap type="none"/>
-            <v:textbox inset="0,0,0,0">
-              <w:txbxContent>
-                <w:p>
-                  <w:pPr>
-                    <w:spacing w:before="0" w:after="0" w:lineRule="exact" w:line="548"/>
-                    <w:ind w:left="0" w:right="0" w:firstLine="0"/>
-                  </w:pPr>
-                  <w:r>
-                    <w:rPr>
-                      <w:rFonts w:ascii="DMSans-Regular" w:hAnsi="DMSans-Regular" w:eastAsia="DMSans-Regular" w:cs="DMSans-Regular"/>
-                      <w:b w:val="0"/>
-                      <w:i w:val="0"/>
-                      <w:color w:val="000000"/>
-                      <w:sz w:val="42"/>
-                    </w:rPr>
-                    <w:t>Series 3</w:t>
-                  </w:r>
-                </w:p>
-              </w:txbxContent>
-            </v:textbox>
-          </v:shape>
-        </w:pict>
-      </w:r>
-      <w:r>
-        <w:pict>
-          <v:shape id="DocuMindTextBox96" type="#_x0000_t202" stroked="f" filled="f" o:allowincell="f" style="position:absolute;margin-left:116.556pt;margin-top:807.689pt;width:58.467pt;height:33.397pt;z-index:251659264;mso-position-horizontal-relative:page;mso-position-vertical-relative:page;mso-wrap-style:none;mso-fit-shape-to-text:t;">
-            <w10:wrap type="none"/>
-            <v:textbox inset="0,0,0,0">
-              <w:txbxContent>
-                <w:p>
-                  <w:pPr>
-                    <w:spacing w:before="0" w:after="0" w:lineRule="exact" w:line="548"/>
-                    <w:ind w:left="0" w:right="0" w:firstLine="0"/>
-                  </w:pPr>
-                  <w:r>
-                    <w:rPr>
-                      <w:rFonts w:ascii="DMSans-Regular" w:hAnsi="DMSans-Regular" w:eastAsia="DMSans-Regular" w:cs="DMSans-Regular"/>
-                      <w:b w:val="0"/>
-                      <w:i w:val="0"/>
-                      <w:color w:val="000000"/>
-                      <w:sz w:val="42"/>
-                    </w:rPr>
-                    <w:t>Item 1</w:t>
-                  </w:r>
-                </w:p>
-              </w:txbxContent>
-            </v:textbox>
-          </v:shape>
-        </w:pict>
-      </w:r>
-      <w:r>
-        <w:pict>
-          <v:shape id="DocuMindTextBox97" type="#_x0000_t202" stroked="f" filled="f" o:allowincell="f" style="position:absolute;margin-left:204.052pt;margin-top:807.689pt;width:64.148pt;height:33.397pt;z-index:251659264;mso-position-horizontal-relative:page;mso-position-vertical-relative:page;mso-wrap-style:none;mso-fit-shape-to-text:t;">
-            <w10:wrap type="none"/>
-            <v:textbox inset="0,0,0,0">
-              <w:txbxContent>
-                <w:p>
-                  <w:pPr>
-                    <w:spacing w:before="0" w:after="0" w:lineRule="exact" w:line="548"/>
-                    <w:ind w:left="0" w:right="0" w:firstLine="0"/>
-                  </w:pPr>
-                  <w:r>
-                    <w:rPr>
-                      <w:rFonts w:ascii="DMSans-Regular" w:hAnsi="DMSans-Regular" w:eastAsia="DMSans-Regular" w:cs="DMSans-Regular"/>
-                      <w:b w:val="0"/>
-                      <w:i w:val="0"/>
-                      <w:color w:val="000000"/>
-                      <w:sz w:val="42"/>
-                    </w:rPr>
-                    <w:t>Item 2</w:t>
-                  </w:r>
-                </w:p>
-              </w:txbxContent>
-            </v:textbox>
-          </v:shape>
-        </w:pict>
-      </w:r>
-      <w:r>
-        <w:pict>
-          <v:shape id="DocuMindTextBox98" type="#_x0000_t202" stroked="f" filled="f" o:allowincell="f" style="position:absolute;margin-left:294.221pt;margin-top:807.689pt;width:64.485pt;height:33.397pt;z-index:251659264;mso-position-horizontal-relative:page;mso-position-vertical-relative:page;mso-wrap-style:none;mso-fit-shape-to-text:t;">
-            <w10:wrap type="none"/>
-            <v:textbox inset="0,0,0,0">
-              <w:txbxContent>
-                <w:p>
-                  <w:pPr>
-                    <w:spacing w:before="0" w:after="0" w:lineRule="exact" w:line="548"/>
-                    <w:ind w:left="0" w:right="0" w:firstLine="0"/>
-                  </w:pPr>
-                  <w:r>
-                    <w:rPr>
-                      <w:rFonts w:ascii="DMSans-Regular" w:hAnsi="DMSans-Regular" w:eastAsia="DMSans-Regular" w:cs="DMSans-Regular"/>
-                      <w:b w:val="0"/>
-                      <w:i w:val="0"/>
-                      <w:color w:val="000000"/>
-                      <w:sz w:val="42"/>
-                    </w:rPr>
-                    <w:t>Item 3</w:t>
-                  </w:r>
-                </w:p>
-              </w:txbxContent>
-            </v:textbox>
-          </v:shape>
-        </w:pict>
-      </w:r>
-      <w:r>
-        <w:pict>
-          <v:shape id="DocuMindTextBox99" type="#_x0000_t202" stroked="f" filled="f" o:allowincell="f" style="position:absolute;margin-left:383.928pt;margin-top:807.689pt;width:64.842pt;height:33.397pt;z-index:251659264;mso-position-horizontal-relative:page;mso-position-vertical-relative:page;mso-wrap-style:none;mso-fit-shape-to-text:t;">
-            <w10:wrap type="none"/>
-            <v:textbox inset="0,0,0,0">
-              <w:txbxContent>
-                <w:p>
-                  <w:pPr>
-                    <w:spacing w:before="0" w:after="0" w:lineRule="exact" w:line="548"/>
-                    <w:ind w:left="0" w:right="0" w:firstLine="0"/>
-                  </w:pPr>
-                  <w:r>
-                    <w:rPr>
-                      <w:rFonts w:ascii="DMSans-Regular" w:hAnsi="DMSans-Regular" w:eastAsia="DMSans-Regular" w:cs="DMSans-Regular"/>
-                      <w:b w:val="0"/>
-                      <w:i w:val="0"/>
-                      <w:color w:val="000000"/>
-                      <w:sz w:val="42"/>
-                    </w:rPr>
-                    <w:t>Item 4</w:t>
-                  </w:r>
-                </w:p>
-              </w:txbxContent>
-            </v:textbox>
-          </v:shape>
-        </w:pict>
-      </w:r>
-      <w:r>
-        <w:pict>
-          <v:shape id="DocuMindTextBox100" type="#_x0000_t202" stroked="f" filled="f" o:allowincell="f" style="position:absolute;margin-left:474.194pt;margin-top:807.689pt;width:64.990pt;height:33.397pt;z-index:251659264;mso-position-horizontal-relative:page;mso-position-vertical-relative:page;mso-wrap-style:none;mso-fit-shape-to-text:t;">
-            <w10:wrap type="none"/>
-            <v:textbox inset="0,0,0,0">
-              <w:txbxContent>
-                <w:p>
-                  <w:pPr>
-                    <w:spacing w:before="0" w:after="0" w:lineRule="exact" w:line="548"/>
-                    <w:ind w:left="0" w:right="0" w:firstLine="0"/>
-                  </w:pPr>
-                  <w:r>
-                    <w:rPr>
-                      <w:rFonts w:ascii="DMSans-Regular" w:hAnsi="DMSans-Regular" w:eastAsia="DMSans-Regular" w:cs="DMSans-Regular"/>
-                      <w:b w:val="0"/>
-                      <w:i w:val="0"/>
-                      <w:color w:val="000000"/>
-                      <w:sz w:val="42"/>
-                    </w:rPr>
-                    <w:t>Item 5</w:t>
-                  </w:r>
-                </w:p>
-              </w:txbxContent>
-            </v:textbox>
-          </v:shape>
-        </w:pict>
-      </w:r>
-      <w:r>
-        <w:pict>
-          <v:shape id="DocuMindTextBox101" type="#_x0000_t202" stroked="f" filled="f" o:allowincell="f" style="position:absolute;margin-left:68.567pt;margin-top:788.214pt;width:17.582pt;height:33.397pt;z-index:251659264;mso-position-horizontal-relative:page;mso-position-vertical-relative:page;mso-wrap-style:none;mso-fit-shape-to-text:t;">
-            <w10:wrap type="none"/>
-            <v:textbox inset="0,0,0,0">
-              <w:txbxContent>
-                <w:p>
-                  <w:pPr>
-                    <w:spacing w:before="0" w:after="0" w:lineRule="exact" w:line="548"/>
-                    <w:ind w:left="0" w:right="0" w:firstLine="0"/>
-                  </w:pPr>
-                  <w:r>
-                    <w:rPr>
-                      <w:rFonts w:ascii="DMSans-Regular" w:hAnsi="DMSans-Regular" w:eastAsia="DMSans-Regular" w:cs="DMSans-Regular"/>
-                      <w:b w:val="0"/>
-                      <w:i w:val="0"/>
-                      <w:color w:val="000000"/>
-                      <w:sz w:val="42"/>
-                    </w:rPr>
-                    <w:t>0</w:t>
-                  </w:r>
-                </w:p>
-              </w:txbxContent>
-            </v:textbox>
-          </v:shape>
-        </w:pict>
-      </w:r>
-      <w:r>
-        <w:pict>
-          <v:shape id="DocuMindTextBox102" type="#_x0000_t202" stroked="f" filled="f" o:allowincell="f" style="position:absolute;margin-left:61.810pt;margin-top:746.384pt;width:23.937pt;height:33.397pt;z-index:251659264;mso-position-horizontal-relative:page;mso-position-vertical-relative:page;mso-wrap-style:none;mso-fit-shape-to-text:t;">
-            <w10:wrap type="none"/>
-            <v:textbox inset="0,0,0,0">
-              <w:txbxContent>
-                <w:p>
-                  <w:pPr>
-                    <w:spacing w:before="0" w:after="0" w:lineRule="exact" w:line="548"/>
-                    <w:ind w:left="0" w:right="0" w:firstLine="0"/>
-                  </w:pPr>
-                  <w:r>
-                    <w:rPr>
-                      <w:rFonts w:ascii="DMSans-Regular" w:hAnsi="DMSans-Regular" w:eastAsia="DMSans-Regular" w:cs="DMSans-Regular"/>
-                      <w:b w:val="0"/>
-                      <w:i w:val="0"/>
-                      <w:color w:val="000000"/>
-                      <w:sz w:val="42"/>
-                    </w:rPr>
-                    <w:t>10</w:t>
-                  </w:r>
-                </w:p>
-              </w:txbxContent>
-            </v:textbox>
-          </v:shape>
-        </w:pict>
-      </w:r>
-      <w:r>
-        <w:pict>
-          <v:shape id="DocuMindTextBox103" type="#_x0000_t202" stroked="f" filled="f" o:allowincell="f" style="position:absolute;margin-left:56.381pt;margin-top:704.555pt;width:29.408pt;height:33.397pt;z-index:251659264;mso-position-horizontal-relative:page;mso-position-vertical-relative:page;mso-wrap-style:none;mso-fit-shape-to-text:t;">
-            <w10:wrap type="none"/>
-            <v:textbox inset="0,0,0,0">
-              <w:txbxContent>
-                <w:p>
-                  <w:pPr>
-                    <w:spacing w:before="0" w:after="0" w:lineRule="exact" w:line="548"/>
-                    <w:ind w:left="0" w:right="0" w:firstLine="0"/>
-                  </w:pPr>
-                  <w:r>
-                    <w:rPr>
-                      <w:rFonts w:ascii="DMSans-Regular" w:hAnsi="DMSans-Regular" w:eastAsia="DMSans-Regular" w:cs="DMSans-Regular"/>
-                      <w:b w:val="0"/>
-                      <w:i w:val="0"/>
-                      <w:color w:val="000000"/>
-                      <w:sz w:val="42"/>
-                    </w:rPr>
-                    <w:t>20</w:t>
-                  </w:r>
-                </w:p>
-              </w:txbxContent>
-            </v:textbox>
-          </v:shape>
-        </w:pict>
-      </w:r>
-      <w:r>
-        <w:pict>
-          <v:shape id="DocuMindTextBox104" type="#_x0000_t202" stroked="f" filled="f" o:allowincell="f" style="position:absolute;margin-left:56.116pt;margin-top:662.726pt;width:29.955pt;height:33.397pt;z-index:251659264;mso-position-horizontal-relative:page;mso-position-vertical-relative:page;mso-wrap-style:none;mso-fit-shape-to-text:t;">
-            <w10:wrap type="none"/>
-            <v:textbox inset="0,0,0,0">
-              <w:txbxContent>
-                <w:p>
-                  <w:pPr>
-                    <w:spacing w:before="0" w:after="0" w:lineRule="exact" w:line="548"/>
-                    <w:ind w:left="0" w:right="0" w:firstLine="0"/>
-                  </w:pPr>
-                  <w:r>
-                    <w:rPr>
-                      <w:rFonts w:ascii="DMSans-Regular" w:hAnsi="DMSans-Regular" w:eastAsia="DMSans-Regular" w:cs="DMSans-Regular"/>
-                      <w:b w:val="0"/>
-                      <w:i w:val="0"/>
-                      <w:color w:val="000000"/>
-                      <w:sz w:val="42"/>
-                    </w:rPr>
-                    <w:t>30</w:t>
-                  </w:r>
-                </w:p>
-              </w:txbxContent>
-            </v:textbox>
-          </v:shape>
-        </w:pict>
-      </w:r>
-      <w:r>
-        <w:pict>
-          <v:shape id="DocuMindTextBox105" type="#_x0000_t202" stroked="f" filled="f" o:allowincell="f" style="position:absolute;margin-left:55.934pt;margin-top:620.896pt;width:30.313pt;height:33.397pt;z-index:251659264;mso-position-horizontal-relative:page;mso-position-vertical-relative:page;mso-wrap-style:none;mso-fit-shape-to-text:t;">
-            <w10:wrap type="none"/>
-            <v:textbox inset="0,0,0,0">
-              <w:txbxContent>
-                <w:p>
-                  <w:pPr>
-                    <w:spacing w:before="0" w:after="0" w:lineRule="exact" w:line="548"/>
-                    <w:ind w:left="0" w:right="0" w:firstLine="0"/>
-                  </w:pPr>
-                  <w:r>
-                    <w:rPr>
-                      <w:rFonts w:ascii="DMSans-Regular" w:hAnsi="DMSans-Regular" w:eastAsia="DMSans-Regular" w:cs="DMSans-Regular"/>
-                      <w:b w:val="0"/>
-                      <w:i w:val="0"/>
-                      <w:color w:val="000000"/>
-                      <w:sz w:val="42"/>
-                    </w:rPr>
-                    <w:t>40</w:t>
-                  </w:r>
-                </w:p>
-              </w:txbxContent>
-            </v:textbox>
-          </v:shape>
-        </w:pict>
-      </w:r>
-      <w:r>
-        <w:pict>
-          <v:shape id="DocuMindTextBox106" type="#_x0000_t202" stroked="f" filled="f" o:allowincell="f" style="position:absolute;margin-left:54.968pt;margin-top:579.067pt;width:30.460pt;height:33.397pt;z-index:251659264;mso-position-horizontal-relative:page;mso-position-vertical-relative:page;mso-wrap-style:none;mso-fit-shape-to-text:t;">
-            <w10:wrap type="none"/>
-            <v:textbox inset="0,0,0,0">
-              <w:txbxContent>
-                <w:p>
-                  <w:pPr>
-                    <w:spacing w:before="0" w:after="0" w:lineRule="exact" w:line="548"/>
-                    <w:ind w:left="0" w:right="0" w:firstLine="0"/>
-                  </w:pPr>
-                  <w:r>
-                    <w:rPr>
-                      <w:rFonts w:ascii="DMSans-Regular" w:hAnsi="DMSans-Regular" w:eastAsia="DMSans-Regular" w:cs="DMSans-Regular"/>
-                      <w:b w:val="0"/>
-                      <w:i w:val="0"/>
-                      <w:color w:val="000000"/>
-                      <w:sz w:val="42"/>
-                    </w:rPr>
-                    <w:t>50</w:t>
                   </w:r>
                 </w:p>
               </w:txbxContent>
@@ -2670,7 +1753,7 @@
       </w:r>
       <w:r>
         <w:pict>
-          <v:shape id="DocuMindVector107" type="#_x0000_t75" stroked="f" o:allowincell="f" style="position:absolute;margin-left:-1.336pt;margin-top:674.270pt;width:735.909pt;height:351.919pt;z-index:0;mso-position-horizontal-relative:page;mso-position-vertical-relative:page;mso-wrap-style:none;">
+          <v:shape id="DocuMindVector56" type="#_x0000_t75" stroked="f" o:allowincell="f" style="position:absolute;margin-left:-1.336pt;margin-top:674.270pt;width:735.909pt;height:351.919pt;z-index:0;mso-position-horizontal-relative:page;mso-position-vertical-relative:page;mso-wrap-style:none;">
             <w10:wrap type="none"/>
             <v:imagedata r:id="rId16" o:title=""/>
           </v:shape>
@@ -2678,7 +1761,7 @@
       </w:r>
       <w:r>
         <w:pict>
-          <v:shape id="DocuMindTextBox108" type="#_x0000_t202" stroked="f" filled="f" o:allowincell="f" style="position:absolute;margin-left:67.299pt;margin-top:56.415pt;width:160.847pt;height:44.529pt;z-index:251659264;mso-position-horizontal-relative:page;mso-position-vertical-relative:page;mso-wrap-style:none;mso-fit-shape-to-text:t;">
+          <v:shape id="DocuMindTextBox57" type="#_x0000_t202" stroked="f" filled="f" o:allowincell="f" style="position:absolute;margin-left:67.299pt;margin-top:56.915pt;width:165.847pt;height:43.529pt;z-index:251659264;mso-position-horizontal-relative:page;mso-position-vertical-relative:page;mso-wrap-style:none;mso-fit-shape-to-text:t;">
             <w10:wrap type="none"/>
             <v:textbox inset="0,0,0,0">
               <w:txbxContent>
@@ -2686,6 +1769,7 @@
                   <w:pPr>
                     <w:spacing w:before="0" w:after="0" w:lineRule="exact" w:line="771"/>
                     <w:ind w:left="0" w:right="0" w:firstLine="0"/>
+                    <w:jc w:val="left"/>
                   </w:pPr>
                   <w:r>
                     <w:rPr>
@@ -2705,7 +1789,7 @@
       </w:r>
       <w:r>
         <w:pict>
-          <v:shape id="DocuMindTextBox109" type="#_x0000_t202" stroked="f" filled="f" o:allowincell="f" style="position:absolute;margin-left:67.299pt;margin-top:114.291pt;width:463.150pt;height:31.682pt;z-index:251659264;mso-position-horizontal-relative:page;mso-position-vertical-relative:page;mso-wrap-style:none;mso-fit-shape-to-text:t;">
+          <v:shape id="DocuMindTextBox58" type="#_x0000_t202" stroked="f" filled="f" o:allowincell="f" style="position:absolute;margin-left:67.299pt;margin-top:114.791pt;width:485.152pt;height:107.729pt;z-index:251659264;mso-position-horizontal-relative:page;mso-position-vertical-relative:page;mso-wrap-style:none;mso-fit-shape-to-text:t;">
             <w10:wrap type="none"/>
             <v:textbox inset="0,0,0,0">
               <w:txbxContent>
@@ -2713,6 +1797,7 @@
                   <w:pPr>
                     <w:spacing w:before="0" w:after="0" w:lineRule="exact" w:line="514"/>
                     <w:ind w:left="0" w:right="0" w:firstLine="0"/>
+                    <w:jc w:val="left"/>
                   </w:pPr>
                   <w:r>
                     <w:rPr>
@@ -2724,23 +1809,9 @@
                     </w:rPr>
                     <w:t>Lorem ipsum dolor sit amet, consectetur adipiscing</w:t>
                   </w:r>
-                </w:p>
-              </w:txbxContent>
-            </v:textbox>
-          </v:shape>
-        </w:pict>
-      </w:r>
-      <w:r>
-        <w:pict>
-          <v:shape id="DocuMindTextBox110" type="#_x0000_t202" stroked="f" filled="f" o:allowincell="f" style="position:absolute;margin-left:67.299pt;margin-top:137.410pt;width:480.152pt;height:31.682pt;z-index:251659264;mso-position-horizontal-relative:page;mso-position-vertical-relative:page;mso-wrap-style:none;mso-fit-shape-to-text:t;">
-            <w10:wrap type="none"/>
-            <v:textbox inset="0,0,0,0">
-              <w:txbxContent>
-                <w:p>
-                  <w:pPr>
-                    <w:spacing w:before="0" w:after="0" w:lineRule="exact" w:line="514"/>
-                    <w:ind w:left="0" w:right="0" w:firstLine="0"/>
-                  </w:pPr>
+                  <w:r>
+                    <w:br/>
+                  </w:r>
                   <w:r>
                     <w:rPr>
                       <w:rFonts w:ascii="DMSans-Regular" w:hAnsi="DMSans-Regular" w:eastAsia="DMSans-Regular" w:cs="DMSans-Regular"/>
@@ -2749,25 +1820,11 @@
                       <w:color w:val="000000"/>
                       <w:sz w:val="39"/>
                     </w:rPr>
-                    <w:t xml:space="preserve"> elit. Integer nec odio. Praesent libero. Sed cursus ant</w:t>
+                    <w:t>elit. Integer nec odio. Praesent libero. Sed cursus ante</w:t>
                   </w:r>
-                </w:p>
-              </w:txbxContent>
-            </v:textbox>
-          </v:shape>
-        </w:pict>
-      </w:r>
-      <w:r>
-        <w:pict>
-          <v:shape id="DocuMindTextBox111" type="#_x0000_t202" stroked="f" filled="f" o:allowincell="f" style="position:absolute;margin-left:67.299pt;margin-top:160.529pt;width:407.570pt;height:31.682pt;z-index:251659264;mso-position-horizontal-relative:page;mso-position-vertical-relative:page;mso-wrap-style:none;mso-fit-shape-to-text:t;">
-            <w10:wrap type="none"/>
-            <v:textbox inset="0,0,0,0">
-              <w:txbxContent>
-                <w:p>
-                  <w:pPr>
-                    <w:spacing w:before="0" w:after="0" w:lineRule="exact" w:line="514"/>
-                    <w:ind w:left="0" w:right="0" w:firstLine="0"/>
-                  </w:pPr>
+                  <w:r>
+                    <w:br/>
+                  </w:r>
                   <w:r>
                     <w:rPr>
                       <w:rFonts w:ascii="DMSans-Regular" w:hAnsi="DMSans-Regular" w:eastAsia="DMSans-Regular" w:cs="DMSans-Regular"/>
@@ -2776,25 +1833,11 @@
                       <w:color w:val="000000"/>
                       <w:sz w:val="39"/>
                     </w:rPr>
-                    <w:t xml:space="preserve">e dapibus diam. Sed nisi. Nulla quis sem at nibh </w:t>
+                    <w:t>dapibus diam. Sed nisi. Nulla quis sem at nibh</w:t>
                   </w:r>
-                </w:p>
-              </w:txbxContent>
-            </v:textbox>
-          </v:shape>
-        </w:pict>
-      </w:r>
-      <w:r>
-        <w:pict>
-          <v:shape id="DocuMindTextBox112" type="#_x0000_t202" stroked="f" filled="f" o:allowincell="f" style="position:absolute;margin-left:67.299pt;margin-top:183.648pt;width:200.965pt;height:31.682pt;z-index:251659264;mso-position-horizontal-relative:page;mso-position-vertical-relative:page;mso-wrap-style:none;mso-fit-shape-to-text:t;">
-            <w10:wrap type="none"/>
-            <v:textbox inset="0,0,0,0">
-              <w:txbxContent>
-                <w:p>
-                  <w:pPr>
-                    <w:spacing w:before="0" w:after="0" w:lineRule="exact" w:line="514"/>
-                    <w:ind w:left="0" w:right="0" w:firstLine="0"/>
-                  </w:pPr>
+                  <w:r>
+                    <w:br/>
+                  </w:r>
                   <w:r>
                     <w:rPr>
                       <w:rFonts w:ascii="DMSans-Regular" w:hAnsi="DMSans-Regular" w:eastAsia="DMSans-Regular" w:cs="DMSans-Regular"/>
@@ -2813,7 +1856,7 @@
       </w:r>
       <w:r>
         <w:pict>
-          <v:shape id="DocuMindTextBox113" type="#_x0000_t202" stroked="f" filled="f" o:allowincell="f" style="position:absolute;margin-left:67.299pt;margin-top:277.434pt;width:164.990pt;height:44.529pt;z-index:251659264;mso-position-horizontal-relative:page;mso-position-vertical-relative:page;mso-wrap-style:none;mso-fit-shape-to-text:t;">
+          <v:shape id="DocuMindTextBox59" type="#_x0000_t202" stroked="f" filled="f" o:allowincell="f" style="position:absolute;margin-left:67.299pt;margin-top:277.934pt;width:169.990pt;height:43.529pt;z-index:251659264;mso-position-horizontal-relative:page;mso-position-vertical-relative:page;mso-wrap-style:none;mso-fit-shape-to-text:t;">
             <w10:wrap type="none"/>
             <v:textbox inset="0,0,0,0">
               <w:txbxContent>
@@ -2821,6 +1864,7 @@
                   <w:pPr>
                     <w:spacing w:before="0" w:after="0" w:lineRule="exact" w:line="771"/>
                     <w:ind w:left="0" w:right="0" w:firstLine="0"/>
+                    <w:jc w:val="left"/>
                   </w:pPr>
                   <w:r>
                     <w:rPr>
@@ -2840,7 +1884,7 @@
       </w:r>
       <w:r>
         <w:pict>
-          <v:shape id="DocuMindTextBox114" type="#_x0000_t202" stroked="f" filled="f" o:allowincell="f" style="position:absolute;margin-left:100.837pt;margin-top:339.934pt;width:242.142pt;height:31.682pt;z-index:251659264;mso-position-horizontal-relative:page;mso-position-vertical-relative:page;mso-wrap-style:none;mso-fit-shape-to-text:t;">
+          <v:shape id="DocuMindTextBox60" type="#_x0000_t202" stroked="f" filled="f" o:allowincell="f" style="position:absolute;margin-left:89.450pt;margin-top:340.434pt;width:258.528pt;height:30.682pt;z-index:251659264;mso-position-horizontal-relative:page;mso-position-vertical-relative:page;mso-wrap-style:none;mso-fit-shape-to-text:t;">
             <w10:wrap type="none"/>
             <v:textbox inset="0,0,0,0">
               <w:txbxContent>
@@ -2848,33 +1892,7 @@
                   <w:pPr>
                     <w:spacing w:before="0" w:after="0" w:lineRule="exact" w:line="514"/>
                     <w:ind w:left="0" w:right="0" w:firstLine="0"/>
-                  </w:pPr>
-                  <w:r>
-                    <w:rPr>
-                      <w:rFonts w:ascii="DMSans-Regular" w:hAnsi="DMSans-Regular" w:eastAsia="DMSans-Regular" w:cs="DMSans-Regular"/>
-                      <w:b w:val="0"/>
-                      <w:i w:val="0"/>
-                      <w:color w:val="000000"/>
-                      <w:sz w:val="39"/>
-                    </w:rPr>
-                    <w:t xml:space="preserve"> Finalize the project report.</w:t>
-                  </w:r>
-                </w:p>
-              </w:txbxContent>
-            </v:textbox>
-          </v:shape>
-        </w:pict>
-      </w:r>
-      <w:r>
-        <w:pict>
-          <v:shape id="DocuMindTextBox115" type="#_x0000_t202" stroked="f" filled="f" o:allowincell="f" style="position:absolute;margin-left:89.450pt;margin-top:339.934pt;width:12.612pt;height:31.682pt;z-index:251659264;mso-position-horizontal-relative:page;mso-position-vertical-relative:page;mso-wrap-style:none;mso-fit-shape-to-text:t;">
-            <w10:wrap type="none"/>
-            <v:textbox inset="0,0,0,0">
-              <w:txbxContent>
-                <w:p>
-                  <w:pPr>
-                    <w:spacing w:before="0" w:after="0" w:lineRule="exact" w:line="514"/>
-                    <w:ind w:left="0" w:right="0" w:firstLine="0"/>
+                    <w:jc w:val="left"/>
                   </w:pPr>
                   <w:r>
                     <w:rPr>
@@ -2886,23 +1904,6 @@
                     </w:rPr>
                     <w:t>1.</w:t>
                   </w:r>
-                </w:p>
-              </w:txbxContent>
-            </v:textbox>
-          </v:shape>
-        </w:pict>
-      </w:r>
-      <w:r>
-        <w:pict>
-          <v:shape id="DocuMindTextBox116" type="#_x0000_t202" stroked="f" filled="f" o:allowincell="f" style="position:absolute;margin-left:100.837pt;margin-top:371.376pt;width:313.166pt;height:31.682pt;z-index:251659264;mso-position-horizontal-relative:page;mso-position-vertical-relative:page;mso-wrap-style:none;mso-fit-shape-to-text:t;">
-            <w10:wrap type="none"/>
-            <v:textbox inset="0,0,0,0">
-              <w:txbxContent>
-                <w:p>
-                  <w:pPr>
-                    <w:spacing w:before="0" w:after="0" w:lineRule="exact" w:line="514"/>
-                    <w:ind w:left="0" w:right="0" w:firstLine="0"/>
-                  </w:pPr>
                   <w:r>
                     <w:rPr>
                       <w:rFonts w:ascii="DMSans-Regular" w:hAnsi="DMSans-Regular" w:eastAsia="DMSans-Regular" w:cs="DMSans-Regular"/>
@@ -2911,7 +1912,17 @@
                       <w:color w:val="000000"/>
                       <w:sz w:val="39"/>
                     </w:rPr>
-                    <w:t xml:space="preserve"> Review the findings with the team.</w:t>
+                    <w:t xml:space="preserve"> </w:t>
+                  </w:r>
+                  <w:r>
+                    <w:rPr>
+                      <w:rFonts w:ascii="DMSans-Regular" w:hAnsi="DMSans-Regular" w:eastAsia="DMSans-Regular" w:cs="DMSans-Regular"/>
+                      <w:b w:val="0"/>
+                      <w:i w:val="0"/>
+                      <w:color w:val="000000"/>
+                      <w:sz w:val="39"/>
+                    </w:rPr>
+                    <w:t>Finalize the project report.</w:t>
                   </w:r>
                 </w:p>
               </w:txbxContent>
@@ -2921,7 +1932,7 @@
       </w:r>
       <w:r>
         <w:pict>
-          <v:shape id="DocuMindTextBox117" type="#_x0000_t202" stroked="f" filled="f" o:allowincell="f" style="position:absolute;margin-left:84.119pt;margin-top:371.376pt;width:17.944pt;height:31.682pt;z-index:251659264;mso-position-horizontal-relative:page;mso-position-vertical-relative:page;mso-wrap-style:none;mso-fit-shape-to-text:t;">
+          <v:shape id="DocuMindTextBox61" type="#_x0000_t202" stroked="f" filled="f" o:allowincell="f" style="position:absolute;margin-left:84.119pt;margin-top:371.876pt;width:334.884pt;height:30.682pt;z-index:251659264;mso-position-horizontal-relative:page;mso-position-vertical-relative:page;mso-wrap-style:none;mso-fit-shape-to-text:t;">
             <w10:wrap type="none"/>
             <v:textbox inset="0,0,0,0">
               <w:txbxContent>
@@ -2929,6 +1940,7 @@
                   <w:pPr>
                     <w:spacing w:before="0" w:after="0" w:lineRule="exact" w:line="514"/>
                     <w:ind w:left="0" w:right="0" w:firstLine="0"/>
+                    <w:jc w:val="left"/>
                   </w:pPr>
                   <w:r>
                     <w:rPr>
@@ -2940,23 +1952,6 @@
                     </w:rPr>
                     <w:t>2.</w:t>
                   </w:r>
-                </w:p>
-              </w:txbxContent>
-            </v:textbox>
-          </v:shape>
-        </w:pict>
-      </w:r>
-      <w:r>
-        <w:pict>
-          <v:shape id="DocuMindTextBox118" type="#_x0000_t202" stroked="f" filled="f" o:allowincell="f" style="position:absolute;margin-left:100.837pt;margin-top:402.818pt;width:361.528pt;height:31.682pt;z-index:251659264;mso-position-horizontal-relative:page;mso-position-vertical-relative:page;mso-wrap-style:none;mso-fit-shape-to-text:t;">
-            <w10:wrap type="none"/>
-            <v:textbox inset="0,0,0,0">
-              <w:txbxContent>
-                <w:p>
-                  <w:pPr>
-                    <w:spacing w:before="0" w:after="0" w:lineRule="exact" w:line="514"/>
-                    <w:ind w:left="0" w:right="0" w:firstLine="0"/>
-                  </w:pPr>
                   <w:r>
                     <w:rPr>
                       <w:rFonts w:ascii="DMSans-Regular" w:hAnsi="DMSans-Regular" w:eastAsia="DMSans-Regular" w:cs="DMSans-Regular"/>
@@ -2965,7 +1960,17 @@
                       <w:color w:val="000000"/>
                       <w:sz w:val="39"/>
                     </w:rPr>
-                    <w:t xml:space="preserve"> Present the final report to stakeholders.</w:t>
+                    <w:t xml:space="preserve"> </w:t>
+                  </w:r>
+                  <w:r>
+                    <w:rPr>
+                      <w:rFonts w:ascii="DMSans-Regular" w:hAnsi="DMSans-Regular" w:eastAsia="DMSans-Regular" w:cs="DMSans-Regular"/>
+                      <w:b w:val="0"/>
+                      <w:i w:val="0"/>
+                      <w:color w:val="000000"/>
+                      <w:sz w:val="39"/>
+                    </w:rPr>
+                    <w:t>Review the findings with the team.</w:t>
                   </w:r>
                 </w:p>
               </w:txbxContent>
@@ -2975,7 +1980,7 @@
       </w:r>
       <w:r>
         <w:pict>
-          <v:shape id="DocuMindTextBox119" type="#_x0000_t202" stroked="f" filled="f" o:allowincell="f" style="position:absolute;margin-left:83.815pt;margin-top:402.818pt;width:18.247pt;height:31.682pt;z-index:251659264;mso-position-horizontal-relative:page;mso-position-vertical-relative:page;mso-wrap-style:none;mso-fit-shape-to-text:t;">
+          <v:shape id="DocuMindTextBox62" type="#_x0000_t202" stroked="f" filled="f" o:allowincell="f" style="position:absolute;margin-left:83.815pt;margin-top:403.318pt;width:383.549pt;height:30.682pt;z-index:251659264;mso-position-horizontal-relative:page;mso-position-vertical-relative:page;mso-wrap-style:none;mso-fit-shape-to-text:t;">
             <w10:wrap type="none"/>
             <v:textbox inset="0,0,0,0">
               <w:txbxContent>
@@ -2983,6 +1988,7 @@
                   <w:pPr>
                     <w:spacing w:before="0" w:after="0" w:lineRule="exact" w:line="514"/>
                     <w:ind w:left="0" w:right="0" w:firstLine="0"/>
+                    <w:jc w:val="left"/>
                   </w:pPr>
                   <w:r>
                     <w:rPr>
@@ -2994,6 +2000,26 @@
                     </w:rPr>
                     <w:t>3.</w:t>
                   </w:r>
+                  <w:r>
+                    <w:rPr>
+                      <w:rFonts w:ascii="DMSans-Regular" w:hAnsi="DMSans-Regular" w:eastAsia="DMSans-Regular" w:cs="DMSans-Regular"/>
+                      <w:b w:val="0"/>
+                      <w:i w:val="0"/>
+                      <w:color w:val="000000"/>
+                      <w:sz w:val="39"/>
+                    </w:rPr>
+                    <w:t xml:space="preserve"> </w:t>
+                  </w:r>
+                  <w:r>
+                    <w:rPr>
+                      <w:rFonts w:ascii="DMSans-Regular" w:hAnsi="DMSans-Regular" w:eastAsia="DMSans-Regular" w:cs="DMSans-Regular"/>
+                      <w:b w:val="0"/>
+                      <w:i w:val="0"/>
+                      <w:color w:val="000000"/>
+                      <w:sz w:val="39"/>
+                    </w:rPr>
+                    <w:t>Present the final report to stakeholders.</w:t>
+                  </w:r>
                 </w:p>
               </w:txbxContent>
             </v:textbox>
@@ -3002,7 +2028,7 @@
       </w:r>
       <w:r>
         <w:pict>
-          <v:shape id="DocuMindTextBox120" type="#_x0000_t202" stroked="f" filled="f" o:allowincell="f" style="position:absolute;margin-left:67.299pt;margin-top:482.732pt;width:163.185pt;height:44.530pt;z-index:251659264;mso-position-horizontal-relative:page;mso-position-vertical-relative:page;mso-wrap-style:none;mso-fit-shape-to-text:t;">
+          <v:shape id="DocuMindTextBox63" type="#_x0000_t202" stroked="f" filled="f" o:allowincell="f" style="position:absolute;margin-left:67.299pt;margin-top:483.232pt;width:168.185pt;height:43.530pt;z-index:251659264;mso-position-horizontal-relative:page;mso-position-vertical-relative:page;mso-wrap-style:none;mso-fit-shape-to-text:t;">
             <w10:wrap type="none"/>
             <v:textbox inset="0,0,0,0">
               <w:txbxContent>
@@ -3010,6 +2036,7 @@
                   <w:pPr>
                     <w:spacing w:before="0" w:after="0" w:lineRule="exact" w:line="771"/>
                     <w:ind w:left="0" w:right="0" w:firstLine="0"/>
+                    <w:jc w:val="left"/>
                   </w:pPr>
                   <w:r>
                     <w:rPr>
@@ -3029,14 +2056,15 @@
       </w:r>
       <w:r>
         <w:pict>
-          <v:shape id="DocuMindTextBox121" type="#_x0000_t202" stroked="f" filled="f" o:allowincell="f" style="position:absolute;margin-left:67.299pt;margin-top:560.029pt;width:463.150pt;height:31.682pt;z-index:251659264;mso-position-horizontal-relative:page;mso-position-vertical-relative:page;mso-wrap-style:none;mso-fit-shape-to-text:t;">
+          <v:shape id="DocuMindTextBox64" type="#_x0000_t202" stroked="f" filled="f" o:allowincell="f" style="position:absolute;margin-left:67.299pt;margin-top:560.529pt;width:485.152pt;height:130.768pt;z-index:251659264;mso-position-horizontal-relative:page;mso-position-vertical-relative:page;mso-wrap-style:none;mso-fit-shape-to-text:t;">
             <w10:wrap type="none"/>
             <v:textbox inset="0,0,0,0">
               <w:txbxContent>
                 <w:p>
                   <w:pPr>
-                    <w:spacing w:before="0" w:after="0" w:lineRule="exact" w:line="514"/>
+                    <w:spacing w:before="0" w:after="0" w:lineRule="exact" w:line="629"/>
                     <w:ind w:left="0" w:right="0" w:firstLine="0"/>
+                    <w:jc w:val="left"/>
                   </w:pPr>
                   <w:r>
                     <w:rPr>
@@ -3048,23 +2076,9 @@
                     </w:rPr>
                     <w:t>Lorem ipsum dolor sit amet, consectetur adipiscing</w:t>
                   </w:r>
-                </w:p>
-              </w:txbxContent>
-            </v:textbox>
-          </v:shape>
-        </w:pict>
-      </w:r>
-      <w:r>
-        <w:pict>
-          <v:shape id="DocuMindTextBox122" type="#_x0000_t202" stroked="f" filled="f" o:allowincell="f" style="position:absolute;margin-left:67.299pt;margin-top:591.471pt;width:480.152pt;height:31.682pt;z-index:251659264;mso-position-horizontal-relative:page;mso-position-vertical-relative:page;mso-wrap-style:none;mso-fit-shape-to-text:t;">
-            <w10:wrap type="none"/>
-            <v:textbox inset="0,0,0,0">
-              <w:txbxContent>
-                <w:p>
-                  <w:pPr>
-                    <w:spacing w:before="0" w:after="0" w:lineRule="exact" w:line="514"/>
-                    <w:ind w:left="0" w:right="0" w:firstLine="0"/>
-                  </w:pPr>
+                  <w:r>
+                    <w:br/>
+                  </w:r>
                   <w:r>
                     <w:rPr>
                       <w:rFonts w:ascii="DMSans-Regular" w:hAnsi="DMSans-Regular" w:eastAsia="DMSans-Regular" w:cs="DMSans-Regular"/>
@@ -3073,25 +2087,11 @@
                       <w:color w:val="000000"/>
                       <w:sz w:val="39"/>
                     </w:rPr>
-                    <w:t xml:space="preserve"> elit. Integer nec odio. Praesent libero. Sed cursus ant</w:t>
+                    <w:t>elit. Integer nec odio. Praesent libero. Sed cursus ante</w:t>
                   </w:r>
-                </w:p>
-              </w:txbxContent>
-            </v:textbox>
-          </v:shape>
-        </w:pict>
-      </w:r>
-      <w:r>
-        <w:pict>
-          <v:shape id="DocuMindTextBox123" type="#_x0000_t202" stroked="f" filled="f" o:allowincell="f" style="position:absolute;margin-left:67.299pt;margin-top:622.913pt;width:407.570pt;height:31.682pt;z-index:251659264;mso-position-horizontal-relative:page;mso-position-vertical-relative:page;mso-wrap-style:none;mso-fit-shape-to-text:t;">
-            <w10:wrap type="none"/>
-            <v:textbox inset="0,0,0,0">
-              <w:txbxContent>
-                <w:p>
-                  <w:pPr>
-                    <w:spacing w:before="0" w:after="0" w:lineRule="exact" w:line="514"/>
-                    <w:ind w:left="0" w:right="0" w:firstLine="0"/>
-                  </w:pPr>
+                  <w:r>
+                    <w:br/>
+                  </w:r>
                   <w:r>
                     <w:rPr>
                       <w:rFonts w:ascii="DMSans-Regular" w:hAnsi="DMSans-Regular" w:eastAsia="DMSans-Regular" w:cs="DMSans-Regular"/>
@@ -3100,25 +2100,11 @@
                       <w:color w:val="000000"/>
                       <w:sz w:val="39"/>
                     </w:rPr>
-                    <w:t xml:space="preserve">e dapibus diam. Sed nisi. Nulla quis sem at nibh </w:t>
+                    <w:t>dapibus diam. Sed nisi. Nulla quis sem at nibh</w:t>
                   </w:r>
-                </w:p>
-              </w:txbxContent>
-            </v:textbox>
-          </v:shape>
-        </w:pict>
-      </w:r>
-      <w:r>
-        <w:pict>
-          <v:shape id="DocuMindTextBox124" type="#_x0000_t202" stroked="f" filled="f" o:allowincell="f" style="position:absolute;margin-left:67.299pt;margin-top:654.355pt;width:200.965pt;height:31.682pt;z-index:251659264;mso-position-horizontal-relative:page;mso-position-vertical-relative:page;mso-wrap-style:none;mso-fit-shape-to-text:t;">
-            <w10:wrap type="none"/>
-            <v:textbox inset="0,0,0,0">
-              <w:txbxContent>
-                <w:p>
-                  <w:pPr>
-                    <w:spacing w:before="0" w:after="0" w:lineRule="exact" w:line="514"/>
-                    <w:ind w:left="0" w:right="0" w:firstLine="0"/>
-                  </w:pPr>
+                  <w:r>
+                    <w:br/>
+                  </w:r>
                   <w:r>
                     <w:rPr>
                       <w:rFonts w:ascii="DMSans-Regular" w:hAnsi="DMSans-Regular" w:eastAsia="DMSans-Regular" w:cs="DMSans-Regular"/>

</xml_diff>